<commit_message>
Registro Rev 1.5, Manuale Utente 1.6, Manuale Amministratore 1.1, Manuale Test 1.1: capitolo pratiche
Co-Authored-By: Claude Opus 5.5 <noreply@anthropic.com>
Claude-Session: https://claude.ai/code/session_01E8XCbEeVHWVP3hntUZ6kZ1
</commit_message>
<xml_diff>
--- a/public/documentazione/Manuale_Amministratore_Portale_CWP.docx
+++ b/public/documentazione/Manuale_Amministratore_Portale_CWP.docx
@@ -302,7 +302,7 @@
                 <w:sz w:val="20"/>
                 <w:szCs w:val="20"/>
               </w:rPr>
-              <w:t xml:space="preserve">Rev. 1.0</w:t>
+              <w:t xml:space="preserve">Rev. 1.1</w:t>
             </w:r>
           </w:p>
         </w:tc>
@@ -719,6 +719,140 @@
                 <w:sz w:val="18"/>
                 <w:szCs w:val="18"/>
               </w:rPr>
+              <w:t xml:space="preserve">1.1</w:t>
+            </w:r>
+          </w:p>
+        </w:tc>
+        <w:tc>
+          <w:tcPr>
+            <w:tcW w:type="dxa" w:w="1300"/>
+            <w:tcBorders>
+              <w:top w:val="single" w:color="D9D4C5" w:sz="4"/>
+              <w:left w:val="single" w:color="D9D4C5" w:sz="4"/>
+              <w:bottom w:val="single" w:color="D9D4C5" w:sz="4"/>
+              <w:right w:val="single" w:color="D9D4C5" w:sz="4"/>
+            </w:tcBorders>
+            <w:tcMar>
+              <w:top w:type="dxa" w:w="70"/>
+              <w:left w:type="dxa" w:w="110"/>
+              <w:bottom w:type="dxa" w:w="70"/>
+              <w:right w:type="dxa" w:w="110"/>
+            </w:tcMar>
+            <w:vAlign w:val="center"/>
+          </w:tcPr>
+          <w:p>
+            <w:pPr>
+              <w:spacing w:after="0" w:before="0"/>
+            </w:pPr>
+            <w:r>
+              <w:rPr>
+                <w:rFonts w:ascii="Arial" w:cs="Arial" w:eastAsia="Arial" w:hAnsi="Arial"/>
+                <w:color w:val="1B2118"/>
+                <w:sz w:val="18"/>
+                <w:szCs w:val="18"/>
+              </w:rPr>
+              <w:t xml:space="preserve">18/10/2026</w:t>
+            </w:r>
+          </w:p>
+        </w:tc>
+        <w:tc>
+          <w:tcPr>
+            <w:tcW w:type="dxa" w:w="5538"/>
+            <w:tcBorders>
+              <w:top w:val="single" w:color="D9D4C5" w:sz="4"/>
+              <w:left w:val="single" w:color="D9D4C5" w:sz="4"/>
+              <w:bottom w:val="single" w:color="D9D4C5" w:sz="4"/>
+              <w:right w:val="single" w:color="D9D4C5" w:sz="4"/>
+            </w:tcBorders>
+            <w:tcMar>
+              <w:top w:type="dxa" w:w="70"/>
+              <w:left w:type="dxa" w:w="110"/>
+              <w:bottom w:type="dxa" w:w="70"/>
+              <w:right w:type="dxa" w:w="110"/>
+            </w:tcMar>
+            <w:vAlign w:val="center"/>
+          </w:tcPr>
+          <w:p>
+            <w:pPr>
+              <w:spacing w:after="0" w:before="0"/>
+            </w:pPr>
+            <w:r>
+              <w:rPr>
+                <w:rFonts w:ascii="Arial" w:cs="Arial" w:eastAsia="Arial" w:hAnsi="Arial"/>
+                <w:color w:val="1B2118"/>
+                <w:sz w:val="18"/>
+                <w:szCs w:val="18"/>
+              </w:rPr>
+              <w:t xml:space="preserve">Note di fase, Ente di Validazione della pratica, consultazione sulla pagina pubblica con conferma dell'email, moderazione con autori e allegati, errata corrige; nuovo capitolo Messaggi con il Comune; pagamenti visibili al Comune; Impostazioni: Enti di Validazione e Modelli di documento; notifiche aggiornate.</w:t>
+            </w:r>
+          </w:p>
+        </w:tc>
+        <w:tc>
+          <w:tcPr>
+            <w:tcW w:type="dxa" w:w="2000"/>
+            <w:tcBorders>
+              <w:top w:val="single" w:color="D9D4C5" w:sz="4"/>
+              <w:left w:val="single" w:color="D9D4C5" w:sz="4"/>
+              <w:bottom w:val="single" w:color="D9D4C5" w:sz="4"/>
+              <w:right w:val="single" w:color="D9D4C5" w:sz="4"/>
+            </w:tcBorders>
+            <w:tcMar>
+              <w:top w:type="dxa" w:w="70"/>
+              <w:left w:type="dxa" w:w="110"/>
+              <w:bottom w:type="dxa" w:w="70"/>
+              <w:right w:type="dxa" w:w="110"/>
+            </w:tcMar>
+            <w:vAlign w:val="center"/>
+          </w:tcPr>
+          <w:p>
+            <w:pPr>
+              <w:spacing w:after="0" w:before="0"/>
+            </w:pPr>
+            <w:r>
+              <w:rPr>
+                <w:rFonts w:ascii="Arial" w:cs="Arial" w:eastAsia="Arial" w:hAnsi="Arial"/>
+                <w:color w:val="1B2118"/>
+                <w:sz w:val="18"/>
+                <w:szCs w:val="18"/>
+              </w:rPr>
+              <w:t xml:space="preserve">Fondazione Operate</w:t>
+            </w:r>
+          </w:p>
+        </w:tc>
+      </w:tr>
+      <w:tr>
+        <w:trPr>
+          <w:cantSplit/>
+        </w:trPr>
+        <w:tc>
+          <w:tcPr>
+            <w:tcW w:type="dxa" w:w="800"/>
+            <w:tcBorders>
+              <w:top w:val="single" w:color="D9D4C5" w:sz="4"/>
+              <w:left w:val="single" w:color="D9D4C5" w:sz="4"/>
+              <w:bottom w:val="single" w:color="D9D4C5" w:sz="4"/>
+              <w:right w:val="single" w:color="D9D4C5" w:sz="4"/>
+            </w:tcBorders>
+            <w:shd w:fill="F6F4EE" w:color="auto" w:val="clear"/>
+            <w:tcMar>
+              <w:top w:type="dxa" w:w="70"/>
+              <w:left w:type="dxa" w:w="110"/>
+              <w:bottom w:type="dxa" w:w="70"/>
+              <w:right w:type="dxa" w:w="110"/>
+            </w:tcMar>
+            <w:vAlign w:val="center"/>
+          </w:tcPr>
+          <w:p>
+            <w:pPr>
+              <w:spacing w:after="0" w:before="0"/>
+            </w:pPr>
+            <w:r>
+              <w:rPr>
+                <w:rFonts w:ascii="Arial" w:cs="Arial" w:eastAsia="Arial" w:hAnsi="Arial"/>
+                <w:color w:val="1B2118"/>
+                <w:sz w:val="18"/>
+                <w:szCs w:val="18"/>
+              </w:rPr>
               <w:t xml:space="preserve">1.0</w:t>
             </w:r>
           </w:p>
@@ -732,6 +866,7 @@
               <w:bottom w:val="single" w:color="D9D4C5" w:sz="4"/>
               <w:right w:val="single" w:color="D9D4C5" w:sz="4"/>
             </w:tcBorders>
+            <w:shd w:fill="F6F4EE" w:color="auto" w:val="clear"/>
             <w:tcMar>
               <w:top w:type="dxa" w:w="70"/>
               <w:left w:type="dxa" w:w="110"/>
@@ -764,6 +899,7 @@
               <w:bottom w:val="single" w:color="D9D4C5" w:sz="4"/>
               <w:right w:val="single" w:color="D9D4C5" w:sz="4"/>
             </w:tcBorders>
+            <w:shd w:fill="F6F4EE" w:color="auto" w:val="clear"/>
             <w:tcMar>
               <w:top w:type="dxa" w:w="70"/>
               <w:left w:type="dxa" w:w="110"/>
@@ -796,6 +932,7 @@
               <w:bottom w:val="single" w:color="D9D4C5" w:sz="4"/>
               <w:right w:val="single" w:color="D9D4C5" w:sz="4"/>
             </w:tcBorders>
+            <w:shd w:fill="F6F4EE" w:color="auto" w:val="clear"/>
             <w:tcMar>
               <w:top w:type="dxa" w:w="70"/>
               <w:left w:type="dxa" w:w="110"/>
@@ -837,7 +974,7 @@
           <w:sz w:val="20"/>
           <w:szCs w:val="20"/>
         </w:rPr>
-        <w:t xml:space="preserve">Questo documento descrive il portale alla revisione 1.0 del 18/10/2026. A ogni modifica del portale il manuale viene aggiornato e la revisione incrementata; la versione corrente si scarica dall'area Documentazione del portale (solo Amministratori).</w:t>
+        <w:t xml:space="preserve">Questo documento descrive il portale alla revisione 1.1 del 18/10/2026. A ogni modifica del portale il manuale viene aggiornato e la revisione incrementata; la versione corrente si scarica dall'area Documentazione del portale (solo Amministratori).</w:t>
       </w:r>
     </w:p>
     <w:p>
@@ -1111,36 +1248,7 @@
             <w:sz w:val="22"/>
             <w:szCs w:val="22"/>
           </w:rPr>
-          <w:t xml:space="preserve">9.  Pagamenti</w:t>
-        </w:r>
-        <w:r>
-          <w:rPr>
-            <w:rFonts w:ascii="Arial" w:cs="Arial" w:eastAsia="Arial" w:hAnsi="Arial"/>
-            <w:color w:val="1B2118"/>
-            <w:sz w:val="22"/>
-            <w:szCs w:val="22"/>
-          </w:rPr>
-          <w:tab/>
-          <w:t xml:space="preserve">12</w:t>
-        </w:r>
-      </w:hyperlink>
-    </w:p>
-    <w:p>
-      <w:pPr>
-        <w:tabs>
-          <w:tab w:val="right" w:pos="9638" w:leader="dot"/>
-        </w:tabs>
-        <w:spacing w:after="130"/>
-      </w:pPr>
-      <w:hyperlink w:history="1" w:anchor="cap10">
-        <w:r>
-          <w:rPr>
-            <w:rFonts w:ascii="Arial" w:cs="Arial" w:eastAsia="Arial" w:hAnsi="Arial"/>
-            <w:color w:val="1B2118"/>
-            <w:sz w:val="22"/>
-            <w:szCs w:val="22"/>
-          </w:rPr>
-          <w:t xml:space="preserve">10.  Export del fascicolo</w:t>
+          <w:t xml:space="preserve">9.  Messaggi con il Comune</w:t>
         </w:r>
         <w:r>
           <w:rPr>
@@ -1161,7 +1269,7 @@
         </w:tabs>
         <w:spacing w:after="130"/>
       </w:pPr>
-      <w:hyperlink w:history="1" w:anchor="cap11">
+      <w:hyperlink w:history="1" w:anchor="cap10">
         <w:r>
           <w:rPr>
             <w:rFonts w:ascii="Arial" w:cs="Arial" w:eastAsia="Arial" w:hAnsi="Arial"/>
@@ -1169,7 +1277,7 @@
             <w:sz w:val="22"/>
             <w:szCs w:val="22"/>
           </w:rPr>
-          <w:t xml:space="preserve">11.  Notifiche ed email</w:t>
+          <w:t xml:space="preserve">10.  Pagamenti</w:t>
         </w:r>
         <w:r>
           <w:rPr>
@@ -1190,7 +1298,7 @@
         </w:tabs>
         <w:spacing w:after="130"/>
       </w:pPr>
-      <w:hyperlink w:history="1" w:anchor="cap12">
+      <w:hyperlink w:history="1" w:anchor="cap11">
         <w:r>
           <w:rPr>
             <w:rFonts w:ascii="Arial" w:cs="Arial" w:eastAsia="Arial" w:hAnsi="Arial"/>
@@ -1198,7 +1306,7 @@
             <w:sz w:val="22"/>
             <w:szCs w:val="22"/>
           </w:rPr>
-          <w:t xml:space="preserve">12.  Gestione utenti</w:t>
+          <w:t xml:space="preserve">11.  Export del fascicolo</w:t>
         </w:r>
         <w:r>
           <w:rPr>
@@ -1219,7 +1327,7 @@
         </w:tabs>
         <w:spacing w:after="130"/>
       </w:pPr>
-      <w:hyperlink w:history="1" w:anchor="cap13">
+      <w:hyperlink w:history="1" w:anchor="cap12">
         <w:r>
           <w:rPr>
             <w:rFonts w:ascii="Arial" w:cs="Arial" w:eastAsia="Arial" w:hAnsi="Arial"/>
@@ -1227,7 +1335,7 @@
             <w:sz w:val="22"/>
             <w:szCs w:val="22"/>
           </w:rPr>
-          <w:t xml:space="preserve">13.  Audit trail</w:t>
+          <w:t xml:space="preserve">12.  Notifiche ed email</w:t>
         </w:r>
         <w:r>
           <w:rPr>
@@ -1248,7 +1356,7 @@
         </w:tabs>
         <w:spacing w:after="130"/>
       </w:pPr>
-      <w:hyperlink w:history="1" w:anchor="cap14">
+      <w:hyperlink w:history="1" w:anchor="cap13">
         <w:r>
           <w:rPr>
             <w:rFonts w:ascii="Arial" w:cs="Arial" w:eastAsia="Arial" w:hAnsi="Arial"/>
@@ -1256,7 +1364,7 @@
             <w:sz w:val="22"/>
             <w:szCs w:val="22"/>
           </w:rPr>
-          <w:t xml:space="preserve">14.  Impostazioni: durata delle fasi</w:t>
+          <w:t xml:space="preserve">13.  Gestione utenti</w:t>
         </w:r>
         <w:r>
           <w:rPr>
@@ -1277,7 +1385,7 @@
         </w:tabs>
         <w:spacing w:after="130"/>
       </w:pPr>
-      <w:hyperlink w:history="1" w:anchor="cap15">
+      <w:hyperlink w:history="1" w:anchor="cap14">
         <w:r>
           <w:rPr>
             <w:rFonts w:ascii="Arial" w:cs="Arial" w:eastAsia="Arial" w:hAnsi="Arial"/>
@@ -1285,7 +1393,7 @@
             <w:sz w:val="22"/>
             <w:szCs w:val="22"/>
           </w:rPr>
-          <w:t xml:space="preserve">15.  Calcolo dei crediti CWP</w:t>
+          <w:t xml:space="preserve">14.  Audit trail</w:t>
         </w:r>
         <w:r>
           <w:rPr>
@@ -1306,7 +1414,7 @@
         </w:tabs>
         <w:spacing w:after="130"/>
       </w:pPr>
-      <w:hyperlink w:history="1" w:anchor="cap16">
+      <w:hyperlink w:history="1" w:anchor="cap15">
         <w:r>
           <w:rPr>
             <w:rFonts w:ascii="Arial" w:cs="Arial" w:eastAsia="Arial" w:hAnsi="Arial"/>
@@ -1314,7 +1422,7 @@
             <w:sz w:val="22"/>
             <w:szCs w:val="22"/>
           </w:rPr>
-          <w:t xml:space="preserve">16.  Documentazione e manuali</w:t>
+          <w:t xml:space="preserve">15.  Impostazioni: fasi, Enti di Validazione e modelli</w:t>
         </w:r>
         <w:r>
           <w:rPr>
@@ -1324,7 +1432,7 @@
             <w:szCs w:val="22"/>
           </w:rPr>
           <w:tab/>
-          <w:t xml:space="preserve">22</w:t>
+          <w:t xml:space="preserve">19</w:t>
         </w:r>
       </w:hyperlink>
     </w:p>
@@ -1335,7 +1443,7 @@
         </w:tabs>
         <w:spacing w:after="130"/>
       </w:pPr>
-      <w:hyperlink w:history="1" w:anchor="cap17">
+      <w:hyperlink w:history="1" w:anchor="cap16">
         <w:r>
           <w:rPr>
             <w:rFonts w:ascii="Arial" w:cs="Arial" w:eastAsia="Arial" w:hAnsi="Arial"/>
@@ -1343,7 +1451,7 @@
             <w:sz w:val="22"/>
             <w:szCs w:val="22"/>
           </w:rPr>
-          <w:t xml:space="preserve">17.  Manutenzione ed emergenze</w:t>
+          <w:t xml:space="preserve">16.  Calcolo dei crediti CWP</w:t>
         </w:r>
         <w:r>
           <w:rPr>
@@ -1353,7 +1461,7 @@
             <w:szCs w:val="22"/>
           </w:rPr>
           <w:tab/>
-          <w:t xml:space="preserve">23</w:t>
+          <w:t xml:space="preserve">21</w:t>
         </w:r>
       </w:hyperlink>
     </w:p>
@@ -1364,7 +1472,7 @@
         </w:tabs>
         <w:spacing w:after="130"/>
       </w:pPr>
-      <w:hyperlink w:history="1" w:anchor="cap18">
+      <w:hyperlink w:history="1" w:anchor="cap17">
         <w:r>
           <w:rPr>
             <w:rFonts w:ascii="Arial" w:cs="Arial" w:eastAsia="Arial" w:hAnsi="Arial"/>
@@ -1372,7 +1480,7 @@
             <w:sz w:val="22"/>
             <w:szCs w:val="22"/>
           </w:rPr>
-          <w:t xml:space="preserve">18.  Funzioni in arrivo</w:t>
+          <w:t xml:space="preserve">17.  Documentazione e manuali</w:t>
         </w:r>
         <w:r>
           <w:rPr>
@@ -1382,7 +1490,65 @@
             <w:szCs w:val="22"/>
           </w:rPr>
           <w:tab/>
-          <w:t xml:space="preserve">24</w:t>
+          <w:t xml:space="preserve">25</w:t>
+        </w:r>
+      </w:hyperlink>
+    </w:p>
+    <w:p>
+      <w:pPr>
+        <w:tabs>
+          <w:tab w:val="right" w:pos="9638" w:leader="dot"/>
+        </w:tabs>
+        <w:spacing w:after="130"/>
+      </w:pPr>
+      <w:hyperlink w:history="1" w:anchor="cap18">
+        <w:r>
+          <w:rPr>
+            <w:rFonts w:ascii="Arial" w:cs="Arial" w:eastAsia="Arial" w:hAnsi="Arial"/>
+            <w:color w:val="1B2118"/>
+            <w:sz w:val="22"/>
+            <w:szCs w:val="22"/>
+          </w:rPr>
+          <w:t xml:space="preserve">18.  Manutenzione ed emergenze</w:t>
+        </w:r>
+        <w:r>
+          <w:rPr>
+            <w:rFonts w:ascii="Arial" w:cs="Arial" w:eastAsia="Arial" w:hAnsi="Arial"/>
+            <w:color w:val="1B2118"/>
+            <w:sz w:val="22"/>
+            <w:szCs w:val="22"/>
+          </w:rPr>
+          <w:tab/>
+          <w:t xml:space="preserve">26</w:t>
+        </w:r>
+      </w:hyperlink>
+    </w:p>
+    <w:p>
+      <w:pPr>
+        <w:tabs>
+          <w:tab w:val="right" w:pos="9638" w:leader="dot"/>
+        </w:tabs>
+        <w:spacing w:after="130"/>
+      </w:pPr>
+      <w:hyperlink w:history="1" w:anchor="cap19">
+        <w:r>
+          <w:rPr>
+            <w:rFonts w:ascii="Arial" w:cs="Arial" w:eastAsia="Arial" w:hAnsi="Arial"/>
+            <w:color w:val="1B2118"/>
+            <w:sz w:val="22"/>
+            <w:szCs w:val="22"/>
+          </w:rPr>
+          <w:t xml:space="preserve">19.  Funzioni in arrivo</w:t>
+        </w:r>
+        <w:r>
+          <w:rPr>
+            <w:rFonts w:ascii="Arial" w:cs="Arial" w:eastAsia="Arial" w:hAnsi="Arial"/>
+            <w:color w:val="1B2118"/>
+            <w:sz w:val="22"/>
+            <w:szCs w:val="22"/>
+          </w:rPr>
+          <w:tab/>
+          <w:t xml:space="preserve">27</w:t>
         </w:r>
       </w:hyperlink>
     </w:p>
@@ -1563,8 +1729,8 @@
         <w:tblLayout w:type="fixed"/>
       </w:tblPr>
       <w:tblGrid>
-        <w:gridCol w:w="4708"/>
-        <w:gridCol w:w="2920"/>
+        <w:gridCol w:w="5052"/>
+        <w:gridCol w:w="2576"/>
         <w:gridCol w:w="2010"/>
       </w:tblGrid>
       <w:tr>
@@ -1573,7 +1739,7 @@
         </w:trPr>
         <w:tc>
           <w:tcPr>
-            <w:tcW w:type="dxa" w:w="4708"/>
+            <w:tcW w:type="dxa" w:w="5052"/>
             <w:tcBorders>
               <w:top w:val="single" w:color="D9D4C5" w:sz="4"/>
               <w:left w:val="single" w:color="D9D4C5" w:sz="4"/>
@@ -1608,7 +1774,7 @@
         </w:tc>
         <w:tc>
           <w:tcPr>
-            <w:tcW w:type="dxa" w:w="2920"/>
+            <w:tcW w:type="dxa" w:w="2576"/>
             <w:tcBorders>
               <w:top w:val="single" w:color="D9D4C5" w:sz="4"/>
               <w:left w:val="single" w:color="D9D4C5" w:sz="4"/>
@@ -1683,7 +1849,7 @@
         </w:trPr>
         <w:tc>
           <w:tcPr>
-            <w:tcW w:type="dxa" w:w="4708"/>
+            <w:tcW w:type="dxa" w:w="5052"/>
             <w:tcBorders>
               <w:top w:val="single" w:color="D9D4C5" w:sz="4"/>
               <w:left w:val="single" w:color="D9D4C5" w:sz="4"/>
@@ -1715,7 +1881,7 @@
         </w:tc>
         <w:tc>
           <w:tcPr>
-            <w:tcW w:type="dxa" w:w="2920"/>
+            <w:tcW w:type="dxa" w:w="2576"/>
             <w:tcBorders>
               <w:top w:val="single" w:color="D9D4C5" w:sz="4"/>
               <w:left w:val="single" w:color="D9D4C5" w:sz="4"/>
@@ -1784,7 +1950,7 @@
         </w:trPr>
         <w:tc>
           <w:tcPr>
-            <w:tcW w:type="dxa" w:w="4708"/>
+            <w:tcW w:type="dxa" w:w="5052"/>
             <w:tcBorders>
               <w:top w:val="single" w:color="D9D4C5" w:sz="4"/>
               <w:left w:val="single" w:color="D9D4C5" w:sz="4"/>
@@ -1817,7 +1983,7 @@
         </w:tc>
         <w:tc>
           <w:tcPr>
-            <w:tcW w:type="dxa" w:w="2920"/>
+            <w:tcW w:type="dxa" w:w="2576"/>
             <w:tcBorders>
               <w:top w:val="single" w:color="D9D4C5" w:sz="4"/>
               <w:left w:val="single" w:color="D9D4C5" w:sz="4"/>
@@ -1888,7 +2054,7 @@
         </w:trPr>
         <w:tc>
           <w:tcPr>
-            <w:tcW w:type="dxa" w:w="4708"/>
+            <w:tcW w:type="dxa" w:w="5052"/>
             <w:tcBorders>
               <w:top w:val="single" w:color="D9D4C5" w:sz="4"/>
               <w:left w:val="single" w:color="D9D4C5" w:sz="4"/>
@@ -1920,7 +2086,7 @@
         </w:tc>
         <w:tc>
           <w:tcPr>
-            <w:tcW w:type="dxa" w:w="2920"/>
+            <w:tcW w:type="dxa" w:w="2576"/>
             <w:tcBorders>
               <w:top w:val="single" w:color="D9D4C5" w:sz="4"/>
               <w:left w:val="single" w:color="D9D4C5" w:sz="4"/>
@@ -1989,7 +2155,7 @@
         </w:trPr>
         <w:tc>
           <w:tcPr>
-            <w:tcW w:type="dxa" w:w="4708"/>
+            <w:tcW w:type="dxa" w:w="5052"/>
             <w:tcBorders>
               <w:top w:val="single" w:color="D9D4C5" w:sz="4"/>
               <w:left w:val="single" w:color="D9D4C5" w:sz="4"/>
@@ -2022,7 +2188,7 @@
         </w:tc>
         <w:tc>
           <w:tcPr>
-            <w:tcW w:type="dxa" w:w="2920"/>
+            <w:tcW w:type="dxa" w:w="2576"/>
             <w:tcBorders>
               <w:top w:val="single" w:color="D9D4C5" w:sz="4"/>
               <w:left w:val="single" w:color="D9D4C5" w:sz="4"/>
@@ -2093,7 +2259,7 @@
         </w:trPr>
         <w:tc>
           <w:tcPr>
-            <w:tcW w:type="dxa" w:w="4708"/>
+            <w:tcW w:type="dxa" w:w="5052"/>
             <w:tcBorders>
               <w:top w:val="single" w:color="D9D4C5" w:sz="4"/>
               <w:left w:val="single" w:color="D9D4C5" w:sz="4"/>
@@ -2125,7 +2291,7 @@
         </w:tc>
         <w:tc>
           <w:tcPr>
-            <w:tcW w:type="dxa" w:w="2920"/>
+            <w:tcW w:type="dxa" w:w="2576"/>
             <w:tcBorders>
               <w:top w:val="single" w:color="D9D4C5" w:sz="4"/>
               <w:left w:val="single" w:color="D9D4C5" w:sz="4"/>
@@ -2194,7 +2360,7 @@
         </w:trPr>
         <w:tc>
           <w:tcPr>
-            <w:tcW w:type="dxa" w:w="4708"/>
+            <w:tcW w:type="dxa" w:w="5052"/>
             <w:tcBorders>
               <w:top w:val="single" w:color="D9D4C5" w:sz="4"/>
               <w:left w:val="single" w:color="D9D4C5" w:sz="4"/>
@@ -2221,13 +2387,13 @@
                 <w:sz w:val="18"/>
                 <w:szCs w:val="18"/>
               </w:rPr>
-              <w:t xml:space="preserve">Impostazioni (durata delle fasi)</w:t>
-            </w:r>
-          </w:p>
-        </w:tc>
-        <w:tc>
-          <w:tcPr>
-            <w:tcW w:type="dxa" w:w="2920"/>
+              <w:t xml:space="preserve">Impostazioni (durata delle fasi, Enti di Validazione, modelli)</w:t>
+            </w:r>
+          </w:p>
+        </w:tc>
+        <w:tc>
+          <w:tcPr>
+            <w:tcW w:type="dxa" w:w="2576"/>
             <w:tcBorders>
               <w:top w:val="single" w:color="D9D4C5" w:sz="4"/>
               <w:left w:val="single" w:color="D9D4C5" w:sz="4"/>
@@ -2298,7 +2464,7 @@
         </w:trPr>
         <w:tc>
           <w:tcPr>
-            <w:tcW w:type="dxa" w:w="4708"/>
+            <w:tcW w:type="dxa" w:w="5052"/>
             <w:tcBorders>
               <w:top w:val="single" w:color="D9D4C5" w:sz="4"/>
               <w:left w:val="single" w:color="D9D4C5" w:sz="4"/>
@@ -2330,7 +2496,7 @@
         </w:tc>
         <w:tc>
           <w:tcPr>
-            <w:tcW w:type="dxa" w:w="2920"/>
+            <w:tcW w:type="dxa" w:w="2576"/>
             <w:tcBorders>
               <w:top w:val="single" w:color="D9D4C5" w:sz="4"/>
               <w:left w:val="single" w:color="D9D4C5" w:sz="4"/>
@@ -2399,7 +2565,7 @@
         </w:trPr>
         <w:tc>
           <w:tcPr>
-            <w:tcW w:type="dxa" w:w="4708"/>
+            <w:tcW w:type="dxa" w:w="5052"/>
             <w:tcBorders>
               <w:top w:val="single" w:color="D9D4C5" w:sz="4"/>
               <w:left w:val="single" w:color="D9D4C5" w:sz="4"/>
@@ -2432,7 +2598,7 @@
         </w:tc>
         <w:tc>
           <w:tcPr>
-            <w:tcW w:type="dxa" w:w="2920"/>
+            <w:tcW w:type="dxa" w:w="2576"/>
             <w:tcBorders>
               <w:top w:val="single" w:color="D9D4C5" w:sz="4"/>
               <w:left w:val="single" w:color="D9D4C5" w:sz="4"/>
@@ -2709,7 +2875,7 @@
         </w:rPr>
         <w:t xml:space="preserve">Si accede da </w:t>
       </w:r>
-      <w:hyperlink w:history="1" r:id="rId6m6gwmxzyktur9i-yboec">
+      <w:hyperlink w:history="1" r:id="rIddn-bxg0vzp5qamcmemdcx">
         <w:r>
           <w:rPr>
             <w:rFonts w:ascii="Arial" w:cs="Arial" w:eastAsia="Arial" w:hAnsi="Arial"/>
@@ -5548,6 +5714,196 @@
           <w:sz w:val="21"/>
           <w:szCs w:val="21"/>
         </w:rPr>
+        <w:t xml:space="preserve">Note di fase.</w:t>
+      </w:r>
+      <w:r>
+        <w:rPr>
+          <w:rFonts w:ascii="Arial" w:cs="Arial" w:eastAsia="Arial" w:hAnsi="Arial"/>
+          <w:color w:val="1B2118"/>
+          <w:sz w:val="21"/>
+          <w:szCs w:val="21"/>
+        </w:rPr>
+        <w:t xml:space="preserve"> Sotto ogni fase, </w:t>
+      </w:r>
+      <w:r>
+        <w:rPr>
+          <w:rFonts w:ascii="Arial" w:cs="Arial" w:eastAsia="Arial" w:hAnsi="Arial"/>
+          <w:b/>
+          <w:bCs/>
+          <w:color w:val="1B2118"/>
+          <w:sz w:val="21"/>
+          <w:szCs w:val="21"/>
+        </w:rPr>
+        <w:t xml:space="preserve">+ Aggiungi nota</w:t>
+      </w:r>
+      <w:r>
+        <w:rPr>
+          <w:rFonts w:ascii="Arial" w:cs="Arial" w:eastAsia="Arial" w:hAnsi="Arial"/>
+          <w:color w:val="1B2118"/>
+          <w:sz w:val="21"/>
+          <w:szCs w:val="21"/>
+        </w:rPr>
+        <w:t xml:space="preserve"> apre un campo di testo. Senza spunta la nota è </w:t>
+      </w:r>
+      <w:r>
+        <w:rPr>
+          <w:rFonts w:ascii="Arial" w:cs="Arial" w:eastAsia="Arial" w:hAnsi="Arial"/>
+          <w:b/>
+          <w:bCs/>
+          <w:color w:val="1B2118"/>
+          <w:sz w:val="21"/>
+          <w:szCs w:val="21"/>
+        </w:rPr>
+        <w:t xml:space="preserve">interna</w:t>
+      </w:r>
+      <w:r>
+        <w:rPr>
+          <w:rFonts w:ascii="Arial" w:cs="Arial" w:eastAsia="Arial" w:hAnsi="Arial"/>
+          <w:color w:val="1B2118"/>
+          <w:sz w:val="21"/>
+          <w:szCs w:val="21"/>
+        </w:rPr>
+        <w:t xml:space="preserve"> (la vede solo la Fondazione, bordo arancione); con la spunta </w:t>
+      </w:r>
+      <w:r>
+        <w:rPr>
+          <w:rFonts w:ascii="Arial" w:cs="Arial" w:eastAsia="Arial" w:hAnsi="Arial"/>
+          <w:b/>
+          <w:bCs/>
+          <w:color w:val="1B2118"/>
+          <w:sz w:val="21"/>
+          <w:szCs w:val="21"/>
+        </w:rPr>
+        <w:t xml:space="preserve">Visibile al Comune</w:t>
+      </w:r>
+      <w:r>
+        <w:rPr>
+          <w:rFonts w:ascii="Arial" w:cs="Arial" w:eastAsia="Arial" w:hAnsi="Arial"/>
+          <w:color w:val="1B2118"/>
+          <w:sz w:val="21"/>
+          <w:szCs w:val="21"/>
+        </w:rPr>
+        <w:t xml:space="preserve"> la nota è </w:t>
+      </w:r>
+      <w:r>
+        <w:rPr>
+          <w:rFonts w:ascii="Arial" w:cs="Arial" w:eastAsia="Arial" w:hAnsi="Arial"/>
+          <w:b/>
+          <w:bCs/>
+          <w:color w:val="1B2118"/>
+          <w:sz w:val="21"/>
+          <w:szCs w:val="21"/>
+        </w:rPr>
+        <w:t xml:space="preserve">condivisa</w:t>
+      </w:r>
+      <w:r>
+        <w:rPr>
+          <w:rFonts w:ascii="Arial" w:cs="Arial" w:eastAsia="Arial" w:hAnsi="Arial"/>
+          <w:color w:val="1B2118"/>
+          <w:sz w:val="21"/>
+          <w:szCs w:val="21"/>
+        </w:rPr>
+        <w:t xml:space="preserve"> (bordo verde) e il Comune riceve la notifica «Nuova nota della Fondazione». Le note non si modificano né si cancellano e finiscono nell'audit: per correggere, aggiungete una nuova nota.</w:t>
+      </w:r>
+    </w:p>
+    <w:p>
+      <w:pPr>
+        <w:spacing w:after="140" w:line="300"/>
+      </w:pPr>
+      <w:r>
+        <w:rPr>
+          <w:rFonts w:ascii="Arial" w:cs="Arial" w:eastAsia="Arial" w:hAnsi="Arial"/>
+          <w:b/>
+          <w:bCs/>
+          <w:color w:val="1B2118"/>
+          <w:sz w:val="21"/>
+          <w:szCs w:val="21"/>
+        </w:rPr>
+        <w:t xml:space="preserve">Ente di Validazione della pratica.</w:t>
+      </w:r>
+      <w:r>
+        <w:rPr>
+          <w:rFonts w:ascii="Arial" w:cs="Arial" w:eastAsia="Arial" w:hAnsi="Arial"/>
+          <w:color w:val="1B2118"/>
+          <w:sz w:val="21"/>
+          <w:szCs w:val="21"/>
+        </w:rPr>
+        <w:t xml:space="preserve"> Nell'intestazione della pratica, accanto a «Ente di Validazione», premete </w:t>
+      </w:r>
+      <w:r>
+        <w:rPr>
+          <w:rFonts w:ascii="Arial" w:cs="Arial" w:eastAsia="Arial" w:hAnsi="Arial"/>
+          <w:b/>
+          <w:bCs/>
+          <w:color w:val="1B2118"/>
+          <w:sz w:val="21"/>
+          <w:szCs w:val="21"/>
+        </w:rPr>
+        <w:t xml:space="preserve">Assegna</w:t>
+      </w:r>
+      <w:r>
+        <w:rPr>
+          <w:rFonts w:ascii="Arial" w:cs="Arial" w:eastAsia="Arial" w:hAnsi="Arial"/>
+          <w:color w:val="1B2118"/>
+          <w:sz w:val="21"/>
+          <w:szCs w:val="21"/>
+        </w:rPr>
+        <w:t xml:space="preserve"> (o </w:t>
+      </w:r>
+      <w:r>
+        <w:rPr>
+          <w:rFonts w:ascii="Arial" w:cs="Arial" w:eastAsia="Arial" w:hAnsi="Arial"/>
+          <w:b/>
+          <w:bCs/>
+          <w:color w:val="1B2118"/>
+          <w:sz w:val="21"/>
+          <w:szCs w:val="21"/>
+        </w:rPr>
+        <w:t xml:space="preserve">Cambia</w:t>
+      </w:r>
+      <w:r>
+        <w:rPr>
+          <w:rFonts w:ascii="Arial" w:cs="Arial" w:eastAsia="Arial" w:hAnsi="Arial"/>
+          <w:color w:val="1B2118"/>
+          <w:sz w:val="21"/>
+          <w:szCs w:val="21"/>
+        </w:rPr>
+        <w:t xml:space="preserve">), scegliete l'ente e premete </w:t>
+      </w:r>
+      <w:r>
+        <w:rPr>
+          <w:rFonts w:ascii="Arial" w:cs="Arial" w:eastAsia="Arial" w:hAnsi="Arial"/>
+          <w:b/>
+          <w:bCs/>
+          <w:color w:val="1B2118"/>
+          <w:sz w:val="21"/>
+          <w:szCs w:val="21"/>
+        </w:rPr>
+        <w:t xml:space="preserve">Salva</w:t>
+      </w:r>
+      <w:r>
+        <w:rPr>
+          <w:rFonts w:ascii="Arial" w:cs="Arial" w:eastAsia="Arial" w:hAnsi="Arial"/>
+          <w:color w:val="1B2118"/>
+          <w:sz w:val="21"/>
+          <w:szCs w:val="21"/>
+        </w:rPr>
+        <w:t xml:space="preserve">. L'elenco degli enti si gestisce in Impostazioni (capitolo «Impostazioni»). Il Comune vede il nome dell'ente assegnato. L'assegnazione è registrata nell'audit.</w:t>
+      </w:r>
+    </w:p>
+    <w:p>
+      <w:pPr>
+        <w:spacing w:after="140" w:line="300"/>
+      </w:pPr>
+      <w:r>
+        <w:rPr>
+          <w:rFonts w:ascii="Arial" w:cs="Arial" w:eastAsia="Arial" w:hAnsi="Arial"/>
+          <w:b/>
+          <w:bCs/>
+          <w:color w:val="1B2118"/>
+          <w:sz w:val="21"/>
+          <w:szCs w:val="21"/>
+        </w:rPr>
         <w:t xml:space="preserve">Nuove versioni durante una fase.</w:t>
       </w:r>
       <w:r>
@@ -6116,7 +6472,27 @@
           <w:sz w:val="21"/>
           <w:szCs w:val="21"/>
         </w:rPr>
-        <w:t xml:space="preserve">Il Comune riceve la notifica con la motivazione, che resta visibile nell'intestazione della pratica. Con la pratica sospesa, annullata o chiusa il Comune non può caricare documenti né rispondere alle integrazioni.</w:t>
+        <w:t xml:space="preserve">Il Comune riceve la notifica con la motivazione, che resta visibile nell'intestazione della pratica. Con la pratica sospesa, annullata o chiusa il Comune vede un avviso che lo spiega, non ha il pulsante </w:t>
+      </w:r>
+      <w:r>
+        <w:rPr>
+          <w:rFonts w:ascii="Arial" w:cs="Arial" w:eastAsia="Arial" w:hAnsi="Arial"/>
+          <w:b/>
+          <w:bCs/>
+          <w:color w:val="1B2118"/>
+          <w:sz w:val="21"/>
+          <w:szCs w:val="21"/>
+        </w:rPr>
+        <w:t xml:space="preserve">+ Carica</w:t>
+      </w:r>
+      <w:r>
+        <w:rPr>
+          <w:rFonts w:ascii="Arial" w:cs="Arial" w:eastAsia="Arial" w:hAnsi="Arial"/>
+          <w:color w:val="1B2118"/>
+          <w:sz w:val="21"/>
+          <w:szCs w:val="21"/>
+        </w:rPr>
+        <w:t xml:space="preserve"> e non può rispondere alle integrazioni; può sempre scrivere nella sezione Messaggi (non sulle pratiche annullate).</w:t>
       </w:r>
     </w:p>
     <w:p>
@@ -6976,7 +7352,45 @@
           <w:sz w:val="21"/>
           <w:szCs w:val="21"/>
         </w:rPr>
-        <w:t xml:space="preserve">La consultazione pubblica riguarda solo i Progetti (fase 3) e dura 30 giorni.</w:t>
+        <w:t xml:space="preserve">La consultazione pubblica riguarda solo i Progetti (fase 3) e dura 30 giorni. Si svolge sulla </w:t>
+      </w:r>
+      <w:r>
+        <w:rPr>
+          <w:rFonts w:ascii="Arial" w:cs="Arial" w:eastAsia="Arial" w:hAnsi="Arial"/>
+          <w:b/>
+          <w:bCs/>
+          <w:color w:val="1B2118"/>
+          <w:sz w:val="21"/>
+          <w:szCs w:val="21"/>
+        </w:rPr>
+        <w:t xml:space="preserve">pagina pubblica</w:t>
+      </w:r>
+      <w:r>
+        <w:rPr>
+          <w:rFonts w:ascii="Arial" w:cs="Arial" w:eastAsia="Arial" w:hAnsi="Arial"/>
+          <w:color w:val="1B2118"/>
+          <w:sz w:val="21"/>
+          <w:szCs w:val="21"/>
+        </w:rPr>
+        <w:t xml:space="preserve"> del portale (</w:t>
+      </w:r>
+      <w:r>
+        <w:rPr>
+          <w:rFonts w:ascii="Consolas" w:cs="Consolas" w:eastAsia="Consolas" w:hAnsi="Consolas"/>
+          <w:color w:val="2F5D3A"/>
+          <w:sz w:val="21"/>
+          <w:szCs w:val="21"/>
+        </w:rPr>
+        <w:t xml:space="preserve">/consultazioni</w:t>
+      </w:r>
+      <w:r>
+        <w:rPr>
+          <w:rFonts w:ascii="Arial" w:cs="Arial" w:eastAsia="Arial" w:hAnsi="Arial"/>
+          <w:color w:val="1B2118"/>
+          <w:sz w:val="21"/>
+          <w:szCs w:val="21"/>
+        </w:rPr>
+        <w:t xml:space="preserve">), aperta a tutti senza credenziali e collegata anche dalla pagina di accesso.</w:t>
       </w:r>
     </w:p>
     <w:p>
@@ -7050,7 +7464,7 @@
           <w:sz w:val="21"/>
           <w:szCs w:val="21"/>
         </w:rPr>
-        <w:t xml:space="preserve"> scegliete il documento.</w:t>
+        <w:t xml:space="preserve"> della pratica scegliete il documento.</w:t>
       </w:r>
     </w:p>
     <w:p>
@@ -7089,7 +7503,7 @@
           <w:sz w:val="21"/>
           <w:szCs w:val="21"/>
         </w:rPr>
-        <w:t xml:space="preserve">. Il periodo va da oggi a 30 giorni dopo e il Comune riceve la notifica.</w:t>
+        <w:t xml:space="preserve">. Il periodo va da oggi a 30 giorni dopo, il Comune riceve la notifica e la consultazione compare nell'elenco pubblico.</w:t>
       </w:r>
     </w:p>
     <w:p>
@@ -7104,22 +7518,76 @@
       <w:r>
         <w:rPr>
           <w:rFonts w:ascii="Arial" w:cs="Arial" w:eastAsia="Arial" w:hAnsi="Arial"/>
-          <w:b/>
-          <w:bCs/>
-          <w:color w:val="1B2118"/>
-          <w:sz w:val="21"/>
-          <w:szCs w:val="21"/>
-        </w:rPr>
-        <w:t xml:space="preserve">Moderare le osservazioni.</w:t>
-      </w:r>
-      <w:r>
-        <w:rPr>
-          <w:rFonts w:ascii="Arial" w:cs="Arial" w:eastAsia="Arial" w:hAnsi="Arial"/>
-          <w:color w:val="1B2118"/>
-          <w:sz w:val="21"/>
-          <w:szCs w:val="21"/>
-        </w:rPr>
-        <w:t xml:space="preserve"> Ogni osservazione arriva come </w:t>
+          <w:color w:val="1B2118"/>
+          <w:sz w:val="21"/>
+          <w:szCs w:val="21"/>
+        </w:rPr>
+        <w:t xml:space="preserve">Nel riquadro trovate il periodo, i giorni rimanenti, il documento e il </w:t>
+      </w:r>
+      <w:r>
+        <w:rPr>
+          <w:rFonts w:ascii="Arial" w:cs="Arial" w:eastAsia="Arial" w:hAnsi="Arial"/>
+          <w:b/>
+          <w:bCs/>
+          <w:color w:val="1B2118"/>
+          <w:sz w:val="21"/>
+          <w:szCs w:val="21"/>
+        </w:rPr>
+        <w:t xml:space="preserve">link alla pagina pubblica</w:t>
+      </w:r>
+      <w:r>
+        <w:rPr>
+          <w:rFonts w:ascii="Arial" w:cs="Arial" w:eastAsia="Arial" w:hAnsi="Arial"/>
+          <w:color w:val="1B2118"/>
+          <w:sz w:val="21"/>
+          <w:szCs w:val="21"/>
+        </w:rPr>
+        <w:t xml:space="preserve"> da diffondere.</w:t>
+      </w:r>
+    </w:p>
+    <w:p>
+      <w:pPr>
+        <w:spacing w:after="140" w:line="300"/>
+      </w:pPr>
+      <w:r>
+        <w:rPr>
+          <w:rFonts w:ascii="Arial" w:cs="Arial" w:eastAsia="Arial" w:hAnsi="Arial"/>
+          <w:b/>
+          <w:bCs/>
+          <w:color w:val="1B2118"/>
+          <w:sz w:val="21"/>
+          <w:szCs w:val="21"/>
+        </w:rPr>
+        <w:t xml:space="preserve">Come arriva un'osservazione.</w:t>
+      </w:r>
+      <w:r>
+        <w:rPr>
+          <w:rFonts w:ascii="Arial" w:cs="Arial" w:eastAsia="Arial" w:hAnsi="Arial"/>
+          <w:color w:val="1B2118"/>
+          <w:sz w:val="21"/>
+          <w:szCs w:val="21"/>
+        </w:rPr>
+        <w:t xml:space="preserve"> Sulla pagina pubblica chiunque scrive nome, email, testo e, se vuole, un allegato (PDF, JPG, PNG, DOCX o ODT, massimo 10 MB). Deve acconsentire al trattamento dei dati e può scegliere di pubblicare il proprio nome. Il portale gli invia un'email con il pulsante </w:t>
+      </w:r>
+      <w:r>
+        <w:rPr>
+          <w:rFonts w:ascii="Arial" w:cs="Arial" w:eastAsia="Arial" w:hAnsi="Arial"/>
+          <w:b/>
+          <w:bCs/>
+          <w:color w:val="1B2118"/>
+          <w:sz w:val="21"/>
+          <w:szCs w:val="21"/>
+        </w:rPr>
+        <w:t xml:space="preserve">Conferma e invia l'osservazione →</w:t>
+      </w:r>
+      <w:r>
+        <w:rPr>
+          <w:rFonts w:ascii="Arial" w:cs="Arial" w:eastAsia="Arial" w:hAnsi="Arial"/>
+          <w:color w:val="1B2118"/>
+          <w:sz w:val="21"/>
+          <w:szCs w:val="21"/>
+        </w:rPr>
+        <w:t xml:space="preserve">, valido 48 ore e una sola volta: solo dopo la conferma l'osservazione arriva alla Fondazione come </w:t>
       </w:r>
       <w:r>
         <w:rPr>
@@ -7139,27 +7607,32 @@
           <w:sz w:val="21"/>
           <w:szCs w:val="21"/>
         </w:rPr>
-        <w:t xml:space="preserve"> (notifica «Nuova osservazione da moderare»). L'autore compare sempre come </w:t>
-      </w:r>
-      <w:r>
-        <w:rPr>
-          <w:rFonts w:ascii="Arial" w:cs="Arial" w:eastAsia="Arial" w:hAnsi="Arial"/>
-          <w:i/>
-          <w:iCs/>
-          <w:color w:val="1B2118"/>
-          <w:sz w:val="21"/>
-          <w:szCs w:val="21"/>
-        </w:rPr>
-        <w:t xml:space="preserve">Partecipante</w:t>
-      </w:r>
-      <w:r>
-        <w:rPr>
-          <w:rFonts w:ascii="Arial" w:cs="Arial" w:eastAsia="Arial" w:hAnsi="Arial"/>
-          <w:color w:val="1B2118"/>
-          <w:sz w:val="21"/>
-          <w:szCs w:val="21"/>
-        </w:rPr>
-        <w:t xml:space="preserve">.</w:t>
+        <w:t xml:space="preserve">, con la notifica «Nuova osservazione da moderare». Il portale limita gli invii (3 all'ora per indirizzo) e blocca i robot.</w:t>
+      </w:r>
+    </w:p>
+    <w:p>
+      <w:pPr>
+        <w:spacing w:after="140" w:line="300"/>
+      </w:pPr>
+      <w:r>
+        <w:rPr>
+          <w:rFonts w:ascii="Arial" w:cs="Arial" w:eastAsia="Arial" w:hAnsi="Arial"/>
+          <w:b/>
+          <w:bCs/>
+          <w:color w:val="1B2118"/>
+          <w:sz w:val="21"/>
+          <w:szCs w:val="21"/>
+        </w:rPr>
+        <w:t xml:space="preserve">Moderare le osservazioni.</w:t>
+      </w:r>
+      <w:r>
+        <w:rPr>
+          <w:rFonts w:ascii="Arial" w:cs="Arial" w:eastAsia="Arial" w:hAnsi="Arial"/>
+          <w:color w:val="1B2118"/>
+          <w:sz w:val="21"/>
+          <w:szCs w:val="21"/>
+        </w:rPr>
+        <w:t xml:space="preserve"> Lo staff vede di ogni osservazione nome, email («email confermata»), data e ora, allegato e se l'autore ha scelto di pubblicare il nome.</w:t>
       </w:r>
     </w:p>
     <w:tbl>
@@ -7338,7 +7811,7 @@
                 <w:sz w:val="18"/>
                 <w:szCs w:val="18"/>
               </w:rPr>
-              <w:t xml:space="preserve"> e il Comune può rispondere</w:t>
+              <w:t xml:space="preserve">: compare sulla pagina pubblica e il Comune può rispondere</w:t>
             </w:r>
           </w:p>
         </w:tc>
@@ -7451,7 +7924,27 @@
           <w:sz w:val="21"/>
           <w:szCs w:val="21"/>
         </w:rPr>
-        <w:t xml:space="preserve">Le risposte alle osservazioni le scrive il Comune; lo staff le vede sotto il testo («Risposta: …»).</w:t>
+        <w:t xml:space="preserve">Sulla pagina pubblica e per il Comune l'autore compare come </w:t>
+      </w:r>
+      <w:r>
+        <w:rPr>
+          <w:rFonts w:ascii="Arial" w:cs="Arial" w:eastAsia="Arial" w:hAnsi="Arial"/>
+          <w:i/>
+          <w:iCs/>
+          <w:color w:val="1B2118"/>
+          <w:sz w:val="21"/>
+          <w:szCs w:val="21"/>
+        </w:rPr>
+        <w:t xml:space="preserve">Partecipante</w:t>
+      </w:r>
+      <w:r>
+        <w:rPr>
+          <w:rFonts w:ascii="Arial" w:cs="Arial" w:eastAsia="Arial" w:hAnsi="Arial"/>
+          <w:color w:val="1B2118"/>
+          <w:sz w:val="21"/>
+          <w:szCs w:val="21"/>
+        </w:rPr>
+        <w:t xml:space="preserve">, oppure con il nome se l'ha scelto; l'email non è mai pubblicata. Le risposte le scrive il Comune e compaiono anche sulla pagina pubblica.</w:t>
       </w:r>
     </w:p>
     <w:p>
@@ -7467,6 +7960,265 @@
           <w:sz w:val="21"/>
           <w:szCs w:val="21"/>
         </w:rPr>
+        <w:t xml:space="preserve">Errata corrige.</w:t>
+      </w:r>
+      <w:r>
+        <w:rPr>
+          <w:rFonts w:ascii="Arial" w:cs="Arial" w:eastAsia="Arial" w:hAnsi="Arial"/>
+          <w:color w:val="1B2118"/>
+          <w:sz w:val="21"/>
+          <w:szCs w:val="21"/>
+        </w:rPr>
+        <w:t xml:space="preserve"> Se il documento in consultazione contiene un errore:</w:t>
+      </w:r>
+    </w:p>
+    <w:p>
+      <w:pPr>
+        <w:pStyle w:val="ListParagraph"/>
+        <w:numPr>
+          <w:ilvl w:val="0"/>
+          <w:numId w:val="10"/>
+        </w:numPr>
+        <w:spacing w:after="70" w:line="290"/>
+      </w:pPr>
+      <w:r>
+        <w:rPr>
+          <w:rFonts w:ascii="Arial" w:cs="Arial" w:eastAsia="Arial" w:hAnsi="Arial"/>
+          <w:color w:val="1B2118"/>
+          <w:sz w:val="21"/>
+          <w:szCs w:val="21"/>
+        </w:rPr>
+        <w:t xml:space="preserve">Se serve, caricate il documento corretto tra i documenti della pratica.</w:t>
+      </w:r>
+    </w:p>
+    <w:p>
+      <w:pPr>
+        <w:pStyle w:val="ListParagraph"/>
+        <w:numPr>
+          <w:ilvl w:val="0"/>
+          <w:numId w:val="10"/>
+        </w:numPr>
+        <w:spacing w:after="70" w:line="290"/>
+      </w:pPr>
+      <w:r>
+        <w:rPr>
+          <w:rFonts w:ascii="Arial" w:cs="Arial" w:eastAsia="Arial" w:hAnsi="Arial"/>
+          <w:color w:val="1B2118"/>
+          <w:sz w:val="21"/>
+          <w:szCs w:val="21"/>
+        </w:rPr>
+        <w:t xml:space="preserve">Nel riquadro premete </w:t>
+      </w:r>
+      <w:r>
+        <w:rPr>
+          <w:rFonts w:ascii="Arial" w:cs="Arial" w:eastAsia="Arial" w:hAnsi="Arial"/>
+          <w:b/>
+          <w:bCs/>
+          <w:color w:val="1B2118"/>
+          <w:sz w:val="21"/>
+          <w:szCs w:val="21"/>
+        </w:rPr>
+        <w:t xml:space="preserve">+ Pubblica errata corrige</w:t>
+      </w:r>
+      <w:r>
+        <w:rPr>
+          <w:rFonts w:ascii="Arial" w:cs="Arial" w:eastAsia="Arial" w:hAnsi="Arial"/>
+          <w:color w:val="1B2118"/>
+          <w:sz w:val="21"/>
+          <w:szCs w:val="21"/>
+        </w:rPr>
+        <w:t xml:space="preserve">.</w:t>
+      </w:r>
+    </w:p>
+    <w:p>
+      <w:pPr>
+        <w:pStyle w:val="ListParagraph"/>
+        <w:numPr>
+          <w:ilvl w:val="0"/>
+          <w:numId w:val="10"/>
+        </w:numPr>
+        <w:spacing w:after="70" w:line="290"/>
+      </w:pPr>
+      <w:r>
+        <w:rPr>
+          <w:rFonts w:ascii="Arial" w:cs="Arial" w:eastAsia="Arial" w:hAnsi="Arial"/>
+          <w:color w:val="1B2118"/>
+          <w:sz w:val="21"/>
+          <w:szCs w:val="21"/>
+        </w:rPr>
+        <w:t xml:space="preserve">Descrivete la correzione in </w:t>
+      </w:r>
+      <w:r>
+        <w:rPr>
+          <w:rFonts w:ascii="Arial" w:cs="Arial" w:eastAsia="Arial" w:hAnsi="Arial"/>
+          <w:b/>
+          <w:bCs/>
+          <w:color w:val="1B2118"/>
+          <w:sz w:val="21"/>
+          <w:szCs w:val="21"/>
+        </w:rPr>
+        <w:t xml:space="preserve">Cosa viene corretto</w:t>
+      </w:r>
+      <w:r>
+        <w:rPr>
+          <w:rFonts w:ascii="Arial" w:cs="Arial" w:eastAsia="Arial" w:hAnsi="Arial"/>
+          <w:color w:val="1B2118"/>
+          <w:sz w:val="21"/>
+          <w:szCs w:val="21"/>
+        </w:rPr>
+        <w:t xml:space="preserve"> e scegliete l'eventuale </w:t>
+      </w:r>
+      <w:r>
+        <w:rPr>
+          <w:rFonts w:ascii="Arial" w:cs="Arial" w:eastAsia="Arial" w:hAnsi="Arial"/>
+          <w:b/>
+          <w:bCs/>
+          <w:color w:val="1B2118"/>
+          <w:sz w:val="21"/>
+          <w:szCs w:val="21"/>
+        </w:rPr>
+        <w:t xml:space="preserve">Documento corretto</w:t>
+      </w:r>
+      <w:r>
+        <w:rPr>
+          <w:rFonts w:ascii="Arial" w:cs="Arial" w:eastAsia="Arial" w:hAnsi="Arial"/>
+          <w:color w:val="1B2118"/>
+          <w:sz w:val="21"/>
+          <w:szCs w:val="21"/>
+        </w:rPr>
+        <w:t xml:space="preserve">.</w:t>
+      </w:r>
+    </w:p>
+    <w:p>
+      <w:pPr>
+        <w:pStyle w:val="ListParagraph"/>
+        <w:numPr>
+          <w:ilvl w:val="0"/>
+          <w:numId w:val="10"/>
+        </w:numPr>
+        <w:spacing w:after="70" w:line="290"/>
+      </w:pPr>
+      <w:r>
+        <w:rPr>
+          <w:rFonts w:ascii="Arial" w:cs="Arial" w:eastAsia="Arial" w:hAnsi="Arial"/>
+          <w:color w:val="1B2118"/>
+          <w:sz w:val="21"/>
+          <w:szCs w:val="21"/>
+        </w:rPr>
+        <w:t xml:space="preserve">Decidete se spuntare </w:t>
+      </w:r>
+      <w:r>
+        <w:rPr>
+          <w:rFonts w:ascii="Arial" w:cs="Arial" w:eastAsia="Arial" w:hAnsi="Arial"/>
+          <w:b/>
+          <w:bCs/>
+          <w:color w:val="1B2118"/>
+          <w:sz w:val="21"/>
+          <w:szCs w:val="21"/>
+        </w:rPr>
+        <w:t xml:space="preserve">Fai ripartire i 30 giorni da oggi</w:t>
+      </w:r>
+      <w:r>
+        <w:rPr>
+          <w:rFonts w:ascii="Arial" w:cs="Arial" w:eastAsia="Arial" w:hAnsi="Arial"/>
+          <w:color w:val="1B2118"/>
+          <w:sz w:val="21"/>
+          <w:szCs w:val="21"/>
+        </w:rPr>
+        <w:t xml:space="preserve">: in questo caso la </w:t>
+      </w:r>
+      <w:r>
+        <w:rPr>
+          <w:rFonts w:ascii="Arial" w:cs="Arial" w:eastAsia="Arial" w:hAnsi="Arial"/>
+          <w:b/>
+          <w:bCs/>
+          <w:color w:val="1B2118"/>
+          <w:sz w:val="21"/>
+          <w:szCs w:val="21"/>
+        </w:rPr>
+        <w:t xml:space="preserve">Motivazione</w:t>
+      </w:r>
+      <w:r>
+        <w:rPr>
+          <w:rFonts w:ascii="Arial" w:cs="Arial" w:eastAsia="Arial" w:hAnsi="Arial"/>
+          <w:color w:val="1B2118"/>
+          <w:sz w:val="21"/>
+          <w:szCs w:val="21"/>
+        </w:rPr>
+        <w:t xml:space="preserve"> è obbligatoria (decisione della Fondazione del 18/10/2026: si decide caso per caso).</w:t>
+      </w:r>
+    </w:p>
+    <w:p>
+      <w:pPr>
+        <w:pStyle w:val="ListParagraph"/>
+        <w:numPr>
+          <w:ilvl w:val="0"/>
+          <w:numId w:val="10"/>
+        </w:numPr>
+        <w:spacing w:after="70" w:line="290"/>
+      </w:pPr>
+      <w:r>
+        <w:rPr>
+          <w:rFonts w:ascii="Arial" w:cs="Arial" w:eastAsia="Arial" w:hAnsi="Arial"/>
+          <w:color w:val="1B2118"/>
+          <w:sz w:val="21"/>
+          <w:szCs w:val="21"/>
+        </w:rPr>
+        <w:t xml:space="preserve">Premete </w:t>
+      </w:r>
+      <w:r>
+        <w:rPr>
+          <w:rFonts w:ascii="Arial" w:cs="Arial" w:eastAsia="Arial" w:hAnsi="Arial"/>
+          <w:b/>
+          <w:bCs/>
+          <w:color w:val="1B2118"/>
+          <w:sz w:val="21"/>
+          <w:szCs w:val="21"/>
+        </w:rPr>
+        <w:t xml:space="preserve">Pubblica errata corrige</w:t>
+      </w:r>
+      <w:r>
+        <w:rPr>
+          <w:rFonts w:ascii="Arial" w:cs="Arial" w:eastAsia="Arial" w:hAnsi="Arial"/>
+          <w:color w:val="1B2118"/>
+          <w:sz w:val="21"/>
+          <w:szCs w:val="21"/>
+        </w:rPr>
+        <w:t xml:space="preserve">.</w:t>
+      </w:r>
+    </w:p>
+    <w:p>
+      <w:pPr>
+        <w:spacing w:after="60"/>
+      </w:pPr>
+    </w:p>
+    <w:p>
+      <w:pPr>
+        <w:spacing w:after="140" w:line="300"/>
+      </w:pPr>
+      <w:r>
+        <w:rPr>
+          <w:rFonts w:ascii="Arial" w:cs="Arial" w:eastAsia="Arial" w:hAnsi="Arial"/>
+          <w:color w:val="1B2118"/>
+          <w:sz w:val="21"/>
+          <w:szCs w:val="21"/>
+        </w:rPr>
+        <w:t xml:space="preserve">L'errata corrige compare nella pratica e sulla pagina pubblica, il Comune riceve la notifica e l'operazione (con l'eventuale proroga) finisce nell'audit.</w:t>
+      </w:r>
+    </w:p>
+    <w:p>
+      <w:pPr>
+        <w:spacing w:after="140" w:line="300"/>
+      </w:pPr>
+      <w:r>
+        <w:rPr>
+          <w:rFonts w:ascii="Arial" w:cs="Arial" w:eastAsia="Arial" w:hAnsi="Arial"/>
+          <w:b/>
+          <w:bCs/>
+          <w:color w:val="1B2118"/>
+          <w:sz w:val="21"/>
+          <w:szCs w:val="21"/>
+        </w:rPr>
         <w:t xml:space="preserve">Chiudere la consultazione.</w:t>
       </w:r>
       <w:r>
@@ -7476,7 +8228,7 @@
           <w:sz w:val="21"/>
           <w:szCs w:val="21"/>
         </w:rPr>
-        <w:t xml:space="preserve"> Dopo 30 giorni il portale non accetta più osservazioni, ma lo stato va chiuso a mano con </w:t>
+        <w:t xml:space="preserve"> Dopo la data di chiusura il portale non accetta più osservazioni, ma lo stato va chiuso a mano con </w:t>
       </w:r>
       <w:r>
         <w:rPr>
@@ -7512,16 +8264,16 @@
           <w:sz w:val="21"/>
           <w:szCs w:val="21"/>
         </w:rPr>
-        <w:t xml:space="preserve">Decisioni prese per i prossimi sviluppi</w:t>
-      </w:r>
-      <w:r>
-        <w:rPr>
-          <w:rFonts w:ascii="Arial" w:cs="Arial" w:eastAsia="Arial" w:hAnsi="Arial"/>
-          <w:color w:val="1B2118"/>
-          <w:sz w:val="21"/>
-          <w:szCs w:val="21"/>
-        </w:rPr>
-        <w:t xml:space="preserve"> (18/10/2026): chi commenta dall'esterno dovrà confermare il proprio indirizzo email con un collegamento prima che l'osservazione venga ricevuta; in caso di errata corrige sarà l'Operatore a scegliere, caso per caso e con motivazione, se far ripartire i 30 giorni.</w:t>
+        <w:t xml:space="preserve">Da sapere.</w:t>
+      </w:r>
+      <w:r>
+        <w:rPr>
+          <w:rFonts w:ascii="Arial" w:cs="Arial" w:eastAsia="Arial" w:hAnsi="Arial"/>
+          <w:color w:val="1B2118"/>
+          <w:sz w:val="21"/>
+          <w:szCs w:val="21"/>
+        </w:rPr>
+        <w:t xml:space="preserve"> Finché il dominio della Fondazione non è verificato sul servizio email, le email di conferma arrivano solo all'indirizzo del titolare del servizio: prima di una consultazione reale il dominio va verificato.</w:t>
       </w:r>
     </w:p>
     <w:p>
@@ -7543,7 +8295,84 @@
           <w:sz w:val="34"/>
           <w:szCs w:val="34"/>
         </w:rPr>
-        <w:t xml:space="preserve">9. Pagamenti</w:t>
+        <w:t xml:space="preserve">9. Messaggi con il Comune</w:t>
+      </w:r>
+      <w:bookmarkEnd w:id="1"/>
+    </w:p>
+    <w:p>
+      <w:pPr>
+        <w:spacing w:after="140" w:line="300"/>
+      </w:pPr>
+      <w:r>
+        <w:rPr>
+          <w:rFonts w:ascii="Arial" w:cs="Arial" w:eastAsia="Arial" w:hAnsi="Arial"/>
+          <w:color w:val="1B2118"/>
+          <w:sz w:val="21"/>
+          <w:szCs w:val="21"/>
+        </w:rPr>
+        <w:t xml:space="preserve">In ogni pratica la sezione </w:t>
+      </w:r>
+      <w:r>
+        <w:rPr>
+          <w:rFonts w:ascii="Arial" w:cs="Arial" w:eastAsia="Arial" w:hAnsi="Arial"/>
+          <w:b/>
+          <w:bCs/>
+          <w:color w:val="1B2118"/>
+          <w:sz w:val="21"/>
+          <w:szCs w:val="21"/>
+        </w:rPr>
+        <w:t xml:space="preserve">Messaggi</w:t>
+      </w:r>
+      <w:r>
+        <w:rPr>
+          <w:rFonts w:ascii="Arial" w:cs="Arial" w:eastAsia="Arial" w:hAnsi="Arial"/>
+          <w:color w:val="1B2118"/>
+          <w:sz w:val="21"/>
+          <w:szCs w:val="21"/>
+        </w:rPr>
+        <w:t xml:space="preserve"> è la conversazione tra Fondazione e Comune su quella pratica. Scrivete nel campo «Scrivi un messaggio…» e premete </w:t>
+      </w:r>
+      <w:r>
+        <w:rPr>
+          <w:rFonts w:ascii="Arial" w:cs="Arial" w:eastAsia="Arial" w:hAnsi="Arial"/>
+          <w:b/>
+          <w:bCs/>
+          <w:color w:val="1B2118"/>
+          <w:sz w:val="21"/>
+          <w:szCs w:val="21"/>
+        </w:rPr>
+        <w:t xml:space="preserve">Invia</w:t>
+      </w:r>
+      <w:r>
+        <w:rPr>
+          <w:rFonts w:ascii="Arial" w:cs="Arial" w:eastAsia="Arial" w:hAnsi="Arial"/>
+          <w:color w:val="1B2118"/>
+          <w:sz w:val="21"/>
+          <w:szCs w:val="21"/>
+        </w:rPr>
+        <w:t xml:space="preserve">. I messaggi della Fondazione sono firmati «Fondazione Operate · nome dell'operatore». A ogni messaggio l'altra parte riceve una notifica e un'email (staff: «Nuovo messaggio dal Cliente»). I messaggi non si modificano né si cancellano e sono registrati nell'audit.</w:t>
+      </w:r>
+    </w:p>
+    <w:p>
+      <w:pPr>
+        <w:pStyle w:val="Heading1"/>
+        <w:pageBreakBefore/>
+        <w:pBdr>
+          <w:bottom w:val="single" w:color="2F5D3A" w:sz="12" w:space="6"/>
+        </w:pBdr>
+        <w:spacing w:after="240" w:before="0"/>
+      </w:pPr>
+      <w:bookmarkStart w:name="cap10" w:id="1"/>
+      <w:r>
+        <w:rPr>
+          <w:rFonts w:ascii="Arial" w:cs="Arial" w:eastAsia="Arial" w:hAnsi="Arial"/>
+          <w:b/>
+          <w:bCs/>
+          <w:color w:val="2F5D3A"/>
+          <w:sz w:val="34"/>
+          <w:szCs w:val="34"/>
+        </w:rPr>
+        <w:t xml:space="preserve">10. Pagamenti</w:t>
       </w:r>
       <w:bookmarkEnd w:id="1"/>
     </w:p>
@@ -7598,7 +8427,7 @@
           <w:sz w:val="21"/>
           <w:szCs w:val="21"/>
         </w:rPr>
-        <w:t xml:space="preserve">. Il portale non incassa pagamenti online: la Fondazione registra le voci previste e gli incassi.</w:t>
+        <w:t xml:space="preserve">. Il portale non incassa pagamenti online: la Fondazione registra le voci previste e gli incassi. Il Comune vede le stesse voci in sola lettura e riceve una notifica quando se ne aggiunge una.</w:t>
       </w:r>
     </w:p>
     <w:p>
@@ -7615,204 +8444,6 @@
           <w:szCs w:val="21"/>
         </w:rPr>
         <w:t xml:space="preserve">Aggiungere una voce</w:t>
-      </w:r>
-    </w:p>
-    <w:p>
-      <w:pPr>
-        <w:pStyle w:val="ListParagraph"/>
-        <w:numPr>
-          <w:ilvl w:val="0"/>
-          <w:numId w:val="10"/>
-        </w:numPr>
-        <w:spacing w:after="70" w:line="290"/>
-      </w:pPr>
-      <w:r>
-        <w:rPr>
-          <w:rFonts w:ascii="Arial" w:cs="Arial" w:eastAsia="Arial" w:hAnsi="Arial"/>
-          <w:color w:val="1B2118"/>
-          <w:sz w:val="21"/>
-          <w:szCs w:val="21"/>
-        </w:rPr>
-        <w:t xml:space="preserve">Premete </w:t>
-      </w:r>
-      <w:r>
-        <w:rPr>
-          <w:rFonts w:ascii="Arial" w:cs="Arial" w:eastAsia="Arial" w:hAnsi="Arial"/>
-          <w:b/>
-          <w:bCs/>
-          <w:color w:val="1B2118"/>
-          <w:sz w:val="21"/>
-          <w:szCs w:val="21"/>
-        </w:rPr>
-        <w:t xml:space="preserve">+ Voce di pagamento</w:t>
-      </w:r>
-      <w:r>
-        <w:rPr>
-          <w:rFonts w:ascii="Arial" w:cs="Arial" w:eastAsia="Arial" w:hAnsi="Arial"/>
-          <w:color w:val="1B2118"/>
-          <w:sz w:val="21"/>
-          <w:szCs w:val="21"/>
-        </w:rPr>
-        <w:t xml:space="preserve">.</w:t>
-      </w:r>
-    </w:p>
-    <w:p>
-      <w:pPr>
-        <w:pStyle w:val="ListParagraph"/>
-        <w:numPr>
-          <w:ilvl w:val="0"/>
-          <w:numId w:val="10"/>
-        </w:numPr>
-        <w:spacing w:after="70" w:line="290"/>
-      </w:pPr>
-      <w:r>
-        <w:rPr>
-          <w:rFonts w:ascii="Arial" w:cs="Arial" w:eastAsia="Arial" w:hAnsi="Arial"/>
-          <w:color w:val="1B2118"/>
-          <w:sz w:val="21"/>
-          <w:szCs w:val="21"/>
-        </w:rPr>
-        <w:t xml:space="preserve">Compilate </w:t>
-      </w:r>
-      <w:r>
-        <w:rPr>
-          <w:rFonts w:ascii="Arial" w:cs="Arial" w:eastAsia="Arial" w:hAnsi="Arial"/>
-          <w:b/>
-          <w:bCs/>
-          <w:color w:val="1B2118"/>
-          <w:sz w:val="21"/>
-          <w:szCs w:val="21"/>
-        </w:rPr>
-        <w:t xml:space="preserve">Voce</w:t>
-      </w:r>
-      <w:r>
-        <w:rPr>
-          <w:rFonts w:ascii="Arial" w:cs="Arial" w:eastAsia="Arial" w:hAnsi="Arial"/>
-          <w:color w:val="1B2118"/>
-          <w:sz w:val="21"/>
-          <w:szCs w:val="21"/>
-        </w:rPr>
-        <w:t xml:space="preserve"> (es. quota di adesione), </w:t>
-      </w:r>
-      <w:r>
-        <w:rPr>
-          <w:rFonts w:ascii="Arial" w:cs="Arial" w:eastAsia="Arial" w:hAnsi="Arial"/>
-          <w:b/>
-          <w:bCs/>
-          <w:color w:val="1B2118"/>
-          <w:sz w:val="21"/>
-          <w:szCs w:val="21"/>
-        </w:rPr>
-        <w:t xml:space="preserve">Importo (€)</w:t>
-      </w:r>
-      <w:r>
-        <w:rPr>
-          <w:rFonts w:ascii="Arial" w:cs="Arial" w:eastAsia="Arial" w:hAnsi="Arial"/>
-          <w:color w:val="1B2118"/>
-          <w:sz w:val="21"/>
-          <w:szCs w:val="21"/>
-        </w:rPr>
-        <w:t xml:space="preserve">, </w:t>
-      </w:r>
-      <w:r>
-        <w:rPr>
-          <w:rFonts w:ascii="Arial" w:cs="Arial" w:eastAsia="Arial" w:hAnsi="Arial"/>
-          <w:b/>
-          <w:bCs/>
-          <w:color w:val="1B2118"/>
-          <w:sz w:val="21"/>
-          <w:szCs w:val="21"/>
-        </w:rPr>
-        <w:t xml:space="preserve">Scadenza</w:t>
-      </w:r>
-      <w:r>
-        <w:rPr>
-          <w:rFonts w:ascii="Arial" w:cs="Arial" w:eastAsia="Arial" w:hAnsi="Arial"/>
-          <w:color w:val="1B2118"/>
-          <w:sz w:val="21"/>
-          <w:szCs w:val="21"/>
-        </w:rPr>
-        <w:t xml:space="preserve"> e, se serve, </w:t>
-      </w:r>
-      <w:r>
-        <w:rPr>
-          <w:rFonts w:ascii="Arial" w:cs="Arial" w:eastAsia="Arial" w:hAnsi="Arial"/>
-          <w:b/>
-          <w:bCs/>
-          <w:color w:val="1B2118"/>
-          <w:sz w:val="21"/>
-          <w:szCs w:val="21"/>
-        </w:rPr>
-        <w:t xml:space="preserve">Riferimento / note</w:t>
-      </w:r>
-      <w:r>
-        <w:rPr>
-          <w:rFonts w:ascii="Arial" w:cs="Arial" w:eastAsia="Arial" w:hAnsi="Arial"/>
-          <w:color w:val="1B2118"/>
-          <w:sz w:val="21"/>
-          <w:szCs w:val="21"/>
-        </w:rPr>
-        <w:t xml:space="preserve">.</w:t>
-      </w:r>
-    </w:p>
-    <w:p>
-      <w:pPr>
-        <w:pStyle w:val="ListParagraph"/>
-        <w:numPr>
-          <w:ilvl w:val="0"/>
-          <w:numId w:val="10"/>
-        </w:numPr>
-        <w:spacing w:after="70" w:line="290"/>
-      </w:pPr>
-      <w:r>
-        <w:rPr>
-          <w:rFonts w:ascii="Arial" w:cs="Arial" w:eastAsia="Arial" w:hAnsi="Arial"/>
-          <w:color w:val="1B2118"/>
-          <w:sz w:val="21"/>
-          <w:szCs w:val="21"/>
-        </w:rPr>
-        <w:t xml:space="preserve">Premete </w:t>
-      </w:r>
-      <w:r>
-        <w:rPr>
-          <w:rFonts w:ascii="Arial" w:cs="Arial" w:eastAsia="Arial" w:hAnsi="Arial"/>
-          <w:b/>
-          <w:bCs/>
-          <w:color w:val="1B2118"/>
-          <w:sz w:val="21"/>
-          <w:szCs w:val="21"/>
-        </w:rPr>
-        <w:t xml:space="preserve">Salva</w:t>
-      </w:r>
-      <w:r>
-        <w:rPr>
-          <w:rFonts w:ascii="Arial" w:cs="Arial" w:eastAsia="Arial" w:hAnsi="Arial"/>
-          <w:color w:val="1B2118"/>
-          <w:sz w:val="21"/>
-          <w:szCs w:val="21"/>
-        </w:rPr>
-        <w:t xml:space="preserve">.</w:t>
-      </w:r>
-    </w:p>
-    <w:p>
-      <w:pPr>
-        <w:spacing w:after="60"/>
-      </w:pPr>
-    </w:p>
-    <w:p>
-      <w:pPr>
-        <w:spacing w:after="140" w:line="300"/>
-      </w:pPr>
-      <w:r>
-        <w:rPr>
-          <w:rFonts w:ascii="Arial" w:cs="Arial" w:eastAsia="Arial" w:hAnsi="Arial"/>
-          <w:b/>
-          <w:bCs/>
-          <w:color w:val="1B2118"/>
-          <w:sz w:val="21"/>
-          <w:szCs w:val="21"/>
-        </w:rPr>
-        <w:t xml:space="preserve">Registrare un incasso</w:t>
       </w:r>
     </w:p>
     <w:p>
@@ -7831,18 +8462,18 @@
           <w:sz w:val="21"/>
           <w:szCs w:val="21"/>
         </w:rPr>
-        <w:t xml:space="preserve">Sulla voce premete </w:t>
-      </w:r>
-      <w:r>
-        <w:rPr>
-          <w:rFonts w:ascii="Arial" w:cs="Arial" w:eastAsia="Arial" w:hAnsi="Arial"/>
-          <w:b/>
-          <w:bCs/>
-          <w:color w:val="1B2118"/>
-          <w:sz w:val="21"/>
-          <w:szCs w:val="21"/>
-        </w:rPr>
-        <w:t xml:space="preserve">Registra incasso</w:t>
+        <w:t xml:space="preserve">Premete </w:t>
+      </w:r>
+      <w:r>
+        <w:rPr>
+          <w:rFonts w:ascii="Arial" w:cs="Arial" w:eastAsia="Arial" w:hAnsi="Arial"/>
+          <w:b/>
+          <w:bCs/>
+          <w:color w:val="1B2118"/>
+          <w:sz w:val="21"/>
+          <w:szCs w:val="21"/>
+        </w:rPr>
+        <w:t xml:space="preserve">+ Voce di pagamento</w:t>
       </w:r>
       <w:r>
         <w:rPr>
@@ -7870,27 +8501,87 @@
           <w:sz w:val="21"/>
           <w:szCs w:val="21"/>
         </w:rPr>
-        <w:t xml:space="preserve">Spuntate </w:t>
-      </w:r>
-      <w:r>
-        <w:rPr>
-          <w:rFonts w:ascii="Arial" w:cs="Arial" w:eastAsia="Arial" w:hAnsi="Arial"/>
-          <w:b/>
-          <w:bCs/>
-          <w:color w:val="1B2118"/>
-          <w:sz w:val="21"/>
-          <w:szCs w:val="21"/>
-        </w:rPr>
-        <w:t xml:space="preserve">Pagamento registrato</w:t>
-      </w:r>
-      <w:r>
-        <w:rPr>
-          <w:rFonts w:ascii="Arial" w:cs="Arial" w:eastAsia="Arial" w:hAnsi="Arial"/>
-          <w:color w:val="1B2118"/>
-          <w:sz w:val="21"/>
-          <w:szCs w:val="21"/>
-        </w:rPr>
-        <w:t xml:space="preserve"> e controllate la data del pagamento (di norma oggi).</w:t>
+        <w:t xml:space="preserve">Compilate </w:t>
+      </w:r>
+      <w:r>
+        <w:rPr>
+          <w:rFonts w:ascii="Arial" w:cs="Arial" w:eastAsia="Arial" w:hAnsi="Arial"/>
+          <w:b/>
+          <w:bCs/>
+          <w:color w:val="1B2118"/>
+          <w:sz w:val="21"/>
+          <w:szCs w:val="21"/>
+        </w:rPr>
+        <w:t xml:space="preserve">Voce</w:t>
+      </w:r>
+      <w:r>
+        <w:rPr>
+          <w:rFonts w:ascii="Arial" w:cs="Arial" w:eastAsia="Arial" w:hAnsi="Arial"/>
+          <w:color w:val="1B2118"/>
+          <w:sz w:val="21"/>
+          <w:szCs w:val="21"/>
+        </w:rPr>
+        <w:t xml:space="preserve"> (es. quota di adesione), </w:t>
+      </w:r>
+      <w:r>
+        <w:rPr>
+          <w:rFonts w:ascii="Arial" w:cs="Arial" w:eastAsia="Arial" w:hAnsi="Arial"/>
+          <w:b/>
+          <w:bCs/>
+          <w:color w:val="1B2118"/>
+          <w:sz w:val="21"/>
+          <w:szCs w:val="21"/>
+        </w:rPr>
+        <w:t xml:space="preserve">Importo (€)</w:t>
+      </w:r>
+      <w:r>
+        <w:rPr>
+          <w:rFonts w:ascii="Arial" w:cs="Arial" w:eastAsia="Arial" w:hAnsi="Arial"/>
+          <w:color w:val="1B2118"/>
+          <w:sz w:val="21"/>
+          <w:szCs w:val="21"/>
+        </w:rPr>
+        <w:t xml:space="preserve">, </w:t>
+      </w:r>
+      <w:r>
+        <w:rPr>
+          <w:rFonts w:ascii="Arial" w:cs="Arial" w:eastAsia="Arial" w:hAnsi="Arial"/>
+          <w:b/>
+          <w:bCs/>
+          <w:color w:val="1B2118"/>
+          <w:sz w:val="21"/>
+          <w:szCs w:val="21"/>
+        </w:rPr>
+        <w:t xml:space="preserve">Scadenza</w:t>
+      </w:r>
+      <w:r>
+        <w:rPr>
+          <w:rFonts w:ascii="Arial" w:cs="Arial" w:eastAsia="Arial" w:hAnsi="Arial"/>
+          <w:color w:val="1B2118"/>
+          <w:sz w:val="21"/>
+          <w:szCs w:val="21"/>
+        </w:rPr>
+        <w:t xml:space="preserve"> e, se serve, </w:t>
+      </w:r>
+      <w:r>
+        <w:rPr>
+          <w:rFonts w:ascii="Arial" w:cs="Arial" w:eastAsia="Arial" w:hAnsi="Arial"/>
+          <w:b/>
+          <w:bCs/>
+          <w:color w:val="1B2118"/>
+          <w:sz w:val="21"/>
+          <w:szCs w:val="21"/>
+        </w:rPr>
+        <w:t xml:space="preserve">Riferimento / note</w:t>
+      </w:r>
+      <w:r>
+        <w:rPr>
+          <w:rFonts w:ascii="Arial" w:cs="Arial" w:eastAsia="Arial" w:hAnsi="Arial"/>
+          <w:color w:val="1B2118"/>
+          <w:sz w:val="21"/>
+          <w:szCs w:val="21"/>
+        </w:rPr>
+        <w:t xml:space="preserve">.</w:t>
       </w:r>
     </w:p>
     <w:p>
@@ -7944,6 +8635,144 @@
       <w:r>
         <w:rPr>
           <w:rFonts w:ascii="Arial" w:cs="Arial" w:eastAsia="Arial" w:hAnsi="Arial"/>
+          <w:b/>
+          <w:bCs/>
+          <w:color w:val="1B2118"/>
+          <w:sz w:val="21"/>
+          <w:szCs w:val="21"/>
+        </w:rPr>
+        <w:t xml:space="preserve">Registrare un incasso</w:t>
+      </w:r>
+    </w:p>
+    <w:p>
+      <w:pPr>
+        <w:pStyle w:val="ListParagraph"/>
+        <w:numPr>
+          <w:ilvl w:val="0"/>
+          <w:numId w:val="12"/>
+        </w:numPr>
+        <w:spacing w:after="70" w:line="290"/>
+      </w:pPr>
+      <w:r>
+        <w:rPr>
+          <w:rFonts w:ascii="Arial" w:cs="Arial" w:eastAsia="Arial" w:hAnsi="Arial"/>
+          <w:color w:val="1B2118"/>
+          <w:sz w:val="21"/>
+          <w:szCs w:val="21"/>
+        </w:rPr>
+        <w:t xml:space="preserve">Sulla voce premete </w:t>
+      </w:r>
+      <w:r>
+        <w:rPr>
+          <w:rFonts w:ascii="Arial" w:cs="Arial" w:eastAsia="Arial" w:hAnsi="Arial"/>
+          <w:b/>
+          <w:bCs/>
+          <w:color w:val="1B2118"/>
+          <w:sz w:val="21"/>
+          <w:szCs w:val="21"/>
+        </w:rPr>
+        <w:t xml:space="preserve">Registra incasso</w:t>
+      </w:r>
+      <w:r>
+        <w:rPr>
+          <w:rFonts w:ascii="Arial" w:cs="Arial" w:eastAsia="Arial" w:hAnsi="Arial"/>
+          <w:color w:val="1B2118"/>
+          <w:sz w:val="21"/>
+          <w:szCs w:val="21"/>
+        </w:rPr>
+        <w:t xml:space="preserve">.</w:t>
+      </w:r>
+    </w:p>
+    <w:p>
+      <w:pPr>
+        <w:pStyle w:val="ListParagraph"/>
+        <w:numPr>
+          <w:ilvl w:val="0"/>
+          <w:numId w:val="12"/>
+        </w:numPr>
+        <w:spacing w:after="70" w:line="290"/>
+      </w:pPr>
+      <w:r>
+        <w:rPr>
+          <w:rFonts w:ascii="Arial" w:cs="Arial" w:eastAsia="Arial" w:hAnsi="Arial"/>
+          <w:color w:val="1B2118"/>
+          <w:sz w:val="21"/>
+          <w:szCs w:val="21"/>
+        </w:rPr>
+        <w:t xml:space="preserve">Spuntate </w:t>
+      </w:r>
+      <w:r>
+        <w:rPr>
+          <w:rFonts w:ascii="Arial" w:cs="Arial" w:eastAsia="Arial" w:hAnsi="Arial"/>
+          <w:b/>
+          <w:bCs/>
+          <w:color w:val="1B2118"/>
+          <w:sz w:val="21"/>
+          <w:szCs w:val="21"/>
+        </w:rPr>
+        <w:t xml:space="preserve">Pagamento registrato</w:t>
+      </w:r>
+      <w:r>
+        <w:rPr>
+          <w:rFonts w:ascii="Arial" w:cs="Arial" w:eastAsia="Arial" w:hAnsi="Arial"/>
+          <w:color w:val="1B2118"/>
+          <w:sz w:val="21"/>
+          <w:szCs w:val="21"/>
+        </w:rPr>
+        <w:t xml:space="preserve"> e controllate la data del pagamento (di norma oggi).</w:t>
+      </w:r>
+    </w:p>
+    <w:p>
+      <w:pPr>
+        <w:pStyle w:val="ListParagraph"/>
+        <w:numPr>
+          <w:ilvl w:val="0"/>
+          <w:numId w:val="12"/>
+        </w:numPr>
+        <w:spacing w:after="70" w:line="290"/>
+      </w:pPr>
+      <w:r>
+        <w:rPr>
+          <w:rFonts w:ascii="Arial" w:cs="Arial" w:eastAsia="Arial" w:hAnsi="Arial"/>
+          <w:color w:val="1B2118"/>
+          <w:sz w:val="21"/>
+          <w:szCs w:val="21"/>
+        </w:rPr>
+        <w:t xml:space="preserve">Premete </w:t>
+      </w:r>
+      <w:r>
+        <w:rPr>
+          <w:rFonts w:ascii="Arial" w:cs="Arial" w:eastAsia="Arial" w:hAnsi="Arial"/>
+          <w:b/>
+          <w:bCs/>
+          <w:color w:val="1B2118"/>
+          <w:sz w:val="21"/>
+          <w:szCs w:val="21"/>
+        </w:rPr>
+        <w:t xml:space="preserve">Salva</w:t>
+      </w:r>
+      <w:r>
+        <w:rPr>
+          <w:rFonts w:ascii="Arial" w:cs="Arial" w:eastAsia="Arial" w:hAnsi="Arial"/>
+          <w:color w:val="1B2118"/>
+          <w:sz w:val="21"/>
+          <w:szCs w:val="21"/>
+        </w:rPr>
+        <w:t xml:space="preserve">.</w:t>
+      </w:r>
+    </w:p>
+    <w:p>
+      <w:pPr>
+        <w:spacing w:after="60"/>
+      </w:pPr>
+    </w:p>
+    <w:p>
+      <w:pPr>
+        <w:spacing w:after="140" w:line="300"/>
+      </w:pPr>
+      <w:r>
+        <w:rPr>
+          <w:rFonts w:ascii="Arial" w:cs="Arial" w:eastAsia="Arial" w:hAnsi="Arial"/>
           <w:color w:val="1B2118"/>
           <w:sz w:val="21"/>
           <w:szCs w:val="21"/>
@@ -8008,7 +8837,7 @@
           <w:sz w:val="21"/>
           <w:szCs w:val="21"/>
         </w:rPr>
-        <w:t xml:space="preserve">. Il portale registra automaticamente chi ha inserito l'incasso, e l'operazione finisce nell'audit. Per decisione del 18/10/2026 le voci di pagamento saranno visibili anche al Comune, in sola lettura.</w:t>
+        <w:t xml:space="preserve">. Il portale registra automaticamente chi ha inserito l'incasso, e l'operazione finisce nell'audit.</w:t>
       </w:r>
     </w:p>
     <w:p>
@@ -8020,7 +8849,7 @@
         </w:pBdr>
         <w:spacing w:after="240" w:before="0"/>
       </w:pPr>
-      <w:bookmarkStart w:name="cap10" w:id="1"/>
+      <w:bookmarkStart w:name="cap11" w:id="1"/>
       <w:r>
         <w:rPr>
           <w:rFonts w:ascii="Arial" w:cs="Arial" w:eastAsia="Arial" w:hAnsi="Arial"/>
@@ -8030,7 +8859,7 @@
           <w:sz w:val="34"/>
           <w:szCs w:val="34"/>
         </w:rPr>
-        <w:t xml:space="preserve">10. Export del fascicolo</w:t>
+        <w:t xml:space="preserve">11. Export del fascicolo</w:t>
       </w:r>
       <w:bookmarkEnd w:id="1"/>
     </w:p>
@@ -8645,7 +9474,7 @@
         </w:pBdr>
         <w:spacing w:after="240" w:before="0"/>
       </w:pPr>
-      <w:bookmarkStart w:name="cap11" w:id="1"/>
+      <w:bookmarkStart w:name="cap12" w:id="1"/>
       <w:r>
         <w:rPr>
           <w:rFonts w:ascii="Arial" w:cs="Arial" w:eastAsia="Arial" w:hAnsi="Arial"/>
@@ -8655,7 +9484,7 @@
           <w:sz w:val="34"/>
           <w:szCs w:val="34"/>
         </w:rPr>
-        <w:t xml:space="preserve">11. Notifiche ed email</w:t>
+        <w:t xml:space="preserve">12. Notifiche ed email</w:t>
       </w:r>
       <w:bookmarkEnd w:id="1"/>
     </w:p>
@@ -8687,8 +9516,8 @@
         <w:tblLayout w:type="fixed"/>
       </w:tblPr>
       <w:tblGrid>
-        <w:gridCol w:w="4439"/>
-        <w:gridCol w:w="5199"/>
+        <w:gridCol w:w="4542"/>
+        <w:gridCol w:w="5096"/>
       </w:tblGrid>
       <w:tr>
         <w:trPr>
@@ -8696,7 +9525,7 @@
         </w:trPr>
         <w:tc>
           <w:tcPr>
-            <w:tcW w:type="dxa" w:w="4439"/>
+            <w:tcW w:type="dxa" w:w="4542"/>
             <w:tcBorders>
               <w:top w:val="single" w:color="D9D4C5" w:sz="4"/>
               <w:left w:val="single" w:color="D9D4C5" w:sz="4"/>
@@ -8731,7 +9560,7 @@
         </w:tc>
         <w:tc>
           <w:tcPr>
-            <w:tcW w:type="dxa" w:w="5199"/>
+            <w:tcW w:type="dxa" w:w="5096"/>
             <w:tcBorders>
               <w:top w:val="single" w:color="D9D4C5" w:sz="4"/>
               <w:left w:val="single" w:color="D9D4C5" w:sz="4"/>
@@ -8771,7 +9600,7 @@
         </w:trPr>
         <w:tc>
           <w:tcPr>
-            <w:tcW w:type="dxa" w:w="4439"/>
+            <w:tcW w:type="dxa" w:w="4542"/>
             <w:tcBorders>
               <w:top w:val="single" w:color="D9D4C5" w:sz="4"/>
               <w:left w:val="single" w:color="D9D4C5" w:sz="4"/>
@@ -8803,7 +9632,7 @@
         </w:tc>
         <w:tc>
           <w:tcPr>
-            <w:tcW w:type="dxa" w:w="5199"/>
+            <w:tcW w:type="dxa" w:w="5096"/>
             <w:tcBorders>
               <w:top w:val="single" w:color="D9D4C5" w:sz="4"/>
               <w:left w:val="single" w:color="D9D4C5" w:sz="4"/>
@@ -8840,7 +9669,7 @@
         </w:trPr>
         <w:tc>
           <w:tcPr>
-            <w:tcW w:type="dxa" w:w="4439"/>
+            <w:tcW w:type="dxa" w:w="4542"/>
             <w:tcBorders>
               <w:top w:val="single" w:color="D9D4C5" w:sz="4"/>
               <w:left w:val="single" w:color="D9D4C5" w:sz="4"/>
@@ -8873,7 +9702,7 @@
         </w:tc>
         <w:tc>
           <w:tcPr>
-            <w:tcW w:type="dxa" w:w="5199"/>
+            <w:tcW w:type="dxa" w:w="5096"/>
             <w:tcBorders>
               <w:top w:val="single" w:color="D9D4C5" w:sz="4"/>
               <w:left w:val="single" w:color="D9D4C5" w:sz="4"/>
@@ -8911,7 +9740,7 @@
         </w:trPr>
         <w:tc>
           <w:tcPr>
-            <w:tcW w:type="dxa" w:w="4439"/>
+            <w:tcW w:type="dxa" w:w="4542"/>
             <w:tcBorders>
               <w:top w:val="single" w:color="D9D4C5" w:sz="4"/>
               <w:left w:val="single" w:color="D9D4C5" w:sz="4"/>
@@ -8937,13 +9766,13 @@
                 <w:sz w:val="18"/>
                 <w:szCs w:val="18"/>
               </w:rPr>
-              <w:t xml:space="preserve">arriva un'osservazione da moderare</w:t>
-            </w:r>
-          </w:p>
-        </w:tc>
-        <w:tc>
-          <w:tcPr>
-            <w:tcW w:type="dxa" w:w="5199"/>
+              <w:t xml:space="preserve">arriva un'osservazione (email confermata) da moderare</w:t>
+            </w:r>
+          </w:p>
+        </w:tc>
+        <w:tc>
+          <w:tcPr>
+            <w:tcW w:type="dxa" w:w="5096"/>
             <w:tcBorders>
               <w:top w:val="single" w:color="D9D4C5" w:sz="4"/>
               <w:left w:val="single" w:color="D9D4C5" w:sz="4"/>
@@ -8980,7 +9809,7 @@
         </w:trPr>
         <w:tc>
           <w:tcPr>
-            <w:tcW w:type="dxa" w:w="4439"/>
+            <w:tcW w:type="dxa" w:w="4542"/>
             <w:tcBorders>
               <w:top w:val="single" w:color="D9D4C5" w:sz="4"/>
               <w:left w:val="single" w:color="D9D4C5" w:sz="4"/>
@@ -9013,7 +9842,7 @@
         </w:tc>
         <w:tc>
           <w:tcPr>
-            <w:tcW w:type="dxa" w:w="5199"/>
+            <w:tcW w:type="dxa" w:w="5096"/>
             <w:tcBorders>
               <w:top w:val="single" w:color="D9D4C5" w:sz="4"/>
               <w:left w:val="single" w:color="D9D4C5" w:sz="4"/>
@@ -9040,7 +9869,7 @@
                 <w:sz w:val="18"/>
                 <w:szCs w:val="18"/>
               </w:rPr>
-              <w:t xml:space="preserve">si apre la consultazione pubblica</w:t>
+              <w:t xml:space="preserve">si apre la consultazione pubblica o esce un'errata corrige</w:t>
             </w:r>
           </w:p>
         </w:tc>
@@ -9051,30 +9880,161 @@
         </w:trPr>
         <w:tc>
           <w:tcPr>
-            <w:tcW w:type="dxa" w:w="4439"/>
-            <w:tcBorders>
-              <w:top w:val="single" w:color="D9D4C5" w:sz="4"/>
-              <w:left w:val="single" w:color="D9D4C5" w:sz="4"/>
-              <w:bottom w:val="single" w:color="D9D4C5" w:sz="4"/>
-              <w:right w:val="single" w:color="D9D4C5" w:sz="4"/>
-            </w:tcBorders>
-            <w:tcMar>
-              <w:top w:type="dxa" w:w="70"/>
-              <w:left w:type="dxa" w:w="110"/>
-              <w:bottom w:type="dxa" w:w="70"/>
-              <w:right w:type="dxa" w:w="110"/>
-            </w:tcMar>
-            <w:vAlign w:val="center"/>
-          </w:tcPr>
-          <w:p>
-            <w:pPr>
-              <w:spacing w:after="0" w:before="0"/>
-            </w:pPr>
-          </w:p>
-        </w:tc>
-        <w:tc>
-          <w:tcPr>
-            <w:tcW w:type="dxa" w:w="5199"/>
+            <w:tcW w:type="dxa" w:w="4542"/>
+            <w:tcBorders>
+              <w:top w:val="single" w:color="D9D4C5" w:sz="4"/>
+              <w:left w:val="single" w:color="D9D4C5" w:sz="4"/>
+              <w:bottom w:val="single" w:color="D9D4C5" w:sz="4"/>
+              <w:right w:val="single" w:color="D9D4C5" w:sz="4"/>
+            </w:tcBorders>
+            <w:tcMar>
+              <w:top w:type="dxa" w:w="70"/>
+              <w:left w:type="dxa" w:w="110"/>
+              <w:bottom w:type="dxa" w:w="70"/>
+              <w:right w:type="dxa" w:w="110"/>
+            </w:tcMar>
+            <w:vAlign w:val="center"/>
+          </w:tcPr>
+          <w:p>
+            <w:pPr>
+              <w:spacing w:after="0" w:before="0"/>
+            </w:pPr>
+            <w:r>
+              <w:rPr>
+                <w:rFonts w:ascii="Arial" w:cs="Arial" w:eastAsia="Arial" w:hAnsi="Arial"/>
+                <w:color w:val="1B2118"/>
+                <w:sz w:val="18"/>
+                <w:szCs w:val="18"/>
+              </w:rPr>
+              <w:t xml:space="preserve">il Comune scrive un messaggio</w:t>
+            </w:r>
+          </w:p>
+        </w:tc>
+        <w:tc>
+          <w:tcPr>
+            <w:tcW w:type="dxa" w:w="5096"/>
+            <w:tcBorders>
+              <w:top w:val="single" w:color="D9D4C5" w:sz="4"/>
+              <w:left w:val="single" w:color="D9D4C5" w:sz="4"/>
+              <w:bottom w:val="single" w:color="D9D4C5" w:sz="4"/>
+              <w:right w:val="single" w:color="D9D4C5" w:sz="4"/>
+            </w:tcBorders>
+            <w:tcMar>
+              <w:top w:type="dxa" w:w="70"/>
+              <w:left w:type="dxa" w:w="110"/>
+              <w:bottom w:type="dxa" w:w="70"/>
+              <w:right w:type="dxa" w:w="110"/>
+            </w:tcMar>
+            <w:vAlign w:val="center"/>
+          </w:tcPr>
+          <w:p>
+            <w:pPr>
+              <w:spacing w:after="0" w:before="0"/>
+            </w:pPr>
+            <w:r>
+              <w:rPr>
+                <w:rFonts w:ascii="Arial" w:cs="Arial" w:eastAsia="Arial" w:hAnsi="Arial"/>
+                <w:color w:val="1B2118"/>
+                <w:sz w:val="18"/>
+                <w:szCs w:val="18"/>
+              </w:rPr>
+              <w:t xml:space="preserve">la Fondazione scrive un messaggio o una nota condivisa</w:t>
+            </w:r>
+          </w:p>
+        </w:tc>
+      </w:tr>
+      <w:tr>
+        <w:trPr>
+          <w:cantSplit/>
+        </w:trPr>
+        <w:tc>
+          <w:tcPr>
+            <w:tcW w:type="dxa" w:w="4542"/>
+            <w:tcBorders>
+              <w:top w:val="single" w:color="D9D4C5" w:sz="4"/>
+              <w:left w:val="single" w:color="D9D4C5" w:sz="4"/>
+              <w:bottom w:val="single" w:color="D9D4C5" w:sz="4"/>
+              <w:right w:val="single" w:color="D9D4C5" w:sz="4"/>
+            </w:tcBorders>
+            <w:shd w:fill="F6F4EE" w:color="auto" w:val="clear"/>
+            <w:tcMar>
+              <w:top w:type="dxa" w:w="70"/>
+              <w:left w:type="dxa" w:w="110"/>
+              <w:bottom w:type="dxa" w:w="70"/>
+              <w:right w:type="dxa" w:w="110"/>
+            </w:tcMar>
+            <w:vAlign w:val="center"/>
+          </w:tcPr>
+          <w:p>
+            <w:pPr>
+              <w:spacing w:after="0" w:before="0"/>
+            </w:pPr>
+          </w:p>
+        </w:tc>
+        <w:tc>
+          <w:tcPr>
+            <w:tcW w:type="dxa" w:w="5096"/>
+            <w:tcBorders>
+              <w:top w:val="single" w:color="D9D4C5" w:sz="4"/>
+              <w:left w:val="single" w:color="D9D4C5" w:sz="4"/>
+              <w:bottom w:val="single" w:color="D9D4C5" w:sz="4"/>
+              <w:right w:val="single" w:color="D9D4C5" w:sz="4"/>
+            </w:tcBorders>
+            <w:shd w:fill="F6F4EE" w:color="auto" w:val="clear"/>
+            <w:tcMar>
+              <w:top w:type="dxa" w:w="70"/>
+              <w:left w:type="dxa" w:w="110"/>
+              <w:bottom w:type="dxa" w:w="70"/>
+              <w:right w:type="dxa" w:w="110"/>
+            </w:tcMar>
+            <w:vAlign w:val="center"/>
+          </w:tcPr>
+          <w:p>
+            <w:pPr>
+              <w:spacing w:after="0" w:before="0"/>
+            </w:pPr>
+            <w:r>
+              <w:rPr>
+                <w:rFonts w:ascii="Arial" w:cs="Arial" w:eastAsia="Arial" w:hAnsi="Arial"/>
+                <w:color w:val="1B2118"/>
+                <w:sz w:val="18"/>
+                <w:szCs w:val="18"/>
+              </w:rPr>
+              <w:t xml:space="preserve">si aggiunge una voce di pagamento</w:t>
+            </w:r>
+          </w:p>
+        </w:tc>
+      </w:tr>
+      <w:tr>
+        <w:trPr>
+          <w:cantSplit/>
+        </w:trPr>
+        <w:tc>
+          <w:tcPr>
+            <w:tcW w:type="dxa" w:w="4542"/>
+            <w:tcBorders>
+              <w:top w:val="single" w:color="D9D4C5" w:sz="4"/>
+              <w:left w:val="single" w:color="D9D4C5" w:sz="4"/>
+              <w:bottom w:val="single" w:color="D9D4C5" w:sz="4"/>
+              <w:right w:val="single" w:color="D9D4C5" w:sz="4"/>
+            </w:tcBorders>
+            <w:tcMar>
+              <w:top w:type="dxa" w:w="70"/>
+              <w:left w:type="dxa" w:w="110"/>
+              <w:bottom w:type="dxa" w:w="70"/>
+              <w:right w:type="dxa" w:w="110"/>
+            </w:tcMar>
+            <w:vAlign w:val="center"/>
+          </w:tcPr>
+          <w:p>
+            <w:pPr>
+              <w:spacing w:after="0" w:before="0"/>
+            </w:pPr>
+          </w:p>
+        </w:tc>
+        <w:tc>
+          <w:tcPr>
+            <w:tcW w:type="dxa" w:w="5096"/>
             <w:tcBorders>
               <w:top w:val="single" w:color="D9D4C5" w:sz="4"/>
               <w:left w:val="single" w:color="D9D4C5" w:sz="4"/>
@@ -9159,7 +10119,7 @@
         </w:pBdr>
         <w:spacing w:after="240" w:before="0"/>
       </w:pPr>
-      <w:bookmarkStart w:name="cap12" w:id="1"/>
+      <w:bookmarkStart w:name="cap13" w:id="1"/>
       <w:r>
         <w:rPr>
           <w:rFonts w:ascii="Arial" w:cs="Arial" w:eastAsia="Arial" w:hAnsi="Arial"/>
@@ -9169,7 +10129,7 @@
           <w:sz w:val="34"/>
           <w:szCs w:val="34"/>
         </w:rPr>
-        <w:t xml:space="preserve">12. Gestione utenti</w:t>
+        <w:t xml:space="preserve">13. Gestione utenti</w:t>
       </w:r>
       <w:bookmarkEnd w:id="1"/>
     </w:p>
@@ -9221,475 +10181,6 @@
           <w:szCs w:val="21"/>
         </w:rPr>
         <w:t xml:space="preserve">Creare un utente</w:t>
-      </w:r>
-    </w:p>
-    <w:p>
-      <w:pPr>
-        <w:pStyle w:val="ListParagraph"/>
-        <w:numPr>
-          <w:ilvl w:val="0"/>
-          <w:numId w:val="12"/>
-        </w:numPr>
-        <w:spacing w:after="70" w:line="290"/>
-      </w:pPr>
-      <w:r>
-        <w:rPr>
-          <w:rFonts w:ascii="Arial" w:cs="Arial" w:eastAsia="Arial" w:hAnsi="Arial"/>
-          <w:color w:val="1B2118"/>
-          <w:sz w:val="21"/>
-          <w:szCs w:val="21"/>
-        </w:rPr>
-        <w:t xml:space="preserve">Premete </w:t>
-      </w:r>
-      <w:r>
-        <w:rPr>
-          <w:rFonts w:ascii="Arial" w:cs="Arial" w:eastAsia="Arial" w:hAnsi="Arial"/>
-          <w:b/>
-          <w:bCs/>
-          <w:color w:val="1B2118"/>
-          <w:sz w:val="21"/>
-          <w:szCs w:val="21"/>
-        </w:rPr>
-        <w:t xml:space="preserve">+ Nuovo utente</w:t>
-      </w:r>
-      <w:r>
-        <w:rPr>
-          <w:rFonts w:ascii="Arial" w:cs="Arial" w:eastAsia="Arial" w:hAnsi="Arial"/>
-          <w:color w:val="1B2118"/>
-          <w:sz w:val="21"/>
-          <w:szCs w:val="21"/>
-        </w:rPr>
-        <w:t xml:space="preserve">.</w:t>
-      </w:r>
-    </w:p>
-    <w:p>
-      <w:pPr>
-        <w:pStyle w:val="ListParagraph"/>
-        <w:numPr>
-          <w:ilvl w:val="0"/>
-          <w:numId w:val="12"/>
-        </w:numPr>
-        <w:spacing w:after="70" w:line="290"/>
-      </w:pPr>
-      <w:r>
-        <w:rPr>
-          <w:rFonts w:ascii="Arial" w:cs="Arial" w:eastAsia="Arial" w:hAnsi="Arial"/>
-          <w:color w:val="1B2118"/>
-          <w:sz w:val="21"/>
-          <w:szCs w:val="21"/>
-        </w:rPr>
-        <w:t xml:space="preserve">Inserite </w:t>
-      </w:r>
-      <w:r>
-        <w:rPr>
-          <w:rFonts w:ascii="Arial" w:cs="Arial" w:eastAsia="Arial" w:hAnsi="Arial"/>
-          <w:b/>
-          <w:bCs/>
-          <w:color w:val="1B2118"/>
-          <w:sz w:val="21"/>
-          <w:szCs w:val="21"/>
-        </w:rPr>
-        <w:t xml:space="preserve">Email</w:t>
-      </w:r>
-      <w:r>
-        <w:rPr>
-          <w:rFonts w:ascii="Arial" w:cs="Arial" w:eastAsia="Arial" w:hAnsi="Arial"/>
-          <w:color w:val="1B2118"/>
-          <w:sz w:val="21"/>
-          <w:szCs w:val="21"/>
-        </w:rPr>
-        <w:t xml:space="preserve"> e, facoltativo, </w:t>
-      </w:r>
-      <w:r>
-        <w:rPr>
-          <w:rFonts w:ascii="Arial" w:cs="Arial" w:eastAsia="Arial" w:hAnsi="Arial"/>
-          <w:b/>
-          <w:bCs/>
-          <w:color w:val="1B2118"/>
-          <w:sz w:val="21"/>
-          <w:szCs w:val="21"/>
-        </w:rPr>
-        <w:t xml:space="preserve">Nome e cognome</w:t>
-      </w:r>
-      <w:r>
-        <w:rPr>
-          <w:rFonts w:ascii="Arial" w:cs="Arial" w:eastAsia="Arial" w:hAnsi="Arial"/>
-          <w:color w:val="1B2118"/>
-          <w:sz w:val="21"/>
-          <w:szCs w:val="21"/>
-        </w:rPr>
-        <w:t xml:space="preserve">.</w:t>
-      </w:r>
-    </w:p>
-    <w:p>
-      <w:pPr>
-        <w:pStyle w:val="ListParagraph"/>
-        <w:numPr>
-          <w:ilvl w:val="0"/>
-          <w:numId w:val="12"/>
-        </w:numPr>
-        <w:spacing w:after="70" w:line="290"/>
-      </w:pPr>
-      <w:r>
-        <w:rPr>
-          <w:rFonts w:ascii="Arial" w:cs="Arial" w:eastAsia="Arial" w:hAnsi="Arial"/>
-          <w:color w:val="1B2118"/>
-          <w:sz w:val="21"/>
-          <w:szCs w:val="21"/>
-        </w:rPr>
-        <w:t xml:space="preserve">La </w:t>
-      </w:r>
-      <w:r>
-        <w:rPr>
-          <w:rFonts w:ascii="Arial" w:cs="Arial" w:eastAsia="Arial" w:hAnsi="Arial"/>
-          <w:b/>
-          <w:bCs/>
-          <w:color w:val="1B2118"/>
-          <w:sz w:val="21"/>
-          <w:szCs w:val="21"/>
-        </w:rPr>
-        <w:t xml:space="preserve">Password temporanea</w:t>
-      </w:r>
-      <w:r>
-        <w:rPr>
-          <w:rFonts w:ascii="Arial" w:cs="Arial" w:eastAsia="Arial" w:hAnsi="Arial"/>
-          <w:color w:val="1B2118"/>
-          <w:sz w:val="21"/>
-          <w:szCs w:val="21"/>
-        </w:rPr>
-        <w:t xml:space="preserve"> è già generata; </w:t>
-      </w:r>
-      <w:r>
-        <w:rPr>
-          <w:rFonts w:ascii="Arial" w:cs="Arial" w:eastAsia="Arial" w:hAnsi="Arial"/>
-          <w:b/>
-          <w:bCs/>
-          <w:color w:val="1B2118"/>
-          <w:sz w:val="21"/>
-          <w:szCs w:val="21"/>
-        </w:rPr>
-        <w:t xml:space="preserve">Genera</w:t>
-      </w:r>
-      <w:r>
-        <w:rPr>
-          <w:rFonts w:ascii="Arial" w:cs="Arial" w:eastAsia="Arial" w:hAnsi="Arial"/>
-          <w:color w:val="1B2118"/>
-          <w:sz w:val="21"/>
-          <w:szCs w:val="21"/>
-        </w:rPr>
-        <w:t xml:space="preserve"> ne crea un'altra.</w:t>
-      </w:r>
-    </w:p>
-    <w:p>
-      <w:pPr>
-        <w:pStyle w:val="ListParagraph"/>
-        <w:numPr>
-          <w:ilvl w:val="0"/>
-          <w:numId w:val="12"/>
-        </w:numPr>
-        <w:spacing w:after="70" w:line="290"/>
-      </w:pPr>
-      <w:r>
-        <w:rPr>
-          <w:rFonts w:ascii="Arial" w:cs="Arial" w:eastAsia="Arial" w:hAnsi="Arial"/>
-          <w:color w:val="1B2118"/>
-          <w:sz w:val="21"/>
-          <w:szCs w:val="21"/>
-        </w:rPr>
-        <w:t xml:space="preserve">Scegliete il </w:t>
-      </w:r>
-      <w:r>
-        <w:rPr>
-          <w:rFonts w:ascii="Arial" w:cs="Arial" w:eastAsia="Arial" w:hAnsi="Arial"/>
-          <w:b/>
-          <w:bCs/>
-          <w:color w:val="1B2118"/>
-          <w:sz w:val="21"/>
-          <w:szCs w:val="21"/>
-        </w:rPr>
-        <w:t xml:space="preserve">Ruolo</w:t>
-      </w:r>
-      <w:r>
-        <w:rPr>
-          <w:rFonts w:ascii="Arial" w:cs="Arial" w:eastAsia="Arial" w:hAnsi="Arial"/>
-          <w:color w:val="1B2118"/>
-          <w:sz w:val="21"/>
-          <w:szCs w:val="21"/>
-        </w:rPr>
-        <w:t xml:space="preserve">: </w:t>
-      </w:r>
-      <w:r>
-        <w:rPr>
-          <w:rFonts w:ascii="Arial" w:cs="Arial" w:eastAsia="Arial" w:hAnsi="Arial"/>
-          <w:i/>
-          <w:iCs/>
-          <w:color w:val="1B2118"/>
-          <w:sz w:val="21"/>
-          <w:szCs w:val="21"/>
-        </w:rPr>
-        <w:t xml:space="preserve">Cliente (comune / azienda)</w:t>
-      </w:r>
-      <w:r>
-        <w:rPr>
-          <w:rFonts w:ascii="Arial" w:cs="Arial" w:eastAsia="Arial" w:hAnsi="Arial"/>
-          <w:color w:val="1B2118"/>
-          <w:sz w:val="21"/>
-          <w:szCs w:val="21"/>
-        </w:rPr>
-        <w:t xml:space="preserve"> oppure </w:t>
-      </w:r>
-      <w:r>
-        <w:rPr>
-          <w:rFonts w:ascii="Arial" w:cs="Arial" w:eastAsia="Arial" w:hAnsi="Arial"/>
-          <w:i/>
-          <w:iCs/>
-          <w:color w:val="1B2118"/>
-          <w:sz w:val="21"/>
-          <w:szCs w:val="21"/>
-        </w:rPr>
-        <w:t xml:space="preserve">Operatore di back-office</w:t>
-      </w:r>
-      <w:r>
-        <w:rPr>
-          <w:rFonts w:ascii="Arial" w:cs="Arial" w:eastAsia="Arial" w:hAnsi="Arial"/>
-          <w:color w:val="1B2118"/>
-          <w:sz w:val="21"/>
-          <w:szCs w:val="21"/>
-        </w:rPr>
-        <w:t xml:space="preserve">.</w:t>
-      </w:r>
-    </w:p>
-    <w:p>
-      <w:pPr>
-        <w:pStyle w:val="ListParagraph"/>
-        <w:numPr>
-          <w:ilvl w:val="0"/>
-          <w:numId w:val="12"/>
-        </w:numPr>
-        <w:spacing w:after="70" w:line="290"/>
-      </w:pPr>
-      <w:r>
-        <w:rPr>
-          <w:rFonts w:ascii="Arial" w:cs="Arial" w:eastAsia="Arial" w:hAnsi="Arial"/>
-          <w:color w:val="1B2118"/>
-          <w:sz w:val="21"/>
-          <w:szCs w:val="21"/>
-        </w:rPr>
-        <w:t xml:space="preserve">Per un Cliente spuntate le </w:t>
-      </w:r>
-      <w:r>
-        <w:rPr>
-          <w:rFonts w:ascii="Arial" w:cs="Arial" w:eastAsia="Arial" w:hAnsi="Arial"/>
-          <w:b/>
-          <w:bCs/>
-          <w:color w:val="1B2118"/>
-          <w:sz w:val="21"/>
-          <w:szCs w:val="21"/>
-        </w:rPr>
-        <w:t xml:space="preserve">Organizzazioni associate</w:t>
-      </w:r>
-      <w:r>
-        <w:rPr>
-          <w:rFonts w:ascii="Arial" w:cs="Arial" w:eastAsia="Arial" w:hAnsi="Arial"/>
-          <w:color w:val="1B2118"/>
-          <w:sz w:val="21"/>
-          <w:szCs w:val="21"/>
-        </w:rPr>
-        <w:t xml:space="preserve"> (almeno una; la prima è la principale). Con più di 6 organizzazioni compare la ricerca.</w:t>
-      </w:r>
-    </w:p>
-    <w:p>
-      <w:pPr>
-        <w:pStyle w:val="ListParagraph"/>
-        <w:numPr>
-          <w:ilvl w:val="0"/>
-          <w:numId w:val="12"/>
-        </w:numPr>
-        <w:spacing w:after="70" w:line="290"/>
-      </w:pPr>
-      <w:r>
-        <w:rPr>
-          <w:rFonts w:ascii="Arial" w:cs="Arial" w:eastAsia="Arial" w:hAnsi="Arial"/>
-          <w:color w:val="1B2118"/>
-          <w:sz w:val="21"/>
-          <w:szCs w:val="21"/>
-        </w:rPr>
-        <w:t xml:space="preserve">Premete </w:t>
-      </w:r>
-      <w:r>
-        <w:rPr>
-          <w:rFonts w:ascii="Arial" w:cs="Arial" w:eastAsia="Arial" w:hAnsi="Arial"/>
-          <w:b/>
-          <w:bCs/>
-          <w:color w:val="1B2118"/>
-          <w:sz w:val="21"/>
-          <w:szCs w:val="21"/>
-        </w:rPr>
-        <w:t xml:space="preserve">Crea utente</w:t>
-      </w:r>
-      <w:r>
-        <w:rPr>
-          <w:rFonts w:ascii="Arial" w:cs="Arial" w:eastAsia="Arial" w:hAnsi="Arial"/>
-          <w:color w:val="1B2118"/>
-          <w:sz w:val="21"/>
-          <w:szCs w:val="21"/>
-        </w:rPr>
-        <w:t xml:space="preserve">.</w:t>
-      </w:r>
-    </w:p>
-    <w:p>
-      <w:pPr>
-        <w:pStyle w:val="ListParagraph"/>
-        <w:numPr>
-          <w:ilvl w:val="0"/>
-          <w:numId w:val="12"/>
-        </w:numPr>
-        <w:spacing w:after="70" w:line="290"/>
-      </w:pPr>
-      <w:r>
-        <w:rPr>
-          <w:rFonts w:ascii="Arial" w:cs="Arial" w:eastAsia="Arial" w:hAnsi="Arial"/>
-          <w:color w:val="1B2118"/>
-          <w:sz w:val="21"/>
-          <w:szCs w:val="21"/>
-        </w:rPr>
-        <w:t xml:space="preserve">Comunicate all'utente email e password temporanea con un canale sicuro, separato dall'email di benvenuto.</w:t>
-      </w:r>
-    </w:p>
-    <w:p>
-      <w:pPr>
-        <w:spacing w:after="60"/>
-      </w:pPr>
-    </w:p>
-    <w:p>
-      <w:pPr>
-        <w:spacing w:after="140" w:line="300"/>
-      </w:pPr>
-      <w:r>
-        <w:rPr>
-          <w:rFonts w:ascii="Arial" w:cs="Arial" w:eastAsia="Arial" w:hAnsi="Arial"/>
-          <w:b/>
-          <w:bCs/>
-          <w:color w:val="1B2118"/>
-          <w:sz w:val="21"/>
-          <w:szCs w:val="21"/>
-        </w:rPr>
-        <w:t xml:space="preserve">Modificare un utente.</w:t>
-      </w:r>
-      <w:r>
-        <w:rPr>
-          <w:rFonts w:ascii="Arial" w:cs="Arial" w:eastAsia="Arial" w:hAnsi="Arial"/>
-          <w:color w:val="1B2118"/>
-          <w:sz w:val="21"/>
-          <w:szCs w:val="21"/>
-        </w:rPr>
-        <w:t xml:space="preserve"> </w:t>
-      </w:r>
-      <w:r>
-        <w:rPr>
-          <w:rFonts w:ascii="Arial" w:cs="Arial" w:eastAsia="Arial" w:hAnsi="Arial"/>
-          <w:b/>
-          <w:bCs/>
-          <w:color w:val="1B2118"/>
-          <w:sz w:val="21"/>
-          <w:szCs w:val="21"/>
-        </w:rPr>
-        <w:t xml:space="preserve">Modifica</w:t>
-      </w:r>
-      <w:r>
-        <w:rPr>
-          <w:rFonts w:ascii="Arial" w:cs="Arial" w:eastAsia="Arial" w:hAnsi="Arial"/>
-          <w:color w:val="1B2118"/>
-          <w:sz w:val="21"/>
-          <w:szCs w:val="21"/>
-        </w:rPr>
-        <w:t xml:space="preserve"> permette di cambiare ruolo e organizzazioni. Passando a Operatore le associazioni alle organizzazioni si azzerano.</w:t>
-      </w:r>
-    </w:p>
-    <w:p>
-      <w:pPr>
-        <w:spacing w:after="140" w:line="300"/>
-      </w:pPr>
-      <w:r>
-        <w:rPr>
-          <w:rFonts w:ascii="Arial" w:cs="Arial" w:eastAsia="Arial" w:hAnsi="Arial"/>
-          <w:b/>
-          <w:bCs/>
-          <w:color w:val="1B2118"/>
-          <w:sz w:val="21"/>
-          <w:szCs w:val="21"/>
-        </w:rPr>
-        <w:t xml:space="preserve">Disattivare o riattivare.</w:t>
-      </w:r>
-      <w:r>
-        <w:rPr>
-          <w:rFonts w:ascii="Arial" w:cs="Arial" w:eastAsia="Arial" w:hAnsi="Arial"/>
-          <w:color w:val="1B2118"/>
-          <w:sz w:val="21"/>
-          <w:szCs w:val="21"/>
-        </w:rPr>
-        <w:t xml:space="preserve"> Un utente </w:t>
-      </w:r>
-      <w:r>
-        <w:rPr>
-          <w:rFonts w:ascii="Arial" w:cs="Arial" w:eastAsia="Arial" w:hAnsi="Arial"/>
-          <w:b/>
-          <w:bCs/>
-          <w:color w:val="1B2118"/>
-          <w:sz w:val="21"/>
-          <w:szCs w:val="21"/>
-        </w:rPr>
-        <w:t xml:space="preserve">Disattivato</w:t>
-      </w:r>
-      <w:r>
-        <w:rPr>
-          <w:rFonts w:ascii="Arial" w:cs="Arial" w:eastAsia="Arial" w:hAnsi="Arial"/>
-          <w:color w:val="1B2118"/>
-          <w:sz w:val="21"/>
-          <w:szCs w:val="21"/>
-        </w:rPr>
-        <w:t xml:space="preserve"> non vede più alcun dato ma resta nello storico. Non si può disattivare sé stessi.</w:t>
-      </w:r>
-    </w:p>
-    <w:p>
-      <w:pPr>
-        <w:spacing w:after="140" w:line="300"/>
-      </w:pPr>
-      <w:r>
-        <w:rPr>
-          <w:rFonts w:ascii="Arial" w:cs="Arial" w:eastAsia="Arial" w:hAnsi="Arial"/>
-          <w:b/>
-          <w:bCs/>
-          <w:color w:val="1B2118"/>
-          <w:sz w:val="21"/>
-          <w:szCs w:val="21"/>
-        </w:rPr>
-        <w:t xml:space="preserve">Password temporanea e primo accesso.</w:t>
-      </w:r>
-      <w:r>
-        <w:rPr>
-          <w:rFonts w:ascii="Arial" w:cs="Arial" w:eastAsia="Arial" w:hAnsi="Arial"/>
-          <w:color w:val="1B2118"/>
-          <w:sz w:val="21"/>
-          <w:szCs w:val="21"/>
-        </w:rPr>
-        <w:t xml:space="preserve"> Ogni nuovo utente entra con la password temporanea: al primo accesso il portale gli chiede di sceglierne una personale e non lo lascia proseguire finché non lo fa.</w:t>
-      </w:r>
-    </w:p>
-    <w:p>
-      <w:pPr>
-        <w:spacing w:after="140" w:line="300"/>
-      </w:pPr>
-      <w:r>
-        <w:rPr>
-          <w:rFonts w:ascii="Arial" w:cs="Arial" w:eastAsia="Arial" w:hAnsi="Arial"/>
-          <w:b/>
-          <w:bCs/>
-          <w:color w:val="1B2118"/>
-          <w:sz w:val="21"/>
-          <w:szCs w:val="21"/>
-        </w:rPr>
-        <w:t xml:space="preserve">Reimpostare la password di un utente</w:t>
       </w:r>
     </w:p>
     <w:p>
@@ -9708,18 +10199,18 @@
           <w:sz w:val="21"/>
           <w:szCs w:val="21"/>
         </w:rPr>
-        <w:t xml:space="preserve">Nella riga dell'utente premete </w:t>
-      </w:r>
-      <w:r>
-        <w:rPr>
-          <w:rFonts w:ascii="Arial" w:cs="Arial" w:eastAsia="Arial" w:hAnsi="Arial"/>
-          <w:b/>
-          <w:bCs/>
-          <w:color w:val="1B2118"/>
-          <w:sz w:val="21"/>
-          <w:szCs w:val="21"/>
-        </w:rPr>
-        <w:t xml:space="preserve">Reimposta password</w:t>
+        <w:t xml:space="preserve">Premete </w:t>
+      </w:r>
+      <w:r>
+        <w:rPr>
+          <w:rFonts w:ascii="Arial" w:cs="Arial" w:eastAsia="Arial" w:hAnsi="Arial"/>
+          <w:b/>
+          <w:bCs/>
+          <w:color w:val="1B2118"/>
+          <w:sz w:val="21"/>
+          <w:szCs w:val="21"/>
+        </w:rPr>
+        <w:t xml:space="preserve">+ Nuovo utente</w:t>
       </w:r>
       <w:r>
         <w:rPr>
@@ -9747,27 +10238,47 @@
           <w:sz w:val="21"/>
           <w:szCs w:val="21"/>
         </w:rPr>
-        <w:t xml:space="preserve">Il portale propone una password temporanea (</w:t>
-      </w:r>
-      <w:r>
-        <w:rPr>
-          <w:rFonts w:ascii="Arial" w:cs="Arial" w:eastAsia="Arial" w:hAnsi="Arial"/>
-          <w:b/>
-          <w:bCs/>
-          <w:color w:val="1B2118"/>
-          <w:sz w:val="21"/>
-          <w:szCs w:val="21"/>
-        </w:rPr>
-        <w:t xml:space="preserve">Genera un'altra</w:t>
-      </w:r>
-      <w:r>
-        <w:rPr>
-          <w:rFonts w:ascii="Arial" w:cs="Arial" w:eastAsia="Arial" w:hAnsi="Arial"/>
-          <w:color w:val="1B2118"/>
-          <w:sz w:val="21"/>
-          <w:szCs w:val="21"/>
-        </w:rPr>
-        <w:t xml:space="preserve"> ne crea una diversa).</w:t>
+        <w:t xml:space="preserve">Inserite </w:t>
+      </w:r>
+      <w:r>
+        <w:rPr>
+          <w:rFonts w:ascii="Arial" w:cs="Arial" w:eastAsia="Arial" w:hAnsi="Arial"/>
+          <w:b/>
+          <w:bCs/>
+          <w:color w:val="1B2118"/>
+          <w:sz w:val="21"/>
+          <w:szCs w:val="21"/>
+        </w:rPr>
+        <w:t xml:space="preserve">Email</w:t>
+      </w:r>
+      <w:r>
+        <w:rPr>
+          <w:rFonts w:ascii="Arial" w:cs="Arial" w:eastAsia="Arial" w:hAnsi="Arial"/>
+          <w:color w:val="1B2118"/>
+          <w:sz w:val="21"/>
+          <w:szCs w:val="21"/>
+        </w:rPr>
+        <w:t xml:space="preserve"> e, facoltativo, </w:t>
+      </w:r>
+      <w:r>
+        <w:rPr>
+          <w:rFonts w:ascii="Arial" w:cs="Arial" w:eastAsia="Arial" w:hAnsi="Arial"/>
+          <w:b/>
+          <w:bCs/>
+          <w:color w:val="1B2118"/>
+          <w:sz w:val="21"/>
+          <w:szCs w:val="21"/>
+        </w:rPr>
+        <w:t xml:space="preserve">Nome e cognome</w:t>
+      </w:r>
+      <w:r>
+        <w:rPr>
+          <w:rFonts w:ascii="Arial" w:cs="Arial" w:eastAsia="Arial" w:hAnsi="Arial"/>
+          <w:color w:val="1B2118"/>
+          <w:sz w:val="21"/>
+          <w:szCs w:val="21"/>
+        </w:rPr>
+        <w:t xml:space="preserve">.</w:t>
       </w:r>
     </w:p>
     <w:p>
@@ -9786,27 +10297,47 @@
           <w:sz w:val="21"/>
           <w:szCs w:val="21"/>
         </w:rPr>
-        <w:t xml:space="preserve">Premete </w:t>
-      </w:r>
-      <w:r>
-        <w:rPr>
-          <w:rFonts w:ascii="Arial" w:cs="Arial" w:eastAsia="Arial" w:hAnsi="Arial"/>
-          <w:b/>
-          <w:bCs/>
-          <w:color w:val="1B2118"/>
-          <w:sz w:val="21"/>
-          <w:szCs w:val="21"/>
-        </w:rPr>
-        <w:t xml:space="preserve">Conferma</w:t>
-      </w:r>
-      <w:r>
-        <w:rPr>
-          <w:rFonts w:ascii="Arial" w:cs="Arial" w:eastAsia="Arial" w:hAnsi="Arial"/>
-          <w:color w:val="1B2118"/>
-          <w:sz w:val="21"/>
-          <w:szCs w:val="21"/>
-        </w:rPr>
-        <w:t xml:space="preserve">: la password precedente smette di funzionare.</w:t>
+        <w:t xml:space="preserve">La </w:t>
+      </w:r>
+      <w:r>
+        <w:rPr>
+          <w:rFonts w:ascii="Arial" w:cs="Arial" w:eastAsia="Arial" w:hAnsi="Arial"/>
+          <w:b/>
+          <w:bCs/>
+          <w:color w:val="1B2118"/>
+          <w:sz w:val="21"/>
+          <w:szCs w:val="21"/>
+        </w:rPr>
+        <w:t xml:space="preserve">Password temporanea</w:t>
+      </w:r>
+      <w:r>
+        <w:rPr>
+          <w:rFonts w:ascii="Arial" w:cs="Arial" w:eastAsia="Arial" w:hAnsi="Arial"/>
+          <w:color w:val="1B2118"/>
+          <w:sz w:val="21"/>
+          <w:szCs w:val="21"/>
+        </w:rPr>
+        <w:t xml:space="preserve"> è già generata; </w:t>
+      </w:r>
+      <w:r>
+        <w:rPr>
+          <w:rFonts w:ascii="Arial" w:cs="Arial" w:eastAsia="Arial" w:hAnsi="Arial"/>
+          <w:b/>
+          <w:bCs/>
+          <w:color w:val="1B2118"/>
+          <w:sz w:val="21"/>
+          <w:szCs w:val="21"/>
+        </w:rPr>
+        <w:t xml:space="preserve">Genera</w:t>
+      </w:r>
+      <w:r>
+        <w:rPr>
+          <w:rFonts w:ascii="Arial" w:cs="Arial" w:eastAsia="Arial" w:hAnsi="Arial"/>
+          <w:color w:val="1B2118"/>
+          <w:sz w:val="21"/>
+          <w:szCs w:val="21"/>
+        </w:rPr>
+        <w:t xml:space="preserve"> ne crea un'altra.</w:t>
       </w:r>
     </w:p>
     <w:p>
@@ -9825,6 +10356,435 @@
           <w:sz w:val="21"/>
           <w:szCs w:val="21"/>
         </w:rPr>
+        <w:t xml:space="preserve">Scegliete il </w:t>
+      </w:r>
+      <w:r>
+        <w:rPr>
+          <w:rFonts w:ascii="Arial" w:cs="Arial" w:eastAsia="Arial" w:hAnsi="Arial"/>
+          <w:b/>
+          <w:bCs/>
+          <w:color w:val="1B2118"/>
+          <w:sz w:val="21"/>
+          <w:szCs w:val="21"/>
+        </w:rPr>
+        <w:t xml:space="preserve">Ruolo</w:t>
+      </w:r>
+      <w:r>
+        <w:rPr>
+          <w:rFonts w:ascii="Arial" w:cs="Arial" w:eastAsia="Arial" w:hAnsi="Arial"/>
+          <w:color w:val="1B2118"/>
+          <w:sz w:val="21"/>
+          <w:szCs w:val="21"/>
+        </w:rPr>
+        <w:t xml:space="preserve">: </w:t>
+      </w:r>
+      <w:r>
+        <w:rPr>
+          <w:rFonts w:ascii="Arial" w:cs="Arial" w:eastAsia="Arial" w:hAnsi="Arial"/>
+          <w:i/>
+          <w:iCs/>
+          <w:color w:val="1B2118"/>
+          <w:sz w:val="21"/>
+          <w:szCs w:val="21"/>
+        </w:rPr>
+        <w:t xml:space="preserve">Cliente (comune / azienda)</w:t>
+      </w:r>
+      <w:r>
+        <w:rPr>
+          <w:rFonts w:ascii="Arial" w:cs="Arial" w:eastAsia="Arial" w:hAnsi="Arial"/>
+          <w:color w:val="1B2118"/>
+          <w:sz w:val="21"/>
+          <w:szCs w:val="21"/>
+        </w:rPr>
+        <w:t xml:space="preserve"> oppure </w:t>
+      </w:r>
+      <w:r>
+        <w:rPr>
+          <w:rFonts w:ascii="Arial" w:cs="Arial" w:eastAsia="Arial" w:hAnsi="Arial"/>
+          <w:i/>
+          <w:iCs/>
+          <w:color w:val="1B2118"/>
+          <w:sz w:val="21"/>
+          <w:szCs w:val="21"/>
+        </w:rPr>
+        <w:t xml:space="preserve">Operatore di back-office</w:t>
+      </w:r>
+      <w:r>
+        <w:rPr>
+          <w:rFonts w:ascii="Arial" w:cs="Arial" w:eastAsia="Arial" w:hAnsi="Arial"/>
+          <w:color w:val="1B2118"/>
+          <w:sz w:val="21"/>
+          <w:szCs w:val="21"/>
+        </w:rPr>
+        <w:t xml:space="preserve">.</w:t>
+      </w:r>
+    </w:p>
+    <w:p>
+      <w:pPr>
+        <w:pStyle w:val="ListParagraph"/>
+        <w:numPr>
+          <w:ilvl w:val="0"/>
+          <w:numId w:val="13"/>
+        </w:numPr>
+        <w:spacing w:after="70" w:line="290"/>
+      </w:pPr>
+      <w:r>
+        <w:rPr>
+          <w:rFonts w:ascii="Arial" w:cs="Arial" w:eastAsia="Arial" w:hAnsi="Arial"/>
+          <w:color w:val="1B2118"/>
+          <w:sz w:val="21"/>
+          <w:szCs w:val="21"/>
+        </w:rPr>
+        <w:t xml:space="preserve">Per un Cliente spuntate le </w:t>
+      </w:r>
+      <w:r>
+        <w:rPr>
+          <w:rFonts w:ascii="Arial" w:cs="Arial" w:eastAsia="Arial" w:hAnsi="Arial"/>
+          <w:b/>
+          <w:bCs/>
+          <w:color w:val="1B2118"/>
+          <w:sz w:val="21"/>
+          <w:szCs w:val="21"/>
+        </w:rPr>
+        <w:t xml:space="preserve">Organizzazioni associate</w:t>
+      </w:r>
+      <w:r>
+        <w:rPr>
+          <w:rFonts w:ascii="Arial" w:cs="Arial" w:eastAsia="Arial" w:hAnsi="Arial"/>
+          <w:color w:val="1B2118"/>
+          <w:sz w:val="21"/>
+          <w:szCs w:val="21"/>
+        </w:rPr>
+        <w:t xml:space="preserve"> (almeno una; la prima è la principale). Con più di 6 organizzazioni compare la ricerca.</w:t>
+      </w:r>
+    </w:p>
+    <w:p>
+      <w:pPr>
+        <w:pStyle w:val="ListParagraph"/>
+        <w:numPr>
+          <w:ilvl w:val="0"/>
+          <w:numId w:val="13"/>
+        </w:numPr>
+        <w:spacing w:after="70" w:line="290"/>
+      </w:pPr>
+      <w:r>
+        <w:rPr>
+          <w:rFonts w:ascii="Arial" w:cs="Arial" w:eastAsia="Arial" w:hAnsi="Arial"/>
+          <w:color w:val="1B2118"/>
+          <w:sz w:val="21"/>
+          <w:szCs w:val="21"/>
+        </w:rPr>
+        <w:t xml:space="preserve">Premete </w:t>
+      </w:r>
+      <w:r>
+        <w:rPr>
+          <w:rFonts w:ascii="Arial" w:cs="Arial" w:eastAsia="Arial" w:hAnsi="Arial"/>
+          <w:b/>
+          <w:bCs/>
+          <w:color w:val="1B2118"/>
+          <w:sz w:val="21"/>
+          <w:szCs w:val="21"/>
+        </w:rPr>
+        <w:t xml:space="preserve">Crea utente</w:t>
+      </w:r>
+      <w:r>
+        <w:rPr>
+          <w:rFonts w:ascii="Arial" w:cs="Arial" w:eastAsia="Arial" w:hAnsi="Arial"/>
+          <w:color w:val="1B2118"/>
+          <w:sz w:val="21"/>
+          <w:szCs w:val="21"/>
+        </w:rPr>
+        <w:t xml:space="preserve">.</w:t>
+      </w:r>
+    </w:p>
+    <w:p>
+      <w:pPr>
+        <w:pStyle w:val="ListParagraph"/>
+        <w:numPr>
+          <w:ilvl w:val="0"/>
+          <w:numId w:val="13"/>
+        </w:numPr>
+        <w:spacing w:after="70" w:line="290"/>
+      </w:pPr>
+      <w:r>
+        <w:rPr>
+          <w:rFonts w:ascii="Arial" w:cs="Arial" w:eastAsia="Arial" w:hAnsi="Arial"/>
+          <w:color w:val="1B2118"/>
+          <w:sz w:val="21"/>
+          <w:szCs w:val="21"/>
+        </w:rPr>
+        <w:t xml:space="preserve">Comunicate all'utente email e password temporanea con un canale sicuro, separato dall'email di benvenuto.</w:t>
+      </w:r>
+    </w:p>
+    <w:p>
+      <w:pPr>
+        <w:spacing w:after="60"/>
+      </w:pPr>
+    </w:p>
+    <w:p>
+      <w:pPr>
+        <w:spacing w:after="140" w:line="300"/>
+      </w:pPr>
+      <w:r>
+        <w:rPr>
+          <w:rFonts w:ascii="Arial" w:cs="Arial" w:eastAsia="Arial" w:hAnsi="Arial"/>
+          <w:b/>
+          <w:bCs/>
+          <w:color w:val="1B2118"/>
+          <w:sz w:val="21"/>
+          <w:szCs w:val="21"/>
+        </w:rPr>
+        <w:t xml:space="preserve">Modificare un utente.</w:t>
+      </w:r>
+      <w:r>
+        <w:rPr>
+          <w:rFonts w:ascii="Arial" w:cs="Arial" w:eastAsia="Arial" w:hAnsi="Arial"/>
+          <w:color w:val="1B2118"/>
+          <w:sz w:val="21"/>
+          <w:szCs w:val="21"/>
+        </w:rPr>
+        <w:t xml:space="preserve"> </w:t>
+      </w:r>
+      <w:r>
+        <w:rPr>
+          <w:rFonts w:ascii="Arial" w:cs="Arial" w:eastAsia="Arial" w:hAnsi="Arial"/>
+          <w:b/>
+          <w:bCs/>
+          <w:color w:val="1B2118"/>
+          <w:sz w:val="21"/>
+          <w:szCs w:val="21"/>
+        </w:rPr>
+        <w:t xml:space="preserve">Modifica</w:t>
+      </w:r>
+      <w:r>
+        <w:rPr>
+          <w:rFonts w:ascii="Arial" w:cs="Arial" w:eastAsia="Arial" w:hAnsi="Arial"/>
+          <w:color w:val="1B2118"/>
+          <w:sz w:val="21"/>
+          <w:szCs w:val="21"/>
+        </w:rPr>
+        <w:t xml:space="preserve"> permette di cambiare ruolo e organizzazioni. Passando a Operatore le associazioni alle organizzazioni si azzerano.</w:t>
+      </w:r>
+    </w:p>
+    <w:p>
+      <w:pPr>
+        <w:spacing w:after="140" w:line="300"/>
+      </w:pPr>
+      <w:r>
+        <w:rPr>
+          <w:rFonts w:ascii="Arial" w:cs="Arial" w:eastAsia="Arial" w:hAnsi="Arial"/>
+          <w:b/>
+          <w:bCs/>
+          <w:color w:val="1B2118"/>
+          <w:sz w:val="21"/>
+          <w:szCs w:val="21"/>
+        </w:rPr>
+        <w:t xml:space="preserve">Disattivare o riattivare.</w:t>
+      </w:r>
+      <w:r>
+        <w:rPr>
+          <w:rFonts w:ascii="Arial" w:cs="Arial" w:eastAsia="Arial" w:hAnsi="Arial"/>
+          <w:color w:val="1B2118"/>
+          <w:sz w:val="21"/>
+          <w:szCs w:val="21"/>
+        </w:rPr>
+        <w:t xml:space="preserve"> Un utente </w:t>
+      </w:r>
+      <w:r>
+        <w:rPr>
+          <w:rFonts w:ascii="Arial" w:cs="Arial" w:eastAsia="Arial" w:hAnsi="Arial"/>
+          <w:b/>
+          <w:bCs/>
+          <w:color w:val="1B2118"/>
+          <w:sz w:val="21"/>
+          <w:szCs w:val="21"/>
+        </w:rPr>
+        <w:t xml:space="preserve">Disattivato</w:t>
+      </w:r>
+      <w:r>
+        <w:rPr>
+          <w:rFonts w:ascii="Arial" w:cs="Arial" w:eastAsia="Arial" w:hAnsi="Arial"/>
+          <w:color w:val="1B2118"/>
+          <w:sz w:val="21"/>
+          <w:szCs w:val="21"/>
+        </w:rPr>
+        <w:t xml:space="preserve"> non vede più alcun dato ma resta nello storico. Non si può disattivare sé stessi.</w:t>
+      </w:r>
+    </w:p>
+    <w:p>
+      <w:pPr>
+        <w:spacing w:after="140" w:line="300"/>
+      </w:pPr>
+      <w:r>
+        <w:rPr>
+          <w:rFonts w:ascii="Arial" w:cs="Arial" w:eastAsia="Arial" w:hAnsi="Arial"/>
+          <w:b/>
+          <w:bCs/>
+          <w:color w:val="1B2118"/>
+          <w:sz w:val="21"/>
+          <w:szCs w:val="21"/>
+        </w:rPr>
+        <w:t xml:space="preserve">Password temporanea e primo accesso.</w:t>
+      </w:r>
+      <w:r>
+        <w:rPr>
+          <w:rFonts w:ascii="Arial" w:cs="Arial" w:eastAsia="Arial" w:hAnsi="Arial"/>
+          <w:color w:val="1B2118"/>
+          <w:sz w:val="21"/>
+          <w:szCs w:val="21"/>
+        </w:rPr>
+        <w:t xml:space="preserve"> Ogni nuovo utente entra con la password temporanea: al primo accesso il portale gli chiede di sceglierne una personale e non lo lascia proseguire finché non lo fa.</w:t>
+      </w:r>
+    </w:p>
+    <w:p>
+      <w:pPr>
+        <w:spacing w:after="140" w:line="300"/>
+      </w:pPr>
+      <w:r>
+        <w:rPr>
+          <w:rFonts w:ascii="Arial" w:cs="Arial" w:eastAsia="Arial" w:hAnsi="Arial"/>
+          <w:b/>
+          <w:bCs/>
+          <w:color w:val="1B2118"/>
+          <w:sz w:val="21"/>
+          <w:szCs w:val="21"/>
+        </w:rPr>
+        <w:t xml:space="preserve">Reimpostare la password di un utente</w:t>
+      </w:r>
+    </w:p>
+    <w:p>
+      <w:pPr>
+        <w:pStyle w:val="ListParagraph"/>
+        <w:numPr>
+          <w:ilvl w:val="0"/>
+          <w:numId w:val="14"/>
+        </w:numPr>
+        <w:spacing w:after="70" w:line="290"/>
+      </w:pPr>
+      <w:r>
+        <w:rPr>
+          <w:rFonts w:ascii="Arial" w:cs="Arial" w:eastAsia="Arial" w:hAnsi="Arial"/>
+          <w:color w:val="1B2118"/>
+          <w:sz w:val="21"/>
+          <w:szCs w:val="21"/>
+        </w:rPr>
+        <w:t xml:space="preserve">Nella riga dell'utente premete </w:t>
+      </w:r>
+      <w:r>
+        <w:rPr>
+          <w:rFonts w:ascii="Arial" w:cs="Arial" w:eastAsia="Arial" w:hAnsi="Arial"/>
+          <w:b/>
+          <w:bCs/>
+          <w:color w:val="1B2118"/>
+          <w:sz w:val="21"/>
+          <w:szCs w:val="21"/>
+        </w:rPr>
+        <w:t xml:space="preserve">Reimposta password</w:t>
+      </w:r>
+      <w:r>
+        <w:rPr>
+          <w:rFonts w:ascii="Arial" w:cs="Arial" w:eastAsia="Arial" w:hAnsi="Arial"/>
+          <w:color w:val="1B2118"/>
+          <w:sz w:val="21"/>
+          <w:szCs w:val="21"/>
+        </w:rPr>
+        <w:t xml:space="preserve">.</w:t>
+      </w:r>
+    </w:p>
+    <w:p>
+      <w:pPr>
+        <w:pStyle w:val="ListParagraph"/>
+        <w:numPr>
+          <w:ilvl w:val="0"/>
+          <w:numId w:val="14"/>
+        </w:numPr>
+        <w:spacing w:after="70" w:line="290"/>
+      </w:pPr>
+      <w:r>
+        <w:rPr>
+          <w:rFonts w:ascii="Arial" w:cs="Arial" w:eastAsia="Arial" w:hAnsi="Arial"/>
+          <w:color w:val="1B2118"/>
+          <w:sz w:val="21"/>
+          <w:szCs w:val="21"/>
+        </w:rPr>
+        <w:t xml:space="preserve">Il portale propone una password temporanea (</w:t>
+      </w:r>
+      <w:r>
+        <w:rPr>
+          <w:rFonts w:ascii="Arial" w:cs="Arial" w:eastAsia="Arial" w:hAnsi="Arial"/>
+          <w:b/>
+          <w:bCs/>
+          <w:color w:val="1B2118"/>
+          <w:sz w:val="21"/>
+          <w:szCs w:val="21"/>
+        </w:rPr>
+        <w:t xml:space="preserve">Genera un'altra</w:t>
+      </w:r>
+      <w:r>
+        <w:rPr>
+          <w:rFonts w:ascii="Arial" w:cs="Arial" w:eastAsia="Arial" w:hAnsi="Arial"/>
+          <w:color w:val="1B2118"/>
+          <w:sz w:val="21"/>
+          <w:szCs w:val="21"/>
+        </w:rPr>
+        <w:t xml:space="preserve"> ne crea una diversa).</w:t>
+      </w:r>
+    </w:p>
+    <w:p>
+      <w:pPr>
+        <w:pStyle w:val="ListParagraph"/>
+        <w:numPr>
+          <w:ilvl w:val="0"/>
+          <w:numId w:val="14"/>
+        </w:numPr>
+        <w:spacing w:after="70" w:line="290"/>
+      </w:pPr>
+      <w:r>
+        <w:rPr>
+          <w:rFonts w:ascii="Arial" w:cs="Arial" w:eastAsia="Arial" w:hAnsi="Arial"/>
+          <w:color w:val="1B2118"/>
+          <w:sz w:val="21"/>
+          <w:szCs w:val="21"/>
+        </w:rPr>
+        <w:t xml:space="preserve">Premete </w:t>
+      </w:r>
+      <w:r>
+        <w:rPr>
+          <w:rFonts w:ascii="Arial" w:cs="Arial" w:eastAsia="Arial" w:hAnsi="Arial"/>
+          <w:b/>
+          <w:bCs/>
+          <w:color w:val="1B2118"/>
+          <w:sz w:val="21"/>
+          <w:szCs w:val="21"/>
+        </w:rPr>
+        <w:t xml:space="preserve">Conferma</w:t>
+      </w:r>
+      <w:r>
+        <w:rPr>
+          <w:rFonts w:ascii="Arial" w:cs="Arial" w:eastAsia="Arial" w:hAnsi="Arial"/>
+          <w:color w:val="1B2118"/>
+          <w:sz w:val="21"/>
+          <w:szCs w:val="21"/>
+        </w:rPr>
+        <w:t xml:space="preserve">: la password precedente smette di funzionare.</w:t>
+      </w:r>
+    </w:p>
+    <w:p>
+      <w:pPr>
+        <w:pStyle w:val="ListParagraph"/>
+        <w:numPr>
+          <w:ilvl w:val="0"/>
+          <w:numId w:val="14"/>
+        </w:numPr>
+        <w:spacing w:after="70" w:line="290"/>
+      </w:pPr>
+      <w:r>
+        <w:rPr>
+          <w:rFonts w:ascii="Arial" w:cs="Arial" w:eastAsia="Arial" w:hAnsi="Arial"/>
+          <w:color w:val="1B2118"/>
+          <w:sz w:val="21"/>
+          <w:szCs w:val="21"/>
+        </w:rPr>
         <w:t xml:space="preserve">Comunicate la password temporanea all'utente con un canale sicuro, ad esempio per telefono. Al primo accesso dovrà sceglierne una personale.</w:t>
       </w:r>
     </w:p>
@@ -9921,7 +10881,7 @@
         </w:pBdr>
         <w:spacing w:after="240" w:before="0"/>
       </w:pPr>
-      <w:bookmarkStart w:name="cap13" w:id="1"/>
+      <w:bookmarkStart w:name="cap14" w:id="1"/>
       <w:r>
         <w:rPr>
           <w:rFonts w:ascii="Arial" w:cs="Arial" w:eastAsia="Arial" w:hAnsi="Arial"/>
@@ -9931,7 +10891,7 @@
           <w:sz w:val="34"/>
           <w:szCs w:val="34"/>
         </w:rPr>
-        <w:t xml:space="preserve">13. Audit trail</w:t>
+        <w:t xml:space="preserve">14. Audit trail</w:t>
       </w:r>
       <w:bookmarkEnd w:id="1"/>
     </w:p>
@@ -10203,7 +11163,7 @@
         </w:pBdr>
         <w:spacing w:after="240" w:before="0"/>
       </w:pPr>
-      <w:bookmarkStart w:name="cap14" w:id="1"/>
+      <w:bookmarkStart w:name="cap15" w:id="1"/>
       <w:r>
         <w:rPr>
           <w:rFonts w:ascii="Arial" w:cs="Arial" w:eastAsia="Arial" w:hAnsi="Arial"/>
@@ -10213,7 +11173,7 @@
           <w:sz w:val="34"/>
           <w:szCs w:val="34"/>
         </w:rPr>
-        <w:t xml:space="preserve">14. Impostazioni: durata delle fasi</w:t>
+        <w:t xml:space="preserve">15. Impostazioni: fasi, Enti di Validazione e modelli</w:t>
       </w:r>
       <w:bookmarkEnd w:id="1"/>
     </w:p>
@@ -10248,7 +11208,39 @@
           <w:sz w:val="21"/>
           <w:szCs w:val="21"/>
         </w:rPr>
-        <w:t xml:space="preserve"> fissa quanti giorni dura ogni fase. Quando un Operatore apre una fase, la scadenza è calcolata con questi valori.</w:t>
+        <w:t xml:space="preserve"> ha tre sezioni: durata delle fasi, Enti di Validazione e modelli di documento.</w:t>
+      </w:r>
+    </w:p>
+    <w:p>
+      <w:pPr>
+        <w:pStyle w:val="Heading2"/>
+        <w:keepNext/>
+        <w:spacing w:after="120" w:before="240"/>
+      </w:pPr>
+      <w:r>
+        <w:rPr>
+          <w:rFonts w:ascii="Arial" w:cs="Arial" w:eastAsia="Arial" w:hAnsi="Arial"/>
+          <w:b/>
+          <w:bCs/>
+          <w:color w:val="2F5D3A"/>
+          <w:sz w:val="25"/>
+          <w:szCs w:val="25"/>
+        </w:rPr>
+        <w:t xml:space="preserve">Durata delle fasi</w:t>
+      </w:r>
+    </w:p>
+    <w:p>
+      <w:pPr>
+        <w:spacing w:after="140" w:line="300"/>
+      </w:pPr>
+      <w:r>
+        <w:rPr>
+          <w:rFonts w:ascii="Arial" w:cs="Arial" w:eastAsia="Arial" w:hAnsi="Arial"/>
+          <w:color w:val="1B2118"/>
+          <w:sz w:val="21"/>
+          <w:szCs w:val="21"/>
+        </w:rPr>
+        <w:t xml:space="preserve">La sezione fissa quanti giorni dura ogni fase. Quando un Operatore apre una fase, la scadenza è calcolata con questi valori.</w:t>
       </w:r>
     </w:p>
     <w:tbl>
@@ -11122,7 +12114,7 @@
         <w:pStyle w:val="ListParagraph"/>
         <w:numPr>
           <w:ilvl w:val="0"/>
-          <w:numId w:val="14"/>
+          <w:numId w:val="15"/>
         </w:numPr>
         <w:spacing w:after="70" w:line="290"/>
       </w:pPr>
@@ -11201,7 +12193,7 @@
         <w:pStyle w:val="ListParagraph"/>
         <w:numPr>
           <w:ilvl w:val="0"/>
-          <w:numId w:val="14"/>
+          <w:numId w:val="15"/>
         </w:numPr>
         <w:spacing w:after="70" w:line="290"/>
       </w:pPr>
@@ -11240,7 +12232,7 @@
         <w:pStyle w:val="ListParagraph"/>
         <w:numPr>
           <w:ilvl w:val="0"/>
-          <w:numId w:val="14"/>
+          <w:numId w:val="15"/>
         </w:numPr>
         <w:spacing w:after="70" w:line="290"/>
       </w:pPr>
@@ -11351,6 +12343,632 @@
           <w:szCs w:val="21"/>
         </w:rPr>
         <w:t xml:space="preserve">. Ogni modifica è registrata nell'audit.</w:t>
+      </w:r>
+    </w:p>
+    <w:p>
+      <w:pPr>
+        <w:pStyle w:val="Heading2"/>
+        <w:keepNext/>
+        <w:spacing w:after="120" w:before="240"/>
+      </w:pPr>
+      <w:r>
+        <w:rPr>
+          <w:rFonts w:ascii="Arial" w:cs="Arial" w:eastAsia="Arial" w:hAnsi="Arial"/>
+          <w:b/>
+          <w:bCs/>
+          <w:color w:val="2F5D3A"/>
+          <w:sz w:val="25"/>
+          <w:szCs w:val="25"/>
+        </w:rPr>
+        <w:t xml:space="preserve">Enti di Validazione</w:t>
+      </w:r>
+    </w:p>
+    <w:p>
+      <w:pPr>
+        <w:spacing w:after="140" w:line="300"/>
+      </w:pPr>
+      <w:r>
+        <w:rPr>
+          <w:rFonts w:ascii="Arial" w:cs="Arial" w:eastAsia="Arial" w:hAnsi="Arial"/>
+          <w:color w:val="1B2118"/>
+          <w:sz w:val="21"/>
+          <w:szCs w:val="21"/>
+        </w:rPr>
+        <w:t xml:space="preserve">Anagrafica degli enti che validano i Progetti (ad esempio RINA). Gli enti non accedono al portale.</w:t>
+      </w:r>
+    </w:p>
+    <w:p>
+      <w:pPr>
+        <w:pStyle w:val="ListParagraph"/>
+        <w:numPr>
+          <w:ilvl w:val="0"/>
+          <w:numId w:val="16"/>
+        </w:numPr>
+        <w:spacing w:after="70" w:line="290"/>
+      </w:pPr>
+      <w:r>
+        <w:rPr>
+          <w:rFonts w:ascii="Arial" w:cs="Arial" w:eastAsia="Arial" w:hAnsi="Arial"/>
+          <w:color w:val="1B2118"/>
+          <w:sz w:val="21"/>
+          <w:szCs w:val="21"/>
+        </w:rPr>
+        <w:t xml:space="preserve">Premete </w:t>
+      </w:r>
+      <w:r>
+        <w:rPr>
+          <w:rFonts w:ascii="Arial" w:cs="Arial" w:eastAsia="Arial" w:hAnsi="Arial"/>
+          <w:b/>
+          <w:bCs/>
+          <w:color w:val="1B2118"/>
+          <w:sz w:val="21"/>
+          <w:szCs w:val="21"/>
+        </w:rPr>
+        <w:t xml:space="preserve">+ Nuovo ente</w:t>
+      </w:r>
+      <w:r>
+        <w:rPr>
+          <w:rFonts w:ascii="Arial" w:cs="Arial" w:eastAsia="Arial" w:hAnsi="Arial"/>
+          <w:color w:val="1B2118"/>
+          <w:sz w:val="21"/>
+          <w:szCs w:val="21"/>
+        </w:rPr>
+        <w:t xml:space="preserve">.</w:t>
+      </w:r>
+    </w:p>
+    <w:p>
+      <w:pPr>
+        <w:pStyle w:val="ListParagraph"/>
+        <w:numPr>
+          <w:ilvl w:val="0"/>
+          <w:numId w:val="16"/>
+        </w:numPr>
+        <w:spacing w:after="70" w:line="290"/>
+      </w:pPr>
+      <w:r>
+        <w:rPr>
+          <w:rFonts w:ascii="Arial" w:cs="Arial" w:eastAsia="Arial" w:hAnsi="Arial"/>
+          <w:color w:val="1B2118"/>
+          <w:sz w:val="21"/>
+          <w:szCs w:val="21"/>
+        </w:rPr>
+        <w:t xml:space="preserve">Compilate </w:t>
+      </w:r>
+      <w:r>
+        <w:rPr>
+          <w:rFonts w:ascii="Arial" w:cs="Arial" w:eastAsia="Arial" w:hAnsi="Arial"/>
+          <w:b/>
+          <w:bCs/>
+          <w:color w:val="1B2118"/>
+          <w:sz w:val="21"/>
+          <w:szCs w:val="21"/>
+        </w:rPr>
+        <w:t xml:space="preserve">Denominazione</w:t>
+      </w:r>
+      <w:r>
+        <w:rPr>
+          <w:rFonts w:ascii="Arial" w:cs="Arial" w:eastAsia="Arial" w:hAnsi="Arial"/>
+          <w:color w:val="1B2118"/>
+          <w:sz w:val="21"/>
+          <w:szCs w:val="21"/>
+        </w:rPr>
+        <w:t xml:space="preserve"> (obbligatoria) e, se disponibili, </w:t>
+      </w:r>
+      <w:r>
+        <w:rPr>
+          <w:rFonts w:ascii="Arial" w:cs="Arial" w:eastAsia="Arial" w:hAnsi="Arial"/>
+          <w:b/>
+          <w:bCs/>
+          <w:color w:val="1B2118"/>
+          <w:sz w:val="21"/>
+          <w:szCs w:val="21"/>
+        </w:rPr>
+        <w:t xml:space="preserve">Identificativo</w:t>
+      </w:r>
+      <w:r>
+        <w:rPr>
+          <w:rFonts w:ascii="Arial" w:cs="Arial" w:eastAsia="Arial" w:hAnsi="Arial"/>
+          <w:color w:val="1B2118"/>
+          <w:sz w:val="21"/>
+          <w:szCs w:val="21"/>
+        </w:rPr>
+        <w:t xml:space="preserve">, </w:t>
+      </w:r>
+      <w:r>
+        <w:rPr>
+          <w:rFonts w:ascii="Arial" w:cs="Arial" w:eastAsia="Arial" w:hAnsi="Arial"/>
+          <w:b/>
+          <w:bCs/>
+          <w:color w:val="1B2118"/>
+          <w:sz w:val="21"/>
+          <w:szCs w:val="21"/>
+        </w:rPr>
+        <w:t xml:space="preserve">Accreditamento</w:t>
+      </w:r>
+      <w:r>
+        <w:rPr>
+          <w:rFonts w:ascii="Arial" w:cs="Arial" w:eastAsia="Arial" w:hAnsi="Arial"/>
+          <w:color w:val="1B2118"/>
+          <w:sz w:val="21"/>
+          <w:szCs w:val="21"/>
+        </w:rPr>
+        <w:t xml:space="preserve">, </w:t>
+      </w:r>
+      <w:r>
+        <w:rPr>
+          <w:rFonts w:ascii="Arial" w:cs="Arial" w:eastAsia="Arial" w:hAnsi="Arial"/>
+          <w:b/>
+          <w:bCs/>
+          <w:color w:val="1B2118"/>
+          <w:sz w:val="21"/>
+          <w:szCs w:val="21"/>
+        </w:rPr>
+        <w:t xml:space="preserve">Referente</w:t>
+      </w:r>
+      <w:r>
+        <w:rPr>
+          <w:rFonts w:ascii="Arial" w:cs="Arial" w:eastAsia="Arial" w:hAnsi="Arial"/>
+          <w:color w:val="1B2118"/>
+          <w:sz w:val="21"/>
+          <w:szCs w:val="21"/>
+        </w:rPr>
+        <w:t xml:space="preserve">, </w:t>
+      </w:r>
+      <w:r>
+        <w:rPr>
+          <w:rFonts w:ascii="Arial" w:cs="Arial" w:eastAsia="Arial" w:hAnsi="Arial"/>
+          <w:b/>
+          <w:bCs/>
+          <w:color w:val="1B2118"/>
+          <w:sz w:val="21"/>
+          <w:szCs w:val="21"/>
+        </w:rPr>
+        <w:t xml:space="preserve">Email</w:t>
+      </w:r>
+      <w:r>
+        <w:rPr>
+          <w:rFonts w:ascii="Arial" w:cs="Arial" w:eastAsia="Arial" w:hAnsi="Arial"/>
+          <w:color w:val="1B2118"/>
+          <w:sz w:val="21"/>
+          <w:szCs w:val="21"/>
+        </w:rPr>
+        <w:t xml:space="preserve">, </w:t>
+      </w:r>
+      <w:r>
+        <w:rPr>
+          <w:rFonts w:ascii="Arial" w:cs="Arial" w:eastAsia="Arial" w:hAnsi="Arial"/>
+          <w:b/>
+          <w:bCs/>
+          <w:color w:val="1B2118"/>
+          <w:sz w:val="21"/>
+          <w:szCs w:val="21"/>
+        </w:rPr>
+        <w:t xml:space="preserve">Telefono</w:t>
+      </w:r>
+      <w:r>
+        <w:rPr>
+          <w:rFonts w:ascii="Arial" w:cs="Arial" w:eastAsia="Arial" w:hAnsi="Arial"/>
+          <w:color w:val="1B2118"/>
+          <w:sz w:val="21"/>
+          <w:szCs w:val="21"/>
+        </w:rPr>
+        <w:t xml:space="preserve">, </w:t>
+      </w:r>
+      <w:r>
+        <w:rPr>
+          <w:rFonts w:ascii="Arial" w:cs="Arial" w:eastAsia="Arial" w:hAnsi="Arial"/>
+          <w:b/>
+          <w:bCs/>
+          <w:color w:val="1B2118"/>
+          <w:sz w:val="21"/>
+          <w:szCs w:val="21"/>
+        </w:rPr>
+        <w:t xml:space="preserve">Note</w:t>
+      </w:r>
+      <w:r>
+        <w:rPr>
+          <w:rFonts w:ascii="Arial" w:cs="Arial" w:eastAsia="Arial" w:hAnsi="Arial"/>
+          <w:color w:val="1B2118"/>
+          <w:sz w:val="21"/>
+          <w:szCs w:val="21"/>
+        </w:rPr>
+        <w:t xml:space="preserve">.</w:t>
+      </w:r>
+    </w:p>
+    <w:p>
+      <w:pPr>
+        <w:pStyle w:val="ListParagraph"/>
+        <w:numPr>
+          <w:ilvl w:val="0"/>
+          <w:numId w:val="16"/>
+        </w:numPr>
+        <w:spacing w:after="70" w:line="290"/>
+      </w:pPr>
+      <w:r>
+        <w:rPr>
+          <w:rFonts w:ascii="Arial" w:cs="Arial" w:eastAsia="Arial" w:hAnsi="Arial"/>
+          <w:color w:val="1B2118"/>
+          <w:sz w:val="21"/>
+          <w:szCs w:val="21"/>
+        </w:rPr>
+        <w:t xml:space="preserve">Premete </w:t>
+      </w:r>
+      <w:r>
+        <w:rPr>
+          <w:rFonts w:ascii="Arial" w:cs="Arial" w:eastAsia="Arial" w:hAnsi="Arial"/>
+          <w:b/>
+          <w:bCs/>
+          <w:color w:val="1B2118"/>
+          <w:sz w:val="21"/>
+          <w:szCs w:val="21"/>
+        </w:rPr>
+        <w:t xml:space="preserve">Salva</w:t>
+      </w:r>
+      <w:r>
+        <w:rPr>
+          <w:rFonts w:ascii="Arial" w:cs="Arial" w:eastAsia="Arial" w:hAnsi="Arial"/>
+          <w:color w:val="1B2118"/>
+          <w:sz w:val="21"/>
+          <w:szCs w:val="21"/>
+        </w:rPr>
+        <w:t xml:space="preserve">.</w:t>
+      </w:r>
+    </w:p>
+    <w:p>
+      <w:pPr>
+        <w:spacing w:after="60"/>
+      </w:pPr>
+    </w:p>
+    <w:p>
+      <w:pPr>
+        <w:spacing w:after="140" w:line="300"/>
+      </w:pPr>
+      <w:r>
+        <w:rPr>
+          <w:rFonts w:ascii="Arial" w:cs="Arial" w:eastAsia="Arial" w:hAnsi="Arial"/>
+          <w:b/>
+          <w:bCs/>
+          <w:color w:val="1B2118"/>
+          <w:sz w:val="21"/>
+          <w:szCs w:val="21"/>
+        </w:rPr>
+        <w:t xml:space="preserve">Modifica</w:t>
+      </w:r>
+      <w:r>
+        <w:rPr>
+          <w:rFonts w:ascii="Arial" w:cs="Arial" w:eastAsia="Arial" w:hAnsi="Arial"/>
+          <w:color w:val="1B2118"/>
+          <w:sz w:val="21"/>
+          <w:szCs w:val="21"/>
+        </w:rPr>
+        <w:t xml:space="preserve"> cambia i dati. Un ente non si cancella: togliendo </w:t>
+      </w:r>
+      <w:r>
+        <w:rPr>
+          <w:rFonts w:ascii="Arial" w:cs="Arial" w:eastAsia="Arial" w:hAnsi="Arial"/>
+          <w:b/>
+          <w:bCs/>
+          <w:color w:val="1B2118"/>
+          <w:sz w:val="21"/>
+          <w:szCs w:val="21"/>
+        </w:rPr>
+        <w:t xml:space="preserve">Attivo</w:t>
+      </w:r>
+      <w:r>
+        <w:rPr>
+          <w:rFonts w:ascii="Arial" w:cs="Arial" w:eastAsia="Arial" w:hAnsi="Arial"/>
+          <w:color w:val="1B2118"/>
+          <w:sz w:val="21"/>
+          <w:szCs w:val="21"/>
+        </w:rPr>
+        <w:t xml:space="preserve"> non si può più assegnare a nuove pratiche, ma resta su quelle a cui era assegnato. L'assegnazione alle pratiche si fa dall'intestazione della pratica.</w:t>
+      </w:r>
+    </w:p>
+    <w:p>
+      <w:pPr>
+        <w:pStyle w:val="Heading2"/>
+        <w:keepNext/>
+        <w:spacing w:after="120" w:before="240"/>
+      </w:pPr>
+      <w:r>
+        <w:rPr>
+          <w:rFonts w:ascii="Arial" w:cs="Arial" w:eastAsia="Arial" w:hAnsi="Arial"/>
+          <w:b/>
+          <w:bCs/>
+          <w:color w:val="2F5D3A"/>
+          <w:sz w:val="25"/>
+          <w:szCs w:val="25"/>
+        </w:rPr>
+        <w:t xml:space="preserve">Modelli di documento</w:t>
+      </w:r>
+    </w:p>
+    <w:p>
+      <w:pPr>
+        <w:spacing w:after="140" w:line="300"/>
+      </w:pPr>
+      <w:r>
+        <w:rPr>
+          <w:rFonts w:ascii="Arial" w:cs="Arial" w:eastAsia="Arial" w:hAnsi="Arial"/>
+          <w:color w:val="1B2118"/>
+          <w:sz w:val="21"/>
+          <w:szCs w:val="21"/>
+        </w:rPr>
+        <w:t xml:space="preserve">Moduli e fac-simile che i Comuni scaricano dal portale.</w:t>
+      </w:r>
+    </w:p>
+    <w:p>
+      <w:pPr>
+        <w:pStyle w:val="ListParagraph"/>
+        <w:numPr>
+          <w:ilvl w:val="0"/>
+          <w:numId w:val="17"/>
+        </w:numPr>
+        <w:spacing w:after="70" w:line="290"/>
+      </w:pPr>
+      <w:r>
+        <w:rPr>
+          <w:rFonts w:ascii="Arial" w:cs="Arial" w:eastAsia="Arial" w:hAnsi="Arial"/>
+          <w:color w:val="1B2118"/>
+          <w:sz w:val="21"/>
+          <w:szCs w:val="21"/>
+        </w:rPr>
+        <w:t xml:space="preserve">Premete </w:t>
+      </w:r>
+      <w:r>
+        <w:rPr>
+          <w:rFonts w:ascii="Arial" w:cs="Arial" w:eastAsia="Arial" w:hAnsi="Arial"/>
+          <w:b/>
+          <w:bCs/>
+          <w:color w:val="1B2118"/>
+          <w:sz w:val="21"/>
+          <w:szCs w:val="21"/>
+        </w:rPr>
+        <w:t xml:space="preserve">+ Nuovo modello</w:t>
+      </w:r>
+      <w:r>
+        <w:rPr>
+          <w:rFonts w:ascii="Arial" w:cs="Arial" w:eastAsia="Arial" w:hAnsi="Arial"/>
+          <w:color w:val="1B2118"/>
+          <w:sz w:val="21"/>
+          <w:szCs w:val="21"/>
+        </w:rPr>
+        <w:t xml:space="preserve">.</w:t>
+      </w:r>
+    </w:p>
+    <w:p>
+      <w:pPr>
+        <w:pStyle w:val="ListParagraph"/>
+        <w:numPr>
+          <w:ilvl w:val="0"/>
+          <w:numId w:val="17"/>
+        </w:numPr>
+        <w:spacing w:after="70" w:line="290"/>
+      </w:pPr>
+      <w:r>
+        <w:rPr>
+          <w:rFonts w:ascii="Arial" w:cs="Arial" w:eastAsia="Arial" w:hAnsi="Arial"/>
+          <w:color w:val="1B2118"/>
+          <w:sz w:val="21"/>
+          <w:szCs w:val="21"/>
+        </w:rPr>
+        <w:t xml:space="preserve">Scrivete il </w:t>
+      </w:r>
+      <w:r>
+        <w:rPr>
+          <w:rFonts w:ascii="Arial" w:cs="Arial" w:eastAsia="Arial" w:hAnsi="Arial"/>
+          <w:b/>
+          <w:bCs/>
+          <w:color w:val="1B2118"/>
+          <w:sz w:val="21"/>
+          <w:szCs w:val="21"/>
+        </w:rPr>
+        <w:t xml:space="preserve">Titolo</w:t>
+      </w:r>
+      <w:r>
+        <w:rPr>
+          <w:rFonts w:ascii="Arial" w:cs="Arial" w:eastAsia="Arial" w:hAnsi="Arial"/>
+          <w:color w:val="1B2118"/>
+          <w:sz w:val="21"/>
+          <w:szCs w:val="21"/>
+        </w:rPr>
+        <w:t xml:space="preserve"> (es. «Modulo di adesione») e, se serve, una </w:t>
+      </w:r>
+      <w:r>
+        <w:rPr>
+          <w:rFonts w:ascii="Arial" w:cs="Arial" w:eastAsia="Arial" w:hAnsi="Arial"/>
+          <w:b/>
+          <w:bCs/>
+          <w:color w:val="1B2118"/>
+          <w:sz w:val="21"/>
+          <w:szCs w:val="21"/>
+        </w:rPr>
+        <w:t xml:space="preserve">Descrizione</w:t>
+      </w:r>
+      <w:r>
+        <w:rPr>
+          <w:rFonts w:ascii="Arial" w:cs="Arial" w:eastAsia="Arial" w:hAnsi="Arial"/>
+          <w:color w:val="1B2118"/>
+          <w:sz w:val="21"/>
+          <w:szCs w:val="21"/>
+        </w:rPr>
+        <w:t xml:space="preserve">.</w:t>
+      </w:r>
+    </w:p>
+    <w:p>
+      <w:pPr>
+        <w:pStyle w:val="ListParagraph"/>
+        <w:numPr>
+          <w:ilvl w:val="0"/>
+          <w:numId w:val="17"/>
+        </w:numPr>
+        <w:spacing w:after="70" w:line="290"/>
+      </w:pPr>
+      <w:r>
+        <w:rPr>
+          <w:rFonts w:ascii="Arial" w:cs="Arial" w:eastAsia="Arial" w:hAnsi="Arial"/>
+          <w:color w:val="1B2118"/>
+          <w:sz w:val="21"/>
+          <w:szCs w:val="21"/>
+        </w:rPr>
+        <w:t xml:space="preserve">In </w:t>
+      </w:r>
+      <w:r>
+        <w:rPr>
+          <w:rFonts w:ascii="Arial" w:cs="Arial" w:eastAsia="Arial" w:hAnsi="Arial"/>
+          <w:b/>
+          <w:bCs/>
+          <w:color w:val="1B2118"/>
+          <w:sz w:val="21"/>
+          <w:szCs w:val="21"/>
+        </w:rPr>
+        <w:t xml:space="preserve">Dove compare</w:t>
+      </w:r>
+      <w:r>
+        <w:rPr>
+          <w:rFonts w:ascii="Arial" w:cs="Arial" w:eastAsia="Arial" w:hAnsi="Arial"/>
+          <w:color w:val="1B2118"/>
+          <w:sz w:val="21"/>
+          <w:szCs w:val="21"/>
+        </w:rPr>
+        <w:t xml:space="preserve"> scegliete una fase (il modello comparirà dentro quella fase in ogni pratica, sotto «Modelli da scaricare») oppure </w:t>
+      </w:r>
+      <w:r>
+        <w:rPr>
+          <w:rFonts w:ascii="Arial" w:cs="Arial" w:eastAsia="Arial" w:hAnsi="Arial"/>
+          <w:b/>
+          <w:bCs/>
+          <w:color w:val="1B2118"/>
+          <w:sz w:val="21"/>
+          <w:szCs w:val="21"/>
+        </w:rPr>
+        <w:t xml:space="preserve">Generale</w:t>
+      </w:r>
+      <w:r>
+        <w:rPr>
+          <w:rFonts w:ascii="Arial" w:cs="Arial" w:eastAsia="Arial" w:hAnsi="Arial"/>
+          <w:color w:val="1B2118"/>
+          <w:sz w:val="21"/>
+          <w:szCs w:val="21"/>
+        </w:rPr>
+        <w:t xml:space="preserve"> (comparirà nella pagina «I tuoi documenti» dei Comuni).</w:t>
+      </w:r>
+    </w:p>
+    <w:p>
+      <w:pPr>
+        <w:pStyle w:val="ListParagraph"/>
+        <w:numPr>
+          <w:ilvl w:val="0"/>
+          <w:numId w:val="17"/>
+        </w:numPr>
+        <w:spacing w:after="70" w:line="290"/>
+      </w:pPr>
+      <w:r>
+        <w:rPr>
+          <w:rFonts w:ascii="Arial" w:cs="Arial" w:eastAsia="Arial" w:hAnsi="Arial"/>
+          <w:color w:val="1B2118"/>
+          <w:sz w:val="21"/>
+          <w:szCs w:val="21"/>
+        </w:rPr>
+        <w:t xml:space="preserve">Scegliete il </w:t>
+      </w:r>
+      <w:r>
+        <w:rPr>
+          <w:rFonts w:ascii="Arial" w:cs="Arial" w:eastAsia="Arial" w:hAnsi="Arial"/>
+          <w:b/>
+          <w:bCs/>
+          <w:color w:val="1B2118"/>
+          <w:sz w:val="21"/>
+          <w:szCs w:val="21"/>
+        </w:rPr>
+        <w:t xml:space="preserve">File</w:t>
+      </w:r>
+      <w:r>
+        <w:rPr>
+          <w:rFonts w:ascii="Arial" w:cs="Arial" w:eastAsia="Arial" w:hAnsi="Arial"/>
+          <w:color w:val="1B2118"/>
+          <w:sz w:val="21"/>
+          <w:szCs w:val="21"/>
+        </w:rPr>
+        <w:t xml:space="preserve"> (stessi formati e limiti dei documenti) e premete </w:t>
+      </w:r>
+      <w:r>
+        <w:rPr>
+          <w:rFonts w:ascii="Arial" w:cs="Arial" w:eastAsia="Arial" w:hAnsi="Arial"/>
+          <w:b/>
+          <w:bCs/>
+          <w:color w:val="1B2118"/>
+          <w:sz w:val="21"/>
+          <w:szCs w:val="21"/>
+        </w:rPr>
+        <w:t xml:space="preserve">Carica e pubblica</w:t>
+      </w:r>
+      <w:r>
+        <w:rPr>
+          <w:rFonts w:ascii="Arial" w:cs="Arial" w:eastAsia="Arial" w:hAnsi="Arial"/>
+          <w:color w:val="1B2118"/>
+          <w:sz w:val="21"/>
+          <w:szCs w:val="21"/>
+        </w:rPr>
+        <w:t xml:space="preserve">.</w:t>
+      </w:r>
+    </w:p>
+    <w:p>
+      <w:pPr>
+        <w:spacing w:after="60"/>
+      </w:pPr>
+    </w:p>
+    <w:p>
+      <w:pPr>
+        <w:spacing w:after="140" w:line="300"/>
+      </w:pPr>
+      <w:r>
+        <w:rPr>
+          <w:rFonts w:ascii="Arial" w:cs="Arial" w:eastAsia="Arial" w:hAnsi="Arial"/>
+          <w:color w:val="1B2118"/>
+          <w:sz w:val="21"/>
+          <w:szCs w:val="21"/>
+        </w:rPr>
+        <w:t xml:space="preserve">Per aggiornare un modello caricate la nuova versione e premete </w:t>
+      </w:r>
+      <w:r>
+        <w:rPr>
+          <w:rFonts w:ascii="Arial" w:cs="Arial" w:eastAsia="Arial" w:hAnsi="Arial"/>
+          <w:b/>
+          <w:bCs/>
+          <w:color w:val="1B2118"/>
+          <w:sz w:val="21"/>
+          <w:szCs w:val="21"/>
+        </w:rPr>
+        <w:t xml:space="preserve">Ritira</w:t>
+      </w:r>
+      <w:r>
+        <w:rPr>
+          <w:rFonts w:ascii="Arial" w:cs="Arial" w:eastAsia="Arial" w:hAnsi="Arial"/>
+          <w:color w:val="1B2118"/>
+          <w:sz w:val="21"/>
+          <w:szCs w:val="21"/>
+        </w:rPr>
+        <w:t xml:space="preserve"> su quella vecchia: i file non si sovrascrivono. Un modello ritirato si può ripubblicare con </w:t>
+      </w:r>
+      <w:r>
+        <w:rPr>
+          <w:rFonts w:ascii="Arial" w:cs="Arial" w:eastAsia="Arial" w:hAnsi="Arial"/>
+          <w:b/>
+          <w:bCs/>
+          <w:color w:val="1B2118"/>
+          <w:sz w:val="21"/>
+          <w:szCs w:val="21"/>
+        </w:rPr>
+        <w:t xml:space="preserve">Ripubblica</w:t>
+      </w:r>
+      <w:r>
+        <w:rPr>
+          <w:rFonts w:ascii="Arial" w:cs="Arial" w:eastAsia="Arial" w:hAnsi="Arial"/>
+          <w:color w:val="1B2118"/>
+          <w:sz w:val="21"/>
+          <w:szCs w:val="21"/>
+        </w:rPr>
+        <w:t xml:space="preserve">. Ogni operazione è registrata nell'audit.</w:t>
       </w:r>
     </w:p>
     <w:p>
@@ -11362,7 +12980,7 @@
         </w:pBdr>
         <w:spacing w:after="240" w:before="0"/>
       </w:pPr>
-      <w:bookmarkStart w:name="cap15" w:id="1"/>
+      <w:bookmarkStart w:name="cap16" w:id="1"/>
       <w:r>
         <w:rPr>
           <w:rFonts w:ascii="Arial" w:cs="Arial" w:eastAsia="Arial" w:hAnsi="Arial"/>
@@ -11372,7 +12990,7 @@
           <w:sz w:val="34"/>
           <w:szCs w:val="34"/>
         </w:rPr>
-        <w:t xml:space="preserve">15. Calcolo dei crediti CWP</w:t>
+        <w:t xml:space="preserve">16. Calcolo dei crediti CWP</w:t>
       </w:r>
       <w:bookmarkEnd w:id="1"/>
     </w:p>
@@ -12963,7 +14581,7 @@
         <w:pStyle w:val="ListParagraph"/>
         <w:numPr>
           <w:ilvl w:val="0"/>
-          <w:numId w:val="15"/>
+          <w:numId w:val="18"/>
         </w:numPr>
         <w:spacing w:after="70" w:line="290"/>
       </w:pPr>
@@ -13002,7 +14620,7 @@
         <w:pStyle w:val="ListParagraph"/>
         <w:numPr>
           <w:ilvl w:val="0"/>
-          <w:numId w:val="15"/>
+          <w:numId w:val="18"/>
         </w:numPr>
         <w:spacing w:after="70" w:line="290"/>
       </w:pPr>
@@ -13041,7 +14659,7 @@
         <w:pStyle w:val="ListParagraph"/>
         <w:numPr>
           <w:ilvl w:val="0"/>
-          <w:numId w:val="15"/>
+          <w:numId w:val="18"/>
         </w:numPr>
         <w:spacing w:after="70" w:line="290"/>
       </w:pPr>
@@ -13180,7 +14798,7 @@
         <w:pStyle w:val="ListParagraph"/>
         <w:numPr>
           <w:ilvl w:val="0"/>
-          <w:numId w:val="15"/>
+          <w:numId w:val="18"/>
         </w:numPr>
         <w:spacing w:after="70" w:line="290"/>
       </w:pPr>
@@ -13219,7 +14837,7 @@
         <w:pStyle w:val="ListParagraph"/>
         <w:numPr>
           <w:ilvl w:val="0"/>
-          <w:numId w:val="15"/>
+          <w:numId w:val="18"/>
         </w:numPr>
         <w:spacing w:after="70" w:line="290"/>
       </w:pPr>
@@ -14946,7 +16564,7 @@
         <w:pStyle w:val="ListParagraph"/>
         <w:numPr>
           <w:ilvl w:val="0"/>
-          <w:numId w:val="16"/>
+          <w:numId w:val="19"/>
         </w:numPr>
         <w:spacing w:after="70" w:line="290"/>
       </w:pPr>
@@ -14985,7 +16603,7 @@
         <w:pStyle w:val="ListParagraph"/>
         <w:numPr>
           <w:ilvl w:val="0"/>
-          <w:numId w:val="16"/>
+          <w:numId w:val="19"/>
         </w:numPr>
         <w:spacing w:after="70" w:line="290"/>
       </w:pPr>
@@ -15024,7 +16642,7 @@
         <w:pStyle w:val="ListParagraph"/>
         <w:numPr>
           <w:ilvl w:val="0"/>
-          <w:numId w:val="16"/>
+          <w:numId w:val="19"/>
         </w:numPr>
         <w:spacing w:after="70" w:line="290"/>
       </w:pPr>
@@ -15844,7 +17462,7 @@
         </w:pBdr>
         <w:spacing w:after="240" w:before="0"/>
       </w:pPr>
-      <w:bookmarkStart w:name="cap16" w:id="1"/>
+      <w:bookmarkStart w:name="cap17" w:id="1"/>
       <w:r>
         <w:rPr>
           <w:rFonts w:ascii="Arial" w:cs="Arial" w:eastAsia="Arial" w:hAnsi="Arial"/>
@@ -15854,7 +17472,7 @@
           <w:sz w:val="34"/>
           <w:szCs w:val="34"/>
         </w:rPr>
-        <w:t xml:space="preserve">16. Documentazione e manuali</w:t>
+        <w:t xml:space="preserve">17. Documentazione e manuali</w:t>
       </w:r>
       <w:bookmarkEnd w:id="1"/>
     </w:p>
@@ -15926,9 +17544,9 @@
         <w:tblLayout w:type="fixed"/>
       </w:tblPr>
       <w:tblGrid>
-        <w:gridCol w:w="2136"/>
+        <w:gridCol w:w="2064"/>
         <w:gridCol w:w="2010"/>
-        <w:gridCol w:w="5492"/>
+        <w:gridCol w:w="5564"/>
       </w:tblGrid>
       <w:tr>
         <w:trPr>
@@ -15936,7 +17554,7 @@
         </w:trPr>
         <w:tc>
           <w:tcPr>
-            <w:tcW w:type="dxa" w:w="2136"/>
+            <w:tcW w:type="dxa" w:w="2064"/>
             <w:tcBorders>
               <w:top w:val="single" w:color="D9D4C5" w:sz="4"/>
               <w:left w:val="single" w:color="D9D4C5" w:sz="4"/>
@@ -16006,7 +17624,7 @@
         </w:tc>
         <w:tc>
           <w:tcPr>
-            <w:tcW w:type="dxa" w:w="5492"/>
+            <w:tcW w:type="dxa" w:w="5564"/>
             <w:tcBorders>
               <w:top w:val="single" w:color="D9D4C5" w:sz="4"/>
               <w:left w:val="single" w:color="D9D4C5" w:sz="4"/>
@@ -16046,7 +17664,7 @@
         </w:trPr>
         <w:tc>
           <w:tcPr>
-            <w:tcW w:type="dxa" w:w="2136"/>
+            <w:tcW w:type="dxa" w:w="2064"/>
             <w:tcBorders>
               <w:top w:val="single" w:color="D9D4C5" w:sz="4"/>
               <w:left w:val="single" w:color="D9D4C5" w:sz="4"/>
@@ -16110,7 +17728,7 @@
         </w:tc>
         <w:tc>
           <w:tcPr>
-            <w:tcW w:type="dxa" w:w="5492"/>
+            <w:tcW w:type="dxa" w:w="5564"/>
             <w:tcBorders>
               <w:top w:val="single" w:color="D9D4C5" w:sz="4"/>
               <w:left w:val="single" w:color="D9D4C5" w:sz="4"/>
@@ -16147,7 +17765,7 @@
         </w:trPr>
         <w:tc>
           <w:tcPr>
-            <w:tcW w:type="dxa" w:w="2136"/>
+            <w:tcW w:type="dxa" w:w="2064"/>
             <w:tcBorders>
               <w:top w:val="single" w:color="D9D4C5" w:sz="4"/>
               <w:left w:val="single" w:color="D9D4C5" w:sz="4"/>
@@ -16213,7 +17831,7 @@
         </w:tc>
         <w:tc>
           <w:tcPr>
-            <w:tcW w:type="dxa" w:w="5492"/>
+            <w:tcW w:type="dxa" w:w="5564"/>
             <w:tcBorders>
               <w:top w:val="single" w:color="D9D4C5" w:sz="4"/>
               <w:left w:val="single" w:color="D9D4C5" w:sz="4"/>
@@ -16251,7 +17869,7 @@
         </w:trPr>
         <w:tc>
           <w:tcPr>
-            <w:tcW w:type="dxa" w:w="2136"/>
+            <w:tcW w:type="dxa" w:w="2064"/>
             <w:tcBorders>
               <w:top w:val="single" w:color="D9D4C5" w:sz="4"/>
               <w:left w:val="single" w:color="D9D4C5" w:sz="4"/>
@@ -16277,6 +17895,108 @@
                 <w:sz w:val="18"/>
                 <w:szCs w:val="18"/>
               </w:rPr>
+              <w:t xml:space="preserve">Manuale Test</w:t>
+            </w:r>
+          </w:p>
+        </w:tc>
+        <w:tc>
+          <w:tcPr>
+            <w:tcW w:type="dxa" w:w="2010"/>
+            <w:tcBorders>
+              <w:top w:val="single" w:color="D9D4C5" w:sz="4"/>
+              <w:left w:val="single" w:color="D9D4C5" w:sz="4"/>
+              <w:bottom w:val="single" w:color="D9D4C5" w:sz="4"/>
+              <w:right w:val="single" w:color="D9D4C5" w:sz="4"/>
+            </w:tcBorders>
+            <w:tcMar>
+              <w:top w:type="dxa" w:w="70"/>
+              <w:left w:type="dxa" w:w="110"/>
+              <w:bottom w:type="dxa" w:w="70"/>
+              <w:right w:type="dxa" w:w="110"/>
+            </w:tcMar>
+            <w:vAlign w:val="center"/>
+          </w:tcPr>
+          <w:p>
+            <w:pPr>
+              <w:spacing w:after="0" w:before="0"/>
+            </w:pPr>
+            <w:r>
+              <w:rPr>
+                <w:rFonts w:ascii="Arial" w:cs="Arial" w:eastAsia="Arial" w:hAnsi="Arial"/>
+                <w:color w:val="1B2118"/>
+                <w:sz w:val="18"/>
+                <w:szCs w:val="18"/>
+              </w:rPr>
+              <w:t xml:space="preserve">solo Amministratori</w:t>
+            </w:r>
+          </w:p>
+        </w:tc>
+        <w:tc>
+          <w:tcPr>
+            <w:tcW w:type="dxa" w:w="5564"/>
+            <w:tcBorders>
+              <w:top w:val="single" w:color="D9D4C5" w:sz="4"/>
+              <w:left w:val="single" w:color="D9D4C5" w:sz="4"/>
+              <w:bottom w:val="single" w:color="D9D4C5" w:sz="4"/>
+              <w:right w:val="single" w:color="D9D4C5" w:sz="4"/>
+            </w:tcBorders>
+            <w:tcMar>
+              <w:top w:type="dxa" w:w="70"/>
+              <w:left w:type="dxa" w:w="110"/>
+              <w:bottom w:type="dxa" w:w="70"/>
+              <w:right w:type="dxa" w:w="110"/>
+            </w:tcMar>
+            <w:vAlign w:val="center"/>
+          </w:tcPr>
+          <w:p>
+            <w:pPr>
+              <w:spacing w:after="0" w:before="0"/>
+            </w:pPr>
+            <w:r>
+              <w:rPr>
+                <w:rFonts w:ascii="Arial" w:cs="Arial" w:eastAsia="Arial" w:hAnsi="Arial"/>
+                <w:color w:val="1B2118"/>
+                <w:sz w:val="18"/>
+                <w:szCs w:val="18"/>
+              </w:rPr>
+              <w:t xml:space="preserve">Guida sintetica per chi collauda il portale: metodo CWP, ruolo del portale, percorso di prova con i risultati attesi</w:t>
+            </w:r>
+          </w:p>
+        </w:tc>
+      </w:tr>
+      <w:tr>
+        <w:trPr>
+          <w:cantSplit/>
+        </w:trPr>
+        <w:tc>
+          <w:tcPr>
+            <w:tcW w:type="dxa" w:w="2064"/>
+            <w:tcBorders>
+              <w:top w:val="single" w:color="D9D4C5" w:sz="4"/>
+              <w:left w:val="single" w:color="D9D4C5" w:sz="4"/>
+              <w:bottom w:val="single" w:color="D9D4C5" w:sz="4"/>
+              <w:right w:val="single" w:color="D9D4C5" w:sz="4"/>
+            </w:tcBorders>
+            <w:shd w:fill="F6F4EE" w:color="auto" w:val="clear"/>
+            <w:tcMar>
+              <w:top w:type="dxa" w:w="70"/>
+              <w:left w:type="dxa" w:w="110"/>
+              <w:bottom w:type="dxa" w:w="70"/>
+              <w:right w:type="dxa" w:w="110"/>
+            </w:tcMar>
+            <w:vAlign w:val="center"/>
+          </w:tcPr>
+          <w:p>
+            <w:pPr>
+              <w:spacing w:after="0" w:before="0"/>
+            </w:pPr>
+            <w:r>
+              <w:rPr>
+                <w:rFonts w:ascii="Arial" w:cs="Arial" w:eastAsia="Arial" w:hAnsi="Arial"/>
+                <w:color w:val="1B2118"/>
+                <w:sz w:val="18"/>
+                <w:szCs w:val="18"/>
+              </w:rPr>
               <w:t xml:space="preserve">Registro sviluppo e deploy</w:t>
             </w:r>
           </w:p>
@@ -16290,6 +18010,7 @@
               <w:bottom w:val="single" w:color="D9D4C5" w:sz="4"/>
               <w:right w:val="single" w:color="D9D4C5" w:sz="4"/>
             </w:tcBorders>
+            <w:shd w:fill="F6F4EE" w:color="auto" w:val="clear"/>
             <w:tcMar>
               <w:top w:type="dxa" w:w="70"/>
               <w:left w:type="dxa" w:w="110"/>
@@ -16315,13 +18036,14 @@
         </w:tc>
         <w:tc>
           <w:tcPr>
-            <w:tcW w:type="dxa" w:w="5492"/>
-            <w:tcBorders>
-              <w:top w:val="single" w:color="D9D4C5" w:sz="4"/>
-              <w:left w:val="single" w:color="D9D4C5" w:sz="4"/>
-              <w:bottom w:val="single" w:color="D9D4C5" w:sz="4"/>
-              <w:right w:val="single" w:color="D9D4C5" w:sz="4"/>
-            </w:tcBorders>
+            <w:tcW w:type="dxa" w:w="5564"/>
+            <w:tcBorders>
+              <w:top w:val="single" w:color="D9D4C5" w:sz="4"/>
+              <w:left w:val="single" w:color="D9D4C5" w:sz="4"/>
+              <w:bottom w:val="single" w:color="D9D4C5" w:sz="4"/>
+              <w:right w:val="single" w:color="D9D4C5" w:sz="4"/>
+            </w:tcBorders>
+            <w:shd w:fill="F6F4EE" w:color="auto" w:val="clear"/>
             <w:tcMar>
               <w:top w:type="dxa" w:w="70"/>
               <w:left w:type="dxa" w:w="110"/>
@@ -16403,7 +18125,7 @@
           <w:sz w:val="21"/>
           <w:szCs w:val="21"/>
         </w:rPr>
-        <w:t xml:space="preserve">. Ogni documento riporta in copertina il numero di revisione e la data; a ogni nuova funzione i manuali e il registro vengono aggiornati insieme.</w:t>
+        <w:t xml:space="preserve">. Ogni documento riporta in copertina il numero di revisione e la data; a ogni nuova funzione i tre manuali e il registro vengono aggiornati insieme.</w:t>
       </w:r>
     </w:p>
     <w:p>
@@ -16415,7 +18137,7 @@
         </w:pBdr>
         <w:spacing w:after="240" w:before="0"/>
       </w:pPr>
-      <w:bookmarkStart w:name="cap17" w:id="1"/>
+      <w:bookmarkStart w:name="cap18" w:id="1"/>
       <w:r>
         <w:rPr>
           <w:rFonts w:ascii="Arial" w:cs="Arial" w:eastAsia="Arial" w:hAnsi="Arial"/>
@@ -16425,7 +18147,7 @@
           <w:sz w:val="34"/>
           <w:szCs w:val="34"/>
         </w:rPr>
-        <w:t xml:space="preserve">17. Manutenzione ed emergenze</w:t>
+        <w:t xml:space="preserve">18. Manutenzione ed emergenze</w:t>
       </w:r>
       <w:bookmarkEnd w:id="1"/>
     </w:p>
@@ -17332,7 +19054,7 @@
         </w:pBdr>
         <w:spacing w:after="240" w:before="0"/>
       </w:pPr>
-      <w:bookmarkStart w:name="cap18" w:id="1"/>
+      <w:bookmarkStart w:name="cap19" w:id="1"/>
       <w:r>
         <w:rPr>
           <w:rFonts w:ascii="Arial" w:cs="Arial" w:eastAsia="Arial" w:hAnsi="Arial"/>
@@ -17342,7 +19064,7 @@
           <w:sz w:val="34"/>
           <w:szCs w:val="34"/>
         </w:rPr>
-        <w:t xml:space="preserve">18. Funzioni in arrivo</w:t>
+        <w:t xml:space="preserve">19. Funzioni in arrivo</w:t>
       </w:r>
       <w:bookmarkEnd w:id="1"/>
     </w:p>
@@ -17358,66 +19080,6 @@
           <w:szCs w:val="21"/>
         </w:rPr>
         <w:t xml:space="preserve">Questo manuale descrive il portale alla data della revisione indicata in copertina. Sono in sviluppo, e saranno aggiunte qui quando disponibili:</w:t>
-      </w:r>
-    </w:p>
-    <w:p>
-      <w:pPr>
-        <w:pStyle w:val="ListParagraph"/>
-        <w:numPr>
-          <w:ilvl w:val="0"/>
-          <w:numId w:val="2"/>
-        </w:numPr>
-        <w:spacing w:after="70" w:line="290"/>
-      </w:pPr>
-      <w:r>
-        <w:rPr>
-          <w:rFonts w:ascii="Arial" w:cs="Arial" w:eastAsia="Arial" w:hAnsi="Arial"/>
-          <w:b/>
-          <w:bCs/>
-          <w:color w:val="1B2118"/>
-          <w:sz w:val="21"/>
-          <w:szCs w:val="21"/>
-        </w:rPr>
-        <w:t xml:space="preserve">Pratiche:</w:t>
-      </w:r>
-      <w:r>
-        <w:rPr>
-          <w:rFonts w:ascii="Arial" w:cs="Arial" w:eastAsia="Arial" w:hAnsi="Arial"/>
-          <w:color w:val="1B2118"/>
-          <w:sz w:val="21"/>
-          <w:szCs w:val="21"/>
-        </w:rPr>
-        <w:t xml:space="preserve"> note di fase, anagrafica degli Enti di Validazione, modelli di documento scaricabili dai Comuni, messaggi tra Comune e Fondazione nella pratica, pagamenti visibili al Comune in sola lettura.</w:t>
-      </w:r>
-    </w:p>
-    <w:p>
-      <w:pPr>
-        <w:pStyle w:val="ListParagraph"/>
-        <w:numPr>
-          <w:ilvl w:val="0"/>
-          <w:numId w:val="2"/>
-        </w:numPr>
-        <w:spacing w:after="70" w:line="290"/>
-      </w:pPr>
-      <w:r>
-        <w:rPr>
-          <w:rFonts w:ascii="Arial" w:cs="Arial" w:eastAsia="Arial" w:hAnsi="Arial"/>
-          <w:b/>
-          <w:bCs/>
-          <w:color w:val="1B2118"/>
-          <w:sz w:val="21"/>
-          <w:szCs w:val="21"/>
-        </w:rPr>
-        <w:t xml:space="preserve">Consultazione pubblica:</w:t>
-      </w:r>
-      <w:r>
-        <w:rPr>
-          <w:rFonts w:ascii="Arial" w:cs="Arial" w:eastAsia="Arial" w:hAnsi="Arial"/>
-          <w:color w:val="1B2118"/>
-          <w:sz w:val="21"/>
-          <w:szCs w:val="21"/>
-        </w:rPr>
-        <w:t xml:space="preserve"> pagina pubblica con conferma dell'email di chi commenta, errata corrige con eventuale ripartenza dei 30 giorni, allegati alle osservazioni.</w:t>
       </w:r>
     </w:p>
     <w:p>
@@ -17779,7 +19441,7 @@
         <w:szCs w:val="16"/>
       </w:rPr>
       <w:tab/>
-      <w:t xml:space="preserve">Manuale Amministratore · Rev. 1.0 · 18/10/2026</w:t>
+      <w:t xml:space="preserve">Manuale Amministratore · Rev. 1.1 · 18/10/2026</w:t>
     </w:r>
   </w:p>
 </w:hdr>
@@ -17844,7 +19506,7 @@
         <w:szCs w:val="16"/>
       </w:rPr>
       <w:tab/>
-      <w:t xml:space="preserve">Manuale Amministratore · Rev. 1.0 · 18/10/2026</w:t>
+      <w:t xml:space="preserve">Manuale Amministratore · Rev. 1.1 · 18/10/2026</w:t>
     </w:r>
   </w:p>
 </w:hdr>
@@ -18071,6 +19733,24 @@
     </w:lvlOverride>
   </w:num>
   <w:num w:numId="16">
+    <w:abstractNumId w:val="3"/>
+    <w:lvlOverride w:ilvl="0">
+      <w:startOverride w:val="1"/>
+    </w:lvlOverride>
+  </w:num>
+  <w:num w:numId="17">
+    <w:abstractNumId w:val="3"/>
+    <w:lvlOverride w:ilvl="0">
+      <w:startOverride w:val="1"/>
+    </w:lvlOverride>
+  </w:num>
+  <w:num w:numId="18">
+    <w:abstractNumId w:val="3"/>
+    <w:lvlOverride w:ilvl="0">
+      <w:startOverride w:val="1"/>
+    </w:lvlOverride>
+  </w:num>
+  <w:num w:numId="19">
     <w:abstractNumId w:val="3"/>
     <w:lvlOverride w:ilvl="0">
       <w:startOverride w:val="1"/>

</xml_diff>

<commit_message>
Registro 1.6, Manuale Utente 1.7, Amministratore 1.2, Test 1.2: import del tracciato
Co-Authored-By: Claude Opus 5.5 <noreply@anthropic.com>
Claude-Session: https://claude.ai/code/session_01E8XCbEeVHWVP3hntUZ6kZ1
</commit_message>
<xml_diff>
--- a/public/documentazione/Manuale_Amministratore_Portale_CWP.docx
+++ b/public/documentazione/Manuale_Amministratore_Portale_CWP.docx
@@ -302,7 +302,7 @@
                 <w:sz w:val="20"/>
                 <w:szCs w:val="20"/>
               </w:rPr>
-              <w:t xml:space="preserve">Rev. 1.1</w:t>
+              <w:t xml:space="preserve">Rev. 1.2</w:t>
             </w:r>
           </w:p>
         </w:tc>
@@ -719,7 +719,7 @@
                 <w:sz w:val="18"/>
                 <w:szCs w:val="18"/>
               </w:rPr>
-              <w:t xml:space="preserve">1.1</w:t>
+              <w:t xml:space="preserve">1.2</w:t>
             </w:r>
           </w:p>
         </w:tc>
@@ -783,7 +783,7 @@
                 <w:sz w:val="18"/>
                 <w:szCs w:val="18"/>
               </w:rPr>
-              <w:t xml:space="preserve">Note di fase, Ente di Validazione della pratica, consultazione sulla pagina pubblica con conferma dell'email, moderazione con autori e allegati, errata corrige; nuovo capitolo Messaggi con il Comune; pagamenti visibili al Comune; Impostazioni: Enti di Validazione e Modelli di documento; notifiche aggiornate.</w:t>
+              <w:t xml:space="preserve">Calcolo crediti: importare il tracciato nel calcolo (dai documenti della pratica o dal computer), singole letture, blocco dei dati personali, controlli di coerenza.</w:t>
             </w:r>
           </w:p>
         </w:tc>
@@ -853,6 +853,142 @@
                 <w:sz w:val="18"/>
                 <w:szCs w:val="18"/>
               </w:rPr>
+              <w:t xml:space="preserve">1.1</w:t>
+            </w:r>
+          </w:p>
+        </w:tc>
+        <w:tc>
+          <w:tcPr>
+            <w:tcW w:type="dxa" w:w="1300"/>
+            <w:tcBorders>
+              <w:top w:val="single" w:color="D9D4C5" w:sz="4"/>
+              <w:left w:val="single" w:color="D9D4C5" w:sz="4"/>
+              <w:bottom w:val="single" w:color="D9D4C5" w:sz="4"/>
+              <w:right w:val="single" w:color="D9D4C5" w:sz="4"/>
+            </w:tcBorders>
+            <w:shd w:fill="F6F4EE" w:color="auto" w:val="clear"/>
+            <w:tcMar>
+              <w:top w:type="dxa" w:w="70"/>
+              <w:left w:type="dxa" w:w="110"/>
+              <w:bottom w:type="dxa" w:w="70"/>
+              <w:right w:type="dxa" w:w="110"/>
+            </w:tcMar>
+            <w:vAlign w:val="center"/>
+          </w:tcPr>
+          <w:p>
+            <w:pPr>
+              <w:spacing w:after="0" w:before="0"/>
+            </w:pPr>
+            <w:r>
+              <w:rPr>
+                <w:rFonts w:ascii="Arial" w:cs="Arial" w:eastAsia="Arial" w:hAnsi="Arial"/>
+                <w:color w:val="1B2118"/>
+                <w:sz w:val="18"/>
+                <w:szCs w:val="18"/>
+              </w:rPr>
+              <w:t xml:space="preserve">18/10/2026</w:t>
+            </w:r>
+          </w:p>
+        </w:tc>
+        <w:tc>
+          <w:tcPr>
+            <w:tcW w:type="dxa" w:w="5538"/>
+            <w:tcBorders>
+              <w:top w:val="single" w:color="D9D4C5" w:sz="4"/>
+              <w:left w:val="single" w:color="D9D4C5" w:sz="4"/>
+              <w:bottom w:val="single" w:color="D9D4C5" w:sz="4"/>
+              <w:right w:val="single" w:color="D9D4C5" w:sz="4"/>
+            </w:tcBorders>
+            <w:shd w:fill="F6F4EE" w:color="auto" w:val="clear"/>
+            <w:tcMar>
+              <w:top w:type="dxa" w:w="70"/>
+              <w:left w:type="dxa" w:w="110"/>
+              <w:bottom w:type="dxa" w:w="70"/>
+              <w:right w:type="dxa" w:w="110"/>
+            </w:tcMar>
+            <w:vAlign w:val="center"/>
+          </w:tcPr>
+          <w:p>
+            <w:pPr>
+              <w:spacing w:after="0" w:before="0"/>
+            </w:pPr>
+            <w:r>
+              <w:rPr>
+                <w:rFonts w:ascii="Arial" w:cs="Arial" w:eastAsia="Arial" w:hAnsi="Arial"/>
+                <w:color w:val="1B2118"/>
+                <w:sz w:val="18"/>
+                <w:szCs w:val="18"/>
+              </w:rPr>
+              <w:t xml:space="preserve">Note di fase, Ente di Validazione della pratica, consultazione sulla pagina pubblica con conferma dell'email, moderazione con autori e allegati, errata corrige; nuovo capitolo Messaggi con il Comune; pagamenti visibili al Comune; Impostazioni: Enti di Validazione e Modelli di documento; notifiche aggiornate.</w:t>
+            </w:r>
+          </w:p>
+        </w:tc>
+        <w:tc>
+          <w:tcPr>
+            <w:tcW w:type="dxa" w:w="2000"/>
+            <w:tcBorders>
+              <w:top w:val="single" w:color="D9D4C5" w:sz="4"/>
+              <w:left w:val="single" w:color="D9D4C5" w:sz="4"/>
+              <w:bottom w:val="single" w:color="D9D4C5" w:sz="4"/>
+              <w:right w:val="single" w:color="D9D4C5" w:sz="4"/>
+            </w:tcBorders>
+            <w:shd w:fill="F6F4EE" w:color="auto" w:val="clear"/>
+            <w:tcMar>
+              <w:top w:type="dxa" w:w="70"/>
+              <w:left w:type="dxa" w:w="110"/>
+              <w:bottom w:type="dxa" w:w="70"/>
+              <w:right w:type="dxa" w:w="110"/>
+            </w:tcMar>
+            <w:vAlign w:val="center"/>
+          </w:tcPr>
+          <w:p>
+            <w:pPr>
+              <w:spacing w:after="0" w:before="0"/>
+            </w:pPr>
+            <w:r>
+              <w:rPr>
+                <w:rFonts w:ascii="Arial" w:cs="Arial" w:eastAsia="Arial" w:hAnsi="Arial"/>
+                <w:color w:val="1B2118"/>
+                <w:sz w:val="18"/>
+                <w:szCs w:val="18"/>
+              </w:rPr>
+              <w:t xml:space="preserve">Fondazione Operate</w:t>
+            </w:r>
+          </w:p>
+        </w:tc>
+      </w:tr>
+      <w:tr>
+        <w:trPr>
+          <w:cantSplit/>
+        </w:trPr>
+        <w:tc>
+          <w:tcPr>
+            <w:tcW w:type="dxa" w:w="800"/>
+            <w:tcBorders>
+              <w:top w:val="single" w:color="D9D4C5" w:sz="4"/>
+              <w:left w:val="single" w:color="D9D4C5" w:sz="4"/>
+              <w:bottom w:val="single" w:color="D9D4C5" w:sz="4"/>
+              <w:right w:val="single" w:color="D9D4C5" w:sz="4"/>
+            </w:tcBorders>
+            <w:tcMar>
+              <w:top w:type="dxa" w:w="70"/>
+              <w:left w:type="dxa" w:w="110"/>
+              <w:bottom w:type="dxa" w:w="70"/>
+              <w:right w:type="dxa" w:w="110"/>
+            </w:tcMar>
+            <w:vAlign w:val="center"/>
+          </w:tcPr>
+          <w:p>
+            <w:pPr>
+              <w:spacing w:after="0" w:before="0"/>
+            </w:pPr>
+            <w:r>
+              <w:rPr>
+                <w:rFonts w:ascii="Arial" w:cs="Arial" w:eastAsia="Arial" w:hAnsi="Arial"/>
+                <w:color w:val="1B2118"/>
+                <w:sz w:val="18"/>
+                <w:szCs w:val="18"/>
+              </w:rPr>
               <w:t xml:space="preserve">1.0</w:t>
             </w:r>
           </w:p>
@@ -866,7 +1002,6 @@
               <w:bottom w:val="single" w:color="D9D4C5" w:sz="4"/>
               <w:right w:val="single" w:color="D9D4C5" w:sz="4"/>
             </w:tcBorders>
-            <w:shd w:fill="F6F4EE" w:color="auto" w:val="clear"/>
             <w:tcMar>
               <w:top w:type="dxa" w:w="70"/>
               <w:left w:type="dxa" w:w="110"/>
@@ -899,7 +1034,6 @@
               <w:bottom w:val="single" w:color="D9D4C5" w:sz="4"/>
               <w:right w:val="single" w:color="D9D4C5" w:sz="4"/>
             </w:tcBorders>
-            <w:shd w:fill="F6F4EE" w:color="auto" w:val="clear"/>
             <w:tcMar>
               <w:top w:type="dxa" w:w="70"/>
               <w:left w:type="dxa" w:w="110"/>
@@ -932,7 +1066,6 @@
               <w:bottom w:val="single" w:color="D9D4C5" w:sz="4"/>
               <w:right w:val="single" w:color="D9D4C5" w:sz="4"/>
             </w:tcBorders>
-            <w:shd w:fill="F6F4EE" w:color="auto" w:val="clear"/>
             <w:tcMar>
               <w:top w:type="dxa" w:w="70"/>
               <w:left w:type="dxa" w:w="110"/>
@@ -974,7 +1107,7 @@
           <w:sz w:val="20"/>
           <w:szCs w:val="20"/>
         </w:rPr>
-        <w:t xml:space="preserve">Questo documento descrive il portale alla revisione 1.1 del 18/10/2026. A ogni modifica del portale il manuale viene aggiornato e la revisione incrementata; la versione corrente si scarica dall'area Documentazione del portale (solo Amministratori).</w:t>
+        <w:t xml:space="preserve">Questo documento descrive il portale alla revisione 1.2 del 18/10/2026. A ogni modifica del portale il manuale viene aggiornato e la revisione incrementata; la versione corrente si scarica dall'area Documentazione del portale (solo Amministratori).</w:t>
       </w:r>
     </w:p>
     <w:p>
@@ -1490,7 +1623,7 @@
             <w:szCs w:val="22"/>
           </w:rPr>
           <w:tab/>
-          <w:t xml:space="preserve">25</w:t>
+          <w:t xml:space="preserve">26</w:t>
         </w:r>
       </w:hyperlink>
     </w:p>
@@ -1519,7 +1652,7 @@
             <w:szCs w:val="22"/>
           </w:rPr>
           <w:tab/>
-          <w:t xml:space="preserve">26</w:t>
+          <w:t xml:space="preserve">27</w:t>
         </w:r>
       </w:hyperlink>
     </w:p>
@@ -1548,7 +1681,7 @@
             <w:szCs w:val="22"/>
           </w:rPr>
           <w:tab/>
-          <w:t xml:space="preserve">27</w:t>
+          <w:t xml:space="preserve">28</w:t>
         </w:r>
       </w:hyperlink>
     </w:p>
@@ -2875,7 +3008,7 @@
         </w:rPr>
         <w:t xml:space="preserve">Si accede da </w:t>
       </w:r>
-      <w:hyperlink w:history="1" r:id="rIddn-bxg0vzp5qamcmemdcx">
+      <w:hyperlink w:history="1" r:id="rIdbav2ewf2ynelsws-wk159">
         <w:r>
           <w:rPr>
             <w:rFonts w:ascii="Arial" w:cs="Arial" w:eastAsia="Arial" w:hAnsi="Arial"/>
@@ -13955,8 +14088,8 @@
         <w:tblLayout w:type="fixed"/>
       </w:tblPr>
       <w:tblGrid>
-        <w:gridCol w:w="4777"/>
-        <w:gridCol w:w="4861"/>
+        <w:gridCol w:w="3715"/>
+        <w:gridCol w:w="5923"/>
       </w:tblGrid>
       <w:tr>
         <w:trPr>
@@ -13964,7 +14097,7 @@
         </w:trPr>
         <w:tc>
           <w:tcPr>
-            <w:tcW w:type="dxa" w:w="4777"/>
+            <w:tcW w:type="dxa" w:w="3715"/>
             <w:tcBorders>
               <w:top w:val="single" w:color="D9D4C5" w:sz="4"/>
               <w:left w:val="single" w:color="D9D4C5" w:sz="4"/>
@@ -13999,7 +14132,7 @@
         </w:tc>
         <w:tc>
           <w:tcPr>
-            <w:tcW w:type="dxa" w:w="4861"/>
+            <w:tcW w:type="dxa" w:w="5923"/>
             <w:tcBorders>
               <w:top w:val="single" w:color="D9D4C5" w:sz="4"/>
               <w:left w:val="single" w:color="D9D4C5" w:sz="4"/>
@@ -14039,7 +14172,7 @@
         </w:trPr>
         <w:tc>
           <w:tcPr>
-            <w:tcW w:type="dxa" w:w="4777"/>
+            <w:tcW w:type="dxa" w:w="3715"/>
             <w:tcBorders>
               <w:top w:val="single" w:color="D9D4C5" w:sz="4"/>
               <w:left w:val="single" w:color="D9D4C5" w:sz="4"/>
@@ -14071,7 +14204,7 @@
         </w:tc>
         <w:tc>
           <w:tcPr>
-            <w:tcW w:type="dxa" w:w="4861"/>
+            <w:tcW w:type="dxa" w:w="5923"/>
             <w:tcBorders>
               <w:top w:val="single" w:color="D9D4C5" w:sz="4"/>
               <w:left w:val="single" w:color="D9D4C5" w:sz="4"/>
@@ -14097,7 +14230,7 @@
                 <w:sz w:val="18"/>
                 <w:szCs w:val="18"/>
               </w:rPr>
-              <w:t xml:space="preserve">1. Impostazioni</w:t>
+              <w:t xml:space="preserve">Ripartizione PEF (passo 3) e tariffa puntuale (passo 6)</w:t>
             </w:r>
           </w:p>
         </w:tc>
@@ -14108,7 +14241,7 @@
         </w:trPr>
         <w:tc>
           <w:tcPr>
-            <w:tcW w:type="dxa" w:w="4777"/>
+            <w:tcW w:type="dxa" w:w="3715"/>
             <w:tcBorders>
               <w:top w:val="single" w:color="D9D4C5" w:sz="4"/>
               <w:left w:val="single" w:color="D9D4C5" w:sz="4"/>
@@ -14141,7 +14274,7 @@
         </w:tc>
         <w:tc>
           <w:tcPr>
-            <w:tcW w:type="dxa" w:w="4861"/>
+            <w:tcW w:type="dxa" w:w="5923"/>
             <w:tcBorders>
               <w:top w:val="single" w:color="D9D4C5" w:sz="4"/>
               <w:left w:val="single" w:color="D9D4C5" w:sz="4"/>
@@ -14179,7 +14312,7 @@
         </w:trPr>
         <w:tc>
           <w:tcPr>
-            <w:tcW w:type="dxa" w:w="4777"/>
+            <w:tcW w:type="dxa" w:w="3715"/>
             <w:tcBorders>
               <w:top w:val="single" w:color="D9D4C5" w:sz="4"/>
               <w:left w:val="single" w:color="D9D4C5" w:sz="4"/>
@@ -14211,7 +14344,7 @@
         </w:tc>
         <w:tc>
           <w:tcPr>
-            <w:tcW w:type="dxa" w:w="4861"/>
+            <w:tcW w:type="dxa" w:w="5923"/>
             <w:tcBorders>
               <w:top w:val="single" w:color="D9D4C5" w:sz="4"/>
               <w:left w:val="single" w:color="D9D4C5" w:sz="4"/>
@@ -14248,7 +14381,7 @@
         </w:trPr>
         <w:tc>
           <w:tcPr>
-            <w:tcW w:type="dxa" w:w="4777"/>
+            <w:tcW w:type="dxa" w:w="3715"/>
             <w:tcBorders>
               <w:top w:val="single" w:color="D9D4C5" w:sz="4"/>
               <w:left w:val="single" w:color="D9D4C5" w:sz="4"/>
@@ -14281,7 +14414,7 @@
         </w:tc>
         <w:tc>
           <w:tcPr>
-            <w:tcW w:type="dxa" w:w="4861"/>
+            <w:tcW w:type="dxa" w:w="5923"/>
             <w:tcBorders>
               <w:top w:val="single" w:color="D9D4C5" w:sz="4"/>
               <w:left w:val="single" w:color="D9D4C5" w:sz="4"/>
@@ -14319,7 +14452,7 @@
         </w:trPr>
         <w:tc>
           <w:tcPr>
-            <w:tcW w:type="dxa" w:w="4777"/>
+            <w:tcW w:type="dxa" w:w="3715"/>
             <w:tcBorders>
               <w:top w:val="single" w:color="D9D4C5" w:sz="4"/>
               <w:left w:val="single" w:color="D9D4C5" w:sz="4"/>
@@ -14351,7 +14484,7 @@
         </w:tc>
         <w:tc>
           <w:tcPr>
-            <w:tcW w:type="dxa" w:w="4861"/>
+            <w:tcW w:type="dxa" w:w="5923"/>
             <w:tcBorders>
               <w:top w:val="single" w:color="D9D4C5" w:sz="4"/>
               <w:left w:val="single" w:color="D9D4C5" w:sz="4"/>
@@ -14377,7 +14510,7 @@
                 <w:sz w:val="18"/>
                 <w:szCs w:val="18"/>
               </w:rPr>
-              <w:t xml:space="preserve">5. Banca Dati Utenze, dopo l'aggregazione</w:t>
+              <w:t xml:space="preserve">5. Banca Dati Utenze: le letture sono sommate per utenza e tipologia</w:t>
             </w:r>
           </w:p>
         </w:tc>
@@ -14388,7 +14521,7 @@
         </w:trPr>
         <w:tc>
           <w:tcPr>
-            <w:tcW w:type="dxa" w:w="4777"/>
+            <w:tcW w:type="dxa" w:w="3715"/>
             <w:tcBorders>
               <w:top w:val="single" w:color="D9D4C5" w:sz="4"/>
               <w:left w:val="single" w:color="D9D4C5" w:sz="4"/>
@@ -14421,7 +14554,7 @@
         </w:tc>
         <w:tc>
           <w:tcPr>
-            <w:tcW w:type="dxa" w:w="4861"/>
+            <w:tcW w:type="dxa" w:w="5923"/>
             <w:tcBorders>
               <w:top w:val="single" w:color="D9D4C5" w:sz="4"/>
               <w:left w:val="single" w:color="D9D4C5" w:sz="4"/>
@@ -14501,7 +14634,27 @@
           <w:sz w:val="21"/>
           <w:szCs w:val="21"/>
         </w:rPr>
-        <w:t xml:space="preserve"> per ogni utenza: niente nomi, codici fiscali, indirizzi o numeri di contratto. Se il file del Comune contiene dati personali, non va caricato nel calcolo: chiedete al Comune di sostituirli con codici.</w:t>
+        <w:t xml:space="preserve"> per ogni utenza: niente nomi, codici fiscali, indirizzi, email o telefoni. Il portale controlla il file prima dell'import e lo </w:t>
+      </w:r>
+      <w:r>
+        <w:rPr>
+          <w:rFonts w:ascii="Arial" w:cs="Arial" w:eastAsia="Arial" w:hAnsi="Arial"/>
+          <w:b/>
+          <w:bCs/>
+          <w:color w:val="1B2118"/>
+          <w:sz w:val="21"/>
+          <w:szCs w:val="21"/>
+        </w:rPr>
+        <w:t xml:space="preserve">blocca</w:t>
+      </w:r>
+      <w:r>
+        <w:rPr>
+          <w:rFonts w:ascii="Arial" w:cs="Arial" w:eastAsia="Arial" w:hAnsi="Arial"/>
+          <w:color w:val="1B2118"/>
+          <w:sz w:val="21"/>
+          <w:szCs w:val="21"/>
+        </w:rPr>
+        <w:t xml:space="preserve"> se trova dati personali, indicando foglio e riga (con il valore oscurato): chiedete al Comune di sostituirli con codici e di caricare di nuovo il file.</w:t>
       </w:r>
     </w:p>
     <w:p>
@@ -14515,47 +14668,25 @@
           <w:sz w:val="21"/>
           <w:szCs w:val="21"/>
         </w:rPr>
-        <w:t xml:space="preserve">Oggi ogni tabella si importa in </w:t>
-      </w:r>
-      <w:r>
-        <w:rPr>
-          <w:rFonts w:ascii="Arial" w:cs="Arial" w:eastAsia="Arial" w:hAnsi="Arial"/>
-          <w:b/>
-          <w:bCs/>
-          <w:color w:val="1B2118"/>
-          <w:sz w:val="21"/>
-          <w:szCs w:val="21"/>
-        </w:rPr>
-        <w:t xml:space="preserve">CSV</w:t>
-      </w:r>
-      <w:r>
-        <w:rPr>
-          <w:rFonts w:ascii="Arial" w:cs="Arial" w:eastAsia="Arial" w:hAnsi="Arial"/>
-          <w:color w:val="1B2118"/>
-          <w:sz w:val="21"/>
-          <w:szCs w:val="21"/>
-        </w:rPr>
-        <w:t xml:space="preserve">: dal file Excel del Comune si salva il foglio come «CSV UTF-8» e lo si importa nel passo corrispondente. Ogni tabella ha </w:t>
-      </w:r>
-      <w:r>
-        <w:rPr>
-          <w:rFonts w:ascii="Arial" w:cs="Arial" w:eastAsia="Arial" w:hAnsi="Arial"/>
-          <w:b/>
-          <w:bCs/>
-          <w:color w:val="1B2118"/>
-          <w:sz w:val="21"/>
-          <w:szCs w:val="21"/>
-        </w:rPr>
-        <w:t xml:space="preserve">Scarica il modello</w:t>
-      </w:r>
-      <w:r>
-        <w:rPr>
-          <w:rFonts w:ascii="Arial" w:cs="Arial" w:eastAsia="Arial" w:hAnsi="Arial"/>
-          <w:color w:val="1B2118"/>
-          <w:sz w:val="21"/>
-          <w:szCs w:val="21"/>
-        </w:rPr>
-        <w:t xml:space="preserve">, che mostra le intestazioni attese. L'import diretto del file Excel e l'aggregazione automatica delle singole letture sono in sviluppo (capitolo «Funzioni in arrivo»).</w:t>
+        <w:t xml:space="preserve">Il Comune carica il tracciato tra i documenti della sua pratica: il file Excel (.xlsx) oppure, se è molto grande, uno ZIP con i fogli salvati in CSV (es. </w:t>
+      </w:r>
+      <w:r>
+        <w:rPr>
+          <w:rFonts w:ascii="Consolas" w:cs="Consolas" w:eastAsia="Consolas" w:hAnsi="Consolas"/>
+          <w:color w:val="2F5D3A"/>
+          <w:sz w:val="21"/>
+          <w:szCs w:val="21"/>
+        </w:rPr>
+        <w:t xml:space="preserve">6_Letture.csv</w:t>
+      </w:r>
+      <w:r>
+        <w:rPr>
+          <w:rFonts w:ascii="Arial" w:cs="Arial" w:eastAsia="Arial" w:hAnsi="Arial"/>
+          <w:color w:val="1B2118"/>
+          <w:sz w:val="21"/>
+          <w:szCs w:val="21"/>
+        </w:rPr>
+        <w:t xml:space="preserve">).</w:t>
       </w:r>
     </w:p>
     <w:p>
@@ -14573,7 +14704,41 @@
           <w:sz w:val="25"/>
           <w:szCs w:val="25"/>
         </w:rPr>
-        <w:t xml:space="preserve">Creare un calcolo</w:t>
+        <w:t xml:space="preserve">Importare il tracciato nel calcolo</w:t>
+      </w:r>
+    </w:p>
+    <w:p>
+      <w:pPr>
+        <w:spacing w:after="140" w:line="300"/>
+      </w:pPr>
+      <w:r>
+        <w:rPr>
+          <w:rFonts w:ascii="Arial" w:cs="Arial" w:eastAsia="Arial" w:hAnsi="Arial"/>
+          <w:color w:val="1B2118"/>
+          <w:sz w:val="21"/>
+          <w:szCs w:val="21"/>
+        </w:rPr>
+        <w:t xml:space="preserve">Il primo passo del calcolo, </w:t>
+      </w:r>
+      <w:r>
+        <w:rPr>
+          <w:rFonts w:ascii="Arial" w:cs="Arial" w:eastAsia="Arial" w:hAnsi="Arial"/>
+          <w:b/>
+          <w:bCs/>
+          <w:color w:val="1B2118"/>
+          <w:sz w:val="21"/>
+          <w:szCs w:val="21"/>
+        </w:rPr>
+        <w:t xml:space="preserve">Importa il tracciato</w:t>
+      </w:r>
+      <w:r>
+        <w:rPr>
+          <w:rFonts w:ascii="Arial" w:cs="Arial" w:eastAsia="Arial" w:hAnsi="Arial"/>
+          <w:color w:val="1B2118"/>
+          <w:sz w:val="21"/>
+          <w:szCs w:val="21"/>
+        </w:rPr>
+        <w:t xml:space="preserve">, legge il file e compila in un colpo solo i passi 2, 3 e 5. Si apre da solo quando il calcolo è ancora vuoto.</w:t>
       </w:r>
     </w:p>
     <w:p>
@@ -14592,27 +14757,27 @@
           <w:sz w:val="21"/>
           <w:szCs w:val="21"/>
         </w:rPr>
-        <w:t xml:space="preserve">Nel menu premete </w:t>
-      </w:r>
-      <w:r>
-        <w:rPr>
-          <w:rFonts w:ascii="Arial" w:cs="Arial" w:eastAsia="Arial" w:hAnsi="Arial"/>
-          <w:b/>
-          <w:bCs/>
-          <w:color w:val="1B2118"/>
-          <w:sz w:val="21"/>
-          <w:szCs w:val="21"/>
-        </w:rPr>
-        <w:t xml:space="preserve">Crediti CWP</w:t>
-      </w:r>
-      <w:r>
-        <w:rPr>
-          <w:rFonts w:ascii="Arial" w:cs="Arial" w:eastAsia="Arial" w:hAnsi="Arial"/>
-          <w:color w:val="1B2118"/>
-          <w:sz w:val="21"/>
-          <w:szCs w:val="21"/>
-        </w:rPr>
-        <w:t xml:space="preserve">: si apre l'elenco dei calcoli (Calcolo, Pratica, Anno / tipo, Crediti netti, Stato).</w:t>
+        <w:t xml:space="preserve">Nel calcolo aprite </w:t>
+      </w:r>
+      <w:r>
+        <w:rPr>
+          <w:rFonts w:ascii="Arial" w:cs="Arial" w:eastAsia="Arial" w:hAnsi="Arial"/>
+          <w:b/>
+          <w:bCs/>
+          <w:color w:val="1B2118"/>
+          <w:sz w:val="21"/>
+          <w:szCs w:val="21"/>
+        </w:rPr>
+        <w:t xml:space="preserve">Importa il tracciato</w:t>
+      </w:r>
+      <w:r>
+        <w:rPr>
+          <w:rFonts w:ascii="Arial" w:cs="Arial" w:eastAsia="Arial" w:hAnsi="Arial"/>
+          <w:color w:val="1B2118"/>
+          <w:sz w:val="21"/>
+          <w:szCs w:val="21"/>
+        </w:rPr>
+        <w:t xml:space="preserve">.</w:t>
       </w:r>
     </w:p>
     <w:p>
@@ -14631,18 +14796,97 @@
           <w:sz w:val="21"/>
           <w:szCs w:val="21"/>
         </w:rPr>
-        <w:t xml:space="preserve">Premete </w:t>
-      </w:r>
-      <w:r>
-        <w:rPr>
-          <w:rFonts w:ascii="Arial" w:cs="Arial" w:eastAsia="Arial" w:hAnsi="Arial"/>
-          <w:b/>
-          <w:bCs/>
-          <w:color w:val="1B2118"/>
-          <w:sz w:val="21"/>
-          <w:szCs w:val="21"/>
-        </w:rPr>
-        <w:t xml:space="preserve">+ Nuovo calcolo</w:t>
+        <w:t xml:space="preserve">Scegliete il file:</w:t>
+      </w:r>
+    </w:p>
+    <w:p>
+      <w:pPr>
+        <w:spacing w:after="60"/>
+      </w:pPr>
+    </w:p>
+    <w:p>
+      <w:pPr>
+        <w:spacing w:after="140" w:line="300"/>
+      </w:pPr>
+      <w:r>
+        <w:rPr>
+          <w:rFonts w:ascii="Arial" w:cs="Arial" w:eastAsia="Arial" w:hAnsi="Arial"/>
+          <w:color w:val="1B2118"/>
+          <w:sz w:val="21"/>
+          <w:szCs w:val="21"/>
+        </w:rPr>
+        <w:t xml:space="preserve">- in </w:t>
+      </w:r>
+      <w:r>
+        <w:rPr>
+          <w:rFonts w:ascii="Arial" w:cs="Arial" w:eastAsia="Arial" w:hAnsi="Arial"/>
+          <w:b/>
+          <w:bCs/>
+          <w:color w:val="1B2118"/>
+          <w:sz w:val="21"/>
+          <w:szCs w:val="21"/>
+        </w:rPr>
+        <w:t xml:space="preserve">Dai documenti della pratica</w:t>
+      </w:r>
+      <w:r>
+        <w:rPr>
+          <w:rFonts w:ascii="Arial" w:cs="Arial" w:eastAsia="Arial" w:hAnsi="Arial"/>
+          <w:color w:val="1B2118"/>
+          <w:sz w:val="21"/>
+          <w:szCs w:val="21"/>
+        </w:rPr>
+        <w:t xml:space="preserve"> compaiono i file .xlsx e .zip caricati nella pratica del calcolo: premete </w:t>
+      </w:r>
+      <w:r>
+        <w:rPr>
+          <w:rFonts w:ascii="Arial" w:cs="Arial" w:eastAsia="Arial" w:hAnsi="Arial"/>
+          <w:b/>
+          <w:bCs/>
+          <w:color w:val="1B2118"/>
+          <w:sz w:val="21"/>
+          <w:szCs w:val="21"/>
+        </w:rPr>
+        <w:t xml:space="preserve">Leggi questo file</w:t>
+      </w:r>
+      <w:r>
+        <w:rPr>
+          <w:rFonts w:ascii="Arial" w:cs="Arial" w:eastAsia="Arial" w:hAnsi="Arial"/>
+          <w:color w:val="1B2118"/>
+          <w:sz w:val="21"/>
+          <w:szCs w:val="21"/>
+        </w:rPr>
+        <w:t xml:space="preserve"> sulla versione giusta; - oppure, da </w:t>
+      </w:r>
+      <w:r>
+        <w:rPr>
+          <w:rFonts w:ascii="Arial" w:cs="Arial" w:eastAsia="Arial" w:hAnsi="Arial"/>
+          <w:b/>
+          <w:bCs/>
+          <w:color w:val="1B2118"/>
+          <w:sz w:val="21"/>
+          <w:szCs w:val="21"/>
+        </w:rPr>
+        <w:t xml:space="preserve">Oppure dal computer</w:t>
+      </w:r>
+      <w:r>
+        <w:rPr>
+          <w:rFonts w:ascii="Arial" w:cs="Arial" w:eastAsia="Arial" w:hAnsi="Arial"/>
+          <w:color w:val="1B2118"/>
+          <w:sz w:val="21"/>
+          <w:szCs w:val="21"/>
+        </w:rPr>
+        <w:t xml:space="preserve">, premete </w:t>
+      </w:r>
+      <w:r>
+        <w:rPr>
+          <w:rFonts w:ascii="Arial" w:cs="Arial" w:eastAsia="Arial" w:hAnsi="Arial"/>
+          <w:b/>
+          <w:bCs/>
+          <w:color w:val="1B2118"/>
+          <w:sz w:val="21"/>
+          <w:szCs w:val="21"/>
+        </w:rPr>
+        <w:t xml:space="preserve">Scegli il file (.xlsx o .zip)</w:t>
       </w:r>
       <w:r>
         <w:rPr>
@@ -14659,7 +14903,7 @@
         <w:pStyle w:val="ListParagraph"/>
         <w:numPr>
           <w:ilvl w:val="0"/>
-          <w:numId w:val="18"/>
+          <w:numId w:val="19"/>
         </w:numPr>
         <w:spacing w:after="70" w:line="290"/>
       </w:pPr>
@@ -14670,118 +14914,38 @@
           <w:sz w:val="21"/>
           <w:szCs w:val="21"/>
         </w:rPr>
-        <w:t xml:space="preserve">Scegliete la </w:t>
-      </w:r>
-      <w:r>
-        <w:rPr>
-          <w:rFonts w:ascii="Arial" w:cs="Arial" w:eastAsia="Arial" w:hAnsi="Arial"/>
-          <w:b/>
-          <w:bCs/>
-          <w:color w:val="1B2118"/>
-          <w:sz w:val="21"/>
-          <w:szCs w:val="21"/>
-        </w:rPr>
-        <w:t xml:space="preserve">Pratica</w:t>
-      </w:r>
-      <w:r>
-        <w:rPr>
-          <w:rFonts w:ascii="Arial" w:cs="Arial" w:eastAsia="Arial" w:hAnsi="Arial"/>
-          <w:color w:val="1B2118"/>
-          <w:sz w:val="21"/>
-          <w:szCs w:val="21"/>
-        </w:rPr>
-        <w:t xml:space="preserve"> (Progetto o Rapporto di Monitoraggio), un </w:t>
-      </w:r>
-      <w:r>
-        <w:rPr>
-          <w:rFonts w:ascii="Arial" w:cs="Arial" w:eastAsia="Arial" w:hAnsi="Arial"/>
-          <w:b/>
-          <w:bCs/>
-          <w:color w:val="1B2118"/>
-          <w:sz w:val="21"/>
-          <w:szCs w:val="21"/>
-        </w:rPr>
-        <w:t xml:space="preserve">Titolo</w:t>
-      </w:r>
-      <w:r>
-        <w:rPr>
-          <w:rFonts w:ascii="Arial" w:cs="Arial" w:eastAsia="Arial" w:hAnsi="Arial"/>
-          <w:color w:val="1B2118"/>
-          <w:sz w:val="21"/>
-          <w:szCs w:val="21"/>
-        </w:rPr>
-        <w:t xml:space="preserve"> (es. «Monitoraggio 2025»), l'</w:t>
-      </w:r>
-      <w:r>
-        <w:rPr>
-          <w:rFonts w:ascii="Arial" w:cs="Arial" w:eastAsia="Arial" w:hAnsi="Arial"/>
-          <w:b/>
-          <w:bCs/>
-          <w:color w:val="1B2118"/>
-          <w:sz w:val="21"/>
-          <w:szCs w:val="21"/>
-        </w:rPr>
-        <w:t xml:space="preserve">Anno di riferimento</w:t>
-      </w:r>
-      <w:r>
-        <w:rPr>
-          <w:rFonts w:ascii="Arial" w:cs="Arial" w:eastAsia="Arial" w:hAnsi="Arial"/>
-          <w:color w:val="1B2118"/>
-          <w:sz w:val="21"/>
-          <w:szCs w:val="21"/>
-        </w:rPr>
-        <w:t xml:space="preserve"> e il </w:t>
-      </w:r>
-      <w:r>
-        <w:rPr>
-          <w:rFonts w:ascii="Arial" w:cs="Arial" w:eastAsia="Arial" w:hAnsi="Arial"/>
-          <w:b/>
-          <w:bCs/>
-          <w:color w:val="1B2118"/>
-          <w:sz w:val="21"/>
-          <w:szCs w:val="21"/>
-        </w:rPr>
-        <w:t xml:space="preserve">Tipo di stima</w:t>
-      </w:r>
-      <w:r>
-        <w:rPr>
-          <w:rFonts w:ascii="Arial" w:cs="Arial" w:eastAsia="Arial" w:hAnsi="Arial"/>
-          <w:color w:val="1B2118"/>
-          <w:sz w:val="21"/>
-          <w:szCs w:val="21"/>
-        </w:rPr>
-        <w:t xml:space="preserve">: </w:t>
-      </w:r>
-      <w:r>
-        <w:rPr>
-          <w:rFonts w:ascii="Arial" w:cs="Arial" w:eastAsia="Arial" w:hAnsi="Arial"/>
-          <w:i/>
-          <w:iCs/>
-          <w:color w:val="1B2118"/>
-          <w:sz w:val="21"/>
-          <w:szCs w:val="21"/>
-        </w:rPr>
-        <w:t xml:space="preserve">Ex post (letture della Banca Dati Utenze)</w:t>
-      </w:r>
-      <w:r>
-        <w:rPr>
-          <w:rFonts w:ascii="Arial" w:cs="Arial" w:eastAsia="Arial" w:hAnsi="Arial"/>
-          <w:color w:val="1B2118"/>
-          <w:sz w:val="21"/>
-          <w:szCs w:val="21"/>
-        </w:rPr>
-        <w:t xml:space="preserve"> oppure </w:t>
-      </w:r>
-      <w:r>
-        <w:rPr>
-          <w:rFonts w:ascii="Arial" w:cs="Arial" w:eastAsia="Arial" w:hAnsi="Arial"/>
-          <w:i/>
-          <w:iCs/>
-          <w:color w:val="1B2118"/>
-          <w:sz w:val="21"/>
-          <w:szCs w:val="21"/>
-        </w:rPr>
-        <w:t xml:space="preserve">Ex ante</w:t>
+        <w:t xml:space="preserve">Il portale mostra l'</w:t>
+      </w:r>
+      <w:r>
+        <w:rPr>
+          <w:rFonts w:ascii="Arial" w:cs="Arial" w:eastAsia="Arial" w:hAnsi="Arial"/>
+          <w:b/>
+          <w:bCs/>
+          <w:color w:val="1B2118"/>
+          <w:sz w:val="21"/>
+          <w:szCs w:val="21"/>
+        </w:rPr>
+        <w:t xml:space="preserve">anteprima</w:t>
+      </w:r>
+      <w:r>
+        <w:rPr>
+          <w:rFonts w:ascii="Arial" w:cs="Arial" w:eastAsia="Arial" w:hAnsi="Arial"/>
+          <w:color w:val="1B2118"/>
+          <w:sz w:val="21"/>
+          <w:szCs w:val="21"/>
+        </w:rPr>
+        <w:t xml:space="preserve">: per ogni parte (ripartizione PEF e tariffa puntuale, rifiuti, classi della delibera, Banca Dati Utenze, beni a riuso) quante righe ha trovato, le righe scartate con il motivo e i </w:t>
+      </w:r>
+      <w:r>
+        <w:rPr>
+          <w:rFonts w:ascii="Arial" w:cs="Arial" w:eastAsia="Arial" w:hAnsi="Arial"/>
+          <w:b/>
+          <w:bCs/>
+          <w:color w:val="1B2118"/>
+          <w:sz w:val="21"/>
+          <w:szCs w:val="21"/>
+        </w:rPr>
+        <w:t xml:space="preserve">controlli di coerenza</w:t>
       </w:r>
       <w:r>
         <w:rPr>
@@ -14798,7 +14962,7 @@
         <w:pStyle w:val="ListParagraph"/>
         <w:numPr>
           <w:ilvl w:val="0"/>
-          <w:numId w:val="18"/>
+          <w:numId w:val="19"/>
         </w:numPr>
         <w:spacing w:after="70" w:line="290"/>
       </w:pPr>
@@ -14809,27 +14973,7 @@
           <w:sz w:val="21"/>
           <w:szCs w:val="21"/>
         </w:rPr>
-        <w:t xml:space="preserve">Solo se è il primo anno del Progetto, compilate </w:t>
-      </w:r>
-      <w:r>
-        <w:rPr>
-          <w:rFonts w:ascii="Arial" w:cs="Arial" w:eastAsia="Arial" w:hAnsi="Arial"/>
-          <w:b/>
-          <w:bCs/>
-          <w:color w:val="1B2118"/>
-          <w:sz w:val="21"/>
-          <w:szCs w:val="21"/>
-        </w:rPr>
-        <w:t xml:space="preserve">Avvio del progetto (solo se nel primo anno)</w:t>
-      </w:r>
-      <w:r>
-        <w:rPr>
-          <w:rFonts w:ascii="Arial" w:cs="Arial" w:eastAsia="Arial" w:hAnsi="Arial"/>
-          <w:color w:val="1B2118"/>
-          <w:sz w:val="21"/>
-          <w:szCs w:val="21"/>
-        </w:rPr>
-        <w:t xml:space="preserve">.</w:t>
+        <w:t xml:space="preserve">Togliete la spunta alle parti che non volete importare.</w:t>
       </w:r>
     </w:p>
     <w:p>
@@ -14837,7 +14981,489 @@
         <w:pStyle w:val="ListParagraph"/>
         <w:numPr>
           <w:ilvl w:val="0"/>
-          <w:numId w:val="18"/>
+          <w:numId w:val="19"/>
+        </w:numPr>
+        <w:spacing w:after="70" w:line="290"/>
+      </w:pPr>
+      <w:r>
+        <w:rPr>
+          <w:rFonts w:ascii="Arial" w:cs="Arial" w:eastAsia="Arial" w:hAnsi="Arial"/>
+          <w:color w:val="1B2118"/>
+          <w:sz w:val="21"/>
+          <w:szCs w:val="21"/>
+        </w:rPr>
+        <w:t xml:space="preserve">Premete </w:t>
+      </w:r>
+      <w:r>
+        <w:rPr>
+          <w:rFonts w:ascii="Arial" w:cs="Arial" w:eastAsia="Arial" w:hAnsi="Arial"/>
+          <w:b/>
+          <w:bCs/>
+          <w:color w:val="1B2118"/>
+          <w:sz w:val="21"/>
+          <w:szCs w:val="21"/>
+        </w:rPr>
+        <w:t xml:space="preserve">Importa nel calcolo</w:t>
+      </w:r>
+      <w:r>
+        <w:rPr>
+          <w:rFonts w:ascii="Arial" w:cs="Arial" w:eastAsia="Arial" w:hAnsi="Arial"/>
+          <w:color w:val="1B2118"/>
+          <w:sz w:val="21"/>
+          <w:szCs w:val="21"/>
+        </w:rPr>
+        <w:t xml:space="preserve">. Le parti spuntate </w:t>
+      </w:r>
+      <w:r>
+        <w:rPr>
+          <w:rFonts w:ascii="Arial" w:cs="Arial" w:eastAsia="Arial" w:hAnsi="Arial"/>
+          <w:b/>
+          <w:bCs/>
+          <w:color w:val="1B2118"/>
+          <w:sz w:val="21"/>
+          <w:szCs w:val="21"/>
+        </w:rPr>
+        <w:t xml:space="preserve">sostituiscono</w:t>
+      </w:r>
+      <w:r>
+        <w:rPr>
+          <w:rFonts w:ascii="Arial" w:cs="Arial" w:eastAsia="Arial" w:hAnsi="Arial"/>
+          <w:color w:val="1B2118"/>
+          <w:sz w:val="21"/>
+          <w:szCs w:val="21"/>
+        </w:rPr>
+        <w:t xml:space="preserve"> quelle del calcolo e sono salvate subito. Il calcolo annota il file di origine («Ultimo import»).</w:t>
+      </w:r>
+    </w:p>
+    <w:p>
+      <w:pPr>
+        <w:spacing w:after="60"/>
+      </w:pPr>
+    </w:p>
+    <w:p>
+      <w:pPr>
+        <w:spacing w:after="140" w:line="300"/>
+      </w:pPr>
+      <w:r>
+        <w:rPr>
+          <w:rFonts w:ascii="Arial" w:cs="Arial" w:eastAsia="Arial" w:hAnsi="Arial"/>
+          <w:b/>
+          <w:bCs/>
+          <w:color w:val="1B2118"/>
+          <w:sz w:val="21"/>
+          <w:szCs w:val="21"/>
+        </w:rPr>
+        <w:t xml:space="preserve">Singole letture.</w:t>
+      </w:r>
+      <w:r>
+        <w:rPr>
+          <w:rFonts w:ascii="Arial" w:cs="Arial" w:eastAsia="Arial" w:hAnsi="Arial"/>
+          <w:color w:val="1B2118"/>
+          <w:sz w:val="21"/>
+          <w:szCs w:val="21"/>
+        </w:rPr>
+        <w:t xml:space="preserve"> Se il Comune ha compilato il foglio 6_Letture, il portale somma le letture dell'anno del calcolo per ogni utenza e tipologia: gli svuotamenti domiciliari diventano numero di svuotamenti e volume medio del contenitore; pesi e volumi alle strutture informatizzate e ai centri di raccolta si sommano. Le letture di altri anni sono escluse e il numero compare tra gli avvisi. Se sono compilati sia il foglio 5 sia il foglio 6, vale il foglio 5.</w:t>
+      </w:r>
+    </w:p>
+    <w:p>
+      <w:pPr>
+        <w:spacing w:after="140" w:line="300"/>
+      </w:pPr>
+      <w:r>
+        <w:rPr>
+          <w:rFonts w:ascii="Arial" w:cs="Arial" w:eastAsia="Arial" w:hAnsi="Arial"/>
+          <w:b/>
+          <w:bCs/>
+          <w:color w:val="1B2118"/>
+          <w:sz w:val="21"/>
+          <w:szCs w:val="21"/>
+        </w:rPr>
+        <w:t xml:space="preserve">Controlli di coerenza.</w:t>
+      </w:r>
+      <w:r>
+        <w:rPr>
+          <w:rFonts w:ascii="Arial" w:cs="Arial" w:eastAsia="Arial" w:hAnsi="Arial"/>
+          <w:color w:val="1B2118"/>
+          <w:sz w:val="21"/>
+          <w:szCs w:val="21"/>
+        </w:rPr>
+        <w:t xml:space="preserve"> Compaiono nell'anteprima, nel passo 5 e nei risultati, divisi in </w:t>
+      </w:r>
+      <w:r>
+        <w:rPr>
+          <w:rFonts w:ascii="Arial" w:cs="Arial" w:eastAsia="Arial" w:hAnsi="Arial"/>
+          <w:i/>
+          <w:iCs/>
+          <w:color w:val="1B2118"/>
+          <w:sz w:val="21"/>
+          <w:szCs w:val="21"/>
+        </w:rPr>
+        <w:t xml:space="preserve">da correggere</w:t>
+      </w:r>
+      <w:r>
+        <w:rPr>
+          <w:rFonts w:ascii="Arial" w:cs="Arial" w:eastAsia="Arial" w:hAnsi="Arial"/>
+          <w:color w:val="1B2118"/>
+          <w:sz w:val="21"/>
+          <w:szCs w:val="21"/>
+        </w:rPr>
+        <w:t xml:space="preserve"> e </w:t>
+      </w:r>
+      <w:r>
+        <w:rPr>
+          <w:rFonts w:ascii="Arial" w:cs="Arial" w:eastAsia="Arial" w:hAnsi="Arial"/>
+          <w:i/>
+          <w:iCs/>
+          <w:color w:val="1B2118"/>
+          <w:sz w:val="21"/>
+          <w:szCs w:val="21"/>
+        </w:rPr>
+        <w:t xml:space="preserve">da verificare</w:t>
+      </w:r>
+      <w:r>
+        <w:rPr>
+          <w:rFonts w:ascii="Arial" w:cs="Arial" w:eastAsia="Arial" w:hAnsi="Arial"/>
+          <w:color w:val="1B2118"/>
+          <w:sz w:val="21"/>
+          <w:szCs w:val="21"/>
+        </w:rPr>
+        <w:t xml:space="preserve">. Ad esempio: ripartizione PEF diversa da 100%, indifferenziato mancante, classi della Banca Dati che non esistono nella delibera (spesso scritte in modo diverso), utenze con classi diverse su righe diverse, più utenze nella Banca Dati che nella delibera, più di 366 svuotamenti, contenitori oltre 5.000 litri, conferimenti superiori al totale del territorio, anno dei dati diverso da quello del calcolo. Non bloccano l'import: si correggono nei passi oppure con un file nuovo del Comune.</w:t>
+      </w:r>
+    </w:p>
+    <w:p>
+      <w:pPr>
+        <w:spacing w:after="140" w:line="300"/>
+      </w:pPr>
+      <w:r>
+        <w:rPr>
+          <w:rFonts w:ascii="Arial" w:cs="Arial" w:eastAsia="Arial" w:hAnsi="Arial"/>
+          <w:color w:val="1B2118"/>
+          <w:sz w:val="21"/>
+          <w:szCs w:val="21"/>
+        </w:rPr>
+        <w:t xml:space="preserve">Le singole tabelle si possono ancora importare a mano in CSV nei passi 2, 3 e 5 (</w:t>
+      </w:r>
+      <w:r>
+        <w:rPr>
+          <w:rFonts w:ascii="Arial" w:cs="Arial" w:eastAsia="Arial" w:hAnsi="Arial"/>
+          <w:b/>
+          <w:bCs/>
+          <w:color w:val="1B2118"/>
+          <w:sz w:val="21"/>
+          <w:szCs w:val="21"/>
+        </w:rPr>
+        <w:t xml:space="preserve">Importa CSV</w:t>
+      </w:r>
+      <w:r>
+        <w:rPr>
+          <w:rFonts w:ascii="Arial" w:cs="Arial" w:eastAsia="Arial" w:hAnsi="Arial"/>
+          <w:color w:val="1B2118"/>
+          <w:sz w:val="21"/>
+          <w:szCs w:val="21"/>
+        </w:rPr>
+        <w:t xml:space="preserve"> e </w:t>
+      </w:r>
+      <w:r>
+        <w:rPr>
+          <w:rFonts w:ascii="Arial" w:cs="Arial" w:eastAsia="Arial" w:hAnsi="Arial"/>
+          <w:b/>
+          <w:bCs/>
+          <w:color w:val="1B2118"/>
+          <w:sz w:val="21"/>
+          <w:szCs w:val="21"/>
+        </w:rPr>
+        <w:t xml:space="preserve">Scarica il modello</w:t>
+      </w:r>
+      <w:r>
+        <w:rPr>
+          <w:rFonts w:ascii="Arial" w:cs="Arial" w:eastAsia="Arial" w:hAnsi="Arial"/>
+          <w:color w:val="1B2118"/>
+          <w:sz w:val="21"/>
+          <w:szCs w:val="21"/>
+        </w:rPr>
+        <w:t xml:space="preserve">).</w:t>
+      </w:r>
+    </w:p>
+    <w:p>
+      <w:pPr>
+        <w:pStyle w:val="Heading2"/>
+        <w:keepNext/>
+        <w:spacing w:after="120" w:before="240"/>
+      </w:pPr>
+      <w:r>
+        <w:rPr>
+          <w:rFonts w:ascii="Arial" w:cs="Arial" w:eastAsia="Arial" w:hAnsi="Arial"/>
+          <w:b/>
+          <w:bCs/>
+          <w:color w:val="2F5D3A"/>
+          <w:sz w:val="25"/>
+          <w:szCs w:val="25"/>
+        </w:rPr>
+        <w:t xml:space="preserve">Creare un calcolo</w:t>
+      </w:r>
+    </w:p>
+    <w:p>
+      <w:pPr>
+        <w:pStyle w:val="ListParagraph"/>
+        <w:numPr>
+          <w:ilvl w:val="0"/>
+          <w:numId w:val="20"/>
+        </w:numPr>
+        <w:spacing w:after="70" w:line="290"/>
+      </w:pPr>
+      <w:r>
+        <w:rPr>
+          <w:rFonts w:ascii="Arial" w:cs="Arial" w:eastAsia="Arial" w:hAnsi="Arial"/>
+          <w:color w:val="1B2118"/>
+          <w:sz w:val="21"/>
+          <w:szCs w:val="21"/>
+        </w:rPr>
+        <w:t xml:space="preserve">Nel menu premete </w:t>
+      </w:r>
+      <w:r>
+        <w:rPr>
+          <w:rFonts w:ascii="Arial" w:cs="Arial" w:eastAsia="Arial" w:hAnsi="Arial"/>
+          <w:b/>
+          <w:bCs/>
+          <w:color w:val="1B2118"/>
+          <w:sz w:val="21"/>
+          <w:szCs w:val="21"/>
+        </w:rPr>
+        <w:t xml:space="preserve">Crediti CWP</w:t>
+      </w:r>
+      <w:r>
+        <w:rPr>
+          <w:rFonts w:ascii="Arial" w:cs="Arial" w:eastAsia="Arial" w:hAnsi="Arial"/>
+          <w:color w:val="1B2118"/>
+          <w:sz w:val="21"/>
+          <w:szCs w:val="21"/>
+        </w:rPr>
+        <w:t xml:space="preserve">: si apre l'elenco dei calcoli (Calcolo, Pratica, Anno / tipo, Crediti netti, Stato).</w:t>
+      </w:r>
+    </w:p>
+    <w:p>
+      <w:pPr>
+        <w:pStyle w:val="ListParagraph"/>
+        <w:numPr>
+          <w:ilvl w:val="0"/>
+          <w:numId w:val="20"/>
+        </w:numPr>
+        <w:spacing w:after="70" w:line="290"/>
+      </w:pPr>
+      <w:r>
+        <w:rPr>
+          <w:rFonts w:ascii="Arial" w:cs="Arial" w:eastAsia="Arial" w:hAnsi="Arial"/>
+          <w:color w:val="1B2118"/>
+          <w:sz w:val="21"/>
+          <w:szCs w:val="21"/>
+        </w:rPr>
+        <w:t xml:space="preserve">Premete </w:t>
+      </w:r>
+      <w:r>
+        <w:rPr>
+          <w:rFonts w:ascii="Arial" w:cs="Arial" w:eastAsia="Arial" w:hAnsi="Arial"/>
+          <w:b/>
+          <w:bCs/>
+          <w:color w:val="1B2118"/>
+          <w:sz w:val="21"/>
+          <w:szCs w:val="21"/>
+        </w:rPr>
+        <w:t xml:space="preserve">+ Nuovo calcolo</w:t>
+      </w:r>
+      <w:r>
+        <w:rPr>
+          <w:rFonts w:ascii="Arial" w:cs="Arial" w:eastAsia="Arial" w:hAnsi="Arial"/>
+          <w:color w:val="1B2118"/>
+          <w:sz w:val="21"/>
+          <w:szCs w:val="21"/>
+        </w:rPr>
+        <w:t xml:space="preserve">.</w:t>
+      </w:r>
+    </w:p>
+    <w:p>
+      <w:pPr>
+        <w:pStyle w:val="ListParagraph"/>
+        <w:numPr>
+          <w:ilvl w:val="0"/>
+          <w:numId w:val="20"/>
+        </w:numPr>
+        <w:spacing w:after="70" w:line="290"/>
+      </w:pPr>
+      <w:r>
+        <w:rPr>
+          <w:rFonts w:ascii="Arial" w:cs="Arial" w:eastAsia="Arial" w:hAnsi="Arial"/>
+          <w:color w:val="1B2118"/>
+          <w:sz w:val="21"/>
+          <w:szCs w:val="21"/>
+        </w:rPr>
+        <w:t xml:space="preserve">Scegliete la </w:t>
+      </w:r>
+      <w:r>
+        <w:rPr>
+          <w:rFonts w:ascii="Arial" w:cs="Arial" w:eastAsia="Arial" w:hAnsi="Arial"/>
+          <w:b/>
+          <w:bCs/>
+          <w:color w:val="1B2118"/>
+          <w:sz w:val="21"/>
+          <w:szCs w:val="21"/>
+        </w:rPr>
+        <w:t xml:space="preserve">Pratica</w:t>
+      </w:r>
+      <w:r>
+        <w:rPr>
+          <w:rFonts w:ascii="Arial" w:cs="Arial" w:eastAsia="Arial" w:hAnsi="Arial"/>
+          <w:color w:val="1B2118"/>
+          <w:sz w:val="21"/>
+          <w:szCs w:val="21"/>
+        </w:rPr>
+        <w:t xml:space="preserve"> (Progetto o Rapporto di Monitoraggio), un </w:t>
+      </w:r>
+      <w:r>
+        <w:rPr>
+          <w:rFonts w:ascii="Arial" w:cs="Arial" w:eastAsia="Arial" w:hAnsi="Arial"/>
+          <w:b/>
+          <w:bCs/>
+          <w:color w:val="1B2118"/>
+          <w:sz w:val="21"/>
+          <w:szCs w:val="21"/>
+        </w:rPr>
+        <w:t xml:space="preserve">Titolo</w:t>
+      </w:r>
+      <w:r>
+        <w:rPr>
+          <w:rFonts w:ascii="Arial" w:cs="Arial" w:eastAsia="Arial" w:hAnsi="Arial"/>
+          <w:color w:val="1B2118"/>
+          <w:sz w:val="21"/>
+          <w:szCs w:val="21"/>
+        </w:rPr>
+        <w:t xml:space="preserve"> (es. «Monitoraggio 2025»), l'</w:t>
+      </w:r>
+      <w:r>
+        <w:rPr>
+          <w:rFonts w:ascii="Arial" w:cs="Arial" w:eastAsia="Arial" w:hAnsi="Arial"/>
+          <w:b/>
+          <w:bCs/>
+          <w:color w:val="1B2118"/>
+          <w:sz w:val="21"/>
+          <w:szCs w:val="21"/>
+        </w:rPr>
+        <w:t xml:space="preserve">Anno di riferimento</w:t>
+      </w:r>
+      <w:r>
+        <w:rPr>
+          <w:rFonts w:ascii="Arial" w:cs="Arial" w:eastAsia="Arial" w:hAnsi="Arial"/>
+          <w:color w:val="1B2118"/>
+          <w:sz w:val="21"/>
+          <w:szCs w:val="21"/>
+        </w:rPr>
+        <w:t xml:space="preserve"> e il </w:t>
+      </w:r>
+      <w:r>
+        <w:rPr>
+          <w:rFonts w:ascii="Arial" w:cs="Arial" w:eastAsia="Arial" w:hAnsi="Arial"/>
+          <w:b/>
+          <w:bCs/>
+          <w:color w:val="1B2118"/>
+          <w:sz w:val="21"/>
+          <w:szCs w:val="21"/>
+        </w:rPr>
+        <w:t xml:space="preserve">Tipo di stima</w:t>
+      </w:r>
+      <w:r>
+        <w:rPr>
+          <w:rFonts w:ascii="Arial" w:cs="Arial" w:eastAsia="Arial" w:hAnsi="Arial"/>
+          <w:color w:val="1B2118"/>
+          <w:sz w:val="21"/>
+          <w:szCs w:val="21"/>
+        </w:rPr>
+        <w:t xml:space="preserve">: </w:t>
+      </w:r>
+      <w:r>
+        <w:rPr>
+          <w:rFonts w:ascii="Arial" w:cs="Arial" w:eastAsia="Arial" w:hAnsi="Arial"/>
+          <w:i/>
+          <w:iCs/>
+          <w:color w:val="1B2118"/>
+          <w:sz w:val="21"/>
+          <w:szCs w:val="21"/>
+        </w:rPr>
+        <w:t xml:space="preserve">Ex post (letture della Banca Dati Utenze)</w:t>
+      </w:r>
+      <w:r>
+        <w:rPr>
+          <w:rFonts w:ascii="Arial" w:cs="Arial" w:eastAsia="Arial" w:hAnsi="Arial"/>
+          <w:color w:val="1B2118"/>
+          <w:sz w:val="21"/>
+          <w:szCs w:val="21"/>
+        </w:rPr>
+        <w:t xml:space="preserve"> oppure </w:t>
+      </w:r>
+      <w:r>
+        <w:rPr>
+          <w:rFonts w:ascii="Arial" w:cs="Arial" w:eastAsia="Arial" w:hAnsi="Arial"/>
+          <w:i/>
+          <w:iCs/>
+          <w:color w:val="1B2118"/>
+          <w:sz w:val="21"/>
+          <w:szCs w:val="21"/>
+        </w:rPr>
+        <w:t xml:space="preserve">Ex ante</w:t>
+      </w:r>
+      <w:r>
+        <w:rPr>
+          <w:rFonts w:ascii="Arial" w:cs="Arial" w:eastAsia="Arial" w:hAnsi="Arial"/>
+          <w:color w:val="1B2118"/>
+          <w:sz w:val="21"/>
+          <w:szCs w:val="21"/>
+        </w:rPr>
+        <w:t xml:space="preserve">.</w:t>
+      </w:r>
+    </w:p>
+    <w:p>
+      <w:pPr>
+        <w:pStyle w:val="ListParagraph"/>
+        <w:numPr>
+          <w:ilvl w:val="0"/>
+          <w:numId w:val="20"/>
+        </w:numPr>
+        <w:spacing w:after="70" w:line="290"/>
+      </w:pPr>
+      <w:r>
+        <w:rPr>
+          <w:rFonts w:ascii="Arial" w:cs="Arial" w:eastAsia="Arial" w:hAnsi="Arial"/>
+          <w:color w:val="1B2118"/>
+          <w:sz w:val="21"/>
+          <w:szCs w:val="21"/>
+        </w:rPr>
+        <w:t xml:space="preserve">Solo se è il primo anno del Progetto, compilate </w:t>
+      </w:r>
+      <w:r>
+        <w:rPr>
+          <w:rFonts w:ascii="Arial" w:cs="Arial" w:eastAsia="Arial" w:hAnsi="Arial"/>
+          <w:b/>
+          <w:bCs/>
+          <w:color w:val="1B2118"/>
+          <w:sz w:val="21"/>
+          <w:szCs w:val="21"/>
+        </w:rPr>
+        <w:t xml:space="preserve">Avvio del progetto (solo se nel primo anno)</w:t>
+      </w:r>
+      <w:r>
+        <w:rPr>
+          <w:rFonts w:ascii="Arial" w:cs="Arial" w:eastAsia="Arial" w:hAnsi="Arial"/>
+          <w:color w:val="1B2118"/>
+          <w:sz w:val="21"/>
+          <w:szCs w:val="21"/>
+        </w:rPr>
+        <w:t xml:space="preserve">.</w:t>
+      </w:r>
+    </w:p>
+    <w:p>
+      <w:pPr>
+        <w:pStyle w:val="ListParagraph"/>
+        <w:numPr>
+          <w:ilvl w:val="0"/>
+          <w:numId w:val="20"/>
         </w:numPr>
         <w:spacing w:after="70" w:line="290"/>
       </w:pPr>
@@ -16564,7 +17190,7 @@
         <w:pStyle w:val="ListParagraph"/>
         <w:numPr>
           <w:ilvl w:val="0"/>
-          <w:numId w:val="19"/>
+          <w:numId w:val="21"/>
         </w:numPr>
         <w:spacing w:after="70" w:line="290"/>
       </w:pPr>
@@ -16603,7 +17229,7 @@
         <w:pStyle w:val="ListParagraph"/>
         <w:numPr>
           <w:ilvl w:val="0"/>
-          <w:numId w:val="19"/>
+          <w:numId w:val="21"/>
         </w:numPr>
         <w:spacing w:after="70" w:line="290"/>
       </w:pPr>
@@ -16642,7 +17268,7 @@
         <w:pStyle w:val="ListParagraph"/>
         <w:numPr>
           <w:ilvl w:val="0"/>
-          <w:numId w:val="19"/>
+          <w:numId w:val="21"/>
         </w:numPr>
         <w:spacing w:after="70" w:line="290"/>
       </w:pPr>
@@ -19109,7 +19735,7 @@
           <w:sz w:val="21"/>
           <w:szCs w:val="21"/>
         </w:rPr>
-        <w:t xml:space="preserve"> import diretto del tracciato dati Excel/ZIP caricato dal Comune, riassunto automatico delle singole letture, controllo dei dati personali, controlli di coerenza, rapporto di calcolo in PDF, registro dei crediti.</w:t>
+        <w:t xml:space="preserve"> rapporto di calcolo in PDF, registro dei crediti calcolati e confermati.</w:t>
       </w:r>
     </w:p>
     <w:p>
@@ -19441,7 +20067,7 @@
         <w:szCs w:val="16"/>
       </w:rPr>
       <w:tab/>
-      <w:t xml:space="preserve">Manuale Amministratore · Rev. 1.1 · 18/10/2026</w:t>
+      <w:t xml:space="preserve">Manuale Amministratore · Rev. 1.2 · 18/10/2026</w:t>
     </w:r>
   </w:p>
 </w:hdr>
@@ -19506,7 +20132,7 @@
         <w:szCs w:val="16"/>
       </w:rPr>
       <w:tab/>
-      <w:t xml:space="preserve">Manuale Amministratore · Rev. 1.1 · 18/10/2026</w:t>
+      <w:t xml:space="preserve">Manuale Amministratore · Rev. 1.2 · 18/10/2026</w:t>
     </w:r>
   </w:p>
 </w:hdr>
@@ -19751,6 +20377,18 @@
     </w:lvlOverride>
   </w:num>
   <w:num w:numId="19">
+    <w:abstractNumId w:val="3"/>
+    <w:lvlOverride w:ilvl="0">
+      <w:startOverride w:val="1"/>
+    </w:lvlOverride>
+  </w:num>
+  <w:num w:numId="20">
+    <w:abstractNumId w:val="3"/>
+    <w:lvlOverride w:ilvl="0">
+      <w:startOverride w:val="1"/>
+    </w:lvlOverride>
+  </w:num>
+  <w:num w:numId="21">
     <w:abstractNumId w:val="3"/>
     <w:lvlOverride w:ilvl="0">
       <w:startOverride w:val="1"/>

</xml_diff>

<commit_message>
Manuale Amministratore: passo di scelta del file senza elenco annidato
Co-Authored-By: Claude Opus 5.5 <noreply@anthropic.com>
Claude-Session: https://claude.ai/code/session_01E8XCbEeVHWVP3hntUZ6kZ1
</commit_message>
<xml_diff>
--- a/public/documentazione/Manuale_Amministratore_Portale_CWP.docx
+++ b/public/documentazione/Manuale_Amministratore_Portale_CWP.docx
@@ -3008,7 +3008,7 @@
         </w:rPr>
         <w:t xml:space="preserve">Si accede da </w:t>
       </w:r>
-      <w:hyperlink w:history="1" r:id="rIdbav2ewf2ynelsws-wk159">
+      <w:hyperlink w:history="1" r:id="rIdik75e8td5h5rzeol2kvae">
         <w:r>
           <w:rPr>
             <w:rFonts w:ascii="Arial" w:cs="Arial" w:eastAsia="Arial" w:hAnsi="Arial"/>
@@ -14796,7 +14796,224 @@
           <w:sz w:val="21"/>
           <w:szCs w:val="21"/>
         </w:rPr>
-        <w:t xml:space="preserve">Scegliete il file:</w:t>
+        <w:t xml:space="preserve">Scegliete il file. In </w:t>
+      </w:r>
+      <w:r>
+        <w:rPr>
+          <w:rFonts w:ascii="Arial" w:cs="Arial" w:eastAsia="Arial" w:hAnsi="Arial"/>
+          <w:b/>
+          <w:bCs/>
+          <w:color w:val="1B2118"/>
+          <w:sz w:val="21"/>
+          <w:szCs w:val="21"/>
+        </w:rPr>
+        <w:t xml:space="preserve">Dai documenti della pratica</w:t>
+      </w:r>
+      <w:r>
+        <w:rPr>
+          <w:rFonts w:ascii="Arial" w:cs="Arial" w:eastAsia="Arial" w:hAnsi="Arial"/>
+          <w:color w:val="1B2118"/>
+          <w:sz w:val="21"/>
+          <w:szCs w:val="21"/>
+        </w:rPr>
+        <w:t xml:space="preserve"> compaiono i file .xlsx e .zip caricati nella pratica del calcolo: premete </w:t>
+      </w:r>
+      <w:r>
+        <w:rPr>
+          <w:rFonts w:ascii="Arial" w:cs="Arial" w:eastAsia="Arial" w:hAnsi="Arial"/>
+          <w:b/>
+          <w:bCs/>
+          <w:color w:val="1B2118"/>
+          <w:sz w:val="21"/>
+          <w:szCs w:val="21"/>
+        </w:rPr>
+        <w:t xml:space="preserve">Leggi questo file</w:t>
+      </w:r>
+      <w:r>
+        <w:rPr>
+          <w:rFonts w:ascii="Arial" w:cs="Arial" w:eastAsia="Arial" w:hAnsi="Arial"/>
+          <w:color w:val="1B2118"/>
+          <w:sz w:val="21"/>
+          <w:szCs w:val="21"/>
+        </w:rPr>
+        <w:t xml:space="preserve"> sulla versione giusta. In alternativa, in </w:t>
+      </w:r>
+      <w:r>
+        <w:rPr>
+          <w:rFonts w:ascii="Arial" w:cs="Arial" w:eastAsia="Arial" w:hAnsi="Arial"/>
+          <w:b/>
+          <w:bCs/>
+          <w:color w:val="1B2118"/>
+          <w:sz w:val="21"/>
+          <w:szCs w:val="21"/>
+        </w:rPr>
+        <w:t xml:space="preserve">Oppure dal computer</w:t>
+      </w:r>
+      <w:r>
+        <w:rPr>
+          <w:rFonts w:ascii="Arial" w:cs="Arial" w:eastAsia="Arial" w:hAnsi="Arial"/>
+          <w:color w:val="1B2118"/>
+          <w:sz w:val="21"/>
+          <w:szCs w:val="21"/>
+        </w:rPr>
+        <w:t xml:space="preserve"> premete </w:t>
+      </w:r>
+      <w:r>
+        <w:rPr>
+          <w:rFonts w:ascii="Arial" w:cs="Arial" w:eastAsia="Arial" w:hAnsi="Arial"/>
+          <w:b/>
+          <w:bCs/>
+          <w:color w:val="1B2118"/>
+          <w:sz w:val="21"/>
+          <w:szCs w:val="21"/>
+        </w:rPr>
+        <w:t xml:space="preserve">Scegli il file (.xlsx o .zip)</w:t>
+      </w:r>
+      <w:r>
+        <w:rPr>
+          <w:rFonts w:ascii="Arial" w:cs="Arial" w:eastAsia="Arial" w:hAnsi="Arial"/>
+          <w:color w:val="1B2118"/>
+          <w:sz w:val="21"/>
+          <w:szCs w:val="21"/>
+        </w:rPr>
+        <w:t xml:space="preserve">.</w:t>
+      </w:r>
+    </w:p>
+    <w:p>
+      <w:pPr>
+        <w:pStyle w:val="ListParagraph"/>
+        <w:numPr>
+          <w:ilvl w:val="0"/>
+          <w:numId w:val="18"/>
+        </w:numPr>
+        <w:spacing w:after="70" w:line="290"/>
+      </w:pPr>
+      <w:r>
+        <w:rPr>
+          <w:rFonts w:ascii="Arial" w:cs="Arial" w:eastAsia="Arial" w:hAnsi="Arial"/>
+          <w:color w:val="1B2118"/>
+          <w:sz w:val="21"/>
+          <w:szCs w:val="21"/>
+        </w:rPr>
+        <w:t xml:space="preserve">Il portale mostra l'</w:t>
+      </w:r>
+      <w:r>
+        <w:rPr>
+          <w:rFonts w:ascii="Arial" w:cs="Arial" w:eastAsia="Arial" w:hAnsi="Arial"/>
+          <w:b/>
+          <w:bCs/>
+          <w:color w:val="1B2118"/>
+          <w:sz w:val="21"/>
+          <w:szCs w:val="21"/>
+        </w:rPr>
+        <w:t xml:space="preserve">anteprima</w:t>
+      </w:r>
+      <w:r>
+        <w:rPr>
+          <w:rFonts w:ascii="Arial" w:cs="Arial" w:eastAsia="Arial" w:hAnsi="Arial"/>
+          <w:color w:val="1B2118"/>
+          <w:sz w:val="21"/>
+          <w:szCs w:val="21"/>
+        </w:rPr>
+        <w:t xml:space="preserve">: per ogni parte (ripartizione PEF e tariffa puntuale, rifiuti, classi della delibera, Banca Dati Utenze, beni a riuso) quante righe ha trovato, le righe scartate con il motivo e i </w:t>
+      </w:r>
+      <w:r>
+        <w:rPr>
+          <w:rFonts w:ascii="Arial" w:cs="Arial" w:eastAsia="Arial" w:hAnsi="Arial"/>
+          <w:b/>
+          <w:bCs/>
+          <w:color w:val="1B2118"/>
+          <w:sz w:val="21"/>
+          <w:szCs w:val="21"/>
+        </w:rPr>
+        <w:t xml:space="preserve">controlli di coerenza</w:t>
+      </w:r>
+      <w:r>
+        <w:rPr>
+          <w:rFonts w:ascii="Arial" w:cs="Arial" w:eastAsia="Arial" w:hAnsi="Arial"/>
+          <w:color w:val="1B2118"/>
+          <w:sz w:val="21"/>
+          <w:szCs w:val="21"/>
+        </w:rPr>
+        <w:t xml:space="preserve">.</w:t>
+      </w:r>
+    </w:p>
+    <w:p>
+      <w:pPr>
+        <w:pStyle w:val="ListParagraph"/>
+        <w:numPr>
+          <w:ilvl w:val="0"/>
+          <w:numId w:val="18"/>
+        </w:numPr>
+        <w:spacing w:after="70" w:line="290"/>
+      </w:pPr>
+      <w:r>
+        <w:rPr>
+          <w:rFonts w:ascii="Arial" w:cs="Arial" w:eastAsia="Arial" w:hAnsi="Arial"/>
+          <w:color w:val="1B2118"/>
+          <w:sz w:val="21"/>
+          <w:szCs w:val="21"/>
+        </w:rPr>
+        <w:t xml:space="preserve">Togliete la spunta alle parti che non volete importare.</w:t>
+      </w:r>
+    </w:p>
+    <w:p>
+      <w:pPr>
+        <w:pStyle w:val="ListParagraph"/>
+        <w:numPr>
+          <w:ilvl w:val="0"/>
+          <w:numId w:val="18"/>
+        </w:numPr>
+        <w:spacing w:after="70" w:line="290"/>
+      </w:pPr>
+      <w:r>
+        <w:rPr>
+          <w:rFonts w:ascii="Arial" w:cs="Arial" w:eastAsia="Arial" w:hAnsi="Arial"/>
+          <w:color w:val="1B2118"/>
+          <w:sz w:val="21"/>
+          <w:szCs w:val="21"/>
+        </w:rPr>
+        <w:t xml:space="preserve">Premete </w:t>
+      </w:r>
+      <w:r>
+        <w:rPr>
+          <w:rFonts w:ascii="Arial" w:cs="Arial" w:eastAsia="Arial" w:hAnsi="Arial"/>
+          <w:b/>
+          <w:bCs/>
+          <w:color w:val="1B2118"/>
+          <w:sz w:val="21"/>
+          <w:szCs w:val="21"/>
+        </w:rPr>
+        <w:t xml:space="preserve">Importa nel calcolo</w:t>
+      </w:r>
+      <w:r>
+        <w:rPr>
+          <w:rFonts w:ascii="Arial" w:cs="Arial" w:eastAsia="Arial" w:hAnsi="Arial"/>
+          <w:color w:val="1B2118"/>
+          <w:sz w:val="21"/>
+          <w:szCs w:val="21"/>
+        </w:rPr>
+        <w:t xml:space="preserve">. Le parti spuntate </w:t>
+      </w:r>
+      <w:r>
+        <w:rPr>
+          <w:rFonts w:ascii="Arial" w:cs="Arial" w:eastAsia="Arial" w:hAnsi="Arial"/>
+          <w:b/>
+          <w:bCs/>
+          <w:color w:val="1B2118"/>
+          <w:sz w:val="21"/>
+          <w:szCs w:val="21"/>
+        </w:rPr>
+        <w:t xml:space="preserve">sostituiscono</w:t>
+      </w:r>
+      <w:r>
+        <w:rPr>
+          <w:rFonts w:ascii="Arial" w:cs="Arial" w:eastAsia="Arial" w:hAnsi="Arial"/>
+          <w:color w:val="1B2118"/>
+          <w:sz w:val="21"/>
+          <w:szCs w:val="21"/>
+        </w:rPr>
+        <w:t xml:space="preserve"> quelle del calcolo e sono salvate subito. Il calcolo annota il file di origine («Ultimo import»).</w:t>
       </w:r>
     </w:p>
     <w:p>
@@ -14811,91 +15028,159 @@
       <w:r>
         <w:rPr>
           <w:rFonts w:ascii="Arial" w:cs="Arial" w:eastAsia="Arial" w:hAnsi="Arial"/>
-          <w:color w:val="1B2118"/>
-          <w:sz w:val="21"/>
-          <w:szCs w:val="21"/>
-        </w:rPr>
-        <w:t xml:space="preserve">- in </w:t>
-      </w:r>
-      <w:r>
-        <w:rPr>
-          <w:rFonts w:ascii="Arial" w:cs="Arial" w:eastAsia="Arial" w:hAnsi="Arial"/>
-          <w:b/>
-          <w:bCs/>
-          <w:color w:val="1B2118"/>
-          <w:sz w:val="21"/>
-          <w:szCs w:val="21"/>
-        </w:rPr>
-        <w:t xml:space="preserve">Dai documenti della pratica</w:t>
-      </w:r>
-      <w:r>
-        <w:rPr>
-          <w:rFonts w:ascii="Arial" w:cs="Arial" w:eastAsia="Arial" w:hAnsi="Arial"/>
-          <w:color w:val="1B2118"/>
-          <w:sz w:val="21"/>
-          <w:szCs w:val="21"/>
-        </w:rPr>
-        <w:t xml:space="preserve"> compaiono i file .xlsx e .zip caricati nella pratica del calcolo: premete </w:t>
-      </w:r>
-      <w:r>
-        <w:rPr>
-          <w:rFonts w:ascii="Arial" w:cs="Arial" w:eastAsia="Arial" w:hAnsi="Arial"/>
-          <w:b/>
-          <w:bCs/>
-          <w:color w:val="1B2118"/>
-          <w:sz w:val="21"/>
-          <w:szCs w:val="21"/>
-        </w:rPr>
-        <w:t xml:space="preserve">Leggi questo file</w:t>
-      </w:r>
-      <w:r>
-        <w:rPr>
-          <w:rFonts w:ascii="Arial" w:cs="Arial" w:eastAsia="Arial" w:hAnsi="Arial"/>
-          <w:color w:val="1B2118"/>
-          <w:sz w:val="21"/>
-          <w:szCs w:val="21"/>
-        </w:rPr>
-        <w:t xml:space="preserve"> sulla versione giusta; - oppure, da </w:t>
-      </w:r>
-      <w:r>
-        <w:rPr>
-          <w:rFonts w:ascii="Arial" w:cs="Arial" w:eastAsia="Arial" w:hAnsi="Arial"/>
-          <w:b/>
-          <w:bCs/>
-          <w:color w:val="1B2118"/>
-          <w:sz w:val="21"/>
-          <w:szCs w:val="21"/>
-        </w:rPr>
-        <w:t xml:space="preserve">Oppure dal computer</w:t>
-      </w:r>
-      <w:r>
-        <w:rPr>
-          <w:rFonts w:ascii="Arial" w:cs="Arial" w:eastAsia="Arial" w:hAnsi="Arial"/>
-          <w:color w:val="1B2118"/>
-          <w:sz w:val="21"/>
-          <w:szCs w:val="21"/>
-        </w:rPr>
-        <w:t xml:space="preserve">, premete </w:t>
-      </w:r>
-      <w:r>
-        <w:rPr>
-          <w:rFonts w:ascii="Arial" w:cs="Arial" w:eastAsia="Arial" w:hAnsi="Arial"/>
-          <w:b/>
-          <w:bCs/>
-          <w:color w:val="1B2118"/>
-          <w:sz w:val="21"/>
-          <w:szCs w:val="21"/>
-        </w:rPr>
-        <w:t xml:space="preserve">Scegli il file (.xlsx o .zip)</w:t>
-      </w:r>
-      <w:r>
-        <w:rPr>
-          <w:rFonts w:ascii="Arial" w:cs="Arial" w:eastAsia="Arial" w:hAnsi="Arial"/>
-          <w:color w:val="1B2118"/>
-          <w:sz w:val="21"/>
-          <w:szCs w:val="21"/>
-        </w:rPr>
-        <w:t xml:space="preserve">.</w:t>
+          <w:b/>
+          <w:bCs/>
+          <w:color w:val="1B2118"/>
+          <w:sz w:val="21"/>
+          <w:szCs w:val="21"/>
+        </w:rPr>
+        <w:t xml:space="preserve">Singole letture.</w:t>
+      </w:r>
+      <w:r>
+        <w:rPr>
+          <w:rFonts w:ascii="Arial" w:cs="Arial" w:eastAsia="Arial" w:hAnsi="Arial"/>
+          <w:color w:val="1B2118"/>
+          <w:sz w:val="21"/>
+          <w:szCs w:val="21"/>
+        </w:rPr>
+        <w:t xml:space="preserve"> Se il Comune ha compilato il foglio 6_Letture, il portale somma le letture dell'anno del calcolo per ogni utenza e tipologia: gli svuotamenti domiciliari diventano numero di svuotamenti e volume medio del contenitore; pesi e volumi alle strutture informatizzate e ai centri di raccolta si sommano. Le letture di altri anni sono escluse e il numero compare tra gli avvisi. Se sono compilati sia il foglio 5 sia il foglio 6, vale il foglio 5.</w:t>
+      </w:r>
+    </w:p>
+    <w:p>
+      <w:pPr>
+        <w:spacing w:after="140" w:line="300"/>
+      </w:pPr>
+      <w:r>
+        <w:rPr>
+          <w:rFonts w:ascii="Arial" w:cs="Arial" w:eastAsia="Arial" w:hAnsi="Arial"/>
+          <w:b/>
+          <w:bCs/>
+          <w:color w:val="1B2118"/>
+          <w:sz w:val="21"/>
+          <w:szCs w:val="21"/>
+        </w:rPr>
+        <w:t xml:space="preserve">Controlli di coerenza.</w:t>
+      </w:r>
+      <w:r>
+        <w:rPr>
+          <w:rFonts w:ascii="Arial" w:cs="Arial" w:eastAsia="Arial" w:hAnsi="Arial"/>
+          <w:color w:val="1B2118"/>
+          <w:sz w:val="21"/>
+          <w:szCs w:val="21"/>
+        </w:rPr>
+        <w:t xml:space="preserve"> Compaiono nell'anteprima, nel passo 5 e nei risultati, divisi in </w:t>
+      </w:r>
+      <w:r>
+        <w:rPr>
+          <w:rFonts w:ascii="Arial" w:cs="Arial" w:eastAsia="Arial" w:hAnsi="Arial"/>
+          <w:i/>
+          <w:iCs/>
+          <w:color w:val="1B2118"/>
+          <w:sz w:val="21"/>
+          <w:szCs w:val="21"/>
+        </w:rPr>
+        <w:t xml:space="preserve">da correggere</w:t>
+      </w:r>
+      <w:r>
+        <w:rPr>
+          <w:rFonts w:ascii="Arial" w:cs="Arial" w:eastAsia="Arial" w:hAnsi="Arial"/>
+          <w:color w:val="1B2118"/>
+          <w:sz w:val="21"/>
+          <w:szCs w:val="21"/>
+        </w:rPr>
+        <w:t xml:space="preserve"> e </w:t>
+      </w:r>
+      <w:r>
+        <w:rPr>
+          <w:rFonts w:ascii="Arial" w:cs="Arial" w:eastAsia="Arial" w:hAnsi="Arial"/>
+          <w:i/>
+          <w:iCs/>
+          <w:color w:val="1B2118"/>
+          <w:sz w:val="21"/>
+          <w:szCs w:val="21"/>
+        </w:rPr>
+        <w:t xml:space="preserve">da verificare</w:t>
+      </w:r>
+      <w:r>
+        <w:rPr>
+          <w:rFonts w:ascii="Arial" w:cs="Arial" w:eastAsia="Arial" w:hAnsi="Arial"/>
+          <w:color w:val="1B2118"/>
+          <w:sz w:val="21"/>
+          <w:szCs w:val="21"/>
+        </w:rPr>
+        <w:t xml:space="preserve">. Ad esempio: ripartizione PEF diversa da 100%, indifferenziato mancante, classi della Banca Dati che non esistono nella delibera (spesso scritte in modo diverso), utenze con classi diverse su righe diverse, più utenze nella Banca Dati che nella delibera, più di 366 svuotamenti, contenitori oltre 5.000 litri, conferimenti superiori al totale del territorio, anno dei dati diverso da quello del calcolo. Non bloccano l'import: si correggono nei passi oppure con un file nuovo del Comune.</w:t>
+      </w:r>
+    </w:p>
+    <w:p>
+      <w:pPr>
+        <w:spacing w:after="140" w:line="300"/>
+      </w:pPr>
+      <w:r>
+        <w:rPr>
+          <w:rFonts w:ascii="Arial" w:cs="Arial" w:eastAsia="Arial" w:hAnsi="Arial"/>
+          <w:color w:val="1B2118"/>
+          <w:sz w:val="21"/>
+          <w:szCs w:val="21"/>
+        </w:rPr>
+        <w:t xml:space="preserve">Le singole tabelle si possono ancora importare a mano in CSV nei passi 2, 3 e 5 (</w:t>
+      </w:r>
+      <w:r>
+        <w:rPr>
+          <w:rFonts w:ascii="Arial" w:cs="Arial" w:eastAsia="Arial" w:hAnsi="Arial"/>
+          <w:b/>
+          <w:bCs/>
+          <w:color w:val="1B2118"/>
+          <w:sz w:val="21"/>
+          <w:szCs w:val="21"/>
+        </w:rPr>
+        <w:t xml:space="preserve">Importa CSV</w:t>
+      </w:r>
+      <w:r>
+        <w:rPr>
+          <w:rFonts w:ascii="Arial" w:cs="Arial" w:eastAsia="Arial" w:hAnsi="Arial"/>
+          <w:color w:val="1B2118"/>
+          <w:sz w:val="21"/>
+          <w:szCs w:val="21"/>
+        </w:rPr>
+        <w:t xml:space="preserve"> e </w:t>
+      </w:r>
+      <w:r>
+        <w:rPr>
+          <w:rFonts w:ascii="Arial" w:cs="Arial" w:eastAsia="Arial" w:hAnsi="Arial"/>
+          <w:b/>
+          <w:bCs/>
+          <w:color w:val="1B2118"/>
+          <w:sz w:val="21"/>
+          <w:szCs w:val="21"/>
+        </w:rPr>
+        <w:t xml:space="preserve">Scarica il modello</w:t>
+      </w:r>
+      <w:r>
+        <w:rPr>
+          <w:rFonts w:ascii="Arial" w:cs="Arial" w:eastAsia="Arial" w:hAnsi="Arial"/>
+          <w:color w:val="1B2118"/>
+          <w:sz w:val="21"/>
+          <w:szCs w:val="21"/>
+        </w:rPr>
+        <w:t xml:space="preserve">).</w:t>
+      </w:r>
+    </w:p>
+    <w:p>
+      <w:pPr>
+        <w:pStyle w:val="Heading2"/>
+        <w:keepNext/>
+        <w:spacing w:after="120" w:before="240"/>
+      </w:pPr>
+      <w:r>
+        <w:rPr>
+          <w:rFonts w:ascii="Arial" w:cs="Arial" w:eastAsia="Arial" w:hAnsi="Arial"/>
+          <w:b/>
+          <w:bCs/>
+          <w:color w:val="2F5D3A"/>
+          <w:sz w:val="25"/>
+          <w:szCs w:val="25"/>
+        </w:rPr>
+        <w:t xml:space="preserve">Creare un calcolo</w:t>
       </w:r>
     </w:p>
     <w:p>
@@ -14914,47 +15199,27 @@
           <w:sz w:val="21"/>
           <w:szCs w:val="21"/>
         </w:rPr>
-        <w:t xml:space="preserve">Il portale mostra l'</w:t>
-      </w:r>
-      <w:r>
-        <w:rPr>
-          <w:rFonts w:ascii="Arial" w:cs="Arial" w:eastAsia="Arial" w:hAnsi="Arial"/>
-          <w:b/>
-          <w:bCs/>
-          <w:color w:val="1B2118"/>
-          <w:sz w:val="21"/>
-          <w:szCs w:val="21"/>
-        </w:rPr>
-        <w:t xml:space="preserve">anteprima</w:t>
-      </w:r>
-      <w:r>
-        <w:rPr>
-          <w:rFonts w:ascii="Arial" w:cs="Arial" w:eastAsia="Arial" w:hAnsi="Arial"/>
-          <w:color w:val="1B2118"/>
-          <w:sz w:val="21"/>
-          <w:szCs w:val="21"/>
-        </w:rPr>
-        <w:t xml:space="preserve">: per ogni parte (ripartizione PEF e tariffa puntuale, rifiuti, classi della delibera, Banca Dati Utenze, beni a riuso) quante righe ha trovato, le righe scartate con il motivo e i </w:t>
-      </w:r>
-      <w:r>
-        <w:rPr>
-          <w:rFonts w:ascii="Arial" w:cs="Arial" w:eastAsia="Arial" w:hAnsi="Arial"/>
-          <w:b/>
-          <w:bCs/>
-          <w:color w:val="1B2118"/>
-          <w:sz w:val="21"/>
-          <w:szCs w:val="21"/>
-        </w:rPr>
-        <w:t xml:space="preserve">controlli di coerenza</w:t>
-      </w:r>
-      <w:r>
-        <w:rPr>
-          <w:rFonts w:ascii="Arial" w:cs="Arial" w:eastAsia="Arial" w:hAnsi="Arial"/>
-          <w:color w:val="1B2118"/>
-          <w:sz w:val="21"/>
-          <w:szCs w:val="21"/>
-        </w:rPr>
-        <w:t xml:space="preserve">.</w:t>
+        <w:t xml:space="preserve">Nel menu premete </w:t>
+      </w:r>
+      <w:r>
+        <w:rPr>
+          <w:rFonts w:ascii="Arial" w:cs="Arial" w:eastAsia="Arial" w:hAnsi="Arial"/>
+          <w:b/>
+          <w:bCs/>
+          <w:color w:val="1B2118"/>
+          <w:sz w:val="21"/>
+          <w:szCs w:val="21"/>
+        </w:rPr>
+        <w:t xml:space="preserve">Crediti CWP</w:t>
+      </w:r>
+      <w:r>
+        <w:rPr>
+          <w:rFonts w:ascii="Arial" w:cs="Arial" w:eastAsia="Arial" w:hAnsi="Arial"/>
+          <w:color w:val="1B2118"/>
+          <w:sz w:val="21"/>
+          <w:szCs w:val="21"/>
+        </w:rPr>
+        <w:t xml:space="preserve">: si apre l'elenco dei calcoli (Calcolo, Pratica, Anno / tipo, Crediti netti, Stato).</w:t>
       </w:r>
     </w:p>
     <w:p>
@@ -14973,7 +15238,27 @@
           <w:sz w:val="21"/>
           <w:szCs w:val="21"/>
         </w:rPr>
-        <w:t xml:space="preserve">Togliete la spunta alle parti che non volete importare.</w:t>
+        <w:t xml:space="preserve">Premete </w:t>
+      </w:r>
+      <w:r>
+        <w:rPr>
+          <w:rFonts w:ascii="Arial" w:cs="Arial" w:eastAsia="Arial" w:hAnsi="Arial"/>
+          <w:b/>
+          <w:bCs/>
+          <w:color w:val="1B2118"/>
+          <w:sz w:val="21"/>
+          <w:szCs w:val="21"/>
+        </w:rPr>
+        <w:t xml:space="preserve">+ Nuovo calcolo</w:t>
+      </w:r>
+      <w:r>
+        <w:rPr>
+          <w:rFonts w:ascii="Arial" w:cs="Arial" w:eastAsia="Arial" w:hAnsi="Arial"/>
+          <w:color w:val="1B2118"/>
+          <w:sz w:val="21"/>
+          <w:szCs w:val="21"/>
+        </w:rPr>
+        <w:t xml:space="preserve">.</w:t>
       </w:r>
     </w:p>
     <w:p>
@@ -14992,102 +15277,87 @@
           <w:sz w:val="21"/>
           <w:szCs w:val="21"/>
         </w:rPr>
-        <w:t xml:space="preserve">Premete </w:t>
-      </w:r>
-      <w:r>
-        <w:rPr>
-          <w:rFonts w:ascii="Arial" w:cs="Arial" w:eastAsia="Arial" w:hAnsi="Arial"/>
-          <w:b/>
-          <w:bCs/>
-          <w:color w:val="1B2118"/>
-          <w:sz w:val="21"/>
-          <w:szCs w:val="21"/>
-        </w:rPr>
-        <w:t xml:space="preserve">Importa nel calcolo</w:t>
-      </w:r>
-      <w:r>
-        <w:rPr>
-          <w:rFonts w:ascii="Arial" w:cs="Arial" w:eastAsia="Arial" w:hAnsi="Arial"/>
-          <w:color w:val="1B2118"/>
-          <w:sz w:val="21"/>
-          <w:szCs w:val="21"/>
-        </w:rPr>
-        <w:t xml:space="preserve">. Le parti spuntate </w:t>
-      </w:r>
-      <w:r>
-        <w:rPr>
-          <w:rFonts w:ascii="Arial" w:cs="Arial" w:eastAsia="Arial" w:hAnsi="Arial"/>
-          <w:b/>
-          <w:bCs/>
-          <w:color w:val="1B2118"/>
-          <w:sz w:val="21"/>
-          <w:szCs w:val="21"/>
-        </w:rPr>
-        <w:t xml:space="preserve">sostituiscono</w:t>
-      </w:r>
-      <w:r>
-        <w:rPr>
-          <w:rFonts w:ascii="Arial" w:cs="Arial" w:eastAsia="Arial" w:hAnsi="Arial"/>
-          <w:color w:val="1B2118"/>
-          <w:sz w:val="21"/>
-          <w:szCs w:val="21"/>
-        </w:rPr>
-        <w:t xml:space="preserve"> quelle del calcolo e sono salvate subito. Il calcolo annota il file di origine («Ultimo import»).</w:t>
-      </w:r>
-    </w:p>
-    <w:p>
-      <w:pPr>
-        <w:spacing w:after="60"/>
-      </w:pPr>
-    </w:p>
-    <w:p>
-      <w:pPr>
-        <w:spacing w:after="140" w:line="300"/>
-      </w:pPr>
-      <w:r>
-        <w:rPr>
-          <w:rFonts w:ascii="Arial" w:cs="Arial" w:eastAsia="Arial" w:hAnsi="Arial"/>
-          <w:b/>
-          <w:bCs/>
-          <w:color w:val="1B2118"/>
-          <w:sz w:val="21"/>
-          <w:szCs w:val="21"/>
-        </w:rPr>
-        <w:t xml:space="preserve">Singole letture.</w:t>
-      </w:r>
-      <w:r>
-        <w:rPr>
-          <w:rFonts w:ascii="Arial" w:cs="Arial" w:eastAsia="Arial" w:hAnsi="Arial"/>
-          <w:color w:val="1B2118"/>
-          <w:sz w:val="21"/>
-          <w:szCs w:val="21"/>
-        </w:rPr>
-        <w:t xml:space="preserve"> Se il Comune ha compilato il foglio 6_Letture, il portale somma le letture dell'anno del calcolo per ogni utenza e tipologia: gli svuotamenti domiciliari diventano numero di svuotamenti e volume medio del contenitore; pesi e volumi alle strutture informatizzate e ai centri di raccolta si sommano. Le letture di altri anni sono escluse e il numero compare tra gli avvisi. Se sono compilati sia il foglio 5 sia il foglio 6, vale il foglio 5.</w:t>
-      </w:r>
-    </w:p>
-    <w:p>
-      <w:pPr>
-        <w:spacing w:after="140" w:line="300"/>
-      </w:pPr>
-      <w:r>
-        <w:rPr>
-          <w:rFonts w:ascii="Arial" w:cs="Arial" w:eastAsia="Arial" w:hAnsi="Arial"/>
-          <w:b/>
-          <w:bCs/>
-          <w:color w:val="1B2118"/>
-          <w:sz w:val="21"/>
-          <w:szCs w:val="21"/>
-        </w:rPr>
-        <w:t xml:space="preserve">Controlli di coerenza.</w:t>
-      </w:r>
-      <w:r>
-        <w:rPr>
-          <w:rFonts w:ascii="Arial" w:cs="Arial" w:eastAsia="Arial" w:hAnsi="Arial"/>
-          <w:color w:val="1B2118"/>
-          <w:sz w:val="21"/>
-          <w:szCs w:val="21"/>
-        </w:rPr>
-        <w:t xml:space="preserve"> Compaiono nell'anteprima, nel passo 5 e nei risultati, divisi in </w:t>
+        <w:t xml:space="preserve">Scegliete la </w:t>
+      </w:r>
+      <w:r>
+        <w:rPr>
+          <w:rFonts w:ascii="Arial" w:cs="Arial" w:eastAsia="Arial" w:hAnsi="Arial"/>
+          <w:b/>
+          <w:bCs/>
+          <w:color w:val="1B2118"/>
+          <w:sz w:val="21"/>
+          <w:szCs w:val="21"/>
+        </w:rPr>
+        <w:t xml:space="preserve">Pratica</w:t>
+      </w:r>
+      <w:r>
+        <w:rPr>
+          <w:rFonts w:ascii="Arial" w:cs="Arial" w:eastAsia="Arial" w:hAnsi="Arial"/>
+          <w:color w:val="1B2118"/>
+          <w:sz w:val="21"/>
+          <w:szCs w:val="21"/>
+        </w:rPr>
+        <w:t xml:space="preserve"> (Progetto o Rapporto di Monitoraggio), un </w:t>
+      </w:r>
+      <w:r>
+        <w:rPr>
+          <w:rFonts w:ascii="Arial" w:cs="Arial" w:eastAsia="Arial" w:hAnsi="Arial"/>
+          <w:b/>
+          <w:bCs/>
+          <w:color w:val="1B2118"/>
+          <w:sz w:val="21"/>
+          <w:szCs w:val="21"/>
+        </w:rPr>
+        <w:t xml:space="preserve">Titolo</w:t>
+      </w:r>
+      <w:r>
+        <w:rPr>
+          <w:rFonts w:ascii="Arial" w:cs="Arial" w:eastAsia="Arial" w:hAnsi="Arial"/>
+          <w:color w:val="1B2118"/>
+          <w:sz w:val="21"/>
+          <w:szCs w:val="21"/>
+        </w:rPr>
+        <w:t xml:space="preserve"> (es. «Monitoraggio 2025»), l'</w:t>
+      </w:r>
+      <w:r>
+        <w:rPr>
+          <w:rFonts w:ascii="Arial" w:cs="Arial" w:eastAsia="Arial" w:hAnsi="Arial"/>
+          <w:b/>
+          <w:bCs/>
+          <w:color w:val="1B2118"/>
+          <w:sz w:val="21"/>
+          <w:szCs w:val="21"/>
+        </w:rPr>
+        <w:t xml:space="preserve">Anno di riferimento</w:t>
+      </w:r>
+      <w:r>
+        <w:rPr>
+          <w:rFonts w:ascii="Arial" w:cs="Arial" w:eastAsia="Arial" w:hAnsi="Arial"/>
+          <w:color w:val="1B2118"/>
+          <w:sz w:val="21"/>
+          <w:szCs w:val="21"/>
+        </w:rPr>
+        <w:t xml:space="preserve"> e il </w:t>
+      </w:r>
+      <w:r>
+        <w:rPr>
+          <w:rFonts w:ascii="Arial" w:cs="Arial" w:eastAsia="Arial" w:hAnsi="Arial"/>
+          <w:b/>
+          <w:bCs/>
+          <w:color w:val="1B2118"/>
+          <w:sz w:val="21"/>
+          <w:szCs w:val="21"/>
+        </w:rPr>
+        <w:t xml:space="preserve">Tipo di stima</w:t>
+      </w:r>
+      <w:r>
+        <w:rPr>
+          <w:rFonts w:ascii="Arial" w:cs="Arial" w:eastAsia="Arial" w:hAnsi="Arial"/>
+          <w:color w:val="1B2118"/>
+          <w:sz w:val="21"/>
+          <w:szCs w:val="21"/>
+        </w:rPr>
+        <w:t xml:space="preserve">: </w:t>
       </w:r>
       <w:r>
         <w:rPr>
@@ -15098,16 +15368,16 @@
           <w:sz w:val="21"/>
           <w:szCs w:val="21"/>
         </w:rPr>
-        <w:t xml:space="preserve">da correggere</w:t>
-      </w:r>
-      <w:r>
-        <w:rPr>
-          <w:rFonts w:ascii="Arial" w:cs="Arial" w:eastAsia="Arial" w:hAnsi="Arial"/>
-          <w:color w:val="1B2118"/>
-          <w:sz w:val="21"/>
-          <w:szCs w:val="21"/>
-        </w:rPr>
-        <w:t xml:space="preserve"> e </w:t>
+        <w:t xml:space="preserve">Ex post (letture della Banca Dati Utenze)</w:t>
+      </w:r>
+      <w:r>
+        <w:rPr>
+          <w:rFonts w:ascii="Arial" w:cs="Arial" w:eastAsia="Arial" w:hAnsi="Arial"/>
+          <w:color w:val="1B2118"/>
+          <w:sz w:val="21"/>
+          <w:szCs w:val="21"/>
+        </w:rPr>
+        <w:t xml:space="preserve"> oppure </w:t>
       </w:r>
       <w:r>
         <w:rPr>
@@ -15118,17 +15388,100 @@
           <w:sz w:val="21"/>
           <w:szCs w:val="21"/>
         </w:rPr>
-        <w:t xml:space="preserve">da verificare</w:t>
-      </w:r>
-      <w:r>
-        <w:rPr>
-          <w:rFonts w:ascii="Arial" w:cs="Arial" w:eastAsia="Arial" w:hAnsi="Arial"/>
-          <w:color w:val="1B2118"/>
-          <w:sz w:val="21"/>
-          <w:szCs w:val="21"/>
-        </w:rPr>
-        <w:t xml:space="preserve">. Ad esempio: ripartizione PEF diversa da 100%, indifferenziato mancante, classi della Banca Dati che non esistono nella delibera (spesso scritte in modo diverso), utenze con classi diverse su righe diverse, più utenze nella Banca Dati che nella delibera, più di 366 svuotamenti, contenitori oltre 5.000 litri, conferimenti superiori al totale del territorio, anno dei dati diverso da quello del calcolo. Non bloccano l'import: si correggono nei passi oppure con un file nuovo del Comune.</w:t>
-      </w:r>
+        <w:t xml:space="preserve">Ex ante</w:t>
+      </w:r>
+      <w:r>
+        <w:rPr>
+          <w:rFonts w:ascii="Arial" w:cs="Arial" w:eastAsia="Arial" w:hAnsi="Arial"/>
+          <w:color w:val="1B2118"/>
+          <w:sz w:val="21"/>
+          <w:szCs w:val="21"/>
+        </w:rPr>
+        <w:t xml:space="preserve">.</w:t>
+      </w:r>
+    </w:p>
+    <w:p>
+      <w:pPr>
+        <w:pStyle w:val="ListParagraph"/>
+        <w:numPr>
+          <w:ilvl w:val="0"/>
+          <w:numId w:val="19"/>
+        </w:numPr>
+        <w:spacing w:after="70" w:line="290"/>
+      </w:pPr>
+      <w:r>
+        <w:rPr>
+          <w:rFonts w:ascii="Arial" w:cs="Arial" w:eastAsia="Arial" w:hAnsi="Arial"/>
+          <w:color w:val="1B2118"/>
+          <w:sz w:val="21"/>
+          <w:szCs w:val="21"/>
+        </w:rPr>
+        <w:t xml:space="preserve">Solo se è il primo anno del Progetto, compilate </w:t>
+      </w:r>
+      <w:r>
+        <w:rPr>
+          <w:rFonts w:ascii="Arial" w:cs="Arial" w:eastAsia="Arial" w:hAnsi="Arial"/>
+          <w:b/>
+          <w:bCs/>
+          <w:color w:val="1B2118"/>
+          <w:sz w:val="21"/>
+          <w:szCs w:val="21"/>
+        </w:rPr>
+        <w:t xml:space="preserve">Avvio del progetto (solo se nel primo anno)</w:t>
+      </w:r>
+      <w:r>
+        <w:rPr>
+          <w:rFonts w:ascii="Arial" w:cs="Arial" w:eastAsia="Arial" w:hAnsi="Arial"/>
+          <w:color w:val="1B2118"/>
+          <w:sz w:val="21"/>
+          <w:szCs w:val="21"/>
+        </w:rPr>
+        <w:t xml:space="preserve">.</w:t>
+      </w:r>
+    </w:p>
+    <w:p>
+      <w:pPr>
+        <w:pStyle w:val="ListParagraph"/>
+        <w:numPr>
+          <w:ilvl w:val="0"/>
+          <w:numId w:val="19"/>
+        </w:numPr>
+        <w:spacing w:after="70" w:line="290"/>
+      </w:pPr>
+      <w:r>
+        <w:rPr>
+          <w:rFonts w:ascii="Arial" w:cs="Arial" w:eastAsia="Arial" w:hAnsi="Arial"/>
+          <w:color w:val="1B2118"/>
+          <w:sz w:val="21"/>
+          <w:szCs w:val="21"/>
+        </w:rPr>
+        <w:t xml:space="preserve">Premete </w:t>
+      </w:r>
+      <w:r>
+        <w:rPr>
+          <w:rFonts w:ascii="Arial" w:cs="Arial" w:eastAsia="Arial" w:hAnsi="Arial"/>
+          <w:b/>
+          <w:bCs/>
+          <w:color w:val="1B2118"/>
+          <w:sz w:val="21"/>
+          <w:szCs w:val="21"/>
+        </w:rPr>
+        <w:t xml:space="preserve">Crea e apri</w:t>
+      </w:r>
+      <w:r>
+        <w:rPr>
+          <w:rFonts w:ascii="Arial" w:cs="Arial" w:eastAsia="Arial" w:hAnsi="Arial"/>
+          <w:color w:val="1B2118"/>
+          <w:sz w:val="21"/>
+          <w:szCs w:val="21"/>
+        </w:rPr>
+        <w:t xml:space="preserve">.</w:t>
+      </w:r>
+    </w:p>
+    <w:p>
+      <w:pPr>
+        <w:spacing w:after="60"/>
+      </w:pPr>
     </w:p>
     <w:p>
       <w:pPr>
@@ -15141,47 +15494,147 @@
           <w:sz w:val="21"/>
           <w:szCs w:val="21"/>
         </w:rPr>
-        <w:t xml:space="preserve">Le singole tabelle si possono ancora importare a mano in CSV nei passi 2, 3 e 5 (</w:t>
-      </w:r>
-      <w:r>
-        <w:rPr>
-          <w:rFonts w:ascii="Arial" w:cs="Arial" w:eastAsia="Arial" w:hAnsi="Arial"/>
-          <w:b/>
-          <w:bCs/>
-          <w:color w:val="1B2118"/>
-          <w:sz w:val="21"/>
-          <w:szCs w:val="21"/>
-        </w:rPr>
-        <w:t xml:space="preserve">Importa CSV</w:t>
-      </w:r>
-      <w:r>
-        <w:rPr>
-          <w:rFonts w:ascii="Arial" w:cs="Arial" w:eastAsia="Arial" w:hAnsi="Arial"/>
-          <w:color w:val="1B2118"/>
-          <w:sz w:val="21"/>
-          <w:szCs w:val="21"/>
-        </w:rPr>
-        <w:t xml:space="preserve"> e </w:t>
-      </w:r>
-      <w:r>
-        <w:rPr>
-          <w:rFonts w:ascii="Arial" w:cs="Arial" w:eastAsia="Arial" w:hAnsi="Arial"/>
-          <w:b/>
-          <w:bCs/>
-          <w:color w:val="1B2118"/>
-          <w:sz w:val="21"/>
-          <w:szCs w:val="21"/>
-        </w:rPr>
-        <w:t xml:space="preserve">Scarica il modello</w:t>
-      </w:r>
-      <w:r>
-        <w:rPr>
-          <w:rFonts w:ascii="Arial" w:cs="Arial" w:eastAsia="Arial" w:hAnsi="Arial"/>
-          <w:color w:val="1B2118"/>
-          <w:sz w:val="21"/>
-          <w:szCs w:val="21"/>
-        </w:rPr>
-        <w:t xml:space="preserve">).</w:t>
+        <w:t xml:space="preserve">Il calcolo nasce come </w:t>
+      </w:r>
+      <w:r>
+        <w:rPr>
+          <w:rFonts w:ascii="Arial" w:cs="Arial" w:eastAsia="Arial" w:hAnsi="Arial"/>
+          <w:b/>
+          <w:bCs/>
+          <w:color w:val="1B2118"/>
+          <w:sz w:val="21"/>
+          <w:szCs w:val="21"/>
+        </w:rPr>
+        <w:t xml:space="preserve">Bozza</w:t>
+      </w:r>
+      <w:r>
+        <w:rPr>
+          <w:rFonts w:ascii="Arial" w:cs="Arial" w:eastAsia="Arial" w:hAnsi="Arial"/>
+          <w:color w:val="1B2118"/>
+          <w:sz w:val="21"/>
+          <w:szCs w:val="21"/>
+        </w:rPr>
+        <w:t xml:space="preserve">. In alto trovate i pulsanti </w:t>
+      </w:r>
+      <w:r>
+        <w:rPr>
+          <w:rFonts w:ascii="Arial" w:cs="Arial" w:eastAsia="Arial" w:hAnsi="Arial"/>
+          <w:b/>
+          <w:bCs/>
+          <w:color w:val="1B2118"/>
+          <w:sz w:val="21"/>
+          <w:szCs w:val="21"/>
+        </w:rPr>
+        <w:t xml:space="preserve">Salva</w:t>
+      </w:r>
+      <w:r>
+        <w:rPr>
+          <w:rFonts w:ascii="Arial" w:cs="Arial" w:eastAsia="Arial" w:hAnsi="Arial"/>
+          <w:color w:val="1B2118"/>
+          <w:sz w:val="21"/>
+          <w:szCs w:val="21"/>
+        </w:rPr>
+        <w:t xml:space="preserve"> (diventa </w:t>
+      </w:r>
+      <w:r>
+        <w:rPr>
+          <w:rFonts w:ascii="Arial" w:cs="Arial" w:eastAsia="Arial" w:hAnsi="Arial"/>
+          <w:i/>
+          <w:iCs/>
+          <w:color w:val="1B2118"/>
+          <w:sz w:val="21"/>
+          <w:szCs w:val="21"/>
+        </w:rPr>
+        <w:t xml:space="preserve">Salvato</w:t>
+      </w:r>
+      <w:r>
+        <w:rPr>
+          <w:rFonts w:ascii="Arial" w:cs="Arial" w:eastAsia="Arial" w:hAnsi="Arial"/>
+          <w:color w:val="1B2118"/>
+          <w:sz w:val="21"/>
+          <w:szCs w:val="21"/>
+        </w:rPr>
+        <w:t xml:space="preserve"> quando non ci sono modifiche), </w:t>
+      </w:r>
+      <w:r>
+        <w:rPr>
+          <w:rFonts w:ascii="Arial" w:cs="Arial" w:eastAsia="Arial" w:hAnsi="Arial"/>
+          <w:b/>
+          <w:bCs/>
+          <w:color w:val="1B2118"/>
+          <w:sz w:val="21"/>
+          <w:szCs w:val="21"/>
+        </w:rPr>
+        <w:t xml:space="preserve">Calcola</w:t>
+      </w:r>
+      <w:r>
+        <w:rPr>
+          <w:rFonts w:ascii="Arial" w:cs="Arial" w:eastAsia="Arial" w:hAnsi="Arial"/>
+          <w:color w:val="1B2118"/>
+          <w:sz w:val="21"/>
+          <w:szCs w:val="21"/>
+        </w:rPr>
+        <w:t xml:space="preserve">, </w:t>
+      </w:r>
+      <w:r>
+        <w:rPr>
+          <w:rFonts w:ascii="Arial" w:cs="Arial" w:eastAsia="Arial" w:hAnsi="Arial"/>
+          <w:b/>
+          <w:bCs/>
+          <w:color w:val="1B2118"/>
+          <w:sz w:val="21"/>
+          <w:szCs w:val="21"/>
+        </w:rPr>
+        <w:t xml:space="preserve">Conferma calcolo</w:t>
+      </w:r>
+      <w:r>
+        <w:rPr>
+          <w:rFonts w:ascii="Arial" w:cs="Arial" w:eastAsia="Arial" w:hAnsi="Arial"/>
+          <w:color w:val="1B2118"/>
+          <w:sz w:val="21"/>
+          <w:szCs w:val="21"/>
+        </w:rPr>
+        <w:t xml:space="preserve"> ed </w:t>
+      </w:r>
+      <w:r>
+        <w:rPr>
+          <w:rFonts w:ascii="Arial" w:cs="Arial" w:eastAsia="Arial" w:hAnsi="Arial"/>
+          <w:b/>
+          <w:bCs/>
+          <w:color w:val="1B2118"/>
+          <w:sz w:val="21"/>
+          <w:szCs w:val="21"/>
+        </w:rPr>
+        <w:t xml:space="preserve">Elimina</w:t>
+      </w:r>
+      <w:r>
+        <w:rPr>
+          <w:rFonts w:ascii="Arial" w:cs="Arial" w:eastAsia="Arial" w:hAnsi="Arial"/>
+          <w:color w:val="1B2118"/>
+          <w:sz w:val="21"/>
+          <w:szCs w:val="21"/>
+        </w:rPr>
+        <w:t xml:space="preserve">. A sinistra c'è il menu </w:t>
+      </w:r>
+      <w:r>
+        <w:rPr>
+          <w:rFonts w:ascii="Arial" w:cs="Arial" w:eastAsia="Arial" w:hAnsi="Arial"/>
+          <w:b/>
+          <w:bCs/>
+          <w:color w:val="1B2118"/>
+          <w:sz w:val="21"/>
+          <w:szCs w:val="21"/>
+        </w:rPr>
+        <w:t xml:space="preserve">Passi del calcolo</w:t>
+      </w:r>
+      <w:r>
+        <w:rPr>
+          <w:rFonts w:ascii="Arial" w:cs="Arial" w:eastAsia="Arial" w:hAnsi="Arial"/>
+          <w:color w:val="1B2118"/>
+          <w:sz w:val="21"/>
+          <w:szCs w:val="21"/>
+        </w:rPr>
+        <w:t xml:space="preserve">.</w:t>
       </w:r>
     </w:p>
     <w:p>
@@ -15199,7 +15652,1518 @@
           <w:sz w:val="25"/>
           <w:szCs w:val="25"/>
         </w:rPr>
-        <w:t xml:space="preserve">Creare un calcolo</w:t>
+        <w:t xml:space="preserve">I sette passi</w:t>
+      </w:r>
+    </w:p>
+    <w:p>
+      <w:pPr>
+        <w:spacing w:after="140" w:line="300"/>
+      </w:pPr>
+      <w:r>
+        <w:rPr>
+          <w:rFonts w:ascii="Arial" w:cs="Arial" w:eastAsia="Arial" w:hAnsi="Arial"/>
+          <w:color w:val="1B2118"/>
+          <w:sz w:val="21"/>
+          <w:szCs w:val="21"/>
+        </w:rPr>
+        <w:t xml:space="preserve">Ogni tabella ha </w:t>
+      </w:r>
+      <w:r>
+        <w:rPr>
+          <w:rFonts w:ascii="Arial" w:cs="Arial" w:eastAsia="Arial" w:hAnsi="Arial"/>
+          <w:b/>
+          <w:bCs/>
+          <w:color w:val="1B2118"/>
+          <w:sz w:val="21"/>
+          <w:szCs w:val="21"/>
+        </w:rPr>
+        <w:t xml:space="preserve">+ Riga</w:t>
+      </w:r>
+      <w:r>
+        <w:rPr>
+          <w:rFonts w:ascii="Arial" w:cs="Arial" w:eastAsia="Arial" w:hAnsi="Arial"/>
+          <w:color w:val="1B2118"/>
+          <w:sz w:val="21"/>
+          <w:szCs w:val="21"/>
+        </w:rPr>
+        <w:t xml:space="preserve">, </w:t>
+      </w:r>
+      <w:r>
+        <w:rPr>
+          <w:rFonts w:ascii="Arial" w:cs="Arial" w:eastAsia="Arial" w:hAnsi="Arial"/>
+          <w:b/>
+          <w:bCs/>
+          <w:color w:val="1B2118"/>
+          <w:sz w:val="21"/>
+          <w:szCs w:val="21"/>
+        </w:rPr>
+        <w:t xml:space="preserve">Importa CSV</w:t>
+      </w:r>
+      <w:r>
+        <w:rPr>
+          <w:rFonts w:ascii="Arial" w:cs="Arial" w:eastAsia="Arial" w:hAnsi="Arial"/>
+          <w:color w:val="1B2118"/>
+          <w:sz w:val="21"/>
+          <w:szCs w:val="21"/>
+        </w:rPr>
+        <w:t xml:space="preserve"> e </w:t>
+      </w:r>
+      <w:r>
+        <w:rPr>
+          <w:rFonts w:ascii="Arial" w:cs="Arial" w:eastAsia="Arial" w:hAnsi="Arial"/>
+          <w:b/>
+          <w:bCs/>
+          <w:color w:val="1B2118"/>
+          <w:sz w:val="21"/>
+          <w:szCs w:val="21"/>
+        </w:rPr>
+        <w:t xml:space="preserve">Scarica il modello</w:t>
+      </w:r>
+      <w:r>
+        <w:rPr>
+          <w:rFonts w:ascii="Arial" w:cs="Arial" w:eastAsia="Arial" w:hAnsi="Arial"/>
+          <w:color w:val="1B2118"/>
+          <w:sz w:val="21"/>
+          <w:szCs w:val="21"/>
+        </w:rPr>
+        <w:t xml:space="preserve">; una riga si toglie con la ×. Ricordatevi di premere </w:t>
+      </w:r>
+      <w:r>
+        <w:rPr>
+          <w:rFonts w:ascii="Arial" w:cs="Arial" w:eastAsia="Arial" w:hAnsi="Arial"/>
+          <w:b/>
+          <w:bCs/>
+          <w:color w:val="1B2118"/>
+          <w:sz w:val="21"/>
+          <w:szCs w:val="21"/>
+        </w:rPr>
+        <w:t xml:space="preserve">Salva</w:t>
+      </w:r>
+      <w:r>
+        <w:rPr>
+          <w:rFonts w:ascii="Arial" w:cs="Arial" w:eastAsia="Arial" w:hAnsi="Arial"/>
+          <w:color w:val="1B2118"/>
+          <w:sz w:val="21"/>
+          <w:szCs w:val="21"/>
+        </w:rPr>
+        <w:t xml:space="preserve">: se lasciate la pagina con modifiche non salvate il browser lo segnala.</w:t>
+      </w:r>
+    </w:p>
+    <w:p>
+      <w:pPr>
+        <w:spacing w:after="140" w:line="300"/>
+      </w:pPr>
+      <w:r>
+        <w:rPr>
+          <w:rFonts w:ascii="Arial" w:cs="Arial" w:eastAsia="Arial" w:hAnsi="Arial"/>
+          <w:b/>
+          <w:bCs/>
+          <w:color w:val="1B2118"/>
+          <w:sz w:val="21"/>
+          <w:szCs w:val="21"/>
+        </w:rPr>
+        <w:t xml:space="preserve">Passo 1 — Impostazioni.</w:t>
+      </w:r>
+      <w:r>
+        <w:rPr>
+          <w:rFonts w:ascii="Arial" w:cs="Arial" w:eastAsia="Arial" w:hAnsi="Arial"/>
+          <w:color w:val="1B2118"/>
+          <w:sz w:val="21"/>
+          <w:szCs w:val="21"/>
+        </w:rPr>
+        <w:t xml:space="preserve"> Titolo, anno, tipo di stima (</w:t>
+      </w:r>
+      <w:r>
+        <w:rPr>
+          <w:rFonts w:ascii="Arial" w:cs="Arial" w:eastAsia="Arial" w:hAnsi="Arial"/>
+          <w:i/>
+          <w:iCs/>
+          <w:color w:val="1B2118"/>
+          <w:sz w:val="21"/>
+          <w:szCs w:val="21"/>
+        </w:rPr>
+        <w:t xml:space="preserve">Ex post (letture reali)</w:t>
+      </w:r>
+      <w:r>
+        <w:rPr>
+          <w:rFonts w:ascii="Arial" w:cs="Arial" w:eastAsia="Arial" w:hAnsi="Arial"/>
+          <w:color w:val="1B2118"/>
+          <w:sz w:val="21"/>
+          <w:szCs w:val="21"/>
+        </w:rPr>
+        <w:t xml:space="preserve"> o </w:t>
+      </w:r>
+      <w:r>
+        <w:rPr>
+          <w:rFonts w:ascii="Arial" w:cs="Arial" w:eastAsia="Arial" w:hAnsi="Arial"/>
+          <w:i/>
+          <w:iCs/>
+          <w:color w:val="1B2118"/>
+          <w:sz w:val="21"/>
+          <w:szCs w:val="21"/>
+        </w:rPr>
+        <w:t xml:space="preserve">Ex ante</w:t>
+      </w:r>
+      <w:r>
+        <w:rPr>
+          <w:rFonts w:ascii="Arial" w:cs="Arial" w:eastAsia="Arial" w:hAnsi="Arial"/>
+          <w:color w:val="1B2118"/>
+          <w:sz w:val="21"/>
+          <w:szCs w:val="21"/>
+        </w:rPr>
+        <w:t xml:space="preserve">), avvio del progetto se primo anno, note e fonti dei dati.</w:t>
+      </w:r>
+    </w:p>
+    <w:p>
+      <w:pPr>
+        <w:spacing w:after="140" w:line="300"/>
+      </w:pPr>
+      <w:r>
+        <w:rPr>
+          <w:rFonts w:ascii="Arial" w:cs="Arial" w:eastAsia="Arial" w:hAnsi="Arial"/>
+          <w:b/>
+          <w:bCs/>
+          <w:color w:val="1B2118"/>
+          <w:sz w:val="21"/>
+          <w:szCs w:val="21"/>
+        </w:rPr>
+        <w:t xml:space="preserve">Passo 2 — Rifiuti del territorio.</w:t>
+      </w:r>
+      <w:r>
+        <w:rPr>
+          <w:rFonts w:ascii="Arial" w:cs="Arial" w:eastAsia="Arial" w:hAnsi="Arial"/>
+          <w:color w:val="1B2118"/>
+          <w:sz w:val="21"/>
+          <w:szCs w:val="21"/>
+        </w:rPr>
+        <w:t xml:space="preserve"> Una riga per codice EER (es. 200301 </w:t>
+      </w:r>
+      <w:r>
+        <w:rPr>
+          <w:rFonts w:ascii="Arial" w:cs="Arial" w:eastAsia="Arial" w:hAnsi="Arial"/>
+          <w:i/>
+          <w:iCs/>
+          <w:color w:val="1B2118"/>
+          <w:sz w:val="21"/>
+          <w:szCs w:val="21"/>
+        </w:rPr>
+        <w:t xml:space="preserve">Rifiuti urbani non differenziati</w:t>
+      </w:r>
+      <w:r>
+        <w:rPr>
+          <w:rFonts w:ascii="Arial" w:cs="Arial" w:eastAsia="Arial" w:hAnsi="Arial"/>
+          <w:color w:val="1B2118"/>
+          <w:sz w:val="21"/>
+          <w:szCs w:val="21"/>
+        </w:rPr>
+        <w:t xml:space="preserve">, 200108 </w:t>
+      </w:r>
+      <w:r>
+        <w:rPr>
+          <w:rFonts w:ascii="Arial" w:cs="Arial" w:eastAsia="Arial" w:hAnsi="Arial"/>
+          <w:i/>
+          <w:iCs/>
+          <w:color w:val="1B2118"/>
+          <w:sz w:val="21"/>
+          <w:szCs w:val="21"/>
+        </w:rPr>
+        <w:t xml:space="preserve">Rifiuti biodegradabili di cucine e mense</w:t>
+      </w:r>
+      <w:r>
+        <w:rPr>
+          <w:rFonts w:ascii="Arial" w:cs="Arial" w:eastAsia="Arial" w:hAnsi="Arial"/>
+          <w:color w:val="1B2118"/>
+          <w:sz w:val="21"/>
+          <w:szCs w:val="21"/>
+        </w:rPr>
+        <w:t xml:space="preserve">, 200201 </w:t>
+      </w:r>
+      <w:r>
+        <w:rPr>
+          <w:rFonts w:ascii="Arial" w:cs="Arial" w:eastAsia="Arial" w:hAnsi="Arial"/>
+          <w:i/>
+          <w:iCs/>
+          <w:color w:val="1B2118"/>
+          <w:sz w:val="21"/>
+          <w:szCs w:val="21"/>
+        </w:rPr>
+        <w:t xml:space="preserve">Rifiuti biodegradabili (verde)</w:t>
+      </w:r>
+      <w:r>
+        <w:rPr>
+          <w:rFonts w:ascii="Arial" w:cs="Arial" w:eastAsia="Arial" w:hAnsi="Arial"/>
+          <w:color w:val="1B2118"/>
+          <w:sz w:val="21"/>
+          <w:szCs w:val="21"/>
+        </w:rPr>
+        <w:t xml:space="preserve">) con tipologia, quantità </w:t>
+      </w:r>
+      <w:r>
+        <w:rPr>
+          <w:rFonts w:ascii="Arial" w:cs="Arial" w:eastAsia="Arial" w:hAnsi="Arial"/>
+          <w:b/>
+          <w:bCs/>
+          <w:color w:val="1B2118"/>
+          <w:sz w:val="21"/>
+          <w:szCs w:val="21"/>
+        </w:rPr>
+        <w:t xml:space="preserve">Qtot (t)</w:t>
+      </w:r>
+      <w:r>
+        <w:rPr>
+          <w:rFonts w:ascii="Arial" w:cs="Arial" w:eastAsia="Arial" w:hAnsi="Arial"/>
+          <w:color w:val="1B2118"/>
+          <w:sz w:val="21"/>
+          <w:szCs w:val="21"/>
+        </w:rPr>
+        <w:t xml:space="preserve"> in tonnellate per anno e la spunta </w:t>
+      </w:r>
+      <w:r>
+        <w:rPr>
+          <w:rFonts w:ascii="Arial" w:cs="Arial" w:eastAsia="Arial" w:hAnsi="Arial"/>
+          <w:b/>
+          <w:bCs/>
+          <w:color w:val="1B2118"/>
+          <w:sz w:val="21"/>
+          <w:szCs w:val="21"/>
+        </w:rPr>
+        <w:t xml:space="preserve">Solo domestiche</w:t>
+      </w:r>
+      <w:r>
+        <w:rPr>
+          <w:rFonts w:ascii="Arial" w:cs="Arial" w:eastAsia="Arial" w:hAnsi="Arial"/>
+          <w:color w:val="1B2118"/>
+          <w:sz w:val="21"/>
+          <w:szCs w:val="21"/>
+        </w:rPr>
+        <w:t xml:space="preserve"> quando il rifiuto è raccolto solo presso le utenze domestiche. Fonte: Catasto rifiuti ISPRA o MUD del Comune. Il modello si chiama </w:t>
+      </w:r>
+      <w:r>
+        <w:rPr>
+          <w:rFonts w:ascii="Arial" w:cs="Arial" w:eastAsia="Arial" w:hAnsi="Arial"/>
+          <w:i/>
+          <w:iCs/>
+          <w:color w:val="1B2118"/>
+          <w:sz w:val="21"/>
+          <w:szCs w:val="21"/>
+        </w:rPr>
+        <w:t xml:space="preserve">rifiuti_ISPRA</w:t>
+      </w:r>
+      <w:r>
+        <w:rPr>
+          <w:rFonts w:ascii="Arial" w:cs="Arial" w:eastAsia="Arial" w:hAnsi="Arial"/>
+          <w:color w:val="1B2118"/>
+          <w:sz w:val="21"/>
+          <w:szCs w:val="21"/>
+        </w:rPr>
+        <w:t xml:space="preserve">.</w:t>
+      </w:r>
+    </w:p>
+    <w:p>
+      <w:pPr>
+        <w:spacing w:after="140" w:line="300"/>
+      </w:pPr>
+      <w:r>
+        <w:rPr>
+          <w:rFonts w:ascii="Arial" w:cs="Arial" w:eastAsia="Arial" w:hAnsi="Arial"/>
+          <w:b/>
+          <w:bCs/>
+          <w:color w:val="1B2118"/>
+          <w:sz w:val="21"/>
+          <w:szCs w:val="21"/>
+        </w:rPr>
+        <w:t xml:space="preserve">Passo 3 — Delibera tariffaria.</w:t>
+      </w:r>
+      <w:r>
+        <w:rPr>
+          <w:rFonts w:ascii="Arial" w:cs="Arial" w:eastAsia="Arial" w:hAnsi="Arial"/>
+          <w:color w:val="1B2118"/>
+          <w:sz w:val="21"/>
+          <w:szCs w:val="21"/>
+        </w:rPr>
+        <w:t xml:space="preserve"> Dalla delibera TARI del Comune:</w:t>
+      </w:r>
+    </w:p>
+    <w:p>
+      <w:pPr>
+        <w:pStyle w:val="ListParagraph"/>
+        <w:numPr>
+          <w:ilvl w:val="0"/>
+          <w:numId w:val="2"/>
+        </w:numPr>
+        <w:spacing w:after="70" w:line="290"/>
+      </w:pPr>
+      <w:r>
+        <w:rPr>
+          <w:rFonts w:ascii="Arial" w:cs="Arial" w:eastAsia="Arial" w:hAnsi="Arial"/>
+          <w:b/>
+          <w:bCs/>
+          <w:color w:val="1B2118"/>
+          <w:sz w:val="21"/>
+          <w:szCs w:val="21"/>
+        </w:rPr>
+        <w:t xml:space="preserve">PEF % utenze domestiche</w:t>
+      </w:r>
+      <w:r>
+        <w:rPr>
+          <w:rFonts w:ascii="Arial" w:cs="Arial" w:eastAsia="Arial" w:hAnsi="Arial"/>
+          <w:color w:val="1B2118"/>
+          <w:sz w:val="21"/>
+          <w:szCs w:val="21"/>
+        </w:rPr>
+        <w:t xml:space="preserve"> e </w:t>
+      </w:r>
+      <w:r>
+        <w:rPr>
+          <w:rFonts w:ascii="Arial" w:cs="Arial" w:eastAsia="Arial" w:hAnsi="Arial"/>
+          <w:b/>
+          <w:bCs/>
+          <w:color w:val="1B2118"/>
+          <w:sz w:val="21"/>
+          <w:szCs w:val="21"/>
+        </w:rPr>
+        <w:t xml:space="preserve">PEF % utenze non domestiche</w:t>
+      </w:r>
+      <w:r>
+        <w:rPr>
+          <w:rFonts w:ascii="Arial" w:cs="Arial" w:eastAsia="Arial" w:hAnsi="Arial"/>
+          <w:color w:val="1B2118"/>
+          <w:sz w:val="21"/>
+          <w:szCs w:val="21"/>
+        </w:rPr>
+        <w:t xml:space="preserve">: la ripartizione dei costi del piano economico finanziario; la somma deve fare 100.</w:t>
+      </w:r>
+    </w:p>
+    <w:p>
+      <w:pPr>
+        <w:pStyle w:val="ListParagraph"/>
+        <w:numPr>
+          <w:ilvl w:val="0"/>
+          <w:numId w:val="2"/>
+        </w:numPr>
+        <w:spacing w:after="70" w:line="290"/>
+      </w:pPr>
+      <w:r>
+        <w:rPr>
+          <w:rFonts w:ascii="Arial" w:cs="Arial" w:eastAsia="Arial" w:hAnsi="Arial"/>
+          <w:b/>
+          <w:bCs/>
+          <w:color w:val="1B2118"/>
+          <w:sz w:val="21"/>
+          <w:szCs w:val="21"/>
+        </w:rPr>
+        <w:t xml:space="preserve">Classi domestiche</w:t>
+      </w:r>
+      <w:r>
+        <w:rPr>
+          <w:rFonts w:ascii="Arial" w:cs="Arial" w:eastAsia="Arial" w:hAnsi="Arial"/>
+          <w:color w:val="1B2118"/>
+          <w:sz w:val="21"/>
+          <w:szCs w:val="21"/>
+        </w:rPr>
+        <w:t xml:space="preserve">: per ogni classe (numero di componenti del nucleo) il </w:t>
+      </w:r>
+      <w:r>
+        <w:rPr>
+          <w:rFonts w:ascii="Arial" w:cs="Arial" w:eastAsia="Arial" w:hAnsi="Arial"/>
+          <w:b/>
+          <w:bCs/>
+          <w:color w:val="1B2118"/>
+          <w:sz w:val="21"/>
+          <w:szCs w:val="21"/>
+        </w:rPr>
+        <w:t xml:space="preserve">N. utenze</w:t>
+      </w:r>
+      <w:r>
+        <w:rPr>
+          <w:rFonts w:ascii="Arial" w:cs="Arial" w:eastAsia="Arial" w:hAnsi="Arial"/>
+          <w:color w:val="1B2118"/>
+          <w:sz w:val="21"/>
+          <w:szCs w:val="21"/>
+        </w:rPr>
+        <w:t xml:space="preserve"> e il coefficiente </w:t>
+      </w:r>
+      <w:r>
+        <w:rPr>
+          <w:rFonts w:ascii="Arial" w:cs="Arial" w:eastAsia="Arial" w:hAnsi="Arial"/>
+          <w:b/>
+          <w:bCs/>
+          <w:color w:val="1B2118"/>
+          <w:sz w:val="21"/>
+          <w:szCs w:val="21"/>
+        </w:rPr>
+        <w:t xml:space="preserve">Kb</w:t>
+      </w:r>
+      <w:r>
+        <w:rPr>
+          <w:rFonts w:ascii="Arial" w:cs="Arial" w:eastAsia="Arial" w:hAnsi="Arial"/>
+          <w:color w:val="1B2118"/>
+          <w:sz w:val="21"/>
+          <w:szCs w:val="21"/>
+        </w:rPr>
+        <w:t xml:space="preserve">.</w:t>
+      </w:r>
+    </w:p>
+    <w:p>
+      <w:pPr>
+        <w:pStyle w:val="ListParagraph"/>
+        <w:numPr>
+          <w:ilvl w:val="0"/>
+          <w:numId w:val="2"/>
+        </w:numPr>
+        <w:spacing w:after="70" w:line="290"/>
+      </w:pPr>
+      <w:r>
+        <w:rPr>
+          <w:rFonts w:ascii="Arial" w:cs="Arial" w:eastAsia="Arial" w:hAnsi="Arial"/>
+          <w:b/>
+          <w:bCs/>
+          <w:color w:val="1B2118"/>
+          <w:sz w:val="21"/>
+          <w:szCs w:val="21"/>
+        </w:rPr>
+        <w:t xml:space="preserve">Classi non domestiche</w:t>
+      </w:r>
+      <w:r>
+        <w:rPr>
+          <w:rFonts w:ascii="Arial" w:cs="Arial" w:eastAsia="Arial" w:hAnsi="Arial"/>
+          <w:color w:val="1B2118"/>
+          <w:sz w:val="21"/>
+          <w:szCs w:val="21"/>
+        </w:rPr>
+        <w:t xml:space="preserve">: per ogni categoria (es. «1 - Musei, biblioteche, scuole») il </w:t>
+      </w:r>
+      <w:r>
+        <w:rPr>
+          <w:rFonts w:ascii="Arial" w:cs="Arial" w:eastAsia="Arial" w:hAnsi="Arial"/>
+          <w:b/>
+          <w:bCs/>
+          <w:color w:val="1B2118"/>
+          <w:sz w:val="21"/>
+          <w:szCs w:val="21"/>
+        </w:rPr>
+        <w:t xml:space="preserve">N. utenze</w:t>
+      </w:r>
+      <w:r>
+        <w:rPr>
+          <w:rFonts w:ascii="Arial" w:cs="Arial" w:eastAsia="Arial" w:hAnsi="Arial"/>
+          <w:color w:val="1B2118"/>
+          <w:sz w:val="21"/>
+          <w:szCs w:val="21"/>
+        </w:rPr>
+        <w:t xml:space="preserve">, la </w:t>
+      </w:r>
+      <w:r>
+        <w:rPr>
+          <w:rFonts w:ascii="Arial" w:cs="Arial" w:eastAsia="Arial" w:hAnsi="Arial"/>
+          <w:b/>
+          <w:bCs/>
+          <w:color w:val="1B2118"/>
+          <w:sz w:val="21"/>
+          <w:szCs w:val="21"/>
+        </w:rPr>
+        <w:t xml:space="preserve">Superficie (m²)</w:t>
+      </w:r>
+      <w:r>
+        <w:rPr>
+          <w:rFonts w:ascii="Arial" w:cs="Arial" w:eastAsia="Arial" w:hAnsi="Arial"/>
+          <w:color w:val="1B2118"/>
+          <w:sz w:val="21"/>
+          <w:szCs w:val="21"/>
+        </w:rPr>
+        <w:t xml:space="preserve"> e il coefficiente </w:t>
+      </w:r>
+      <w:r>
+        <w:rPr>
+          <w:rFonts w:ascii="Arial" w:cs="Arial" w:eastAsia="Arial" w:hAnsi="Arial"/>
+          <w:b/>
+          <w:bCs/>
+          <w:color w:val="1B2118"/>
+          <w:sz w:val="21"/>
+          <w:szCs w:val="21"/>
+        </w:rPr>
+        <w:t xml:space="preserve">Kd</w:t>
+      </w:r>
+      <w:r>
+        <w:rPr>
+          <w:rFonts w:ascii="Arial" w:cs="Arial" w:eastAsia="Arial" w:hAnsi="Arial"/>
+          <w:color w:val="1B2118"/>
+          <w:sz w:val="21"/>
+          <w:szCs w:val="21"/>
+        </w:rPr>
+        <w:t xml:space="preserve">.</w:t>
+      </w:r>
+    </w:p>
+    <w:p>
+      <w:pPr>
+        <w:spacing w:after="140" w:line="300"/>
+      </w:pPr>
+      <w:r>
+        <w:rPr>
+          <w:rFonts w:ascii="Arial" w:cs="Arial" w:eastAsia="Arial" w:hAnsi="Arial"/>
+          <w:b/>
+          <w:bCs/>
+          <w:color w:val="1B2118"/>
+          <w:sz w:val="21"/>
+          <w:szCs w:val="21"/>
+        </w:rPr>
+        <w:t xml:space="preserve">Passo 4 — Fattori di emissione e pesi specifici.</w:t>
+      </w:r>
+      <w:r>
+        <w:rPr>
+          <w:rFonts w:ascii="Arial" w:cs="Arial" w:eastAsia="Arial" w:hAnsi="Arial"/>
+          <w:color w:val="1B2118"/>
+          <w:sz w:val="21"/>
+          <w:szCs w:val="21"/>
+        </w:rPr>
+        <w:t xml:space="preserve"> La tabella è già compilata con i valori della Metodologia: </w:t>
+      </w:r>
+      <w:r>
+        <w:rPr>
+          <w:rFonts w:ascii="Arial" w:cs="Arial" w:eastAsia="Arial" w:hAnsi="Arial"/>
+          <w:b/>
+          <w:bCs/>
+          <w:color w:val="1B2118"/>
+          <w:sz w:val="21"/>
+          <w:szCs w:val="21"/>
+        </w:rPr>
+        <w:t xml:space="preserve">FErid(r)</w:t>
+      </w:r>
+      <w:r>
+        <w:rPr>
+          <w:rFonts w:ascii="Arial" w:cs="Arial" w:eastAsia="Arial" w:hAnsi="Arial"/>
+          <w:color w:val="1B2118"/>
+          <w:sz w:val="21"/>
+          <w:szCs w:val="21"/>
+        </w:rPr>
+        <w:t xml:space="preserve"> in kgCO₂eq/kg dalle Tabelle 3 (USEPA WARM) e 4 (WRAP) e i pesi specifici di default della Tabella 8. Il fattore dell'indifferenziato è </w:t>
+      </w:r>
+      <w:r>
+        <w:rPr>
+          <w:rFonts w:ascii="Arial" w:cs="Arial" w:eastAsia="Arial" w:hAnsi="Arial"/>
+          <w:i/>
+          <w:iCs/>
+          <w:color w:val="1B2118"/>
+          <w:sz w:val="21"/>
+          <w:szCs w:val="21"/>
+        </w:rPr>
+        <w:t xml:space="preserve">Calcolato (f. 16-17)</w:t>
+      </w:r>
+      <w:r>
+        <w:rPr>
+          <w:rFonts w:ascii="Arial" w:cs="Arial" w:eastAsia="Arial" w:hAnsi="Arial"/>
+          <w:color w:val="1B2118"/>
+          <w:sz w:val="21"/>
+          <w:szCs w:val="21"/>
+        </w:rPr>
+        <w:t xml:space="preserve"> dal portale. Un valore si cambia solo citando la fonte nelle note. Qui si trovano anche i </w:t>
+      </w:r>
+      <w:r>
+        <w:rPr>
+          <w:rFonts w:ascii="Arial" w:cs="Arial" w:eastAsia="Arial" w:hAnsi="Arial"/>
+          <w:b/>
+          <w:bCs/>
+          <w:color w:val="1B2118"/>
+          <w:sz w:val="21"/>
+          <w:szCs w:val="21"/>
+        </w:rPr>
+        <w:t xml:space="preserve">beni a riuso</w:t>
+      </w:r>
+      <w:r>
+        <w:rPr>
+          <w:rFonts w:ascii="Arial" w:cs="Arial" w:eastAsia="Arial" w:hAnsi="Arial"/>
+          <w:color w:val="1B2118"/>
+          <w:sz w:val="21"/>
+          <w:szCs w:val="21"/>
+        </w:rPr>
+        <w:t xml:space="preserve"> (peso e fattore FErid(b)) e l'opzione </w:t>
+      </w:r>
+      <w:r>
+        <w:rPr>
+          <w:rFonts w:ascii="Arial" w:cs="Arial" w:eastAsia="Arial" w:hAnsi="Arial"/>
+          <w:b/>
+          <w:bCs/>
+          <w:color w:val="1B2118"/>
+          <w:sz w:val="21"/>
+          <w:szCs w:val="21"/>
+        </w:rPr>
+        <w:t xml:space="preserve">Tratta il riuso come riduzione di emissioni</w:t>
+      </w:r>
+      <w:r>
+        <w:rPr>
+          <w:rFonts w:ascii="Arial" w:cs="Arial" w:eastAsia="Arial" w:hAnsi="Arial"/>
+          <w:color w:val="1B2118"/>
+          <w:sz w:val="21"/>
+          <w:szCs w:val="21"/>
+        </w:rPr>
+        <w:t xml:space="preserve">, che resta spenta finché la Fondazione non conferma la scelta (vedi «Scelte da confermare»).</w:t>
+      </w:r>
+    </w:p>
+    <w:p>
+      <w:pPr>
+        <w:spacing w:after="140" w:line="300"/>
+      </w:pPr>
+      <w:r>
+        <w:rPr>
+          <w:rFonts w:ascii="Arial" w:cs="Arial" w:eastAsia="Arial" w:hAnsi="Arial"/>
+          <w:b/>
+          <w:bCs/>
+          <w:color w:val="1B2118"/>
+          <w:sz w:val="21"/>
+          <w:szCs w:val="21"/>
+        </w:rPr>
+        <w:t xml:space="preserve">Passo 5 — Banca Dati Utenze.</w:t>
+      </w:r>
+      <w:r>
+        <w:rPr>
+          <w:rFonts w:ascii="Arial" w:cs="Arial" w:eastAsia="Arial" w:hAnsi="Arial"/>
+          <w:color w:val="1B2118"/>
+          <w:sz w:val="21"/>
+          <w:szCs w:val="21"/>
+        </w:rPr>
+        <w:t xml:space="preserve"> Il cuore del calcolo </w:t>
+      </w:r>
+      <w:r>
+        <w:rPr>
+          <w:rFonts w:ascii="Arial" w:cs="Arial" w:eastAsia="Arial" w:hAnsi="Arial"/>
+          <w:i/>
+          <w:iCs/>
+          <w:color w:val="1B2118"/>
+          <w:sz w:val="21"/>
+          <w:szCs w:val="21"/>
+        </w:rPr>
+        <w:t xml:space="preserve">ex post</w:t>
+      </w:r>
+      <w:r>
+        <w:rPr>
+          <w:rFonts w:ascii="Arial" w:cs="Arial" w:eastAsia="Arial" w:hAnsi="Arial"/>
+          <w:color w:val="1B2118"/>
+          <w:sz w:val="21"/>
+          <w:szCs w:val="21"/>
+        </w:rPr>
+        <w:t xml:space="preserve">. Due tabelle:</w:t>
+      </w:r>
+    </w:p>
+    <w:p>
+      <w:pPr>
+        <w:pStyle w:val="ListParagraph"/>
+        <w:numPr>
+          <w:ilvl w:val="0"/>
+          <w:numId w:val="2"/>
+        </w:numPr>
+        <w:spacing w:after="70" w:line="290"/>
+      </w:pPr>
+      <w:r>
+        <w:rPr>
+          <w:rFonts w:ascii="Arial" w:cs="Arial" w:eastAsia="Arial" w:hAnsi="Arial"/>
+          <w:b/>
+          <w:bCs/>
+          <w:color w:val="1B2118"/>
+          <w:sz w:val="21"/>
+          <w:szCs w:val="21"/>
+        </w:rPr>
+        <w:t xml:space="preserve">Conferimenti</w:t>
+      </w:r>
+      <w:r>
+        <w:rPr>
+          <w:rFonts w:ascii="Arial" w:cs="Arial" w:eastAsia="Arial" w:hAnsi="Arial"/>
+          <w:color w:val="1B2118"/>
+          <w:sz w:val="21"/>
+          <w:szCs w:val="21"/>
+        </w:rPr>
+        <w:t xml:space="preserve">: una riga per utenza e tipologia di rifiuto, con </w:t>
+      </w:r>
+      <w:r>
+        <w:rPr>
+          <w:rFonts w:ascii="Arial" w:cs="Arial" w:eastAsia="Arial" w:hAnsi="Arial"/>
+          <w:b/>
+          <w:bCs/>
+          <w:color w:val="1B2118"/>
+          <w:sz w:val="21"/>
+          <w:szCs w:val="21"/>
+        </w:rPr>
+        <w:t xml:space="preserve">codice utenza</w:t>
+      </w:r>
+      <w:r>
+        <w:rPr>
+          <w:rFonts w:ascii="Arial" w:cs="Arial" w:eastAsia="Arial" w:hAnsi="Arial"/>
+          <w:color w:val="1B2118"/>
+          <w:sz w:val="21"/>
+          <w:szCs w:val="21"/>
+        </w:rPr>
+        <w:t xml:space="preserve">, macrocategoria (domestica o non domestica), classe, numero di </w:t>
+      </w:r>
+      <w:r>
+        <w:rPr>
+          <w:rFonts w:ascii="Arial" w:cs="Arial" w:eastAsia="Arial" w:hAnsi="Arial"/>
+          <w:b/>
+          <w:bCs/>
+          <w:color w:val="1B2118"/>
+          <w:sz w:val="21"/>
+          <w:szCs w:val="21"/>
+        </w:rPr>
+        <w:t xml:space="preserve">Svuotamenti</w:t>
+      </w:r>
+      <w:r>
+        <w:rPr>
+          <w:rFonts w:ascii="Arial" w:cs="Arial" w:eastAsia="Arial" w:hAnsi="Arial"/>
+          <w:color w:val="1B2118"/>
+          <w:sz w:val="21"/>
+          <w:szCs w:val="21"/>
+        </w:rPr>
+        <w:t xml:space="preserve"> e </w:t>
+      </w:r>
+      <w:r>
+        <w:rPr>
+          <w:rFonts w:ascii="Arial" w:cs="Arial" w:eastAsia="Arial" w:hAnsi="Arial"/>
+          <w:b/>
+          <w:bCs/>
+          <w:color w:val="1B2118"/>
+          <w:sz w:val="21"/>
+          <w:szCs w:val="21"/>
+        </w:rPr>
+        <w:t xml:space="preserve">Volume contenitore (L)</w:t>
+      </w:r>
+      <w:r>
+        <w:rPr>
+          <w:rFonts w:ascii="Arial" w:cs="Arial" w:eastAsia="Arial" w:hAnsi="Arial"/>
+          <w:color w:val="1B2118"/>
+          <w:sz w:val="21"/>
+          <w:szCs w:val="21"/>
+        </w:rPr>
+        <w:t xml:space="preserve"> per la raccolta domiciliare, e i pesi o volumi conferiti presso le </w:t>
+      </w:r>
+      <w:r>
+        <w:rPr>
+          <w:rFonts w:ascii="Arial" w:cs="Arial" w:eastAsia="Arial" w:hAnsi="Arial"/>
+          <w:b/>
+          <w:bCs/>
+          <w:color w:val="1B2118"/>
+          <w:sz w:val="21"/>
+          <w:szCs w:val="21"/>
+        </w:rPr>
+        <w:t xml:space="preserve">strutture informatizzate</w:t>
+      </w:r>
+      <w:r>
+        <w:rPr>
+          <w:rFonts w:ascii="Arial" w:cs="Arial" w:eastAsia="Arial" w:hAnsi="Arial"/>
+          <w:color w:val="1B2118"/>
+          <w:sz w:val="21"/>
+          <w:szCs w:val="21"/>
+        </w:rPr>
+        <w:t xml:space="preserve"> e i </w:t>
+      </w:r>
+      <w:r>
+        <w:rPr>
+          <w:rFonts w:ascii="Arial" w:cs="Arial" w:eastAsia="Arial" w:hAnsi="Arial"/>
+          <w:b/>
+          <w:bCs/>
+          <w:color w:val="1B2118"/>
+          <w:sz w:val="21"/>
+          <w:szCs w:val="21"/>
+        </w:rPr>
+        <w:t xml:space="preserve">centri di raccolta</w:t>
+      </w:r>
+      <w:r>
+        <w:rPr>
+          <w:rFonts w:ascii="Arial" w:cs="Arial" w:eastAsia="Arial" w:hAnsi="Arial"/>
+          <w:color w:val="1B2118"/>
+          <w:sz w:val="21"/>
+          <w:szCs w:val="21"/>
+        </w:rPr>
+        <w:t xml:space="preserve">.</w:t>
+      </w:r>
+    </w:p>
+    <w:p>
+      <w:pPr>
+        <w:pStyle w:val="ListParagraph"/>
+        <w:numPr>
+          <w:ilvl w:val="0"/>
+          <w:numId w:val="2"/>
+        </w:numPr>
+        <w:spacing w:after="70" w:line="290"/>
+      </w:pPr>
+      <w:r>
+        <w:rPr>
+          <w:rFonts w:ascii="Arial" w:cs="Arial" w:eastAsia="Arial" w:hAnsi="Arial"/>
+          <w:b/>
+          <w:bCs/>
+          <w:color w:val="1B2118"/>
+          <w:sz w:val="21"/>
+          <w:szCs w:val="21"/>
+        </w:rPr>
+        <w:t xml:space="preserve">Beni a riuso</w:t>
+      </w:r>
+      <w:r>
+        <w:rPr>
+          <w:rFonts w:ascii="Arial" w:cs="Arial" w:eastAsia="Arial" w:hAnsi="Arial"/>
+          <w:color w:val="1B2118"/>
+          <w:sz w:val="21"/>
+          <w:szCs w:val="21"/>
+        </w:rPr>
+        <w:t xml:space="preserve">: una riga per utenza e bene conferito al riuso (codice bene, quantità).</w:t>
+      </w:r>
+    </w:p>
+    <w:p>
+      <w:pPr>
+        <w:spacing w:after="140" w:line="300"/>
+      </w:pPr>
+      <w:r>
+        <w:rPr>
+          <w:rFonts w:ascii="Arial" w:cs="Arial" w:eastAsia="Arial" w:hAnsi="Arial"/>
+          <w:b/>
+          <w:bCs/>
+          <w:color w:val="1B2118"/>
+          <w:sz w:val="21"/>
+          <w:szCs w:val="21"/>
+        </w:rPr>
+        <w:t xml:space="preserve">Attenzione.</w:t>
+      </w:r>
+      <w:r>
+        <w:rPr>
+          <w:rFonts w:ascii="Arial" w:cs="Arial" w:eastAsia="Arial" w:hAnsi="Arial"/>
+          <w:color w:val="1B2118"/>
+          <w:sz w:val="21"/>
+          <w:szCs w:val="21"/>
+        </w:rPr>
+        <w:t xml:space="preserve"> </w:t>
+      </w:r>
+      <w:r>
+        <w:rPr>
+          <w:rFonts w:ascii="Arial" w:cs="Arial" w:eastAsia="Arial" w:hAnsi="Arial"/>
+          <w:b/>
+          <w:bCs/>
+          <w:color w:val="1B2118"/>
+          <w:sz w:val="21"/>
+          <w:szCs w:val="21"/>
+        </w:rPr>
+        <w:t xml:space="preserve">Importa CSV (sostituisce i dati)</w:t>
+      </w:r>
+      <w:r>
+        <w:rPr>
+          <w:rFonts w:ascii="Arial" w:cs="Arial" w:eastAsia="Arial" w:hAnsi="Arial"/>
+          <w:color w:val="1B2118"/>
+          <w:sz w:val="21"/>
+          <w:szCs w:val="21"/>
+        </w:rPr>
+        <w:t xml:space="preserve"> cancella le righe già presenti nella tabella e salva subito il nuovo contenuto. Importate sempre il file completo.</w:t>
+      </w:r>
+    </w:p>
+    <w:p>
+      <w:pPr>
+        <w:spacing w:after="140" w:line="300"/>
+      </w:pPr>
+      <w:r>
+        <w:rPr>
+          <w:rFonts w:ascii="Arial" w:cs="Arial" w:eastAsia="Arial" w:hAnsi="Arial"/>
+          <w:color w:val="1B2118"/>
+          <w:sz w:val="21"/>
+          <w:szCs w:val="21"/>
+        </w:rPr>
+        <w:t xml:space="preserve">L'opzione </w:t>
+      </w:r>
+      <w:r>
+        <w:rPr>
+          <w:rFonts w:ascii="Arial" w:cs="Arial" w:eastAsia="Arial" w:hAnsi="Arial"/>
+          <w:b/>
+          <w:bCs/>
+          <w:color w:val="1B2118"/>
+          <w:sz w:val="21"/>
+          <w:szCs w:val="21"/>
+        </w:rPr>
+        <w:t xml:space="preserve">Calcola il peso specifico a consuntivo (formula 18), invece dei valori della Tabella 8</w:t>
+      </w:r>
+      <w:r>
+        <w:rPr>
+          <w:rFonts w:ascii="Arial" w:cs="Arial" w:eastAsia="Arial" w:hAnsi="Arial"/>
+          <w:color w:val="1B2118"/>
+          <w:sz w:val="21"/>
+          <w:szCs w:val="21"/>
+        </w:rPr>
+        <w:t xml:space="preserve"> si usa quando il gestore ha sia pesi sia volumi misurati.</w:t>
+      </w:r>
+    </w:p>
+    <w:p>
+      <w:pPr>
+        <w:spacing w:after="140" w:line="300"/>
+      </w:pPr>
+      <w:r>
+        <w:rPr>
+          <w:rFonts w:ascii="Arial" w:cs="Arial" w:eastAsia="Arial" w:hAnsi="Arial"/>
+          <w:b/>
+          <w:bCs/>
+          <w:color w:val="1B2118"/>
+          <w:sz w:val="21"/>
+          <w:szCs w:val="21"/>
+        </w:rPr>
+        <w:t xml:space="preserve">Passo 6 — Buffer (Analisi del rischio).</w:t>
+      </w:r>
+      <w:r>
+        <w:rPr>
+          <w:rFonts w:ascii="Arial" w:cs="Arial" w:eastAsia="Arial" w:hAnsi="Arial"/>
+          <w:color w:val="1B2118"/>
+          <w:sz w:val="21"/>
+          <w:szCs w:val="21"/>
+        </w:rPr>
+        <w:t xml:space="preserve"> Il buffer parte dal 30% e si riduce in base a come il Comune misura i conferimenti:</w:t>
+      </w:r>
+    </w:p>
+    <w:p>
+      <w:pPr>
+        <w:pStyle w:val="ListParagraph"/>
+        <w:numPr>
+          <w:ilvl w:val="0"/>
+          <w:numId w:val="2"/>
+        </w:numPr>
+        <w:spacing w:after="70" w:line="290"/>
+      </w:pPr>
+      <w:r>
+        <w:rPr>
+          <w:rFonts w:ascii="Arial" w:cs="Arial" w:eastAsia="Arial" w:hAnsi="Arial"/>
+          <w:color w:val="1B2118"/>
+          <w:sz w:val="21"/>
+          <w:szCs w:val="21"/>
+        </w:rPr>
+        <w:t xml:space="preserve">utenze e rifiuti monitorati (Tabelle 15 e 16), compilabili a mano o con </w:t>
+      </w:r>
+      <w:r>
+        <w:rPr>
+          <w:rFonts w:ascii="Arial" w:cs="Arial" w:eastAsia="Arial" w:hAnsi="Arial"/>
+          <w:b/>
+          <w:bCs/>
+          <w:color w:val="1B2118"/>
+          <w:sz w:val="21"/>
+          <w:szCs w:val="21"/>
+        </w:rPr>
+        <w:t xml:space="preserve">Ricava dai dati importati</w:t>
+      </w:r>
+      <w:r>
+        <w:rPr>
+          <w:rFonts w:ascii="Arial" w:cs="Arial" w:eastAsia="Arial" w:hAnsi="Arial"/>
+          <w:color w:val="1B2118"/>
+          <w:sz w:val="21"/>
+          <w:szCs w:val="21"/>
+        </w:rPr>
+        <w:t xml:space="preserve">, che li ricava dalla Banca Dati Utenze;</w:t>
+      </w:r>
+    </w:p>
+    <w:p>
+      <w:pPr>
+        <w:pStyle w:val="ListParagraph"/>
+        <w:numPr>
+          <w:ilvl w:val="0"/>
+          <w:numId w:val="2"/>
+        </w:numPr>
+        <w:spacing w:after="70" w:line="290"/>
+      </w:pPr>
+      <w:r>
+        <w:rPr>
+          <w:rFonts w:ascii="Arial" w:cs="Arial" w:eastAsia="Arial" w:hAnsi="Arial"/>
+          <w:b/>
+          <w:bCs/>
+          <w:color w:val="1B2118"/>
+          <w:sz w:val="21"/>
+          <w:szCs w:val="21"/>
+        </w:rPr>
+        <w:t xml:space="preserve">Misura presso Centri di Raccolta / Riuso (−2%)</w:t>
+      </w:r>
+      <w:r>
+        <w:rPr>
+          <w:rFonts w:ascii="Arial" w:cs="Arial" w:eastAsia="Arial" w:hAnsi="Arial"/>
+          <w:color w:val="1B2118"/>
+          <w:sz w:val="21"/>
+          <w:szCs w:val="21"/>
+        </w:rPr>
+        <w:t xml:space="preserve">;</w:t>
+      </w:r>
+    </w:p>
+    <w:p>
+      <w:pPr>
+        <w:pStyle w:val="ListParagraph"/>
+        <w:numPr>
+          <w:ilvl w:val="0"/>
+          <w:numId w:val="2"/>
+        </w:numPr>
+        <w:spacing w:after="70" w:line="290"/>
+      </w:pPr>
+      <w:r>
+        <w:rPr>
+          <w:rFonts w:ascii="Arial" w:cs="Arial" w:eastAsia="Arial" w:hAnsi="Arial"/>
+          <w:b/>
+          <w:bCs/>
+          <w:color w:val="1B2118"/>
+          <w:sz w:val="21"/>
+          <w:szCs w:val="21"/>
+        </w:rPr>
+        <w:t xml:space="preserve">Misura ingombranti, verde o indumenti fuori dai centri (−1%)</w:t>
+      </w:r>
+      <w:r>
+        <w:rPr>
+          <w:rFonts w:ascii="Arial" w:cs="Arial" w:eastAsia="Arial" w:hAnsi="Arial"/>
+          <w:color w:val="1B2118"/>
+          <w:sz w:val="21"/>
+          <w:szCs w:val="21"/>
+        </w:rPr>
+        <w:t xml:space="preserve">;</w:t>
+      </w:r>
+    </w:p>
+    <w:p>
+      <w:pPr>
+        <w:pStyle w:val="ListParagraph"/>
+        <w:numPr>
+          <w:ilvl w:val="0"/>
+          <w:numId w:val="2"/>
+        </w:numPr>
+        <w:spacing w:after="70" w:line="290"/>
+      </w:pPr>
+      <w:r>
+        <w:rPr>
+          <w:rFonts w:ascii="Arial" w:cs="Arial" w:eastAsia="Arial" w:hAnsi="Arial"/>
+          <w:b/>
+          <w:bCs/>
+          <w:color w:val="1B2118"/>
+          <w:sz w:val="21"/>
+          <w:szCs w:val="21"/>
+        </w:rPr>
+        <w:t xml:space="preserve">Tariffa puntuale attiva nell'anno (buffer dimezzato)</w:t>
+      </w:r>
+      <w:r>
+        <w:rPr>
+          <w:rFonts w:ascii="Arial" w:cs="Arial" w:eastAsia="Arial" w:hAnsi="Arial"/>
+          <w:color w:val="1B2118"/>
+          <w:sz w:val="21"/>
+          <w:szCs w:val="21"/>
+        </w:rPr>
+        <w:t xml:space="preserve">;</w:t>
+      </w:r>
+    </w:p>
+    <w:p>
+      <w:pPr>
+        <w:pStyle w:val="ListParagraph"/>
+        <w:numPr>
+          <w:ilvl w:val="0"/>
+          <w:numId w:val="2"/>
+        </w:numPr>
+        <w:spacing w:after="70" w:line="290"/>
+      </w:pPr>
+      <w:r>
+        <w:rPr>
+          <w:rFonts w:ascii="Arial" w:cs="Arial" w:eastAsia="Arial" w:hAnsi="Arial"/>
+          <w:b/>
+          <w:bCs/>
+          <w:color w:val="1B2118"/>
+          <w:sz w:val="21"/>
+          <w:szCs w:val="21"/>
+        </w:rPr>
+        <w:t xml:space="preserve">Solo le utenze che riducono la CO₂eq (le altre non pesano sul territorio)</w:t>
+      </w:r>
+      <w:r>
+        <w:rPr>
+          <w:rFonts w:ascii="Arial" w:cs="Arial" w:eastAsia="Arial" w:hAnsi="Arial"/>
+          <w:color w:val="1B2118"/>
+          <w:sz w:val="21"/>
+          <w:szCs w:val="21"/>
+        </w:rPr>
+        <w:t xml:space="preserve">: la scelta «utenze virtuose».</w:t>
+      </w:r>
+    </w:p>
+    <w:p>
+      <w:pPr>
+        <w:spacing w:after="140" w:line="300"/>
+      </w:pPr>
+      <w:r>
+        <w:rPr>
+          <w:rFonts w:ascii="Arial" w:cs="Arial" w:eastAsia="Arial" w:hAnsi="Arial"/>
+          <w:b/>
+          <w:bCs/>
+          <w:color w:val="1B2118"/>
+          <w:sz w:val="21"/>
+          <w:szCs w:val="21"/>
+        </w:rPr>
+        <w:t xml:space="preserve">Passo 7 — Risultati.</w:t>
+      </w:r>
+      <w:r>
+        <w:rPr>
+          <w:rFonts w:ascii="Arial" w:cs="Arial" w:eastAsia="Arial" w:hAnsi="Arial"/>
+          <w:color w:val="1B2118"/>
+          <w:sz w:val="21"/>
+          <w:szCs w:val="21"/>
+        </w:rPr>
+        <w:t xml:space="preserve"> Premete </w:t>
+      </w:r>
+      <w:r>
+        <w:rPr>
+          <w:rFonts w:ascii="Arial" w:cs="Arial" w:eastAsia="Arial" w:hAnsi="Arial"/>
+          <w:b/>
+          <w:bCs/>
+          <w:color w:val="1B2118"/>
+          <w:sz w:val="21"/>
+          <w:szCs w:val="21"/>
+        </w:rPr>
+        <w:t xml:space="preserve">Calcola</w:t>
+      </w:r>
+      <w:r>
+        <w:rPr>
+          <w:rFonts w:ascii="Arial" w:cs="Arial" w:eastAsia="Arial" w:hAnsi="Arial"/>
+          <w:color w:val="1B2118"/>
+          <w:sz w:val="21"/>
+          <w:szCs w:val="21"/>
+        </w:rPr>
+        <w:t xml:space="preserve">.</w:t>
+      </w:r>
+    </w:p>
+    <w:p>
+      <w:pPr>
+        <w:pStyle w:val="Heading2"/>
+        <w:keepNext/>
+        <w:spacing w:after="120" w:before="240"/>
+      </w:pPr>
+      <w:r>
+        <w:rPr>
+          <w:rFonts w:ascii="Arial" w:cs="Arial" w:eastAsia="Arial" w:hAnsi="Arial"/>
+          <w:b/>
+          <w:bCs/>
+          <w:color w:val="2F5D3A"/>
+          <w:sz w:val="25"/>
+          <w:szCs w:val="25"/>
+        </w:rPr>
+        <w:t xml:space="preserve">Leggere i risultati</w:t>
+      </w:r>
+    </w:p>
+    <w:p>
+      <w:pPr>
+        <w:spacing w:after="140" w:line="300"/>
+      </w:pPr>
+      <w:r>
+        <w:rPr>
+          <w:rFonts w:ascii="Arial" w:cs="Arial" w:eastAsia="Arial" w:hAnsi="Arial"/>
+          <w:color w:val="1B2118"/>
+          <w:sz w:val="21"/>
+          <w:szCs w:val="21"/>
+        </w:rPr>
+        <w:t xml:space="preserve">Dopo </w:t>
+      </w:r>
+      <w:r>
+        <w:rPr>
+          <w:rFonts w:ascii="Arial" w:cs="Arial" w:eastAsia="Arial" w:hAnsi="Arial"/>
+          <w:b/>
+          <w:bCs/>
+          <w:color w:val="1B2118"/>
+          <w:sz w:val="21"/>
+          <w:szCs w:val="21"/>
+        </w:rPr>
+        <w:t xml:space="preserve">Calcola</w:t>
+      </w:r>
+      <w:r>
+        <w:rPr>
+          <w:rFonts w:ascii="Arial" w:cs="Arial" w:eastAsia="Arial" w:hAnsi="Arial"/>
+          <w:color w:val="1B2118"/>
+          <w:sz w:val="21"/>
+          <w:szCs w:val="21"/>
+        </w:rPr>
+        <w:t xml:space="preserve"> il passo 7 mostra in evidenza </w:t>
+      </w:r>
+      <w:r>
+        <w:rPr>
+          <w:rFonts w:ascii="Arial" w:cs="Arial" w:eastAsia="Arial" w:hAnsi="Arial"/>
+          <w:b/>
+          <w:bCs/>
+          <w:color w:val="1B2118"/>
+          <w:sz w:val="21"/>
+          <w:szCs w:val="21"/>
+        </w:rPr>
+        <w:t xml:space="preserve">Crediti netti</w:t>
+      </w:r>
+      <w:r>
+        <w:rPr>
+          <w:rFonts w:ascii="Arial" w:cs="Arial" w:eastAsia="Arial" w:hAnsi="Arial"/>
+          <w:color w:val="1B2118"/>
+          <w:sz w:val="21"/>
+          <w:szCs w:val="21"/>
+        </w:rPr>
+        <w:t xml:space="preserve"> e </w:t>
+      </w:r>
+      <w:r>
+        <w:rPr>
+          <w:rFonts w:ascii="Arial" w:cs="Arial" w:eastAsia="Arial" w:hAnsi="Arial"/>
+          <w:b/>
+          <w:bCs/>
+          <w:color w:val="1B2118"/>
+          <w:sz w:val="21"/>
+          <w:szCs w:val="21"/>
+        </w:rPr>
+        <w:t xml:space="preserve">Crediti lordi (−ΔI)</w:t>
+      </w:r>
+      <w:r>
+        <w:rPr>
+          <w:rFonts w:ascii="Arial" w:cs="Arial" w:eastAsia="Arial" w:hAnsi="Arial"/>
+          <w:color w:val="1B2118"/>
+          <w:sz w:val="21"/>
+          <w:szCs w:val="21"/>
+        </w:rPr>
+        <w:t xml:space="preserve"> in tCO₂eq e il buffer applicato, poi le tabelle di dettaglio:</w:t>
+      </w:r>
+    </w:p>
+    <w:p>
+      <w:pPr>
+        <w:pStyle w:val="ListParagraph"/>
+        <w:numPr>
+          <w:ilvl w:val="0"/>
+          <w:numId w:val="2"/>
+        </w:numPr>
+        <w:spacing w:after="70" w:line="290"/>
+      </w:pPr>
+      <w:r>
+        <w:rPr>
+          <w:rFonts w:ascii="Arial" w:cs="Arial" w:eastAsia="Arial" w:hAnsi="Arial"/>
+          <w:b/>
+          <w:bCs/>
+          <w:color w:val="1B2118"/>
+          <w:sz w:val="21"/>
+          <w:szCs w:val="21"/>
+        </w:rPr>
+        <w:t xml:space="preserve">Territorio</w:t>
+      </w:r>
+      <w:r>
+        <w:rPr>
+          <w:rFonts w:ascii="Arial" w:cs="Arial" w:eastAsia="Arial" w:hAnsi="Arial"/>
+          <w:color w:val="1B2118"/>
+          <w:sz w:val="21"/>
+          <w:szCs w:val="21"/>
+        </w:rPr>
+        <w:t xml:space="preserve">: anno, coefficiente primo anno, Qtot, ripartizione P%UD e P%UnD, EA del territorio, FE dell'indifferenziato;</w:t>
+      </w:r>
+    </w:p>
+    <w:p>
+      <w:pPr>
+        <w:pStyle w:val="ListParagraph"/>
+        <w:numPr>
+          <w:ilvl w:val="0"/>
+          <w:numId w:val="2"/>
+        </w:numPr>
+        <w:spacing w:after="70" w:line="290"/>
+      </w:pPr>
+      <w:r>
+        <w:rPr>
+          <w:rFonts w:ascii="Arial" w:cs="Arial" w:eastAsia="Arial" w:hAnsi="Arial"/>
+          <w:b/>
+          <w:bCs/>
+          <w:color w:val="1B2118"/>
+          <w:sz w:val="21"/>
+          <w:szCs w:val="21"/>
+        </w:rPr>
+        <w:t xml:space="preserve">Utenze</w:t>
+      </w:r>
+      <w:r>
+        <w:rPr>
+          <w:rFonts w:ascii="Arial" w:cs="Arial" w:eastAsia="Arial" w:hAnsi="Arial"/>
+          <w:color w:val="1B2118"/>
+          <w:sz w:val="21"/>
+          <w:szCs w:val="21"/>
+        </w:rPr>
+        <w:t xml:space="preserve">: numero di utenze e di utenze virtuose, ΔI complessiva;</w:t>
+      </w:r>
+    </w:p>
+    <w:p>
+      <w:pPr>
+        <w:pStyle w:val="ListParagraph"/>
+        <w:numPr>
+          <w:ilvl w:val="0"/>
+          <w:numId w:val="2"/>
+        </w:numPr>
+        <w:spacing w:after="70" w:line="290"/>
+      </w:pPr>
+      <w:r>
+        <w:rPr>
+          <w:rFonts w:ascii="Arial" w:cs="Arial" w:eastAsia="Arial" w:hAnsi="Arial"/>
+          <w:b/>
+          <w:bCs/>
+          <w:color w:val="1B2118"/>
+          <w:sz w:val="21"/>
+          <w:szCs w:val="21"/>
+        </w:rPr>
+        <w:t xml:space="preserve">Crediti</w:t>
+      </w:r>
+      <w:r>
+        <w:rPr>
+          <w:rFonts w:ascii="Arial" w:cs="Arial" w:eastAsia="Arial" w:hAnsi="Arial"/>
+          <w:color w:val="1B2118"/>
+          <w:sz w:val="21"/>
+          <w:szCs w:val="21"/>
+        </w:rPr>
+        <w:t xml:space="preserve">: buffer (%), crediti lordi, quota buffer, crediti netti, oppure il debito;</w:t>
+      </w:r>
+    </w:p>
+    <w:p>
+      <w:pPr>
+        <w:pStyle w:val="ListParagraph"/>
+        <w:numPr>
+          <w:ilvl w:val="0"/>
+          <w:numId w:val="2"/>
+        </w:numPr>
+        <w:spacing w:after="70" w:line="290"/>
+      </w:pPr>
+      <w:r>
+        <w:rPr>
+          <w:rFonts w:ascii="Arial" w:cs="Arial" w:eastAsia="Arial" w:hAnsi="Arial"/>
+          <w:b/>
+          <w:bCs/>
+          <w:color w:val="1B2118"/>
+          <w:sz w:val="21"/>
+          <w:szCs w:val="21"/>
+        </w:rPr>
+        <w:t xml:space="preserve">Dettaglio per utenza</w:t>
+      </w:r>
+      <w:r>
+        <w:rPr>
+          <w:rFonts w:ascii="Arial" w:cs="Arial" w:eastAsia="Arial" w:hAnsi="Arial"/>
+          <w:color w:val="1B2118"/>
+          <w:sz w:val="21"/>
+          <w:szCs w:val="21"/>
+        </w:rPr>
+        <w:t xml:space="preserve">: utenza, macrocategoria, classe, EA, EP e ΔI.</w:t>
+      </w:r>
+    </w:p>
+    <w:p>
+      <w:pPr>
+        <w:spacing w:after="140" w:line="300"/>
+      </w:pPr>
+      <w:r>
+        <w:rPr>
+          <w:rFonts w:ascii="Arial" w:cs="Arial" w:eastAsia="Arial" w:hAnsi="Arial"/>
+          <w:color w:val="1B2118"/>
+          <w:sz w:val="21"/>
+          <w:szCs w:val="21"/>
+        </w:rPr>
+        <w:t xml:space="preserve">Il riquadro </w:t>
+      </w:r>
+      <w:r>
+        <w:rPr>
+          <w:rFonts w:ascii="Arial" w:cs="Arial" w:eastAsia="Arial" w:hAnsi="Arial"/>
+          <w:b/>
+          <w:bCs/>
+          <w:color w:val="1B2118"/>
+          <w:sz w:val="21"/>
+          <w:szCs w:val="21"/>
+        </w:rPr>
+        <w:t xml:space="preserve">Da verificare</w:t>
+      </w:r>
+      <w:r>
+        <w:rPr>
+          <w:rFonts w:ascii="Arial" w:cs="Arial" w:eastAsia="Arial" w:hAnsi="Arial"/>
+          <w:color w:val="1B2118"/>
+          <w:sz w:val="21"/>
+          <w:szCs w:val="21"/>
+        </w:rPr>
+        <w:t xml:space="preserve"> elenca i dati mancanti o incoerenti (ad esempio un rifiuto senza fattore di emissione o una classe senza utenze). Va letto sempre prima di confermare.</w:t>
+      </w:r>
+    </w:p>
+    <w:p>
+      <w:pPr>
+        <w:spacing w:after="140" w:line="300"/>
+      </w:pPr>
+      <w:r>
+        <w:rPr>
+          <w:rFonts w:ascii="Arial" w:cs="Arial" w:eastAsia="Arial" w:hAnsi="Arial"/>
+          <w:b/>
+          <w:bCs/>
+          <w:color w:val="1B2118"/>
+          <w:sz w:val="21"/>
+          <w:szCs w:val="21"/>
+        </w:rPr>
+        <w:t xml:space="preserve">Scarica il riepilogo (CSV)</w:t>
+      </w:r>
+      <w:r>
+        <w:rPr>
+          <w:rFonts w:ascii="Arial" w:cs="Arial" w:eastAsia="Arial" w:hAnsi="Arial"/>
+          <w:color w:val="1B2118"/>
+          <w:sz w:val="21"/>
+          <w:szCs w:val="21"/>
+        </w:rPr>
+        <w:t xml:space="preserve"> e </w:t>
+      </w:r>
+      <w:r>
+        <w:rPr>
+          <w:rFonts w:ascii="Arial" w:cs="Arial" w:eastAsia="Arial" w:hAnsi="Arial"/>
+          <w:b/>
+          <w:bCs/>
+          <w:color w:val="1B2118"/>
+          <w:sz w:val="21"/>
+          <w:szCs w:val="21"/>
+        </w:rPr>
+        <w:t xml:space="preserve">Scarica il dettaglio per utenza (CSV)</w:t>
+      </w:r>
+      <w:r>
+        <w:rPr>
+          <w:rFonts w:ascii="Arial" w:cs="Arial" w:eastAsia="Arial" w:hAnsi="Arial"/>
+          <w:color w:val="1B2118"/>
+          <w:sz w:val="21"/>
+          <w:szCs w:val="21"/>
+        </w:rPr>
+        <w:t xml:space="preserve"> esportano i risultati in file che si aprono con Excel.</w:t>
+      </w:r>
+    </w:p>
+    <w:p>
+      <w:pPr>
+        <w:pStyle w:val="Heading2"/>
+        <w:keepNext/>
+        <w:spacing w:after="120" w:before="240"/>
+      </w:pPr>
+      <w:r>
+        <w:rPr>
+          <w:rFonts w:ascii="Arial" w:cs="Arial" w:eastAsia="Arial" w:hAnsi="Arial"/>
+          <w:b/>
+          <w:bCs/>
+          <w:color w:val="2F5D3A"/>
+          <w:sz w:val="25"/>
+          <w:szCs w:val="25"/>
+        </w:rPr>
+        <w:t xml:space="preserve">Confermare e correggere</w:t>
+      </w:r>
+    </w:p>
+    <w:p>
+      <w:pPr>
+        <w:spacing w:after="140" w:line="300"/>
+      </w:pPr>
+      <w:r>
+        <w:rPr>
+          <w:rFonts w:ascii="Arial" w:cs="Arial" w:eastAsia="Arial" w:hAnsi="Arial"/>
+          <w:b/>
+          <w:bCs/>
+          <w:color w:val="1B2118"/>
+          <w:sz w:val="21"/>
+          <w:szCs w:val="21"/>
+        </w:rPr>
+        <w:t xml:space="preserve">Prima di confermare.</w:t>
+      </w:r>
+      <w:r>
+        <w:rPr>
+          <w:rFonts w:ascii="Arial" w:cs="Arial" w:eastAsia="Arial" w:hAnsi="Arial"/>
+          <w:color w:val="1B2118"/>
+          <w:sz w:val="21"/>
+          <w:szCs w:val="21"/>
+        </w:rPr>
+        <w:t xml:space="preserve"> Controllate che: il riquadro </w:t>
+      </w:r>
+      <w:r>
+        <w:rPr>
+          <w:rFonts w:ascii="Arial" w:cs="Arial" w:eastAsia="Arial" w:hAnsi="Arial"/>
+          <w:i/>
+          <w:iCs/>
+          <w:color w:val="1B2118"/>
+          <w:sz w:val="21"/>
+          <w:szCs w:val="21"/>
+        </w:rPr>
+        <w:t xml:space="preserve">Da verificare</w:t>
+      </w:r>
+      <w:r>
+        <w:rPr>
+          <w:rFonts w:ascii="Arial" w:cs="Arial" w:eastAsia="Arial" w:hAnsi="Arial"/>
+          <w:color w:val="1B2118"/>
+          <w:sz w:val="21"/>
+          <w:szCs w:val="21"/>
+        </w:rPr>
+        <w:t xml:space="preserve"> sia vuoto o che ogni voce sia spiegata nelle note; le quantità del passo 2 coincidano con il Catasto ISPRA; la somma PEF del passo 3 faccia 100; il numero di utenze della Banca Dati sia coerente con la delibera; il buffer corrisponda a come il Comune misura davvero i conferimenti.</w:t>
       </w:r>
     </w:p>
     <w:p>
@@ -15218,27 +17182,27 @@
           <w:sz w:val="21"/>
           <w:szCs w:val="21"/>
         </w:rPr>
-        <w:t xml:space="preserve">Nel menu premete </w:t>
-      </w:r>
-      <w:r>
-        <w:rPr>
-          <w:rFonts w:ascii="Arial" w:cs="Arial" w:eastAsia="Arial" w:hAnsi="Arial"/>
-          <w:b/>
-          <w:bCs/>
-          <w:color w:val="1B2118"/>
-          <w:sz w:val="21"/>
-          <w:szCs w:val="21"/>
-        </w:rPr>
-        <w:t xml:space="preserve">Crediti CWP</w:t>
-      </w:r>
-      <w:r>
-        <w:rPr>
-          <w:rFonts w:ascii="Arial" w:cs="Arial" w:eastAsia="Arial" w:hAnsi="Arial"/>
-          <w:color w:val="1B2118"/>
-          <w:sz w:val="21"/>
-          <w:szCs w:val="21"/>
-        </w:rPr>
-        <w:t xml:space="preserve">: si apre l'elenco dei calcoli (Calcolo, Pratica, Anno / tipo, Crediti netti, Stato).</w:t>
+        <w:t xml:space="preserve">Salvate e premete </w:t>
+      </w:r>
+      <w:r>
+        <w:rPr>
+          <w:rFonts w:ascii="Arial" w:cs="Arial" w:eastAsia="Arial" w:hAnsi="Arial"/>
+          <w:b/>
+          <w:bCs/>
+          <w:color w:val="1B2118"/>
+          <w:sz w:val="21"/>
+          <w:szCs w:val="21"/>
+        </w:rPr>
+        <w:t xml:space="preserve">Calcola</w:t>
+      </w:r>
+      <w:r>
+        <w:rPr>
+          <w:rFonts w:ascii="Arial" w:cs="Arial" w:eastAsia="Arial" w:hAnsi="Arial"/>
+          <w:color w:val="1B2118"/>
+          <w:sz w:val="21"/>
+          <w:szCs w:val="21"/>
+        </w:rPr>
+        <w:t xml:space="preserve">.</w:t>
       </w:r>
     </w:p>
     <w:p>
@@ -15268,16 +17232,16 @@
           <w:sz w:val="21"/>
           <w:szCs w:val="21"/>
         </w:rPr>
-        <w:t xml:space="preserve">+ Nuovo calcolo</w:t>
-      </w:r>
-      <w:r>
-        <w:rPr>
-          <w:rFonts w:ascii="Arial" w:cs="Arial" w:eastAsia="Arial" w:hAnsi="Arial"/>
-          <w:color w:val="1B2118"/>
-          <w:sz w:val="21"/>
-          <w:szCs w:val="21"/>
-        </w:rPr>
-        <w:t xml:space="preserve">.</w:t>
+        <w:t xml:space="preserve">Conferma calcolo</w:t>
+      </w:r>
+      <w:r>
+        <w:rPr>
+          <w:rFonts w:ascii="Arial" w:cs="Arial" w:eastAsia="Arial" w:hAnsi="Arial"/>
+          <w:color w:val="1B2118"/>
+          <w:sz w:val="21"/>
+          <w:szCs w:val="21"/>
+        </w:rPr>
+        <w:t xml:space="preserve">: compare il riquadro «Confermare il calcolo?» con i crediti netti.</w:t>
       </w:r>
     </w:p>
     <w:p>
@@ -15286,1989 +17250,6 @@
         <w:numPr>
           <w:ilvl w:val="0"/>
           <w:numId w:val="20"/>
-        </w:numPr>
-        <w:spacing w:after="70" w:line="290"/>
-      </w:pPr>
-      <w:r>
-        <w:rPr>
-          <w:rFonts w:ascii="Arial" w:cs="Arial" w:eastAsia="Arial" w:hAnsi="Arial"/>
-          <w:color w:val="1B2118"/>
-          <w:sz w:val="21"/>
-          <w:szCs w:val="21"/>
-        </w:rPr>
-        <w:t xml:space="preserve">Scegliete la </w:t>
-      </w:r>
-      <w:r>
-        <w:rPr>
-          <w:rFonts w:ascii="Arial" w:cs="Arial" w:eastAsia="Arial" w:hAnsi="Arial"/>
-          <w:b/>
-          <w:bCs/>
-          <w:color w:val="1B2118"/>
-          <w:sz w:val="21"/>
-          <w:szCs w:val="21"/>
-        </w:rPr>
-        <w:t xml:space="preserve">Pratica</w:t>
-      </w:r>
-      <w:r>
-        <w:rPr>
-          <w:rFonts w:ascii="Arial" w:cs="Arial" w:eastAsia="Arial" w:hAnsi="Arial"/>
-          <w:color w:val="1B2118"/>
-          <w:sz w:val="21"/>
-          <w:szCs w:val="21"/>
-        </w:rPr>
-        <w:t xml:space="preserve"> (Progetto o Rapporto di Monitoraggio), un </w:t>
-      </w:r>
-      <w:r>
-        <w:rPr>
-          <w:rFonts w:ascii="Arial" w:cs="Arial" w:eastAsia="Arial" w:hAnsi="Arial"/>
-          <w:b/>
-          <w:bCs/>
-          <w:color w:val="1B2118"/>
-          <w:sz w:val="21"/>
-          <w:szCs w:val="21"/>
-        </w:rPr>
-        <w:t xml:space="preserve">Titolo</w:t>
-      </w:r>
-      <w:r>
-        <w:rPr>
-          <w:rFonts w:ascii="Arial" w:cs="Arial" w:eastAsia="Arial" w:hAnsi="Arial"/>
-          <w:color w:val="1B2118"/>
-          <w:sz w:val="21"/>
-          <w:szCs w:val="21"/>
-        </w:rPr>
-        <w:t xml:space="preserve"> (es. «Monitoraggio 2025»), l'</w:t>
-      </w:r>
-      <w:r>
-        <w:rPr>
-          <w:rFonts w:ascii="Arial" w:cs="Arial" w:eastAsia="Arial" w:hAnsi="Arial"/>
-          <w:b/>
-          <w:bCs/>
-          <w:color w:val="1B2118"/>
-          <w:sz w:val="21"/>
-          <w:szCs w:val="21"/>
-        </w:rPr>
-        <w:t xml:space="preserve">Anno di riferimento</w:t>
-      </w:r>
-      <w:r>
-        <w:rPr>
-          <w:rFonts w:ascii="Arial" w:cs="Arial" w:eastAsia="Arial" w:hAnsi="Arial"/>
-          <w:color w:val="1B2118"/>
-          <w:sz w:val="21"/>
-          <w:szCs w:val="21"/>
-        </w:rPr>
-        <w:t xml:space="preserve"> e il </w:t>
-      </w:r>
-      <w:r>
-        <w:rPr>
-          <w:rFonts w:ascii="Arial" w:cs="Arial" w:eastAsia="Arial" w:hAnsi="Arial"/>
-          <w:b/>
-          <w:bCs/>
-          <w:color w:val="1B2118"/>
-          <w:sz w:val="21"/>
-          <w:szCs w:val="21"/>
-        </w:rPr>
-        <w:t xml:space="preserve">Tipo di stima</w:t>
-      </w:r>
-      <w:r>
-        <w:rPr>
-          <w:rFonts w:ascii="Arial" w:cs="Arial" w:eastAsia="Arial" w:hAnsi="Arial"/>
-          <w:color w:val="1B2118"/>
-          <w:sz w:val="21"/>
-          <w:szCs w:val="21"/>
-        </w:rPr>
-        <w:t xml:space="preserve">: </w:t>
-      </w:r>
-      <w:r>
-        <w:rPr>
-          <w:rFonts w:ascii="Arial" w:cs="Arial" w:eastAsia="Arial" w:hAnsi="Arial"/>
-          <w:i/>
-          <w:iCs/>
-          <w:color w:val="1B2118"/>
-          <w:sz w:val="21"/>
-          <w:szCs w:val="21"/>
-        </w:rPr>
-        <w:t xml:space="preserve">Ex post (letture della Banca Dati Utenze)</w:t>
-      </w:r>
-      <w:r>
-        <w:rPr>
-          <w:rFonts w:ascii="Arial" w:cs="Arial" w:eastAsia="Arial" w:hAnsi="Arial"/>
-          <w:color w:val="1B2118"/>
-          <w:sz w:val="21"/>
-          <w:szCs w:val="21"/>
-        </w:rPr>
-        <w:t xml:space="preserve"> oppure </w:t>
-      </w:r>
-      <w:r>
-        <w:rPr>
-          <w:rFonts w:ascii="Arial" w:cs="Arial" w:eastAsia="Arial" w:hAnsi="Arial"/>
-          <w:i/>
-          <w:iCs/>
-          <w:color w:val="1B2118"/>
-          <w:sz w:val="21"/>
-          <w:szCs w:val="21"/>
-        </w:rPr>
-        <w:t xml:space="preserve">Ex ante</w:t>
-      </w:r>
-      <w:r>
-        <w:rPr>
-          <w:rFonts w:ascii="Arial" w:cs="Arial" w:eastAsia="Arial" w:hAnsi="Arial"/>
-          <w:color w:val="1B2118"/>
-          <w:sz w:val="21"/>
-          <w:szCs w:val="21"/>
-        </w:rPr>
-        <w:t xml:space="preserve">.</w:t>
-      </w:r>
-    </w:p>
-    <w:p>
-      <w:pPr>
-        <w:pStyle w:val="ListParagraph"/>
-        <w:numPr>
-          <w:ilvl w:val="0"/>
-          <w:numId w:val="20"/>
-        </w:numPr>
-        <w:spacing w:after="70" w:line="290"/>
-      </w:pPr>
-      <w:r>
-        <w:rPr>
-          <w:rFonts w:ascii="Arial" w:cs="Arial" w:eastAsia="Arial" w:hAnsi="Arial"/>
-          <w:color w:val="1B2118"/>
-          <w:sz w:val="21"/>
-          <w:szCs w:val="21"/>
-        </w:rPr>
-        <w:t xml:space="preserve">Solo se è il primo anno del Progetto, compilate </w:t>
-      </w:r>
-      <w:r>
-        <w:rPr>
-          <w:rFonts w:ascii="Arial" w:cs="Arial" w:eastAsia="Arial" w:hAnsi="Arial"/>
-          <w:b/>
-          <w:bCs/>
-          <w:color w:val="1B2118"/>
-          <w:sz w:val="21"/>
-          <w:szCs w:val="21"/>
-        </w:rPr>
-        <w:t xml:space="preserve">Avvio del progetto (solo se nel primo anno)</w:t>
-      </w:r>
-      <w:r>
-        <w:rPr>
-          <w:rFonts w:ascii="Arial" w:cs="Arial" w:eastAsia="Arial" w:hAnsi="Arial"/>
-          <w:color w:val="1B2118"/>
-          <w:sz w:val="21"/>
-          <w:szCs w:val="21"/>
-        </w:rPr>
-        <w:t xml:space="preserve">.</w:t>
-      </w:r>
-    </w:p>
-    <w:p>
-      <w:pPr>
-        <w:pStyle w:val="ListParagraph"/>
-        <w:numPr>
-          <w:ilvl w:val="0"/>
-          <w:numId w:val="20"/>
-        </w:numPr>
-        <w:spacing w:after="70" w:line="290"/>
-      </w:pPr>
-      <w:r>
-        <w:rPr>
-          <w:rFonts w:ascii="Arial" w:cs="Arial" w:eastAsia="Arial" w:hAnsi="Arial"/>
-          <w:color w:val="1B2118"/>
-          <w:sz w:val="21"/>
-          <w:szCs w:val="21"/>
-        </w:rPr>
-        <w:t xml:space="preserve">Premete </w:t>
-      </w:r>
-      <w:r>
-        <w:rPr>
-          <w:rFonts w:ascii="Arial" w:cs="Arial" w:eastAsia="Arial" w:hAnsi="Arial"/>
-          <w:b/>
-          <w:bCs/>
-          <w:color w:val="1B2118"/>
-          <w:sz w:val="21"/>
-          <w:szCs w:val="21"/>
-        </w:rPr>
-        <w:t xml:space="preserve">Crea e apri</w:t>
-      </w:r>
-      <w:r>
-        <w:rPr>
-          <w:rFonts w:ascii="Arial" w:cs="Arial" w:eastAsia="Arial" w:hAnsi="Arial"/>
-          <w:color w:val="1B2118"/>
-          <w:sz w:val="21"/>
-          <w:szCs w:val="21"/>
-        </w:rPr>
-        <w:t xml:space="preserve">.</w:t>
-      </w:r>
-    </w:p>
-    <w:p>
-      <w:pPr>
-        <w:spacing w:after="60"/>
-      </w:pPr>
-    </w:p>
-    <w:p>
-      <w:pPr>
-        <w:spacing w:after="140" w:line="300"/>
-      </w:pPr>
-      <w:r>
-        <w:rPr>
-          <w:rFonts w:ascii="Arial" w:cs="Arial" w:eastAsia="Arial" w:hAnsi="Arial"/>
-          <w:color w:val="1B2118"/>
-          <w:sz w:val="21"/>
-          <w:szCs w:val="21"/>
-        </w:rPr>
-        <w:t xml:space="preserve">Il calcolo nasce come </w:t>
-      </w:r>
-      <w:r>
-        <w:rPr>
-          <w:rFonts w:ascii="Arial" w:cs="Arial" w:eastAsia="Arial" w:hAnsi="Arial"/>
-          <w:b/>
-          <w:bCs/>
-          <w:color w:val="1B2118"/>
-          <w:sz w:val="21"/>
-          <w:szCs w:val="21"/>
-        </w:rPr>
-        <w:t xml:space="preserve">Bozza</w:t>
-      </w:r>
-      <w:r>
-        <w:rPr>
-          <w:rFonts w:ascii="Arial" w:cs="Arial" w:eastAsia="Arial" w:hAnsi="Arial"/>
-          <w:color w:val="1B2118"/>
-          <w:sz w:val="21"/>
-          <w:szCs w:val="21"/>
-        </w:rPr>
-        <w:t xml:space="preserve">. In alto trovate i pulsanti </w:t>
-      </w:r>
-      <w:r>
-        <w:rPr>
-          <w:rFonts w:ascii="Arial" w:cs="Arial" w:eastAsia="Arial" w:hAnsi="Arial"/>
-          <w:b/>
-          <w:bCs/>
-          <w:color w:val="1B2118"/>
-          <w:sz w:val="21"/>
-          <w:szCs w:val="21"/>
-        </w:rPr>
-        <w:t xml:space="preserve">Salva</w:t>
-      </w:r>
-      <w:r>
-        <w:rPr>
-          <w:rFonts w:ascii="Arial" w:cs="Arial" w:eastAsia="Arial" w:hAnsi="Arial"/>
-          <w:color w:val="1B2118"/>
-          <w:sz w:val="21"/>
-          <w:szCs w:val="21"/>
-        </w:rPr>
-        <w:t xml:space="preserve"> (diventa </w:t>
-      </w:r>
-      <w:r>
-        <w:rPr>
-          <w:rFonts w:ascii="Arial" w:cs="Arial" w:eastAsia="Arial" w:hAnsi="Arial"/>
-          <w:i/>
-          <w:iCs/>
-          <w:color w:val="1B2118"/>
-          <w:sz w:val="21"/>
-          <w:szCs w:val="21"/>
-        </w:rPr>
-        <w:t xml:space="preserve">Salvato</w:t>
-      </w:r>
-      <w:r>
-        <w:rPr>
-          <w:rFonts w:ascii="Arial" w:cs="Arial" w:eastAsia="Arial" w:hAnsi="Arial"/>
-          <w:color w:val="1B2118"/>
-          <w:sz w:val="21"/>
-          <w:szCs w:val="21"/>
-        </w:rPr>
-        <w:t xml:space="preserve"> quando non ci sono modifiche), </w:t>
-      </w:r>
-      <w:r>
-        <w:rPr>
-          <w:rFonts w:ascii="Arial" w:cs="Arial" w:eastAsia="Arial" w:hAnsi="Arial"/>
-          <w:b/>
-          <w:bCs/>
-          <w:color w:val="1B2118"/>
-          <w:sz w:val="21"/>
-          <w:szCs w:val="21"/>
-        </w:rPr>
-        <w:t xml:space="preserve">Calcola</w:t>
-      </w:r>
-      <w:r>
-        <w:rPr>
-          <w:rFonts w:ascii="Arial" w:cs="Arial" w:eastAsia="Arial" w:hAnsi="Arial"/>
-          <w:color w:val="1B2118"/>
-          <w:sz w:val="21"/>
-          <w:szCs w:val="21"/>
-        </w:rPr>
-        <w:t xml:space="preserve">, </w:t>
-      </w:r>
-      <w:r>
-        <w:rPr>
-          <w:rFonts w:ascii="Arial" w:cs="Arial" w:eastAsia="Arial" w:hAnsi="Arial"/>
-          <w:b/>
-          <w:bCs/>
-          <w:color w:val="1B2118"/>
-          <w:sz w:val="21"/>
-          <w:szCs w:val="21"/>
-        </w:rPr>
-        <w:t xml:space="preserve">Conferma calcolo</w:t>
-      </w:r>
-      <w:r>
-        <w:rPr>
-          <w:rFonts w:ascii="Arial" w:cs="Arial" w:eastAsia="Arial" w:hAnsi="Arial"/>
-          <w:color w:val="1B2118"/>
-          <w:sz w:val="21"/>
-          <w:szCs w:val="21"/>
-        </w:rPr>
-        <w:t xml:space="preserve"> ed </w:t>
-      </w:r>
-      <w:r>
-        <w:rPr>
-          <w:rFonts w:ascii="Arial" w:cs="Arial" w:eastAsia="Arial" w:hAnsi="Arial"/>
-          <w:b/>
-          <w:bCs/>
-          <w:color w:val="1B2118"/>
-          <w:sz w:val="21"/>
-          <w:szCs w:val="21"/>
-        </w:rPr>
-        <w:t xml:space="preserve">Elimina</w:t>
-      </w:r>
-      <w:r>
-        <w:rPr>
-          <w:rFonts w:ascii="Arial" w:cs="Arial" w:eastAsia="Arial" w:hAnsi="Arial"/>
-          <w:color w:val="1B2118"/>
-          <w:sz w:val="21"/>
-          <w:szCs w:val="21"/>
-        </w:rPr>
-        <w:t xml:space="preserve">. A sinistra c'è il menu </w:t>
-      </w:r>
-      <w:r>
-        <w:rPr>
-          <w:rFonts w:ascii="Arial" w:cs="Arial" w:eastAsia="Arial" w:hAnsi="Arial"/>
-          <w:b/>
-          <w:bCs/>
-          <w:color w:val="1B2118"/>
-          <w:sz w:val="21"/>
-          <w:szCs w:val="21"/>
-        </w:rPr>
-        <w:t xml:space="preserve">Passi del calcolo</w:t>
-      </w:r>
-      <w:r>
-        <w:rPr>
-          <w:rFonts w:ascii="Arial" w:cs="Arial" w:eastAsia="Arial" w:hAnsi="Arial"/>
-          <w:color w:val="1B2118"/>
-          <w:sz w:val="21"/>
-          <w:szCs w:val="21"/>
-        </w:rPr>
-        <w:t xml:space="preserve">.</w:t>
-      </w:r>
-    </w:p>
-    <w:p>
-      <w:pPr>
-        <w:pStyle w:val="Heading2"/>
-        <w:keepNext/>
-        <w:spacing w:after="120" w:before="240"/>
-      </w:pPr>
-      <w:r>
-        <w:rPr>
-          <w:rFonts w:ascii="Arial" w:cs="Arial" w:eastAsia="Arial" w:hAnsi="Arial"/>
-          <w:b/>
-          <w:bCs/>
-          <w:color w:val="2F5D3A"/>
-          <w:sz w:val="25"/>
-          <w:szCs w:val="25"/>
-        </w:rPr>
-        <w:t xml:space="preserve">I sette passi</w:t>
-      </w:r>
-    </w:p>
-    <w:p>
-      <w:pPr>
-        <w:spacing w:after="140" w:line="300"/>
-      </w:pPr>
-      <w:r>
-        <w:rPr>
-          <w:rFonts w:ascii="Arial" w:cs="Arial" w:eastAsia="Arial" w:hAnsi="Arial"/>
-          <w:color w:val="1B2118"/>
-          <w:sz w:val="21"/>
-          <w:szCs w:val="21"/>
-        </w:rPr>
-        <w:t xml:space="preserve">Ogni tabella ha </w:t>
-      </w:r>
-      <w:r>
-        <w:rPr>
-          <w:rFonts w:ascii="Arial" w:cs="Arial" w:eastAsia="Arial" w:hAnsi="Arial"/>
-          <w:b/>
-          <w:bCs/>
-          <w:color w:val="1B2118"/>
-          <w:sz w:val="21"/>
-          <w:szCs w:val="21"/>
-        </w:rPr>
-        <w:t xml:space="preserve">+ Riga</w:t>
-      </w:r>
-      <w:r>
-        <w:rPr>
-          <w:rFonts w:ascii="Arial" w:cs="Arial" w:eastAsia="Arial" w:hAnsi="Arial"/>
-          <w:color w:val="1B2118"/>
-          <w:sz w:val="21"/>
-          <w:szCs w:val="21"/>
-        </w:rPr>
-        <w:t xml:space="preserve">, </w:t>
-      </w:r>
-      <w:r>
-        <w:rPr>
-          <w:rFonts w:ascii="Arial" w:cs="Arial" w:eastAsia="Arial" w:hAnsi="Arial"/>
-          <w:b/>
-          <w:bCs/>
-          <w:color w:val="1B2118"/>
-          <w:sz w:val="21"/>
-          <w:szCs w:val="21"/>
-        </w:rPr>
-        <w:t xml:space="preserve">Importa CSV</w:t>
-      </w:r>
-      <w:r>
-        <w:rPr>
-          <w:rFonts w:ascii="Arial" w:cs="Arial" w:eastAsia="Arial" w:hAnsi="Arial"/>
-          <w:color w:val="1B2118"/>
-          <w:sz w:val="21"/>
-          <w:szCs w:val="21"/>
-        </w:rPr>
-        <w:t xml:space="preserve"> e </w:t>
-      </w:r>
-      <w:r>
-        <w:rPr>
-          <w:rFonts w:ascii="Arial" w:cs="Arial" w:eastAsia="Arial" w:hAnsi="Arial"/>
-          <w:b/>
-          <w:bCs/>
-          <w:color w:val="1B2118"/>
-          <w:sz w:val="21"/>
-          <w:szCs w:val="21"/>
-        </w:rPr>
-        <w:t xml:space="preserve">Scarica il modello</w:t>
-      </w:r>
-      <w:r>
-        <w:rPr>
-          <w:rFonts w:ascii="Arial" w:cs="Arial" w:eastAsia="Arial" w:hAnsi="Arial"/>
-          <w:color w:val="1B2118"/>
-          <w:sz w:val="21"/>
-          <w:szCs w:val="21"/>
-        </w:rPr>
-        <w:t xml:space="preserve">; una riga si toglie con la ×. Ricordatevi di premere </w:t>
-      </w:r>
-      <w:r>
-        <w:rPr>
-          <w:rFonts w:ascii="Arial" w:cs="Arial" w:eastAsia="Arial" w:hAnsi="Arial"/>
-          <w:b/>
-          <w:bCs/>
-          <w:color w:val="1B2118"/>
-          <w:sz w:val="21"/>
-          <w:szCs w:val="21"/>
-        </w:rPr>
-        <w:t xml:space="preserve">Salva</w:t>
-      </w:r>
-      <w:r>
-        <w:rPr>
-          <w:rFonts w:ascii="Arial" w:cs="Arial" w:eastAsia="Arial" w:hAnsi="Arial"/>
-          <w:color w:val="1B2118"/>
-          <w:sz w:val="21"/>
-          <w:szCs w:val="21"/>
-        </w:rPr>
-        <w:t xml:space="preserve">: se lasciate la pagina con modifiche non salvate il browser lo segnala.</w:t>
-      </w:r>
-    </w:p>
-    <w:p>
-      <w:pPr>
-        <w:spacing w:after="140" w:line="300"/>
-      </w:pPr>
-      <w:r>
-        <w:rPr>
-          <w:rFonts w:ascii="Arial" w:cs="Arial" w:eastAsia="Arial" w:hAnsi="Arial"/>
-          <w:b/>
-          <w:bCs/>
-          <w:color w:val="1B2118"/>
-          <w:sz w:val="21"/>
-          <w:szCs w:val="21"/>
-        </w:rPr>
-        <w:t xml:space="preserve">Passo 1 — Impostazioni.</w:t>
-      </w:r>
-      <w:r>
-        <w:rPr>
-          <w:rFonts w:ascii="Arial" w:cs="Arial" w:eastAsia="Arial" w:hAnsi="Arial"/>
-          <w:color w:val="1B2118"/>
-          <w:sz w:val="21"/>
-          <w:szCs w:val="21"/>
-        </w:rPr>
-        <w:t xml:space="preserve"> Titolo, anno, tipo di stima (</w:t>
-      </w:r>
-      <w:r>
-        <w:rPr>
-          <w:rFonts w:ascii="Arial" w:cs="Arial" w:eastAsia="Arial" w:hAnsi="Arial"/>
-          <w:i/>
-          <w:iCs/>
-          <w:color w:val="1B2118"/>
-          <w:sz w:val="21"/>
-          <w:szCs w:val="21"/>
-        </w:rPr>
-        <w:t xml:space="preserve">Ex post (letture reali)</w:t>
-      </w:r>
-      <w:r>
-        <w:rPr>
-          <w:rFonts w:ascii="Arial" w:cs="Arial" w:eastAsia="Arial" w:hAnsi="Arial"/>
-          <w:color w:val="1B2118"/>
-          <w:sz w:val="21"/>
-          <w:szCs w:val="21"/>
-        </w:rPr>
-        <w:t xml:space="preserve"> o </w:t>
-      </w:r>
-      <w:r>
-        <w:rPr>
-          <w:rFonts w:ascii="Arial" w:cs="Arial" w:eastAsia="Arial" w:hAnsi="Arial"/>
-          <w:i/>
-          <w:iCs/>
-          <w:color w:val="1B2118"/>
-          <w:sz w:val="21"/>
-          <w:szCs w:val="21"/>
-        </w:rPr>
-        <w:t xml:space="preserve">Ex ante</w:t>
-      </w:r>
-      <w:r>
-        <w:rPr>
-          <w:rFonts w:ascii="Arial" w:cs="Arial" w:eastAsia="Arial" w:hAnsi="Arial"/>
-          <w:color w:val="1B2118"/>
-          <w:sz w:val="21"/>
-          <w:szCs w:val="21"/>
-        </w:rPr>
-        <w:t xml:space="preserve">), avvio del progetto se primo anno, note e fonti dei dati.</w:t>
-      </w:r>
-    </w:p>
-    <w:p>
-      <w:pPr>
-        <w:spacing w:after="140" w:line="300"/>
-      </w:pPr>
-      <w:r>
-        <w:rPr>
-          <w:rFonts w:ascii="Arial" w:cs="Arial" w:eastAsia="Arial" w:hAnsi="Arial"/>
-          <w:b/>
-          <w:bCs/>
-          <w:color w:val="1B2118"/>
-          <w:sz w:val="21"/>
-          <w:szCs w:val="21"/>
-        </w:rPr>
-        <w:t xml:space="preserve">Passo 2 — Rifiuti del territorio.</w:t>
-      </w:r>
-      <w:r>
-        <w:rPr>
-          <w:rFonts w:ascii="Arial" w:cs="Arial" w:eastAsia="Arial" w:hAnsi="Arial"/>
-          <w:color w:val="1B2118"/>
-          <w:sz w:val="21"/>
-          <w:szCs w:val="21"/>
-        </w:rPr>
-        <w:t xml:space="preserve"> Una riga per codice EER (es. 200301 </w:t>
-      </w:r>
-      <w:r>
-        <w:rPr>
-          <w:rFonts w:ascii="Arial" w:cs="Arial" w:eastAsia="Arial" w:hAnsi="Arial"/>
-          <w:i/>
-          <w:iCs/>
-          <w:color w:val="1B2118"/>
-          <w:sz w:val="21"/>
-          <w:szCs w:val="21"/>
-        </w:rPr>
-        <w:t xml:space="preserve">Rifiuti urbani non differenziati</w:t>
-      </w:r>
-      <w:r>
-        <w:rPr>
-          <w:rFonts w:ascii="Arial" w:cs="Arial" w:eastAsia="Arial" w:hAnsi="Arial"/>
-          <w:color w:val="1B2118"/>
-          <w:sz w:val="21"/>
-          <w:szCs w:val="21"/>
-        </w:rPr>
-        <w:t xml:space="preserve">, 200108 </w:t>
-      </w:r>
-      <w:r>
-        <w:rPr>
-          <w:rFonts w:ascii="Arial" w:cs="Arial" w:eastAsia="Arial" w:hAnsi="Arial"/>
-          <w:i/>
-          <w:iCs/>
-          <w:color w:val="1B2118"/>
-          <w:sz w:val="21"/>
-          <w:szCs w:val="21"/>
-        </w:rPr>
-        <w:t xml:space="preserve">Rifiuti biodegradabili di cucine e mense</w:t>
-      </w:r>
-      <w:r>
-        <w:rPr>
-          <w:rFonts w:ascii="Arial" w:cs="Arial" w:eastAsia="Arial" w:hAnsi="Arial"/>
-          <w:color w:val="1B2118"/>
-          <w:sz w:val="21"/>
-          <w:szCs w:val="21"/>
-        </w:rPr>
-        <w:t xml:space="preserve">, 200201 </w:t>
-      </w:r>
-      <w:r>
-        <w:rPr>
-          <w:rFonts w:ascii="Arial" w:cs="Arial" w:eastAsia="Arial" w:hAnsi="Arial"/>
-          <w:i/>
-          <w:iCs/>
-          <w:color w:val="1B2118"/>
-          <w:sz w:val="21"/>
-          <w:szCs w:val="21"/>
-        </w:rPr>
-        <w:t xml:space="preserve">Rifiuti biodegradabili (verde)</w:t>
-      </w:r>
-      <w:r>
-        <w:rPr>
-          <w:rFonts w:ascii="Arial" w:cs="Arial" w:eastAsia="Arial" w:hAnsi="Arial"/>
-          <w:color w:val="1B2118"/>
-          <w:sz w:val="21"/>
-          <w:szCs w:val="21"/>
-        </w:rPr>
-        <w:t xml:space="preserve">) con tipologia, quantità </w:t>
-      </w:r>
-      <w:r>
-        <w:rPr>
-          <w:rFonts w:ascii="Arial" w:cs="Arial" w:eastAsia="Arial" w:hAnsi="Arial"/>
-          <w:b/>
-          <w:bCs/>
-          <w:color w:val="1B2118"/>
-          <w:sz w:val="21"/>
-          <w:szCs w:val="21"/>
-        </w:rPr>
-        <w:t xml:space="preserve">Qtot (t)</w:t>
-      </w:r>
-      <w:r>
-        <w:rPr>
-          <w:rFonts w:ascii="Arial" w:cs="Arial" w:eastAsia="Arial" w:hAnsi="Arial"/>
-          <w:color w:val="1B2118"/>
-          <w:sz w:val="21"/>
-          <w:szCs w:val="21"/>
-        </w:rPr>
-        <w:t xml:space="preserve"> in tonnellate per anno e la spunta </w:t>
-      </w:r>
-      <w:r>
-        <w:rPr>
-          <w:rFonts w:ascii="Arial" w:cs="Arial" w:eastAsia="Arial" w:hAnsi="Arial"/>
-          <w:b/>
-          <w:bCs/>
-          <w:color w:val="1B2118"/>
-          <w:sz w:val="21"/>
-          <w:szCs w:val="21"/>
-        </w:rPr>
-        <w:t xml:space="preserve">Solo domestiche</w:t>
-      </w:r>
-      <w:r>
-        <w:rPr>
-          <w:rFonts w:ascii="Arial" w:cs="Arial" w:eastAsia="Arial" w:hAnsi="Arial"/>
-          <w:color w:val="1B2118"/>
-          <w:sz w:val="21"/>
-          <w:szCs w:val="21"/>
-        </w:rPr>
-        <w:t xml:space="preserve"> quando il rifiuto è raccolto solo presso le utenze domestiche. Fonte: Catasto rifiuti ISPRA o MUD del Comune. Il modello si chiama </w:t>
-      </w:r>
-      <w:r>
-        <w:rPr>
-          <w:rFonts w:ascii="Arial" w:cs="Arial" w:eastAsia="Arial" w:hAnsi="Arial"/>
-          <w:i/>
-          <w:iCs/>
-          <w:color w:val="1B2118"/>
-          <w:sz w:val="21"/>
-          <w:szCs w:val="21"/>
-        </w:rPr>
-        <w:t xml:space="preserve">rifiuti_ISPRA</w:t>
-      </w:r>
-      <w:r>
-        <w:rPr>
-          <w:rFonts w:ascii="Arial" w:cs="Arial" w:eastAsia="Arial" w:hAnsi="Arial"/>
-          <w:color w:val="1B2118"/>
-          <w:sz w:val="21"/>
-          <w:szCs w:val="21"/>
-        </w:rPr>
-        <w:t xml:space="preserve">.</w:t>
-      </w:r>
-    </w:p>
-    <w:p>
-      <w:pPr>
-        <w:spacing w:after="140" w:line="300"/>
-      </w:pPr>
-      <w:r>
-        <w:rPr>
-          <w:rFonts w:ascii="Arial" w:cs="Arial" w:eastAsia="Arial" w:hAnsi="Arial"/>
-          <w:b/>
-          <w:bCs/>
-          <w:color w:val="1B2118"/>
-          <w:sz w:val="21"/>
-          <w:szCs w:val="21"/>
-        </w:rPr>
-        <w:t xml:space="preserve">Passo 3 — Delibera tariffaria.</w:t>
-      </w:r>
-      <w:r>
-        <w:rPr>
-          <w:rFonts w:ascii="Arial" w:cs="Arial" w:eastAsia="Arial" w:hAnsi="Arial"/>
-          <w:color w:val="1B2118"/>
-          <w:sz w:val="21"/>
-          <w:szCs w:val="21"/>
-        </w:rPr>
-        <w:t xml:space="preserve"> Dalla delibera TARI del Comune:</w:t>
-      </w:r>
-    </w:p>
-    <w:p>
-      <w:pPr>
-        <w:pStyle w:val="ListParagraph"/>
-        <w:numPr>
-          <w:ilvl w:val="0"/>
-          <w:numId w:val="2"/>
-        </w:numPr>
-        <w:spacing w:after="70" w:line="290"/>
-      </w:pPr>
-      <w:r>
-        <w:rPr>
-          <w:rFonts w:ascii="Arial" w:cs="Arial" w:eastAsia="Arial" w:hAnsi="Arial"/>
-          <w:b/>
-          <w:bCs/>
-          <w:color w:val="1B2118"/>
-          <w:sz w:val="21"/>
-          <w:szCs w:val="21"/>
-        </w:rPr>
-        <w:t xml:space="preserve">PEF % utenze domestiche</w:t>
-      </w:r>
-      <w:r>
-        <w:rPr>
-          <w:rFonts w:ascii="Arial" w:cs="Arial" w:eastAsia="Arial" w:hAnsi="Arial"/>
-          <w:color w:val="1B2118"/>
-          <w:sz w:val="21"/>
-          <w:szCs w:val="21"/>
-        </w:rPr>
-        <w:t xml:space="preserve"> e </w:t>
-      </w:r>
-      <w:r>
-        <w:rPr>
-          <w:rFonts w:ascii="Arial" w:cs="Arial" w:eastAsia="Arial" w:hAnsi="Arial"/>
-          <w:b/>
-          <w:bCs/>
-          <w:color w:val="1B2118"/>
-          <w:sz w:val="21"/>
-          <w:szCs w:val="21"/>
-        </w:rPr>
-        <w:t xml:space="preserve">PEF % utenze non domestiche</w:t>
-      </w:r>
-      <w:r>
-        <w:rPr>
-          <w:rFonts w:ascii="Arial" w:cs="Arial" w:eastAsia="Arial" w:hAnsi="Arial"/>
-          <w:color w:val="1B2118"/>
-          <w:sz w:val="21"/>
-          <w:szCs w:val="21"/>
-        </w:rPr>
-        <w:t xml:space="preserve">: la ripartizione dei costi del piano economico finanziario; la somma deve fare 100.</w:t>
-      </w:r>
-    </w:p>
-    <w:p>
-      <w:pPr>
-        <w:pStyle w:val="ListParagraph"/>
-        <w:numPr>
-          <w:ilvl w:val="0"/>
-          <w:numId w:val="2"/>
-        </w:numPr>
-        <w:spacing w:after="70" w:line="290"/>
-      </w:pPr>
-      <w:r>
-        <w:rPr>
-          <w:rFonts w:ascii="Arial" w:cs="Arial" w:eastAsia="Arial" w:hAnsi="Arial"/>
-          <w:b/>
-          <w:bCs/>
-          <w:color w:val="1B2118"/>
-          <w:sz w:val="21"/>
-          <w:szCs w:val="21"/>
-        </w:rPr>
-        <w:t xml:space="preserve">Classi domestiche</w:t>
-      </w:r>
-      <w:r>
-        <w:rPr>
-          <w:rFonts w:ascii="Arial" w:cs="Arial" w:eastAsia="Arial" w:hAnsi="Arial"/>
-          <w:color w:val="1B2118"/>
-          <w:sz w:val="21"/>
-          <w:szCs w:val="21"/>
-        </w:rPr>
-        <w:t xml:space="preserve">: per ogni classe (numero di componenti del nucleo) il </w:t>
-      </w:r>
-      <w:r>
-        <w:rPr>
-          <w:rFonts w:ascii="Arial" w:cs="Arial" w:eastAsia="Arial" w:hAnsi="Arial"/>
-          <w:b/>
-          <w:bCs/>
-          <w:color w:val="1B2118"/>
-          <w:sz w:val="21"/>
-          <w:szCs w:val="21"/>
-        </w:rPr>
-        <w:t xml:space="preserve">N. utenze</w:t>
-      </w:r>
-      <w:r>
-        <w:rPr>
-          <w:rFonts w:ascii="Arial" w:cs="Arial" w:eastAsia="Arial" w:hAnsi="Arial"/>
-          <w:color w:val="1B2118"/>
-          <w:sz w:val="21"/>
-          <w:szCs w:val="21"/>
-        </w:rPr>
-        <w:t xml:space="preserve"> e il coefficiente </w:t>
-      </w:r>
-      <w:r>
-        <w:rPr>
-          <w:rFonts w:ascii="Arial" w:cs="Arial" w:eastAsia="Arial" w:hAnsi="Arial"/>
-          <w:b/>
-          <w:bCs/>
-          <w:color w:val="1B2118"/>
-          <w:sz w:val="21"/>
-          <w:szCs w:val="21"/>
-        </w:rPr>
-        <w:t xml:space="preserve">Kb</w:t>
-      </w:r>
-      <w:r>
-        <w:rPr>
-          <w:rFonts w:ascii="Arial" w:cs="Arial" w:eastAsia="Arial" w:hAnsi="Arial"/>
-          <w:color w:val="1B2118"/>
-          <w:sz w:val="21"/>
-          <w:szCs w:val="21"/>
-        </w:rPr>
-        <w:t xml:space="preserve">.</w:t>
-      </w:r>
-    </w:p>
-    <w:p>
-      <w:pPr>
-        <w:pStyle w:val="ListParagraph"/>
-        <w:numPr>
-          <w:ilvl w:val="0"/>
-          <w:numId w:val="2"/>
-        </w:numPr>
-        <w:spacing w:after="70" w:line="290"/>
-      </w:pPr>
-      <w:r>
-        <w:rPr>
-          <w:rFonts w:ascii="Arial" w:cs="Arial" w:eastAsia="Arial" w:hAnsi="Arial"/>
-          <w:b/>
-          <w:bCs/>
-          <w:color w:val="1B2118"/>
-          <w:sz w:val="21"/>
-          <w:szCs w:val="21"/>
-        </w:rPr>
-        <w:t xml:space="preserve">Classi non domestiche</w:t>
-      </w:r>
-      <w:r>
-        <w:rPr>
-          <w:rFonts w:ascii="Arial" w:cs="Arial" w:eastAsia="Arial" w:hAnsi="Arial"/>
-          <w:color w:val="1B2118"/>
-          <w:sz w:val="21"/>
-          <w:szCs w:val="21"/>
-        </w:rPr>
-        <w:t xml:space="preserve">: per ogni categoria (es. «1 - Musei, biblioteche, scuole») il </w:t>
-      </w:r>
-      <w:r>
-        <w:rPr>
-          <w:rFonts w:ascii="Arial" w:cs="Arial" w:eastAsia="Arial" w:hAnsi="Arial"/>
-          <w:b/>
-          <w:bCs/>
-          <w:color w:val="1B2118"/>
-          <w:sz w:val="21"/>
-          <w:szCs w:val="21"/>
-        </w:rPr>
-        <w:t xml:space="preserve">N. utenze</w:t>
-      </w:r>
-      <w:r>
-        <w:rPr>
-          <w:rFonts w:ascii="Arial" w:cs="Arial" w:eastAsia="Arial" w:hAnsi="Arial"/>
-          <w:color w:val="1B2118"/>
-          <w:sz w:val="21"/>
-          <w:szCs w:val="21"/>
-        </w:rPr>
-        <w:t xml:space="preserve">, la </w:t>
-      </w:r>
-      <w:r>
-        <w:rPr>
-          <w:rFonts w:ascii="Arial" w:cs="Arial" w:eastAsia="Arial" w:hAnsi="Arial"/>
-          <w:b/>
-          <w:bCs/>
-          <w:color w:val="1B2118"/>
-          <w:sz w:val="21"/>
-          <w:szCs w:val="21"/>
-        </w:rPr>
-        <w:t xml:space="preserve">Superficie (m²)</w:t>
-      </w:r>
-      <w:r>
-        <w:rPr>
-          <w:rFonts w:ascii="Arial" w:cs="Arial" w:eastAsia="Arial" w:hAnsi="Arial"/>
-          <w:color w:val="1B2118"/>
-          <w:sz w:val="21"/>
-          <w:szCs w:val="21"/>
-        </w:rPr>
-        <w:t xml:space="preserve"> e il coefficiente </w:t>
-      </w:r>
-      <w:r>
-        <w:rPr>
-          <w:rFonts w:ascii="Arial" w:cs="Arial" w:eastAsia="Arial" w:hAnsi="Arial"/>
-          <w:b/>
-          <w:bCs/>
-          <w:color w:val="1B2118"/>
-          <w:sz w:val="21"/>
-          <w:szCs w:val="21"/>
-        </w:rPr>
-        <w:t xml:space="preserve">Kd</w:t>
-      </w:r>
-      <w:r>
-        <w:rPr>
-          <w:rFonts w:ascii="Arial" w:cs="Arial" w:eastAsia="Arial" w:hAnsi="Arial"/>
-          <w:color w:val="1B2118"/>
-          <w:sz w:val="21"/>
-          <w:szCs w:val="21"/>
-        </w:rPr>
-        <w:t xml:space="preserve">.</w:t>
-      </w:r>
-    </w:p>
-    <w:p>
-      <w:pPr>
-        <w:spacing w:after="140" w:line="300"/>
-      </w:pPr>
-      <w:r>
-        <w:rPr>
-          <w:rFonts w:ascii="Arial" w:cs="Arial" w:eastAsia="Arial" w:hAnsi="Arial"/>
-          <w:b/>
-          <w:bCs/>
-          <w:color w:val="1B2118"/>
-          <w:sz w:val="21"/>
-          <w:szCs w:val="21"/>
-        </w:rPr>
-        <w:t xml:space="preserve">Passo 4 — Fattori di emissione e pesi specifici.</w:t>
-      </w:r>
-      <w:r>
-        <w:rPr>
-          <w:rFonts w:ascii="Arial" w:cs="Arial" w:eastAsia="Arial" w:hAnsi="Arial"/>
-          <w:color w:val="1B2118"/>
-          <w:sz w:val="21"/>
-          <w:szCs w:val="21"/>
-        </w:rPr>
-        <w:t xml:space="preserve"> La tabella è già compilata con i valori della Metodologia: </w:t>
-      </w:r>
-      <w:r>
-        <w:rPr>
-          <w:rFonts w:ascii="Arial" w:cs="Arial" w:eastAsia="Arial" w:hAnsi="Arial"/>
-          <w:b/>
-          <w:bCs/>
-          <w:color w:val="1B2118"/>
-          <w:sz w:val="21"/>
-          <w:szCs w:val="21"/>
-        </w:rPr>
-        <w:t xml:space="preserve">FErid(r)</w:t>
-      </w:r>
-      <w:r>
-        <w:rPr>
-          <w:rFonts w:ascii="Arial" w:cs="Arial" w:eastAsia="Arial" w:hAnsi="Arial"/>
-          <w:color w:val="1B2118"/>
-          <w:sz w:val="21"/>
-          <w:szCs w:val="21"/>
-        </w:rPr>
-        <w:t xml:space="preserve"> in kgCO₂eq/kg dalle Tabelle 3 (USEPA WARM) e 4 (WRAP) e i pesi specifici di default della Tabella 8. Il fattore dell'indifferenziato è </w:t>
-      </w:r>
-      <w:r>
-        <w:rPr>
-          <w:rFonts w:ascii="Arial" w:cs="Arial" w:eastAsia="Arial" w:hAnsi="Arial"/>
-          <w:i/>
-          <w:iCs/>
-          <w:color w:val="1B2118"/>
-          <w:sz w:val="21"/>
-          <w:szCs w:val="21"/>
-        </w:rPr>
-        <w:t xml:space="preserve">Calcolato (f. 16-17)</w:t>
-      </w:r>
-      <w:r>
-        <w:rPr>
-          <w:rFonts w:ascii="Arial" w:cs="Arial" w:eastAsia="Arial" w:hAnsi="Arial"/>
-          <w:color w:val="1B2118"/>
-          <w:sz w:val="21"/>
-          <w:szCs w:val="21"/>
-        </w:rPr>
-        <w:t xml:space="preserve"> dal portale. Un valore si cambia solo citando la fonte nelle note. Qui si trovano anche i </w:t>
-      </w:r>
-      <w:r>
-        <w:rPr>
-          <w:rFonts w:ascii="Arial" w:cs="Arial" w:eastAsia="Arial" w:hAnsi="Arial"/>
-          <w:b/>
-          <w:bCs/>
-          <w:color w:val="1B2118"/>
-          <w:sz w:val="21"/>
-          <w:szCs w:val="21"/>
-        </w:rPr>
-        <w:t xml:space="preserve">beni a riuso</w:t>
-      </w:r>
-      <w:r>
-        <w:rPr>
-          <w:rFonts w:ascii="Arial" w:cs="Arial" w:eastAsia="Arial" w:hAnsi="Arial"/>
-          <w:color w:val="1B2118"/>
-          <w:sz w:val="21"/>
-          <w:szCs w:val="21"/>
-        </w:rPr>
-        <w:t xml:space="preserve"> (peso e fattore FErid(b)) e l'opzione </w:t>
-      </w:r>
-      <w:r>
-        <w:rPr>
-          <w:rFonts w:ascii="Arial" w:cs="Arial" w:eastAsia="Arial" w:hAnsi="Arial"/>
-          <w:b/>
-          <w:bCs/>
-          <w:color w:val="1B2118"/>
-          <w:sz w:val="21"/>
-          <w:szCs w:val="21"/>
-        </w:rPr>
-        <w:t xml:space="preserve">Tratta il riuso come riduzione di emissioni</w:t>
-      </w:r>
-      <w:r>
-        <w:rPr>
-          <w:rFonts w:ascii="Arial" w:cs="Arial" w:eastAsia="Arial" w:hAnsi="Arial"/>
-          <w:color w:val="1B2118"/>
-          <w:sz w:val="21"/>
-          <w:szCs w:val="21"/>
-        </w:rPr>
-        <w:t xml:space="preserve">, che resta spenta finché la Fondazione non conferma la scelta (vedi «Scelte da confermare»).</w:t>
-      </w:r>
-    </w:p>
-    <w:p>
-      <w:pPr>
-        <w:spacing w:after="140" w:line="300"/>
-      </w:pPr>
-      <w:r>
-        <w:rPr>
-          <w:rFonts w:ascii="Arial" w:cs="Arial" w:eastAsia="Arial" w:hAnsi="Arial"/>
-          <w:b/>
-          <w:bCs/>
-          <w:color w:val="1B2118"/>
-          <w:sz w:val="21"/>
-          <w:szCs w:val="21"/>
-        </w:rPr>
-        <w:t xml:space="preserve">Passo 5 — Banca Dati Utenze.</w:t>
-      </w:r>
-      <w:r>
-        <w:rPr>
-          <w:rFonts w:ascii="Arial" w:cs="Arial" w:eastAsia="Arial" w:hAnsi="Arial"/>
-          <w:color w:val="1B2118"/>
-          <w:sz w:val="21"/>
-          <w:szCs w:val="21"/>
-        </w:rPr>
-        <w:t xml:space="preserve"> Il cuore del calcolo </w:t>
-      </w:r>
-      <w:r>
-        <w:rPr>
-          <w:rFonts w:ascii="Arial" w:cs="Arial" w:eastAsia="Arial" w:hAnsi="Arial"/>
-          <w:i/>
-          <w:iCs/>
-          <w:color w:val="1B2118"/>
-          <w:sz w:val="21"/>
-          <w:szCs w:val="21"/>
-        </w:rPr>
-        <w:t xml:space="preserve">ex post</w:t>
-      </w:r>
-      <w:r>
-        <w:rPr>
-          <w:rFonts w:ascii="Arial" w:cs="Arial" w:eastAsia="Arial" w:hAnsi="Arial"/>
-          <w:color w:val="1B2118"/>
-          <w:sz w:val="21"/>
-          <w:szCs w:val="21"/>
-        </w:rPr>
-        <w:t xml:space="preserve">. Due tabelle:</w:t>
-      </w:r>
-    </w:p>
-    <w:p>
-      <w:pPr>
-        <w:pStyle w:val="ListParagraph"/>
-        <w:numPr>
-          <w:ilvl w:val="0"/>
-          <w:numId w:val="2"/>
-        </w:numPr>
-        <w:spacing w:after="70" w:line="290"/>
-      </w:pPr>
-      <w:r>
-        <w:rPr>
-          <w:rFonts w:ascii="Arial" w:cs="Arial" w:eastAsia="Arial" w:hAnsi="Arial"/>
-          <w:b/>
-          <w:bCs/>
-          <w:color w:val="1B2118"/>
-          <w:sz w:val="21"/>
-          <w:szCs w:val="21"/>
-        </w:rPr>
-        <w:t xml:space="preserve">Conferimenti</w:t>
-      </w:r>
-      <w:r>
-        <w:rPr>
-          <w:rFonts w:ascii="Arial" w:cs="Arial" w:eastAsia="Arial" w:hAnsi="Arial"/>
-          <w:color w:val="1B2118"/>
-          <w:sz w:val="21"/>
-          <w:szCs w:val="21"/>
-        </w:rPr>
-        <w:t xml:space="preserve">: una riga per utenza e tipologia di rifiuto, con </w:t>
-      </w:r>
-      <w:r>
-        <w:rPr>
-          <w:rFonts w:ascii="Arial" w:cs="Arial" w:eastAsia="Arial" w:hAnsi="Arial"/>
-          <w:b/>
-          <w:bCs/>
-          <w:color w:val="1B2118"/>
-          <w:sz w:val="21"/>
-          <w:szCs w:val="21"/>
-        </w:rPr>
-        <w:t xml:space="preserve">codice utenza</w:t>
-      </w:r>
-      <w:r>
-        <w:rPr>
-          <w:rFonts w:ascii="Arial" w:cs="Arial" w:eastAsia="Arial" w:hAnsi="Arial"/>
-          <w:color w:val="1B2118"/>
-          <w:sz w:val="21"/>
-          <w:szCs w:val="21"/>
-        </w:rPr>
-        <w:t xml:space="preserve">, macrocategoria (domestica o non domestica), classe, numero di </w:t>
-      </w:r>
-      <w:r>
-        <w:rPr>
-          <w:rFonts w:ascii="Arial" w:cs="Arial" w:eastAsia="Arial" w:hAnsi="Arial"/>
-          <w:b/>
-          <w:bCs/>
-          <w:color w:val="1B2118"/>
-          <w:sz w:val="21"/>
-          <w:szCs w:val="21"/>
-        </w:rPr>
-        <w:t xml:space="preserve">Svuotamenti</w:t>
-      </w:r>
-      <w:r>
-        <w:rPr>
-          <w:rFonts w:ascii="Arial" w:cs="Arial" w:eastAsia="Arial" w:hAnsi="Arial"/>
-          <w:color w:val="1B2118"/>
-          <w:sz w:val="21"/>
-          <w:szCs w:val="21"/>
-        </w:rPr>
-        <w:t xml:space="preserve"> e </w:t>
-      </w:r>
-      <w:r>
-        <w:rPr>
-          <w:rFonts w:ascii="Arial" w:cs="Arial" w:eastAsia="Arial" w:hAnsi="Arial"/>
-          <w:b/>
-          <w:bCs/>
-          <w:color w:val="1B2118"/>
-          <w:sz w:val="21"/>
-          <w:szCs w:val="21"/>
-        </w:rPr>
-        <w:t xml:space="preserve">Volume contenitore (L)</w:t>
-      </w:r>
-      <w:r>
-        <w:rPr>
-          <w:rFonts w:ascii="Arial" w:cs="Arial" w:eastAsia="Arial" w:hAnsi="Arial"/>
-          <w:color w:val="1B2118"/>
-          <w:sz w:val="21"/>
-          <w:szCs w:val="21"/>
-        </w:rPr>
-        <w:t xml:space="preserve"> per la raccolta domiciliare, e i pesi o volumi conferiti presso le </w:t>
-      </w:r>
-      <w:r>
-        <w:rPr>
-          <w:rFonts w:ascii="Arial" w:cs="Arial" w:eastAsia="Arial" w:hAnsi="Arial"/>
-          <w:b/>
-          <w:bCs/>
-          <w:color w:val="1B2118"/>
-          <w:sz w:val="21"/>
-          <w:szCs w:val="21"/>
-        </w:rPr>
-        <w:t xml:space="preserve">strutture informatizzate</w:t>
-      </w:r>
-      <w:r>
-        <w:rPr>
-          <w:rFonts w:ascii="Arial" w:cs="Arial" w:eastAsia="Arial" w:hAnsi="Arial"/>
-          <w:color w:val="1B2118"/>
-          <w:sz w:val="21"/>
-          <w:szCs w:val="21"/>
-        </w:rPr>
-        <w:t xml:space="preserve"> e i </w:t>
-      </w:r>
-      <w:r>
-        <w:rPr>
-          <w:rFonts w:ascii="Arial" w:cs="Arial" w:eastAsia="Arial" w:hAnsi="Arial"/>
-          <w:b/>
-          <w:bCs/>
-          <w:color w:val="1B2118"/>
-          <w:sz w:val="21"/>
-          <w:szCs w:val="21"/>
-        </w:rPr>
-        <w:t xml:space="preserve">centri di raccolta</w:t>
-      </w:r>
-      <w:r>
-        <w:rPr>
-          <w:rFonts w:ascii="Arial" w:cs="Arial" w:eastAsia="Arial" w:hAnsi="Arial"/>
-          <w:color w:val="1B2118"/>
-          <w:sz w:val="21"/>
-          <w:szCs w:val="21"/>
-        </w:rPr>
-        <w:t xml:space="preserve">.</w:t>
-      </w:r>
-    </w:p>
-    <w:p>
-      <w:pPr>
-        <w:pStyle w:val="ListParagraph"/>
-        <w:numPr>
-          <w:ilvl w:val="0"/>
-          <w:numId w:val="2"/>
-        </w:numPr>
-        <w:spacing w:after="70" w:line="290"/>
-      </w:pPr>
-      <w:r>
-        <w:rPr>
-          <w:rFonts w:ascii="Arial" w:cs="Arial" w:eastAsia="Arial" w:hAnsi="Arial"/>
-          <w:b/>
-          <w:bCs/>
-          <w:color w:val="1B2118"/>
-          <w:sz w:val="21"/>
-          <w:szCs w:val="21"/>
-        </w:rPr>
-        <w:t xml:space="preserve">Beni a riuso</w:t>
-      </w:r>
-      <w:r>
-        <w:rPr>
-          <w:rFonts w:ascii="Arial" w:cs="Arial" w:eastAsia="Arial" w:hAnsi="Arial"/>
-          <w:color w:val="1B2118"/>
-          <w:sz w:val="21"/>
-          <w:szCs w:val="21"/>
-        </w:rPr>
-        <w:t xml:space="preserve">: una riga per utenza e bene conferito al riuso (codice bene, quantità).</w:t>
-      </w:r>
-    </w:p>
-    <w:p>
-      <w:pPr>
-        <w:spacing w:after="140" w:line="300"/>
-      </w:pPr>
-      <w:r>
-        <w:rPr>
-          <w:rFonts w:ascii="Arial" w:cs="Arial" w:eastAsia="Arial" w:hAnsi="Arial"/>
-          <w:b/>
-          <w:bCs/>
-          <w:color w:val="1B2118"/>
-          <w:sz w:val="21"/>
-          <w:szCs w:val="21"/>
-        </w:rPr>
-        <w:t xml:space="preserve">Attenzione.</w:t>
-      </w:r>
-      <w:r>
-        <w:rPr>
-          <w:rFonts w:ascii="Arial" w:cs="Arial" w:eastAsia="Arial" w:hAnsi="Arial"/>
-          <w:color w:val="1B2118"/>
-          <w:sz w:val="21"/>
-          <w:szCs w:val="21"/>
-        </w:rPr>
-        <w:t xml:space="preserve"> </w:t>
-      </w:r>
-      <w:r>
-        <w:rPr>
-          <w:rFonts w:ascii="Arial" w:cs="Arial" w:eastAsia="Arial" w:hAnsi="Arial"/>
-          <w:b/>
-          <w:bCs/>
-          <w:color w:val="1B2118"/>
-          <w:sz w:val="21"/>
-          <w:szCs w:val="21"/>
-        </w:rPr>
-        <w:t xml:space="preserve">Importa CSV (sostituisce i dati)</w:t>
-      </w:r>
-      <w:r>
-        <w:rPr>
-          <w:rFonts w:ascii="Arial" w:cs="Arial" w:eastAsia="Arial" w:hAnsi="Arial"/>
-          <w:color w:val="1B2118"/>
-          <w:sz w:val="21"/>
-          <w:szCs w:val="21"/>
-        </w:rPr>
-        <w:t xml:space="preserve"> cancella le righe già presenti nella tabella e salva subito il nuovo contenuto. Importate sempre il file completo.</w:t>
-      </w:r>
-    </w:p>
-    <w:p>
-      <w:pPr>
-        <w:spacing w:after="140" w:line="300"/>
-      </w:pPr>
-      <w:r>
-        <w:rPr>
-          <w:rFonts w:ascii="Arial" w:cs="Arial" w:eastAsia="Arial" w:hAnsi="Arial"/>
-          <w:color w:val="1B2118"/>
-          <w:sz w:val="21"/>
-          <w:szCs w:val="21"/>
-        </w:rPr>
-        <w:t xml:space="preserve">L'opzione </w:t>
-      </w:r>
-      <w:r>
-        <w:rPr>
-          <w:rFonts w:ascii="Arial" w:cs="Arial" w:eastAsia="Arial" w:hAnsi="Arial"/>
-          <w:b/>
-          <w:bCs/>
-          <w:color w:val="1B2118"/>
-          <w:sz w:val="21"/>
-          <w:szCs w:val="21"/>
-        </w:rPr>
-        <w:t xml:space="preserve">Calcola il peso specifico a consuntivo (formula 18), invece dei valori della Tabella 8</w:t>
-      </w:r>
-      <w:r>
-        <w:rPr>
-          <w:rFonts w:ascii="Arial" w:cs="Arial" w:eastAsia="Arial" w:hAnsi="Arial"/>
-          <w:color w:val="1B2118"/>
-          <w:sz w:val="21"/>
-          <w:szCs w:val="21"/>
-        </w:rPr>
-        <w:t xml:space="preserve"> si usa quando il gestore ha sia pesi sia volumi misurati.</w:t>
-      </w:r>
-    </w:p>
-    <w:p>
-      <w:pPr>
-        <w:spacing w:after="140" w:line="300"/>
-      </w:pPr>
-      <w:r>
-        <w:rPr>
-          <w:rFonts w:ascii="Arial" w:cs="Arial" w:eastAsia="Arial" w:hAnsi="Arial"/>
-          <w:b/>
-          <w:bCs/>
-          <w:color w:val="1B2118"/>
-          <w:sz w:val="21"/>
-          <w:szCs w:val="21"/>
-        </w:rPr>
-        <w:t xml:space="preserve">Passo 6 — Buffer (Analisi del rischio).</w:t>
-      </w:r>
-      <w:r>
-        <w:rPr>
-          <w:rFonts w:ascii="Arial" w:cs="Arial" w:eastAsia="Arial" w:hAnsi="Arial"/>
-          <w:color w:val="1B2118"/>
-          <w:sz w:val="21"/>
-          <w:szCs w:val="21"/>
-        </w:rPr>
-        <w:t xml:space="preserve"> Il buffer parte dal 30% e si riduce in base a come il Comune misura i conferimenti:</w:t>
-      </w:r>
-    </w:p>
-    <w:p>
-      <w:pPr>
-        <w:pStyle w:val="ListParagraph"/>
-        <w:numPr>
-          <w:ilvl w:val="0"/>
-          <w:numId w:val="2"/>
-        </w:numPr>
-        <w:spacing w:after="70" w:line="290"/>
-      </w:pPr>
-      <w:r>
-        <w:rPr>
-          <w:rFonts w:ascii="Arial" w:cs="Arial" w:eastAsia="Arial" w:hAnsi="Arial"/>
-          <w:color w:val="1B2118"/>
-          <w:sz w:val="21"/>
-          <w:szCs w:val="21"/>
-        </w:rPr>
-        <w:t xml:space="preserve">utenze e rifiuti monitorati (Tabelle 15 e 16), compilabili a mano o con </w:t>
-      </w:r>
-      <w:r>
-        <w:rPr>
-          <w:rFonts w:ascii="Arial" w:cs="Arial" w:eastAsia="Arial" w:hAnsi="Arial"/>
-          <w:b/>
-          <w:bCs/>
-          <w:color w:val="1B2118"/>
-          <w:sz w:val="21"/>
-          <w:szCs w:val="21"/>
-        </w:rPr>
-        <w:t xml:space="preserve">Ricava dai dati importati</w:t>
-      </w:r>
-      <w:r>
-        <w:rPr>
-          <w:rFonts w:ascii="Arial" w:cs="Arial" w:eastAsia="Arial" w:hAnsi="Arial"/>
-          <w:color w:val="1B2118"/>
-          <w:sz w:val="21"/>
-          <w:szCs w:val="21"/>
-        </w:rPr>
-        <w:t xml:space="preserve">, che li ricava dalla Banca Dati Utenze;</w:t>
-      </w:r>
-    </w:p>
-    <w:p>
-      <w:pPr>
-        <w:pStyle w:val="ListParagraph"/>
-        <w:numPr>
-          <w:ilvl w:val="0"/>
-          <w:numId w:val="2"/>
-        </w:numPr>
-        <w:spacing w:after="70" w:line="290"/>
-      </w:pPr>
-      <w:r>
-        <w:rPr>
-          <w:rFonts w:ascii="Arial" w:cs="Arial" w:eastAsia="Arial" w:hAnsi="Arial"/>
-          <w:b/>
-          <w:bCs/>
-          <w:color w:val="1B2118"/>
-          <w:sz w:val="21"/>
-          <w:szCs w:val="21"/>
-        </w:rPr>
-        <w:t xml:space="preserve">Misura presso Centri di Raccolta / Riuso (−2%)</w:t>
-      </w:r>
-      <w:r>
-        <w:rPr>
-          <w:rFonts w:ascii="Arial" w:cs="Arial" w:eastAsia="Arial" w:hAnsi="Arial"/>
-          <w:color w:val="1B2118"/>
-          <w:sz w:val="21"/>
-          <w:szCs w:val="21"/>
-        </w:rPr>
-        <w:t xml:space="preserve">;</w:t>
-      </w:r>
-    </w:p>
-    <w:p>
-      <w:pPr>
-        <w:pStyle w:val="ListParagraph"/>
-        <w:numPr>
-          <w:ilvl w:val="0"/>
-          <w:numId w:val="2"/>
-        </w:numPr>
-        <w:spacing w:after="70" w:line="290"/>
-      </w:pPr>
-      <w:r>
-        <w:rPr>
-          <w:rFonts w:ascii="Arial" w:cs="Arial" w:eastAsia="Arial" w:hAnsi="Arial"/>
-          <w:b/>
-          <w:bCs/>
-          <w:color w:val="1B2118"/>
-          <w:sz w:val="21"/>
-          <w:szCs w:val="21"/>
-        </w:rPr>
-        <w:t xml:space="preserve">Misura ingombranti, verde o indumenti fuori dai centri (−1%)</w:t>
-      </w:r>
-      <w:r>
-        <w:rPr>
-          <w:rFonts w:ascii="Arial" w:cs="Arial" w:eastAsia="Arial" w:hAnsi="Arial"/>
-          <w:color w:val="1B2118"/>
-          <w:sz w:val="21"/>
-          <w:szCs w:val="21"/>
-        </w:rPr>
-        <w:t xml:space="preserve">;</w:t>
-      </w:r>
-    </w:p>
-    <w:p>
-      <w:pPr>
-        <w:pStyle w:val="ListParagraph"/>
-        <w:numPr>
-          <w:ilvl w:val="0"/>
-          <w:numId w:val="2"/>
-        </w:numPr>
-        <w:spacing w:after="70" w:line="290"/>
-      </w:pPr>
-      <w:r>
-        <w:rPr>
-          <w:rFonts w:ascii="Arial" w:cs="Arial" w:eastAsia="Arial" w:hAnsi="Arial"/>
-          <w:b/>
-          <w:bCs/>
-          <w:color w:val="1B2118"/>
-          <w:sz w:val="21"/>
-          <w:szCs w:val="21"/>
-        </w:rPr>
-        <w:t xml:space="preserve">Tariffa puntuale attiva nell'anno (buffer dimezzato)</w:t>
-      </w:r>
-      <w:r>
-        <w:rPr>
-          <w:rFonts w:ascii="Arial" w:cs="Arial" w:eastAsia="Arial" w:hAnsi="Arial"/>
-          <w:color w:val="1B2118"/>
-          <w:sz w:val="21"/>
-          <w:szCs w:val="21"/>
-        </w:rPr>
-        <w:t xml:space="preserve">;</w:t>
-      </w:r>
-    </w:p>
-    <w:p>
-      <w:pPr>
-        <w:pStyle w:val="ListParagraph"/>
-        <w:numPr>
-          <w:ilvl w:val="0"/>
-          <w:numId w:val="2"/>
-        </w:numPr>
-        <w:spacing w:after="70" w:line="290"/>
-      </w:pPr>
-      <w:r>
-        <w:rPr>
-          <w:rFonts w:ascii="Arial" w:cs="Arial" w:eastAsia="Arial" w:hAnsi="Arial"/>
-          <w:b/>
-          <w:bCs/>
-          <w:color w:val="1B2118"/>
-          <w:sz w:val="21"/>
-          <w:szCs w:val="21"/>
-        </w:rPr>
-        <w:t xml:space="preserve">Solo le utenze che riducono la CO₂eq (le altre non pesano sul territorio)</w:t>
-      </w:r>
-      <w:r>
-        <w:rPr>
-          <w:rFonts w:ascii="Arial" w:cs="Arial" w:eastAsia="Arial" w:hAnsi="Arial"/>
-          <w:color w:val="1B2118"/>
-          <w:sz w:val="21"/>
-          <w:szCs w:val="21"/>
-        </w:rPr>
-        <w:t xml:space="preserve">: la scelta «utenze virtuose».</w:t>
-      </w:r>
-    </w:p>
-    <w:p>
-      <w:pPr>
-        <w:spacing w:after="140" w:line="300"/>
-      </w:pPr>
-      <w:r>
-        <w:rPr>
-          <w:rFonts w:ascii="Arial" w:cs="Arial" w:eastAsia="Arial" w:hAnsi="Arial"/>
-          <w:b/>
-          <w:bCs/>
-          <w:color w:val="1B2118"/>
-          <w:sz w:val="21"/>
-          <w:szCs w:val="21"/>
-        </w:rPr>
-        <w:t xml:space="preserve">Passo 7 — Risultati.</w:t>
-      </w:r>
-      <w:r>
-        <w:rPr>
-          <w:rFonts w:ascii="Arial" w:cs="Arial" w:eastAsia="Arial" w:hAnsi="Arial"/>
-          <w:color w:val="1B2118"/>
-          <w:sz w:val="21"/>
-          <w:szCs w:val="21"/>
-        </w:rPr>
-        <w:t xml:space="preserve"> Premete </w:t>
-      </w:r>
-      <w:r>
-        <w:rPr>
-          <w:rFonts w:ascii="Arial" w:cs="Arial" w:eastAsia="Arial" w:hAnsi="Arial"/>
-          <w:b/>
-          <w:bCs/>
-          <w:color w:val="1B2118"/>
-          <w:sz w:val="21"/>
-          <w:szCs w:val="21"/>
-        </w:rPr>
-        <w:t xml:space="preserve">Calcola</w:t>
-      </w:r>
-      <w:r>
-        <w:rPr>
-          <w:rFonts w:ascii="Arial" w:cs="Arial" w:eastAsia="Arial" w:hAnsi="Arial"/>
-          <w:color w:val="1B2118"/>
-          <w:sz w:val="21"/>
-          <w:szCs w:val="21"/>
-        </w:rPr>
-        <w:t xml:space="preserve">.</w:t>
-      </w:r>
-    </w:p>
-    <w:p>
-      <w:pPr>
-        <w:pStyle w:val="Heading2"/>
-        <w:keepNext/>
-        <w:spacing w:after="120" w:before="240"/>
-      </w:pPr>
-      <w:r>
-        <w:rPr>
-          <w:rFonts w:ascii="Arial" w:cs="Arial" w:eastAsia="Arial" w:hAnsi="Arial"/>
-          <w:b/>
-          <w:bCs/>
-          <w:color w:val="2F5D3A"/>
-          <w:sz w:val="25"/>
-          <w:szCs w:val="25"/>
-        </w:rPr>
-        <w:t xml:space="preserve">Leggere i risultati</w:t>
-      </w:r>
-    </w:p>
-    <w:p>
-      <w:pPr>
-        <w:spacing w:after="140" w:line="300"/>
-      </w:pPr>
-      <w:r>
-        <w:rPr>
-          <w:rFonts w:ascii="Arial" w:cs="Arial" w:eastAsia="Arial" w:hAnsi="Arial"/>
-          <w:color w:val="1B2118"/>
-          <w:sz w:val="21"/>
-          <w:szCs w:val="21"/>
-        </w:rPr>
-        <w:t xml:space="preserve">Dopo </w:t>
-      </w:r>
-      <w:r>
-        <w:rPr>
-          <w:rFonts w:ascii="Arial" w:cs="Arial" w:eastAsia="Arial" w:hAnsi="Arial"/>
-          <w:b/>
-          <w:bCs/>
-          <w:color w:val="1B2118"/>
-          <w:sz w:val="21"/>
-          <w:szCs w:val="21"/>
-        </w:rPr>
-        <w:t xml:space="preserve">Calcola</w:t>
-      </w:r>
-      <w:r>
-        <w:rPr>
-          <w:rFonts w:ascii="Arial" w:cs="Arial" w:eastAsia="Arial" w:hAnsi="Arial"/>
-          <w:color w:val="1B2118"/>
-          <w:sz w:val="21"/>
-          <w:szCs w:val="21"/>
-        </w:rPr>
-        <w:t xml:space="preserve"> il passo 7 mostra in evidenza </w:t>
-      </w:r>
-      <w:r>
-        <w:rPr>
-          <w:rFonts w:ascii="Arial" w:cs="Arial" w:eastAsia="Arial" w:hAnsi="Arial"/>
-          <w:b/>
-          <w:bCs/>
-          <w:color w:val="1B2118"/>
-          <w:sz w:val="21"/>
-          <w:szCs w:val="21"/>
-        </w:rPr>
-        <w:t xml:space="preserve">Crediti netti</w:t>
-      </w:r>
-      <w:r>
-        <w:rPr>
-          <w:rFonts w:ascii="Arial" w:cs="Arial" w:eastAsia="Arial" w:hAnsi="Arial"/>
-          <w:color w:val="1B2118"/>
-          <w:sz w:val="21"/>
-          <w:szCs w:val="21"/>
-        </w:rPr>
-        <w:t xml:space="preserve"> e </w:t>
-      </w:r>
-      <w:r>
-        <w:rPr>
-          <w:rFonts w:ascii="Arial" w:cs="Arial" w:eastAsia="Arial" w:hAnsi="Arial"/>
-          <w:b/>
-          <w:bCs/>
-          <w:color w:val="1B2118"/>
-          <w:sz w:val="21"/>
-          <w:szCs w:val="21"/>
-        </w:rPr>
-        <w:t xml:space="preserve">Crediti lordi (−ΔI)</w:t>
-      </w:r>
-      <w:r>
-        <w:rPr>
-          <w:rFonts w:ascii="Arial" w:cs="Arial" w:eastAsia="Arial" w:hAnsi="Arial"/>
-          <w:color w:val="1B2118"/>
-          <w:sz w:val="21"/>
-          <w:szCs w:val="21"/>
-        </w:rPr>
-        <w:t xml:space="preserve"> in tCO₂eq e il buffer applicato, poi le tabelle di dettaglio:</w:t>
-      </w:r>
-    </w:p>
-    <w:p>
-      <w:pPr>
-        <w:pStyle w:val="ListParagraph"/>
-        <w:numPr>
-          <w:ilvl w:val="0"/>
-          <w:numId w:val="2"/>
-        </w:numPr>
-        <w:spacing w:after="70" w:line="290"/>
-      </w:pPr>
-      <w:r>
-        <w:rPr>
-          <w:rFonts w:ascii="Arial" w:cs="Arial" w:eastAsia="Arial" w:hAnsi="Arial"/>
-          <w:b/>
-          <w:bCs/>
-          <w:color w:val="1B2118"/>
-          <w:sz w:val="21"/>
-          <w:szCs w:val="21"/>
-        </w:rPr>
-        <w:t xml:space="preserve">Territorio</w:t>
-      </w:r>
-      <w:r>
-        <w:rPr>
-          <w:rFonts w:ascii="Arial" w:cs="Arial" w:eastAsia="Arial" w:hAnsi="Arial"/>
-          <w:color w:val="1B2118"/>
-          <w:sz w:val="21"/>
-          <w:szCs w:val="21"/>
-        </w:rPr>
-        <w:t xml:space="preserve">: anno, coefficiente primo anno, Qtot, ripartizione P%UD e P%UnD, EA del territorio, FE dell'indifferenziato;</w:t>
-      </w:r>
-    </w:p>
-    <w:p>
-      <w:pPr>
-        <w:pStyle w:val="ListParagraph"/>
-        <w:numPr>
-          <w:ilvl w:val="0"/>
-          <w:numId w:val="2"/>
-        </w:numPr>
-        <w:spacing w:after="70" w:line="290"/>
-      </w:pPr>
-      <w:r>
-        <w:rPr>
-          <w:rFonts w:ascii="Arial" w:cs="Arial" w:eastAsia="Arial" w:hAnsi="Arial"/>
-          <w:b/>
-          <w:bCs/>
-          <w:color w:val="1B2118"/>
-          <w:sz w:val="21"/>
-          <w:szCs w:val="21"/>
-        </w:rPr>
-        <w:t xml:space="preserve">Utenze</w:t>
-      </w:r>
-      <w:r>
-        <w:rPr>
-          <w:rFonts w:ascii="Arial" w:cs="Arial" w:eastAsia="Arial" w:hAnsi="Arial"/>
-          <w:color w:val="1B2118"/>
-          <w:sz w:val="21"/>
-          <w:szCs w:val="21"/>
-        </w:rPr>
-        <w:t xml:space="preserve">: numero di utenze e di utenze virtuose, ΔI complessiva;</w:t>
-      </w:r>
-    </w:p>
-    <w:p>
-      <w:pPr>
-        <w:pStyle w:val="ListParagraph"/>
-        <w:numPr>
-          <w:ilvl w:val="0"/>
-          <w:numId w:val="2"/>
-        </w:numPr>
-        <w:spacing w:after="70" w:line="290"/>
-      </w:pPr>
-      <w:r>
-        <w:rPr>
-          <w:rFonts w:ascii="Arial" w:cs="Arial" w:eastAsia="Arial" w:hAnsi="Arial"/>
-          <w:b/>
-          <w:bCs/>
-          <w:color w:val="1B2118"/>
-          <w:sz w:val="21"/>
-          <w:szCs w:val="21"/>
-        </w:rPr>
-        <w:t xml:space="preserve">Crediti</w:t>
-      </w:r>
-      <w:r>
-        <w:rPr>
-          <w:rFonts w:ascii="Arial" w:cs="Arial" w:eastAsia="Arial" w:hAnsi="Arial"/>
-          <w:color w:val="1B2118"/>
-          <w:sz w:val="21"/>
-          <w:szCs w:val="21"/>
-        </w:rPr>
-        <w:t xml:space="preserve">: buffer (%), crediti lordi, quota buffer, crediti netti, oppure il debito;</w:t>
-      </w:r>
-    </w:p>
-    <w:p>
-      <w:pPr>
-        <w:pStyle w:val="ListParagraph"/>
-        <w:numPr>
-          <w:ilvl w:val="0"/>
-          <w:numId w:val="2"/>
-        </w:numPr>
-        <w:spacing w:after="70" w:line="290"/>
-      </w:pPr>
-      <w:r>
-        <w:rPr>
-          <w:rFonts w:ascii="Arial" w:cs="Arial" w:eastAsia="Arial" w:hAnsi="Arial"/>
-          <w:b/>
-          <w:bCs/>
-          <w:color w:val="1B2118"/>
-          <w:sz w:val="21"/>
-          <w:szCs w:val="21"/>
-        </w:rPr>
-        <w:t xml:space="preserve">Dettaglio per utenza</w:t>
-      </w:r>
-      <w:r>
-        <w:rPr>
-          <w:rFonts w:ascii="Arial" w:cs="Arial" w:eastAsia="Arial" w:hAnsi="Arial"/>
-          <w:color w:val="1B2118"/>
-          <w:sz w:val="21"/>
-          <w:szCs w:val="21"/>
-        </w:rPr>
-        <w:t xml:space="preserve">: utenza, macrocategoria, classe, EA, EP e ΔI.</w:t>
-      </w:r>
-    </w:p>
-    <w:p>
-      <w:pPr>
-        <w:spacing w:after="140" w:line="300"/>
-      </w:pPr>
-      <w:r>
-        <w:rPr>
-          <w:rFonts w:ascii="Arial" w:cs="Arial" w:eastAsia="Arial" w:hAnsi="Arial"/>
-          <w:color w:val="1B2118"/>
-          <w:sz w:val="21"/>
-          <w:szCs w:val="21"/>
-        </w:rPr>
-        <w:t xml:space="preserve">Il riquadro </w:t>
-      </w:r>
-      <w:r>
-        <w:rPr>
-          <w:rFonts w:ascii="Arial" w:cs="Arial" w:eastAsia="Arial" w:hAnsi="Arial"/>
-          <w:b/>
-          <w:bCs/>
-          <w:color w:val="1B2118"/>
-          <w:sz w:val="21"/>
-          <w:szCs w:val="21"/>
-        </w:rPr>
-        <w:t xml:space="preserve">Da verificare</w:t>
-      </w:r>
-      <w:r>
-        <w:rPr>
-          <w:rFonts w:ascii="Arial" w:cs="Arial" w:eastAsia="Arial" w:hAnsi="Arial"/>
-          <w:color w:val="1B2118"/>
-          <w:sz w:val="21"/>
-          <w:szCs w:val="21"/>
-        </w:rPr>
-        <w:t xml:space="preserve"> elenca i dati mancanti o incoerenti (ad esempio un rifiuto senza fattore di emissione o una classe senza utenze). Va letto sempre prima di confermare.</w:t>
-      </w:r>
-    </w:p>
-    <w:p>
-      <w:pPr>
-        <w:spacing w:after="140" w:line="300"/>
-      </w:pPr>
-      <w:r>
-        <w:rPr>
-          <w:rFonts w:ascii="Arial" w:cs="Arial" w:eastAsia="Arial" w:hAnsi="Arial"/>
-          <w:b/>
-          <w:bCs/>
-          <w:color w:val="1B2118"/>
-          <w:sz w:val="21"/>
-          <w:szCs w:val="21"/>
-        </w:rPr>
-        <w:t xml:space="preserve">Scarica il riepilogo (CSV)</w:t>
-      </w:r>
-      <w:r>
-        <w:rPr>
-          <w:rFonts w:ascii="Arial" w:cs="Arial" w:eastAsia="Arial" w:hAnsi="Arial"/>
-          <w:color w:val="1B2118"/>
-          <w:sz w:val="21"/>
-          <w:szCs w:val="21"/>
-        </w:rPr>
-        <w:t xml:space="preserve"> e </w:t>
-      </w:r>
-      <w:r>
-        <w:rPr>
-          <w:rFonts w:ascii="Arial" w:cs="Arial" w:eastAsia="Arial" w:hAnsi="Arial"/>
-          <w:b/>
-          <w:bCs/>
-          <w:color w:val="1B2118"/>
-          <w:sz w:val="21"/>
-          <w:szCs w:val="21"/>
-        </w:rPr>
-        <w:t xml:space="preserve">Scarica il dettaglio per utenza (CSV)</w:t>
-      </w:r>
-      <w:r>
-        <w:rPr>
-          <w:rFonts w:ascii="Arial" w:cs="Arial" w:eastAsia="Arial" w:hAnsi="Arial"/>
-          <w:color w:val="1B2118"/>
-          <w:sz w:val="21"/>
-          <w:szCs w:val="21"/>
-        </w:rPr>
-        <w:t xml:space="preserve"> esportano i risultati in file che si aprono con Excel.</w:t>
-      </w:r>
-    </w:p>
-    <w:p>
-      <w:pPr>
-        <w:pStyle w:val="Heading2"/>
-        <w:keepNext/>
-        <w:spacing w:after="120" w:before="240"/>
-      </w:pPr>
-      <w:r>
-        <w:rPr>
-          <w:rFonts w:ascii="Arial" w:cs="Arial" w:eastAsia="Arial" w:hAnsi="Arial"/>
-          <w:b/>
-          <w:bCs/>
-          <w:color w:val="2F5D3A"/>
-          <w:sz w:val="25"/>
-          <w:szCs w:val="25"/>
-        </w:rPr>
-        <w:t xml:space="preserve">Confermare e correggere</w:t>
-      </w:r>
-    </w:p>
-    <w:p>
-      <w:pPr>
-        <w:spacing w:after="140" w:line="300"/>
-      </w:pPr>
-      <w:r>
-        <w:rPr>
-          <w:rFonts w:ascii="Arial" w:cs="Arial" w:eastAsia="Arial" w:hAnsi="Arial"/>
-          <w:b/>
-          <w:bCs/>
-          <w:color w:val="1B2118"/>
-          <w:sz w:val="21"/>
-          <w:szCs w:val="21"/>
-        </w:rPr>
-        <w:t xml:space="preserve">Prima di confermare.</w:t>
-      </w:r>
-      <w:r>
-        <w:rPr>
-          <w:rFonts w:ascii="Arial" w:cs="Arial" w:eastAsia="Arial" w:hAnsi="Arial"/>
-          <w:color w:val="1B2118"/>
-          <w:sz w:val="21"/>
-          <w:szCs w:val="21"/>
-        </w:rPr>
-        <w:t xml:space="preserve"> Controllate che: il riquadro </w:t>
-      </w:r>
-      <w:r>
-        <w:rPr>
-          <w:rFonts w:ascii="Arial" w:cs="Arial" w:eastAsia="Arial" w:hAnsi="Arial"/>
-          <w:i/>
-          <w:iCs/>
-          <w:color w:val="1B2118"/>
-          <w:sz w:val="21"/>
-          <w:szCs w:val="21"/>
-        </w:rPr>
-        <w:t xml:space="preserve">Da verificare</w:t>
-      </w:r>
-      <w:r>
-        <w:rPr>
-          <w:rFonts w:ascii="Arial" w:cs="Arial" w:eastAsia="Arial" w:hAnsi="Arial"/>
-          <w:color w:val="1B2118"/>
-          <w:sz w:val="21"/>
-          <w:szCs w:val="21"/>
-        </w:rPr>
-        <w:t xml:space="preserve"> sia vuoto o che ogni voce sia spiegata nelle note; le quantità del passo 2 coincidano con il Catasto ISPRA; la somma PEF del passo 3 faccia 100; il numero di utenze della Banca Dati sia coerente con la delibera; il buffer corrisponda a come il Comune misura davvero i conferimenti.</w:t>
-      </w:r>
-    </w:p>
-    <w:p>
-      <w:pPr>
-        <w:pStyle w:val="ListParagraph"/>
-        <w:numPr>
-          <w:ilvl w:val="0"/>
-          <w:numId w:val="21"/>
-        </w:numPr>
-        <w:spacing w:after="70" w:line="290"/>
-      </w:pPr>
-      <w:r>
-        <w:rPr>
-          <w:rFonts w:ascii="Arial" w:cs="Arial" w:eastAsia="Arial" w:hAnsi="Arial"/>
-          <w:color w:val="1B2118"/>
-          <w:sz w:val="21"/>
-          <w:szCs w:val="21"/>
-        </w:rPr>
-        <w:t xml:space="preserve">Salvate e premete </w:t>
-      </w:r>
-      <w:r>
-        <w:rPr>
-          <w:rFonts w:ascii="Arial" w:cs="Arial" w:eastAsia="Arial" w:hAnsi="Arial"/>
-          <w:b/>
-          <w:bCs/>
-          <w:color w:val="1B2118"/>
-          <w:sz w:val="21"/>
-          <w:szCs w:val="21"/>
-        </w:rPr>
-        <w:t xml:space="preserve">Calcola</w:t>
-      </w:r>
-      <w:r>
-        <w:rPr>
-          <w:rFonts w:ascii="Arial" w:cs="Arial" w:eastAsia="Arial" w:hAnsi="Arial"/>
-          <w:color w:val="1B2118"/>
-          <w:sz w:val="21"/>
-          <w:szCs w:val="21"/>
-        </w:rPr>
-        <w:t xml:space="preserve">.</w:t>
-      </w:r>
-    </w:p>
-    <w:p>
-      <w:pPr>
-        <w:pStyle w:val="ListParagraph"/>
-        <w:numPr>
-          <w:ilvl w:val="0"/>
-          <w:numId w:val="21"/>
-        </w:numPr>
-        <w:spacing w:after="70" w:line="290"/>
-      </w:pPr>
-      <w:r>
-        <w:rPr>
-          <w:rFonts w:ascii="Arial" w:cs="Arial" w:eastAsia="Arial" w:hAnsi="Arial"/>
-          <w:color w:val="1B2118"/>
-          <w:sz w:val="21"/>
-          <w:szCs w:val="21"/>
-        </w:rPr>
-        <w:t xml:space="preserve">Premete </w:t>
-      </w:r>
-      <w:r>
-        <w:rPr>
-          <w:rFonts w:ascii="Arial" w:cs="Arial" w:eastAsia="Arial" w:hAnsi="Arial"/>
-          <w:b/>
-          <w:bCs/>
-          <w:color w:val="1B2118"/>
-          <w:sz w:val="21"/>
-          <w:szCs w:val="21"/>
-        </w:rPr>
-        <w:t xml:space="preserve">Conferma calcolo</w:t>
-      </w:r>
-      <w:r>
-        <w:rPr>
-          <w:rFonts w:ascii="Arial" w:cs="Arial" w:eastAsia="Arial" w:hAnsi="Arial"/>
-          <w:color w:val="1B2118"/>
-          <w:sz w:val="21"/>
-          <w:szCs w:val="21"/>
-        </w:rPr>
-        <w:t xml:space="preserve">: compare il riquadro «Confermare il calcolo?» con i crediti netti.</w:t>
-      </w:r>
-    </w:p>
-    <w:p>
-      <w:pPr>
-        <w:pStyle w:val="ListParagraph"/>
-        <w:numPr>
-          <w:ilvl w:val="0"/>
-          <w:numId w:val="21"/>
         </w:numPr>
         <w:spacing w:after="70" w:line="290"/>
       </w:pPr>
@@ -20383,12 +20364,6 @@
     </w:lvlOverride>
   </w:num>
   <w:num w:numId="20">
-    <w:abstractNumId w:val="3"/>
-    <w:lvlOverride w:ilvl="0">
-      <w:startOverride w:val="1"/>
-    </w:lvlOverride>
-  </w:num>
-  <w:num w:numId="21">
     <w:abstractNumId w:val="3"/>
     <w:lvlOverride w:ilvl="0">
       <w:startOverride w:val="1"/>

</xml_diff>

<commit_message>
Registro 1.7, Manuale Utente 1.8, Amministratore 1.3, Test 1.3: rapporto PDF e registro dei crediti
Co-Authored-By: Claude Opus 5.5 <noreply@anthropic.com>
Claude-Session: https://claude.ai/code/session_01E8XCbEeVHWVP3hntUZ6kZ1
</commit_message>
<xml_diff>
--- a/public/documentazione/Manuale_Amministratore_Portale_CWP.docx
+++ b/public/documentazione/Manuale_Amministratore_Portale_CWP.docx
@@ -302,7 +302,7 @@
                 <w:sz w:val="20"/>
                 <w:szCs w:val="20"/>
               </w:rPr>
-              <w:t xml:space="preserve">Rev. 1.2</w:t>
+              <w:t xml:space="preserve">Rev. 1.3</w:t>
             </w:r>
           </w:p>
         </w:tc>
@@ -719,7 +719,7 @@
                 <w:sz w:val="18"/>
                 <w:szCs w:val="18"/>
               </w:rPr>
-              <w:t xml:space="preserve">1.2</w:t>
+              <w:t xml:space="preserve">1.3</w:t>
             </w:r>
           </w:p>
         </w:tc>
@@ -783,7 +783,7 @@
                 <w:sz w:val="18"/>
                 <w:szCs w:val="18"/>
               </w:rPr>
-              <w:t xml:space="preserve">Calcolo crediti: importare il tracciato nel calcolo (dai documenti della pratica o dal computer), singole letture, blocco dei dati personali, controlli di coerenza.</w:t>
+              <w:t xml:space="preserve">Rapporto di calcolo in PDF, archiviazione nella pratica, numero di registro, registro dei crediti.</w:t>
             </w:r>
           </w:p>
         </w:tc>
@@ -853,7 +853,7 @@
                 <w:sz w:val="18"/>
                 <w:szCs w:val="18"/>
               </w:rPr>
-              <w:t xml:space="preserve">1.1</w:t>
+              <w:t xml:space="preserve">1.2</w:t>
             </w:r>
           </w:p>
         </w:tc>
@@ -919,7 +919,7 @@
                 <w:sz w:val="18"/>
                 <w:szCs w:val="18"/>
               </w:rPr>
-              <w:t xml:space="preserve">Note di fase, Ente di Validazione della pratica, consultazione sulla pagina pubblica con conferma dell'email, moderazione con autori e allegati, errata corrige; nuovo capitolo Messaggi con il Comune; pagamenti visibili al Comune; Impostazioni: Enti di Validazione e Modelli di documento; notifiche aggiornate.</w:t>
+              <w:t xml:space="preserve">Calcolo crediti: importare il tracciato nel calcolo (dai documenti della pratica o dal computer), singole letture, blocco dei dati personali, controlli di coerenza.</w:t>
             </w:r>
           </w:p>
         </w:tc>
@@ -989,6 +989,140 @@
                 <w:sz w:val="18"/>
                 <w:szCs w:val="18"/>
               </w:rPr>
+              <w:t xml:space="preserve">1.1</w:t>
+            </w:r>
+          </w:p>
+        </w:tc>
+        <w:tc>
+          <w:tcPr>
+            <w:tcW w:type="dxa" w:w="1300"/>
+            <w:tcBorders>
+              <w:top w:val="single" w:color="D9D4C5" w:sz="4"/>
+              <w:left w:val="single" w:color="D9D4C5" w:sz="4"/>
+              <w:bottom w:val="single" w:color="D9D4C5" w:sz="4"/>
+              <w:right w:val="single" w:color="D9D4C5" w:sz="4"/>
+            </w:tcBorders>
+            <w:tcMar>
+              <w:top w:type="dxa" w:w="70"/>
+              <w:left w:type="dxa" w:w="110"/>
+              <w:bottom w:type="dxa" w:w="70"/>
+              <w:right w:type="dxa" w:w="110"/>
+            </w:tcMar>
+            <w:vAlign w:val="center"/>
+          </w:tcPr>
+          <w:p>
+            <w:pPr>
+              <w:spacing w:after="0" w:before="0"/>
+            </w:pPr>
+            <w:r>
+              <w:rPr>
+                <w:rFonts w:ascii="Arial" w:cs="Arial" w:eastAsia="Arial" w:hAnsi="Arial"/>
+                <w:color w:val="1B2118"/>
+                <w:sz w:val="18"/>
+                <w:szCs w:val="18"/>
+              </w:rPr>
+              <w:t xml:space="preserve">18/10/2026</w:t>
+            </w:r>
+          </w:p>
+        </w:tc>
+        <w:tc>
+          <w:tcPr>
+            <w:tcW w:type="dxa" w:w="5538"/>
+            <w:tcBorders>
+              <w:top w:val="single" w:color="D9D4C5" w:sz="4"/>
+              <w:left w:val="single" w:color="D9D4C5" w:sz="4"/>
+              <w:bottom w:val="single" w:color="D9D4C5" w:sz="4"/>
+              <w:right w:val="single" w:color="D9D4C5" w:sz="4"/>
+            </w:tcBorders>
+            <w:tcMar>
+              <w:top w:type="dxa" w:w="70"/>
+              <w:left w:type="dxa" w:w="110"/>
+              <w:bottom w:type="dxa" w:w="70"/>
+              <w:right w:type="dxa" w:w="110"/>
+            </w:tcMar>
+            <w:vAlign w:val="center"/>
+          </w:tcPr>
+          <w:p>
+            <w:pPr>
+              <w:spacing w:after="0" w:before="0"/>
+            </w:pPr>
+            <w:r>
+              <w:rPr>
+                <w:rFonts w:ascii="Arial" w:cs="Arial" w:eastAsia="Arial" w:hAnsi="Arial"/>
+                <w:color w:val="1B2118"/>
+                <w:sz w:val="18"/>
+                <w:szCs w:val="18"/>
+              </w:rPr>
+              <w:t xml:space="preserve">Note di fase, Ente di Validazione della pratica, consultazione sulla pagina pubblica con conferma dell'email, moderazione con autori e allegati, errata corrige; nuovo capitolo Messaggi con il Comune; pagamenti visibili al Comune; Impostazioni: Enti di Validazione e Modelli di documento; notifiche aggiornate.</w:t>
+            </w:r>
+          </w:p>
+        </w:tc>
+        <w:tc>
+          <w:tcPr>
+            <w:tcW w:type="dxa" w:w="2000"/>
+            <w:tcBorders>
+              <w:top w:val="single" w:color="D9D4C5" w:sz="4"/>
+              <w:left w:val="single" w:color="D9D4C5" w:sz="4"/>
+              <w:bottom w:val="single" w:color="D9D4C5" w:sz="4"/>
+              <w:right w:val="single" w:color="D9D4C5" w:sz="4"/>
+            </w:tcBorders>
+            <w:tcMar>
+              <w:top w:type="dxa" w:w="70"/>
+              <w:left w:type="dxa" w:w="110"/>
+              <w:bottom w:type="dxa" w:w="70"/>
+              <w:right w:type="dxa" w:w="110"/>
+            </w:tcMar>
+            <w:vAlign w:val="center"/>
+          </w:tcPr>
+          <w:p>
+            <w:pPr>
+              <w:spacing w:after="0" w:before="0"/>
+            </w:pPr>
+            <w:r>
+              <w:rPr>
+                <w:rFonts w:ascii="Arial" w:cs="Arial" w:eastAsia="Arial" w:hAnsi="Arial"/>
+                <w:color w:val="1B2118"/>
+                <w:sz w:val="18"/>
+                <w:szCs w:val="18"/>
+              </w:rPr>
+              <w:t xml:space="preserve">Fondazione Operate</w:t>
+            </w:r>
+          </w:p>
+        </w:tc>
+      </w:tr>
+      <w:tr>
+        <w:trPr>
+          <w:cantSplit/>
+        </w:trPr>
+        <w:tc>
+          <w:tcPr>
+            <w:tcW w:type="dxa" w:w="800"/>
+            <w:tcBorders>
+              <w:top w:val="single" w:color="D9D4C5" w:sz="4"/>
+              <w:left w:val="single" w:color="D9D4C5" w:sz="4"/>
+              <w:bottom w:val="single" w:color="D9D4C5" w:sz="4"/>
+              <w:right w:val="single" w:color="D9D4C5" w:sz="4"/>
+            </w:tcBorders>
+            <w:shd w:fill="F6F4EE" w:color="auto" w:val="clear"/>
+            <w:tcMar>
+              <w:top w:type="dxa" w:w="70"/>
+              <w:left w:type="dxa" w:w="110"/>
+              <w:bottom w:type="dxa" w:w="70"/>
+              <w:right w:type="dxa" w:w="110"/>
+            </w:tcMar>
+            <w:vAlign w:val="center"/>
+          </w:tcPr>
+          <w:p>
+            <w:pPr>
+              <w:spacing w:after="0" w:before="0"/>
+            </w:pPr>
+            <w:r>
+              <w:rPr>
+                <w:rFonts w:ascii="Arial" w:cs="Arial" w:eastAsia="Arial" w:hAnsi="Arial"/>
+                <w:color w:val="1B2118"/>
+                <w:sz w:val="18"/>
+                <w:szCs w:val="18"/>
+              </w:rPr>
               <w:t xml:space="preserve">1.0</w:t>
             </w:r>
           </w:p>
@@ -1002,6 +1136,7 @@
               <w:bottom w:val="single" w:color="D9D4C5" w:sz="4"/>
               <w:right w:val="single" w:color="D9D4C5" w:sz="4"/>
             </w:tcBorders>
+            <w:shd w:fill="F6F4EE" w:color="auto" w:val="clear"/>
             <w:tcMar>
               <w:top w:type="dxa" w:w="70"/>
               <w:left w:type="dxa" w:w="110"/>
@@ -1034,6 +1169,7 @@
               <w:bottom w:val="single" w:color="D9D4C5" w:sz="4"/>
               <w:right w:val="single" w:color="D9D4C5" w:sz="4"/>
             </w:tcBorders>
+            <w:shd w:fill="F6F4EE" w:color="auto" w:val="clear"/>
             <w:tcMar>
               <w:top w:type="dxa" w:w="70"/>
               <w:left w:type="dxa" w:w="110"/>
@@ -1066,6 +1202,7 @@
               <w:bottom w:val="single" w:color="D9D4C5" w:sz="4"/>
               <w:right w:val="single" w:color="D9D4C5" w:sz="4"/>
             </w:tcBorders>
+            <w:shd w:fill="F6F4EE" w:color="auto" w:val="clear"/>
             <w:tcMar>
               <w:top w:type="dxa" w:w="70"/>
               <w:left w:type="dxa" w:w="110"/>
@@ -1107,7 +1244,7 @@
           <w:sz w:val="20"/>
           <w:szCs w:val="20"/>
         </w:rPr>
-        <w:t xml:space="preserve">Questo documento descrive il portale alla revisione 1.2 del 18/10/2026. A ogni modifica del portale il manuale viene aggiornato e la revisione incrementata; la versione corrente si scarica dall'area Documentazione del portale (solo Amministratori).</w:t>
+        <w:t xml:space="preserve">Questo documento descrive il portale alla revisione 1.3 del 18/10/2026. A ogni modifica del portale il manuale viene aggiornato e la revisione incrementata; la versione corrente si scarica dall'area Documentazione del portale (solo Amministratori).</w:t>
       </w:r>
     </w:p>
     <w:p>
@@ -3008,7 +3145,7 @@
         </w:rPr>
         <w:t xml:space="preserve">Si accede da </w:t>
       </w:r>
-      <w:hyperlink w:history="1" r:id="rIdik75e8td5h5rzeol2kvae">
+      <w:hyperlink w:history="1" r:id="rIdr1ccahdp7cr5i5e2glhmg">
         <w:r>
           <w:rPr>
             <w:rFonts w:ascii="Arial" w:cs="Arial" w:eastAsia="Arial" w:hAnsi="Arial"/>
@@ -17071,6 +17208,51 @@
           <w:sz w:val="21"/>
           <w:szCs w:val="21"/>
         </w:rPr>
+        <w:t xml:space="preserve">Scarica il rapporto (PDF)</w:t>
+      </w:r>
+      <w:r>
+        <w:rPr>
+          <w:rFonts w:ascii="Arial" w:cs="Arial" w:eastAsia="Arial" w:hAnsi="Arial"/>
+          <w:color w:val="1B2118"/>
+          <w:sz w:val="21"/>
+          <w:szCs w:val="21"/>
+        </w:rPr>
+        <w:t xml:space="preserve"> crea il </w:t>
+      </w:r>
+      <w:r>
+        <w:rPr>
+          <w:rFonts w:ascii="Arial" w:cs="Arial" w:eastAsia="Arial" w:hAnsi="Arial"/>
+          <w:b/>
+          <w:bCs/>
+          <w:color w:val="1B2118"/>
+          <w:sz w:val="21"/>
+          <w:szCs w:val="21"/>
+        </w:rPr>
+        <w:t xml:space="preserve">rapporto di calcolo</w:t>
+      </w:r>
+      <w:r>
+        <w:rPr>
+          <w:rFonts w:ascii="Arial" w:cs="Arial" w:eastAsia="Arial" w:hAnsi="Arial"/>
+          <w:color w:val="1B2118"/>
+          <w:sz w:val="21"/>
+          <w:szCs w:val="21"/>
+        </w:rPr>
+        <w:t xml:space="preserve">: scheda (pratica, ente, anno, tipo di stima, stato, numero di registro, file di origine dei dati e impronta SHA-256 dei dati), sintesi dei crediti, buffer voce per voce, dati di ingresso (rifiuti, delibera, fattori di emissione usati), risultati per tipologia e per classe, avvisi e controlli di coerenza, scelte interpretative applicate. Il rapporto di una bozza porta la scritta «BOZZA» su ogni pagina. Il dettaglio per singola utenza non è nel rapporto, per riservatezza: resta nel CSV.</w:t>
+      </w:r>
+    </w:p>
+    <w:p>
+      <w:pPr>
+        <w:spacing w:after="140" w:line="300"/>
+      </w:pPr>
+      <w:r>
+        <w:rPr>
+          <w:rFonts w:ascii="Arial" w:cs="Arial" w:eastAsia="Arial" w:hAnsi="Arial"/>
+          <w:b/>
+          <w:bCs/>
+          <w:color w:val="1B2118"/>
+          <w:sz w:val="21"/>
+          <w:szCs w:val="21"/>
+        </w:rPr>
         <w:t xml:space="preserve">Scarica il riepilogo (CSV)</w:t>
       </w:r>
       <w:r>
@@ -17355,6 +17537,154 @@
           <w:sz w:val="21"/>
           <w:szCs w:val="21"/>
         </w:rPr>
+        <w:t xml:space="preserve">Numero di registro.</w:t>
+      </w:r>
+      <w:r>
+        <w:rPr>
+          <w:rFonts w:ascii="Arial" w:cs="Arial" w:eastAsia="Arial" w:hAnsi="Arial"/>
+          <w:color w:val="1B2118"/>
+          <w:sz w:val="21"/>
+          <w:szCs w:val="21"/>
+        </w:rPr>
+        <w:t xml:space="preserve"> Alla conferma, un calcolo </w:t>
+      </w:r>
+      <w:r>
+        <w:rPr>
+          <w:rFonts w:ascii="Arial" w:cs="Arial" w:eastAsia="Arial" w:hAnsi="Arial"/>
+          <w:b/>
+          <w:bCs/>
+          <w:color w:val="1B2118"/>
+          <w:sz w:val="21"/>
+          <w:szCs w:val="21"/>
+        </w:rPr>
+        <w:t xml:space="preserve">ex post</w:t>
+      </w:r>
+      <w:r>
+        <w:rPr>
+          <w:rFonts w:ascii="Arial" w:cs="Arial" w:eastAsia="Arial" w:hAnsi="Arial"/>
+          <w:color w:val="1B2118"/>
+          <w:sz w:val="21"/>
+          <w:szCs w:val="21"/>
+        </w:rPr>
+        <w:t xml:space="preserve"> riceve dal portale un numero di registro progressivo, ad esempio </w:t>
+      </w:r>
+      <w:r>
+        <w:rPr>
+          <w:rFonts w:ascii="Consolas" w:cs="Consolas" w:eastAsia="Consolas" w:hAnsi="Consolas"/>
+          <w:color w:val="2F5D3A"/>
+          <w:sz w:val="21"/>
+          <w:szCs w:val="21"/>
+        </w:rPr>
+        <w:t xml:space="preserve">CWP-REG-2026-0001</w:t>
+      </w:r>
+      <w:r>
+        <w:rPr>
+          <w:rFonts w:ascii="Arial" w:cs="Arial" w:eastAsia="Arial" w:hAnsi="Arial"/>
+          <w:color w:val="1B2118"/>
+          <w:sz w:val="21"/>
+          <w:szCs w:val="21"/>
+        </w:rPr>
+        <w:t xml:space="preserve">, che compare accanto a «Confermato il», nell'elenco dei calcoli e nel rapporto. Le stime ex ante non hanno numero.</w:t>
+      </w:r>
+    </w:p>
+    <w:p>
+      <w:pPr>
+        <w:spacing w:after="140" w:line="300"/>
+      </w:pPr>
+      <w:r>
+        <w:rPr>
+          <w:rFonts w:ascii="Arial" w:cs="Arial" w:eastAsia="Arial" w:hAnsi="Arial"/>
+          <w:b/>
+          <w:bCs/>
+          <w:color w:val="1B2118"/>
+          <w:sz w:val="21"/>
+          <w:szCs w:val="21"/>
+        </w:rPr>
+        <w:t xml:space="preserve">Archiviare il rapporto.</w:t>
+      </w:r>
+      <w:r>
+        <w:rPr>
+          <w:rFonts w:ascii="Arial" w:cs="Arial" w:eastAsia="Arial" w:hAnsi="Arial"/>
+          <w:color w:val="1B2118"/>
+          <w:sz w:val="21"/>
+          <w:szCs w:val="21"/>
+        </w:rPr>
+        <w:t xml:space="preserve"> Su un calcolo confermato, </w:t>
+      </w:r>
+      <w:r>
+        <w:rPr>
+          <w:rFonts w:ascii="Arial" w:cs="Arial" w:eastAsia="Arial" w:hAnsi="Arial"/>
+          <w:b/>
+          <w:bCs/>
+          <w:color w:val="1B2118"/>
+          <w:sz w:val="21"/>
+          <w:szCs w:val="21"/>
+        </w:rPr>
+        <w:t xml:space="preserve">Archivia il rapporto nella pratica</w:t>
+      </w:r>
+      <w:r>
+        <w:rPr>
+          <w:rFonts w:ascii="Arial" w:cs="Arial" w:eastAsia="Arial" w:hAnsi="Arial"/>
+          <w:color w:val="1B2118"/>
+          <w:sz w:val="21"/>
+          <w:szCs w:val="21"/>
+        </w:rPr>
+        <w:t xml:space="preserve"> salva il PDF tra i documenti generali della pratica, con tipologia </w:t>
+      </w:r>
+      <w:r>
+        <w:rPr>
+          <w:rFonts w:ascii="Arial" w:cs="Arial" w:eastAsia="Arial" w:hAnsi="Arial"/>
+          <w:i/>
+          <w:iCs/>
+          <w:color w:val="1B2118"/>
+          <w:sz w:val="21"/>
+          <w:szCs w:val="21"/>
+        </w:rPr>
+        <w:t xml:space="preserve">Rapporto di calcolo dei crediti</w:t>
+      </w:r>
+      <w:r>
+        <w:rPr>
+          <w:rFonts w:ascii="Arial" w:cs="Arial" w:eastAsia="Arial" w:hAnsi="Arial"/>
+          <w:color w:val="1B2118"/>
+          <w:sz w:val="21"/>
+          <w:szCs w:val="21"/>
+        </w:rPr>
+        <w:t xml:space="preserve"> e </w:t>
+      </w:r>
+      <w:r>
+        <w:rPr>
+          <w:rFonts w:ascii="Arial" w:cs="Arial" w:eastAsia="Arial" w:hAnsi="Arial"/>
+          <w:b/>
+          <w:bCs/>
+          <w:color w:val="1B2118"/>
+          <w:sz w:val="21"/>
+          <w:szCs w:val="21"/>
+        </w:rPr>
+        <w:t xml:space="preserve">non visibile al Comune</w:t>
+      </w:r>
+      <w:r>
+        <w:rPr>
+          <w:rFonts w:ascii="Arial" w:cs="Arial" w:eastAsia="Arial" w:hAnsi="Arial"/>
+          <w:color w:val="1B2118"/>
+          <w:sz w:val="21"/>
+          <w:szCs w:val="21"/>
+        </w:rPr>
+        <w:t xml:space="preserve">: per mostrarlo al Comune spuntate «Cliente» sul documento nella pratica. Archiviandolo di nuovo nasce una nuova versione.</w:t>
+      </w:r>
+    </w:p>
+    <w:p>
+      <w:pPr>
+        <w:spacing w:after="140" w:line="300"/>
+      </w:pPr>
+      <w:r>
+        <w:rPr>
+          <w:rFonts w:ascii="Arial" w:cs="Arial" w:eastAsia="Arial" w:hAnsi="Arial"/>
+          <w:b/>
+          <w:bCs/>
+          <w:color w:val="1B2118"/>
+          <w:sz w:val="21"/>
+          <w:szCs w:val="21"/>
+        </w:rPr>
         <w:t xml:space="preserve">Correggere un calcolo confermato.</w:t>
       </w:r>
       <w:r>
@@ -17419,6 +17749,257 @@
           <w:szCs w:val="21"/>
         </w:rPr>
         <w:t xml:space="preserve">Creazione, ricalcolo e conferma sono registrati nell'audit.</w:t>
+      </w:r>
+    </w:p>
+    <w:p>
+      <w:pPr>
+        <w:pStyle w:val="Heading2"/>
+        <w:keepNext/>
+        <w:spacing w:after="120" w:before="240"/>
+      </w:pPr>
+      <w:r>
+        <w:rPr>
+          <w:rFonts w:ascii="Arial" w:cs="Arial" w:eastAsia="Arial" w:hAnsi="Arial"/>
+          <w:b/>
+          <w:bCs/>
+          <w:color w:val="2F5D3A"/>
+          <w:sz w:val="25"/>
+          <w:szCs w:val="25"/>
+        </w:rPr>
+        <w:t xml:space="preserve">Registro dei crediti</w:t>
+      </w:r>
+    </w:p>
+    <w:p>
+      <w:pPr>
+        <w:spacing w:after="140" w:line="300"/>
+      </w:pPr>
+      <w:r>
+        <w:rPr>
+          <w:rFonts w:ascii="Arial" w:cs="Arial" w:eastAsia="Arial" w:hAnsi="Arial"/>
+          <w:color w:val="1B2118"/>
+          <w:sz w:val="21"/>
+          <w:szCs w:val="21"/>
+        </w:rPr>
+        <w:t xml:space="preserve">Nella pagina </w:t>
+      </w:r>
+      <w:r>
+        <w:rPr>
+          <w:rFonts w:ascii="Arial" w:cs="Arial" w:eastAsia="Arial" w:hAnsi="Arial"/>
+          <w:b/>
+          <w:bCs/>
+          <w:color w:val="1B2118"/>
+          <w:sz w:val="21"/>
+          <w:szCs w:val="21"/>
+        </w:rPr>
+        <w:t xml:space="preserve">Crediti CWP</w:t>
+      </w:r>
+      <w:r>
+        <w:rPr>
+          <w:rFonts w:ascii="Arial" w:cs="Arial" w:eastAsia="Arial" w:hAnsi="Arial"/>
+          <w:color w:val="1B2118"/>
+          <w:sz w:val="21"/>
+          <w:szCs w:val="21"/>
+        </w:rPr>
+        <w:t xml:space="preserve"> la vista </w:t>
+      </w:r>
+      <w:r>
+        <w:rPr>
+          <w:rFonts w:ascii="Arial" w:cs="Arial" w:eastAsia="Arial" w:hAnsi="Arial"/>
+          <w:b/>
+          <w:bCs/>
+          <w:color w:val="1B2118"/>
+          <w:sz w:val="21"/>
+          <w:szCs w:val="21"/>
+        </w:rPr>
+        <w:t xml:space="preserve">Registro dei crediti</w:t>
+      </w:r>
+      <w:r>
+        <w:rPr>
+          <w:rFonts w:ascii="Arial" w:cs="Arial" w:eastAsia="Arial" w:hAnsi="Arial"/>
+          <w:color w:val="1B2118"/>
+          <w:sz w:val="21"/>
+          <w:szCs w:val="21"/>
+        </w:rPr>
+        <w:t xml:space="preserve"> elenca i calcoli ex post confermati, in ordine di numero di registro: pratica ed ente, anno, crediti lordi, buffer, crediti netti, data e autore della conferma, stato.</w:t>
+      </w:r>
+    </w:p>
+    <w:p>
+      <w:pPr>
+        <w:pStyle w:val="ListParagraph"/>
+        <w:numPr>
+          <w:ilvl w:val="0"/>
+          <w:numId w:val="2"/>
+        </w:numPr>
+        <w:spacing w:after="70" w:line="290"/>
+      </w:pPr>
+      <w:r>
+        <w:rPr>
+          <w:rFonts w:ascii="Arial" w:cs="Arial" w:eastAsia="Arial" w:hAnsi="Arial"/>
+          <w:b/>
+          <w:bCs/>
+          <w:color w:val="1B2118"/>
+          <w:sz w:val="21"/>
+          <w:szCs w:val="21"/>
+        </w:rPr>
+        <w:t xml:space="preserve">Valido</w:t>
+      </w:r>
+      <w:r>
+        <w:rPr>
+          <w:rFonts w:ascii="Arial" w:cs="Arial" w:eastAsia="Arial" w:hAnsi="Arial"/>
+          <w:color w:val="1B2118"/>
+          <w:sz w:val="21"/>
+          <w:szCs w:val="21"/>
+        </w:rPr>
+        <w:t xml:space="preserve">: i crediti della riga contano nei totali.</w:t>
+      </w:r>
+    </w:p>
+    <w:p>
+      <w:pPr>
+        <w:pStyle w:val="ListParagraph"/>
+        <w:numPr>
+          <w:ilvl w:val="0"/>
+          <w:numId w:val="2"/>
+        </w:numPr>
+        <w:spacing w:after="70" w:line="290"/>
+      </w:pPr>
+      <w:r>
+        <w:rPr>
+          <w:rFonts w:ascii="Arial" w:cs="Arial" w:eastAsia="Arial" w:hAnsi="Arial"/>
+          <w:b/>
+          <w:bCs/>
+          <w:color w:val="1B2118"/>
+          <w:sz w:val="21"/>
+          <w:szCs w:val="21"/>
+        </w:rPr>
+        <w:t xml:space="preserve">Sostituito da CWP-REG-…</w:t>
+      </w:r>
+      <w:r>
+        <w:rPr>
+          <w:rFonts w:ascii="Arial" w:cs="Arial" w:eastAsia="Arial" w:hAnsi="Arial"/>
+          <w:color w:val="1B2118"/>
+          <w:sz w:val="21"/>
+          <w:szCs w:val="21"/>
+        </w:rPr>
+        <w:t xml:space="preserve">: il calcolo è stato corretto con una nuova versione confermata; il numero resta nel registro e non si riusa, ma i crediti non contano.</w:t>
+      </w:r>
+    </w:p>
+    <w:p>
+      <w:pPr>
+        <w:spacing w:after="140" w:line="300"/>
+      </w:pPr>
+      <w:r>
+        <w:rPr>
+          <w:rFonts w:ascii="Arial" w:cs="Arial" w:eastAsia="Arial" w:hAnsi="Arial"/>
+          <w:color w:val="1B2118"/>
+          <w:sz w:val="21"/>
+          <w:szCs w:val="21"/>
+        </w:rPr>
+        <w:t xml:space="preserve">In alto compaiono il totale dei crediti netti validi e i totali per ente e anno. </w:t>
+      </w:r>
+      <w:r>
+        <w:rPr>
+          <w:rFonts w:ascii="Arial" w:cs="Arial" w:eastAsia="Arial" w:hAnsi="Arial"/>
+          <w:b/>
+          <w:bCs/>
+          <w:color w:val="1B2118"/>
+          <w:sz w:val="21"/>
+          <w:szCs w:val="21"/>
+        </w:rPr>
+        <w:t xml:space="preserve">Solo le righe valide</w:t>
+      </w:r>
+      <w:r>
+        <w:rPr>
+          <w:rFonts w:ascii="Arial" w:cs="Arial" w:eastAsia="Arial" w:hAnsi="Arial"/>
+          <w:color w:val="1B2118"/>
+          <w:sz w:val="21"/>
+          <w:szCs w:val="21"/>
+        </w:rPr>
+        <w:t xml:space="preserve"> nasconde le sostituite; </w:t>
+      </w:r>
+      <w:r>
+        <w:rPr>
+          <w:rFonts w:ascii="Arial" w:cs="Arial" w:eastAsia="Arial" w:hAnsi="Arial"/>
+          <w:b/>
+          <w:bCs/>
+          <w:color w:val="1B2118"/>
+          <w:sz w:val="21"/>
+          <w:szCs w:val="21"/>
+        </w:rPr>
+        <w:t xml:space="preserve">Scarica il registro (CSV)</w:t>
+      </w:r>
+      <w:r>
+        <w:rPr>
+          <w:rFonts w:ascii="Arial" w:cs="Arial" w:eastAsia="Arial" w:hAnsi="Arial"/>
+          <w:color w:val="1B2118"/>
+          <w:sz w:val="21"/>
+          <w:szCs w:val="21"/>
+        </w:rPr>
+        <w:t xml:space="preserve"> esporta tutto il registro. Fate clic su una riga per aprire il calcolo.</w:t>
+      </w:r>
+    </w:p>
+    <w:p>
+      <w:pPr>
+        <w:spacing w:after="140" w:line="300"/>
+      </w:pPr>
+      <w:r>
+        <w:rPr>
+          <w:rFonts w:ascii="Arial" w:cs="Arial" w:eastAsia="Arial" w:hAnsi="Arial"/>
+          <w:b/>
+          <w:bCs/>
+          <w:color w:val="1B2118"/>
+          <w:sz w:val="21"/>
+          <w:szCs w:val="21"/>
+        </w:rPr>
+        <w:t xml:space="preserve">Da completare.</w:t>
+      </w:r>
+      <w:r>
+        <w:rPr>
+          <w:rFonts w:ascii="Arial" w:cs="Arial" w:eastAsia="Arial" w:hAnsi="Arial"/>
+          <w:color w:val="1B2118"/>
+          <w:sz w:val="21"/>
+          <w:szCs w:val="21"/>
+        </w:rPr>
+        <w:t xml:space="preserve"> Le regole dello </w:t>
+      </w:r>
+      <w:r>
+        <w:rPr>
+          <w:rFonts w:ascii="Arial" w:cs="Arial" w:eastAsia="Arial" w:hAnsi="Arial"/>
+          <w:i/>
+          <w:iCs/>
+          <w:color w:val="1B2118"/>
+          <w:sz w:val="21"/>
+          <w:szCs w:val="21"/>
+        </w:rPr>
+        <w:t xml:space="preserve">Standard CWP</w:t>
+      </w:r>
+      <w:r>
+        <w:rPr>
+          <w:rFonts w:ascii="Arial" w:cs="Arial" w:eastAsia="Arial" w:hAnsi="Arial"/>
+          <w:color w:val="1B2118"/>
+          <w:sz w:val="21"/>
+          <w:szCs w:val="21"/>
+        </w:rPr>
+        <w:t xml:space="preserve"> e della </w:t>
+      </w:r>
+      <w:r>
+        <w:rPr>
+          <w:rFonts w:ascii="Arial" w:cs="Arial" w:eastAsia="Arial" w:hAnsi="Arial"/>
+          <w:i/>
+          <w:iCs/>
+          <w:color w:val="1B2118"/>
+          <w:sz w:val="21"/>
+          <w:szCs w:val="21"/>
+        </w:rPr>
+        <w:t xml:space="preserve">Guida al Programma</w:t>
+      </w:r>
+      <w:r>
+        <w:rPr>
+          <w:rFonts w:ascii="Arial" w:cs="Arial" w:eastAsia="Arial" w:hAnsi="Arial"/>
+          <w:color w:val="1B2118"/>
+          <w:sz w:val="21"/>
+          <w:szCs w:val="21"/>
+        </w:rPr>
+        <w:t xml:space="preserve"> per emissione, trasferimento e annullamento dei crediti verranno aggiunte al registro quando i documenti saranno disponibili.</w:t>
       </w:r>
     </w:p>
     <w:p>
@@ -19716,7 +20297,7 @@
           <w:sz w:val="21"/>
           <w:szCs w:val="21"/>
         </w:rPr>
-        <w:t xml:space="preserve"> rapporto di calcolo in PDF, registro dei crediti calcolati e confermati.</w:t>
+        <w:t xml:space="preserve"> regole del registro previste dallo Standard CWP (emissione, trasferimento, annullamento dei crediti).</w:t>
       </w:r>
     </w:p>
     <w:p>
@@ -20048,7 +20629,7 @@
         <w:szCs w:val="16"/>
       </w:rPr>
       <w:tab/>
-      <w:t xml:space="preserve">Manuale Amministratore · Rev. 1.2 · 18/10/2026</w:t>
+      <w:t xml:space="preserve">Manuale Amministratore · Rev. 1.3 · 18/10/2026</w:t>
     </w:r>
   </w:p>
 </w:hdr>
@@ -20113,7 +20694,7 @@
         <w:szCs w:val="16"/>
       </w:rPr>
       <w:tab/>
-      <w:t xml:space="preserve">Manuale Amministratore · Rev. 1.2 · 18/10/2026</w:t>
+      <w:t xml:space="preserve">Manuale Amministratore · Rev. 1.3 · 18/10/2026</w:t>
     </w:r>
   </w:p>
 </w:hdr>

</xml_diff>

<commit_message>
Documenti: Registro 1.9, Manuale Amministratore 1.4, Manuale Test 1.4 (script 20)
Co-Authored-By: Claude Opus 5.5 <noreply@anthropic.com>
Claude-Session: https://claude.ai/code/session_01E8XCbEeVHWVP3hntUZ6kZ1
</commit_message>
<xml_diff>
--- a/public/documentazione/Manuale_Amministratore_Portale_CWP.docx
+++ b/public/documentazione/Manuale_Amministratore_Portale_CWP.docx
@@ -302,7 +302,7 @@
                 <w:sz w:val="20"/>
                 <w:szCs w:val="20"/>
               </w:rPr>
-              <w:t xml:space="preserve">Rev. 1.3</w:t>
+              <w:t xml:space="preserve">Rev. 1.4</w:t>
             </w:r>
           </w:p>
         </w:tc>
@@ -719,7 +719,7 @@
                 <w:sz w:val="18"/>
                 <w:szCs w:val="18"/>
               </w:rPr>
-              <w:t xml:space="preserve">1.3</w:t>
+              <w:t xml:space="preserve">1.4</w:t>
             </w:r>
           </w:p>
         </w:tc>
@@ -783,7 +783,7 @@
                 <w:sz w:val="18"/>
                 <w:szCs w:val="18"/>
               </w:rPr>
-              <w:t xml:space="preserve">Rapporto di calcolo in PDF, archiviazione nella pratica, numero di registro, registro dei crediti.</w:t>
+              <w:t xml:space="preserve">Calcolo crediti: il risultato si azzera quando cambiano dati o Banca Dati Utenze, conferma solo dopo un nuovo «Calcola». Gestione utenti: password temporanea di almeno 10 caratteri con lettere e numeri, creazione annullata se non va a buon fine, nessun accesso ai dati prima del cambio password.</w:t>
             </w:r>
           </w:p>
         </w:tc>
@@ -853,7 +853,7 @@
                 <w:sz w:val="18"/>
                 <w:szCs w:val="18"/>
               </w:rPr>
-              <w:t xml:space="preserve">1.2</w:t>
+              <w:t xml:space="preserve">1.3</w:t>
             </w:r>
           </w:p>
         </w:tc>
@@ -919,7 +919,7 @@
                 <w:sz w:val="18"/>
                 <w:szCs w:val="18"/>
               </w:rPr>
-              <w:t xml:space="preserve">Calcolo crediti: importare il tracciato nel calcolo (dai documenti della pratica o dal computer), singole letture, blocco dei dati personali, controlli di coerenza.</w:t>
+              <w:t xml:space="preserve">Rapporto di calcolo in PDF, archiviazione nella pratica, numero di registro, registro dei crediti.</w:t>
             </w:r>
           </w:p>
         </w:tc>
@@ -989,7 +989,7 @@
                 <w:sz w:val="18"/>
                 <w:szCs w:val="18"/>
               </w:rPr>
-              <w:t xml:space="preserve">1.1</w:t>
+              <w:t xml:space="preserve">1.2</w:t>
             </w:r>
           </w:p>
         </w:tc>
@@ -1053,7 +1053,7 @@
                 <w:sz w:val="18"/>
                 <w:szCs w:val="18"/>
               </w:rPr>
-              <w:t xml:space="preserve">Note di fase, Ente di Validazione della pratica, consultazione sulla pagina pubblica con conferma dell'email, moderazione con autori e allegati, errata corrige; nuovo capitolo Messaggi con il Comune; pagamenti visibili al Comune; Impostazioni: Enti di Validazione e Modelli di documento; notifiche aggiornate.</w:t>
+              <w:t xml:space="preserve">Calcolo crediti: importare il tracciato nel calcolo (dai documenti della pratica o dal computer), singole letture, blocco dei dati personali, controlli di coerenza.</w:t>
             </w:r>
           </w:p>
         </w:tc>
@@ -1123,6 +1123,142 @@
                 <w:sz w:val="18"/>
                 <w:szCs w:val="18"/>
               </w:rPr>
+              <w:t xml:space="preserve">1.1</w:t>
+            </w:r>
+          </w:p>
+        </w:tc>
+        <w:tc>
+          <w:tcPr>
+            <w:tcW w:type="dxa" w:w="1300"/>
+            <w:tcBorders>
+              <w:top w:val="single" w:color="D9D4C5" w:sz="4"/>
+              <w:left w:val="single" w:color="D9D4C5" w:sz="4"/>
+              <w:bottom w:val="single" w:color="D9D4C5" w:sz="4"/>
+              <w:right w:val="single" w:color="D9D4C5" w:sz="4"/>
+            </w:tcBorders>
+            <w:shd w:fill="F6F4EE" w:color="auto" w:val="clear"/>
+            <w:tcMar>
+              <w:top w:type="dxa" w:w="70"/>
+              <w:left w:type="dxa" w:w="110"/>
+              <w:bottom w:type="dxa" w:w="70"/>
+              <w:right w:type="dxa" w:w="110"/>
+            </w:tcMar>
+            <w:vAlign w:val="center"/>
+          </w:tcPr>
+          <w:p>
+            <w:pPr>
+              <w:spacing w:after="0" w:before="0"/>
+            </w:pPr>
+            <w:r>
+              <w:rPr>
+                <w:rFonts w:ascii="Arial" w:cs="Arial" w:eastAsia="Arial" w:hAnsi="Arial"/>
+                <w:color w:val="1B2118"/>
+                <w:sz w:val="18"/>
+                <w:szCs w:val="18"/>
+              </w:rPr>
+              <w:t xml:space="preserve">18/10/2026</w:t>
+            </w:r>
+          </w:p>
+        </w:tc>
+        <w:tc>
+          <w:tcPr>
+            <w:tcW w:type="dxa" w:w="5538"/>
+            <w:tcBorders>
+              <w:top w:val="single" w:color="D9D4C5" w:sz="4"/>
+              <w:left w:val="single" w:color="D9D4C5" w:sz="4"/>
+              <w:bottom w:val="single" w:color="D9D4C5" w:sz="4"/>
+              <w:right w:val="single" w:color="D9D4C5" w:sz="4"/>
+            </w:tcBorders>
+            <w:shd w:fill="F6F4EE" w:color="auto" w:val="clear"/>
+            <w:tcMar>
+              <w:top w:type="dxa" w:w="70"/>
+              <w:left w:type="dxa" w:w="110"/>
+              <w:bottom w:type="dxa" w:w="70"/>
+              <w:right w:type="dxa" w:w="110"/>
+            </w:tcMar>
+            <w:vAlign w:val="center"/>
+          </w:tcPr>
+          <w:p>
+            <w:pPr>
+              <w:spacing w:after="0" w:before="0"/>
+            </w:pPr>
+            <w:r>
+              <w:rPr>
+                <w:rFonts w:ascii="Arial" w:cs="Arial" w:eastAsia="Arial" w:hAnsi="Arial"/>
+                <w:color w:val="1B2118"/>
+                <w:sz w:val="18"/>
+                <w:szCs w:val="18"/>
+              </w:rPr>
+              <w:t xml:space="preserve">Note di fase, Ente di Validazione della pratica, consultazione sulla pagina pubblica con conferma dell'email, moderazione con autori e allegati, errata corrige; nuovo capitolo Messaggi con il Comune; pagamenti visibili al Comune; Impostazioni: Enti di Validazione e Modelli di documento; notifiche aggiornate.</w:t>
+            </w:r>
+          </w:p>
+        </w:tc>
+        <w:tc>
+          <w:tcPr>
+            <w:tcW w:type="dxa" w:w="2000"/>
+            <w:tcBorders>
+              <w:top w:val="single" w:color="D9D4C5" w:sz="4"/>
+              <w:left w:val="single" w:color="D9D4C5" w:sz="4"/>
+              <w:bottom w:val="single" w:color="D9D4C5" w:sz="4"/>
+              <w:right w:val="single" w:color="D9D4C5" w:sz="4"/>
+            </w:tcBorders>
+            <w:shd w:fill="F6F4EE" w:color="auto" w:val="clear"/>
+            <w:tcMar>
+              <w:top w:type="dxa" w:w="70"/>
+              <w:left w:type="dxa" w:w="110"/>
+              <w:bottom w:type="dxa" w:w="70"/>
+              <w:right w:type="dxa" w:w="110"/>
+            </w:tcMar>
+            <w:vAlign w:val="center"/>
+          </w:tcPr>
+          <w:p>
+            <w:pPr>
+              <w:spacing w:after="0" w:before="0"/>
+            </w:pPr>
+            <w:r>
+              <w:rPr>
+                <w:rFonts w:ascii="Arial" w:cs="Arial" w:eastAsia="Arial" w:hAnsi="Arial"/>
+                <w:color w:val="1B2118"/>
+                <w:sz w:val="18"/>
+                <w:szCs w:val="18"/>
+              </w:rPr>
+              <w:t xml:space="preserve">Fondazione Operate</w:t>
+            </w:r>
+          </w:p>
+        </w:tc>
+      </w:tr>
+      <w:tr>
+        <w:trPr>
+          <w:cantSplit/>
+        </w:trPr>
+        <w:tc>
+          <w:tcPr>
+            <w:tcW w:type="dxa" w:w="800"/>
+            <w:tcBorders>
+              <w:top w:val="single" w:color="D9D4C5" w:sz="4"/>
+              <w:left w:val="single" w:color="D9D4C5" w:sz="4"/>
+              <w:bottom w:val="single" w:color="D9D4C5" w:sz="4"/>
+              <w:right w:val="single" w:color="D9D4C5" w:sz="4"/>
+            </w:tcBorders>
+            <w:tcMar>
+              <w:top w:type="dxa" w:w="70"/>
+              <w:left w:type="dxa" w:w="110"/>
+              <w:bottom w:type="dxa" w:w="70"/>
+              <w:right w:type="dxa" w:w="110"/>
+            </w:tcMar>
+            <w:vAlign w:val="center"/>
+          </w:tcPr>
+          <w:p>
+            <w:pPr>
+              <w:spacing w:after="0" w:before="0"/>
+            </w:pPr>
+            <w:r>
+              <w:rPr>
+                <w:rFonts w:ascii="Arial" w:cs="Arial" w:eastAsia="Arial" w:hAnsi="Arial"/>
+                <w:color w:val="1B2118"/>
+                <w:sz w:val="18"/>
+                <w:szCs w:val="18"/>
+              </w:rPr>
               <w:t xml:space="preserve">1.0</w:t>
             </w:r>
           </w:p>
@@ -1136,7 +1272,6 @@
               <w:bottom w:val="single" w:color="D9D4C5" w:sz="4"/>
               <w:right w:val="single" w:color="D9D4C5" w:sz="4"/>
             </w:tcBorders>
-            <w:shd w:fill="F6F4EE" w:color="auto" w:val="clear"/>
             <w:tcMar>
               <w:top w:type="dxa" w:w="70"/>
               <w:left w:type="dxa" w:w="110"/>
@@ -1169,7 +1304,6 @@
               <w:bottom w:val="single" w:color="D9D4C5" w:sz="4"/>
               <w:right w:val="single" w:color="D9D4C5" w:sz="4"/>
             </w:tcBorders>
-            <w:shd w:fill="F6F4EE" w:color="auto" w:val="clear"/>
             <w:tcMar>
               <w:top w:type="dxa" w:w="70"/>
               <w:left w:type="dxa" w:w="110"/>
@@ -1202,7 +1336,6 @@
               <w:bottom w:val="single" w:color="D9D4C5" w:sz="4"/>
               <w:right w:val="single" w:color="D9D4C5" w:sz="4"/>
             </w:tcBorders>
-            <w:shd w:fill="F6F4EE" w:color="auto" w:val="clear"/>
             <w:tcMar>
               <w:top w:type="dxa" w:w="70"/>
               <w:left w:type="dxa" w:w="110"/>
@@ -1244,7 +1377,7 @@
           <w:sz w:val="20"/>
           <w:szCs w:val="20"/>
         </w:rPr>
-        <w:t xml:space="preserve">Questo documento descrive il portale alla revisione 1.3 del 18/10/2026. A ogni modifica del portale il manuale viene aggiornato e la revisione incrementata; la versione corrente si scarica dall'area Documentazione del portale (solo Amministratori).</w:t>
+        <w:t xml:space="preserve">Questo documento descrive il portale alla revisione 1.4 del 18/10/2026. A ogni modifica del portale il manuale viene aggiornato e la revisione incrementata; la versione corrente si scarica dall'area Documentazione del portale (solo Amministratori).</w:t>
       </w:r>
     </w:p>
     <w:p>
@@ -3145,7 +3278,7 @@
         </w:rPr>
         <w:t xml:space="preserve">Si accede da </w:t>
       </w:r>
-      <w:hyperlink w:history="1" r:id="rIdr1ccahdp7cr5i5e2glhmg">
+      <w:hyperlink w:history="1" r:id="rIdojptsociupcsvcgbav79k">
         <w:r>
           <w:rPr>
             <w:rFonts w:ascii="Arial" w:cs="Arial" w:eastAsia="Arial" w:hAnsi="Arial"/>
@@ -10607,7 +10740,7 @@
           <w:sz w:val="21"/>
           <w:szCs w:val="21"/>
         </w:rPr>
-        <w:t xml:space="preserve"> ne crea un'altra.</w:t>
+        <w:t xml:space="preserve"> ne crea un'altra. Se la scrivete a mano deve avere almeno 10 caratteri, con lettere e numeri.</w:t>
       </w:r>
     </w:p>
     <w:p>
@@ -10764,7 +10897,7 @@
           <w:sz w:val="21"/>
           <w:szCs w:val="21"/>
         </w:rPr>
-        <w:t xml:space="preserve">.</w:t>
+        <w:t xml:space="preserve">. Se qualcosa non va a buon fine (ad esempio un'organizzazione non salvata), l'utente non viene creato e compare il motivo: correggete e riprovate.</w:t>
       </w:r>
     </w:p>
     <w:p>
@@ -10903,7 +11036,7 @@
           <w:sz w:val="21"/>
           <w:szCs w:val="21"/>
         </w:rPr>
-        <w:t xml:space="preserve"> Ogni nuovo utente entra con la password temporanea: al primo accesso il portale gli chiede di sceglierne una personale e non lo lascia proseguire finché non lo fa.</w:t>
+        <w:t xml:space="preserve"> Ogni nuovo utente entra con la password temporanea: al primo accesso il portale gli chiede di sceglierne una personale e non lo lascia proseguire finché non lo fa. Finché non l'ha cambiata non vede né modifica alcun dato del portale.</w:t>
       </w:r>
     </w:p>
     <w:p>
@@ -17469,6 +17602,91 @@
       <w:pPr>
         <w:spacing w:after="60"/>
       </w:pPr>
+    </w:p>
+    <w:p>
+      <w:pPr>
+        <w:spacing w:after="140" w:line="300"/>
+      </w:pPr>
+      <w:r>
+        <w:rPr>
+          <w:rFonts w:ascii="Arial" w:cs="Arial" w:eastAsia="Arial" w:hAnsi="Arial"/>
+          <w:b/>
+          <w:bCs/>
+          <w:color w:val="1B2118"/>
+          <w:sz w:val="21"/>
+          <w:szCs w:val="21"/>
+        </w:rPr>
+        <w:t xml:space="preserve">Il risultato vale solo per i dati con cui è stato calcolato.</w:t>
+      </w:r>
+      <w:r>
+        <w:rPr>
+          <w:rFonts w:ascii="Arial" w:cs="Arial" w:eastAsia="Arial" w:hAnsi="Arial"/>
+          <w:color w:val="1B2118"/>
+          <w:sz w:val="21"/>
+          <w:szCs w:val="21"/>
+        </w:rPr>
+        <w:t xml:space="preserve"> Se dopo «Calcola» cambiate un dato, salvate o reimportate la Banca Dati Utenze, il risultato salvato si azzera e </w:t>
+      </w:r>
+      <w:r>
+        <w:rPr>
+          <w:rFonts w:ascii="Arial" w:cs="Arial" w:eastAsia="Arial" w:hAnsi="Arial"/>
+          <w:b/>
+          <w:bCs/>
+          <w:color w:val="1B2118"/>
+          <w:sz w:val="21"/>
+          <w:szCs w:val="21"/>
+        </w:rPr>
+        <w:t xml:space="preserve">Conferma calcolo</w:t>
+      </w:r>
+      <w:r>
+        <w:rPr>
+          <w:rFonts w:ascii="Arial" w:cs="Arial" w:eastAsia="Arial" w:hAnsi="Arial"/>
+          <w:color w:val="1B2118"/>
+          <w:sz w:val="21"/>
+          <w:szCs w:val="21"/>
+        </w:rPr>
+        <w:t xml:space="preserve"> scompare: premete di nuovo </w:t>
+      </w:r>
+      <w:r>
+        <w:rPr>
+          <w:rFonts w:ascii="Arial" w:cs="Arial" w:eastAsia="Arial" w:hAnsi="Arial"/>
+          <w:b/>
+          <w:bCs/>
+          <w:color w:val="1B2118"/>
+          <w:sz w:val="21"/>
+          <w:szCs w:val="21"/>
+        </w:rPr>
+        <w:t xml:space="preserve">Calcola</w:t>
+      </w:r>
+      <w:r>
+        <w:rPr>
+          <w:rFonts w:ascii="Arial" w:cs="Arial" w:eastAsia="Arial" w:hAnsi="Arial"/>
+          <w:color w:val="1B2118"/>
+          <w:sz w:val="21"/>
+          <w:szCs w:val="21"/>
+        </w:rPr>
+        <w:t xml:space="preserve">. Se alla conferma compare il messaggio che la Banca Dati salvata non corrisponde a quella usata nel calcolo, ricaricate la pagina e premete </w:t>
+      </w:r>
+      <w:r>
+        <w:rPr>
+          <w:rFonts w:ascii="Arial" w:cs="Arial" w:eastAsia="Arial" w:hAnsi="Arial"/>
+          <w:b/>
+          <w:bCs/>
+          <w:color w:val="1B2118"/>
+          <w:sz w:val="21"/>
+          <w:szCs w:val="21"/>
+        </w:rPr>
+        <w:t xml:space="preserve">Calcola</w:t>
+      </w:r>
+      <w:r>
+        <w:rPr>
+          <w:rFonts w:ascii="Arial" w:cs="Arial" w:eastAsia="Arial" w:hAnsi="Arial"/>
+          <w:color w:val="1B2118"/>
+          <w:sz w:val="21"/>
+          <w:szCs w:val="21"/>
+        </w:rPr>
+        <w:t xml:space="preserve">. I calcoli in bozza calcolati prima del 18/10/2026 vanno ricalcolati prima della conferma.</w:t>
+      </w:r>
     </w:p>
     <w:p>
       <w:pPr>
@@ -20629,7 +20847,7 @@
         <w:szCs w:val="16"/>
       </w:rPr>
       <w:tab/>
-      <w:t xml:space="preserve">Manuale Amministratore · Rev. 1.3 · 18/10/2026</w:t>
+      <w:t xml:space="preserve">Manuale Amministratore · Rev. 1.4 · 18/10/2026</w:t>
     </w:r>
   </w:p>
 </w:hdr>
@@ -20694,7 +20912,7 @@
         <w:szCs w:val="16"/>
       </w:rPr>
       <w:tab/>
-      <w:t xml:space="preserve">Manuale Amministratore · Rev. 1.3 · 18/10/2026</w:t>
+      <w:t xml:space="preserve">Manuale Amministratore · Rev. 1.4 · 18/10/2026</w:t>
     </w:r>
   </w:p>
 </w:hdr>

</xml_diff>

<commit_message>
Documenti: rilettura dei documenti CWP, buffer corretto nei manuali (Registro 2.1, Amministratore 1.6, Test 1.6)
Co-Authored-By: Claude Opus 5.5 <noreply@anthropic.com>
Claude-Session: https://claude.ai/code/session_01E8XCbEeVHWVP3hntUZ6kZ1
</commit_message>
<xml_diff>
--- a/public/documentazione/Manuale_Amministratore_Portale_CWP.docx
+++ b/public/documentazione/Manuale_Amministratore_Portale_CWP.docx
@@ -302,7 +302,7 @@
                 <w:sz w:val="20"/>
                 <w:szCs w:val="20"/>
               </w:rPr>
-              <w:t xml:space="preserve">Rev. 1.5</w:t>
+              <w:t xml:space="preserve">Rev. 1.6</w:t>
             </w:r>
           </w:p>
         </w:tc>
@@ -719,7 +719,7 @@
                 <w:sz w:val="18"/>
                 <w:szCs w:val="18"/>
               </w:rPr>
-              <w:t xml:space="preserve">1.5</w:t>
+              <w:t xml:space="preserve">1.6</w:t>
             </w:r>
           </w:p>
         </w:tc>
@@ -783,7 +783,7 @@
                 <w:sz w:val="18"/>
                 <w:szCs w:val="18"/>
               </w:rPr>
-              <w:t xml:space="preserve">Nuova pagina Anagrafiche (Organizzazioni ed Enti, anche per gli Operatori); Rapporti con 4 fasi e durate proprie; documenti richiesti per fase; consultazione con documento bloccato, osservazioni numerate e motivazione; conservazione per 10 anni; fascicolo con riepilogo PDF e nuove cartelle.</w:t>
+              <w:t xml:space="preserve">Calcolo crediti: descrizione corretta del buffer (somma delle voci delle Tabelle 15 e 16, più il 20% con le sole utenze virtuose, al massimo 80%).</w:t>
             </w:r>
           </w:p>
         </w:tc>
@@ -853,7 +853,7 @@
                 <w:sz w:val="18"/>
                 <w:szCs w:val="18"/>
               </w:rPr>
-              <w:t xml:space="preserve">1.4</w:t>
+              <w:t xml:space="preserve">1.5</w:t>
             </w:r>
           </w:p>
         </w:tc>
@@ -919,7 +919,7 @@
                 <w:sz w:val="18"/>
                 <w:szCs w:val="18"/>
               </w:rPr>
-              <w:t xml:space="preserve">Calcolo crediti: il risultato si azzera quando cambiano dati o Banca Dati Utenze, conferma solo dopo un nuovo «Calcola». Gestione utenti: password temporanea di almeno 10 caratteri con lettere e numeri, creazione annullata se non va a buon fine, nessun accesso ai dati prima del cambio password.</w:t>
+              <w:t xml:space="preserve">Nuova pagina Anagrafiche (Organizzazioni ed Enti, anche per gli Operatori); Rapporti con 4 fasi e durate proprie; documenti richiesti per fase; consultazione con documento bloccato, osservazioni numerate e motivazione; conservazione per 10 anni; fascicolo con riepilogo PDF e nuove cartelle.</w:t>
             </w:r>
           </w:p>
         </w:tc>
@@ -989,7 +989,7 @@
                 <w:sz w:val="18"/>
                 <w:szCs w:val="18"/>
               </w:rPr>
-              <w:t xml:space="preserve">1.3</w:t>
+              <w:t xml:space="preserve">1.4</w:t>
             </w:r>
           </w:p>
         </w:tc>
@@ -1053,7 +1053,7 @@
                 <w:sz w:val="18"/>
                 <w:szCs w:val="18"/>
               </w:rPr>
-              <w:t xml:space="preserve">Rapporto di calcolo in PDF, archiviazione nella pratica, numero di registro, registro dei crediti.</w:t>
+              <w:t xml:space="preserve">Calcolo crediti: il risultato si azzera quando cambiano dati o Banca Dati Utenze, conferma solo dopo un nuovo «Calcola». Gestione utenti: password temporanea di almeno 10 caratteri con lettere e numeri, creazione annullata se non va a buon fine, nessun accesso ai dati prima del cambio password.</w:t>
             </w:r>
           </w:p>
         </w:tc>
@@ -1123,7 +1123,7 @@
                 <w:sz w:val="18"/>
                 <w:szCs w:val="18"/>
               </w:rPr>
-              <w:t xml:space="preserve">1.2</w:t>
+              <w:t xml:space="preserve">1.3</w:t>
             </w:r>
           </w:p>
         </w:tc>
@@ -1189,7 +1189,7 @@
                 <w:sz w:val="18"/>
                 <w:szCs w:val="18"/>
               </w:rPr>
-              <w:t xml:space="preserve">Calcolo crediti: importare il tracciato nel calcolo (dai documenti della pratica o dal computer), singole letture, blocco dei dati personali, controlli di coerenza.</w:t>
+              <w:t xml:space="preserve">Rapporto di calcolo in PDF, archiviazione nella pratica, numero di registro, registro dei crediti.</w:t>
             </w:r>
           </w:p>
         </w:tc>
@@ -1259,7 +1259,7 @@
                 <w:sz w:val="18"/>
                 <w:szCs w:val="18"/>
               </w:rPr>
-              <w:t xml:space="preserve">1.1</w:t>
+              <w:t xml:space="preserve">1.2</w:t>
             </w:r>
           </w:p>
         </w:tc>
@@ -1323,7 +1323,7 @@
                 <w:sz w:val="18"/>
                 <w:szCs w:val="18"/>
               </w:rPr>
-              <w:t xml:space="preserve">Note di fase, Ente di Validazione della pratica, consultazione sulla pagina pubblica con conferma dell'email, moderazione con autori e allegati, errata corrige; nuovo capitolo Messaggi con il Comune; pagamenti visibili al Comune; Impostazioni: Enti di Validazione e Modelli di documento; notifiche aggiornate.</w:t>
+              <w:t xml:space="preserve">Calcolo crediti: importare il tracciato nel calcolo (dai documenti della pratica o dal computer), singole letture, blocco dei dati personali, controlli di coerenza.</w:t>
             </w:r>
           </w:p>
         </w:tc>
@@ -1393,6 +1393,142 @@
                 <w:sz w:val="18"/>
                 <w:szCs w:val="18"/>
               </w:rPr>
+              <w:t xml:space="preserve">1.1</w:t>
+            </w:r>
+          </w:p>
+        </w:tc>
+        <w:tc>
+          <w:tcPr>
+            <w:tcW w:type="dxa" w:w="1300"/>
+            <w:tcBorders>
+              <w:top w:val="single" w:color="D9D4C5" w:sz="4"/>
+              <w:left w:val="single" w:color="D9D4C5" w:sz="4"/>
+              <w:bottom w:val="single" w:color="D9D4C5" w:sz="4"/>
+              <w:right w:val="single" w:color="D9D4C5" w:sz="4"/>
+            </w:tcBorders>
+            <w:shd w:fill="F6F4EE" w:color="auto" w:val="clear"/>
+            <w:tcMar>
+              <w:top w:type="dxa" w:w="70"/>
+              <w:left w:type="dxa" w:w="110"/>
+              <w:bottom w:type="dxa" w:w="70"/>
+              <w:right w:type="dxa" w:w="110"/>
+            </w:tcMar>
+            <w:vAlign w:val="center"/>
+          </w:tcPr>
+          <w:p>
+            <w:pPr>
+              <w:spacing w:after="0" w:before="0"/>
+            </w:pPr>
+            <w:r>
+              <w:rPr>
+                <w:rFonts w:ascii="Arial" w:cs="Arial" w:eastAsia="Arial" w:hAnsi="Arial"/>
+                <w:color w:val="1B2118"/>
+                <w:sz w:val="18"/>
+                <w:szCs w:val="18"/>
+              </w:rPr>
+              <w:t xml:space="preserve">18/10/2026</w:t>
+            </w:r>
+          </w:p>
+        </w:tc>
+        <w:tc>
+          <w:tcPr>
+            <w:tcW w:type="dxa" w:w="5538"/>
+            <w:tcBorders>
+              <w:top w:val="single" w:color="D9D4C5" w:sz="4"/>
+              <w:left w:val="single" w:color="D9D4C5" w:sz="4"/>
+              <w:bottom w:val="single" w:color="D9D4C5" w:sz="4"/>
+              <w:right w:val="single" w:color="D9D4C5" w:sz="4"/>
+            </w:tcBorders>
+            <w:shd w:fill="F6F4EE" w:color="auto" w:val="clear"/>
+            <w:tcMar>
+              <w:top w:type="dxa" w:w="70"/>
+              <w:left w:type="dxa" w:w="110"/>
+              <w:bottom w:type="dxa" w:w="70"/>
+              <w:right w:type="dxa" w:w="110"/>
+            </w:tcMar>
+            <w:vAlign w:val="center"/>
+          </w:tcPr>
+          <w:p>
+            <w:pPr>
+              <w:spacing w:after="0" w:before="0"/>
+            </w:pPr>
+            <w:r>
+              <w:rPr>
+                <w:rFonts w:ascii="Arial" w:cs="Arial" w:eastAsia="Arial" w:hAnsi="Arial"/>
+                <w:color w:val="1B2118"/>
+                <w:sz w:val="18"/>
+                <w:szCs w:val="18"/>
+              </w:rPr>
+              <w:t xml:space="preserve">Note di fase, Ente di Validazione della pratica, consultazione sulla pagina pubblica con conferma dell'email, moderazione con autori e allegati, errata corrige; nuovo capitolo Messaggi con il Comune; pagamenti visibili al Comune; Impostazioni: Enti di Validazione e Modelli di documento; notifiche aggiornate.</w:t>
+            </w:r>
+          </w:p>
+        </w:tc>
+        <w:tc>
+          <w:tcPr>
+            <w:tcW w:type="dxa" w:w="2000"/>
+            <w:tcBorders>
+              <w:top w:val="single" w:color="D9D4C5" w:sz="4"/>
+              <w:left w:val="single" w:color="D9D4C5" w:sz="4"/>
+              <w:bottom w:val="single" w:color="D9D4C5" w:sz="4"/>
+              <w:right w:val="single" w:color="D9D4C5" w:sz="4"/>
+            </w:tcBorders>
+            <w:shd w:fill="F6F4EE" w:color="auto" w:val="clear"/>
+            <w:tcMar>
+              <w:top w:type="dxa" w:w="70"/>
+              <w:left w:type="dxa" w:w="110"/>
+              <w:bottom w:type="dxa" w:w="70"/>
+              <w:right w:type="dxa" w:w="110"/>
+            </w:tcMar>
+            <w:vAlign w:val="center"/>
+          </w:tcPr>
+          <w:p>
+            <w:pPr>
+              <w:spacing w:after="0" w:before="0"/>
+            </w:pPr>
+            <w:r>
+              <w:rPr>
+                <w:rFonts w:ascii="Arial" w:cs="Arial" w:eastAsia="Arial" w:hAnsi="Arial"/>
+                <w:color w:val="1B2118"/>
+                <w:sz w:val="18"/>
+                <w:szCs w:val="18"/>
+              </w:rPr>
+              <w:t xml:space="preserve">Fondazione Operate</w:t>
+            </w:r>
+          </w:p>
+        </w:tc>
+      </w:tr>
+      <w:tr>
+        <w:trPr>
+          <w:cantSplit/>
+        </w:trPr>
+        <w:tc>
+          <w:tcPr>
+            <w:tcW w:type="dxa" w:w="800"/>
+            <w:tcBorders>
+              <w:top w:val="single" w:color="D9D4C5" w:sz="4"/>
+              <w:left w:val="single" w:color="D9D4C5" w:sz="4"/>
+              <w:bottom w:val="single" w:color="D9D4C5" w:sz="4"/>
+              <w:right w:val="single" w:color="D9D4C5" w:sz="4"/>
+            </w:tcBorders>
+            <w:tcMar>
+              <w:top w:type="dxa" w:w="70"/>
+              <w:left w:type="dxa" w:w="110"/>
+              <w:bottom w:type="dxa" w:w="70"/>
+              <w:right w:type="dxa" w:w="110"/>
+            </w:tcMar>
+            <w:vAlign w:val="center"/>
+          </w:tcPr>
+          <w:p>
+            <w:pPr>
+              <w:spacing w:after="0" w:before="0"/>
+            </w:pPr>
+            <w:r>
+              <w:rPr>
+                <w:rFonts w:ascii="Arial" w:cs="Arial" w:eastAsia="Arial" w:hAnsi="Arial"/>
+                <w:color w:val="1B2118"/>
+                <w:sz w:val="18"/>
+                <w:szCs w:val="18"/>
+              </w:rPr>
               <w:t xml:space="preserve">1.0</w:t>
             </w:r>
           </w:p>
@@ -1406,7 +1542,6 @@
               <w:bottom w:val="single" w:color="D9D4C5" w:sz="4"/>
               <w:right w:val="single" w:color="D9D4C5" w:sz="4"/>
             </w:tcBorders>
-            <w:shd w:fill="F6F4EE" w:color="auto" w:val="clear"/>
             <w:tcMar>
               <w:top w:type="dxa" w:w="70"/>
               <w:left w:type="dxa" w:w="110"/>
@@ -1439,7 +1574,6 @@
               <w:bottom w:val="single" w:color="D9D4C5" w:sz="4"/>
               <w:right w:val="single" w:color="D9D4C5" w:sz="4"/>
             </w:tcBorders>
-            <w:shd w:fill="F6F4EE" w:color="auto" w:val="clear"/>
             <w:tcMar>
               <w:top w:type="dxa" w:w="70"/>
               <w:left w:type="dxa" w:w="110"/>
@@ -1472,7 +1606,6 @@
               <w:bottom w:val="single" w:color="D9D4C5" w:sz="4"/>
               <w:right w:val="single" w:color="D9D4C5" w:sz="4"/>
             </w:tcBorders>
-            <w:shd w:fill="F6F4EE" w:color="auto" w:val="clear"/>
             <w:tcMar>
               <w:top w:type="dxa" w:w="70"/>
               <w:left w:type="dxa" w:w="110"/>
@@ -1514,7 +1647,7 @@
           <w:sz w:val="20"/>
           <w:szCs w:val="20"/>
         </w:rPr>
-        <w:t xml:space="preserve">Questo documento descrive il portale alla revisione 1.5 del 18/10/2026. A ogni modifica del portale il manuale viene aggiornato e la revisione incrementata; la versione corrente si scarica dall'area Documentazione del portale (solo Amministratori).</w:t>
+        <w:t xml:space="preserve">Questo documento descrive il portale alla revisione 1.6 del 18/10/2026. A ogni modifica del portale il manuale viene aggiornato e la revisione incrementata; la versione corrente si scarica dall'area Documentazione del portale (solo Amministratori).</w:t>
       </w:r>
     </w:p>
     <w:p>
@@ -3575,7 +3708,7 @@
         </w:rPr>
         <w:t xml:space="preserve">Si accede da </w:t>
       </w:r>
-      <w:hyperlink w:history="1" r:id="rId_uvuohehl5_lgaprihnwn">
+      <w:hyperlink w:history="1" r:id="rId63xqhbo-v_oxnxemw5vgs">
         <w:r>
           <w:rPr>
             <w:rFonts w:ascii="Arial" w:cs="Arial" w:eastAsia="Arial" w:hAnsi="Arial"/>
@@ -16083,7 +16216,7 @@
                 <w:sz w:val="18"/>
                 <w:szCs w:val="18"/>
               </w:rPr>
-              <w:t xml:space="preserve">Quota di crediti trattenuta a garanzia, dal 30% in giù (Tabelle 15 e 16)</w:t>
+              <w:t xml:space="preserve">Quota di crediti trattenuta a garanzia: somma delle voci delle Tabelle 15 e 16 (più il 20% con le sole utenze virtuose), al massimo 80%</w:t>
             </w:r>
           </w:p>
         </w:tc>
@@ -18979,7 +19112,7 @@
           <w:sz w:val="21"/>
           <w:szCs w:val="21"/>
         </w:rPr>
-        <w:t xml:space="preserve"> Il buffer parte dal 30% e si riduce in base a come il Comune misura i conferimenti:</w:t>
+        <w:t xml:space="preserve"> Il buffer è la somma di più voci e non supera l'80%; ogni voce dipende da come il Comune misura utenze e conferimenti (per i rifiuti misurati si va dal 30% con il solo indifferenziato al 3% con tutte le frazioni principali):</w:t>
       </w:r>
     </w:p>
     <w:p>
@@ -22951,7 +23084,7 @@
         <w:szCs w:val="16"/>
       </w:rPr>
       <w:tab/>
-      <w:t xml:space="preserve">Manuale Amministratore · Rev. 1.5 · 18/10/2026</w:t>
+      <w:t xml:space="preserve">Manuale Amministratore · Rev. 1.6 · 18/10/2026</w:t>
     </w:r>
   </w:p>
 </w:hdr>
@@ -23016,7 +23149,7 @@
         <w:szCs w:val="16"/>
       </w:rPr>
       <w:tab/>
-      <w:t xml:space="preserve">Manuale Amministratore · Rev. 1.5 · 18/10/2026</w:t>
+      <w:t xml:space="preserve">Manuale Amministratore · Rev. 1.6 · 18/10/2026</w:t>
     </w:r>
   </w:p>
 </w:hdr>

</xml_diff>

<commit_message>
Manuale Amministratore 1.8: PEC e documenti del Programma pubblicati
Co-Authored-By: Claude Opus 5.5 <noreply@anthropic.com>
Claude-Session: https://claude.ai/code/session_01E8XCbEeVHWVP3hntUZ6kZ1
</commit_message>
<xml_diff>
--- a/public/documentazione/Manuale_Amministratore_Portale_CWP.docx
+++ b/public/documentazione/Manuale_Amministratore_Portale_CWP.docx
@@ -302,7 +302,7 @@
                 <w:sz w:val="20"/>
                 <w:szCs w:val="20"/>
               </w:rPr>
-              <w:t xml:space="preserve">Rev. 1.7</w:t>
+              <w:t xml:space="preserve">Rev. 1.8</w:t>
             </w:r>
           </w:p>
         </w:tc>
@@ -365,7 +365,7 @@
                 <w:sz w:val="20"/>
                 <w:szCs w:val="20"/>
               </w:rPr>
-              <w:t xml:space="preserve">18/10/2026</w:t>
+              <w:t xml:space="preserve">19/10/2026</w:t>
             </w:r>
           </w:p>
         </w:tc>
@@ -719,7 +719,7 @@
                 <w:sz w:val="18"/>
                 <w:szCs w:val="18"/>
               </w:rPr>
-              <w:t xml:space="preserve">1.7</w:t>
+              <w:t xml:space="preserve">1.8</w:t>
             </w:r>
           </w:p>
         </w:tc>
@@ -751,7 +751,7 @@
                 <w:sz w:val="18"/>
                 <w:szCs w:val="18"/>
               </w:rPr>
-              <w:t xml:space="preserve">18/10/2026</w:t>
+              <w:t xml:space="preserve">19/10/2026</w:t>
             </w:r>
           </w:p>
         </w:tc>
@@ -783,7 +783,7 @@
                 <w:sz w:val="18"/>
                 <w:szCs w:val="18"/>
               </w:rPr>
-              <w:t xml:space="preserve">Allineamento ai documenti ufficiali del Programma (script 22-24): Rapporto a 7 fasi, feedback pubblico, stati del Programma, dati del progetto e territorio ISTAT, ritiro e rientro, account unico e delegati, registri, tariffe e sospensione, accuratezza e accertamenti, informazioni del Programma e metodologie, modelli pubblici; nuovi capitoli Crediti emessi, Reclami, Pagina pubblica; qualità dei dati nel calcolo.</w:t>
+              <w:t xml:space="preserve">PEC del Programma e documenti ufficiali già pubblicati sulla pagina pubblica.</w:t>
             </w:r>
           </w:p>
         </w:tc>
@@ -853,7 +853,7 @@
                 <w:sz w:val="18"/>
                 <w:szCs w:val="18"/>
               </w:rPr>
-              <w:t xml:space="preserve">1.6</w:t>
+              <w:t xml:space="preserve">1.7</w:t>
             </w:r>
           </w:p>
         </w:tc>
@@ -919,7 +919,7 @@
                 <w:sz w:val="18"/>
                 <w:szCs w:val="18"/>
               </w:rPr>
-              <w:t xml:space="preserve">Calcolo crediti: descrizione corretta del buffer (somma delle voci delle Tabelle 15 e 16, più il 20% con le sole utenze virtuose, al massimo 80%).</w:t>
+              <w:t xml:space="preserve">Allineamento ai documenti ufficiali del Programma (script 22-24): Rapporto a 7 fasi, feedback pubblico, stati del Programma, dati del progetto e territorio ISTAT, ritiro e rientro, account unico e delegati, registri, tariffe e sospensione, accuratezza e accertamenti, informazioni del Programma e metodologie, modelli pubblici; nuovi capitoli Crediti emessi, Reclami, Pagina pubblica; qualità dei dati nel calcolo.</w:t>
             </w:r>
           </w:p>
         </w:tc>
@@ -989,7 +989,7 @@
                 <w:sz w:val="18"/>
                 <w:szCs w:val="18"/>
               </w:rPr>
-              <w:t xml:space="preserve">1.5</w:t>
+              <w:t xml:space="preserve">1.6</w:t>
             </w:r>
           </w:p>
         </w:tc>
@@ -1053,7 +1053,7 @@
                 <w:sz w:val="18"/>
                 <w:szCs w:val="18"/>
               </w:rPr>
-              <w:t xml:space="preserve">Nuova pagina Anagrafiche (Organizzazioni ed Enti, anche per gli Operatori); Rapporti con 4 fasi e durate proprie; documenti richiesti per fase; consultazione con documento bloccato, osservazioni numerate e motivazione; conservazione per 10 anni; fascicolo con riepilogo PDF e nuove cartelle.</w:t>
+              <w:t xml:space="preserve">Calcolo crediti: descrizione corretta del buffer (somma delle voci delle Tabelle 15 e 16, più il 20% con le sole utenze virtuose, al massimo 80%).</w:t>
             </w:r>
           </w:p>
         </w:tc>
@@ -1123,7 +1123,7 @@
                 <w:sz w:val="18"/>
                 <w:szCs w:val="18"/>
               </w:rPr>
-              <w:t xml:space="preserve">1.4</w:t>
+              <w:t xml:space="preserve">1.5</w:t>
             </w:r>
           </w:p>
         </w:tc>
@@ -1189,7 +1189,7 @@
                 <w:sz w:val="18"/>
                 <w:szCs w:val="18"/>
               </w:rPr>
-              <w:t xml:space="preserve">Calcolo crediti: il risultato si azzera quando cambiano dati o Banca Dati Utenze, conferma solo dopo un nuovo «Calcola». Gestione utenti: password temporanea di almeno 10 caratteri con lettere e numeri, creazione annullata se non va a buon fine, nessun accesso ai dati prima del cambio password.</w:t>
+              <w:t xml:space="preserve">Nuova pagina Anagrafiche (Organizzazioni ed Enti, anche per gli Operatori); Rapporti con 4 fasi e durate proprie; documenti richiesti per fase; consultazione con documento bloccato, osservazioni numerate e motivazione; conservazione per 10 anni; fascicolo con riepilogo PDF e nuove cartelle.</w:t>
             </w:r>
           </w:p>
         </w:tc>
@@ -1259,7 +1259,7 @@
                 <w:sz w:val="18"/>
                 <w:szCs w:val="18"/>
               </w:rPr>
-              <w:t xml:space="preserve">1.3</w:t>
+              <w:t xml:space="preserve">1.4</w:t>
             </w:r>
           </w:p>
         </w:tc>
@@ -1323,7 +1323,7 @@
                 <w:sz w:val="18"/>
                 <w:szCs w:val="18"/>
               </w:rPr>
-              <w:t xml:space="preserve">Rapporto di calcolo in PDF, archiviazione nella pratica, numero di registro, registro dei crediti.</w:t>
+              <w:t xml:space="preserve">Calcolo crediti: il risultato si azzera quando cambiano dati o Banca Dati Utenze, conferma solo dopo un nuovo «Calcola». Gestione utenti: password temporanea di almeno 10 caratteri con lettere e numeri, creazione annullata se non va a buon fine, nessun accesso ai dati prima del cambio password.</w:t>
             </w:r>
           </w:p>
         </w:tc>
@@ -1393,7 +1393,7 @@
                 <w:sz w:val="18"/>
                 <w:szCs w:val="18"/>
               </w:rPr>
-              <w:t xml:space="preserve">1.2</w:t>
+              <w:t xml:space="preserve">1.3</w:t>
             </w:r>
           </w:p>
         </w:tc>
@@ -1459,7 +1459,7 @@
                 <w:sz w:val="18"/>
                 <w:szCs w:val="18"/>
               </w:rPr>
-              <w:t xml:space="preserve">Calcolo crediti: importare il tracciato nel calcolo (dai documenti della pratica o dal computer), singole letture, blocco dei dati personali, controlli di coerenza.</w:t>
+              <w:t xml:space="preserve">Rapporto di calcolo in PDF, archiviazione nella pratica, numero di registro, registro dei crediti.</w:t>
             </w:r>
           </w:p>
         </w:tc>
@@ -1529,7 +1529,7 @@
                 <w:sz w:val="18"/>
                 <w:szCs w:val="18"/>
               </w:rPr>
-              <w:t xml:space="preserve">1.1</w:t>
+              <w:t xml:space="preserve">1.2</w:t>
             </w:r>
           </w:p>
         </w:tc>
@@ -1593,7 +1593,7 @@
                 <w:sz w:val="18"/>
                 <w:szCs w:val="18"/>
               </w:rPr>
-              <w:t xml:space="preserve">Note di fase, Ente di Validazione della pratica, consultazione sulla pagina pubblica con conferma dell'email, moderazione con autori e allegati, errata corrige; nuovo capitolo Messaggi con il Comune; pagamenti visibili al Comune; Impostazioni: Enti di Validazione e Modelli di documento; notifiche aggiornate.</w:t>
+              <w:t xml:space="preserve">Calcolo crediti: importare il tracciato nel calcolo (dai documenti della pratica o dal computer), singole letture, blocco dei dati personali, controlli di coerenza.</w:t>
             </w:r>
           </w:p>
         </w:tc>
@@ -1663,6 +1663,142 @@
                 <w:sz w:val="18"/>
                 <w:szCs w:val="18"/>
               </w:rPr>
+              <w:t xml:space="preserve">1.1</w:t>
+            </w:r>
+          </w:p>
+        </w:tc>
+        <w:tc>
+          <w:tcPr>
+            <w:tcW w:type="dxa" w:w="1300"/>
+            <w:tcBorders>
+              <w:top w:val="single" w:color="D9D4C5" w:sz="4"/>
+              <w:left w:val="single" w:color="D9D4C5" w:sz="4"/>
+              <w:bottom w:val="single" w:color="D9D4C5" w:sz="4"/>
+              <w:right w:val="single" w:color="D9D4C5" w:sz="4"/>
+            </w:tcBorders>
+            <w:shd w:fill="F6F4EE" w:color="auto" w:val="clear"/>
+            <w:tcMar>
+              <w:top w:type="dxa" w:w="70"/>
+              <w:left w:type="dxa" w:w="110"/>
+              <w:bottom w:type="dxa" w:w="70"/>
+              <w:right w:type="dxa" w:w="110"/>
+            </w:tcMar>
+            <w:vAlign w:val="center"/>
+          </w:tcPr>
+          <w:p>
+            <w:pPr>
+              <w:spacing w:after="0" w:before="0"/>
+            </w:pPr>
+            <w:r>
+              <w:rPr>
+                <w:rFonts w:ascii="Arial" w:cs="Arial" w:eastAsia="Arial" w:hAnsi="Arial"/>
+                <w:color w:val="1B2118"/>
+                <w:sz w:val="18"/>
+                <w:szCs w:val="18"/>
+              </w:rPr>
+              <w:t xml:space="preserve">18/10/2026</w:t>
+            </w:r>
+          </w:p>
+        </w:tc>
+        <w:tc>
+          <w:tcPr>
+            <w:tcW w:type="dxa" w:w="5538"/>
+            <w:tcBorders>
+              <w:top w:val="single" w:color="D9D4C5" w:sz="4"/>
+              <w:left w:val="single" w:color="D9D4C5" w:sz="4"/>
+              <w:bottom w:val="single" w:color="D9D4C5" w:sz="4"/>
+              <w:right w:val="single" w:color="D9D4C5" w:sz="4"/>
+            </w:tcBorders>
+            <w:shd w:fill="F6F4EE" w:color="auto" w:val="clear"/>
+            <w:tcMar>
+              <w:top w:type="dxa" w:w="70"/>
+              <w:left w:type="dxa" w:w="110"/>
+              <w:bottom w:type="dxa" w:w="70"/>
+              <w:right w:type="dxa" w:w="110"/>
+            </w:tcMar>
+            <w:vAlign w:val="center"/>
+          </w:tcPr>
+          <w:p>
+            <w:pPr>
+              <w:spacing w:after="0" w:before="0"/>
+            </w:pPr>
+            <w:r>
+              <w:rPr>
+                <w:rFonts w:ascii="Arial" w:cs="Arial" w:eastAsia="Arial" w:hAnsi="Arial"/>
+                <w:color w:val="1B2118"/>
+                <w:sz w:val="18"/>
+                <w:szCs w:val="18"/>
+              </w:rPr>
+              <w:t xml:space="preserve">Note di fase, Ente di Validazione della pratica, consultazione sulla pagina pubblica con conferma dell'email, moderazione con autori e allegati, errata corrige; nuovo capitolo Messaggi con il Comune; pagamenti visibili al Comune; Impostazioni: Enti di Validazione e Modelli di documento; notifiche aggiornate.</w:t>
+            </w:r>
+          </w:p>
+        </w:tc>
+        <w:tc>
+          <w:tcPr>
+            <w:tcW w:type="dxa" w:w="2000"/>
+            <w:tcBorders>
+              <w:top w:val="single" w:color="D9D4C5" w:sz="4"/>
+              <w:left w:val="single" w:color="D9D4C5" w:sz="4"/>
+              <w:bottom w:val="single" w:color="D9D4C5" w:sz="4"/>
+              <w:right w:val="single" w:color="D9D4C5" w:sz="4"/>
+            </w:tcBorders>
+            <w:shd w:fill="F6F4EE" w:color="auto" w:val="clear"/>
+            <w:tcMar>
+              <w:top w:type="dxa" w:w="70"/>
+              <w:left w:type="dxa" w:w="110"/>
+              <w:bottom w:type="dxa" w:w="70"/>
+              <w:right w:type="dxa" w:w="110"/>
+            </w:tcMar>
+            <w:vAlign w:val="center"/>
+          </w:tcPr>
+          <w:p>
+            <w:pPr>
+              <w:spacing w:after="0" w:before="0"/>
+            </w:pPr>
+            <w:r>
+              <w:rPr>
+                <w:rFonts w:ascii="Arial" w:cs="Arial" w:eastAsia="Arial" w:hAnsi="Arial"/>
+                <w:color w:val="1B2118"/>
+                <w:sz w:val="18"/>
+                <w:szCs w:val="18"/>
+              </w:rPr>
+              <w:t xml:space="preserve">Fondazione Operate</w:t>
+            </w:r>
+          </w:p>
+        </w:tc>
+      </w:tr>
+      <w:tr>
+        <w:trPr>
+          <w:cantSplit/>
+        </w:trPr>
+        <w:tc>
+          <w:tcPr>
+            <w:tcW w:type="dxa" w:w="800"/>
+            <w:tcBorders>
+              <w:top w:val="single" w:color="D9D4C5" w:sz="4"/>
+              <w:left w:val="single" w:color="D9D4C5" w:sz="4"/>
+              <w:bottom w:val="single" w:color="D9D4C5" w:sz="4"/>
+              <w:right w:val="single" w:color="D9D4C5" w:sz="4"/>
+            </w:tcBorders>
+            <w:tcMar>
+              <w:top w:type="dxa" w:w="70"/>
+              <w:left w:type="dxa" w:w="110"/>
+              <w:bottom w:type="dxa" w:w="70"/>
+              <w:right w:type="dxa" w:w="110"/>
+            </w:tcMar>
+            <w:vAlign w:val="center"/>
+          </w:tcPr>
+          <w:p>
+            <w:pPr>
+              <w:spacing w:after="0" w:before="0"/>
+            </w:pPr>
+            <w:r>
+              <w:rPr>
+                <w:rFonts w:ascii="Arial" w:cs="Arial" w:eastAsia="Arial" w:hAnsi="Arial"/>
+                <w:color w:val="1B2118"/>
+                <w:sz w:val="18"/>
+                <w:szCs w:val="18"/>
+              </w:rPr>
               <w:t xml:space="preserve">1.0</w:t>
             </w:r>
           </w:p>
@@ -1676,7 +1812,6 @@
               <w:bottom w:val="single" w:color="D9D4C5" w:sz="4"/>
               <w:right w:val="single" w:color="D9D4C5" w:sz="4"/>
             </w:tcBorders>
-            <w:shd w:fill="F6F4EE" w:color="auto" w:val="clear"/>
             <w:tcMar>
               <w:top w:type="dxa" w:w="70"/>
               <w:left w:type="dxa" w:w="110"/>
@@ -1709,7 +1844,6 @@
               <w:bottom w:val="single" w:color="D9D4C5" w:sz="4"/>
               <w:right w:val="single" w:color="D9D4C5" w:sz="4"/>
             </w:tcBorders>
-            <w:shd w:fill="F6F4EE" w:color="auto" w:val="clear"/>
             <w:tcMar>
               <w:top w:type="dxa" w:w="70"/>
               <w:left w:type="dxa" w:w="110"/>
@@ -1742,7 +1876,6 @@
               <w:bottom w:val="single" w:color="D9D4C5" w:sz="4"/>
               <w:right w:val="single" w:color="D9D4C5" w:sz="4"/>
             </w:tcBorders>
-            <w:shd w:fill="F6F4EE" w:color="auto" w:val="clear"/>
             <w:tcMar>
               <w:top w:type="dxa" w:w="70"/>
               <w:left w:type="dxa" w:w="110"/>
@@ -1784,7 +1917,7 @@
           <w:sz w:val="20"/>
           <w:szCs w:val="20"/>
         </w:rPr>
-        <w:t xml:space="preserve">Questo documento descrive il portale alla revisione 1.7 del 18/10/2026. A ogni modifica del portale il manuale viene aggiornato e la revisione incrementata; la versione corrente si scarica dall'area Documentazione del portale (solo Amministratori).</w:t>
+        <w:t xml:space="preserve">Questo documento descrive il portale alla revisione 1.8 del 19/10/2026. A ogni modifica del portale il manuale viene aggiornato e la revisione incrementata; la versione corrente si scarica dall'area Documentazione del portale (solo Amministratori).</w:t>
       </w:r>
     </w:p>
     <w:p>
@@ -4335,7 +4468,7 @@
         </w:rPr>
         <w:t xml:space="preserve">Si accede da </w:t>
       </w:r>
-      <w:hyperlink w:history="1" r:id="rId6igbmrzijsc3xjrltxp8z">
+      <w:hyperlink w:history="1" r:id="rIdgdmcrgli0vd0zvmky3stf">
         <w:r>
           <w:rPr>
             <w:rFonts w:ascii="Arial" w:cs="Arial" w:eastAsia="Arial" w:hAnsi="Arial"/>
@@ -20189,7 +20322,7 @@
           <w:sz w:val="21"/>
           <w:szCs w:val="21"/>
         </w:rPr>
-        <w:t xml:space="preserve">. Valori iniziali: soggetto promotore Studio Associato Wastelab (Guida 3.1), in attesa dell'incarico al soggetto giuridico che gestirà la piattaforma; email info@carbonwasteprint.com; sito www.carbonwasteprint.com; la PEC è da inserire. Cambiate i campi e premete </w:t>
+        <w:t xml:space="preserve">. Valori iniziali: soggetto promotore Studio Associato Wastelab (Guida 3.1), in attesa dell'incarico al soggetto giuridico che gestirà la piattaforma; email info@carbonwasteprint.com; sito www.carbonwasteprint.com; PEC operate@pec.it (dal 19/10/2026). Tra i modelli di documento sono già pubblicati, come «Documento del Programma», gli otto documenti ufficiali v1.2 (Guida, Definizioni, Normativa, Standard, Metodologia, Politica di reclamo, Schema tariffario, Gestione della qualità dei dati), e il PDF della Metodologia è collegato alla metodologia approvata. Cambiate i campi e premete </w:t>
       </w:r>
       <w:r>
         <w:rPr>
@@ -36121,7 +36254,7 @@
         <w:szCs w:val="16"/>
       </w:rPr>
       <w:tab/>
-      <w:t xml:space="preserve">Manuale Amministratore · Rev. 1.7 · 18/10/2026</w:t>
+      <w:t xml:space="preserve">Manuale Amministratore · Rev. 1.8 · 19/10/2026</w:t>
     </w:r>
   </w:p>
 </w:hdr>
@@ -36186,7 +36319,7 @@
         <w:szCs w:val="16"/>
       </w:rPr>
       <w:tab/>
-      <w:t xml:space="preserve">Manuale Amministratore · Rev. 1.7 · 18/10/2026</w:t>
+      <w:t xml:space="preserve">Manuale Amministratore · Rev. 1.8 · 19/10/2026</w:t>
     </w:r>
   </w:p>
 </w:hdr>

</xml_diff>

<commit_message>
Fondazione Operate soggetto promotore: Registro 2.3, Amministratore 1.9, Test 1.8, testo in Impostazioni
Co-Authored-By: Claude Opus 5.5 <noreply@anthropic.com>
Claude-Session: https://claude.ai/code/session_01E8XCbEeVHWVP3hntUZ6kZ1
</commit_message>
<xml_diff>
--- a/public/documentazione/Manuale_Amministratore_Portale_CWP.docx
+++ b/public/documentazione/Manuale_Amministratore_Portale_CWP.docx
@@ -302,7 +302,7 @@
                 <w:sz w:val="20"/>
                 <w:szCs w:val="20"/>
               </w:rPr>
-              <w:t xml:space="preserve">Rev. 1.8</w:t>
+              <w:t xml:space="preserve">Rev. 1.9</w:t>
             </w:r>
           </w:p>
         </w:tc>
@@ -719,7 +719,7 @@
                 <w:sz w:val="18"/>
                 <w:szCs w:val="18"/>
               </w:rPr>
-              <w:t xml:space="preserve">1.8</w:t>
+              <w:t xml:space="preserve">1.9</w:t>
             </w:r>
           </w:p>
         </w:tc>
@@ -783,7 +783,7 @@
                 <w:sz w:val="18"/>
                 <w:szCs w:val="18"/>
               </w:rPr>
-              <w:t xml:space="preserve">PEC del Programma e documenti ufficiali già pubblicati sulla pagina pubblica.</w:t>
+              <w:t xml:space="preserve">Fondazione Operate soggetto promotore del programma (esclusiva conferita da Wastelab).</w:t>
             </w:r>
           </w:p>
         </w:tc>
@@ -853,7 +853,7 @@
                 <w:sz w:val="18"/>
                 <w:szCs w:val="18"/>
               </w:rPr>
-              <w:t xml:space="preserve">1.7</w:t>
+              <w:t xml:space="preserve">1.8</w:t>
             </w:r>
           </w:p>
         </w:tc>
@@ -886,7 +886,7 @@
                 <w:sz w:val="18"/>
                 <w:szCs w:val="18"/>
               </w:rPr>
-              <w:t xml:space="preserve">18/10/2026</w:t>
+              <w:t xml:space="preserve">19/10/2026</w:t>
             </w:r>
           </w:p>
         </w:tc>
@@ -919,7 +919,7 @@
                 <w:sz w:val="18"/>
                 <w:szCs w:val="18"/>
               </w:rPr>
-              <w:t xml:space="preserve">Allineamento ai documenti ufficiali del Programma (script 22-24): Rapporto a 7 fasi, feedback pubblico, stati del Programma, dati del progetto e territorio ISTAT, ritiro e rientro, account unico e delegati, registri, tariffe e sospensione, accuratezza e accertamenti, informazioni del Programma e metodologie, modelli pubblici; nuovi capitoli Crediti emessi, Reclami, Pagina pubblica; qualità dei dati nel calcolo.</w:t>
+              <w:t xml:space="preserve">PEC del Programma e documenti ufficiali già pubblicati sulla pagina pubblica.</w:t>
             </w:r>
           </w:p>
         </w:tc>
@@ -989,7 +989,7 @@
                 <w:sz w:val="18"/>
                 <w:szCs w:val="18"/>
               </w:rPr>
-              <w:t xml:space="preserve">1.6</w:t>
+              <w:t xml:space="preserve">1.7</w:t>
             </w:r>
           </w:p>
         </w:tc>
@@ -1053,7 +1053,7 @@
                 <w:sz w:val="18"/>
                 <w:szCs w:val="18"/>
               </w:rPr>
-              <w:t xml:space="preserve">Calcolo crediti: descrizione corretta del buffer (somma delle voci delle Tabelle 15 e 16, più il 20% con le sole utenze virtuose, al massimo 80%).</w:t>
+              <w:t xml:space="preserve">Allineamento ai documenti ufficiali del Programma (script 22-24): Rapporto a 7 fasi, feedback pubblico, stati del Programma, dati del progetto e territorio ISTAT, ritiro e rientro, account unico e delegati, registri, tariffe e sospensione, accuratezza e accertamenti, informazioni del Programma e metodologie, modelli pubblici; nuovi capitoli Crediti emessi, Reclami, Pagina pubblica; qualità dei dati nel calcolo.</w:t>
             </w:r>
           </w:p>
         </w:tc>
@@ -1123,7 +1123,7 @@
                 <w:sz w:val="18"/>
                 <w:szCs w:val="18"/>
               </w:rPr>
-              <w:t xml:space="preserve">1.5</w:t>
+              <w:t xml:space="preserve">1.6</w:t>
             </w:r>
           </w:p>
         </w:tc>
@@ -1189,7 +1189,7 @@
                 <w:sz w:val="18"/>
                 <w:szCs w:val="18"/>
               </w:rPr>
-              <w:t xml:space="preserve">Nuova pagina Anagrafiche (Organizzazioni ed Enti, anche per gli Operatori); Rapporti con 4 fasi e durate proprie; documenti richiesti per fase; consultazione con documento bloccato, osservazioni numerate e motivazione; conservazione per 10 anni; fascicolo con riepilogo PDF e nuove cartelle.</w:t>
+              <w:t xml:space="preserve">Calcolo crediti: descrizione corretta del buffer (somma delle voci delle Tabelle 15 e 16, più il 20% con le sole utenze virtuose, al massimo 80%).</w:t>
             </w:r>
           </w:p>
         </w:tc>
@@ -1259,7 +1259,7 @@
                 <w:sz w:val="18"/>
                 <w:szCs w:val="18"/>
               </w:rPr>
-              <w:t xml:space="preserve">1.4</w:t>
+              <w:t xml:space="preserve">1.5</w:t>
             </w:r>
           </w:p>
         </w:tc>
@@ -1323,7 +1323,7 @@
                 <w:sz w:val="18"/>
                 <w:szCs w:val="18"/>
               </w:rPr>
-              <w:t xml:space="preserve">Calcolo crediti: il risultato si azzera quando cambiano dati o Banca Dati Utenze, conferma solo dopo un nuovo «Calcola». Gestione utenti: password temporanea di almeno 10 caratteri con lettere e numeri, creazione annullata se non va a buon fine, nessun accesso ai dati prima del cambio password.</w:t>
+              <w:t xml:space="preserve">Nuova pagina Anagrafiche (Organizzazioni ed Enti, anche per gli Operatori); Rapporti con 4 fasi e durate proprie; documenti richiesti per fase; consultazione con documento bloccato, osservazioni numerate e motivazione; conservazione per 10 anni; fascicolo con riepilogo PDF e nuove cartelle.</w:t>
             </w:r>
           </w:p>
         </w:tc>
@@ -1393,7 +1393,7 @@
                 <w:sz w:val="18"/>
                 <w:szCs w:val="18"/>
               </w:rPr>
-              <w:t xml:space="preserve">1.3</w:t>
+              <w:t xml:space="preserve">1.4</w:t>
             </w:r>
           </w:p>
         </w:tc>
@@ -1459,7 +1459,7 @@
                 <w:sz w:val="18"/>
                 <w:szCs w:val="18"/>
               </w:rPr>
-              <w:t xml:space="preserve">Rapporto di calcolo in PDF, archiviazione nella pratica, numero di registro, registro dei crediti.</w:t>
+              <w:t xml:space="preserve">Calcolo crediti: il risultato si azzera quando cambiano dati o Banca Dati Utenze, conferma solo dopo un nuovo «Calcola». Gestione utenti: password temporanea di almeno 10 caratteri con lettere e numeri, creazione annullata se non va a buon fine, nessun accesso ai dati prima del cambio password.</w:t>
             </w:r>
           </w:p>
         </w:tc>
@@ -1529,7 +1529,7 @@
                 <w:sz w:val="18"/>
                 <w:szCs w:val="18"/>
               </w:rPr>
-              <w:t xml:space="preserve">1.2</w:t>
+              <w:t xml:space="preserve">1.3</w:t>
             </w:r>
           </w:p>
         </w:tc>
@@ -1593,7 +1593,7 @@
                 <w:sz w:val="18"/>
                 <w:szCs w:val="18"/>
               </w:rPr>
-              <w:t xml:space="preserve">Calcolo crediti: importare il tracciato nel calcolo (dai documenti della pratica o dal computer), singole letture, blocco dei dati personali, controlli di coerenza.</w:t>
+              <w:t xml:space="preserve">Rapporto di calcolo in PDF, archiviazione nella pratica, numero di registro, registro dei crediti.</w:t>
             </w:r>
           </w:p>
         </w:tc>
@@ -1663,7 +1663,7 @@
                 <w:sz w:val="18"/>
                 <w:szCs w:val="18"/>
               </w:rPr>
-              <w:t xml:space="preserve">1.1</w:t>
+              <w:t xml:space="preserve">1.2</w:t>
             </w:r>
           </w:p>
         </w:tc>
@@ -1729,7 +1729,7 @@
                 <w:sz w:val="18"/>
                 <w:szCs w:val="18"/>
               </w:rPr>
-              <w:t xml:space="preserve">Note di fase, Ente di Validazione della pratica, consultazione sulla pagina pubblica con conferma dell'email, moderazione con autori e allegati, errata corrige; nuovo capitolo Messaggi con il Comune; pagamenti visibili al Comune; Impostazioni: Enti di Validazione e Modelli di documento; notifiche aggiornate.</w:t>
+              <w:t xml:space="preserve">Calcolo crediti: importare il tracciato nel calcolo (dai documenti della pratica o dal computer), singole letture, blocco dei dati personali, controlli di coerenza.</w:t>
             </w:r>
           </w:p>
         </w:tc>
@@ -1799,6 +1799,140 @@
                 <w:sz w:val="18"/>
                 <w:szCs w:val="18"/>
               </w:rPr>
+              <w:t xml:space="preserve">1.1</w:t>
+            </w:r>
+          </w:p>
+        </w:tc>
+        <w:tc>
+          <w:tcPr>
+            <w:tcW w:type="dxa" w:w="1300"/>
+            <w:tcBorders>
+              <w:top w:val="single" w:color="D9D4C5" w:sz="4"/>
+              <w:left w:val="single" w:color="D9D4C5" w:sz="4"/>
+              <w:bottom w:val="single" w:color="D9D4C5" w:sz="4"/>
+              <w:right w:val="single" w:color="D9D4C5" w:sz="4"/>
+            </w:tcBorders>
+            <w:tcMar>
+              <w:top w:type="dxa" w:w="70"/>
+              <w:left w:type="dxa" w:w="110"/>
+              <w:bottom w:type="dxa" w:w="70"/>
+              <w:right w:type="dxa" w:w="110"/>
+            </w:tcMar>
+            <w:vAlign w:val="center"/>
+          </w:tcPr>
+          <w:p>
+            <w:pPr>
+              <w:spacing w:after="0" w:before="0"/>
+            </w:pPr>
+            <w:r>
+              <w:rPr>
+                <w:rFonts w:ascii="Arial" w:cs="Arial" w:eastAsia="Arial" w:hAnsi="Arial"/>
+                <w:color w:val="1B2118"/>
+                <w:sz w:val="18"/>
+                <w:szCs w:val="18"/>
+              </w:rPr>
+              <w:t xml:space="preserve">18/10/2026</w:t>
+            </w:r>
+          </w:p>
+        </w:tc>
+        <w:tc>
+          <w:tcPr>
+            <w:tcW w:type="dxa" w:w="5538"/>
+            <w:tcBorders>
+              <w:top w:val="single" w:color="D9D4C5" w:sz="4"/>
+              <w:left w:val="single" w:color="D9D4C5" w:sz="4"/>
+              <w:bottom w:val="single" w:color="D9D4C5" w:sz="4"/>
+              <w:right w:val="single" w:color="D9D4C5" w:sz="4"/>
+            </w:tcBorders>
+            <w:tcMar>
+              <w:top w:type="dxa" w:w="70"/>
+              <w:left w:type="dxa" w:w="110"/>
+              <w:bottom w:type="dxa" w:w="70"/>
+              <w:right w:type="dxa" w:w="110"/>
+            </w:tcMar>
+            <w:vAlign w:val="center"/>
+          </w:tcPr>
+          <w:p>
+            <w:pPr>
+              <w:spacing w:after="0" w:before="0"/>
+            </w:pPr>
+            <w:r>
+              <w:rPr>
+                <w:rFonts w:ascii="Arial" w:cs="Arial" w:eastAsia="Arial" w:hAnsi="Arial"/>
+                <w:color w:val="1B2118"/>
+                <w:sz w:val="18"/>
+                <w:szCs w:val="18"/>
+              </w:rPr>
+              <w:t xml:space="preserve">Note di fase, Ente di Validazione della pratica, consultazione sulla pagina pubblica con conferma dell'email, moderazione con autori e allegati, errata corrige; nuovo capitolo Messaggi con il Comune; pagamenti visibili al Comune; Impostazioni: Enti di Validazione e Modelli di documento; notifiche aggiornate.</w:t>
+            </w:r>
+          </w:p>
+        </w:tc>
+        <w:tc>
+          <w:tcPr>
+            <w:tcW w:type="dxa" w:w="2000"/>
+            <w:tcBorders>
+              <w:top w:val="single" w:color="D9D4C5" w:sz="4"/>
+              <w:left w:val="single" w:color="D9D4C5" w:sz="4"/>
+              <w:bottom w:val="single" w:color="D9D4C5" w:sz="4"/>
+              <w:right w:val="single" w:color="D9D4C5" w:sz="4"/>
+            </w:tcBorders>
+            <w:tcMar>
+              <w:top w:type="dxa" w:w="70"/>
+              <w:left w:type="dxa" w:w="110"/>
+              <w:bottom w:type="dxa" w:w="70"/>
+              <w:right w:type="dxa" w:w="110"/>
+            </w:tcMar>
+            <w:vAlign w:val="center"/>
+          </w:tcPr>
+          <w:p>
+            <w:pPr>
+              <w:spacing w:after="0" w:before="0"/>
+            </w:pPr>
+            <w:r>
+              <w:rPr>
+                <w:rFonts w:ascii="Arial" w:cs="Arial" w:eastAsia="Arial" w:hAnsi="Arial"/>
+                <w:color w:val="1B2118"/>
+                <w:sz w:val="18"/>
+                <w:szCs w:val="18"/>
+              </w:rPr>
+              <w:t xml:space="preserve">Fondazione Operate</w:t>
+            </w:r>
+          </w:p>
+        </w:tc>
+      </w:tr>
+      <w:tr>
+        <w:trPr>
+          <w:cantSplit/>
+        </w:trPr>
+        <w:tc>
+          <w:tcPr>
+            <w:tcW w:type="dxa" w:w="800"/>
+            <w:tcBorders>
+              <w:top w:val="single" w:color="D9D4C5" w:sz="4"/>
+              <w:left w:val="single" w:color="D9D4C5" w:sz="4"/>
+              <w:bottom w:val="single" w:color="D9D4C5" w:sz="4"/>
+              <w:right w:val="single" w:color="D9D4C5" w:sz="4"/>
+            </w:tcBorders>
+            <w:shd w:fill="F6F4EE" w:color="auto" w:val="clear"/>
+            <w:tcMar>
+              <w:top w:type="dxa" w:w="70"/>
+              <w:left w:type="dxa" w:w="110"/>
+              <w:bottom w:type="dxa" w:w="70"/>
+              <w:right w:type="dxa" w:w="110"/>
+            </w:tcMar>
+            <w:vAlign w:val="center"/>
+          </w:tcPr>
+          <w:p>
+            <w:pPr>
+              <w:spacing w:after="0" w:before="0"/>
+            </w:pPr>
+            <w:r>
+              <w:rPr>
+                <w:rFonts w:ascii="Arial" w:cs="Arial" w:eastAsia="Arial" w:hAnsi="Arial"/>
+                <w:color w:val="1B2118"/>
+                <w:sz w:val="18"/>
+                <w:szCs w:val="18"/>
+              </w:rPr>
               <w:t xml:space="preserve">1.0</w:t>
             </w:r>
           </w:p>
@@ -1812,6 +1946,7 @@
               <w:bottom w:val="single" w:color="D9D4C5" w:sz="4"/>
               <w:right w:val="single" w:color="D9D4C5" w:sz="4"/>
             </w:tcBorders>
+            <w:shd w:fill="F6F4EE" w:color="auto" w:val="clear"/>
             <w:tcMar>
               <w:top w:type="dxa" w:w="70"/>
               <w:left w:type="dxa" w:w="110"/>
@@ -1844,6 +1979,7 @@
               <w:bottom w:val="single" w:color="D9D4C5" w:sz="4"/>
               <w:right w:val="single" w:color="D9D4C5" w:sz="4"/>
             </w:tcBorders>
+            <w:shd w:fill="F6F4EE" w:color="auto" w:val="clear"/>
             <w:tcMar>
               <w:top w:type="dxa" w:w="70"/>
               <w:left w:type="dxa" w:w="110"/>
@@ -1876,6 +2012,7 @@
               <w:bottom w:val="single" w:color="D9D4C5" w:sz="4"/>
               <w:right w:val="single" w:color="D9D4C5" w:sz="4"/>
             </w:tcBorders>
+            <w:shd w:fill="F6F4EE" w:color="auto" w:val="clear"/>
             <w:tcMar>
               <w:top w:type="dxa" w:w="70"/>
               <w:left w:type="dxa" w:w="110"/>
@@ -1917,7 +2054,7 @@
           <w:sz w:val="20"/>
           <w:szCs w:val="20"/>
         </w:rPr>
-        <w:t xml:space="preserve">Questo documento descrive il portale alla revisione 1.8 del 19/10/2026. A ogni modifica del portale il manuale viene aggiornato e la revisione incrementata; la versione corrente si scarica dall'area Documentazione del portale (solo Amministratori).</w:t>
+        <w:t xml:space="preserve">Questo documento descrive il portale alla revisione 1.9 del 19/10/2026. A ogni modifica del portale il manuale viene aggiornato e la revisione incrementata; la versione corrente si scarica dall'area Documentazione del portale (solo Amministratori).</w:t>
       </w:r>
     </w:p>
     <w:p>
@@ -4468,7 +4605,7 @@
         </w:rPr>
         <w:t xml:space="preserve">Si accede da </w:t>
       </w:r>
-      <w:hyperlink w:history="1" r:id="rIdgdmcrgli0vd0zvmky3stf">
+      <w:hyperlink w:history="1" r:id="rIdumohah5f3vr68lypoaztu">
         <w:r>
           <w:rPr>
             <w:rFonts w:ascii="Arial" w:cs="Arial" w:eastAsia="Arial" w:hAnsi="Arial"/>
@@ -20322,7 +20459,7 @@
           <w:sz w:val="21"/>
           <w:szCs w:val="21"/>
         </w:rPr>
-        <w:t xml:space="preserve">. Valori iniziali: soggetto promotore Studio Associato Wastelab (Guida 3.1), in attesa dell'incarico al soggetto giuridico che gestirà la piattaforma; email info@carbonwasteprint.com; sito www.carbonwasteprint.com; PEC operate@pec.it (dal 19/10/2026). Tra i modelli di documento sono già pubblicati, come «Documento del Programma», gli otto documenti ufficiali v1.2 (Guida, Definizioni, Normativa, Standard, Metodologia, Politica di reclamo, Schema tariffario, Gestione della qualità dei dati), e il PDF della Metodologia è collegato alla metodologia approvata. Cambiate i campi e premete </w:t>
+        <w:t xml:space="preserve">. Valori iniziali: soggetto promotore Fondazione Operate, gestore in esclusiva del Programma (parte commerciale e parte tecnologica, portale CWP) per conferimento dello Studio Associato Wastelab, proprietario del Programma (dal 19/10/2026); email info@carbonwasteprint.com; sito www.carbonwasteprint.com; PEC operate@pec.it (dal 19/10/2026). Tra i modelli di documento sono già pubblicati, come «Documento del Programma», gli otto documenti ufficiali v1.2 (Guida, Definizioni, Normativa, Standard, Metodologia, Politica di reclamo, Schema tariffario, Gestione della qualità dei dati), e il PDF della Metodologia è collegato alla metodologia approvata. Cambiate i campi e premete </w:t>
       </w:r>
       <w:r>
         <w:rPr>
@@ -35873,56 +36010,6 @@
           <w:szCs w:val="21"/>
         </w:rPr>
         <w:t xml:space="preserve"> (Guida 3.9): serve l'adesione della Fondazione come fornitore di servizi (con AgID o con un aggregatore accreditato) e il relativo contratto. Intanto chi partecipa al feedback pubblico si identifica con l'email confermata.</w:t>
-      </w:r>
-    </w:p>
-    <w:p>
-      <w:pPr>
-        <w:pStyle w:val="ListParagraph"/>
-        <w:numPr>
-          <w:ilvl w:val="0"/>
-          <w:numId w:val="2"/>
-        </w:numPr>
-        <w:spacing w:after="70" w:line="290"/>
-      </w:pPr>
-      <w:r>
-        <w:rPr>
-          <w:rFonts w:ascii="Arial" w:cs="Arial" w:eastAsia="Arial" w:hAnsi="Arial"/>
-          <w:b/>
-          <w:bCs/>
-          <w:color w:val="1B2118"/>
-          <w:sz w:val="21"/>
-          <w:szCs w:val="21"/>
-        </w:rPr>
-        <w:t xml:space="preserve">Incarico formale del soggetto promotore del programma</w:t>
-      </w:r>
-      <w:r>
-        <w:rPr>
-          <w:rFonts w:ascii="Arial" w:cs="Arial" w:eastAsia="Arial" w:hAnsi="Arial"/>
-          <w:color w:val="1B2118"/>
-          <w:sz w:val="21"/>
-          <w:szCs w:val="21"/>
-        </w:rPr>
-        <w:t xml:space="preserve"> (Guida 3.1): è un atto dello Studio Associato Wastelab, non del portale; quando sarà formalizzato si aggiorna il testo in </w:t>
-      </w:r>
-      <w:r>
-        <w:rPr>
-          <w:rFonts w:ascii="Arial" w:cs="Arial" w:eastAsia="Arial" w:hAnsi="Arial"/>
-          <w:i/>
-          <w:iCs/>
-          <w:color w:val="1B2118"/>
-          <w:sz w:val="21"/>
-          <w:szCs w:val="21"/>
-        </w:rPr>
-        <w:t xml:space="preserve">Impostazioni → Il Programma</w:t>
-      </w:r>
-      <w:r>
-        <w:rPr>
-          <w:rFonts w:ascii="Arial" w:cs="Arial" w:eastAsia="Arial" w:hAnsi="Arial"/>
-          <w:color w:val="1B2118"/>
-          <w:sz w:val="21"/>
-          <w:szCs w:val="21"/>
-        </w:rPr>
-        <w:t xml:space="preserve">.</w:t>
       </w:r>
     </w:p>
     <w:p>
@@ -36254,7 +36341,7 @@
         <w:szCs w:val="16"/>
       </w:rPr>
       <w:tab/>
-      <w:t xml:space="preserve">Manuale Amministratore · Rev. 1.8 · 19/10/2026</w:t>
+      <w:t xml:space="preserve">Manuale Amministratore · Rev. 1.9 · 19/10/2026</w:t>
     </w:r>
   </w:p>
 </w:hdr>
@@ -36319,7 +36406,7 @@
         <w:szCs w:val="16"/>
       </w:rPr>
       <w:tab/>
-      <w:t xml:space="preserve">Manuale Amministratore · Rev. 1.8 · 19/10/2026</w:t>
+      <w:t xml:space="preserve">Manuale Amministratore · Rev. 1.9 · 19/10/2026</w:t>
     </w:r>
   </w:p>
 </w:hdr>

</xml_diff>

<commit_message>
Istruzioni di ripristino (rev. 1.0): copie di sicurezza e ripristino di GitHub, Vercel, Supabase, Resend e progetto Claude; Amministratore 2.0, Registro 2.4
Co-Authored-By: Claude Opus 5.5 <noreply@anthropic.com>
Claude-Session: https://claude.ai/code/session_01E8XCbEeVHWVP3hntUZ6kZ1
</commit_message>
<xml_diff>
--- a/public/documentazione/Manuale_Amministratore_Portale_CWP.docx
+++ b/public/documentazione/Manuale_Amministratore_Portale_CWP.docx
@@ -302,7 +302,7 @@
                 <w:sz w:val="20"/>
                 <w:szCs w:val="20"/>
               </w:rPr>
-              <w:t xml:space="preserve">Rev. 1.9</w:t>
+              <w:t xml:space="preserve">Rev. 2.0</w:t>
             </w:r>
           </w:p>
         </w:tc>
@@ -719,7 +719,7 @@
                 <w:sz w:val="18"/>
                 <w:szCs w:val="18"/>
               </w:rPr>
-              <w:t xml:space="preserve">1.9</w:t>
+              <w:t xml:space="preserve">2.0</w:t>
             </w:r>
           </w:p>
         </w:tc>
@@ -783,7 +783,7 @@
                 <w:sz w:val="18"/>
                 <w:szCs w:val="18"/>
               </w:rPr>
-              <w:t xml:space="preserve">Fondazione Operate soggetto promotore del programma (esclusiva conferita da Wastelab).</w:t>
+              <w:t xml:space="preserve">Copie di sicurezza e ripristino: rimando alle Istruzioni di ripristino e punti essenziali (capitolo Manutenzione ed emergenze).</w:t>
             </w:r>
           </w:p>
         </w:tc>
@@ -853,7 +853,7 @@
                 <w:sz w:val="18"/>
                 <w:szCs w:val="18"/>
               </w:rPr>
-              <w:t xml:space="preserve">1.8</w:t>
+              <w:t xml:space="preserve">1.9</w:t>
             </w:r>
           </w:p>
         </w:tc>
@@ -919,7 +919,7 @@
                 <w:sz w:val="18"/>
                 <w:szCs w:val="18"/>
               </w:rPr>
-              <w:t xml:space="preserve">PEC del Programma e documenti ufficiali già pubblicati sulla pagina pubblica.</w:t>
+              <w:t xml:space="preserve">Fondazione Operate soggetto promotore del programma (esclusiva conferita da Wastelab).</w:t>
             </w:r>
           </w:p>
         </w:tc>
@@ -989,7 +989,7 @@
                 <w:sz w:val="18"/>
                 <w:szCs w:val="18"/>
               </w:rPr>
-              <w:t xml:space="preserve">1.7</w:t>
+              <w:t xml:space="preserve">1.8</w:t>
             </w:r>
           </w:p>
         </w:tc>
@@ -1021,7 +1021,7 @@
                 <w:sz w:val="18"/>
                 <w:szCs w:val="18"/>
               </w:rPr>
-              <w:t xml:space="preserve">18/10/2026</w:t>
+              <w:t xml:space="preserve">19/10/2026</w:t>
             </w:r>
           </w:p>
         </w:tc>
@@ -1053,7 +1053,7 @@
                 <w:sz w:val="18"/>
                 <w:szCs w:val="18"/>
               </w:rPr>
-              <w:t xml:space="preserve">Allineamento ai documenti ufficiali del Programma (script 22-24): Rapporto a 7 fasi, feedback pubblico, stati del Programma, dati del progetto e territorio ISTAT, ritiro e rientro, account unico e delegati, registri, tariffe e sospensione, accuratezza e accertamenti, informazioni del Programma e metodologie, modelli pubblici; nuovi capitoli Crediti emessi, Reclami, Pagina pubblica; qualità dei dati nel calcolo.</w:t>
+              <w:t xml:space="preserve">PEC del Programma e documenti ufficiali già pubblicati sulla pagina pubblica.</w:t>
             </w:r>
           </w:p>
         </w:tc>
@@ -1123,7 +1123,7 @@
                 <w:sz w:val="18"/>
                 <w:szCs w:val="18"/>
               </w:rPr>
-              <w:t xml:space="preserve">1.6</w:t>
+              <w:t xml:space="preserve">1.7</w:t>
             </w:r>
           </w:p>
         </w:tc>
@@ -1189,7 +1189,7 @@
                 <w:sz w:val="18"/>
                 <w:szCs w:val="18"/>
               </w:rPr>
-              <w:t xml:space="preserve">Calcolo crediti: descrizione corretta del buffer (somma delle voci delle Tabelle 15 e 16, più il 20% con le sole utenze virtuose, al massimo 80%).</w:t>
+              <w:t xml:space="preserve">Allineamento ai documenti ufficiali del Programma (script 22-24): Rapporto a 7 fasi, feedback pubblico, stati del Programma, dati del progetto e territorio ISTAT, ritiro e rientro, account unico e delegati, registri, tariffe e sospensione, accuratezza e accertamenti, informazioni del Programma e metodologie, modelli pubblici; nuovi capitoli Crediti emessi, Reclami, Pagina pubblica; qualità dei dati nel calcolo.</w:t>
             </w:r>
           </w:p>
         </w:tc>
@@ -1259,7 +1259,7 @@
                 <w:sz w:val="18"/>
                 <w:szCs w:val="18"/>
               </w:rPr>
-              <w:t xml:space="preserve">1.5</w:t>
+              <w:t xml:space="preserve">1.6</w:t>
             </w:r>
           </w:p>
         </w:tc>
@@ -1323,7 +1323,7 @@
                 <w:sz w:val="18"/>
                 <w:szCs w:val="18"/>
               </w:rPr>
-              <w:t xml:space="preserve">Nuova pagina Anagrafiche (Organizzazioni ed Enti, anche per gli Operatori); Rapporti con 4 fasi e durate proprie; documenti richiesti per fase; consultazione con documento bloccato, osservazioni numerate e motivazione; conservazione per 10 anni; fascicolo con riepilogo PDF e nuove cartelle.</w:t>
+              <w:t xml:space="preserve">Calcolo crediti: descrizione corretta del buffer (somma delle voci delle Tabelle 15 e 16, più il 20% con le sole utenze virtuose, al massimo 80%).</w:t>
             </w:r>
           </w:p>
         </w:tc>
@@ -1393,7 +1393,7 @@
                 <w:sz w:val="18"/>
                 <w:szCs w:val="18"/>
               </w:rPr>
-              <w:t xml:space="preserve">1.4</w:t>
+              <w:t xml:space="preserve">1.5</w:t>
             </w:r>
           </w:p>
         </w:tc>
@@ -1459,7 +1459,7 @@
                 <w:sz w:val="18"/>
                 <w:szCs w:val="18"/>
               </w:rPr>
-              <w:t xml:space="preserve">Calcolo crediti: il risultato si azzera quando cambiano dati o Banca Dati Utenze, conferma solo dopo un nuovo «Calcola». Gestione utenti: password temporanea di almeno 10 caratteri con lettere e numeri, creazione annullata se non va a buon fine, nessun accesso ai dati prima del cambio password.</w:t>
+              <w:t xml:space="preserve">Nuova pagina Anagrafiche (Organizzazioni ed Enti, anche per gli Operatori); Rapporti con 4 fasi e durate proprie; documenti richiesti per fase; consultazione con documento bloccato, osservazioni numerate e motivazione; conservazione per 10 anni; fascicolo con riepilogo PDF e nuove cartelle.</w:t>
             </w:r>
           </w:p>
         </w:tc>
@@ -1529,7 +1529,7 @@
                 <w:sz w:val="18"/>
                 <w:szCs w:val="18"/>
               </w:rPr>
-              <w:t xml:space="preserve">1.3</w:t>
+              <w:t xml:space="preserve">1.4</w:t>
             </w:r>
           </w:p>
         </w:tc>
@@ -1593,7 +1593,7 @@
                 <w:sz w:val="18"/>
                 <w:szCs w:val="18"/>
               </w:rPr>
-              <w:t xml:space="preserve">Rapporto di calcolo in PDF, archiviazione nella pratica, numero di registro, registro dei crediti.</w:t>
+              <w:t xml:space="preserve">Calcolo crediti: il risultato si azzera quando cambiano dati o Banca Dati Utenze, conferma solo dopo un nuovo «Calcola». Gestione utenti: password temporanea di almeno 10 caratteri con lettere e numeri, creazione annullata se non va a buon fine, nessun accesso ai dati prima del cambio password.</w:t>
             </w:r>
           </w:p>
         </w:tc>
@@ -1663,7 +1663,7 @@
                 <w:sz w:val="18"/>
                 <w:szCs w:val="18"/>
               </w:rPr>
-              <w:t xml:space="preserve">1.2</w:t>
+              <w:t xml:space="preserve">1.3</w:t>
             </w:r>
           </w:p>
         </w:tc>
@@ -1729,7 +1729,7 @@
                 <w:sz w:val="18"/>
                 <w:szCs w:val="18"/>
               </w:rPr>
-              <w:t xml:space="preserve">Calcolo crediti: importare il tracciato nel calcolo (dai documenti della pratica o dal computer), singole letture, blocco dei dati personali, controlli di coerenza.</w:t>
+              <w:t xml:space="preserve">Rapporto di calcolo in PDF, archiviazione nella pratica, numero di registro, registro dei crediti.</w:t>
             </w:r>
           </w:p>
         </w:tc>
@@ -1799,7 +1799,7 @@
                 <w:sz w:val="18"/>
                 <w:szCs w:val="18"/>
               </w:rPr>
-              <w:t xml:space="preserve">1.1</w:t>
+              <w:t xml:space="preserve">1.2</w:t>
             </w:r>
           </w:p>
         </w:tc>
@@ -1863,7 +1863,7 @@
                 <w:sz w:val="18"/>
                 <w:szCs w:val="18"/>
               </w:rPr>
-              <w:t xml:space="preserve">Note di fase, Ente di Validazione della pratica, consultazione sulla pagina pubblica con conferma dell'email, moderazione con autori e allegati, errata corrige; nuovo capitolo Messaggi con il Comune; pagamenti visibili al Comune; Impostazioni: Enti di Validazione e Modelli di documento; notifiche aggiornate.</w:t>
+              <w:t xml:space="preserve">Calcolo crediti: importare il tracciato nel calcolo (dai documenti della pratica o dal computer), singole letture, blocco dei dati personali, controlli di coerenza.</w:t>
             </w:r>
           </w:p>
         </w:tc>
@@ -1933,6 +1933,142 @@
                 <w:sz w:val="18"/>
                 <w:szCs w:val="18"/>
               </w:rPr>
+              <w:t xml:space="preserve">1.1</w:t>
+            </w:r>
+          </w:p>
+        </w:tc>
+        <w:tc>
+          <w:tcPr>
+            <w:tcW w:type="dxa" w:w="1300"/>
+            <w:tcBorders>
+              <w:top w:val="single" w:color="D9D4C5" w:sz="4"/>
+              <w:left w:val="single" w:color="D9D4C5" w:sz="4"/>
+              <w:bottom w:val="single" w:color="D9D4C5" w:sz="4"/>
+              <w:right w:val="single" w:color="D9D4C5" w:sz="4"/>
+            </w:tcBorders>
+            <w:shd w:fill="F6F4EE" w:color="auto" w:val="clear"/>
+            <w:tcMar>
+              <w:top w:type="dxa" w:w="70"/>
+              <w:left w:type="dxa" w:w="110"/>
+              <w:bottom w:type="dxa" w:w="70"/>
+              <w:right w:type="dxa" w:w="110"/>
+            </w:tcMar>
+            <w:vAlign w:val="center"/>
+          </w:tcPr>
+          <w:p>
+            <w:pPr>
+              <w:spacing w:after="0" w:before="0"/>
+            </w:pPr>
+            <w:r>
+              <w:rPr>
+                <w:rFonts w:ascii="Arial" w:cs="Arial" w:eastAsia="Arial" w:hAnsi="Arial"/>
+                <w:color w:val="1B2118"/>
+                <w:sz w:val="18"/>
+                <w:szCs w:val="18"/>
+              </w:rPr>
+              <w:t xml:space="preserve">18/10/2026</w:t>
+            </w:r>
+          </w:p>
+        </w:tc>
+        <w:tc>
+          <w:tcPr>
+            <w:tcW w:type="dxa" w:w="5538"/>
+            <w:tcBorders>
+              <w:top w:val="single" w:color="D9D4C5" w:sz="4"/>
+              <w:left w:val="single" w:color="D9D4C5" w:sz="4"/>
+              <w:bottom w:val="single" w:color="D9D4C5" w:sz="4"/>
+              <w:right w:val="single" w:color="D9D4C5" w:sz="4"/>
+            </w:tcBorders>
+            <w:shd w:fill="F6F4EE" w:color="auto" w:val="clear"/>
+            <w:tcMar>
+              <w:top w:type="dxa" w:w="70"/>
+              <w:left w:type="dxa" w:w="110"/>
+              <w:bottom w:type="dxa" w:w="70"/>
+              <w:right w:type="dxa" w:w="110"/>
+            </w:tcMar>
+            <w:vAlign w:val="center"/>
+          </w:tcPr>
+          <w:p>
+            <w:pPr>
+              <w:spacing w:after="0" w:before="0"/>
+            </w:pPr>
+            <w:r>
+              <w:rPr>
+                <w:rFonts w:ascii="Arial" w:cs="Arial" w:eastAsia="Arial" w:hAnsi="Arial"/>
+                <w:color w:val="1B2118"/>
+                <w:sz w:val="18"/>
+                <w:szCs w:val="18"/>
+              </w:rPr>
+              <w:t xml:space="preserve">Note di fase, Ente di Validazione della pratica, consultazione sulla pagina pubblica con conferma dell'email, moderazione con autori e allegati, errata corrige; nuovo capitolo Messaggi con il Comune; pagamenti visibili al Comune; Impostazioni: Enti di Validazione e Modelli di documento; notifiche aggiornate.</w:t>
+            </w:r>
+          </w:p>
+        </w:tc>
+        <w:tc>
+          <w:tcPr>
+            <w:tcW w:type="dxa" w:w="2000"/>
+            <w:tcBorders>
+              <w:top w:val="single" w:color="D9D4C5" w:sz="4"/>
+              <w:left w:val="single" w:color="D9D4C5" w:sz="4"/>
+              <w:bottom w:val="single" w:color="D9D4C5" w:sz="4"/>
+              <w:right w:val="single" w:color="D9D4C5" w:sz="4"/>
+            </w:tcBorders>
+            <w:shd w:fill="F6F4EE" w:color="auto" w:val="clear"/>
+            <w:tcMar>
+              <w:top w:type="dxa" w:w="70"/>
+              <w:left w:type="dxa" w:w="110"/>
+              <w:bottom w:type="dxa" w:w="70"/>
+              <w:right w:type="dxa" w:w="110"/>
+            </w:tcMar>
+            <w:vAlign w:val="center"/>
+          </w:tcPr>
+          <w:p>
+            <w:pPr>
+              <w:spacing w:after="0" w:before="0"/>
+            </w:pPr>
+            <w:r>
+              <w:rPr>
+                <w:rFonts w:ascii="Arial" w:cs="Arial" w:eastAsia="Arial" w:hAnsi="Arial"/>
+                <w:color w:val="1B2118"/>
+                <w:sz w:val="18"/>
+                <w:szCs w:val="18"/>
+              </w:rPr>
+              <w:t xml:space="preserve">Fondazione Operate</w:t>
+            </w:r>
+          </w:p>
+        </w:tc>
+      </w:tr>
+      <w:tr>
+        <w:trPr>
+          <w:cantSplit/>
+        </w:trPr>
+        <w:tc>
+          <w:tcPr>
+            <w:tcW w:type="dxa" w:w="800"/>
+            <w:tcBorders>
+              <w:top w:val="single" w:color="D9D4C5" w:sz="4"/>
+              <w:left w:val="single" w:color="D9D4C5" w:sz="4"/>
+              <w:bottom w:val="single" w:color="D9D4C5" w:sz="4"/>
+              <w:right w:val="single" w:color="D9D4C5" w:sz="4"/>
+            </w:tcBorders>
+            <w:tcMar>
+              <w:top w:type="dxa" w:w="70"/>
+              <w:left w:type="dxa" w:w="110"/>
+              <w:bottom w:type="dxa" w:w="70"/>
+              <w:right w:type="dxa" w:w="110"/>
+            </w:tcMar>
+            <w:vAlign w:val="center"/>
+          </w:tcPr>
+          <w:p>
+            <w:pPr>
+              <w:spacing w:after="0" w:before="0"/>
+            </w:pPr>
+            <w:r>
+              <w:rPr>
+                <w:rFonts w:ascii="Arial" w:cs="Arial" w:eastAsia="Arial" w:hAnsi="Arial"/>
+                <w:color w:val="1B2118"/>
+                <w:sz w:val="18"/>
+                <w:szCs w:val="18"/>
+              </w:rPr>
               <w:t xml:space="preserve">1.0</w:t>
             </w:r>
           </w:p>
@@ -1946,7 +2082,6 @@
               <w:bottom w:val="single" w:color="D9D4C5" w:sz="4"/>
               <w:right w:val="single" w:color="D9D4C5" w:sz="4"/>
             </w:tcBorders>
-            <w:shd w:fill="F6F4EE" w:color="auto" w:val="clear"/>
             <w:tcMar>
               <w:top w:type="dxa" w:w="70"/>
               <w:left w:type="dxa" w:w="110"/>
@@ -1979,7 +2114,6 @@
               <w:bottom w:val="single" w:color="D9D4C5" w:sz="4"/>
               <w:right w:val="single" w:color="D9D4C5" w:sz="4"/>
             </w:tcBorders>
-            <w:shd w:fill="F6F4EE" w:color="auto" w:val="clear"/>
             <w:tcMar>
               <w:top w:type="dxa" w:w="70"/>
               <w:left w:type="dxa" w:w="110"/>
@@ -2012,7 +2146,6 @@
               <w:bottom w:val="single" w:color="D9D4C5" w:sz="4"/>
               <w:right w:val="single" w:color="D9D4C5" w:sz="4"/>
             </w:tcBorders>
-            <w:shd w:fill="F6F4EE" w:color="auto" w:val="clear"/>
             <w:tcMar>
               <w:top w:type="dxa" w:w="70"/>
               <w:left w:type="dxa" w:w="110"/>
@@ -2054,7 +2187,7 @@
           <w:sz w:val="20"/>
           <w:szCs w:val="20"/>
         </w:rPr>
-        <w:t xml:space="preserve">Questo documento descrive il portale alla revisione 1.9 del 19/10/2026. A ogni modifica del portale il manuale viene aggiornato e la revisione incrementata; la versione corrente si scarica dall'area Documentazione del portale (solo Amministratori).</w:t>
+        <w:t xml:space="preserve">Questo documento descrive il portale alla revisione 2.0 del 19/10/2026. A ogni modifica del portale il manuale viene aggiornato e la revisione incrementata; la versione corrente si scarica dall'area Documentazione del portale (solo Amministratori).</w:t>
       </w:r>
     </w:p>
     <w:p>
@@ -4605,7 +4738,7 @@
         </w:rPr>
         <w:t xml:space="preserve">Si accede da </w:t>
       </w:r>
-      <w:hyperlink w:history="1" r:id="rIdumohah5f3vr68lypoaztu">
+      <w:hyperlink w:history="1" r:id="rIdepd1lwxmteo5xxobp-4zi">
         <w:r>
           <w:rPr>
             <w:rFonts w:ascii="Arial" w:cs="Arial" w:eastAsia="Arial" w:hAnsi="Arial"/>
@@ -35943,6 +36076,247 @@
           <w:szCs w:val="21"/>
         </w:rPr>
         <w:t xml:space="preserve"> Le chiavi dei servizi si inseriscono solo nelle rispettive dashboard. Non vanno mai scritte in email, chat o documenti.</w:t>
+      </w:r>
+    </w:p>
+    <w:p>
+      <w:pPr>
+        <w:spacing w:after="140" w:line="300"/>
+      </w:pPr>
+      <w:r>
+        <w:rPr>
+          <w:rFonts w:ascii="Arial" w:cs="Arial" w:eastAsia="Arial" w:hAnsi="Arial"/>
+          <w:b/>
+          <w:bCs/>
+          <w:color w:val="1B2118"/>
+          <w:sz w:val="21"/>
+          <w:szCs w:val="21"/>
+        </w:rPr>
+        <w:t xml:space="preserve">Copie di sicurezza e ripristino.</w:t>
+      </w:r>
+      <w:r>
+        <w:rPr>
+          <w:rFonts w:ascii="Arial" w:cs="Arial" w:eastAsia="Arial" w:hAnsi="Arial"/>
+          <w:color w:val="1B2118"/>
+          <w:sz w:val="21"/>
+          <w:szCs w:val="21"/>
+        </w:rPr>
+        <w:t xml:space="preserve"> Le procedure complete sono in un documento a parte, le </w:t>
+      </w:r>
+      <w:r>
+        <w:rPr>
+          <w:rFonts w:ascii="Arial" w:cs="Arial" w:eastAsia="Arial" w:hAnsi="Arial"/>
+          <w:b/>
+          <w:bCs/>
+          <w:color w:val="1B2118"/>
+          <w:sz w:val="21"/>
+          <w:szCs w:val="21"/>
+        </w:rPr>
+        <w:t xml:space="preserve">Istruzioni di ripristino</w:t>
+      </w:r>
+      <w:r>
+        <w:rPr>
+          <w:rFonts w:ascii="Arial" w:cs="Arial" w:eastAsia="Arial" w:hAnsi="Arial"/>
+          <w:color w:val="1B2118"/>
+          <w:sz w:val="21"/>
+          <w:szCs w:val="21"/>
+        </w:rPr>
+        <w:t xml:space="preserve"> (pagina </w:t>
+      </w:r>
+      <w:r>
+        <w:rPr>
+          <w:rFonts w:ascii="Arial" w:cs="Arial" w:eastAsia="Arial" w:hAnsi="Arial"/>
+          <w:i/>
+          <w:iCs/>
+          <w:color w:val="1B2118"/>
+          <w:sz w:val="21"/>
+          <w:szCs w:val="21"/>
+        </w:rPr>
+        <w:t xml:space="preserve">Documentazione</w:t>
+      </w:r>
+      <w:r>
+        <w:rPr>
+          <w:rFonts w:ascii="Arial" w:cs="Arial" w:eastAsia="Arial" w:hAnsi="Arial"/>
+          <w:color w:val="1B2118"/>
+          <w:sz w:val="21"/>
+          <w:szCs w:val="21"/>
+        </w:rPr>
+        <w:t xml:space="preserve">, solo Amministratori; una copia è anche in ogni archivio di backup). Spiegano dove stanno codice e dati, quali copie fare e con che frequenza, e come rimettere in funzione GitHub, Vercel, Supabase, Resend e il progetto Claude. In sintesi:</w:t>
+      </w:r>
+    </w:p>
+    <w:p>
+      <w:pPr>
+        <w:pStyle w:val="ListParagraph"/>
+        <w:numPr>
+          <w:ilvl w:val="0"/>
+          <w:numId w:val="2"/>
+        </w:numPr>
+        <w:spacing w:after="70" w:line="290"/>
+      </w:pPr>
+      <w:r>
+        <w:rPr>
+          <w:rFonts w:ascii="Arial" w:cs="Arial" w:eastAsia="Arial" w:hAnsi="Arial"/>
+          <w:color w:val="1B2118"/>
+          <w:sz w:val="21"/>
+          <w:szCs w:val="21"/>
+        </w:rPr>
+        <w:t xml:space="preserve">a ogni rilascio importante si chiede a Claude l'archivio di backup completo e lo si conserva in due posti (computer e Google Drive);</w:t>
+      </w:r>
+    </w:p>
+    <w:p>
+      <w:pPr>
+        <w:pStyle w:val="ListParagraph"/>
+        <w:numPr>
+          <w:ilvl w:val="0"/>
+          <w:numId w:val="2"/>
+        </w:numPr>
+        <w:spacing w:after="70" w:line="290"/>
+      </w:pPr>
+      <w:r>
+        <w:rPr>
+          <w:rFonts w:ascii="Arial" w:cs="Arial" w:eastAsia="Arial" w:hAnsi="Arial"/>
+          <w:color w:val="1B2118"/>
+          <w:sz w:val="21"/>
+          <w:szCs w:val="21"/>
+        </w:rPr>
+        <w:t xml:space="preserve">le copie del database di Supabase non contengono i file caricati: i file si copiano a parte;</w:t>
+      </w:r>
+    </w:p>
+    <w:p>
+      <w:pPr>
+        <w:pStyle w:val="ListParagraph"/>
+        <w:numPr>
+          <w:ilvl w:val="0"/>
+          <w:numId w:val="2"/>
+        </w:numPr>
+        <w:spacing w:after="70" w:line="290"/>
+      </w:pPr>
+      <w:r>
+        <w:rPr>
+          <w:rFonts w:ascii="Arial" w:cs="Arial" w:eastAsia="Arial" w:hAnsi="Arial"/>
+          <w:color w:val="1B2118"/>
+          <w:sz w:val="21"/>
+          <w:szCs w:val="21"/>
+        </w:rPr>
+        <w:t xml:space="preserve">se un rilascio rompe qualcosa, su Vercel si ripubblica la versione precedente (</w:t>
+      </w:r>
+      <w:r>
+        <w:rPr>
+          <w:rFonts w:ascii="Arial" w:cs="Arial" w:eastAsia="Arial" w:hAnsi="Arial"/>
+          <w:i/>
+          <w:iCs/>
+          <w:color w:val="1B2118"/>
+          <w:sz w:val="21"/>
+          <w:szCs w:val="21"/>
+        </w:rPr>
+        <w:t xml:space="preserve">Deployments</w:t>
+      </w:r>
+      <w:r>
+        <w:rPr>
+          <w:rFonts w:ascii="Arial" w:cs="Arial" w:eastAsia="Arial" w:hAnsi="Arial"/>
+          <w:color w:val="1B2118"/>
+          <w:sz w:val="21"/>
+          <w:szCs w:val="21"/>
+        </w:rPr>
+        <w:t xml:space="preserve"> › </w:t>
+      </w:r>
+      <w:r>
+        <w:rPr>
+          <w:rFonts w:ascii="Arial" w:cs="Arial" w:eastAsia="Arial" w:hAnsi="Arial"/>
+          <w:i/>
+          <w:iCs/>
+          <w:color w:val="1B2118"/>
+          <w:sz w:val="21"/>
+          <w:szCs w:val="21"/>
+        </w:rPr>
+        <w:t xml:space="preserve">Promote to Production</w:t>
+      </w:r>
+      <w:r>
+        <w:rPr>
+          <w:rFonts w:ascii="Arial" w:cs="Arial" w:eastAsia="Arial" w:hAnsi="Arial"/>
+          <w:color w:val="1B2118"/>
+          <w:sz w:val="21"/>
+          <w:szCs w:val="21"/>
+        </w:rPr>
+        <w:t xml:space="preserve">);</w:t>
+      </w:r>
+    </w:p>
+    <w:p>
+      <w:pPr>
+        <w:pStyle w:val="ListParagraph"/>
+        <w:numPr>
+          <w:ilvl w:val="0"/>
+          <w:numId w:val="2"/>
+        </w:numPr>
+        <w:spacing w:after="70" w:line="290"/>
+      </w:pPr>
+      <w:r>
+        <w:rPr>
+          <w:rFonts w:ascii="Arial" w:cs="Arial" w:eastAsia="Arial" w:hAnsi="Arial"/>
+          <w:color w:val="1B2118"/>
+          <w:sz w:val="21"/>
+          <w:szCs w:val="21"/>
+        </w:rPr>
+        <w:t xml:space="preserve">un repository GitHub cancellato si recupera entro 90 giorni da </w:t>
+      </w:r>
+      <w:r>
+        <w:rPr>
+          <w:rFonts w:ascii="Arial" w:cs="Arial" w:eastAsia="Arial" w:hAnsi="Arial"/>
+          <w:i/>
+          <w:iCs/>
+          <w:color w:val="1B2118"/>
+          <w:sz w:val="21"/>
+          <w:szCs w:val="21"/>
+        </w:rPr>
+        <w:t xml:space="preserve">Settings</w:t>
+      </w:r>
+      <w:r>
+        <w:rPr>
+          <w:rFonts w:ascii="Arial" w:cs="Arial" w:eastAsia="Arial" w:hAnsi="Arial"/>
+          <w:color w:val="1B2118"/>
+          <w:sz w:val="21"/>
+          <w:szCs w:val="21"/>
+        </w:rPr>
+        <w:t xml:space="preserve"> › </w:t>
+      </w:r>
+      <w:r>
+        <w:rPr>
+          <w:rFonts w:ascii="Arial" w:cs="Arial" w:eastAsia="Arial" w:hAnsi="Arial"/>
+          <w:i/>
+          <w:iCs/>
+          <w:color w:val="1B2118"/>
+          <w:sz w:val="21"/>
+          <w:szCs w:val="21"/>
+        </w:rPr>
+        <w:t xml:space="preserve">Repositories</w:t>
+      </w:r>
+      <w:r>
+        <w:rPr>
+          <w:rFonts w:ascii="Arial" w:cs="Arial" w:eastAsia="Arial" w:hAnsi="Arial"/>
+          <w:color w:val="1B2118"/>
+          <w:sz w:val="21"/>
+          <w:szCs w:val="21"/>
+        </w:rPr>
+        <w:t xml:space="preserve"> › </w:t>
+      </w:r>
+      <w:r>
+        <w:rPr>
+          <w:rFonts w:ascii="Arial" w:cs="Arial" w:eastAsia="Arial" w:hAnsi="Arial"/>
+          <w:i/>
+          <w:iCs/>
+          <w:color w:val="1B2118"/>
+          <w:sz w:val="21"/>
+          <w:szCs w:val="21"/>
+        </w:rPr>
+        <w:t xml:space="preserve">Deleted repositories</w:t>
+      </w:r>
+      <w:r>
+        <w:rPr>
+          <w:rFonts w:ascii="Arial" w:cs="Arial" w:eastAsia="Arial" w:hAnsi="Arial"/>
+          <w:color w:val="1B2118"/>
+          <w:sz w:val="21"/>
+          <w:szCs w:val="21"/>
+        </w:rPr>
+        <w:t xml:space="preserve">.</w:t>
       </w:r>
     </w:p>
     <w:p>
@@ -36341,7 +36715,7 @@
         <w:szCs w:val="16"/>
       </w:rPr>
       <w:tab/>
-      <w:t xml:space="preserve">Manuale Amministratore · Rev. 1.9 · 19/10/2026</w:t>
+      <w:t xml:space="preserve">Manuale Amministratore · Rev. 2.0 · 19/10/2026</w:t>
     </w:r>
   </w:p>
 </w:hdr>
@@ -36406,7 +36780,7 @@
         <w:szCs w:val="16"/>
       </w:rPr>
       <w:tab/>
-      <w:t xml:space="preserve">Manuale Amministratore · Rev. 1.9 · 19/10/2026</w:t>
+      <w:t xml:space="preserve">Manuale Amministratore · Rev. 2.0 · 19/10/2026</w:t>
     </w:r>
   </w:p>
 </w:hdr>

</xml_diff>

<commit_message>
Simulatore di scenari (backlog 37) e assistente virtuale nei documenti: Utente 2.1, Amministratore 2.1, Test 1.9, Registro 2.5
Co-Authored-By: Claude Opus 5.5 <noreply@anthropic.com>
Claude-Session: https://claude.ai/code/session_01E8XCbEeVHWVP3hntUZ6kZ1
</commit_message>
<xml_diff>
--- a/public/documentazione/Manuale_Amministratore_Portale_CWP.docx
+++ b/public/documentazione/Manuale_Amministratore_Portale_CWP.docx
@@ -302,7 +302,7 @@
                 <w:sz w:val="20"/>
                 <w:szCs w:val="20"/>
               </w:rPr>
-              <w:t xml:space="preserve">Rev. 2.0</w:t>
+              <w:t xml:space="preserve">Rev. 2.1</w:t>
             </w:r>
           </w:p>
         </w:tc>
@@ -719,7 +719,7 @@
                 <w:sz w:val="18"/>
                 <w:szCs w:val="18"/>
               </w:rPr>
-              <w:t xml:space="preserve">2.0</w:t>
+              <w:t xml:space="preserve">2.1</w:t>
             </w:r>
           </w:p>
         </w:tc>
@@ -783,7 +783,7 @@
                 <w:sz w:val="18"/>
                 <w:szCs w:val="18"/>
               </w:rPr>
-              <w:t xml:space="preserve">Copie di sicurezza e ripristino: rimando alle Istruzioni di ripristino e punti essenziali (capitolo Manutenzione ed emergenze).</w:t>
+              <w:t xml:space="preserve">Funzioni in arrivo: simulatore di scenari (7, 10 o 21 anni, obiettivi annui, % di differenziata e crediti stimati) e assistente virtuale (Claude).</w:t>
             </w:r>
           </w:p>
         </w:tc>
@@ -853,7 +853,7 @@
                 <w:sz w:val="18"/>
                 <w:szCs w:val="18"/>
               </w:rPr>
-              <w:t xml:space="preserve">1.9</w:t>
+              <w:t xml:space="preserve">2.0</w:t>
             </w:r>
           </w:p>
         </w:tc>
@@ -919,7 +919,7 @@
                 <w:sz w:val="18"/>
                 <w:szCs w:val="18"/>
               </w:rPr>
-              <w:t xml:space="preserve">Fondazione Operate soggetto promotore del programma (esclusiva conferita da Wastelab).</w:t>
+              <w:t xml:space="preserve">Copie di sicurezza e ripristino: rimando alle Istruzioni di ripristino e punti essenziali (capitolo Manutenzione ed emergenze).</w:t>
             </w:r>
           </w:p>
         </w:tc>
@@ -989,7 +989,7 @@
                 <w:sz w:val="18"/>
                 <w:szCs w:val="18"/>
               </w:rPr>
-              <w:t xml:space="preserve">1.8</w:t>
+              <w:t xml:space="preserve">1.9</w:t>
             </w:r>
           </w:p>
         </w:tc>
@@ -1053,7 +1053,7 @@
                 <w:sz w:val="18"/>
                 <w:szCs w:val="18"/>
               </w:rPr>
-              <w:t xml:space="preserve">PEC del Programma e documenti ufficiali già pubblicati sulla pagina pubblica.</w:t>
+              <w:t xml:space="preserve">Fondazione Operate soggetto promotore del programma (esclusiva conferita da Wastelab).</w:t>
             </w:r>
           </w:p>
         </w:tc>
@@ -1123,7 +1123,7 @@
                 <w:sz w:val="18"/>
                 <w:szCs w:val="18"/>
               </w:rPr>
-              <w:t xml:space="preserve">1.7</w:t>
+              <w:t xml:space="preserve">1.8</w:t>
             </w:r>
           </w:p>
         </w:tc>
@@ -1156,7 +1156,7 @@
                 <w:sz w:val="18"/>
                 <w:szCs w:val="18"/>
               </w:rPr>
-              <w:t xml:space="preserve">18/10/2026</w:t>
+              <w:t xml:space="preserve">19/10/2026</w:t>
             </w:r>
           </w:p>
         </w:tc>
@@ -1189,7 +1189,7 @@
                 <w:sz w:val="18"/>
                 <w:szCs w:val="18"/>
               </w:rPr>
-              <w:t xml:space="preserve">Allineamento ai documenti ufficiali del Programma (script 22-24): Rapporto a 7 fasi, feedback pubblico, stati del Programma, dati del progetto e territorio ISTAT, ritiro e rientro, account unico e delegati, registri, tariffe e sospensione, accuratezza e accertamenti, informazioni del Programma e metodologie, modelli pubblici; nuovi capitoli Crediti emessi, Reclami, Pagina pubblica; qualità dei dati nel calcolo.</w:t>
+              <w:t xml:space="preserve">PEC del Programma e documenti ufficiali già pubblicati sulla pagina pubblica.</w:t>
             </w:r>
           </w:p>
         </w:tc>
@@ -1259,7 +1259,7 @@
                 <w:sz w:val="18"/>
                 <w:szCs w:val="18"/>
               </w:rPr>
-              <w:t xml:space="preserve">1.6</w:t>
+              <w:t xml:space="preserve">1.7</w:t>
             </w:r>
           </w:p>
         </w:tc>
@@ -1323,7 +1323,7 @@
                 <w:sz w:val="18"/>
                 <w:szCs w:val="18"/>
               </w:rPr>
-              <w:t xml:space="preserve">Calcolo crediti: descrizione corretta del buffer (somma delle voci delle Tabelle 15 e 16, più il 20% con le sole utenze virtuose, al massimo 80%).</w:t>
+              <w:t xml:space="preserve">Allineamento ai documenti ufficiali del Programma (script 22-24): Rapporto a 7 fasi, feedback pubblico, stati del Programma, dati del progetto e territorio ISTAT, ritiro e rientro, account unico e delegati, registri, tariffe e sospensione, accuratezza e accertamenti, informazioni del Programma e metodologie, modelli pubblici; nuovi capitoli Crediti emessi, Reclami, Pagina pubblica; qualità dei dati nel calcolo.</w:t>
             </w:r>
           </w:p>
         </w:tc>
@@ -1393,7 +1393,7 @@
                 <w:sz w:val="18"/>
                 <w:szCs w:val="18"/>
               </w:rPr>
-              <w:t xml:space="preserve">1.5</w:t>
+              <w:t xml:space="preserve">1.6</w:t>
             </w:r>
           </w:p>
         </w:tc>
@@ -1459,7 +1459,7 @@
                 <w:sz w:val="18"/>
                 <w:szCs w:val="18"/>
               </w:rPr>
-              <w:t xml:space="preserve">Nuova pagina Anagrafiche (Organizzazioni ed Enti, anche per gli Operatori); Rapporti con 4 fasi e durate proprie; documenti richiesti per fase; consultazione con documento bloccato, osservazioni numerate e motivazione; conservazione per 10 anni; fascicolo con riepilogo PDF e nuove cartelle.</w:t>
+              <w:t xml:space="preserve">Calcolo crediti: descrizione corretta del buffer (somma delle voci delle Tabelle 15 e 16, più il 20% con le sole utenze virtuose, al massimo 80%).</w:t>
             </w:r>
           </w:p>
         </w:tc>
@@ -1529,7 +1529,7 @@
                 <w:sz w:val="18"/>
                 <w:szCs w:val="18"/>
               </w:rPr>
-              <w:t xml:space="preserve">1.4</w:t>
+              <w:t xml:space="preserve">1.5</w:t>
             </w:r>
           </w:p>
         </w:tc>
@@ -1593,7 +1593,7 @@
                 <w:sz w:val="18"/>
                 <w:szCs w:val="18"/>
               </w:rPr>
-              <w:t xml:space="preserve">Calcolo crediti: il risultato si azzera quando cambiano dati o Banca Dati Utenze, conferma solo dopo un nuovo «Calcola». Gestione utenti: password temporanea di almeno 10 caratteri con lettere e numeri, creazione annullata se non va a buon fine, nessun accesso ai dati prima del cambio password.</w:t>
+              <w:t xml:space="preserve">Nuova pagina Anagrafiche (Organizzazioni ed Enti, anche per gli Operatori); Rapporti con 4 fasi e durate proprie; documenti richiesti per fase; consultazione con documento bloccato, osservazioni numerate e motivazione; conservazione per 10 anni; fascicolo con riepilogo PDF e nuove cartelle.</w:t>
             </w:r>
           </w:p>
         </w:tc>
@@ -1663,7 +1663,7 @@
                 <w:sz w:val="18"/>
                 <w:szCs w:val="18"/>
               </w:rPr>
-              <w:t xml:space="preserve">1.3</w:t>
+              <w:t xml:space="preserve">1.4</w:t>
             </w:r>
           </w:p>
         </w:tc>
@@ -1729,7 +1729,7 @@
                 <w:sz w:val="18"/>
                 <w:szCs w:val="18"/>
               </w:rPr>
-              <w:t xml:space="preserve">Rapporto di calcolo in PDF, archiviazione nella pratica, numero di registro, registro dei crediti.</w:t>
+              <w:t xml:space="preserve">Calcolo crediti: il risultato si azzera quando cambiano dati o Banca Dati Utenze, conferma solo dopo un nuovo «Calcola». Gestione utenti: password temporanea di almeno 10 caratteri con lettere e numeri, creazione annullata se non va a buon fine, nessun accesso ai dati prima del cambio password.</w:t>
             </w:r>
           </w:p>
         </w:tc>
@@ -1799,7 +1799,7 @@
                 <w:sz w:val="18"/>
                 <w:szCs w:val="18"/>
               </w:rPr>
-              <w:t xml:space="preserve">1.2</w:t>
+              <w:t xml:space="preserve">1.3</w:t>
             </w:r>
           </w:p>
         </w:tc>
@@ -1863,7 +1863,7 @@
                 <w:sz w:val="18"/>
                 <w:szCs w:val="18"/>
               </w:rPr>
-              <w:t xml:space="preserve">Calcolo crediti: importare il tracciato nel calcolo (dai documenti della pratica o dal computer), singole letture, blocco dei dati personali, controlli di coerenza.</w:t>
+              <w:t xml:space="preserve">Rapporto di calcolo in PDF, archiviazione nella pratica, numero di registro, registro dei crediti.</w:t>
             </w:r>
           </w:p>
         </w:tc>
@@ -1933,7 +1933,7 @@
                 <w:sz w:val="18"/>
                 <w:szCs w:val="18"/>
               </w:rPr>
-              <w:t xml:space="preserve">1.1</w:t>
+              <w:t xml:space="preserve">1.2</w:t>
             </w:r>
           </w:p>
         </w:tc>
@@ -1999,7 +1999,7 @@
                 <w:sz w:val="18"/>
                 <w:szCs w:val="18"/>
               </w:rPr>
-              <w:t xml:space="preserve">Note di fase, Ente di Validazione della pratica, consultazione sulla pagina pubblica con conferma dell'email, moderazione con autori e allegati, errata corrige; nuovo capitolo Messaggi con il Comune; pagamenti visibili al Comune; Impostazioni: Enti di Validazione e Modelli di documento; notifiche aggiornate.</w:t>
+              <w:t xml:space="preserve">Calcolo crediti: importare il tracciato nel calcolo (dai documenti della pratica o dal computer), singole letture, blocco dei dati personali, controlli di coerenza.</w:t>
             </w:r>
           </w:p>
         </w:tc>
@@ -2069,6 +2069,140 @@
                 <w:sz w:val="18"/>
                 <w:szCs w:val="18"/>
               </w:rPr>
+              <w:t xml:space="preserve">1.1</w:t>
+            </w:r>
+          </w:p>
+        </w:tc>
+        <w:tc>
+          <w:tcPr>
+            <w:tcW w:type="dxa" w:w="1300"/>
+            <w:tcBorders>
+              <w:top w:val="single" w:color="D9D4C5" w:sz="4"/>
+              <w:left w:val="single" w:color="D9D4C5" w:sz="4"/>
+              <w:bottom w:val="single" w:color="D9D4C5" w:sz="4"/>
+              <w:right w:val="single" w:color="D9D4C5" w:sz="4"/>
+            </w:tcBorders>
+            <w:tcMar>
+              <w:top w:type="dxa" w:w="70"/>
+              <w:left w:type="dxa" w:w="110"/>
+              <w:bottom w:type="dxa" w:w="70"/>
+              <w:right w:type="dxa" w:w="110"/>
+            </w:tcMar>
+            <w:vAlign w:val="center"/>
+          </w:tcPr>
+          <w:p>
+            <w:pPr>
+              <w:spacing w:after="0" w:before="0"/>
+            </w:pPr>
+            <w:r>
+              <w:rPr>
+                <w:rFonts w:ascii="Arial" w:cs="Arial" w:eastAsia="Arial" w:hAnsi="Arial"/>
+                <w:color w:val="1B2118"/>
+                <w:sz w:val="18"/>
+                <w:szCs w:val="18"/>
+              </w:rPr>
+              <w:t xml:space="preserve">18/10/2026</w:t>
+            </w:r>
+          </w:p>
+        </w:tc>
+        <w:tc>
+          <w:tcPr>
+            <w:tcW w:type="dxa" w:w="5538"/>
+            <w:tcBorders>
+              <w:top w:val="single" w:color="D9D4C5" w:sz="4"/>
+              <w:left w:val="single" w:color="D9D4C5" w:sz="4"/>
+              <w:bottom w:val="single" w:color="D9D4C5" w:sz="4"/>
+              <w:right w:val="single" w:color="D9D4C5" w:sz="4"/>
+            </w:tcBorders>
+            <w:tcMar>
+              <w:top w:type="dxa" w:w="70"/>
+              <w:left w:type="dxa" w:w="110"/>
+              <w:bottom w:type="dxa" w:w="70"/>
+              <w:right w:type="dxa" w:w="110"/>
+            </w:tcMar>
+            <w:vAlign w:val="center"/>
+          </w:tcPr>
+          <w:p>
+            <w:pPr>
+              <w:spacing w:after="0" w:before="0"/>
+            </w:pPr>
+            <w:r>
+              <w:rPr>
+                <w:rFonts w:ascii="Arial" w:cs="Arial" w:eastAsia="Arial" w:hAnsi="Arial"/>
+                <w:color w:val="1B2118"/>
+                <w:sz w:val="18"/>
+                <w:szCs w:val="18"/>
+              </w:rPr>
+              <w:t xml:space="preserve">Note di fase, Ente di Validazione della pratica, consultazione sulla pagina pubblica con conferma dell'email, moderazione con autori e allegati, errata corrige; nuovo capitolo Messaggi con il Comune; pagamenti visibili al Comune; Impostazioni: Enti di Validazione e Modelli di documento; notifiche aggiornate.</w:t>
+            </w:r>
+          </w:p>
+        </w:tc>
+        <w:tc>
+          <w:tcPr>
+            <w:tcW w:type="dxa" w:w="2000"/>
+            <w:tcBorders>
+              <w:top w:val="single" w:color="D9D4C5" w:sz="4"/>
+              <w:left w:val="single" w:color="D9D4C5" w:sz="4"/>
+              <w:bottom w:val="single" w:color="D9D4C5" w:sz="4"/>
+              <w:right w:val="single" w:color="D9D4C5" w:sz="4"/>
+            </w:tcBorders>
+            <w:tcMar>
+              <w:top w:type="dxa" w:w="70"/>
+              <w:left w:type="dxa" w:w="110"/>
+              <w:bottom w:type="dxa" w:w="70"/>
+              <w:right w:type="dxa" w:w="110"/>
+            </w:tcMar>
+            <w:vAlign w:val="center"/>
+          </w:tcPr>
+          <w:p>
+            <w:pPr>
+              <w:spacing w:after="0" w:before="0"/>
+            </w:pPr>
+            <w:r>
+              <w:rPr>
+                <w:rFonts w:ascii="Arial" w:cs="Arial" w:eastAsia="Arial" w:hAnsi="Arial"/>
+                <w:color w:val="1B2118"/>
+                <w:sz w:val="18"/>
+                <w:szCs w:val="18"/>
+              </w:rPr>
+              <w:t xml:space="preserve">Fondazione Operate</w:t>
+            </w:r>
+          </w:p>
+        </w:tc>
+      </w:tr>
+      <w:tr>
+        <w:trPr>
+          <w:cantSplit/>
+        </w:trPr>
+        <w:tc>
+          <w:tcPr>
+            <w:tcW w:type="dxa" w:w="800"/>
+            <w:tcBorders>
+              <w:top w:val="single" w:color="D9D4C5" w:sz="4"/>
+              <w:left w:val="single" w:color="D9D4C5" w:sz="4"/>
+              <w:bottom w:val="single" w:color="D9D4C5" w:sz="4"/>
+              <w:right w:val="single" w:color="D9D4C5" w:sz="4"/>
+            </w:tcBorders>
+            <w:shd w:fill="F6F4EE" w:color="auto" w:val="clear"/>
+            <w:tcMar>
+              <w:top w:type="dxa" w:w="70"/>
+              <w:left w:type="dxa" w:w="110"/>
+              <w:bottom w:type="dxa" w:w="70"/>
+              <w:right w:type="dxa" w:w="110"/>
+            </w:tcMar>
+            <w:vAlign w:val="center"/>
+          </w:tcPr>
+          <w:p>
+            <w:pPr>
+              <w:spacing w:after="0" w:before="0"/>
+            </w:pPr>
+            <w:r>
+              <w:rPr>
+                <w:rFonts w:ascii="Arial" w:cs="Arial" w:eastAsia="Arial" w:hAnsi="Arial"/>
+                <w:color w:val="1B2118"/>
+                <w:sz w:val="18"/>
+                <w:szCs w:val="18"/>
+              </w:rPr>
               <w:t xml:space="preserve">1.0</w:t>
             </w:r>
           </w:p>
@@ -2082,6 +2216,7 @@
               <w:bottom w:val="single" w:color="D9D4C5" w:sz="4"/>
               <w:right w:val="single" w:color="D9D4C5" w:sz="4"/>
             </w:tcBorders>
+            <w:shd w:fill="F6F4EE" w:color="auto" w:val="clear"/>
             <w:tcMar>
               <w:top w:type="dxa" w:w="70"/>
               <w:left w:type="dxa" w:w="110"/>
@@ -2114,6 +2249,7 @@
               <w:bottom w:val="single" w:color="D9D4C5" w:sz="4"/>
               <w:right w:val="single" w:color="D9D4C5" w:sz="4"/>
             </w:tcBorders>
+            <w:shd w:fill="F6F4EE" w:color="auto" w:val="clear"/>
             <w:tcMar>
               <w:top w:type="dxa" w:w="70"/>
               <w:left w:type="dxa" w:w="110"/>
@@ -2146,6 +2282,7 @@
               <w:bottom w:val="single" w:color="D9D4C5" w:sz="4"/>
               <w:right w:val="single" w:color="D9D4C5" w:sz="4"/>
             </w:tcBorders>
+            <w:shd w:fill="F6F4EE" w:color="auto" w:val="clear"/>
             <w:tcMar>
               <w:top w:type="dxa" w:w="70"/>
               <w:left w:type="dxa" w:w="110"/>
@@ -2187,7 +2324,7 @@
           <w:sz w:val="20"/>
           <w:szCs w:val="20"/>
         </w:rPr>
-        <w:t xml:space="preserve">Questo documento descrive il portale alla revisione 2.0 del 19/10/2026. A ogni modifica del portale il manuale viene aggiornato e la revisione incrementata; la versione corrente si scarica dall'area Documentazione del portale (solo Amministratori).</w:t>
+        <w:t xml:space="preserve">Questo documento descrive il portale alla revisione 2.1 del 19/10/2026. A ogni modifica del portale il manuale viene aggiornato e la revisione incrementata; la versione corrente si scarica dall'area Documentazione del portale (solo Amministratori).</w:t>
       </w:r>
     </w:p>
     <w:p>
@@ -4738,7 +4875,7 @@
         </w:rPr>
         <w:t xml:space="preserve">Si accede da </w:t>
       </w:r>
-      <w:hyperlink w:history="1" r:id="rIdepd1lwxmteo5xxobp-4zi">
+      <w:hyperlink w:history="1" r:id="rIdb8pkginzman125v53cjhg">
         <w:r>
           <w:rPr>
             <w:rFonts w:ascii="Arial" w:cs="Arial" w:eastAsia="Arial" w:hAnsi="Arial"/>
@@ -36448,36 +36585,142 @@
     </w:p>
     <w:p>
       <w:pPr>
-        <w:spacing w:after="140" w:line="300"/>
-      </w:pPr>
-      <w:r>
-        <w:rPr>
-          <w:rFonts w:ascii="Arial" w:cs="Arial" w:eastAsia="Arial" w:hAnsi="Arial"/>
-          <w:color w:val="1B2118"/>
-          <w:sz w:val="21"/>
-          <w:szCs w:val="21"/>
-        </w:rPr>
-        <w:t xml:space="preserve">In valutazione: un </w:t>
-      </w:r>
-      <w:r>
-        <w:rPr>
-          <w:rFonts w:ascii="Arial" w:cs="Arial" w:eastAsia="Arial" w:hAnsi="Arial"/>
-          <w:b/>
-          <w:bCs/>
-          <w:color w:val="1B2118"/>
-          <w:sz w:val="21"/>
-          <w:szCs w:val="21"/>
-        </w:rPr>
-        <w:t xml:space="preserve">assistente AI (Claude) integrato nel portale</w:t>
-      </w:r>
-      <w:r>
-        <w:rPr>
-          <w:rFonts w:ascii="Arial" w:cs="Arial" w:eastAsia="Arial" w:hAnsi="Arial"/>
-          <w:color w:val="1B2118"/>
-          <w:sz w:val="21"/>
-          <w:szCs w:val="21"/>
-        </w:rPr>
-        <w:t xml:space="preserve">, per aiutare i Comuni nella compilazione e gli Operatori nei controlli.</w:t>
+        <w:pStyle w:val="ListParagraph"/>
+        <w:numPr>
+          <w:ilvl w:val="0"/>
+          <w:numId w:val="2"/>
+        </w:numPr>
+        <w:spacing w:after="70" w:line="290"/>
+      </w:pPr>
+      <w:r>
+        <w:rPr>
+          <w:rFonts w:ascii="Arial" w:cs="Arial" w:eastAsia="Arial" w:hAnsi="Arial"/>
+          <w:b/>
+          <w:bCs/>
+          <w:color w:val="1B2118"/>
+          <w:sz w:val="21"/>
+          <w:szCs w:val="21"/>
+        </w:rPr>
+        <w:t xml:space="preserve">Simulatore di scenari</w:t>
+      </w:r>
+      <w:r>
+        <w:rPr>
+          <w:rFonts w:ascii="Arial" w:cs="Arial" w:eastAsia="Arial" w:hAnsi="Arial"/>
+          <w:color w:val="1B2118"/>
+          <w:sz w:val="21"/>
+          <w:szCs w:val="21"/>
+        </w:rPr>
+        <w:t xml:space="preserve"> (sezione Crediti): per ogni Comune più scenari, con durata scelta da un menu a tendina (</w:t>
+      </w:r>
+      <w:r>
+        <w:rPr>
+          <w:rFonts w:ascii="Arial" w:cs="Arial" w:eastAsia="Arial" w:hAnsi="Arial"/>
+          <w:b/>
+          <w:bCs/>
+          <w:color w:val="1B2118"/>
+          <w:sz w:val="21"/>
+          <w:szCs w:val="21"/>
+        </w:rPr>
+        <w:t xml:space="preserve">7, 10 o 21 anni</w:t>
+      </w:r>
+      <w:r>
+        <w:rPr>
+          <w:rFonts w:ascii="Arial" w:cs="Arial" w:eastAsia="Arial" w:hAnsi="Arial"/>
+          <w:color w:val="1B2118"/>
+          <w:sz w:val="21"/>
+          <w:szCs w:val="21"/>
+        </w:rPr>
+        <w:t xml:space="preserve">). Si inseriscono i dati dell'anno base (popolazione, produzione totale e pro capite, raccolta differenziata, ripartizione per frazione e i parametri del calcolo) e, per ogni anno, gli obiettivi di produzione totale e pro capite e di </w:t>
+      </w:r>
+      <w:r>
+        <w:rPr>
+          <w:rFonts w:ascii="Arial" w:cs="Arial" w:eastAsia="Arial" w:hAnsi="Arial"/>
+          <w:b/>
+          <w:bCs/>
+          <w:color w:val="1B2118"/>
+          <w:sz w:val="21"/>
+          <w:szCs w:val="21"/>
+        </w:rPr>
+        <w:t xml:space="preserve">secco residuo pro capite</w:t>
+      </w:r>
+      <w:r>
+        <w:rPr>
+          <w:rFonts w:ascii="Arial" w:cs="Arial" w:eastAsia="Arial" w:hAnsi="Arial"/>
+          <w:color w:val="1B2118"/>
+          <w:sz w:val="21"/>
+          <w:szCs w:val="21"/>
+        </w:rPr>
+        <w:t xml:space="preserve">. Il simulatore ricalcola la </w:t>
+      </w:r>
+      <w:r>
+        <w:rPr>
+          <w:rFonts w:ascii="Arial" w:cs="Arial" w:eastAsia="Arial" w:hAnsi="Arial"/>
+          <w:b/>
+          <w:bCs/>
+          <w:color w:val="1B2118"/>
+          <w:sz w:val="21"/>
+          <w:szCs w:val="21"/>
+        </w:rPr>
+        <w:t xml:space="preserve">percentuale di differenziata</w:t>
+      </w:r>
+      <w:r>
+        <w:rPr>
+          <w:rFonts w:ascii="Arial" w:cs="Arial" w:eastAsia="Arial" w:hAnsi="Arial"/>
+          <w:color w:val="1B2118"/>
+          <w:sz w:val="21"/>
+          <w:szCs w:val="21"/>
+        </w:rPr>
+        <w:t xml:space="preserve"> e stima </w:t>
+      </w:r>
+      <w:r>
+        <w:rPr>
+          <w:rFonts w:ascii="Arial" w:cs="Arial" w:eastAsia="Arial" w:hAnsi="Arial"/>
+          <w:b/>
+          <w:bCs/>
+          <w:color w:val="1B2118"/>
+          <w:sz w:val="21"/>
+          <w:szCs w:val="21"/>
+        </w:rPr>
+        <w:t xml:space="preserve">anno per anno i crediti</w:t>
+      </w:r>
+      <w:r>
+        <w:rPr>
+          <w:rFonts w:ascii="Arial" w:cs="Arial" w:eastAsia="Arial" w:hAnsi="Arial"/>
+          <w:color w:val="1B2118"/>
+          <w:sz w:val="21"/>
+          <w:szCs w:val="21"/>
+        </w:rPr>
+        <w:t xml:space="preserve"> che il Comune potrebbe generare, con tabella, grafico e confronto tra scenari. È una stima ex ante, non un calcolo certificabile: il modello va confermato dalla Fondazione.</w:t>
+      </w:r>
+    </w:p>
+    <w:p>
+      <w:pPr>
+        <w:pStyle w:val="ListParagraph"/>
+        <w:numPr>
+          <w:ilvl w:val="0"/>
+          <w:numId w:val="2"/>
+        </w:numPr>
+        <w:spacing w:after="70" w:line="290"/>
+      </w:pPr>
+      <w:r>
+        <w:rPr>
+          <w:rFonts w:ascii="Arial" w:cs="Arial" w:eastAsia="Arial" w:hAnsi="Arial"/>
+          <w:b/>
+          <w:bCs/>
+          <w:color w:val="1B2118"/>
+          <w:sz w:val="21"/>
+          <w:szCs w:val="21"/>
+        </w:rPr>
+        <w:t xml:space="preserve">Assistente virtuale (Claude) integrato nel portale:</w:t>
+      </w:r>
+      <w:r>
+        <w:rPr>
+          <w:rFonts w:ascii="Arial" w:cs="Arial" w:eastAsia="Arial" w:hAnsi="Arial"/>
+          <w:color w:val="1B2118"/>
+          <w:sz w:val="21"/>
+          <w:szCs w:val="21"/>
+        </w:rPr>
+        <w:t xml:space="preserve"> aiuta i Comuni nella compilazione (cosa manca nella pratica, come preparare i dati) e gli Operatori nei controlli (completezza dei documenti, bozze di richieste di integrazione e di risposte, spiegazione dei risultati del calcolo). Resta un supporto: le decisioni restano alla Fondazione e ogni sua azione è registrata nell'audit.</w:t>
       </w:r>
     </w:p>
     <w:sectPr>
@@ -36715,7 +36958,7 @@
         <w:szCs w:val="16"/>
       </w:rPr>
       <w:tab/>
-      <w:t xml:space="preserve">Manuale Amministratore · Rev. 2.0 · 19/10/2026</w:t>
+      <w:t xml:space="preserve">Manuale Amministratore · Rev. 2.1 · 19/10/2026</w:t>
     </w:r>
   </w:p>
 </w:hdr>
@@ -36780,7 +37023,7 @@
         <w:szCs w:val="16"/>
       </w:rPr>
       <w:tab/>
-      <w:t xml:space="preserve">Manuale Amministratore · Rev. 2.0 · 19/10/2026</w:t>
+      <w:t xml:space="preserve">Manuale Amministratore · Rev. 2.1 · 19/10/2026</w:t>
     </w:r>
   </w:p>
 </w:hdr>

</xml_diff>

<commit_message>
Simulatore di scenari, prima versione: script 28, pagina /simulatore, motore e prove; manuali e registro aggiornati
Co-Authored-By: Claude Opus 5.5 <noreply@anthropic.com>
Claude-Session: https://claude.ai/code/session_01E8XCbEeVHWVP3hntUZ6kZ1
</commit_message>
<xml_diff>
--- a/public/documentazione/Manuale_Amministratore_Portale_CWP.docx
+++ b/public/documentazione/Manuale_Amministratore_Portale_CWP.docx
@@ -302,7 +302,7 @@
                 <w:sz w:val="20"/>
                 <w:szCs w:val="20"/>
               </w:rPr>
-              <w:t xml:space="preserve">Rev. 2.1</w:t>
+              <w:t xml:space="preserve">Rev. 2.2</w:t>
             </w:r>
           </w:p>
         </w:tc>
@@ -719,7 +719,7 @@
                 <w:sz w:val="18"/>
                 <w:szCs w:val="18"/>
               </w:rPr>
-              <w:t xml:space="preserve">2.1</w:t>
+              <w:t xml:space="preserve">2.2</w:t>
             </w:r>
           </w:p>
         </w:tc>
@@ -783,7 +783,7 @@
                 <w:sz w:val="18"/>
                 <w:szCs w:val="18"/>
               </w:rPr>
-              <w:t xml:space="preserve">Funzioni in arrivo: simulatore di scenari (7, 10 o 21 anni, obiettivi annui, % di differenziata e crediti stimati) e assistente virtuale (Claude).</w:t>
+              <w:t xml:space="preserve">Nuovo capitolo «Simulatore di scenari»: creazione, anno base, obiettivi annui, risultati, modello di stima.</w:t>
             </w:r>
           </w:p>
         </w:tc>
@@ -853,7 +853,7 @@
                 <w:sz w:val="18"/>
                 <w:szCs w:val="18"/>
               </w:rPr>
-              <w:t xml:space="preserve">2.0</w:t>
+              <w:t xml:space="preserve">2.1</w:t>
             </w:r>
           </w:p>
         </w:tc>
@@ -919,7 +919,7 @@
                 <w:sz w:val="18"/>
                 <w:szCs w:val="18"/>
               </w:rPr>
-              <w:t xml:space="preserve">Copie di sicurezza e ripristino: rimando alle Istruzioni di ripristino e punti essenziali (capitolo Manutenzione ed emergenze).</w:t>
+              <w:t xml:space="preserve">Funzioni in arrivo: simulatore di scenari (7, 10 o 21 anni, obiettivi annui, % di differenziata e crediti stimati) e assistente virtuale (Claude).</w:t>
             </w:r>
           </w:p>
         </w:tc>
@@ -989,7 +989,7 @@
                 <w:sz w:val="18"/>
                 <w:szCs w:val="18"/>
               </w:rPr>
-              <w:t xml:space="preserve">1.9</w:t>
+              <w:t xml:space="preserve">2.0</w:t>
             </w:r>
           </w:p>
         </w:tc>
@@ -1053,7 +1053,7 @@
                 <w:sz w:val="18"/>
                 <w:szCs w:val="18"/>
               </w:rPr>
-              <w:t xml:space="preserve">Fondazione Operate soggetto promotore del programma (esclusiva conferita da Wastelab).</w:t>
+              <w:t xml:space="preserve">Copie di sicurezza e ripristino: rimando alle Istruzioni di ripristino e punti essenziali (capitolo Manutenzione ed emergenze).</w:t>
             </w:r>
           </w:p>
         </w:tc>
@@ -1123,7 +1123,7 @@
                 <w:sz w:val="18"/>
                 <w:szCs w:val="18"/>
               </w:rPr>
-              <w:t xml:space="preserve">1.8</w:t>
+              <w:t xml:space="preserve">1.9</w:t>
             </w:r>
           </w:p>
         </w:tc>
@@ -1189,7 +1189,7 @@
                 <w:sz w:val="18"/>
                 <w:szCs w:val="18"/>
               </w:rPr>
-              <w:t xml:space="preserve">PEC del Programma e documenti ufficiali già pubblicati sulla pagina pubblica.</w:t>
+              <w:t xml:space="preserve">Fondazione Operate soggetto promotore del programma (esclusiva conferita da Wastelab).</w:t>
             </w:r>
           </w:p>
         </w:tc>
@@ -1259,7 +1259,7 @@
                 <w:sz w:val="18"/>
                 <w:szCs w:val="18"/>
               </w:rPr>
-              <w:t xml:space="preserve">1.7</w:t>
+              <w:t xml:space="preserve">1.8</w:t>
             </w:r>
           </w:p>
         </w:tc>
@@ -1291,7 +1291,7 @@
                 <w:sz w:val="18"/>
                 <w:szCs w:val="18"/>
               </w:rPr>
-              <w:t xml:space="preserve">18/10/2026</w:t>
+              <w:t xml:space="preserve">19/10/2026</w:t>
             </w:r>
           </w:p>
         </w:tc>
@@ -1323,7 +1323,7 @@
                 <w:sz w:val="18"/>
                 <w:szCs w:val="18"/>
               </w:rPr>
-              <w:t xml:space="preserve">Allineamento ai documenti ufficiali del Programma (script 22-24): Rapporto a 7 fasi, feedback pubblico, stati del Programma, dati del progetto e territorio ISTAT, ritiro e rientro, account unico e delegati, registri, tariffe e sospensione, accuratezza e accertamenti, informazioni del Programma e metodologie, modelli pubblici; nuovi capitoli Crediti emessi, Reclami, Pagina pubblica; qualità dei dati nel calcolo.</w:t>
+              <w:t xml:space="preserve">PEC del Programma e documenti ufficiali già pubblicati sulla pagina pubblica.</w:t>
             </w:r>
           </w:p>
         </w:tc>
@@ -1393,7 +1393,7 @@
                 <w:sz w:val="18"/>
                 <w:szCs w:val="18"/>
               </w:rPr>
-              <w:t xml:space="preserve">1.6</w:t>
+              <w:t xml:space="preserve">1.7</w:t>
             </w:r>
           </w:p>
         </w:tc>
@@ -1459,7 +1459,7 @@
                 <w:sz w:val="18"/>
                 <w:szCs w:val="18"/>
               </w:rPr>
-              <w:t xml:space="preserve">Calcolo crediti: descrizione corretta del buffer (somma delle voci delle Tabelle 15 e 16, più il 20% con le sole utenze virtuose, al massimo 80%).</w:t>
+              <w:t xml:space="preserve">Allineamento ai documenti ufficiali del Programma (script 22-24): Rapporto a 7 fasi, feedback pubblico, stati del Programma, dati del progetto e territorio ISTAT, ritiro e rientro, account unico e delegati, registri, tariffe e sospensione, accuratezza e accertamenti, informazioni del Programma e metodologie, modelli pubblici; nuovi capitoli Crediti emessi, Reclami, Pagina pubblica; qualità dei dati nel calcolo.</w:t>
             </w:r>
           </w:p>
         </w:tc>
@@ -1529,7 +1529,7 @@
                 <w:sz w:val="18"/>
                 <w:szCs w:val="18"/>
               </w:rPr>
-              <w:t xml:space="preserve">1.5</w:t>
+              <w:t xml:space="preserve">1.6</w:t>
             </w:r>
           </w:p>
         </w:tc>
@@ -1593,7 +1593,7 @@
                 <w:sz w:val="18"/>
                 <w:szCs w:val="18"/>
               </w:rPr>
-              <w:t xml:space="preserve">Nuova pagina Anagrafiche (Organizzazioni ed Enti, anche per gli Operatori); Rapporti con 4 fasi e durate proprie; documenti richiesti per fase; consultazione con documento bloccato, osservazioni numerate e motivazione; conservazione per 10 anni; fascicolo con riepilogo PDF e nuove cartelle.</w:t>
+              <w:t xml:space="preserve">Calcolo crediti: descrizione corretta del buffer (somma delle voci delle Tabelle 15 e 16, più il 20% con le sole utenze virtuose, al massimo 80%).</w:t>
             </w:r>
           </w:p>
         </w:tc>
@@ -1663,7 +1663,7 @@
                 <w:sz w:val="18"/>
                 <w:szCs w:val="18"/>
               </w:rPr>
-              <w:t xml:space="preserve">1.4</w:t>
+              <w:t xml:space="preserve">1.5</w:t>
             </w:r>
           </w:p>
         </w:tc>
@@ -1729,7 +1729,7 @@
                 <w:sz w:val="18"/>
                 <w:szCs w:val="18"/>
               </w:rPr>
-              <w:t xml:space="preserve">Calcolo crediti: il risultato si azzera quando cambiano dati o Banca Dati Utenze, conferma solo dopo un nuovo «Calcola». Gestione utenti: password temporanea di almeno 10 caratteri con lettere e numeri, creazione annullata se non va a buon fine, nessun accesso ai dati prima del cambio password.</w:t>
+              <w:t xml:space="preserve">Nuova pagina Anagrafiche (Organizzazioni ed Enti, anche per gli Operatori); Rapporti con 4 fasi e durate proprie; documenti richiesti per fase; consultazione con documento bloccato, osservazioni numerate e motivazione; conservazione per 10 anni; fascicolo con riepilogo PDF e nuove cartelle.</w:t>
             </w:r>
           </w:p>
         </w:tc>
@@ -1799,7 +1799,7 @@
                 <w:sz w:val="18"/>
                 <w:szCs w:val="18"/>
               </w:rPr>
-              <w:t xml:space="preserve">1.3</w:t>
+              <w:t xml:space="preserve">1.4</w:t>
             </w:r>
           </w:p>
         </w:tc>
@@ -1863,7 +1863,7 @@
                 <w:sz w:val="18"/>
                 <w:szCs w:val="18"/>
               </w:rPr>
-              <w:t xml:space="preserve">Rapporto di calcolo in PDF, archiviazione nella pratica, numero di registro, registro dei crediti.</w:t>
+              <w:t xml:space="preserve">Calcolo crediti: il risultato si azzera quando cambiano dati o Banca Dati Utenze, conferma solo dopo un nuovo «Calcola». Gestione utenti: password temporanea di almeno 10 caratteri con lettere e numeri, creazione annullata se non va a buon fine, nessun accesso ai dati prima del cambio password.</w:t>
             </w:r>
           </w:p>
         </w:tc>
@@ -1933,7 +1933,7 @@
                 <w:sz w:val="18"/>
                 <w:szCs w:val="18"/>
               </w:rPr>
-              <w:t xml:space="preserve">1.2</w:t>
+              <w:t xml:space="preserve">1.3</w:t>
             </w:r>
           </w:p>
         </w:tc>
@@ -1999,7 +1999,7 @@
                 <w:sz w:val="18"/>
                 <w:szCs w:val="18"/>
               </w:rPr>
-              <w:t xml:space="preserve">Calcolo crediti: importare il tracciato nel calcolo (dai documenti della pratica o dal computer), singole letture, blocco dei dati personali, controlli di coerenza.</w:t>
+              <w:t xml:space="preserve">Rapporto di calcolo in PDF, archiviazione nella pratica, numero di registro, registro dei crediti.</w:t>
             </w:r>
           </w:p>
         </w:tc>
@@ -2069,7 +2069,7 @@
                 <w:sz w:val="18"/>
                 <w:szCs w:val="18"/>
               </w:rPr>
-              <w:t xml:space="preserve">1.1</w:t>
+              <w:t xml:space="preserve">1.2</w:t>
             </w:r>
           </w:p>
         </w:tc>
@@ -2133,7 +2133,7 @@
                 <w:sz w:val="18"/>
                 <w:szCs w:val="18"/>
               </w:rPr>
-              <w:t xml:space="preserve">Note di fase, Ente di Validazione della pratica, consultazione sulla pagina pubblica con conferma dell'email, moderazione con autori e allegati, errata corrige; nuovo capitolo Messaggi con il Comune; pagamenti visibili al Comune; Impostazioni: Enti di Validazione e Modelli di documento; notifiche aggiornate.</w:t>
+              <w:t xml:space="preserve">Calcolo crediti: importare il tracciato nel calcolo (dai documenti della pratica o dal computer), singole letture, blocco dei dati personali, controlli di coerenza.</w:t>
             </w:r>
           </w:p>
         </w:tc>
@@ -2203,6 +2203,142 @@
                 <w:sz w:val="18"/>
                 <w:szCs w:val="18"/>
               </w:rPr>
+              <w:t xml:space="preserve">1.1</w:t>
+            </w:r>
+          </w:p>
+        </w:tc>
+        <w:tc>
+          <w:tcPr>
+            <w:tcW w:type="dxa" w:w="1300"/>
+            <w:tcBorders>
+              <w:top w:val="single" w:color="D9D4C5" w:sz="4"/>
+              <w:left w:val="single" w:color="D9D4C5" w:sz="4"/>
+              <w:bottom w:val="single" w:color="D9D4C5" w:sz="4"/>
+              <w:right w:val="single" w:color="D9D4C5" w:sz="4"/>
+            </w:tcBorders>
+            <w:shd w:fill="F6F4EE" w:color="auto" w:val="clear"/>
+            <w:tcMar>
+              <w:top w:type="dxa" w:w="70"/>
+              <w:left w:type="dxa" w:w="110"/>
+              <w:bottom w:type="dxa" w:w="70"/>
+              <w:right w:type="dxa" w:w="110"/>
+            </w:tcMar>
+            <w:vAlign w:val="center"/>
+          </w:tcPr>
+          <w:p>
+            <w:pPr>
+              <w:spacing w:after="0" w:before="0"/>
+            </w:pPr>
+            <w:r>
+              <w:rPr>
+                <w:rFonts w:ascii="Arial" w:cs="Arial" w:eastAsia="Arial" w:hAnsi="Arial"/>
+                <w:color w:val="1B2118"/>
+                <w:sz w:val="18"/>
+                <w:szCs w:val="18"/>
+              </w:rPr>
+              <w:t xml:space="preserve">18/10/2026</w:t>
+            </w:r>
+          </w:p>
+        </w:tc>
+        <w:tc>
+          <w:tcPr>
+            <w:tcW w:type="dxa" w:w="5538"/>
+            <w:tcBorders>
+              <w:top w:val="single" w:color="D9D4C5" w:sz="4"/>
+              <w:left w:val="single" w:color="D9D4C5" w:sz="4"/>
+              <w:bottom w:val="single" w:color="D9D4C5" w:sz="4"/>
+              <w:right w:val="single" w:color="D9D4C5" w:sz="4"/>
+            </w:tcBorders>
+            <w:shd w:fill="F6F4EE" w:color="auto" w:val="clear"/>
+            <w:tcMar>
+              <w:top w:type="dxa" w:w="70"/>
+              <w:left w:type="dxa" w:w="110"/>
+              <w:bottom w:type="dxa" w:w="70"/>
+              <w:right w:type="dxa" w:w="110"/>
+            </w:tcMar>
+            <w:vAlign w:val="center"/>
+          </w:tcPr>
+          <w:p>
+            <w:pPr>
+              <w:spacing w:after="0" w:before="0"/>
+            </w:pPr>
+            <w:r>
+              <w:rPr>
+                <w:rFonts w:ascii="Arial" w:cs="Arial" w:eastAsia="Arial" w:hAnsi="Arial"/>
+                <w:color w:val="1B2118"/>
+                <w:sz w:val="18"/>
+                <w:szCs w:val="18"/>
+              </w:rPr>
+              <w:t xml:space="preserve">Note di fase, Ente di Validazione della pratica, consultazione sulla pagina pubblica con conferma dell'email, moderazione con autori e allegati, errata corrige; nuovo capitolo Messaggi con il Comune; pagamenti visibili al Comune; Impostazioni: Enti di Validazione e Modelli di documento; notifiche aggiornate.</w:t>
+            </w:r>
+          </w:p>
+        </w:tc>
+        <w:tc>
+          <w:tcPr>
+            <w:tcW w:type="dxa" w:w="2000"/>
+            <w:tcBorders>
+              <w:top w:val="single" w:color="D9D4C5" w:sz="4"/>
+              <w:left w:val="single" w:color="D9D4C5" w:sz="4"/>
+              <w:bottom w:val="single" w:color="D9D4C5" w:sz="4"/>
+              <w:right w:val="single" w:color="D9D4C5" w:sz="4"/>
+            </w:tcBorders>
+            <w:shd w:fill="F6F4EE" w:color="auto" w:val="clear"/>
+            <w:tcMar>
+              <w:top w:type="dxa" w:w="70"/>
+              <w:left w:type="dxa" w:w="110"/>
+              <w:bottom w:type="dxa" w:w="70"/>
+              <w:right w:type="dxa" w:w="110"/>
+            </w:tcMar>
+            <w:vAlign w:val="center"/>
+          </w:tcPr>
+          <w:p>
+            <w:pPr>
+              <w:spacing w:after="0" w:before="0"/>
+            </w:pPr>
+            <w:r>
+              <w:rPr>
+                <w:rFonts w:ascii="Arial" w:cs="Arial" w:eastAsia="Arial" w:hAnsi="Arial"/>
+                <w:color w:val="1B2118"/>
+                <w:sz w:val="18"/>
+                <w:szCs w:val="18"/>
+              </w:rPr>
+              <w:t xml:space="preserve">Fondazione Operate</w:t>
+            </w:r>
+          </w:p>
+        </w:tc>
+      </w:tr>
+      <w:tr>
+        <w:trPr>
+          <w:cantSplit/>
+        </w:trPr>
+        <w:tc>
+          <w:tcPr>
+            <w:tcW w:type="dxa" w:w="800"/>
+            <w:tcBorders>
+              <w:top w:val="single" w:color="D9D4C5" w:sz="4"/>
+              <w:left w:val="single" w:color="D9D4C5" w:sz="4"/>
+              <w:bottom w:val="single" w:color="D9D4C5" w:sz="4"/>
+              <w:right w:val="single" w:color="D9D4C5" w:sz="4"/>
+            </w:tcBorders>
+            <w:tcMar>
+              <w:top w:type="dxa" w:w="70"/>
+              <w:left w:type="dxa" w:w="110"/>
+              <w:bottom w:type="dxa" w:w="70"/>
+              <w:right w:type="dxa" w:w="110"/>
+            </w:tcMar>
+            <w:vAlign w:val="center"/>
+          </w:tcPr>
+          <w:p>
+            <w:pPr>
+              <w:spacing w:after="0" w:before="0"/>
+            </w:pPr>
+            <w:r>
+              <w:rPr>
+                <w:rFonts w:ascii="Arial" w:cs="Arial" w:eastAsia="Arial" w:hAnsi="Arial"/>
+                <w:color w:val="1B2118"/>
+                <w:sz w:val="18"/>
+                <w:szCs w:val="18"/>
+              </w:rPr>
               <w:t xml:space="preserve">1.0</w:t>
             </w:r>
           </w:p>
@@ -2216,7 +2352,6 @@
               <w:bottom w:val="single" w:color="D9D4C5" w:sz="4"/>
               <w:right w:val="single" w:color="D9D4C5" w:sz="4"/>
             </w:tcBorders>
-            <w:shd w:fill="F6F4EE" w:color="auto" w:val="clear"/>
             <w:tcMar>
               <w:top w:type="dxa" w:w="70"/>
               <w:left w:type="dxa" w:w="110"/>
@@ -2249,7 +2384,6 @@
               <w:bottom w:val="single" w:color="D9D4C5" w:sz="4"/>
               <w:right w:val="single" w:color="D9D4C5" w:sz="4"/>
             </w:tcBorders>
-            <w:shd w:fill="F6F4EE" w:color="auto" w:val="clear"/>
             <w:tcMar>
               <w:top w:type="dxa" w:w="70"/>
               <w:left w:type="dxa" w:w="110"/>
@@ -2282,7 +2416,6 @@
               <w:bottom w:val="single" w:color="D9D4C5" w:sz="4"/>
               <w:right w:val="single" w:color="D9D4C5" w:sz="4"/>
             </w:tcBorders>
-            <w:shd w:fill="F6F4EE" w:color="auto" w:val="clear"/>
             <w:tcMar>
               <w:top w:type="dxa" w:w="70"/>
               <w:left w:type="dxa" w:w="110"/>
@@ -2324,7 +2457,7 @@
           <w:sz w:val="20"/>
           <w:szCs w:val="20"/>
         </w:rPr>
-        <w:t xml:space="preserve">Questo documento descrive il portale alla revisione 2.1 del 19/10/2026. A ogni modifica del portale il manuale viene aggiornato e la revisione incrementata; la versione corrente si scarica dall'area Documentazione del portale (solo Amministratori).</w:t>
+        <w:t xml:space="preserve">Questo documento descrive il portale alla revisione 2.2 del 19/10/2026. A ogni modifica del portale il manuale viene aggiornato e la revisione incrementata; la versione corrente si scarica dall'area Documentazione del portale (solo Amministratori).</w:t>
       </w:r>
     </w:p>
     <w:p>
@@ -2859,7 +2992,7 @@
             <w:sz w:val="22"/>
             <w:szCs w:val="22"/>
           </w:rPr>
-          <w:t xml:space="preserve">18.  Crediti emessi</w:t>
+          <w:t xml:space="preserve">18.  Simulatore di scenari</w:t>
         </w:r>
         <w:r>
           <w:rPr>
@@ -2888,7 +3021,7 @@
             <w:sz w:val="22"/>
             <w:szCs w:val="22"/>
           </w:rPr>
-          <w:t xml:space="preserve">19.  Reclami e richieste di chiarimento</w:t>
+          <w:t xml:space="preserve">19.  Crediti emessi</w:t>
         </w:r>
         <w:r>
           <w:rPr>
@@ -2917,36 +3050,7 @@
             <w:sz w:val="22"/>
             <w:szCs w:val="22"/>
           </w:rPr>
-          <w:t xml:space="preserve">20.  Pagina pubblica del Programma</w:t>
-        </w:r>
-        <w:r>
-          <w:rPr>
-            <w:rFonts w:ascii="Arial" w:cs="Arial" w:eastAsia="Arial" w:hAnsi="Arial"/>
-            <w:color w:val="1B2118"/>
-            <w:sz w:val="22"/>
-            <w:szCs w:val="22"/>
-          </w:rPr>
-          <w:tab/>
-          <w:t xml:space="preserve">37</w:t>
-        </w:r>
-      </w:hyperlink>
-    </w:p>
-    <w:p>
-      <w:pPr>
-        <w:tabs>
-          <w:tab w:val="right" w:pos="9638" w:leader="dot"/>
-        </w:tabs>
-        <w:spacing w:after="130"/>
-      </w:pPr>
-      <w:hyperlink w:history="1" w:anchor="cap21">
-        <w:r>
-          <w:rPr>
-            <w:rFonts w:ascii="Arial" w:cs="Arial" w:eastAsia="Arial" w:hAnsi="Arial"/>
-            <w:color w:val="1B2118"/>
-            <w:sz w:val="22"/>
-            <w:szCs w:val="22"/>
-          </w:rPr>
-          <w:t xml:space="preserve">21.  Documentazione e manuali</w:t>
+          <w:t xml:space="preserve">20.  Reclami e richieste di chiarimento</w:t>
         </w:r>
         <w:r>
           <w:rPr>
@@ -2967,7 +3071,7 @@
         </w:tabs>
         <w:spacing w:after="130"/>
       </w:pPr>
-      <w:hyperlink w:history="1" w:anchor="cap22">
+      <w:hyperlink w:history="1" w:anchor="cap21">
         <w:r>
           <w:rPr>
             <w:rFonts w:ascii="Arial" w:cs="Arial" w:eastAsia="Arial" w:hAnsi="Arial"/>
@@ -2975,7 +3079,7 @@
             <w:sz w:val="22"/>
             <w:szCs w:val="22"/>
           </w:rPr>
-          <w:t xml:space="preserve">22.  Manutenzione ed emergenze</w:t>
+          <w:t xml:space="preserve">21.  Pagina pubblica del Programma</w:t>
         </w:r>
         <w:r>
           <w:rPr>
@@ -2996,7 +3100,7 @@
         </w:tabs>
         <w:spacing w:after="130"/>
       </w:pPr>
-      <w:hyperlink w:history="1" w:anchor="cap23">
+      <w:hyperlink w:history="1" w:anchor="cap22">
         <w:r>
           <w:rPr>
             <w:rFonts w:ascii="Arial" w:cs="Arial" w:eastAsia="Arial" w:hAnsi="Arial"/>
@@ -3004,7 +3108,7 @@
             <w:sz w:val="22"/>
             <w:szCs w:val="22"/>
           </w:rPr>
-          <w:t xml:space="preserve">23.  Funzioni in arrivo</w:t>
+          <w:t xml:space="preserve">22.  Documentazione e manuali</w:t>
         </w:r>
         <w:r>
           <w:rPr>
@@ -3015,6 +3119,64 @@
           </w:rPr>
           <w:tab/>
           <w:t xml:space="preserve">40</w:t>
+        </w:r>
+      </w:hyperlink>
+    </w:p>
+    <w:p>
+      <w:pPr>
+        <w:tabs>
+          <w:tab w:val="right" w:pos="9638" w:leader="dot"/>
+        </w:tabs>
+        <w:spacing w:after="130"/>
+      </w:pPr>
+      <w:hyperlink w:history="1" w:anchor="cap23">
+        <w:r>
+          <w:rPr>
+            <w:rFonts w:ascii="Arial" w:cs="Arial" w:eastAsia="Arial" w:hAnsi="Arial"/>
+            <w:color w:val="1B2118"/>
+            <w:sz w:val="22"/>
+            <w:szCs w:val="22"/>
+          </w:rPr>
+          <w:t xml:space="preserve">23.  Manutenzione ed emergenze</w:t>
+        </w:r>
+        <w:r>
+          <w:rPr>
+            <w:rFonts w:ascii="Arial" w:cs="Arial" w:eastAsia="Arial" w:hAnsi="Arial"/>
+            <w:color w:val="1B2118"/>
+            <w:sz w:val="22"/>
+            <w:szCs w:val="22"/>
+          </w:rPr>
+          <w:tab/>
+          <w:t xml:space="preserve">41</w:t>
+        </w:r>
+      </w:hyperlink>
+    </w:p>
+    <w:p>
+      <w:pPr>
+        <w:tabs>
+          <w:tab w:val="right" w:pos="9638" w:leader="dot"/>
+        </w:tabs>
+        <w:spacing w:after="130"/>
+      </w:pPr>
+      <w:hyperlink w:history="1" w:anchor="cap24">
+        <w:r>
+          <w:rPr>
+            <w:rFonts w:ascii="Arial" w:cs="Arial" w:eastAsia="Arial" w:hAnsi="Arial"/>
+            <w:color w:val="1B2118"/>
+            <w:sz w:val="22"/>
+            <w:szCs w:val="22"/>
+          </w:rPr>
+          <w:t xml:space="preserve">24.  Funzioni in arrivo</w:t>
+        </w:r>
+        <w:r>
+          <w:rPr>
+            <w:rFonts w:ascii="Arial" w:cs="Arial" w:eastAsia="Arial" w:hAnsi="Arial"/>
+            <w:color w:val="1B2118"/>
+            <w:sz w:val="22"/>
+            <w:szCs w:val="22"/>
+          </w:rPr>
+          <w:tab/>
+          <w:t xml:space="preserve">42</w:t>
         </w:r>
       </w:hyperlink>
     </w:p>
@@ -4875,7 +5037,7 @@
         </w:rPr>
         <w:t xml:space="preserve">Si accede da </w:t>
       </w:r>
-      <w:hyperlink w:history="1" r:id="rIdb8pkginzman125v53cjhg">
+      <w:hyperlink w:history="1" r:id="rIdylhhkeyypbeptjypupqwc">
         <w:r>
           <w:rPr>
             <w:rFonts w:ascii="Arial" w:cs="Arial" w:eastAsia="Arial" w:hAnsi="Arial"/>
@@ -31468,7 +31630,7 @@
           <w:sz w:val="34"/>
           <w:szCs w:val="34"/>
         </w:rPr>
-        <w:t xml:space="preserve">18. Crediti emessi</w:t>
+        <w:t xml:space="preserve">18. Simulatore di scenari</w:t>
       </w:r>
       <w:bookmarkEnd w:id="1"/>
     </w:p>
@@ -31483,97 +31645,27 @@
           <w:sz w:val="21"/>
           <w:szCs w:val="21"/>
         </w:rPr>
-        <w:t xml:space="preserve">Dopo la registrazione di un Rapporto di Monitoraggio la Fondazione emette i crediti, con un </w:t>
-      </w:r>
-      <w:r>
-        <w:rPr>
-          <w:rFonts w:ascii="Arial" w:cs="Arial" w:eastAsia="Arial" w:hAnsi="Arial"/>
-          <w:b/>
-          <w:bCs/>
-          <w:color w:val="1B2118"/>
-          <w:sz w:val="21"/>
-          <w:szCs w:val="21"/>
-        </w:rPr>
-        <w:t xml:space="preserve">ID univoco per ogni credito</w:t>
-      </w:r>
-      <w:r>
-        <w:rPr>
-          <w:rFonts w:ascii="Arial" w:cs="Arial" w:eastAsia="Arial" w:hAnsi="Arial"/>
-          <w:color w:val="1B2118"/>
-          <w:sz w:val="21"/>
-          <w:szCs w:val="21"/>
-        </w:rPr>
-        <w:t xml:space="preserve"> (Guida 6.3.2 e 6.3.3, Tabella 5; Standard 6.2). I crediti si seguono nel riquadro </w:t>
-      </w:r>
-      <w:r>
-        <w:rPr>
-          <w:rFonts w:ascii="Arial" w:cs="Arial" w:eastAsia="Arial" w:hAnsi="Arial"/>
-          <w:b/>
-          <w:bCs/>
-          <w:color w:val="1B2118"/>
-          <w:sz w:val="21"/>
-          <w:szCs w:val="21"/>
-        </w:rPr>
-        <w:t xml:space="preserve">Crediti emessi</w:t>
-      </w:r>
-      <w:r>
-        <w:rPr>
-          <w:rFonts w:ascii="Arial" w:cs="Arial" w:eastAsia="Arial" w:hAnsi="Arial"/>
-          <w:color w:val="1B2118"/>
-          <w:sz w:val="21"/>
-          <w:szCs w:val="21"/>
-        </w:rPr>
-        <w:t xml:space="preserve"> del Rapporto e nella pagina </w:t>
-      </w:r>
-      <w:r>
-        <w:rPr>
-          <w:rFonts w:ascii="Arial" w:cs="Arial" w:eastAsia="Arial" w:hAnsi="Arial"/>
-          <w:b/>
-          <w:bCs/>
-          <w:color w:val="1B2118"/>
-          <w:sz w:val="21"/>
-          <w:szCs w:val="21"/>
-        </w:rPr>
-        <w:t xml:space="preserve">Crediti emessi</w:t>
-      </w:r>
-      <w:r>
-        <w:rPr>
-          <w:rFonts w:ascii="Arial" w:cs="Arial" w:eastAsia="Arial" w:hAnsi="Arial"/>
-          <w:color w:val="1B2118"/>
-          <w:sz w:val="21"/>
-          <w:szCs w:val="21"/>
-        </w:rPr>
-        <w:t xml:space="preserve"> del menu.</w:t>
-      </w:r>
-    </w:p>
-    <w:p>
-      <w:pPr>
-        <w:spacing w:after="140" w:line="300"/>
-      </w:pPr>
-      <w:r>
-        <w:rPr>
-          <w:rFonts w:ascii="Arial" w:cs="Arial" w:eastAsia="Arial" w:hAnsi="Arial"/>
-          <w:b/>
-          <w:bCs/>
-          <w:color w:val="1B2118"/>
-          <w:sz w:val="21"/>
-          <w:szCs w:val="21"/>
-        </w:rPr>
-        <w:t xml:space="preserve">Emettere i crediti (solo Amministratori)</w:t>
-      </w:r>
-    </w:p>
-    <w:p>
-      <w:pPr>
-        <w:spacing w:after="140" w:line="300"/>
-      </w:pPr>
-      <w:r>
-        <w:rPr>
-          <w:rFonts w:ascii="Arial" w:cs="Arial" w:eastAsia="Arial" w:hAnsi="Arial"/>
-          <w:color w:val="1B2118"/>
-          <w:sz w:val="21"/>
-          <w:szCs w:val="21"/>
-        </w:rPr>
-        <w:t xml:space="preserve">L'emissione è possibile solo se il Rapporto è registrato (fase 6 </w:t>
+        <w:t xml:space="preserve">Il </w:t>
+      </w:r>
+      <w:r>
+        <w:rPr>
+          <w:rFonts w:ascii="Arial" w:cs="Arial" w:eastAsia="Arial" w:hAnsi="Arial"/>
+          <w:b/>
+          <w:bCs/>
+          <w:color w:val="1B2118"/>
+          <w:sz w:val="21"/>
+          <w:szCs w:val="21"/>
+        </w:rPr>
+        <w:t xml:space="preserve">Simulatore</w:t>
+      </w:r>
+      <w:r>
+        <w:rPr>
+          <w:rFonts w:ascii="Arial" w:cs="Arial" w:eastAsia="Arial" w:hAnsi="Arial"/>
+          <w:color w:val="1B2118"/>
+          <w:sz w:val="21"/>
+          <w:szCs w:val="21"/>
+        </w:rPr>
+        <w:t xml:space="preserve"> (menu </w:t>
       </w:r>
       <w:r>
         <w:rPr>
@@ -31584,16 +31676,72 @@
           <w:sz w:val="21"/>
           <w:szCs w:val="21"/>
         </w:rPr>
-        <w:t xml:space="preserve">Seconda verifica documentale</w:t>
-      </w:r>
-      <w:r>
-        <w:rPr>
-          <w:rFonts w:ascii="Arial" w:cs="Arial" w:eastAsia="Arial" w:hAnsi="Arial"/>
-          <w:color w:val="1B2118"/>
-          <w:sz w:val="21"/>
-          <w:szCs w:val="21"/>
-        </w:rPr>
-        <w:t xml:space="preserve"> completata) e se Rapporto e Progetto non sono sospesi, annullati o ritirati. Prima della registrazione il riquadro spiega che i crediti si emettono dopo la seconda verifica documentale.</w:t>
+        <w:t xml:space="preserve">Simulatore</w:t>
+      </w:r>
+      <w:r>
+        <w:rPr>
+          <w:rFonts w:ascii="Arial" w:cs="Arial" w:eastAsia="Arial" w:hAnsi="Arial"/>
+          <w:color w:val="1B2118"/>
+          <w:sz w:val="21"/>
+          <w:szCs w:val="21"/>
+        </w:rPr>
+        <w:t xml:space="preserve">, per Operatori e Amministratori) stima in anticipo quanti crediti un Comune potrebbe generare in </w:t>
+      </w:r>
+      <w:r>
+        <w:rPr>
+          <w:rFonts w:ascii="Arial" w:cs="Arial" w:eastAsia="Arial" w:hAnsi="Arial"/>
+          <w:b/>
+          <w:bCs/>
+          <w:color w:val="1B2118"/>
+          <w:sz w:val="21"/>
+          <w:szCs w:val="21"/>
+        </w:rPr>
+        <w:t xml:space="preserve">7, 10 o 21 anni</w:t>
+      </w:r>
+      <w:r>
+        <w:rPr>
+          <w:rFonts w:ascii="Arial" w:cs="Arial" w:eastAsia="Arial" w:hAnsi="Arial"/>
+          <w:color w:val="1B2118"/>
+          <w:sz w:val="21"/>
+          <w:szCs w:val="21"/>
+        </w:rPr>
+        <w:t xml:space="preserve">. Serve per presentare il Programma a un Comune o per confrontare obiettivi diversi. È una </w:t>
+      </w:r>
+      <w:r>
+        <w:rPr>
+          <w:rFonts w:ascii="Arial" w:cs="Arial" w:eastAsia="Arial" w:hAnsi="Arial"/>
+          <w:b/>
+          <w:bCs/>
+          <w:color w:val="1B2118"/>
+          <w:sz w:val="21"/>
+          <w:szCs w:val="21"/>
+        </w:rPr>
+        <w:t xml:space="preserve">stima ex ante, non certificabile</w:t>
+      </w:r>
+      <w:r>
+        <w:rPr>
+          <w:rFonts w:ascii="Arial" w:cs="Arial" w:eastAsia="Arial" w:hAnsi="Arial"/>
+          <w:color w:val="1B2118"/>
+          <w:sz w:val="21"/>
+          <w:szCs w:val="21"/>
+        </w:rPr>
+        <w:t xml:space="preserve">: i crediti veri si calcolano a consuntivo, con il calcolo dei crediti e la Banca Dati Utenze.</w:t>
+      </w:r>
+    </w:p>
+    <w:p>
+      <w:pPr>
+        <w:spacing w:after="140" w:line="300"/>
+      </w:pPr>
+      <w:r>
+        <w:rPr>
+          <w:rFonts w:ascii="Arial" w:cs="Arial" w:eastAsia="Arial" w:hAnsi="Arial"/>
+          <w:b/>
+          <w:bCs/>
+          <w:color w:val="1B2118"/>
+          <w:sz w:val="21"/>
+          <w:szCs w:val="21"/>
+        </w:rPr>
+        <w:t xml:space="preserve">Creare uno scenario</w:t>
       </w:r>
     </w:p>
     <w:p>
@@ -31612,38 +31760,38 @@
           <w:sz w:val="21"/>
           <w:szCs w:val="21"/>
         </w:rPr>
-        <w:t xml:space="preserve">Nel Rapporto, riquadro </w:t>
-      </w:r>
-      <w:r>
-        <w:rPr>
-          <w:rFonts w:ascii="Arial" w:cs="Arial" w:eastAsia="Arial" w:hAnsi="Arial"/>
-          <w:b/>
-          <w:bCs/>
-          <w:color w:val="1B2118"/>
-          <w:sz w:val="21"/>
-          <w:szCs w:val="21"/>
-        </w:rPr>
-        <w:t xml:space="preserve">Crediti emessi</w:t>
-      </w:r>
-      <w:r>
-        <w:rPr>
-          <w:rFonts w:ascii="Arial" w:cs="Arial" w:eastAsia="Arial" w:hAnsi="Arial"/>
-          <w:color w:val="1B2118"/>
-          <w:sz w:val="21"/>
-          <w:szCs w:val="21"/>
-        </w:rPr>
-        <w:t xml:space="preserve">, premete </w:t>
-      </w:r>
-      <w:r>
-        <w:rPr>
-          <w:rFonts w:ascii="Arial" w:cs="Arial" w:eastAsia="Arial" w:hAnsi="Arial"/>
-          <w:b/>
-          <w:bCs/>
-          <w:color w:val="1B2118"/>
-          <w:sz w:val="21"/>
-          <w:szCs w:val="21"/>
-        </w:rPr>
-        <w:t xml:space="preserve">+ Emetti crediti</w:t>
+        <w:t xml:space="preserve">Menu </w:t>
+      </w:r>
+      <w:r>
+        <w:rPr>
+          <w:rFonts w:ascii="Arial" w:cs="Arial" w:eastAsia="Arial" w:hAnsi="Arial"/>
+          <w:b/>
+          <w:bCs/>
+          <w:color w:val="1B2118"/>
+          <w:sz w:val="21"/>
+          <w:szCs w:val="21"/>
+        </w:rPr>
+        <w:t xml:space="preserve">Simulatore</w:t>
+      </w:r>
+      <w:r>
+        <w:rPr>
+          <w:rFonts w:ascii="Arial" w:cs="Arial" w:eastAsia="Arial" w:hAnsi="Arial"/>
+          <w:color w:val="1B2118"/>
+          <w:sz w:val="21"/>
+          <w:szCs w:val="21"/>
+        </w:rPr>
+        <w:t xml:space="preserve"> → </w:t>
+      </w:r>
+      <w:r>
+        <w:rPr>
+          <w:rFonts w:ascii="Arial" w:cs="Arial" w:eastAsia="Arial" w:hAnsi="Arial"/>
+          <w:b/>
+          <w:bCs/>
+          <w:color w:val="1B2118"/>
+          <w:sz w:val="21"/>
+          <w:szCs w:val="21"/>
+        </w:rPr>
+        <w:t xml:space="preserve">+ Nuovo scenario</w:t>
       </w:r>
       <w:r>
         <w:rPr>
@@ -31671,27 +31819,7 @@
           <w:sz w:val="21"/>
           <w:szCs w:val="21"/>
         </w:rPr>
-        <w:t xml:space="preserve">Se c'è, scegliete il </w:t>
-      </w:r>
-      <w:r>
-        <w:rPr>
-          <w:rFonts w:ascii="Arial" w:cs="Arial" w:eastAsia="Arial" w:hAnsi="Arial"/>
-          <w:b/>
-          <w:bCs/>
-          <w:color w:val="1B2118"/>
-          <w:sz w:val="21"/>
-          <w:szCs w:val="21"/>
-        </w:rPr>
-        <w:t xml:space="preserve">Calcolo ex post confermato (facoltativo)</w:t>
-      </w:r>
-      <w:r>
-        <w:rPr>
-          <w:rFonts w:ascii="Arial" w:cs="Arial" w:eastAsia="Arial" w:hAnsi="Arial"/>
-          <w:color w:val="1B2118"/>
-          <w:sz w:val="21"/>
-          <w:szCs w:val="21"/>
-        </w:rPr>
-        <w:t xml:space="preserve"> del Rapporto o del suo Progetto: il totale emesso con quel calcolo non può superare i suoi crediti netti.</w:t>
+        <w:t xml:space="preserve">Scegliete il Comune tra quelli censiti oppure scrivetene il nome (si possono simulare anche Comuni non ancora aderenti).</w:t>
       </w:r>
     </w:p>
     <w:p>
@@ -31710,47 +31838,156 @@
           <w:sz w:val="21"/>
           <w:szCs w:val="21"/>
         </w:rPr>
-        <w:t xml:space="preserve">Scrivete i </w:t>
-      </w:r>
-      <w:r>
-        <w:rPr>
-          <w:rFonts w:ascii="Arial" w:cs="Arial" w:eastAsia="Arial" w:hAnsi="Arial"/>
-          <w:b/>
-          <w:bCs/>
-          <w:color w:val="1B2118"/>
-          <w:sz w:val="21"/>
-          <w:szCs w:val="21"/>
-        </w:rPr>
-        <w:t xml:space="preserve">Crediti da emettere (tCO₂eq)</w:t>
-      </w:r>
-      <w:r>
-        <w:rPr>
-          <w:rFonts w:ascii="Arial" w:cs="Arial" w:eastAsia="Arial" w:hAnsi="Arial"/>
-          <w:color w:val="1B2118"/>
-          <w:sz w:val="21"/>
-          <w:szCs w:val="21"/>
-        </w:rPr>
-        <w:t xml:space="preserve"> e, nelle </w:t>
-      </w:r>
-      <w:r>
-        <w:rPr>
-          <w:rFonts w:ascii="Arial" w:cs="Arial" w:eastAsia="Arial" w:hAnsi="Arial"/>
-          <w:b/>
-          <w:bCs/>
-          <w:color w:val="1B2118"/>
-          <w:sz w:val="21"/>
-          <w:szCs w:val="21"/>
-        </w:rPr>
-        <w:t xml:space="preserve">Note</w:t>
-      </w:r>
-      <w:r>
-        <w:rPr>
-          <w:rFonts w:ascii="Arial" w:cs="Arial" w:eastAsia="Arial" w:hAnsi="Arial"/>
-          <w:color w:val="1B2118"/>
-          <w:sz w:val="21"/>
-          <w:szCs w:val="21"/>
-        </w:rPr>
-        <w:t xml:space="preserve">, ad esempio gli estremi del Rapporto di verifica e della Dichiarazione dell'ente.</w:t>
+        <w:t xml:space="preserve">Date un nome allo scenario (per esempio «prudente», «obiettivo», «ambizioso»), scegliete la </w:t>
+      </w:r>
+      <w:r>
+        <w:rPr>
+          <w:rFonts w:ascii="Arial" w:cs="Arial" w:eastAsia="Arial" w:hAnsi="Arial"/>
+          <w:b/>
+          <w:bCs/>
+          <w:color w:val="1B2118"/>
+          <w:sz w:val="21"/>
+          <w:szCs w:val="21"/>
+        </w:rPr>
+        <w:t xml:space="preserve">durata</w:t>
+      </w:r>
+      <w:r>
+        <w:rPr>
+          <w:rFonts w:ascii="Arial" w:cs="Arial" w:eastAsia="Arial" w:hAnsi="Arial"/>
+          <w:color w:val="1B2118"/>
+          <w:sz w:val="21"/>
+          <w:szCs w:val="21"/>
+        </w:rPr>
+        <w:t xml:space="preserve"> dal menu a tendina (7, 10 o 21 anni) e il primo anno → </w:t>
+      </w:r>
+      <w:r>
+        <w:rPr>
+          <w:rFonts w:ascii="Arial" w:cs="Arial" w:eastAsia="Arial" w:hAnsi="Arial"/>
+          <w:b/>
+          <w:bCs/>
+          <w:color w:val="1B2118"/>
+          <w:sz w:val="21"/>
+          <w:szCs w:val="21"/>
+        </w:rPr>
+        <w:t xml:space="preserve">Crea scenario</w:t>
+      </w:r>
+      <w:r>
+        <w:rPr>
+          <w:rFonts w:ascii="Arial" w:cs="Arial" w:eastAsia="Arial" w:hAnsi="Arial"/>
+          <w:color w:val="1B2118"/>
+          <w:sz w:val="21"/>
+          <w:szCs w:val="21"/>
+        </w:rPr>
+        <w:t xml:space="preserve">.</w:t>
+      </w:r>
+    </w:p>
+    <w:p>
+      <w:pPr>
+        <w:spacing w:after="60"/>
+      </w:pPr>
+    </w:p>
+    <w:p>
+      <w:pPr>
+        <w:spacing w:after="140" w:line="300"/>
+      </w:pPr>
+      <w:r>
+        <w:rPr>
+          <w:rFonts w:ascii="Arial" w:cs="Arial" w:eastAsia="Arial" w:hAnsi="Arial"/>
+          <w:color w:val="1B2118"/>
+          <w:sz w:val="21"/>
+          <w:szCs w:val="21"/>
+        </w:rPr>
+        <w:t xml:space="preserve">Per ogni Comune si possono creare più scenari; con </w:t>
+      </w:r>
+      <w:r>
+        <w:rPr>
+          <w:rFonts w:ascii="Arial" w:cs="Arial" w:eastAsia="Arial" w:hAnsi="Arial"/>
+          <w:b/>
+          <w:bCs/>
+          <w:color w:val="1B2118"/>
+          <w:sz w:val="21"/>
+          <w:szCs w:val="21"/>
+        </w:rPr>
+        <w:t xml:space="preserve">Duplica</w:t>
+      </w:r>
+      <w:r>
+        <w:rPr>
+          <w:rFonts w:ascii="Arial" w:cs="Arial" w:eastAsia="Arial" w:hAnsi="Arial"/>
+          <w:color w:val="1B2118"/>
+          <w:sz w:val="21"/>
+          <w:szCs w:val="21"/>
+        </w:rPr>
+        <w:t xml:space="preserve"> si parte da uno esistente e si cambia solo qualche obiettivo.</w:t>
+      </w:r>
+    </w:p>
+    <w:p>
+      <w:pPr>
+        <w:spacing w:after="140" w:line="300"/>
+      </w:pPr>
+      <w:r>
+        <w:rPr>
+          <w:rFonts w:ascii="Arial" w:cs="Arial" w:eastAsia="Arial" w:hAnsi="Arial"/>
+          <w:b/>
+          <w:bCs/>
+          <w:color w:val="1B2118"/>
+          <w:sz w:val="21"/>
+          <w:szCs w:val="21"/>
+        </w:rPr>
+        <w:t xml:space="preserve">1. Impostazioni.</w:t>
+      </w:r>
+      <w:r>
+        <w:rPr>
+          <w:rFonts w:ascii="Arial" w:cs="Arial" w:eastAsia="Arial" w:hAnsi="Arial"/>
+          <w:color w:val="1B2118"/>
+          <w:sz w:val="21"/>
+          <w:szCs w:val="21"/>
+        </w:rPr>
+        <w:t xml:space="preserve"> Nome, durata (menu a tendina 7 / 10 / 21 anni, Standard 4.3.8), primo anno, </w:t>
+      </w:r>
+      <w:r>
+        <w:rPr>
+          <w:rFonts w:ascii="Arial" w:cs="Arial" w:eastAsia="Arial" w:hAnsi="Arial"/>
+          <w:b/>
+          <w:bCs/>
+          <w:color w:val="1B2118"/>
+          <w:sz w:val="21"/>
+          <w:szCs w:val="21"/>
+        </w:rPr>
+        <w:t xml:space="preserve">buffer previsto</w:t>
+      </w:r>
+      <w:r>
+        <w:rPr>
+          <w:rFonts w:ascii="Arial" w:cs="Arial" w:eastAsia="Arial" w:hAnsi="Arial"/>
+          <w:color w:val="1B2118"/>
+          <w:sz w:val="21"/>
+          <w:szCs w:val="21"/>
+        </w:rPr>
+        <w:t xml:space="preserve"> (quota trattenuta dai crediti lordi, Capitolo 7 della Metodologia; 20% è un valore cautelativo) e note sulle ipotesi.</w:t>
+      </w:r>
+    </w:p>
+    <w:p>
+      <w:pPr>
+        <w:spacing w:after="140" w:line="300"/>
+      </w:pPr>
+      <w:r>
+        <w:rPr>
+          <w:rFonts w:ascii="Arial" w:cs="Arial" w:eastAsia="Arial" w:hAnsi="Arial"/>
+          <w:b/>
+          <w:bCs/>
+          <w:color w:val="1B2118"/>
+          <w:sz w:val="21"/>
+          <w:szCs w:val="21"/>
+        </w:rPr>
+        <w:t xml:space="preserve">2. Dati dell'anno base.</w:t>
+      </w:r>
+      <w:r>
+        <w:rPr>
+          <w:rFonts w:ascii="Arial" w:cs="Arial" w:eastAsia="Arial" w:hAnsi="Arial"/>
+          <w:color w:val="1B2118"/>
+          <w:sz w:val="21"/>
+          <w:szCs w:val="21"/>
+        </w:rPr>
+        <w:t xml:space="preserve"> Anno, popolazione residente e rifiuti per tipologia in tonnellate (secco residuo compreso). Tre modi per compilarli:</w:t>
       </w:r>
     </w:p>
     <w:p>
@@ -31758,7 +31995,7 @@
         <w:pStyle w:val="ListParagraph"/>
         <w:numPr>
           <w:ilvl w:val="0"/>
-          <w:numId w:val="30"/>
+          <w:numId w:val="2"/>
         </w:numPr>
         <w:spacing w:after="70" w:line="290"/>
       </w:pPr>
@@ -31769,47 +32006,7 @@
           <w:sz w:val="21"/>
           <w:szCs w:val="21"/>
         </w:rPr>
-        <w:t xml:space="preserve">Lasciate spuntato </w:t>
-      </w:r>
-      <w:r>
-        <w:rPr>
-          <w:rFonts w:ascii="Arial" w:cs="Arial" w:eastAsia="Arial" w:hAnsi="Arial"/>
-          <w:b/>
-          <w:bCs/>
-          <w:color w:val="1B2118"/>
-          <w:sz w:val="21"/>
-          <w:szCs w:val="21"/>
-        </w:rPr>
-        <w:t xml:space="preserve">Aggiungi la voce di pagamento della tariffa di emissione</w:t>
-      </w:r>
-      <w:r>
-        <w:rPr>
-          <w:rFonts w:ascii="Arial" w:cs="Arial" w:eastAsia="Arial" w:hAnsi="Arial"/>
-          <w:color w:val="1B2118"/>
-          <w:sz w:val="21"/>
-          <w:szCs w:val="21"/>
-        </w:rPr>
-        <w:t xml:space="preserve"> per creare la voce </w:t>
-      </w:r>
-      <w:r>
-        <w:rPr>
-          <w:rFonts w:ascii="Arial" w:cs="Arial" w:eastAsia="Arial" w:hAnsi="Arial"/>
-          <w:i/>
-          <w:iCs/>
-          <w:color w:val="1B2118"/>
-          <w:sz w:val="21"/>
-          <w:szCs w:val="21"/>
-        </w:rPr>
-        <w:t xml:space="preserve">Emissione dei crediti</w:t>
-      </w:r>
-      <w:r>
-        <w:rPr>
-          <w:rFonts w:ascii="Arial" w:cs="Arial" w:eastAsia="Arial" w:hAnsi="Arial"/>
-          <w:color w:val="1B2118"/>
-          <w:sz w:val="21"/>
-          <w:szCs w:val="21"/>
-        </w:rPr>
-        <w:t xml:space="preserve"> con l'importo a scaglioni e scadenza a 30 giorni.</w:t>
+        <w:t xml:space="preserve">a mano, dai dati del Catasto ISPRA o del gestore;</w:t>
       </w:r>
     </w:p>
     <w:p>
@@ -31817,13 +32014,308 @@
         <w:pStyle w:val="ListParagraph"/>
         <w:numPr>
           <w:ilvl w:val="0"/>
-          <w:numId w:val="30"/>
+          <w:numId w:val="2"/>
         </w:numPr>
         <w:spacing w:after="70" w:line="290"/>
       </w:pPr>
       <w:r>
         <w:rPr>
           <w:rFonts w:ascii="Arial" w:cs="Arial" w:eastAsia="Arial" w:hAnsi="Arial"/>
+          <w:b/>
+          <w:bCs/>
+          <w:color w:val="1B2118"/>
+          <w:sz w:val="21"/>
+          <w:szCs w:val="21"/>
+        </w:rPr>
+        <w:t xml:space="preserve">Usa i valori medi del cluster</w:t>
+      </w:r>
+      <w:r>
+        <w:rPr>
+          <w:rFonts w:ascii="Arial" w:cs="Arial" w:eastAsia="Arial" w:hAnsi="Arial"/>
+          <w:color w:val="1B2118"/>
+          <w:sz w:val="21"/>
+          <w:szCs w:val="21"/>
+        </w:rPr>
+        <w:t xml:space="preserve">: scelto il cluster SOSE del Comune, il portale riempie la tabella con i valori medi pro capite della Tabella 3 dello Standard × popolazione;</w:t>
+      </w:r>
+    </w:p>
+    <w:p>
+      <w:pPr>
+        <w:pStyle w:val="ListParagraph"/>
+        <w:numPr>
+          <w:ilvl w:val="0"/>
+          <w:numId w:val="2"/>
+        </w:numPr>
+        <w:spacing w:after="70" w:line="290"/>
+      </w:pPr>
+      <w:r>
+        <w:rPr>
+          <w:rFonts w:ascii="Arial" w:cs="Arial" w:eastAsia="Arial" w:hAnsi="Arial"/>
+          <w:b/>
+          <w:bCs/>
+          <w:color w:val="1B2118"/>
+          <w:sz w:val="21"/>
+          <w:szCs w:val="21"/>
+        </w:rPr>
+        <w:t xml:space="preserve">Importa da un calcolo dei crediti</w:t>
+      </w:r>
+      <w:r>
+        <w:rPr>
+          <w:rFonts w:ascii="Arial" w:cs="Arial" w:eastAsia="Arial" w:hAnsi="Arial"/>
+          <w:color w:val="1B2118"/>
+          <w:sz w:val="21"/>
+          <w:szCs w:val="21"/>
+        </w:rPr>
+        <w:t xml:space="preserve"> (solo Amministratori): riprende i rifiuti del territorio da un calcolo già fatto.</w:t>
+      </w:r>
+    </w:p>
+    <w:p>
+      <w:pPr>
+        <w:spacing w:after="140" w:line="300"/>
+      </w:pPr>
+      <w:r>
+        <w:rPr>
+          <w:rFonts w:ascii="Arial" w:cs="Arial" w:eastAsia="Arial" w:hAnsi="Arial"/>
+          <w:color w:val="1B2118"/>
+          <w:sz w:val="21"/>
+          <w:szCs w:val="21"/>
+        </w:rPr>
+        <w:t xml:space="preserve">A destra il riepilogo: produzione totale e pro capite, secco pro capite, </w:t>
+      </w:r>
+      <w:r>
+        <w:rPr>
+          <w:rFonts w:ascii="Arial" w:cs="Arial" w:eastAsia="Arial" w:hAnsi="Arial"/>
+          <w:b/>
+          <w:bCs/>
+          <w:color w:val="1B2118"/>
+          <w:sz w:val="21"/>
+          <w:szCs w:val="21"/>
+        </w:rPr>
+        <w:t xml:space="preserve">% di raccolta differenziata</w:t>
+      </w:r>
+      <w:r>
+        <w:rPr>
+          <w:rFonts w:ascii="Arial" w:cs="Arial" w:eastAsia="Arial" w:hAnsi="Arial"/>
+          <w:color w:val="1B2118"/>
+          <w:sz w:val="21"/>
+          <w:szCs w:val="21"/>
+        </w:rPr>
+        <w:t xml:space="preserve"> e fattore di emissione del secco (formule 16-17).</w:t>
+      </w:r>
+    </w:p>
+    <w:p>
+      <w:pPr>
+        <w:spacing w:after="140" w:line="300"/>
+      </w:pPr>
+      <w:r>
+        <w:rPr>
+          <w:rFonts w:ascii="Arial" w:cs="Arial" w:eastAsia="Arial" w:hAnsi="Arial"/>
+          <w:b/>
+          <w:bCs/>
+          <w:color w:val="1B2118"/>
+          <w:sz w:val="21"/>
+          <w:szCs w:val="21"/>
+        </w:rPr>
+        <w:t xml:space="preserve">3. Obiettivi anno per anno.</w:t>
+      </w:r>
+      <w:r>
+        <w:rPr>
+          <w:rFonts w:ascii="Arial" w:cs="Arial" w:eastAsia="Arial" w:hAnsi="Arial"/>
+          <w:color w:val="1B2118"/>
+          <w:sz w:val="21"/>
+          <w:szCs w:val="21"/>
+        </w:rPr>
+        <w:t xml:space="preserve"> Una riga per ogni anno del periodo: popolazione, </w:t>
+      </w:r>
+      <w:r>
+        <w:rPr>
+          <w:rFonts w:ascii="Arial" w:cs="Arial" w:eastAsia="Arial" w:hAnsi="Arial"/>
+          <w:b/>
+          <w:bCs/>
+          <w:color w:val="1B2118"/>
+          <w:sz w:val="21"/>
+          <w:szCs w:val="21"/>
+        </w:rPr>
+        <w:t xml:space="preserve">produzione totale prevista</w:t>
+      </w:r>
+      <w:r>
+        <w:rPr>
+          <w:rFonts w:ascii="Arial" w:cs="Arial" w:eastAsia="Arial" w:hAnsi="Arial"/>
+          <w:color w:val="1B2118"/>
+          <w:sz w:val="21"/>
+          <w:szCs w:val="21"/>
+        </w:rPr>
+        <w:t xml:space="preserve"> (in tonnellate, oppure scrivendo il pro capite in kg/ab) e </w:t>
+      </w:r>
+      <w:r>
+        <w:rPr>
+          <w:rFonts w:ascii="Arial" w:cs="Arial" w:eastAsia="Arial" w:hAnsi="Arial"/>
+          <w:b/>
+          <w:bCs/>
+          <w:color w:val="1B2118"/>
+          <w:sz w:val="21"/>
+          <w:szCs w:val="21"/>
+        </w:rPr>
+        <w:t xml:space="preserve">secco residuo pro capite</w:t>
+      </w:r>
+      <w:r>
+        <w:rPr>
+          <w:rFonts w:ascii="Arial" w:cs="Arial" w:eastAsia="Arial" w:hAnsi="Arial"/>
+          <w:color w:val="1B2118"/>
+          <w:sz w:val="21"/>
+          <w:szCs w:val="21"/>
+        </w:rPr>
+        <w:t xml:space="preserve"> obiettivo. Per non compilare tutto a mano, indicate gli obiettivi dell'ultimo anno (produzione pro capite e secco pro capite) e premete </w:t>
+      </w:r>
+      <w:r>
+        <w:rPr>
+          <w:rFonts w:ascii="Arial" w:cs="Arial" w:eastAsia="Arial" w:hAnsi="Arial"/>
+          <w:b/>
+          <w:bCs/>
+          <w:color w:val="1B2118"/>
+          <w:sz w:val="21"/>
+          <w:szCs w:val="21"/>
+        </w:rPr>
+        <w:t xml:space="preserve">Applica la traiettoria</w:t>
+      </w:r>
+      <w:r>
+        <w:rPr>
+          <w:rFonts w:ascii="Arial" w:cs="Arial" w:eastAsia="Arial" w:hAnsi="Arial"/>
+          <w:color w:val="1B2118"/>
+          <w:sz w:val="21"/>
+          <w:szCs w:val="21"/>
+        </w:rPr>
+        <w:t xml:space="preserve">: il portale riempie gli anni con un andamento lineare dall'anno base, poi potete correggere i singoli anni. Per ogni anno il portale ricalcola il secco in tonnellate e la </w:t>
+      </w:r>
+      <w:r>
+        <w:rPr>
+          <w:rFonts w:ascii="Arial" w:cs="Arial" w:eastAsia="Arial" w:hAnsi="Arial"/>
+          <w:b/>
+          <w:bCs/>
+          <w:color w:val="1B2118"/>
+          <w:sz w:val="21"/>
+          <w:szCs w:val="21"/>
+        </w:rPr>
+        <w:t xml:space="preserve">% di differenziata</w:t>
+      </w:r>
+      <w:r>
+        <w:rPr>
+          <w:rFonts w:ascii="Arial" w:cs="Arial" w:eastAsia="Arial" w:hAnsi="Arial"/>
+          <w:color w:val="1B2118"/>
+          <w:sz w:val="21"/>
+          <w:szCs w:val="21"/>
+        </w:rPr>
+        <w:t xml:space="preserve">.</w:t>
+      </w:r>
+    </w:p>
+    <w:p>
+      <w:pPr>
+        <w:spacing w:after="140" w:line="300"/>
+      </w:pPr>
+      <w:r>
+        <w:rPr>
+          <w:rFonts w:ascii="Arial" w:cs="Arial" w:eastAsia="Arial" w:hAnsi="Arial"/>
+          <w:b/>
+          <w:bCs/>
+          <w:color w:val="1B2118"/>
+          <w:sz w:val="21"/>
+          <w:szCs w:val="21"/>
+        </w:rPr>
+        <w:t xml:space="preserve">4. Risultati.</w:t>
+      </w:r>
+      <w:r>
+        <w:rPr>
+          <w:rFonts w:ascii="Arial" w:cs="Arial" w:eastAsia="Arial" w:hAnsi="Arial"/>
+          <w:color w:val="1B2118"/>
+          <w:sz w:val="21"/>
+          <w:szCs w:val="21"/>
+        </w:rPr>
+        <w:t xml:space="preserve"> Si aggiornano a ogni modifica:</w:t>
+      </w:r>
+    </w:p>
+    <w:p>
+      <w:pPr>
+        <w:pStyle w:val="ListParagraph"/>
+        <w:numPr>
+          <w:ilvl w:val="0"/>
+          <w:numId w:val="2"/>
+        </w:numPr>
+        <w:spacing w:after="70" w:line="290"/>
+      </w:pPr>
+      <w:r>
+        <w:rPr>
+          <w:rFonts w:ascii="Arial" w:cs="Arial" w:eastAsia="Arial" w:hAnsi="Arial"/>
+          <w:color w:val="1B2118"/>
+          <w:sz w:val="21"/>
+          <w:szCs w:val="21"/>
+        </w:rPr>
+        <w:t xml:space="preserve">crediti netti stimati nel periodo e media annua, % di differenziata dell'ultimo anno, rifiuti evitati;</w:t>
+      </w:r>
+    </w:p>
+    <w:p>
+      <w:pPr>
+        <w:pStyle w:val="ListParagraph"/>
+        <w:numPr>
+          <w:ilvl w:val="0"/>
+          <w:numId w:val="2"/>
+        </w:numPr>
+        <w:spacing w:after="70" w:line="290"/>
+      </w:pPr>
+      <w:r>
+        <w:rPr>
+          <w:rFonts w:ascii="Arial" w:cs="Arial" w:eastAsia="Arial" w:hAnsi="Arial"/>
+          <w:color w:val="1B2118"/>
+          <w:sz w:val="21"/>
+          <w:szCs w:val="21"/>
+        </w:rPr>
+        <w:t xml:space="preserve">grafico dei crediti netti per anno e grafico della % di differenziata rispetto all'anno base;</w:t>
+      </w:r>
+    </w:p>
+    <w:p>
+      <w:pPr>
+        <w:pStyle w:val="ListParagraph"/>
+        <w:numPr>
+          <w:ilvl w:val="0"/>
+          <w:numId w:val="2"/>
+        </w:numPr>
+        <w:spacing w:after="70" w:line="290"/>
+      </w:pPr>
+      <w:r>
+        <w:rPr>
+          <w:rFonts w:ascii="Arial" w:cs="Arial" w:eastAsia="Arial" w:hAnsi="Arial"/>
+          <w:color w:val="1B2118"/>
+          <w:sz w:val="21"/>
+          <w:szCs w:val="21"/>
+        </w:rPr>
+        <w:t xml:space="preserve">tabella anno per anno: produzione, scenario di riferimento, rifiuti evitati, crediti lordi, buffer, crediti netti e cumulati;</w:t>
+      </w:r>
+    </w:p>
+    <w:p>
+      <w:pPr>
+        <w:pStyle w:val="ListParagraph"/>
+        <w:numPr>
+          <w:ilvl w:val="0"/>
+          <w:numId w:val="2"/>
+        </w:numPr>
+        <w:spacing w:after="70" w:line="290"/>
+      </w:pPr>
+      <w:r>
+        <w:rPr>
+          <w:rFonts w:ascii="Arial" w:cs="Arial" w:eastAsia="Arial" w:hAnsi="Arial"/>
+          <w:color w:val="1B2118"/>
+          <w:sz w:val="21"/>
+          <w:szCs w:val="21"/>
+        </w:rPr>
+        <w:t xml:space="preserve">eventuali avvisi (dati mancanti, secco superiore al totale).</w:t>
+      </w:r>
+    </w:p>
+    <w:p>
+      <w:pPr>
+        <w:spacing w:after="140" w:line="300"/>
+      </w:pPr>
+      <w:r>
+        <w:rPr>
+          <w:rFonts w:ascii="Arial" w:cs="Arial" w:eastAsia="Arial" w:hAnsi="Arial"/>
           <w:color w:val="1B2118"/>
           <w:sz w:val="21"/>
           <w:szCs w:val="21"/>
@@ -31839,22 +32331,77 @@
           <w:sz w:val="21"/>
           <w:szCs w:val="21"/>
         </w:rPr>
-        <w:t xml:space="preserve">Emetti</w:t>
-      </w:r>
-      <w:r>
-        <w:rPr>
-          <w:rFonts w:ascii="Arial" w:cs="Arial" w:eastAsia="Arial" w:hAnsi="Arial"/>
-          <w:color w:val="1B2118"/>
-          <w:sz w:val="21"/>
-          <w:szCs w:val="21"/>
-        </w:rPr>
-        <w:t xml:space="preserve">.</w:t>
-      </w:r>
-    </w:p>
-    <w:p>
-      <w:pPr>
-        <w:spacing w:after="60"/>
-      </w:pPr>
+        <w:t xml:space="preserve">Salva</w:t>
+      </w:r>
+      <w:r>
+        <w:rPr>
+          <w:rFonts w:ascii="Arial" w:cs="Arial" w:eastAsia="Arial" w:hAnsi="Arial"/>
+          <w:color w:val="1B2118"/>
+          <w:sz w:val="21"/>
+          <w:szCs w:val="21"/>
+        </w:rPr>
+        <w:t xml:space="preserve"> per conservare lo scenario: nell'elenco </w:t>
+      </w:r>
+      <w:r>
+        <w:rPr>
+          <w:rFonts w:ascii="Arial" w:cs="Arial" w:eastAsia="Arial" w:hAnsi="Arial"/>
+          <w:i/>
+          <w:iCs/>
+          <w:color w:val="1B2118"/>
+          <w:sz w:val="21"/>
+          <w:szCs w:val="21"/>
+        </w:rPr>
+        <w:t xml:space="preserve">Scenari per Comune</w:t>
+      </w:r>
+      <w:r>
+        <w:rPr>
+          <w:rFonts w:ascii="Arial" w:cs="Arial" w:eastAsia="Arial" w:hAnsi="Arial"/>
+          <w:color w:val="1B2118"/>
+          <w:sz w:val="21"/>
+          <w:szCs w:val="21"/>
+        </w:rPr>
+        <w:t xml:space="preserve"> compaiono, per confrontarli, la % di differenziata finale e i crediti netti stimati di ogni scenario. </w:t>
+      </w:r>
+      <w:r>
+        <w:rPr>
+          <w:rFonts w:ascii="Arial" w:cs="Arial" w:eastAsia="Arial" w:hAnsi="Arial"/>
+          <w:b/>
+          <w:bCs/>
+          <w:color w:val="1B2118"/>
+          <w:sz w:val="21"/>
+          <w:szCs w:val="21"/>
+        </w:rPr>
+        <w:t xml:space="preserve">Esporta CSV</w:t>
+      </w:r>
+      <w:r>
+        <w:rPr>
+          <w:rFonts w:ascii="Arial" w:cs="Arial" w:eastAsia="Arial" w:hAnsi="Arial"/>
+          <w:color w:val="1B2118"/>
+          <w:sz w:val="21"/>
+          <w:szCs w:val="21"/>
+        </w:rPr>
+        <w:t xml:space="preserve"> scarica la tabella (si apre con Excel), </w:t>
+      </w:r>
+      <w:r>
+        <w:rPr>
+          <w:rFonts w:ascii="Arial" w:cs="Arial" w:eastAsia="Arial" w:hAnsi="Arial"/>
+          <w:b/>
+          <w:bCs/>
+          <w:color w:val="1B2118"/>
+          <w:sz w:val="21"/>
+          <w:szCs w:val="21"/>
+        </w:rPr>
+        <w:t xml:space="preserve">Stampa</w:t>
+      </w:r>
+      <w:r>
+        <w:rPr>
+          <w:rFonts w:ascii="Arial" w:cs="Arial" w:eastAsia="Arial" w:hAnsi="Arial"/>
+          <w:color w:val="1B2118"/>
+          <w:sz w:val="21"/>
+          <w:szCs w:val="21"/>
+        </w:rPr>
+        <w:t xml:space="preserve"> produce una versione da stampare o salvare in PDF.</w:t>
+      </w:r>
     </w:p>
     <w:p>
       <w:pPr>
@@ -31863,104 +32410,513 @@
       <w:r>
         <w:rPr>
           <w:rFonts w:ascii="Arial" w:cs="Arial" w:eastAsia="Arial" w:hAnsi="Arial"/>
-          <w:color w:val="1B2118"/>
-          <w:sz w:val="21"/>
-          <w:szCs w:val="21"/>
-        </w:rPr>
-        <w:t xml:space="preserve">Nasce un </w:t>
-      </w:r>
-      <w:r>
-        <w:rPr>
-          <w:rFonts w:ascii="Arial" w:cs="Arial" w:eastAsia="Arial" w:hAnsi="Arial"/>
-          <w:b/>
-          <w:bCs/>
-          <w:color w:val="1B2118"/>
-          <w:sz w:val="21"/>
-          <w:szCs w:val="21"/>
-        </w:rPr>
-        <w:t xml:space="preserve">lotto</w:t>
-      </w:r>
-      <w:r>
-        <w:rPr>
-          <w:rFonts w:ascii="Arial" w:cs="Arial" w:eastAsia="Arial" w:hAnsi="Arial"/>
-          <w:color w:val="1B2118"/>
-          <w:sz w:val="21"/>
-          <w:szCs w:val="21"/>
-        </w:rPr>
-        <w:t xml:space="preserve"> con codice </w:t>
-      </w:r>
-      <w:r>
-        <w:rPr>
-          <w:rFonts w:ascii="Consolas" w:cs="Consolas" w:eastAsia="Consolas" w:hAnsi="Consolas"/>
+          <w:b/>
+          <w:bCs/>
+          <w:color w:val="1B2118"/>
+          <w:sz w:val="21"/>
+          <w:szCs w:val="21"/>
+        </w:rPr>
+        <w:t xml:space="preserve">Come stima i crediti.</w:t>
+      </w:r>
+      <w:r>
+        <w:rPr>
+          <w:rFonts w:ascii="Arial" w:cs="Arial" w:eastAsia="Arial" w:hAnsi="Arial"/>
+          <w:color w:val="1B2118"/>
+          <w:sz w:val="21"/>
+          <w:szCs w:val="21"/>
+        </w:rPr>
+        <w:t xml:space="preserve"> Il simulatore usa le formule della Metodologia CWP v1.2 a livello di Comune:</w:t>
+      </w:r>
+    </w:p>
+    <w:tbl>
+      <w:tblPr>
+        <w:tblW w:type="dxa" w:w="9638"/>
+        <w:tblBorders>
+          <w:top w:val="single" w:color="auto" w:sz="4"/>
+          <w:left w:val="single" w:color="auto" w:sz="4"/>
+          <w:bottom w:val="single" w:color="auto" w:sz="4"/>
+          <w:right w:val="single" w:color="auto" w:sz="4"/>
+          <w:insideH w:val="single" w:color="auto" w:sz="4"/>
+          <w:insideV w:val="single" w:color="auto" w:sz="4"/>
+        </w:tblBorders>
+        <w:tblLayout w:type="fixed"/>
+      </w:tblPr>
+      <w:tblGrid>
+        <w:gridCol w:w="2271"/>
+        <w:gridCol w:w="7367"/>
+      </w:tblGrid>
+      <w:tr>
+        <w:trPr>
+          <w:tblHeader/>
+        </w:trPr>
+        <w:tc>
+          <w:tcPr>
+            <w:tcW w:type="dxa" w:w="2271"/>
+            <w:tcBorders>
+              <w:top w:val="single" w:color="D9D4C5" w:sz="4"/>
+              <w:left w:val="single" w:color="D9D4C5" w:sz="4"/>
+              <w:bottom w:val="single" w:color="D9D4C5" w:sz="4"/>
+              <w:right w:val="single" w:color="D9D4C5" w:sz="4"/>
+            </w:tcBorders>
+            <w:shd w:fill="2F5D3A" w:color="auto" w:val="clear"/>
+            <w:tcMar>
+              <w:top w:type="dxa" w:w="70"/>
+              <w:left w:type="dxa" w:w="110"/>
+              <w:bottom w:type="dxa" w:w="70"/>
+              <w:right w:type="dxa" w:w="110"/>
+            </w:tcMar>
+            <w:vAlign w:val="center"/>
+          </w:tcPr>
+          <w:p>
+            <w:pPr>
+              <w:spacing w:after="0" w:before="0"/>
+            </w:pPr>
+            <w:r>
+              <w:rPr>
+                <w:rFonts w:ascii="Arial" w:cs="Arial" w:eastAsia="Arial" w:hAnsi="Arial"/>
+                <w:b/>
+                <w:bCs/>
+                <w:color w:val="FFFFFF"/>
+                <w:sz w:val="18"/>
+                <w:szCs w:val="18"/>
+              </w:rPr>
+              <w:t xml:space="preserve">Grandezza</w:t>
+            </w:r>
+          </w:p>
+        </w:tc>
+        <w:tc>
+          <w:tcPr>
+            <w:tcW w:type="dxa" w:w="7367"/>
+            <w:tcBorders>
+              <w:top w:val="single" w:color="D9D4C5" w:sz="4"/>
+              <w:left w:val="single" w:color="D9D4C5" w:sz="4"/>
+              <w:bottom w:val="single" w:color="D9D4C5" w:sz="4"/>
+              <w:right w:val="single" w:color="D9D4C5" w:sz="4"/>
+            </w:tcBorders>
+            <w:shd w:fill="2F5D3A" w:color="auto" w:val="clear"/>
+            <w:tcMar>
+              <w:top w:type="dxa" w:w="70"/>
+              <w:left w:type="dxa" w:w="110"/>
+              <w:bottom w:type="dxa" w:w="70"/>
+              <w:right w:type="dxa" w:w="110"/>
+            </w:tcMar>
+            <w:vAlign w:val="center"/>
+          </w:tcPr>
+          <w:p>
+            <w:pPr>
+              <w:spacing w:after="0" w:before="0"/>
+            </w:pPr>
+            <w:r>
+              <w:rPr>
+                <w:rFonts w:ascii="Arial" w:cs="Arial" w:eastAsia="Arial" w:hAnsi="Arial"/>
+                <w:b/>
+                <w:bCs/>
+                <w:color w:val="FFFFFF"/>
+                <w:sz w:val="18"/>
+                <w:szCs w:val="18"/>
+              </w:rPr>
+              <w:t xml:space="preserve">Come si calcola</w:t>
+            </w:r>
+          </w:p>
+        </w:tc>
+      </w:tr>
+      <w:tr>
+        <w:trPr>
+          <w:cantSplit/>
+        </w:trPr>
+        <w:tc>
+          <w:tcPr>
+            <w:tcW w:type="dxa" w:w="2271"/>
+            <w:tcBorders>
+              <w:top w:val="single" w:color="D9D4C5" w:sz="4"/>
+              <w:left w:val="single" w:color="D9D4C5" w:sz="4"/>
+              <w:bottom w:val="single" w:color="D9D4C5" w:sz="4"/>
+              <w:right w:val="single" w:color="D9D4C5" w:sz="4"/>
+            </w:tcBorders>
+            <w:tcMar>
+              <w:top w:type="dxa" w:w="70"/>
+              <w:left w:type="dxa" w:w="110"/>
+              <w:bottom w:type="dxa" w:w="70"/>
+              <w:right w:type="dxa" w:w="110"/>
+            </w:tcMar>
+            <w:vAlign w:val="center"/>
+          </w:tcPr>
+          <w:p>
+            <w:pPr>
+              <w:spacing w:after="0" w:before="0"/>
+            </w:pPr>
+            <w:r>
+              <w:rPr>
+                <w:rFonts w:ascii="Arial" w:cs="Arial" w:eastAsia="Arial" w:hAnsi="Arial"/>
+                <w:color w:val="1B2118"/>
+                <w:sz w:val="18"/>
+                <w:szCs w:val="18"/>
+              </w:rPr>
+              <w:t xml:space="preserve">Scenario di riferimento</w:t>
+            </w:r>
+          </w:p>
+        </w:tc>
+        <w:tc>
+          <w:tcPr>
+            <w:tcW w:type="dxa" w:w="7367"/>
+            <w:tcBorders>
+              <w:top w:val="single" w:color="D9D4C5" w:sz="4"/>
+              <w:left w:val="single" w:color="D9D4C5" w:sz="4"/>
+              <w:bottom w:val="single" w:color="D9D4C5" w:sz="4"/>
+              <w:right w:val="single" w:color="D9D4C5" w:sz="4"/>
+            </w:tcBorders>
+            <w:tcMar>
+              <w:top w:type="dxa" w:w="70"/>
+              <w:left w:type="dxa" w:w="110"/>
+              <w:bottom w:type="dxa" w:w="70"/>
+              <w:right w:type="dxa" w:w="110"/>
+            </w:tcMar>
+            <w:vAlign w:val="center"/>
+          </w:tcPr>
+          <w:p>
+            <w:pPr>
+              <w:spacing w:after="0" w:before="0"/>
+            </w:pPr>
+            <w:r>
+              <w:rPr>
+                <w:rFonts w:ascii="Arial" w:cs="Arial" w:eastAsia="Arial" w:hAnsi="Arial"/>
+                <w:color w:val="1B2118"/>
+                <w:sz w:val="18"/>
+                <w:szCs w:val="18"/>
+              </w:rPr>
+              <w:t xml:space="preserve">Rifiuti pro capite dell'anno base, per tipologia, × popolazione dell'anno</w:t>
+            </w:r>
+          </w:p>
+        </w:tc>
+      </w:tr>
+      <w:tr>
+        <w:trPr>
+          <w:cantSplit/>
+        </w:trPr>
+        <w:tc>
+          <w:tcPr>
+            <w:tcW w:type="dxa" w:w="2271"/>
+            <w:tcBorders>
+              <w:top w:val="single" w:color="D9D4C5" w:sz="4"/>
+              <w:left w:val="single" w:color="D9D4C5" w:sz="4"/>
+              <w:bottom w:val="single" w:color="D9D4C5" w:sz="4"/>
+              <w:right w:val="single" w:color="D9D4C5" w:sz="4"/>
+            </w:tcBorders>
+            <w:shd w:fill="F6F4EE" w:color="auto" w:val="clear"/>
+            <w:tcMar>
+              <w:top w:type="dxa" w:w="70"/>
+              <w:left w:type="dxa" w:w="110"/>
+              <w:bottom w:type="dxa" w:w="70"/>
+              <w:right w:type="dxa" w:w="110"/>
+            </w:tcMar>
+            <w:vAlign w:val="center"/>
+          </w:tcPr>
+          <w:p>
+            <w:pPr>
+              <w:spacing w:after="0" w:before="0"/>
+            </w:pPr>
+            <w:r>
+              <w:rPr>
+                <w:rFonts w:ascii="Arial" w:cs="Arial" w:eastAsia="Arial" w:hAnsi="Arial"/>
+                <w:color w:val="1B2118"/>
+                <w:sz w:val="18"/>
+                <w:szCs w:val="18"/>
+              </w:rPr>
+              <w:t xml:space="preserve">Scenario simulato</w:t>
+            </w:r>
+          </w:p>
+        </w:tc>
+        <w:tc>
+          <w:tcPr>
+            <w:tcW w:type="dxa" w:w="7367"/>
+            <w:tcBorders>
+              <w:top w:val="single" w:color="D9D4C5" w:sz="4"/>
+              <w:left w:val="single" w:color="D9D4C5" w:sz="4"/>
+              <w:bottom w:val="single" w:color="D9D4C5" w:sz="4"/>
+              <w:right w:val="single" w:color="D9D4C5" w:sz="4"/>
+            </w:tcBorders>
+            <w:shd w:fill="F6F4EE" w:color="auto" w:val="clear"/>
+            <w:tcMar>
+              <w:top w:type="dxa" w:w="70"/>
+              <w:left w:type="dxa" w:w="110"/>
+              <w:bottom w:type="dxa" w:w="70"/>
+              <w:right w:type="dxa" w:w="110"/>
+            </w:tcMar>
+            <w:vAlign w:val="center"/>
+          </w:tcPr>
+          <w:p>
+            <w:pPr>
+              <w:spacing w:after="0" w:before="0"/>
+            </w:pPr>
+            <w:r>
+              <w:rPr>
+                <w:rFonts w:ascii="Arial" w:cs="Arial" w:eastAsia="Arial" w:hAnsi="Arial"/>
+                <w:color w:val="1B2118"/>
+                <w:sz w:val="18"/>
+                <w:szCs w:val="18"/>
+              </w:rPr>
+              <w:t xml:space="preserve">Secco obiettivo + differenziata (totale − secco) ripartita con le proporzioni dell'anno base</w:t>
+            </w:r>
+          </w:p>
+        </w:tc>
+      </w:tr>
+      <w:tr>
+        <w:trPr>
+          <w:cantSplit/>
+        </w:trPr>
+        <w:tc>
+          <w:tcPr>
+            <w:tcW w:type="dxa" w:w="2271"/>
+            <w:tcBorders>
+              <w:top w:val="single" w:color="D9D4C5" w:sz="4"/>
+              <w:left w:val="single" w:color="D9D4C5" w:sz="4"/>
+              <w:bottom w:val="single" w:color="D9D4C5" w:sz="4"/>
+              <w:right w:val="single" w:color="D9D4C5" w:sz="4"/>
+            </w:tcBorders>
+            <w:tcMar>
+              <w:top w:type="dxa" w:w="70"/>
+              <w:left w:type="dxa" w:w="110"/>
+              <w:bottom w:type="dxa" w:w="70"/>
+              <w:right w:type="dxa" w:w="110"/>
+            </w:tcMar>
+            <w:vAlign w:val="center"/>
+          </w:tcPr>
+          <w:p>
+            <w:pPr>
+              <w:spacing w:after="0" w:before="0"/>
+            </w:pPr>
+            <w:r>
+              <w:rPr>
+                <w:rFonts w:ascii="Arial" w:cs="Arial" w:eastAsia="Arial" w:hAnsi="Arial"/>
+                <w:color w:val="1B2118"/>
+                <w:sz w:val="18"/>
+                <w:szCs w:val="18"/>
+              </w:rPr>
+              <w:t xml:space="preserve">Emissioni</w:t>
+            </w:r>
+          </w:p>
+        </w:tc>
+        <w:tc>
+          <w:tcPr>
+            <w:tcW w:type="dxa" w:w="7367"/>
+            <w:tcBorders>
+              <w:top w:val="single" w:color="D9D4C5" w:sz="4"/>
+              <w:left w:val="single" w:color="D9D4C5" w:sz="4"/>
+              <w:bottom w:val="single" w:color="D9D4C5" w:sz="4"/>
+              <w:right w:val="single" w:color="D9D4C5" w:sz="4"/>
+            </w:tcBorders>
+            <w:tcMar>
+              <w:top w:type="dxa" w:w="70"/>
+              <w:left w:type="dxa" w:w="110"/>
+              <w:bottom w:type="dxa" w:w="70"/>
+              <w:right w:type="dxa" w:w="110"/>
+            </w:tcMar>
+            <w:vAlign w:val="center"/>
+          </w:tcPr>
+          <w:p>
+            <w:pPr>
+              <w:spacing w:after="0" w:before="0"/>
+            </w:pPr>
+            <w:r>
+              <w:rPr>
+                <w:rFonts w:ascii="Arial" w:cs="Arial" w:eastAsia="Arial" w:hAnsi="Arial"/>
+                <w:color w:val="1B2118"/>
+                <w:sz w:val="18"/>
+                <w:szCs w:val="18"/>
+              </w:rPr>
+              <w:t xml:space="preserve">− Σ quantità × fattore di emissione (formule 13 e 25); per il secco la media dei fattori della differenziata (formule 16-17)</w:t>
+            </w:r>
+          </w:p>
+        </w:tc>
+      </w:tr>
+      <w:tr>
+        <w:trPr>
+          <w:cantSplit/>
+        </w:trPr>
+        <w:tc>
+          <w:tcPr>
+            <w:tcW w:type="dxa" w:w="2271"/>
+            <w:tcBorders>
+              <w:top w:val="single" w:color="D9D4C5" w:sz="4"/>
+              <w:left w:val="single" w:color="D9D4C5" w:sz="4"/>
+              <w:bottom w:val="single" w:color="D9D4C5" w:sz="4"/>
+              <w:right w:val="single" w:color="D9D4C5" w:sz="4"/>
+            </w:tcBorders>
+            <w:shd w:fill="F6F4EE" w:color="auto" w:val="clear"/>
+            <w:tcMar>
+              <w:top w:type="dxa" w:w="70"/>
+              <w:left w:type="dxa" w:w="110"/>
+              <w:bottom w:type="dxa" w:w="70"/>
+              <w:right w:type="dxa" w:w="110"/>
+            </w:tcMar>
+            <w:vAlign w:val="center"/>
+          </w:tcPr>
+          <w:p>
+            <w:pPr>
+              <w:spacing w:after="0" w:before="0"/>
+            </w:pPr>
+            <w:r>
+              <w:rPr>
+                <w:rFonts w:ascii="Arial" w:cs="Arial" w:eastAsia="Arial" w:hAnsi="Arial"/>
+                <w:color w:val="1B2118"/>
+                <w:sz w:val="18"/>
+                <w:szCs w:val="18"/>
+              </w:rPr>
+              <w:t xml:space="preserve">Crediti</w:t>
+            </w:r>
+          </w:p>
+        </w:tc>
+        <w:tc>
+          <w:tcPr>
+            <w:tcW w:type="dxa" w:w="7367"/>
+            <w:tcBorders>
+              <w:top w:val="single" w:color="D9D4C5" w:sz="4"/>
+              <w:left w:val="single" w:color="D9D4C5" w:sz="4"/>
+              <w:bottom w:val="single" w:color="D9D4C5" w:sz="4"/>
+              <w:right w:val="single" w:color="D9D4C5" w:sz="4"/>
+            </w:tcBorders>
+            <w:shd w:fill="F6F4EE" w:color="auto" w:val="clear"/>
+            <w:tcMar>
+              <w:top w:type="dxa" w:w="70"/>
+              <w:left w:type="dxa" w:w="110"/>
+              <w:bottom w:type="dxa" w:w="70"/>
+              <w:right w:type="dxa" w:w="110"/>
+            </w:tcMar>
+            <w:vAlign w:val="center"/>
+          </w:tcPr>
+          <w:p>
+            <w:pPr>
+              <w:spacing w:after="0" w:before="0"/>
+            </w:pPr>
+            <w:r>
+              <w:rPr>
+                <w:rFonts w:ascii="Arial" w:cs="Arial" w:eastAsia="Arial" w:hAnsi="Arial"/>
+                <w:color w:val="1B2118"/>
+                <w:sz w:val="18"/>
+                <w:szCs w:val="18"/>
+              </w:rPr>
+              <w:t xml:space="preserve">Lordi = riduzione delle emissioni rispetto al riferimento; netti = lordi × (1 − buffer)</w:t>
+            </w:r>
+          </w:p>
+        </w:tc>
+      </w:tr>
+    </w:tbl>
+    <w:p>
+      <w:pPr>
+        <w:spacing w:after="160"/>
+      </w:pPr>
+    </w:p>
+    <w:p>
+      <w:pPr>
+        <w:pBdr>
+          <w:left w:val="single" w:color="2F5D3A" w:sz="18" w:space="8"/>
+        </w:pBdr>
+        <w:shd w:fill="E4EDE1" w:color="auto" w:val="clear"/>
+        <w:spacing w:after="140" w:line="300"/>
+        <w:ind w:left="240"/>
+      </w:pPr>
+      <w:r>
+        <w:rPr>
+          <w:rFonts w:ascii="Arial" w:cs="Arial" w:eastAsia="Arial" w:hAnsi="Arial"/>
+          <w:b/>
+          <w:bCs/>
+          <w:color w:val="1B2118"/>
+          <w:sz w:val="21"/>
+          <w:szCs w:val="21"/>
+        </w:rPr>
+        <w:t xml:space="preserve">Da sapere.</w:t>
+      </w:r>
+      <w:r>
+        <w:rPr>
+          <w:rFonts w:ascii="Arial" w:cs="Arial" w:eastAsia="Arial" w:hAnsi="Arial"/>
+          <w:color w:val="1B2118"/>
+          <w:sz w:val="21"/>
+          <w:szCs w:val="21"/>
+        </w:rPr>
+        <w:t xml:space="preserve"> Con queste formule i crediti nascono dai </w:t>
+      </w:r>
+      <w:r>
+        <w:rPr>
+          <w:rFonts w:ascii="Arial" w:cs="Arial" w:eastAsia="Arial" w:hAnsi="Arial"/>
+          <w:b/>
+          <w:bCs/>
+          <w:color w:val="1B2118"/>
+          <w:sz w:val="21"/>
+          <w:szCs w:val="21"/>
+        </w:rPr>
+        <w:t xml:space="preserve">rifiuti evitati</w:t>
+      </w:r>
+      <w:r>
+        <w:rPr>
+          <w:rFonts w:ascii="Arial" w:cs="Arial" w:eastAsia="Arial" w:hAnsi="Arial"/>
+          <w:color w:val="1B2118"/>
+          <w:sz w:val="21"/>
+          <w:szCs w:val="21"/>
+        </w:rPr>
+        <w:t xml:space="preserve">, cioè prodotti in meno rispetto allo scenario di riferimento: il riquadro </w:t>
+      </w:r>
+      <w:r>
+        <w:rPr>
+          <w:rFonts w:ascii="Arial" w:cs="Arial" w:eastAsia="Arial" w:hAnsi="Arial"/>
+          <w:i/>
+          <w:iCs/>
+          <w:color w:val="1B2118"/>
+          <w:sz w:val="21"/>
+          <w:szCs w:val="21"/>
+        </w:rPr>
+        <w:t xml:space="preserve">Da dove vengono i crediti</w:t>
+      </w:r>
+      <w:r>
+        <w:rPr>
+          <w:rFonts w:ascii="Arial" w:cs="Arial" w:eastAsia="Arial" w:hAnsi="Arial"/>
+          <w:color w:val="1B2118"/>
+          <w:sz w:val="21"/>
+          <w:szCs w:val="21"/>
+        </w:rPr>
+        <w:t xml:space="preserve"> indica quante tCO₂eq vale una tonnellata in meno per quel Comune. Spostare rifiuti dal secco alla differenziata alza la percentuale di raccolta differenziata ma, a parità di produzione totale, non genera crediti. Il modello semplificato va confermato dalla Fondazione.</w:t>
+      </w:r>
+    </w:p>
+    <w:p>
+      <w:pPr>
+        <w:spacing w:after="120"/>
+      </w:pPr>
+    </w:p>
+    <w:p>
+      <w:pPr>
+        <w:spacing w:after="140" w:line="300"/>
+      </w:pPr>
+      <w:r>
+        <w:rPr>
+          <w:rFonts w:ascii="Arial" w:cs="Arial" w:eastAsia="Arial" w:hAnsi="Arial"/>
+          <w:color w:val="1B2118"/>
+          <w:sz w:val="21"/>
+          <w:szCs w:val="21"/>
+        </w:rPr>
+        <w:t xml:space="preserve">Ogni creazione, modifica e cancellazione di uno scenario è registrata nell'audit. I Comuni non vedono gli scenari.</w:t>
+      </w:r>
+    </w:p>
+    <w:p>
+      <w:pPr>
+        <w:pStyle w:val="Heading1"/>
+        <w:pageBreakBefore/>
+        <w:pBdr>
+          <w:bottom w:val="single" w:color="2F5D3A" w:sz="12" w:space="6"/>
+        </w:pBdr>
+        <w:spacing w:after="240" w:before="0"/>
+      </w:pPr>
+      <w:bookmarkStart w:name="cap19" w:id="1"/>
+      <w:r>
+        <w:rPr>
+          <w:rFonts w:ascii="Arial" w:cs="Arial" w:eastAsia="Arial" w:hAnsi="Arial"/>
+          <w:b/>
+          <w:bCs/>
           <w:color w:val="2F5D3A"/>
-          <w:sz w:val="21"/>
-          <w:szCs w:val="21"/>
-        </w:rPr>
-        <w:t xml:space="preserve">&lt;codice Rapporto&gt;-L1</w:t>
-      </w:r>
-      <w:r>
-        <w:rPr>
-          <w:rFonts w:ascii="Arial" w:cs="Arial" w:eastAsia="Arial" w:hAnsi="Arial"/>
-          <w:color w:val="1B2118"/>
-          <w:sz w:val="21"/>
-          <w:szCs w:val="21"/>
-        </w:rPr>
-        <w:t xml:space="preserve"> (poi L2, L3…) e ogni credito ha l'ID </w:t>
-      </w:r>
-      <w:r>
-        <w:rPr>
-          <w:rFonts w:ascii="Consolas" w:cs="Consolas" w:eastAsia="Consolas" w:hAnsi="Consolas"/>
-          <w:color w:val="2F5D3A"/>
-          <w:sz w:val="21"/>
-          <w:szCs w:val="21"/>
-        </w:rPr>
-        <w:t xml:space="preserve">&lt;codice lotto&gt;-000001</w:t>
-      </w:r>
-      <w:r>
-        <w:rPr>
-          <w:rFonts w:ascii="Arial" w:cs="Arial" w:eastAsia="Arial" w:hAnsi="Arial"/>
-          <w:color w:val="1B2118"/>
-          <w:sz w:val="21"/>
-          <w:szCs w:val="21"/>
-        </w:rPr>
-        <w:t xml:space="preserve">, </w:t>
-      </w:r>
-      <w:r>
-        <w:rPr>
-          <w:rFonts w:ascii="Consolas" w:cs="Consolas" w:eastAsia="Consolas" w:hAnsi="Consolas"/>
-          <w:color w:val="2F5D3A"/>
-          <w:sz w:val="21"/>
-          <w:szCs w:val="21"/>
-        </w:rPr>
-        <w:t xml:space="preserve">-000002</w:t>
-      </w:r>
-      <w:r>
-        <w:rPr>
-          <w:rFonts w:ascii="Arial" w:cs="Arial" w:eastAsia="Arial" w:hAnsi="Arial"/>
-          <w:color w:val="1B2118"/>
-          <w:sz w:val="21"/>
-          <w:szCs w:val="21"/>
-        </w:rPr>
-        <w:t xml:space="preserve"> e così via (es. </w:t>
-      </w:r>
-      <w:r>
-        <w:rPr>
-          <w:rFonts w:ascii="Consolas" w:cs="Consolas" w:eastAsia="Consolas" w:hAnsi="Consolas"/>
-          <w:color w:val="2F5D3A"/>
-          <w:sz w:val="21"/>
-          <w:szCs w:val="21"/>
-        </w:rPr>
-        <w:t xml:space="preserve">CWP-2026-0001-RM1-L1-000001</w:t>
-      </w:r>
-      <w:r>
-        <w:rPr>
-          <w:rFonts w:ascii="Arial" w:cs="Arial" w:eastAsia="Arial" w:hAnsi="Arial"/>
-          <w:color w:val="1B2118"/>
-          <w:sz w:val="21"/>
-          <w:szCs w:val="21"/>
-        </w:rPr>
-        <w:t xml:space="preserve">). Il lotto mostra quantità, data di emissione e ID dal primo all'ultimo. Il Comune riceve la notifica «Crediti emessi» e vede i propri crediti in sola lettura.</w:t>
-      </w:r>
+          <w:sz w:val="34"/>
+          <w:szCs w:val="34"/>
+        </w:rPr>
+        <w:t xml:space="preserve">19. Crediti emessi</w:t>
+      </w:r>
+      <w:bookmarkEnd w:id="1"/>
     </w:p>
     <w:p>
       <w:pPr>
@@ -31969,13 +32925,121 @@
       <w:r>
         <w:rPr>
           <w:rFonts w:ascii="Arial" w:cs="Arial" w:eastAsia="Arial" w:hAnsi="Arial"/>
-          <w:b/>
-          <w:bCs/>
-          <w:color w:val="1B2118"/>
-          <w:sz w:val="21"/>
-          <w:szCs w:val="21"/>
-        </w:rPr>
-        <w:t xml:space="preserve">Caricare i crediti sul registro (staff)</w:t>
+          <w:color w:val="1B2118"/>
+          <w:sz w:val="21"/>
+          <w:szCs w:val="21"/>
+        </w:rPr>
+        <w:t xml:space="preserve">Dopo la registrazione di un Rapporto di Monitoraggio la Fondazione emette i crediti, con un </w:t>
+      </w:r>
+      <w:r>
+        <w:rPr>
+          <w:rFonts w:ascii="Arial" w:cs="Arial" w:eastAsia="Arial" w:hAnsi="Arial"/>
+          <w:b/>
+          <w:bCs/>
+          <w:color w:val="1B2118"/>
+          <w:sz w:val="21"/>
+          <w:szCs w:val="21"/>
+        </w:rPr>
+        <w:t xml:space="preserve">ID univoco per ogni credito</w:t>
+      </w:r>
+      <w:r>
+        <w:rPr>
+          <w:rFonts w:ascii="Arial" w:cs="Arial" w:eastAsia="Arial" w:hAnsi="Arial"/>
+          <w:color w:val="1B2118"/>
+          <w:sz w:val="21"/>
+          <w:szCs w:val="21"/>
+        </w:rPr>
+        <w:t xml:space="preserve"> (Guida 6.3.2 e 6.3.3, Tabella 5; Standard 6.2). I crediti si seguono nel riquadro </w:t>
+      </w:r>
+      <w:r>
+        <w:rPr>
+          <w:rFonts w:ascii="Arial" w:cs="Arial" w:eastAsia="Arial" w:hAnsi="Arial"/>
+          <w:b/>
+          <w:bCs/>
+          <w:color w:val="1B2118"/>
+          <w:sz w:val="21"/>
+          <w:szCs w:val="21"/>
+        </w:rPr>
+        <w:t xml:space="preserve">Crediti emessi</w:t>
+      </w:r>
+      <w:r>
+        <w:rPr>
+          <w:rFonts w:ascii="Arial" w:cs="Arial" w:eastAsia="Arial" w:hAnsi="Arial"/>
+          <w:color w:val="1B2118"/>
+          <w:sz w:val="21"/>
+          <w:szCs w:val="21"/>
+        </w:rPr>
+        <w:t xml:space="preserve"> del Rapporto e nella pagina </w:t>
+      </w:r>
+      <w:r>
+        <w:rPr>
+          <w:rFonts w:ascii="Arial" w:cs="Arial" w:eastAsia="Arial" w:hAnsi="Arial"/>
+          <w:b/>
+          <w:bCs/>
+          <w:color w:val="1B2118"/>
+          <w:sz w:val="21"/>
+          <w:szCs w:val="21"/>
+        </w:rPr>
+        <w:t xml:space="preserve">Crediti emessi</w:t>
+      </w:r>
+      <w:r>
+        <w:rPr>
+          <w:rFonts w:ascii="Arial" w:cs="Arial" w:eastAsia="Arial" w:hAnsi="Arial"/>
+          <w:color w:val="1B2118"/>
+          <w:sz w:val="21"/>
+          <w:szCs w:val="21"/>
+        </w:rPr>
+        <w:t xml:space="preserve"> del menu.</w:t>
+      </w:r>
+    </w:p>
+    <w:p>
+      <w:pPr>
+        <w:spacing w:after="140" w:line="300"/>
+      </w:pPr>
+      <w:r>
+        <w:rPr>
+          <w:rFonts w:ascii="Arial" w:cs="Arial" w:eastAsia="Arial" w:hAnsi="Arial"/>
+          <w:b/>
+          <w:bCs/>
+          <w:color w:val="1B2118"/>
+          <w:sz w:val="21"/>
+          <w:szCs w:val="21"/>
+        </w:rPr>
+        <w:t xml:space="preserve">Emettere i crediti (solo Amministratori)</w:t>
+      </w:r>
+    </w:p>
+    <w:p>
+      <w:pPr>
+        <w:spacing w:after="140" w:line="300"/>
+      </w:pPr>
+      <w:r>
+        <w:rPr>
+          <w:rFonts w:ascii="Arial" w:cs="Arial" w:eastAsia="Arial" w:hAnsi="Arial"/>
+          <w:color w:val="1B2118"/>
+          <w:sz w:val="21"/>
+          <w:szCs w:val="21"/>
+        </w:rPr>
+        <w:t xml:space="preserve">L'emissione è possibile solo se il Rapporto è registrato (fase 6 </w:t>
+      </w:r>
+      <w:r>
+        <w:rPr>
+          <w:rFonts w:ascii="Arial" w:cs="Arial" w:eastAsia="Arial" w:hAnsi="Arial"/>
+          <w:i/>
+          <w:iCs/>
+          <w:color w:val="1B2118"/>
+          <w:sz w:val="21"/>
+          <w:szCs w:val="21"/>
+        </w:rPr>
+        <w:t xml:space="preserve">Seconda verifica documentale</w:t>
+      </w:r>
+      <w:r>
+        <w:rPr>
+          <w:rFonts w:ascii="Arial" w:cs="Arial" w:eastAsia="Arial" w:hAnsi="Arial"/>
+          <w:color w:val="1B2118"/>
+          <w:sz w:val="21"/>
+          <w:szCs w:val="21"/>
+        </w:rPr>
+        <w:t xml:space="preserve"> completata) e se Rapporto e Progetto non sono sospesi, annullati o ritirati. Prima della registrazione il riquadro spiega che i crediti si emettono dopo la seconda verifica documentale.</w:t>
       </w:r>
     </w:p>
     <w:p>
@@ -31994,18 +33058,38 @@
           <w:sz w:val="21"/>
           <w:szCs w:val="21"/>
         </w:rPr>
-        <w:t xml:space="preserve">Sul lotto premete </w:t>
-      </w:r>
-      <w:r>
-        <w:rPr>
-          <w:rFonts w:ascii="Arial" w:cs="Arial" w:eastAsia="Arial" w:hAnsi="Arial"/>
-          <w:b/>
-          <w:bCs/>
-          <w:color w:val="1B2118"/>
-          <w:sz w:val="21"/>
-          <w:szCs w:val="21"/>
-        </w:rPr>
-        <w:t xml:space="preserve">Carica sul registro</w:t>
+        <w:t xml:space="preserve">Nel Rapporto, riquadro </w:t>
+      </w:r>
+      <w:r>
+        <w:rPr>
+          <w:rFonts w:ascii="Arial" w:cs="Arial" w:eastAsia="Arial" w:hAnsi="Arial"/>
+          <w:b/>
+          <w:bCs/>
+          <w:color w:val="1B2118"/>
+          <w:sz w:val="21"/>
+          <w:szCs w:val="21"/>
+        </w:rPr>
+        <w:t xml:space="preserve">Crediti emessi</w:t>
+      </w:r>
+      <w:r>
+        <w:rPr>
+          <w:rFonts w:ascii="Arial" w:cs="Arial" w:eastAsia="Arial" w:hAnsi="Arial"/>
+          <w:color w:val="1B2118"/>
+          <w:sz w:val="21"/>
+          <w:szCs w:val="21"/>
+        </w:rPr>
+        <w:t xml:space="preserve">, premete </w:t>
+      </w:r>
+      <w:r>
+        <w:rPr>
+          <w:rFonts w:ascii="Arial" w:cs="Arial" w:eastAsia="Arial" w:hAnsi="Arial"/>
+          <w:b/>
+          <w:bCs/>
+          <w:color w:val="1B2118"/>
+          <w:sz w:val="21"/>
+          <w:szCs w:val="21"/>
+        </w:rPr>
+        <w:t xml:space="preserve">+ Emetti crediti</w:t>
       </w:r>
       <w:r>
         <w:rPr>
@@ -32033,47 +33117,27 @@
           <w:sz w:val="21"/>
           <w:szCs w:val="21"/>
         </w:rPr>
-        <w:t xml:space="preserve">Scegliete il </w:t>
-      </w:r>
-      <w:r>
-        <w:rPr>
-          <w:rFonts w:ascii="Arial" w:cs="Arial" w:eastAsia="Arial" w:hAnsi="Arial"/>
-          <w:b/>
-          <w:bCs/>
-          <w:color w:val="1B2118"/>
-          <w:sz w:val="21"/>
-          <w:szCs w:val="21"/>
-        </w:rPr>
-        <w:t xml:space="preserve">Registro scelto dal promotore</w:t>
-      </w:r>
-      <w:r>
-        <w:rPr>
-          <w:rFonts w:ascii="Arial" w:cs="Arial" w:eastAsia="Arial" w:hAnsi="Arial"/>
-          <w:color w:val="1B2118"/>
-          <w:sz w:val="21"/>
-          <w:szCs w:val="21"/>
-        </w:rPr>
-        <w:t xml:space="preserve"> (tra i registri attivi delle Anagrafiche) e la </w:t>
-      </w:r>
-      <w:r>
-        <w:rPr>
-          <w:rFonts w:ascii="Arial" w:cs="Arial" w:eastAsia="Arial" w:hAnsi="Arial"/>
-          <w:b/>
-          <w:bCs/>
-          <w:color w:val="1B2118"/>
-          <w:sz w:val="21"/>
-          <w:szCs w:val="21"/>
-        </w:rPr>
-        <w:t xml:space="preserve">Data</w:t>
-      </w:r>
-      <w:r>
-        <w:rPr>
-          <w:rFonts w:ascii="Arial" w:cs="Arial" w:eastAsia="Arial" w:hAnsi="Arial"/>
-          <w:color w:val="1B2118"/>
-          <w:sz w:val="21"/>
-          <w:szCs w:val="21"/>
-        </w:rPr>
-        <w:t xml:space="preserve">.</w:t>
+        <w:t xml:space="preserve">Se c'è, scegliete il </w:t>
+      </w:r>
+      <w:r>
+        <w:rPr>
+          <w:rFonts w:ascii="Arial" w:cs="Arial" w:eastAsia="Arial" w:hAnsi="Arial"/>
+          <w:b/>
+          <w:bCs/>
+          <w:color w:val="1B2118"/>
+          <w:sz w:val="21"/>
+          <w:szCs w:val="21"/>
+        </w:rPr>
+        <w:t xml:space="preserve">Calcolo ex post confermato (facoltativo)</w:t>
+      </w:r>
+      <w:r>
+        <w:rPr>
+          <w:rFonts w:ascii="Arial" w:cs="Arial" w:eastAsia="Arial" w:hAnsi="Arial"/>
+          <w:color w:val="1B2118"/>
+          <w:sz w:val="21"/>
+          <w:szCs w:val="21"/>
+        </w:rPr>
+        <w:t xml:space="preserve"> del Rapporto o del suo Progetto: il totale emesso con quel calcolo non può superare i suoi crediti netti.</w:t>
       </w:r>
     </w:p>
     <w:p>
@@ -32092,62 +33156,86 @@
           <w:sz w:val="21"/>
           <w:szCs w:val="21"/>
         </w:rPr>
-        <w:t xml:space="preserve">Premete </w:t>
-      </w:r>
-      <w:r>
-        <w:rPr>
-          <w:rFonts w:ascii="Arial" w:cs="Arial" w:eastAsia="Arial" w:hAnsi="Arial"/>
-          <w:b/>
-          <w:bCs/>
-          <w:color w:val="1B2118"/>
-          <w:sz w:val="21"/>
-          <w:szCs w:val="21"/>
-        </w:rPr>
-        <w:t xml:space="preserve">Conferma</w:t>
-      </w:r>
-      <w:r>
-        <w:rPr>
-          <w:rFonts w:ascii="Arial" w:cs="Arial" w:eastAsia="Arial" w:hAnsi="Arial"/>
-          <w:color w:val="1B2118"/>
-          <w:sz w:val="21"/>
-          <w:szCs w:val="21"/>
-        </w:rPr>
-        <w:t xml:space="preserve">.</w:t>
-      </w:r>
-    </w:p>
-    <w:p>
-      <w:pPr>
-        <w:spacing w:after="60"/>
-      </w:pPr>
-    </w:p>
-    <w:p>
-      <w:pPr>
-        <w:spacing w:after="140" w:line="300"/>
-      </w:pPr>
-      <w:r>
-        <w:rPr>
-          <w:rFonts w:ascii="Arial" w:cs="Arial" w:eastAsia="Arial" w:hAnsi="Arial"/>
-          <w:b/>
-          <w:bCs/>
-          <w:color w:val="1B2118"/>
-          <w:sz w:val="21"/>
-          <w:szCs w:val="21"/>
-        </w:rPr>
-        <w:t xml:space="preserve">Registrare una vendita (staff)</w:t>
-      </w:r>
-    </w:p>
-    <w:p>
-      <w:pPr>
-        <w:spacing w:after="140" w:line="300"/>
-      </w:pPr>
-      <w:r>
-        <w:rPr>
-          <w:rFonts w:ascii="Arial" w:cs="Arial" w:eastAsia="Arial" w:hAnsi="Arial"/>
-          <w:color w:val="1B2118"/>
-          <w:sz w:val="21"/>
-          <w:szCs w:val="21"/>
-        </w:rPr>
-        <w:t xml:space="preserve">Quando il registro comunica una vendita (</w:t>
+        <w:t xml:space="preserve">Scrivete i </w:t>
+      </w:r>
+      <w:r>
+        <w:rPr>
+          <w:rFonts w:ascii="Arial" w:cs="Arial" w:eastAsia="Arial" w:hAnsi="Arial"/>
+          <w:b/>
+          <w:bCs/>
+          <w:color w:val="1B2118"/>
+          <w:sz w:val="21"/>
+          <w:szCs w:val="21"/>
+        </w:rPr>
+        <w:t xml:space="preserve">Crediti da emettere (tCO₂eq)</w:t>
+      </w:r>
+      <w:r>
+        <w:rPr>
+          <w:rFonts w:ascii="Arial" w:cs="Arial" w:eastAsia="Arial" w:hAnsi="Arial"/>
+          <w:color w:val="1B2118"/>
+          <w:sz w:val="21"/>
+          <w:szCs w:val="21"/>
+        </w:rPr>
+        <w:t xml:space="preserve"> e, nelle </w:t>
+      </w:r>
+      <w:r>
+        <w:rPr>
+          <w:rFonts w:ascii="Arial" w:cs="Arial" w:eastAsia="Arial" w:hAnsi="Arial"/>
+          <w:b/>
+          <w:bCs/>
+          <w:color w:val="1B2118"/>
+          <w:sz w:val="21"/>
+          <w:szCs w:val="21"/>
+        </w:rPr>
+        <w:t xml:space="preserve">Note</w:t>
+      </w:r>
+      <w:r>
+        <w:rPr>
+          <w:rFonts w:ascii="Arial" w:cs="Arial" w:eastAsia="Arial" w:hAnsi="Arial"/>
+          <w:color w:val="1B2118"/>
+          <w:sz w:val="21"/>
+          <w:szCs w:val="21"/>
+        </w:rPr>
+        <w:t xml:space="preserve">, ad esempio gli estremi del Rapporto di verifica e della Dichiarazione dell'ente.</w:t>
+      </w:r>
+    </w:p>
+    <w:p>
+      <w:pPr>
+        <w:pStyle w:val="ListParagraph"/>
+        <w:numPr>
+          <w:ilvl w:val="0"/>
+          <w:numId w:val="31"/>
+        </w:numPr>
+        <w:spacing w:after="70" w:line="290"/>
+      </w:pPr>
+      <w:r>
+        <w:rPr>
+          <w:rFonts w:ascii="Arial" w:cs="Arial" w:eastAsia="Arial" w:hAnsi="Arial"/>
+          <w:color w:val="1B2118"/>
+          <w:sz w:val="21"/>
+          <w:szCs w:val="21"/>
+        </w:rPr>
+        <w:t xml:space="preserve">Lasciate spuntato </w:t>
+      </w:r>
+      <w:r>
+        <w:rPr>
+          <w:rFonts w:ascii="Arial" w:cs="Arial" w:eastAsia="Arial" w:hAnsi="Arial"/>
+          <w:b/>
+          <w:bCs/>
+          <w:color w:val="1B2118"/>
+          <w:sz w:val="21"/>
+          <w:szCs w:val="21"/>
+        </w:rPr>
+        <w:t xml:space="preserve">Aggiungi la voce di pagamento della tariffa di emissione</w:t>
+      </w:r>
+      <w:r>
+        <w:rPr>
+          <w:rFonts w:ascii="Arial" w:cs="Arial" w:eastAsia="Arial" w:hAnsi="Arial"/>
+          <w:color w:val="1B2118"/>
+          <w:sz w:val="21"/>
+          <w:szCs w:val="21"/>
+        </w:rPr>
+        <w:t xml:space="preserve"> per creare la voce </w:t>
       </w:r>
       <w:r>
         <w:rPr>
@@ -32158,16 +33246,182 @@
           <w:sz w:val="21"/>
           <w:szCs w:val="21"/>
         </w:rPr>
-        <w:t xml:space="preserve">Comunicazione di vendita dei crediti</w:t>
-      </w:r>
-      <w:r>
-        <w:rPr>
-          <w:rFonts w:ascii="Arial" w:cs="Arial" w:eastAsia="Arial" w:hAnsi="Arial"/>
-          <w:color w:val="1B2118"/>
-          <w:sz w:val="21"/>
-          <w:szCs w:val="21"/>
-        </w:rPr>
-        <w:t xml:space="preserve">):</w:t>
+        <w:t xml:space="preserve">Emissione dei crediti</w:t>
+      </w:r>
+      <w:r>
+        <w:rPr>
+          <w:rFonts w:ascii="Arial" w:cs="Arial" w:eastAsia="Arial" w:hAnsi="Arial"/>
+          <w:color w:val="1B2118"/>
+          <w:sz w:val="21"/>
+          <w:szCs w:val="21"/>
+        </w:rPr>
+        <w:t xml:space="preserve"> con l'importo a scaglioni e scadenza a 30 giorni.</w:t>
+      </w:r>
+    </w:p>
+    <w:p>
+      <w:pPr>
+        <w:pStyle w:val="ListParagraph"/>
+        <w:numPr>
+          <w:ilvl w:val="0"/>
+          <w:numId w:val="31"/>
+        </w:numPr>
+        <w:spacing w:after="70" w:line="290"/>
+      </w:pPr>
+      <w:r>
+        <w:rPr>
+          <w:rFonts w:ascii="Arial" w:cs="Arial" w:eastAsia="Arial" w:hAnsi="Arial"/>
+          <w:color w:val="1B2118"/>
+          <w:sz w:val="21"/>
+          <w:szCs w:val="21"/>
+        </w:rPr>
+        <w:t xml:space="preserve">Premete </w:t>
+      </w:r>
+      <w:r>
+        <w:rPr>
+          <w:rFonts w:ascii="Arial" w:cs="Arial" w:eastAsia="Arial" w:hAnsi="Arial"/>
+          <w:b/>
+          <w:bCs/>
+          <w:color w:val="1B2118"/>
+          <w:sz w:val="21"/>
+          <w:szCs w:val="21"/>
+        </w:rPr>
+        <w:t xml:space="preserve">Emetti</w:t>
+      </w:r>
+      <w:r>
+        <w:rPr>
+          <w:rFonts w:ascii="Arial" w:cs="Arial" w:eastAsia="Arial" w:hAnsi="Arial"/>
+          <w:color w:val="1B2118"/>
+          <w:sz w:val="21"/>
+          <w:szCs w:val="21"/>
+        </w:rPr>
+        <w:t xml:space="preserve">.</w:t>
+      </w:r>
+    </w:p>
+    <w:p>
+      <w:pPr>
+        <w:spacing w:after="60"/>
+      </w:pPr>
+    </w:p>
+    <w:p>
+      <w:pPr>
+        <w:spacing w:after="140" w:line="300"/>
+      </w:pPr>
+      <w:r>
+        <w:rPr>
+          <w:rFonts w:ascii="Arial" w:cs="Arial" w:eastAsia="Arial" w:hAnsi="Arial"/>
+          <w:color w:val="1B2118"/>
+          <w:sz w:val="21"/>
+          <w:szCs w:val="21"/>
+        </w:rPr>
+        <w:t xml:space="preserve">Nasce un </w:t>
+      </w:r>
+      <w:r>
+        <w:rPr>
+          <w:rFonts w:ascii="Arial" w:cs="Arial" w:eastAsia="Arial" w:hAnsi="Arial"/>
+          <w:b/>
+          <w:bCs/>
+          <w:color w:val="1B2118"/>
+          <w:sz w:val="21"/>
+          <w:szCs w:val="21"/>
+        </w:rPr>
+        <w:t xml:space="preserve">lotto</w:t>
+      </w:r>
+      <w:r>
+        <w:rPr>
+          <w:rFonts w:ascii="Arial" w:cs="Arial" w:eastAsia="Arial" w:hAnsi="Arial"/>
+          <w:color w:val="1B2118"/>
+          <w:sz w:val="21"/>
+          <w:szCs w:val="21"/>
+        </w:rPr>
+        <w:t xml:space="preserve"> con codice </w:t>
+      </w:r>
+      <w:r>
+        <w:rPr>
+          <w:rFonts w:ascii="Consolas" w:cs="Consolas" w:eastAsia="Consolas" w:hAnsi="Consolas"/>
+          <w:color w:val="2F5D3A"/>
+          <w:sz w:val="21"/>
+          <w:szCs w:val="21"/>
+        </w:rPr>
+        <w:t xml:space="preserve">&lt;codice Rapporto&gt;-L1</w:t>
+      </w:r>
+      <w:r>
+        <w:rPr>
+          <w:rFonts w:ascii="Arial" w:cs="Arial" w:eastAsia="Arial" w:hAnsi="Arial"/>
+          <w:color w:val="1B2118"/>
+          <w:sz w:val="21"/>
+          <w:szCs w:val="21"/>
+        </w:rPr>
+        <w:t xml:space="preserve"> (poi L2, L3…) e ogni credito ha l'ID </w:t>
+      </w:r>
+      <w:r>
+        <w:rPr>
+          <w:rFonts w:ascii="Consolas" w:cs="Consolas" w:eastAsia="Consolas" w:hAnsi="Consolas"/>
+          <w:color w:val="2F5D3A"/>
+          <w:sz w:val="21"/>
+          <w:szCs w:val="21"/>
+        </w:rPr>
+        <w:t xml:space="preserve">&lt;codice lotto&gt;-000001</w:t>
+      </w:r>
+      <w:r>
+        <w:rPr>
+          <w:rFonts w:ascii="Arial" w:cs="Arial" w:eastAsia="Arial" w:hAnsi="Arial"/>
+          <w:color w:val="1B2118"/>
+          <w:sz w:val="21"/>
+          <w:szCs w:val="21"/>
+        </w:rPr>
+        <w:t xml:space="preserve">, </w:t>
+      </w:r>
+      <w:r>
+        <w:rPr>
+          <w:rFonts w:ascii="Consolas" w:cs="Consolas" w:eastAsia="Consolas" w:hAnsi="Consolas"/>
+          <w:color w:val="2F5D3A"/>
+          <w:sz w:val="21"/>
+          <w:szCs w:val="21"/>
+        </w:rPr>
+        <w:t xml:space="preserve">-000002</w:t>
+      </w:r>
+      <w:r>
+        <w:rPr>
+          <w:rFonts w:ascii="Arial" w:cs="Arial" w:eastAsia="Arial" w:hAnsi="Arial"/>
+          <w:color w:val="1B2118"/>
+          <w:sz w:val="21"/>
+          <w:szCs w:val="21"/>
+        </w:rPr>
+        <w:t xml:space="preserve"> e così via (es. </w:t>
+      </w:r>
+      <w:r>
+        <w:rPr>
+          <w:rFonts w:ascii="Consolas" w:cs="Consolas" w:eastAsia="Consolas" w:hAnsi="Consolas"/>
+          <w:color w:val="2F5D3A"/>
+          <w:sz w:val="21"/>
+          <w:szCs w:val="21"/>
+        </w:rPr>
+        <w:t xml:space="preserve">CWP-2026-0001-RM1-L1-000001</w:t>
+      </w:r>
+      <w:r>
+        <w:rPr>
+          <w:rFonts w:ascii="Arial" w:cs="Arial" w:eastAsia="Arial" w:hAnsi="Arial"/>
+          <w:color w:val="1B2118"/>
+          <w:sz w:val="21"/>
+          <w:szCs w:val="21"/>
+        </w:rPr>
+        <w:t xml:space="preserve">). Il lotto mostra quantità, data di emissione e ID dal primo all'ultimo. Il Comune riceve la notifica «Crediti emessi» e vede i propri crediti in sola lettura.</w:t>
+      </w:r>
+    </w:p>
+    <w:p>
+      <w:pPr>
+        <w:spacing w:after="140" w:line="300"/>
+      </w:pPr>
+      <w:r>
+        <w:rPr>
+          <w:rFonts w:ascii="Arial" w:cs="Arial" w:eastAsia="Arial" w:hAnsi="Arial"/>
+          <w:b/>
+          <w:bCs/>
+          <w:color w:val="1B2118"/>
+          <w:sz w:val="21"/>
+          <w:szCs w:val="21"/>
+        </w:rPr>
+        <w:t xml:space="preserve">Caricare i crediti sul registro (staff)</w:t>
       </w:r>
     </w:p>
     <w:p>
@@ -32186,7 +33440,27 @@
           <w:sz w:val="21"/>
           <w:szCs w:val="21"/>
         </w:rPr>
-        <w:t xml:space="preserve">Caricate, se c'è, la comunicazione tra i documenti del Rapporto.</w:t>
+        <w:t xml:space="preserve">Sul lotto premete </w:t>
+      </w:r>
+      <w:r>
+        <w:rPr>
+          <w:rFonts w:ascii="Arial" w:cs="Arial" w:eastAsia="Arial" w:hAnsi="Arial"/>
+          <w:b/>
+          <w:bCs/>
+          <w:color w:val="1B2118"/>
+          <w:sz w:val="21"/>
+          <w:szCs w:val="21"/>
+        </w:rPr>
+        <w:t xml:space="preserve">Carica sul registro</w:t>
+      </w:r>
+      <w:r>
+        <w:rPr>
+          <w:rFonts w:ascii="Arial" w:cs="Arial" w:eastAsia="Arial" w:hAnsi="Arial"/>
+          <w:color w:val="1B2118"/>
+          <w:sz w:val="21"/>
+          <w:szCs w:val="21"/>
+        </w:rPr>
+        <w:t xml:space="preserve">.</w:t>
       </w:r>
     </w:p>
     <w:p>
@@ -32205,18 +33479,38 @@
           <w:sz w:val="21"/>
           <w:szCs w:val="21"/>
         </w:rPr>
-        <w:t xml:space="preserve">Sul lotto premete </w:t>
-      </w:r>
-      <w:r>
-        <w:rPr>
-          <w:rFonts w:ascii="Arial" w:cs="Arial" w:eastAsia="Arial" w:hAnsi="Arial"/>
-          <w:b/>
-          <w:bCs/>
-          <w:color w:val="1B2118"/>
-          <w:sz w:val="21"/>
-          <w:szCs w:val="21"/>
-        </w:rPr>
-        <w:t xml:space="preserve">Registra una vendita (N disponibili)</w:t>
+        <w:t xml:space="preserve">Scegliete il </w:t>
+      </w:r>
+      <w:r>
+        <w:rPr>
+          <w:rFonts w:ascii="Arial" w:cs="Arial" w:eastAsia="Arial" w:hAnsi="Arial"/>
+          <w:b/>
+          <w:bCs/>
+          <w:color w:val="1B2118"/>
+          <w:sz w:val="21"/>
+          <w:szCs w:val="21"/>
+        </w:rPr>
+        <w:t xml:space="preserve">Registro scelto dal promotore</w:t>
+      </w:r>
+      <w:r>
+        <w:rPr>
+          <w:rFonts w:ascii="Arial" w:cs="Arial" w:eastAsia="Arial" w:hAnsi="Arial"/>
+          <w:color w:val="1B2118"/>
+          <w:sz w:val="21"/>
+          <w:szCs w:val="21"/>
+        </w:rPr>
+        <w:t xml:space="preserve"> (tra i registri attivi delle Anagrafiche) e la </w:t>
+      </w:r>
+      <w:r>
+        <w:rPr>
+          <w:rFonts w:ascii="Arial" w:cs="Arial" w:eastAsia="Arial" w:hAnsi="Arial"/>
+          <w:b/>
+          <w:bCs/>
+          <w:color w:val="1B2118"/>
+          <w:sz w:val="21"/>
+          <w:szCs w:val="21"/>
+        </w:rPr>
+        <w:t xml:space="preserve">Data</w:t>
       </w:r>
       <w:r>
         <w:rPr>
@@ -32244,166 +33538,62 @@
           <w:sz w:val="21"/>
           <w:szCs w:val="21"/>
         </w:rPr>
-        <w:t xml:space="preserve">Compilate </w:t>
-      </w:r>
-      <w:r>
-        <w:rPr>
-          <w:rFonts w:ascii="Arial" w:cs="Arial" w:eastAsia="Arial" w:hAnsi="Arial"/>
-          <w:b/>
-          <w:bCs/>
-          <w:color w:val="1B2118"/>
-          <w:sz w:val="21"/>
-          <w:szCs w:val="21"/>
-        </w:rPr>
-        <w:t xml:space="preserve">Crediti venduti</w:t>
-      </w:r>
-      <w:r>
-        <w:rPr>
-          <w:rFonts w:ascii="Arial" w:cs="Arial" w:eastAsia="Arial" w:hAnsi="Arial"/>
-          <w:color w:val="1B2118"/>
-          <w:sz w:val="21"/>
-          <w:szCs w:val="21"/>
-        </w:rPr>
-        <w:t xml:space="preserve">, </w:t>
-      </w:r>
-      <w:r>
-        <w:rPr>
-          <w:rFonts w:ascii="Arial" w:cs="Arial" w:eastAsia="Arial" w:hAnsi="Arial"/>
-          <w:b/>
-          <w:bCs/>
-          <w:color w:val="1B2118"/>
-          <w:sz w:val="21"/>
-          <w:szCs w:val="21"/>
-        </w:rPr>
-        <w:t xml:space="preserve">Beneficiario</w:t>
-      </w:r>
-      <w:r>
-        <w:rPr>
-          <w:rFonts w:ascii="Arial" w:cs="Arial" w:eastAsia="Arial" w:hAnsi="Arial"/>
-          <w:color w:val="1B2118"/>
-          <w:sz w:val="21"/>
-          <w:szCs w:val="21"/>
-        </w:rPr>
-        <w:t xml:space="preserve">, </w:t>
-      </w:r>
-      <w:r>
-        <w:rPr>
-          <w:rFonts w:ascii="Arial" w:cs="Arial" w:eastAsia="Arial" w:hAnsi="Arial"/>
-          <w:b/>
-          <w:bCs/>
-          <w:color w:val="1B2118"/>
-          <w:sz w:val="21"/>
-          <w:szCs w:val="21"/>
-        </w:rPr>
-        <w:t xml:space="preserve">Obiettivo di compensazione</w:t>
-      </w:r>
-      <w:r>
-        <w:rPr>
-          <w:rFonts w:ascii="Arial" w:cs="Arial" w:eastAsia="Arial" w:hAnsi="Arial"/>
-          <w:color w:val="1B2118"/>
-          <w:sz w:val="21"/>
-          <w:szCs w:val="21"/>
-        </w:rPr>
-        <w:t xml:space="preserve">, </w:t>
-      </w:r>
-      <w:r>
-        <w:rPr>
-          <w:rFonts w:ascii="Arial" w:cs="Arial" w:eastAsia="Arial" w:hAnsi="Arial"/>
-          <w:b/>
-          <w:bCs/>
-          <w:color w:val="1B2118"/>
-          <w:sz w:val="21"/>
-          <w:szCs w:val="21"/>
-        </w:rPr>
-        <w:t xml:space="preserve">Valore di vendita (€)</w:t>
-      </w:r>
-      <w:r>
-        <w:rPr>
-          <w:rFonts w:ascii="Arial" w:cs="Arial" w:eastAsia="Arial" w:hAnsi="Arial"/>
-          <w:color w:val="1B2118"/>
-          <w:sz w:val="21"/>
-          <w:szCs w:val="21"/>
-        </w:rPr>
-        <w:t xml:space="preserve">, la </w:t>
-      </w:r>
-      <w:r>
-        <w:rPr>
-          <w:rFonts w:ascii="Arial" w:cs="Arial" w:eastAsia="Arial" w:hAnsi="Arial"/>
-          <w:b/>
-          <w:bCs/>
-          <w:color w:val="1B2118"/>
-          <w:sz w:val="21"/>
-          <w:szCs w:val="21"/>
-        </w:rPr>
-        <w:t xml:space="preserve">Data</w:t>
-      </w:r>
-      <w:r>
-        <w:rPr>
-          <w:rFonts w:ascii="Arial" w:cs="Arial" w:eastAsia="Arial" w:hAnsi="Arial"/>
-          <w:color w:val="1B2118"/>
-          <w:sz w:val="21"/>
-          <w:szCs w:val="21"/>
-        </w:rPr>
-        <w:t xml:space="preserve"> e, facoltativa, la </w:t>
-      </w:r>
-      <w:r>
-        <w:rPr>
-          <w:rFonts w:ascii="Arial" w:cs="Arial" w:eastAsia="Arial" w:hAnsi="Arial"/>
-          <w:b/>
-          <w:bCs/>
-          <w:color w:val="1B2118"/>
-          <w:sz w:val="21"/>
-          <w:szCs w:val="21"/>
-        </w:rPr>
-        <w:t xml:space="preserve">Comunicazione di vendita (documento del Rapporto)</w:t>
-      </w:r>
-      <w:r>
-        <w:rPr>
-          <w:rFonts w:ascii="Arial" w:cs="Arial" w:eastAsia="Arial" w:hAnsi="Arial"/>
-          <w:color w:val="1B2118"/>
-          <w:sz w:val="21"/>
-          <w:szCs w:val="21"/>
-        </w:rPr>
-        <w:t xml:space="preserve">, che diventa pubblica.</w:t>
-      </w:r>
-    </w:p>
-    <w:p>
-      <w:pPr>
-        <w:pStyle w:val="ListParagraph"/>
-        <w:numPr>
-          <w:ilvl w:val="0"/>
-          <w:numId w:val="32"/>
-        </w:numPr>
-        <w:spacing w:after="70" w:line="290"/>
-      </w:pPr>
-      <w:r>
-        <w:rPr>
-          <w:rFonts w:ascii="Arial" w:cs="Arial" w:eastAsia="Arial" w:hAnsi="Arial"/>
-          <w:color w:val="1B2118"/>
-          <w:sz w:val="21"/>
-          <w:szCs w:val="21"/>
-        </w:rPr>
-        <w:t xml:space="preserve">Lasciate spuntato </w:t>
-      </w:r>
-      <w:r>
-        <w:rPr>
-          <w:rFonts w:ascii="Arial" w:cs="Arial" w:eastAsia="Arial" w:hAnsi="Arial"/>
-          <w:b/>
-          <w:bCs/>
-          <w:color w:val="1B2118"/>
-          <w:sz w:val="21"/>
-          <w:szCs w:val="21"/>
-        </w:rPr>
-        <w:t xml:space="preserve">Aggiungi la voce di pagamento della tariffa di vendita</w:t>
-      </w:r>
-      <w:r>
-        <w:rPr>
-          <w:rFonts w:ascii="Arial" w:cs="Arial" w:eastAsia="Arial" w:hAnsi="Arial"/>
-          <w:color w:val="1B2118"/>
-          <w:sz w:val="21"/>
-          <w:szCs w:val="21"/>
-        </w:rPr>
-        <w:t xml:space="preserve"> per creare la voce </w:t>
+        <w:t xml:space="preserve">Premete </w:t>
+      </w:r>
+      <w:r>
+        <w:rPr>
+          <w:rFonts w:ascii="Arial" w:cs="Arial" w:eastAsia="Arial" w:hAnsi="Arial"/>
+          <w:b/>
+          <w:bCs/>
+          <w:color w:val="1B2118"/>
+          <w:sz w:val="21"/>
+          <w:szCs w:val="21"/>
+        </w:rPr>
+        <w:t xml:space="preserve">Conferma</w:t>
+      </w:r>
+      <w:r>
+        <w:rPr>
+          <w:rFonts w:ascii="Arial" w:cs="Arial" w:eastAsia="Arial" w:hAnsi="Arial"/>
+          <w:color w:val="1B2118"/>
+          <w:sz w:val="21"/>
+          <w:szCs w:val="21"/>
+        </w:rPr>
+        <w:t xml:space="preserve">.</w:t>
+      </w:r>
+    </w:p>
+    <w:p>
+      <w:pPr>
+        <w:spacing w:after="60"/>
+      </w:pPr>
+    </w:p>
+    <w:p>
+      <w:pPr>
+        <w:spacing w:after="140" w:line="300"/>
+      </w:pPr>
+      <w:r>
+        <w:rPr>
+          <w:rFonts w:ascii="Arial" w:cs="Arial" w:eastAsia="Arial" w:hAnsi="Arial"/>
+          <w:b/>
+          <w:bCs/>
+          <w:color w:val="1B2118"/>
+          <w:sz w:val="21"/>
+          <w:szCs w:val="21"/>
+        </w:rPr>
+        <w:t xml:space="preserve">Registrare una vendita (staff)</w:t>
+      </w:r>
+    </w:p>
+    <w:p>
+      <w:pPr>
+        <w:spacing w:after="140" w:line="300"/>
+      </w:pPr>
+      <w:r>
+        <w:rPr>
+          <w:rFonts w:ascii="Arial" w:cs="Arial" w:eastAsia="Arial" w:hAnsi="Arial"/>
+          <w:color w:val="1B2118"/>
+          <w:sz w:val="21"/>
+          <w:szCs w:val="21"/>
+        </w:rPr>
+        <w:t xml:space="preserve">Quando il registro comunica una vendita (</w:t>
       </w:r>
       <w:r>
         <w:rPr>
@@ -32414,124 +33604,16 @@
           <w:sz w:val="21"/>
           <w:szCs w:val="21"/>
         </w:rPr>
-        <w:t xml:space="preserve">Vendita dei crediti</w:t>
-      </w:r>
-      <w:r>
-        <w:rPr>
-          <w:rFonts w:ascii="Arial" w:cs="Arial" w:eastAsia="Arial" w:hAnsi="Arial"/>
-          <w:color w:val="1B2118"/>
-          <w:sz w:val="21"/>
-          <w:szCs w:val="21"/>
-        </w:rPr>
-        <w:t xml:space="preserve"> (20% del valore, con il minimo dello Schema tariffario).</w:t>
-      </w:r>
-    </w:p>
-    <w:p>
-      <w:pPr>
-        <w:pStyle w:val="ListParagraph"/>
-        <w:numPr>
-          <w:ilvl w:val="0"/>
-          <w:numId w:val="32"/>
-        </w:numPr>
-        <w:spacing w:after="70" w:line="290"/>
-      </w:pPr>
-      <w:r>
-        <w:rPr>
-          <w:rFonts w:ascii="Arial" w:cs="Arial" w:eastAsia="Arial" w:hAnsi="Arial"/>
-          <w:color w:val="1B2118"/>
-          <w:sz w:val="21"/>
-          <w:szCs w:val="21"/>
-        </w:rPr>
-        <w:t xml:space="preserve">Premete </w:t>
-      </w:r>
-      <w:r>
-        <w:rPr>
-          <w:rFonts w:ascii="Arial" w:cs="Arial" w:eastAsia="Arial" w:hAnsi="Arial"/>
-          <w:b/>
-          <w:bCs/>
-          <w:color w:val="1B2118"/>
-          <w:sz w:val="21"/>
-          <w:szCs w:val="21"/>
-        </w:rPr>
-        <w:t xml:space="preserve">Conferma</w:t>
-      </w:r>
-      <w:r>
-        <w:rPr>
-          <w:rFonts w:ascii="Arial" w:cs="Arial" w:eastAsia="Arial" w:hAnsi="Arial"/>
-          <w:color w:val="1B2118"/>
-          <w:sz w:val="21"/>
-          <w:szCs w:val="21"/>
-        </w:rPr>
-        <w:t xml:space="preserve">.</w:t>
-      </w:r>
-    </w:p>
-    <w:p>
-      <w:pPr>
-        <w:spacing w:after="60"/>
-      </w:pPr>
-    </w:p>
-    <w:p>
-      <w:pPr>
-        <w:spacing w:after="140" w:line="300"/>
-      </w:pPr>
-      <w:r>
-        <w:rPr>
-          <w:rFonts w:ascii="Arial" w:cs="Arial" w:eastAsia="Arial" w:hAnsi="Arial"/>
-          <w:color w:val="1B2118"/>
-          <w:sz w:val="21"/>
-          <w:szCs w:val="21"/>
-        </w:rPr>
-        <w:t xml:space="preserve">Gli ID dei crediti venduti seguono quelli già venduti; non si possono vendere più crediti di quelli del lotto, e solo dopo il caricamento sul registro.</w:t>
-      </w:r>
-    </w:p>
-    <w:p>
-      <w:pPr>
-        <w:spacing w:after="140" w:line="300"/>
-      </w:pPr>
-      <w:r>
-        <w:rPr>
-          <w:rFonts w:ascii="Arial" w:cs="Arial" w:eastAsia="Arial" w:hAnsi="Arial"/>
-          <w:b/>
-          <w:bCs/>
-          <w:color w:val="1B2118"/>
-          <w:sz w:val="21"/>
-          <w:szCs w:val="21"/>
-        </w:rPr>
-        <w:t xml:space="preserve">Registrare la cancellazione (staff)</w:t>
-      </w:r>
-    </w:p>
-    <w:p>
-      <w:pPr>
-        <w:spacing w:after="140" w:line="300"/>
-      </w:pPr>
-      <w:r>
-        <w:rPr>
-          <w:rFonts w:ascii="Arial" w:cs="Arial" w:eastAsia="Arial" w:hAnsi="Arial"/>
-          <w:color w:val="1B2118"/>
-          <w:sz w:val="21"/>
-          <w:szCs w:val="21"/>
-        </w:rPr>
-        <w:t xml:space="preserve">Il registro deve inviare la </w:t>
-      </w:r>
-      <w:r>
-        <w:rPr>
-          <w:rFonts w:ascii="Arial" w:cs="Arial" w:eastAsia="Arial" w:hAnsi="Arial"/>
-          <w:i/>
-          <w:iCs/>
-          <w:color w:val="1B2118"/>
-          <w:sz w:val="21"/>
-          <w:szCs w:val="21"/>
-        </w:rPr>
-        <w:t xml:space="preserve">Dichiarazione di cancellazione tombale dei crediti</w:t>
-      </w:r>
-      <w:r>
-        <w:rPr>
-          <w:rFonts w:ascii="Arial" w:cs="Arial" w:eastAsia="Arial" w:hAnsi="Arial"/>
-          <w:color w:val="1B2118"/>
-          <w:sz w:val="21"/>
-          <w:szCs w:val="21"/>
-        </w:rPr>
-        <w:t xml:space="preserve"> entro 10 giorni dalla vendita.</w:t>
+        <w:t xml:space="preserve">Comunicazione di vendita dei crediti</w:t>
+      </w:r>
+      <w:r>
+        <w:rPr>
+          <w:rFonts w:ascii="Arial" w:cs="Arial" w:eastAsia="Arial" w:hAnsi="Arial"/>
+          <w:color w:val="1B2118"/>
+          <w:sz w:val="21"/>
+          <w:szCs w:val="21"/>
+        </w:rPr>
+        <w:t xml:space="preserve">):</w:t>
       </w:r>
     </w:p>
     <w:p>
@@ -32550,7 +33632,7 @@
           <w:sz w:val="21"/>
           <w:szCs w:val="21"/>
         </w:rPr>
-        <w:t xml:space="preserve">Caricate la dichiarazione tra i documenti del Rapporto (è obbligatoria).</w:t>
+        <w:t xml:space="preserve">Caricate, se c'è, la comunicazione tra i documenti del Rapporto.</w:t>
       </w:r>
     </w:p>
     <w:p>
@@ -32569,58 +33651,18 @@
           <w:sz w:val="21"/>
           <w:szCs w:val="21"/>
         </w:rPr>
-        <w:t xml:space="preserve">Sulla vendita premete </w:t>
-      </w:r>
-      <w:r>
-        <w:rPr>
-          <w:rFonts w:ascii="Arial" w:cs="Arial" w:eastAsia="Arial" w:hAnsi="Arial"/>
-          <w:b/>
-          <w:bCs/>
-          <w:color w:val="1B2118"/>
-          <w:sz w:val="21"/>
-          <w:szCs w:val="21"/>
-        </w:rPr>
-        <w:t xml:space="preserve">Registra la cancellazione</w:t>
-      </w:r>
-      <w:r>
-        <w:rPr>
-          <w:rFonts w:ascii="Arial" w:cs="Arial" w:eastAsia="Arial" w:hAnsi="Arial"/>
-          <w:color w:val="1B2118"/>
-          <w:sz w:val="21"/>
-          <w:szCs w:val="21"/>
-        </w:rPr>
-        <w:t xml:space="preserve">, scegliete la </w:t>
-      </w:r>
-      <w:r>
-        <w:rPr>
-          <w:rFonts w:ascii="Arial" w:cs="Arial" w:eastAsia="Arial" w:hAnsi="Arial"/>
-          <w:b/>
-          <w:bCs/>
-          <w:color w:val="1B2118"/>
-          <w:sz w:val="21"/>
-          <w:szCs w:val="21"/>
-        </w:rPr>
-        <w:t xml:space="preserve">Dichiarazione di cancellazione tombale</w:t>
-      </w:r>
-      <w:r>
-        <w:rPr>
-          <w:rFonts w:ascii="Arial" w:cs="Arial" w:eastAsia="Arial" w:hAnsi="Arial"/>
-          <w:color w:val="1B2118"/>
-          <w:sz w:val="21"/>
-          <w:szCs w:val="21"/>
-        </w:rPr>
-        <w:t xml:space="preserve"> e la </w:t>
-      </w:r>
-      <w:r>
-        <w:rPr>
-          <w:rFonts w:ascii="Arial" w:cs="Arial" w:eastAsia="Arial" w:hAnsi="Arial"/>
-          <w:b/>
-          <w:bCs/>
-          <w:color w:val="1B2118"/>
-          <w:sz w:val="21"/>
-          <w:szCs w:val="21"/>
-        </w:rPr>
-        <w:t xml:space="preserve">Data</w:t>
+        <w:t xml:space="preserve">Sul lotto premete </w:t>
+      </w:r>
+      <w:r>
+        <w:rPr>
+          <w:rFonts w:ascii="Arial" w:cs="Arial" w:eastAsia="Arial" w:hAnsi="Arial"/>
+          <w:b/>
+          <w:bCs/>
+          <w:color w:val="1B2118"/>
+          <w:sz w:val="21"/>
+          <w:szCs w:val="21"/>
+        </w:rPr>
+        <w:t xml:space="preserve">Registra una vendita (N disponibili)</w:t>
       </w:r>
       <w:r>
         <w:rPr>
@@ -32638,6 +33680,410 @@
         <w:numPr>
           <w:ilvl w:val="0"/>
           <w:numId w:val="33"/>
+        </w:numPr>
+        <w:spacing w:after="70" w:line="290"/>
+      </w:pPr>
+      <w:r>
+        <w:rPr>
+          <w:rFonts w:ascii="Arial" w:cs="Arial" w:eastAsia="Arial" w:hAnsi="Arial"/>
+          <w:color w:val="1B2118"/>
+          <w:sz w:val="21"/>
+          <w:szCs w:val="21"/>
+        </w:rPr>
+        <w:t xml:space="preserve">Compilate </w:t>
+      </w:r>
+      <w:r>
+        <w:rPr>
+          <w:rFonts w:ascii="Arial" w:cs="Arial" w:eastAsia="Arial" w:hAnsi="Arial"/>
+          <w:b/>
+          <w:bCs/>
+          <w:color w:val="1B2118"/>
+          <w:sz w:val="21"/>
+          <w:szCs w:val="21"/>
+        </w:rPr>
+        <w:t xml:space="preserve">Crediti venduti</w:t>
+      </w:r>
+      <w:r>
+        <w:rPr>
+          <w:rFonts w:ascii="Arial" w:cs="Arial" w:eastAsia="Arial" w:hAnsi="Arial"/>
+          <w:color w:val="1B2118"/>
+          <w:sz w:val="21"/>
+          <w:szCs w:val="21"/>
+        </w:rPr>
+        <w:t xml:space="preserve">, </w:t>
+      </w:r>
+      <w:r>
+        <w:rPr>
+          <w:rFonts w:ascii="Arial" w:cs="Arial" w:eastAsia="Arial" w:hAnsi="Arial"/>
+          <w:b/>
+          <w:bCs/>
+          <w:color w:val="1B2118"/>
+          <w:sz w:val="21"/>
+          <w:szCs w:val="21"/>
+        </w:rPr>
+        <w:t xml:space="preserve">Beneficiario</w:t>
+      </w:r>
+      <w:r>
+        <w:rPr>
+          <w:rFonts w:ascii="Arial" w:cs="Arial" w:eastAsia="Arial" w:hAnsi="Arial"/>
+          <w:color w:val="1B2118"/>
+          <w:sz w:val="21"/>
+          <w:szCs w:val="21"/>
+        </w:rPr>
+        <w:t xml:space="preserve">, </w:t>
+      </w:r>
+      <w:r>
+        <w:rPr>
+          <w:rFonts w:ascii="Arial" w:cs="Arial" w:eastAsia="Arial" w:hAnsi="Arial"/>
+          <w:b/>
+          <w:bCs/>
+          <w:color w:val="1B2118"/>
+          <w:sz w:val="21"/>
+          <w:szCs w:val="21"/>
+        </w:rPr>
+        <w:t xml:space="preserve">Obiettivo di compensazione</w:t>
+      </w:r>
+      <w:r>
+        <w:rPr>
+          <w:rFonts w:ascii="Arial" w:cs="Arial" w:eastAsia="Arial" w:hAnsi="Arial"/>
+          <w:color w:val="1B2118"/>
+          <w:sz w:val="21"/>
+          <w:szCs w:val="21"/>
+        </w:rPr>
+        <w:t xml:space="preserve">, </w:t>
+      </w:r>
+      <w:r>
+        <w:rPr>
+          <w:rFonts w:ascii="Arial" w:cs="Arial" w:eastAsia="Arial" w:hAnsi="Arial"/>
+          <w:b/>
+          <w:bCs/>
+          <w:color w:val="1B2118"/>
+          <w:sz w:val="21"/>
+          <w:szCs w:val="21"/>
+        </w:rPr>
+        <w:t xml:space="preserve">Valore di vendita (€)</w:t>
+      </w:r>
+      <w:r>
+        <w:rPr>
+          <w:rFonts w:ascii="Arial" w:cs="Arial" w:eastAsia="Arial" w:hAnsi="Arial"/>
+          <w:color w:val="1B2118"/>
+          <w:sz w:val="21"/>
+          <w:szCs w:val="21"/>
+        </w:rPr>
+        <w:t xml:space="preserve">, la </w:t>
+      </w:r>
+      <w:r>
+        <w:rPr>
+          <w:rFonts w:ascii="Arial" w:cs="Arial" w:eastAsia="Arial" w:hAnsi="Arial"/>
+          <w:b/>
+          <w:bCs/>
+          <w:color w:val="1B2118"/>
+          <w:sz w:val="21"/>
+          <w:szCs w:val="21"/>
+        </w:rPr>
+        <w:t xml:space="preserve">Data</w:t>
+      </w:r>
+      <w:r>
+        <w:rPr>
+          <w:rFonts w:ascii="Arial" w:cs="Arial" w:eastAsia="Arial" w:hAnsi="Arial"/>
+          <w:color w:val="1B2118"/>
+          <w:sz w:val="21"/>
+          <w:szCs w:val="21"/>
+        </w:rPr>
+        <w:t xml:space="preserve"> e, facoltativa, la </w:t>
+      </w:r>
+      <w:r>
+        <w:rPr>
+          <w:rFonts w:ascii="Arial" w:cs="Arial" w:eastAsia="Arial" w:hAnsi="Arial"/>
+          <w:b/>
+          <w:bCs/>
+          <w:color w:val="1B2118"/>
+          <w:sz w:val="21"/>
+          <w:szCs w:val="21"/>
+        </w:rPr>
+        <w:t xml:space="preserve">Comunicazione di vendita (documento del Rapporto)</w:t>
+      </w:r>
+      <w:r>
+        <w:rPr>
+          <w:rFonts w:ascii="Arial" w:cs="Arial" w:eastAsia="Arial" w:hAnsi="Arial"/>
+          <w:color w:val="1B2118"/>
+          <w:sz w:val="21"/>
+          <w:szCs w:val="21"/>
+        </w:rPr>
+        <w:t xml:space="preserve">, che diventa pubblica.</w:t>
+      </w:r>
+    </w:p>
+    <w:p>
+      <w:pPr>
+        <w:pStyle w:val="ListParagraph"/>
+        <w:numPr>
+          <w:ilvl w:val="0"/>
+          <w:numId w:val="33"/>
+        </w:numPr>
+        <w:spacing w:after="70" w:line="290"/>
+      </w:pPr>
+      <w:r>
+        <w:rPr>
+          <w:rFonts w:ascii="Arial" w:cs="Arial" w:eastAsia="Arial" w:hAnsi="Arial"/>
+          <w:color w:val="1B2118"/>
+          <w:sz w:val="21"/>
+          <w:szCs w:val="21"/>
+        </w:rPr>
+        <w:t xml:space="preserve">Lasciate spuntato </w:t>
+      </w:r>
+      <w:r>
+        <w:rPr>
+          <w:rFonts w:ascii="Arial" w:cs="Arial" w:eastAsia="Arial" w:hAnsi="Arial"/>
+          <w:b/>
+          <w:bCs/>
+          <w:color w:val="1B2118"/>
+          <w:sz w:val="21"/>
+          <w:szCs w:val="21"/>
+        </w:rPr>
+        <w:t xml:space="preserve">Aggiungi la voce di pagamento della tariffa di vendita</w:t>
+      </w:r>
+      <w:r>
+        <w:rPr>
+          <w:rFonts w:ascii="Arial" w:cs="Arial" w:eastAsia="Arial" w:hAnsi="Arial"/>
+          <w:color w:val="1B2118"/>
+          <w:sz w:val="21"/>
+          <w:szCs w:val="21"/>
+        </w:rPr>
+        <w:t xml:space="preserve"> per creare la voce </w:t>
+      </w:r>
+      <w:r>
+        <w:rPr>
+          <w:rFonts w:ascii="Arial" w:cs="Arial" w:eastAsia="Arial" w:hAnsi="Arial"/>
+          <w:i/>
+          <w:iCs/>
+          <w:color w:val="1B2118"/>
+          <w:sz w:val="21"/>
+          <w:szCs w:val="21"/>
+        </w:rPr>
+        <w:t xml:space="preserve">Vendita dei crediti</w:t>
+      </w:r>
+      <w:r>
+        <w:rPr>
+          <w:rFonts w:ascii="Arial" w:cs="Arial" w:eastAsia="Arial" w:hAnsi="Arial"/>
+          <w:color w:val="1B2118"/>
+          <w:sz w:val="21"/>
+          <w:szCs w:val="21"/>
+        </w:rPr>
+        <w:t xml:space="preserve"> (20% del valore, con il minimo dello Schema tariffario).</w:t>
+      </w:r>
+    </w:p>
+    <w:p>
+      <w:pPr>
+        <w:pStyle w:val="ListParagraph"/>
+        <w:numPr>
+          <w:ilvl w:val="0"/>
+          <w:numId w:val="33"/>
+        </w:numPr>
+        <w:spacing w:after="70" w:line="290"/>
+      </w:pPr>
+      <w:r>
+        <w:rPr>
+          <w:rFonts w:ascii="Arial" w:cs="Arial" w:eastAsia="Arial" w:hAnsi="Arial"/>
+          <w:color w:val="1B2118"/>
+          <w:sz w:val="21"/>
+          <w:szCs w:val="21"/>
+        </w:rPr>
+        <w:t xml:space="preserve">Premete </w:t>
+      </w:r>
+      <w:r>
+        <w:rPr>
+          <w:rFonts w:ascii="Arial" w:cs="Arial" w:eastAsia="Arial" w:hAnsi="Arial"/>
+          <w:b/>
+          <w:bCs/>
+          <w:color w:val="1B2118"/>
+          <w:sz w:val="21"/>
+          <w:szCs w:val="21"/>
+        </w:rPr>
+        <w:t xml:space="preserve">Conferma</w:t>
+      </w:r>
+      <w:r>
+        <w:rPr>
+          <w:rFonts w:ascii="Arial" w:cs="Arial" w:eastAsia="Arial" w:hAnsi="Arial"/>
+          <w:color w:val="1B2118"/>
+          <w:sz w:val="21"/>
+          <w:szCs w:val="21"/>
+        </w:rPr>
+        <w:t xml:space="preserve">.</w:t>
+      </w:r>
+    </w:p>
+    <w:p>
+      <w:pPr>
+        <w:spacing w:after="60"/>
+      </w:pPr>
+    </w:p>
+    <w:p>
+      <w:pPr>
+        <w:spacing w:after="140" w:line="300"/>
+      </w:pPr>
+      <w:r>
+        <w:rPr>
+          <w:rFonts w:ascii="Arial" w:cs="Arial" w:eastAsia="Arial" w:hAnsi="Arial"/>
+          <w:color w:val="1B2118"/>
+          <w:sz w:val="21"/>
+          <w:szCs w:val="21"/>
+        </w:rPr>
+        <w:t xml:space="preserve">Gli ID dei crediti venduti seguono quelli già venduti; non si possono vendere più crediti di quelli del lotto, e solo dopo il caricamento sul registro.</w:t>
+      </w:r>
+    </w:p>
+    <w:p>
+      <w:pPr>
+        <w:spacing w:after="140" w:line="300"/>
+      </w:pPr>
+      <w:r>
+        <w:rPr>
+          <w:rFonts w:ascii="Arial" w:cs="Arial" w:eastAsia="Arial" w:hAnsi="Arial"/>
+          <w:b/>
+          <w:bCs/>
+          <w:color w:val="1B2118"/>
+          <w:sz w:val="21"/>
+          <w:szCs w:val="21"/>
+        </w:rPr>
+        <w:t xml:space="preserve">Registrare la cancellazione (staff)</w:t>
+      </w:r>
+    </w:p>
+    <w:p>
+      <w:pPr>
+        <w:spacing w:after="140" w:line="300"/>
+      </w:pPr>
+      <w:r>
+        <w:rPr>
+          <w:rFonts w:ascii="Arial" w:cs="Arial" w:eastAsia="Arial" w:hAnsi="Arial"/>
+          <w:color w:val="1B2118"/>
+          <w:sz w:val="21"/>
+          <w:szCs w:val="21"/>
+        </w:rPr>
+        <w:t xml:space="preserve">Il registro deve inviare la </w:t>
+      </w:r>
+      <w:r>
+        <w:rPr>
+          <w:rFonts w:ascii="Arial" w:cs="Arial" w:eastAsia="Arial" w:hAnsi="Arial"/>
+          <w:i/>
+          <w:iCs/>
+          <w:color w:val="1B2118"/>
+          <w:sz w:val="21"/>
+          <w:szCs w:val="21"/>
+        </w:rPr>
+        <w:t xml:space="preserve">Dichiarazione di cancellazione tombale dei crediti</w:t>
+      </w:r>
+      <w:r>
+        <w:rPr>
+          <w:rFonts w:ascii="Arial" w:cs="Arial" w:eastAsia="Arial" w:hAnsi="Arial"/>
+          <w:color w:val="1B2118"/>
+          <w:sz w:val="21"/>
+          <w:szCs w:val="21"/>
+        </w:rPr>
+        <w:t xml:space="preserve"> entro 10 giorni dalla vendita.</w:t>
+      </w:r>
+    </w:p>
+    <w:p>
+      <w:pPr>
+        <w:pStyle w:val="ListParagraph"/>
+        <w:numPr>
+          <w:ilvl w:val="0"/>
+          <w:numId w:val="34"/>
+        </w:numPr>
+        <w:spacing w:after="70" w:line="290"/>
+      </w:pPr>
+      <w:r>
+        <w:rPr>
+          <w:rFonts w:ascii="Arial" w:cs="Arial" w:eastAsia="Arial" w:hAnsi="Arial"/>
+          <w:color w:val="1B2118"/>
+          <w:sz w:val="21"/>
+          <w:szCs w:val="21"/>
+        </w:rPr>
+        <w:t xml:space="preserve">Caricate la dichiarazione tra i documenti del Rapporto (è obbligatoria).</w:t>
+      </w:r>
+    </w:p>
+    <w:p>
+      <w:pPr>
+        <w:pStyle w:val="ListParagraph"/>
+        <w:numPr>
+          <w:ilvl w:val="0"/>
+          <w:numId w:val="34"/>
+        </w:numPr>
+        <w:spacing w:after="70" w:line="290"/>
+      </w:pPr>
+      <w:r>
+        <w:rPr>
+          <w:rFonts w:ascii="Arial" w:cs="Arial" w:eastAsia="Arial" w:hAnsi="Arial"/>
+          <w:color w:val="1B2118"/>
+          <w:sz w:val="21"/>
+          <w:szCs w:val="21"/>
+        </w:rPr>
+        <w:t xml:space="preserve">Sulla vendita premete </w:t>
+      </w:r>
+      <w:r>
+        <w:rPr>
+          <w:rFonts w:ascii="Arial" w:cs="Arial" w:eastAsia="Arial" w:hAnsi="Arial"/>
+          <w:b/>
+          <w:bCs/>
+          <w:color w:val="1B2118"/>
+          <w:sz w:val="21"/>
+          <w:szCs w:val="21"/>
+        </w:rPr>
+        <w:t xml:space="preserve">Registra la cancellazione</w:t>
+      </w:r>
+      <w:r>
+        <w:rPr>
+          <w:rFonts w:ascii="Arial" w:cs="Arial" w:eastAsia="Arial" w:hAnsi="Arial"/>
+          <w:color w:val="1B2118"/>
+          <w:sz w:val="21"/>
+          <w:szCs w:val="21"/>
+        </w:rPr>
+        <w:t xml:space="preserve">, scegliete la </w:t>
+      </w:r>
+      <w:r>
+        <w:rPr>
+          <w:rFonts w:ascii="Arial" w:cs="Arial" w:eastAsia="Arial" w:hAnsi="Arial"/>
+          <w:b/>
+          <w:bCs/>
+          <w:color w:val="1B2118"/>
+          <w:sz w:val="21"/>
+          <w:szCs w:val="21"/>
+        </w:rPr>
+        <w:t xml:space="preserve">Dichiarazione di cancellazione tombale</w:t>
+      </w:r>
+      <w:r>
+        <w:rPr>
+          <w:rFonts w:ascii="Arial" w:cs="Arial" w:eastAsia="Arial" w:hAnsi="Arial"/>
+          <w:color w:val="1B2118"/>
+          <w:sz w:val="21"/>
+          <w:szCs w:val="21"/>
+        </w:rPr>
+        <w:t xml:space="preserve"> e la </w:t>
+      </w:r>
+      <w:r>
+        <w:rPr>
+          <w:rFonts w:ascii="Arial" w:cs="Arial" w:eastAsia="Arial" w:hAnsi="Arial"/>
+          <w:b/>
+          <w:bCs/>
+          <w:color w:val="1B2118"/>
+          <w:sz w:val="21"/>
+          <w:szCs w:val="21"/>
+        </w:rPr>
+        <w:t xml:space="preserve">Data</w:t>
+      </w:r>
+      <w:r>
+        <w:rPr>
+          <w:rFonts w:ascii="Arial" w:cs="Arial" w:eastAsia="Arial" w:hAnsi="Arial"/>
+          <w:color w:val="1B2118"/>
+          <w:sz w:val="21"/>
+          <w:szCs w:val="21"/>
+        </w:rPr>
+        <w:t xml:space="preserve">.</w:t>
+      </w:r>
+    </w:p>
+    <w:p>
+      <w:pPr>
+        <w:pStyle w:val="ListParagraph"/>
+        <w:numPr>
+          <w:ilvl w:val="0"/>
+          <w:numId w:val="34"/>
         </w:numPr>
         <w:spacing w:after="70" w:line="290"/>
       </w:pPr>
@@ -33096,7 +34542,7 @@
         </w:pBdr>
         <w:spacing w:after="240" w:before="0"/>
       </w:pPr>
-      <w:bookmarkStart w:name="cap19" w:id="1"/>
+      <w:bookmarkStart w:name="cap20" w:id="1"/>
       <w:r>
         <w:rPr>
           <w:rFonts w:ascii="Arial" w:cs="Arial" w:eastAsia="Arial" w:hAnsi="Arial"/>
@@ -33106,7 +34552,7 @@
           <w:sz w:val="34"/>
           <w:szCs w:val="34"/>
         </w:rPr>
-        <w:t xml:space="preserve">19. Reclami e richieste di chiarimento</w:t>
+        <w:t xml:space="preserve">20. Reclami e richieste di chiarimento</w:t>
       </w:r>
       <w:bookmarkEnd w:id="1"/>
     </w:p>
@@ -33584,344 +35030,6 @@
           <w:szCs w:val="21"/>
         </w:rPr>
         <w:t xml:space="preserve">Registrare un reclamo arrivato per PEC o email:</w:t>
-      </w:r>
-    </w:p>
-    <w:p>
-      <w:pPr>
-        <w:pStyle w:val="ListParagraph"/>
-        <w:numPr>
-          <w:ilvl w:val="0"/>
-          <w:numId w:val="34"/>
-        </w:numPr>
-        <w:spacing w:after="70" w:line="290"/>
-      </w:pPr>
-      <w:r>
-        <w:rPr>
-          <w:rFonts w:ascii="Arial" w:cs="Arial" w:eastAsia="Arial" w:hAnsi="Arial"/>
-          <w:color w:val="1B2118"/>
-          <w:sz w:val="21"/>
-          <w:szCs w:val="21"/>
-        </w:rPr>
-        <w:t xml:space="preserve">Premete </w:t>
-      </w:r>
-      <w:r>
-        <w:rPr>
-          <w:rFonts w:ascii="Arial" w:cs="Arial" w:eastAsia="Arial" w:hAnsi="Arial"/>
-          <w:b/>
-          <w:bCs/>
-          <w:color w:val="1B2118"/>
-          <w:sz w:val="21"/>
-          <w:szCs w:val="21"/>
-        </w:rPr>
-        <w:t xml:space="preserve">+ Registra (PEC, email)</w:t>
-      </w:r>
-      <w:r>
-        <w:rPr>
-          <w:rFonts w:ascii="Arial" w:cs="Arial" w:eastAsia="Arial" w:hAnsi="Arial"/>
-          <w:color w:val="1B2118"/>
-          <w:sz w:val="21"/>
-          <w:szCs w:val="21"/>
-        </w:rPr>
-        <w:t xml:space="preserve">.</w:t>
-      </w:r>
-    </w:p>
-    <w:p>
-      <w:pPr>
-        <w:pStyle w:val="ListParagraph"/>
-        <w:numPr>
-          <w:ilvl w:val="0"/>
-          <w:numId w:val="34"/>
-        </w:numPr>
-        <w:spacing w:after="70" w:line="290"/>
-      </w:pPr>
-      <w:r>
-        <w:rPr>
-          <w:rFonts w:ascii="Arial" w:cs="Arial" w:eastAsia="Arial" w:hAnsi="Arial"/>
-          <w:color w:val="1B2118"/>
-          <w:sz w:val="21"/>
-          <w:szCs w:val="21"/>
-        </w:rPr>
-        <w:t xml:space="preserve">Compilate </w:t>
-      </w:r>
-      <w:r>
-        <w:rPr>
-          <w:rFonts w:ascii="Arial" w:cs="Arial" w:eastAsia="Arial" w:hAnsi="Arial"/>
-          <w:b/>
-          <w:bCs/>
-          <w:color w:val="1B2118"/>
-          <w:sz w:val="21"/>
-          <w:szCs w:val="21"/>
-        </w:rPr>
-        <w:t xml:space="preserve">Tipo</w:t>
-      </w:r>
-      <w:r>
-        <w:rPr>
-          <w:rFonts w:ascii="Arial" w:cs="Arial" w:eastAsia="Arial" w:hAnsi="Arial"/>
-          <w:color w:val="1B2118"/>
-          <w:sz w:val="21"/>
-          <w:szCs w:val="21"/>
-        </w:rPr>
-        <w:t xml:space="preserve">, </w:t>
-      </w:r>
-      <w:r>
-        <w:rPr>
-          <w:rFonts w:ascii="Arial" w:cs="Arial" w:eastAsia="Arial" w:hAnsi="Arial"/>
-          <w:b/>
-          <w:bCs/>
-          <w:color w:val="1B2118"/>
-          <w:sz w:val="21"/>
-          <w:szCs w:val="21"/>
-        </w:rPr>
-        <w:t xml:space="preserve">Canale</w:t>
-      </w:r>
-      <w:r>
-        <w:rPr>
-          <w:rFonts w:ascii="Arial" w:cs="Arial" w:eastAsia="Arial" w:hAnsi="Arial"/>
-          <w:color w:val="1B2118"/>
-          <w:sz w:val="21"/>
-          <w:szCs w:val="21"/>
-        </w:rPr>
-        <w:t xml:space="preserve"> (pec, portale, email, altro), </w:t>
-      </w:r>
-      <w:r>
-        <w:rPr>
-          <w:rFonts w:ascii="Arial" w:cs="Arial" w:eastAsia="Arial" w:hAnsi="Arial"/>
-          <w:b/>
-          <w:bCs/>
-          <w:color w:val="1B2118"/>
-          <w:sz w:val="21"/>
-          <w:szCs w:val="21"/>
-        </w:rPr>
-        <w:t xml:space="preserve">Ricevuto il</w:t>
-      </w:r>
-      <w:r>
-        <w:rPr>
-          <w:rFonts w:ascii="Arial" w:cs="Arial" w:eastAsia="Arial" w:hAnsi="Arial"/>
-          <w:color w:val="1B2118"/>
-          <w:sz w:val="21"/>
-          <w:szCs w:val="21"/>
-        </w:rPr>
-        <w:t xml:space="preserve">, </w:t>
-      </w:r>
-      <w:r>
-        <w:rPr>
-          <w:rFonts w:ascii="Arial" w:cs="Arial" w:eastAsia="Arial" w:hAnsi="Arial"/>
-          <w:b/>
-          <w:bCs/>
-          <w:color w:val="1B2118"/>
-          <w:sz w:val="21"/>
-          <w:szCs w:val="21"/>
-        </w:rPr>
-        <w:t xml:space="preserve">Nome e cognome</w:t>
-      </w:r>
-      <w:r>
-        <w:rPr>
-          <w:rFonts w:ascii="Arial" w:cs="Arial" w:eastAsia="Arial" w:hAnsi="Arial"/>
-          <w:color w:val="1B2118"/>
-          <w:sz w:val="21"/>
-          <w:szCs w:val="21"/>
-        </w:rPr>
-        <w:t xml:space="preserve">, </w:t>
-      </w:r>
-      <w:r>
-        <w:rPr>
-          <w:rFonts w:ascii="Arial" w:cs="Arial" w:eastAsia="Arial" w:hAnsi="Arial"/>
-          <w:b/>
-          <w:bCs/>
-          <w:color w:val="1B2118"/>
-          <w:sz w:val="21"/>
-          <w:szCs w:val="21"/>
-        </w:rPr>
-        <w:t xml:space="preserve">Organizzazione</w:t>
-      </w:r>
-      <w:r>
-        <w:rPr>
-          <w:rFonts w:ascii="Arial" w:cs="Arial" w:eastAsia="Arial" w:hAnsi="Arial"/>
-          <w:color w:val="1B2118"/>
-          <w:sz w:val="21"/>
-          <w:szCs w:val="21"/>
-        </w:rPr>
-        <w:t xml:space="preserve">, </w:t>
-      </w:r>
-      <w:r>
-        <w:rPr>
-          <w:rFonts w:ascii="Arial" w:cs="Arial" w:eastAsia="Arial" w:hAnsi="Arial"/>
-          <w:b/>
-          <w:bCs/>
-          <w:color w:val="1B2118"/>
-          <w:sz w:val="21"/>
-          <w:szCs w:val="21"/>
-        </w:rPr>
-        <w:t xml:space="preserve">Ruolo</w:t>
-      </w:r>
-      <w:r>
-        <w:rPr>
-          <w:rFonts w:ascii="Arial" w:cs="Arial" w:eastAsia="Arial" w:hAnsi="Arial"/>
-          <w:color w:val="1B2118"/>
-          <w:sz w:val="21"/>
-          <w:szCs w:val="21"/>
-        </w:rPr>
-        <w:t xml:space="preserve"> (promotore del progetto, ente di validazione e verifica, sviluppatore di metodologia, registro, stakeholder), </w:t>
-      </w:r>
-      <w:r>
-        <w:rPr>
-          <w:rFonts w:ascii="Arial" w:cs="Arial" w:eastAsia="Arial" w:hAnsi="Arial"/>
-          <w:b/>
-          <w:bCs/>
-          <w:color w:val="1B2118"/>
-          <w:sz w:val="21"/>
-          <w:szCs w:val="21"/>
-        </w:rPr>
-        <w:t xml:space="preserve">Contatti</w:t>
-      </w:r>
-      <w:r>
-        <w:rPr>
-          <w:rFonts w:ascii="Arial" w:cs="Arial" w:eastAsia="Arial" w:hAnsi="Arial"/>
-          <w:color w:val="1B2118"/>
-          <w:sz w:val="21"/>
-          <w:szCs w:val="21"/>
-        </w:rPr>
-        <w:t xml:space="preserve">, </w:t>
-      </w:r>
-      <w:r>
-        <w:rPr>
-          <w:rFonts w:ascii="Arial" w:cs="Arial" w:eastAsia="Arial" w:hAnsi="Arial"/>
-          <w:b/>
-          <w:bCs/>
-          <w:color w:val="1B2118"/>
-          <w:sz w:val="21"/>
-          <w:szCs w:val="21"/>
-        </w:rPr>
-        <w:t xml:space="preserve">Progetto</w:t>
-      </w:r>
-      <w:r>
-        <w:rPr>
-          <w:rFonts w:ascii="Arial" w:cs="Arial" w:eastAsia="Arial" w:hAnsi="Arial"/>
-          <w:color w:val="1B2118"/>
-          <w:sz w:val="21"/>
-          <w:szCs w:val="21"/>
-        </w:rPr>
-        <w:t xml:space="preserve">, </w:t>
-      </w:r>
-      <w:r>
-        <w:rPr>
-          <w:rFonts w:ascii="Arial" w:cs="Arial" w:eastAsia="Arial" w:hAnsi="Arial"/>
-          <w:b/>
-          <w:bCs/>
-          <w:color w:val="1B2118"/>
-          <w:sz w:val="21"/>
-          <w:szCs w:val="21"/>
-        </w:rPr>
-        <w:t xml:space="preserve">Oggetto</w:t>
-      </w:r>
-      <w:r>
-        <w:rPr>
-          <w:rFonts w:ascii="Arial" w:cs="Arial" w:eastAsia="Arial" w:hAnsi="Arial"/>
-          <w:color w:val="1B2118"/>
-          <w:sz w:val="21"/>
-          <w:szCs w:val="21"/>
-        </w:rPr>
-        <w:t xml:space="preserve">, </w:t>
-      </w:r>
-      <w:r>
-        <w:rPr>
-          <w:rFonts w:ascii="Arial" w:cs="Arial" w:eastAsia="Arial" w:hAnsi="Arial"/>
-          <w:b/>
-          <w:bCs/>
-          <w:color w:val="1B2118"/>
-          <w:sz w:val="21"/>
-          <w:szCs w:val="21"/>
-        </w:rPr>
-        <w:t xml:space="preserve">Dettagli</w:t>
-      </w:r>
-      <w:r>
-        <w:rPr>
-          <w:rFonts w:ascii="Arial" w:cs="Arial" w:eastAsia="Arial" w:hAnsi="Arial"/>
-          <w:color w:val="1B2118"/>
-          <w:sz w:val="21"/>
-          <w:szCs w:val="21"/>
-        </w:rPr>
-        <w:t xml:space="preserve"> e </w:t>
-      </w:r>
-      <w:r>
-        <w:rPr>
-          <w:rFonts w:ascii="Arial" w:cs="Arial" w:eastAsia="Arial" w:hAnsi="Arial"/>
-          <w:b/>
-          <w:bCs/>
-          <w:color w:val="1B2118"/>
-          <w:sz w:val="21"/>
-          <w:szCs w:val="21"/>
-        </w:rPr>
-        <w:t xml:space="preserve">Conflitto di interessi dichiarato</w:t>
-      </w:r>
-      <w:r>
-        <w:rPr>
-          <w:rFonts w:ascii="Arial" w:cs="Arial" w:eastAsia="Arial" w:hAnsi="Arial"/>
-          <w:color w:val="1B2118"/>
-          <w:sz w:val="21"/>
-          <w:szCs w:val="21"/>
-        </w:rPr>
-        <w:t xml:space="preserve">.</w:t>
-      </w:r>
-    </w:p>
-    <w:p>
-      <w:pPr>
-        <w:pStyle w:val="ListParagraph"/>
-        <w:numPr>
-          <w:ilvl w:val="0"/>
-          <w:numId w:val="34"/>
-        </w:numPr>
-        <w:spacing w:after="70" w:line="290"/>
-      </w:pPr>
-      <w:r>
-        <w:rPr>
-          <w:rFonts w:ascii="Arial" w:cs="Arial" w:eastAsia="Arial" w:hAnsi="Arial"/>
-          <w:color w:val="1B2118"/>
-          <w:sz w:val="21"/>
-          <w:szCs w:val="21"/>
-        </w:rPr>
-        <w:t xml:space="preserve">Premete </w:t>
-      </w:r>
-      <w:r>
-        <w:rPr>
-          <w:rFonts w:ascii="Arial" w:cs="Arial" w:eastAsia="Arial" w:hAnsi="Arial"/>
-          <w:b/>
-          <w:bCs/>
-          <w:color w:val="1B2118"/>
-          <w:sz w:val="21"/>
-          <w:szCs w:val="21"/>
-        </w:rPr>
-        <w:t xml:space="preserve">Salva</w:t>
-      </w:r>
-      <w:r>
-        <w:rPr>
-          <w:rFonts w:ascii="Arial" w:cs="Arial" w:eastAsia="Arial" w:hAnsi="Arial"/>
-          <w:color w:val="1B2118"/>
-          <w:sz w:val="21"/>
-          <w:szCs w:val="21"/>
-        </w:rPr>
-        <w:t xml:space="preserve">.</w:t>
-      </w:r>
-    </w:p>
-    <w:p>
-      <w:pPr>
-        <w:spacing w:after="60"/>
-      </w:pPr>
-    </w:p>
-    <w:p>
-      <w:pPr>
-        <w:spacing w:after="140" w:line="300"/>
-      </w:pPr>
-      <w:r>
-        <w:rPr>
-          <w:rFonts w:ascii="Arial" w:cs="Arial" w:eastAsia="Arial" w:hAnsi="Arial"/>
-          <w:i/>
-          <w:iCs/>
-          <w:color w:val="1B2118"/>
-          <w:sz w:val="21"/>
-          <w:szCs w:val="21"/>
-        </w:rPr>
-        <w:t xml:space="preserve">Gestire un reclamo:</w:t>
       </w:r>
     </w:p>
     <w:p>
@@ -33940,18 +35048,18 @@
           <w:sz w:val="21"/>
           <w:szCs w:val="21"/>
         </w:rPr>
-        <w:t xml:space="preserve">Sulla riga premete </w:t>
-      </w:r>
-      <w:r>
-        <w:rPr>
-          <w:rFonts w:ascii="Arial" w:cs="Arial" w:eastAsia="Arial" w:hAnsi="Arial"/>
-          <w:b/>
-          <w:bCs/>
-          <w:color w:val="1B2118"/>
-          <w:sz w:val="21"/>
-          <w:szCs w:val="21"/>
-        </w:rPr>
-        <w:t xml:space="preserve">Gestisci</w:t>
+        <w:t xml:space="preserve">Premete </w:t>
+      </w:r>
+      <w:r>
+        <w:rPr>
+          <w:rFonts w:ascii="Arial" w:cs="Arial" w:eastAsia="Arial" w:hAnsi="Arial"/>
+          <w:b/>
+          <w:bCs/>
+          <w:color w:val="1B2118"/>
+          <w:sz w:val="21"/>
+          <w:szCs w:val="21"/>
+        </w:rPr>
+        <w:t xml:space="preserve">+ Registra (PEC, email)</w:t>
       </w:r>
       <w:r>
         <w:rPr>
@@ -33979,38 +35087,18 @@
           <w:sz w:val="21"/>
           <w:szCs w:val="21"/>
         </w:rPr>
-        <w:t xml:space="preserve">Aggiornate </w:t>
-      </w:r>
-      <w:r>
-        <w:rPr>
-          <w:rFonts w:ascii="Arial" w:cs="Arial" w:eastAsia="Arial" w:hAnsi="Arial"/>
-          <w:b/>
-          <w:bCs/>
-          <w:color w:val="1B2118"/>
-          <w:sz w:val="21"/>
-          <w:szCs w:val="21"/>
-        </w:rPr>
-        <w:t xml:space="preserve">Stato</w:t>
-      </w:r>
-      <w:r>
-        <w:rPr>
-          <w:rFonts w:ascii="Arial" w:cs="Arial" w:eastAsia="Arial" w:hAnsi="Arial"/>
-          <w:color w:val="1B2118"/>
-          <w:sz w:val="21"/>
-          <w:szCs w:val="21"/>
-        </w:rPr>
-        <w:t xml:space="preserve"> (ricevuto, in esame, risposto, chiuso), </w:t>
-      </w:r>
-      <w:r>
-        <w:rPr>
-          <w:rFonts w:ascii="Arial" w:cs="Arial" w:eastAsia="Arial" w:hAnsi="Arial"/>
-          <w:b/>
-          <w:bCs/>
-          <w:color w:val="1B2118"/>
-          <w:sz w:val="21"/>
-          <w:szCs w:val="21"/>
-        </w:rPr>
-        <w:t xml:space="preserve">Gestito da</w:t>
+        <w:t xml:space="preserve">Compilate </w:t>
+      </w:r>
+      <w:r>
+        <w:rPr>
+          <w:rFonts w:ascii="Arial" w:cs="Arial" w:eastAsia="Arial" w:hAnsi="Arial"/>
+          <w:b/>
+          <w:bCs/>
+          <w:color w:val="1B2118"/>
+          <w:sz w:val="21"/>
+          <w:szCs w:val="21"/>
+        </w:rPr>
+        <w:t xml:space="preserve">Tipo</w:t>
       </w:r>
       <w:r>
         <w:rPr>
@@ -34030,27 +35118,187 @@
           <w:sz w:val="21"/>
           <w:szCs w:val="21"/>
         </w:rPr>
-        <w:t xml:space="preserve">Conferma di ricezione inviata il</w:t>
-      </w:r>
-      <w:r>
-        <w:rPr>
-          <w:rFonts w:ascii="Arial" w:cs="Arial" w:eastAsia="Arial" w:hAnsi="Arial"/>
-          <w:color w:val="1B2118"/>
-          <w:sz w:val="21"/>
-          <w:szCs w:val="21"/>
-        </w:rPr>
-        <w:t xml:space="preserve"> e, se previsti, i </w:t>
-      </w:r>
-      <w:r>
-        <w:rPr>
-          <w:rFonts w:ascii="Arial" w:cs="Arial" w:eastAsia="Arial" w:hAnsi="Arial"/>
-          <w:b/>
-          <w:bCs/>
-          <w:color w:val="1B2118"/>
-          <w:sz w:val="21"/>
-          <w:szCs w:val="21"/>
-        </w:rPr>
-        <w:t xml:space="preserve">Costi addebitati (€)</w:t>
+        <w:t xml:space="preserve">Canale</w:t>
+      </w:r>
+      <w:r>
+        <w:rPr>
+          <w:rFonts w:ascii="Arial" w:cs="Arial" w:eastAsia="Arial" w:hAnsi="Arial"/>
+          <w:color w:val="1B2118"/>
+          <w:sz w:val="21"/>
+          <w:szCs w:val="21"/>
+        </w:rPr>
+        <w:t xml:space="preserve"> (pec, portale, email, altro), </w:t>
+      </w:r>
+      <w:r>
+        <w:rPr>
+          <w:rFonts w:ascii="Arial" w:cs="Arial" w:eastAsia="Arial" w:hAnsi="Arial"/>
+          <w:b/>
+          <w:bCs/>
+          <w:color w:val="1B2118"/>
+          <w:sz w:val="21"/>
+          <w:szCs w:val="21"/>
+        </w:rPr>
+        <w:t xml:space="preserve">Ricevuto il</w:t>
+      </w:r>
+      <w:r>
+        <w:rPr>
+          <w:rFonts w:ascii="Arial" w:cs="Arial" w:eastAsia="Arial" w:hAnsi="Arial"/>
+          <w:color w:val="1B2118"/>
+          <w:sz w:val="21"/>
+          <w:szCs w:val="21"/>
+        </w:rPr>
+        <w:t xml:space="preserve">, </w:t>
+      </w:r>
+      <w:r>
+        <w:rPr>
+          <w:rFonts w:ascii="Arial" w:cs="Arial" w:eastAsia="Arial" w:hAnsi="Arial"/>
+          <w:b/>
+          <w:bCs/>
+          <w:color w:val="1B2118"/>
+          <w:sz w:val="21"/>
+          <w:szCs w:val="21"/>
+        </w:rPr>
+        <w:t xml:space="preserve">Nome e cognome</w:t>
+      </w:r>
+      <w:r>
+        <w:rPr>
+          <w:rFonts w:ascii="Arial" w:cs="Arial" w:eastAsia="Arial" w:hAnsi="Arial"/>
+          <w:color w:val="1B2118"/>
+          <w:sz w:val="21"/>
+          <w:szCs w:val="21"/>
+        </w:rPr>
+        <w:t xml:space="preserve">, </w:t>
+      </w:r>
+      <w:r>
+        <w:rPr>
+          <w:rFonts w:ascii="Arial" w:cs="Arial" w:eastAsia="Arial" w:hAnsi="Arial"/>
+          <w:b/>
+          <w:bCs/>
+          <w:color w:val="1B2118"/>
+          <w:sz w:val="21"/>
+          <w:szCs w:val="21"/>
+        </w:rPr>
+        <w:t xml:space="preserve">Organizzazione</w:t>
+      </w:r>
+      <w:r>
+        <w:rPr>
+          <w:rFonts w:ascii="Arial" w:cs="Arial" w:eastAsia="Arial" w:hAnsi="Arial"/>
+          <w:color w:val="1B2118"/>
+          <w:sz w:val="21"/>
+          <w:szCs w:val="21"/>
+        </w:rPr>
+        <w:t xml:space="preserve">, </w:t>
+      </w:r>
+      <w:r>
+        <w:rPr>
+          <w:rFonts w:ascii="Arial" w:cs="Arial" w:eastAsia="Arial" w:hAnsi="Arial"/>
+          <w:b/>
+          <w:bCs/>
+          <w:color w:val="1B2118"/>
+          <w:sz w:val="21"/>
+          <w:szCs w:val="21"/>
+        </w:rPr>
+        <w:t xml:space="preserve">Ruolo</w:t>
+      </w:r>
+      <w:r>
+        <w:rPr>
+          <w:rFonts w:ascii="Arial" w:cs="Arial" w:eastAsia="Arial" w:hAnsi="Arial"/>
+          <w:color w:val="1B2118"/>
+          <w:sz w:val="21"/>
+          <w:szCs w:val="21"/>
+        </w:rPr>
+        <w:t xml:space="preserve"> (promotore del progetto, ente di validazione e verifica, sviluppatore di metodologia, registro, stakeholder), </w:t>
+      </w:r>
+      <w:r>
+        <w:rPr>
+          <w:rFonts w:ascii="Arial" w:cs="Arial" w:eastAsia="Arial" w:hAnsi="Arial"/>
+          <w:b/>
+          <w:bCs/>
+          <w:color w:val="1B2118"/>
+          <w:sz w:val="21"/>
+          <w:szCs w:val="21"/>
+        </w:rPr>
+        <w:t xml:space="preserve">Contatti</w:t>
+      </w:r>
+      <w:r>
+        <w:rPr>
+          <w:rFonts w:ascii="Arial" w:cs="Arial" w:eastAsia="Arial" w:hAnsi="Arial"/>
+          <w:color w:val="1B2118"/>
+          <w:sz w:val="21"/>
+          <w:szCs w:val="21"/>
+        </w:rPr>
+        <w:t xml:space="preserve">, </w:t>
+      </w:r>
+      <w:r>
+        <w:rPr>
+          <w:rFonts w:ascii="Arial" w:cs="Arial" w:eastAsia="Arial" w:hAnsi="Arial"/>
+          <w:b/>
+          <w:bCs/>
+          <w:color w:val="1B2118"/>
+          <w:sz w:val="21"/>
+          <w:szCs w:val="21"/>
+        </w:rPr>
+        <w:t xml:space="preserve">Progetto</w:t>
+      </w:r>
+      <w:r>
+        <w:rPr>
+          <w:rFonts w:ascii="Arial" w:cs="Arial" w:eastAsia="Arial" w:hAnsi="Arial"/>
+          <w:color w:val="1B2118"/>
+          <w:sz w:val="21"/>
+          <w:szCs w:val="21"/>
+        </w:rPr>
+        <w:t xml:space="preserve">, </w:t>
+      </w:r>
+      <w:r>
+        <w:rPr>
+          <w:rFonts w:ascii="Arial" w:cs="Arial" w:eastAsia="Arial" w:hAnsi="Arial"/>
+          <w:b/>
+          <w:bCs/>
+          <w:color w:val="1B2118"/>
+          <w:sz w:val="21"/>
+          <w:szCs w:val="21"/>
+        </w:rPr>
+        <w:t xml:space="preserve">Oggetto</w:t>
+      </w:r>
+      <w:r>
+        <w:rPr>
+          <w:rFonts w:ascii="Arial" w:cs="Arial" w:eastAsia="Arial" w:hAnsi="Arial"/>
+          <w:color w:val="1B2118"/>
+          <w:sz w:val="21"/>
+          <w:szCs w:val="21"/>
+        </w:rPr>
+        <w:t xml:space="preserve">, </w:t>
+      </w:r>
+      <w:r>
+        <w:rPr>
+          <w:rFonts w:ascii="Arial" w:cs="Arial" w:eastAsia="Arial" w:hAnsi="Arial"/>
+          <w:b/>
+          <w:bCs/>
+          <w:color w:val="1B2118"/>
+          <w:sz w:val="21"/>
+          <w:szCs w:val="21"/>
+        </w:rPr>
+        <w:t xml:space="preserve">Dettagli</w:t>
+      </w:r>
+      <w:r>
+        <w:rPr>
+          <w:rFonts w:ascii="Arial" w:cs="Arial" w:eastAsia="Arial" w:hAnsi="Arial"/>
+          <w:color w:val="1B2118"/>
+          <w:sz w:val="21"/>
+          <w:szCs w:val="21"/>
+        </w:rPr>
+        <w:t xml:space="preserve"> e </w:t>
+      </w:r>
+      <w:r>
+        <w:rPr>
+          <w:rFonts w:ascii="Arial" w:cs="Arial" w:eastAsia="Arial" w:hAnsi="Arial"/>
+          <w:b/>
+          <w:bCs/>
+          <w:color w:val="1B2118"/>
+          <w:sz w:val="21"/>
+          <w:szCs w:val="21"/>
+        </w:rPr>
+        <w:t xml:space="preserve">Conflitto di interessi dichiarato</w:t>
       </w:r>
       <w:r>
         <w:rPr>
@@ -34078,47 +35326,48 @@
           <w:sz w:val="21"/>
           <w:szCs w:val="21"/>
         </w:rPr>
-        <w:t xml:space="preserve">Scrivete la </w:t>
-      </w:r>
-      <w:r>
-        <w:rPr>
-          <w:rFonts w:ascii="Arial" w:cs="Arial" w:eastAsia="Arial" w:hAnsi="Arial"/>
-          <w:b/>
-          <w:bCs/>
-          <w:color w:val="1B2118"/>
-          <w:sz w:val="21"/>
-          <w:szCs w:val="21"/>
-        </w:rPr>
-        <w:t xml:space="preserve">Risposta scritta</w:t>
-      </w:r>
-      <w:r>
-        <w:rPr>
-          <w:rFonts w:ascii="Arial" w:cs="Arial" w:eastAsia="Arial" w:hAnsi="Arial"/>
-          <w:color w:val="1B2118"/>
-          <w:sz w:val="21"/>
-          <w:szCs w:val="21"/>
-        </w:rPr>
-        <w:t xml:space="preserve"> e, se serve, le </w:t>
-      </w:r>
-      <w:r>
-        <w:rPr>
-          <w:rFonts w:ascii="Arial" w:cs="Arial" w:eastAsia="Arial" w:hAnsi="Arial"/>
-          <w:b/>
-          <w:bCs/>
-          <w:color w:val="1B2118"/>
-          <w:sz w:val="21"/>
-          <w:szCs w:val="21"/>
-        </w:rPr>
-        <w:t xml:space="preserve">Note interne (riservate)</w:t>
-      </w:r>
-      <w:r>
-        <w:rPr>
-          <w:rFonts w:ascii="Arial" w:cs="Arial" w:eastAsia="Arial" w:hAnsi="Arial"/>
-          <w:color w:val="1B2118"/>
-          <w:sz w:val="21"/>
-          <w:szCs w:val="21"/>
-        </w:rPr>
-        <w:t xml:space="preserve">, che l'autore non vede mai.</w:t>
+        <w:t xml:space="preserve">Premete </w:t>
+      </w:r>
+      <w:r>
+        <w:rPr>
+          <w:rFonts w:ascii="Arial" w:cs="Arial" w:eastAsia="Arial" w:hAnsi="Arial"/>
+          <w:b/>
+          <w:bCs/>
+          <w:color w:val="1B2118"/>
+          <w:sz w:val="21"/>
+          <w:szCs w:val="21"/>
+        </w:rPr>
+        <w:t xml:space="preserve">Salva</w:t>
+      </w:r>
+      <w:r>
+        <w:rPr>
+          <w:rFonts w:ascii="Arial" w:cs="Arial" w:eastAsia="Arial" w:hAnsi="Arial"/>
+          <w:color w:val="1B2118"/>
+          <w:sz w:val="21"/>
+          <w:szCs w:val="21"/>
+        </w:rPr>
+        <w:t xml:space="preserve">.</w:t>
+      </w:r>
+    </w:p>
+    <w:p>
+      <w:pPr>
+        <w:spacing w:after="60"/>
+      </w:pPr>
+    </w:p>
+    <w:p>
+      <w:pPr>
+        <w:spacing w:after="140" w:line="300"/>
+      </w:pPr>
+      <w:r>
+        <w:rPr>
+          <w:rFonts w:ascii="Arial" w:cs="Arial" w:eastAsia="Arial" w:hAnsi="Arial"/>
+          <w:i/>
+          <w:iCs/>
+          <w:color w:val="1B2118"/>
+          <w:sz w:val="21"/>
+          <w:szCs w:val="21"/>
+        </w:rPr>
+        <w:t xml:space="preserve">Gestire un reclamo:</w:t>
       </w:r>
     </w:p>
     <w:p>
@@ -34126,7 +35375,204 @@
         <w:pStyle w:val="ListParagraph"/>
         <w:numPr>
           <w:ilvl w:val="0"/>
-          <w:numId w:val="35"/>
+          <w:numId w:val="36"/>
+        </w:numPr>
+        <w:spacing w:after="70" w:line="290"/>
+      </w:pPr>
+      <w:r>
+        <w:rPr>
+          <w:rFonts w:ascii="Arial" w:cs="Arial" w:eastAsia="Arial" w:hAnsi="Arial"/>
+          <w:color w:val="1B2118"/>
+          <w:sz w:val="21"/>
+          <w:szCs w:val="21"/>
+        </w:rPr>
+        <w:t xml:space="preserve">Sulla riga premete </w:t>
+      </w:r>
+      <w:r>
+        <w:rPr>
+          <w:rFonts w:ascii="Arial" w:cs="Arial" w:eastAsia="Arial" w:hAnsi="Arial"/>
+          <w:b/>
+          <w:bCs/>
+          <w:color w:val="1B2118"/>
+          <w:sz w:val="21"/>
+          <w:szCs w:val="21"/>
+        </w:rPr>
+        <w:t xml:space="preserve">Gestisci</w:t>
+      </w:r>
+      <w:r>
+        <w:rPr>
+          <w:rFonts w:ascii="Arial" w:cs="Arial" w:eastAsia="Arial" w:hAnsi="Arial"/>
+          <w:color w:val="1B2118"/>
+          <w:sz w:val="21"/>
+          <w:szCs w:val="21"/>
+        </w:rPr>
+        <w:t xml:space="preserve">.</w:t>
+      </w:r>
+    </w:p>
+    <w:p>
+      <w:pPr>
+        <w:pStyle w:val="ListParagraph"/>
+        <w:numPr>
+          <w:ilvl w:val="0"/>
+          <w:numId w:val="36"/>
+        </w:numPr>
+        <w:spacing w:after="70" w:line="290"/>
+      </w:pPr>
+      <w:r>
+        <w:rPr>
+          <w:rFonts w:ascii="Arial" w:cs="Arial" w:eastAsia="Arial" w:hAnsi="Arial"/>
+          <w:color w:val="1B2118"/>
+          <w:sz w:val="21"/>
+          <w:szCs w:val="21"/>
+        </w:rPr>
+        <w:t xml:space="preserve">Aggiornate </w:t>
+      </w:r>
+      <w:r>
+        <w:rPr>
+          <w:rFonts w:ascii="Arial" w:cs="Arial" w:eastAsia="Arial" w:hAnsi="Arial"/>
+          <w:b/>
+          <w:bCs/>
+          <w:color w:val="1B2118"/>
+          <w:sz w:val="21"/>
+          <w:szCs w:val="21"/>
+        </w:rPr>
+        <w:t xml:space="preserve">Stato</w:t>
+      </w:r>
+      <w:r>
+        <w:rPr>
+          <w:rFonts w:ascii="Arial" w:cs="Arial" w:eastAsia="Arial" w:hAnsi="Arial"/>
+          <w:color w:val="1B2118"/>
+          <w:sz w:val="21"/>
+          <w:szCs w:val="21"/>
+        </w:rPr>
+        <w:t xml:space="preserve"> (ricevuto, in esame, risposto, chiuso), </w:t>
+      </w:r>
+      <w:r>
+        <w:rPr>
+          <w:rFonts w:ascii="Arial" w:cs="Arial" w:eastAsia="Arial" w:hAnsi="Arial"/>
+          <w:b/>
+          <w:bCs/>
+          <w:color w:val="1B2118"/>
+          <w:sz w:val="21"/>
+          <w:szCs w:val="21"/>
+        </w:rPr>
+        <w:t xml:space="preserve">Gestito da</w:t>
+      </w:r>
+      <w:r>
+        <w:rPr>
+          <w:rFonts w:ascii="Arial" w:cs="Arial" w:eastAsia="Arial" w:hAnsi="Arial"/>
+          <w:color w:val="1B2118"/>
+          <w:sz w:val="21"/>
+          <w:szCs w:val="21"/>
+        </w:rPr>
+        <w:t xml:space="preserve">, </w:t>
+      </w:r>
+      <w:r>
+        <w:rPr>
+          <w:rFonts w:ascii="Arial" w:cs="Arial" w:eastAsia="Arial" w:hAnsi="Arial"/>
+          <w:b/>
+          <w:bCs/>
+          <w:color w:val="1B2118"/>
+          <w:sz w:val="21"/>
+          <w:szCs w:val="21"/>
+        </w:rPr>
+        <w:t xml:space="preserve">Conferma di ricezione inviata il</w:t>
+      </w:r>
+      <w:r>
+        <w:rPr>
+          <w:rFonts w:ascii="Arial" w:cs="Arial" w:eastAsia="Arial" w:hAnsi="Arial"/>
+          <w:color w:val="1B2118"/>
+          <w:sz w:val="21"/>
+          <w:szCs w:val="21"/>
+        </w:rPr>
+        <w:t xml:space="preserve"> e, se previsti, i </w:t>
+      </w:r>
+      <w:r>
+        <w:rPr>
+          <w:rFonts w:ascii="Arial" w:cs="Arial" w:eastAsia="Arial" w:hAnsi="Arial"/>
+          <w:b/>
+          <w:bCs/>
+          <w:color w:val="1B2118"/>
+          <w:sz w:val="21"/>
+          <w:szCs w:val="21"/>
+        </w:rPr>
+        <w:t xml:space="preserve">Costi addebitati (€)</w:t>
+      </w:r>
+      <w:r>
+        <w:rPr>
+          <w:rFonts w:ascii="Arial" w:cs="Arial" w:eastAsia="Arial" w:hAnsi="Arial"/>
+          <w:color w:val="1B2118"/>
+          <w:sz w:val="21"/>
+          <w:szCs w:val="21"/>
+        </w:rPr>
+        <w:t xml:space="preserve">.</w:t>
+      </w:r>
+    </w:p>
+    <w:p>
+      <w:pPr>
+        <w:pStyle w:val="ListParagraph"/>
+        <w:numPr>
+          <w:ilvl w:val="0"/>
+          <w:numId w:val="36"/>
+        </w:numPr>
+        <w:spacing w:after="70" w:line="290"/>
+      </w:pPr>
+      <w:r>
+        <w:rPr>
+          <w:rFonts w:ascii="Arial" w:cs="Arial" w:eastAsia="Arial" w:hAnsi="Arial"/>
+          <w:color w:val="1B2118"/>
+          <w:sz w:val="21"/>
+          <w:szCs w:val="21"/>
+        </w:rPr>
+        <w:t xml:space="preserve">Scrivete la </w:t>
+      </w:r>
+      <w:r>
+        <w:rPr>
+          <w:rFonts w:ascii="Arial" w:cs="Arial" w:eastAsia="Arial" w:hAnsi="Arial"/>
+          <w:b/>
+          <w:bCs/>
+          <w:color w:val="1B2118"/>
+          <w:sz w:val="21"/>
+          <w:szCs w:val="21"/>
+        </w:rPr>
+        <w:t xml:space="preserve">Risposta scritta</w:t>
+      </w:r>
+      <w:r>
+        <w:rPr>
+          <w:rFonts w:ascii="Arial" w:cs="Arial" w:eastAsia="Arial" w:hAnsi="Arial"/>
+          <w:color w:val="1B2118"/>
+          <w:sz w:val="21"/>
+          <w:szCs w:val="21"/>
+        </w:rPr>
+        <w:t xml:space="preserve"> e, se serve, le </w:t>
+      </w:r>
+      <w:r>
+        <w:rPr>
+          <w:rFonts w:ascii="Arial" w:cs="Arial" w:eastAsia="Arial" w:hAnsi="Arial"/>
+          <w:b/>
+          <w:bCs/>
+          <w:color w:val="1B2118"/>
+          <w:sz w:val="21"/>
+          <w:szCs w:val="21"/>
+        </w:rPr>
+        <w:t xml:space="preserve">Note interne (riservate)</w:t>
+      </w:r>
+      <w:r>
+        <w:rPr>
+          <w:rFonts w:ascii="Arial" w:cs="Arial" w:eastAsia="Arial" w:hAnsi="Arial"/>
+          <w:color w:val="1B2118"/>
+          <w:sz w:val="21"/>
+          <w:szCs w:val="21"/>
+        </w:rPr>
+        <w:t xml:space="preserve">, che l'autore non vede mai.</w:t>
+      </w:r>
+    </w:p>
+    <w:p>
+      <w:pPr>
+        <w:pStyle w:val="ListParagraph"/>
+        <w:numPr>
+          <w:ilvl w:val="0"/>
+          <w:numId w:val="36"/>
         </w:numPr>
         <w:spacing w:after="70" w:line="290"/>
       </w:pPr>
@@ -34188,7 +35634,7 @@
         </w:pBdr>
         <w:spacing w:after="240" w:before="0"/>
       </w:pPr>
-      <w:bookmarkStart w:name="cap20" w:id="1"/>
+      <w:bookmarkStart w:name="cap21" w:id="1"/>
       <w:r>
         <w:rPr>
           <w:rFonts w:ascii="Arial" w:cs="Arial" w:eastAsia="Arial" w:hAnsi="Arial"/>
@@ -34198,7 +35644,7 @@
           <w:sz w:val="34"/>
           <w:szCs w:val="34"/>
         </w:rPr>
-        <w:t xml:space="preserve">20. Pagina pubblica del Programma</w:t>
+        <w:t xml:space="preserve">21. Pagina pubblica del Programma</w:t>
       </w:r>
       <w:bookmarkEnd w:id="1"/>
     </w:p>
@@ -34632,7 +36078,7 @@
         </w:pBdr>
         <w:spacing w:after="240" w:before="0"/>
       </w:pPr>
-      <w:bookmarkStart w:name="cap21" w:id="1"/>
+      <w:bookmarkStart w:name="cap22" w:id="1"/>
       <w:r>
         <w:rPr>
           <w:rFonts w:ascii="Arial" w:cs="Arial" w:eastAsia="Arial" w:hAnsi="Arial"/>
@@ -34642,7 +36088,7 @@
           <w:sz w:val="34"/>
           <w:szCs w:val="34"/>
         </w:rPr>
-        <w:t xml:space="preserve">21. Documentazione e manuali</w:t>
+        <w:t xml:space="preserve">22. Documentazione e manuali</w:t>
       </w:r>
       <w:bookmarkEnd w:id="1"/>
     </w:p>
@@ -35307,7 +36753,7 @@
         </w:pBdr>
         <w:spacing w:after="240" w:before="0"/>
       </w:pPr>
-      <w:bookmarkStart w:name="cap22" w:id="1"/>
+      <w:bookmarkStart w:name="cap23" w:id="1"/>
       <w:r>
         <w:rPr>
           <w:rFonts w:ascii="Arial" w:cs="Arial" w:eastAsia="Arial" w:hAnsi="Arial"/>
@@ -35317,7 +36763,7 @@
           <w:sz w:val="34"/>
           <w:szCs w:val="34"/>
         </w:rPr>
-        <w:t xml:space="preserve">22. Manutenzione ed emergenze</w:t>
+        <w:t xml:space="preserve">23. Manutenzione ed emergenze</w:t>
       </w:r>
       <w:bookmarkEnd w:id="1"/>
     </w:p>
@@ -36465,7 +37911,7 @@
         </w:pBdr>
         <w:spacing w:after="240" w:before="0"/>
       </w:pPr>
-      <w:bookmarkStart w:name="cap23" w:id="1"/>
+      <w:bookmarkStart w:name="cap24" w:id="1"/>
       <w:r>
         <w:rPr>
           <w:rFonts w:ascii="Arial" w:cs="Arial" w:eastAsia="Arial" w:hAnsi="Arial"/>
@@ -36475,7 +37921,7 @@
           <w:sz w:val="34"/>
           <w:szCs w:val="34"/>
         </w:rPr>
-        <w:t xml:space="preserve">23. Funzioni in arrivo</w:t>
+        <w:t xml:space="preserve">24. Funzioni in arrivo</w:t>
       </w:r>
       <w:bookmarkEnd w:id="1"/>
     </w:p>
@@ -36601,96 +38047,16 @@
           <w:sz w:val="21"/>
           <w:szCs w:val="21"/>
         </w:rPr>
-        <w:t xml:space="preserve">Simulatore di scenari</w:t>
-      </w:r>
-      <w:r>
-        <w:rPr>
-          <w:rFonts w:ascii="Arial" w:cs="Arial" w:eastAsia="Arial" w:hAnsi="Arial"/>
-          <w:color w:val="1B2118"/>
-          <w:sz w:val="21"/>
-          <w:szCs w:val="21"/>
-        </w:rPr>
-        <w:t xml:space="preserve"> (sezione Crediti): per ogni Comune più scenari, con durata scelta da un menu a tendina (</w:t>
-      </w:r>
-      <w:r>
-        <w:rPr>
-          <w:rFonts w:ascii="Arial" w:cs="Arial" w:eastAsia="Arial" w:hAnsi="Arial"/>
-          <w:b/>
-          <w:bCs/>
-          <w:color w:val="1B2118"/>
-          <w:sz w:val="21"/>
-          <w:szCs w:val="21"/>
-        </w:rPr>
-        <w:t xml:space="preserve">7, 10 o 21 anni</w:t>
-      </w:r>
-      <w:r>
-        <w:rPr>
-          <w:rFonts w:ascii="Arial" w:cs="Arial" w:eastAsia="Arial" w:hAnsi="Arial"/>
-          <w:color w:val="1B2118"/>
-          <w:sz w:val="21"/>
-          <w:szCs w:val="21"/>
-        </w:rPr>
-        <w:t xml:space="preserve">). Si inseriscono i dati dell'anno base (popolazione, produzione totale e pro capite, raccolta differenziata, ripartizione per frazione e i parametri del calcolo) e, per ogni anno, gli obiettivi di produzione totale e pro capite e di </w:t>
-      </w:r>
-      <w:r>
-        <w:rPr>
-          <w:rFonts w:ascii="Arial" w:cs="Arial" w:eastAsia="Arial" w:hAnsi="Arial"/>
-          <w:b/>
-          <w:bCs/>
-          <w:color w:val="1B2118"/>
-          <w:sz w:val="21"/>
-          <w:szCs w:val="21"/>
-        </w:rPr>
-        <w:t xml:space="preserve">secco residuo pro capite</w:t>
-      </w:r>
-      <w:r>
-        <w:rPr>
-          <w:rFonts w:ascii="Arial" w:cs="Arial" w:eastAsia="Arial" w:hAnsi="Arial"/>
-          <w:color w:val="1B2118"/>
-          <w:sz w:val="21"/>
-          <w:szCs w:val="21"/>
-        </w:rPr>
-        <w:t xml:space="preserve">. Il simulatore ricalcola la </w:t>
-      </w:r>
-      <w:r>
-        <w:rPr>
-          <w:rFonts w:ascii="Arial" w:cs="Arial" w:eastAsia="Arial" w:hAnsi="Arial"/>
-          <w:b/>
-          <w:bCs/>
-          <w:color w:val="1B2118"/>
-          <w:sz w:val="21"/>
-          <w:szCs w:val="21"/>
-        </w:rPr>
-        <w:t xml:space="preserve">percentuale di differenziata</w:t>
-      </w:r>
-      <w:r>
-        <w:rPr>
-          <w:rFonts w:ascii="Arial" w:cs="Arial" w:eastAsia="Arial" w:hAnsi="Arial"/>
-          <w:color w:val="1B2118"/>
-          <w:sz w:val="21"/>
-          <w:szCs w:val="21"/>
-        </w:rPr>
-        <w:t xml:space="preserve"> e stima </w:t>
-      </w:r>
-      <w:r>
-        <w:rPr>
-          <w:rFonts w:ascii="Arial" w:cs="Arial" w:eastAsia="Arial" w:hAnsi="Arial"/>
-          <w:b/>
-          <w:bCs/>
-          <w:color w:val="1B2118"/>
-          <w:sz w:val="21"/>
-          <w:szCs w:val="21"/>
-        </w:rPr>
-        <w:t xml:space="preserve">anno per anno i crediti</w:t>
-      </w:r>
-      <w:r>
-        <w:rPr>
-          <w:rFonts w:ascii="Arial" w:cs="Arial" w:eastAsia="Arial" w:hAnsi="Arial"/>
-          <w:color w:val="1B2118"/>
-          <w:sz w:val="21"/>
-          <w:szCs w:val="21"/>
-        </w:rPr>
-        <w:t xml:space="preserve"> che il Comune potrebbe generare, con tabella, grafico e confronto tra scenari. È una stima ex ante, non un calcolo certificabile: il modello va confermato dalla Fondazione.</w:t>
+        <w:t xml:space="preserve">Simulatore di scenari:</w:t>
+      </w:r>
+      <w:r>
+        <w:rPr>
+          <w:rFonts w:ascii="Arial" w:cs="Arial" w:eastAsia="Arial" w:hAnsi="Arial"/>
+          <w:color w:val="1B2118"/>
+          <w:sz w:val="21"/>
+          <w:szCs w:val="21"/>
+        </w:rPr>
+        <w:t xml:space="preserve"> la prima versione è disponibile (capitolo «Simulatore di scenari»). In arrivo: stampa in PDF impaginata e, se la Fondazione lo decide, la visione dello scenario da parte del Comune.</w:t>
       </w:r>
     </w:p>
     <w:p>
@@ -36958,7 +38324,7 @@
         <w:szCs w:val="16"/>
       </w:rPr>
       <w:tab/>
-      <w:t xml:space="preserve">Manuale Amministratore · Rev. 2.1 · 19/10/2026</w:t>
+      <w:t xml:space="preserve">Manuale Amministratore · Rev. 2.2 · 19/10/2026</w:t>
     </w:r>
   </w:p>
 </w:hdr>
@@ -37023,7 +38389,7 @@
         <w:szCs w:val="16"/>
       </w:rPr>
       <w:tab/>
-      <w:t xml:space="preserve">Manuale Amministratore · Rev. 2.1 · 19/10/2026</w:t>
+      <w:t xml:space="preserve">Manuale Amministratore · Rev. 2.2 · 19/10/2026</w:t>
     </w:r>
   </w:p>
 </w:hdr>
@@ -37364,6 +38730,12 @@
     </w:lvlOverride>
   </w:num>
   <w:num w:numId="35">
+    <w:abstractNumId w:val="3"/>
+    <w:lvlOverride w:ilvl="0">
+      <w:startOverride w:val="1"/>
+    </w:lvlOverride>
+  </w:num>
+  <w:num w:numId="36">
     <w:abstractNumId w:val="3"/>
     <w:lvlOverride w:ilvl="0">
       <w:startOverride w:val="1"/>

</xml_diff>

<commit_message>
Simulatore conforme al modello CWP: scenario di riferimento Standard 4.8.1, avvisi di addizionalità e qualità, situazione attuale; documenti aggiornati
Co-Authored-By: Claude Opus 5.5 <noreply@anthropic.com>
Claude-Session: https://claude.ai/code/session_01E8XCbEeVHWVP3hntUZ6kZ1
</commit_message>
<xml_diff>
--- a/public/documentazione/Manuale_Amministratore_Portale_CWP.docx
+++ b/public/documentazione/Manuale_Amministratore_Portale_CWP.docx
@@ -302,7 +302,7 @@
                 <w:sz w:val="20"/>
                 <w:szCs w:val="20"/>
               </w:rPr>
-              <w:t xml:space="preserve">Rev. 2.2</w:t>
+              <w:t xml:space="preserve">Rev. 2.3</w:t>
             </w:r>
           </w:p>
         </w:tc>
@@ -719,7 +719,7 @@
                 <w:sz w:val="18"/>
                 <w:szCs w:val="18"/>
               </w:rPr>
-              <w:t xml:space="preserve">2.2</w:t>
+              <w:t xml:space="preserve">2.3</w:t>
             </w:r>
           </w:p>
         </w:tc>
@@ -783,7 +783,7 @@
                 <w:sz w:val="18"/>
                 <w:szCs w:val="18"/>
               </w:rPr>
-              <w:t xml:space="preserve">Nuovo capitolo «Simulatore di scenari»: creazione, anno base, obiettivi annui, risultati, modello di stima.</w:t>
+              <w:t xml:space="preserve">Simulatore conforme al modello CWP: scenario di riferimento dello Standard 4.8.1, situazione attuale, conformità.</w:t>
             </w:r>
           </w:p>
         </w:tc>
@@ -853,7 +853,7 @@
                 <w:sz w:val="18"/>
                 <w:szCs w:val="18"/>
               </w:rPr>
-              <w:t xml:space="preserve">2.1</w:t>
+              <w:t xml:space="preserve">2.2</w:t>
             </w:r>
           </w:p>
         </w:tc>
@@ -919,7 +919,7 @@
                 <w:sz w:val="18"/>
                 <w:szCs w:val="18"/>
               </w:rPr>
-              <w:t xml:space="preserve">Funzioni in arrivo: simulatore di scenari (7, 10 o 21 anni, obiettivi annui, % di differenziata e crediti stimati) e assistente virtuale (Claude).</w:t>
+              <w:t xml:space="preserve">Nuovo capitolo «Simulatore di scenari»: creazione, anno base, obiettivi annui, risultati, modello di stima.</w:t>
             </w:r>
           </w:p>
         </w:tc>
@@ -989,7 +989,7 @@
                 <w:sz w:val="18"/>
                 <w:szCs w:val="18"/>
               </w:rPr>
-              <w:t xml:space="preserve">2.0</w:t>
+              <w:t xml:space="preserve">2.1</w:t>
             </w:r>
           </w:p>
         </w:tc>
@@ -1053,7 +1053,7 @@
                 <w:sz w:val="18"/>
                 <w:szCs w:val="18"/>
               </w:rPr>
-              <w:t xml:space="preserve">Copie di sicurezza e ripristino: rimando alle Istruzioni di ripristino e punti essenziali (capitolo Manutenzione ed emergenze).</w:t>
+              <w:t xml:space="preserve">Funzioni in arrivo: simulatore di scenari (7, 10 o 21 anni, obiettivi annui, % di differenziata e crediti stimati) e assistente virtuale (Claude).</w:t>
             </w:r>
           </w:p>
         </w:tc>
@@ -1123,7 +1123,7 @@
                 <w:sz w:val="18"/>
                 <w:szCs w:val="18"/>
               </w:rPr>
-              <w:t xml:space="preserve">1.9</w:t>
+              <w:t xml:space="preserve">2.0</w:t>
             </w:r>
           </w:p>
         </w:tc>
@@ -1189,7 +1189,7 @@
                 <w:sz w:val="18"/>
                 <w:szCs w:val="18"/>
               </w:rPr>
-              <w:t xml:space="preserve">Fondazione Operate soggetto promotore del programma (esclusiva conferita da Wastelab).</w:t>
+              <w:t xml:space="preserve">Copie di sicurezza e ripristino: rimando alle Istruzioni di ripristino e punti essenziali (capitolo Manutenzione ed emergenze).</w:t>
             </w:r>
           </w:p>
         </w:tc>
@@ -1259,7 +1259,7 @@
                 <w:sz w:val="18"/>
                 <w:szCs w:val="18"/>
               </w:rPr>
-              <w:t xml:space="preserve">1.8</w:t>
+              <w:t xml:space="preserve">1.9</w:t>
             </w:r>
           </w:p>
         </w:tc>
@@ -1323,7 +1323,7 @@
                 <w:sz w:val="18"/>
                 <w:szCs w:val="18"/>
               </w:rPr>
-              <w:t xml:space="preserve">PEC del Programma e documenti ufficiali già pubblicati sulla pagina pubblica.</w:t>
+              <w:t xml:space="preserve">Fondazione Operate soggetto promotore del programma (esclusiva conferita da Wastelab).</w:t>
             </w:r>
           </w:p>
         </w:tc>
@@ -1393,7 +1393,7 @@
                 <w:sz w:val="18"/>
                 <w:szCs w:val="18"/>
               </w:rPr>
-              <w:t xml:space="preserve">1.7</w:t>
+              <w:t xml:space="preserve">1.8</w:t>
             </w:r>
           </w:p>
         </w:tc>
@@ -1426,7 +1426,7 @@
                 <w:sz w:val="18"/>
                 <w:szCs w:val="18"/>
               </w:rPr>
-              <w:t xml:space="preserve">18/10/2026</w:t>
+              <w:t xml:space="preserve">19/10/2026</w:t>
             </w:r>
           </w:p>
         </w:tc>
@@ -1459,7 +1459,7 @@
                 <w:sz w:val="18"/>
                 <w:szCs w:val="18"/>
               </w:rPr>
-              <w:t xml:space="preserve">Allineamento ai documenti ufficiali del Programma (script 22-24): Rapporto a 7 fasi, feedback pubblico, stati del Programma, dati del progetto e territorio ISTAT, ritiro e rientro, account unico e delegati, registri, tariffe e sospensione, accuratezza e accertamenti, informazioni del Programma e metodologie, modelli pubblici; nuovi capitoli Crediti emessi, Reclami, Pagina pubblica; qualità dei dati nel calcolo.</w:t>
+              <w:t xml:space="preserve">PEC del Programma e documenti ufficiali già pubblicati sulla pagina pubblica.</w:t>
             </w:r>
           </w:p>
         </w:tc>
@@ -1529,7 +1529,7 @@
                 <w:sz w:val="18"/>
                 <w:szCs w:val="18"/>
               </w:rPr>
-              <w:t xml:space="preserve">1.6</w:t>
+              <w:t xml:space="preserve">1.7</w:t>
             </w:r>
           </w:p>
         </w:tc>
@@ -1593,7 +1593,7 @@
                 <w:sz w:val="18"/>
                 <w:szCs w:val="18"/>
               </w:rPr>
-              <w:t xml:space="preserve">Calcolo crediti: descrizione corretta del buffer (somma delle voci delle Tabelle 15 e 16, più il 20% con le sole utenze virtuose, al massimo 80%).</w:t>
+              <w:t xml:space="preserve">Allineamento ai documenti ufficiali del Programma (script 22-24): Rapporto a 7 fasi, feedback pubblico, stati del Programma, dati del progetto e territorio ISTAT, ritiro e rientro, account unico e delegati, registri, tariffe e sospensione, accuratezza e accertamenti, informazioni del Programma e metodologie, modelli pubblici; nuovi capitoli Crediti emessi, Reclami, Pagina pubblica; qualità dei dati nel calcolo.</w:t>
             </w:r>
           </w:p>
         </w:tc>
@@ -1663,7 +1663,7 @@
                 <w:sz w:val="18"/>
                 <w:szCs w:val="18"/>
               </w:rPr>
-              <w:t xml:space="preserve">1.5</w:t>
+              <w:t xml:space="preserve">1.6</w:t>
             </w:r>
           </w:p>
         </w:tc>
@@ -1729,7 +1729,7 @@
                 <w:sz w:val="18"/>
                 <w:szCs w:val="18"/>
               </w:rPr>
-              <w:t xml:space="preserve">Nuova pagina Anagrafiche (Organizzazioni ed Enti, anche per gli Operatori); Rapporti con 4 fasi e durate proprie; documenti richiesti per fase; consultazione con documento bloccato, osservazioni numerate e motivazione; conservazione per 10 anni; fascicolo con riepilogo PDF e nuove cartelle.</w:t>
+              <w:t xml:space="preserve">Calcolo crediti: descrizione corretta del buffer (somma delle voci delle Tabelle 15 e 16, più il 20% con le sole utenze virtuose, al massimo 80%).</w:t>
             </w:r>
           </w:p>
         </w:tc>
@@ -1799,7 +1799,7 @@
                 <w:sz w:val="18"/>
                 <w:szCs w:val="18"/>
               </w:rPr>
-              <w:t xml:space="preserve">1.4</w:t>
+              <w:t xml:space="preserve">1.5</w:t>
             </w:r>
           </w:p>
         </w:tc>
@@ -1863,7 +1863,7 @@
                 <w:sz w:val="18"/>
                 <w:szCs w:val="18"/>
               </w:rPr>
-              <w:t xml:space="preserve">Calcolo crediti: il risultato si azzera quando cambiano dati o Banca Dati Utenze, conferma solo dopo un nuovo «Calcola». Gestione utenti: password temporanea di almeno 10 caratteri con lettere e numeri, creazione annullata se non va a buon fine, nessun accesso ai dati prima del cambio password.</w:t>
+              <w:t xml:space="preserve">Nuova pagina Anagrafiche (Organizzazioni ed Enti, anche per gli Operatori); Rapporti con 4 fasi e durate proprie; documenti richiesti per fase; consultazione con documento bloccato, osservazioni numerate e motivazione; conservazione per 10 anni; fascicolo con riepilogo PDF e nuove cartelle.</w:t>
             </w:r>
           </w:p>
         </w:tc>
@@ -1933,7 +1933,7 @@
                 <w:sz w:val="18"/>
                 <w:szCs w:val="18"/>
               </w:rPr>
-              <w:t xml:space="preserve">1.3</w:t>
+              <w:t xml:space="preserve">1.4</w:t>
             </w:r>
           </w:p>
         </w:tc>
@@ -1999,7 +1999,7 @@
                 <w:sz w:val="18"/>
                 <w:szCs w:val="18"/>
               </w:rPr>
-              <w:t xml:space="preserve">Rapporto di calcolo in PDF, archiviazione nella pratica, numero di registro, registro dei crediti.</w:t>
+              <w:t xml:space="preserve">Calcolo crediti: il risultato si azzera quando cambiano dati o Banca Dati Utenze, conferma solo dopo un nuovo «Calcola». Gestione utenti: password temporanea di almeno 10 caratteri con lettere e numeri, creazione annullata se non va a buon fine, nessun accesso ai dati prima del cambio password.</w:t>
             </w:r>
           </w:p>
         </w:tc>
@@ -2069,7 +2069,7 @@
                 <w:sz w:val="18"/>
                 <w:szCs w:val="18"/>
               </w:rPr>
-              <w:t xml:space="preserve">1.2</w:t>
+              <w:t xml:space="preserve">1.3</w:t>
             </w:r>
           </w:p>
         </w:tc>
@@ -2133,7 +2133,7 @@
                 <w:sz w:val="18"/>
                 <w:szCs w:val="18"/>
               </w:rPr>
-              <w:t xml:space="preserve">Calcolo crediti: importare il tracciato nel calcolo (dai documenti della pratica o dal computer), singole letture, blocco dei dati personali, controlli di coerenza.</w:t>
+              <w:t xml:space="preserve">Rapporto di calcolo in PDF, archiviazione nella pratica, numero di registro, registro dei crediti.</w:t>
             </w:r>
           </w:p>
         </w:tc>
@@ -2203,7 +2203,7 @@
                 <w:sz w:val="18"/>
                 <w:szCs w:val="18"/>
               </w:rPr>
-              <w:t xml:space="preserve">1.1</w:t>
+              <w:t xml:space="preserve">1.2</w:t>
             </w:r>
           </w:p>
         </w:tc>
@@ -2269,7 +2269,7 @@
                 <w:sz w:val="18"/>
                 <w:szCs w:val="18"/>
               </w:rPr>
-              <w:t xml:space="preserve">Note di fase, Ente di Validazione della pratica, consultazione sulla pagina pubblica con conferma dell'email, moderazione con autori e allegati, errata corrige; nuovo capitolo Messaggi con il Comune; pagamenti visibili al Comune; Impostazioni: Enti di Validazione e Modelli di documento; notifiche aggiornate.</w:t>
+              <w:t xml:space="preserve">Calcolo crediti: importare il tracciato nel calcolo (dai documenti della pratica o dal computer), singole letture, blocco dei dati personali, controlli di coerenza.</w:t>
             </w:r>
           </w:p>
         </w:tc>
@@ -2339,6 +2339,140 @@
                 <w:sz w:val="18"/>
                 <w:szCs w:val="18"/>
               </w:rPr>
+              <w:t xml:space="preserve">1.1</w:t>
+            </w:r>
+          </w:p>
+        </w:tc>
+        <w:tc>
+          <w:tcPr>
+            <w:tcW w:type="dxa" w:w="1300"/>
+            <w:tcBorders>
+              <w:top w:val="single" w:color="D9D4C5" w:sz="4"/>
+              <w:left w:val="single" w:color="D9D4C5" w:sz="4"/>
+              <w:bottom w:val="single" w:color="D9D4C5" w:sz="4"/>
+              <w:right w:val="single" w:color="D9D4C5" w:sz="4"/>
+            </w:tcBorders>
+            <w:tcMar>
+              <w:top w:type="dxa" w:w="70"/>
+              <w:left w:type="dxa" w:w="110"/>
+              <w:bottom w:type="dxa" w:w="70"/>
+              <w:right w:type="dxa" w:w="110"/>
+            </w:tcMar>
+            <w:vAlign w:val="center"/>
+          </w:tcPr>
+          <w:p>
+            <w:pPr>
+              <w:spacing w:after="0" w:before="0"/>
+            </w:pPr>
+            <w:r>
+              <w:rPr>
+                <w:rFonts w:ascii="Arial" w:cs="Arial" w:eastAsia="Arial" w:hAnsi="Arial"/>
+                <w:color w:val="1B2118"/>
+                <w:sz w:val="18"/>
+                <w:szCs w:val="18"/>
+              </w:rPr>
+              <w:t xml:space="preserve">18/10/2026</w:t>
+            </w:r>
+          </w:p>
+        </w:tc>
+        <w:tc>
+          <w:tcPr>
+            <w:tcW w:type="dxa" w:w="5538"/>
+            <w:tcBorders>
+              <w:top w:val="single" w:color="D9D4C5" w:sz="4"/>
+              <w:left w:val="single" w:color="D9D4C5" w:sz="4"/>
+              <w:bottom w:val="single" w:color="D9D4C5" w:sz="4"/>
+              <w:right w:val="single" w:color="D9D4C5" w:sz="4"/>
+            </w:tcBorders>
+            <w:tcMar>
+              <w:top w:type="dxa" w:w="70"/>
+              <w:left w:type="dxa" w:w="110"/>
+              <w:bottom w:type="dxa" w:w="70"/>
+              <w:right w:type="dxa" w:w="110"/>
+            </w:tcMar>
+            <w:vAlign w:val="center"/>
+          </w:tcPr>
+          <w:p>
+            <w:pPr>
+              <w:spacing w:after="0" w:before="0"/>
+            </w:pPr>
+            <w:r>
+              <w:rPr>
+                <w:rFonts w:ascii="Arial" w:cs="Arial" w:eastAsia="Arial" w:hAnsi="Arial"/>
+                <w:color w:val="1B2118"/>
+                <w:sz w:val="18"/>
+                <w:szCs w:val="18"/>
+              </w:rPr>
+              <w:t xml:space="preserve">Note di fase, Ente di Validazione della pratica, consultazione sulla pagina pubblica con conferma dell'email, moderazione con autori e allegati, errata corrige; nuovo capitolo Messaggi con il Comune; pagamenti visibili al Comune; Impostazioni: Enti di Validazione e Modelli di documento; notifiche aggiornate.</w:t>
+            </w:r>
+          </w:p>
+        </w:tc>
+        <w:tc>
+          <w:tcPr>
+            <w:tcW w:type="dxa" w:w="2000"/>
+            <w:tcBorders>
+              <w:top w:val="single" w:color="D9D4C5" w:sz="4"/>
+              <w:left w:val="single" w:color="D9D4C5" w:sz="4"/>
+              <w:bottom w:val="single" w:color="D9D4C5" w:sz="4"/>
+              <w:right w:val="single" w:color="D9D4C5" w:sz="4"/>
+            </w:tcBorders>
+            <w:tcMar>
+              <w:top w:type="dxa" w:w="70"/>
+              <w:left w:type="dxa" w:w="110"/>
+              <w:bottom w:type="dxa" w:w="70"/>
+              <w:right w:type="dxa" w:w="110"/>
+            </w:tcMar>
+            <w:vAlign w:val="center"/>
+          </w:tcPr>
+          <w:p>
+            <w:pPr>
+              <w:spacing w:after="0" w:before="0"/>
+            </w:pPr>
+            <w:r>
+              <w:rPr>
+                <w:rFonts w:ascii="Arial" w:cs="Arial" w:eastAsia="Arial" w:hAnsi="Arial"/>
+                <w:color w:val="1B2118"/>
+                <w:sz w:val="18"/>
+                <w:szCs w:val="18"/>
+              </w:rPr>
+              <w:t xml:space="preserve">Fondazione Operate</w:t>
+            </w:r>
+          </w:p>
+        </w:tc>
+      </w:tr>
+      <w:tr>
+        <w:trPr>
+          <w:cantSplit/>
+        </w:trPr>
+        <w:tc>
+          <w:tcPr>
+            <w:tcW w:type="dxa" w:w="800"/>
+            <w:tcBorders>
+              <w:top w:val="single" w:color="D9D4C5" w:sz="4"/>
+              <w:left w:val="single" w:color="D9D4C5" w:sz="4"/>
+              <w:bottom w:val="single" w:color="D9D4C5" w:sz="4"/>
+              <w:right w:val="single" w:color="D9D4C5" w:sz="4"/>
+            </w:tcBorders>
+            <w:shd w:fill="F6F4EE" w:color="auto" w:val="clear"/>
+            <w:tcMar>
+              <w:top w:type="dxa" w:w="70"/>
+              <w:left w:type="dxa" w:w="110"/>
+              <w:bottom w:type="dxa" w:w="70"/>
+              <w:right w:type="dxa" w:w="110"/>
+            </w:tcMar>
+            <w:vAlign w:val="center"/>
+          </w:tcPr>
+          <w:p>
+            <w:pPr>
+              <w:spacing w:after="0" w:before="0"/>
+            </w:pPr>
+            <w:r>
+              <w:rPr>
+                <w:rFonts w:ascii="Arial" w:cs="Arial" w:eastAsia="Arial" w:hAnsi="Arial"/>
+                <w:color w:val="1B2118"/>
+                <w:sz w:val="18"/>
+                <w:szCs w:val="18"/>
+              </w:rPr>
               <w:t xml:space="preserve">1.0</w:t>
             </w:r>
           </w:p>
@@ -2352,6 +2486,7 @@
               <w:bottom w:val="single" w:color="D9D4C5" w:sz="4"/>
               <w:right w:val="single" w:color="D9D4C5" w:sz="4"/>
             </w:tcBorders>
+            <w:shd w:fill="F6F4EE" w:color="auto" w:val="clear"/>
             <w:tcMar>
               <w:top w:type="dxa" w:w="70"/>
               <w:left w:type="dxa" w:w="110"/>
@@ -2384,6 +2519,7 @@
               <w:bottom w:val="single" w:color="D9D4C5" w:sz="4"/>
               <w:right w:val="single" w:color="D9D4C5" w:sz="4"/>
             </w:tcBorders>
+            <w:shd w:fill="F6F4EE" w:color="auto" w:val="clear"/>
             <w:tcMar>
               <w:top w:type="dxa" w:w="70"/>
               <w:left w:type="dxa" w:w="110"/>
@@ -2416,6 +2552,7 @@
               <w:bottom w:val="single" w:color="D9D4C5" w:sz="4"/>
               <w:right w:val="single" w:color="D9D4C5" w:sz="4"/>
             </w:tcBorders>
+            <w:shd w:fill="F6F4EE" w:color="auto" w:val="clear"/>
             <w:tcMar>
               <w:top w:type="dxa" w:w="70"/>
               <w:left w:type="dxa" w:w="110"/>
@@ -2457,7 +2594,7 @@
           <w:sz w:val="20"/>
           <w:szCs w:val="20"/>
         </w:rPr>
-        <w:t xml:space="preserve">Questo documento descrive il portale alla revisione 2.2 del 19/10/2026. A ogni modifica del portale il manuale viene aggiornato e la revisione incrementata; la versione corrente si scarica dall'area Documentazione del portale (solo Amministratori).</w:t>
+        <w:t xml:space="preserve">Questo documento descrive il portale alla revisione 2.3 del 19/10/2026. A ogni modifica del portale il manuale viene aggiornato e la revisione incrementata; la versione corrente si scarica dall'area Documentazione del portale (solo Amministratori).</w:t>
       </w:r>
     </w:p>
     <w:p>
@@ -2509,7 +2646,7 @@
             <w:szCs w:val="22"/>
           </w:rPr>
           <w:tab/>
-          <w:t xml:space="preserve">4</w:t>
+          <w:t xml:space="preserve">5</w:t>
         </w:r>
       </w:hyperlink>
     </w:p>
@@ -2538,7 +2675,7 @@
             <w:szCs w:val="22"/>
           </w:rPr>
           <w:tab/>
-          <w:t xml:space="preserve">5</w:t>
+          <w:t xml:space="preserve">6</w:t>
         </w:r>
       </w:hyperlink>
     </w:p>
@@ -2567,7 +2704,7 @@
             <w:szCs w:val="22"/>
           </w:rPr>
           <w:tab/>
-          <w:t xml:space="preserve">6</w:t>
+          <w:t xml:space="preserve">7</w:t>
         </w:r>
       </w:hyperlink>
     </w:p>
@@ -2596,7 +2733,7 @@
             <w:szCs w:val="22"/>
           </w:rPr>
           <w:tab/>
-          <w:t xml:space="preserve">7</w:t>
+          <w:t xml:space="preserve">8</w:t>
         </w:r>
       </w:hyperlink>
     </w:p>
@@ -2625,7 +2762,7 @@
             <w:szCs w:val="22"/>
           </w:rPr>
           <w:tab/>
-          <w:t xml:space="preserve">9</w:t>
+          <w:t xml:space="preserve">10</w:t>
         </w:r>
       </w:hyperlink>
     </w:p>
@@ -2654,7 +2791,7 @@
             <w:szCs w:val="22"/>
           </w:rPr>
           <w:tab/>
-          <w:t xml:space="preserve">11</w:t>
+          <w:t xml:space="preserve">12</w:t>
         </w:r>
       </w:hyperlink>
     </w:p>
@@ -2683,7 +2820,7 @@
             <w:szCs w:val="22"/>
           </w:rPr>
           <w:tab/>
-          <w:t xml:space="preserve">12</w:t>
+          <w:t xml:space="preserve">13</w:t>
         </w:r>
       </w:hyperlink>
     </w:p>
@@ -2712,7 +2849,7 @@
             <w:szCs w:val="22"/>
           </w:rPr>
           <w:tab/>
-          <w:t xml:space="preserve">13</w:t>
+          <w:t xml:space="preserve">14</w:t>
         </w:r>
       </w:hyperlink>
     </w:p>
@@ -2741,7 +2878,7 @@
             <w:szCs w:val="22"/>
           </w:rPr>
           <w:tab/>
-          <w:t xml:space="preserve">15</w:t>
+          <w:t xml:space="preserve">16</w:t>
         </w:r>
       </w:hyperlink>
     </w:p>
@@ -2770,7 +2907,7 @@
             <w:szCs w:val="22"/>
           </w:rPr>
           <w:tab/>
-          <w:t xml:space="preserve">16</w:t>
+          <w:t xml:space="preserve">17</w:t>
         </w:r>
       </w:hyperlink>
     </w:p>
@@ -2799,7 +2936,7 @@
             <w:szCs w:val="22"/>
           </w:rPr>
           <w:tab/>
-          <w:t xml:space="preserve">18</w:t>
+          <w:t xml:space="preserve">19</w:t>
         </w:r>
       </w:hyperlink>
     </w:p>
@@ -2828,7 +2965,7 @@
             <w:szCs w:val="22"/>
           </w:rPr>
           <w:tab/>
-          <w:t xml:space="preserve">19</w:t>
+          <w:t xml:space="preserve">20</w:t>
         </w:r>
       </w:hyperlink>
     </w:p>
@@ -2857,7 +2994,7 @@
             <w:szCs w:val="22"/>
           </w:rPr>
           <w:tab/>
-          <w:t xml:space="preserve">20</w:t>
+          <w:t xml:space="preserve">21</w:t>
         </w:r>
       </w:hyperlink>
     </w:p>
@@ -2886,7 +3023,7 @@
             <w:szCs w:val="22"/>
           </w:rPr>
           <w:tab/>
-          <w:t xml:space="preserve">22</w:t>
+          <w:t xml:space="preserve">23</w:t>
         </w:r>
       </w:hyperlink>
     </w:p>
@@ -2944,7 +3081,7 @@
             <w:szCs w:val="22"/>
           </w:rPr>
           <w:tab/>
-          <w:t xml:space="preserve">25</w:t>
+          <w:t xml:space="preserve">26</w:t>
         </w:r>
       </w:hyperlink>
     </w:p>
@@ -2973,7 +3110,7 @@
             <w:szCs w:val="22"/>
           </w:rPr>
           <w:tab/>
-          <w:t xml:space="preserve">28</w:t>
+          <w:t xml:space="preserve">29</w:t>
         </w:r>
       </w:hyperlink>
     </w:p>
@@ -3002,7 +3139,7 @@
             <w:szCs w:val="22"/>
           </w:rPr>
           <w:tab/>
-          <w:t xml:space="preserve">34</w:t>
+          <w:t xml:space="preserve">35</w:t>
         </w:r>
       </w:hyperlink>
     </w:p>
@@ -3031,7 +3168,7 @@
             <w:szCs w:val="22"/>
           </w:rPr>
           <w:tab/>
-          <w:t xml:space="preserve">36</w:t>
+          <w:t xml:space="preserve">37</w:t>
         </w:r>
       </w:hyperlink>
     </w:p>
@@ -3060,7 +3197,7 @@
             <w:szCs w:val="22"/>
           </w:rPr>
           <w:tab/>
-          <w:t xml:space="preserve">38</w:t>
+          <w:t xml:space="preserve">39</w:t>
         </w:r>
       </w:hyperlink>
     </w:p>
@@ -3089,7 +3226,7 @@
             <w:szCs w:val="22"/>
           </w:rPr>
           <w:tab/>
-          <w:t xml:space="preserve">39</w:t>
+          <w:t xml:space="preserve">40</w:t>
         </w:r>
       </w:hyperlink>
     </w:p>
@@ -3118,7 +3255,7 @@
             <w:szCs w:val="22"/>
           </w:rPr>
           <w:tab/>
-          <w:t xml:space="preserve">40</w:t>
+          <w:t xml:space="preserve">41</w:t>
         </w:r>
       </w:hyperlink>
     </w:p>
@@ -3147,7 +3284,7 @@
             <w:szCs w:val="22"/>
           </w:rPr>
           <w:tab/>
-          <w:t xml:space="preserve">41</w:t>
+          <w:t xml:space="preserve">42</w:t>
         </w:r>
       </w:hyperlink>
     </w:p>
@@ -3176,7 +3313,7 @@
             <w:szCs w:val="22"/>
           </w:rPr>
           <w:tab/>
-          <w:t xml:space="preserve">42</w:t>
+          <w:t xml:space="preserve">43</w:t>
         </w:r>
       </w:hyperlink>
     </w:p>
@@ -5037,7 +5174,7 @@
         </w:rPr>
         <w:t xml:space="preserve">Si accede da </w:t>
       </w:r>
-      <w:hyperlink w:history="1" r:id="rIdylhhkeyypbeptjypupqwc">
+      <w:hyperlink w:history="1" r:id="rIdrnzn3vmxiyf-ek0c8amxe">
         <w:r>
           <w:rPr>
             <w:rFonts w:ascii="Arial" w:cs="Arial" w:eastAsia="Arial" w:hAnsi="Arial"/>
@@ -31978,16 +32115,16 @@
           <w:sz w:val="21"/>
           <w:szCs w:val="21"/>
         </w:rPr>
-        <w:t xml:space="preserve">2. Dati dell'anno base.</w:t>
-      </w:r>
-      <w:r>
-        <w:rPr>
-          <w:rFonts w:ascii="Arial" w:cs="Arial" w:eastAsia="Arial" w:hAnsi="Arial"/>
-          <w:color w:val="1B2118"/>
-          <w:sz w:val="21"/>
-          <w:szCs w:val="21"/>
-        </w:rPr>
-        <w:t xml:space="preserve"> Anno, popolazione residente e rifiuti per tipologia in tonnellate (secco residuo compreso). Tre modi per compilarli:</w:t>
+        <w:t xml:space="preserve">2. Scenario di riferimento (Standard 4.8.1).</w:t>
+      </w:r>
+      <w:r>
+        <w:rPr>
+          <w:rFonts w:ascii="Arial" w:cs="Arial" w:eastAsia="Arial" w:hAnsi="Arial"/>
+          <w:color w:val="1B2118"/>
+          <w:sz w:val="21"/>
+          <w:szCs w:val="21"/>
+        </w:rPr>
+        <w:t xml:space="preserve"> È la situazione «senza progetto» con cui si confrontano gli obiettivi, come nel Programma. Due modi, scelti con i pulsanti:</w:t>
       </w:r>
     </w:p>
     <w:p>
@@ -32002,11 +32139,22 @@
       <w:r>
         <w:rPr>
           <w:rFonts w:ascii="Arial" w:cs="Arial" w:eastAsia="Arial" w:hAnsi="Arial"/>
-          <w:color w:val="1B2118"/>
-          <w:sz w:val="21"/>
-          <w:szCs w:val="21"/>
-        </w:rPr>
-        <w:t xml:space="preserve">a mano, dai dati del Catasto ISPRA o del gestore;</w:t>
+          <w:b/>
+          <w:bCs/>
+          <w:color w:val="1B2118"/>
+          <w:sz w:val="21"/>
+          <w:szCs w:val="21"/>
+        </w:rPr>
+        <w:t xml:space="preserve">Anno con il 65% di differenziata</w:t>
+      </w:r>
+      <w:r>
+        <w:rPr>
+          <w:rFonts w:ascii="Arial" w:cs="Arial" w:eastAsia="Arial" w:hAnsi="Arial"/>
+          <w:color w:val="1B2118"/>
+          <w:sz w:val="21"/>
+          <w:szCs w:val="21"/>
+        </w:rPr>
+        <w:t xml:space="preserve">: l'anno in cui il Comune ha raggiunto l'obiettivo di legge (tra 64% e 66%, dati Catasto ISPRA), con popolazione e rifiuti per tipologia in tonnellate; si compilano a mano o, per gli Amministratori, si importano da un calcolo dei crediti. Se la differenziata dell'anno indicato è fuori dall'intervallo il portale lo segnala (Standard 4.8.1 e addizionalità normativa 4.9.1); se è indicato il cluster, segnala anche le tipologie che si scostano più del 30% dalla Tabella 3 (Gestione della qualità dei dati, 3.1.2);</w:t>
       </w:r>
     </w:p>
     <w:p>
@@ -32027,46 +32175,36 @@
           <w:sz w:val="21"/>
           <w:szCs w:val="21"/>
         </w:rPr>
-        <w:t xml:space="preserve">Usa i valori medi del cluster</w:t>
-      </w:r>
-      <w:r>
-        <w:rPr>
-          <w:rFonts w:ascii="Arial" w:cs="Arial" w:eastAsia="Arial" w:hAnsi="Arial"/>
-          <w:color w:val="1B2118"/>
-          <w:sz w:val="21"/>
-          <w:szCs w:val="21"/>
-        </w:rPr>
-        <w:t xml:space="preserve">: scelto il cluster SOSE del Comune, il portale riempie la tabella con i valori medi pro capite della Tabella 3 dello Standard × popolazione;</w:t>
-      </w:r>
-    </w:p>
-    <w:p>
-      <w:pPr>
-        <w:pStyle w:val="ListParagraph"/>
-        <w:numPr>
-          <w:ilvl w:val="0"/>
-          <w:numId w:val="2"/>
-        </w:numPr>
-        <w:spacing w:after="70" w:line="290"/>
-      </w:pPr>
-      <w:r>
-        <w:rPr>
-          <w:rFonts w:ascii="Arial" w:cs="Arial" w:eastAsia="Arial" w:hAnsi="Arial"/>
-          <w:b/>
-          <w:bCs/>
-          <w:color w:val="1B2118"/>
-          <w:sz w:val="21"/>
-          <w:szCs w:val="21"/>
-        </w:rPr>
-        <w:t xml:space="preserve">Importa da un calcolo dei crediti</w:t>
-      </w:r>
-      <w:r>
-        <w:rPr>
-          <w:rFonts w:ascii="Arial" w:cs="Arial" w:eastAsia="Arial" w:hAnsi="Arial"/>
-          <w:color w:val="1B2118"/>
-          <w:sz w:val="21"/>
-          <w:szCs w:val="21"/>
-        </w:rPr>
-        <w:t xml:space="preserve"> (solo Amministratori): riprende i rifiuti del territorio da un calcolo già fatto.</w:t>
+        <w:t xml:space="preserve">Valori medi del cluster (Tabella 3)</w:t>
+      </w:r>
+      <w:r>
+        <w:rPr>
+          <w:rFonts w:ascii="Arial" w:cs="Arial" w:eastAsia="Arial" w:hAnsi="Arial"/>
+          <w:color w:val="1B2118"/>
+          <w:sz w:val="21"/>
+          <w:szCs w:val="21"/>
+        </w:rPr>
+        <w:t xml:space="preserve">: quando il Comune non ha un anno con il 65%, si sceglie il cluster SOSE, si indica la popolazione ISPRA 2022 e si preme </w:t>
+      </w:r>
+      <w:r>
+        <w:rPr>
+          <w:rFonts w:ascii="Arial" w:cs="Arial" w:eastAsia="Arial" w:hAnsi="Arial"/>
+          <w:b/>
+          <w:bCs/>
+          <w:color w:val="1B2118"/>
+          <w:sz w:val="21"/>
+          <w:szCs w:val="21"/>
+        </w:rPr>
+        <w:t xml:space="preserve">Calcola dai valori medi del cluster</w:t>
+      </w:r>
+      <w:r>
+        <w:rPr>
+          <w:rFonts w:ascii="Arial" w:cs="Arial" w:eastAsia="Arial" w:hAnsi="Arial"/>
+          <w:color w:val="1B2118"/>
+          <w:sz w:val="21"/>
+          <w:szCs w:val="21"/>
+        </w:rPr>
+        <w:t xml:space="preserve">.</w:t>
       </w:r>
     </w:p>
     <w:p>
@@ -32100,7 +32238,7 @@
           <w:sz w:val="21"/>
           <w:szCs w:val="21"/>
         </w:rPr>
-        <w:t xml:space="preserve"> e fattore di emissione del secco (formule 16-17).</w:t>
+        <w:t xml:space="preserve">, esito del controllo sul 65% e fattore di emissione del secco (formule 16-17).</w:t>
       </w:r>
     </w:p>
     <w:p>
@@ -32116,6 +32254,31 @@
           <w:sz w:val="21"/>
           <w:szCs w:val="21"/>
         </w:rPr>
+        <w:t xml:space="preserve">Situazione attuale (facoltativa).</w:t>
+      </w:r>
+      <w:r>
+        <w:rPr>
+          <w:rFonts w:ascii="Arial" w:cs="Arial" w:eastAsia="Arial" w:hAnsi="Arial"/>
+          <w:color w:val="1B2118"/>
+          <w:sz w:val="21"/>
+          <w:szCs w:val="21"/>
+        </w:rPr>
+        <w:t xml:space="preserve"> L'ultimo anno con dati disponibili (popolazione, produzione pro capite, secco pro capite): è il punto di partenza degli obiettivi e della traiettoria. I crediti si calcolano sempre rispetto allo scenario di riferimento.</w:t>
+      </w:r>
+    </w:p>
+    <w:p>
+      <w:pPr>
+        <w:spacing w:after="140" w:line="300"/>
+      </w:pPr>
+      <w:r>
+        <w:rPr>
+          <w:rFonts w:ascii="Arial" w:cs="Arial" w:eastAsia="Arial" w:hAnsi="Arial"/>
+          <w:b/>
+          <w:bCs/>
+          <w:color w:val="1B2118"/>
+          <w:sz w:val="21"/>
+          <w:szCs w:val="21"/>
+        </w:rPr>
         <w:t xml:space="preserve">3. Obiettivi anno per anno.</w:t>
       </w:r>
       <w:r>
@@ -32185,7 +32348,7 @@
           <w:sz w:val="21"/>
           <w:szCs w:val="21"/>
         </w:rPr>
-        <w:t xml:space="preserve">: il portale riempie gli anni con un andamento lineare dall'anno base, poi potete correggere i singoli anni. Per ogni anno il portale ricalcola il secco in tonnellate e la </w:t>
+        <w:t xml:space="preserve">: il portale riempie gli anni con un andamento lineare dalla situazione attuale (o dal riferimento), poi potete correggere i singoli anni. Per ogni anno il portale ricalcola il secco in tonnellate e la </w:t>
       </w:r>
       <w:r>
         <w:rPr>
@@ -32584,7 +32747,7 @@
                 <w:sz w:val="18"/>
                 <w:szCs w:val="18"/>
               </w:rPr>
-              <w:t xml:space="preserve">Rifiuti pro capite dell'anno base, per tipologia, × popolazione dell'anno</w:t>
+              <w:t xml:space="preserve">Rifiuti pro capite dell'anno di riferimento (o del cluster), per tipologia, × popolazione dell'anno</w:t>
             </w:r>
           </w:p>
         </w:tc>
@@ -32655,7 +32818,7 @@
                 <w:sz w:val="18"/>
                 <w:szCs w:val="18"/>
               </w:rPr>
-              <w:t xml:space="preserve">Secco obiettivo + differenziata (totale − secco) ripartita con le proporzioni dell'anno base</w:t>
+              <w:t xml:space="preserve">Secco obiettivo + differenziata (totale − secco) ripartita con le proporzioni del riferimento</w:t>
             </w:r>
           </w:p>
         </w:tc>
@@ -32880,6 +33043,31 @@
       <w:pPr>
         <w:spacing w:after="120"/>
       </w:pPr>
+    </w:p>
+    <w:p>
+      <w:pPr>
+        <w:spacing w:after="140" w:line="300"/>
+      </w:pPr>
+      <w:r>
+        <w:rPr>
+          <w:rFonts w:ascii="Arial" w:cs="Arial" w:eastAsia="Arial" w:hAnsi="Arial"/>
+          <w:b/>
+          <w:bCs/>
+          <w:color w:val="1B2118"/>
+          <w:sz w:val="21"/>
+          <w:szCs w:val="21"/>
+        </w:rPr>
+        <w:t xml:space="preserve">Conformità al modello CWP.</w:t>
+      </w:r>
+      <w:r>
+        <w:rPr>
+          <w:rFonts w:ascii="Arial" w:cs="Arial" w:eastAsia="Arial" w:hAnsi="Arial"/>
+          <w:color w:val="1B2118"/>
+          <w:sz w:val="21"/>
+          <w:szCs w:val="21"/>
+        </w:rPr>
+        <w:t xml:space="preserve"> La stima ex ante a livello di Comune è ammessa dalla Metodologia (Capitolo 6.1, valori medi su tutte le utenze; Capitolo 6.2, emissioni di progetto ex ante «complessivamente a livello di Ente»). Il simulatore segue lo Standard per la durata (4.3.8), lo scenario di riferimento (4.8.1) e l'addizionalità (4.9.1), e la Metodologia per fattori di emissione (Tabelle 3-4), fattore del secco (formule 16-17), variazione di impatto e buffer (formule 31-32, Capitolo 7). I beni a riuso valgono zero, come chiede la Metodologia per la stima ex ante (Capitolo 6.1), e non ci sono perdite (leakage, Capitolo 6.3). Non sono considerati il primo anno parziale (formula 1) e la componente trasporto (Capitolo 9). Il calcolo per singola utenza resta quello ex post.</w:t>
+      </w:r>
     </w:p>
     <w:p>
       <w:pPr>
@@ -38324,7 +38512,7 @@
         <w:szCs w:val="16"/>
       </w:rPr>
       <w:tab/>
-      <w:t xml:space="preserve">Manuale Amministratore · Rev. 2.2 · 19/10/2026</w:t>
+      <w:t xml:space="preserve">Manuale Amministratore · Rev. 2.3 · 19/10/2026</w:t>
     </w:r>
   </w:p>
 </w:hdr>
@@ -38389,7 +38577,7 @@
         <w:szCs w:val="16"/>
       </w:rPr>
       <w:tab/>
-      <w:t xml:space="preserve">Manuale Amministratore · Rev. 2.2 · 19/10/2026</w:t>
+      <w:t xml:space="preserve">Manuale Amministratore · Rev. 2.3 · 19/10/2026</w:t>
     </w:r>
   </w:p>
 </w:hdr>

</xml_diff>

<commit_message>
Simulatore: riferimento sempre alla soglia del 65% di differenziata, risultati per differenza dalla soglia, controllo dei valori fuori scala
Co-Authored-By: Claude Opus 5.5 <noreply@anthropic.com>
Claude-Session: https://claude.ai/code/session_01E8XCbEeVHWVP3hntUZ6kZ1
</commit_message>
<xml_diff>
--- a/public/documentazione/Manuale_Amministratore_Portale_CWP.docx
+++ b/public/documentazione/Manuale_Amministratore_Portale_CWP.docx
@@ -302,7 +302,7 @@
                 <w:sz w:val="20"/>
                 <w:szCs w:val="20"/>
               </w:rPr>
-              <w:t xml:space="preserve">Rev. 2.3</w:t>
+              <w:t xml:space="preserve">Rev. 2.4</w:t>
             </w:r>
           </w:p>
         </w:tc>
@@ -719,7 +719,7 @@
                 <w:sz w:val="18"/>
                 <w:szCs w:val="18"/>
               </w:rPr>
-              <w:t xml:space="preserve">2.3</w:t>
+              <w:t xml:space="preserve">2.4</w:t>
             </w:r>
           </w:p>
         </w:tc>
@@ -783,7 +783,7 @@
                 <w:sz w:val="18"/>
                 <w:szCs w:val="18"/>
               </w:rPr>
-              <w:t xml:space="preserve">Simulatore conforme al modello CWP: scenario di riferimento dello Standard 4.8.1, situazione attuale, conformità.</w:t>
+              <w:t xml:space="preserve">Simulatore: riferimento sempre alla soglia del 65% di differenziata e controllo dei valori fuori scala.</w:t>
             </w:r>
           </w:p>
         </w:tc>
@@ -853,7 +853,7 @@
                 <w:sz w:val="18"/>
                 <w:szCs w:val="18"/>
               </w:rPr>
-              <w:t xml:space="preserve">2.2</w:t>
+              <w:t xml:space="preserve">2.3</w:t>
             </w:r>
           </w:p>
         </w:tc>
@@ -919,7 +919,7 @@
                 <w:sz w:val="18"/>
                 <w:szCs w:val="18"/>
               </w:rPr>
-              <w:t xml:space="preserve">Nuovo capitolo «Simulatore di scenari»: creazione, anno base, obiettivi annui, risultati, modello di stima.</w:t>
+              <w:t xml:space="preserve">Simulatore conforme al modello CWP: scenario di riferimento dello Standard 4.8.1, situazione attuale, conformità.</w:t>
             </w:r>
           </w:p>
         </w:tc>
@@ -989,7 +989,7 @@
                 <w:sz w:val="18"/>
                 <w:szCs w:val="18"/>
               </w:rPr>
-              <w:t xml:space="preserve">2.1</w:t>
+              <w:t xml:space="preserve">2.2</w:t>
             </w:r>
           </w:p>
         </w:tc>
@@ -1053,7 +1053,7 @@
                 <w:sz w:val="18"/>
                 <w:szCs w:val="18"/>
               </w:rPr>
-              <w:t xml:space="preserve">Funzioni in arrivo: simulatore di scenari (7, 10 o 21 anni, obiettivi annui, % di differenziata e crediti stimati) e assistente virtuale (Claude).</w:t>
+              <w:t xml:space="preserve">Nuovo capitolo «Simulatore di scenari»: creazione, anno base, obiettivi annui, risultati, modello di stima.</w:t>
             </w:r>
           </w:p>
         </w:tc>
@@ -1123,7 +1123,7 @@
                 <w:sz w:val="18"/>
                 <w:szCs w:val="18"/>
               </w:rPr>
-              <w:t xml:space="preserve">2.0</w:t>
+              <w:t xml:space="preserve">2.1</w:t>
             </w:r>
           </w:p>
         </w:tc>
@@ -1189,7 +1189,7 @@
                 <w:sz w:val="18"/>
                 <w:szCs w:val="18"/>
               </w:rPr>
-              <w:t xml:space="preserve">Copie di sicurezza e ripristino: rimando alle Istruzioni di ripristino e punti essenziali (capitolo Manutenzione ed emergenze).</w:t>
+              <w:t xml:space="preserve">Funzioni in arrivo: simulatore di scenari (7, 10 o 21 anni, obiettivi annui, % di differenziata e crediti stimati) e assistente virtuale (Claude).</w:t>
             </w:r>
           </w:p>
         </w:tc>
@@ -1259,7 +1259,7 @@
                 <w:sz w:val="18"/>
                 <w:szCs w:val="18"/>
               </w:rPr>
-              <w:t xml:space="preserve">1.9</w:t>
+              <w:t xml:space="preserve">2.0</w:t>
             </w:r>
           </w:p>
         </w:tc>
@@ -1323,7 +1323,7 @@
                 <w:sz w:val="18"/>
                 <w:szCs w:val="18"/>
               </w:rPr>
-              <w:t xml:space="preserve">Fondazione Operate soggetto promotore del programma (esclusiva conferita da Wastelab).</w:t>
+              <w:t xml:space="preserve">Copie di sicurezza e ripristino: rimando alle Istruzioni di ripristino e punti essenziali (capitolo Manutenzione ed emergenze).</w:t>
             </w:r>
           </w:p>
         </w:tc>
@@ -1393,7 +1393,7 @@
                 <w:sz w:val="18"/>
                 <w:szCs w:val="18"/>
               </w:rPr>
-              <w:t xml:space="preserve">1.8</w:t>
+              <w:t xml:space="preserve">1.9</w:t>
             </w:r>
           </w:p>
         </w:tc>
@@ -1459,7 +1459,7 @@
                 <w:sz w:val="18"/>
                 <w:szCs w:val="18"/>
               </w:rPr>
-              <w:t xml:space="preserve">PEC del Programma e documenti ufficiali già pubblicati sulla pagina pubblica.</w:t>
+              <w:t xml:space="preserve">Fondazione Operate soggetto promotore del programma (esclusiva conferita da Wastelab).</w:t>
             </w:r>
           </w:p>
         </w:tc>
@@ -1529,7 +1529,7 @@
                 <w:sz w:val="18"/>
                 <w:szCs w:val="18"/>
               </w:rPr>
-              <w:t xml:space="preserve">1.7</w:t>
+              <w:t xml:space="preserve">1.8</w:t>
             </w:r>
           </w:p>
         </w:tc>
@@ -1561,7 +1561,7 @@
                 <w:sz w:val="18"/>
                 <w:szCs w:val="18"/>
               </w:rPr>
-              <w:t xml:space="preserve">18/10/2026</w:t>
+              <w:t xml:space="preserve">19/10/2026</w:t>
             </w:r>
           </w:p>
         </w:tc>
@@ -1593,7 +1593,7 @@
                 <w:sz w:val="18"/>
                 <w:szCs w:val="18"/>
               </w:rPr>
-              <w:t xml:space="preserve">Allineamento ai documenti ufficiali del Programma (script 22-24): Rapporto a 7 fasi, feedback pubblico, stati del Programma, dati del progetto e territorio ISTAT, ritiro e rientro, account unico e delegati, registri, tariffe e sospensione, accuratezza e accertamenti, informazioni del Programma e metodologie, modelli pubblici; nuovi capitoli Crediti emessi, Reclami, Pagina pubblica; qualità dei dati nel calcolo.</w:t>
+              <w:t xml:space="preserve">PEC del Programma e documenti ufficiali già pubblicati sulla pagina pubblica.</w:t>
             </w:r>
           </w:p>
         </w:tc>
@@ -1663,7 +1663,7 @@
                 <w:sz w:val="18"/>
                 <w:szCs w:val="18"/>
               </w:rPr>
-              <w:t xml:space="preserve">1.6</w:t>
+              <w:t xml:space="preserve">1.7</w:t>
             </w:r>
           </w:p>
         </w:tc>
@@ -1729,7 +1729,7 @@
                 <w:sz w:val="18"/>
                 <w:szCs w:val="18"/>
               </w:rPr>
-              <w:t xml:space="preserve">Calcolo crediti: descrizione corretta del buffer (somma delle voci delle Tabelle 15 e 16, più il 20% con le sole utenze virtuose, al massimo 80%).</w:t>
+              <w:t xml:space="preserve">Allineamento ai documenti ufficiali del Programma (script 22-24): Rapporto a 7 fasi, feedback pubblico, stati del Programma, dati del progetto e territorio ISTAT, ritiro e rientro, account unico e delegati, registri, tariffe e sospensione, accuratezza e accertamenti, informazioni del Programma e metodologie, modelli pubblici; nuovi capitoli Crediti emessi, Reclami, Pagina pubblica; qualità dei dati nel calcolo.</w:t>
             </w:r>
           </w:p>
         </w:tc>
@@ -1799,7 +1799,7 @@
                 <w:sz w:val="18"/>
                 <w:szCs w:val="18"/>
               </w:rPr>
-              <w:t xml:space="preserve">1.5</w:t>
+              <w:t xml:space="preserve">1.6</w:t>
             </w:r>
           </w:p>
         </w:tc>
@@ -1863,7 +1863,7 @@
                 <w:sz w:val="18"/>
                 <w:szCs w:val="18"/>
               </w:rPr>
-              <w:t xml:space="preserve">Nuova pagina Anagrafiche (Organizzazioni ed Enti, anche per gli Operatori); Rapporti con 4 fasi e durate proprie; documenti richiesti per fase; consultazione con documento bloccato, osservazioni numerate e motivazione; conservazione per 10 anni; fascicolo con riepilogo PDF e nuove cartelle.</w:t>
+              <w:t xml:space="preserve">Calcolo crediti: descrizione corretta del buffer (somma delle voci delle Tabelle 15 e 16, più il 20% con le sole utenze virtuose, al massimo 80%).</w:t>
             </w:r>
           </w:p>
         </w:tc>
@@ -1933,7 +1933,7 @@
                 <w:sz w:val="18"/>
                 <w:szCs w:val="18"/>
               </w:rPr>
-              <w:t xml:space="preserve">1.4</w:t>
+              <w:t xml:space="preserve">1.5</w:t>
             </w:r>
           </w:p>
         </w:tc>
@@ -1999,7 +1999,7 @@
                 <w:sz w:val="18"/>
                 <w:szCs w:val="18"/>
               </w:rPr>
-              <w:t xml:space="preserve">Calcolo crediti: il risultato si azzera quando cambiano dati o Banca Dati Utenze, conferma solo dopo un nuovo «Calcola». Gestione utenti: password temporanea di almeno 10 caratteri con lettere e numeri, creazione annullata se non va a buon fine, nessun accesso ai dati prima del cambio password.</w:t>
+              <w:t xml:space="preserve">Nuova pagina Anagrafiche (Organizzazioni ed Enti, anche per gli Operatori); Rapporti con 4 fasi e durate proprie; documenti richiesti per fase; consultazione con documento bloccato, osservazioni numerate e motivazione; conservazione per 10 anni; fascicolo con riepilogo PDF e nuove cartelle.</w:t>
             </w:r>
           </w:p>
         </w:tc>
@@ -2069,7 +2069,7 @@
                 <w:sz w:val="18"/>
                 <w:szCs w:val="18"/>
               </w:rPr>
-              <w:t xml:space="preserve">1.3</w:t>
+              <w:t xml:space="preserve">1.4</w:t>
             </w:r>
           </w:p>
         </w:tc>
@@ -2133,7 +2133,7 @@
                 <w:sz w:val="18"/>
                 <w:szCs w:val="18"/>
               </w:rPr>
-              <w:t xml:space="preserve">Rapporto di calcolo in PDF, archiviazione nella pratica, numero di registro, registro dei crediti.</w:t>
+              <w:t xml:space="preserve">Calcolo crediti: il risultato si azzera quando cambiano dati o Banca Dati Utenze, conferma solo dopo un nuovo «Calcola». Gestione utenti: password temporanea di almeno 10 caratteri con lettere e numeri, creazione annullata se non va a buon fine, nessun accesso ai dati prima del cambio password.</w:t>
             </w:r>
           </w:p>
         </w:tc>
@@ -2203,7 +2203,7 @@
                 <w:sz w:val="18"/>
                 <w:szCs w:val="18"/>
               </w:rPr>
-              <w:t xml:space="preserve">1.2</w:t>
+              <w:t xml:space="preserve">1.3</w:t>
             </w:r>
           </w:p>
         </w:tc>
@@ -2269,7 +2269,7 @@
                 <w:sz w:val="18"/>
                 <w:szCs w:val="18"/>
               </w:rPr>
-              <w:t xml:space="preserve">Calcolo crediti: importare il tracciato nel calcolo (dai documenti della pratica o dal computer), singole letture, blocco dei dati personali, controlli di coerenza.</w:t>
+              <w:t xml:space="preserve">Rapporto di calcolo in PDF, archiviazione nella pratica, numero di registro, registro dei crediti.</w:t>
             </w:r>
           </w:p>
         </w:tc>
@@ -2339,7 +2339,7 @@
                 <w:sz w:val="18"/>
                 <w:szCs w:val="18"/>
               </w:rPr>
-              <w:t xml:space="preserve">1.1</w:t>
+              <w:t xml:space="preserve">1.2</w:t>
             </w:r>
           </w:p>
         </w:tc>
@@ -2403,7 +2403,7 @@
                 <w:sz w:val="18"/>
                 <w:szCs w:val="18"/>
               </w:rPr>
-              <w:t xml:space="preserve">Note di fase, Ente di Validazione della pratica, consultazione sulla pagina pubblica con conferma dell'email, moderazione con autori e allegati, errata corrige; nuovo capitolo Messaggi con il Comune; pagamenti visibili al Comune; Impostazioni: Enti di Validazione e Modelli di documento; notifiche aggiornate.</w:t>
+              <w:t xml:space="preserve">Calcolo crediti: importare il tracciato nel calcolo (dai documenti della pratica o dal computer), singole letture, blocco dei dati personali, controlli di coerenza.</w:t>
             </w:r>
           </w:p>
         </w:tc>
@@ -2473,6 +2473,142 @@
                 <w:sz w:val="18"/>
                 <w:szCs w:val="18"/>
               </w:rPr>
+              <w:t xml:space="preserve">1.1</w:t>
+            </w:r>
+          </w:p>
+        </w:tc>
+        <w:tc>
+          <w:tcPr>
+            <w:tcW w:type="dxa" w:w="1300"/>
+            <w:tcBorders>
+              <w:top w:val="single" w:color="D9D4C5" w:sz="4"/>
+              <w:left w:val="single" w:color="D9D4C5" w:sz="4"/>
+              <w:bottom w:val="single" w:color="D9D4C5" w:sz="4"/>
+              <w:right w:val="single" w:color="D9D4C5" w:sz="4"/>
+            </w:tcBorders>
+            <w:shd w:fill="F6F4EE" w:color="auto" w:val="clear"/>
+            <w:tcMar>
+              <w:top w:type="dxa" w:w="70"/>
+              <w:left w:type="dxa" w:w="110"/>
+              <w:bottom w:type="dxa" w:w="70"/>
+              <w:right w:type="dxa" w:w="110"/>
+            </w:tcMar>
+            <w:vAlign w:val="center"/>
+          </w:tcPr>
+          <w:p>
+            <w:pPr>
+              <w:spacing w:after="0" w:before="0"/>
+            </w:pPr>
+            <w:r>
+              <w:rPr>
+                <w:rFonts w:ascii="Arial" w:cs="Arial" w:eastAsia="Arial" w:hAnsi="Arial"/>
+                <w:color w:val="1B2118"/>
+                <w:sz w:val="18"/>
+                <w:szCs w:val="18"/>
+              </w:rPr>
+              <w:t xml:space="preserve">18/10/2026</w:t>
+            </w:r>
+          </w:p>
+        </w:tc>
+        <w:tc>
+          <w:tcPr>
+            <w:tcW w:type="dxa" w:w="5538"/>
+            <w:tcBorders>
+              <w:top w:val="single" w:color="D9D4C5" w:sz="4"/>
+              <w:left w:val="single" w:color="D9D4C5" w:sz="4"/>
+              <w:bottom w:val="single" w:color="D9D4C5" w:sz="4"/>
+              <w:right w:val="single" w:color="D9D4C5" w:sz="4"/>
+            </w:tcBorders>
+            <w:shd w:fill="F6F4EE" w:color="auto" w:val="clear"/>
+            <w:tcMar>
+              <w:top w:type="dxa" w:w="70"/>
+              <w:left w:type="dxa" w:w="110"/>
+              <w:bottom w:type="dxa" w:w="70"/>
+              <w:right w:type="dxa" w:w="110"/>
+            </w:tcMar>
+            <w:vAlign w:val="center"/>
+          </w:tcPr>
+          <w:p>
+            <w:pPr>
+              <w:spacing w:after="0" w:before="0"/>
+            </w:pPr>
+            <w:r>
+              <w:rPr>
+                <w:rFonts w:ascii="Arial" w:cs="Arial" w:eastAsia="Arial" w:hAnsi="Arial"/>
+                <w:color w:val="1B2118"/>
+                <w:sz w:val="18"/>
+                <w:szCs w:val="18"/>
+              </w:rPr>
+              <w:t xml:space="preserve">Note di fase, Ente di Validazione della pratica, consultazione sulla pagina pubblica con conferma dell'email, moderazione con autori e allegati, errata corrige; nuovo capitolo Messaggi con il Comune; pagamenti visibili al Comune; Impostazioni: Enti di Validazione e Modelli di documento; notifiche aggiornate.</w:t>
+            </w:r>
+          </w:p>
+        </w:tc>
+        <w:tc>
+          <w:tcPr>
+            <w:tcW w:type="dxa" w:w="2000"/>
+            <w:tcBorders>
+              <w:top w:val="single" w:color="D9D4C5" w:sz="4"/>
+              <w:left w:val="single" w:color="D9D4C5" w:sz="4"/>
+              <w:bottom w:val="single" w:color="D9D4C5" w:sz="4"/>
+              <w:right w:val="single" w:color="D9D4C5" w:sz="4"/>
+            </w:tcBorders>
+            <w:shd w:fill="F6F4EE" w:color="auto" w:val="clear"/>
+            <w:tcMar>
+              <w:top w:type="dxa" w:w="70"/>
+              <w:left w:type="dxa" w:w="110"/>
+              <w:bottom w:type="dxa" w:w="70"/>
+              <w:right w:type="dxa" w:w="110"/>
+            </w:tcMar>
+            <w:vAlign w:val="center"/>
+          </w:tcPr>
+          <w:p>
+            <w:pPr>
+              <w:spacing w:after="0" w:before="0"/>
+            </w:pPr>
+            <w:r>
+              <w:rPr>
+                <w:rFonts w:ascii="Arial" w:cs="Arial" w:eastAsia="Arial" w:hAnsi="Arial"/>
+                <w:color w:val="1B2118"/>
+                <w:sz w:val="18"/>
+                <w:szCs w:val="18"/>
+              </w:rPr>
+              <w:t xml:space="preserve">Fondazione Operate</w:t>
+            </w:r>
+          </w:p>
+        </w:tc>
+      </w:tr>
+      <w:tr>
+        <w:trPr>
+          <w:cantSplit/>
+        </w:trPr>
+        <w:tc>
+          <w:tcPr>
+            <w:tcW w:type="dxa" w:w="800"/>
+            <w:tcBorders>
+              <w:top w:val="single" w:color="D9D4C5" w:sz="4"/>
+              <w:left w:val="single" w:color="D9D4C5" w:sz="4"/>
+              <w:bottom w:val="single" w:color="D9D4C5" w:sz="4"/>
+              <w:right w:val="single" w:color="D9D4C5" w:sz="4"/>
+            </w:tcBorders>
+            <w:tcMar>
+              <w:top w:type="dxa" w:w="70"/>
+              <w:left w:type="dxa" w:w="110"/>
+              <w:bottom w:type="dxa" w:w="70"/>
+              <w:right w:type="dxa" w:w="110"/>
+            </w:tcMar>
+            <w:vAlign w:val="center"/>
+          </w:tcPr>
+          <w:p>
+            <w:pPr>
+              <w:spacing w:after="0" w:before="0"/>
+            </w:pPr>
+            <w:r>
+              <w:rPr>
+                <w:rFonts w:ascii="Arial" w:cs="Arial" w:eastAsia="Arial" w:hAnsi="Arial"/>
+                <w:color w:val="1B2118"/>
+                <w:sz w:val="18"/>
+                <w:szCs w:val="18"/>
+              </w:rPr>
               <w:t xml:space="preserve">1.0</w:t>
             </w:r>
           </w:p>
@@ -2486,7 +2622,6 @@
               <w:bottom w:val="single" w:color="D9D4C5" w:sz="4"/>
               <w:right w:val="single" w:color="D9D4C5" w:sz="4"/>
             </w:tcBorders>
-            <w:shd w:fill="F6F4EE" w:color="auto" w:val="clear"/>
             <w:tcMar>
               <w:top w:type="dxa" w:w="70"/>
               <w:left w:type="dxa" w:w="110"/>
@@ -2519,7 +2654,6 @@
               <w:bottom w:val="single" w:color="D9D4C5" w:sz="4"/>
               <w:right w:val="single" w:color="D9D4C5" w:sz="4"/>
             </w:tcBorders>
-            <w:shd w:fill="F6F4EE" w:color="auto" w:val="clear"/>
             <w:tcMar>
               <w:top w:type="dxa" w:w="70"/>
               <w:left w:type="dxa" w:w="110"/>
@@ -2552,7 +2686,6 @@
               <w:bottom w:val="single" w:color="D9D4C5" w:sz="4"/>
               <w:right w:val="single" w:color="D9D4C5" w:sz="4"/>
             </w:tcBorders>
-            <w:shd w:fill="F6F4EE" w:color="auto" w:val="clear"/>
             <w:tcMar>
               <w:top w:type="dxa" w:w="70"/>
               <w:left w:type="dxa" w:w="110"/>
@@ -2594,7 +2727,7 @@
           <w:sz w:val="20"/>
           <w:szCs w:val="20"/>
         </w:rPr>
-        <w:t xml:space="preserve">Questo documento descrive il portale alla revisione 2.3 del 19/10/2026. A ogni modifica del portale il manuale viene aggiornato e la revisione incrementata; la versione corrente si scarica dall'area Documentazione del portale (solo Amministratori).</w:t>
+        <w:t xml:space="preserve">Questo documento descrive il portale alla revisione 2.4 del 19/10/2026. A ogni modifica del portale il manuale viene aggiornato e la revisione incrementata; la versione corrente si scarica dall'area Documentazione del portale (solo Amministratori).</w:t>
       </w:r>
     </w:p>
     <w:p>
@@ -5174,7 +5307,7 @@
         </w:rPr>
         <w:t xml:space="preserve">Si accede da </w:t>
       </w:r>
-      <w:hyperlink w:history="1" r:id="rIdrnzn3vmxiyf-ek0c8amxe">
+      <w:hyperlink w:history="1" r:id="rIdfqxuog87hqs67yct7dtux">
         <w:r>
           <w:rPr>
             <w:rFonts w:ascii="Arial" w:cs="Arial" w:eastAsia="Arial" w:hAnsi="Arial"/>
@@ -32238,7 +32371,27 @@
           <w:sz w:val="21"/>
           <w:szCs w:val="21"/>
         </w:rPr>
-        <w:t xml:space="preserve">, esito del controllo sul 65% e fattore di emissione del secco (formule 16-17).</w:t>
+        <w:t xml:space="preserve"> e fattore di emissione del secco (formule 16-17). </w:t>
+      </w:r>
+      <w:r>
+        <w:rPr>
+          <w:rFonts w:ascii="Arial" w:cs="Arial" w:eastAsia="Arial" w:hAnsi="Arial"/>
+          <w:b/>
+          <w:bCs/>
+          <w:color w:val="1B2118"/>
+          <w:sz w:val="21"/>
+          <w:szCs w:val="21"/>
+        </w:rPr>
+        <w:t xml:space="preserve">Nel calcolo il riferimento è sempre portato alla soglia minima del 65% di differenziata</w:t>
+      </w:r>
+      <w:r>
+        <w:rPr>
+          <w:rFonts w:ascii="Arial" w:cs="Arial" w:eastAsia="Arial" w:hAnsi="Arial"/>
+          <w:color w:val="1B2118"/>
+          <w:sz w:val="21"/>
+          <w:szCs w:val="21"/>
+        </w:rPr>
+        <w:t xml:space="preserve">: stessa produzione totale, secco al 35%. Ogni anno i risultati si calcolano per differenza da questa soglia, e la tabella dei risultati mostra di quanti punti la differenziata supera il 65%. Se i dati inseriti hanno una percentuale diversa, un avviso lo segnala; un altro avviso compare se la produzione pro capite è fuori scala (unità di misura sbagliata).</w:t>
       </w:r>
     </w:p>
     <w:p>
@@ -38512,7 +38665,7 @@
         <w:szCs w:val="16"/>
       </w:rPr>
       <w:tab/>
-      <w:t xml:space="preserve">Manuale Amministratore · Rev. 2.3 · 19/10/2026</w:t>
+      <w:t xml:space="preserve">Manuale Amministratore · Rev. 2.4 · 19/10/2026</w:t>
     </w:r>
   </w:p>
 </w:hdr>
@@ -38577,7 +38730,7 @@
         <w:szCs w:val="16"/>
       </w:rPr>
       <w:tab/>
-      <w:t xml:space="preserve">Manuale Amministratore · Rev. 2.3 · 19/10/2026</w:t>
+      <w:t xml:space="preserve">Manuale Amministratore · Rev. 2.4 · 19/10/2026</w:t>
     </w:r>
   </w:p>
 </w:hdr>

</xml_diff>

<commit_message>
Simulatore: costi per il Comune dai contratti tipo della Fondazione (partecipazione e consulenza), scenari di valore minimo e massimo, indicatori per abitante; documenti aggiornati
Co-Authored-By: Claude Opus 5.5 <noreply@anthropic.com>
Claude-Session: https://claude.ai/code/session_01E8XCbEeVHWVP3hntUZ6kZ1
</commit_message>
<xml_diff>
--- a/public/documentazione/Manuale_Amministratore_Portale_CWP.docx
+++ b/public/documentazione/Manuale_Amministratore_Portale_CWP.docx
@@ -302,7 +302,7 @@
                 <w:sz w:val="20"/>
                 <w:szCs w:val="20"/>
               </w:rPr>
-              <w:t xml:space="preserve">Rev. 2.4</w:t>
+              <w:t xml:space="preserve">Rev. 2.5</w:t>
             </w:r>
           </w:p>
         </w:tc>
@@ -719,7 +719,7 @@
                 <w:sz w:val="18"/>
                 <w:szCs w:val="18"/>
               </w:rPr>
-              <w:t xml:space="preserve">2.4</w:t>
+              <w:t xml:space="preserve">2.5</w:t>
             </w:r>
           </w:p>
         </w:tc>
@@ -783,7 +783,7 @@
                 <w:sz w:val="18"/>
                 <w:szCs w:val="18"/>
               </w:rPr>
-              <w:t xml:space="preserve">Simulatore: riferimento sempre alla soglia del 65% di differenziata e controllo dei valori fuori scala.</w:t>
+              <w:t xml:space="preserve">Simulatore: simulazione economica con valore unitario del credito e costi per il Comune (contratti tipo della Fondazione, Schema tariffario).</w:t>
             </w:r>
           </w:p>
         </w:tc>
@@ -853,7 +853,7 @@
                 <w:sz w:val="18"/>
                 <w:szCs w:val="18"/>
               </w:rPr>
-              <w:t xml:space="preserve">2.3</w:t>
+              <w:t xml:space="preserve">2.4</w:t>
             </w:r>
           </w:p>
         </w:tc>
@@ -919,7 +919,7 @@
                 <w:sz w:val="18"/>
                 <w:szCs w:val="18"/>
               </w:rPr>
-              <w:t xml:space="preserve">Simulatore conforme al modello CWP: scenario di riferimento dello Standard 4.8.1, situazione attuale, conformità.</w:t>
+              <w:t xml:space="preserve">Simulatore: riferimento sempre alla soglia del 65% di differenziata e controllo dei valori fuori scala.</w:t>
             </w:r>
           </w:p>
         </w:tc>
@@ -989,7 +989,7 @@
                 <w:sz w:val="18"/>
                 <w:szCs w:val="18"/>
               </w:rPr>
-              <w:t xml:space="preserve">2.2</w:t>
+              <w:t xml:space="preserve">2.3</w:t>
             </w:r>
           </w:p>
         </w:tc>
@@ -1053,7 +1053,7 @@
                 <w:sz w:val="18"/>
                 <w:szCs w:val="18"/>
               </w:rPr>
-              <w:t xml:space="preserve">Nuovo capitolo «Simulatore di scenari»: creazione, anno base, obiettivi annui, risultati, modello di stima.</w:t>
+              <w:t xml:space="preserve">Simulatore conforme al modello CWP: scenario di riferimento dello Standard 4.8.1, situazione attuale, conformità.</w:t>
             </w:r>
           </w:p>
         </w:tc>
@@ -1123,7 +1123,7 @@
                 <w:sz w:val="18"/>
                 <w:szCs w:val="18"/>
               </w:rPr>
-              <w:t xml:space="preserve">2.1</w:t>
+              <w:t xml:space="preserve">2.2</w:t>
             </w:r>
           </w:p>
         </w:tc>
@@ -1189,7 +1189,7 @@
                 <w:sz w:val="18"/>
                 <w:szCs w:val="18"/>
               </w:rPr>
-              <w:t xml:space="preserve">Funzioni in arrivo: simulatore di scenari (7, 10 o 21 anni, obiettivi annui, % di differenziata e crediti stimati) e assistente virtuale (Claude).</w:t>
+              <w:t xml:space="preserve">Nuovo capitolo «Simulatore di scenari»: creazione, anno base, obiettivi annui, risultati, modello di stima.</w:t>
             </w:r>
           </w:p>
         </w:tc>
@@ -1259,7 +1259,7 @@
                 <w:sz w:val="18"/>
                 <w:szCs w:val="18"/>
               </w:rPr>
-              <w:t xml:space="preserve">2.0</w:t>
+              <w:t xml:space="preserve">2.1</w:t>
             </w:r>
           </w:p>
         </w:tc>
@@ -1323,7 +1323,7 @@
                 <w:sz w:val="18"/>
                 <w:szCs w:val="18"/>
               </w:rPr>
-              <w:t xml:space="preserve">Copie di sicurezza e ripristino: rimando alle Istruzioni di ripristino e punti essenziali (capitolo Manutenzione ed emergenze).</w:t>
+              <w:t xml:space="preserve">Funzioni in arrivo: simulatore di scenari (7, 10 o 21 anni, obiettivi annui, % di differenziata e crediti stimati) e assistente virtuale (Claude).</w:t>
             </w:r>
           </w:p>
         </w:tc>
@@ -1393,7 +1393,7 @@
                 <w:sz w:val="18"/>
                 <w:szCs w:val="18"/>
               </w:rPr>
-              <w:t xml:space="preserve">1.9</w:t>
+              <w:t xml:space="preserve">2.0</w:t>
             </w:r>
           </w:p>
         </w:tc>
@@ -1459,7 +1459,7 @@
                 <w:sz w:val="18"/>
                 <w:szCs w:val="18"/>
               </w:rPr>
-              <w:t xml:space="preserve">Fondazione Operate soggetto promotore del programma (esclusiva conferita da Wastelab).</w:t>
+              <w:t xml:space="preserve">Copie di sicurezza e ripristino: rimando alle Istruzioni di ripristino e punti essenziali (capitolo Manutenzione ed emergenze).</w:t>
             </w:r>
           </w:p>
         </w:tc>
@@ -1529,7 +1529,7 @@
                 <w:sz w:val="18"/>
                 <w:szCs w:val="18"/>
               </w:rPr>
-              <w:t xml:space="preserve">1.8</w:t>
+              <w:t xml:space="preserve">1.9</w:t>
             </w:r>
           </w:p>
         </w:tc>
@@ -1593,7 +1593,7 @@
                 <w:sz w:val="18"/>
                 <w:szCs w:val="18"/>
               </w:rPr>
-              <w:t xml:space="preserve">PEC del Programma e documenti ufficiali già pubblicati sulla pagina pubblica.</w:t>
+              <w:t xml:space="preserve">Fondazione Operate soggetto promotore del programma (esclusiva conferita da Wastelab).</w:t>
             </w:r>
           </w:p>
         </w:tc>
@@ -1663,7 +1663,7 @@
                 <w:sz w:val="18"/>
                 <w:szCs w:val="18"/>
               </w:rPr>
-              <w:t xml:space="preserve">1.7</w:t>
+              <w:t xml:space="preserve">1.8</w:t>
             </w:r>
           </w:p>
         </w:tc>
@@ -1696,7 +1696,7 @@
                 <w:sz w:val="18"/>
                 <w:szCs w:val="18"/>
               </w:rPr>
-              <w:t xml:space="preserve">18/10/2026</w:t>
+              <w:t xml:space="preserve">19/10/2026</w:t>
             </w:r>
           </w:p>
         </w:tc>
@@ -1729,7 +1729,7 @@
                 <w:sz w:val="18"/>
                 <w:szCs w:val="18"/>
               </w:rPr>
-              <w:t xml:space="preserve">Allineamento ai documenti ufficiali del Programma (script 22-24): Rapporto a 7 fasi, feedback pubblico, stati del Programma, dati del progetto e territorio ISTAT, ritiro e rientro, account unico e delegati, registri, tariffe e sospensione, accuratezza e accertamenti, informazioni del Programma e metodologie, modelli pubblici; nuovi capitoli Crediti emessi, Reclami, Pagina pubblica; qualità dei dati nel calcolo.</w:t>
+              <w:t xml:space="preserve">PEC del Programma e documenti ufficiali già pubblicati sulla pagina pubblica.</w:t>
             </w:r>
           </w:p>
         </w:tc>
@@ -1799,7 +1799,7 @@
                 <w:sz w:val="18"/>
                 <w:szCs w:val="18"/>
               </w:rPr>
-              <w:t xml:space="preserve">1.6</w:t>
+              <w:t xml:space="preserve">1.7</w:t>
             </w:r>
           </w:p>
         </w:tc>
@@ -1863,7 +1863,7 @@
                 <w:sz w:val="18"/>
                 <w:szCs w:val="18"/>
               </w:rPr>
-              <w:t xml:space="preserve">Calcolo crediti: descrizione corretta del buffer (somma delle voci delle Tabelle 15 e 16, più il 20% con le sole utenze virtuose, al massimo 80%).</w:t>
+              <w:t xml:space="preserve">Allineamento ai documenti ufficiali del Programma (script 22-24): Rapporto a 7 fasi, feedback pubblico, stati del Programma, dati del progetto e territorio ISTAT, ritiro e rientro, account unico e delegati, registri, tariffe e sospensione, accuratezza e accertamenti, informazioni del Programma e metodologie, modelli pubblici; nuovi capitoli Crediti emessi, Reclami, Pagina pubblica; qualità dei dati nel calcolo.</w:t>
             </w:r>
           </w:p>
         </w:tc>
@@ -1933,7 +1933,7 @@
                 <w:sz w:val="18"/>
                 <w:szCs w:val="18"/>
               </w:rPr>
-              <w:t xml:space="preserve">1.5</w:t>
+              <w:t xml:space="preserve">1.6</w:t>
             </w:r>
           </w:p>
         </w:tc>
@@ -1999,7 +1999,7 @@
                 <w:sz w:val="18"/>
                 <w:szCs w:val="18"/>
               </w:rPr>
-              <w:t xml:space="preserve">Nuova pagina Anagrafiche (Organizzazioni ed Enti, anche per gli Operatori); Rapporti con 4 fasi e durate proprie; documenti richiesti per fase; consultazione con documento bloccato, osservazioni numerate e motivazione; conservazione per 10 anni; fascicolo con riepilogo PDF e nuove cartelle.</w:t>
+              <w:t xml:space="preserve">Calcolo crediti: descrizione corretta del buffer (somma delle voci delle Tabelle 15 e 16, più il 20% con le sole utenze virtuose, al massimo 80%).</w:t>
             </w:r>
           </w:p>
         </w:tc>
@@ -2069,7 +2069,7 @@
                 <w:sz w:val="18"/>
                 <w:szCs w:val="18"/>
               </w:rPr>
-              <w:t xml:space="preserve">1.4</w:t>
+              <w:t xml:space="preserve">1.5</w:t>
             </w:r>
           </w:p>
         </w:tc>
@@ -2133,7 +2133,7 @@
                 <w:sz w:val="18"/>
                 <w:szCs w:val="18"/>
               </w:rPr>
-              <w:t xml:space="preserve">Calcolo crediti: il risultato si azzera quando cambiano dati o Banca Dati Utenze, conferma solo dopo un nuovo «Calcola». Gestione utenti: password temporanea di almeno 10 caratteri con lettere e numeri, creazione annullata se non va a buon fine, nessun accesso ai dati prima del cambio password.</w:t>
+              <w:t xml:space="preserve">Nuova pagina Anagrafiche (Organizzazioni ed Enti, anche per gli Operatori); Rapporti con 4 fasi e durate proprie; documenti richiesti per fase; consultazione con documento bloccato, osservazioni numerate e motivazione; conservazione per 10 anni; fascicolo con riepilogo PDF e nuove cartelle.</w:t>
             </w:r>
           </w:p>
         </w:tc>
@@ -2203,7 +2203,7 @@
                 <w:sz w:val="18"/>
                 <w:szCs w:val="18"/>
               </w:rPr>
-              <w:t xml:space="preserve">1.3</w:t>
+              <w:t xml:space="preserve">1.4</w:t>
             </w:r>
           </w:p>
         </w:tc>
@@ -2269,7 +2269,7 @@
                 <w:sz w:val="18"/>
                 <w:szCs w:val="18"/>
               </w:rPr>
-              <w:t xml:space="preserve">Rapporto di calcolo in PDF, archiviazione nella pratica, numero di registro, registro dei crediti.</w:t>
+              <w:t xml:space="preserve">Calcolo crediti: il risultato si azzera quando cambiano dati o Banca Dati Utenze, conferma solo dopo un nuovo «Calcola». Gestione utenti: password temporanea di almeno 10 caratteri con lettere e numeri, creazione annullata se non va a buon fine, nessun accesso ai dati prima del cambio password.</w:t>
             </w:r>
           </w:p>
         </w:tc>
@@ -2339,7 +2339,7 @@
                 <w:sz w:val="18"/>
                 <w:szCs w:val="18"/>
               </w:rPr>
-              <w:t xml:space="preserve">1.2</w:t>
+              <w:t xml:space="preserve">1.3</w:t>
             </w:r>
           </w:p>
         </w:tc>
@@ -2403,7 +2403,7 @@
                 <w:sz w:val="18"/>
                 <w:szCs w:val="18"/>
               </w:rPr>
-              <w:t xml:space="preserve">Calcolo crediti: importare il tracciato nel calcolo (dai documenti della pratica o dal computer), singole letture, blocco dei dati personali, controlli di coerenza.</w:t>
+              <w:t xml:space="preserve">Rapporto di calcolo in PDF, archiviazione nella pratica, numero di registro, registro dei crediti.</w:t>
             </w:r>
           </w:p>
         </w:tc>
@@ -2473,7 +2473,7 @@
                 <w:sz w:val="18"/>
                 <w:szCs w:val="18"/>
               </w:rPr>
-              <w:t xml:space="preserve">1.1</w:t>
+              <w:t xml:space="preserve">1.2</w:t>
             </w:r>
           </w:p>
         </w:tc>
@@ -2539,7 +2539,7 @@
                 <w:sz w:val="18"/>
                 <w:szCs w:val="18"/>
               </w:rPr>
-              <w:t xml:space="preserve">Note di fase, Ente di Validazione della pratica, consultazione sulla pagina pubblica con conferma dell'email, moderazione con autori e allegati, errata corrige; nuovo capitolo Messaggi con il Comune; pagamenti visibili al Comune; Impostazioni: Enti di Validazione e Modelli di documento; notifiche aggiornate.</w:t>
+              <w:t xml:space="preserve">Calcolo crediti: importare il tracciato nel calcolo (dai documenti della pratica o dal computer), singole letture, blocco dei dati personali, controlli di coerenza.</w:t>
             </w:r>
           </w:p>
         </w:tc>
@@ -2609,6 +2609,140 @@
                 <w:sz w:val="18"/>
                 <w:szCs w:val="18"/>
               </w:rPr>
+              <w:t xml:space="preserve">1.1</w:t>
+            </w:r>
+          </w:p>
+        </w:tc>
+        <w:tc>
+          <w:tcPr>
+            <w:tcW w:type="dxa" w:w="1300"/>
+            <w:tcBorders>
+              <w:top w:val="single" w:color="D9D4C5" w:sz="4"/>
+              <w:left w:val="single" w:color="D9D4C5" w:sz="4"/>
+              <w:bottom w:val="single" w:color="D9D4C5" w:sz="4"/>
+              <w:right w:val="single" w:color="D9D4C5" w:sz="4"/>
+            </w:tcBorders>
+            <w:tcMar>
+              <w:top w:type="dxa" w:w="70"/>
+              <w:left w:type="dxa" w:w="110"/>
+              <w:bottom w:type="dxa" w:w="70"/>
+              <w:right w:type="dxa" w:w="110"/>
+            </w:tcMar>
+            <w:vAlign w:val="center"/>
+          </w:tcPr>
+          <w:p>
+            <w:pPr>
+              <w:spacing w:after="0" w:before="0"/>
+            </w:pPr>
+            <w:r>
+              <w:rPr>
+                <w:rFonts w:ascii="Arial" w:cs="Arial" w:eastAsia="Arial" w:hAnsi="Arial"/>
+                <w:color w:val="1B2118"/>
+                <w:sz w:val="18"/>
+                <w:szCs w:val="18"/>
+              </w:rPr>
+              <w:t xml:space="preserve">18/10/2026</w:t>
+            </w:r>
+          </w:p>
+        </w:tc>
+        <w:tc>
+          <w:tcPr>
+            <w:tcW w:type="dxa" w:w="5538"/>
+            <w:tcBorders>
+              <w:top w:val="single" w:color="D9D4C5" w:sz="4"/>
+              <w:left w:val="single" w:color="D9D4C5" w:sz="4"/>
+              <w:bottom w:val="single" w:color="D9D4C5" w:sz="4"/>
+              <w:right w:val="single" w:color="D9D4C5" w:sz="4"/>
+            </w:tcBorders>
+            <w:tcMar>
+              <w:top w:type="dxa" w:w="70"/>
+              <w:left w:type="dxa" w:w="110"/>
+              <w:bottom w:type="dxa" w:w="70"/>
+              <w:right w:type="dxa" w:w="110"/>
+            </w:tcMar>
+            <w:vAlign w:val="center"/>
+          </w:tcPr>
+          <w:p>
+            <w:pPr>
+              <w:spacing w:after="0" w:before="0"/>
+            </w:pPr>
+            <w:r>
+              <w:rPr>
+                <w:rFonts w:ascii="Arial" w:cs="Arial" w:eastAsia="Arial" w:hAnsi="Arial"/>
+                <w:color w:val="1B2118"/>
+                <w:sz w:val="18"/>
+                <w:szCs w:val="18"/>
+              </w:rPr>
+              <w:t xml:space="preserve">Note di fase, Ente di Validazione della pratica, consultazione sulla pagina pubblica con conferma dell'email, moderazione con autori e allegati, errata corrige; nuovo capitolo Messaggi con il Comune; pagamenti visibili al Comune; Impostazioni: Enti di Validazione e Modelli di documento; notifiche aggiornate.</w:t>
+            </w:r>
+          </w:p>
+        </w:tc>
+        <w:tc>
+          <w:tcPr>
+            <w:tcW w:type="dxa" w:w="2000"/>
+            <w:tcBorders>
+              <w:top w:val="single" w:color="D9D4C5" w:sz="4"/>
+              <w:left w:val="single" w:color="D9D4C5" w:sz="4"/>
+              <w:bottom w:val="single" w:color="D9D4C5" w:sz="4"/>
+              <w:right w:val="single" w:color="D9D4C5" w:sz="4"/>
+            </w:tcBorders>
+            <w:tcMar>
+              <w:top w:type="dxa" w:w="70"/>
+              <w:left w:type="dxa" w:w="110"/>
+              <w:bottom w:type="dxa" w:w="70"/>
+              <w:right w:type="dxa" w:w="110"/>
+            </w:tcMar>
+            <w:vAlign w:val="center"/>
+          </w:tcPr>
+          <w:p>
+            <w:pPr>
+              <w:spacing w:after="0" w:before="0"/>
+            </w:pPr>
+            <w:r>
+              <w:rPr>
+                <w:rFonts w:ascii="Arial" w:cs="Arial" w:eastAsia="Arial" w:hAnsi="Arial"/>
+                <w:color w:val="1B2118"/>
+                <w:sz w:val="18"/>
+                <w:szCs w:val="18"/>
+              </w:rPr>
+              <w:t xml:space="preserve">Fondazione Operate</w:t>
+            </w:r>
+          </w:p>
+        </w:tc>
+      </w:tr>
+      <w:tr>
+        <w:trPr>
+          <w:cantSplit/>
+        </w:trPr>
+        <w:tc>
+          <w:tcPr>
+            <w:tcW w:type="dxa" w:w="800"/>
+            <w:tcBorders>
+              <w:top w:val="single" w:color="D9D4C5" w:sz="4"/>
+              <w:left w:val="single" w:color="D9D4C5" w:sz="4"/>
+              <w:bottom w:val="single" w:color="D9D4C5" w:sz="4"/>
+              <w:right w:val="single" w:color="D9D4C5" w:sz="4"/>
+            </w:tcBorders>
+            <w:shd w:fill="F6F4EE" w:color="auto" w:val="clear"/>
+            <w:tcMar>
+              <w:top w:type="dxa" w:w="70"/>
+              <w:left w:type="dxa" w:w="110"/>
+              <w:bottom w:type="dxa" w:w="70"/>
+              <w:right w:type="dxa" w:w="110"/>
+            </w:tcMar>
+            <w:vAlign w:val="center"/>
+          </w:tcPr>
+          <w:p>
+            <w:pPr>
+              <w:spacing w:after="0" w:before="0"/>
+            </w:pPr>
+            <w:r>
+              <w:rPr>
+                <w:rFonts w:ascii="Arial" w:cs="Arial" w:eastAsia="Arial" w:hAnsi="Arial"/>
+                <w:color w:val="1B2118"/>
+                <w:sz w:val="18"/>
+                <w:szCs w:val="18"/>
+              </w:rPr>
               <w:t xml:space="preserve">1.0</w:t>
             </w:r>
           </w:p>
@@ -2622,6 +2756,7 @@
               <w:bottom w:val="single" w:color="D9D4C5" w:sz="4"/>
               <w:right w:val="single" w:color="D9D4C5" w:sz="4"/>
             </w:tcBorders>
+            <w:shd w:fill="F6F4EE" w:color="auto" w:val="clear"/>
             <w:tcMar>
               <w:top w:type="dxa" w:w="70"/>
               <w:left w:type="dxa" w:w="110"/>
@@ -2654,6 +2789,7 @@
               <w:bottom w:val="single" w:color="D9D4C5" w:sz="4"/>
               <w:right w:val="single" w:color="D9D4C5" w:sz="4"/>
             </w:tcBorders>
+            <w:shd w:fill="F6F4EE" w:color="auto" w:val="clear"/>
             <w:tcMar>
               <w:top w:type="dxa" w:w="70"/>
               <w:left w:type="dxa" w:w="110"/>
@@ -2686,6 +2822,7 @@
               <w:bottom w:val="single" w:color="D9D4C5" w:sz="4"/>
               <w:right w:val="single" w:color="D9D4C5" w:sz="4"/>
             </w:tcBorders>
+            <w:shd w:fill="F6F4EE" w:color="auto" w:val="clear"/>
             <w:tcMar>
               <w:top w:type="dxa" w:w="70"/>
               <w:left w:type="dxa" w:w="110"/>
@@ -2727,7 +2864,7 @@
           <w:sz w:val="20"/>
           <w:szCs w:val="20"/>
         </w:rPr>
-        <w:t xml:space="preserve">Questo documento descrive il portale alla revisione 2.4 del 19/10/2026. A ogni modifica del portale il manuale viene aggiornato e la revisione incrementata; la versione corrente si scarica dall'area Documentazione del portale (solo Amministratori).</w:t>
+        <w:t xml:space="preserve">Questo documento descrive il portale alla revisione 2.5 del 19/10/2026. A ogni modifica del portale il manuale viene aggiornato e la revisione incrementata; la versione corrente si scarica dall'area Documentazione del portale (solo Amministratori).</w:t>
       </w:r>
     </w:p>
     <w:p>
@@ -3301,7 +3438,7 @@
             <w:szCs w:val="22"/>
           </w:rPr>
           <w:tab/>
-          <w:t xml:space="preserve">37</w:t>
+          <w:t xml:space="preserve">38</w:t>
         </w:r>
       </w:hyperlink>
     </w:p>
@@ -3330,7 +3467,7 @@
             <w:szCs w:val="22"/>
           </w:rPr>
           <w:tab/>
-          <w:t xml:space="preserve">39</w:t>
+          <w:t xml:space="preserve">40</w:t>
         </w:r>
       </w:hyperlink>
     </w:p>
@@ -3359,7 +3496,7 @@
             <w:szCs w:val="22"/>
           </w:rPr>
           <w:tab/>
-          <w:t xml:space="preserve">40</w:t>
+          <w:t xml:space="preserve">41</w:t>
         </w:r>
       </w:hyperlink>
     </w:p>
@@ -3388,7 +3525,7 @@
             <w:szCs w:val="22"/>
           </w:rPr>
           <w:tab/>
-          <w:t xml:space="preserve">41</w:t>
+          <w:t xml:space="preserve">42</w:t>
         </w:r>
       </w:hyperlink>
     </w:p>
@@ -3417,7 +3554,7 @@
             <w:szCs w:val="22"/>
           </w:rPr>
           <w:tab/>
-          <w:t xml:space="preserve">42</w:t>
+          <w:t xml:space="preserve">43</w:t>
         </w:r>
       </w:hyperlink>
     </w:p>
@@ -3446,7 +3583,7 @@
             <w:szCs w:val="22"/>
           </w:rPr>
           <w:tab/>
-          <w:t xml:space="preserve">43</w:t>
+          <w:t xml:space="preserve">44</w:t>
         </w:r>
       </w:hyperlink>
     </w:p>
@@ -5307,7 +5444,7 @@
         </w:rPr>
         <w:t xml:space="preserve">Si accede da </w:t>
       </w:r>
-      <w:hyperlink w:history="1" r:id="rIdffpgazc-qiwt1lcy72lin">
+      <w:hyperlink w:history="1" r:id="rIdc2oqtgvudh1trpkgvrta-">
         <w:r>
           <w:rPr>
             <w:rFonts w:ascii="Arial" w:cs="Arial" w:eastAsia="Arial" w:hAnsi="Arial"/>
@@ -32718,6 +32855,230 @@
         </w:rPr>
         <w:t xml:space="preserve"> produce una versione da stampare o salvare in PDF.</w:t>
       </w:r>
+    </w:p>
+    <w:p>
+      <w:pPr>
+        <w:spacing w:after="140" w:line="300"/>
+      </w:pPr>
+      <w:r>
+        <w:rPr>
+          <w:rFonts w:ascii="Arial" w:cs="Arial" w:eastAsia="Arial" w:hAnsi="Arial"/>
+          <w:b/>
+          <w:bCs/>
+          <w:color w:val="1B2118"/>
+          <w:sz w:val="21"/>
+          <w:szCs w:val="21"/>
+        </w:rPr>
+        <w:t xml:space="preserve">5. Simulazione economica: ricavi e costi per il Comune.</w:t>
+      </w:r>
+      <w:r>
+        <w:rPr>
+          <w:rFonts w:ascii="Arial" w:cs="Arial" w:eastAsia="Arial" w:hAnsi="Arial"/>
+          <w:color w:val="1B2118"/>
+          <w:sz w:val="21"/>
+          <w:szCs w:val="21"/>
+        </w:rPr>
+        <w:t xml:space="preserve"> Digitate il </w:t>
+      </w:r>
+      <w:r>
+        <w:rPr>
+          <w:rFonts w:ascii="Arial" w:cs="Arial" w:eastAsia="Arial" w:hAnsi="Arial"/>
+          <w:b/>
+          <w:bCs/>
+          <w:color w:val="1B2118"/>
+          <w:sz w:val="21"/>
+          <w:szCs w:val="21"/>
+        </w:rPr>
+        <w:t xml:space="preserve">valore unitario del credito</w:t>
+      </w:r>
+      <w:r>
+        <w:rPr>
+          <w:rFonts w:ascii="Arial" w:cs="Arial" w:eastAsia="Arial" w:hAnsi="Arial"/>
+          <w:color w:val="1B2118"/>
+          <w:sz w:val="21"/>
+          <w:szCs w:val="21"/>
+        </w:rPr>
+        <w:t xml:space="preserve"> (€ per credito; un credito è una tonnellata di CO₂eq) e, se volete, un valore minimo e uno massimo (scenario peggiore e migliore, come nell'Allegato A del contratto tipo) e la variazione annua del valore. Poi scegliete i </w:t>
+      </w:r>
+      <w:r>
+        <w:rPr>
+          <w:rFonts w:ascii="Arial" w:cs="Arial" w:eastAsia="Arial" w:hAnsi="Arial"/>
+          <w:b/>
+          <w:bCs/>
+          <w:color w:val="1B2118"/>
+          <w:sz w:val="21"/>
+          <w:szCs w:val="21"/>
+        </w:rPr>
+        <w:t xml:space="preserve">costi a carico del Comune o del gestore</w:t>
+      </w:r>
+      <w:r>
+        <w:rPr>
+          <w:rFonts w:ascii="Arial" w:cs="Arial" w:eastAsia="Arial" w:hAnsi="Arial"/>
+          <w:color w:val="1B2118"/>
+          <w:sz w:val="21"/>
+          <w:szCs w:val="21"/>
+        </w:rPr>
+        <w:t xml:space="preserve"> (IVA esclusa):</w:t>
+      </w:r>
+    </w:p>
+    <w:p>
+      <w:pPr>
+        <w:pStyle w:val="ListParagraph"/>
+        <w:numPr>
+          <w:ilvl w:val="0"/>
+          <w:numId w:val="2"/>
+        </w:numPr>
+        <w:spacing w:after="70" w:line="290"/>
+      </w:pPr>
+      <w:r>
+        <w:rPr>
+          <w:rFonts w:ascii="Arial" w:cs="Arial" w:eastAsia="Arial" w:hAnsi="Arial"/>
+          <w:b/>
+          <w:bCs/>
+          <w:color w:val="1B2118"/>
+          <w:sz w:val="21"/>
+          <w:szCs w:val="21"/>
+        </w:rPr>
+        <w:t xml:space="preserve">Contratti tipo della Fondazione</w:t>
+      </w:r>
+      <w:r>
+        <w:rPr>
+          <w:rFonts w:ascii="Arial" w:cs="Arial" w:eastAsia="Arial" w:hAnsi="Arial"/>
+          <w:color w:val="1B2118"/>
+          <w:sz w:val="21"/>
+          <w:szCs w:val="21"/>
+        </w:rPr>
+        <w:t xml:space="preserve"> (predefinito): le voci del contratto di partecipazione al Programma (registrazione del Progetto, dei crediti del Progetto, del Rapporto di Monitoraggio e dei crediti del Rapporto) e del contratto di consulenza (redazione del Progetto e del Rapporto), per ogni anno del periodo, con i valori delle bozze EsaCom del 15/10/2026; le voci «per abitante» si moltiplicano per la popolazione del Comune e tutte si possono modificare;</w:t>
+      </w:r>
+    </w:p>
+    <w:p>
+      <w:pPr>
+        <w:pStyle w:val="ListParagraph"/>
+        <w:numPr>
+          <w:ilvl w:val="0"/>
+          <w:numId w:val="2"/>
+        </w:numPr>
+        <w:spacing w:after="70" w:line="290"/>
+      </w:pPr>
+      <w:r>
+        <w:rPr>
+          <w:rFonts w:ascii="Arial" w:cs="Arial" w:eastAsia="Arial" w:hAnsi="Arial"/>
+          <w:b/>
+          <w:bCs/>
+          <w:color w:val="1B2118"/>
+          <w:sz w:val="21"/>
+          <w:szCs w:val="21"/>
+        </w:rPr>
+        <w:t xml:space="preserve">Schema tariffario</w:t>
+      </w:r>
+      <w:r>
+        <w:rPr>
+          <w:rFonts w:ascii="Arial" w:cs="Arial" w:eastAsia="Arial" w:hAnsi="Arial"/>
+          <w:color w:val="1B2118"/>
+          <w:sz w:val="21"/>
+          <w:szCs w:val="21"/>
+        </w:rPr>
+        <w:t xml:space="preserve">: le tariffe massime pubblicate (registrazione, emissione e vendita dei crediti);</w:t>
+      </w:r>
+    </w:p>
+    <w:p>
+      <w:pPr>
+        <w:pStyle w:val="ListParagraph"/>
+        <w:numPr>
+          <w:ilvl w:val="0"/>
+          <w:numId w:val="2"/>
+        </w:numPr>
+        <w:spacing w:after="70" w:line="290"/>
+      </w:pPr>
+      <w:r>
+        <w:rPr>
+          <w:rFonts w:ascii="Arial" w:cs="Arial" w:eastAsia="Arial" w:hAnsi="Arial"/>
+          <w:b/>
+          <w:bCs/>
+          <w:color w:val="1B2118"/>
+          <w:sz w:val="21"/>
+          <w:szCs w:val="21"/>
+        </w:rPr>
+        <w:t xml:space="preserve">Solo i costi indicati sotto</w:t>
+      </w:r>
+      <w:r>
+        <w:rPr>
+          <w:rFonts w:ascii="Arial" w:cs="Arial" w:eastAsia="Arial" w:hAnsi="Arial"/>
+          <w:color w:val="1B2118"/>
+          <w:sz w:val="21"/>
+          <w:szCs w:val="21"/>
+        </w:rPr>
+        <w:t xml:space="preserve">.</w:t>
+      </w:r>
+    </w:p>
+    <w:p>
+      <w:pPr>
+        <w:spacing w:after="140" w:line="300"/>
+      </w:pPr>
+      <w:r>
+        <w:rPr>
+          <w:rFonts w:ascii="Arial" w:cs="Arial" w:eastAsia="Arial" w:hAnsi="Arial"/>
+          <w:color w:val="1B2118"/>
+          <w:sz w:val="21"/>
+          <w:szCs w:val="21"/>
+        </w:rPr>
+        <w:t xml:space="preserve">In tutti i casi potete aggiungere il costo dell'ente di validazione (una tantum), della verifica annuale e altri costi annui. Per ogni anno compaiono crediti, valore, ricavi, partecipazione al Programma, consulenza, ente, altri costi, costi totali, margine e cumulato; in alto ricavi (con l'intervallo minimo-massimo), costi, margine netto con l'anno di rientro e </w:t>
+      </w:r>
+      <w:r>
+        <w:rPr>
+          <w:rFonts w:ascii="Arial" w:cs="Arial" w:eastAsia="Arial" w:hAnsi="Arial"/>
+          <w:b/>
+          <w:bCs/>
+          <w:color w:val="1B2118"/>
+          <w:sz w:val="21"/>
+          <w:szCs w:val="21"/>
+        </w:rPr>
+        <w:t xml:space="preserve">costo e ricavo per abitante</w:t>
+      </w:r>
+      <w:r>
+        <w:rPr>
+          <w:rFonts w:ascii="Arial" w:cs="Arial" w:eastAsia="Arial" w:hAnsi="Arial"/>
+          <w:color w:val="1B2118"/>
+          <w:sz w:val="21"/>
+          <w:szCs w:val="21"/>
+        </w:rPr>
+        <w:t xml:space="preserve"> nel periodo. È una stima indicativa, non un piano finanziario.</w:t>
+      </w:r>
+    </w:p>
+    <w:p>
+      <w:pPr>
+        <w:pBdr>
+          <w:left w:val="single" w:color="2F5D3A" w:sz="18" w:space="8"/>
+        </w:pBdr>
+        <w:shd w:fill="E4EDE1" w:color="auto" w:val="clear"/>
+        <w:spacing w:after="140" w:line="300"/>
+        <w:ind w:left="240"/>
+      </w:pPr>
+      <w:r>
+        <w:rPr>
+          <w:rFonts w:ascii="Arial" w:cs="Arial" w:eastAsia="Arial" w:hAnsi="Arial"/>
+          <w:b/>
+          <w:bCs/>
+          <w:color w:val="1B2118"/>
+          <w:sz w:val="21"/>
+          <w:szCs w:val="21"/>
+        </w:rPr>
+        <w:t xml:space="preserve">Da sapere.</w:t>
+      </w:r>
+      <w:r>
+        <w:rPr>
+          <w:rFonts w:ascii="Arial" w:cs="Arial" w:eastAsia="Arial" w:hAnsi="Arial"/>
+          <w:color w:val="1B2118"/>
+          <w:sz w:val="21"/>
+          <w:szCs w:val="21"/>
+        </w:rPr>
+        <w:t xml:space="preserve"> Per un Comune piccolo le voci fisse dei contratti (registrazioni del Progetto e del Rapporto) pesano molto: nei contratti EsaCom i Comuni sono aggregati in un unico progetto (154.247 abitanti). Inoltre il simulatore stima meno crediti per abitante dell'Allegato A del contratto EsaCom, perché lavora sui totali del Comune e non per singola utenza: il metodo di stima va allineato.</w:t>
+      </w:r>
+    </w:p>
+    <w:p>
+      <w:pPr>
+        <w:spacing w:after="120"/>
+      </w:pPr>
     </w:p>
     <w:p>
       <w:pPr>
@@ -38665,7 +39026,7 @@
         <w:szCs w:val="16"/>
       </w:rPr>
       <w:tab/>
-      <w:t xml:space="preserve">Manuale Amministratore · Rev. 2.4 · 19/10/2026</w:t>
+      <w:t xml:space="preserve">Manuale Amministratore · Rev. 2.5 · 19/10/2026</w:t>
     </w:r>
   </w:p>
 </w:hdr>
@@ -38730,7 +39091,7 @@
         <w:szCs w:val="16"/>
       </w:rPr>
       <w:tab/>
-      <w:t xml:space="preserve">Manuale Amministratore · Rev. 2.4 · 19/10/2026</w:t>
+      <w:t xml:space="preserve">Manuale Amministratore · Rev. 2.5 · 19/10/2026</w:t>
     </w:r>
   </w:p>
 </w:hdr>

</xml_diff>

<commit_message>
Simulatore: valore del credito digitato anno per anno, proposto 32 €; documenti aggiornati
Co-Authored-By: Claude Opus 5.5 <noreply@anthropic.com>
Claude-Session: https://claude.ai/code/session_01E8XCbEeVHWVP3hntUZ6kZ1
</commit_message>
<xml_diff>
--- a/public/documentazione/Manuale_Amministratore_Portale_CWP.docx
+++ b/public/documentazione/Manuale_Amministratore_Portale_CWP.docx
@@ -302,7 +302,7 @@
                 <w:sz w:val="20"/>
                 <w:szCs w:val="20"/>
               </w:rPr>
-              <w:t xml:space="preserve">Rev. 2.5</w:t>
+              <w:t xml:space="preserve">Rev. 2.6</w:t>
             </w:r>
           </w:p>
         </w:tc>
@@ -719,7 +719,7 @@
                 <w:sz w:val="18"/>
                 <w:szCs w:val="18"/>
               </w:rPr>
-              <w:t xml:space="preserve">2.5</w:t>
+              <w:t xml:space="preserve">2.6</w:t>
             </w:r>
           </w:p>
         </w:tc>
@@ -783,7 +783,7 @@
                 <w:sz w:val="18"/>
                 <w:szCs w:val="18"/>
               </w:rPr>
-              <w:t xml:space="preserve">Simulatore: simulazione economica con valore unitario del credito e costi per il Comune (contratti tipo della Fondazione, Schema tariffario).</w:t>
+              <w:t xml:space="preserve">Simulatore: valore del credito anno per anno, proposto 32 €.</w:t>
             </w:r>
           </w:p>
         </w:tc>
@@ -853,7 +853,7 @@
                 <w:sz w:val="18"/>
                 <w:szCs w:val="18"/>
               </w:rPr>
-              <w:t xml:space="preserve">2.4</w:t>
+              <w:t xml:space="preserve">2.5</w:t>
             </w:r>
           </w:p>
         </w:tc>
@@ -919,7 +919,7 @@
                 <w:sz w:val="18"/>
                 <w:szCs w:val="18"/>
               </w:rPr>
-              <w:t xml:space="preserve">Simulatore: riferimento sempre alla soglia del 65% di differenziata e controllo dei valori fuori scala.</w:t>
+              <w:t xml:space="preserve">Simulatore: simulazione economica con valore unitario del credito e costi per il Comune (contratti tipo della Fondazione, Schema tariffario).</w:t>
             </w:r>
           </w:p>
         </w:tc>
@@ -989,7 +989,7 @@
                 <w:sz w:val="18"/>
                 <w:szCs w:val="18"/>
               </w:rPr>
-              <w:t xml:space="preserve">2.3</w:t>
+              <w:t xml:space="preserve">2.4</w:t>
             </w:r>
           </w:p>
         </w:tc>
@@ -1053,7 +1053,7 @@
                 <w:sz w:val="18"/>
                 <w:szCs w:val="18"/>
               </w:rPr>
-              <w:t xml:space="preserve">Simulatore conforme al modello CWP: scenario di riferimento dello Standard 4.8.1, situazione attuale, conformità.</w:t>
+              <w:t xml:space="preserve">Simulatore: riferimento sempre alla soglia del 65% di differenziata e controllo dei valori fuori scala.</w:t>
             </w:r>
           </w:p>
         </w:tc>
@@ -1123,7 +1123,7 @@
                 <w:sz w:val="18"/>
                 <w:szCs w:val="18"/>
               </w:rPr>
-              <w:t xml:space="preserve">2.2</w:t>
+              <w:t xml:space="preserve">2.3</w:t>
             </w:r>
           </w:p>
         </w:tc>
@@ -1189,7 +1189,7 @@
                 <w:sz w:val="18"/>
                 <w:szCs w:val="18"/>
               </w:rPr>
-              <w:t xml:space="preserve">Nuovo capitolo «Simulatore di scenari»: creazione, anno base, obiettivi annui, risultati, modello di stima.</w:t>
+              <w:t xml:space="preserve">Simulatore conforme al modello CWP: scenario di riferimento dello Standard 4.8.1, situazione attuale, conformità.</w:t>
             </w:r>
           </w:p>
         </w:tc>
@@ -1259,7 +1259,7 @@
                 <w:sz w:val="18"/>
                 <w:szCs w:val="18"/>
               </w:rPr>
-              <w:t xml:space="preserve">2.1</w:t>
+              <w:t xml:space="preserve">2.2</w:t>
             </w:r>
           </w:p>
         </w:tc>
@@ -1323,7 +1323,7 @@
                 <w:sz w:val="18"/>
                 <w:szCs w:val="18"/>
               </w:rPr>
-              <w:t xml:space="preserve">Funzioni in arrivo: simulatore di scenari (7, 10 o 21 anni, obiettivi annui, % di differenziata e crediti stimati) e assistente virtuale (Claude).</w:t>
+              <w:t xml:space="preserve">Nuovo capitolo «Simulatore di scenari»: creazione, anno base, obiettivi annui, risultati, modello di stima.</w:t>
             </w:r>
           </w:p>
         </w:tc>
@@ -1393,7 +1393,7 @@
                 <w:sz w:val="18"/>
                 <w:szCs w:val="18"/>
               </w:rPr>
-              <w:t xml:space="preserve">2.0</w:t>
+              <w:t xml:space="preserve">2.1</w:t>
             </w:r>
           </w:p>
         </w:tc>
@@ -1459,7 +1459,7 @@
                 <w:sz w:val="18"/>
                 <w:szCs w:val="18"/>
               </w:rPr>
-              <w:t xml:space="preserve">Copie di sicurezza e ripristino: rimando alle Istruzioni di ripristino e punti essenziali (capitolo Manutenzione ed emergenze).</w:t>
+              <w:t xml:space="preserve">Funzioni in arrivo: simulatore di scenari (7, 10 o 21 anni, obiettivi annui, % di differenziata e crediti stimati) e assistente virtuale (Claude).</w:t>
             </w:r>
           </w:p>
         </w:tc>
@@ -1529,7 +1529,7 @@
                 <w:sz w:val="18"/>
                 <w:szCs w:val="18"/>
               </w:rPr>
-              <w:t xml:space="preserve">1.9</w:t>
+              <w:t xml:space="preserve">2.0</w:t>
             </w:r>
           </w:p>
         </w:tc>
@@ -1593,7 +1593,7 @@
                 <w:sz w:val="18"/>
                 <w:szCs w:val="18"/>
               </w:rPr>
-              <w:t xml:space="preserve">Fondazione Operate soggetto promotore del programma (esclusiva conferita da Wastelab).</w:t>
+              <w:t xml:space="preserve">Copie di sicurezza e ripristino: rimando alle Istruzioni di ripristino e punti essenziali (capitolo Manutenzione ed emergenze).</w:t>
             </w:r>
           </w:p>
         </w:tc>
@@ -1663,7 +1663,7 @@
                 <w:sz w:val="18"/>
                 <w:szCs w:val="18"/>
               </w:rPr>
-              <w:t xml:space="preserve">1.8</w:t>
+              <w:t xml:space="preserve">1.9</w:t>
             </w:r>
           </w:p>
         </w:tc>
@@ -1729,7 +1729,7 @@
                 <w:sz w:val="18"/>
                 <w:szCs w:val="18"/>
               </w:rPr>
-              <w:t xml:space="preserve">PEC del Programma e documenti ufficiali già pubblicati sulla pagina pubblica.</w:t>
+              <w:t xml:space="preserve">Fondazione Operate soggetto promotore del programma (esclusiva conferita da Wastelab).</w:t>
             </w:r>
           </w:p>
         </w:tc>
@@ -1799,7 +1799,7 @@
                 <w:sz w:val="18"/>
                 <w:szCs w:val="18"/>
               </w:rPr>
-              <w:t xml:space="preserve">1.7</w:t>
+              <w:t xml:space="preserve">1.8</w:t>
             </w:r>
           </w:p>
         </w:tc>
@@ -1831,7 +1831,7 @@
                 <w:sz w:val="18"/>
                 <w:szCs w:val="18"/>
               </w:rPr>
-              <w:t xml:space="preserve">18/10/2026</w:t>
+              <w:t xml:space="preserve">19/10/2026</w:t>
             </w:r>
           </w:p>
         </w:tc>
@@ -1863,7 +1863,7 @@
                 <w:sz w:val="18"/>
                 <w:szCs w:val="18"/>
               </w:rPr>
-              <w:t xml:space="preserve">Allineamento ai documenti ufficiali del Programma (script 22-24): Rapporto a 7 fasi, feedback pubblico, stati del Programma, dati del progetto e territorio ISTAT, ritiro e rientro, account unico e delegati, registri, tariffe e sospensione, accuratezza e accertamenti, informazioni del Programma e metodologie, modelli pubblici; nuovi capitoli Crediti emessi, Reclami, Pagina pubblica; qualità dei dati nel calcolo.</w:t>
+              <w:t xml:space="preserve">PEC del Programma e documenti ufficiali già pubblicati sulla pagina pubblica.</w:t>
             </w:r>
           </w:p>
         </w:tc>
@@ -1933,7 +1933,7 @@
                 <w:sz w:val="18"/>
                 <w:szCs w:val="18"/>
               </w:rPr>
-              <w:t xml:space="preserve">1.6</w:t>
+              <w:t xml:space="preserve">1.7</w:t>
             </w:r>
           </w:p>
         </w:tc>
@@ -1999,7 +1999,7 @@
                 <w:sz w:val="18"/>
                 <w:szCs w:val="18"/>
               </w:rPr>
-              <w:t xml:space="preserve">Calcolo crediti: descrizione corretta del buffer (somma delle voci delle Tabelle 15 e 16, più il 20% con le sole utenze virtuose, al massimo 80%).</w:t>
+              <w:t xml:space="preserve">Allineamento ai documenti ufficiali del Programma (script 22-24): Rapporto a 7 fasi, feedback pubblico, stati del Programma, dati del progetto e territorio ISTAT, ritiro e rientro, account unico e delegati, registri, tariffe e sospensione, accuratezza e accertamenti, informazioni del Programma e metodologie, modelli pubblici; nuovi capitoli Crediti emessi, Reclami, Pagina pubblica; qualità dei dati nel calcolo.</w:t>
             </w:r>
           </w:p>
         </w:tc>
@@ -2069,7 +2069,7 @@
                 <w:sz w:val="18"/>
                 <w:szCs w:val="18"/>
               </w:rPr>
-              <w:t xml:space="preserve">1.5</w:t>
+              <w:t xml:space="preserve">1.6</w:t>
             </w:r>
           </w:p>
         </w:tc>
@@ -2133,7 +2133,7 @@
                 <w:sz w:val="18"/>
                 <w:szCs w:val="18"/>
               </w:rPr>
-              <w:t xml:space="preserve">Nuova pagina Anagrafiche (Organizzazioni ed Enti, anche per gli Operatori); Rapporti con 4 fasi e durate proprie; documenti richiesti per fase; consultazione con documento bloccato, osservazioni numerate e motivazione; conservazione per 10 anni; fascicolo con riepilogo PDF e nuove cartelle.</w:t>
+              <w:t xml:space="preserve">Calcolo crediti: descrizione corretta del buffer (somma delle voci delle Tabelle 15 e 16, più il 20% con le sole utenze virtuose, al massimo 80%).</w:t>
             </w:r>
           </w:p>
         </w:tc>
@@ -2203,7 +2203,7 @@
                 <w:sz w:val="18"/>
                 <w:szCs w:val="18"/>
               </w:rPr>
-              <w:t xml:space="preserve">1.4</w:t>
+              <w:t xml:space="preserve">1.5</w:t>
             </w:r>
           </w:p>
         </w:tc>
@@ -2269,7 +2269,7 @@
                 <w:sz w:val="18"/>
                 <w:szCs w:val="18"/>
               </w:rPr>
-              <w:t xml:space="preserve">Calcolo crediti: il risultato si azzera quando cambiano dati o Banca Dati Utenze, conferma solo dopo un nuovo «Calcola». Gestione utenti: password temporanea di almeno 10 caratteri con lettere e numeri, creazione annullata se non va a buon fine, nessun accesso ai dati prima del cambio password.</w:t>
+              <w:t xml:space="preserve">Nuova pagina Anagrafiche (Organizzazioni ed Enti, anche per gli Operatori); Rapporti con 4 fasi e durate proprie; documenti richiesti per fase; consultazione con documento bloccato, osservazioni numerate e motivazione; conservazione per 10 anni; fascicolo con riepilogo PDF e nuove cartelle.</w:t>
             </w:r>
           </w:p>
         </w:tc>
@@ -2339,7 +2339,7 @@
                 <w:sz w:val="18"/>
                 <w:szCs w:val="18"/>
               </w:rPr>
-              <w:t xml:space="preserve">1.3</w:t>
+              <w:t xml:space="preserve">1.4</w:t>
             </w:r>
           </w:p>
         </w:tc>
@@ -2403,7 +2403,7 @@
                 <w:sz w:val="18"/>
                 <w:szCs w:val="18"/>
               </w:rPr>
-              <w:t xml:space="preserve">Rapporto di calcolo in PDF, archiviazione nella pratica, numero di registro, registro dei crediti.</w:t>
+              <w:t xml:space="preserve">Calcolo crediti: il risultato si azzera quando cambiano dati o Banca Dati Utenze, conferma solo dopo un nuovo «Calcola». Gestione utenti: password temporanea di almeno 10 caratteri con lettere e numeri, creazione annullata se non va a buon fine, nessun accesso ai dati prima del cambio password.</w:t>
             </w:r>
           </w:p>
         </w:tc>
@@ -2473,7 +2473,7 @@
                 <w:sz w:val="18"/>
                 <w:szCs w:val="18"/>
               </w:rPr>
-              <w:t xml:space="preserve">1.2</w:t>
+              <w:t xml:space="preserve">1.3</w:t>
             </w:r>
           </w:p>
         </w:tc>
@@ -2539,7 +2539,7 @@
                 <w:sz w:val="18"/>
                 <w:szCs w:val="18"/>
               </w:rPr>
-              <w:t xml:space="preserve">Calcolo crediti: importare il tracciato nel calcolo (dai documenti della pratica o dal computer), singole letture, blocco dei dati personali, controlli di coerenza.</w:t>
+              <w:t xml:space="preserve">Rapporto di calcolo in PDF, archiviazione nella pratica, numero di registro, registro dei crediti.</w:t>
             </w:r>
           </w:p>
         </w:tc>
@@ -2609,7 +2609,7 @@
                 <w:sz w:val="18"/>
                 <w:szCs w:val="18"/>
               </w:rPr>
-              <w:t xml:space="preserve">1.1</w:t>
+              <w:t xml:space="preserve">1.2</w:t>
             </w:r>
           </w:p>
         </w:tc>
@@ -2673,7 +2673,7 @@
                 <w:sz w:val="18"/>
                 <w:szCs w:val="18"/>
               </w:rPr>
-              <w:t xml:space="preserve">Note di fase, Ente di Validazione della pratica, consultazione sulla pagina pubblica con conferma dell'email, moderazione con autori e allegati, errata corrige; nuovo capitolo Messaggi con il Comune; pagamenti visibili al Comune; Impostazioni: Enti di Validazione e Modelli di documento; notifiche aggiornate.</w:t>
+              <w:t xml:space="preserve">Calcolo crediti: importare il tracciato nel calcolo (dai documenti della pratica o dal computer), singole letture, blocco dei dati personali, controlli di coerenza.</w:t>
             </w:r>
           </w:p>
         </w:tc>
@@ -2743,6 +2743,142 @@
                 <w:sz w:val="18"/>
                 <w:szCs w:val="18"/>
               </w:rPr>
+              <w:t xml:space="preserve">1.1</w:t>
+            </w:r>
+          </w:p>
+        </w:tc>
+        <w:tc>
+          <w:tcPr>
+            <w:tcW w:type="dxa" w:w="1300"/>
+            <w:tcBorders>
+              <w:top w:val="single" w:color="D9D4C5" w:sz="4"/>
+              <w:left w:val="single" w:color="D9D4C5" w:sz="4"/>
+              <w:bottom w:val="single" w:color="D9D4C5" w:sz="4"/>
+              <w:right w:val="single" w:color="D9D4C5" w:sz="4"/>
+            </w:tcBorders>
+            <w:shd w:fill="F6F4EE" w:color="auto" w:val="clear"/>
+            <w:tcMar>
+              <w:top w:type="dxa" w:w="70"/>
+              <w:left w:type="dxa" w:w="110"/>
+              <w:bottom w:type="dxa" w:w="70"/>
+              <w:right w:type="dxa" w:w="110"/>
+            </w:tcMar>
+            <w:vAlign w:val="center"/>
+          </w:tcPr>
+          <w:p>
+            <w:pPr>
+              <w:spacing w:after="0" w:before="0"/>
+            </w:pPr>
+            <w:r>
+              <w:rPr>
+                <w:rFonts w:ascii="Arial" w:cs="Arial" w:eastAsia="Arial" w:hAnsi="Arial"/>
+                <w:color w:val="1B2118"/>
+                <w:sz w:val="18"/>
+                <w:szCs w:val="18"/>
+              </w:rPr>
+              <w:t xml:space="preserve">18/10/2026</w:t>
+            </w:r>
+          </w:p>
+        </w:tc>
+        <w:tc>
+          <w:tcPr>
+            <w:tcW w:type="dxa" w:w="5538"/>
+            <w:tcBorders>
+              <w:top w:val="single" w:color="D9D4C5" w:sz="4"/>
+              <w:left w:val="single" w:color="D9D4C5" w:sz="4"/>
+              <w:bottom w:val="single" w:color="D9D4C5" w:sz="4"/>
+              <w:right w:val="single" w:color="D9D4C5" w:sz="4"/>
+            </w:tcBorders>
+            <w:shd w:fill="F6F4EE" w:color="auto" w:val="clear"/>
+            <w:tcMar>
+              <w:top w:type="dxa" w:w="70"/>
+              <w:left w:type="dxa" w:w="110"/>
+              <w:bottom w:type="dxa" w:w="70"/>
+              <w:right w:type="dxa" w:w="110"/>
+            </w:tcMar>
+            <w:vAlign w:val="center"/>
+          </w:tcPr>
+          <w:p>
+            <w:pPr>
+              <w:spacing w:after="0" w:before="0"/>
+            </w:pPr>
+            <w:r>
+              <w:rPr>
+                <w:rFonts w:ascii="Arial" w:cs="Arial" w:eastAsia="Arial" w:hAnsi="Arial"/>
+                <w:color w:val="1B2118"/>
+                <w:sz w:val="18"/>
+                <w:szCs w:val="18"/>
+              </w:rPr>
+              <w:t xml:space="preserve">Note di fase, Ente di Validazione della pratica, consultazione sulla pagina pubblica con conferma dell'email, moderazione con autori e allegati, errata corrige; nuovo capitolo Messaggi con il Comune; pagamenti visibili al Comune; Impostazioni: Enti di Validazione e Modelli di documento; notifiche aggiornate.</w:t>
+            </w:r>
+          </w:p>
+        </w:tc>
+        <w:tc>
+          <w:tcPr>
+            <w:tcW w:type="dxa" w:w="2000"/>
+            <w:tcBorders>
+              <w:top w:val="single" w:color="D9D4C5" w:sz="4"/>
+              <w:left w:val="single" w:color="D9D4C5" w:sz="4"/>
+              <w:bottom w:val="single" w:color="D9D4C5" w:sz="4"/>
+              <w:right w:val="single" w:color="D9D4C5" w:sz="4"/>
+            </w:tcBorders>
+            <w:shd w:fill="F6F4EE" w:color="auto" w:val="clear"/>
+            <w:tcMar>
+              <w:top w:type="dxa" w:w="70"/>
+              <w:left w:type="dxa" w:w="110"/>
+              <w:bottom w:type="dxa" w:w="70"/>
+              <w:right w:type="dxa" w:w="110"/>
+            </w:tcMar>
+            <w:vAlign w:val="center"/>
+          </w:tcPr>
+          <w:p>
+            <w:pPr>
+              <w:spacing w:after="0" w:before="0"/>
+            </w:pPr>
+            <w:r>
+              <w:rPr>
+                <w:rFonts w:ascii="Arial" w:cs="Arial" w:eastAsia="Arial" w:hAnsi="Arial"/>
+                <w:color w:val="1B2118"/>
+                <w:sz w:val="18"/>
+                <w:szCs w:val="18"/>
+              </w:rPr>
+              <w:t xml:space="preserve">Fondazione Operate</w:t>
+            </w:r>
+          </w:p>
+        </w:tc>
+      </w:tr>
+      <w:tr>
+        <w:trPr>
+          <w:cantSplit/>
+        </w:trPr>
+        <w:tc>
+          <w:tcPr>
+            <w:tcW w:type="dxa" w:w="800"/>
+            <w:tcBorders>
+              <w:top w:val="single" w:color="D9D4C5" w:sz="4"/>
+              <w:left w:val="single" w:color="D9D4C5" w:sz="4"/>
+              <w:bottom w:val="single" w:color="D9D4C5" w:sz="4"/>
+              <w:right w:val="single" w:color="D9D4C5" w:sz="4"/>
+            </w:tcBorders>
+            <w:tcMar>
+              <w:top w:type="dxa" w:w="70"/>
+              <w:left w:type="dxa" w:w="110"/>
+              <w:bottom w:type="dxa" w:w="70"/>
+              <w:right w:type="dxa" w:w="110"/>
+            </w:tcMar>
+            <w:vAlign w:val="center"/>
+          </w:tcPr>
+          <w:p>
+            <w:pPr>
+              <w:spacing w:after="0" w:before="0"/>
+            </w:pPr>
+            <w:r>
+              <w:rPr>
+                <w:rFonts w:ascii="Arial" w:cs="Arial" w:eastAsia="Arial" w:hAnsi="Arial"/>
+                <w:color w:val="1B2118"/>
+                <w:sz w:val="18"/>
+                <w:szCs w:val="18"/>
+              </w:rPr>
               <w:t xml:space="preserve">1.0</w:t>
             </w:r>
           </w:p>
@@ -2756,7 +2892,6 @@
               <w:bottom w:val="single" w:color="D9D4C5" w:sz="4"/>
               <w:right w:val="single" w:color="D9D4C5" w:sz="4"/>
             </w:tcBorders>
-            <w:shd w:fill="F6F4EE" w:color="auto" w:val="clear"/>
             <w:tcMar>
               <w:top w:type="dxa" w:w="70"/>
               <w:left w:type="dxa" w:w="110"/>
@@ -2789,7 +2924,6 @@
               <w:bottom w:val="single" w:color="D9D4C5" w:sz="4"/>
               <w:right w:val="single" w:color="D9D4C5" w:sz="4"/>
             </w:tcBorders>
-            <w:shd w:fill="F6F4EE" w:color="auto" w:val="clear"/>
             <w:tcMar>
               <w:top w:type="dxa" w:w="70"/>
               <w:left w:type="dxa" w:w="110"/>
@@ -2822,7 +2956,6 @@
               <w:bottom w:val="single" w:color="D9D4C5" w:sz="4"/>
               <w:right w:val="single" w:color="D9D4C5" w:sz="4"/>
             </w:tcBorders>
-            <w:shd w:fill="F6F4EE" w:color="auto" w:val="clear"/>
             <w:tcMar>
               <w:top w:type="dxa" w:w="70"/>
               <w:left w:type="dxa" w:w="110"/>
@@ -2864,7 +2997,7 @@
           <w:sz w:val="20"/>
           <w:szCs w:val="20"/>
         </w:rPr>
-        <w:t xml:space="preserve">Questo documento descrive il portale alla revisione 2.5 del 19/10/2026. A ogni modifica del portale il manuale viene aggiornato e la revisione incrementata; la versione corrente si scarica dall'area Documentazione del portale (solo Amministratori).</w:t>
+        <w:t xml:space="preserve">Questo documento descrive il portale alla revisione 2.6 del 19/10/2026. A ogni modifica del portale il manuale viene aggiornato e la revisione incrementata; la versione corrente si scarica dall'area Documentazione del portale (solo Amministratori).</w:t>
       </w:r>
     </w:p>
     <w:p>
@@ -5444,7 +5577,7 @@
         </w:rPr>
         <w:t xml:space="preserve">Si accede da </w:t>
       </w:r>
-      <w:hyperlink w:history="1" r:id="rIdc2oqtgvudh1trpkgvrta-">
+      <w:hyperlink w:history="1" r:id="rIdmna-f8uqfcve8xvigojef">
         <w:r>
           <w:rPr>
             <w:rFonts w:ascii="Arial" w:cs="Arial" w:eastAsia="Arial" w:hAnsi="Arial"/>
@@ -32878,27 +33011,87 @@
           <w:sz w:val="21"/>
           <w:szCs w:val="21"/>
         </w:rPr>
-        <w:t xml:space="preserve"> Digitate il </w:t>
-      </w:r>
-      <w:r>
-        <w:rPr>
-          <w:rFonts w:ascii="Arial" w:cs="Arial" w:eastAsia="Arial" w:hAnsi="Arial"/>
-          <w:b/>
-          <w:bCs/>
-          <w:color w:val="1B2118"/>
-          <w:sz w:val="21"/>
-          <w:szCs w:val="21"/>
-        </w:rPr>
-        <w:t xml:space="preserve">valore unitario del credito</w:t>
-      </w:r>
-      <w:r>
-        <w:rPr>
-          <w:rFonts w:ascii="Arial" w:cs="Arial" w:eastAsia="Arial" w:hAnsi="Arial"/>
-          <w:color w:val="1B2118"/>
-          <w:sz w:val="21"/>
-          <w:szCs w:val="21"/>
-        </w:rPr>
-        <w:t xml:space="preserve"> (€ per credito; un credito è una tonnellata di CO₂eq) e, se volete, un valore minimo e uno massimo (scenario peggiore e migliore, come nell'Allegato A del contratto tipo) e la variazione annua del valore. Poi scegliete i </w:t>
+        <w:t xml:space="preserve"> Il </w:t>
+      </w:r>
+      <w:r>
+        <w:rPr>
+          <w:rFonts w:ascii="Arial" w:cs="Arial" w:eastAsia="Arial" w:hAnsi="Arial"/>
+          <w:b/>
+          <w:bCs/>
+          <w:color w:val="1B2118"/>
+          <w:sz w:val="21"/>
+          <w:szCs w:val="21"/>
+        </w:rPr>
+        <w:t xml:space="preserve">valore del credito</w:t>
+      </w:r>
+      <w:r>
+        <w:rPr>
+          <w:rFonts w:ascii="Arial" w:cs="Arial" w:eastAsia="Arial" w:hAnsi="Arial"/>
+          <w:color w:val="1B2118"/>
+          <w:sz w:val="21"/>
+          <w:szCs w:val="21"/>
+        </w:rPr>
+        <w:t xml:space="preserve"> (€ per credito; un credito è una tonnellata di CO₂eq) si digita </w:t>
+      </w:r>
+      <w:r>
+        <w:rPr>
+          <w:rFonts w:ascii="Arial" w:cs="Arial" w:eastAsia="Arial" w:hAnsi="Arial"/>
+          <w:b/>
+          <w:bCs/>
+          <w:color w:val="1B2118"/>
+          <w:sz w:val="21"/>
+          <w:szCs w:val="21"/>
+        </w:rPr>
+        <w:t xml:space="preserve">anno per anno</w:t>
+      </w:r>
+      <w:r>
+        <w:rPr>
+          <w:rFonts w:ascii="Arial" w:cs="Arial" w:eastAsia="Arial" w:hAnsi="Arial"/>
+          <w:color w:val="1B2118"/>
+          <w:sz w:val="21"/>
+          <w:szCs w:val="21"/>
+        </w:rPr>
+        <w:t xml:space="preserve"> nella colonna «Valore» della tabella. Il portale propone </w:t>
+      </w:r>
+      <w:r>
+        <w:rPr>
+          <w:rFonts w:ascii="Arial" w:cs="Arial" w:eastAsia="Arial" w:hAnsi="Arial"/>
+          <w:b/>
+          <w:bCs/>
+          <w:color w:val="1B2118"/>
+          <w:sz w:val="21"/>
+          <w:szCs w:val="21"/>
+        </w:rPr>
+        <w:t xml:space="preserve">32 €</w:t>
+      </w:r>
+      <w:r>
+        <w:rPr>
+          <w:rFonts w:ascii="Arial" w:cs="Arial" w:eastAsia="Arial" w:hAnsi="Arial"/>
+          <w:color w:val="1B2118"/>
+          <w:sz w:val="21"/>
+          <w:szCs w:val="21"/>
+        </w:rPr>
+        <w:t xml:space="preserve">: per compilare tutti gli anni insieme indicate il valore proposto e, se volete, una variazione annua, poi premete </w:t>
+      </w:r>
+      <w:r>
+        <w:rPr>
+          <w:rFonts w:ascii="Arial" w:cs="Arial" w:eastAsia="Arial" w:hAnsi="Arial"/>
+          <w:b/>
+          <w:bCs/>
+          <w:color w:val="1B2118"/>
+          <w:sz w:val="21"/>
+          <w:szCs w:val="21"/>
+        </w:rPr>
+        <w:t xml:space="preserve">Applica a tutti gli anni</w:t>
+      </w:r>
+      <w:r>
+        <w:rPr>
+          <w:rFonts w:ascii="Arial" w:cs="Arial" w:eastAsia="Arial" w:hAnsi="Arial"/>
+          <w:color w:val="1B2118"/>
+          <w:sz w:val="21"/>
+          <w:szCs w:val="21"/>
+        </w:rPr>
+        <w:t xml:space="preserve">; correggete poi i singoli anni. Poi scegliete i </w:t>
       </w:r>
       <w:r>
         <w:rPr>
@@ -33022,7 +33215,7 @@
           <w:sz w:val="21"/>
           <w:szCs w:val="21"/>
         </w:rPr>
-        <w:t xml:space="preserve">In tutti i casi potete aggiungere il costo dell'ente di validazione (una tantum), della verifica annuale e altri costi annui. Per ogni anno compaiono crediti, valore, ricavi, partecipazione al Programma, consulenza, ente, altri costi, costi totali, margine e cumulato; in alto ricavi (con l'intervallo minimo-massimo), costi, margine netto con l'anno di rientro e </w:t>
+        <w:t xml:space="preserve">In tutti i casi potete aggiungere il costo dell'ente di validazione (una tantum), della verifica annuale e altri costi annui. Per ogni anno compaiono crediti, valore, ricavi, partecipazione al Programma, consulenza, ente, altri costi, costi totali, margine e cumulato; in alto ricavi, costi, margine netto con l'anno di rientro e </w:t>
       </w:r>
       <w:r>
         <w:rPr>
@@ -39026,7 +39219,7 @@
         <w:szCs w:val="16"/>
       </w:rPr>
       <w:tab/>
-      <w:t xml:space="preserve">Manuale Amministratore · Rev. 2.5 · 19/10/2026</w:t>
+      <w:t xml:space="preserve">Manuale Amministratore · Rev. 2.6 · 19/10/2026</w:t>
     </w:r>
   </w:p>
 </w:hdr>
@@ -39091,7 +39284,7 @@
         <w:szCs w:val="16"/>
       </w:rPr>
       <w:tab/>
-      <w:t xml:space="preserve">Manuale Amministratore · Rev. 2.5 · 19/10/2026</w:t>
+      <w:t xml:space="preserve">Manuale Amministratore · Rev. 2.6 · 19/10/2026</w:t>
     </w:r>
   </w:p>
 </w:hdr>

</xml_diff>

<commit_message>
Simulatore: costi per il Comune secondo Caso 1 (progetto volontario) o Caso 2 (progetto da bando), tabelle del 28/07/2026; manuali e registro aggiornati
Co-Authored-By: Claude Opus 5.5 <noreply@anthropic.com>
Claude-Session: https://claude.ai/code/session_01E8XCbEeVHWVP3hntUZ6kZ1
</commit_message>
<xml_diff>
--- a/public/documentazione/Manuale_Amministratore_Portale_CWP.docx
+++ b/public/documentazione/Manuale_Amministratore_Portale_CWP.docx
@@ -302,7 +302,7 @@
                 <w:sz w:val="20"/>
                 <w:szCs w:val="20"/>
               </w:rPr>
-              <w:t xml:space="preserve">Rev. 2.6</w:t>
+              <w:t xml:space="preserve">Rev. 2.7</w:t>
             </w:r>
           </w:p>
         </w:tc>
@@ -719,7 +719,7 @@
                 <w:sz w:val="18"/>
                 <w:szCs w:val="18"/>
               </w:rPr>
-              <w:t xml:space="preserve">2.6</w:t>
+              <w:t xml:space="preserve">2.7</w:t>
             </w:r>
           </w:p>
         </w:tc>
@@ -783,7 +783,7 @@
                 <w:sz w:val="18"/>
                 <w:szCs w:val="18"/>
               </w:rPr>
-              <w:t xml:space="preserve">Simulatore: valore del credito anno per anno, proposto 32 €.</w:t>
+              <w:t xml:space="preserve">Simulatore: costi per il Comune secondo il Caso 1 (progetto volontario) o il Caso 2 (progetto obbligatorio da bando).</w:t>
             </w:r>
           </w:p>
         </w:tc>
@@ -853,7 +853,7 @@
                 <w:sz w:val="18"/>
                 <w:szCs w:val="18"/>
               </w:rPr>
-              <w:t xml:space="preserve">2.5</w:t>
+              <w:t xml:space="preserve">2.6</w:t>
             </w:r>
           </w:p>
         </w:tc>
@@ -919,7 +919,7 @@
                 <w:sz w:val="18"/>
                 <w:szCs w:val="18"/>
               </w:rPr>
-              <w:t xml:space="preserve">Simulatore: simulazione economica con valore unitario del credito e costi per il Comune (contratti tipo della Fondazione, Schema tariffario).</w:t>
+              <w:t xml:space="preserve">Simulatore: valore del credito anno per anno, proposto 32 €.</w:t>
             </w:r>
           </w:p>
         </w:tc>
@@ -989,7 +989,7 @@
                 <w:sz w:val="18"/>
                 <w:szCs w:val="18"/>
               </w:rPr>
-              <w:t xml:space="preserve">2.4</w:t>
+              <w:t xml:space="preserve">2.5</w:t>
             </w:r>
           </w:p>
         </w:tc>
@@ -1053,7 +1053,7 @@
                 <w:sz w:val="18"/>
                 <w:szCs w:val="18"/>
               </w:rPr>
-              <w:t xml:space="preserve">Simulatore: riferimento sempre alla soglia del 65% di differenziata e controllo dei valori fuori scala.</w:t>
+              <w:t xml:space="preserve">Simulatore: simulazione economica con valore unitario del credito e costi per il Comune (contratti tipo della Fondazione, Schema tariffario).</w:t>
             </w:r>
           </w:p>
         </w:tc>
@@ -1123,7 +1123,7 @@
                 <w:sz w:val="18"/>
                 <w:szCs w:val="18"/>
               </w:rPr>
-              <w:t xml:space="preserve">2.3</w:t>
+              <w:t xml:space="preserve">2.4</w:t>
             </w:r>
           </w:p>
         </w:tc>
@@ -1189,7 +1189,7 @@
                 <w:sz w:val="18"/>
                 <w:szCs w:val="18"/>
               </w:rPr>
-              <w:t xml:space="preserve">Simulatore conforme al modello CWP: scenario di riferimento dello Standard 4.8.1, situazione attuale, conformità.</w:t>
+              <w:t xml:space="preserve">Simulatore: riferimento sempre alla soglia del 65% di differenziata e controllo dei valori fuori scala.</w:t>
             </w:r>
           </w:p>
         </w:tc>
@@ -1259,7 +1259,7 @@
                 <w:sz w:val="18"/>
                 <w:szCs w:val="18"/>
               </w:rPr>
-              <w:t xml:space="preserve">2.2</w:t>
+              <w:t xml:space="preserve">2.3</w:t>
             </w:r>
           </w:p>
         </w:tc>
@@ -1323,7 +1323,7 @@
                 <w:sz w:val="18"/>
                 <w:szCs w:val="18"/>
               </w:rPr>
-              <w:t xml:space="preserve">Nuovo capitolo «Simulatore di scenari»: creazione, anno base, obiettivi annui, risultati, modello di stima.</w:t>
+              <w:t xml:space="preserve">Simulatore conforme al modello CWP: scenario di riferimento dello Standard 4.8.1, situazione attuale, conformità.</w:t>
             </w:r>
           </w:p>
         </w:tc>
@@ -1393,7 +1393,7 @@
                 <w:sz w:val="18"/>
                 <w:szCs w:val="18"/>
               </w:rPr>
-              <w:t xml:space="preserve">2.1</w:t>
+              <w:t xml:space="preserve">2.2</w:t>
             </w:r>
           </w:p>
         </w:tc>
@@ -1459,7 +1459,7 @@
                 <w:sz w:val="18"/>
                 <w:szCs w:val="18"/>
               </w:rPr>
-              <w:t xml:space="preserve">Funzioni in arrivo: simulatore di scenari (7, 10 o 21 anni, obiettivi annui, % di differenziata e crediti stimati) e assistente virtuale (Claude).</w:t>
+              <w:t xml:space="preserve">Nuovo capitolo «Simulatore di scenari»: creazione, anno base, obiettivi annui, risultati, modello di stima.</w:t>
             </w:r>
           </w:p>
         </w:tc>
@@ -1529,7 +1529,7 @@
                 <w:sz w:val="18"/>
                 <w:szCs w:val="18"/>
               </w:rPr>
-              <w:t xml:space="preserve">2.0</w:t>
+              <w:t xml:space="preserve">2.1</w:t>
             </w:r>
           </w:p>
         </w:tc>
@@ -1593,7 +1593,7 @@
                 <w:sz w:val="18"/>
                 <w:szCs w:val="18"/>
               </w:rPr>
-              <w:t xml:space="preserve">Copie di sicurezza e ripristino: rimando alle Istruzioni di ripristino e punti essenziali (capitolo Manutenzione ed emergenze).</w:t>
+              <w:t xml:space="preserve">Funzioni in arrivo: simulatore di scenari (7, 10 o 21 anni, obiettivi annui, % di differenziata e crediti stimati) e assistente virtuale (Claude).</w:t>
             </w:r>
           </w:p>
         </w:tc>
@@ -1663,7 +1663,7 @@
                 <w:sz w:val="18"/>
                 <w:szCs w:val="18"/>
               </w:rPr>
-              <w:t xml:space="preserve">1.9</w:t>
+              <w:t xml:space="preserve">2.0</w:t>
             </w:r>
           </w:p>
         </w:tc>
@@ -1729,7 +1729,7 @@
                 <w:sz w:val="18"/>
                 <w:szCs w:val="18"/>
               </w:rPr>
-              <w:t xml:space="preserve">Fondazione Operate soggetto promotore del programma (esclusiva conferita da Wastelab).</w:t>
+              <w:t xml:space="preserve">Copie di sicurezza e ripristino: rimando alle Istruzioni di ripristino e punti essenziali (capitolo Manutenzione ed emergenze).</w:t>
             </w:r>
           </w:p>
         </w:tc>
@@ -1799,7 +1799,7 @@
                 <w:sz w:val="18"/>
                 <w:szCs w:val="18"/>
               </w:rPr>
-              <w:t xml:space="preserve">1.8</w:t>
+              <w:t xml:space="preserve">1.9</w:t>
             </w:r>
           </w:p>
         </w:tc>
@@ -1863,7 +1863,7 @@
                 <w:sz w:val="18"/>
                 <w:szCs w:val="18"/>
               </w:rPr>
-              <w:t xml:space="preserve">PEC del Programma e documenti ufficiali già pubblicati sulla pagina pubblica.</w:t>
+              <w:t xml:space="preserve">Fondazione Operate soggetto promotore del programma (esclusiva conferita da Wastelab).</w:t>
             </w:r>
           </w:p>
         </w:tc>
@@ -1933,7 +1933,7 @@
                 <w:sz w:val="18"/>
                 <w:szCs w:val="18"/>
               </w:rPr>
-              <w:t xml:space="preserve">1.7</w:t>
+              <w:t xml:space="preserve">1.8</w:t>
             </w:r>
           </w:p>
         </w:tc>
@@ -1966,7 +1966,7 @@
                 <w:sz w:val="18"/>
                 <w:szCs w:val="18"/>
               </w:rPr>
-              <w:t xml:space="preserve">18/10/2026</w:t>
+              <w:t xml:space="preserve">19/10/2026</w:t>
             </w:r>
           </w:p>
         </w:tc>
@@ -1999,7 +1999,7 @@
                 <w:sz w:val="18"/>
                 <w:szCs w:val="18"/>
               </w:rPr>
-              <w:t xml:space="preserve">Allineamento ai documenti ufficiali del Programma (script 22-24): Rapporto a 7 fasi, feedback pubblico, stati del Programma, dati del progetto e territorio ISTAT, ritiro e rientro, account unico e delegati, registri, tariffe e sospensione, accuratezza e accertamenti, informazioni del Programma e metodologie, modelli pubblici; nuovi capitoli Crediti emessi, Reclami, Pagina pubblica; qualità dei dati nel calcolo.</w:t>
+              <w:t xml:space="preserve">PEC del Programma e documenti ufficiali già pubblicati sulla pagina pubblica.</w:t>
             </w:r>
           </w:p>
         </w:tc>
@@ -2069,7 +2069,7 @@
                 <w:sz w:val="18"/>
                 <w:szCs w:val="18"/>
               </w:rPr>
-              <w:t xml:space="preserve">1.6</w:t>
+              <w:t xml:space="preserve">1.7</w:t>
             </w:r>
           </w:p>
         </w:tc>
@@ -2133,7 +2133,7 @@
                 <w:sz w:val="18"/>
                 <w:szCs w:val="18"/>
               </w:rPr>
-              <w:t xml:space="preserve">Calcolo crediti: descrizione corretta del buffer (somma delle voci delle Tabelle 15 e 16, più il 20% con le sole utenze virtuose, al massimo 80%).</w:t>
+              <w:t xml:space="preserve">Allineamento ai documenti ufficiali del Programma (script 22-24): Rapporto a 7 fasi, feedback pubblico, stati del Programma, dati del progetto e territorio ISTAT, ritiro e rientro, account unico e delegati, registri, tariffe e sospensione, accuratezza e accertamenti, informazioni del Programma e metodologie, modelli pubblici; nuovi capitoli Crediti emessi, Reclami, Pagina pubblica; qualità dei dati nel calcolo.</w:t>
             </w:r>
           </w:p>
         </w:tc>
@@ -2203,7 +2203,7 @@
                 <w:sz w:val="18"/>
                 <w:szCs w:val="18"/>
               </w:rPr>
-              <w:t xml:space="preserve">1.5</w:t>
+              <w:t xml:space="preserve">1.6</w:t>
             </w:r>
           </w:p>
         </w:tc>
@@ -2269,7 +2269,7 @@
                 <w:sz w:val="18"/>
                 <w:szCs w:val="18"/>
               </w:rPr>
-              <w:t xml:space="preserve">Nuova pagina Anagrafiche (Organizzazioni ed Enti, anche per gli Operatori); Rapporti con 4 fasi e durate proprie; documenti richiesti per fase; consultazione con documento bloccato, osservazioni numerate e motivazione; conservazione per 10 anni; fascicolo con riepilogo PDF e nuove cartelle.</w:t>
+              <w:t xml:space="preserve">Calcolo crediti: descrizione corretta del buffer (somma delle voci delle Tabelle 15 e 16, più il 20% con le sole utenze virtuose, al massimo 80%).</w:t>
             </w:r>
           </w:p>
         </w:tc>
@@ -2339,7 +2339,7 @@
                 <w:sz w:val="18"/>
                 <w:szCs w:val="18"/>
               </w:rPr>
-              <w:t xml:space="preserve">1.4</w:t>
+              <w:t xml:space="preserve">1.5</w:t>
             </w:r>
           </w:p>
         </w:tc>
@@ -2403,7 +2403,7 @@
                 <w:sz w:val="18"/>
                 <w:szCs w:val="18"/>
               </w:rPr>
-              <w:t xml:space="preserve">Calcolo crediti: il risultato si azzera quando cambiano dati o Banca Dati Utenze, conferma solo dopo un nuovo «Calcola». Gestione utenti: password temporanea di almeno 10 caratteri con lettere e numeri, creazione annullata se non va a buon fine, nessun accesso ai dati prima del cambio password.</w:t>
+              <w:t xml:space="preserve">Nuova pagina Anagrafiche (Organizzazioni ed Enti, anche per gli Operatori); Rapporti con 4 fasi e durate proprie; documenti richiesti per fase; consultazione con documento bloccato, osservazioni numerate e motivazione; conservazione per 10 anni; fascicolo con riepilogo PDF e nuove cartelle.</w:t>
             </w:r>
           </w:p>
         </w:tc>
@@ -2473,7 +2473,7 @@
                 <w:sz w:val="18"/>
                 <w:szCs w:val="18"/>
               </w:rPr>
-              <w:t xml:space="preserve">1.3</w:t>
+              <w:t xml:space="preserve">1.4</w:t>
             </w:r>
           </w:p>
         </w:tc>
@@ -2539,7 +2539,7 @@
                 <w:sz w:val="18"/>
                 <w:szCs w:val="18"/>
               </w:rPr>
-              <w:t xml:space="preserve">Rapporto di calcolo in PDF, archiviazione nella pratica, numero di registro, registro dei crediti.</w:t>
+              <w:t xml:space="preserve">Calcolo crediti: il risultato si azzera quando cambiano dati o Banca Dati Utenze, conferma solo dopo un nuovo «Calcola». Gestione utenti: password temporanea di almeno 10 caratteri con lettere e numeri, creazione annullata se non va a buon fine, nessun accesso ai dati prima del cambio password.</w:t>
             </w:r>
           </w:p>
         </w:tc>
@@ -2609,7 +2609,7 @@
                 <w:sz w:val="18"/>
                 <w:szCs w:val="18"/>
               </w:rPr>
-              <w:t xml:space="preserve">1.2</w:t>
+              <w:t xml:space="preserve">1.3</w:t>
             </w:r>
           </w:p>
         </w:tc>
@@ -2673,7 +2673,7 @@
                 <w:sz w:val="18"/>
                 <w:szCs w:val="18"/>
               </w:rPr>
-              <w:t xml:space="preserve">Calcolo crediti: importare il tracciato nel calcolo (dai documenti della pratica o dal computer), singole letture, blocco dei dati personali, controlli di coerenza.</w:t>
+              <w:t xml:space="preserve">Rapporto di calcolo in PDF, archiviazione nella pratica, numero di registro, registro dei crediti.</w:t>
             </w:r>
           </w:p>
         </w:tc>
@@ -2743,7 +2743,7 @@
                 <w:sz w:val="18"/>
                 <w:szCs w:val="18"/>
               </w:rPr>
-              <w:t xml:space="preserve">1.1</w:t>
+              <w:t xml:space="preserve">1.2</w:t>
             </w:r>
           </w:p>
         </w:tc>
@@ -2809,7 +2809,7 @@
                 <w:sz w:val="18"/>
                 <w:szCs w:val="18"/>
               </w:rPr>
-              <w:t xml:space="preserve">Note di fase, Ente di Validazione della pratica, consultazione sulla pagina pubblica con conferma dell'email, moderazione con autori e allegati, errata corrige; nuovo capitolo Messaggi con il Comune; pagamenti visibili al Comune; Impostazioni: Enti di Validazione e Modelli di documento; notifiche aggiornate.</w:t>
+              <w:t xml:space="preserve">Calcolo crediti: importare il tracciato nel calcolo (dai documenti della pratica o dal computer), singole letture, blocco dei dati personali, controlli di coerenza.</w:t>
             </w:r>
           </w:p>
         </w:tc>
@@ -2879,6 +2879,140 @@
                 <w:sz w:val="18"/>
                 <w:szCs w:val="18"/>
               </w:rPr>
+              <w:t xml:space="preserve">1.1</w:t>
+            </w:r>
+          </w:p>
+        </w:tc>
+        <w:tc>
+          <w:tcPr>
+            <w:tcW w:type="dxa" w:w="1300"/>
+            <w:tcBorders>
+              <w:top w:val="single" w:color="D9D4C5" w:sz="4"/>
+              <w:left w:val="single" w:color="D9D4C5" w:sz="4"/>
+              <w:bottom w:val="single" w:color="D9D4C5" w:sz="4"/>
+              <w:right w:val="single" w:color="D9D4C5" w:sz="4"/>
+            </w:tcBorders>
+            <w:tcMar>
+              <w:top w:type="dxa" w:w="70"/>
+              <w:left w:type="dxa" w:w="110"/>
+              <w:bottom w:type="dxa" w:w="70"/>
+              <w:right w:type="dxa" w:w="110"/>
+            </w:tcMar>
+            <w:vAlign w:val="center"/>
+          </w:tcPr>
+          <w:p>
+            <w:pPr>
+              <w:spacing w:after="0" w:before="0"/>
+            </w:pPr>
+            <w:r>
+              <w:rPr>
+                <w:rFonts w:ascii="Arial" w:cs="Arial" w:eastAsia="Arial" w:hAnsi="Arial"/>
+                <w:color w:val="1B2118"/>
+                <w:sz w:val="18"/>
+                <w:szCs w:val="18"/>
+              </w:rPr>
+              <w:t xml:space="preserve">18/10/2026</w:t>
+            </w:r>
+          </w:p>
+        </w:tc>
+        <w:tc>
+          <w:tcPr>
+            <w:tcW w:type="dxa" w:w="5538"/>
+            <w:tcBorders>
+              <w:top w:val="single" w:color="D9D4C5" w:sz="4"/>
+              <w:left w:val="single" w:color="D9D4C5" w:sz="4"/>
+              <w:bottom w:val="single" w:color="D9D4C5" w:sz="4"/>
+              <w:right w:val="single" w:color="D9D4C5" w:sz="4"/>
+            </w:tcBorders>
+            <w:tcMar>
+              <w:top w:type="dxa" w:w="70"/>
+              <w:left w:type="dxa" w:w="110"/>
+              <w:bottom w:type="dxa" w:w="70"/>
+              <w:right w:type="dxa" w:w="110"/>
+            </w:tcMar>
+            <w:vAlign w:val="center"/>
+          </w:tcPr>
+          <w:p>
+            <w:pPr>
+              <w:spacing w:after="0" w:before="0"/>
+            </w:pPr>
+            <w:r>
+              <w:rPr>
+                <w:rFonts w:ascii="Arial" w:cs="Arial" w:eastAsia="Arial" w:hAnsi="Arial"/>
+                <w:color w:val="1B2118"/>
+                <w:sz w:val="18"/>
+                <w:szCs w:val="18"/>
+              </w:rPr>
+              <w:t xml:space="preserve">Note di fase, Ente di Validazione della pratica, consultazione sulla pagina pubblica con conferma dell'email, moderazione con autori e allegati, errata corrige; nuovo capitolo Messaggi con il Comune; pagamenti visibili al Comune; Impostazioni: Enti di Validazione e Modelli di documento; notifiche aggiornate.</w:t>
+            </w:r>
+          </w:p>
+        </w:tc>
+        <w:tc>
+          <w:tcPr>
+            <w:tcW w:type="dxa" w:w="2000"/>
+            <w:tcBorders>
+              <w:top w:val="single" w:color="D9D4C5" w:sz="4"/>
+              <w:left w:val="single" w:color="D9D4C5" w:sz="4"/>
+              <w:bottom w:val="single" w:color="D9D4C5" w:sz="4"/>
+              <w:right w:val="single" w:color="D9D4C5" w:sz="4"/>
+            </w:tcBorders>
+            <w:tcMar>
+              <w:top w:type="dxa" w:w="70"/>
+              <w:left w:type="dxa" w:w="110"/>
+              <w:bottom w:type="dxa" w:w="70"/>
+              <w:right w:type="dxa" w:w="110"/>
+            </w:tcMar>
+            <w:vAlign w:val="center"/>
+          </w:tcPr>
+          <w:p>
+            <w:pPr>
+              <w:spacing w:after="0" w:before="0"/>
+            </w:pPr>
+            <w:r>
+              <w:rPr>
+                <w:rFonts w:ascii="Arial" w:cs="Arial" w:eastAsia="Arial" w:hAnsi="Arial"/>
+                <w:color w:val="1B2118"/>
+                <w:sz w:val="18"/>
+                <w:szCs w:val="18"/>
+              </w:rPr>
+              <w:t xml:space="preserve">Fondazione Operate</w:t>
+            </w:r>
+          </w:p>
+        </w:tc>
+      </w:tr>
+      <w:tr>
+        <w:trPr>
+          <w:cantSplit/>
+        </w:trPr>
+        <w:tc>
+          <w:tcPr>
+            <w:tcW w:type="dxa" w:w="800"/>
+            <w:tcBorders>
+              <w:top w:val="single" w:color="D9D4C5" w:sz="4"/>
+              <w:left w:val="single" w:color="D9D4C5" w:sz="4"/>
+              <w:bottom w:val="single" w:color="D9D4C5" w:sz="4"/>
+              <w:right w:val="single" w:color="D9D4C5" w:sz="4"/>
+            </w:tcBorders>
+            <w:shd w:fill="F6F4EE" w:color="auto" w:val="clear"/>
+            <w:tcMar>
+              <w:top w:type="dxa" w:w="70"/>
+              <w:left w:type="dxa" w:w="110"/>
+              <w:bottom w:type="dxa" w:w="70"/>
+              <w:right w:type="dxa" w:w="110"/>
+            </w:tcMar>
+            <w:vAlign w:val="center"/>
+          </w:tcPr>
+          <w:p>
+            <w:pPr>
+              <w:spacing w:after="0" w:before="0"/>
+            </w:pPr>
+            <w:r>
+              <w:rPr>
+                <w:rFonts w:ascii="Arial" w:cs="Arial" w:eastAsia="Arial" w:hAnsi="Arial"/>
+                <w:color w:val="1B2118"/>
+                <w:sz w:val="18"/>
+                <w:szCs w:val="18"/>
+              </w:rPr>
               <w:t xml:space="preserve">1.0</w:t>
             </w:r>
           </w:p>
@@ -2892,6 +3026,7 @@
               <w:bottom w:val="single" w:color="D9D4C5" w:sz="4"/>
               <w:right w:val="single" w:color="D9D4C5" w:sz="4"/>
             </w:tcBorders>
+            <w:shd w:fill="F6F4EE" w:color="auto" w:val="clear"/>
             <w:tcMar>
               <w:top w:type="dxa" w:w="70"/>
               <w:left w:type="dxa" w:w="110"/>
@@ -2924,6 +3059,7 @@
               <w:bottom w:val="single" w:color="D9D4C5" w:sz="4"/>
               <w:right w:val="single" w:color="D9D4C5" w:sz="4"/>
             </w:tcBorders>
+            <w:shd w:fill="F6F4EE" w:color="auto" w:val="clear"/>
             <w:tcMar>
               <w:top w:type="dxa" w:w="70"/>
               <w:left w:type="dxa" w:w="110"/>
@@ -2956,6 +3092,7 @@
               <w:bottom w:val="single" w:color="D9D4C5" w:sz="4"/>
               <w:right w:val="single" w:color="D9D4C5" w:sz="4"/>
             </w:tcBorders>
+            <w:shd w:fill="F6F4EE" w:color="auto" w:val="clear"/>
             <w:tcMar>
               <w:top w:type="dxa" w:w="70"/>
               <w:left w:type="dxa" w:w="110"/>
@@ -2997,7 +3134,7 @@
           <w:sz w:val="20"/>
           <w:szCs w:val="20"/>
         </w:rPr>
-        <w:t xml:space="preserve">Questo documento descrive il portale alla revisione 2.6 del 19/10/2026. A ogni modifica del portale il manuale viene aggiornato e la revisione incrementata; la versione corrente si scarica dall'area Documentazione del portale (solo Amministratori).</w:t>
+        <w:t xml:space="preserve">Questo documento descrive il portale alla revisione 2.7 del 19/10/2026. A ogni modifica del portale il manuale viene aggiornato e la revisione incrementata; la versione corrente si scarica dall'area Documentazione del portale (solo Amministratori).</w:t>
       </w:r>
     </w:p>
     <w:p>
@@ -5577,7 +5714,7 @@
         </w:rPr>
         <w:t xml:space="preserve">Si accede da </w:t>
       </w:r>
-      <w:hyperlink w:history="1" r:id="rIdmna-f8uqfcve8xvigojef">
+      <w:hyperlink w:history="1" r:id="rIdszoj4vvh3jnqjv1o6neh4">
         <w:r>
           <w:rPr>
             <w:rFonts w:ascii="Arial" w:cs="Arial" w:eastAsia="Arial" w:hAnsi="Arial"/>
@@ -33091,27 +33228,27 @@
           <w:sz w:val="21"/>
           <w:szCs w:val="21"/>
         </w:rPr>
-        <w:t xml:space="preserve">; correggete poi i singoli anni. Poi scegliete i </w:t>
-      </w:r>
-      <w:r>
-        <w:rPr>
-          <w:rFonts w:ascii="Arial" w:cs="Arial" w:eastAsia="Arial" w:hAnsi="Arial"/>
-          <w:b/>
-          <w:bCs/>
-          <w:color w:val="1B2118"/>
-          <w:sz w:val="21"/>
-          <w:szCs w:val="21"/>
-        </w:rPr>
-        <w:t xml:space="preserve">costi a carico del Comune o del gestore</w:t>
-      </w:r>
-      <w:r>
-        <w:rPr>
-          <w:rFonts w:ascii="Arial" w:cs="Arial" w:eastAsia="Arial" w:hAnsi="Arial"/>
-          <w:color w:val="1B2118"/>
-          <w:sz w:val="21"/>
-          <w:szCs w:val="21"/>
-        </w:rPr>
-        <w:t xml:space="preserve"> (IVA esclusa):</w:t>
+        <w:t xml:space="preserve">; correggete poi i singoli anni. Poi il simulatore chiede: </w:t>
+      </w:r>
+      <w:r>
+        <w:rPr>
+          <w:rFonts w:ascii="Arial" w:cs="Arial" w:eastAsia="Arial" w:hAnsi="Arial"/>
+          <w:b/>
+          <w:bCs/>
+          <w:color w:val="1B2118"/>
+          <w:sz w:val="21"/>
+          <w:szCs w:val="21"/>
+        </w:rPr>
+        <w:t xml:space="preserve">«Simulare i costi in base al Caso 1 o al Caso 2?»</w:t>
+      </w:r>
+      <w:r>
+        <w:rPr>
+          <w:rFonts w:ascii="Arial" w:cs="Arial" w:eastAsia="Arial" w:hAnsi="Arial"/>
+          <w:color w:val="1B2118"/>
+          <w:sz w:val="21"/>
+          <w:szCs w:val="21"/>
+        </w:rPr>
+        <w:t xml:space="preserve">. Sono le tabelle «Costi per il Soggetto Promotore» di Fondazione Operate (28/07/2026), IVA esclusa, per progetti di 10 anni:</w:t>
       </w:r>
     </w:p>
     <w:p>
@@ -33132,16 +33269,16 @@
           <w:sz w:val="21"/>
           <w:szCs w:val="21"/>
         </w:rPr>
-        <w:t xml:space="preserve">Contratti tipo della Fondazione</w:t>
-      </w:r>
-      <w:r>
-        <w:rPr>
-          <w:rFonts w:ascii="Arial" w:cs="Arial" w:eastAsia="Arial" w:hAnsi="Arial"/>
-          <w:color w:val="1B2118"/>
-          <w:sz w:val="21"/>
-          <w:szCs w:val="21"/>
-        </w:rPr>
-        <w:t xml:space="preserve"> (predefinito): le voci del contratto di partecipazione al Programma (registrazione del Progetto, dei crediti del Progetto, del Rapporto di Monitoraggio e dei crediti del Rapporto) e del contratto di consulenza (redazione del Progetto e del Rapporto), per ogni anno del periodo, con i valori delle bozze EsaCom del 15/10/2026; le voci «per abitante» si moltiplicano per la popolazione del Comune e tutte si possono modificare;</w:t>
+        <w:t xml:space="preserve">Caso 1 – Progetto volontario</w:t>
+      </w:r>
+      <w:r>
+        <w:rPr>
+          <w:rFonts w:ascii="Arial" w:cs="Arial" w:eastAsia="Arial" w:hAnsi="Arial"/>
+          <w:color w:val="1B2118"/>
+          <w:sz w:val="21"/>
+          <w:szCs w:val="21"/>
+        </w:rPr>
+        <w:t xml:space="preserve">: il Comune o il gestore aderisce di propria iniziativa;</w:t>
       </w:r>
     </w:p>
     <w:p>
@@ -33162,6 +33299,114 @@
           <w:sz w:val="21"/>
           <w:szCs w:val="21"/>
         </w:rPr>
+        <w:t xml:space="preserve">Caso 2 – Progetto obbligatorio</w:t>
+      </w:r>
+      <w:r>
+        <w:rPr>
+          <w:rFonts w:ascii="Arial" w:cs="Arial" w:eastAsia="Arial" w:hAnsi="Arial"/>
+          <w:color w:val="1B2118"/>
+          <w:sz w:val="21"/>
+          <w:szCs w:val="21"/>
+        </w:rPr>
+        <w:t xml:space="preserve">: il progetto arriva da un bando di gara di un Comune che ha inserito il CWP come metodo; le tariffe sono più alte.</w:t>
+      </w:r>
+    </w:p>
+    <w:p>
+      <w:pPr>
+        <w:spacing w:after="140" w:line="300"/>
+      </w:pPr>
+      <w:r>
+        <w:rPr>
+          <w:rFonts w:ascii="Arial" w:cs="Arial" w:eastAsia="Arial" w:hAnsi="Arial"/>
+          <w:color w:val="1B2118"/>
+          <w:sz w:val="21"/>
+          <w:szCs w:val="21"/>
+        </w:rPr>
+        <w:t xml:space="preserve">Per ogni attività (Progetto, Rapporto di Monitoraggio, registrazione del Progetto, dei crediti del Progetto, del Rapporto e dei crediti del Rapporto) il portale calcola il costo per abitante in base alla popolazione: valori fissi fino a 5.000 abitanti e oltre 100.000, </w:t>
+      </w:r>
+      <w:r>
+        <w:rPr>
+          <w:rFonts w:ascii="Arial" w:cs="Arial" w:eastAsia="Arial" w:hAnsi="Arial"/>
+          <w:b/>
+          <w:bCs/>
+          <w:color w:val="1B2118"/>
+          <w:sz w:val="21"/>
+          <w:szCs w:val="21"/>
+        </w:rPr>
+        <w:t xml:space="preserve">interpolati</w:t>
+      </w:r>
+      <w:r>
+        <w:rPr>
+          <w:rFonts w:ascii="Arial" w:cs="Arial" w:eastAsia="Arial" w:hAnsi="Arial"/>
+          <w:color w:val="1B2118"/>
+          <w:sz w:val="21"/>
+          <w:szCs w:val="21"/>
+        </w:rPr>
+        <w:t xml:space="preserve"> tra 5.000 e 20.000 e tra 20.000 e 100.000 abitanti, arrotondati per eccesso al centesimo. Il costo annuo è il costo per abitante × la popolazione, mai sotto il </w:t>
+      </w:r>
+      <w:r>
+        <w:rPr>
+          <w:rFonts w:ascii="Arial" w:cs="Arial" w:eastAsia="Arial" w:hAnsi="Arial"/>
+          <w:b/>
+          <w:bCs/>
+          <w:color w:val="1B2118"/>
+          <w:sz w:val="21"/>
+          <w:szCs w:val="21"/>
+        </w:rPr>
+        <w:t xml:space="preserve">minimo</w:t>
+      </w:r>
+      <w:r>
+        <w:rPr>
+          <w:rFonts w:ascii="Arial" w:cs="Arial" w:eastAsia="Arial" w:hAnsi="Arial"/>
+          <w:color w:val="1B2118"/>
+          <w:sz w:val="21"/>
+          <w:szCs w:val="21"/>
+        </w:rPr>
+        <w:t xml:space="preserve"> né sopra il </w:t>
+      </w:r>
+      <w:r>
+        <w:rPr>
+          <w:rFonts w:ascii="Arial" w:cs="Arial" w:eastAsia="Arial" w:hAnsi="Arial"/>
+          <w:b/>
+          <w:bCs/>
+          <w:color w:val="1B2118"/>
+          <w:sz w:val="21"/>
+          <w:szCs w:val="21"/>
+        </w:rPr>
+        <w:t xml:space="preserve">massimo</w:t>
+      </w:r>
+      <w:r>
+        <w:rPr>
+          <w:rFonts w:ascii="Arial" w:cs="Arial" w:eastAsia="Arial" w:hAnsi="Arial"/>
+          <w:color w:val="1B2118"/>
+          <w:sz w:val="21"/>
+          <w:szCs w:val="21"/>
+        </w:rPr>
+        <w:t xml:space="preserve"> annuo della tabella. Le voci una tantum sono già ammortizzate in 10 anni, quindi si pagano ogni anno. Una tabella mostra le sei voci con € per abitante, € all'anno e il totale annuo. Le tabelle non comprendono la validazione dell'ente. Per progetti di durata diversa da 10 anni compare un avviso: i costi vanno computati a parte.</w:t>
+      </w:r>
+    </w:p>
+    <w:p>
+      <w:pPr>
+        <w:spacing w:after="140" w:line="300"/>
+      </w:pPr>
+      <w:r>
+        <w:rPr>
+          <w:rFonts w:ascii="Arial" w:cs="Arial" w:eastAsia="Arial" w:hAnsi="Arial"/>
+          <w:color w:val="1B2118"/>
+          <w:sz w:val="21"/>
+          <w:szCs w:val="21"/>
+        </w:rPr>
+        <w:t xml:space="preserve">In alternativa si può scegliere lo </w:t>
+      </w:r>
+      <w:r>
+        <w:rPr>
+          <w:rFonts w:ascii="Arial" w:cs="Arial" w:eastAsia="Arial" w:hAnsi="Arial"/>
+          <w:b/>
+          <w:bCs/>
+          <w:color w:val="1B2118"/>
+          <w:sz w:val="21"/>
+          <w:szCs w:val="21"/>
+        </w:rPr>
         <w:t xml:space="preserve">Schema tariffario</w:t>
       </w:r>
       <w:r>
@@ -33171,28 +33416,18 @@
           <w:sz w:val="21"/>
           <w:szCs w:val="21"/>
         </w:rPr>
-        <w:t xml:space="preserve">: le tariffe massime pubblicate (registrazione, emissione e vendita dei crediti);</w:t>
-      </w:r>
-    </w:p>
-    <w:p>
-      <w:pPr>
-        <w:pStyle w:val="ListParagraph"/>
-        <w:numPr>
-          <w:ilvl w:val="0"/>
-          <w:numId w:val="2"/>
-        </w:numPr>
-        <w:spacing w:after="70" w:line="290"/>
-      </w:pPr>
-      <w:r>
-        <w:rPr>
-          <w:rFonts w:ascii="Arial" w:cs="Arial" w:eastAsia="Arial" w:hAnsi="Arial"/>
-          <w:b/>
-          <w:bCs/>
-          <w:color w:val="1B2118"/>
-          <w:sz w:val="21"/>
-          <w:szCs w:val="21"/>
-        </w:rPr>
-        <w:t xml:space="preserve">Solo i costi indicati sotto</w:t>
+        <w:t xml:space="preserve"> (tariffe massime pubblicate) o </w:t>
+      </w:r>
+      <w:r>
+        <w:rPr>
+          <w:rFonts w:ascii="Arial" w:cs="Arial" w:eastAsia="Arial" w:hAnsi="Arial"/>
+          <w:b/>
+          <w:bCs/>
+          <w:color w:val="1B2118"/>
+          <w:sz w:val="21"/>
+          <w:szCs w:val="21"/>
+        </w:rPr>
+        <w:t xml:space="preserve">nessuna tariffa</w:t>
       </w:r>
       <w:r>
         <w:rPr>
@@ -33215,7 +33450,7 @@
           <w:sz w:val="21"/>
           <w:szCs w:val="21"/>
         </w:rPr>
-        <w:t xml:space="preserve">In tutti i casi potete aggiungere il costo dell'ente di validazione (una tantum), della verifica annuale e altri costi annui. Per ogni anno compaiono crediti, valore, ricavi, partecipazione al Programma, consulenza, ente, altri costi, costi totali, margine e cumulato; in alto ricavi, costi, margine netto con l'anno di rientro e </w:t>
+        <w:t xml:space="preserve">In tutti i casi potete aggiungere il costo dell'ente di validazione (una tantum), della verifica annuale e altri costi annui. Per ogni anno compaiono crediti, valore, ricavi, partecipazione al Programma (registrazioni), consulenza (redazione di Progetto e Rapporto), ente, altri costi, costi totali, margine e cumulato; in alto ricavi, costi, margine netto con l'anno di rientro e </w:t>
       </w:r>
       <w:r>
         <w:rPr>
@@ -33265,7 +33500,7 @@
           <w:sz w:val="21"/>
           <w:szCs w:val="21"/>
         </w:rPr>
-        <w:t xml:space="preserve"> Per un Comune piccolo le voci fisse dei contratti (registrazioni del Progetto e del Rapporto) pesano molto: nei contratti EsaCom i Comuni sono aggregati in un unico progetto (154.247 abitanti). Inoltre il simulatore stima meno crediti per abitante dell'Allegato A del contratto EsaCom, perché lavora sui totali del Comune e non per singola utenza: il metodo di stima va allineato.</w:t>
+        <w:t xml:space="preserve"> Con il Caso 1 e 154.247 abitanti il simulatore riproduce le cifre dei contratti tipo EsaCom. Il simulatore stima meno crediti per abitante dell'Allegato A del contratto EsaCom, perché lavora sui totali del Comune e non per singola utenza: il metodo di stima va allineato.</w:t>
       </w:r>
     </w:p>
     <w:p>
@@ -39219,7 +39454,7 @@
         <w:szCs w:val="16"/>
       </w:rPr>
       <w:tab/>
-      <w:t xml:space="preserve">Manuale Amministratore · Rev. 2.6 · 19/10/2026</w:t>
+      <w:t xml:space="preserve">Manuale Amministratore · Rev. 2.7 · 19/10/2026</w:t>
     </w:r>
   </w:p>
 </w:hdr>
@@ -39284,7 +39519,7 @@
         <w:szCs w:val="16"/>
       </w:rPr>
       <w:tab/>
-      <w:t xml:space="preserve">Manuale Amministratore · Rev. 2.6 · 19/10/2026</w:t>
+      <w:t xml:space="preserve">Manuale Amministratore · Rev. 2.7 · 19/10/2026</w:t>
     </w:r>
   </w:p>
 </w:hdr>

</xml_diff>

<commit_message>
Più Amministratori con accesso completo; Amministratore principale (luca.moretti@operate.it) protetto: script 29, pagina Utenti, manuali e registro
Co-Authored-By: Claude Opus 5.5 <noreply@anthropic.com>
Claude-Session: https://claude.ai/code/session_01E8XCbEeVHWVP3hntUZ6kZ1
</commit_message>
<xml_diff>
--- a/public/documentazione/Manuale_Amministratore_Portale_CWP.docx
+++ b/public/documentazione/Manuale_Amministratore_Portale_CWP.docx
@@ -302,7 +302,7 @@
                 <w:sz w:val="20"/>
                 <w:szCs w:val="20"/>
               </w:rPr>
-              <w:t xml:space="preserve">Rev. 2.7</w:t>
+              <w:t xml:space="preserve">Rev. 2.8</w:t>
             </w:r>
           </w:p>
         </w:tc>
@@ -719,7 +719,7 @@
                 <w:sz w:val="18"/>
                 <w:szCs w:val="18"/>
               </w:rPr>
-              <w:t xml:space="preserve">2.7</w:t>
+              <w:t xml:space="preserve">2.8</w:t>
             </w:r>
           </w:p>
         </w:tc>
@@ -783,7 +783,7 @@
                 <w:sz w:val="18"/>
                 <w:szCs w:val="18"/>
               </w:rPr>
-              <w:t xml:space="preserve">Simulatore: costi per il Comune secondo il Caso 1 (progetto volontario) o il Caso 2 (progetto obbligatorio da bando).</w:t>
+              <w:t xml:space="preserve">Più Amministratori con accesso completo; Amministratore principale protetto (script 29).</w:t>
             </w:r>
           </w:p>
         </w:tc>
@@ -853,7 +853,7 @@
                 <w:sz w:val="18"/>
                 <w:szCs w:val="18"/>
               </w:rPr>
-              <w:t xml:space="preserve">2.6</w:t>
+              <w:t xml:space="preserve">2.7</w:t>
             </w:r>
           </w:p>
         </w:tc>
@@ -919,7 +919,7 @@
                 <w:sz w:val="18"/>
                 <w:szCs w:val="18"/>
               </w:rPr>
-              <w:t xml:space="preserve">Simulatore: valore del credito anno per anno, proposto 32 €.</w:t>
+              <w:t xml:space="preserve">Simulatore: costi per il Comune secondo il Caso 1 (progetto volontario) o il Caso 2 (progetto obbligatorio da bando).</w:t>
             </w:r>
           </w:p>
         </w:tc>
@@ -989,7 +989,7 @@
                 <w:sz w:val="18"/>
                 <w:szCs w:val="18"/>
               </w:rPr>
-              <w:t xml:space="preserve">2.5</w:t>
+              <w:t xml:space="preserve">2.6</w:t>
             </w:r>
           </w:p>
         </w:tc>
@@ -1053,7 +1053,7 @@
                 <w:sz w:val="18"/>
                 <w:szCs w:val="18"/>
               </w:rPr>
-              <w:t xml:space="preserve">Simulatore: simulazione economica con valore unitario del credito e costi per il Comune (contratti tipo della Fondazione, Schema tariffario).</w:t>
+              <w:t xml:space="preserve">Simulatore: valore del credito anno per anno, proposto 32 €.</w:t>
             </w:r>
           </w:p>
         </w:tc>
@@ -1123,7 +1123,7 @@
                 <w:sz w:val="18"/>
                 <w:szCs w:val="18"/>
               </w:rPr>
-              <w:t xml:space="preserve">2.4</w:t>
+              <w:t xml:space="preserve">2.5</w:t>
             </w:r>
           </w:p>
         </w:tc>
@@ -1189,7 +1189,7 @@
                 <w:sz w:val="18"/>
                 <w:szCs w:val="18"/>
               </w:rPr>
-              <w:t xml:space="preserve">Simulatore: riferimento sempre alla soglia del 65% di differenziata e controllo dei valori fuori scala.</w:t>
+              <w:t xml:space="preserve">Simulatore: simulazione economica con valore unitario del credito e costi per il Comune (contratti tipo della Fondazione, Schema tariffario).</w:t>
             </w:r>
           </w:p>
         </w:tc>
@@ -1259,7 +1259,7 @@
                 <w:sz w:val="18"/>
                 <w:szCs w:val="18"/>
               </w:rPr>
-              <w:t xml:space="preserve">2.3</w:t>
+              <w:t xml:space="preserve">2.4</w:t>
             </w:r>
           </w:p>
         </w:tc>
@@ -1323,7 +1323,7 @@
                 <w:sz w:val="18"/>
                 <w:szCs w:val="18"/>
               </w:rPr>
-              <w:t xml:space="preserve">Simulatore conforme al modello CWP: scenario di riferimento dello Standard 4.8.1, situazione attuale, conformità.</w:t>
+              <w:t xml:space="preserve">Simulatore: riferimento sempre alla soglia del 65% di differenziata e controllo dei valori fuori scala.</w:t>
             </w:r>
           </w:p>
         </w:tc>
@@ -1393,7 +1393,7 @@
                 <w:sz w:val="18"/>
                 <w:szCs w:val="18"/>
               </w:rPr>
-              <w:t xml:space="preserve">2.2</w:t>
+              <w:t xml:space="preserve">2.3</w:t>
             </w:r>
           </w:p>
         </w:tc>
@@ -1459,7 +1459,7 @@
                 <w:sz w:val="18"/>
                 <w:szCs w:val="18"/>
               </w:rPr>
-              <w:t xml:space="preserve">Nuovo capitolo «Simulatore di scenari»: creazione, anno base, obiettivi annui, risultati, modello di stima.</w:t>
+              <w:t xml:space="preserve">Simulatore conforme al modello CWP: scenario di riferimento dello Standard 4.8.1, situazione attuale, conformità.</w:t>
             </w:r>
           </w:p>
         </w:tc>
@@ -1529,7 +1529,7 @@
                 <w:sz w:val="18"/>
                 <w:szCs w:val="18"/>
               </w:rPr>
-              <w:t xml:space="preserve">2.1</w:t>
+              <w:t xml:space="preserve">2.2</w:t>
             </w:r>
           </w:p>
         </w:tc>
@@ -1593,7 +1593,7 @@
                 <w:sz w:val="18"/>
                 <w:szCs w:val="18"/>
               </w:rPr>
-              <w:t xml:space="preserve">Funzioni in arrivo: simulatore di scenari (7, 10 o 21 anni, obiettivi annui, % di differenziata e crediti stimati) e assistente virtuale (Claude).</w:t>
+              <w:t xml:space="preserve">Nuovo capitolo «Simulatore di scenari»: creazione, anno base, obiettivi annui, risultati, modello di stima.</w:t>
             </w:r>
           </w:p>
         </w:tc>
@@ -1663,7 +1663,7 @@
                 <w:sz w:val="18"/>
                 <w:szCs w:val="18"/>
               </w:rPr>
-              <w:t xml:space="preserve">2.0</w:t>
+              <w:t xml:space="preserve">2.1</w:t>
             </w:r>
           </w:p>
         </w:tc>
@@ -1729,7 +1729,7 @@
                 <w:sz w:val="18"/>
                 <w:szCs w:val="18"/>
               </w:rPr>
-              <w:t xml:space="preserve">Copie di sicurezza e ripristino: rimando alle Istruzioni di ripristino e punti essenziali (capitolo Manutenzione ed emergenze).</w:t>
+              <w:t xml:space="preserve">Funzioni in arrivo: simulatore di scenari (7, 10 o 21 anni, obiettivi annui, % di differenziata e crediti stimati) e assistente virtuale (Claude).</w:t>
             </w:r>
           </w:p>
         </w:tc>
@@ -1799,7 +1799,7 @@
                 <w:sz w:val="18"/>
                 <w:szCs w:val="18"/>
               </w:rPr>
-              <w:t xml:space="preserve">1.9</w:t>
+              <w:t xml:space="preserve">2.0</w:t>
             </w:r>
           </w:p>
         </w:tc>
@@ -1863,7 +1863,7 @@
                 <w:sz w:val="18"/>
                 <w:szCs w:val="18"/>
               </w:rPr>
-              <w:t xml:space="preserve">Fondazione Operate soggetto promotore del programma (esclusiva conferita da Wastelab).</w:t>
+              <w:t xml:space="preserve">Copie di sicurezza e ripristino: rimando alle Istruzioni di ripristino e punti essenziali (capitolo Manutenzione ed emergenze).</w:t>
             </w:r>
           </w:p>
         </w:tc>
@@ -1933,7 +1933,7 @@
                 <w:sz w:val="18"/>
                 <w:szCs w:val="18"/>
               </w:rPr>
-              <w:t xml:space="preserve">1.8</w:t>
+              <w:t xml:space="preserve">1.9</w:t>
             </w:r>
           </w:p>
         </w:tc>
@@ -1999,7 +1999,7 @@
                 <w:sz w:val="18"/>
                 <w:szCs w:val="18"/>
               </w:rPr>
-              <w:t xml:space="preserve">PEC del Programma e documenti ufficiali già pubblicati sulla pagina pubblica.</w:t>
+              <w:t xml:space="preserve">Fondazione Operate soggetto promotore del programma (esclusiva conferita da Wastelab).</w:t>
             </w:r>
           </w:p>
         </w:tc>
@@ -2069,7 +2069,7 @@
                 <w:sz w:val="18"/>
                 <w:szCs w:val="18"/>
               </w:rPr>
-              <w:t xml:space="preserve">1.7</w:t>
+              <w:t xml:space="preserve">1.8</w:t>
             </w:r>
           </w:p>
         </w:tc>
@@ -2101,7 +2101,7 @@
                 <w:sz w:val="18"/>
                 <w:szCs w:val="18"/>
               </w:rPr>
-              <w:t xml:space="preserve">18/10/2026</w:t>
+              <w:t xml:space="preserve">19/10/2026</w:t>
             </w:r>
           </w:p>
         </w:tc>
@@ -2133,7 +2133,7 @@
                 <w:sz w:val="18"/>
                 <w:szCs w:val="18"/>
               </w:rPr>
-              <w:t xml:space="preserve">Allineamento ai documenti ufficiali del Programma (script 22-24): Rapporto a 7 fasi, feedback pubblico, stati del Programma, dati del progetto e territorio ISTAT, ritiro e rientro, account unico e delegati, registri, tariffe e sospensione, accuratezza e accertamenti, informazioni del Programma e metodologie, modelli pubblici; nuovi capitoli Crediti emessi, Reclami, Pagina pubblica; qualità dei dati nel calcolo.</w:t>
+              <w:t xml:space="preserve">PEC del Programma e documenti ufficiali già pubblicati sulla pagina pubblica.</w:t>
             </w:r>
           </w:p>
         </w:tc>
@@ -2203,7 +2203,7 @@
                 <w:sz w:val="18"/>
                 <w:szCs w:val="18"/>
               </w:rPr>
-              <w:t xml:space="preserve">1.6</w:t>
+              <w:t xml:space="preserve">1.7</w:t>
             </w:r>
           </w:p>
         </w:tc>
@@ -2269,7 +2269,7 @@
                 <w:sz w:val="18"/>
                 <w:szCs w:val="18"/>
               </w:rPr>
-              <w:t xml:space="preserve">Calcolo crediti: descrizione corretta del buffer (somma delle voci delle Tabelle 15 e 16, più il 20% con le sole utenze virtuose, al massimo 80%).</w:t>
+              <w:t xml:space="preserve">Allineamento ai documenti ufficiali del Programma (script 22-24): Rapporto a 7 fasi, feedback pubblico, stati del Programma, dati del progetto e territorio ISTAT, ritiro e rientro, account unico e delegati, registri, tariffe e sospensione, accuratezza e accertamenti, informazioni del Programma e metodologie, modelli pubblici; nuovi capitoli Crediti emessi, Reclami, Pagina pubblica; qualità dei dati nel calcolo.</w:t>
             </w:r>
           </w:p>
         </w:tc>
@@ -2339,7 +2339,7 @@
                 <w:sz w:val="18"/>
                 <w:szCs w:val="18"/>
               </w:rPr>
-              <w:t xml:space="preserve">1.5</w:t>
+              <w:t xml:space="preserve">1.6</w:t>
             </w:r>
           </w:p>
         </w:tc>
@@ -2403,7 +2403,7 @@
                 <w:sz w:val="18"/>
                 <w:szCs w:val="18"/>
               </w:rPr>
-              <w:t xml:space="preserve">Nuova pagina Anagrafiche (Organizzazioni ed Enti, anche per gli Operatori); Rapporti con 4 fasi e durate proprie; documenti richiesti per fase; consultazione con documento bloccato, osservazioni numerate e motivazione; conservazione per 10 anni; fascicolo con riepilogo PDF e nuove cartelle.</w:t>
+              <w:t xml:space="preserve">Calcolo crediti: descrizione corretta del buffer (somma delle voci delle Tabelle 15 e 16, più il 20% con le sole utenze virtuose, al massimo 80%).</w:t>
             </w:r>
           </w:p>
         </w:tc>
@@ -2473,7 +2473,7 @@
                 <w:sz w:val="18"/>
                 <w:szCs w:val="18"/>
               </w:rPr>
-              <w:t xml:space="preserve">1.4</w:t>
+              <w:t xml:space="preserve">1.5</w:t>
             </w:r>
           </w:p>
         </w:tc>
@@ -2539,7 +2539,7 @@
                 <w:sz w:val="18"/>
                 <w:szCs w:val="18"/>
               </w:rPr>
-              <w:t xml:space="preserve">Calcolo crediti: il risultato si azzera quando cambiano dati o Banca Dati Utenze, conferma solo dopo un nuovo «Calcola». Gestione utenti: password temporanea di almeno 10 caratteri con lettere e numeri, creazione annullata se non va a buon fine, nessun accesso ai dati prima del cambio password.</w:t>
+              <w:t xml:space="preserve">Nuova pagina Anagrafiche (Organizzazioni ed Enti, anche per gli Operatori); Rapporti con 4 fasi e durate proprie; documenti richiesti per fase; consultazione con documento bloccato, osservazioni numerate e motivazione; conservazione per 10 anni; fascicolo con riepilogo PDF e nuove cartelle.</w:t>
             </w:r>
           </w:p>
         </w:tc>
@@ -2609,7 +2609,7 @@
                 <w:sz w:val="18"/>
                 <w:szCs w:val="18"/>
               </w:rPr>
-              <w:t xml:space="preserve">1.3</w:t>
+              <w:t xml:space="preserve">1.4</w:t>
             </w:r>
           </w:p>
         </w:tc>
@@ -2673,7 +2673,7 @@
                 <w:sz w:val="18"/>
                 <w:szCs w:val="18"/>
               </w:rPr>
-              <w:t xml:space="preserve">Rapporto di calcolo in PDF, archiviazione nella pratica, numero di registro, registro dei crediti.</w:t>
+              <w:t xml:space="preserve">Calcolo crediti: il risultato si azzera quando cambiano dati o Banca Dati Utenze, conferma solo dopo un nuovo «Calcola». Gestione utenti: password temporanea di almeno 10 caratteri con lettere e numeri, creazione annullata se non va a buon fine, nessun accesso ai dati prima del cambio password.</w:t>
             </w:r>
           </w:p>
         </w:tc>
@@ -2743,7 +2743,7 @@
                 <w:sz w:val="18"/>
                 <w:szCs w:val="18"/>
               </w:rPr>
-              <w:t xml:space="preserve">1.2</w:t>
+              <w:t xml:space="preserve">1.3</w:t>
             </w:r>
           </w:p>
         </w:tc>
@@ -2809,7 +2809,7 @@
                 <w:sz w:val="18"/>
                 <w:szCs w:val="18"/>
               </w:rPr>
-              <w:t xml:space="preserve">Calcolo crediti: importare il tracciato nel calcolo (dai documenti della pratica o dal computer), singole letture, blocco dei dati personali, controlli di coerenza.</w:t>
+              <w:t xml:space="preserve">Rapporto di calcolo in PDF, archiviazione nella pratica, numero di registro, registro dei crediti.</w:t>
             </w:r>
           </w:p>
         </w:tc>
@@ -2879,7 +2879,7 @@
                 <w:sz w:val="18"/>
                 <w:szCs w:val="18"/>
               </w:rPr>
-              <w:t xml:space="preserve">1.1</w:t>
+              <w:t xml:space="preserve">1.2</w:t>
             </w:r>
           </w:p>
         </w:tc>
@@ -2943,7 +2943,7 @@
                 <w:sz w:val="18"/>
                 <w:szCs w:val="18"/>
               </w:rPr>
-              <w:t xml:space="preserve">Note di fase, Ente di Validazione della pratica, consultazione sulla pagina pubblica con conferma dell'email, moderazione con autori e allegati, errata corrige; nuovo capitolo Messaggi con il Comune; pagamenti visibili al Comune; Impostazioni: Enti di Validazione e Modelli di documento; notifiche aggiornate.</w:t>
+              <w:t xml:space="preserve">Calcolo crediti: importare il tracciato nel calcolo (dai documenti della pratica o dal computer), singole letture, blocco dei dati personali, controlli di coerenza.</w:t>
             </w:r>
           </w:p>
         </w:tc>
@@ -3013,6 +3013,142 @@
                 <w:sz w:val="18"/>
                 <w:szCs w:val="18"/>
               </w:rPr>
+              <w:t xml:space="preserve">1.1</w:t>
+            </w:r>
+          </w:p>
+        </w:tc>
+        <w:tc>
+          <w:tcPr>
+            <w:tcW w:type="dxa" w:w="1300"/>
+            <w:tcBorders>
+              <w:top w:val="single" w:color="D9D4C5" w:sz="4"/>
+              <w:left w:val="single" w:color="D9D4C5" w:sz="4"/>
+              <w:bottom w:val="single" w:color="D9D4C5" w:sz="4"/>
+              <w:right w:val="single" w:color="D9D4C5" w:sz="4"/>
+            </w:tcBorders>
+            <w:shd w:fill="F6F4EE" w:color="auto" w:val="clear"/>
+            <w:tcMar>
+              <w:top w:type="dxa" w:w="70"/>
+              <w:left w:type="dxa" w:w="110"/>
+              <w:bottom w:type="dxa" w:w="70"/>
+              <w:right w:type="dxa" w:w="110"/>
+            </w:tcMar>
+            <w:vAlign w:val="center"/>
+          </w:tcPr>
+          <w:p>
+            <w:pPr>
+              <w:spacing w:after="0" w:before="0"/>
+            </w:pPr>
+            <w:r>
+              <w:rPr>
+                <w:rFonts w:ascii="Arial" w:cs="Arial" w:eastAsia="Arial" w:hAnsi="Arial"/>
+                <w:color w:val="1B2118"/>
+                <w:sz w:val="18"/>
+                <w:szCs w:val="18"/>
+              </w:rPr>
+              <w:t xml:space="preserve">18/10/2026</w:t>
+            </w:r>
+          </w:p>
+        </w:tc>
+        <w:tc>
+          <w:tcPr>
+            <w:tcW w:type="dxa" w:w="5538"/>
+            <w:tcBorders>
+              <w:top w:val="single" w:color="D9D4C5" w:sz="4"/>
+              <w:left w:val="single" w:color="D9D4C5" w:sz="4"/>
+              <w:bottom w:val="single" w:color="D9D4C5" w:sz="4"/>
+              <w:right w:val="single" w:color="D9D4C5" w:sz="4"/>
+            </w:tcBorders>
+            <w:shd w:fill="F6F4EE" w:color="auto" w:val="clear"/>
+            <w:tcMar>
+              <w:top w:type="dxa" w:w="70"/>
+              <w:left w:type="dxa" w:w="110"/>
+              <w:bottom w:type="dxa" w:w="70"/>
+              <w:right w:type="dxa" w:w="110"/>
+            </w:tcMar>
+            <w:vAlign w:val="center"/>
+          </w:tcPr>
+          <w:p>
+            <w:pPr>
+              <w:spacing w:after="0" w:before="0"/>
+            </w:pPr>
+            <w:r>
+              <w:rPr>
+                <w:rFonts w:ascii="Arial" w:cs="Arial" w:eastAsia="Arial" w:hAnsi="Arial"/>
+                <w:color w:val="1B2118"/>
+                <w:sz w:val="18"/>
+                <w:szCs w:val="18"/>
+              </w:rPr>
+              <w:t xml:space="preserve">Note di fase, Ente di Validazione della pratica, consultazione sulla pagina pubblica con conferma dell'email, moderazione con autori e allegati, errata corrige; nuovo capitolo Messaggi con il Comune; pagamenti visibili al Comune; Impostazioni: Enti di Validazione e Modelli di documento; notifiche aggiornate.</w:t>
+            </w:r>
+          </w:p>
+        </w:tc>
+        <w:tc>
+          <w:tcPr>
+            <w:tcW w:type="dxa" w:w="2000"/>
+            <w:tcBorders>
+              <w:top w:val="single" w:color="D9D4C5" w:sz="4"/>
+              <w:left w:val="single" w:color="D9D4C5" w:sz="4"/>
+              <w:bottom w:val="single" w:color="D9D4C5" w:sz="4"/>
+              <w:right w:val="single" w:color="D9D4C5" w:sz="4"/>
+            </w:tcBorders>
+            <w:shd w:fill="F6F4EE" w:color="auto" w:val="clear"/>
+            <w:tcMar>
+              <w:top w:type="dxa" w:w="70"/>
+              <w:left w:type="dxa" w:w="110"/>
+              <w:bottom w:type="dxa" w:w="70"/>
+              <w:right w:type="dxa" w:w="110"/>
+            </w:tcMar>
+            <w:vAlign w:val="center"/>
+          </w:tcPr>
+          <w:p>
+            <w:pPr>
+              <w:spacing w:after="0" w:before="0"/>
+            </w:pPr>
+            <w:r>
+              <w:rPr>
+                <w:rFonts w:ascii="Arial" w:cs="Arial" w:eastAsia="Arial" w:hAnsi="Arial"/>
+                <w:color w:val="1B2118"/>
+                <w:sz w:val="18"/>
+                <w:szCs w:val="18"/>
+              </w:rPr>
+              <w:t xml:space="preserve">Fondazione Operate</w:t>
+            </w:r>
+          </w:p>
+        </w:tc>
+      </w:tr>
+      <w:tr>
+        <w:trPr>
+          <w:cantSplit/>
+        </w:trPr>
+        <w:tc>
+          <w:tcPr>
+            <w:tcW w:type="dxa" w:w="800"/>
+            <w:tcBorders>
+              <w:top w:val="single" w:color="D9D4C5" w:sz="4"/>
+              <w:left w:val="single" w:color="D9D4C5" w:sz="4"/>
+              <w:bottom w:val="single" w:color="D9D4C5" w:sz="4"/>
+              <w:right w:val="single" w:color="D9D4C5" w:sz="4"/>
+            </w:tcBorders>
+            <w:tcMar>
+              <w:top w:type="dxa" w:w="70"/>
+              <w:left w:type="dxa" w:w="110"/>
+              <w:bottom w:type="dxa" w:w="70"/>
+              <w:right w:type="dxa" w:w="110"/>
+            </w:tcMar>
+            <w:vAlign w:val="center"/>
+          </w:tcPr>
+          <w:p>
+            <w:pPr>
+              <w:spacing w:after="0" w:before="0"/>
+            </w:pPr>
+            <w:r>
+              <w:rPr>
+                <w:rFonts w:ascii="Arial" w:cs="Arial" w:eastAsia="Arial" w:hAnsi="Arial"/>
+                <w:color w:val="1B2118"/>
+                <w:sz w:val="18"/>
+                <w:szCs w:val="18"/>
+              </w:rPr>
               <w:t xml:space="preserve">1.0</w:t>
             </w:r>
           </w:p>
@@ -3026,7 +3162,6 @@
               <w:bottom w:val="single" w:color="D9D4C5" w:sz="4"/>
               <w:right w:val="single" w:color="D9D4C5" w:sz="4"/>
             </w:tcBorders>
-            <w:shd w:fill="F6F4EE" w:color="auto" w:val="clear"/>
             <w:tcMar>
               <w:top w:type="dxa" w:w="70"/>
               <w:left w:type="dxa" w:w="110"/>
@@ -3059,7 +3194,6 @@
               <w:bottom w:val="single" w:color="D9D4C5" w:sz="4"/>
               <w:right w:val="single" w:color="D9D4C5" w:sz="4"/>
             </w:tcBorders>
-            <w:shd w:fill="F6F4EE" w:color="auto" w:val="clear"/>
             <w:tcMar>
               <w:top w:type="dxa" w:w="70"/>
               <w:left w:type="dxa" w:w="110"/>
@@ -3092,7 +3226,6 @@
               <w:bottom w:val="single" w:color="D9D4C5" w:sz="4"/>
               <w:right w:val="single" w:color="D9D4C5" w:sz="4"/>
             </w:tcBorders>
-            <w:shd w:fill="F6F4EE" w:color="auto" w:val="clear"/>
             <w:tcMar>
               <w:top w:type="dxa" w:w="70"/>
               <w:left w:type="dxa" w:w="110"/>
@@ -3134,7 +3267,7 @@
           <w:sz w:val="20"/>
           <w:szCs w:val="20"/>
         </w:rPr>
-        <w:t xml:space="preserve">Questo documento descrive il portale alla revisione 2.7 del 19/10/2026. A ogni modifica del portale il manuale viene aggiornato e la revisione incrementata; la versione corrente si scarica dall'area Documentazione del portale (solo Amministratori).</w:t>
+        <w:t xml:space="preserve">Questo documento descrive il portale alla revisione 2.8 del 19/10/2026. A ogni modifica del portale il manuale viene aggiornato e la revisione incrementata; la versione corrente si scarica dall'area Documentazione del portale (solo Amministratori).</w:t>
       </w:r>
     </w:p>
     <w:p>
@@ -3215,7 +3348,7 @@
             <w:szCs w:val="22"/>
           </w:rPr>
           <w:tab/>
-          <w:t xml:space="preserve">6</w:t>
+          <w:t xml:space="preserve">7</w:t>
         </w:r>
       </w:hyperlink>
     </w:p>
@@ -3244,7 +3377,7 @@
             <w:szCs w:val="22"/>
           </w:rPr>
           <w:tab/>
-          <w:t xml:space="preserve">7</w:t>
+          <w:t xml:space="preserve">8</w:t>
         </w:r>
       </w:hyperlink>
     </w:p>
@@ -3273,7 +3406,7 @@
             <w:szCs w:val="22"/>
           </w:rPr>
           <w:tab/>
-          <w:t xml:space="preserve">8</w:t>
+          <w:t xml:space="preserve">9</w:t>
         </w:r>
       </w:hyperlink>
     </w:p>
@@ -3302,7 +3435,7 @@
             <w:szCs w:val="22"/>
           </w:rPr>
           <w:tab/>
-          <w:t xml:space="preserve">10</w:t>
+          <w:t xml:space="preserve">11</w:t>
         </w:r>
       </w:hyperlink>
     </w:p>
@@ -3331,7 +3464,7 @@
             <w:szCs w:val="22"/>
           </w:rPr>
           <w:tab/>
-          <w:t xml:space="preserve">12</w:t>
+          <w:t xml:space="preserve">13</w:t>
         </w:r>
       </w:hyperlink>
     </w:p>
@@ -3360,7 +3493,7 @@
             <w:szCs w:val="22"/>
           </w:rPr>
           <w:tab/>
-          <w:t xml:space="preserve">13</w:t>
+          <w:t xml:space="preserve">14</w:t>
         </w:r>
       </w:hyperlink>
     </w:p>
@@ -3389,7 +3522,7 @@
             <w:szCs w:val="22"/>
           </w:rPr>
           <w:tab/>
-          <w:t xml:space="preserve">14</w:t>
+          <w:t xml:space="preserve">15</w:t>
         </w:r>
       </w:hyperlink>
     </w:p>
@@ -3418,7 +3551,7 @@
             <w:szCs w:val="22"/>
           </w:rPr>
           <w:tab/>
-          <w:t xml:space="preserve">16</w:t>
+          <w:t xml:space="preserve">17</w:t>
         </w:r>
       </w:hyperlink>
     </w:p>
@@ -3447,7 +3580,7 @@
             <w:szCs w:val="22"/>
           </w:rPr>
           <w:tab/>
-          <w:t xml:space="preserve">17</w:t>
+          <w:t xml:space="preserve">18</w:t>
         </w:r>
       </w:hyperlink>
     </w:p>
@@ -3476,7 +3609,7 @@
             <w:szCs w:val="22"/>
           </w:rPr>
           <w:tab/>
-          <w:t xml:space="preserve">19</w:t>
+          <w:t xml:space="preserve">20</w:t>
         </w:r>
       </w:hyperlink>
     </w:p>
@@ -3505,7 +3638,7 @@
             <w:szCs w:val="22"/>
           </w:rPr>
           <w:tab/>
-          <w:t xml:space="preserve">20</w:t>
+          <w:t xml:space="preserve">21</w:t>
         </w:r>
       </w:hyperlink>
     </w:p>
@@ -3534,7 +3667,7 @@
             <w:szCs w:val="22"/>
           </w:rPr>
           <w:tab/>
-          <w:t xml:space="preserve">21</w:t>
+          <w:t xml:space="preserve">22</w:t>
         </w:r>
       </w:hyperlink>
     </w:p>
@@ -3563,7 +3696,7 @@
             <w:szCs w:val="22"/>
           </w:rPr>
           <w:tab/>
-          <w:t xml:space="preserve">23</w:t>
+          <w:t xml:space="preserve">24</w:t>
         </w:r>
       </w:hyperlink>
     </w:p>
@@ -3621,7 +3754,7 @@
             <w:szCs w:val="22"/>
           </w:rPr>
           <w:tab/>
-          <w:t xml:space="preserve">26</w:t>
+          <w:t xml:space="preserve">27</w:t>
         </w:r>
       </w:hyperlink>
     </w:p>
@@ -3650,7 +3783,7 @@
             <w:szCs w:val="22"/>
           </w:rPr>
           <w:tab/>
-          <w:t xml:space="preserve">29</w:t>
+          <w:t xml:space="preserve">30</w:t>
         </w:r>
       </w:hyperlink>
     </w:p>
@@ -3679,7 +3812,7 @@
             <w:szCs w:val="22"/>
           </w:rPr>
           <w:tab/>
-          <w:t xml:space="preserve">35</w:t>
+          <w:t xml:space="preserve">36</w:t>
         </w:r>
       </w:hyperlink>
     </w:p>
@@ -3708,7 +3841,7 @@
             <w:szCs w:val="22"/>
           </w:rPr>
           <w:tab/>
-          <w:t xml:space="preserve">38</w:t>
+          <w:t xml:space="preserve">39</w:t>
         </w:r>
       </w:hyperlink>
     </w:p>
@@ -3737,7 +3870,7 @@
             <w:szCs w:val="22"/>
           </w:rPr>
           <w:tab/>
-          <w:t xml:space="preserve">40</w:t>
+          <w:t xml:space="preserve">41</w:t>
         </w:r>
       </w:hyperlink>
     </w:p>
@@ -3766,7 +3899,7 @@
             <w:szCs w:val="22"/>
           </w:rPr>
           <w:tab/>
-          <w:t xml:space="preserve">41</w:t>
+          <w:t xml:space="preserve">42</w:t>
         </w:r>
       </w:hyperlink>
     </w:p>
@@ -3795,7 +3928,7 @@
             <w:szCs w:val="22"/>
           </w:rPr>
           <w:tab/>
-          <w:t xml:space="preserve">42</w:t>
+          <w:t xml:space="preserve">43</w:t>
         </w:r>
       </w:hyperlink>
     </w:p>
@@ -3824,7 +3957,7 @@
             <w:szCs w:val="22"/>
           </w:rPr>
           <w:tab/>
-          <w:t xml:space="preserve">43</w:t>
+          <w:t xml:space="preserve">44</w:t>
         </w:r>
       </w:hyperlink>
     </w:p>
@@ -3853,7 +3986,7 @@
             <w:szCs w:val="22"/>
           </w:rPr>
           <w:tab/>
-          <w:t xml:space="preserve">44</w:t>
+          <w:t xml:space="preserve">45</w:t>
         </w:r>
       </w:hyperlink>
     </w:p>
@@ -5368,36 +5501,116 @@
           </w:p>
         </w:tc>
       </w:tr>
+    </w:tbl>
+    <w:p>
+      <w:pPr>
+        <w:spacing w:after="160"/>
+      </w:pPr>
+    </w:p>
+    <w:p>
+      <w:pPr>
+        <w:spacing w:after="140" w:line="300"/>
+      </w:pPr>
+      <w:r>
+        <w:rPr>
+          <w:rFonts w:ascii="Arial" w:cs="Arial" w:eastAsia="Arial" w:hAnsi="Arial"/>
+          <w:color w:val="1B2118"/>
+          <w:sz w:val="21"/>
+          <w:szCs w:val="21"/>
+        </w:rPr>
+        <w:t xml:space="preserve">Gli </w:t>
+      </w:r>
+      <w:r>
+        <w:rPr>
+          <w:rFonts w:ascii="Arial" w:cs="Arial" w:eastAsia="Arial" w:hAnsi="Arial"/>
+          <w:b/>
+          <w:bCs/>
+          <w:color w:val="1B2118"/>
+          <w:sz w:val="21"/>
+          <w:szCs w:val="21"/>
+        </w:rPr>
+        <w:t xml:space="preserve">Amministratori</w:t>
+      </w:r>
+      <w:r>
+        <w:rPr>
+          <w:rFonts w:ascii="Arial" w:cs="Arial" w:eastAsia="Arial" w:hAnsi="Arial"/>
+          <w:color w:val="1B2118"/>
+          <w:sz w:val="21"/>
+          <w:szCs w:val="21"/>
+        </w:rPr>
+        <w:t xml:space="preserve"> possono essere più di uno e hanno tutti accesso completo a tutti i dati. Un Amministratore può nominare altri Amministratori (capitolo «Gestione utenti»). L'</w:t>
+      </w:r>
+      <w:r>
+        <w:rPr>
+          <w:rFonts w:ascii="Arial" w:cs="Arial" w:eastAsia="Arial" w:hAnsi="Arial"/>
+          <w:b/>
+          <w:bCs/>
+          <w:color w:val="1B2118"/>
+          <w:sz w:val="21"/>
+          <w:szCs w:val="21"/>
+        </w:rPr>
+        <w:t xml:space="preserve">Amministratore principale</w:t>
+      </w:r>
+      <w:r>
+        <w:rPr>
+          <w:rFonts w:ascii="Arial" w:cs="Arial" w:eastAsia="Arial" w:hAnsi="Arial"/>
+          <w:color w:val="1B2118"/>
+          <w:sz w:val="21"/>
+          <w:szCs w:val="21"/>
+        </w:rPr>
+        <w:t xml:space="preserve"> è luca.moretti@operate.it: nessuno lo può modificare, disattivare o cancellare.</w:t>
+      </w:r>
+    </w:p>
+    <w:tbl>
+      <w:tblPr>
+        <w:tblW w:type="dxa" w:w="9638"/>
+        <w:tblBorders>
+          <w:top w:val="single" w:color="auto" w:sz="4"/>
+          <w:left w:val="single" w:color="auto" w:sz="4"/>
+          <w:bottom w:val="single" w:color="auto" w:sz="4"/>
+          <w:right w:val="single" w:color="auto" w:sz="4"/>
+          <w:insideH w:val="single" w:color="auto" w:sz="4"/>
+          <w:insideV w:val="single" w:color="auto" w:sz="4"/>
+        </w:tblBorders>
+        <w:tblLayout w:type="fixed"/>
+      </w:tblPr>
+      <w:tblGrid>
+        <w:gridCol w:w="6325"/>
+        <w:gridCol w:w="1657"/>
+        <w:gridCol w:w="1656"/>
+      </w:tblGrid>
       <w:tr>
         <w:trPr>
-          <w:cantSplit/>
+          <w:tblHeader/>
         </w:trPr>
         <w:tc>
           <w:tcPr>
-            <w:tcW w:type="dxa" w:w="5449"/>
-            <w:tcBorders>
-              <w:top w:val="single" w:color="D9D4C5" w:sz="4"/>
-              <w:left w:val="single" w:color="D9D4C5" w:sz="4"/>
-              <w:bottom w:val="single" w:color="D9D4C5" w:sz="4"/>
-              <w:right w:val="single" w:color="D9D4C5" w:sz="4"/>
-            </w:tcBorders>
-            <w:shd w:fill="F6F4EE" w:color="auto" w:val="clear"/>
-            <w:tcMar>
-              <w:top w:type="dxa" w:w="70"/>
-              <w:left w:type="dxa" w:w="110"/>
-              <w:bottom w:type="dxa" w:w="70"/>
-              <w:right w:type="dxa" w:w="110"/>
-            </w:tcMar>
-            <w:vAlign w:val="center"/>
-          </w:tcPr>
-          <w:p>
-            <w:pPr>
-              <w:spacing w:after="0" w:before="0"/>
-            </w:pPr>
-            <w:r>
-              <w:rPr>
-                <w:rFonts w:ascii="Arial" w:cs="Arial" w:eastAsia="Arial" w:hAnsi="Arial"/>
-                <w:color w:val="1B2118"/>
+            <w:tcW w:type="dxa" w:w="6325"/>
+            <w:tcBorders>
+              <w:top w:val="single" w:color="D9D4C5" w:sz="4"/>
+              <w:left w:val="single" w:color="D9D4C5" w:sz="4"/>
+              <w:bottom w:val="single" w:color="D9D4C5" w:sz="4"/>
+              <w:right w:val="single" w:color="D9D4C5" w:sz="4"/>
+            </w:tcBorders>
+            <w:shd w:fill="2F5D3A" w:color="auto" w:val="clear"/>
+            <w:tcMar>
+              <w:top w:type="dxa" w:w="70"/>
+              <w:left w:type="dxa" w:w="110"/>
+              <w:bottom w:type="dxa" w:w="70"/>
+              <w:right w:type="dxa" w:w="110"/>
+            </w:tcMar>
+            <w:vAlign w:val="center"/>
+          </w:tcPr>
+          <w:p>
+            <w:pPr>
+              <w:spacing w:after="0" w:before="0"/>
+            </w:pPr>
+            <w:r>
+              <w:rPr>
+                <w:rFonts w:ascii="Arial" w:cs="Arial" w:eastAsia="Arial" w:hAnsi="Arial"/>
+                <w:b/>
+                <w:bCs/>
+                <w:color w:val="FFFFFF"/>
                 <w:sz w:val="18"/>
                 <w:szCs w:val="18"/>
               </w:rPr>
@@ -5407,30 +5620,32 @@
         </w:tc>
         <w:tc>
           <w:tcPr>
-            <w:tcW w:type="dxa" w:w="2179"/>
-            <w:tcBorders>
-              <w:top w:val="single" w:color="D9D4C5" w:sz="4"/>
-              <w:left w:val="single" w:color="D9D4C5" w:sz="4"/>
-              <w:bottom w:val="single" w:color="D9D4C5" w:sz="4"/>
-              <w:right w:val="single" w:color="D9D4C5" w:sz="4"/>
-            </w:tcBorders>
-            <w:shd w:fill="F6F4EE" w:color="auto" w:val="clear"/>
-            <w:tcMar>
-              <w:top w:type="dxa" w:w="70"/>
-              <w:left w:type="dxa" w:w="110"/>
-              <w:bottom w:type="dxa" w:w="70"/>
-              <w:right w:type="dxa" w:w="110"/>
-            </w:tcMar>
-            <w:vAlign w:val="center"/>
-          </w:tcPr>
-          <w:p>
-            <w:pPr>
-              <w:spacing w:after="0" w:before="0"/>
-            </w:pPr>
-            <w:r>
-              <w:rPr>
-                <w:rFonts w:ascii="Arial" w:cs="Arial" w:eastAsia="Arial" w:hAnsi="Arial"/>
-                <w:color w:val="1B2118"/>
+            <w:tcW w:type="dxa" w:w="1657"/>
+            <w:tcBorders>
+              <w:top w:val="single" w:color="D9D4C5" w:sz="4"/>
+              <w:left w:val="single" w:color="D9D4C5" w:sz="4"/>
+              <w:bottom w:val="single" w:color="D9D4C5" w:sz="4"/>
+              <w:right w:val="single" w:color="D9D4C5" w:sz="4"/>
+            </w:tcBorders>
+            <w:shd w:fill="2F5D3A" w:color="auto" w:val="clear"/>
+            <w:tcMar>
+              <w:top w:type="dxa" w:w="70"/>
+              <w:left w:type="dxa" w:w="110"/>
+              <w:bottom w:type="dxa" w:w="70"/>
+              <w:right w:type="dxa" w:w="110"/>
+            </w:tcMar>
+            <w:vAlign w:val="center"/>
+          </w:tcPr>
+          <w:p>
+            <w:pPr>
+              <w:spacing w:after="0" w:before="0"/>
+            </w:pPr>
+            <w:r>
+              <w:rPr>
+                <w:rFonts w:ascii="Arial" w:cs="Arial" w:eastAsia="Arial" w:hAnsi="Arial"/>
+                <w:b/>
+                <w:bCs/>
+                <w:color w:val="FFFFFF"/>
                 <w:sz w:val="18"/>
                 <w:szCs w:val="18"/>
               </w:rPr>
@@ -5440,30 +5655,32 @@
         </w:tc>
         <w:tc>
           <w:tcPr>
-            <w:tcW w:type="dxa" w:w="2010"/>
-            <w:tcBorders>
-              <w:top w:val="single" w:color="D9D4C5" w:sz="4"/>
-              <w:left w:val="single" w:color="D9D4C5" w:sz="4"/>
-              <w:bottom w:val="single" w:color="D9D4C5" w:sz="4"/>
-              <w:right w:val="single" w:color="D9D4C5" w:sz="4"/>
-            </w:tcBorders>
-            <w:shd w:fill="F6F4EE" w:color="auto" w:val="clear"/>
-            <w:tcMar>
-              <w:top w:type="dxa" w:w="70"/>
-              <w:left w:type="dxa" w:w="110"/>
-              <w:bottom w:type="dxa" w:w="70"/>
-              <w:right w:type="dxa" w:w="110"/>
-            </w:tcMar>
-            <w:vAlign w:val="center"/>
-          </w:tcPr>
-          <w:p>
-            <w:pPr>
-              <w:spacing w:after="0" w:before="0"/>
-            </w:pPr>
-            <w:r>
-              <w:rPr>
-                <w:rFonts w:ascii="Arial" w:cs="Arial" w:eastAsia="Arial" w:hAnsi="Arial"/>
-                <w:color w:val="1B2118"/>
+            <w:tcW w:type="dxa" w:w="1656"/>
+            <w:tcBorders>
+              <w:top w:val="single" w:color="D9D4C5" w:sz="4"/>
+              <w:left w:val="single" w:color="D9D4C5" w:sz="4"/>
+              <w:bottom w:val="single" w:color="D9D4C5" w:sz="4"/>
+              <w:right w:val="single" w:color="D9D4C5" w:sz="4"/>
+            </w:tcBorders>
+            <w:shd w:fill="2F5D3A" w:color="auto" w:val="clear"/>
+            <w:tcMar>
+              <w:top w:type="dxa" w:w="70"/>
+              <w:left w:type="dxa" w:w="110"/>
+              <w:bottom w:type="dxa" w:w="70"/>
+              <w:right w:type="dxa" w:w="110"/>
+            </w:tcMar>
+            <w:vAlign w:val="center"/>
+          </w:tcPr>
+          <w:p>
+            <w:pPr>
+              <w:spacing w:after="0" w:before="0"/>
+            </w:pPr>
+            <w:r>
+              <w:rPr>
+                <w:rFonts w:ascii="Arial" w:cs="Arial" w:eastAsia="Arial" w:hAnsi="Arial"/>
+                <w:b/>
+                <w:bCs/>
+                <w:color w:val="FFFFFF"/>
                 <w:sz w:val="18"/>
                 <w:szCs w:val="18"/>
               </w:rPr>
@@ -5714,7 +5931,7 @@
         </w:rPr>
         <w:t xml:space="preserve">Si accede da </w:t>
       </w:r>
-      <w:hyperlink w:history="1" r:id="rIdszoj4vvh3jnqjv1o6neh4">
+      <w:hyperlink w:history="1" r:id="rIdiprc1wkq5idh1mjgc4ur5">
         <w:r>
           <w:rPr>
             <w:rFonts w:ascii="Arial" w:cs="Arial" w:eastAsia="Arial" w:hAnsi="Arial"/>
@@ -19203,7 +19420,7 @@
           <w:sz w:val="21"/>
           <w:szCs w:val="21"/>
         </w:rPr>
-        <w:t xml:space="preserve"> oppure </w:t>
+        <w:t xml:space="preserve">, </w:t>
       </w:r>
       <w:r>
         <w:rPr>
@@ -19223,7 +19440,27 @@
           <w:sz w:val="21"/>
           <w:szCs w:val="21"/>
         </w:rPr>
-        <w:t xml:space="preserve">.</w:t>
+        <w:t xml:space="preserve"> oppure </w:t>
+      </w:r>
+      <w:r>
+        <w:rPr>
+          <w:rFonts w:ascii="Arial" w:cs="Arial" w:eastAsia="Arial" w:hAnsi="Arial"/>
+          <w:i/>
+          <w:iCs/>
+          <w:color w:val="1B2118"/>
+          <w:sz w:val="21"/>
+          <w:szCs w:val="21"/>
+        </w:rPr>
+        <w:t xml:space="preserve">Amministratore</w:t>
+      </w:r>
+      <w:r>
+        <w:rPr>
+          <w:rFonts w:ascii="Arial" w:cs="Arial" w:eastAsia="Arial" w:hAnsi="Arial"/>
+          <w:color w:val="1B2118"/>
+          <w:sz w:val="21"/>
+          <w:szCs w:val="21"/>
+        </w:rPr>
+        <w:t xml:space="preserve">. Scegliendo Amministratore compare un promemoria: avrà accesso completo a tutti i dati e alla gestione utenti; assegnate questo ruolo solo a persone della Fondazione.</w:t>
       </w:r>
     </w:p>
     <w:p>
@@ -19607,7 +19844,27 @@
           <w:sz w:val="21"/>
           <w:szCs w:val="21"/>
         </w:rPr>
-        <w:t xml:space="preserve"> permette di cambiare ruolo e organizzazioni. Passando a Operatore le associazioni alle organizzazioni si azzerano.</w:t>
+        <w:t xml:space="preserve"> permette di cambiare ruolo e organizzazioni. Passando a Operatore o ad Amministratore le associazioni alle organizzazioni si azzerano. Con </w:t>
+      </w:r>
+      <w:r>
+        <w:rPr>
+          <w:rFonts w:ascii="Arial" w:cs="Arial" w:eastAsia="Arial" w:hAnsi="Arial"/>
+          <w:b/>
+          <w:bCs/>
+          <w:color w:val="1B2118"/>
+          <w:sz w:val="21"/>
+          <w:szCs w:val="21"/>
+        </w:rPr>
+        <w:t xml:space="preserve">Modifica</w:t>
+      </w:r>
+      <w:r>
+        <w:rPr>
+          <w:rFonts w:ascii="Arial" w:cs="Arial" w:eastAsia="Arial" w:hAnsi="Arial"/>
+          <w:color w:val="1B2118"/>
+          <w:sz w:val="21"/>
+          <w:szCs w:val="21"/>
+        </w:rPr>
+        <w:t xml:space="preserve"> si nomina Amministratore un utente esistente, o si riporta un Amministratore a Operatore.</w:t>
       </w:r>
     </w:p>
     <w:p>
@@ -19652,7 +19909,7 @@
           <w:sz w:val="21"/>
           <w:szCs w:val="21"/>
         </w:rPr>
-        <w:t xml:space="preserve"> non vede più alcun dato ma resta nello storico. Non si può disattivare sé stessi. Un Cliente si riattiva solo se la sua Organizzazione non ha nel frattempo un altro account attivo.</w:t>
+        <w:t xml:space="preserve"> non vede più alcun dato ma resta nello storico. Non si può disattivare sé stessi. Si può disattivare anche un altro Amministratore. Un Cliente si riattiva solo se la sua Organizzazione non ha nel frattempo un altro account attivo.</w:t>
       </w:r>
     </w:p>
     <w:p>
@@ -19864,6 +20121,91 @@
           <w:sz w:val="21"/>
           <w:szCs w:val="21"/>
         </w:rPr>
+        <w:t xml:space="preserve">Amministratore principale.</w:t>
+      </w:r>
+      <w:r>
+        <w:rPr>
+          <w:rFonts w:ascii="Arial" w:cs="Arial" w:eastAsia="Arial" w:hAnsi="Arial"/>
+          <w:color w:val="1B2118"/>
+          <w:sz w:val="21"/>
+          <w:szCs w:val="21"/>
+        </w:rPr>
+        <w:t xml:space="preserve"> La riga di luca.moretti@operate.it ha il segno </w:t>
+      </w:r>
+      <w:r>
+        <w:rPr>
+          <w:rFonts w:ascii="Arial" w:cs="Arial" w:eastAsia="Arial" w:hAnsi="Arial"/>
+          <w:b/>
+          <w:bCs/>
+          <w:color w:val="1B2118"/>
+          <w:sz w:val="21"/>
+          <w:szCs w:val="21"/>
+        </w:rPr>
+        <w:t xml:space="preserve">Principale</w:t>
+      </w:r>
+      <w:r>
+        <w:rPr>
+          <w:rFonts w:ascii="Arial" w:cs="Arial" w:eastAsia="Arial" w:hAnsi="Arial"/>
+          <w:color w:val="1B2118"/>
+          <w:sz w:val="21"/>
+          <w:szCs w:val="21"/>
+        </w:rPr>
+        <w:t xml:space="preserve"> e nessun pulsante: nessun Amministratore la può modificare, declassare, disattivare o cancellare. Lo impedisce il database (script 29), non solo la pagina: nemmeno dal pannello </w:t>
+      </w:r>
+      <w:r>
+        <w:rPr>
+          <w:rFonts w:ascii="Arial" w:cs="Arial" w:eastAsia="Arial" w:hAnsi="Arial"/>
+          <w:i/>
+          <w:iCs/>
+          <w:color w:val="1B2118"/>
+          <w:sz w:val="21"/>
+          <w:szCs w:val="21"/>
+        </w:rPr>
+        <w:t xml:space="preserve">Authentication</w:t>
+      </w:r>
+      <w:r>
+        <w:rPr>
+          <w:rFonts w:ascii="Arial" w:cs="Arial" w:eastAsia="Arial" w:hAnsi="Arial"/>
+          <w:color w:val="1B2118"/>
+          <w:sz w:val="21"/>
+          <w:szCs w:val="21"/>
+        </w:rPr>
+        <w:t xml:space="preserve"> di Supabase si può cancellare l'account. In caso di reale necessità la protezione si toglie solo dal </w:t>
+      </w:r>
+      <w:r>
+        <w:rPr>
+          <w:rFonts w:ascii="Arial" w:cs="Arial" w:eastAsia="Arial" w:hAnsi="Arial"/>
+          <w:i/>
+          <w:iCs/>
+          <w:color w:val="1B2118"/>
+          <w:sz w:val="21"/>
+          <w:szCs w:val="21"/>
+        </w:rPr>
+        <w:t xml:space="preserve">SQL Editor</w:t>
+      </w:r>
+      <w:r>
+        <w:rPr>
+          <w:rFonts w:ascii="Arial" w:cs="Arial" w:eastAsia="Arial" w:hAnsi="Arial"/>
+          <w:color w:val="1B2118"/>
+          <w:sz w:val="21"/>
+          <w:szCs w:val="21"/>
+        </w:rPr>
+        <w:t xml:space="preserve"> di Supabase, con le istruzioni in fondo allo script 29.</w:t>
+      </w:r>
+    </w:p>
+    <w:p>
+      <w:pPr>
+        <w:spacing w:after="140" w:line="300"/>
+      </w:pPr>
+      <w:r>
+        <w:rPr>
+          <w:rFonts w:ascii="Arial" w:cs="Arial" w:eastAsia="Arial" w:hAnsi="Arial"/>
+          <w:b/>
+          <w:bCs/>
+          <w:color w:val="1B2118"/>
+          <w:sz w:val="21"/>
+          <w:szCs w:val="21"/>
+        </w:rPr>
         <w:t xml:space="preserve">Limiti.</w:t>
       </w:r>
       <w:r>
@@ -19873,7 +20215,7 @@
           <w:sz w:val="21"/>
           <w:szCs w:val="21"/>
         </w:rPr>
-        <w:t xml:space="preserve"> Dal portale non si creano né si nominano Amministratori: si fa da Supabase, per sicurezza. La password di un Amministratore si gestisce con </w:t>
+        <w:t xml:space="preserve"> Nessuno può cambiare il proprio ruolo né disattivare sé stesso. La password di un Amministratore non si reimposta dalla pagina Utenti: si gestisce con </w:t>
       </w:r>
       <w:r>
         <w:rPr>
@@ -39454,7 +39796,7 @@
         <w:szCs w:val="16"/>
       </w:rPr>
       <w:tab/>
-      <w:t xml:space="preserve">Manuale Amministratore · Rev. 2.7 · 19/10/2026</w:t>
+      <w:t xml:space="preserve">Manuale Amministratore · Rev. 2.8 · 19/10/2026</w:t>
     </w:r>
   </w:p>
 </w:hdr>
@@ -39519,7 +39861,7 @@
         <w:szCs w:val="16"/>
       </w:rPr>
       <w:tab/>
-      <w:t xml:space="preserve">Manuale Amministratore · Rev. 2.7 · 19/10/2026</w:t>
+      <w:t xml:space="preserve">Manuale Amministratore · Rev. 2.8 · 19/10/2026</w:t>
     </w:r>
   </w:p>
 </w:hdr>

</xml_diff>

<commit_message>
Email con le credenziali al nuovo utente e alla reimpostazione della password (crea-utente, reimposta-password); esito mostrato nella pagina Utenti; manuali e registro
Co-Authored-By: Claude Opus 5.5 <noreply@anthropic.com>
Claude-Session: https://claude.ai/code/session_01E8XCbEeVHWVP3hntUZ6kZ1
</commit_message>
<xml_diff>
--- a/public/documentazione/Manuale_Amministratore_Portale_CWP.docx
+++ b/public/documentazione/Manuale_Amministratore_Portale_CWP.docx
@@ -302,7 +302,7 @@
                 <w:sz w:val="20"/>
                 <w:szCs w:val="20"/>
               </w:rPr>
-              <w:t xml:space="preserve">Rev. 2.8</w:t>
+              <w:t xml:space="preserve">Rev. 2.9</w:t>
             </w:r>
           </w:p>
         </w:tc>
@@ -719,7 +719,7 @@
                 <w:sz w:val="18"/>
                 <w:szCs w:val="18"/>
               </w:rPr>
-              <w:t xml:space="preserve">2.8</w:t>
+              <w:t xml:space="preserve">2.9</w:t>
             </w:r>
           </w:p>
         </w:tc>
@@ -783,7 +783,7 @@
                 <w:sz w:val="18"/>
                 <w:szCs w:val="18"/>
               </w:rPr>
-              <w:t xml:space="preserve">Più Amministratori con accesso completo; Amministratore principale protetto (script 29).</w:t>
+              <w:t xml:space="preserve">Email automatica con le credenziali al nuovo utente e alla reimpostazione della password.</w:t>
             </w:r>
           </w:p>
         </w:tc>
@@ -853,7 +853,7 @@
                 <w:sz w:val="18"/>
                 <w:szCs w:val="18"/>
               </w:rPr>
-              <w:t xml:space="preserve">2.7</w:t>
+              <w:t xml:space="preserve">2.8</w:t>
             </w:r>
           </w:p>
         </w:tc>
@@ -919,7 +919,7 @@
                 <w:sz w:val="18"/>
                 <w:szCs w:val="18"/>
               </w:rPr>
-              <w:t xml:space="preserve">Simulatore: costi per il Comune secondo il Caso 1 (progetto volontario) o il Caso 2 (progetto obbligatorio da bando).</w:t>
+              <w:t xml:space="preserve">Più Amministratori con accesso completo; Amministratore principale protetto (script 29).</w:t>
             </w:r>
           </w:p>
         </w:tc>
@@ -989,7 +989,7 @@
                 <w:sz w:val="18"/>
                 <w:szCs w:val="18"/>
               </w:rPr>
-              <w:t xml:space="preserve">2.6</w:t>
+              <w:t xml:space="preserve">2.7</w:t>
             </w:r>
           </w:p>
         </w:tc>
@@ -1053,7 +1053,7 @@
                 <w:sz w:val="18"/>
                 <w:szCs w:val="18"/>
               </w:rPr>
-              <w:t xml:space="preserve">Simulatore: valore del credito anno per anno, proposto 32 €.</w:t>
+              <w:t xml:space="preserve">Simulatore: costi per il Comune secondo il Caso 1 (progetto volontario) o il Caso 2 (progetto obbligatorio da bando).</w:t>
             </w:r>
           </w:p>
         </w:tc>
@@ -1123,7 +1123,7 @@
                 <w:sz w:val="18"/>
                 <w:szCs w:val="18"/>
               </w:rPr>
-              <w:t xml:space="preserve">2.5</w:t>
+              <w:t xml:space="preserve">2.6</w:t>
             </w:r>
           </w:p>
         </w:tc>
@@ -1189,7 +1189,7 @@
                 <w:sz w:val="18"/>
                 <w:szCs w:val="18"/>
               </w:rPr>
-              <w:t xml:space="preserve">Simulatore: simulazione economica con valore unitario del credito e costi per il Comune (contratti tipo della Fondazione, Schema tariffario).</w:t>
+              <w:t xml:space="preserve">Simulatore: valore del credito anno per anno, proposto 32 €.</w:t>
             </w:r>
           </w:p>
         </w:tc>
@@ -1259,7 +1259,7 @@
                 <w:sz w:val="18"/>
                 <w:szCs w:val="18"/>
               </w:rPr>
-              <w:t xml:space="preserve">2.4</w:t>
+              <w:t xml:space="preserve">2.5</w:t>
             </w:r>
           </w:p>
         </w:tc>
@@ -1323,7 +1323,7 @@
                 <w:sz w:val="18"/>
                 <w:szCs w:val="18"/>
               </w:rPr>
-              <w:t xml:space="preserve">Simulatore: riferimento sempre alla soglia del 65% di differenziata e controllo dei valori fuori scala.</w:t>
+              <w:t xml:space="preserve">Simulatore: simulazione economica con valore unitario del credito e costi per il Comune (contratti tipo della Fondazione, Schema tariffario).</w:t>
             </w:r>
           </w:p>
         </w:tc>
@@ -1393,7 +1393,7 @@
                 <w:sz w:val="18"/>
                 <w:szCs w:val="18"/>
               </w:rPr>
-              <w:t xml:space="preserve">2.3</w:t>
+              <w:t xml:space="preserve">2.4</w:t>
             </w:r>
           </w:p>
         </w:tc>
@@ -1459,7 +1459,7 @@
                 <w:sz w:val="18"/>
                 <w:szCs w:val="18"/>
               </w:rPr>
-              <w:t xml:space="preserve">Simulatore conforme al modello CWP: scenario di riferimento dello Standard 4.8.1, situazione attuale, conformità.</w:t>
+              <w:t xml:space="preserve">Simulatore: riferimento sempre alla soglia del 65% di differenziata e controllo dei valori fuori scala.</w:t>
             </w:r>
           </w:p>
         </w:tc>
@@ -1529,7 +1529,7 @@
                 <w:sz w:val="18"/>
                 <w:szCs w:val="18"/>
               </w:rPr>
-              <w:t xml:space="preserve">2.2</w:t>
+              <w:t xml:space="preserve">2.3</w:t>
             </w:r>
           </w:p>
         </w:tc>
@@ -1593,7 +1593,7 @@
                 <w:sz w:val="18"/>
                 <w:szCs w:val="18"/>
               </w:rPr>
-              <w:t xml:space="preserve">Nuovo capitolo «Simulatore di scenari»: creazione, anno base, obiettivi annui, risultati, modello di stima.</w:t>
+              <w:t xml:space="preserve">Simulatore conforme al modello CWP: scenario di riferimento dello Standard 4.8.1, situazione attuale, conformità.</w:t>
             </w:r>
           </w:p>
         </w:tc>
@@ -1663,7 +1663,7 @@
                 <w:sz w:val="18"/>
                 <w:szCs w:val="18"/>
               </w:rPr>
-              <w:t xml:space="preserve">2.1</w:t>
+              <w:t xml:space="preserve">2.2</w:t>
             </w:r>
           </w:p>
         </w:tc>
@@ -1729,7 +1729,7 @@
                 <w:sz w:val="18"/>
                 <w:szCs w:val="18"/>
               </w:rPr>
-              <w:t xml:space="preserve">Funzioni in arrivo: simulatore di scenari (7, 10 o 21 anni, obiettivi annui, % di differenziata e crediti stimati) e assistente virtuale (Claude).</w:t>
+              <w:t xml:space="preserve">Nuovo capitolo «Simulatore di scenari»: creazione, anno base, obiettivi annui, risultati, modello di stima.</w:t>
             </w:r>
           </w:p>
         </w:tc>
@@ -1799,7 +1799,7 @@
                 <w:sz w:val="18"/>
                 <w:szCs w:val="18"/>
               </w:rPr>
-              <w:t xml:space="preserve">2.0</w:t>
+              <w:t xml:space="preserve">2.1</w:t>
             </w:r>
           </w:p>
         </w:tc>
@@ -1863,7 +1863,7 @@
                 <w:sz w:val="18"/>
                 <w:szCs w:val="18"/>
               </w:rPr>
-              <w:t xml:space="preserve">Copie di sicurezza e ripristino: rimando alle Istruzioni di ripristino e punti essenziali (capitolo Manutenzione ed emergenze).</w:t>
+              <w:t xml:space="preserve">Funzioni in arrivo: simulatore di scenari (7, 10 o 21 anni, obiettivi annui, % di differenziata e crediti stimati) e assistente virtuale (Claude).</w:t>
             </w:r>
           </w:p>
         </w:tc>
@@ -1933,7 +1933,7 @@
                 <w:sz w:val="18"/>
                 <w:szCs w:val="18"/>
               </w:rPr>
-              <w:t xml:space="preserve">1.9</w:t>
+              <w:t xml:space="preserve">2.0</w:t>
             </w:r>
           </w:p>
         </w:tc>
@@ -1999,7 +1999,7 @@
                 <w:sz w:val="18"/>
                 <w:szCs w:val="18"/>
               </w:rPr>
-              <w:t xml:space="preserve">Fondazione Operate soggetto promotore del programma (esclusiva conferita da Wastelab).</w:t>
+              <w:t xml:space="preserve">Copie di sicurezza e ripristino: rimando alle Istruzioni di ripristino e punti essenziali (capitolo Manutenzione ed emergenze).</w:t>
             </w:r>
           </w:p>
         </w:tc>
@@ -2069,7 +2069,7 @@
                 <w:sz w:val="18"/>
                 <w:szCs w:val="18"/>
               </w:rPr>
-              <w:t xml:space="preserve">1.8</w:t>
+              <w:t xml:space="preserve">1.9</w:t>
             </w:r>
           </w:p>
         </w:tc>
@@ -2133,7 +2133,7 @@
                 <w:sz w:val="18"/>
                 <w:szCs w:val="18"/>
               </w:rPr>
-              <w:t xml:space="preserve">PEC del Programma e documenti ufficiali già pubblicati sulla pagina pubblica.</w:t>
+              <w:t xml:space="preserve">Fondazione Operate soggetto promotore del programma (esclusiva conferita da Wastelab).</w:t>
             </w:r>
           </w:p>
         </w:tc>
@@ -2203,7 +2203,7 @@
                 <w:sz w:val="18"/>
                 <w:szCs w:val="18"/>
               </w:rPr>
-              <w:t xml:space="preserve">1.7</w:t>
+              <w:t xml:space="preserve">1.8</w:t>
             </w:r>
           </w:p>
         </w:tc>
@@ -2236,7 +2236,7 @@
                 <w:sz w:val="18"/>
                 <w:szCs w:val="18"/>
               </w:rPr>
-              <w:t xml:space="preserve">18/10/2026</w:t>
+              <w:t xml:space="preserve">19/10/2026</w:t>
             </w:r>
           </w:p>
         </w:tc>
@@ -2269,7 +2269,7 @@
                 <w:sz w:val="18"/>
                 <w:szCs w:val="18"/>
               </w:rPr>
-              <w:t xml:space="preserve">Allineamento ai documenti ufficiali del Programma (script 22-24): Rapporto a 7 fasi, feedback pubblico, stati del Programma, dati del progetto e territorio ISTAT, ritiro e rientro, account unico e delegati, registri, tariffe e sospensione, accuratezza e accertamenti, informazioni del Programma e metodologie, modelli pubblici; nuovi capitoli Crediti emessi, Reclami, Pagina pubblica; qualità dei dati nel calcolo.</w:t>
+              <w:t xml:space="preserve">PEC del Programma e documenti ufficiali già pubblicati sulla pagina pubblica.</w:t>
             </w:r>
           </w:p>
         </w:tc>
@@ -2339,7 +2339,7 @@
                 <w:sz w:val="18"/>
                 <w:szCs w:val="18"/>
               </w:rPr>
-              <w:t xml:space="preserve">1.6</w:t>
+              <w:t xml:space="preserve">1.7</w:t>
             </w:r>
           </w:p>
         </w:tc>
@@ -2403,7 +2403,7 @@
                 <w:sz w:val="18"/>
                 <w:szCs w:val="18"/>
               </w:rPr>
-              <w:t xml:space="preserve">Calcolo crediti: descrizione corretta del buffer (somma delle voci delle Tabelle 15 e 16, più il 20% con le sole utenze virtuose, al massimo 80%).</w:t>
+              <w:t xml:space="preserve">Allineamento ai documenti ufficiali del Programma (script 22-24): Rapporto a 7 fasi, feedback pubblico, stati del Programma, dati del progetto e territorio ISTAT, ritiro e rientro, account unico e delegati, registri, tariffe e sospensione, accuratezza e accertamenti, informazioni del Programma e metodologie, modelli pubblici; nuovi capitoli Crediti emessi, Reclami, Pagina pubblica; qualità dei dati nel calcolo.</w:t>
             </w:r>
           </w:p>
         </w:tc>
@@ -2473,7 +2473,7 @@
                 <w:sz w:val="18"/>
                 <w:szCs w:val="18"/>
               </w:rPr>
-              <w:t xml:space="preserve">1.5</w:t>
+              <w:t xml:space="preserve">1.6</w:t>
             </w:r>
           </w:p>
         </w:tc>
@@ -2539,7 +2539,7 @@
                 <w:sz w:val="18"/>
                 <w:szCs w:val="18"/>
               </w:rPr>
-              <w:t xml:space="preserve">Nuova pagina Anagrafiche (Organizzazioni ed Enti, anche per gli Operatori); Rapporti con 4 fasi e durate proprie; documenti richiesti per fase; consultazione con documento bloccato, osservazioni numerate e motivazione; conservazione per 10 anni; fascicolo con riepilogo PDF e nuove cartelle.</w:t>
+              <w:t xml:space="preserve">Calcolo crediti: descrizione corretta del buffer (somma delle voci delle Tabelle 15 e 16, più il 20% con le sole utenze virtuose, al massimo 80%).</w:t>
             </w:r>
           </w:p>
         </w:tc>
@@ -2609,7 +2609,7 @@
                 <w:sz w:val="18"/>
                 <w:szCs w:val="18"/>
               </w:rPr>
-              <w:t xml:space="preserve">1.4</w:t>
+              <w:t xml:space="preserve">1.5</w:t>
             </w:r>
           </w:p>
         </w:tc>
@@ -2673,7 +2673,7 @@
                 <w:sz w:val="18"/>
                 <w:szCs w:val="18"/>
               </w:rPr>
-              <w:t xml:space="preserve">Calcolo crediti: il risultato si azzera quando cambiano dati o Banca Dati Utenze, conferma solo dopo un nuovo «Calcola». Gestione utenti: password temporanea di almeno 10 caratteri con lettere e numeri, creazione annullata se non va a buon fine, nessun accesso ai dati prima del cambio password.</w:t>
+              <w:t xml:space="preserve">Nuova pagina Anagrafiche (Organizzazioni ed Enti, anche per gli Operatori); Rapporti con 4 fasi e durate proprie; documenti richiesti per fase; consultazione con documento bloccato, osservazioni numerate e motivazione; conservazione per 10 anni; fascicolo con riepilogo PDF e nuove cartelle.</w:t>
             </w:r>
           </w:p>
         </w:tc>
@@ -2743,7 +2743,7 @@
                 <w:sz w:val="18"/>
                 <w:szCs w:val="18"/>
               </w:rPr>
-              <w:t xml:space="preserve">1.3</w:t>
+              <w:t xml:space="preserve">1.4</w:t>
             </w:r>
           </w:p>
         </w:tc>
@@ -2809,7 +2809,7 @@
                 <w:sz w:val="18"/>
                 <w:szCs w:val="18"/>
               </w:rPr>
-              <w:t xml:space="preserve">Rapporto di calcolo in PDF, archiviazione nella pratica, numero di registro, registro dei crediti.</w:t>
+              <w:t xml:space="preserve">Calcolo crediti: il risultato si azzera quando cambiano dati o Banca Dati Utenze, conferma solo dopo un nuovo «Calcola». Gestione utenti: password temporanea di almeno 10 caratteri con lettere e numeri, creazione annullata se non va a buon fine, nessun accesso ai dati prima del cambio password.</w:t>
             </w:r>
           </w:p>
         </w:tc>
@@ -2879,7 +2879,7 @@
                 <w:sz w:val="18"/>
                 <w:szCs w:val="18"/>
               </w:rPr>
-              <w:t xml:space="preserve">1.2</w:t>
+              <w:t xml:space="preserve">1.3</w:t>
             </w:r>
           </w:p>
         </w:tc>
@@ -2943,7 +2943,7 @@
                 <w:sz w:val="18"/>
                 <w:szCs w:val="18"/>
               </w:rPr>
-              <w:t xml:space="preserve">Calcolo crediti: importare il tracciato nel calcolo (dai documenti della pratica o dal computer), singole letture, blocco dei dati personali, controlli di coerenza.</w:t>
+              <w:t xml:space="preserve">Rapporto di calcolo in PDF, archiviazione nella pratica, numero di registro, registro dei crediti.</w:t>
             </w:r>
           </w:p>
         </w:tc>
@@ -3013,7 +3013,7 @@
                 <w:sz w:val="18"/>
                 <w:szCs w:val="18"/>
               </w:rPr>
-              <w:t xml:space="preserve">1.1</w:t>
+              <w:t xml:space="preserve">1.2</w:t>
             </w:r>
           </w:p>
         </w:tc>
@@ -3079,7 +3079,7 @@
                 <w:sz w:val="18"/>
                 <w:szCs w:val="18"/>
               </w:rPr>
-              <w:t xml:space="preserve">Note di fase, Ente di Validazione della pratica, consultazione sulla pagina pubblica con conferma dell'email, moderazione con autori e allegati, errata corrige; nuovo capitolo Messaggi con il Comune; pagamenti visibili al Comune; Impostazioni: Enti di Validazione e Modelli di documento; notifiche aggiornate.</w:t>
+              <w:t xml:space="preserve">Calcolo crediti: importare il tracciato nel calcolo (dai documenti della pratica o dal computer), singole letture, blocco dei dati personali, controlli di coerenza.</w:t>
             </w:r>
           </w:p>
         </w:tc>
@@ -3149,6 +3149,140 @@
                 <w:sz w:val="18"/>
                 <w:szCs w:val="18"/>
               </w:rPr>
+              <w:t xml:space="preserve">1.1</w:t>
+            </w:r>
+          </w:p>
+        </w:tc>
+        <w:tc>
+          <w:tcPr>
+            <w:tcW w:type="dxa" w:w="1300"/>
+            <w:tcBorders>
+              <w:top w:val="single" w:color="D9D4C5" w:sz="4"/>
+              <w:left w:val="single" w:color="D9D4C5" w:sz="4"/>
+              <w:bottom w:val="single" w:color="D9D4C5" w:sz="4"/>
+              <w:right w:val="single" w:color="D9D4C5" w:sz="4"/>
+            </w:tcBorders>
+            <w:tcMar>
+              <w:top w:type="dxa" w:w="70"/>
+              <w:left w:type="dxa" w:w="110"/>
+              <w:bottom w:type="dxa" w:w="70"/>
+              <w:right w:type="dxa" w:w="110"/>
+            </w:tcMar>
+            <w:vAlign w:val="center"/>
+          </w:tcPr>
+          <w:p>
+            <w:pPr>
+              <w:spacing w:after="0" w:before="0"/>
+            </w:pPr>
+            <w:r>
+              <w:rPr>
+                <w:rFonts w:ascii="Arial" w:cs="Arial" w:eastAsia="Arial" w:hAnsi="Arial"/>
+                <w:color w:val="1B2118"/>
+                <w:sz w:val="18"/>
+                <w:szCs w:val="18"/>
+              </w:rPr>
+              <w:t xml:space="preserve">18/10/2026</w:t>
+            </w:r>
+          </w:p>
+        </w:tc>
+        <w:tc>
+          <w:tcPr>
+            <w:tcW w:type="dxa" w:w="5538"/>
+            <w:tcBorders>
+              <w:top w:val="single" w:color="D9D4C5" w:sz="4"/>
+              <w:left w:val="single" w:color="D9D4C5" w:sz="4"/>
+              <w:bottom w:val="single" w:color="D9D4C5" w:sz="4"/>
+              <w:right w:val="single" w:color="D9D4C5" w:sz="4"/>
+            </w:tcBorders>
+            <w:tcMar>
+              <w:top w:type="dxa" w:w="70"/>
+              <w:left w:type="dxa" w:w="110"/>
+              <w:bottom w:type="dxa" w:w="70"/>
+              <w:right w:type="dxa" w:w="110"/>
+            </w:tcMar>
+            <w:vAlign w:val="center"/>
+          </w:tcPr>
+          <w:p>
+            <w:pPr>
+              <w:spacing w:after="0" w:before="0"/>
+            </w:pPr>
+            <w:r>
+              <w:rPr>
+                <w:rFonts w:ascii="Arial" w:cs="Arial" w:eastAsia="Arial" w:hAnsi="Arial"/>
+                <w:color w:val="1B2118"/>
+                <w:sz w:val="18"/>
+                <w:szCs w:val="18"/>
+              </w:rPr>
+              <w:t xml:space="preserve">Note di fase, Ente di Validazione della pratica, consultazione sulla pagina pubblica con conferma dell'email, moderazione con autori e allegati, errata corrige; nuovo capitolo Messaggi con il Comune; pagamenti visibili al Comune; Impostazioni: Enti di Validazione e Modelli di documento; notifiche aggiornate.</w:t>
+            </w:r>
+          </w:p>
+        </w:tc>
+        <w:tc>
+          <w:tcPr>
+            <w:tcW w:type="dxa" w:w="2000"/>
+            <w:tcBorders>
+              <w:top w:val="single" w:color="D9D4C5" w:sz="4"/>
+              <w:left w:val="single" w:color="D9D4C5" w:sz="4"/>
+              <w:bottom w:val="single" w:color="D9D4C5" w:sz="4"/>
+              <w:right w:val="single" w:color="D9D4C5" w:sz="4"/>
+            </w:tcBorders>
+            <w:tcMar>
+              <w:top w:type="dxa" w:w="70"/>
+              <w:left w:type="dxa" w:w="110"/>
+              <w:bottom w:type="dxa" w:w="70"/>
+              <w:right w:type="dxa" w:w="110"/>
+            </w:tcMar>
+            <w:vAlign w:val="center"/>
+          </w:tcPr>
+          <w:p>
+            <w:pPr>
+              <w:spacing w:after="0" w:before="0"/>
+            </w:pPr>
+            <w:r>
+              <w:rPr>
+                <w:rFonts w:ascii="Arial" w:cs="Arial" w:eastAsia="Arial" w:hAnsi="Arial"/>
+                <w:color w:val="1B2118"/>
+                <w:sz w:val="18"/>
+                <w:szCs w:val="18"/>
+              </w:rPr>
+              <w:t xml:space="preserve">Fondazione Operate</w:t>
+            </w:r>
+          </w:p>
+        </w:tc>
+      </w:tr>
+      <w:tr>
+        <w:trPr>
+          <w:cantSplit/>
+        </w:trPr>
+        <w:tc>
+          <w:tcPr>
+            <w:tcW w:type="dxa" w:w="800"/>
+            <w:tcBorders>
+              <w:top w:val="single" w:color="D9D4C5" w:sz="4"/>
+              <w:left w:val="single" w:color="D9D4C5" w:sz="4"/>
+              <w:bottom w:val="single" w:color="D9D4C5" w:sz="4"/>
+              <w:right w:val="single" w:color="D9D4C5" w:sz="4"/>
+            </w:tcBorders>
+            <w:shd w:fill="F6F4EE" w:color="auto" w:val="clear"/>
+            <w:tcMar>
+              <w:top w:type="dxa" w:w="70"/>
+              <w:left w:type="dxa" w:w="110"/>
+              <w:bottom w:type="dxa" w:w="70"/>
+              <w:right w:type="dxa" w:w="110"/>
+            </w:tcMar>
+            <w:vAlign w:val="center"/>
+          </w:tcPr>
+          <w:p>
+            <w:pPr>
+              <w:spacing w:after="0" w:before="0"/>
+            </w:pPr>
+            <w:r>
+              <w:rPr>
+                <w:rFonts w:ascii="Arial" w:cs="Arial" w:eastAsia="Arial" w:hAnsi="Arial"/>
+                <w:color w:val="1B2118"/>
+                <w:sz w:val="18"/>
+                <w:szCs w:val="18"/>
+              </w:rPr>
               <w:t xml:space="preserve">1.0</w:t>
             </w:r>
           </w:p>
@@ -3162,6 +3296,7 @@
               <w:bottom w:val="single" w:color="D9D4C5" w:sz="4"/>
               <w:right w:val="single" w:color="D9D4C5" w:sz="4"/>
             </w:tcBorders>
+            <w:shd w:fill="F6F4EE" w:color="auto" w:val="clear"/>
             <w:tcMar>
               <w:top w:type="dxa" w:w="70"/>
               <w:left w:type="dxa" w:w="110"/>
@@ -3194,6 +3329,7 @@
               <w:bottom w:val="single" w:color="D9D4C5" w:sz="4"/>
               <w:right w:val="single" w:color="D9D4C5" w:sz="4"/>
             </w:tcBorders>
+            <w:shd w:fill="F6F4EE" w:color="auto" w:val="clear"/>
             <w:tcMar>
               <w:top w:type="dxa" w:w="70"/>
               <w:left w:type="dxa" w:w="110"/>
@@ -3226,6 +3362,7 @@
               <w:bottom w:val="single" w:color="D9D4C5" w:sz="4"/>
               <w:right w:val="single" w:color="D9D4C5" w:sz="4"/>
             </w:tcBorders>
+            <w:shd w:fill="F6F4EE" w:color="auto" w:val="clear"/>
             <w:tcMar>
               <w:top w:type="dxa" w:w="70"/>
               <w:left w:type="dxa" w:w="110"/>
@@ -3267,7 +3404,7 @@
           <w:sz w:val="20"/>
           <w:szCs w:val="20"/>
         </w:rPr>
-        <w:t xml:space="preserve">Questo documento descrive il portale alla revisione 2.8 del 19/10/2026. A ogni modifica del portale il manuale viene aggiornato e la revisione incrementata; la versione corrente si scarica dall'area Documentazione del portale (solo Amministratori).</w:t>
+        <w:t xml:space="preserve">Questo documento descrive il portale alla revisione 2.9 del 19/10/2026. A ogni modifica del portale il manuale viene aggiornato e la revisione incrementata; la versione corrente si scarica dall'area Documentazione del portale (solo Amministratori).</w:t>
       </w:r>
     </w:p>
     <w:p>
@@ -5931,7 +6068,7 @@
         </w:rPr>
         <w:t xml:space="preserve">Si accede da </w:t>
       </w:r>
-      <w:hyperlink w:history="1" r:id="rIdiprc1wkq5idh1mjgc4ur5">
+      <w:hyperlink w:history="1" r:id="rIdhnxcy_s1turyk3bzcbncx">
         <w:r>
           <w:rPr>
             <w:rFonts w:ascii="Arial" w:cs="Arial" w:eastAsia="Arial" w:hAnsi="Arial"/>
@@ -19557,13 +19694,116 @@
           <w:sz w:val="21"/>
           <w:szCs w:val="21"/>
         </w:rPr>
-        <w:t xml:space="preserve">Comunicate all'utente email e password temporanea con un canale sicuro, separato dall'email di benvenuto.</w:t>
+        <w:t xml:space="preserve">Il portale </w:t>
+      </w:r>
+      <w:r>
+        <w:rPr>
+          <w:rFonts w:ascii="Arial" w:cs="Arial" w:eastAsia="Arial" w:hAnsi="Arial"/>
+          <w:b/>
+          <w:bCs/>
+          <w:color w:val="1B2118"/>
+          <w:sz w:val="21"/>
+          <w:szCs w:val="21"/>
+        </w:rPr>
+        <w:t xml:space="preserve">invia all'utente un'email</w:t>
+      </w:r>
+      <w:r>
+        <w:rPr>
+          <w:rFonts w:ascii="Arial" w:cs="Arial" w:eastAsia="Arial" w:hAnsi="Arial"/>
+          <w:color w:val="1B2118"/>
+          <w:sz w:val="21"/>
+          <w:szCs w:val="21"/>
+        </w:rPr>
+        <w:t xml:space="preserve"> con l'indirizzo del portale, l'email di accesso e la password temporanea, ricordando che al primo accesso dovrà sceglierne una personale. La finestra dice se l'email è partita («✉ Email … inviata a …»). Se non è partita compare </w:t>
+      </w:r>
+      <w:r>
+        <w:rPr>
+          <w:rFonts w:ascii="Arial" w:cs="Arial" w:eastAsia="Arial" w:hAnsi="Arial"/>
+          <w:b/>
+          <w:bCs/>
+          <w:color w:val="1B2118"/>
+          <w:sz w:val="21"/>
+          <w:szCs w:val="21"/>
+        </w:rPr>
+        <w:t xml:space="preserve">⚠ Email non inviata</w:t>
+      </w:r>
+      <w:r>
+        <w:rPr>
+          <w:rFonts w:ascii="Arial" w:cs="Arial" w:eastAsia="Arial" w:hAnsi="Arial"/>
+          <w:color w:val="1B2118"/>
+          <w:sz w:val="21"/>
+          <w:szCs w:val="21"/>
+        </w:rPr>
+        <w:t xml:space="preserve"> con il motivo: l'utente è comunque creato, e la password va comunicata a mano con un canale sicuro, ad esempio per telefono.</w:t>
       </w:r>
     </w:p>
     <w:p>
       <w:pPr>
         <w:spacing w:after="60"/>
       </w:pPr>
+    </w:p>
+    <w:p>
+      <w:pPr>
+        <w:spacing w:after="140" w:line="300"/>
+      </w:pPr>
+      <w:r>
+        <w:rPr>
+          <w:rFonts w:ascii="Arial" w:cs="Arial" w:eastAsia="Arial" w:hAnsi="Arial"/>
+          <w:b/>
+          <w:bCs/>
+          <w:color w:val="1B2118"/>
+          <w:sz w:val="21"/>
+          <w:szCs w:val="21"/>
+        </w:rPr>
+        <w:t xml:space="preserve">Limite attuale delle email.</w:t>
+      </w:r>
+      <w:r>
+        <w:rPr>
+          <w:rFonts w:ascii="Arial" w:cs="Arial" w:eastAsia="Arial" w:hAnsi="Arial"/>
+          <w:color w:val="1B2118"/>
+          <w:sz w:val="21"/>
+          <w:szCs w:val="21"/>
+        </w:rPr>
+        <w:t xml:space="preserve"> Finché il dominio della Fondazione non è verificato su Resend, le email partono dal mittente di prova e arrivano </w:t>
+      </w:r>
+      <w:r>
+        <w:rPr>
+          <w:rFonts w:ascii="Arial" w:cs="Arial" w:eastAsia="Arial" w:hAnsi="Arial"/>
+          <w:b/>
+          <w:bCs/>
+          <w:color w:val="1B2118"/>
+          <w:sz w:val="21"/>
+          <w:szCs w:val="21"/>
+        </w:rPr>
+        <w:t xml:space="preserve">solo</w:t>
+      </w:r>
+      <w:r>
+        <w:rPr>
+          <w:rFonts w:ascii="Arial" w:cs="Arial" w:eastAsia="Arial" w:hAnsi="Arial"/>
+          <w:color w:val="1B2118"/>
+          <w:sz w:val="21"/>
+          <w:szCs w:val="21"/>
+        </w:rPr>
+        <w:t xml:space="preserve"> all'indirizzo del titolare dell'account Resend: per tutti gli altri compare «Email non inviata (Resend 403 …)». Dopo la verifica del dominio e l'impostazione del segreto </w:t>
+      </w:r>
+      <w:r>
+        <w:rPr>
+          <w:rFonts w:ascii="Consolas" w:cs="Consolas" w:eastAsia="Consolas" w:hAnsi="Consolas"/>
+          <w:color w:val="2F5D3A"/>
+          <w:sz w:val="21"/>
+          <w:szCs w:val="21"/>
+        </w:rPr>
+        <w:t xml:space="preserve">EMAIL_MITTENTE</w:t>
+      </w:r>
+      <w:r>
+        <w:rPr>
+          <w:rFonts w:ascii="Arial" w:cs="Arial" w:eastAsia="Arial" w:hAnsi="Arial"/>
+          <w:color w:val="1B2118"/>
+          <w:sz w:val="21"/>
+          <w:szCs w:val="21"/>
+        </w:rPr>
+        <w:t xml:space="preserve"> le email arrivano a tutti.</w:t>
+      </w:r>
     </w:p>
     <w:p>
       <w:pPr>
@@ -20086,7 +20326,27 @@
           <w:sz w:val="21"/>
           <w:szCs w:val="21"/>
         </w:rPr>
-        <w:t xml:space="preserve">Comunicate la password temporanea all'utente con un canale sicuro, ad esempio per telefono. Al primo accesso dovrà sceglierne una personale.</w:t>
+        <w:t xml:space="preserve">Il portale invia all'utente un'email con la nuova password temporanea e dice se è partita. Se compare </w:t>
+      </w:r>
+      <w:r>
+        <w:rPr>
+          <w:rFonts w:ascii="Arial" w:cs="Arial" w:eastAsia="Arial" w:hAnsi="Arial"/>
+          <w:b/>
+          <w:bCs/>
+          <w:color w:val="1B2118"/>
+          <w:sz w:val="21"/>
+          <w:szCs w:val="21"/>
+        </w:rPr>
+        <w:t xml:space="preserve">⚠ Email non inviata</w:t>
+      </w:r>
+      <w:r>
+        <w:rPr>
+          <w:rFonts w:ascii="Arial" w:cs="Arial" w:eastAsia="Arial" w:hAnsi="Arial"/>
+          <w:color w:val="1B2118"/>
+          <w:sz w:val="21"/>
+          <w:szCs w:val="21"/>
+        </w:rPr>
+        <w:t xml:space="preserve">, comunicate la password con un canale sicuro, ad esempio per telefono. Al primo accesso dovrà sceglierne una personale.</w:t>
       </w:r>
     </w:p>
     <w:p>
@@ -39796,7 +40056,7 @@
         <w:szCs w:val="16"/>
       </w:rPr>
       <w:tab/>
-      <w:t xml:space="preserve">Manuale Amministratore · Rev. 2.8 · 19/10/2026</w:t>
+      <w:t xml:space="preserve">Manuale Amministratore · Rev. 2.9 · 19/10/2026</w:t>
     </w:r>
   </w:p>
 </w:hdr>
@@ -39861,7 +40121,7 @@
         <w:szCs w:val="16"/>
       </w:rPr>
       <w:tab/>
-      <w:t xml:space="preserve">Manuale Amministratore · Rev. 2.8 · 19/10/2026</w:t>
+      <w:t xml:space="preserve">Manuale Amministratore · Rev. 2.9 · 19/10/2026</w:t>
     </w:r>
   </w:p>
 </w:hdr>

</xml_diff>

<commit_message>
Dashboard (ex Cruscotto) con barra a LED delle 7 fasi per ogni pratica; manuali e registro
Co-Authored-By: Claude Opus 5.5 <noreply@anthropic.com>
Claude-Session: https://claude.ai/code/session_01E8XCbEeVHWVP3hntUZ6kZ1
</commit_message>
<xml_diff>
--- a/public/documentazione/Manuale_Amministratore_Portale_CWP.docx
+++ b/public/documentazione/Manuale_Amministratore_Portale_CWP.docx
@@ -302,7 +302,7 @@
                 <w:sz w:val="20"/>
                 <w:szCs w:val="20"/>
               </w:rPr>
-              <w:t xml:space="preserve">Rev. 3.0</w:t>
+              <w:t xml:space="preserve">Rev. 3.1</w:t>
             </w:r>
           </w:p>
         </w:tc>
@@ -719,7 +719,7 @@
                 <w:sz w:val="18"/>
                 <w:szCs w:val="18"/>
               </w:rPr>
-              <w:t xml:space="preserve">3.0</w:t>
+              <w:t xml:space="preserve">3.1</w:t>
             </w:r>
           </w:p>
         </w:tc>
@@ -783,7 +783,7 @@
                 <w:sz w:val="18"/>
                 <w:szCs w:val="18"/>
               </w:rPr>
-              <w:t xml:space="preserve">Eliminazione degli utenti che non hanno mai operato (script 30).</w:t>
+              <w:t xml:space="preserve">Cruscotto diventa Dashboard; barra a LED delle 7 fasi per ogni pratica.</w:t>
             </w:r>
           </w:p>
         </w:tc>
@@ -853,7 +853,7 @@
                 <w:sz w:val="18"/>
                 <w:szCs w:val="18"/>
               </w:rPr>
-              <w:t xml:space="preserve">2.9</w:t>
+              <w:t xml:space="preserve">3.0</w:t>
             </w:r>
           </w:p>
         </w:tc>
@@ -919,7 +919,7 @@
                 <w:sz w:val="18"/>
                 <w:szCs w:val="18"/>
               </w:rPr>
-              <w:t xml:space="preserve">Email automatica con le credenziali al nuovo utente e alla reimpostazione della password.</w:t>
+              <w:t xml:space="preserve">Eliminazione degli utenti che non hanno mai operato (script 30).</w:t>
             </w:r>
           </w:p>
         </w:tc>
@@ -989,7 +989,7 @@
                 <w:sz w:val="18"/>
                 <w:szCs w:val="18"/>
               </w:rPr>
-              <w:t xml:space="preserve">2.8</w:t>
+              <w:t xml:space="preserve">2.9</w:t>
             </w:r>
           </w:p>
         </w:tc>
@@ -1053,7 +1053,7 @@
                 <w:sz w:val="18"/>
                 <w:szCs w:val="18"/>
               </w:rPr>
-              <w:t xml:space="preserve">Più Amministratori con accesso completo; Amministratore principale protetto (script 29).</w:t>
+              <w:t xml:space="preserve">Email automatica con le credenziali al nuovo utente e alla reimpostazione della password.</w:t>
             </w:r>
           </w:p>
         </w:tc>
@@ -1123,7 +1123,7 @@
                 <w:sz w:val="18"/>
                 <w:szCs w:val="18"/>
               </w:rPr>
-              <w:t xml:space="preserve">2.7</w:t>
+              <w:t xml:space="preserve">2.8</w:t>
             </w:r>
           </w:p>
         </w:tc>
@@ -1189,7 +1189,7 @@
                 <w:sz w:val="18"/>
                 <w:szCs w:val="18"/>
               </w:rPr>
-              <w:t xml:space="preserve">Simulatore: costi per il Comune secondo il Caso 1 (progetto volontario) o il Caso 2 (progetto obbligatorio da bando).</w:t>
+              <w:t xml:space="preserve">Più Amministratori con accesso completo; Amministratore principale protetto (script 29).</w:t>
             </w:r>
           </w:p>
         </w:tc>
@@ -1259,7 +1259,7 @@
                 <w:sz w:val="18"/>
                 <w:szCs w:val="18"/>
               </w:rPr>
-              <w:t xml:space="preserve">2.6</w:t>
+              <w:t xml:space="preserve">2.7</w:t>
             </w:r>
           </w:p>
         </w:tc>
@@ -1323,7 +1323,7 @@
                 <w:sz w:val="18"/>
                 <w:szCs w:val="18"/>
               </w:rPr>
-              <w:t xml:space="preserve">Simulatore: valore del credito anno per anno, proposto 32 €.</w:t>
+              <w:t xml:space="preserve">Simulatore: costi per il Comune secondo il Caso 1 (progetto volontario) o il Caso 2 (progetto obbligatorio da bando).</w:t>
             </w:r>
           </w:p>
         </w:tc>
@@ -1393,7 +1393,7 @@
                 <w:sz w:val="18"/>
                 <w:szCs w:val="18"/>
               </w:rPr>
-              <w:t xml:space="preserve">2.5</w:t>
+              <w:t xml:space="preserve">2.6</w:t>
             </w:r>
           </w:p>
         </w:tc>
@@ -1459,7 +1459,7 @@
                 <w:sz w:val="18"/>
                 <w:szCs w:val="18"/>
               </w:rPr>
-              <w:t xml:space="preserve">Simulatore: simulazione economica con valore unitario del credito e costi per il Comune (contratti tipo della Fondazione, Schema tariffario).</w:t>
+              <w:t xml:space="preserve">Simulatore: valore del credito anno per anno, proposto 32 €.</w:t>
             </w:r>
           </w:p>
         </w:tc>
@@ -1529,7 +1529,7 @@
                 <w:sz w:val="18"/>
                 <w:szCs w:val="18"/>
               </w:rPr>
-              <w:t xml:space="preserve">2.4</w:t>
+              <w:t xml:space="preserve">2.5</w:t>
             </w:r>
           </w:p>
         </w:tc>
@@ -1593,7 +1593,7 @@
                 <w:sz w:val="18"/>
                 <w:szCs w:val="18"/>
               </w:rPr>
-              <w:t xml:space="preserve">Simulatore: riferimento sempre alla soglia del 65% di differenziata e controllo dei valori fuori scala.</w:t>
+              <w:t xml:space="preserve">Simulatore: simulazione economica con valore unitario del credito e costi per il Comune (contratti tipo della Fondazione, Schema tariffario).</w:t>
             </w:r>
           </w:p>
         </w:tc>
@@ -1663,7 +1663,7 @@
                 <w:sz w:val="18"/>
                 <w:szCs w:val="18"/>
               </w:rPr>
-              <w:t xml:space="preserve">2.3</w:t>
+              <w:t xml:space="preserve">2.4</w:t>
             </w:r>
           </w:p>
         </w:tc>
@@ -1729,7 +1729,7 @@
                 <w:sz w:val="18"/>
                 <w:szCs w:val="18"/>
               </w:rPr>
-              <w:t xml:space="preserve">Simulatore conforme al modello CWP: scenario di riferimento dello Standard 4.8.1, situazione attuale, conformità.</w:t>
+              <w:t xml:space="preserve">Simulatore: riferimento sempre alla soglia del 65% di differenziata e controllo dei valori fuori scala.</w:t>
             </w:r>
           </w:p>
         </w:tc>
@@ -1799,7 +1799,7 @@
                 <w:sz w:val="18"/>
                 <w:szCs w:val="18"/>
               </w:rPr>
-              <w:t xml:space="preserve">2.2</w:t>
+              <w:t xml:space="preserve">2.3</w:t>
             </w:r>
           </w:p>
         </w:tc>
@@ -1863,7 +1863,7 @@
                 <w:sz w:val="18"/>
                 <w:szCs w:val="18"/>
               </w:rPr>
-              <w:t xml:space="preserve">Nuovo capitolo «Simulatore di scenari»: creazione, anno base, obiettivi annui, risultati, modello di stima.</w:t>
+              <w:t xml:space="preserve">Simulatore conforme al modello CWP: scenario di riferimento dello Standard 4.8.1, situazione attuale, conformità.</w:t>
             </w:r>
           </w:p>
         </w:tc>
@@ -1933,7 +1933,7 @@
                 <w:sz w:val="18"/>
                 <w:szCs w:val="18"/>
               </w:rPr>
-              <w:t xml:space="preserve">2.1</w:t>
+              <w:t xml:space="preserve">2.2</w:t>
             </w:r>
           </w:p>
         </w:tc>
@@ -1999,7 +1999,7 @@
                 <w:sz w:val="18"/>
                 <w:szCs w:val="18"/>
               </w:rPr>
-              <w:t xml:space="preserve">Funzioni in arrivo: simulatore di scenari (7, 10 o 21 anni, obiettivi annui, % di differenziata e crediti stimati) e assistente virtuale (Claude).</w:t>
+              <w:t xml:space="preserve">Nuovo capitolo «Simulatore di scenari»: creazione, anno base, obiettivi annui, risultati, modello di stima.</w:t>
             </w:r>
           </w:p>
         </w:tc>
@@ -2069,7 +2069,7 @@
                 <w:sz w:val="18"/>
                 <w:szCs w:val="18"/>
               </w:rPr>
-              <w:t xml:space="preserve">2.0</w:t>
+              <w:t xml:space="preserve">2.1</w:t>
             </w:r>
           </w:p>
         </w:tc>
@@ -2133,7 +2133,7 @@
                 <w:sz w:val="18"/>
                 <w:szCs w:val="18"/>
               </w:rPr>
-              <w:t xml:space="preserve">Copie di sicurezza e ripristino: rimando alle Istruzioni di ripristino e punti essenziali (capitolo Manutenzione ed emergenze).</w:t>
+              <w:t xml:space="preserve">Funzioni in arrivo: simulatore di scenari (7, 10 o 21 anni, obiettivi annui, % di differenziata e crediti stimati) e assistente virtuale (Claude).</w:t>
             </w:r>
           </w:p>
         </w:tc>
@@ -2203,7 +2203,7 @@
                 <w:sz w:val="18"/>
                 <w:szCs w:val="18"/>
               </w:rPr>
-              <w:t xml:space="preserve">1.9</w:t>
+              <w:t xml:space="preserve">2.0</w:t>
             </w:r>
           </w:p>
         </w:tc>
@@ -2269,7 +2269,7 @@
                 <w:sz w:val="18"/>
                 <w:szCs w:val="18"/>
               </w:rPr>
-              <w:t xml:space="preserve">Fondazione Operate soggetto promotore del programma (esclusiva conferita da Wastelab).</w:t>
+              <w:t xml:space="preserve">Copie di sicurezza e ripristino: rimando alle Istruzioni di ripristino e punti essenziali (capitolo Manutenzione ed emergenze).</w:t>
             </w:r>
           </w:p>
         </w:tc>
@@ -2339,7 +2339,7 @@
                 <w:sz w:val="18"/>
                 <w:szCs w:val="18"/>
               </w:rPr>
-              <w:t xml:space="preserve">1.8</w:t>
+              <w:t xml:space="preserve">1.9</w:t>
             </w:r>
           </w:p>
         </w:tc>
@@ -2403,7 +2403,7 @@
                 <w:sz w:val="18"/>
                 <w:szCs w:val="18"/>
               </w:rPr>
-              <w:t xml:space="preserve">PEC del Programma e documenti ufficiali già pubblicati sulla pagina pubblica.</w:t>
+              <w:t xml:space="preserve">Fondazione Operate soggetto promotore del programma (esclusiva conferita da Wastelab).</w:t>
             </w:r>
           </w:p>
         </w:tc>
@@ -2473,7 +2473,7 @@
                 <w:sz w:val="18"/>
                 <w:szCs w:val="18"/>
               </w:rPr>
-              <w:t xml:space="preserve">1.7</w:t>
+              <w:t xml:space="preserve">1.8</w:t>
             </w:r>
           </w:p>
         </w:tc>
@@ -2506,7 +2506,7 @@
                 <w:sz w:val="18"/>
                 <w:szCs w:val="18"/>
               </w:rPr>
-              <w:t xml:space="preserve">18/10/2026</w:t>
+              <w:t xml:space="preserve">19/10/2026</w:t>
             </w:r>
           </w:p>
         </w:tc>
@@ -2539,7 +2539,7 @@
                 <w:sz w:val="18"/>
                 <w:szCs w:val="18"/>
               </w:rPr>
-              <w:t xml:space="preserve">Allineamento ai documenti ufficiali del Programma (script 22-24): Rapporto a 7 fasi, feedback pubblico, stati del Programma, dati del progetto e territorio ISTAT, ritiro e rientro, account unico e delegati, registri, tariffe e sospensione, accuratezza e accertamenti, informazioni del Programma e metodologie, modelli pubblici; nuovi capitoli Crediti emessi, Reclami, Pagina pubblica; qualità dei dati nel calcolo.</w:t>
+              <w:t xml:space="preserve">PEC del Programma e documenti ufficiali già pubblicati sulla pagina pubblica.</w:t>
             </w:r>
           </w:p>
         </w:tc>
@@ -2609,7 +2609,7 @@
                 <w:sz w:val="18"/>
                 <w:szCs w:val="18"/>
               </w:rPr>
-              <w:t xml:space="preserve">1.6</w:t>
+              <w:t xml:space="preserve">1.7</w:t>
             </w:r>
           </w:p>
         </w:tc>
@@ -2673,7 +2673,7 @@
                 <w:sz w:val="18"/>
                 <w:szCs w:val="18"/>
               </w:rPr>
-              <w:t xml:space="preserve">Calcolo crediti: descrizione corretta del buffer (somma delle voci delle Tabelle 15 e 16, più il 20% con le sole utenze virtuose, al massimo 80%).</w:t>
+              <w:t xml:space="preserve">Allineamento ai documenti ufficiali del Programma (script 22-24): Rapporto a 7 fasi, feedback pubblico, stati del Programma, dati del progetto e territorio ISTAT, ritiro e rientro, account unico e delegati, registri, tariffe e sospensione, accuratezza e accertamenti, informazioni del Programma e metodologie, modelli pubblici; nuovi capitoli Crediti emessi, Reclami, Pagina pubblica; qualità dei dati nel calcolo.</w:t>
             </w:r>
           </w:p>
         </w:tc>
@@ -2743,7 +2743,7 @@
                 <w:sz w:val="18"/>
                 <w:szCs w:val="18"/>
               </w:rPr>
-              <w:t xml:space="preserve">1.5</w:t>
+              <w:t xml:space="preserve">1.6</w:t>
             </w:r>
           </w:p>
         </w:tc>
@@ -2809,7 +2809,7 @@
                 <w:sz w:val="18"/>
                 <w:szCs w:val="18"/>
               </w:rPr>
-              <w:t xml:space="preserve">Nuova pagina Anagrafiche (Organizzazioni ed Enti, anche per gli Operatori); Rapporti con 4 fasi e durate proprie; documenti richiesti per fase; consultazione con documento bloccato, osservazioni numerate e motivazione; conservazione per 10 anni; fascicolo con riepilogo PDF e nuove cartelle.</w:t>
+              <w:t xml:space="preserve">Calcolo crediti: descrizione corretta del buffer (somma delle voci delle Tabelle 15 e 16, più il 20% con le sole utenze virtuose, al massimo 80%).</w:t>
             </w:r>
           </w:p>
         </w:tc>
@@ -2879,7 +2879,7 @@
                 <w:sz w:val="18"/>
                 <w:szCs w:val="18"/>
               </w:rPr>
-              <w:t xml:space="preserve">1.4</w:t>
+              <w:t xml:space="preserve">1.5</w:t>
             </w:r>
           </w:p>
         </w:tc>
@@ -2943,7 +2943,7 @@
                 <w:sz w:val="18"/>
                 <w:szCs w:val="18"/>
               </w:rPr>
-              <w:t xml:space="preserve">Calcolo crediti: il risultato si azzera quando cambiano dati o Banca Dati Utenze, conferma solo dopo un nuovo «Calcola». Gestione utenti: password temporanea di almeno 10 caratteri con lettere e numeri, creazione annullata se non va a buon fine, nessun accesso ai dati prima del cambio password.</w:t>
+              <w:t xml:space="preserve">Nuova pagina Anagrafiche (Organizzazioni ed Enti, anche per gli Operatori); Rapporti con 4 fasi e durate proprie; documenti richiesti per fase; consultazione con documento bloccato, osservazioni numerate e motivazione; conservazione per 10 anni; fascicolo con riepilogo PDF e nuove cartelle.</w:t>
             </w:r>
           </w:p>
         </w:tc>
@@ -3013,7 +3013,7 @@
                 <w:sz w:val="18"/>
                 <w:szCs w:val="18"/>
               </w:rPr>
-              <w:t xml:space="preserve">1.3</w:t>
+              <w:t xml:space="preserve">1.4</w:t>
             </w:r>
           </w:p>
         </w:tc>
@@ -3079,7 +3079,7 @@
                 <w:sz w:val="18"/>
                 <w:szCs w:val="18"/>
               </w:rPr>
-              <w:t xml:space="preserve">Rapporto di calcolo in PDF, archiviazione nella pratica, numero di registro, registro dei crediti.</w:t>
+              <w:t xml:space="preserve">Calcolo crediti: il risultato si azzera quando cambiano dati o Banca Dati Utenze, conferma solo dopo un nuovo «Calcola». Gestione utenti: password temporanea di almeno 10 caratteri con lettere e numeri, creazione annullata se non va a buon fine, nessun accesso ai dati prima del cambio password.</w:t>
             </w:r>
           </w:p>
         </w:tc>
@@ -3149,7 +3149,7 @@
                 <w:sz w:val="18"/>
                 <w:szCs w:val="18"/>
               </w:rPr>
-              <w:t xml:space="preserve">1.2</w:t>
+              <w:t xml:space="preserve">1.3</w:t>
             </w:r>
           </w:p>
         </w:tc>
@@ -3213,7 +3213,7 @@
                 <w:sz w:val="18"/>
                 <w:szCs w:val="18"/>
               </w:rPr>
-              <w:t xml:space="preserve">Calcolo crediti: importare il tracciato nel calcolo (dai documenti della pratica o dal computer), singole letture, blocco dei dati personali, controlli di coerenza.</w:t>
+              <w:t xml:space="preserve">Rapporto di calcolo in PDF, archiviazione nella pratica, numero di registro, registro dei crediti.</w:t>
             </w:r>
           </w:p>
         </w:tc>
@@ -3283,7 +3283,7 @@
                 <w:sz w:val="18"/>
                 <w:szCs w:val="18"/>
               </w:rPr>
-              <w:t xml:space="preserve">1.1</w:t>
+              <w:t xml:space="preserve">1.2</w:t>
             </w:r>
           </w:p>
         </w:tc>
@@ -3349,7 +3349,7 @@
                 <w:sz w:val="18"/>
                 <w:szCs w:val="18"/>
               </w:rPr>
-              <w:t xml:space="preserve">Note di fase, Ente di Validazione della pratica, consultazione sulla pagina pubblica con conferma dell'email, moderazione con autori e allegati, errata corrige; nuovo capitolo Messaggi con il Comune; pagamenti visibili al Comune; Impostazioni: Enti di Validazione e Modelli di documento; notifiche aggiornate.</w:t>
+              <w:t xml:space="preserve">Calcolo crediti: importare il tracciato nel calcolo (dai documenti della pratica o dal computer), singole letture, blocco dei dati personali, controlli di coerenza.</w:t>
             </w:r>
           </w:p>
         </w:tc>
@@ -3419,6 +3419,140 @@
                 <w:sz w:val="18"/>
                 <w:szCs w:val="18"/>
               </w:rPr>
+              <w:t xml:space="preserve">1.1</w:t>
+            </w:r>
+          </w:p>
+        </w:tc>
+        <w:tc>
+          <w:tcPr>
+            <w:tcW w:type="dxa" w:w="1300"/>
+            <w:tcBorders>
+              <w:top w:val="single" w:color="D9D4C5" w:sz="4"/>
+              <w:left w:val="single" w:color="D9D4C5" w:sz="4"/>
+              <w:bottom w:val="single" w:color="D9D4C5" w:sz="4"/>
+              <w:right w:val="single" w:color="D9D4C5" w:sz="4"/>
+            </w:tcBorders>
+            <w:tcMar>
+              <w:top w:type="dxa" w:w="70"/>
+              <w:left w:type="dxa" w:w="110"/>
+              <w:bottom w:type="dxa" w:w="70"/>
+              <w:right w:type="dxa" w:w="110"/>
+            </w:tcMar>
+            <w:vAlign w:val="center"/>
+          </w:tcPr>
+          <w:p>
+            <w:pPr>
+              <w:spacing w:after="0" w:before="0"/>
+            </w:pPr>
+            <w:r>
+              <w:rPr>
+                <w:rFonts w:ascii="Arial" w:cs="Arial" w:eastAsia="Arial" w:hAnsi="Arial"/>
+                <w:color w:val="1B2118"/>
+                <w:sz w:val="18"/>
+                <w:szCs w:val="18"/>
+              </w:rPr>
+              <w:t xml:space="preserve">18/10/2026</w:t>
+            </w:r>
+          </w:p>
+        </w:tc>
+        <w:tc>
+          <w:tcPr>
+            <w:tcW w:type="dxa" w:w="5538"/>
+            <w:tcBorders>
+              <w:top w:val="single" w:color="D9D4C5" w:sz="4"/>
+              <w:left w:val="single" w:color="D9D4C5" w:sz="4"/>
+              <w:bottom w:val="single" w:color="D9D4C5" w:sz="4"/>
+              <w:right w:val="single" w:color="D9D4C5" w:sz="4"/>
+            </w:tcBorders>
+            <w:tcMar>
+              <w:top w:type="dxa" w:w="70"/>
+              <w:left w:type="dxa" w:w="110"/>
+              <w:bottom w:type="dxa" w:w="70"/>
+              <w:right w:type="dxa" w:w="110"/>
+            </w:tcMar>
+            <w:vAlign w:val="center"/>
+          </w:tcPr>
+          <w:p>
+            <w:pPr>
+              <w:spacing w:after="0" w:before="0"/>
+            </w:pPr>
+            <w:r>
+              <w:rPr>
+                <w:rFonts w:ascii="Arial" w:cs="Arial" w:eastAsia="Arial" w:hAnsi="Arial"/>
+                <w:color w:val="1B2118"/>
+                <w:sz w:val="18"/>
+                <w:szCs w:val="18"/>
+              </w:rPr>
+              <w:t xml:space="preserve">Note di fase, Ente di Validazione della pratica, consultazione sulla pagina pubblica con conferma dell'email, moderazione con autori e allegati, errata corrige; nuovo capitolo Messaggi con il Comune; pagamenti visibili al Comune; Impostazioni: Enti di Validazione e Modelli di documento; notifiche aggiornate.</w:t>
+            </w:r>
+          </w:p>
+        </w:tc>
+        <w:tc>
+          <w:tcPr>
+            <w:tcW w:type="dxa" w:w="2000"/>
+            <w:tcBorders>
+              <w:top w:val="single" w:color="D9D4C5" w:sz="4"/>
+              <w:left w:val="single" w:color="D9D4C5" w:sz="4"/>
+              <w:bottom w:val="single" w:color="D9D4C5" w:sz="4"/>
+              <w:right w:val="single" w:color="D9D4C5" w:sz="4"/>
+            </w:tcBorders>
+            <w:tcMar>
+              <w:top w:type="dxa" w:w="70"/>
+              <w:left w:type="dxa" w:w="110"/>
+              <w:bottom w:type="dxa" w:w="70"/>
+              <w:right w:type="dxa" w:w="110"/>
+            </w:tcMar>
+            <w:vAlign w:val="center"/>
+          </w:tcPr>
+          <w:p>
+            <w:pPr>
+              <w:spacing w:after="0" w:before="0"/>
+            </w:pPr>
+            <w:r>
+              <w:rPr>
+                <w:rFonts w:ascii="Arial" w:cs="Arial" w:eastAsia="Arial" w:hAnsi="Arial"/>
+                <w:color w:val="1B2118"/>
+                <w:sz w:val="18"/>
+                <w:szCs w:val="18"/>
+              </w:rPr>
+              <w:t xml:space="preserve">Fondazione Operate</w:t>
+            </w:r>
+          </w:p>
+        </w:tc>
+      </w:tr>
+      <w:tr>
+        <w:trPr>
+          <w:cantSplit/>
+        </w:trPr>
+        <w:tc>
+          <w:tcPr>
+            <w:tcW w:type="dxa" w:w="800"/>
+            <w:tcBorders>
+              <w:top w:val="single" w:color="D9D4C5" w:sz="4"/>
+              <w:left w:val="single" w:color="D9D4C5" w:sz="4"/>
+              <w:bottom w:val="single" w:color="D9D4C5" w:sz="4"/>
+              <w:right w:val="single" w:color="D9D4C5" w:sz="4"/>
+            </w:tcBorders>
+            <w:shd w:fill="F6F4EE" w:color="auto" w:val="clear"/>
+            <w:tcMar>
+              <w:top w:type="dxa" w:w="70"/>
+              <w:left w:type="dxa" w:w="110"/>
+              <w:bottom w:type="dxa" w:w="70"/>
+              <w:right w:type="dxa" w:w="110"/>
+            </w:tcMar>
+            <w:vAlign w:val="center"/>
+          </w:tcPr>
+          <w:p>
+            <w:pPr>
+              <w:spacing w:after="0" w:before="0"/>
+            </w:pPr>
+            <w:r>
+              <w:rPr>
+                <w:rFonts w:ascii="Arial" w:cs="Arial" w:eastAsia="Arial" w:hAnsi="Arial"/>
+                <w:color w:val="1B2118"/>
+                <w:sz w:val="18"/>
+                <w:szCs w:val="18"/>
+              </w:rPr>
               <w:t xml:space="preserve">1.0</w:t>
             </w:r>
           </w:p>
@@ -3432,6 +3566,7 @@
               <w:bottom w:val="single" w:color="D9D4C5" w:sz="4"/>
               <w:right w:val="single" w:color="D9D4C5" w:sz="4"/>
             </w:tcBorders>
+            <w:shd w:fill="F6F4EE" w:color="auto" w:val="clear"/>
             <w:tcMar>
               <w:top w:type="dxa" w:w="70"/>
               <w:left w:type="dxa" w:w="110"/>
@@ -3464,6 +3599,7 @@
               <w:bottom w:val="single" w:color="D9D4C5" w:sz="4"/>
               <w:right w:val="single" w:color="D9D4C5" w:sz="4"/>
             </w:tcBorders>
+            <w:shd w:fill="F6F4EE" w:color="auto" w:val="clear"/>
             <w:tcMar>
               <w:top w:type="dxa" w:w="70"/>
               <w:left w:type="dxa" w:w="110"/>
@@ -3496,6 +3632,7 @@
               <w:bottom w:val="single" w:color="D9D4C5" w:sz="4"/>
               <w:right w:val="single" w:color="D9D4C5" w:sz="4"/>
             </w:tcBorders>
+            <w:shd w:fill="F6F4EE" w:color="auto" w:val="clear"/>
             <w:tcMar>
               <w:top w:type="dxa" w:w="70"/>
               <w:left w:type="dxa" w:w="110"/>
@@ -3537,7 +3674,7 @@
           <w:sz w:val="20"/>
           <w:szCs w:val="20"/>
         </w:rPr>
-        <w:t xml:space="preserve">Questo documento descrive il portale alla revisione 3.0 del 19/10/2026. A ogni modifica del portale il manuale viene aggiornato e la revisione incrementata; la versione corrente si scarica dall'area Documentazione del portale (solo Amministratori).</w:t>
+        <w:t xml:space="preserve">Questo documento descrive il portale alla revisione 3.1 del 19/10/2026. A ogni modifica del portale il manuale viene aggiornato e la revisione incrementata; la versione corrente si scarica dall'area Documentazione del portale (solo Amministratori).</w:t>
       </w:r>
     </w:p>
     <w:p>
@@ -3637,7 +3774,7 @@
             <w:sz w:val="22"/>
             <w:szCs w:val="22"/>
           </w:rPr>
-          <w:t xml:space="preserve">3.  Cruscotto</w:t>
+          <w:t xml:space="preserve">3.  Dashboard</w:t>
         </w:r>
         <w:r>
           <w:rPr>
@@ -4677,7 +4814,7 @@
                 <w:sz w:val="18"/>
                 <w:szCs w:val="18"/>
               </w:rPr>
-              <w:t xml:space="preserve">Cruscotto, pratiche, fasi, scadenze</w:t>
+              <w:t xml:space="preserve">Dashboard, pratiche, fasi, scadenze</w:t>
             </w:r>
           </w:p>
         </w:tc>
@@ -6201,7 +6338,7 @@
         </w:rPr>
         <w:t xml:space="preserve">Si accede da </w:t>
       </w:r>
-      <w:hyperlink w:history="1" r:id="rIdnb6uqucpi5pc4myihby6h">
+      <w:hyperlink w:history="1" r:id="rId81dtopimi38fql_6krtsp">
         <w:r>
           <w:rPr>
             <w:rFonts w:ascii="Arial" w:cs="Arial" w:eastAsia="Arial" w:hAnsi="Arial"/>
@@ -6519,7 +6656,7 @@
                 <w:sz w:val="18"/>
                 <w:szCs w:val="18"/>
               </w:rPr>
-              <w:t xml:space="preserve">Cruscotto, Pratiche, Anagrafiche, Crediti emessi, Reclami, Manuale</w:t>
+              <w:t xml:space="preserve">Dashboard, Pratiche, Anagrafiche, Crediti emessi, Reclami, Manuale</w:t>
             </w:r>
           </w:p>
         </w:tc>
@@ -6590,7 +6727,7 @@
                 <w:sz w:val="18"/>
                 <w:szCs w:val="18"/>
               </w:rPr>
-              <w:t xml:space="preserve">Cruscotto, Pratiche, Utenti, Audit, Anagrafiche, Calcolo crediti, Crediti emessi, Reclami, Impostazioni, Documentazione</w:t>
+              <w:t xml:space="preserve">Dashboard, Pratiche, Utenti, Audit, Anagrafiche, Calcolo crediti, Crediti emessi, Reclami, Impostazioni, Documentazione</w:t>
             </w:r>
           </w:p>
         </w:tc>
@@ -7018,7 +7155,7 @@
           <w:sz w:val="34"/>
           <w:szCs w:val="34"/>
         </w:rPr>
-        <w:t xml:space="preserve">3. Cruscotto</w:t>
+        <w:t xml:space="preserve">3. Dashboard</w:t>
       </w:r>
       <w:bookmarkEnd w:id="1"/>
     </w:p>
@@ -7033,27 +7170,152 @@
           <w:sz w:val="21"/>
           <w:szCs w:val="21"/>
         </w:rPr>
-        <w:t xml:space="preserve">Il </w:t>
-      </w:r>
-      <w:r>
-        <w:rPr>
-          <w:rFonts w:ascii="Arial" w:cs="Arial" w:eastAsia="Arial" w:hAnsi="Arial"/>
-          <w:b/>
-          <w:bCs/>
-          <w:color w:val="1B2118"/>
-          <w:sz w:val="21"/>
-          <w:szCs w:val="21"/>
-        </w:rPr>
-        <w:t xml:space="preserve">Cruscotto</w:t>
-      </w:r>
-      <w:r>
-        <w:rPr>
-          <w:rFonts w:ascii="Arial" w:cs="Arial" w:eastAsia="Arial" w:hAnsi="Arial"/>
-          <w:color w:val="1B2118"/>
-          <w:sz w:val="21"/>
-          <w:szCs w:val="21"/>
-        </w:rPr>
-        <w:t xml:space="preserve"> è la pagina iniziale dello staff: mostra in un'unica tabella tutte le pratiche, Progetti e Rapporti, con la fase corrente, la scadenza e ciò che c'è da fare.</w:t>
+        <w:t xml:space="preserve">La </w:t>
+      </w:r>
+      <w:r>
+        <w:rPr>
+          <w:rFonts w:ascii="Arial" w:cs="Arial" w:eastAsia="Arial" w:hAnsi="Arial"/>
+          <w:b/>
+          <w:bCs/>
+          <w:color w:val="1B2118"/>
+          <w:sz w:val="21"/>
+          <w:szCs w:val="21"/>
+        </w:rPr>
+        <w:t xml:space="preserve">Dashboard</w:t>
+      </w:r>
+      <w:r>
+        <w:rPr>
+          <w:rFonts w:ascii="Arial" w:cs="Arial" w:eastAsia="Arial" w:hAnsi="Arial"/>
+          <w:color w:val="1B2118"/>
+          <w:sz w:val="21"/>
+          <w:szCs w:val="21"/>
+        </w:rPr>
+        <w:t xml:space="preserve"> è la pagina iniziale dello staff: mostra in un'unica tabella tutte le pratiche, Progetti e Rapporti, con l'avanzamento, la fase corrente, la scadenza e ciò che c'è da fare.</w:t>
+      </w:r>
+    </w:p>
+    <w:p>
+      <w:pPr>
+        <w:spacing w:after="140" w:line="300"/>
+      </w:pPr>
+      <w:r>
+        <w:rPr>
+          <w:rFonts w:ascii="Arial" w:cs="Arial" w:eastAsia="Arial" w:hAnsi="Arial"/>
+          <w:b/>
+          <w:bCs/>
+          <w:color w:val="1B2118"/>
+          <w:sz w:val="21"/>
+          <w:szCs w:val="21"/>
+        </w:rPr>
+        <w:t xml:space="preserve">Barra di avanzamento a LED.</w:t>
+      </w:r>
+      <w:r>
+        <w:rPr>
+          <w:rFonts w:ascii="Arial" w:cs="Arial" w:eastAsia="Arial" w:hAnsi="Arial"/>
+          <w:color w:val="1B2118"/>
+          <w:sz w:val="21"/>
+          <w:szCs w:val="21"/>
+        </w:rPr>
+        <w:t xml:space="preserve"> La colonna </w:t>
+      </w:r>
+      <w:r>
+        <w:rPr>
+          <w:rFonts w:ascii="Arial" w:cs="Arial" w:eastAsia="Arial" w:hAnsi="Arial"/>
+          <w:b/>
+          <w:bCs/>
+          <w:color w:val="1B2118"/>
+          <w:sz w:val="21"/>
+          <w:szCs w:val="21"/>
+        </w:rPr>
+        <w:t xml:space="preserve">Avanzamento</w:t>
+      </w:r>
+      <w:r>
+        <w:rPr>
+          <w:rFonts w:ascii="Arial" w:cs="Arial" w:eastAsia="Arial" w:hAnsi="Arial"/>
+          <w:color w:val="1B2118"/>
+          <w:sz w:val="21"/>
+          <w:szCs w:val="21"/>
+        </w:rPr>
+        <w:t xml:space="preserve"> mostra per ogni pratica (quindi per ogni Comune) una barra di 7 luci, una per fase. Le fasi </w:t>
+      </w:r>
+      <w:r>
+        <w:rPr>
+          <w:rFonts w:ascii="Arial" w:cs="Arial" w:eastAsia="Arial" w:hAnsi="Arial"/>
+          <w:b/>
+          <w:bCs/>
+          <w:color w:val="1B2118"/>
+          <w:sz w:val="21"/>
+          <w:szCs w:val="21"/>
+        </w:rPr>
+        <w:t xml:space="preserve">completate sono accese</w:t>
+      </w:r>
+      <w:r>
+        <w:rPr>
+          <w:rFonts w:ascii="Arial" w:cs="Arial" w:eastAsia="Arial" w:hAnsi="Arial"/>
+          <w:color w:val="1B2118"/>
+          <w:sz w:val="21"/>
+          <w:szCs w:val="21"/>
+        </w:rPr>
+        <w:t xml:space="preserve"> (ambra), quelle </w:t>
+      </w:r>
+      <w:r>
+        <w:rPr>
+          <w:rFonts w:ascii="Arial" w:cs="Arial" w:eastAsia="Arial" w:hAnsi="Arial"/>
+          <w:b/>
+          <w:bCs/>
+          <w:color w:val="1B2118"/>
+          <w:sz w:val="21"/>
+          <w:szCs w:val="21"/>
+        </w:rPr>
+        <w:t xml:space="preserve">ancora da fare sono spente</w:t>
+      </w:r>
+      <w:r>
+        <w:rPr>
+          <w:rFonts w:ascii="Arial" w:cs="Arial" w:eastAsia="Arial" w:hAnsi="Arial"/>
+          <w:color w:val="1B2118"/>
+          <w:sz w:val="21"/>
+          <w:szCs w:val="21"/>
+        </w:rPr>
+        <w:t xml:space="preserve">. La </w:t>
+      </w:r>
+      <w:r>
+        <w:rPr>
+          <w:rFonts w:ascii="Arial" w:cs="Arial" w:eastAsia="Arial" w:hAnsi="Arial"/>
+          <w:b/>
+          <w:bCs/>
+          <w:color w:val="1B2118"/>
+          <w:sz w:val="21"/>
+          <w:szCs w:val="21"/>
+        </w:rPr>
+        <w:t xml:space="preserve">settima luce</w:t>
+      </w:r>
+      <w:r>
+        <w:rPr>
+          <w:rFonts w:ascii="Arial" w:cs="Arial" w:eastAsia="Arial" w:hAnsi="Arial"/>
+          <w:color w:val="1B2118"/>
+          <w:sz w:val="21"/>
+          <w:szCs w:val="21"/>
+        </w:rPr>
+        <w:t xml:space="preserve">, la Chiusura, si accende in </w:t>
+      </w:r>
+      <w:r>
+        <w:rPr>
+          <w:rFonts w:ascii="Arial" w:cs="Arial" w:eastAsia="Arial" w:hAnsi="Arial"/>
+          <w:b/>
+          <w:bCs/>
+          <w:color w:val="1B2118"/>
+          <w:sz w:val="21"/>
+          <w:szCs w:val="21"/>
+        </w:rPr>
+        <w:t xml:space="preserve">verde</w:t>
+      </w:r>
+      <w:r>
+        <w:rPr>
+          <w:rFonts w:ascii="Arial" w:cs="Arial" w:eastAsia="Arial" w:hAnsi="Arial"/>
+          <w:color w:val="1B2118"/>
+          <w:sz w:val="21"/>
+          <w:szCs w:val="21"/>
+        </w:rPr>
+        <w:t xml:space="preserve">. La fase in corso è spenta ma ha un contorno ambra, così si vede subito dove è arrivata la pratica. Accanto c'è il conteggio, ad esempio «4/7». Passando il mouse su una luce compaiono numero, nome e stato della fase.</w:t>
       </w:r>
     </w:p>
     <w:p>
@@ -14156,7 +14418,7 @@
           <w:sz w:val="21"/>
           <w:szCs w:val="21"/>
         </w:rPr>
-        <w:t xml:space="preserve">. Nel Cruscotto i riquadri </w:t>
+        <w:t xml:space="preserve">. Nella Dashboard i riquadri </w:t>
       </w:r>
       <w:r>
         <w:rPr>
@@ -40391,7 +40653,7 @@
         <w:szCs w:val="16"/>
       </w:rPr>
       <w:tab/>
-      <w:t xml:space="preserve">Manuale Amministratore · Rev. 3.0 · 19/10/2026</w:t>
+      <w:t xml:space="preserve">Manuale Amministratore · Rev. 3.1 · 19/10/2026</w:t>
     </w:r>
   </w:p>
 </w:hdr>
@@ -40456,7 +40718,7 @@
         <w:szCs w:val="16"/>
       </w:rPr>
       <w:tab/>
-      <w:t xml:space="preserve">Manuale Amministratore · Rev. 3.0 · 19/10/2026</w:t>
+      <w:t xml:space="preserve">Manuale Amministratore · Rev. 3.1 · 19/10/2026</w:t>
     </w:r>
   </w:p>
 </w:hdr>

</xml_diff>

<commit_message>
Simulatore: metodo per utenza (solo utenze virtuose) come nell'Allegato A EsaCom, buffer guidato del Capitolo 7, taratura; analisi e manuali
Co-Authored-By: Claude Opus 5.5 <noreply@anthropic.com>
Claude-Session: https://claude.ai/code/session_01E8XCbEeVHWVP3hntUZ6kZ1
</commit_message>
<xml_diff>
--- a/public/documentazione/Manuale_Amministratore_Portale_CWP.docx
+++ b/public/documentazione/Manuale_Amministratore_Portale_CWP.docx
@@ -302,7 +302,7 @@
                 <w:sz w:val="20"/>
                 <w:szCs w:val="20"/>
               </w:rPr>
-              <w:t xml:space="preserve">Rev. 3.1</w:t>
+              <w:t xml:space="preserve">Rev. 3.2</w:t>
             </w:r>
           </w:p>
         </w:tc>
@@ -719,7 +719,7 @@
                 <w:sz w:val="18"/>
                 <w:szCs w:val="18"/>
               </w:rPr>
-              <w:t xml:space="preserve">3.1</w:t>
+              <w:t xml:space="preserve">3.2</w:t>
             </w:r>
           </w:p>
         </w:tc>
@@ -783,7 +783,7 @@
                 <w:sz w:val="18"/>
                 <w:szCs w:val="18"/>
               </w:rPr>
-              <w:t xml:space="preserve">Cruscotto diventa Dashboard; barra a LED delle 7 fasi per ogni pratica.</w:t>
+              <w:t xml:space="preserve">Simulatore: metodo di stima per utenza (solo utenze virtuose), buffer del Capitolo 7, taratura.</w:t>
             </w:r>
           </w:p>
         </w:tc>
@@ -853,7 +853,7 @@
                 <w:sz w:val="18"/>
                 <w:szCs w:val="18"/>
               </w:rPr>
-              <w:t xml:space="preserve">3.0</w:t>
+              <w:t xml:space="preserve">3.1</w:t>
             </w:r>
           </w:p>
         </w:tc>
@@ -919,7 +919,7 @@
                 <w:sz w:val="18"/>
                 <w:szCs w:val="18"/>
               </w:rPr>
-              <w:t xml:space="preserve">Eliminazione degli utenti che non hanno mai operato (script 30).</w:t>
+              <w:t xml:space="preserve">Cruscotto diventa Dashboard; barra a LED delle 7 fasi per ogni pratica.</w:t>
             </w:r>
           </w:p>
         </w:tc>
@@ -989,7 +989,7 @@
                 <w:sz w:val="18"/>
                 <w:szCs w:val="18"/>
               </w:rPr>
-              <w:t xml:space="preserve">2.9</w:t>
+              <w:t xml:space="preserve">3.0</w:t>
             </w:r>
           </w:p>
         </w:tc>
@@ -1053,7 +1053,7 @@
                 <w:sz w:val="18"/>
                 <w:szCs w:val="18"/>
               </w:rPr>
-              <w:t xml:space="preserve">Email automatica con le credenziali al nuovo utente e alla reimpostazione della password.</w:t>
+              <w:t xml:space="preserve">Eliminazione degli utenti che non hanno mai operato (script 30).</w:t>
             </w:r>
           </w:p>
         </w:tc>
@@ -1123,7 +1123,7 @@
                 <w:sz w:val="18"/>
                 <w:szCs w:val="18"/>
               </w:rPr>
-              <w:t xml:space="preserve">2.8</w:t>
+              <w:t xml:space="preserve">2.9</w:t>
             </w:r>
           </w:p>
         </w:tc>
@@ -1189,7 +1189,7 @@
                 <w:sz w:val="18"/>
                 <w:szCs w:val="18"/>
               </w:rPr>
-              <w:t xml:space="preserve">Più Amministratori con accesso completo; Amministratore principale protetto (script 29).</w:t>
+              <w:t xml:space="preserve">Email automatica con le credenziali al nuovo utente e alla reimpostazione della password.</w:t>
             </w:r>
           </w:p>
         </w:tc>
@@ -1259,7 +1259,7 @@
                 <w:sz w:val="18"/>
                 <w:szCs w:val="18"/>
               </w:rPr>
-              <w:t xml:space="preserve">2.7</w:t>
+              <w:t xml:space="preserve">2.8</w:t>
             </w:r>
           </w:p>
         </w:tc>
@@ -1323,7 +1323,7 @@
                 <w:sz w:val="18"/>
                 <w:szCs w:val="18"/>
               </w:rPr>
-              <w:t xml:space="preserve">Simulatore: costi per il Comune secondo il Caso 1 (progetto volontario) o il Caso 2 (progetto obbligatorio da bando).</w:t>
+              <w:t xml:space="preserve">Più Amministratori con accesso completo; Amministratore principale protetto (script 29).</w:t>
             </w:r>
           </w:p>
         </w:tc>
@@ -1393,7 +1393,7 @@
                 <w:sz w:val="18"/>
                 <w:szCs w:val="18"/>
               </w:rPr>
-              <w:t xml:space="preserve">2.6</w:t>
+              <w:t xml:space="preserve">2.7</w:t>
             </w:r>
           </w:p>
         </w:tc>
@@ -1459,7 +1459,7 @@
                 <w:sz w:val="18"/>
                 <w:szCs w:val="18"/>
               </w:rPr>
-              <w:t xml:space="preserve">Simulatore: valore del credito anno per anno, proposto 32 €.</w:t>
+              <w:t xml:space="preserve">Simulatore: costi per il Comune secondo il Caso 1 (progetto volontario) o il Caso 2 (progetto obbligatorio da bando).</w:t>
             </w:r>
           </w:p>
         </w:tc>
@@ -1529,7 +1529,7 @@
                 <w:sz w:val="18"/>
                 <w:szCs w:val="18"/>
               </w:rPr>
-              <w:t xml:space="preserve">2.5</w:t>
+              <w:t xml:space="preserve">2.6</w:t>
             </w:r>
           </w:p>
         </w:tc>
@@ -1593,7 +1593,7 @@
                 <w:sz w:val="18"/>
                 <w:szCs w:val="18"/>
               </w:rPr>
-              <w:t xml:space="preserve">Simulatore: simulazione economica con valore unitario del credito e costi per il Comune (contratti tipo della Fondazione, Schema tariffario).</w:t>
+              <w:t xml:space="preserve">Simulatore: valore del credito anno per anno, proposto 32 €.</w:t>
             </w:r>
           </w:p>
         </w:tc>
@@ -1663,7 +1663,7 @@
                 <w:sz w:val="18"/>
                 <w:szCs w:val="18"/>
               </w:rPr>
-              <w:t xml:space="preserve">2.4</w:t>
+              <w:t xml:space="preserve">2.5</w:t>
             </w:r>
           </w:p>
         </w:tc>
@@ -1729,7 +1729,7 @@
                 <w:sz w:val="18"/>
                 <w:szCs w:val="18"/>
               </w:rPr>
-              <w:t xml:space="preserve">Simulatore: riferimento sempre alla soglia del 65% di differenziata e controllo dei valori fuori scala.</w:t>
+              <w:t xml:space="preserve">Simulatore: simulazione economica con valore unitario del credito e costi per il Comune (contratti tipo della Fondazione, Schema tariffario).</w:t>
             </w:r>
           </w:p>
         </w:tc>
@@ -1799,7 +1799,7 @@
                 <w:sz w:val="18"/>
                 <w:szCs w:val="18"/>
               </w:rPr>
-              <w:t xml:space="preserve">2.3</w:t>
+              <w:t xml:space="preserve">2.4</w:t>
             </w:r>
           </w:p>
         </w:tc>
@@ -1863,7 +1863,7 @@
                 <w:sz w:val="18"/>
                 <w:szCs w:val="18"/>
               </w:rPr>
-              <w:t xml:space="preserve">Simulatore conforme al modello CWP: scenario di riferimento dello Standard 4.8.1, situazione attuale, conformità.</w:t>
+              <w:t xml:space="preserve">Simulatore: riferimento sempre alla soglia del 65% di differenziata e controllo dei valori fuori scala.</w:t>
             </w:r>
           </w:p>
         </w:tc>
@@ -1933,7 +1933,7 @@
                 <w:sz w:val="18"/>
                 <w:szCs w:val="18"/>
               </w:rPr>
-              <w:t xml:space="preserve">2.2</w:t>
+              <w:t xml:space="preserve">2.3</w:t>
             </w:r>
           </w:p>
         </w:tc>
@@ -1999,7 +1999,7 @@
                 <w:sz w:val="18"/>
                 <w:szCs w:val="18"/>
               </w:rPr>
-              <w:t xml:space="preserve">Nuovo capitolo «Simulatore di scenari»: creazione, anno base, obiettivi annui, risultati, modello di stima.</w:t>
+              <w:t xml:space="preserve">Simulatore conforme al modello CWP: scenario di riferimento dello Standard 4.8.1, situazione attuale, conformità.</w:t>
             </w:r>
           </w:p>
         </w:tc>
@@ -2069,7 +2069,7 @@
                 <w:sz w:val="18"/>
                 <w:szCs w:val="18"/>
               </w:rPr>
-              <w:t xml:space="preserve">2.1</w:t>
+              <w:t xml:space="preserve">2.2</w:t>
             </w:r>
           </w:p>
         </w:tc>
@@ -2133,7 +2133,7 @@
                 <w:sz w:val="18"/>
                 <w:szCs w:val="18"/>
               </w:rPr>
-              <w:t xml:space="preserve">Funzioni in arrivo: simulatore di scenari (7, 10 o 21 anni, obiettivi annui, % di differenziata e crediti stimati) e assistente virtuale (Claude).</w:t>
+              <w:t xml:space="preserve">Nuovo capitolo «Simulatore di scenari»: creazione, anno base, obiettivi annui, risultati, modello di stima.</w:t>
             </w:r>
           </w:p>
         </w:tc>
@@ -2203,7 +2203,7 @@
                 <w:sz w:val="18"/>
                 <w:szCs w:val="18"/>
               </w:rPr>
-              <w:t xml:space="preserve">2.0</w:t>
+              <w:t xml:space="preserve">2.1</w:t>
             </w:r>
           </w:p>
         </w:tc>
@@ -2269,7 +2269,7 @@
                 <w:sz w:val="18"/>
                 <w:szCs w:val="18"/>
               </w:rPr>
-              <w:t xml:space="preserve">Copie di sicurezza e ripristino: rimando alle Istruzioni di ripristino e punti essenziali (capitolo Manutenzione ed emergenze).</w:t>
+              <w:t xml:space="preserve">Funzioni in arrivo: simulatore di scenari (7, 10 o 21 anni, obiettivi annui, % di differenziata e crediti stimati) e assistente virtuale (Claude).</w:t>
             </w:r>
           </w:p>
         </w:tc>
@@ -2339,7 +2339,7 @@
                 <w:sz w:val="18"/>
                 <w:szCs w:val="18"/>
               </w:rPr>
-              <w:t xml:space="preserve">1.9</w:t>
+              <w:t xml:space="preserve">2.0</w:t>
             </w:r>
           </w:p>
         </w:tc>
@@ -2403,7 +2403,7 @@
                 <w:sz w:val="18"/>
                 <w:szCs w:val="18"/>
               </w:rPr>
-              <w:t xml:space="preserve">Fondazione Operate soggetto promotore del programma (esclusiva conferita da Wastelab).</w:t>
+              <w:t xml:space="preserve">Copie di sicurezza e ripristino: rimando alle Istruzioni di ripristino e punti essenziali (capitolo Manutenzione ed emergenze).</w:t>
             </w:r>
           </w:p>
         </w:tc>
@@ -2473,7 +2473,7 @@
                 <w:sz w:val="18"/>
                 <w:szCs w:val="18"/>
               </w:rPr>
-              <w:t xml:space="preserve">1.8</w:t>
+              <w:t xml:space="preserve">1.9</w:t>
             </w:r>
           </w:p>
         </w:tc>
@@ -2539,7 +2539,7 @@
                 <w:sz w:val="18"/>
                 <w:szCs w:val="18"/>
               </w:rPr>
-              <w:t xml:space="preserve">PEC del Programma e documenti ufficiali già pubblicati sulla pagina pubblica.</w:t>
+              <w:t xml:space="preserve">Fondazione Operate soggetto promotore del programma (esclusiva conferita da Wastelab).</w:t>
             </w:r>
           </w:p>
         </w:tc>
@@ -2609,7 +2609,7 @@
                 <w:sz w:val="18"/>
                 <w:szCs w:val="18"/>
               </w:rPr>
-              <w:t xml:space="preserve">1.7</w:t>
+              <w:t xml:space="preserve">1.8</w:t>
             </w:r>
           </w:p>
         </w:tc>
@@ -2641,7 +2641,7 @@
                 <w:sz w:val="18"/>
                 <w:szCs w:val="18"/>
               </w:rPr>
-              <w:t xml:space="preserve">18/10/2026</w:t>
+              <w:t xml:space="preserve">19/10/2026</w:t>
             </w:r>
           </w:p>
         </w:tc>
@@ -2673,7 +2673,7 @@
                 <w:sz w:val="18"/>
                 <w:szCs w:val="18"/>
               </w:rPr>
-              <w:t xml:space="preserve">Allineamento ai documenti ufficiali del Programma (script 22-24): Rapporto a 7 fasi, feedback pubblico, stati del Programma, dati del progetto e territorio ISTAT, ritiro e rientro, account unico e delegati, registri, tariffe e sospensione, accuratezza e accertamenti, informazioni del Programma e metodologie, modelli pubblici; nuovi capitoli Crediti emessi, Reclami, Pagina pubblica; qualità dei dati nel calcolo.</w:t>
+              <w:t xml:space="preserve">PEC del Programma e documenti ufficiali già pubblicati sulla pagina pubblica.</w:t>
             </w:r>
           </w:p>
         </w:tc>
@@ -2743,7 +2743,7 @@
                 <w:sz w:val="18"/>
                 <w:szCs w:val="18"/>
               </w:rPr>
-              <w:t xml:space="preserve">1.6</w:t>
+              <w:t xml:space="preserve">1.7</w:t>
             </w:r>
           </w:p>
         </w:tc>
@@ -2809,7 +2809,7 @@
                 <w:sz w:val="18"/>
                 <w:szCs w:val="18"/>
               </w:rPr>
-              <w:t xml:space="preserve">Calcolo crediti: descrizione corretta del buffer (somma delle voci delle Tabelle 15 e 16, più il 20% con le sole utenze virtuose, al massimo 80%).</w:t>
+              <w:t xml:space="preserve">Allineamento ai documenti ufficiali del Programma (script 22-24): Rapporto a 7 fasi, feedback pubblico, stati del Programma, dati del progetto e territorio ISTAT, ritiro e rientro, account unico e delegati, registri, tariffe e sospensione, accuratezza e accertamenti, informazioni del Programma e metodologie, modelli pubblici; nuovi capitoli Crediti emessi, Reclami, Pagina pubblica; qualità dei dati nel calcolo.</w:t>
             </w:r>
           </w:p>
         </w:tc>
@@ -2879,7 +2879,7 @@
                 <w:sz w:val="18"/>
                 <w:szCs w:val="18"/>
               </w:rPr>
-              <w:t xml:space="preserve">1.5</w:t>
+              <w:t xml:space="preserve">1.6</w:t>
             </w:r>
           </w:p>
         </w:tc>
@@ -2943,7 +2943,7 @@
                 <w:sz w:val="18"/>
                 <w:szCs w:val="18"/>
               </w:rPr>
-              <w:t xml:space="preserve">Nuova pagina Anagrafiche (Organizzazioni ed Enti, anche per gli Operatori); Rapporti con 4 fasi e durate proprie; documenti richiesti per fase; consultazione con documento bloccato, osservazioni numerate e motivazione; conservazione per 10 anni; fascicolo con riepilogo PDF e nuove cartelle.</w:t>
+              <w:t xml:space="preserve">Calcolo crediti: descrizione corretta del buffer (somma delle voci delle Tabelle 15 e 16, più il 20% con le sole utenze virtuose, al massimo 80%).</w:t>
             </w:r>
           </w:p>
         </w:tc>
@@ -3013,7 +3013,7 @@
                 <w:sz w:val="18"/>
                 <w:szCs w:val="18"/>
               </w:rPr>
-              <w:t xml:space="preserve">1.4</w:t>
+              <w:t xml:space="preserve">1.5</w:t>
             </w:r>
           </w:p>
         </w:tc>
@@ -3079,7 +3079,7 @@
                 <w:sz w:val="18"/>
                 <w:szCs w:val="18"/>
               </w:rPr>
-              <w:t xml:space="preserve">Calcolo crediti: il risultato si azzera quando cambiano dati o Banca Dati Utenze, conferma solo dopo un nuovo «Calcola». Gestione utenti: password temporanea di almeno 10 caratteri con lettere e numeri, creazione annullata se non va a buon fine, nessun accesso ai dati prima del cambio password.</w:t>
+              <w:t xml:space="preserve">Nuova pagina Anagrafiche (Organizzazioni ed Enti, anche per gli Operatori); Rapporti con 4 fasi e durate proprie; documenti richiesti per fase; consultazione con documento bloccato, osservazioni numerate e motivazione; conservazione per 10 anni; fascicolo con riepilogo PDF e nuove cartelle.</w:t>
             </w:r>
           </w:p>
         </w:tc>
@@ -3149,7 +3149,7 @@
                 <w:sz w:val="18"/>
                 <w:szCs w:val="18"/>
               </w:rPr>
-              <w:t xml:space="preserve">1.3</w:t>
+              <w:t xml:space="preserve">1.4</w:t>
             </w:r>
           </w:p>
         </w:tc>
@@ -3213,7 +3213,7 @@
                 <w:sz w:val="18"/>
                 <w:szCs w:val="18"/>
               </w:rPr>
-              <w:t xml:space="preserve">Rapporto di calcolo in PDF, archiviazione nella pratica, numero di registro, registro dei crediti.</w:t>
+              <w:t xml:space="preserve">Calcolo crediti: il risultato si azzera quando cambiano dati o Banca Dati Utenze, conferma solo dopo un nuovo «Calcola». Gestione utenti: password temporanea di almeno 10 caratteri con lettere e numeri, creazione annullata se non va a buon fine, nessun accesso ai dati prima del cambio password.</w:t>
             </w:r>
           </w:p>
         </w:tc>
@@ -3283,7 +3283,7 @@
                 <w:sz w:val="18"/>
                 <w:szCs w:val="18"/>
               </w:rPr>
-              <w:t xml:space="preserve">1.2</w:t>
+              <w:t xml:space="preserve">1.3</w:t>
             </w:r>
           </w:p>
         </w:tc>
@@ -3349,7 +3349,7 @@
                 <w:sz w:val="18"/>
                 <w:szCs w:val="18"/>
               </w:rPr>
-              <w:t xml:space="preserve">Calcolo crediti: importare il tracciato nel calcolo (dai documenti della pratica o dal computer), singole letture, blocco dei dati personali, controlli di coerenza.</w:t>
+              <w:t xml:space="preserve">Rapporto di calcolo in PDF, archiviazione nella pratica, numero di registro, registro dei crediti.</w:t>
             </w:r>
           </w:p>
         </w:tc>
@@ -3419,7 +3419,7 @@
                 <w:sz w:val="18"/>
                 <w:szCs w:val="18"/>
               </w:rPr>
-              <w:t xml:space="preserve">1.1</w:t>
+              <w:t xml:space="preserve">1.2</w:t>
             </w:r>
           </w:p>
         </w:tc>
@@ -3483,7 +3483,7 @@
                 <w:sz w:val="18"/>
                 <w:szCs w:val="18"/>
               </w:rPr>
-              <w:t xml:space="preserve">Note di fase, Ente di Validazione della pratica, consultazione sulla pagina pubblica con conferma dell'email, moderazione con autori e allegati, errata corrige; nuovo capitolo Messaggi con il Comune; pagamenti visibili al Comune; Impostazioni: Enti di Validazione e Modelli di documento; notifiche aggiornate.</w:t>
+              <w:t xml:space="preserve">Calcolo crediti: importare il tracciato nel calcolo (dai documenti della pratica o dal computer), singole letture, blocco dei dati personali, controlli di coerenza.</w:t>
             </w:r>
           </w:p>
         </w:tc>
@@ -3553,6 +3553,142 @@
                 <w:sz w:val="18"/>
                 <w:szCs w:val="18"/>
               </w:rPr>
+              <w:t xml:space="preserve">1.1</w:t>
+            </w:r>
+          </w:p>
+        </w:tc>
+        <w:tc>
+          <w:tcPr>
+            <w:tcW w:type="dxa" w:w="1300"/>
+            <w:tcBorders>
+              <w:top w:val="single" w:color="D9D4C5" w:sz="4"/>
+              <w:left w:val="single" w:color="D9D4C5" w:sz="4"/>
+              <w:bottom w:val="single" w:color="D9D4C5" w:sz="4"/>
+              <w:right w:val="single" w:color="D9D4C5" w:sz="4"/>
+            </w:tcBorders>
+            <w:shd w:fill="F6F4EE" w:color="auto" w:val="clear"/>
+            <w:tcMar>
+              <w:top w:type="dxa" w:w="70"/>
+              <w:left w:type="dxa" w:w="110"/>
+              <w:bottom w:type="dxa" w:w="70"/>
+              <w:right w:type="dxa" w:w="110"/>
+            </w:tcMar>
+            <w:vAlign w:val="center"/>
+          </w:tcPr>
+          <w:p>
+            <w:pPr>
+              <w:spacing w:after="0" w:before="0"/>
+            </w:pPr>
+            <w:r>
+              <w:rPr>
+                <w:rFonts w:ascii="Arial" w:cs="Arial" w:eastAsia="Arial" w:hAnsi="Arial"/>
+                <w:color w:val="1B2118"/>
+                <w:sz w:val="18"/>
+                <w:szCs w:val="18"/>
+              </w:rPr>
+              <w:t xml:space="preserve">18/10/2026</w:t>
+            </w:r>
+          </w:p>
+        </w:tc>
+        <w:tc>
+          <w:tcPr>
+            <w:tcW w:type="dxa" w:w="5538"/>
+            <w:tcBorders>
+              <w:top w:val="single" w:color="D9D4C5" w:sz="4"/>
+              <w:left w:val="single" w:color="D9D4C5" w:sz="4"/>
+              <w:bottom w:val="single" w:color="D9D4C5" w:sz="4"/>
+              <w:right w:val="single" w:color="D9D4C5" w:sz="4"/>
+            </w:tcBorders>
+            <w:shd w:fill="F6F4EE" w:color="auto" w:val="clear"/>
+            <w:tcMar>
+              <w:top w:type="dxa" w:w="70"/>
+              <w:left w:type="dxa" w:w="110"/>
+              <w:bottom w:type="dxa" w:w="70"/>
+              <w:right w:type="dxa" w:w="110"/>
+            </w:tcMar>
+            <w:vAlign w:val="center"/>
+          </w:tcPr>
+          <w:p>
+            <w:pPr>
+              <w:spacing w:after="0" w:before="0"/>
+            </w:pPr>
+            <w:r>
+              <w:rPr>
+                <w:rFonts w:ascii="Arial" w:cs="Arial" w:eastAsia="Arial" w:hAnsi="Arial"/>
+                <w:color w:val="1B2118"/>
+                <w:sz w:val="18"/>
+                <w:szCs w:val="18"/>
+              </w:rPr>
+              <w:t xml:space="preserve">Note di fase, Ente di Validazione della pratica, consultazione sulla pagina pubblica con conferma dell'email, moderazione con autori e allegati, errata corrige; nuovo capitolo Messaggi con il Comune; pagamenti visibili al Comune; Impostazioni: Enti di Validazione e Modelli di documento; notifiche aggiornate.</w:t>
+            </w:r>
+          </w:p>
+        </w:tc>
+        <w:tc>
+          <w:tcPr>
+            <w:tcW w:type="dxa" w:w="2000"/>
+            <w:tcBorders>
+              <w:top w:val="single" w:color="D9D4C5" w:sz="4"/>
+              <w:left w:val="single" w:color="D9D4C5" w:sz="4"/>
+              <w:bottom w:val="single" w:color="D9D4C5" w:sz="4"/>
+              <w:right w:val="single" w:color="D9D4C5" w:sz="4"/>
+            </w:tcBorders>
+            <w:shd w:fill="F6F4EE" w:color="auto" w:val="clear"/>
+            <w:tcMar>
+              <w:top w:type="dxa" w:w="70"/>
+              <w:left w:type="dxa" w:w="110"/>
+              <w:bottom w:type="dxa" w:w="70"/>
+              <w:right w:type="dxa" w:w="110"/>
+            </w:tcMar>
+            <w:vAlign w:val="center"/>
+          </w:tcPr>
+          <w:p>
+            <w:pPr>
+              <w:spacing w:after="0" w:before="0"/>
+            </w:pPr>
+            <w:r>
+              <w:rPr>
+                <w:rFonts w:ascii="Arial" w:cs="Arial" w:eastAsia="Arial" w:hAnsi="Arial"/>
+                <w:color w:val="1B2118"/>
+                <w:sz w:val="18"/>
+                <w:szCs w:val="18"/>
+              </w:rPr>
+              <w:t xml:space="preserve">Fondazione Operate</w:t>
+            </w:r>
+          </w:p>
+        </w:tc>
+      </w:tr>
+      <w:tr>
+        <w:trPr>
+          <w:cantSplit/>
+        </w:trPr>
+        <w:tc>
+          <w:tcPr>
+            <w:tcW w:type="dxa" w:w="800"/>
+            <w:tcBorders>
+              <w:top w:val="single" w:color="D9D4C5" w:sz="4"/>
+              <w:left w:val="single" w:color="D9D4C5" w:sz="4"/>
+              <w:bottom w:val="single" w:color="D9D4C5" w:sz="4"/>
+              <w:right w:val="single" w:color="D9D4C5" w:sz="4"/>
+            </w:tcBorders>
+            <w:tcMar>
+              <w:top w:type="dxa" w:w="70"/>
+              <w:left w:type="dxa" w:w="110"/>
+              <w:bottom w:type="dxa" w:w="70"/>
+              <w:right w:type="dxa" w:w="110"/>
+            </w:tcMar>
+            <w:vAlign w:val="center"/>
+          </w:tcPr>
+          <w:p>
+            <w:pPr>
+              <w:spacing w:after="0" w:before="0"/>
+            </w:pPr>
+            <w:r>
+              <w:rPr>
+                <w:rFonts w:ascii="Arial" w:cs="Arial" w:eastAsia="Arial" w:hAnsi="Arial"/>
+                <w:color w:val="1B2118"/>
+                <w:sz w:val="18"/>
+                <w:szCs w:val="18"/>
+              </w:rPr>
               <w:t xml:space="preserve">1.0</w:t>
             </w:r>
           </w:p>
@@ -3566,7 +3702,6 @@
               <w:bottom w:val="single" w:color="D9D4C5" w:sz="4"/>
               <w:right w:val="single" w:color="D9D4C5" w:sz="4"/>
             </w:tcBorders>
-            <w:shd w:fill="F6F4EE" w:color="auto" w:val="clear"/>
             <w:tcMar>
               <w:top w:type="dxa" w:w="70"/>
               <w:left w:type="dxa" w:w="110"/>
@@ -3599,7 +3734,6 @@
               <w:bottom w:val="single" w:color="D9D4C5" w:sz="4"/>
               <w:right w:val="single" w:color="D9D4C5" w:sz="4"/>
             </w:tcBorders>
-            <w:shd w:fill="F6F4EE" w:color="auto" w:val="clear"/>
             <w:tcMar>
               <w:top w:type="dxa" w:w="70"/>
               <w:left w:type="dxa" w:w="110"/>
@@ -3632,7 +3766,6 @@
               <w:bottom w:val="single" w:color="D9D4C5" w:sz="4"/>
               <w:right w:val="single" w:color="D9D4C5" w:sz="4"/>
             </w:tcBorders>
-            <w:shd w:fill="F6F4EE" w:color="auto" w:val="clear"/>
             <w:tcMar>
               <w:top w:type="dxa" w:w="70"/>
               <w:left w:type="dxa" w:w="110"/>
@@ -3674,7 +3807,7 @@
           <w:sz w:val="20"/>
           <w:szCs w:val="20"/>
         </w:rPr>
-        <w:t xml:space="preserve">Questo documento descrive il portale alla revisione 3.1 del 19/10/2026. A ogni modifica del portale il manuale viene aggiornato e la revisione incrementata; la versione corrente si scarica dall'area Documentazione del portale (solo Amministratori).</w:t>
+        <w:t xml:space="preserve">Questo documento descrive il portale alla revisione 3.2 del 19/10/2026. A ogni modifica del portale il manuale viene aggiornato e la revisione incrementata; la versione corrente si scarica dall'area Documentazione del portale (solo Amministratori).</w:t>
       </w:r>
     </w:p>
     <w:p>
@@ -6338,7 +6471,7 @@
         </w:rPr>
         <w:t xml:space="preserve">Si accede da </w:t>
       </w:r>
-      <w:hyperlink w:history="1" r:id="rId81dtopimi38fql_6krtsp">
+      <w:hyperlink w:history="1" r:id="rIdjyfmvoxgegdh8rcc5p_5-">
         <w:r>
           <w:rPr>
             <w:rFonts w:ascii="Arial" w:cs="Arial" w:eastAsia="Arial" w:hAnsi="Arial"/>
@@ -33829,6 +33962,26 @@
           <w:sz w:val="21"/>
           <w:szCs w:val="21"/>
         </w:rPr>
+        <w:t xml:space="preserve">metodo di stima dei crediti</w:t>
+      </w:r>
+      <w:r>
+        <w:rPr>
+          <w:rFonts w:ascii="Arial" w:cs="Arial" w:eastAsia="Arial" w:hAnsi="Arial"/>
+          <w:color w:val="1B2118"/>
+          <w:sz w:val="21"/>
+          <w:szCs w:val="21"/>
+        </w:rPr>
+        <w:t xml:space="preserve">, </w:t>
+      </w:r>
+      <w:r>
+        <w:rPr>
+          <w:rFonts w:ascii="Arial" w:cs="Arial" w:eastAsia="Arial" w:hAnsi="Arial"/>
+          <w:b/>
+          <w:bCs/>
+          <w:color w:val="1B2118"/>
+          <w:sz w:val="21"/>
+          <w:szCs w:val="21"/>
+        </w:rPr>
         <w:t xml:space="preserve">buffer previsto</w:t>
       </w:r>
       <w:r>
@@ -33838,7 +33991,7 @@
           <w:sz w:val="21"/>
           <w:szCs w:val="21"/>
         </w:rPr>
-        <w:t xml:space="preserve"> (quota trattenuta dai crediti lordi, Capitolo 7 della Metodologia; 20% è un valore cautelativo) e note sulle ipotesi.</w:t>
+        <w:t xml:space="preserve"> (quota trattenuta dai crediti lordi, Capitolo 7 della Metodologia) e note sulle ipotesi.</w:t>
       </w:r>
     </w:p>
     <w:p>
@@ -33854,16 +34007,16 @@
           <w:sz w:val="21"/>
           <w:szCs w:val="21"/>
         </w:rPr>
-        <w:t xml:space="preserve">2. Scenario di riferimento (Standard 4.8.1).</w:t>
-      </w:r>
-      <w:r>
-        <w:rPr>
-          <w:rFonts w:ascii="Arial" w:cs="Arial" w:eastAsia="Arial" w:hAnsi="Arial"/>
-          <w:color w:val="1B2118"/>
-          <w:sz w:val="21"/>
-          <w:szCs w:val="21"/>
-        </w:rPr>
-        <w:t xml:space="preserve"> È la situazione «senza progetto» con cui si confrontano gli obiettivi, come nel Programma. Due modi, scelti con i pulsanti:</w:t>
+        <w:t xml:space="preserve">Metodo di stima.</w:t>
+      </w:r>
+      <w:r>
+        <w:rPr>
+          <w:rFonts w:ascii="Arial" w:cs="Arial" w:eastAsia="Arial" w:hAnsi="Arial"/>
+          <w:color w:val="1B2118"/>
+          <w:sz w:val="21"/>
+          <w:szCs w:val="21"/>
+        </w:rPr>
+        <w:t xml:space="preserve"> Si sceglie tra due metodi, entrambi previsti dalla formula 32 della Metodologia:</w:t>
       </w:r>
     </w:p>
     <w:p>
@@ -33884,16 +34037,16 @@
           <w:sz w:val="21"/>
           <w:szCs w:val="21"/>
         </w:rPr>
-        <w:t xml:space="preserve">Anno con il 65% di differenziata</w:t>
-      </w:r>
-      <w:r>
-        <w:rPr>
-          <w:rFonts w:ascii="Arial" w:cs="Arial" w:eastAsia="Arial" w:hAnsi="Arial"/>
-          <w:color w:val="1B2118"/>
-          <w:sz w:val="21"/>
-          <w:szCs w:val="21"/>
-        </w:rPr>
-        <w:t xml:space="preserve">: l'anno in cui il Comune ha raggiunto l'obiettivo di legge (tra 64% e 66%, dati Catasto ISPRA), con popolazione e rifiuti per tipologia in tonnellate; si compilano a mano o, per gli Amministratori, si importano da un calcolo dei crediti. Se la differenziata dell'anno indicato è fuori dall'intervallo il portale lo segnala (Standard 4.8.1 e addizionalità normativa 4.9.1); se è indicato il cluster, segnala anche le tipologie che si scostano più del 30% dalla Tabella 3 (Gestione della qualità dei dati, 3.1.2);</w:t>
+        <w:t xml:space="preserve">Bilancio del Comune (tutte le utenze insieme).</w:t>
+      </w:r>
+      <w:r>
+        <w:rPr>
+          <w:rFonts w:ascii="Arial" w:cs="Arial" w:eastAsia="Arial" w:hAnsi="Arial"/>
+          <w:color w:val="1B2118"/>
+          <w:sz w:val="21"/>
+          <w:szCs w:val="21"/>
+        </w:rPr>
+        <w:t xml:space="preserve"> Confronta i totali del Comune con lo scenario di riferimento: le utenze che peggiorano compensano quelle che migliorano, quindi i crediti nascono solo dai rifiuti evitati in totale. È la stima più prudente.</w:t>
       </w:r>
     </w:p>
     <w:p>
@@ -33914,36 +34067,36 @@
           <w:sz w:val="21"/>
           <w:szCs w:val="21"/>
         </w:rPr>
-        <w:t xml:space="preserve">Valori medi del cluster (Tabella 3)</w:t>
-      </w:r>
-      <w:r>
-        <w:rPr>
-          <w:rFonts w:ascii="Arial" w:cs="Arial" w:eastAsia="Arial" w:hAnsi="Arial"/>
-          <w:color w:val="1B2118"/>
-          <w:sz w:val="21"/>
-          <w:szCs w:val="21"/>
-        </w:rPr>
-        <w:t xml:space="preserve">: quando il Comune non ha un anno con il 65%, si sceglie il cluster SOSE, si indica la popolazione ISPRA 2022 e si preme </w:t>
-      </w:r>
-      <w:r>
-        <w:rPr>
-          <w:rFonts w:ascii="Arial" w:cs="Arial" w:eastAsia="Arial" w:hAnsi="Arial"/>
-          <w:b/>
-          <w:bCs/>
-          <w:color w:val="1B2118"/>
-          <w:sz w:val="21"/>
-          <w:szCs w:val="21"/>
-        </w:rPr>
-        <w:t xml:space="preserve">Calcola dai valori medi del cluster</w:t>
-      </w:r>
-      <w:r>
-        <w:rPr>
-          <w:rFonts w:ascii="Arial" w:cs="Arial" w:eastAsia="Arial" w:hAnsi="Arial"/>
-          <w:color w:val="1B2118"/>
-          <w:sz w:val="21"/>
-          <w:szCs w:val="21"/>
-        </w:rPr>
-        <w:t xml:space="preserve">.</w:t>
+        <w:t xml:space="preserve">Per utenza: solo utenze virtuose (con buffer).</w:t>
+      </w:r>
+      <w:r>
+        <w:rPr>
+          <w:rFonts w:ascii="Arial" w:cs="Arial" w:eastAsia="Arial" w:hAnsi="Arial"/>
+          <w:color w:val="1B2118"/>
+          <w:sz w:val="21"/>
+          <w:szCs w:val="21"/>
+        </w:rPr>
+        <w:t xml:space="preserve"> Contano solo le utenze che producono meno del valore atteso, per i rifiuti misurati per utenza (ad esempio secco e organico con la tariffa puntuale); i debiti delle altre li copre il buffer. È il metodo delle stime dell'Allegato A dei contratti tipo EsaCom. Senza Banca Dati Utenze la differenza tra le utenze si rappresenta con la </w:t>
+      </w:r>
+      <w:r>
+        <w:rPr>
+          <w:rFonts w:ascii="Arial" w:cs="Arial" w:eastAsia="Arial" w:hAnsi="Arial"/>
+          <w:b/>
+          <w:bCs/>
+          <w:color w:val="1B2118"/>
+          <w:sz w:val="21"/>
+          <w:szCs w:val="21"/>
+        </w:rPr>
+        <w:t xml:space="preserve">variabilità tra utenze</w:t>
+      </w:r>
+      <w:r>
+        <w:rPr>
+          <w:rFonts w:ascii="Arial" w:cs="Arial" w:eastAsia="Arial" w:hAnsi="Arial"/>
+          <w:color w:val="1B2118"/>
+          <w:sz w:val="21"/>
+          <w:szCs w:val="21"/>
+        </w:rPr>
+        <w:t xml:space="preserve"> (proposta 30%): è un'ipotesi, da tarare sui dati reali del gestore.</w:t>
       </w:r>
     </w:p>
     <w:p>
@@ -33957,47 +34110,127 @@
           <w:sz w:val="21"/>
           <w:szCs w:val="21"/>
         </w:rPr>
-        <w:t xml:space="preserve">A destra il riepilogo: produzione totale e pro capite, secco pro capite, </w:t>
-      </w:r>
-      <w:r>
-        <w:rPr>
-          <w:rFonts w:ascii="Arial" w:cs="Arial" w:eastAsia="Arial" w:hAnsi="Arial"/>
-          <w:b/>
-          <w:bCs/>
-          <w:color w:val="1B2118"/>
-          <w:sz w:val="21"/>
-          <w:szCs w:val="21"/>
-        </w:rPr>
-        <w:t xml:space="preserve">% di raccolta differenziata</w:t>
-      </w:r>
-      <w:r>
-        <w:rPr>
-          <w:rFonts w:ascii="Arial" w:cs="Arial" w:eastAsia="Arial" w:hAnsi="Arial"/>
-          <w:color w:val="1B2118"/>
-          <w:sz w:val="21"/>
-          <w:szCs w:val="21"/>
-        </w:rPr>
-        <w:t xml:space="preserve"> e fattore di emissione del secco (formule 16-17). </w:t>
-      </w:r>
-      <w:r>
-        <w:rPr>
-          <w:rFonts w:ascii="Arial" w:cs="Arial" w:eastAsia="Arial" w:hAnsi="Arial"/>
-          <w:b/>
-          <w:bCs/>
-          <w:color w:val="1B2118"/>
-          <w:sz w:val="21"/>
-          <w:szCs w:val="21"/>
-        </w:rPr>
-        <w:t xml:space="preserve">Nel calcolo il riferimento è sempre portato alla soglia minima del 65% di differenziata</w:t>
-      </w:r>
-      <w:r>
-        <w:rPr>
-          <w:rFonts w:ascii="Arial" w:cs="Arial" w:eastAsia="Arial" w:hAnsi="Arial"/>
-          <w:color w:val="1B2118"/>
-          <w:sz w:val="21"/>
-          <w:szCs w:val="21"/>
-        </w:rPr>
-        <w:t xml:space="preserve">: stessa produzione totale, secco al 35%. Ogni anno i risultati si calcolano per differenza da questa soglia, e la tabella dei risultati mostra di quanti punti la differenziata supera il 65%. Se i dati inseriti hanno una percentuale diversa, un avviso lo segnala; un altro avviso compare se la produzione pro capite è fuori scala (unità di misura sbagliata).</w:t>
+        <w:t xml:space="preserve">Nel riquadro sotto si indicano i </w:t>
+      </w:r>
+      <w:r>
+        <w:rPr>
+          <w:rFonts w:ascii="Arial" w:cs="Arial" w:eastAsia="Arial" w:hAnsi="Arial"/>
+          <w:b/>
+          <w:bCs/>
+          <w:color w:val="1B2118"/>
+          <w:sz w:val="21"/>
+          <w:szCs w:val="21"/>
+        </w:rPr>
+        <w:t xml:space="preserve">rifiuti misurati per utenza</w:t>
+      </w:r>
+      <w:r>
+        <w:rPr>
+          <w:rFonts w:ascii="Arial" w:cs="Arial" w:eastAsia="Arial" w:hAnsi="Arial"/>
+          <w:color w:val="1B2118"/>
+          <w:sz w:val="21"/>
+          <w:szCs w:val="21"/>
+        </w:rPr>
+        <w:t xml:space="preserve"> (Tabella 16), le </w:t>
+      </w:r>
+      <w:r>
+        <w:rPr>
+          <w:rFonts w:ascii="Arial" w:cs="Arial" w:eastAsia="Arial" w:hAnsi="Arial"/>
+          <w:b/>
+          <w:bCs/>
+          <w:color w:val="1B2118"/>
+          <w:sz w:val="21"/>
+          <w:szCs w:val="21"/>
+        </w:rPr>
+        <w:t xml:space="preserve">utenze monitorate</w:t>
+      </w:r>
+      <w:r>
+        <w:rPr>
+          <w:rFonts w:ascii="Arial" w:cs="Arial" w:eastAsia="Arial" w:hAnsi="Arial"/>
+          <w:color w:val="1B2118"/>
+          <w:sz w:val="21"/>
+          <w:szCs w:val="21"/>
+        </w:rPr>
+        <w:t xml:space="preserve"> (Tabella 15) e se sono attive la </w:t>
+      </w:r>
+      <w:r>
+        <w:rPr>
+          <w:rFonts w:ascii="Arial" w:cs="Arial" w:eastAsia="Arial" w:hAnsi="Arial"/>
+          <w:b/>
+          <w:bCs/>
+          <w:color w:val="1B2118"/>
+          <w:sz w:val="21"/>
+          <w:szCs w:val="21"/>
+        </w:rPr>
+        <w:t xml:space="preserve">tariffa puntuale</w:t>
+      </w:r>
+      <w:r>
+        <w:rPr>
+          <w:rFonts w:ascii="Arial" w:cs="Arial" w:eastAsia="Arial" w:hAnsi="Arial"/>
+          <w:color w:val="1B2118"/>
+          <w:sz w:val="21"/>
+          <w:szCs w:val="21"/>
+        </w:rPr>
+        <w:t xml:space="preserve">, la misura ai </w:t>
+      </w:r>
+      <w:r>
+        <w:rPr>
+          <w:rFonts w:ascii="Arial" w:cs="Arial" w:eastAsia="Arial" w:hAnsi="Arial"/>
+          <w:b/>
+          <w:bCs/>
+          <w:color w:val="1B2118"/>
+          <w:sz w:val="21"/>
+          <w:szCs w:val="21"/>
+        </w:rPr>
+        <w:t xml:space="preserve">centri di raccolta</w:t>
+      </w:r>
+      <w:r>
+        <w:rPr>
+          <w:rFonts w:ascii="Arial" w:cs="Arial" w:eastAsia="Arial" w:hAnsi="Arial"/>
+          <w:color w:val="1B2118"/>
+          <w:sz w:val="21"/>
+          <w:szCs w:val="21"/>
+        </w:rPr>
+        <w:t xml:space="preserve"> (−2%) e la misura di ingombranti, verde o indumenti (−1%). Il portale mostra il </w:t>
+      </w:r>
+      <w:r>
+        <w:rPr>
+          <w:rFonts w:ascii="Arial" w:cs="Arial" w:eastAsia="Arial" w:hAnsi="Arial"/>
+          <w:b/>
+          <w:bCs/>
+          <w:color w:val="1B2118"/>
+          <w:sz w:val="21"/>
+          <w:szCs w:val="21"/>
+        </w:rPr>
+        <w:t xml:space="preserve">buffer secondo il Capitolo 7</w:t>
+      </w:r>
+      <w:r>
+        <w:rPr>
+          <w:rFonts w:ascii="Arial" w:cs="Arial" w:eastAsia="Arial" w:hAnsi="Arial"/>
+          <w:color w:val="1B2118"/>
+          <w:sz w:val="21"/>
+          <w:szCs w:val="21"/>
+        </w:rPr>
+        <w:t xml:space="preserve"> con le voci che lo compongono: 20% se si contano solo le utenze virtuose, più le Tabelle 15 e 16, con la parte della Tabella 16 dimezzata dalla tariffa puntuale, al massimo 80%. </w:t>
+      </w:r>
+      <w:r>
+        <w:rPr>
+          <w:rFonts w:ascii="Arial" w:cs="Arial" w:eastAsia="Arial" w:hAnsi="Arial"/>
+          <w:b/>
+          <w:bCs/>
+          <w:color w:val="1B2118"/>
+          <w:sz w:val="21"/>
+          <w:szCs w:val="21"/>
+        </w:rPr>
+        <w:t xml:space="preserve">Usa questo buffer</w:t>
+      </w:r>
+      <w:r>
+        <w:rPr>
+          <w:rFonts w:ascii="Arial" w:cs="Arial" w:eastAsia="Arial" w:hAnsi="Arial"/>
+          <w:color w:val="1B2118"/>
+          <w:sz w:val="21"/>
+          <w:szCs w:val="21"/>
+        </w:rPr>
+        <w:t xml:space="preserve"> lo applica allo scenario. Se il buffer impostato è più basso del minimo, i Risultati lo segnalano.</w:t>
       </w:r>
     </w:p>
     <w:p>
@@ -34013,16 +34246,36 @@
           <w:sz w:val="21"/>
           <w:szCs w:val="21"/>
         </w:rPr>
-        <w:t xml:space="preserve">Situazione attuale (facoltativa).</w:t>
-      </w:r>
-      <w:r>
-        <w:rPr>
-          <w:rFonts w:ascii="Arial" w:cs="Arial" w:eastAsia="Arial" w:hAnsi="Arial"/>
-          <w:color w:val="1B2118"/>
-          <w:sz w:val="21"/>
-          <w:szCs w:val="21"/>
-        </w:rPr>
-        <w:t xml:space="preserve"> L'ultimo anno con dati disponibili (popolazione, produzione pro capite, secco pro capite): è il punto di partenza degli obiettivi e della traiettoria. I crediti si calcolano sempre rispetto allo scenario di riferimento.</w:t>
+        <w:t xml:space="preserve">Taratura.</w:t>
+      </w:r>
+      <w:r>
+        <w:rPr>
+          <w:rFonts w:ascii="Arial" w:cs="Arial" w:eastAsia="Arial" w:hAnsi="Arial"/>
+          <w:color w:val="1B2118"/>
+          <w:sz w:val="21"/>
+          <w:szCs w:val="21"/>
+        </w:rPr>
+        <w:t xml:space="preserve"> Con il metodo per utenza si può scrivere un valore di crediti netti per abitante all'anno da riprodurre (ad esempio 0,19 di una stima già fatta) e premere </w:t>
+      </w:r>
+      <w:r>
+        <w:rPr>
+          <w:rFonts w:ascii="Arial" w:cs="Arial" w:eastAsia="Arial" w:hAnsi="Arial"/>
+          <w:b/>
+          <w:bCs/>
+          <w:color w:val="1B2118"/>
+          <w:sz w:val="21"/>
+          <w:szCs w:val="21"/>
+        </w:rPr>
+        <w:t xml:space="preserve">Trova la variabilità</w:t>
+      </w:r>
+      <w:r>
+        <w:rPr>
+          <w:rFonts w:ascii="Arial" w:cs="Arial" w:eastAsia="Arial" w:hAnsi="Arial"/>
+          <w:color w:val="1B2118"/>
+          <w:sz w:val="21"/>
+          <w:szCs w:val="21"/>
+        </w:rPr>
+        <w:t xml:space="preserve">: il portale cerca la variabilità tra utenze che porta a quel risultato con i dati dello scenario.</w:t>
       </w:r>
     </w:p>
     <w:p>
@@ -34038,121 +34291,16 @@
           <w:sz w:val="21"/>
           <w:szCs w:val="21"/>
         </w:rPr>
-        <w:t xml:space="preserve">3. Obiettivi anno per anno.</w:t>
-      </w:r>
-      <w:r>
-        <w:rPr>
-          <w:rFonts w:ascii="Arial" w:cs="Arial" w:eastAsia="Arial" w:hAnsi="Arial"/>
-          <w:color w:val="1B2118"/>
-          <w:sz w:val="21"/>
-          <w:szCs w:val="21"/>
-        </w:rPr>
-        <w:t xml:space="preserve"> Una riga per ogni anno del periodo: popolazione, </w:t>
-      </w:r>
-      <w:r>
-        <w:rPr>
-          <w:rFonts w:ascii="Arial" w:cs="Arial" w:eastAsia="Arial" w:hAnsi="Arial"/>
-          <w:b/>
-          <w:bCs/>
-          <w:color w:val="1B2118"/>
-          <w:sz w:val="21"/>
-          <w:szCs w:val="21"/>
-        </w:rPr>
-        <w:t xml:space="preserve">produzione totale prevista</w:t>
-      </w:r>
-      <w:r>
-        <w:rPr>
-          <w:rFonts w:ascii="Arial" w:cs="Arial" w:eastAsia="Arial" w:hAnsi="Arial"/>
-          <w:color w:val="1B2118"/>
-          <w:sz w:val="21"/>
-          <w:szCs w:val="21"/>
-        </w:rPr>
-        <w:t xml:space="preserve"> (in tonnellate, oppure scrivendo il pro capite in kg/ab) e </w:t>
-      </w:r>
-      <w:r>
-        <w:rPr>
-          <w:rFonts w:ascii="Arial" w:cs="Arial" w:eastAsia="Arial" w:hAnsi="Arial"/>
-          <w:b/>
-          <w:bCs/>
-          <w:color w:val="1B2118"/>
-          <w:sz w:val="21"/>
-          <w:szCs w:val="21"/>
-        </w:rPr>
-        <w:t xml:space="preserve">secco residuo pro capite</w:t>
-      </w:r>
-      <w:r>
-        <w:rPr>
-          <w:rFonts w:ascii="Arial" w:cs="Arial" w:eastAsia="Arial" w:hAnsi="Arial"/>
-          <w:color w:val="1B2118"/>
-          <w:sz w:val="21"/>
-          <w:szCs w:val="21"/>
-        </w:rPr>
-        <w:t xml:space="preserve"> obiettivo. Per non compilare tutto a mano, indicate gli obiettivi dell'ultimo anno (produzione pro capite e secco pro capite) e premete </w:t>
-      </w:r>
-      <w:r>
-        <w:rPr>
-          <w:rFonts w:ascii="Arial" w:cs="Arial" w:eastAsia="Arial" w:hAnsi="Arial"/>
-          <w:b/>
-          <w:bCs/>
-          <w:color w:val="1B2118"/>
-          <w:sz w:val="21"/>
-          <w:szCs w:val="21"/>
-        </w:rPr>
-        <w:t xml:space="preserve">Applica la traiettoria</w:t>
-      </w:r>
-      <w:r>
-        <w:rPr>
-          <w:rFonts w:ascii="Arial" w:cs="Arial" w:eastAsia="Arial" w:hAnsi="Arial"/>
-          <w:color w:val="1B2118"/>
-          <w:sz w:val="21"/>
-          <w:szCs w:val="21"/>
-        </w:rPr>
-        <w:t xml:space="preserve">: il portale riempie gli anni con un andamento lineare dalla situazione attuale (o dal riferimento), poi potete correggere i singoli anni. Per ogni anno il portale ricalcola il secco in tonnellate e la </w:t>
-      </w:r>
-      <w:r>
-        <w:rPr>
-          <w:rFonts w:ascii="Arial" w:cs="Arial" w:eastAsia="Arial" w:hAnsi="Arial"/>
-          <w:b/>
-          <w:bCs/>
-          <w:color w:val="1B2118"/>
-          <w:sz w:val="21"/>
-          <w:szCs w:val="21"/>
-        </w:rPr>
-        <w:t xml:space="preserve">% di differenziata</w:t>
-      </w:r>
-      <w:r>
-        <w:rPr>
-          <w:rFonts w:ascii="Arial" w:cs="Arial" w:eastAsia="Arial" w:hAnsi="Arial"/>
-          <w:color w:val="1B2118"/>
-          <w:sz w:val="21"/>
-          <w:szCs w:val="21"/>
-        </w:rPr>
-        <w:t xml:space="preserve">.</w:t>
-      </w:r>
-    </w:p>
-    <w:p>
-      <w:pPr>
-        <w:spacing w:after="140" w:line="300"/>
-      </w:pPr>
-      <w:r>
-        <w:rPr>
-          <w:rFonts w:ascii="Arial" w:cs="Arial" w:eastAsia="Arial" w:hAnsi="Arial"/>
-          <w:b/>
-          <w:bCs/>
-          <w:color w:val="1B2118"/>
-          <w:sz w:val="21"/>
-          <w:szCs w:val="21"/>
-        </w:rPr>
-        <w:t xml:space="preserve">4. Risultati.</w:t>
-      </w:r>
-      <w:r>
-        <w:rPr>
-          <w:rFonts w:ascii="Arial" w:cs="Arial" w:eastAsia="Arial" w:hAnsi="Arial"/>
-          <w:color w:val="1B2118"/>
-          <w:sz w:val="21"/>
-          <w:szCs w:val="21"/>
-        </w:rPr>
-        <w:t xml:space="preserve"> Si aggiornano a ogni modifica:</w:t>
+        <w:t xml:space="preserve">2. Scenario di riferimento (Standard 4.8.1).</w:t>
+      </w:r>
+      <w:r>
+        <w:rPr>
+          <w:rFonts w:ascii="Arial" w:cs="Arial" w:eastAsia="Arial" w:hAnsi="Arial"/>
+          <w:color w:val="1B2118"/>
+          <w:sz w:val="21"/>
+          <w:szCs w:val="21"/>
+        </w:rPr>
+        <w:t xml:space="preserve"> È la situazione «senza progetto» con cui si confrontano gli obiettivi, come nel Programma. Due modi, scelti con i pulsanti:</w:t>
       </w:r>
     </w:p>
     <w:p>
@@ -34167,11 +34315,22 @@
       <w:r>
         <w:rPr>
           <w:rFonts w:ascii="Arial" w:cs="Arial" w:eastAsia="Arial" w:hAnsi="Arial"/>
-          <w:color w:val="1B2118"/>
-          <w:sz w:val="21"/>
-          <w:szCs w:val="21"/>
-        </w:rPr>
-        <w:t xml:space="preserve">crediti netti stimati nel periodo e media annua, % di differenziata dell'ultimo anno, rifiuti evitati;</w:t>
+          <w:b/>
+          <w:bCs/>
+          <w:color w:val="1B2118"/>
+          <w:sz w:val="21"/>
+          <w:szCs w:val="21"/>
+        </w:rPr>
+        <w:t xml:space="preserve">Anno con il 65% di differenziata</w:t>
+      </w:r>
+      <w:r>
+        <w:rPr>
+          <w:rFonts w:ascii="Arial" w:cs="Arial" w:eastAsia="Arial" w:hAnsi="Arial"/>
+          <w:color w:val="1B2118"/>
+          <w:sz w:val="21"/>
+          <w:szCs w:val="21"/>
+        </w:rPr>
+        <w:t xml:space="preserve">: l'anno in cui il Comune ha raggiunto l'obiettivo di legge (tra 64% e 66%, dati Catasto ISPRA), con popolazione e rifiuti per tipologia in tonnellate; si compilano a mano o, per gli Amministratori, si importano da un calcolo dei crediti. Se la differenziata dell'anno indicato è fuori dall'intervallo il portale lo segnala (Standard 4.8.1 e addizionalità normativa 4.9.1); se è indicato il cluster, segnala anche le tipologie che si scostano più del 30% dalla Tabella 3 (Gestione della qualità dei dati, 3.1.2);</w:t>
       </w:r>
     </w:p>
     <w:p>
@@ -34186,11 +34345,251 @@
       <w:r>
         <w:rPr>
           <w:rFonts w:ascii="Arial" w:cs="Arial" w:eastAsia="Arial" w:hAnsi="Arial"/>
-          <w:color w:val="1B2118"/>
-          <w:sz w:val="21"/>
-          <w:szCs w:val="21"/>
-        </w:rPr>
-        <w:t xml:space="preserve">grafico dei crediti netti per anno e grafico della % di differenziata rispetto all'anno base;</w:t>
+          <w:b/>
+          <w:bCs/>
+          <w:color w:val="1B2118"/>
+          <w:sz w:val="21"/>
+          <w:szCs w:val="21"/>
+        </w:rPr>
+        <w:t xml:space="preserve">Valori medi del cluster (Tabella 3)</w:t>
+      </w:r>
+      <w:r>
+        <w:rPr>
+          <w:rFonts w:ascii="Arial" w:cs="Arial" w:eastAsia="Arial" w:hAnsi="Arial"/>
+          <w:color w:val="1B2118"/>
+          <w:sz w:val="21"/>
+          <w:szCs w:val="21"/>
+        </w:rPr>
+        <w:t xml:space="preserve">: quando il Comune non ha un anno con il 65%, si sceglie il cluster SOSE, si indica la popolazione ISPRA 2022 e si preme </w:t>
+      </w:r>
+      <w:r>
+        <w:rPr>
+          <w:rFonts w:ascii="Arial" w:cs="Arial" w:eastAsia="Arial" w:hAnsi="Arial"/>
+          <w:b/>
+          <w:bCs/>
+          <w:color w:val="1B2118"/>
+          <w:sz w:val="21"/>
+          <w:szCs w:val="21"/>
+        </w:rPr>
+        <w:t xml:space="preserve">Calcola dai valori medi del cluster</w:t>
+      </w:r>
+      <w:r>
+        <w:rPr>
+          <w:rFonts w:ascii="Arial" w:cs="Arial" w:eastAsia="Arial" w:hAnsi="Arial"/>
+          <w:color w:val="1B2118"/>
+          <w:sz w:val="21"/>
+          <w:szCs w:val="21"/>
+        </w:rPr>
+        <w:t xml:space="preserve">.</w:t>
+      </w:r>
+    </w:p>
+    <w:p>
+      <w:pPr>
+        <w:spacing w:after="140" w:line="300"/>
+      </w:pPr>
+      <w:r>
+        <w:rPr>
+          <w:rFonts w:ascii="Arial" w:cs="Arial" w:eastAsia="Arial" w:hAnsi="Arial"/>
+          <w:color w:val="1B2118"/>
+          <w:sz w:val="21"/>
+          <w:szCs w:val="21"/>
+        </w:rPr>
+        <w:t xml:space="preserve">A destra il riepilogo: produzione totale e pro capite, secco pro capite, </w:t>
+      </w:r>
+      <w:r>
+        <w:rPr>
+          <w:rFonts w:ascii="Arial" w:cs="Arial" w:eastAsia="Arial" w:hAnsi="Arial"/>
+          <w:b/>
+          <w:bCs/>
+          <w:color w:val="1B2118"/>
+          <w:sz w:val="21"/>
+          <w:szCs w:val="21"/>
+        </w:rPr>
+        <w:t xml:space="preserve">% di raccolta differenziata</w:t>
+      </w:r>
+      <w:r>
+        <w:rPr>
+          <w:rFonts w:ascii="Arial" w:cs="Arial" w:eastAsia="Arial" w:hAnsi="Arial"/>
+          <w:color w:val="1B2118"/>
+          <w:sz w:val="21"/>
+          <w:szCs w:val="21"/>
+        </w:rPr>
+        <w:t xml:space="preserve"> e fattore di emissione del secco (formule 16-17). </w:t>
+      </w:r>
+      <w:r>
+        <w:rPr>
+          <w:rFonts w:ascii="Arial" w:cs="Arial" w:eastAsia="Arial" w:hAnsi="Arial"/>
+          <w:b/>
+          <w:bCs/>
+          <w:color w:val="1B2118"/>
+          <w:sz w:val="21"/>
+          <w:szCs w:val="21"/>
+        </w:rPr>
+        <w:t xml:space="preserve">Nel calcolo il riferimento è sempre portato alla soglia minima del 65% di differenziata</w:t>
+      </w:r>
+      <w:r>
+        <w:rPr>
+          <w:rFonts w:ascii="Arial" w:cs="Arial" w:eastAsia="Arial" w:hAnsi="Arial"/>
+          <w:color w:val="1B2118"/>
+          <w:sz w:val="21"/>
+          <w:szCs w:val="21"/>
+        </w:rPr>
+        <w:t xml:space="preserve">: stessa produzione totale, secco al 35%. Ogni anno i risultati si calcolano per differenza da questa soglia, e la tabella dei risultati mostra di quanti punti la differenziata supera il 65%. Se i dati inseriti hanno una percentuale diversa, un avviso lo segnala; un altro avviso compare se la produzione pro capite è fuori scala (unità di misura sbagliata).</w:t>
+      </w:r>
+    </w:p>
+    <w:p>
+      <w:pPr>
+        <w:spacing w:after="140" w:line="300"/>
+      </w:pPr>
+      <w:r>
+        <w:rPr>
+          <w:rFonts w:ascii="Arial" w:cs="Arial" w:eastAsia="Arial" w:hAnsi="Arial"/>
+          <w:b/>
+          <w:bCs/>
+          <w:color w:val="1B2118"/>
+          <w:sz w:val="21"/>
+          <w:szCs w:val="21"/>
+        </w:rPr>
+        <w:t xml:space="preserve">Situazione attuale (facoltativa).</w:t>
+      </w:r>
+      <w:r>
+        <w:rPr>
+          <w:rFonts w:ascii="Arial" w:cs="Arial" w:eastAsia="Arial" w:hAnsi="Arial"/>
+          <w:color w:val="1B2118"/>
+          <w:sz w:val="21"/>
+          <w:szCs w:val="21"/>
+        </w:rPr>
+        <w:t xml:space="preserve"> L'ultimo anno con dati disponibili (popolazione, produzione pro capite, secco pro capite): è il punto di partenza degli obiettivi e della traiettoria. I crediti si calcolano sempre rispetto allo scenario di riferimento.</w:t>
+      </w:r>
+    </w:p>
+    <w:p>
+      <w:pPr>
+        <w:spacing w:after="140" w:line="300"/>
+      </w:pPr>
+      <w:r>
+        <w:rPr>
+          <w:rFonts w:ascii="Arial" w:cs="Arial" w:eastAsia="Arial" w:hAnsi="Arial"/>
+          <w:b/>
+          <w:bCs/>
+          <w:color w:val="1B2118"/>
+          <w:sz w:val="21"/>
+          <w:szCs w:val="21"/>
+        </w:rPr>
+        <w:t xml:space="preserve">3. Obiettivi anno per anno.</w:t>
+      </w:r>
+      <w:r>
+        <w:rPr>
+          <w:rFonts w:ascii="Arial" w:cs="Arial" w:eastAsia="Arial" w:hAnsi="Arial"/>
+          <w:color w:val="1B2118"/>
+          <w:sz w:val="21"/>
+          <w:szCs w:val="21"/>
+        </w:rPr>
+        <w:t xml:space="preserve"> Una riga per ogni anno del periodo: popolazione, </w:t>
+      </w:r>
+      <w:r>
+        <w:rPr>
+          <w:rFonts w:ascii="Arial" w:cs="Arial" w:eastAsia="Arial" w:hAnsi="Arial"/>
+          <w:b/>
+          <w:bCs/>
+          <w:color w:val="1B2118"/>
+          <w:sz w:val="21"/>
+          <w:szCs w:val="21"/>
+        </w:rPr>
+        <w:t xml:space="preserve">produzione totale prevista</w:t>
+      </w:r>
+      <w:r>
+        <w:rPr>
+          <w:rFonts w:ascii="Arial" w:cs="Arial" w:eastAsia="Arial" w:hAnsi="Arial"/>
+          <w:color w:val="1B2118"/>
+          <w:sz w:val="21"/>
+          <w:szCs w:val="21"/>
+        </w:rPr>
+        <w:t xml:space="preserve"> (in tonnellate, oppure scrivendo il pro capite in kg/ab) e </w:t>
+      </w:r>
+      <w:r>
+        <w:rPr>
+          <w:rFonts w:ascii="Arial" w:cs="Arial" w:eastAsia="Arial" w:hAnsi="Arial"/>
+          <w:b/>
+          <w:bCs/>
+          <w:color w:val="1B2118"/>
+          <w:sz w:val="21"/>
+          <w:szCs w:val="21"/>
+        </w:rPr>
+        <w:t xml:space="preserve">secco residuo pro capite</w:t>
+      </w:r>
+      <w:r>
+        <w:rPr>
+          <w:rFonts w:ascii="Arial" w:cs="Arial" w:eastAsia="Arial" w:hAnsi="Arial"/>
+          <w:color w:val="1B2118"/>
+          <w:sz w:val="21"/>
+          <w:szCs w:val="21"/>
+        </w:rPr>
+        <w:t xml:space="preserve"> obiettivo. Per non compilare tutto a mano, indicate gli obiettivi dell'ultimo anno (produzione pro capite e secco pro capite) e premete </w:t>
+      </w:r>
+      <w:r>
+        <w:rPr>
+          <w:rFonts w:ascii="Arial" w:cs="Arial" w:eastAsia="Arial" w:hAnsi="Arial"/>
+          <w:b/>
+          <w:bCs/>
+          <w:color w:val="1B2118"/>
+          <w:sz w:val="21"/>
+          <w:szCs w:val="21"/>
+        </w:rPr>
+        <w:t xml:space="preserve">Applica la traiettoria</w:t>
+      </w:r>
+      <w:r>
+        <w:rPr>
+          <w:rFonts w:ascii="Arial" w:cs="Arial" w:eastAsia="Arial" w:hAnsi="Arial"/>
+          <w:color w:val="1B2118"/>
+          <w:sz w:val="21"/>
+          <w:szCs w:val="21"/>
+        </w:rPr>
+        <w:t xml:space="preserve">: il portale riempie gli anni con un andamento lineare dalla situazione attuale (o dal riferimento), poi potete correggere i singoli anni. Per ogni anno il portale ricalcola il secco in tonnellate e la </w:t>
+      </w:r>
+      <w:r>
+        <w:rPr>
+          <w:rFonts w:ascii="Arial" w:cs="Arial" w:eastAsia="Arial" w:hAnsi="Arial"/>
+          <w:b/>
+          <w:bCs/>
+          <w:color w:val="1B2118"/>
+          <w:sz w:val="21"/>
+          <w:szCs w:val="21"/>
+        </w:rPr>
+        <w:t xml:space="preserve">% di differenziata</w:t>
+      </w:r>
+      <w:r>
+        <w:rPr>
+          <w:rFonts w:ascii="Arial" w:cs="Arial" w:eastAsia="Arial" w:hAnsi="Arial"/>
+          <w:color w:val="1B2118"/>
+          <w:sz w:val="21"/>
+          <w:szCs w:val="21"/>
+        </w:rPr>
+        <w:t xml:space="preserve">.</w:t>
+      </w:r>
+    </w:p>
+    <w:p>
+      <w:pPr>
+        <w:spacing w:after="140" w:line="300"/>
+      </w:pPr>
+      <w:r>
+        <w:rPr>
+          <w:rFonts w:ascii="Arial" w:cs="Arial" w:eastAsia="Arial" w:hAnsi="Arial"/>
+          <w:b/>
+          <w:bCs/>
+          <w:color w:val="1B2118"/>
+          <w:sz w:val="21"/>
+          <w:szCs w:val="21"/>
+        </w:rPr>
+        <w:t xml:space="preserve">4. Risultati.</w:t>
+      </w:r>
+      <w:r>
+        <w:rPr>
+          <w:rFonts w:ascii="Arial" w:cs="Arial" w:eastAsia="Arial" w:hAnsi="Arial"/>
+          <w:color w:val="1B2118"/>
+          <w:sz w:val="21"/>
+          <w:szCs w:val="21"/>
+        </w:rPr>
+        <w:t xml:space="preserve"> Si aggiornano a ogni modifica:</w:t>
       </w:r>
     </w:p>
     <w:p>
@@ -34209,7 +34608,104 @@
           <w:sz w:val="21"/>
           <w:szCs w:val="21"/>
         </w:rPr>
-        <w:t xml:space="preserve">tabella anno per anno: produzione, scenario di riferimento, rifiuti evitati, crediti lordi, buffer, crediti netti e cumulati;</w:t>
+        <w:t xml:space="preserve">crediti netti stimati nel periodo e media annua, % di differenziata dell'ultimo anno, rifiuti evitati;</w:t>
+      </w:r>
+    </w:p>
+    <w:p>
+      <w:pPr>
+        <w:pStyle w:val="ListParagraph"/>
+        <w:numPr>
+          <w:ilvl w:val="0"/>
+          <w:numId w:val="2"/>
+        </w:numPr>
+        <w:spacing w:after="70" w:line="290"/>
+      </w:pPr>
+      <w:r>
+        <w:rPr>
+          <w:rFonts w:ascii="Arial" w:cs="Arial" w:eastAsia="Arial" w:hAnsi="Arial"/>
+          <w:color w:val="1B2118"/>
+          <w:sz w:val="21"/>
+          <w:szCs w:val="21"/>
+        </w:rPr>
+        <w:t xml:space="preserve">grafico dei crediti netti per anno e grafico della % di differenziata rispetto all'anno base;</w:t>
+      </w:r>
+    </w:p>
+    <w:p>
+      <w:pPr>
+        <w:pStyle w:val="ListParagraph"/>
+        <w:numPr>
+          <w:ilvl w:val="0"/>
+          <w:numId w:val="2"/>
+        </w:numPr>
+        <w:spacing w:after="70" w:line="290"/>
+      </w:pPr>
+      <w:r>
+        <w:rPr>
+          <w:rFonts w:ascii="Arial" w:cs="Arial" w:eastAsia="Arial" w:hAnsi="Arial"/>
+          <w:color w:val="1B2118"/>
+          <w:sz w:val="21"/>
+          <w:szCs w:val="21"/>
+        </w:rPr>
+        <w:t xml:space="preserve">riquadro </w:t>
+      </w:r>
+      <w:r>
+        <w:rPr>
+          <w:rFonts w:ascii="Arial" w:cs="Arial" w:eastAsia="Arial" w:hAnsi="Arial"/>
+          <w:b/>
+          <w:bCs/>
+          <w:color w:val="1B2118"/>
+          <w:sz w:val="21"/>
+          <w:szCs w:val="21"/>
+        </w:rPr>
+        <w:t xml:space="preserve">Per abitante all'anno</w:t>
+      </w:r>
+      <w:r>
+        <w:rPr>
+          <w:rFonts w:ascii="Arial" w:cs="Arial" w:eastAsia="Arial" w:hAnsi="Arial"/>
+          <w:color w:val="1B2118"/>
+          <w:sz w:val="21"/>
+          <w:szCs w:val="21"/>
+        </w:rPr>
+        <w:t xml:space="preserve">: crediti netti medi per abitante, da confrontare con le stime dei contratti (Allegato A EsaCom: 0,19-0,23);</w:t>
+      </w:r>
+    </w:p>
+    <w:p>
+      <w:pPr>
+        <w:pStyle w:val="ListParagraph"/>
+        <w:numPr>
+          <w:ilvl w:val="0"/>
+          <w:numId w:val="2"/>
+        </w:numPr>
+        <w:spacing w:after="70" w:line="290"/>
+      </w:pPr>
+      <w:r>
+        <w:rPr>
+          <w:rFonts w:ascii="Arial" w:cs="Arial" w:eastAsia="Arial" w:hAnsi="Arial"/>
+          <w:color w:val="1B2118"/>
+          <w:sz w:val="21"/>
+          <w:szCs w:val="21"/>
+        </w:rPr>
+        <w:t xml:space="preserve">tabella anno per anno: produzione, scenario di riferimento, rifiuti evitati, crediti lordi, buffer, crediti netti e cumulati; con il metodo per utenza anche la colonna </w:t>
+      </w:r>
+      <w:r>
+        <w:rPr>
+          <w:rFonts w:ascii="Arial" w:cs="Arial" w:eastAsia="Arial" w:hAnsi="Arial"/>
+          <w:b/>
+          <w:bCs/>
+          <w:color w:val="1B2118"/>
+          <w:sz w:val="21"/>
+          <w:szCs w:val="21"/>
+        </w:rPr>
+        <w:t xml:space="preserve">Bilancio del Comune</w:t>
+      </w:r>
+      <w:r>
+        <w:rPr>
+          <w:rFonts w:ascii="Arial" w:cs="Arial" w:eastAsia="Arial" w:hAnsi="Arial"/>
+          <w:color w:val="1B2118"/>
+          <w:sz w:val="21"/>
+          <w:szCs w:val="21"/>
+        </w:rPr>
+        <w:t xml:space="preserve">, per confronto;</w:t>
       </w:r>
     </w:p>
     <w:p>
@@ -40653,7 +41149,7 @@
         <w:szCs w:val="16"/>
       </w:rPr>
       <w:tab/>
-      <w:t xml:space="preserve">Manuale Amministratore · Rev. 3.1 · 19/10/2026</w:t>
+      <w:t xml:space="preserve">Manuale Amministratore · Rev. 3.2 · 19/10/2026</w:t>
     </w:r>
   </w:p>
 </w:hdr>
@@ -40718,7 +41214,7 @@
         <w:szCs w:val="16"/>
       </w:rPr>
       <w:tab/>
-      <w:t xml:space="preserve">Manuale Amministratore · Rev. 3.1 · 19/10/2026</w:t>
+      <w:t xml:space="preserve">Manuale Amministratore · Rev. 3.2 · 19/10/2026</w:t>
     </w:r>
   </w:p>
 </w:hdr>

</xml_diff>

<commit_message>
Ordinamento per colonna di tutte le tabelle e «Ordina per» negli elenchi a schede; manuali e registro
Co-Authored-By: Claude Opus 5.5 <noreply@anthropic.com>
Claude-Session: https://claude.ai/code/session_01E8XCbEeVHWVP3hntUZ6kZ1
</commit_message>
<xml_diff>
--- a/public/documentazione/Manuale_Amministratore_Portale_CWP.docx
+++ b/public/documentazione/Manuale_Amministratore_Portale_CWP.docx
@@ -302,7 +302,7 @@
                 <w:sz w:val="20"/>
                 <w:szCs w:val="20"/>
               </w:rPr>
-              <w:t xml:space="preserve">Rev. 3.2</w:t>
+              <w:t xml:space="preserve">Rev. 3.3</w:t>
             </w:r>
           </w:p>
         </w:tc>
@@ -719,7 +719,7 @@
                 <w:sz w:val="18"/>
                 <w:szCs w:val="18"/>
               </w:rPr>
-              <w:t xml:space="preserve">3.2</w:t>
+              <w:t xml:space="preserve">3.3</w:t>
             </w:r>
           </w:p>
         </w:tc>
@@ -783,7 +783,7 @@
                 <w:sz w:val="18"/>
                 <w:szCs w:val="18"/>
               </w:rPr>
-              <w:t xml:space="preserve">Simulatore: metodo di stima per utenza (solo utenze virtuose), buffer del Capitolo 7, taratura.</w:t>
+              <w:t xml:space="preserve">Ordinamento di tutte le tabelle e degli elenchi.</w:t>
             </w:r>
           </w:p>
         </w:tc>
@@ -853,7 +853,7 @@
                 <w:sz w:val="18"/>
                 <w:szCs w:val="18"/>
               </w:rPr>
-              <w:t xml:space="preserve">3.1</w:t>
+              <w:t xml:space="preserve">3.2</w:t>
             </w:r>
           </w:p>
         </w:tc>
@@ -919,7 +919,7 @@
                 <w:sz w:val="18"/>
                 <w:szCs w:val="18"/>
               </w:rPr>
-              <w:t xml:space="preserve">Cruscotto diventa Dashboard; barra a LED delle 7 fasi per ogni pratica.</w:t>
+              <w:t xml:space="preserve">Simulatore: metodo di stima per utenza (solo utenze virtuose), buffer del Capitolo 7, taratura.</w:t>
             </w:r>
           </w:p>
         </w:tc>
@@ -989,7 +989,7 @@
                 <w:sz w:val="18"/>
                 <w:szCs w:val="18"/>
               </w:rPr>
-              <w:t xml:space="preserve">3.0</w:t>
+              <w:t xml:space="preserve">3.1</w:t>
             </w:r>
           </w:p>
         </w:tc>
@@ -1053,7 +1053,7 @@
                 <w:sz w:val="18"/>
                 <w:szCs w:val="18"/>
               </w:rPr>
-              <w:t xml:space="preserve">Eliminazione degli utenti che non hanno mai operato (script 30).</w:t>
+              <w:t xml:space="preserve">Cruscotto diventa Dashboard; barra a LED delle 7 fasi per ogni pratica.</w:t>
             </w:r>
           </w:p>
         </w:tc>
@@ -1123,7 +1123,7 @@
                 <w:sz w:val="18"/>
                 <w:szCs w:val="18"/>
               </w:rPr>
-              <w:t xml:space="preserve">2.9</w:t>
+              <w:t xml:space="preserve">3.0</w:t>
             </w:r>
           </w:p>
         </w:tc>
@@ -1189,7 +1189,7 @@
                 <w:sz w:val="18"/>
                 <w:szCs w:val="18"/>
               </w:rPr>
-              <w:t xml:space="preserve">Email automatica con le credenziali al nuovo utente e alla reimpostazione della password.</w:t>
+              <w:t xml:space="preserve">Eliminazione degli utenti che non hanno mai operato (script 30).</w:t>
             </w:r>
           </w:p>
         </w:tc>
@@ -1259,7 +1259,7 @@
                 <w:sz w:val="18"/>
                 <w:szCs w:val="18"/>
               </w:rPr>
-              <w:t xml:space="preserve">2.8</w:t>
+              <w:t xml:space="preserve">2.9</w:t>
             </w:r>
           </w:p>
         </w:tc>
@@ -1323,7 +1323,7 @@
                 <w:sz w:val="18"/>
                 <w:szCs w:val="18"/>
               </w:rPr>
-              <w:t xml:space="preserve">Più Amministratori con accesso completo; Amministratore principale protetto (script 29).</w:t>
+              <w:t xml:space="preserve">Email automatica con le credenziali al nuovo utente e alla reimpostazione della password.</w:t>
             </w:r>
           </w:p>
         </w:tc>
@@ -1393,7 +1393,7 @@
                 <w:sz w:val="18"/>
                 <w:szCs w:val="18"/>
               </w:rPr>
-              <w:t xml:space="preserve">2.7</w:t>
+              <w:t xml:space="preserve">2.8</w:t>
             </w:r>
           </w:p>
         </w:tc>
@@ -1459,7 +1459,7 @@
                 <w:sz w:val="18"/>
                 <w:szCs w:val="18"/>
               </w:rPr>
-              <w:t xml:space="preserve">Simulatore: costi per il Comune secondo il Caso 1 (progetto volontario) o il Caso 2 (progetto obbligatorio da bando).</w:t>
+              <w:t xml:space="preserve">Più Amministratori con accesso completo; Amministratore principale protetto (script 29).</w:t>
             </w:r>
           </w:p>
         </w:tc>
@@ -1529,7 +1529,7 @@
                 <w:sz w:val="18"/>
                 <w:szCs w:val="18"/>
               </w:rPr>
-              <w:t xml:space="preserve">2.6</w:t>
+              <w:t xml:space="preserve">2.7</w:t>
             </w:r>
           </w:p>
         </w:tc>
@@ -1593,7 +1593,7 @@
                 <w:sz w:val="18"/>
                 <w:szCs w:val="18"/>
               </w:rPr>
-              <w:t xml:space="preserve">Simulatore: valore del credito anno per anno, proposto 32 €.</w:t>
+              <w:t xml:space="preserve">Simulatore: costi per il Comune secondo il Caso 1 (progetto volontario) o il Caso 2 (progetto obbligatorio da bando).</w:t>
             </w:r>
           </w:p>
         </w:tc>
@@ -1663,7 +1663,7 @@
                 <w:sz w:val="18"/>
                 <w:szCs w:val="18"/>
               </w:rPr>
-              <w:t xml:space="preserve">2.5</w:t>
+              <w:t xml:space="preserve">2.6</w:t>
             </w:r>
           </w:p>
         </w:tc>
@@ -1729,7 +1729,7 @@
                 <w:sz w:val="18"/>
                 <w:szCs w:val="18"/>
               </w:rPr>
-              <w:t xml:space="preserve">Simulatore: simulazione economica con valore unitario del credito e costi per il Comune (contratti tipo della Fondazione, Schema tariffario).</w:t>
+              <w:t xml:space="preserve">Simulatore: valore del credito anno per anno, proposto 32 €.</w:t>
             </w:r>
           </w:p>
         </w:tc>
@@ -1799,7 +1799,7 @@
                 <w:sz w:val="18"/>
                 <w:szCs w:val="18"/>
               </w:rPr>
-              <w:t xml:space="preserve">2.4</w:t>
+              <w:t xml:space="preserve">2.5</w:t>
             </w:r>
           </w:p>
         </w:tc>
@@ -1863,7 +1863,7 @@
                 <w:sz w:val="18"/>
                 <w:szCs w:val="18"/>
               </w:rPr>
-              <w:t xml:space="preserve">Simulatore: riferimento sempre alla soglia del 65% di differenziata e controllo dei valori fuori scala.</w:t>
+              <w:t xml:space="preserve">Simulatore: simulazione economica con valore unitario del credito e costi per il Comune (contratti tipo della Fondazione, Schema tariffario).</w:t>
             </w:r>
           </w:p>
         </w:tc>
@@ -1933,7 +1933,7 @@
                 <w:sz w:val="18"/>
                 <w:szCs w:val="18"/>
               </w:rPr>
-              <w:t xml:space="preserve">2.3</w:t>
+              <w:t xml:space="preserve">2.4</w:t>
             </w:r>
           </w:p>
         </w:tc>
@@ -1999,7 +1999,7 @@
                 <w:sz w:val="18"/>
                 <w:szCs w:val="18"/>
               </w:rPr>
-              <w:t xml:space="preserve">Simulatore conforme al modello CWP: scenario di riferimento dello Standard 4.8.1, situazione attuale, conformità.</w:t>
+              <w:t xml:space="preserve">Simulatore: riferimento sempre alla soglia del 65% di differenziata e controllo dei valori fuori scala.</w:t>
             </w:r>
           </w:p>
         </w:tc>
@@ -2069,7 +2069,7 @@
                 <w:sz w:val="18"/>
                 <w:szCs w:val="18"/>
               </w:rPr>
-              <w:t xml:space="preserve">2.2</w:t>
+              <w:t xml:space="preserve">2.3</w:t>
             </w:r>
           </w:p>
         </w:tc>
@@ -2133,7 +2133,7 @@
                 <w:sz w:val="18"/>
                 <w:szCs w:val="18"/>
               </w:rPr>
-              <w:t xml:space="preserve">Nuovo capitolo «Simulatore di scenari»: creazione, anno base, obiettivi annui, risultati, modello di stima.</w:t>
+              <w:t xml:space="preserve">Simulatore conforme al modello CWP: scenario di riferimento dello Standard 4.8.1, situazione attuale, conformità.</w:t>
             </w:r>
           </w:p>
         </w:tc>
@@ -2203,7 +2203,7 @@
                 <w:sz w:val="18"/>
                 <w:szCs w:val="18"/>
               </w:rPr>
-              <w:t xml:space="preserve">2.1</w:t>
+              <w:t xml:space="preserve">2.2</w:t>
             </w:r>
           </w:p>
         </w:tc>
@@ -2269,7 +2269,7 @@
                 <w:sz w:val="18"/>
                 <w:szCs w:val="18"/>
               </w:rPr>
-              <w:t xml:space="preserve">Funzioni in arrivo: simulatore di scenari (7, 10 o 21 anni, obiettivi annui, % di differenziata e crediti stimati) e assistente virtuale (Claude).</w:t>
+              <w:t xml:space="preserve">Nuovo capitolo «Simulatore di scenari»: creazione, anno base, obiettivi annui, risultati, modello di stima.</w:t>
             </w:r>
           </w:p>
         </w:tc>
@@ -2339,7 +2339,7 @@
                 <w:sz w:val="18"/>
                 <w:szCs w:val="18"/>
               </w:rPr>
-              <w:t xml:space="preserve">2.0</w:t>
+              <w:t xml:space="preserve">2.1</w:t>
             </w:r>
           </w:p>
         </w:tc>
@@ -2403,7 +2403,7 @@
                 <w:sz w:val="18"/>
                 <w:szCs w:val="18"/>
               </w:rPr>
-              <w:t xml:space="preserve">Copie di sicurezza e ripristino: rimando alle Istruzioni di ripristino e punti essenziali (capitolo Manutenzione ed emergenze).</w:t>
+              <w:t xml:space="preserve">Funzioni in arrivo: simulatore di scenari (7, 10 o 21 anni, obiettivi annui, % di differenziata e crediti stimati) e assistente virtuale (Claude).</w:t>
             </w:r>
           </w:p>
         </w:tc>
@@ -2473,7 +2473,7 @@
                 <w:sz w:val="18"/>
                 <w:szCs w:val="18"/>
               </w:rPr>
-              <w:t xml:space="preserve">1.9</w:t>
+              <w:t xml:space="preserve">2.0</w:t>
             </w:r>
           </w:p>
         </w:tc>
@@ -2539,7 +2539,7 @@
                 <w:sz w:val="18"/>
                 <w:szCs w:val="18"/>
               </w:rPr>
-              <w:t xml:space="preserve">Fondazione Operate soggetto promotore del programma (esclusiva conferita da Wastelab).</w:t>
+              <w:t xml:space="preserve">Copie di sicurezza e ripristino: rimando alle Istruzioni di ripristino e punti essenziali (capitolo Manutenzione ed emergenze).</w:t>
             </w:r>
           </w:p>
         </w:tc>
@@ -2609,7 +2609,7 @@
                 <w:sz w:val="18"/>
                 <w:szCs w:val="18"/>
               </w:rPr>
-              <w:t xml:space="preserve">1.8</w:t>
+              <w:t xml:space="preserve">1.9</w:t>
             </w:r>
           </w:p>
         </w:tc>
@@ -2673,7 +2673,7 @@
                 <w:sz w:val="18"/>
                 <w:szCs w:val="18"/>
               </w:rPr>
-              <w:t xml:space="preserve">PEC del Programma e documenti ufficiali già pubblicati sulla pagina pubblica.</w:t>
+              <w:t xml:space="preserve">Fondazione Operate soggetto promotore del programma (esclusiva conferita da Wastelab).</w:t>
             </w:r>
           </w:p>
         </w:tc>
@@ -2743,7 +2743,7 @@
                 <w:sz w:val="18"/>
                 <w:szCs w:val="18"/>
               </w:rPr>
-              <w:t xml:space="preserve">1.7</w:t>
+              <w:t xml:space="preserve">1.8</w:t>
             </w:r>
           </w:p>
         </w:tc>
@@ -2776,7 +2776,7 @@
                 <w:sz w:val="18"/>
                 <w:szCs w:val="18"/>
               </w:rPr>
-              <w:t xml:space="preserve">18/10/2026</w:t>
+              <w:t xml:space="preserve">19/10/2026</w:t>
             </w:r>
           </w:p>
         </w:tc>
@@ -2809,7 +2809,7 @@
                 <w:sz w:val="18"/>
                 <w:szCs w:val="18"/>
               </w:rPr>
-              <w:t xml:space="preserve">Allineamento ai documenti ufficiali del Programma (script 22-24): Rapporto a 7 fasi, feedback pubblico, stati del Programma, dati del progetto e territorio ISTAT, ritiro e rientro, account unico e delegati, registri, tariffe e sospensione, accuratezza e accertamenti, informazioni del Programma e metodologie, modelli pubblici; nuovi capitoli Crediti emessi, Reclami, Pagina pubblica; qualità dei dati nel calcolo.</w:t>
+              <w:t xml:space="preserve">PEC del Programma e documenti ufficiali già pubblicati sulla pagina pubblica.</w:t>
             </w:r>
           </w:p>
         </w:tc>
@@ -2879,7 +2879,7 @@
                 <w:sz w:val="18"/>
                 <w:szCs w:val="18"/>
               </w:rPr>
-              <w:t xml:space="preserve">1.6</w:t>
+              <w:t xml:space="preserve">1.7</w:t>
             </w:r>
           </w:p>
         </w:tc>
@@ -2943,7 +2943,7 @@
                 <w:sz w:val="18"/>
                 <w:szCs w:val="18"/>
               </w:rPr>
-              <w:t xml:space="preserve">Calcolo crediti: descrizione corretta del buffer (somma delle voci delle Tabelle 15 e 16, più il 20% con le sole utenze virtuose, al massimo 80%).</w:t>
+              <w:t xml:space="preserve">Allineamento ai documenti ufficiali del Programma (script 22-24): Rapporto a 7 fasi, feedback pubblico, stati del Programma, dati del progetto e territorio ISTAT, ritiro e rientro, account unico e delegati, registri, tariffe e sospensione, accuratezza e accertamenti, informazioni del Programma e metodologie, modelli pubblici; nuovi capitoli Crediti emessi, Reclami, Pagina pubblica; qualità dei dati nel calcolo.</w:t>
             </w:r>
           </w:p>
         </w:tc>
@@ -3013,7 +3013,7 @@
                 <w:sz w:val="18"/>
                 <w:szCs w:val="18"/>
               </w:rPr>
-              <w:t xml:space="preserve">1.5</w:t>
+              <w:t xml:space="preserve">1.6</w:t>
             </w:r>
           </w:p>
         </w:tc>
@@ -3079,7 +3079,7 @@
                 <w:sz w:val="18"/>
                 <w:szCs w:val="18"/>
               </w:rPr>
-              <w:t xml:space="preserve">Nuova pagina Anagrafiche (Organizzazioni ed Enti, anche per gli Operatori); Rapporti con 4 fasi e durate proprie; documenti richiesti per fase; consultazione con documento bloccato, osservazioni numerate e motivazione; conservazione per 10 anni; fascicolo con riepilogo PDF e nuove cartelle.</w:t>
+              <w:t xml:space="preserve">Calcolo crediti: descrizione corretta del buffer (somma delle voci delle Tabelle 15 e 16, più il 20% con le sole utenze virtuose, al massimo 80%).</w:t>
             </w:r>
           </w:p>
         </w:tc>
@@ -3149,7 +3149,7 @@
                 <w:sz w:val="18"/>
                 <w:szCs w:val="18"/>
               </w:rPr>
-              <w:t xml:space="preserve">1.4</w:t>
+              <w:t xml:space="preserve">1.5</w:t>
             </w:r>
           </w:p>
         </w:tc>
@@ -3213,7 +3213,7 @@
                 <w:sz w:val="18"/>
                 <w:szCs w:val="18"/>
               </w:rPr>
-              <w:t xml:space="preserve">Calcolo crediti: il risultato si azzera quando cambiano dati o Banca Dati Utenze, conferma solo dopo un nuovo «Calcola». Gestione utenti: password temporanea di almeno 10 caratteri con lettere e numeri, creazione annullata se non va a buon fine, nessun accesso ai dati prima del cambio password.</w:t>
+              <w:t xml:space="preserve">Nuova pagina Anagrafiche (Organizzazioni ed Enti, anche per gli Operatori); Rapporti con 4 fasi e durate proprie; documenti richiesti per fase; consultazione con documento bloccato, osservazioni numerate e motivazione; conservazione per 10 anni; fascicolo con riepilogo PDF e nuove cartelle.</w:t>
             </w:r>
           </w:p>
         </w:tc>
@@ -3283,7 +3283,7 @@
                 <w:sz w:val="18"/>
                 <w:szCs w:val="18"/>
               </w:rPr>
-              <w:t xml:space="preserve">1.3</w:t>
+              <w:t xml:space="preserve">1.4</w:t>
             </w:r>
           </w:p>
         </w:tc>
@@ -3349,7 +3349,7 @@
                 <w:sz w:val="18"/>
                 <w:szCs w:val="18"/>
               </w:rPr>
-              <w:t xml:space="preserve">Rapporto di calcolo in PDF, archiviazione nella pratica, numero di registro, registro dei crediti.</w:t>
+              <w:t xml:space="preserve">Calcolo crediti: il risultato si azzera quando cambiano dati o Banca Dati Utenze, conferma solo dopo un nuovo «Calcola». Gestione utenti: password temporanea di almeno 10 caratteri con lettere e numeri, creazione annullata se non va a buon fine, nessun accesso ai dati prima del cambio password.</w:t>
             </w:r>
           </w:p>
         </w:tc>
@@ -3419,7 +3419,7 @@
                 <w:sz w:val="18"/>
                 <w:szCs w:val="18"/>
               </w:rPr>
-              <w:t xml:space="preserve">1.2</w:t>
+              <w:t xml:space="preserve">1.3</w:t>
             </w:r>
           </w:p>
         </w:tc>
@@ -3483,7 +3483,7 @@
                 <w:sz w:val="18"/>
                 <w:szCs w:val="18"/>
               </w:rPr>
-              <w:t xml:space="preserve">Calcolo crediti: importare il tracciato nel calcolo (dai documenti della pratica o dal computer), singole letture, blocco dei dati personali, controlli di coerenza.</w:t>
+              <w:t xml:space="preserve">Rapporto di calcolo in PDF, archiviazione nella pratica, numero di registro, registro dei crediti.</w:t>
             </w:r>
           </w:p>
         </w:tc>
@@ -3553,7 +3553,7 @@
                 <w:sz w:val="18"/>
                 <w:szCs w:val="18"/>
               </w:rPr>
-              <w:t xml:space="preserve">1.1</w:t>
+              <w:t xml:space="preserve">1.2</w:t>
             </w:r>
           </w:p>
         </w:tc>
@@ -3619,7 +3619,7 @@
                 <w:sz w:val="18"/>
                 <w:szCs w:val="18"/>
               </w:rPr>
-              <w:t xml:space="preserve">Note di fase, Ente di Validazione della pratica, consultazione sulla pagina pubblica con conferma dell'email, moderazione con autori e allegati, errata corrige; nuovo capitolo Messaggi con il Comune; pagamenti visibili al Comune; Impostazioni: Enti di Validazione e Modelli di documento; notifiche aggiornate.</w:t>
+              <w:t xml:space="preserve">Calcolo crediti: importare il tracciato nel calcolo (dai documenti della pratica o dal computer), singole letture, blocco dei dati personali, controlli di coerenza.</w:t>
             </w:r>
           </w:p>
         </w:tc>
@@ -3689,6 +3689,140 @@
                 <w:sz w:val="18"/>
                 <w:szCs w:val="18"/>
               </w:rPr>
+              <w:t xml:space="preserve">1.1</w:t>
+            </w:r>
+          </w:p>
+        </w:tc>
+        <w:tc>
+          <w:tcPr>
+            <w:tcW w:type="dxa" w:w="1300"/>
+            <w:tcBorders>
+              <w:top w:val="single" w:color="D9D4C5" w:sz="4"/>
+              <w:left w:val="single" w:color="D9D4C5" w:sz="4"/>
+              <w:bottom w:val="single" w:color="D9D4C5" w:sz="4"/>
+              <w:right w:val="single" w:color="D9D4C5" w:sz="4"/>
+            </w:tcBorders>
+            <w:tcMar>
+              <w:top w:type="dxa" w:w="70"/>
+              <w:left w:type="dxa" w:w="110"/>
+              <w:bottom w:type="dxa" w:w="70"/>
+              <w:right w:type="dxa" w:w="110"/>
+            </w:tcMar>
+            <w:vAlign w:val="center"/>
+          </w:tcPr>
+          <w:p>
+            <w:pPr>
+              <w:spacing w:after="0" w:before="0"/>
+            </w:pPr>
+            <w:r>
+              <w:rPr>
+                <w:rFonts w:ascii="Arial" w:cs="Arial" w:eastAsia="Arial" w:hAnsi="Arial"/>
+                <w:color w:val="1B2118"/>
+                <w:sz w:val="18"/>
+                <w:szCs w:val="18"/>
+              </w:rPr>
+              <w:t xml:space="preserve">18/10/2026</w:t>
+            </w:r>
+          </w:p>
+        </w:tc>
+        <w:tc>
+          <w:tcPr>
+            <w:tcW w:type="dxa" w:w="5538"/>
+            <w:tcBorders>
+              <w:top w:val="single" w:color="D9D4C5" w:sz="4"/>
+              <w:left w:val="single" w:color="D9D4C5" w:sz="4"/>
+              <w:bottom w:val="single" w:color="D9D4C5" w:sz="4"/>
+              <w:right w:val="single" w:color="D9D4C5" w:sz="4"/>
+            </w:tcBorders>
+            <w:tcMar>
+              <w:top w:type="dxa" w:w="70"/>
+              <w:left w:type="dxa" w:w="110"/>
+              <w:bottom w:type="dxa" w:w="70"/>
+              <w:right w:type="dxa" w:w="110"/>
+            </w:tcMar>
+            <w:vAlign w:val="center"/>
+          </w:tcPr>
+          <w:p>
+            <w:pPr>
+              <w:spacing w:after="0" w:before="0"/>
+            </w:pPr>
+            <w:r>
+              <w:rPr>
+                <w:rFonts w:ascii="Arial" w:cs="Arial" w:eastAsia="Arial" w:hAnsi="Arial"/>
+                <w:color w:val="1B2118"/>
+                <w:sz w:val="18"/>
+                <w:szCs w:val="18"/>
+              </w:rPr>
+              <w:t xml:space="preserve">Note di fase, Ente di Validazione della pratica, consultazione sulla pagina pubblica con conferma dell'email, moderazione con autori e allegati, errata corrige; nuovo capitolo Messaggi con il Comune; pagamenti visibili al Comune; Impostazioni: Enti di Validazione e Modelli di documento; notifiche aggiornate.</w:t>
+            </w:r>
+          </w:p>
+        </w:tc>
+        <w:tc>
+          <w:tcPr>
+            <w:tcW w:type="dxa" w:w="2000"/>
+            <w:tcBorders>
+              <w:top w:val="single" w:color="D9D4C5" w:sz="4"/>
+              <w:left w:val="single" w:color="D9D4C5" w:sz="4"/>
+              <w:bottom w:val="single" w:color="D9D4C5" w:sz="4"/>
+              <w:right w:val="single" w:color="D9D4C5" w:sz="4"/>
+            </w:tcBorders>
+            <w:tcMar>
+              <w:top w:type="dxa" w:w="70"/>
+              <w:left w:type="dxa" w:w="110"/>
+              <w:bottom w:type="dxa" w:w="70"/>
+              <w:right w:type="dxa" w:w="110"/>
+            </w:tcMar>
+            <w:vAlign w:val="center"/>
+          </w:tcPr>
+          <w:p>
+            <w:pPr>
+              <w:spacing w:after="0" w:before="0"/>
+            </w:pPr>
+            <w:r>
+              <w:rPr>
+                <w:rFonts w:ascii="Arial" w:cs="Arial" w:eastAsia="Arial" w:hAnsi="Arial"/>
+                <w:color w:val="1B2118"/>
+                <w:sz w:val="18"/>
+                <w:szCs w:val="18"/>
+              </w:rPr>
+              <w:t xml:space="preserve">Fondazione Operate</w:t>
+            </w:r>
+          </w:p>
+        </w:tc>
+      </w:tr>
+      <w:tr>
+        <w:trPr>
+          <w:cantSplit/>
+        </w:trPr>
+        <w:tc>
+          <w:tcPr>
+            <w:tcW w:type="dxa" w:w="800"/>
+            <w:tcBorders>
+              <w:top w:val="single" w:color="D9D4C5" w:sz="4"/>
+              <w:left w:val="single" w:color="D9D4C5" w:sz="4"/>
+              <w:bottom w:val="single" w:color="D9D4C5" w:sz="4"/>
+              <w:right w:val="single" w:color="D9D4C5" w:sz="4"/>
+            </w:tcBorders>
+            <w:shd w:fill="F6F4EE" w:color="auto" w:val="clear"/>
+            <w:tcMar>
+              <w:top w:type="dxa" w:w="70"/>
+              <w:left w:type="dxa" w:w="110"/>
+              <w:bottom w:type="dxa" w:w="70"/>
+              <w:right w:type="dxa" w:w="110"/>
+            </w:tcMar>
+            <w:vAlign w:val="center"/>
+          </w:tcPr>
+          <w:p>
+            <w:pPr>
+              <w:spacing w:after="0" w:before="0"/>
+            </w:pPr>
+            <w:r>
+              <w:rPr>
+                <w:rFonts w:ascii="Arial" w:cs="Arial" w:eastAsia="Arial" w:hAnsi="Arial"/>
+                <w:color w:val="1B2118"/>
+                <w:sz w:val="18"/>
+                <w:szCs w:val="18"/>
+              </w:rPr>
               <w:t xml:space="preserve">1.0</w:t>
             </w:r>
           </w:p>
@@ -3702,6 +3836,7 @@
               <w:bottom w:val="single" w:color="D9D4C5" w:sz="4"/>
               <w:right w:val="single" w:color="D9D4C5" w:sz="4"/>
             </w:tcBorders>
+            <w:shd w:fill="F6F4EE" w:color="auto" w:val="clear"/>
             <w:tcMar>
               <w:top w:type="dxa" w:w="70"/>
               <w:left w:type="dxa" w:w="110"/>
@@ -3734,6 +3869,7 @@
               <w:bottom w:val="single" w:color="D9D4C5" w:sz="4"/>
               <w:right w:val="single" w:color="D9D4C5" w:sz="4"/>
             </w:tcBorders>
+            <w:shd w:fill="F6F4EE" w:color="auto" w:val="clear"/>
             <w:tcMar>
               <w:top w:type="dxa" w:w="70"/>
               <w:left w:type="dxa" w:w="110"/>
@@ -3766,6 +3902,7 @@
               <w:bottom w:val="single" w:color="D9D4C5" w:sz="4"/>
               <w:right w:val="single" w:color="D9D4C5" w:sz="4"/>
             </w:tcBorders>
+            <w:shd w:fill="F6F4EE" w:color="auto" w:val="clear"/>
             <w:tcMar>
               <w:top w:type="dxa" w:w="70"/>
               <w:left w:type="dxa" w:w="110"/>
@@ -3807,7 +3944,7 @@
           <w:sz w:val="20"/>
           <w:szCs w:val="20"/>
         </w:rPr>
-        <w:t xml:space="preserve">Questo documento descrive il portale alla revisione 3.2 del 19/10/2026. A ogni modifica del portale il manuale viene aggiornato e la revisione incrementata; la versione corrente si scarica dall'area Documentazione del portale (solo Amministratori).</w:t>
+        <w:t xml:space="preserve">Questo documento descrive il portale alla revisione 3.3 del 19/10/2026. A ogni modifica del portale il manuale viene aggiornato e la revisione incrementata; la versione corrente si scarica dall'area Documentazione del portale (solo Amministratori).</w:t>
       </w:r>
     </w:p>
     <w:p>
@@ -6471,7 +6608,7 @@
         </w:rPr>
         <w:t xml:space="preserve">Si accede da </w:t>
       </w:r>
-      <w:hyperlink w:history="1" r:id="rIdjyfmvoxgegdh8rcc5p_5-">
+      <w:hyperlink w:history="1" r:id="rIdyvf3qlkguxisloddectwb">
         <w:r>
           <w:rPr>
             <w:rFonts w:ascii="Arial" w:cs="Arial" w:eastAsia="Arial" w:hAnsi="Arial"/>
@@ -6870,6 +7007,51 @@
       <w:pPr>
         <w:spacing w:after="160"/>
       </w:pPr>
+    </w:p>
+    <w:p>
+      <w:pPr>
+        <w:spacing w:after="140" w:line="300"/>
+      </w:pPr>
+      <w:r>
+        <w:rPr>
+          <w:rFonts w:ascii="Arial" w:cs="Arial" w:eastAsia="Arial" w:hAnsi="Arial"/>
+          <w:b/>
+          <w:bCs/>
+          <w:color w:val="1B2118"/>
+          <w:sz w:val="21"/>
+          <w:szCs w:val="21"/>
+        </w:rPr>
+        <w:t xml:space="preserve">Ordinare tabelle ed elenchi.</w:t>
+      </w:r>
+      <w:r>
+        <w:rPr>
+          <w:rFonts w:ascii="Arial" w:cs="Arial" w:eastAsia="Arial" w:hAnsi="Arial"/>
+          <w:color w:val="1B2118"/>
+          <w:sz w:val="21"/>
+          <w:szCs w:val="21"/>
+        </w:rPr>
+        <w:t xml:space="preserve"> Ogni tabella del portale si ordina per qualsiasi colonna: fate clic sull'intestazione per l'ordine crescente (freccia ▲) e di nuovo per il decrescente (▼); le colonne non ordinate mostrano ↕. Vale per Dashboard, Audit, Calcolo crediti, Registro dei crediti, Simulatore (scenari, risultati, costi e parte economica) e per le tabelle del calcolo. Gli elenchi a schede (Pratiche, Utenti, Organizzazioni, Enti di Validazione, Registri, Reclami, Crediti emessi, documenti, pagamenti e Rapporti di una pratica) hanno in alto il menu </w:t>
+      </w:r>
+      <w:r>
+        <w:rPr>
+          <w:rFonts w:ascii="Arial" w:cs="Arial" w:eastAsia="Arial" w:hAnsi="Arial"/>
+          <w:b/>
+          <w:bCs/>
+          <w:color w:val="1B2118"/>
+          <w:sz w:val="21"/>
+          <w:szCs w:val="21"/>
+        </w:rPr>
+        <w:t xml:space="preserve">Ordina per</w:t>
+      </w:r>
+      <w:r>
+        <w:rPr>
+          <w:rFonts w:ascii="Arial" w:cs="Arial" w:eastAsia="Arial" w:hAnsi="Arial"/>
+          <w:color w:val="1B2118"/>
+          <w:sz w:val="21"/>
+          <w:szCs w:val="21"/>
+        </w:rPr>
+        <w:t xml:space="preserve"> con il pulsante ▲/▼ del verso; «ordine predefinito» torna all'ordine iniziale. I valori vuoti restano sempre in fondo. Le tabelle in cui si inseriscono i dati anno per anno restano in ordine di anno.</w:t>
+      </w:r>
     </w:p>
     <w:p>
       <w:pPr>
@@ -41149,7 +41331,7 @@
         <w:szCs w:val="16"/>
       </w:rPr>
       <w:tab/>
-      <w:t xml:space="preserve">Manuale Amministratore · Rev. 3.2 · 19/10/2026</w:t>
+      <w:t xml:space="preserve">Manuale Amministratore · Rev. 3.3 · 19/10/2026</w:t>
     </w:r>
   </w:p>
 </w:hdr>
@@ -41214,7 +41396,7 @@
         <w:szCs w:val="16"/>
       </w:rPr>
       <w:tab/>
-      <w:t xml:space="preserve">Manuale Amministratore · Rev. 3.2 · 19/10/2026</w:t>
+      <w:t xml:space="preserve">Manuale Amministratore · Rev. 3.3 · 19/10/2026</w:t>
     </w:r>
   </w:p>
 </w:hdr>

</xml_diff>

<commit_message>
Presentazione di riepilogo nel portale: generatore nel repository, PowerPoint e PDF nella pagina Documentazione (solo Amministratori), revisione 2.0 con le novità del 19/10; regola di rilascio e documenti aggiornati
Co-Authored-By: Claude Opus 5.5 <noreply@anthropic.com>
Claude-Session: https://claude.ai/code/session_01E8XCbEeVHWVP3hntUZ6kZ1
</commit_message>
<xml_diff>
--- a/public/documentazione/Manuale_Amministratore_Portale_CWP.docx
+++ b/public/documentazione/Manuale_Amministratore_Portale_CWP.docx
@@ -302,7 +302,7 @@
                 <w:sz w:val="20"/>
                 <w:szCs w:val="20"/>
               </w:rPr>
-              <w:t xml:space="preserve">Rev. 3.3</w:t>
+              <w:t xml:space="preserve">Rev. 3.4</w:t>
             </w:r>
           </w:p>
         </w:tc>
@@ -719,7 +719,7 @@
                 <w:sz w:val="18"/>
                 <w:szCs w:val="18"/>
               </w:rPr>
-              <w:t xml:space="preserve">3.3</w:t>
+              <w:t xml:space="preserve">3.4</w:t>
             </w:r>
           </w:p>
         </w:tc>
@@ -783,7 +783,7 @@
                 <w:sz w:val="18"/>
                 <w:szCs w:val="18"/>
               </w:rPr>
-              <w:t xml:space="preserve">Ordinamento di tutte le tabelle e degli elenchi.</w:t>
+              <w:t xml:space="preserve">Presentazione di riepilogo nella pagina Documentazione.</w:t>
             </w:r>
           </w:p>
         </w:tc>
@@ -853,7 +853,7 @@
                 <w:sz w:val="18"/>
                 <w:szCs w:val="18"/>
               </w:rPr>
-              <w:t xml:space="preserve">3.2</w:t>
+              <w:t xml:space="preserve">3.3</w:t>
             </w:r>
           </w:p>
         </w:tc>
@@ -919,7 +919,7 @@
                 <w:sz w:val="18"/>
                 <w:szCs w:val="18"/>
               </w:rPr>
-              <w:t xml:space="preserve">Simulatore: metodo di stima per utenza (solo utenze virtuose), buffer del Capitolo 7, taratura.</w:t>
+              <w:t xml:space="preserve">Ordinamento di tutte le tabelle e degli elenchi.</w:t>
             </w:r>
           </w:p>
         </w:tc>
@@ -989,7 +989,7 @@
                 <w:sz w:val="18"/>
                 <w:szCs w:val="18"/>
               </w:rPr>
-              <w:t xml:space="preserve">3.1</w:t>
+              <w:t xml:space="preserve">3.2</w:t>
             </w:r>
           </w:p>
         </w:tc>
@@ -1053,7 +1053,7 @@
                 <w:sz w:val="18"/>
                 <w:szCs w:val="18"/>
               </w:rPr>
-              <w:t xml:space="preserve">Cruscotto diventa Dashboard; barra a LED delle 7 fasi per ogni pratica.</w:t>
+              <w:t xml:space="preserve">Simulatore: metodo di stima per utenza (solo utenze virtuose), buffer del Capitolo 7, taratura.</w:t>
             </w:r>
           </w:p>
         </w:tc>
@@ -1123,7 +1123,7 @@
                 <w:sz w:val="18"/>
                 <w:szCs w:val="18"/>
               </w:rPr>
-              <w:t xml:space="preserve">3.0</w:t>
+              <w:t xml:space="preserve">3.1</w:t>
             </w:r>
           </w:p>
         </w:tc>
@@ -1189,7 +1189,7 @@
                 <w:sz w:val="18"/>
                 <w:szCs w:val="18"/>
               </w:rPr>
-              <w:t xml:space="preserve">Eliminazione degli utenti che non hanno mai operato (script 30).</w:t>
+              <w:t xml:space="preserve">Cruscotto diventa Dashboard; barra a LED delle 7 fasi per ogni pratica.</w:t>
             </w:r>
           </w:p>
         </w:tc>
@@ -1259,7 +1259,7 @@
                 <w:sz w:val="18"/>
                 <w:szCs w:val="18"/>
               </w:rPr>
-              <w:t xml:space="preserve">2.9</w:t>
+              <w:t xml:space="preserve">3.0</w:t>
             </w:r>
           </w:p>
         </w:tc>
@@ -1323,7 +1323,7 @@
                 <w:sz w:val="18"/>
                 <w:szCs w:val="18"/>
               </w:rPr>
-              <w:t xml:space="preserve">Email automatica con le credenziali al nuovo utente e alla reimpostazione della password.</w:t>
+              <w:t xml:space="preserve">Eliminazione degli utenti che non hanno mai operato (script 30).</w:t>
             </w:r>
           </w:p>
         </w:tc>
@@ -1393,7 +1393,7 @@
                 <w:sz w:val="18"/>
                 <w:szCs w:val="18"/>
               </w:rPr>
-              <w:t xml:space="preserve">2.8</w:t>
+              <w:t xml:space="preserve">2.9</w:t>
             </w:r>
           </w:p>
         </w:tc>
@@ -1459,7 +1459,7 @@
                 <w:sz w:val="18"/>
                 <w:szCs w:val="18"/>
               </w:rPr>
-              <w:t xml:space="preserve">Più Amministratori con accesso completo; Amministratore principale protetto (script 29).</w:t>
+              <w:t xml:space="preserve">Email automatica con le credenziali al nuovo utente e alla reimpostazione della password.</w:t>
             </w:r>
           </w:p>
         </w:tc>
@@ -1529,7 +1529,7 @@
                 <w:sz w:val="18"/>
                 <w:szCs w:val="18"/>
               </w:rPr>
-              <w:t xml:space="preserve">2.7</w:t>
+              <w:t xml:space="preserve">2.8</w:t>
             </w:r>
           </w:p>
         </w:tc>
@@ -1593,7 +1593,7 @@
                 <w:sz w:val="18"/>
                 <w:szCs w:val="18"/>
               </w:rPr>
-              <w:t xml:space="preserve">Simulatore: costi per il Comune secondo il Caso 1 (progetto volontario) o il Caso 2 (progetto obbligatorio da bando).</w:t>
+              <w:t xml:space="preserve">Più Amministratori con accesso completo; Amministratore principale protetto (script 29).</w:t>
             </w:r>
           </w:p>
         </w:tc>
@@ -1663,7 +1663,7 @@
                 <w:sz w:val="18"/>
                 <w:szCs w:val="18"/>
               </w:rPr>
-              <w:t xml:space="preserve">2.6</w:t>
+              <w:t xml:space="preserve">2.7</w:t>
             </w:r>
           </w:p>
         </w:tc>
@@ -1729,7 +1729,7 @@
                 <w:sz w:val="18"/>
                 <w:szCs w:val="18"/>
               </w:rPr>
-              <w:t xml:space="preserve">Simulatore: valore del credito anno per anno, proposto 32 €.</w:t>
+              <w:t xml:space="preserve">Simulatore: costi per il Comune secondo il Caso 1 (progetto volontario) o il Caso 2 (progetto obbligatorio da bando).</w:t>
             </w:r>
           </w:p>
         </w:tc>
@@ -1799,7 +1799,7 @@
                 <w:sz w:val="18"/>
                 <w:szCs w:val="18"/>
               </w:rPr>
-              <w:t xml:space="preserve">2.5</w:t>
+              <w:t xml:space="preserve">2.6</w:t>
             </w:r>
           </w:p>
         </w:tc>
@@ -1863,7 +1863,7 @@
                 <w:sz w:val="18"/>
                 <w:szCs w:val="18"/>
               </w:rPr>
-              <w:t xml:space="preserve">Simulatore: simulazione economica con valore unitario del credito e costi per il Comune (contratti tipo della Fondazione, Schema tariffario).</w:t>
+              <w:t xml:space="preserve">Simulatore: valore del credito anno per anno, proposto 32 €.</w:t>
             </w:r>
           </w:p>
         </w:tc>
@@ -1933,7 +1933,7 @@
                 <w:sz w:val="18"/>
                 <w:szCs w:val="18"/>
               </w:rPr>
-              <w:t xml:space="preserve">2.4</w:t>
+              <w:t xml:space="preserve">2.5</w:t>
             </w:r>
           </w:p>
         </w:tc>
@@ -1999,7 +1999,7 @@
                 <w:sz w:val="18"/>
                 <w:szCs w:val="18"/>
               </w:rPr>
-              <w:t xml:space="preserve">Simulatore: riferimento sempre alla soglia del 65% di differenziata e controllo dei valori fuori scala.</w:t>
+              <w:t xml:space="preserve">Simulatore: simulazione economica con valore unitario del credito e costi per il Comune (contratti tipo della Fondazione, Schema tariffario).</w:t>
             </w:r>
           </w:p>
         </w:tc>
@@ -2069,7 +2069,7 @@
                 <w:sz w:val="18"/>
                 <w:szCs w:val="18"/>
               </w:rPr>
-              <w:t xml:space="preserve">2.3</w:t>
+              <w:t xml:space="preserve">2.4</w:t>
             </w:r>
           </w:p>
         </w:tc>
@@ -2133,7 +2133,7 @@
                 <w:sz w:val="18"/>
                 <w:szCs w:val="18"/>
               </w:rPr>
-              <w:t xml:space="preserve">Simulatore conforme al modello CWP: scenario di riferimento dello Standard 4.8.1, situazione attuale, conformità.</w:t>
+              <w:t xml:space="preserve">Simulatore: riferimento sempre alla soglia del 65% di differenziata e controllo dei valori fuori scala.</w:t>
             </w:r>
           </w:p>
         </w:tc>
@@ -2203,7 +2203,7 @@
                 <w:sz w:val="18"/>
                 <w:szCs w:val="18"/>
               </w:rPr>
-              <w:t xml:space="preserve">2.2</w:t>
+              <w:t xml:space="preserve">2.3</w:t>
             </w:r>
           </w:p>
         </w:tc>
@@ -2269,7 +2269,7 @@
                 <w:sz w:val="18"/>
                 <w:szCs w:val="18"/>
               </w:rPr>
-              <w:t xml:space="preserve">Nuovo capitolo «Simulatore di scenari»: creazione, anno base, obiettivi annui, risultati, modello di stima.</w:t>
+              <w:t xml:space="preserve">Simulatore conforme al modello CWP: scenario di riferimento dello Standard 4.8.1, situazione attuale, conformità.</w:t>
             </w:r>
           </w:p>
         </w:tc>
@@ -2339,7 +2339,7 @@
                 <w:sz w:val="18"/>
                 <w:szCs w:val="18"/>
               </w:rPr>
-              <w:t xml:space="preserve">2.1</w:t>
+              <w:t xml:space="preserve">2.2</w:t>
             </w:r>
           </w:p>
         </w:tc>
@@ -2403,7 +2403,7 @@
                 <w:sz w:val="18"/>
                 <w:szCs w:val="18"/>
               </w:rPr>
-              <w:t xml:space="preserve">Funzioni in arrivo: simulatore di scenari (7, 10 o 21 anni, obiettivi annui, % di differenziata e crediti stimati) e assistente virtuale (Claude).</w:t>
+              <w:t xml:space="preserve">Nuovo capitolo «Simulatore di scenari»: creazione, anno base, obiettivi annui, risultati, modello di stima.</w:t>
             </w:r>
           </w:p>
         </w:tc>
@@ -2473,7 +2473,7 @@
                 <w:sz w:val="18"/>
                 <w:szCs w:val="18"/>
               </w:rPr>
-              <w:t xml:space="preserve">2.0</w:t>
+              <w:t xml:space="preserve">2.1</w:t>
             </w:r>
           </w:p>
         </w:tc>
@@ -2539,7 +2539,7 @@
                 <w:sz w:val="18"/>
                 <w:szCs w:val="18"/>
               </w:rPr>
-              <w:t xml:space="preserve">Copie di sicurezza e ripristino: rimando alle Istruzioni di ripristino e punti essenziali (capitolo Manutenzione ed emergenze).</w:t>
+              <w:t xml:space="preserve">Funzioni in arrivo: simulatore di scenari (7, 10 o 21 anni, obiettivi annui, % di differenziata e crediti stimati) e assistente virtuale (Claude).</w:t>
             </w:r>
           </w:p>
         </w:tc>
@@ -2609,7 +2609,7 @@
                 <w:sz w:val="18"/>
                 <w:szCs w:val="18"/>
               </w:rPr>
-              <w:t xml:space="preserve">1.9</w:t>
+              <w:t xml:space="preserve">2.0</w:t>
             </w:r>
           </w:p>
         </w:tc>
@@ -2673,7 +2673,7 @@
                 <w:sz w:val="18"/>
                 <w:szCs w:val="18"/>
               </w:rPr>
-              <w:t xml:space="preserve">Fondazione Operate soggetto promotore del programma (esclusiva conferita da Wastelab).</w:t>
+              <w:t xml:space="preserve">Copie di sicurezza e ripristino: rimando alle Istruzioni di ripristino e punti essenziali (capitolo Manutenzione ed emergenze).</w:t>
             </w:r>
           </w:p>
         </w:tc>
@@ -2743,7 +2743,7 @@
                 <w:sz w:val="18"/>
                 <w:szCs w:val="18"/>
               </w:rPr>
-              <w:t xml:space="preserve">1.8</w:t>
+              <w:t xml:space="preserve">1.9</w:t>
             </w:r>
           </w:p>
         </w:tc>
@@ -2809,7 +2809,7 @@
                 <w:sz w:val="18"/>
                 <w:szCs w:val="18"/>
               </w:rPr>
-              <w:t xml:space="preserve">PEC del Programma e documenti ufficiali già pubblicati sulla pagina pubblica.</w:t>
+              <w:t xml:space="preserve">Fondazione Operate soggetto promotore del programma (esclusiva conferita da Wastelab).</w:t>
             </w:r>
           </w:p>
         </w:tc>
@@ -2879,7 +2879,7 @@
                 <w:sz w:val="18"/>
                 <w:szCs w:val="18"/>
               </w:rPr>
-              <w:t xml:space="preserve">1.7</w:t>
+              <w:t xml:space="preserve">1.8</w:t>
             </w:r>
           </w:p>
         </w:tc>
@@ -2911,7 +2911,7 @@
                 <w:sz w:val="18"/>
                 <w:szCs w:val="18"/>
               </w:rPr>
-              <w:t xml:space="preserve">18/10/2026</w:t>
+              <w:t xml:space="preserve">19/10/2026</w:t>
             </w:r>
           </w:p>
         </w:tc>
@@ -2943,7 +2943,7 @@
                 <w:sz w:val="18"/>
                 <w:szCs w:val="18"/>
               </w:rPr>
-              <w:t xml:space="preserve">Allineamento ai documenti ufficiali del Programma (script 22-24): Rapporto a 7 fasi, feedback pubblico, stati del Programma, dati del progetto e territorio ISTAT, ritiro e rientro, account unico e delegati, registri, tariffe e sospensione, accuratezza e accertamenti, informazioni del Programma e metodologie, modelli pubblici; nuovi capitoli Crediti emessi, Reclami, Pagina pubblica; qualità dei dati nel calcolo.</w:t>
+              <w:t xml:space="preserve">PEC del Programma e documenti ufficiali già pubblicati sulla pagina pubblica.</w:t>
             </w:r>
           </w:p>
         </w:tc>
@@ -3013,7 +3013,7 @@
                 <w:sz w:val="18"/>
                 <w:szCs w:val="18"/>
               </w:rPr>
-              <w:t xml:space="preserve">1.6</w:t>
+              <w:t xml:space="preserve">1.7</w:t>
             </w:r>
           </w:p>
         </w:tc>
@@ -3079,7 +3079,7 @@
                 <w:sz w:val="18"/>
                 <w:szCs w:val="18"/>
               </w:rPr>
-              <w:t xml:space="preserve">Calcolo crediti: descrizione corretta del buffer (somma delle voci delle Tabelle 15 e 16, più il 20% con le sole utenze virtuose, al massimo 80%).</w:t>
+              <w:t xml:space="preserve">Allineamento ai documenti ufficiali del Programma (script 22-24): Rapporto a 7 fasi, feedback pubblico, stati del Programma, dati del progetto e territorio ISTAT, ritiro e rientro, account unico e delegati, registri, tariffe e sospensione, accuratezza e accertamenti, informazioni del Programma e metodologie, modelli pubblici; nuovi capitoli Crediti emessi, Reclami, Pagina pubblica; qualità dei dati nel calcolo.</w:t>
             </w:r>
           </w:p>
         </w:tc>
@@ -3149,7 +3149,7 @@
                 <w:sz w:val="18"/>
                 <w:szCs w:val="18"/>
               </w:rPr>
-              <w:t xml:space="preserve">1.5</w:t>
+              <w:t xml:space="preserve">1.6</w:t>
             </w:r>
           </w:p>
         </w:tc>
@@ -3213,7 +3213,7 @@
                 <w:sz w:val="18"/>
                 <w:szCs w:val="18"/>
               </w:rPr>
-              <w:t xml:space="preserve">Nuova pagina Anagrafiche (Organizzazioni ed Enti, anche per gli Operatori); Rapporti con 4 fasi e durate proprie; documenti richiesti per fase; consultazione con documento bloccato, osservazioni numerate e motivazione; conservazione per 10 anni; fascicolo con riepilogo PDF e nuove cartelle.</w:t>
+              <w:t xml:space="preserve">Calcolo crediti: descrizione corretta del buffer (somma delle voci delle Tabelle 15 e 16, più il 20% con le sole utenze virtuose, al massimo 80%).</w:t>
             </w:r>
           </w:p>
         </w:tc>
@@ -3283,7 +3283,7 @@
                 <w:sz w:val="18"/>
                 <w:szCs w:val="18"/>
               </w:rPr>
-              <w:t xml:space="preserve">1.4</w:t>
+              <w:t xml:space="preserve">1.5</w:t>
             </w:r>
           </w:p>
         </w:tc>
@@ -3349,7 +3349,7 @@
                 <w:sz w:val="18"/>
                 <w:szCs w:val="18"/>
               </w:rPr>
-              <w:t xml:space="preserve">Calcolo crediti: il risultato si azzera quando cambiano dati o Banca Dati Utenze, conferma solo dopo un nuovo «Calcola». Gestione utenti: password temporanea di almeno 10 caratteri con lettere e numeri, creazione annullata se non va a buon fine, nessun accesso ai dati prima del cambio password.</w:t>
+              <w:t xml:space="preserve">Nuova pagina Anagrafiche (Organizzazioni ed Enti, anche per gli Operatori); Rapporti con 4 fasi e durate proprie; documenti richiesti per fase; consultazione con documento bloccato, osservazioni numerate e motivazione; conservazione per 10 anni; fascicolo con riepilogo PDF e nuove cartelle.</w:t>
             </w:r>
           </w:p>
         </w:tc>
@@ -3419,7 +3419,7 @@
                 <w:sz w:val="18"/>
                 <w:szCs w:val="18"/>
               </w:rPr>
-              <w:t xml:space="preserve">1.3</w:t>
+              <w:t xml:space="preserve">1.4</w:t>
             </w:r>
           </w:p>
         </w:tc>
@@ -3483,7 +3483,7 @@
                 <w:sz w:val="18"/>
                 <w:szCs w:val="18"/>
               </w:rPr>
-              <w:t xml:space="preserve">Rapporto di calcolo in PDF, archiviazione nella pratica, numero di registro, registro dei crediti.</w:t>
+              <w:t xml:space="preserve">Calcolo crediti: il risultato si azzera quando cambiano dati o Banca Dati Utenze, conferma solo dopo un nuovo «Calcola». Gestione utenti: password temporanea di almeno 10 caratteri con lettere e numeri, creazione annullata se non va a buon fine, nessun accesso ai dati prima del cambio password.</w:t>
             </w:r>
           </w:p>
         </w:tc>
@@ -3553,7 +3553,7 @@
                 <w:sz w:val="18"/>
                 <w:szCs w:val="18"/>
               </w:rPr>
-              <w:t xml:space="preserve">1.2</w:t>
+              <w:t xml:space="preserve">1.3</w:t>
             </w:r>
           </w:p>
         </w:tc>
@@ -3619,7 +3619,7 @@
                 <w:sz w:val="18"/>
                 <w:szCs w:val="18"/>
               </w:rPr>
-              <w:t xml:space="preserve">Calcolo crediti: importare il tracciato nel calcolo (dai documenti della pratica o dal computer), singole letture, blocco dei dati personali, controlli di coerenza.</w:t>
+              <w:t xml:space="preserve">Rapporto di calcolo in PDF, archiviazione nella pratica, numero di registro, registro dei crediti.</w:t>
             </w:r>
           </w:p>
         </w:tc>
@@ -3689,7 +3689,7 @@
                 <w:sz w:val="18"/>
                 <w:szCs w:val="18"/>
               </w:rPr>
-              <w:t xml:space="preserve">1.1</w:t>
+              <w:t xml:space="preserve">1.2</w:t>
             </w:r>
           </w:p>
         </w:tc>
@@ -3753,7 +3753,7 @@
                 <w:sz w:val="18"/>
                 <w:szCs w:val="18"/>
               </w:rPr>
-              <w:t xml:space="preserve">Note di fase, Ente di Validazione della pratica, consultazione sulla pagina pubblica con conferma dell'email, moderazione con autori e allegati, errata corrige; nuovo capitolo Messaggi con il Comune; pagamenti visibili al Comune; Impostazioni: Enti di Validazione e Modelli di documento; notifiche aggiornate.</w:t>
+              <w:t xml:space="preserve">Calcolo crediti: importare il tracciato nel calcolo (dai documenti della pratica o dal computer), singole letture, blocco dei dati personali, controlli di coerenza.</w:t>
             </w:r>
           </w:p>
         </w:tc>
@@ -3823,6 +3823,142 @@
                 <w:sz w:val="18"/>
                 <w:szCs w:val="18"/>
               </w:rPr>
+              <w:t xml:space="preserve">1.1</w:t>
+            </w:r>
+          </w:p>
+        </w:tc>
+        <w:tc>
+          <w:tcPr>
+            <w:tcW w:type="dxa" w:w="1300"/>
+            <w:tcBorders>
+              <w:top w:val="single" w:color="D9D4C5" w:sz="4"/>
+              <w:left w:val="single" w:color="D9D4C5" w:sz="4"/>
+              <w:bottom w:val="single" w:color="D9D4C5" w:sz="4"/>
+              <w:right w:val="single" w:color="D9D4C5" w:sz="4"/>
+            </w:tcBorders>
+            <w:shd w:fill="F6F4EE" w:color="auto" w:val="clear"/>
+            <w:tcMar>
+              <w:top w:type="dxa" w:w="70"/>
+              <w:left w:type="dxa" w:w="110"/>
+              <w:bottom w:type="dxa" w:w="70"/>
+              <w:right w:type="dxa" w:w="110"/>
+            </w:tcMar>
+            <w:vAlign w:val="center"/>
+          </w:tcPr>
+          <w:p>
+            <w:pPr>
+              <w:spacing w:after="0" w:before="0"/>
+            </w:pPr>
+            <w:r>
+              <w:rPr>
+                <w:rFonts w:ascii="Arial" w:cs="Arial" w:eastAsia="Arial" w:hAnsi="Arial"/>
+                <w:color w:val="1B2118"/>
+                <w:sz w:val="18"/>
+                <w:szCs w:val="18"/>
+              </w:rPr>
+              <w:t xml:space="preserve">18/10/2026</w:t>
+            </w:r>
+          </w:p>
+        </w:tc>
+        <w:tc>
+          <w:tcPr>
+            <w:tcW w:type="dxa" w:w="5538"/>
+            <w:tcBorders>
+              <w:top w:val="single" w:color="D9D4C5" w:sz="4"/>
+              <w:left w:val="single" w:color="D9D4C5" w:sz="4"/>
+              <w:bottom w:val="single" w:color="D9D4C5" w:sz="4"/>
+              <w:right w:val="single" w:color="D9D4C5" w:sz="4"/>
+            </w:tcBorders>
+            <w:shd w:fill="F6F4EE" w:color="auto" w:val="clear"/>
+            <w:tcMar>
+              <w:top w:type="dxa" w:w="70"/>
+              <w:left w:type="dxa" w:w="110"/>
+              <w:bottom w:type="dxa" w:w="70"/>
+              <w:right w:type="dxa" w:w="110"/>
+            </w:tcMar>
+            <w:vAlign w:val="center"/>
+          </w:tcPr>
+          <w:p>
+            <w:pPr>
+              <w:spacing w:after="0" w:before="0"/>
+            </w:pPr>
+            <w:r>
+              <w:rPr>
+                <w:rFonts w:ascii="Arial" w:cs="Arial" w:eastAsia="Arial" w:hAnsi="Arial"/>
+                <w:color w:val="1B2118"/>
+                <w:sz w:val="18"/>
+                <w:szCs w:val="18"/>
+              </w:rPr>
+              <w:t xml:space="preserve">Note di fase, Ente di Validazione della pratica, consultazione sulla pagina pubblica con conferma dell'email, moderazione con autori e allegati, errata corrige; nuovo capitolo Messaggi con il Comune; pagamenti visibili al Comune; Impostazioni: Enti di Validazione e Modelli di documento; notifiche aggiornate.</w:t>
+            </w:r>
+          </w:p>
+        </w:tc>
+        <w:tc>
+          <w:tcPr>
+            <w:tcW w:type="dxa" w:w="2000"/>
+            <w:tcBorders>
+              <w:top w:val="single" w:color="D9D4C5" w:sz="4"/>
+              <w:left w:val="single" w:color="D9D4C5" w:sz="4"/>
+              <w:bottom w:val="single" w:color="D9D4C5" w:sz="4"/>
+              <w:right w:val="single" w:color="D9D4C5" w:sz="4"/>
+            </w:tcBorders>
+            <w:shd w:fill="F6F4EE" w:color="auto" w:val="clear"/>
+            <w:tcMar>
+              <w:top w:type="dxa" w:w="70"/>
+              <w:left w:type="dxa" w:w="110"/>
+              <w:bottom w:type="dxa" w:w="70"/>
+              <w:right w:type="dxa" w:w="110"/>
+            </w:tcMar>
+            <w:vAlign w:val="center"/>
+          </w:tcPr>
+          <w:p>
+            <w:pPr>
+              <w:spacing w:after="0" w:before="0"/>
+            </w:pPr>
+            <w:r>
+              <w:rPr>
+                <w:rFonts w:ascii="Arial" w:cs="Arial" w:eastAsia="Arial" w:hAnsi="Arial"/>
+                <w:color w:val="1B2118"/>
+                <w:sz w:val="18"/>
+                <w:szCs w:val="18"/>
+              </w:rPr>
+              <w:t xml:space="preserve">Fondazione Operate</w:t>
+            </w:r>
+          </w:p>
+        </w:tc>
+      </w:tr>
+      <w:tr>
+        <w:trPr>
+          <w:cantSplit/>
+        </w:trPr>
+        <w:tc>
+          <w:tcPr>
+            <w:tcW w:type="dxa" w:w="800"/>
+            <w:tcBorders>
+              <w:top w:val="single" w:color="D9D4C5" w:sz="4"/>
+              <w:left w:val="single" w:color="D9D4C5" w:sz="4"/>
+              <w:bottom w:val="single" w:color="D9D4C5" w:sz="4"/>
+              <w:right w:val="single" w:color="D9D4C5" w:sz="4"/>
+            </w:tcBorders>
+            <w:tcMar>
+              <w:top w:type="dxa" w:w="70"/>
+              <w:left w:type="dxa" w:w="110"/>
+              <w:bottom w:type="dxa" w:w="70"/>
+              <w:right w:type="dxa" w:w="110"/>
+            </w:tcMar>
+            <w:vAlign w:val="center"/>
+          </w:tcPr>
+          <w:p>
+            <w:pPr>
+              <w:spacing w:after="0" w:before="0"/>
+            </w:pPr>
+            <w:r>
+              <w:rPr>
+                <w:rFonts w:ascii="Arial" w:cs="Arial" w:eastAsia="Arial" w:hAnsi="Arial"/>
+                <w:color w:val="1B2118"/>
+                <w:sz w:val="18"/>
+                <w:szCs w:val="18"/>
+              </w:rPr>
               <w:t xml:space="preserve">1.0</w:t>
             </w:r>
           </w:p>
@@ -3836,7 +3972,6 @@
               <w:bottom w:val="single" w:color="D9D4C5" w:sz="4"/>
               <w:right w:val="single" w:color="D9D4C5" w:sz="4"/>
             </w:tcBorders>
-            <w:shd w:fill="F6F4EE" w:color="auto" w:val="clear"/>
             <w:tcMar>
               <w:top w:type="dxa" w:w="70"/>
               <w:left w:type="dxa" w:w="110"/>
@@ -3869,7 +4004,6 @@
               <w:bottom w:val="single" w:color="D9D4C5" w:sz="4"/>
               <w:right w:val="single" w:color="D9D4C5" w:sz="4"/>
             </w:tcBorders>
-            <w:shd w:fill="F6F4EE" w:color="auto" w:val="clear"/>
             <w:tcMar>
               <w:top w:type="dxa" w:w="70"/>
               <w:left w:type="dxa" w:w="110"/>
@@ -3902,7 +4036,6 @@
               <w:bottom w:val="single" w:color="D9D4C5" w:sz="4"/>
               <w:right w:val="single" w:color="D9D4C5" w:sz="4"/>
             </w:tcBorders>
-            <w:shd w:fill="F6F4EE" w:color="auto" w:val="clear"/>
             <w:tcMar>
               <w:top w:type="dxa" w:w="70"/>
               <w:left w:type="dxa" w:w="110"/>
@@ -3944,7 +4077,7 @@
           <w:sz w:val="20"/>
           <w:szCs w:val="20"/>
         </w:rPr>
-        <w:t xml:space="preserve">Questo documento descrive il portale alla revisione 3.3 del 19/10/2026. A ogni modifica del portale il manuale viene aggiornato e la revisione incrementata; la versione corrente si scarica dall'area Documentazione del portale (solo Amministratori).</w:t>
+        <w:t xml:space="preserve">Questo documento descrive il portale alla revisione 3.4 del 19/10/2026. A ogni modifica del portale il manuale viene aggiornato e la revisione incrementata; la versione corrente si scarica dall'area Documentazione del portale (solo Amministratori).</w:t>
       </w:r>
     </w:p>
     <w:p>
@@ -6608,7 +6741,7 @@
         </w:rPr>
         <w:t xml:space="preserve">Si accede da </w:t>
       </w:r>
-      <w:hyperlink w:history="1" r:id="rIdyvf3qlkguxisloddectwb">
+      <w:hyperlink w:history="1" r:id="rIdnkkqtsbmbt3dhfaykorsg">
         <w:r>
           <w:rPr>
             <w:rFonts w:ascii="Arial" w:cs="Arial" w:eastAsia="Arial" w:hAnsi="Arial"/>
@@ -39167,9 +39300,9 @@
         <w:tblLayout w:type="fixed"/>
       </w:tblPr>
       <w:tblGrid>
-        <w:gridCol w:w="2064"/>
+        <w:gridCol w:w="2136"/>
         <w:gridCol w:w="2010"/>
-        <w:gridCol w:w="5564"/>
+        <w:gridCol w:w="5492"/>
       </w:tblGrid>
       <w:tr>
         <w:trPr>
@@ -39177,7 +39310,7 @@
         </w:trPr>
         <w:tc>
           <w:tcPr>
-            <w:tcW w:type="dxa" w:w="2064"/>
+            <w:tcW w:type="dxa" w:w="2136"/>
             <w:tcBorders>
               <w:top w:val="single" w:color="D9D4C5" w:sz="4"/>
               <w:left w:val="single" w:color="D9D4C5" w:sz="4"/>
@@ -39247,7 +39380,7 @@
         </w:tc>
         <w:tc>
           <w:tcPr>
-            <w:tcW w:type="dxa" w:w="5564"/>
+            <w:tcW w:type="dxa" w:w="5492"/>
             <w:tcBorders>
               <w:top w:val="single" w:color="D9D4C5" w:sz="4"/>
               <w:left w:val="single" w:color="D9D4C5" w:sz="4"/>
@@ -39287,7 +39420,7 @@
         </w:trPr>
         <w:tc>
           <w:tcPr>
-            <w:tcW w:type="dxa" w:w="2064"/>
+            <w:tcW w:type="dxa" w:w="2136"/>
             <w:tcBorders>
               <w:top w:val="single" w:color="D9D4C5" w:sz="4"/>
               <w:left w:val="single" w:color="D9D4C5" w:sz="4"/>
@@ -39351,7 +39484,7 @@
         </w:tc>
         <w:tc>
           <w:tcPr>
-            <w:tcW w:type="dxa" w:w="5564"/>
+            <w:tcW w:type="dxa" w:w="5492"/>
             <w:tcBorders>
               <w:top w:val="single" w:color="D9D4C5" w:sz="4"/>
               <w:left w:val="single" w:color="D9D4C5" w:sz="4"/>
@@ -39388,7 +39521,7 @@
         </w:trPr>
         <w:tc>
           <w:tcPr>
-            <w:tcW w:type="dxa" w:w="2064"/>
+            <w:tcW w:type="dxa" w:w="2136"/>
             <w:tcBorders>
               <w:top w:val="single" w:color="D9D4C5" w:sz="4"/>
               <w:left w:val="single" w:color="D9D4C5" w:sz="4"/>
@@ -39454,7 +39587,7 @@
         </w:tc>
         <w:tc>
           <w:tcPr>
-            <w:tcW w:type="dxa" w:w="5564"/>
+            <w:tcW w:type="dxa" w:w="5492"/>
             <w:tcBorders>
               <w:top w:val="single" w:color="D9D4C5" w:sz="4"/>
               <w:left w:val="single" w:color="D9D4C5" w:sz="4"/>
@@ -39492,7 +39625,7 @@
         </w:trPr>
         <w:tc>
           <w:tcPr>
-            <w:tcW w:type="dxa" w:w="2064"/>
+            <w:tcW w:type="dxa" w:w="2136"/>
             <w:tcBorders>
               <w:top w:val="single" w:color="D9D4C5" w:sz="4"/>
               <w:left w:val="single" w:color="D9D4C5" w:sz="4"/>
@@ -39556,7 +39689,7 @@
         </w:tc>
         <w:tc>
           <w:tcPr>
-            <w:tcW w:type="dxa" w:w="5564"/>
+            <w:tcW w:type="dxa" w:w="5492"/>
             <w:tcBorders>
               <w:top w:val="single" w:color="D9D4C5" w:sz="4"/>
               <w:left w:val="single" w:color="D9D4C5" w:sz="4"/>
@@ -39593,7 +39726,7 @@
         </w:trPr>
         <w:tc>
           <w:tcPr>
-            <w:tcW w:type="dxa" w:w="2064"/>
+            <w:tcW w:type="dxa" w:w="2136"/>
             <w:tcBorders>
               <w:top w:val="single" w:color="D9D4C5" w:sz="4"/>
               <w:left w:val="single" w:color="D9D4C5" w:sz="4"/>
@@ -39659,7 +39792,7 @@
         </w:tc>
         <w:tc>
           <w:tcPr>
-            <w:tcW w:type="dxa" w:w="5564"/>
+            <w:tcW w:type="dxa" w:w="5492"/>
             <w:tcBorders>
               <w:top w:val="single" w:color="D9D4C5" w:sz="4"/>
               <w:left w:val="single" w:color="D9D4C5" w:sz="4"/>
@@ -39687,6 +39820,211 @@
                 <w:szCs w:val="18"/>
               </w:rPr>
               <w:t xml:space="preserve">Architettura, servizi, database, codice, cronologia dei rilasci, decisioni e backlog</w:t>
+            </w:r>
+          </w:p>
+        </w:tc>
+      </w:tr>
+      <w:tr>
+        <w:trPr>
+          <w:cantSplit/>
+        </w:trPr>
+        <w:tc>
+          <w:tcPr>
+            <w:tcW w:type="dxa" w:w="2136"/>
+            <w:tcBorders>
+              <w:top w:val="single" w:color="D9D4C5" w:sz="4"/>
+              <w:left w:val="single" w:color="D9D4C5" w:sz="4"/>
+              <w:bottom w:val="single" w:color="D9D4C5" w:sz="4"/>
+              <w:right w:val="single" w:color="D9D4C5" w:sz="4"/>
+            </w:tcBorders>
+            <w:tcMar>
+              <w:top w:type="dxa" w:w="70"/>
+              <w:left w:type="dxa" w:w="110"/>
+              <w:bottom w:type="dxa" w:w="70"/>
+              <w:right w:type="dxa" w:w="110"/>
+            </w:tcMar>
+            <w:vAlign w:val="center"/>
+          </w:tcPr>
+          <w:p>
+            <w:pPr>
+              <w:spacing w:after="0" w:before="0"/>
+            </w:pPr>
+            <w:r>
+              <w:rPr>
+                <w:rFonts w:ascii="Arial" w:cs="Arial" w:eastAsia="Arial" w:hAnsi="Arial"/>
+                <w:color w:val="1B2118"/>
+                <w:sz w:val="18"/>
+                <w:szCs w:val="18"/>
+              </w:rPr>
+              <w:t xml:space="preserve">Istruzioni di ripristino</w:t>
+            </w:r>
+          </w:p>
+        </w:tc>
+        <w:tc>
+          <w:tcPr>
+            <w:tcW w:type="dxa" w:w="2010"/>
+            <w:tcBorders>
+              <w:top w:val="single" w:color="D9D4C5" w:sz="4"/>
+              <w:left w:val="single" w:color="D9D4C5" w:sz="4"/>
+              <w:bottom w:val="single" w:color="D9D4C5" w:sz="4"/>
+              <w:right w:val="single" w:color="D9D4C5" w:sz="4"/>
+            </w:tcBorders>
+            <w:tcMar>
+              <w:top w:type="dxa" w:w="70"/>
+              <w:left w:type="dxa" w:w="110"/>
+              <w:bottom w:type="dxa" w:w="70"/>
+              <w:right w:type="dxa" w:w="110"/>
+            </w:tcMar>
+            <w:vAlign w:val="center"/>
+          </w:tcPr>
+          <w:p>
+            <w:pPr>
+              <w:spacing w:after="0" w:before="0"/>
+            </w:pPr>
+            <w:r>
+              <w:rPr>
+                <w:rFonts w:ascii="Arial" w:cs="Arial" w:eastAsia="Arial" w:hAnsi="Arial"/>
+                <w:color w:val="1B2118"/>
+                <w:sz w:val="18"/>
+                <w:szCs w:val="18"/>
+              </w:rPr>
+              <w:t xml:space="preserve">solo Amministratori</w:t>
+            </w:r>
+          </w:p>
+        </w:tc>
+        <w:tc>
+          <w:tcPr>
+            <w:tcW w:type="dxa" w:w="5492"/>
+            <w:tcBorders>
+              <w:top w:val="single" w:color="D9D4C5" w:sz="4"/>
+              <w:left w:val="single" w:color="D9D4C5" w:sz="4"/>
+              <w:bottom w:val="single" w:color="D9D4C5" w:sz="4"/>
+              <w:right w:val="single" w:color="D9D4C5" w:sz="4"/>
+            </w:tcBorders>
+            <w:tcMar>
+              <w:top w:type="dxa" w:w="70"/>
+              <w:left w:type="dxa" w:w="110"/>
+              <w:bottom w:type="dxa" w:w="70"/>
+              <w:right w:type="dxa" w:w="110"/>
+            </w:tcMar>
+            <w:vAlign w:val="center"/>
+          </w:tcPr>
+          <w:p>
+            <w:pPr>
+              <w:spacing w:after="0" w:before="0"/>
+            </w:pPr>
+            <w:r>
+              <w:rPr>
+                <w:rFonts w:ascii="Arial" w:cs="Arial" w:eastAsia="Arial" w:hAnsi="Arial"/>
+                <w:color w:val="1B2118"/>
+                <w:sz w:val="18"/>
+                <w:szCs w:val="18"/>
+              </w:rPr>
+              <w:t xml:space="preserve">Copie di sicurezza e ripristino di GitHub, Vercel, Supabase, Resend e del progetto Claude</w:t>
+            </w:r>
+          </w:p>
+        </w:tc>
+      </w:tr>
+      <w:tr>
+        <w:trPr>
+          <w:cantSplit/>
+        </w:trPr>
+        <w:tc>
+          <w:tcPr>
+            <w:tcW w:type="dxa" w:w="2136"/>
+            <w:tcBorders>
+              <w:top w:val="single" w:color="D9D4C5" w:sz="4"/>
+              <w:left w:val="single" w:color="D9D4C5" w:sz="4"/>
+              <w:bottom w:val="single" w:color="D9D4C5" w:sz="4"/>
+              <w:right w:val="single" w:color="D9D4C5" w:sz="4"/>
+            </w:tcBorders>
+            <w:shd w:fill="F6F4EE" w:color="auto" w:val="clear"/>
+            <w:tcMar>
+              <w:top w:type="dxa" w:w="70"/>
+              <w:left w:type="dxa" w:w="110"/>
+              <w:bottom w:type="dxa" w:w="70"/>
+              <w:right w:type="dxa" w:w="110"/>
+            </w:tcMar>
+            <w:vAlign w:val="center"/>
+          </w:tcPr>
+          <w:p>
+            <w:pPr>
+              <w:spacing w:after="0" w:before="0"/>
+            </w:pPr>
+            <w:r>
+              <w:rPr>
+                <w:rFonts w:ascii="Arial" w:cs="Arial" w:eastAsia="Arial" w:hAnsi="Arial"/>
+                <w:color w:val="1B2118"/>
+                <w:sz w:val="18"/>
+                <w:szCs w:val="18"/>
+              </w:rPr>
+              <w:t xml:space="preserve">Presentazione di riepilogo</w:t>
+            </w:r>
+          </w:p>
+        </w:tc>
+        <w:tc>
+          <w:tcPr>
+            <w:tcW w:type="dxa" w:w="2010"/>
+            <w:tcBorders>
+              <w:top w:val="single" w:color="D9D4C5" w:sz="4"/>
+              <w:left w:val="single" w:color="D9D4C5" w:sz="4"/>
+              <w:bottom w:val="single" w:color="D9D4C5" w:sz="4"/>
+              <w:right w:val="single" w:color="D9D4C5" w:sz="4"/>
+            </w:tcBorders>
+            <w:shd w:fill="F6F4EE" w:color="auto" w:val="clear"/>
+            <w:tcMar>
+              <w:top w:type="dxa" w:w="70"/>
+              <w:left w:type="dxa" w:w="110"/>
+              <w:bottom w:type="dxa" w:w="70"/>
+              <w:right w:type="dxa" w:w="110"/>
+            </w:tcMar>
+            <w:vAlign w:val="center"/>
+          </w:tcPr>
+          <w:p>
+            <w:pPr>
+              <w:spacing w:after="0" w:before="0"/>
+            </w:pPr>
+            <w:r>
+              <w:rPr>
+                <w:rFonts w:ascii="Arial" w:cs="Arial" w:eastAsia="Arial" w:hAnsi="Arial"/>
+                <w:color w:val="1B2118"/>
+                <w:sz w:val="18"/>
+                <w:szCs w:val="18"/>
+              </w:rPr>
+              <w:t xml:space="preserve">solo Amministratori</w:t>
+            </w:r>
+          </w:p>
+        </w:tc>
+        <w:tc>
+          <w:tcPr>
+            <w:tcW w:type="dxa" w:w="5492"/>
+            <w:tcBorders>
+              <w:top w:val="single" w:color="D9D4C5" w:sz="4"/>
+              <w:left w:val="single" w:color="D9D4C5" w:sz="4"/>
+              <w:bottom w:val="single" w:color="D9D4C5" w:sz="4"/>
+              <w:right w:val="single" w:color="D9D4C5" w:sz="4"/>
+            </w:tcBorders>
+            <w:shd w:fill="F6F4EE" w:color="auto" w:val="clear"/>
+            <w:tcMar>
+              <w:top w:type="dxa" w:w="70"/>
+              <w:left w:type="dxa" w:w="110"/>
+              <w:bottom w:type="dxa" w:w="70"/>
+              <w:right w:type="dxa" w:w="110"/>
+            </w:tcMar>
+            <w:vAlign w:val="center"/>
+          </w:tcPr>
+          <w:p>
+            <w:pPr>
+              <w:spacing w:after="0" w:before="0"/>
+            </w:pPr>
+            <w:r>
+              <w:rPr>
+                <w:rFonts w:ascii="Arial" w:cs="Arial" w:eastAsia="Arial" w:hAnsi="Arial"/>
+                <w:color w:val="1B2118"/>
+                <w:sz w:val="18"/>
+                <w:szCs w:val="18"/>
+              </w:rPr>
+              <w:t xml:space="preserve">Recap del portale in slide (PDF e PowerPoint): metodologia, funzioni, novità, punti aperti, simulatore, piani a pagamento, scelte da prendere</w:t>
             </w:r>
           </w:p>
         </w:tc>
@@ -39748,7 +40086,27 @@
           <w:sz w:val="21"/>
           <w:szCs w:val="21"/>
         </w:rPr>
-        <w:t xml:space="preserve">. Ogni documento riporta in copertina il numero di revisione e la data; a ogni nuova funzione i tre manuali e il registro vengono aggiornati insieme.</w:t>
+        <w:t xml:space="preserve">. Ogni documento riporta in copertina il numero di revisione e la data; a ogni nuova funzione si aggiornano insieme i manuali, il Registro e la Presentazione di riepilogo. Per la presentazione il secondo pulsante è </w:t>
+      </w:r>
+      <w:r>
+        <w:rPr>
+          <w:rFonts w:ascii="Arial" w:cs="Arial" w:eastAsia="Arial" w:hAnsi="Arial"/>
+          <w:b/>
+          <w:bCs/>
+          <w:color w:val="1B2118"/>
+          <w:sz w:val="21"/>
+          <w:szCs w:val="21"/>
+        </w:rPr>
+        <w:t xml:space="preserve">Scarica PowerPoint</w:t>
+      </w:r>
+      <w:r>
+        <w:rPr>
+          <w:rFonts w:ascii="Arial" w:cs="Arial" w:eastAsia="Arial" w:hAnsi="Arial"/>
+          <w:color w:val="1B2118"/>
+          <w:sz w:val="21"/>
+          <w:szCs w:val="21"/>
+        </w:rPr>
+        <w:t xml:space="preserve">.</w:t>
       </w:r>
     </w:p>
     <w:p>
@@ -41331,7 +41689,7 @@
         <w:szCs w:val="16"/>
       </w:rPr>
       <w:tab/>
-      <w:t xml:space="preserve">Manuale Amministratore · Rev. 3.3 · 19/10/2026</w:t>
+      <w:t xml:space="preserve">Manuale Amministratore · Rev. 3.4 · 19/10/2026</w:t>
     </w:r>
   </w:p>
 </w:hdr>
@@ -41396,7 +41754,7 @@
         <w:szCs w:val="16"/>
       </w:rPr>
       <w:tab/>
-      <w:t xml:space="preserve">Manuale Amministratore · Rev. 3.3 · 19/10/2026</w:t>
+      <w:t xml:space="preserve">Manuale Amministratore · Rev. 3.4 · 19/10/2026</w:t>
     </w:r>
   </w:p>
 </w:hdr>

</xml_diff>

<commit_message>
Assistente virtuale con Claude (funzione assistente, script 31, base di conoscenza, pulsante «Assistente»); documenti ufficiali del Programma nella Documentazione; barra a LED più fine; manuali, registro e presentazione 2.1
Co-Authored-By: Claude Opus 5.5 <noreply@anthropic.com>
Claude-Session: https://claude.ai/code/session_01E8XCbEeVHWVP3hntUZ6kZ1
</commit_message>
<xml_diff>
--- a/public/documentazione/Manuale_Amministratore_Portale_CWP.docx
+++ b/public/documentazione/Manuale_Amministratore_Portale_CWP.docx
@@ -302,7 +302,7 @@
                 <w:sz w:val="20"/>
                 <w:szCs w:val="20"/>
               </w:rPr>
-              <w:t xml:space="preserve">Rev. 3.4</w:t>
+              <w:t xml:space="preserve">Rev. 3.5</w:t>
             </w:r>
           </w:p>
         </w:tc>
@@ -719,7 +719,7 @@
                 <w:sz w:val="18"/>
                 <w:szCs w:val="18"/>
               </w:rPr>
-              <w:t xml:space="preserve">3.4</w:t>
+              <w:t xml:space="preserve">3.5</w:t>
             </w:r>
           </w:p>
         </w:tc>
@@ -783,7 +783,7 @@
                 <w:sz w:val="18"/>
                 <w:szCs w:val="18"/>
               </w:rPr>
-              <w:t xml:space="preserve">Presentazione di riepilogo nella pagina Documentazione.</w:t>
+              <w:t xml:space="preserve">Assistente virtuale; documenti ufficiali del Programma nella Documentazione.</w:t>
             </w:r>
           </w:p>
         </w:tc>
@@ -853,7 +853,7 @@
                 <w:sz w:val="18"/>
                 <w:szCs w:val="18"/>
               </w:rPr>
-              <w:t xml:space="preserve">3.3</w:t>
+              <w:t xml:space="preserve">3.4</w:t>
             </w:r>
           </w:p>
         </w:tc>
@@ -919,7 +919,7 @@
                 <w:sz w:val="18"/>
                 <w:szCs w:val="18"/>
               </w:rPr>
-              <w:t xml:space="preserve">Ordinamento di tutte le tabelle e degli elenchi.</w:t>
+              <w:t xml:space="preserve">Presentazione di riepilogo nella pagina Documentazione.</w:t>
             </w:r>
           </w:p>
         </w:tc>
@@ -989,7 +989,7 @@
                 <w:sz w:val="18"/>
                 <w:szCs w:val="18"/>
               </w:rPr>
-              <w:t xml:space="preserve">3.2</w:t>
+              <w:t xml:space="preserve">3.3</w:t>
             </w:r>
           </w:p>
         </w:tc>
@@ -1053,7 +1053,7 @@
                 <w:sz w:val="18"/>
                 <w:szCs w:val="18"/>
               </w:rPr>
-              <w:t xml:space="preserve">Simulatore: metodo di stima per utenza (solo utenze virtuose), buffer del Capitolo 7, taratura.</w:t>
+              <w:t xml:space="preserve">Ordinamento di tutte le tabelle e degli elenchi.</w:t>
             </w:r>
           </w:p>
         </w:tc>
@@ -1123,7 +1123,7 @@
                 <w:sz w:val="18"/>
                 <w:szCs w:val="18"/>
               </w:rPr>
-              <w:t xml:space="preserve">3.1</w:t>
+              <w:t xml:space="preserve">3.2</w:t>
             </w:r>
           </w:p>
         </w:tc>
@@ -1189,7 +1189,7 @@
                 <w:sz w:val="18"/>
                 <w:szCs w:val="18"/>
               </w:rPr>
-              <w:t xml:space="preserve">Cruscotto diventa Dashboard; barra a LED delle 7 fasi per ogni pratica.</w:t>
+              <w:t xml:space="preserve">Simulatore: metodo di stima per utenza (solo utenze virtuose), buffer del Capitolo 7, taratura.</w:t>
             </w:r>
           </w:p>
         </w:tc>
@@ -1259,7 +1259,7 @@
                 <w:sz w:val="18"/>
                 <w:szCs w:val="18"/>
               </w:rPr>
-              <w:t xml:space="preserve">3.0</w:t>
+              <w:t xml:space="preserve">3.1</w:t>
             </w:r>
           </w:p>
         </w:tc>
@@ -1323,7 +1323,7 @@
                 <w:sz w:val="18"/>
                 <w:szCs w:val="18"/>
               </w:rPr>
-              <w:t xml:space="preserve">Eliminazione degli utenti che non hanno mai operato (script 30).</w:t>
+              <w:t xml:space="preserve">Cruscotto diventa Dashboard; barra a LED delle 7 fasi per ogni pratica.</w:t>
             </w:r>
           </w:p>
         </w:tc>
@@ -1393,7 +1393,7 @@
                 <w:sz w:val="18"/>
                 <w:szCs w:val="18"/>
               </w:rPr>
-              <w:t xml:space="preserve">2.9</w:t>
+              <w:t xml:space="preserve">3.0</w:t>
             </w:r>
           </w:p>
         </w:tc>
@@ -1459,7 +1459,7 @@
                 <w:sz w:val="18"/>
                 <w:szCs w:val="18"/>
               </w:rPr>
-              <w:t xml:space="preserve">Email automatica con le credenziali al nuovo utente e alla reimpostazione della password.</w:t>
+              <w:t xml:space="preserve">Eliminazione degli utenti che non hanno mai operato (script 30).</w:t>
             </w:r>
           </w:p>
         </w:tc>
@@ -1529,7 +1529,7 @@
                 <w:sz w:val="18"/>
                 <w:szCs w:val="18"/>
               </w:rPr>
-              <w:t xml:space="preserve">2.8</w:t>
+              <w:t xml:space="preserve">2.9</w:t>
             </w:r>
           </w:p>
         </w:tc>
@@ -1593,7 +1593,7 @@
                 <w:sz w:val="18"/>
                 <w:szCs w:val="18"/>
               </w:rPr>
-              <w:t xml:space="preserve">Più Amministratori con accesso completo; Amministratore principale protetto (script 29).</w:t>
+              <w:t xml:space="preserve">Email automatica con le credenziali al nuovo utente e alla reimpostazione della password.</w:t>
             </w:r>
           </w:p>
         </w:tc>
@@ -1663,7 +1663,7 @@
                 <w:sz w:val="18"/>
                 <w:szCs w:val="18"/>
               </w:rPr>
-              <w:t xml:space="preserve">2.7</w:t>
+              <w:t xml:space="preserve">2.8</w:t>
             </w:r>
           </w:p>
         </w:tc>
@@ -1729,7 +1729,7 @@
                 <w:sz w:val="18"/>
                 <w:szCs w:val="18"/>
               </w:rPr>
-              <w:t xml:space="preserve">Simulatore: costi per il Comune secondo il Caso 1 (progetto volontario) o il Caso 2 (progetto obbligatorio da bando).</w:t>
+              <w:t xml:space="preserve">Più Amministratori con accesso completo; Amministratore principale protetto (script 29).</w:t>
             </w:r>
           </w:p>
         </w:tc>
@@ -1799,7 +1799,7 @@
                 <w:sz w:val="18"/>
                 <w:szCs w:val="18"/>
               </w:rPr>
-              <w:t xml:space="preserve">2.6</w:t>
+              <w:t xml:space="preserve">2.7</w:t>
             </w:r>
           </w:p>
         </w:tc>
@@ -1863,7 +1863,7 @@
                 <w:sz w:val="18"/>
                 <w:szCs w:val="18"/>
               </w:rPr>
-              <w:t xml:space="preserve">Simulatore: valore del credito anno per anno, proposto 32 €.</w:t>
+              <w:t xml:space="preserve">Simulatore: costi per il Comune secondo il Caso 1 (progetto volontario) o il Caso 2 (progetto obbligatorio da bando).</w:t>
             </w:r>
           </w:p>
         </w:tc>
@@ -1933,7 +1933,7 @@
                 <w:sz w:val="18"/>
                 <w:szCs w:val="18"/>
               </w:rPr>
-              <w:t xml:space="preserve">2.5</w:t>
+              <w:t xml:space="preserve">2.6</w:t>
             </w:r>
           </w:p>
         </w:tc>
@@ -1999,7 +1999,7 @@
                 <w:sz w:val="18"/>
                 <w:szCs w:val="18"/>
               </w:rPr>
-              <w:t xml:space="preserve">Simulatore: simulazione economica con valore unitario del credito e costi per il Comune (contratti tipo della Fondazione, Schema tariffario).</w:t>
+              <w:t xml:space="preserve">Simulatore: valore del credito anno per anno, proposto 32 €.</w:t>
             </w:r>
           </w:p>
         </w:tc>
@@ -2069,7 +2069,7 @@
                 <w:sz w:val="18"/>
                 <w:szCs w:val="18"/>
               </w:rPr>
-              <w:t xml:space="preserve">2.4</w:t>
+              <w:t xml:space="preserve">2.5</w:t>
             </w:r>
           </w:p>
         </w:tc>
@@ -2133,7 +2133,7 @@
                 <w:sz w:val="18"/>
                 <w:szCs w:val="18"/>
               </w:rPr>
-              <w:t xml:space="preserve">Simulatore: riferimento sempre alla soglia del 65% di differenziata e controllo dei valori fuori scala.</w:t>
+              <w:t xml:space="preserve">Simulatore: simulazione economica con valore unitario del credito e costi per il Comune (contratti tipo della Fondazione, Schema tariffario).</w:t>
             </w:r>
           </w:p>
         </w:tc>
@@ -2203,7 +2203,7 @@
                 <w:sz w:val="18"/>
                 <w:szCs w:val="18"/>
               </w:rPr>
-              <w:t xml:space="preserve">2.3</w:t>
+              <w:t xml:space="preserve">2.4</w:t>
             </w:r>
           </w:p>
         </w:tc>
@@ -2269,7 +2269,7 @@
                 <w:sz w:val="18"/>
                 <w:szCs w:val="18"/>
               </w:rPr>
-              <w:t xml:space="preserve">Simulatore conforme al modello CWP: scenario di riferimento dello Standard 4.8.1, situazione attuale, conformità.</w:t>
+              <w:t xml:space="preserve">Simulatore: riferimento sempre alla soglia del 65% di differenziata e controllo dei valori fuori scala.</w:t>
             </w:r>
           </w:p>
         </w:tc>
@@ -2339,7 +2339,7 @@
                 <w:sz w:val="18"/>
                 <w:szCs w:val="18"/>
               </w:rPr>
-              <w:t xml:space="preserve">2.2</w:t>
+              <w:t xml:space="preserve">2.3</w:t>
             </w:r>
           </w:p>
         </w:tc>
@@ -2403,7 +2403,7 @@
                 <w:sz w:val="18"/>
                 <w:szCs w:val="18"/>
               </w:rPr>
-              <w:t xml:space="preserve">Nuovo capitolo «Simulatore di scenari»: creazione, anno base, obiettivi annui, risultati, modello di stima.</w:t>
+              <w:t xml:space="preserve">Simulatore conforme al modello CWP: scenario di riferimento dello Standard 4.8.1, situazione attuale, conformità.</w:t>
             </w:r>
           </w:p>
         </w:tc>
@@ -2473,7 +2473,7 @@
                 <w:sz w:val="18"/>
                 <w:szCs w:val="18"/>
               </w:rPr>
-              <w:t xml:space="preserve">2.1</w:t>
+              <w:t xml:space="preserve">2.2</w:t>
             </w:r>
           </w:p>
         </w:tc>
@@ -2539,7 +2539,7 @@
                 <w:sz w:val="18"/>
                 <w:szCs w:val="18"/>
               </w:rPr>
-              <w:t xml:space="preserve">Funzioni in arrivo: simulatore di scenari (7, 10 o 21 anni, obiettivi annui, % di differenziata e crediti stimati) e assistente virtuale (Claude).</w:t>
+              <w:t xml:space="preserve">Nuovo capitolo «Simulatore di scenari»: creazione, anno base, obiettivi annui, risultati, modello di stima.</w:t>
             </w:r>
           </w:p>
         </w:tc>
@@ -2609,7 +2609,7 @@
                 <w:sz w:val="18"/>
                 <w:szCs w:val="18"/>
               </w:rPr>
-              <w:t xml:space="preserve">2.0</w:t>
+              <w:t xml:space="preserve">2.1</w:t>
             </w:r>
           </w:p>
         </w:tc>
@@ -2673,7 +2673,7 @@
                 <w:sz w:val="18"/>
                 <w:szCs w:val="18"/>
               </w:rPr>
-              <w:t xml:space="preserve">Copie di sicurezza e ripristino: rimando alle Istruzioni di ripristino e punti essenziali (capitolo Manutenzione ed emergenze).</w:t>
+              <w:t xml:space="preserve">Funzioni in arrivo: simulatore di scenari (7, 10 o 21 anni, obiettivi annui, % di differenziata e crediti stimati) e assistente virtuale (Claude).</w:t>
             </w:r>
           </w:p>
         </w:tc>
@@ -2743,7 +2743,7 @@
                 <w:sz w:val="18"/>
                 <w:szCs w:val="18"/>
               </w:rPr>
-              <w:t xml:space="preserve">1.9</w:t>
+              <w:t xml:space="preserve">2.0</w:t>
             </w:r>
           </w:p>
         </w:tc>
@@ -2809,7 +2809,7 @@
                 <w:sz w:val="18"/>
                 <w:szCs w:val="18"/>
               </w:rPr>
-              <w:t xml:space="preserve">Fondazione Operate soggetto promotore del programma (esclusiva conferita da Wastelab).</w:t>
+              <w:t xml:space="preserve">Copie di sicurezza e ripristino: rimando alle Istruzioni di ripristino e punti essenziali (capitolo Manutenzione ed emergenze).</w:t>
             </w:r>
           </w:p>
         </w:tc>
@@ -2879,7 +2879,7 @@
                 <w:sz w:val="18"/>
                 <w:szCs w:val="18"/>
               </w:rPr>
-              <w:t xml:space="preserve">1.8</w:t>
+              <w:t xml:space="preserve">1.9</w:t>
             </w:r>
           </w:p>
         </w:tc>
@@ -2943,7 +2943,7 @@
                 <w:sz w:val="18"/>
                 <w:szCs w:val="18"/>
               </w:rPr>
-              <w:t xml:space="preserve">PEC del Programma e documenti ufficiali già pubblicati sulla pagina pubblica.</w:t>
+              <w:t xml:space="preserve">Fondazione Operate soggetto promotore del programma (esclusiva conferita da Wastelab).</w:t>
             </w:r>
           </w:p>
         </w:tc>
@@ -3013,7 +3013,7 @@
                 <w:sz w:val="18"/>
                 <w:szCs w:val="18"/>
               </w:rPr>
-              <w:t xml:space="preserve">1.7</w:t>
+              <w:t xml:space="preserve">1.8</w:t>
             </w:r>
           </w:p>
         </w:tc>
@@ -3046,7 +3046,7 @@
                 <w:sz w:val="18"/>
                 <w:szCs w:val="18"/>
               </w:rPr>
-              <w:t xml:space="preserve">18/10/2026</w:t>
+              <w:t xml:space="preserve">19/10/2026</w:t>
             </w:r>
           </w:p>
         </w:tc>
@@ -3079,7 +3079,7 @@
                 <w:sz w:val="18"/>
                 <w:szCs w:val="18"/>
               </w:rPr>
-              <w:t xml:space="preserve">Allineamento ai documenti ufficiali del Programma (script 22-24): Rapporto a 7 fasi, feedback pubblico, stati del Programma, dati del progetto e territorio ISTAT, ritiro e rientro, account unico e delegati, registri, tariffe e sospensione, accuratezza e accertamenti, informazioni del Programma e metodologie, modelli pubblici; nuovi capitoli Crediti emessi, Reclami, Pagina pubblica; qualità dei dati nel calcolo.</w:t>
+              <w:t xml:space="preserve">PEC del Programma e documenti ufficiali già pubblicati sulla pagina pubblica.</w:t>
             </w:r>
           </w:p>
         </w:tc>
@@ -3149,7 +3149,7 @@
                 <w:sz w:val="18"/>
                 <w:szCs w:val="18"/>
               </w:rPr>
-              <w:t xml:space="preserve">1.6</w:t>
+              <w:t xml:space="preserve">1.7</w:t>
             </w:r>
           </w:p>
         </w:tc>
@@ -3213,7 +3213,7 @@
                 <w:sz w:val="18"/>
                 <w:szCs w:val="18"/>
               </w:rPr>
-              <w:t xml:space="preserve">Calcolo crediti: descrizione corretta del buffer (somma delle voci delle Tabelle 15 e 16, più il 20% con le sole utenze virtuose, al massimo 80%).</w:t>
+              <w:t xml:space="preserve">Allineamento ai documenti ufficiali del Programma (script 22-24): Rapporto a 7 fasi, feedback pubblico, stati del Programma, dati del progetto e territorio ISTAT, ritiro e rientro, account unico e delegati, registri, tariffe e sospensione, accuratezza e accertamenti, informazioni del Programma e metodologie, modelli pubblici; nuovi capitoli Crediti emessi, Reclami, Pagina pubblica; qualità dei dati nel calcolo.</w:t>
             </w:r>
           </w:p>
         </w:tc>
@@ -3283,7 +3283,7 @@
                 <w:sz w:val="18"/>
                 <w:szCs w:val="18"/>
               </w:rPr>
-              <w:t xml:space="preserve">1.5</w:t>
+              <w:t xml:space="preserve">1.6</w:t>
             </w:r>
           </w:p>
         </w:tc>
@@ -3349,7 +3349,7 @@
                 <w:sz w:val="18"/>
                 <w:szCs w:val="18"/>
               </w:rPr>
-              <w:t xml:space="preserve">Nuova pagina Anagrafiche (Organizzazioni ed Enti, anche per gli Operatori); Rapporti con 4 fasi e durate proprie; documenti richiesti per fase; consultazione con documento bloccato, osservazioni numerate e motivazione; conservazione per 10 anni; fascicolo con riepilogo PDF e nuove cartelle.</w:t>
+              <w:t xml:space="preserve">Calcolo crediti: descrizione corretta del buffer (somma delle voci delle Tabelle 15 e 16, più il 20% con le sole utenze virtuose, al massimo 80%).</w:t>
             </w:r>
           </w:p>
         </w:tc>
@@ -3419,7 +3419,7 @@
                 <w:sz w:val="18"/>
                 <w:szCs w:val="18"/>
               </w:rPr>
-              <w:t xml:space="preserve">1.4</w:t>
+              <w:t xml:space="preserve">1.5</w:t>
             </w:r>
           </w:p>
         </w:tc>
@@ -3483,7 +3483,7 @@
                 <w:sz w:val="18"/>
                 <w:szCs w:val="18"/>
               </w:rPr>
-              <w:t xml:space="preserve">Calcolo crediti: il risultato si azzera quando cambiano dati o Banca Dati Utenze, conferma solo dopo un nuovo «Calcola». Gestione utenti: password temporanea di almeno 10 caratteri con lettere e numeri, creazione annullata se non va a buon fine, nessun accesso ai dati prima del cambio password.</w:t>
+              <w:t xml:space="preserve">Nuova pagina Anagrafiche (Organizzazioni ed Enti, anche per gli Operatori); Rapporti con 4 fasi e durate proprie; documenti richiesti per fase; consultazione con documento bloccato, osservazioni numerate e motivazione; conservazione per 10 anni; fascicolo con riepilogo PDF e nuove cartelle.</w:t>
             </w:r>
           </w:p>
         </w:tc>
@@ -3553,7 +3553,7 @@
                 <w:sz w:val="18"/>
                 <w:szCs w:val="18"/>
               </w:rPr>
-              <w:t xml:space="preserve">1.3</w:t>
+              <w:t xml:space="preserve">1.4</w:t>
             </w:r>
           </w:p>
         </w:tc>
@@ -3619,7 +3619,7 @@
                 <w:sz w:val="18"/>
                 <w:szCs w:val="18"/>
               </w:rPr>
-              <w:t xml:space="preserve">Rapporto di calcolo in PDF, archiviazione nella pratica, numero di registro, registro dei crediti.</w:t>
+              <w:t xml:space="preserve">Calcolo crediti: il risultato si azzera quando cambiano dati o Banca Dati Utenze, conferma solo dopo un nuovo «Calcola». Gestione utenti: password temporanea di almeno 10 caratteri con lettere e numeri, creazione annullata se non va a buon fine, nessun accesso ai dati prima del cambio password.</w:t>
             </w:r>
           </w:p>
         </w:tc>
@@ -3689,7 +3689,7 @@
                 <w:sz w:val="18"/>
                 <w:szCs w:val="18"/>
               </w:rPr>
-              <w:t xml:space="preserve">1.2</w:t>
+              <w:t xml:space="preserve">1.3</w:t>
             </w:r>
           </w:p>
         </w:tc>
@@ -3753,7 +3753,7 @@
                 <w:sz w:val="18"/>
                 <w:szCs w:val="18"/>
               </w:rPr>
-              <w:t xml:space="preserve">Calcolo crediti: importare il tracciato nel calcolo (dai documenti della pratica o dal computer), singole letture, blocco dei dati personali, controlli di coerenza.</w:t>
+              <w:t xml:space="preserve">Rapporto di calcolo in PDF, archiviazione nella pratica, numero di registro, registro dei crediti.</w:t>
             </w:r>
           </w:p>
         </w:tc>
@@ -3823,7 +3823,7 @@
                 <w:sz w:val="18"/>
                 <w:szCs w:val="18"/>
               </w:rPr>
-              <w:t xml:space="preserve">1.1</w:t>
+              <w:t xml:space="preserve">1.2</w:t>
             </w:r>
           </w:p>
         </w:tc>
@@ -3889,7 +3889,7 @@
                 <w:sz w:val="18"/>
                 <w:szCs w:val="18"/>
               </w:rPr>
-              <w:t xml:space="preserve">Note di fase, Ente di Validazione della pratica, consultazione sulla pagina pubblica con conferma dell'email, moderazione con autori e allegati, errata corrige; nuovo capitolo Messaggi con il Comune; pagamenti visibili al Comune; Impostazioni: Enti di Validazione e Modelli di documento; notifiche aggiornate.</w:t>
+              <w:t xml:space="preserve">Calcolo crediti: importare il tracciato nel calcolo (dai documenti della pratica o dal computer), singole letture, blocco dei dati personali, controlli di coerenza.</w:t>
             </w:r>
           </w:p>
         </w:tc>
@@ -3959,6 +3959,140 @@
                 <w:sz w:val="18"/>
                 <w:szCs w:val="18"/>
               </w:rPr>
+              <w:t xml:space="preserve">1.1</w:t>
+            </w:r>
+          </w:p>
+        </w:tc>
+        <w:tc>
+          <w:tcPr>
+            <w:tcW w:type="dxa" w:w="1300"/>
+            <w:tcBorders>
+              <w:top w:val="single" w:color="D9D4C5" w:sz="4"/>
+              <w:left w:val="single" w:color="D9D4C5" w:sz="4"/>
+              <w:bottom w:val="single" w:color="D9D4C5" w:sz="4"/>
+              <w:right w:val="single" w:color="D9D4C5" w:sz="4"/>
+            </w:tcBorders>
+            <w:tcMar>
+              <w:top w:type="dxa" w:w="70"/>
+              <w:left w:type="dxa" w:w="110"/>
+              <w:bottom w:type="dxa" w:w="70"/>
+              <w:right w:type="dxa" w:w="110"/>
+            </w:tcMar>
+            <w:vAlign w:val="center"/>
+          </w:tcPr>
+          <w:p>
+            <w:pPr>
+              <w:spacing w:after="0" w:before="0"/>
+            </w:pPr>
+            <w:r>
+              <w:rPr>
+                <w:rFonts w:ascii="Arial" w:cs="Arial" w:eastAsia="Arial" w:hAnsi="Arial"/>
+                <w:color w:val="1B2118"/>
+                <w:sz w:val="18"/>
+                <w:szCs w:val="18"/>
+              </w:rPr>
+              <w:t xml:space="preserve">18/10/2026</w:t>
+            </w:r>
+          </w:p>
+        </w:tc>
+        <w:tc>
+          <w:tcPr>
+            <w:tcW w:type="dxa" w:w="5538"/>
+            <w:tcBorders>
+              <w:top w:val="single" w:color="D9D4C5" w:sz="4"/>
+              <w:left w:val="single" w:color="D9D4C5" w:sz="4"/>
+              <w:bottom w:val="single" w:color="D9D4C5" w:sz="4"/>
+              <w:right w:val="single" w:color="D9D4C5" w:sz="4"/>
+            </w:tcBorders>
+            <w:tcMar>
+              <w:top w:type="dxa" w:w="70"/>
+              <w:left w:type="dxa" w:w="110"/>
+              <w:bottom w:type="dxa" w:w="70"/>
+              <w:right w:type="dxa" w:w="110"/>
+            </w:tcMar>
+            <w:vAlign w:val="center"/>
+          </w:tcPr>
+          <w:p>
+            <w:pPr>
+              <w:spacing w:after="0" w:before="0"/>
+            </w:pPr>
+            <w:r>
+              <w:rPr>
+                <w:rFonts w:ascii="Arial" w:cs="Arial" w:eastAsia="Arial" w:hAnsi="Arial"/>
+                <w:color w:val="1B2118"/>
+                <w:sz w:val="18"/>
+                <w:szCs w:val="18"/>
+              </w:rPr>
+              <w:t xml:space="preserve">Note di fase, Ente di Validazione della pratica, consultazione sulla pagina pubblica con conferma dell'email, moderazione con autori e allegati, errata corrige; nuovo capitolo Messaggi con il Comune; pagamenti visibili al Comune; Impostazioni: Enti di Validazione e Modelli di documento; notifiche aggiornate.</w:t>
+            </w:r>
+          </w:p>
+        </w:tc>
+        <w:tc>
+          <w:tcPr>
+            <w:tcW w:type="dxa" w:w="2000"/>
+            <w:tcBorders>
+              <w:top w:val="single" w:color="D9D4C5" w:sz="4"/>
+              <w:left w:val="single" w:color="D9D4C5" w:sz="4"/>
+              <w:bottom w:val="single" w:color="D9D4C5" w:sz="4"/>
+              <w:right w:val="single" w:color="D9D4C5" w:sz="4"/>
+            </w:tcBorders>
+            <w:tcMar>
+              <w:top w:type="dxa" w:w="70"/>
+              <w:left w:type="dxa" w:w="110"/>
+              <w:bottom w:type="dxa" w:w="70"/>
+              <w:right w:type="dxa" w:w="110"/>
+            </w:tcMar>
+            <w:vAlign w:val="center"/>
+          </w:tcPr>
+          <w:p>
+            <w:pPr>
+              <w:spacing w:after="0" w:before="0"/>
+            </w:pPr>
+            <w:r>
+              <w:rPr>
+                <w:rFonts w:ascii="Arial" w:cs="Arial" w:eastAsia="Arial" w:hAnsi="Arial"/>
+                <w:color w:val="1B2118"/>
+                <w:sz w:val="18"/>
+                <w:szCs w:val="18"/>
+              </w:rPr>
+              <w:t xml:space="preserve">Fondazione Operate</w:t>
+            </w:r>
+          </w:p>
+        </w:tc>
+      </w:tr>
+      <w:tr>
+        <w:trPr>
+          <w:cantSplit/>
+        </w:trPr>
+        <w:tc>
+          <w:tcPr>
+            <w:tcW w:type="dxa" w:w="800"/>
+            <w:tcBorders>
+              <w:top w:val="single" w:color="D9D4C5" w:sz="4"/>
+              <w:left w:val="single" w:color="D9D4C5" w:sz="4"/>
+              <w:bottom w:val="single" w:color="D9D4C5" w:sz="4"/>
+              <w:right w:val="single" w:color="D9D4C5" w:sz="4"/>
+            </w:tcBorders>
+            <w:shd w:fill="F6F4EE" w:color="auto" w:val="clear"/>
+            <w:tcMar>
+              <w:top w:type="dxa" w:w="70"/>
+              <w:left w:type="dxa" w:w="110"/>
+              <w:bottom w:type="dxa" w:w="70"/>
+              <w:right w:type="dxa" w:w="110"/>
+            </w:tcMar>
+            <w:vAlign w:val="center"/>
+          </w:tcPr>
+          <w:p>
+            <w:pPr>
+              <w:spacing w:after="0" w:before="0"/>
+            </w:pPr>
+            <w:r>
+              <w:rPr>
+                <w:rFonts w:ascii="Arial" w:cs="Arial" w:eastAsia="Arial" w:hAnsi="Arial"/>
+                <w:color w:val="1B2118"/>
+                <w:sz w:val="18"/>
+                <w:szCs w:val="18"/>
+              </w:rPr>
               <w:t xml:space="preserve">1.0</w:t>
             </w:r>
           </w:p>
@@ -3972,6 +4106,7 @@
               <w:bottom w:val="single" w:color="D9D4C5" w:sz="4"/>
               <w:right w:val="single" w:color="D9D4C5" w:sz="4"/>
             </w:tcBorders>
+            <w:shd w:fill="F6F4EE" w:color="auto" w:val="clear"/>
             <w:tcMar>
               <w:top w:type="dxa" w:w="70"/>
               <w:left w:type="dxa" w:w="110"/>
@@ -4004,6 +4139,7 @@
               <w:bottom w:val="single" w:color="D9D4C5" w:sz="4"/>
               <w:right w:val="single" w:color="D9D4C5" w:sz="4"/>
             </w:tcBorders>
+            <w:shd w:fill="F6F4EE" w:color="auto" w:val="clear"/>
             <w:tcMar>
               <w:top w:type="dxa" w:w="70"/>
               <w:left w:type="dxa" w:w="110"/>
@@ -4036,6 +4172,7 @@
               <w:bottom w:val="single" w:color="D9D4C5" w:sz="4"/>
               <w:right w:val="single" w:color="D9D4C5" w:sz="4"/>
             </w:tcBorders>
+            <w:shd w:fill="F6F4EE" w:color="auto" w:val="clear"/>
             <w:tcMar>
               <w:top w:type="dxa" w:w="70"/>
               <w:left w:type="dxa" w:w="110"/>
@@ -4077,7 +4214,7 @@
           <w:sz w:val="20"/>
           <w:szCs w:val="20"/>
         </w:rPr>
-        <w:t xml:space="preserve">Questo documento descrive il portale alla revisione 3.4 del 19/10/2026. A ogni modifica del portale il manuale viene aggiornato e la revisione incrementata; la versione corrente si scarica dall'area Documentazione del portale (solo Amministratori).</w:t>
+        <w:t xml:space="preserve">Questo documento descrive il portale alla revisione 3.5 del 19/10/2026. A ogni modifica del portale il manuale viene aggiornato e la revisione incrementata; la versione corrente si scarica dall'area Documentazione del portale (solo Amministratori).</w:t>
       </w:r>
     </w:p>
     <w:p>
@@ -4757,7 +4894,7 @@
             <w:sz w:val="22"/>
             <w:szCs w:val="22"/>
           </w:rPr>
-          <w:t xml:space="preserve">23.  Manutenzione ed emergenze</w:t>
+          <w:t xml:space="preserve">23.  Assistente virtuale</w:t>
         </w:r>
         <w:r>
           <w:rPr>
@@ -4786,7 +4923,7 @@
             <w:sz w:val="22"/>
             <w:szCs w:val="22"/>
           </w:rPr>
-          <w:t xml:space="preserve">24.  Funzioni in arrivo</w:t>
+          <w:t xml:space="preserve">24.  Manutenzione ed emergenze</w:t>
         </w:r>
         <w:r>
           <w:rPr>
@@ -4797,6 +4934,35 @@
           </w:rPr>
           <w:tab/>
           <w:t xml:space="preserve">45</w:t>
+        </w:r>
+      </w:hyperlink>
+    </w:p>
+    <w:p>
+      <w:pPr>
+        <w:tabs>
+          <w:tab w:val="right" w:pos="9638" w:leader="dot"/>
+        </w:tabs>
+        <w:spacing w:after="130"/>
+      </w:pPr>
+      <w:hyperlink w:history="1" w:anchor="cap25">
+        <w:r>
+          <w:rPr>
+            <w:rFonts w:ascii="Arial" w:cs="Arial" w:eastAsia="Arial" w:hAnsi="Arial"/>
+            <w:color w:val="1B2118"/>
+            <w:sz w:val="22"/>
+            <w:szCs w:val="22"/>
+          </w:rPr>
+          <w:t xml:space="preserve">25.  Funzioni in arrivo</w:t>
+        </w:r>
+        <w:r>
+          <w:rPr>
+            <w:rFonts w:ascii="Arial" w:cs="Arial" w:eastAsia="Arial" w:hAnsi="Arial"/>
+            <w:color w:val="1B2118"/>
+            <w:sz w:val="22"/>
+            <w:szCs w:val="22"/>
+          </w:rPr>
+          <w:tab/>
+          <w:t xml:space="preserve">46</w:t>
         </w:r>
       </w:hyperlink>
     </w:p>
@@ -6741,7 +6907,7 @@
         </w:rPr>
         <w:t xml:space="preserve">Si accede da </w:t>
       </w:r>
-      <w:hyperlink w:history="1" r:id="rIdnkkqtsbmbt3dhfaykorsg">
+      <w:hyperlink w:history="1" r:id="rIdcl2nyj_fwzmukoz7qec6r">
         <w:r>
           <w:rPr>
             <w:rFonts w:ascii="Arial" w:cs="Arial" w:eastAsia="Arial" w:hAnsi="Arial"/>
@@ -40042,6 +40208,91 @@
       <w:r>
         <w:rPr>
           <w:rFonts w:ascii="Arial" w:cs="Arial" w:eastAsia="Arial" w:hAnsi="Arial"/>
+          <w:b/>
+          <w:bCs/>
+          <w:color w:val="1B2118"/>
+          <w:sz w:val="21"/>
+          <w:szCs w:val="21"/>
+        </w:rPr>
+        <w:t xml:space="preserve">Documenti ufficiali del Programma.</w:t>
+      </w:r>
+      <w:r>
+        <w:rPr>
+          <w:rFonts w:ascii="Arial" w:cs="Arial" w:eastAsia="Arial" w:hAnsi="Arial"/>
+          <w:color w:val="1B2118"/>
+          <w:sz w:val="21"/>
+          <w:szCs w:val="21"/>
+        </w:rPr>
+        <w:t xml:space="preserve"> In fondo alla pagina Documentazione ci sono gli </w:t>
+      </w:r>
+      <w:r>
+        <w:rPr>
+          <w:rFonts w:ascii="Arial" w:cs="Arial" w:eastAsia="Arial" w:hAnsi="Arial"/>
+          <w:b/>
+          <w:bCs/>
+          <w:color w:val="1B2118"/>
+          <w:sz w:val="21"/>
+          <w:szCs w:val="21"/>
+        </w:rPr>
+        <w:t xml:space="preserve">8 documenti ufficiali del Programma Carbon WastePrint® versione 1.2</w:t>
+      </w:r>
+      <w:r>
+        <w:rPr>
+          <w:rFonts w:ascii="Arial" w:cs="Arial" w:eastAsia="Arial" w:hAnsi="Arial"/>
+          <w:color w:val="1B2118"/>
+          <w:sz w:val="21"/>
+          <w:szCs w:val="21"/>
+        </w:rPr>
+        <w:t xml:space="preserve"> (04/09/2025): 0. Guida al Programma, 1. Definizioni, 2. Normativa di riferimento, 3. Standard, 4. Metodologia, 5. Politica di reclamo, 6. Schema tariffario, 7. Gestione della qualità dei dati. </w:t>
+      </w:r>
+      <w:r>
+        <w:rPr>
+          <w:rFonts w:ascii="Arial" w:cs="Arial" w:eastAsia="Arial" w:hAnsi="Arial"/>
+          <w:b/>
+          <w:bCs/>
+          <w:color w:val="1B2118"/>
+          <w:sz w:val="21"/>
+          <w:szCs w:val="21"/>
+        </w:rPr>
+        <w:t xml:space="preserve">Apri PDF</w:t>
+      </w:r>
+      <w:r>
+        <w:rPr>
+          <w:rFonts w:ascii="Arial" w:cs="Arial" w:eastAsia="Arial" w:hAnsi="Arial"/>
+          <w:color w:val="1B2118"/>
+          <w:sz w:val="21"/>
+          <w:szCs w:val="21"/>
+        </w:rPr>
+        <w:t xml:space="preserve"> li apre in una nuova scheda, </w:t>
+      </w:r>
+      <w:r>
+        <w:rPr>
+          <w:rFonts w:ascii="Arial" w:cs="Arial" w:eastAsia="Arial" w:hAnsi="Arial"/>
+          <w:b/>
+          <w:bCs/>
+          <w:color w:val="1B2118"/>
+          <w:sz w:val="21"/>
+          <w:szCs w:val="21"/>
+        </w:rPr>
+        <w:t xml:space="preserve">Scarica</w:t>
+      </w:r>
+      <w:r>
+        <w:rPr>
+          <w:rFonts w:ascii="Arial" w:cs="Arial" w:eastAsia="Arial" w:hAnsi="Arial"/>
+          <w:color w:val="1B2118"/>
+          <w:sz w:val="21"/>
+          <w:szCs w:val="21"/>
+        </w:rPr>
+        <w:t xml:space="preserve"> li salva. Sono gli stessi pubblicati sulla pagina pubblica del Programma e si aggiornano da Impostazioni → Modelli (categoria «programma»).</w:t>
+      </w:r>
+    </w:p>
+    <w:p>
+      <w:pPr>
+        <w:spacing w:after="140" w:line="300"/>
+      </w:pPr>
+      <w:r>
+        <w:rPr>
+          <w:rFonts w:ascii="Arial" w:cs="Arial" w:eastAsia="Arial" w:hAnsi="Arial"/>
           <w:color w:val="1B2118"/>
           <w:sz w:val="21"/>
           <w:szCs w:val="21"/>
@@ -40128,7 +40379,440 @@
           <w:sz w:val="34"/>
           <w:szCs w:val="34"/>
         </w:rPr>
-        <w:t xml:space="preserve">23. Manutenzione ed emergenze</w:t>
+        <w:t xml:space="preserve">23. Assistente virtuale</w:t>
+      </w:r>
+      <w:bookmarkEnd w:id="1"/>
+    </w:p>
+    <w:p>
+      <w:pPr>
+        <w:spacing w:after="140" w:line="300"/>
+      </w:pPr>
+      <w:r>
+        <w:rPr>
+          <w:rFonts w:ascii="Arial" w:cs="Arial" w:eastAsia="Arial" w:hAnsi="Arial"/>
+          <w:color w:val="1B2118"/>
+          <w:sz w:val="21"/>
+          <w:szCs w:val="21"/>
+        </w:rPr>
+        <w:t xml:space="preserve">In basso a destra di ogni pagina c'è il pulsante </w:t>
+      </w:r>
+      <w:r>
+        <w:rPr>
+          <w:rFonts w:ascii="Arial" w:cs="Arial" w:eastAsia="Arial" w:hAnsi="Arial"/>
+          <w:b/>
+          <w:bCs/>
+          <w:color w:val="1B2118"/>
+          <w:sz w:val="21"/>
+          <w:szCs w:val="21"/>
+        </w:rPr>
+        <w:t xml:space="preserve">✦ Assistente</w:t>
+      </w:r>
+      <w:r>
+        <w:rPr>
+          <w:rFonts w:ascii="Arial" w:cs="Arial" w:eastAsia="Arial" w:hAnsi="Arial"/>
+          <w:color w:val="1B2118"/>
+          <w:sz w:val="21"/>
+          <w:szCs w:val="21"/>
+        </w:rPr>
+        <w:t xml:space="preserve">: apre una chat con un assistente basato su </w:t>
+      </w:r>
+      <w:r>
+        <w:rPr>
+          <w:rFonts w:ascii="Arial" w:cs="Arial" w:eastAsia="Arial" w:hAnsi="Arial"/>
+          <w:b/>
+          <w:bCs/>
+          <w:color w:val="1B2118"/>
+          <w:sz w:val="21"/>
+          <w:szCs w:val="21"/>
+        </w:rPr>
+        <w:t xml:space="preserve">Claude</w:t>
+      </w:r>
+      <w:r>
+        <w:rPr>
+          <w:rFonts w:ascii="Arial" w:cs="Arial" w:eastAsia="Arial" w:hAnsi="Arial"/>
+          <w:color w:val="1B2118"/>
+          <w:sz w:val="21"/>
+          <w:szCs w:val="21"/>
+        </w:rPr>
+        <w:t xml:space="preserve"> (Anthropic) che risponde alle domande sul funzionamento del portale e del Programma. Per ora è disponibile per gli </w:t>
+      </w:r>
+      <w:r>
+        <w:rPr>
+          <w:rFonts w:ascii="Arial" w:cs="Arial" w:eastAsia="Arial" w:hAnsi="Arial"/>
+          <w:b/>
+          <w:bCs/>
+          <w:color w:val="1B2118"/>
+          <w:sz w:val="21"/>
+          <w:szCs w:val="21"/>
+        </w:rPr>
+        <w:t xml:space="preserve">Amministratori</w:t>
+      </w:r>
+      <w:r>
+        <w:rPr>
+          <w:rFonts w:ascii="Arial" w:cs="Arial" w:eastAsia="Arial" w:hAnsi="Arial"/>
+          <w:color w:val="1B2118"/>
+          <w:sz w:val="21"/>
+          <w:szCs w:val="21"/>
+        </w:rPr>
+        <w:t xml:space="preserve"> e per gli </w:t>
+      </w:r>
+      <w:r>
+        <w:rPr>
+          <w:rFonts w:ascii="Arial" w:cs="Arial" w:eastAsia="Arial" w:hAnsi="Arial"/>
+          <w:b/>
+          <w:bCs/>
+          <w:color w:val="1B2118"/>
+          <w:sz w:val="21"/>
+          <w:szCs w:val="21"/>
+        </w:rPr>
+        <w:t xml:space="preserve">utenti degli enti</w:t>
+      </w:r>
+      <w:r>
+        <w:rPr>
+          <w:rFonts w:ascii="Arial" w:cs="Arial" w:eastAsia="Arial" w:hAnsi="Arial"/>
+          <w:color w:val="1B2118"/>
+          <w:sz w:val="21"/>
+          <w:szCs w:val="21"/>
+        </w:rPr>
+        <w:t xml:space="preserve">.</w:t>
+      </w:r>
+    </w:p>
+    <w:p>
+      <w:pPr>
+        <w:spacing w:after="140" w:line="300"/>
+      </w:pPr>
+      <w:r>
+        <w:rPr>
+          <w:rFonts w:ascii="Arial" w:cs="Arial" w:eastAsia="Arial" w:hAnsi="Arial"/>
+          <w:b/>
+          <w:bCs/>
+          <w:color w:val="1B2118"/>
+          <w:sz w:val="21"/>
+          <w:szCs w:val="21"/>
+        </w:rPr>
+        <w:t xml:space="preserve">Cosa sa.</w:t>
+      </w:r>
+      <w:r>
+        <w:rPr>
+          <w:rFonts w:ascii="Arial" w:cs="Arial" w:eastAsia="Arial" w:hAnsi="Arial"/>
+          <w:color w:val="1B2118"/>
+          <w:sz w:val="21"/>
+          <w:szCs w:val="21"/>
+        </w:rPr>
+        <w:t xml:space="preserve"> Risponde solo dalla sua base di conoscenza: per gli Amministratori il Manuale Utente, questo manuale, le tariffe (Schema tariffario v1.2 e costi Caso 1 e Caso 2 del 28/07/2026) e le note sul calcolo dei crediti; per gli enti il Manuale Utente e le tariffe. Se una cosa non c'è lo dice e invita a scrivere alla Fondazione. </w:t>
+      </w:r>
+      <w:r>
+        <w:rPr>
+          <w:rFonts w:ascii="Arial" w:cs="Arial" w:eastAsia="Arial" w:hAnsi="Arial"/>
+          <w:b/>
+          <w:bCs/>
+          <w:color w:val="1B2118"/>
+          <w:sz w:val="21"/>
+          <w:szCs w:val="21"/>
+        </w:rPr>
+        <w:t xml:space="preserve">Non vede i dati delle pratiche</w:t>
+      </w:r>
+      <w:r>
+        <w:rPr>
+          <w:rFonts w:ascii="Arial" w:cs="Arial" w:eastAsia="Arial" w:hAnsi="Arial"/>
+          <w:color w:val="1B2118"/>
+          <w:sz w:val="21"/>
+          <w:szCs w:val="21"/>
+        </w:rPr>
+        <w:t xml:space="preserve"> e non fa operazioni: spiega dove e come farle.</w:t>
+      </w:r>
+    </w:p>
+    <w:p>
+      <w:pPr>
+        <w:spacing w:after="140" w:line="300"/>
+      </w:pPr>
+      <w:r>
+        <w:rPr>
+          <w:rFonts w:ascii="Arial" w:cs="Arial" w:eastAsia="Arial" w:hAnsi="Arial"/>
+          <w:b/>
+          <w:bCs/>
+          <w:color w:val="1B2118"/>
+          <w:sz w:val="21"/>
+          <w:szCs w:val="21"/>
+        </w:rPr>
+        <w:t xml:space="preserve">Come si usa.</w:t>
+      </w:r>
+      <w:r>
+        <w:rPr>
+          <w:rFonts w:ascii="Arial" w:cs="Arial" w:eastAsia="Arial" w:hAnsi="Arial"/>
+          <w:color w:val="1B2118"/>
+          <w:sz w:val="21"/>
+          <w:szCs w:val="21"/>
+        </w:rPr>
+        <w:t xml:space="preserve"> Si scrive la domanda (o si sceglie un esempio) e si preme </w:t>
+      </w:r>
+      <w:r>
+        <w:rPr>
+          <w:rFonts w:ascii="Arial" w:cs="Arial" w:eastAsia="Arial" w:hAnsi="Arial"/>
+          <w:b/>
+          <w:bCs/>
+          <w:color w:val="1B2118"/>
+          <w:sz w:val="21"/>
+          <w:szCs w:val="21"/>
+        </w:rPr>
+        <w:t xml:space="preserve">Invio</w:t>
+      </w:r>
+      <w:r>
+        <w:rPr>
+          <w:rFonts w:ascii="Arial" w:cs="Arial" w:eastAsia="Arial" w:hAnsi="Arial"/>
+          <w:color w:val="1B2118"/>
+          <w:sz w:val="21"/>
+          <w:szCs w:val="21"/>
+        </w:rPr>
+        <w:t xml:space="preserve"> o </w:t>
+      </w:r>
+      <w:r>
+        <w:rPr>
+          <w:rFonts w:ascii="Arial" w:cs="Arial" w:eastAsia="Arial" w:hAnsi="Arial"/>
+          <w:b/>
+          <w:bCs/>
+          <w:color w:val="1B2118"/>
+          <w:sz w:val="21"/>
+          <w:szCs w:val="21"/>
+        </w:rPr>
+        <w:t xml:space="preserve">Invia</w:t>
+      </w:r>
+      <w:r>
+        <w:rPr>
+          <w:rFonts w:ascii="Arial" w:cs="Arial" w:eastAsia="Arial" w:hAnsi="Arial"/>
+          <w:color w:val="1B2118"/>
+          <w:sz w:val="21"/>
+          <w:szCs w:val="21"/>
+        </w:rPr>
+        <w:t xml:space="preserve">; </w:t>
+      </w:r>
+      <w:r>
+        <w:rPr>
+          <w:rFonts w:ascii="Arial" w:cs="Arial" w:eastAsia="Arial" w:hAnsi="Arial"/>
+          <w:b/>
+          <w:bCs/>
+          <w:color w:val="1B2118"/>
+          <w:sz w:val="21"/>
+          <w:szCs w:val="21"/>
+        </w:rPr>
+        <w:t xml:space="preserve">Nuova</w:t>
+      </w:r>
+      <w:r>
+        <w:rPr>
+          <w:rFonts w:ascii="Arial" w:cs="Arial" w:eastAsia="Arial" w:hAnsi="Arial"/>
+          <w:color w:val="1B2118"/>
+          <w:sz w:val="21"/>
+          <w:szCs w:val="21"/>
+        </w:rPr>
+        <w:t xml:space="preserve"> ricomincia la conversazione, </w:t>
+      </w:r>
+      <w:r>
+        <w:rPr>
+          <w:rFonts w:ascii="Arial" w:cs="Arial" w:eastAsia="Arial" w:hAnsi="Arial"/>
+          <w:b/>
+          <w:bCs/>
+          <w:color w:val="1B2118"/>
+          <w:sz w:val="21"/>
+          <w:szCs w:val="21"/>
+        </w:rPr>
+        <w:t xml:space="preserve">✕</w:t>
+      </w:r>
+      <w:r>
+        <w:rPr>
+          <w:rFonts w:ascii="Arial" w:cs="Arial" w:eastAsia="Arial" w:hAnsi="Arial"/>
+          <w:color w:val="1B2118"/>
+          <w:sz w:val="21"/>
+          <w:szCs w:val="21"/>
+        </w:rPr>
+        <w:t xml:space="preserve"> chiude la finestra. La conversazione resta solo nella pagina: il portale non salva domande né risposte, conta solo quante domande fa ogni utente e i token usati (limite predefinito 40 domande al giorno per utente). Le risposte sono generate da un'intelligenza artificiale: in caso di dubbio vale il manuale.</w:t>
+      </w:r>
+    </w:p>
+    <w:p>
+      <w:pPr>
+        <w:spacing w:after="140" w:line="300"/>
+      </w:pPr>
+      <w:r>
+        <w:rPr>
+          <w:rFonts w:ascii="Arial" w:cs="Arial" w:eastAsia="Arial" w:hAnsi="Arial"/>
+          <w:b/>
+          <w:bCs/>
+          <w:color w:val="1B2118"/>
+          <w:sz w:val="21"/>
+          <w:szCs w:val="21"/>
+        </w:rPr>
+        <w:t xml:space="preserve">Attivazione e costi.</w:t>
+      </w:r>
+      <w:r>
+        <w:rPr>
+          <w:rFonts w:ascii="Arial" w:cs="Arial" w:eastAsia="Arial" w:hAnsi="Arial"/>
+          <w:color w:val="1B2118"/>
+          <w:sz w:val="21"/>
+          <w:szCs w:val="21"/>
+        </w:rPr>
+        <w:t xml:space="preserve"> L'assistente funziona con una chiave della </w:t>
+      </w:r>
+      <w:r>
+        <w:rPr>
+          <w:rFonts w:ascii="Arial" w:cs="Arial" w:eastAsia="Arial" w:hAnsi="Arial"/>
+          <w:b/>
+          <w:bCs/>
+          <w:color w:val="1B2118"/>
+          <w:sz w:val="21"/>
+          <w:szCs w:val="21"/>
+        </w:rPr>
+        <w:t xml:space="preserve">Claude Console</w:t>
+      </w:r>
+      <w:r>
+        <w:rPr>
+          <w:rFonts w:ascii="Arial" w:cs="Arial" w:eastAsia="Arial" w:hAnsi="Arial"/>
+          <w:color w:val="1B2118"/>
+          <w:sz w:val="21"/>
+          <w:szCs w:val="21"/>
+        </w:rPr>
+        <w:t xml:space="preserve"> di Anthropic, che solo Luca inserisce nei segreti di Supabase (</w:t>
+      </w:r>
+      <w:r>
+        <w:rPr>
+          <w:rFonts w:ascii="Consolas" w:cs="Consolas" w:eastAsia="Consolas" w:hAnsi="Consolas"/>
+          <w:color w:val="2F5D3A"/>
+          <w:sz w:val="21"/>
+          <w:szCs w:val="21"/>
+        </w:rPr>
+        <w:t xml:space="preserve">ANTHROPIC_API_KEY</w:t>
+      </w:r>
+      <w:r>
+        <w:rPr>
+          <w:rFonts w:ascii="Arial" w:cs="Arial" w:eastAsia="Arial" w:hAnsi="Arial"/>
+          <w:color w:val="1B2118"/>
+          <w:sz w:val="21"/>
+          <w:szCs w:val="21"/>
+        </w:rPr>
+        <w:t xml:space="preserve">). L'uso si paga con i crediti dell'organizzazione della Console a cui appartiene la chiave: con un piano Claude </w:t>
+      </w:r>
+      <w:r>
+        <w:rPr>
+          <w:rFonts w:ascii="Arial" w:cs="Arial" w:eastAsia="Arial" w:hAnsi="Arial"/>
+          <w:b/>
+          <w:bCs/>
+          <w:color w:val="1B2118"/>
+          <w:sz w:val="21"/>
+          <w:szCs w:val="21"/>
+        </w:rPr>
+        <w:t xml:space="preserve">Max o Team</w:t>
+      </w:r>
+      <w:r>
+        <w:rPr>
+          <w:rFonts w:ascii="Arial" w:cs="Arial" w:eastAsia="Arial" w:hAnsi="Arial"/>
+          <w:color w:val="1B2118"/>
+          <w:sz w:val="21"/>
+          <w:szCs w:val="21"/>
+        </w:rPr>
+        <w:t xml:space="preserve"> si possono collegare i </w:t>
+      </w:r>
+      <w:r>
+        <w:rPr>
+          <w:rFonts w:ascii="Arial" w:cs="Arial" w:eastAsia="Arial" w:hAnsi="Arial"/>
+          <w:b/>
+          <w:bCs/>
+          <w:color w:val="1B2118"/>
+          <w:sz w:val="21"/>
+          <w:szCs w:val="21"/>
+        </w:rPr>
+        <w:t xml:space="preserve">crediti API mensili</w:t>
+      </w:r>
+      <w:r>
+        <w:rPr>
+          <w:rFonts w:ascii="Arial" w:cs="Arial" w:eastAsia="Arial" w:hAnsi="Arial"/>
+          <w:color w:val="1B2118"/>
+          <w:sz w:val="21"/>
+          <w:szCs w:val="21"/>
+        </w:rPr>
+        <w:t xml:space="preserve"> del piano a quell'organizzazione (Impostazioni → Fatturazione su claude.ai). Il modello predefinito è </w:t>
+      </w:r>
+      <w:r>
+        <w:rPr>
+          <w:rFonts w:ascii="Arial" w:cs="Arial" w:eastAsia="Arial" w:hAnsi="Arial"/>
+          <w:b/>
+          <w:bCs/>
+          <w:color w:val="1B2118"/>
+          <w:sz w:val="21"/>
+          <w:szCs w:val="21"/>
+        </w:rPr>
+        <w:t xml:space="preserve">Claude Haiku 5.5</w:t>
+      </w:r>
+      <w:r>
+        <w:rPr>
+          <w:rFonts w:ascii="Arial" w:cs="Arial" w:eastAsia="Arial" w:hAnsi="Arial"/>
+          <w:color w:val="1B2118"/>
+          <w:sz w:val="21"/>
+          <w:szCs w:val="21"/>
+        </w:rPr>
+        <w:t xml:space="preserve">, il più economico: la base di conoscenza si rilegge dalla cache, quindi una domanda costa di solito meno di un centesimo di dollaro.</w:t>
+      </w:r>
+    </w:p>
+    <w:p>
+      <w:pPr>
+        <w:spacing w:after="140" w:line="300"/>
+      </w:pPr>
+      <w:r>
+        <w:rPr>
+          <w:rFonts w:ascii="Arial" w:cs="Arial" w:eastAsia="Arial" w:hAnsi="Arial"/>
+          <w:b/>
+          <w:bCs/>
+          <w:color w:val="1B2118"/>
+          <w:sz w:val="21"/>
+          <w:szCs w:val="21"/>
+        </w:rPr>
+        <w:t xml:space="preserve">Aggiornare le conoscenze.</w:t>
+      </w:r>
+      <w:r>
+        <w:rPr>
+          <w:rFonts w:ascii="Arial" w:cs="Arial" w:eastAsia="Arial" w:hAnsi="Arial"/>
+          <w:color w:val="1B2118"/>
+          <w:sz w:val="21"/>
+          <w:szCs w:val="21"/>
+        </w:rPr>
+        <w:t xml:space="preserve"> Quando cambiano i manuali o le tariffe si rigenera la base di conoscenza (</w:t>
+      </w:r>
+      <w:r>
+        <w:rPr>
+          <w:rFonts w:ascii="Consolas" w:cs="Consolas" w:eastAsia="Consolas" w:hAnsi="Consolas"/>
+          <w:color w:val="2F5D3A"/>
+          <w:sz w:val="21"/>
+          <w:szCs w:val="21"/>
+        </w:rPr>
+        <w:t xml:space="preserve">node strumenti/genera_base_conoscenza.cjs</w:t>
+      </w:r>
+      <w:r>
+        <w:rPr>
+          <w:rFonts w:ascii="Arial" w:cs="Arial" w:eastAsia="Arial" w:hAnsi="Arial"/>
+          <w:color w:val="1B2118"/>
+          <w:sz w:val="21"/>
+          <w:szCs w:val="21"/>
+        </w:rPr>
+        <w:t xml:space="preserve">) e si pubblica: l'assistente la rilegge entro 10 minuti.</w:t>
+      </w:r>
+    </w:p>
+    <w:p>
+      <w:pPr>
+        <w:pStyle w:val="Heading1"/>
+        <w:pageBreakBefore/>
+        <w:pBdr>
+          <w:bottom w:val="single" w:color="2F5D3A" w:sz="12" w:space="6"/>
+        </w:pBdr>
+        <w:spacing w:after="240" w:before="0"/>
+      </w:pPr>
+      <w:bookmarkStart w:name="cap24" w:id="1"/>
+      <w:r>
+        <w:rPr>
+          <w:rFonts w:ascii="Arial" w:cs="Arial" w:eastAsia="Arial" w:hAnsi="Arial"/>
+          <w:b/>
+          <w:bCs/>
+          <w:color w:val="2F5D3A"/>
+          <w:sz w:val="34"/>
+          <w:szCs w:val="34"/>
+        </w:rPr>
+        <w:t xml:space="preserve">24. Manutenzione ed emergenze</w:t>
       </w:r>
       <w:bookmarkEnd w:id="1"/>
     </w:p>
@@ -41276,7 +41960,7 @@
         </w:pBdr>
         <w:spacing w:after="240" w:before="0"/>
       </w:pPr>
-      <w:bookmarkStart w:name="cap24" w:id="1"/>
+      <w:bookmarkStart w:name="cap25" w:id="1"/>
       <w:r>
         <w:rPr>
           <w:rFonts w:ascii="Arial" w:cs="Arial" w:eastAsia="Arial" w:hAnsi="Arial"/>
@@ -41286,7 +41970,7 @@
           <w:sz w:val="34"/>
           <w:szCs w:val="34"/>
         </w:rPr>
-        <w:t xml:space="preserve">24. Funzioni in arrivo</w:t>
+        <w:t xml:space="preserve">25. Funzioni in arrivo</w:t>
       </w:r>
       <w:bookmarkEnd w:id="1"/>
     </w:p>
@@ -41442,16 +42126,16 @@
           <w:sz w:val="21"/>
           <w:szCs w:val="21"/>
         </w:rPr>
-        <w:t xml:space="preserve">Assistente virtuale (Claude) integrato nel portale:</w:t>
-      </w:r>
-      <w:r>
-        <w:rPr>
-          <w:rFonts w:ascii="Arial" w:cs="Arial" w:eastAsia="Arial" w:hAnsi="Arial"/>
-          <w:color w:val="1B2118"/>
-          <w:sz w:val="21"/>
-          <w:szCs w:val="21"/>
-        </w:rPr>
-        <w:t xml:space="preserve"> aiuta i Comuni nella compilazione (cosa manca nella pratica, come preparare i dati) e gli Operatori nei controlli (completezza dei documenti, bozze di richieste di integrazione e di risposte, spiegazione dei risultati del calcolo). Resta un supporto: le decisioni restano alla Fondazione e ogni sua azione è registrata nell'audit.</w:t>
+        <w:t xml:space="preserve">Assistente virtuale, passi successivi:</w:t>
+      </w:r>
+      <w:r>
+        <w:rPr>
+          <w:rFonts w:ascii="Arial" w:cs="Arial" w:eastAsia="Arial" w:hAnsi="Arial"/>
+          <w:color w:val="1B2118"/>
+          <w:sz w:val="21"/>
+          <w:szCs w:val="21"/>
+        </w:rPr>
+        <w:t xml:space="preserve"> la prima versione risponde sul funzionamento del portale (capitolo «Assistente virtuale»). In arrivo: estensione agli Operatori e, con regole sulla privacy, l'aiuto sulla singola pratica (cosa manca, bozze di richieste di integrazione e di risposte, spiegazione dei risultati del calcolo). Resta un supporto: le decisioni restano alla Fondazione.</w:t>
       </w:r>
     </w:p>
     <w:sectPr>
@@ -41689,7 +42373,7 @@
         <w:szCs w:val="16"/>
       </w:rPr>
       <w:tab/>
-      <w:t xml:space="preserve">Manuale Amministratore · Rev. 3.4 · 19/10/2026</w:t>
+      <w:t xml:space="preserve">Manuale Amministratore · Rev. 3.5 · 19/10/2026</w:t>
     </w:r>
   </w:p>
 </w:hdr>
@@ -41754,7 +42438,7 @@
         <w:szCs w:val="16"/>
       </w:rPr>
       <w:tab/>
-      <w:t xml:space="preserve">Manuale Amministratore · Rev. 3.4 · 19/10/2026</w:t>
+      <w:t xml:space="preserve">Manuale Amministratore · Rev. 3.5 · 19/10/2026</w:t>
     </w:r>
   </w:p>
 </w:hdr>

</xml_diff>

<commit_message>
Assistente: messaggio d'attesa «Un attimo…»; backlog con riepilogo «Da fare subito» e punti 38-39; Manuale Utente 2.7, Amministratore 3.7, Test 3.3, Registro 4.3, Presentazione 2.3
Co-Authored-By: Claude Opus 5.5 <noreply@anthropic.com>
Claude-Session: https://claude.ai/code/session_01E8XCbEeVHWVP3hntUZ6kZ1
</commit_message>
<xml_diff>
--- a/public/documentazione/Manuale_Amministratore_Portale_CWP.docx
+++ b/public/documentazione/Manuale_Amministratore_Portale_CWP.docx
@@ -302,7 +302,7 @@
                 <w:sz w:val="20"/>
                 <w:szCs w:val="20"/>
               </w:rPr>
-              <w:t xml:space="preserve">Rev. 3.6</w:t>
+              <w:t xml:space="preserve">Rev. 3.7</w:t>
             </w:r>
           </w:p>
         </w:tc>
@@ -719,7 +719,7 @@
                 <w:sz w:val="18"/>
                 <w:szCs w:val="18"/>
               </w:rPr>
-              <w:t xml:space="preserve">3.6</w:t>
+              <w:t xml:space="preserve">3.7</w:t>
             </w:r>
           </w:p>
         </w:tc>
@@ -783,7 +783,7 @@
                 <w:sz w:val="18"/>
                 <w:szCs w:val="18"/>
               </w:rPr>
-              <w:t xml:space="preserve">Assistente virtuale attivo: chiave legata a uno spazio di lavoro, crediti e consumi.</w:t>
+              <w:t xml:space="preserve">Assistente virtuale: messaggio «Un attimo…» durante l'attesa.</w:t>
             </w:r>
           </w:p>
         </w:tc>
@@ -853,7 +853,7 @@
                 <w:sz w:val="18"/>
                 <w:szCs w:val="18"/>
               </w:rPr>
-              <w:t xml:space="preserve">3.5</w:t>
+              <w:t xml:space="preserve">3.6</w:t>
             </w:r>
           </w:p>
         </w:tc>
@@ -919,7 +919,7 @@
                 <w:sz w:val="18"/>
                 <w:szCs w:val="18"/>
               </w:rPr>
-              <w:t xml:space="preserve">Assistente virtuale; documenti ufficiali del Programma nella Documentazione.</w:t>
+              <w:t xml:space="preserve">Assistente virtuale attivo: chiave legata a uno spazio di lavoro, crediti e consumi.</w:t>
             </w:r>
           </w:p>
         </w:tc>
@@ -989,7 +989,7 @@
                 <w:sz w:val="18"/>
                 <w:szCs w:val="18"/>
               </w:rPr>
-              <w:t xml:space="preserve">3.4</w:t>
+              <w:t xml:space="preserve">3.5</w:t>
             </w:r>
           </w:p>
         </w:tc>
@@ -1053,7 +1053,7 @@
                 <w:sz w:val="18"/>
                 <w:szCs w:val="18"/>
               </w:rPr>
-              <w:t xml:space="preserve">Presentazione di riepilogo nella pagina Documentazione.</w:t>
+              <w:t xml:space="preserve">Assistente virtuale; documenti ufficiali del Programma nella Documentazione.</w:t>
             </w:r>
           </w:p>
         </w:tc>
@@ -1123,7 +1123,7 @@
                 <w:sz w:val="18"/>
                 <w:szCs w:val="18"/>
               </w:rPr>
-              <w:t xml:space="preserve">3.3</w:t>
+              <w:t xml:space="preserve">3.4</w:t>
             </w:r>
           </w:p>
         </w:tc>
@@ -1189,7 +1189,7 @@
                 <w:sz w:val="18"/>
                 <w:szCs w:val="18"/>
               </w:rPr>
-              <w:t xml:space="preserve">Ordinamento di tutte le tabelle e degli elenchi.</w:t>
+              <w:t xml:space="preserve">Presentazione di riepilogo nella pagina Documentazione.</w:t>
             </w:r>
           </w:p>
         </w:tc>
@@ -1259,7 +1259,7 @@
                 <w:sz w:val="18"/>
                 <w:szCs w:val="18"/>
               </w:rPr>
-              <w:t xml:space="preserve">3.2</w:t>
+              <w:t xml:space="preserve">3.3</w:t>
             </w:r>
           </w:p>
         </w:tc>
@@ -1323,7 +1323,7 @@
                 <w:sz w:val="18"/>
                 <w:szCs w:val="18"/>
               </w:rPr>
-              <w:t xml:space="preserve">Simulatore: metodo di stima per utenza (solo utenze virtuose), buffer del Capitolo 7, taratura.</w:t>
+              <w:t xml:space="preserve">Ordinamento di tutte le tabelle e degli elenchi.</w:t>
             </w:r>
           </w:p>
         </w:tc>
@@ -1393,7 +1393,7 @@
                 <w:sz w:val="18"/>
                 <w:szCs w:val="18"/>
               </w:rPr>
-              <w:t xml:space="preserve">3.1</w:t>
+              <w:t xml:space="preserve">3.2</w:t>
             </w:r>
           </w:p>
         </w:tc>
@@ -1459,7 +1459,7 @@
                 <w:sz w:val="18"/>
                 <w:szCs w:val="18"/>
               </w:rPr>
-              <w:t xml:space="preserve">Cruscotto diventa Dashboard; barra a LED delle 7 fasi per ogni pratica.</w:t>
+              <w:t xml:space="preserve">Simulatore: metodo di stima per utenza (solo utenze virtuose), buffer del Capitolo 7, taratura.</w:t>
             </w:r>
           </w:p>
         </w:tc>
@@ -1529,7 +1529,7 @@
                 <w:sz w:val="18"/>
                 <w:szCs w:val="18"/>
               </w:rPr>
-              <w:t xml:space="preserve">3.0</w:t>
+              <w:t xml:space="preserve">3.1</w:t>
             </w:r>
           </w:p>
         </w:tc>
@@ -1593,7 +1593,7 @@
                 <w:sz w:val="18"/>
                 <w:szCs w:val="18"/>
               </w:rPr>
-              <w:t xml:space="preserve">Eliminazione degli utenti che non hanno mai operato (script 30).</w:t>
+              <w:t xml:space="preserve">Cruscotto diventa Dashboard; barra a LED delle 7 fasi per ogni pratica.</w:t>
             </w:r>
           </w:p>
         </w:tc>
@@ -1663,7 +1663,7 @@
                 <w:sz w:val="18"/>
                 <w:szCs w:val="18"/>
               </w:rPr>
-              <w:t xml:space="preserve">2.9</w:t>
+              <w:t xml:space="preserve">3.0</w:t>
             </w:r>
           </w:p>
         </w:tc>
@@ -1729,7 +1729,7 @@
                 <w:sz w:val="18"/>
                 <w:szCs w:val="18"/>
               </w:rPr>
-              <w:t xml:space="preserve">Email automatica con le credenziali al nuovo utente e alla reimpostazione della password.</w:t>
+              <w:t xml:space="preserve">Eliminazione degli utenti che non hanno mai operato (script 30).</w:t>
             </w:r>
           </w:p>
         </w:tc>
@@ -1799,7 +1799,7 @@
                 <w:sz w:val="18"/>
                 <w:szCs w:val="18"/>
               </w:rPr>
-              <w:t xml:space="preserve">2.8</w:t>
+              <w:t xml:space="preserve">2.9</w:t>
             </w:r>
           </w:p>
         </w:tc>
@@ -1863,7 +1863,7 @@
                 <w:sz w:val="18"/>
                 <w:szCs w:val="18"/>
               </w:rPr>
-              <w:t xml:space="preserve">Più Amministratori con accesso completo; Amministratore principale protetto (script 29).</w:t>
+              <w:t xml:space="preserve">Email automatica con le credenziali al nuovo utente e alla reimpostazione della password.</w:t>
             </w:r>
           </w:p>
         </w:tc>
@@ -1933,7 +1933,7 @@
                 <w:sz w:val="18"/>
                 <w:szCs w:val="18"/>
               </w:rPr>
-              <w:t xml:space="preserve">2.7</w:t>
+              <w:t xml:space="preserve">2.8</w:t>
             </w:r>
           </w:p>
         </w:tc>
@@ -1999,7 +1999,7 @@
                 <w:sz w:val="18"/>
                 <w:szCs w:val="18"/>
               </w:rPr>
-              <w:t xml:space="preserve">Simulatore: costi per il Comune secondo il Caso 1 (progetto volontario) o il Caso 2 (progetto obbligatorio da bando).</w:t>
+              <w:t xml:space="preserve">Più Amministratori con accesso completo; Amministratore principale protetto (script 29).</w:t>
             </w:r>
           </w:p>
         </w:tc>
@@ -2069,7 +2069,7 @@
                 <w:sz w:val="18"/>
                 <w:szCs w:val="18"/>
               </w:rPr>
-              <w:t xml:space="preserve">2.6</w:t>
+              <w:t xml:space="preserve">2.7</w:t>
             </w:r>
           </w:p>
         </w:tc>
@@ -2133,7 +2133,7 @@
                 <w:sz w:val="18"/>
                 <w:szCs w:val="18"/>
               </w:rPr>
-              <w:t xml:space="preserve">Simulatore: valore del credito anno per anno, proposto 32 €.</w:t>
+              <w:t xml:space="preserve">Simulatore: costi per il Comune secondo il Caso 1 (progetto volontario) o il Caso 2 (progetto obbligatorio da bando).</w:t>
             </w:r>
           </w:p>
         </w:tc>
@@ -2203,7 +2203,7 @@
                 <w:sz w:val="18"/>
                 <w:szCs w:val="18"/>
               </w:rPr>
-              <w:t xml:space="preserve">2.5</w:t>
+              <w:t xml:space="preserve">2.6</w:t>
             </w:r>
           </w:p>
         </w:tc>
@@ -2269,7 +2269,7 @@
                 <w:sz w:val="18"/>
                 <w:szCs w:val="18"/>
               </w:rPr>
-              <w:t xml:space="preserve">Simulatore: simulazione economica con valore unitario del credito e costi per il Comune (contratti tipo della Fondazione, Schema tariffario).</w:t>
+              <w:t xml:space="preserve">Simulatore: valore del credito anno per anno, proposto 32 €.</w:t>
             </w:r>
           </w:p>
         </w:tc>
@@ -2339,7 +2339,7 @@
                 <w:sz w:val="18"/>
                 <w:szCs w:val="18"/>
               </w:rPr>
-              <w:t xml:space="preserve">2.4</w:t>
+              <w:t xml:space="preserve">2.5</w:t>
             </w:r>
           </w:p>
         </w:tc>
@@ -2403,7 +2403,7 @@
                 <w:sz w:val="18"/>
                 <w:szCs w:val="18"/>
               </w:rPr>
-              <w:t xml:space="preserve">Simulatore: riferimento sempre alla soglia del 65% di differenziata e controllo dei valori fuori scala.</w:t>
+              <w:t xml:space="preserve">Simulatore: simulazione economica con valore unitario del credito e costi per il Comune (contratti tipo della Fondazione, Schema tariffario).</w:t>
             </w:r>
           </w:p>
         </w:tc>
@@ -2473,7 +2473,7 @@
                 <w:sz w:val="18"/>
                 <w:szCs w:val="18"/>
               </w:rPr>
-              <w:t xml:space="preserve">2.3</w:t>
+              <w:t xml:space="preserve">2.4</w:t>
             </w:r>
           </w:p>
         </w:tc>
@@ -2539,7 +2539,7 @@
                 <w:sz w:val="18"/>
                 <w:szCs w:val="18"/>
               </w:rPr>
-              <w:t xml:space="preserve">Simulatore conforme al modello CWP: scenario di riferimento dello Standard 4.8.1, situazione attuale, conformità.</w:t>
+              <w:t xml:space="preserve">Simulatore: riferimento sempre alla soglia del 65% di differenziata e controllo dei valori fuori scala.</w:t>
             </w:r>
           </w:p>
         </w:tc>
@@ -2609,7 +2609,7 @@
                 <w:sz w:val="18"/>
                 <w:szCs w:val="18"/>
               </w:rPr>
-              <w:t xml:space="preserve">2.2</w:t>
+              <w:t xml:space="preserve">2.3</w:t>
             </w:r>
           </w:p>
         </w:tc>
@@ -2673,7 +2673,7 @@
                 <w:sz w:val="18"/>
                 <w:szCs w:val="18"/>
               </w:rPr>
-              <w:t xml:space="preserve">Nuovo capitolo «Simulatore di scenari»: creazione, anno base, obiettivi annui, risultati, modello di stima.</w:t>
+              <w:t xml:space="preserve">Simulatore conforme al modello CWP: scenario di riferimento dello Standard 4.8.1, situazione attuale, conformità.</w:t>
             </w:r>
           </w:p>
         </w:tc>
@@ -2743,7 +2743,7 @@
                 <w:sz w:val="18"/>
                 <w:szCs w:val="18"/>
               </w:rPr>
-              <w:t xml:space="preserve">2.1</w:t>
+              <w:t xml:space="preserve">2.2</w:t>
             </w:r>
           </w:p>
         </w:tc>
@@ -2809,7 +2809,7 @@
                 <w:sz w:val="18"/>
                 <w:szCs w:val="18"/>
               </w:rPr>
-              <w:t xml:space="preserve">Funzioni in arrivo: simulatore di scenari (7, 10 o 21 anni, obiettivi annui, % di differenziata e crediti stimati) e assistente virtuale (Claude).</w:t>
+              <w:t xml:space="preserve">Nuovo capitolo «Simulatore di scenari»: creazione, anno base, obiettivi annui, risultati, modello di stima.</w:t>
             </w:r>
           </w:p>
         </w:tc>
@@ -2879,7 +2879,7 @@
                 <w:sz w:val="18"/>
                 <w:szCs w:val="18"/>
               </w:rPr>
-              <w:t xml:space="preserve">2.0</w:t>
+              <w:t xml:space="preserve">2.1</w:t>
             </w:r>
           </w:p>
         </w:tc>
@@ -2943,7 +2943,7 @@
                 <w:sz w:val="18"/>
                 <w:szCs w:val="18"/>
               </w:rPr>
-              <w:t xml:space="preserve">Copie di sicurezza e ripristino: rimando alle Istruzioni di ripristino e punti essenziali (capitolo Manutenzione ed emergenze).</w:t>
+              <w:t xml:space="preserve">Funzioni in arrivo: simulatore di scenari (7, 10 o 21 anni, obiettivi annui, % di differenziata e crediti stimati) e assistente virtuale (Claude).</w:t>
             </w:r>
           </w:p>
         </w:tc>
@@ -3013,7 +3013,7 @@
                 <w:sz w:val="18"/>
                 <w:szCs w:val="18"/>
               </w:rPr>
-              <w:t xml:space="preserve">1.9</w:t>
+              <w:t xml:space="preserve">2.0</w:t>
             </w:r>
           </w:p>
         </w:tc>
@@ -3079,7 +3079,7 @@
                 <w:sz w:val="18"/>
                 <w:szCs w:val="18"/>
               </w:rPr>
-              <w:t xml:space="preserve">Fondazione Operate soggetto promotore del programma (esclusiva conferita da Wastelab).</w:t>
+              <w:t xml:space="preserve">Copie di sicurezza e ripristino: rimando alle Istruzioni di ripristino e punti essenziali (capitolo Manutenzione ed emergenze).</w:t>
             </w:r>
           </w:p>
         </w:tc>
@@ -3149,7 +3149,7 @@
                 <w:sz w:val="18"/>
                 <w:szCs w:val="18"/>
               </w:rPr>
-              <w:t xml:space="preserve">1.8</w:t>
+              <w:t xml:space="preserve">1.9</w:t>
             </w:r>
           </w:p>
         </w:tc>
@@ -3213,7 +3213,7 @@
                 <w:sz w:val="18"/>
                 <w:szCs w:val="18"/>
               </w:rPr>
-              <w:t xml:space="preserve">PEC del Programma e documenti ufficiali già pubblicati sulla pagina pubblica.</w:t>
+              <w:t xml:space="preserve">Fondazione Operate soggetto promotore del programma (esclusiva conferita da Wastelab).</w:t>
             </w:r>
           </w:p>
         </w:tc>
@@ -3283,7 +3283,7 @@
                 <w:sz w:val="18"/>
                 <w:szCs w:val="18"/>
               </w:rPr>
-              <w:t xml:space="preserve">1.7</w:t>
+              <w:t xml:space="preserve">1.8</w:t>
             </w:r>
           </w:p>
         </w:tc>
@@ -3316,7 +3316,7 @@
                 <w:sz w:val="18"/>
                 <w:szCs w:val="18"/>
               </w:rPr>
-              <w:t xml:space="preserve">18/10/2026</w:t>
+              <w:t xml:space="preserve">19/10/2026</w:t>
             </w:r>
           </w:p>
         </w:tc>
@@ -3349,7 +3349,7 @@
                 <w:sz w:val="18"/>
                 <w:szCs w:val="18"/>
               </w:rPr>
-              <w:t xml:space="preserve">Allineamento ai documenti ufficiali del Programma (script 22-24): Rapporto a 7 fasi, feedback pubblico, stati del Programma, dati del progetto e territorio ISTAT, ritiro e rientro, account unico e delegati, registri, tariffe e sospensione, accuratezza e accertamenti, informazioni del Programma e metodologie, modelli pubblici; nuovi capitoli Crediti emessi, Reclami, Pagina pubblica; qualità dei dati nel calcolo.</w:t>
+              <w:t xml:space="preserve">PEC del Programma e documenti ufficiali già pubblicati sulla pagina pubblica.</w:t>
             </w:r>
           </w:p>
         </w:tc>
@@ -3419,7 +3419,7 @@
                 <w:sz w:val="18"/>
                 <w:szCs w:val="18"/>
               </w:rPr>
-              <w:t xml:space="preserve">1.6</w:t>
+              <w:t xml:space="preserve">1.7</w:t>
             </w:r>
           </w:p>
         </w:tc>
@@ -3483,7 +3483,7 @@
                 <w:sz w:val="18"/>
                 <w:szCs w:val="18"/>
               </w:rPr>
-              <w:t xml:space="preserve">Calcolo crediti: descrizione corretta del buffer (somma delle voci delle Tabelle 15 e 16, più il 20% con le sole utenze virtuose, al massimo 80%).</w:t>
+              <w:t xml:space="preserve">Allineamento ai documenti ufficiali del Programma (script 22-24): Rapporto a 7 fasi, feedback pubblico, stati del Programma, dati del progetto e territorio ISTAT, ritiro e rientro, account unico e delegati, registri, tariffe e sospensione, accuratezza e accertamenti, informazioni del Programma e metodologie, modelli pubblici; nuovi capitoli Crediti emessi, Reclami, Pagina pubblica; qualità dei dati nel calcolo.</w:t>
             </w:r>
           </w:p>
         </w:tc>
@@ -3553,7 +3553,7 @@
                 <w:sz w:val="18"/>
                 <w:szCs w:val="18"/>
               </w:rPr>
-              <w:t xml:space="preserve">1.5</w:t>
+              <w:t xml:space="preserve">1.6</w:t>
             </w:r>
           </w:p>
         </w:tc>
@@ -3619,7 +3619,7 @@
                 <w:sz w:val="18"/>
                 <w:szCs w:val="18"/>
               </w:rPr>
-              <w:t xml:space="preserve">Nuova pagina Anagrafiche (Organizzazioni ed Enti, anche per gli Operatori); Rapporti con 4 fasi e durate proprie; documenti richiesti per fase; consultazione con documento bloccato, osservazioni numerate e motivazione; conservazione per 10 anni; fascicolo con riepilogo PDF e nuove cartelle.</w:t>
+              <w:t xml:space="preserve">Calcolo crediti: descrizione corretta del buffer (somma delle voci delle Tabelle 15 e 16, più il 20% con le sole utenze virtuose, al massimo 80%).</w:t>
             </w:r>
           </w:p>
         </w:tc>
@@ -3689,7 +3689,7 @@
                 <w:sz w:val="18"/>
                 <w:szCs w:val="18"/>
               </w:rPr>
-              <w:t xml:space="preserve">1.4</w:t>
+              <w:t xml:space="preserve">1.5</w:t>
             </w:r>
           </w:p>
         </w:tc>
@@ -3753,7 +3753,7 @@
                 <w:sz w:val="18"/>
                 <w:szCs w:val="18"/>
               </w:rPr>
-              <w:t xml:space="preserve">Calcolo crediti: il risultato si azzera quando cambiano dati o Banca Dati Utenze, conferma solo dopo un nuovo «Calcola». Gestione utenti: password temporanea di almeno 10 caratteri con lettere e numeri, creazione annullata se non va a buon fine, nessun accesso ai dati prima del cambio password.</w:t>
+              <w:t xml:space="preserve">Nuova pagina Anagrafiche (Organizzazioni ed Enti, anche per gli Operatori); Rapporti con 4 fasi e durate proprie; documenti richiesti per fase; consultazione con documento bloccato, osservazioni numerate e motivazione; conservazione per 10 anni; fascicolo con riepilogo PDF e nuove cartelle.</w:t>
             </w:r>
           </w:p>
         </w:tc>
@@ -3823,7 +3823,7 @@
                 <w:sz w:val="18"/>
                 <w:szCs w:val="18"/>
               </w:rPr>
-              <w:t xml:space="preserve">1.3</w:t>
+              <w:t xml:space="preserve">1.4</w:t>
             </w:r>
           </w:p>
         </w:tc>
@@ -3889,7 +3889,7 @@
                 <w:sz w:val="18"/>
                 <w:szCs w:val="18"/>
               </w:rPr>
-              <w:t xml:space="preserve">Rapporto di calcolo in PDF, archiviazione nella pratica, numero di registro, registro dei crediti.</w:t>
+              <w:t xml:space="preserve">Calcolo crediti: il risultato si azzera quando cambiano dati o Banca Dati Utenze, conferma solo dopo un nuovo «Calcola». Gestione utenti: password temporanea di almeno 10 caratteri con lettere e numeri, creazione annullata se non va a buon fine, nessun accesso ai dati prima del cambio password.</w:t>
             </w:r>
           </w:p>
         </w:tc>
@@ -3959,7 +3959,7 @@
                 <w:sz w:val="18"/>
                 <w:szCs w:val="18"/>
               </w:rPr>
-              <w:t xml:space="preserve">1.2</w:t>
+              <w:t xml:space="preserve">1.3</w:t>
             </w:r>
           </w:p>
         </w:tc>
@@ -4023,7 +4023,7 @@
                 <w:sz w:val="18"/>
                 <w:szCs w:val="18"/>
               </w:rPr>
-              <w:t xml:space="preserve">Calcolo crediti: importare il tracciato nel calcolo (dai documenti della pratica o dal computer), singole letture, blocco dei dati personali, controlli di coerenza.</w:t>
+              <w:t xml:space="preserve">Rapporto di calcolo in PDF, archiviazione nella pratica, numero di registro, registro dei crediti.</w:t>
             </w:r>
           </w:p>
         </w:tc>
@@ -4093,7 +4093,7 @@
                 <w:sz w:val="18"/>
                 <w:szCs w:val="18"/>
               </w:rPr>
-              <w:t xml:space="preserve">1.1</w:t>
+              <w:t xml:space="preserve">1.2</w:t>
             </w:r>
           </w:p>
         </w:tc>
@@ -4159,7 +4159,7 @@
                 <w:sz w:val="18"/>
                 <w:szCs w:val="18"/>
               </w:rPr>
-              <w:t xml:space="preserve">Note di fase, Ente di Validazione della pratica, consultazione sulla pagina pubblica con conferma dell'email, moderazione con autori e allegati, errata corrige; nuovo capitolo Messaggi con il Comune; pagamenti visibili al Comune; Impostazioni: Enti di Validazione e Modelli di documento; notifiche aggiornate.</w:t>
+              <w:t xml:space="preserve">Calcolo crediti: importare il tracciato nel calcolo (dai documenti della pratica o dal computer), singole letture, blocco dei dati personali, controlli di coerenza.</w:t>
             </w:r>
           </w:p>
         </w:tc>
@@ -4229,6 +4229,140 @@
                 <w:sz w:val="18"/>
                 <w:szCs w:val="18"/>
               </w:rPr>
+              <w:t xml:space="preserve">1.1</w:t>
+            </w:r>
+          </w:p>
+        </w:tc>
+        <w:tc>
+          <w:tcPr>
+            <w:tcW w:type="dxa" w:w="1300"/>
+            <w:tcBorders>
+              <w:top w:val="single" w:color="D9D4C5" w:sz="4"/>
+              <w:left w:val="single" w:color="D9D4C5" w:sz="4"/>
+              <w:bottom w:val="single" w:color="D9D4C5" w:sz="4"/>
+              <w:right w:val="single" w:color="D9D4C5" w:sz="4"/>
+            </w:tcBorders>
+            <w:tcMar>
+              <w:top w:type="dxa" w:w="70"/>
+              <w:left w:type="dxa" w:w="110"/>
+              <w:bottom w:type="dxa" w:w="70"/>
+              <w:right w:type="dxa" w:w="110"/>
+            </w:tcMar>
+            <w:vAlign w:val="center"/>
+          </w:tcPr>
+          <w:p>
+            <w:pPr>
+              <w:spacing w:after="0" w:before="0"/>
+            </w:pPr>
+            <w:r>
+              <w:rPr>
+                <w:rFonts w:ascii="Arial" w:cs="Arial" w:eastAsia="Arial" w:hAnsi="Arial"/>
+                <w:color w:val="1B2118"/>
+                <w:sz w:val="18"/>
+                <w:szCs w:val="18"/>
+              </w:rPr>
+              <w:t xml:space="preserve">18/10/2026</w:t>
+            </w:r>
+          </w:p>
+        </w:tc>
+        <w:tc>
+          <w:tcPr>
+            <w:tcW w:type="dxa" w:w="5538"/>
+            <w:tcBorders>
+              <w:top w:val="single" w:color="D9D4C5" w:sz="4"/>
+              <w:left w:val="single" w:color="D9D4C5" w:sz="4"/>
+              <w:bottom w:val="single" w:color="D9D4C5" w:sz="4"/>
+              <w:right w:val="single" w:color="D9D4C5" w:sz="4"/>
+            </w:tcBorders>
+            <w:tcMar>
+              <w:top w:type="dxa" w:w="70"/>
+              <w:left w:type="dxa" w:w="110"/>
+              <w:bottom w:type="dxa" w:w="70"/>
+              <w:right w:type="dxa" w:w="110"/>
+            </w:tcMar>
+            <w:vAlign w:val="center"/>
+          </w:tcPr>
+          <w:p>
+            <w:pPr>
+              <w:spacing w:after="0" w:before="0"/>
+            </w:pPr>
+            <w:r>
+              <w:rPr>
+                <w:rFonts w:ascii="Arial" w:cs="Arial" w:eastAsia="Arial" w:hAnsi="Arial"/>
+                <w:color w:val="1B2118"/>
+                <w:sz w:val="18"/>
+                <w:szCs w:val="18"/>
+              </w:rPr>
+              <w:t xml:space="preserve">Note di fase, Ente di Validazione della pratica, consultazione sulla pagina pubblica con conferma dell'email, moderazione con autori e allegati, errata corrige; nuovo capitolo Messaggi con il Comune; pagamenti visibili al Comune; Impostazioni: Enti di Validazione e Modelli di documento; notifiche aggiornate.</w:t>
+            </w:r>
+          </w:p>
+        </w:tc>
+        <w:tc>
+          <w:tcPr>
+            <w:tcW w:type="dxa" w:w="2000"/>
+            <w:tcBorders>
+              <w:top w:val="single" w:color="D9D4C5" w:sz="4"/>
+              <w:left w:val="single" w:color="D9D4C5" w:sz="4"/>
+              <w:bottom w:val="single" w:color="D9D4C5" w:sz="4"/>
+              <w:right w:val="single" w:color="D9D4C5" w:sz="4"/>
+            </w:tcBorders>
+            <w:tcMar>
+              <w:top w:type="dxa" w:w="70"/>
+              <w:left w:type="dxa" w:w="110"/>
+              <w:bottom w:type="dxa" w:w="70"/>
+              <w:right w:type="dxa" w:w="110"/>
+            </w:tcMar>
+            <w:vAlign w:val="center"/>
+          </w:tcPr>
+          <w:p>
+            <w:pPr>
+              <w:spacing w:after="0" w:before="0"/>
+            </w:pPr>
+            <w:r>
+              <w:rPr>
+                <w:rFonts w:ascii="Arial" w:cs="Arial" w:eastAsia="Arial" w:hAnsi="Arial"/>
+                <w:color w:val="1B2118"/>
+                <w:sz w:val="18"/>
+                <w:szCs w:val="18"/>
+              </w:rPr>
+              <w:t xml:space="preserve">Fondazione Operate</w:t>
+            </w:r>
+          </w:p>
+        </w:tc>
+      </w:tr>
+      <w:tr>
+        <w:trPr>
+          <w:cantSplit/>
+        </w:trPr>
+        <w:tc>
+          <w:tcPr>
+            <w:tcW w:type="dxa" w:w="800"/>
+            <w:tcBorders>
+              <w:top w:val="single" w:color="D9D4C5" w:sz="4"/>
+              <w:left w:val="single" w:color="D9D4C5" w:sz="4"/>
+              <w:bottom w:val="single" w:color="D9D4C5" w:sz="4"/>
+              <w:right w:val="single" w:color="D9D4C5" w:sz="4"/>
+            </w:tcBorders>
+            <w:shd w:fill="F6F4EE" w:color="auto" w:val="clear"/>
+            <w:tcMar>
+              <w:top w:type="dxa" w:w="70"/>
+              <w:left w:type="dxa" w:w="110"/>
+              <w:bottom w:type="dxa" w:w="70"/>
+              <w:right w:type="dxa" w:w="110"/>
+            </w:tcMar>
+            <w:vAlign w:val="center"/>
+          </w:tcPr>
+          <w:p>
+            <w:pPr>
+              <w:spacing w:after="0" w:before="0"/>
+            </w:pPr>
+            <w:r>
+              <w:rPr>
+                <w:rFonts w:ascii="Arial" w:cs="Arial" w:eastAsia="Arial" w:hAnsi="Arial"/>
+                <w:color w:val="1B2118"/>
+                <w:sz w:val="18"/>
+                <w:szCs w:val="18"/>
+              </w:rPr>
               <w:t xml:space="preserve">1.0</w:t>
             </w:r>
           </w:p>
@@ -4242,6 +4376,7 @@
               <w:bottom w:val="single" w:color="D9D4C5" w:sz="4"/>
               <w:right w:val="single" w:color="D9D4C5" w:sz="4"/>
             </w:tcBorders>
+            <w:shd w:fill="F6F4EE" w:color="auto" w:val="clear"/>
             <w:tcMar>
               <w:top w:type="dxa" w:w="70"/>
               <w:left w:type="dxa" w:w="110"/>
@@ -4274,6 +4409,7 @@
               <w:bottom w:val="single" w:color="D9D4C5" w:sz="4"/>
               <w:right w:val="single" w:color="D9D4C5" w:sz="4"/>
             </w:tcBorders>
+            <w:shd w:fill="F6F4EE" w:color="auto" w:val="clear"/>
             <w:tcMar>
               <w:top w:type="dxa" w:w="70"/>
               <w:left w:type="dxa" w:w="110"/>
@@ -4306,6 +4442,7 @@
               <w:bottom w:val="single" w:color="D9D4C5" w:sz="4"/>
               <w:right w:val="single" w:color="D9D4C5" w:sz="4"/>
             </w:tcBorders>
+            <w:shd w:fill="F6F4EE" w:color="auto" w:val="clear"/>
             <w:tcMar>
               <w:top w:type="dxa" w:w="70"/>
               <w:left w:type="dxa" w:w="110"/>
@@ -4347,7 +4484,7 @@
           <w:sz w:val="20"/>
           <w:szCs w:val="20"/>
         </w:rPr>
-        <w:t xml:space="preserve">Questo documento descrive il portale alla revisione 3.6 del 19/10/2026. A ogni modifica del portale il manuale viene aggiornato e la revisione incrementata; la versione corrente si scarica dall'area Documentazione del portale (solo Amministratori).</w:t>
+        <w:t xml:space="preserve">Questo documento descrive il portale alla revisione 3.7 del 19/10/2026. A ogni modifica del portale il manuale viene aggiornato e la revisione incrementata; la versione corrente si scarica dall'area Documentazione del portale (solo Amministratori).</w:t>
       </w:r>
     </w:p>
     <w:p>
@@ -7040,7 +7177,7 @@
         </w:rPr>
         <w:t xml:space="preserve">Si accede da </w:t>
       </w:r>
-      <w:hyperlink w:history="1" r:id="rIdkmp3npyemmosjf_59lpaz">
+      <w:hyperlink w:history="1" r:id="rId5hsfauebjjwaddkmixqbf">
         <w:r>
           <w:rPr>
             <w:rFonts w:ascii="Arial" w:cs="Arial" w:eastAsia="Arial" w:hAnsi="Arial"/>
@@ -40717,7 +40854,7 @@
           <w:sz w:val="21"/>
           <w:szCs w:val="21"/>
         </w:rPr>
-        <w:t xml:space="preserve">; </w:t>
+        <w:t xml:space="preserve">; mentre l'assistente prepara la risposta compare «Un attimo…» (di solito pochi secondi); </w:t>
       </w:r>
       <w:r>
         <w:rPr>
@@ -42546,7 +42683,7 @@
         <w:szCs w:val="16"/>
       </w:rPr>
       <w:tab/>
-      <w:t xml:space="preserve">Manuale Amministratore · Rev. 3.6 · 19/10/2026</w:t>
+      <w:t xml:space="preserve">Manuale Amministratore · Rev. 3.7 · 19/10/2026</w:t>
     </w:r>
   </w:p>
 </w:hdr>
@@ -42611,7 +42748,7 @@
         <w:szCs w:val="16"/>
       </w:rPr>
       <w:tab/>
-      <w:t xml:space="preserve">Manuale Amministratore · Rev. 3.6 · 19/10/2026</w:t>
+      <w:t xml:space="preserve">Manuale Amministratore · Rev. 3.7 · 19/10/2026</w:t>
     </w:r>
   </w:p>
 </w:hdr>

</xml_diff>

<commit_message>
Menu degli Amministratori riordinato, sezione rinominata «Audit User», voce «Marketplaces» in arrivo (grigia) per Amministratori ed enti; Registro 4.8, Manuale Utente 3.0, Amministratore 4.0, Test 3.6, Presentazione 2.6
Co-Authored-By: Claude Opus 5.5 <noreply@anthropic.com>
Claude-Session: https://claude.ai/code/session_01E8XCbEeVHWVP3hntUZ6kZ1
</commit_message>
<xml_diff>
--- a/public/documentazione/Manuale_Amministratore_Portale_CWP.docx
+++ b/public/documentazione/Manuale_Amministratore_Portale_CWP.docx
@@ -302,7 +302,7 @@
                 <w:sz w:val="20"/>
                 <w:szCs w:val="20"/>
               </w:rPr>
-              <w:t xml:space="preserve">Rev. 3.9</w:t>
+              <w:t xml:space="preserve">Rev. 4.0</w:t>
             </w:r>
           </w:p>
         </w:tc>
@@ -719,7 +719,7 @@
                 <w:sz w:val="18"/>
                 <w:szCs w:val="18"/>
               </w:rPr>
-              <w:t xml:space="preserve">3.9</w:t>
+              <w:t xml:space="preserve">4.0</w:t>
             </w:r>
           </w:p>
         </w:tc>
@@ -783,7 +783,7 @@
                 <w:sz w:val="18"/>
                 <w:szCs w:val="18"/>
               </w:rPr>
-              <w:t xml:space="preserve">Nuovo capitolo «Audit trail user».</w:t>
+              <w:t xml:space="preserve">Nuovo ordine del menu; la sezione si chiama «Audit User». Voce «Marketplaces» in arrivo.</w:t>
             </w:r>
           </w:p>
         </w:tc>
@@ -853,7 +853,7 @@
                 <w:sz w:val="18"/>
                 <w:szCs w:val="18"/>
               </w:rPr>
-              <w:t xml:space="preserve">3.8</w:t>
+              <w:t xml:space="preserve">3.9</w:t>
             </w:r>
           </w:p>
         </w:tc>
@@ -919,7 +919,7 @@
                 <w:sz w:val="18"/>
                 <w:szCs w:val="18"/>
               </w:rPr>
-              <w:t xml:space="preserve">Utenti online; PDF ed Excel del simulatore; messaggi d'errore dell'assistente.</w:t>
+              <w:t xml:space="preserve">Nuovo capitolo «Audit trail user».</w:t>
             </w:r>
           </w:p>
         </w:tc>
@@ -989,7 +989,7 @@
                 <w:sz w:val="18"/>
                 <w:szCs w:val="18"/>
               </w:rPr>
-              <w:t xml:space="preserve">3.7</w:t>
+              <w:t xml:space="preserve">3.8</w:t>
             </w:r>
           </w:p>
         </w:tc>
@@ -1021,7 +1021,7 @@
                 <w:sz w:val="18"/>
                 <w:szCs w:val="18"/>
               </w:rPr>
-              <w:t xml:space="preserve">19/10/2026</w:t>
+              <w:t xml:space="preserve">20/10/2026</w:t>
             </w:r>
           </w:p>
         </w:tc>
@@ -1053,7 +1053,7 @@
                 <w:sz w:val="18"/>
                 <w:szCs w:val="18"/>
               </w:rPr>
-              <w:t xml:space="preserve">Assistente virtuale: messaggio «Un attimo…» durante l'attesa.</w:t>
+              <w:t xml:space="preserve">Utenti online; PDF ed Excel del simulatore; messaggi d'errore dell'assistente.</w:t>
             </w:r>
           </w:p>
         </w:tc>
@@ -1123,7 +1123,7 @@
                 <w:sz w:val="18"/>
                 <w:szCs w:val="18"/>
               </w:rPr>
-              <w:t xml:space="preserve">3.6</w:t>
+              <w:t xml:space="preserve">3.7</w:t>
             </w:r>
           </w:p>
         </w:tc>
@@ -1189,7 +1189,7 @@
                 <w:sz w:val="18"/>
                 <w:szCs w:val="18"/>
               </w:rPr>
-              <w:t xml:space="preserve">Assistente virtuale attivo: chiave legata a uno spazio di lavoro, crediti e consumi.</w:t>
+              <w:t xml:space="preserve">Assistente virtuale: messaggio «Un attimo…» durante l'attesa.</w:t>
             </w:r>
           </w:p>
         </w:tc>
@@ -1259,7 +1259,7 @@
                 <w:sz w:val="18"/>
                 <w:szCs w:val="18"/>
               </w:rPr>
-              <w:t xml:space="preserve">3.5</w:t>
+              <w:t xml:space="preserve">3.6</w:t>
             </w:r>
           </w:p>
         </w:tc>
@@ -1323,7 +1323,7 @@
                 <w:sz w:val="18"/>
                 <w:szCs w:val="18"/>
               </w:rPr>
-              <w:t xml:space="preserve">Assistente virtuale; documenti ufficiali del Programma nella Documentazione.</w:t>
+              <w:t xml:space="preserve">Assistente virtuale attivo: chiave legata a uno spazio di lavoro, crediti e consumi.</w:t>
             </w:r>
           </w:p>
         </w:tc>
@@ -1393,7 +1393,7 @@
                 <w:sz w:val="18"/>
                 <w:szCs w:val="18"/>
               </w:rPr>
-              <w:t xml:space="preserve">3.4</w:t>
+              <w:t xml:space="preserve">3.5</w:t>
             </w:r>
           </w:p>
         </w:tc>
@@ -1459,7 +1459,7 @@
                 <w:sz w:val="18"/>
                 <w:szCs w:val="18"/>
               </w:rPr>
-              <w:t xml:space="preserve">Presentazione di riepilogo nella pagina Documentazione.</w:t>
+              <w:t xml:space="preserve">Assistente virtuale; documenti ufficiali del Programma nella Documentazione.</w:t>
             </w:r>
           </w:p>
         </w:tc>
@@ -1529,7 +1529,7 @@
                 <w:sz w:val="18"/>
                 <w:szCs w:val="18"/>
               </w:rPr>
-              <w:t xml:space="preserve">3.3</w:t>
+              <w:t xml:space="preserve">3.4</w:t>
             </w:r>
           </w:p>
         </w:tc>
@@ -1593,7 +1593,7 @@
                 <w:sz w:val="18"/>
                 <w:szCs w:val="18"/>
               </w:rPr>
-              <w:t xml:space="preserve">Ordinamento di tutte le tabelle e degli elenchi.</w:t>
+              <w:t xml:space="preserve">Presentazione di riepilogo nella pagina Documentazione.</w:t>
             </w:r>
           </w:p>
         </w:tc>
@@ -1663,7 +1663,7 @@
                 <w:sz w:val="18"/>
                 <w:szCs w:val="18"/>
               </w:rPr>
-              <w:t xml:space="preserve">3.2</w:t>
+              <w:t xml:space="preserve">3.3</w:t>
             </w:r>
           </w:p>
         </w:tc>
@@ -1729,7 +1729,7 @@
                 <w:sz w:val="18"/>
                 <w:szCs w:val="18"/>
               </w:rPr>
-              <w:t xml:space="preserve">Simulatore: metodo di stima per utenza (solo utenze virtuose), buffer del Capitolo 7, taratura.</w:t>
+              <w:t xml:space="preserve">Ordinamento di tutte le tabelle e degli elenchi.</w:t>
             </w:r>
           </w:p>
         </w:tc>
@@ -1799,7 +1799,7 @@
                 <w:sz w:val="18"/>
                 <w:szCs w:val="18"/>
               </w:rPr>
-              <w:t xml:space="preserve">3.1</w:t>
+              <w:t xml:space="preserve">3.2</w:t>
             </w:r>
           </w:p>
         </w:tc>
@@ -1863,7 +1863,7 @@
                 <w:sz w:val="18"/>
                 <w:szCs w:val="18"/>
               </w:rPr>
-              <w:t xml:space="preserve">Cruscotto diventa Dashboard; barra a LED delle 7 fasi per ogni pratica.</w:t>
+              <w:t xml:space="preserve">Simulatore: metodo di stima per utenza (solo utenze virtuose), buffer del Capitolo 7, taratura.</w:t>
             </w:r>
           </w:p>
         </w:tc>
@@ -1933,7 +1933,7 @@
                 <w:sz w:val="18"/>
                 <w:szCs w:val="18"/>
               </w:rPr>
-              <w:t xml:space="preserve">3.0</w:t>
+              <w:t xml:space="preserve">3.1</w:t>
             </w:r>
           </w:p>
         </w:tc>
@@ -1999,7 +1999,7 @@
                 <w:sz w:val="18"/>
                 <w:szCs w:val="18"/>
               </w:rPr>
-              <w:t xml:space="preserve">Eliminazione degli utenti che non hanno mai operato (script 30).</w:t>
+              <w:t xml:space="preserve">Cruscotto diventa Dashboard; barra a LED delle 7 fasi per ogni pratica.</w:t>
             </w:r>
           </w:p>
         </w:tc>
@@ -2069,7 +2069,7 @@
                 <w:sz w:val="18"/>
                 <w:szCs w:val="18"/>
               </w:rPr>
-              <w:t xml:space="preserve">2.9</w:t>
+              <w:t xml:space="preserve">3.0</w:t>
             </w:r>
           </w:p>
         </w:tc>
@@ -2133,7 +2133,7 @@
                 <w:sz w:val="18"/>
                 <w:szCs w:val="18"/>
               </w:rPr>
-              <w:t xml:space="preserve">Email automatica con le credenziali al nuovo utente e alla reimpostazione della password.</w:t>
+              <w:t xml:space="preserve">Eliminazione degli utenti che non hanno mai operato (script 30).</w:t>
             </w:r>
           </w:p>
         </w:tc>
@@ -2203,7 +2203,7 @@
                 <w:sz w:val="18"/>
                 <w:szCs w:val="18"/>
               </w:rPr>
-              <w:t xml:space="preserve">2.8</w:t>
+              <w:t xml:space="preserve">2.9</w:t>
             </w:r>
           </w:p>
         </w:tc>
@@ -2269,7 +2269,7 @@
                 <w:sz w:val="18"/>
                 <w:szCs w:val="18"/>
               </w:rPr>
-              <w:t xml:space="preserve">Più Amministratori con accesso completo; Amministratore principale protetto (script 29).</w:t>
+              <w:t xml:space="preserve">Email automatica con le credenziali al nuovo utente e alla reimpostazione della password.</w:t>
             </w:r>
           </w:p>
         </w:tc>
@@ -2339,7 +2339,7 @@
                 <w:sz w:val="18"/>
                 <w:szCs w:val="18"/>
               </w:rPr>
-              <w:t xml:space="preserve">2.7</w:t>
+              <w:t xml:space="preserve">2.8</w:t>
             </w:r>
           </w:p>
         </w:tc>
@@ -2403,7 +2403,7 @@
                 <w:sz w:val="18"/>
                 <w:szCs w:val="18"/>
               </w:rPr>
-              <w:t xml:space="preserve">Simulatore: costi per il Comune secondo il Caso 1 (progetto volontario) o il Caso 2 (progetto obbligatorio da bando).</w:t>
+              <w:t xml:space="preserve">Più Amministratori con accesso completo; Amministratore principale protetto (script 29).</w:t>
             </w:r>
           </w:p>
         </w:tc>
@@ -2473,7 +2473,7 @@
                 <w:sz w:val="18"/>
                 <w:szCs w:val="18"/>
               </w:rPr>
-              <w:t xml:space="preserve">2.6</w:t>
+              <w:t xml:space="preserve">2.7</w:t>
             </w:r>
           </w:p>
         </w:tc>
@@ -2539,7 +2539,7 @@
                 <w:sz w:val="18"/>
                 <w:szCs w:val="18"/>
               </w:rPr>
-              <w:t xml:space="preserve">Simulatore: valore del credito anno per anno, proposto 32 €.</w:t>
+              <w:t xml:space="preserve">Simulatore: costi per il Comune secondo il Caso 1 (progetto volontario) o il Caso 2 (progetto obbligatorio da bando).</w:t>
             </w:r>
           </w:p>
         </w:tc>
@@ -2609,7 +2609,7 @@
                 <w:sz w:val="18"/>
                 <w:szCs w:val="18"/>
               </w:rPr>
-              <w:t xml:space="preserve">2.5</w:t>
+              <w:t xml:space="preserve">2.6</w:t>
             </w:r>
           </w:p>
         </w:tc>
@@ -2673,7 +2673,7 @@
                 <w:sz w:val="18"/>
                 <w:szCs w:val="18"/>
               </w:rPr>
-              <w:t xml:space="preserve">Simulatore: simulazione economica con valore unitario del credito e costi per il Comune (contratti tipo della Fondazione, Schema tariffario).</w:t>
+              <w:t xml:space="preserve">Simulatore: valore del credito anno per anno, proposto 32 €.</w:t>
             </w:r>
           </w:p>
         </w:tc>
@@ -2743,7 +2743,7 @@
                 <w:sz w:val="18"/>
                 <w:szCs w:val="18"/>
               </w:rPr>
-              <w:t xml:space="preserve">2.4</w:t>
+              <w:t xml:space="preserve">2.5</w:t>
             </w:r>
           </w:p>
         </w:tc>
@@ -2809,7 +2809,7 @@
                 <w:sz w:val="18"/>
                 <w:szCs w:val="18"/>
               </w:rPr>
-              <w:t xml:space="preserve">Simulatore: riferimento sempre alla soglia del 65% di differenziata e controllo dei valori fuori scala.</w:t>
+              <w:t xml:space="preserve">Simulatore: simulazione economica con valore unitario del credito e costi per il Comune (contratti tipo della Fondazione, Schema tariffario).</w:t>
             </w:r>
           </w:p>
         </w:tc>
@@ -2879,7 +2879,7 @@
                 <w:sz w:val="18"/>
                 <w:szCs w:val="18"/>
               </w:rPr>
-              <w:t xml:space="preserve">2.3</w:t>
+              <w:t xml:space="preserve">2.4</w:t>
             </w:r>
           </w:p>
         </w:tc>
@@ -2943,7 +2943,7 @@
                 <w:sz w:val="18"/>
                 <w:szCs w:val="18"/>
               </w:rPr>
-              <w:t xml:space="preserve">Simulatore conforme al modello CWP: scenario di riferimento dello Standard 4.8.1, situazione attuale, conformità.</w:t>
+              <w:t xml:space="preserve">Simulatore: riferimento sempre alla soglia del 65% di differenziata e controllo dei valori fuori scala.</w:t>
             </w:r>
           </w:p>
         </w:tc>
@@ -3013,7 +3013,7 @@
                 <w:sz w:val="18"/>
                 <w:szCs w:val="18"/>
               </w:rPr>
-              <w:t xml:space="preserve">2.2</w:t>
+              <w:t xml:space="preserve">2.3</w:t>
             </w:r>
           </w:p>
         </w:tc>
@@ -3079,7 +3079,7 @@
                 <w:sz w:val="18"/>
                 <w:szCs w:val="18"/>
               </w:rPr>
-              <w:t xml:space="preserve">Nuovo capitolo «Simulatore di scenari»: creazione, anno base, obiettivi annui, risultati, modello di stima.</w:t>
+              <w:t xml:space="preserve">Simulatore conforme al modello CWP: scenario di riferimento dello Standard 4.8.1, situazione attuale, conformità.</w:t>
             </w:r>
           </w:p>
         </w:tc>
@@ -3149,7 +3149,7 @@
                 <w:sz w:val="18"/>
                 <w:szCs w:val="18"/>
               </w:rPr>
-              <w:t xml:space="preserve">2.1</w:t>
+              <w:t xml:space="preserve">2.2</w:t>
             </w:r>
           </w:p>
         </w:tc>
@@ -3213,7 +3213,7 @@
                 <w:sz w:val="18"/>
                 <w:szCs w:val="18"/>
               </w:rPr>
-              <w:t xml:space="preserve">Funzioni in arrivo: simulatore di scenari (7, 10 o 21 anni, obiettivi annui, % di differenziata e crediti stimati) e assistente virtuale (Claude).</w:t>
+              <w:t xml:space="preserve">Nuovo capitolo «Simulatore di scenari»: creazione, anno base, obiettivi annui, risultati, modello di stima.</w:t>
             </w:r>
           </w:p>
         </w:tc>
@@ -3283,7 +3283,7 @@
                 <w:sz w:val="18"/>
                 <w:szCs w:val="18"/>
               </w:rPr>
-              <w:t xml:space="preserve">2.0</w:t>
+              <w:t xml:space="preserve">2.1</w:t>
             </w:r>
           </w:p>
         </w:tc>
@@ -3349,7 +3349,7 @@
                 <w:sz w:val="18"/>
                 <w:szCs w:val="18"/>
               </w:rPr>
-              <w:t xml:space="preserve">Copie di sicurezza e ripristino: rimando alle Istruzioni di ripristino e punti essenziali (capitolo Manutenzione ed emergenze).</w:t>
+              <w:t xml:space="preserve">Funzioni in arrivo: simulatore di scenari (7, 10 o 21 anni, obiettivi annui, % di differenziata e crediti stimati) e assistente virtuale (Claude).</w:t>
             </w:r>
           </w:p>
         </w:tc>
@@ -3419,7 +3419,7 @@
                 <w:sz w:val="18"/>
                 <w:szCs w:val="18"/>
               </w:rPr>
-              <w:t xml:space="preserve">1.9</w:t>
+              <w:t xml:space="preserve">2.0</w:t>
             </w:r>
           </w:p>
         </w:tc>
@@ -3483,7 +3483,7 @@
                 <w:sz w:val="18"/>
                 <w:szCs w:val="18"/>
               </w:rPr>
-              <w:t xml:space="preserve">Fondazione Operate soggetto promotore del programma (esclusiva conferita da Wastelab).</w:t>
+              <w:t xml:space="preserve">Copie di sicurezza e ripristino: rimando alle Istruzioni di ripristino e punti essenziali (capitolo Manutenzione ed emergenze).</w:t>
             </w:r>
           </w:p>
         </w:tc>
@@ -3553,7 +3553,7 @@
                 <w:sz w:val="18"/>
                 <w:szCs w:val="18"/>
               </w:rPr>
-              <w:t xml:space="preserve">1.8</w:t>
+              <w:t xml:space="preserve">1.9</w:t>
             </w:r>
           </w:p>
         </w:tc>
@@ -3619,7 +3619,7 @@
                 <w:sz w:val="18"/>
                 <w:szCs w:val="18"/>
               </w:rPr>
-              <w:t xml:space="preserve">PEC del Programma e documenti ufficiali già pubblicati sulla pagina pubblica.</w:t>
+              <w:t xml:space="preserve">Fondazione Operate soggetto promotore del programma (esclusiva conferita da Wastelab).</w:t>
             </w:r>
           </w:p>
         </w:tc>
@@ -3689,7 +3689,7 @@
                 <w:sz w:val="18"/>
                 <w:szCs w:val="18"/>
               </w:rPr>
-              <w:t xml:space="preserve">1.7</w:t>
+              <w:t xml:space="preserve">1.8</w:t>
             </w:r>
           </w:p>
         </w:tc>
@@ -3721,7 +3721,7 @@
                 <w:sz w:val="18"/>
                 <w:szCs w:val="18"/>
               </w:rPr>
-              <w:t xml:space="preserve">18/10/2026</w:t>
+              <w:t xml:space="preserve">19/10/2026</w:t>
             </w:r>
           </w:p>
         </w:tc>
@@ -3753,7 +3753,7 @@
                 <w:sz w:val="18"/>
                 <w:szCs w:val="18"/>
               </w:rPr>
-              <w:t xml:space="preserve">Allineamento ai documenti ufficiali del Programma (script 22-24): Rapporto a 7 fasi, feedback pubblico, stati del Programma, dati del progetto e territorio ISTAT, ritiro e rientro, account unico e delegati, registri, tariffe e sospensione, accuratezza e accertamenti, informazioni del Programma e metodologie, modelli pubblici; nuovi capitoli Crediti emessi, Reclami, Pagina pubblica; qualità dei dati nel calcolo.</w:t>
+              <w:t xml:space="preserve">PEC del Programma e documenti ufficiali già pubblicati sulla pagina pubblica.</w:t>
             </w:r>
           </w:p>
         </w:tc>
@@ -3823,7 +3823,7 @@
                 <w:sz w:val="18"/>
                 <w:szCs w:val="18"/>
               </w:rPr>
-              <w:t xml:space="preserve">1.6</w:t>
+              <w:t xml:space="preserve">1.7</w:t>
             </w:r>
           </w:p>
         </w:tc>
@@ -3889,7 +3889,7 @@
                 <w:sz w:val="18"/>
                 <w:szCs w:val="18"/>
               </w:rPr>
-              <w:t xml:space="preserve">Calcolo crediti: descrizione corretta del buffer (somma delle voci delle Tabelle 15 e 16, più il 20% con le sole utenze virtuose, al massimo 80%).</w:t>
+              <w:t xml:space="preserve">Allineamento ai documenti ufficiali del Programma (script 22-24): Rapporto a 7 fasi, feedback pubblico, stati del Programma, dati del progetto e territorio ISTAT, ritiro e rientro, account unico e delegati, registri, tariffe e sospensione, accuratezza e accertamenti, informazioni del Programma e metodologie, modelli pubblici; nuovi capitoli Crediti emessi, Reclami, Pagina pubblica; qualità dei dati nel calcolo.</w:t>
             </w:r>
           </w:p>
         </w:tc>
@@ -3959,7 +3959,7 @@
                 <w:sz w:val="18"/>
                 <w:szCs w:val="18"/>
               </w:rPr>
-              <w:t xml:space="preserve">1.5</w:t>
+              <w:t xml:space="preserve">1.6</w:t>
             </w:r>
           </w:p>
         </w:tc>
@@ -4023,7 +4023,7 @@
                 <w:sz w:val="18"/>
                 <w:szCs w:val="18"/>
               </w:rPr>
-              <w:t xml:space="preserve">Nuova pagina Anagrafiche (Organizzazioni ed Enti, anche per gli Operatori); Rapporti con 4 fasi e durate proprie; documenti richiesti per fase; consultazione con documento bloccato, osservazioni numerate e motivazione; conservazione per 10 anni; fascicolo con riepilogo PDF e nuove cartelle.</w:t>
+              <w:t xml:space="preserve">Calcolo crediti: descrizione corretta del buffer (somma delle voci delle Tabelle 15 e 16, più il 20% con le sole utenze virtuose, al massimo 80%).</w:t>
             </w:r>
           </w:p>
         </w:tc>
@@ -4093,7 +4093,7 @@
                 <w:sz w:val="18"/>
                 <w:szCs w:val="18"/>
               </w:rPr>
-              <w:t xml:space="preserve">1.4</w:t>
+              <w:t xml:space="preserve">1.5</w:t>
             </w:r>
           </w:p>
         </w:tc>
@@ -4159,7 +4159,7 @@
                 <w:sz w:val="18"/>
                 <w:szCs w:val="18"/>
               </w:rPr>
-              <w:t xml:space="preserve">Calcolo crediti: il risultato si azzera quando cambiano dati o Banca Dati Utenze, conferma solo dopo un nuovo «Calcola». Gestione utenti: password temporanea di almeno 10 caratteri con lettere e numeri, creazione annullata se non va a buon fine, nessun accesso ai dati prima del cambio password.</w:t>
+              <w:t xml:space="preserve">Nuova pagina Anagrafiche (Organizzazioni ed Enti, anche per gli Operatori); Rapporti con 4 fasi e durate proprie; documenti richiesti per fase; consultazione con documento bloccato, osservazioni numerate e motivazione; conservazione per 10 anni; fascicolo con riepilogo PDF e nuove cartelle.</w:t>
             </w:r>
           </w:p>
         </w:tc>
@@ -4229,7 +4229,7 @@
                 <w:sz w:val="18"/>
                 <w:szCs w:val="18"/>
               </w:rPr>
-              <w:t xml:space="preserve">1.3</w:t>
+              <w:t xml:space="preserve">1.4</w:t>
             </w:r>
           </w:p>
         </w:tc>
@@ -4293,7 +4293,7 @@
                 <w:sz w:val="18"/>
                 <w:szCs w:val="18"/>
               </w:rPr>
-              <w:t xml:space="preserve">Rapporto di calcolo in PDF, archiviazione nella pratica, numero di registro, registro dei crediti.</w:t>
+              <w:t xml:space="preserve">Calcolo crediti: il risultato si azzera quando cambiano dati o Banca Dati Utenze, conferma solo dopo un nuovo «Calcola». Gestione utenti: password temporanea di almeno 10 caratteri con lettere e numeri, creazione annullata se non va a buon fine, nessun accesso ai dati prima del cambio password.</w:t>
             </w:r>
           </w:p>
         </w:tc>
@@ -4363,7 +4363,7 @@
                 <w:sz w:val="18"/>
                 <w:szCs w:val="18"/>
               </w:rPr>
-              <w:t xml:space="preserve">1.2</w:t>
+              <w:t xml:space="preserve">1.3</w:t>
             </w:r>
           </w:p>
         </w:tc>
@@ -4429,7 +4429,7 @@
                 <w:sz w:val="18"/>
                 <w:szCs w:val="18"/>
               </w:rPr>
-              <w:t xml:space="preserve">Calcolo crediti: importare il tracciato nel calcolo (dai documenti della pratica o dal computer), singole letture, blocco dei dati personali, controlli di coerenza.</w:t>
+              <w:t xml:space="preserve">Rapporto di calcolo in PDF, archiviazione nella pratica, numero di registro, registro dei crediti.</w:t>
             </w:r>
           </w:p>
         </w:tc>
@@ -4499,7 +4499,7 @@
                 <w:sz w:val="18"/>
                 <w:szCs w:val="18"/>
               </w:rPr>
-              <w:t xml:space="preserve">1.1</w:t>
+              <w:t xml:space="preserve">1.2</w:t>
             </w:r>
           </w:p>
         </w:tc>
@@ -4563,7 +4563,7 @@
                 <w:sz w:val="18"/>
                 <w:szCs w:val="18"/>
               </w:rPr>
-              <w:t xml:space="preserve">Note di fase, Ente di Validazione della pratica, consultazione sulla pagina pubblica con conferma dell'email, moderazione con autori e allegati, errata corrige; nuovo capitolo Messaggi con il Comune; pagamenti visibili al Comune; Impostazioni: Enti di Validazione e Modelli di documento; notifiche aggiornate.</w:t>
+              <w:t xml:space="preserve">Calcolo crediti: importare il tracciato nel calcolo (dai documenti della pratica o dal computer), singole letture, blocco dei dati personali, controlli di coerenza.</w:t>
             </w:r>
           </w:p>
         </w:tc>
@@ -4633,6 +4633,142 @@
                 <w:sz w:val="18"/>
                 <w:szCs w:val="18"/>
               </w:rPr>
+              <w:t xml:space="preserve">1.1</w:t>
+            </w:r>
+          </w:p>
+        </w:tc>
+        <w:tc>
+          <w:tcPr>
+            <w:tcW w:type="dxa" w:w="1300"/>
+            <w:tcBorders>
+              <w:top w:val="single" w:color="D9D4C5" w:sz="4"/>
+              <w:left w:val="single" w:color="D9D4C5" w:sz="4"/>
+              <w:bottom w:val="single" w:color="D9D4C5" w:sz="4"/>
+              <w:right w:val="single" w:color="D9D4C5" w:sz="4"/>
+            </w:tcBorders>
+            <w:shd w:fill="F6F4EE" w:color="auto" w:val="clear"/>
+            <w:tcMar>
+              <w:top w:type="dxa" w:w="70"/>
+              <w:left w:type="dxa" w:w="110"/>
+              <w:bottom w:type="dxa" w:w="70"/>
+              <w:right w:type="dxa" w:w="110"/>
+            </w:tcMar>
+            <w:vAlign w:val="center"/>
+          </w:tcPr>
+          <w:p>
+            <w:pPr>
+              <w:spacing w:after="0" w:before="0"/>
+            </w:pPr>
+            <w:r>
+              <w:rPr>
+                <w:rFonts w:ascii="Arial" w:cs="Arial" w:eastAsia="Arial" w:hAnsi="Arial"/>
+                <w:color w:val="1B2118"/>
+                <w:sz w:val="18"/>
+                <w:szCs w:val="18"/>
+              </w:rPr>
+              <w:t xml:space="preserve">18/10/2026</w:t>
+            </w:r>
+          </w:p>
+        </w:tc>
+        <w:tc>
+          <w:tcPr>
+            <w:tcW w:type="dxa" w:w="5538"/>
+            <w:tcBorders>
+              <w:top w:val="single" w:color="D9D4C5" w:sz="4"/>
+              <w:left w:val="single" w:color="D9D4C5" w:sz="4"/>
+              <w:bottom w:val="single" w:color="D9D4C5" w:sz="4"/>
+              <w:right w:val="single" w:color="D9D4C5" w:sz="4"/>
+            </w:tcBorders>
+            <w:shd w:fill="F6F4EE" w:color="auto" w:val="clear"/>
+            <w:tcMar>
+              <w:top w:type="dxa" w:w="70"/>
+              <w:left w:type="dxa" w:w="110"/>
+              <w:bottom w:type="dxa" w:w="70"/>
+              <w:right w:type="dxa" w:w="110"/>
+            </w:tcMar>
+            <w:vAlign w:val="center"/>
+          </w:tcPr>
+          <w:p>
+            <w:pPr>
+              <w:spacing w:after="0" w:before="0"/>
+            </w:pPr>
+            <w:r>
+              <w:rPr>
+                <w:rFonts w:ascii="Arial" w:cs="Arial" w:eastAsia="Arial" w:hAnsi="Arial"/>
+                <w:color w:val="1B2118"/>
+                <w:sz w:val="18"/>
+                <w:szCs w:val="18"/>
+              </w:rPr>
+              <w:t xml:space="preserve">Note di fase, Ente di Validazione della pratica, consultazione sulla pagina pubblica con conferma dell'email, moderazione con autori e allegati, errata corrige; nuovo capitolo Messaggi con il Comune; pagamenti visibili al Comune; Impostazioni: Enti di Validazione e Modelli di documento; notifiche aggiornate.</w:t>
+            </w:r>
+          </w:p>
+        </w:tc>
+        <w:tc>
+          <w:tcPr>
+            <w:tcW w:type="dxa" w:w="2000"/>
+            <w:tcBorders>
+              <w:top w:val="single" w:color="D9D4C5" w:sz="4"/>
+              <w:left w:val="single" w:color="D9D4C5" w:sz="4"/>
+              <w:bottom w:val="single" w:color="D9D4C5" w:sz="4"/>
+              <w:right w:val="single" w:color="D9D4C5" w:sz="4"/>
+            </w:tcBorders>
+            <w:shd w:fill="F6F4EE" w:color="auto" w:val="clear"/>
+            <w:tcMar>
+              <w:top w:type="dxa" w:w="70"/>
+              <w:left w:type="dxa" w:w="110"/>
+              <w:bottom w:type="dxa" w:w="70"/>
+              <w:right w:type="dxa" w:w="110"/>
+            </w:tcMar>
+            <w:vAlign w:val="center"/>
+          </w:tcPr>
+          <w:p>
+            <w:pPr>
+              <w:spacing w:after="0" w:before="0"/>
+            </w:pPr>
+            <w:r>
+              <w:rPr>
+                <w:rFonts w:ascii="Arial" w:cs="Arial" w:eastAsia="Arial" w:hAnsi="Arial"/>
+                <w:color w:val="1B2118"/>
+                <w:sz w:val="18"/>
+                <w:szCs w:val="18"/>
+              </w:rPr>
+              <w:t xml:space="preserve">Fondazione Operate</w:t>
+            </w:r>
+          </w:p>
+        </w:tc>
+      </w:tr>
+      <w:tr>
+        <w:trPr>
+          <w:cantSplit/>
+        </w:trPr>
+        <w:tc>
+          <w:tcPr>
+            <w:tcW w:type="dxa" w:w="800"/>
+            <w:tcBorders>
+              <w:top w:val="single" w:color="D9D4C5" w:sz="4"/>
+              <w:left w:val="single" w:color="D9D4C5" w:sz="4"/>
+              <w:bottom w:val="single" w:color="D9D4C5" w:sz="4"/>
+              <w:right w:val="single" w:color="D9D4C5" w:sz="4"/>
+            </w:tcBorders>
+            <w:tcMar>
+              <w:top w:type="dxa" w:w="70"/>
+              <w:left w:type="dxa" w:w="110"/>
+              <w:bottom w:type="dxa" w:w="70"/>
+              <w:right w:type="dxa" w:w="110"/>
+            </w:tcMar>
+            <w:vAlign w:val="center"/>
+          </w:tcPr>
+          <w:p>
+            <w:pPr>
+              <w:spacing w:after="0" w:before="0"/>
+            </w:pPr>
+            <w:r>
+              <w:rPr>
+                <w:rFonts w:ascii="Arial" w:cs="Arial" w:eastAsia="Arial" w:hAnsi="Arial"/>
+                <w:color w:val="1B2118"/>
+                <w:sz w:val="18"/>
+                <w:szCs w:val="18"/>
+              </w:rPr>
               <w:t xml:space="preserve">1.0</w:t>
             </w:r>
           </w:p>
@@ -4646,7 +4782,6 @@
               <w:bottom w:val="single" w:color="D9D4C5" w:sz="4"/>
               <w:right w:val="single" w:color="D9D4C5" w:sz="4"/>
             </w:tcBorders>
-            <w:shd w:fill="F6F4EE" w:color="auto" w:val="clear"/>
             <w:tcMar>
               <w:top w:type="dxa" w:w="70"/>
               <w:left w:type="dxa" w:w="110"/>
@@ -4679,7 +4814,6 @@
               <w:bottom w:val="single" w:color="D9D4C5" w:sz="4"/>
               <w:right w:val="single" w:color="D9D4C5" w:sz="4"/>
             </w:tcBorders>
-            <w:shd w:fill="F6F4EE" w:color="auto" w:val="clear"/>
             <w:tcMar>
               <w:top w:type="dxa" w:w="70"/>
               <w:left w:type="dxa" w:w="110"/>
@@ -4712,7 +4846,6 @@
               <w:bottom w:val="single" w:color="D9D4C5" w:sz="4"/>
               <w:right w:val="single" w:color="D9D4C5" w:sz="4"/>
             </w:tcBorders>
-            <w:shd w:fill="F6F4EE" w:color="auto" w:val="clear"/>
             <w:tcMar>
               <w:top w:type="dxa" w:w="70"/>
               <w:left w:type="dxa" w:w="110"/>
@@ -4754,7 +4887,7 @@
           <w:sz w:val="20"/>
           <w:szCs w:val="20"/>
         </w:rPr>
-        <w:t xml:space="preserve">Questo documento descrive il portale alla revisione 3.9 del 20/10/2026. A ogni modifica del portale il manuale viene aggiornato e la revisione incrementata; la versione corrente si scarica dall'area Documentazione del portale (solo Amministratori).</w:t>
+        <w:t xml:space="preserve">Questo documento descrive il portale alla revisione 4.0 del 20/10/2026. A ogni modifica del portale il manuale viene aggiornato e la revisione incrementata; la versione corrente si scarica dall'area Documentazione del portale (solo Amministratori).</w:t>
       </w:r>
     </w:p>
     <w:p>
@@ -5173,7 +5306,7 @@
             <w:sz w:val="22"/>
             <w:szCs w:val="22"/>
           </w:rPr>
-          <w:t xml:space="preserve">14.  Audit trail user (solo Amministratore principale)</w:t>
+          <w:t xml:space="preserve">14.  Audit User (solo Amministratore principale)</w:t>
         </w:r>
         <w:r>
           <w:rPr>
@@ -7476,7 +7609,7 @@
         </w:rPr>
         <w:t xml:space="preserve">Si accede da </w:t>
       </w:r>
-      <w:hyperlink w:history="1" r:id="rIdsapclup_ljyqyhohxiire">
+      <w:hyperlink w:history="1" r:id="rIduoylf1wb83a5pq2trdhvm">
         <w:r>
           <w:rPr>
             <w:rFonts w:ascii="Arial" w:cs="Arial" w:eastAsia="Arial" w:hAnsi="Arial"/>
@@ -7865,7 +7998,27 @@
                 <w:sz w:val="18"/>
                 <w:szCs w:val="18"/>
               </w:rPr>
-              <w:t xml:space="preserve">Dashboard, Pratiche, Utenti, Audit, Anagrafiche, Calcolo crediti, Crediti emessi, Reclami, Impostazioni, Documentazione</w:t>
+              <w:t xml:space="preserve">Dashboard, Anagrafiche, Simulatore, Pratiche, Reclami, Calcolo crediti, Crediti emessi, Impostazioni, Utenti, Audit, Audit User (solo l'Amministratore principale), Documentazione; </w:t>
+            </w:r>
+            <w:r>
+              <w:rPr>
+                <w:rFonts w:ascii="Arial" w:cs="Arial" w:eastAsia="Arial" w:hAnsi="Arial"/>
+                <w:b/>
+                <w:bCs/>
+                <w:color w:val="1B2118"/>
+                <w:sz w:val="18"/>
+                <w:szCs w:val="18"/>
+              </w:rPr>
+              <w:t xml:space="preserve">Marketplaces</w:t>
+            </w:r>
+            <w:r>
+              <w:rPr>
+                <w:rFonts w:ascii="Arial" w:cs="Arial" w:eastAsia="Arial" w:hAnsi="Arial"/>
+                <w:color w:val="1B2118"/>
+                <w:sz w:val="18"/>
+                <w:szCs w:val="18"/>
+              </w:rPr>
+              <w:t xml:space="preserve"> in grigio, non cliccabile (sezione in arrivo)</w:t>
             </w:r>
           </w:p>
         </w:tc>
@@ -22286,7 +22439,7 @@
           <w:sz w:val="21"/>
           <w:szCs w:val="21"/>
         </w:rPr>
-        <w:t xml:space="preserve">Audit trail user</w:t>
+        <w:t xml:space="preserve">Audit User</w:t>
       </w:r>
       <w:r>
         <w:rPr>
@@ -22476,7 +22629,7 @@
           <w:sz w:val="34"/>
           <w:szCs w:val="34"/>
         </w:rPr>
-        <w:t xml:space="preserve">14. Audit trail user (solo Amministratore principale)</w:t>
+        <w:t xml:space="preserve">14. Audit User (solo Amministratore principale)</w:t>
       </w:r>
       <w:bookmarkEnd w:id="1"/>
     </w:p>
@@ -22502,7 +22655,7 @@
           <w:sz w:val="21"/>
           <w:szCs w:val="21"/>
         </w:rPr>
-        <w:t xml:space="preserve">Audit trail user</w:t>
+        <w:t xml:space="preserve">Audit User</w:t>
       </w:r>
       <w:r>
         <w:rPr>
@@ -43720,7 +43873,7 @@
         <w:szCs w:val="16"/>
       </w:rPr>
       <w:tab/>
-      <w:t xml:space="preserve">Manuale Amministratore · Rev. 3.9 · 20/10/2026</w:t>
+      <w:t xml:space="preserve">Manuale Amministratore · Rev. 4.0 · 20/10/2026</w:t>
     </w:r>
   </w:p>
 </w:hdr>
@@ -43785,7 +43938,7 @@
         <w:szCs w:val="16"/>
       </w:rPr>
       <w:tab/>
-      <w:t xml:space="preserve">Manuale Amministratore · Rev. 3.9 · 20/10/2026</w:t>
+      <w:t xml:space="preserve">Manuale Amministratore · Rev. 4.0 · 20/10/2026</w:t>
     </w:r>
   </w:p>
 </w:hdr>

</xml_diff>

<commit_message>
Collaudo V01: correzioni D01-D07, presidi R04/R05/R07, script 35
- D07: import CSV della Banca Dati tutto o niente, negativi rifiutati in
  import, salvataggio, coerenza e motore (risultato bloccato, non salvato)
- D04: date di calendario rigorose (tracciato, primo anno, date.js)
- D02: buffer manuale fuori 0-80% = errore (calcolatore e simulatore)
- D01: erroriScenario blocca risultati e salvataggio del simulatore
- D03: zero esplicito distinto dal vuoto nei prezzi del credito
- D05: colonna Oggetto e modifiche in Audit e Audit User
- D06: testoSicuroCsv contro le formule nei CSV
- R05 conferma solo senza errori di coerenza; R04 pareggio; R07 P%UD in %
- supabase/35_controlli_collaudo.sql (vincoli NOT VALID, trigger)
- test/collaudo_v01.test.mjs; manuali e Registro aggiornati

Co-Authored-By: Claude Opus 5.5 <noreply@anthropic.com>
Claude-Session: https://claude.ai/code/session_01E8XCbEeVHWVP3hntUZ6kZ1
</commit_message>
<xml_diff>
--- a/public/documentazione/Manuale_Amministratore_Portale_CWP.docx
+++ b/public/documentazione/Manuale_Amministratore_Portale_CWP.docx
@@ -302,7 +302,7 @@
                 <w:sz w:val="20"/>
                 <w:szCs w:val="20"/>
               </w:rPr>
-              <w:t xml:space="preserve">Rev. 4.2</w:t>
+              <w:t xml:space="preserve">Rev. 4.3</w:t>
             </w:r>
           </w:p>
         </w:tc>
@@ -719,7 +719,7 @@
                 <w:sz w:val="18"/>
                 <w:szCs w:val="18"/>
               </w:rPr>
-              <w:t xml:space="preserve">4.2</w:t>
+              <w:t xml:space="preserve">4.3</w:t>
             </w:r>
           </w:p>
         </w:tc>
@@ -783,7 +783,7 @@
                 <w:sz w:val="18"/>
                 <w:szCs w:val="18"/>
               </w:rPr>
-              <w:t xml:space="preserve">Nuovo capitolo «Sicurezza»: inattività, avvisi, protezioni del sito e del database.</w:t>
+              <w:t xml:space="preserve">Correzioni del collaudo V01: import CSV della Banca Dati «tutto o niente» senza valori negativi, calcolo bloccato con dati non ammessi, buffer manuale 0-80%, conferma definitiva solo senza errori di coerenza, dati non ammessi nel simulatore e zero esplicito nei prezzi, colonna «Oggetto e modifiche» nell'Audit.</w:t>
             </w:r>
           </w:p>
         </w:tc>
@@ -853,7 +853,7 @@
                 <w:sz w:val="18"/>
                 <w:szCs w:val="18"/>
               </w:rPr>
-              <w:t xml:space="preserve">4.1</w:t>
+              <w:t xml:space="preserve">4.2</w:t>
             </w:r>
           </w:p>
         </w:tc>
@@ -919,7 +919,7 @@
                 <w:sz w:val="18"/>
                 <w:szCs w:val="18"/>
               </w:rPr>
-              <w:t xml:space="preserve">Voci di menu degli enti aggiornate.</w:t>
+              <w:t xml:space="preserve">Nuovo capitolo «Sicurezza»: inattività, avvisi, protezioni del sito e del database.</w:t>
             </w:r>
           </w:p>
         </w:tc>
@@ -989,7 +989,7 @@
                 <w:sz w:val="18"/>
                 <w:szCs w:val="18"/>
               </w:rPr>
-              <w:t xml:space="preserve">4.0</w:t>
+              <w:t xml:space="preserve">4.1</w:t>
             </w:r>
           </w:p>
         </w:tc>
@@ -1053,7 +1053,7 @@
                 <w:sz w:val="18"/>
                 <w:szCs w:val="18"/>
               </w:rPr>
-              <w:t xml:space="preserve">Nuovo ordine del menu; la sezione si chiama «Audit User». Voce «Marketplaces» in arrivo.</w:t>
+              <w:t xml:space="preserve">Voci di menu degli enti aggiornate.</w:t>
             </w:r>
           </w:p>
         </w:tc>
@@ -1123,7 +1123,7 @@
                 <w:sz w:val="18"/>
                 <w:szCs w:val="18"/>
               </w:rPr>
-              <w:t xml:space="preserve">3.9</w:t>
+              <w:t xml:space="preserve">4.0</w:t>
             </w:r>
           </w:p>
         </w:tc>
@@ -1189,7 +1189,7 @@
                 <w:sz w:val="18"/>
                 <w:szCs w:val="18"/>
               </w:rPr>
-              <w:t xml:space="preserve">Nuovo capitolo «Audit trail user».</w:t>
+              <w:t xml:space="preserve">Nuovo ordine del menu; la sezione si chiama «Audit User». Voce «Marketplaces» in arrivo.</w:t>
             </w:r>
           </w:p>
         </w:tc>
@@ -1259,7 +1259,7 @@
                 <w:sz w:val="18"/>
                 <w:szCs w:val="18"/>
               </w:rPr>
-              <w:t xml:space="preserve">3.8</w:t>
+              <w:t xml:space="preserve">3.9</w:t>
             </w:r>
           </w:p>
         </w:tc>
@@ -1323,7 +1323,7 @@
                 <w:sz w:val="18"/>
                 <w:szCs w:val="18"/>
               </w:rPr>
-              <w:t xml:space="preserve">Utenti online; PDF ed Excel del simulatore; messaggi d'errore dell'assistente.</w:t>
+              <w:t xml:space="preserve">Nuovo capitolo «Audit trail user».</w:t>
             </w:r>
           </w:p>
         </w:tc>
@@ -1393,7 +1393,7 @@
                 <w:sz w:val="18"/>
                 <w:szCs w:val="18"/>
               </w:rPr>
-              <w:t xml:space="preserve">3.7</w:t>
+              <w:t xml:space="preserve">3.8</w:t>
             </w:r>
           </w:p>
         </w:tc>
@@ -1426,7 +1426,7 @@
                 <w:sz w:val="18"/>
                 <w:szCs w:val="18"/>
               </w:rPr>
-              <w:t xml:space="preserve">19/10/2026</w:t>
+              <w:t xml:space="preserve">20/10/2026</w:t>
             </w:r>
           </w:p>
         </w:tc>
@@ -1459,7 +1459,7 @@
                 <w:sz w:val="18"/>
                 <w:szCs w:val="18"/>
               </w:rPr>
-              <w:t xml:space="preserve">Assistente virtuale: messaggio «Un attimo…» durante l'attesa.</w:t>
+              <w:t xml:space="preserve">Utenti online; PDF ed Excel del simulatore; messaggi d'errore dell'assistente.</w:t>
             </w:r>
           </w:p>
         </w:tc>
@@ -1529,7 +1529,7 @@
                 <w:sz w:val="18"/>
                 <w:szCs w:val="18"/>
               </w:rPr>
-              <w:t xml:space="preserve">3.6</w:t>
+              <w:t xml:space="preserve">3.7</w:t>
             </w:r>
           </w:p>
         </w:tc>
@@ -1593,7 +1593,7 @@
                 <w:sz w:val="18"/>
                 <w:szCs w:val="18"/>
               </w:rPr>
-              <w:t xml:space="preserve">Assistente virtuale attivo: chiave legata a uno spazio di lavoro, crediti e consumi.</w:t>
+              <w:t xml:space="preserve">Assistente virtuale: messaggio «Un attimo…» durante l'attesa.</w:t>
             </w:r>
           </w:p>
         </w:tc>
@@ -1663,7 +1663,7 @@
                 <w:sz w:val="18"/>
                 <w:szCs w:val="18"/>
               </w:rPr>
-              <w:t xml:space="preserve">3.5</w:t>
+              <w:t xml:space="preserve">3.6</w:t>
             </w:r>
           </w:p>
         </w:tc>
@@ -1729,7 +1729,7 @@
                 <w:sz w:val="18"/>
                 <w:szCs w:val="18"/>
               </w:rPr>
-              <w:t xml:space="preserve">Assistente virtuale; documenti ufficiali del Programma nella Documentazione.</w:t>
+              <w:t xml:space="preserve">Assistente virtuale attivo: chiave legata a uno spazio di lavoro, crediti e consumi.</w:t>
             </w:r>
           </w:p>
         </w:tc>
@@ -1799,7 +1799,7 @@
                 <w:sz w:val="18"/>
                 <w:szCs w:val="18"/>
               </w:rPr>
-              <w:t xml:space="preserve">3.4</w:t>
+              <w:t xml:space="preserve">3.5</w:t>
             </w:r>
           </w:p>
         </w:tc>
@@ -1863,7 +1863,7 @@
                 <w:sz w:val="18"/>
                 <w:szCs w:val="18"/>
               </w:rPr>
-              <w:t xml:space="preserve">Presentazione di riepilogo nella pagina Documentazione.</w:t>
+              <w:t xml:space="preserve">Assistente virtuale; documenti ufficiali del Programma nella Documentazione.</w:t>
             </w:r>
           </w:p>
         </w:tc>
@@ -1933,7 +1933,7 @@
                 <w:sz w:val="18"/>
                 <w:szCs w:val="18"/>
               </w:rPr>
-              <w:t xml:space="preserve">3.3</w:t>
+              <w:t xml:space="preserve">3.4</w:t>
             </w:r>
           </w:p>
         </w:tc>
@@ -1999,7 +1999,7 @@
                 <w:sz w:val="18"/>
                 <w:szCs w:val="18"/>
               </w:rPr>
-              <w:t xml:space="preserve">Ordinamento di tutte le tabelle e degli elenchi.</w:t>
+              <w:t xml:space="preserve">Presentazione di riepilogo nella pagina Documentazione.</w:t>
             </w:r>
           </w:p>
         </w:tc>
@@ -2069,7 +2069,7 @@
                 <w:sz w:val="18"/>
                 <w:szCs w:val="18"/>
               </w:rPr>
-              <w:t xml:space="preserve">3.2</w:t>
+              <w:t xml:space="preserve">3.3</w:t>
             </w:r>
           </w:p>
         </w:tc>
@@ -2133,7 +2133,7 @@
                 <w:sz w:val="18"/>
                 <w:szCs w:val="18"/>
               </w:rPr>
-              <w:t xml:space="preserve">Simulatore: metodo di stima per utenza (solo utenze virtuose), buffer del Capitolo 7, taratura.</w:t>
+              <w:t xml:space="preserve">Ordinamento di tutte le tabelle e degli elenchi.</w:t>
             </w:r>
           </w:p>
         </w:tc>
@@ -2203,7 +2203,7 @@
                 <w:sz w:val="18"/>
                 <w:szCs w:val="18"/>
               </w:rPr>
-              <w:t xml:space="preserve">3.1</w:t>
+              <w:t xml:space="preserve">3.2</w:t>
             </w:r>
           </w:p>
         </w:tc>
@@ -2269,7 +2269,7 @@
                 <w:sz w:val="18"/>
                 <w:szCs w:val="18"/>
               </w:rPr>
-              <w:t xml:space="preserve">Cruscotto diventa Dashboard; barra a LED delle 7 fasi per ogni pratica.</w:t>
+              <w:t xml:space="preserve">Simulatore: metodo di stima per utenza (solo utenze virtuose), buffer del Capitolo 7, taratura.</w:t>
             </w:r>
           </w:p>
         </w:tc>
@@ -2339,7 +2339,7 @@
                 <w:sz w:val="18"/>
                 <w:szCs w:val="18"/>
               </w:rPr>
-              <w:t xml:space="preserve">3.0</w:t>
+              <w:t xml:space="preserve">3.1</w:t>
             </w:r>
           </w:p>
         </w:tc>
@@ -2403,7 +2403,7 @@
                 <w:sz w:val="18"/>
                 <w:szCs w:val="18"/>
               </w:rPr>
-              <w:t xml:space="preserve">Eliminazione degli utenti che non hanno mai operato (script 30).</w:t>
+              <w:t xml:space="preserve">Cruscotto diventa Dashboard; barra a LED delle 7 fasi per ogni pratica.</w:t>
             </w:r>
           </w:p>
         </w:tc>
@@ -2473,7 +2473,7 @@
                 <w:sz w:val="18"/>
                 <w:szCs w:val="18"/>
               </w:rPr>
-              <w:t xml:space="preserve">2.9</w:t>
+              <w:t xml:space="preserve">3.0</w:t>
             </w:r>
           </w:p>
         </w:tc>
@@ -2539,7 +2539,7 @@
                 <w:sz w:val="18"/>
                 <w:szCs w:val="18"/>
               </w:rPr>
-              <w:t xml:space="preserve">Email automatica con le credenziali al nuovo utente e alla reimpostazione della password.</w:t>
+              <w:t xml:space="preserve">Eliminazione degli utenti che non hanno mai operato (script 30).</w:t>
             </w:r>
           </w:p>
         </w:tc>
@@ -2609,7 +2609,7 @@
                 <w:sz w:val="18"/>
                 <w:szCs w:val="18"/>
               </w:rPr>
-              <w:t xml:space="preserve">2.8</w:t>
+              <w:t xml:space="preserve">2.9</w:t>
             </w:r>
           </w:p>
         </w:tc>
@@ -2673,7 +2673,7 @@
                 <w:sz w:val="18"/>
                 <w:szCs w:val="18"/>
               </w:rPr>
-              <w:t xml:space="preserve">Più Amministratori con accesso completo; Amministratore principale protetto (script 29).</w:t>
+              <w:t xml:space="preserve">Email automatica con le credenziali al nuovo utente e alla reimpostazione della password.</w:t>
             </w:r>
           </w:p>
         </w:tc>
@@ -2743,7 +2743,7 @@
                 <w:sz w:val="18"/>
                 <w:szCs w:val="18"/>
               </w:rPr>
-              <w:t xml:space="preserve">2.7</w:t>
+              <w:t xml:space="preserve">2.8</w:t>
             </w:r>
           </w:p>
         </w:tc>
@@ -2809,7 +2809,7 @@
                 <w:sz w:val="18"/>
                 <w:szCs w:val="18"/>
               </w:rPr>
-              <w:t xml:space="preserve">Simulatore: costi per il Comune secondo il Caso 1 (progetto volontario) o il Caso 2 (progetto obbligatorio da bando).</w:t>
+              <w:t xml:space="preserve">Più Amministratori con accesso completo; Amministratore principale protetto (script 29).</w:t>
             </w:r>
           </w:p>
         </w:tc>
@@ -2879,7 +2879,7 @@
                 <w:sz w:val="18"/>
                 <w:szCs w:val="18"/>
               </w:rPr>
-              <w:t xml:space="preserve">2.6</w:t>
+              <w:t xml:space="preserve">2.7</w:t>
             </w:r>
           </w:p>
         </w:tc>
@@ -2943,7 +2943,7 @@
                 <w:sz w:val="18"/>
                 <w:szCs w:val="18"/>
               </w:rPr>
-              <w:t xml:space="preserve">Simulatore: valore del credito anno per anno, proposto 32 €.</w:t>
+              <w:t xml:space="preserve">Simulatore: costi per il Comune secondo il Caso 1 (progetto volontario) o il Caso 2 (progetto obbligatorio da bando).</w:t>
             </w:r>
           </w:p>
         </w:tc>
@@ -3013,7 +3013,7 @@
                 <w:sz w:val="18"/>
                 <w:szCs w:val="18"/>
               </w:rPr>
-              <w:t xml:space="preserve">2.5</w:t>
+              <w:t xml:space="preserve">2.6</w:t>
             </w:r>
           </w:p>
         </w:tc>
@@ -3079,7 +3079,7 @@
                 <w:sz w:val="18"/>
                 <w:szCs w:val="18"/>
               </w:rPr>
-              <w:t xml:space="preserve">Simulatore: simulazione economica con valore unitario del credito e costi per il Comune (contratti tipo della Fondazione, Schema tariffario).</w:t>
+              <w:t xml:space="preserve">Simulatore: valore del credito anno per anno, proposto 32 €.</w:t>
             </w:r>
           </w:p>
         </w:tc>
@@ -3149,7 +3149,7 @@
                 <w:sz w:val="18"/>
                 <w:szCs w:val="18"/>
               </w:rPr>
-              <w:t xml:space="preserve">2.4</w:t>
+              <w:t xml:space="preserve">2.5</w:t>
             </w:r>
           </w:p>
         </w:tc>
@@ -3213,7 +3213,7 @@
                 <w:sz w:val="18"/>
                 <w:szCs w:val="18"/>
               </w:rPr>
-              <w:t xml:space="preserve">Simulatore: riferimento sempre alla soglia del 65% di differenziata e controllo dei valori fuori scala.</w:t>
+              <w:t xml:space="preserve">Simulatore: simulazione economica con valore unitario del credito e costi per il Comune (contratti tipo della Fondazione, Schema tariffario).</w:t>
             </w:r>
           </w:p>
         </w:tc>
@@ -3283,7 +3283,7 @@
                 <w:sz w:val="18"/>
                 <w:szCs w:val="18"/>
               </w:rPr>
-              <w:t xml:space="preserve">2.3</w:t>
+              <w:t xml:space="preserve">2.4</w:t>
             </w:r>
           </w:p>
         </w:tc>
@@ -3349,7 +3349,7 @@
                 <w:sz w:val="18"/>
                 <w:szCs w:val="18"/>
               </w:rPr>
-              <w:t xml:space="preserve">Simulatore conforme al modello CWP: scenario di riferimento dello Standard 4.8.1, situazione attuale, conformità.</w:t>
+              <w:t xml:space="preserve">Simulatore: riferimento sempre alla soglia del 65% di differenziata e controllo dei valori fuori scala.</w:t>
             </w:r>
           </w:p>
         </w:tc>
@@ -3419,7 +3419,7 @@
                 <w:sz w:val="18"/>
                 <w:szCs w:val="18"/>
               </w:rPr>
-              <w:t xml:space="preserve">2.2</w:t>
+              <w:t xml:space="preserve">2.3</w:t>
             </w:r>
           </w:p>
         </w:tc>
@@ -3483,7 +3483,7 @@
                 <w:sz w:val="18"/>
                 <w:szCs w:val="18"/>
               </w:rPr>
-              <w:t xml:space="preserve">Nuovo capitolo «Simulatore di scenari»: creazione, anno base, obiettivi annui, risultati, modello di stima.</w:t>
+              <w:t xml:space="preserve">Simulatore conforme al modello CWP: scenario di riferimento dello Standard 4.8.1, situazione attuale, conformità.</w:t>
             </w:r>
           </w:p>
         </w:tc>
@@ -3553,7 +3553,7 @@
                 <w:sz w:val="18"/>
                 <w:szCs w:val="18"/>
               </w:rPr>
-              <w:t xml:space="preserve">2.1</w:t>
+              <w:t xml:space="preserve">2.2</w:t>
             </w:r>
           </w:p>
         </w:tc>
@@ -3619,7 +3619,7 @@
                 <w:sz w:val="18"/>
                 <w:szCs w:val="18"/>
               </w:rPr>
-              <w:t xml:space="preserve">Funzioni in arrivo: simulatore di scenari (7, 10 o 21 anni, obiettivi annui, % di differenziata e crediti stimati) e assistente virtuale (Claude).</w:t>
+              <w:t xml:space="preserve">Nuovo capitolo «Simulatore di scenari»: creazione, anno base, obiettivi annui, risultati, modello di stima.</w:t>
             </w:r>
           </w:p>
         </w:tc>
@@ -3689,7 +3689,7 @@
                 <w:sz w:val="18"/>
                 <w:szCs w:val="18"/>
               </w:rPr>
-              <w:t xml:space="preserve">2.0</w:t>
+              <w:t xml:space="preserve">2.1</w:t>
             </w:r>
           </w:p>
         </w:tc>
@@ -3753,7 +3753,7 @@
                 <w:sz w:val="18"/>
                 <w:szCs w:val="18"/>
               </w:rPr>
-              <w:t xml:space="preserve">Copie di sicurezza e ripristino: rimando alle Istruzioni di ripristino e punti essenziali (capitolo Manutenzione ed emergenze).</w:t>
+              <w:t xml:space="preserve">Funzioni in arrivo: simulatore di scenari (7, 10 o 21 anni, obiettivi annui, % di differenziata e crediti stimati) e assistente virtuale (Claude).</w:t>
             </w:r>
           </w:p>
         </w:tc>
@@ -3823,7 +3823,7 @@
                 <w:sz w:val="18"/>
                 <w:szCs w:val="18"/>
               </w:rPr>
-              <w:t xml:space="preserve">1.9</w:t>
+              <w:t xml:space="preserve">2.0</w:t>
             </w:r>
           </w:p>
         </w:tc>
@@ -3889,7 +3889,7 @@
                 <w:sz w:val="18"/>
                 <w:szCs w:val="18"/>
               </w:rPr>
-              <w:t xml:space="preserve">Fondazione Operate soggetto promotore del programma (esclusiva conferita da Wastelab).</w:t>
+              <w:t xml:space="preserve">Copie di sicurezza e ripristino: rimando alle Istruzioni di ripristino e punti essenziali (capitolo Manutenzione ed emergenze).</w:t>
             </w:r>
           </w:p>
         </w:tc>
@@ -3959,7 +3959,7 @@
                 <w:sz w:val="18"/>
                 <w:szCs w:val="18"/>
               </w:rPr>
-              <w:t xml:space="preserve">1.8</w:t>
+              <w:t xml:space="preserve">1.9</w:t>
             </w:r>
           </w:p>
         </w:tc>
@@ -4023,7 +4023,7 @@
                 <w:sz w:val="18"/>
                 <w:szCs w:val="18"/>
               </w:rPr>
-              <w:t xml:space="preserve">PEC del Programma e documenti ufficiali già pubblicati sulla pagina pubblica.</w:t>
+              <w:t xml:space="preserve">Fondazione Operate soggetto promotore del programma (esclusiva conferita da Wastelab).</w:t>
             </w:r>
           </w:p>
         </w:tc>
@@ -4093,7 +4093,7 @@
                 <w:sz w:val="18"/>
                 <w:szCs w:val="18"/>
               </w:rPr>
-              <w:t xml:space="preserve">1.7</w:t>
+              <w:t xml:space="preserve">1.8</w:t>
             </w:r>
           </w:p>
         </w:tc>
@@ -4126,7 +4126,7 @@
                 <w:sz w:val="18"/>
                 <w:szCs w:val="18"/>
               </w:rPr>
-              <w:t xml:space="preserve">18/10/2026</w:t>
+              <w:t xml:space="preserve">19/10/2026</w:t>
             </w:r>
           </w:p>
         </w:tc>
@@ -4159,7 +4159,7 @@
                 <w:sz w:val="18"/>
                 <w:szCs w:val="18"/>
               </w:rPr>
-              <w:t xml:space="preserve">Allineamento ai documenti ufficiali del Programma (script 22-24): Rapporto a 7 fasi, feedback pubblico, stati del Programma, dati del progetto e territorio ISTAT, ritiro e rientro, account unico e delegati, registri, tariffe e sospensione, accuratezza e accertamenti, informazioni del Programma e metodologie, modelli pubblici; nuovi capitoli Crediti emessi, Reclami, Pagina pubblica; qualità dei dati nel calcolo.</w:t>
+              <w:t xml:space="preserve">PEC del Programma e documenti ufficiali già pubblicati sulla pagina pubblica.</w:t>
             </w:r>
           </w:p>
         </w:tc>
@@ -4229,7 +4229,7 @@
                 <w:sz w:val="18"/>
                 <w:szCs w:val="18"/>
               </w:rPr>
-              <w:t xml:space="preserve">1.6</w:t>
+              <w:t xml:space="preserve">1.7</w:t>
             </w:r>
           </w:p>
         </w:tc>
@@ -4293,7 +4293,7 @@
                 <w:sz w:val="18"/>
                 <w:szCs w:val="18"/>
               </w:rPr>
-              <w:t xml:space="preserve">Calcolo crediti: descrizione corretta del buffer (somma delle voci delle Tabelle 15 e 16, più il 20% con le sole utenze virtuose, al massimo 80%).</w:t>
+              <w:t xml:space="preserve">Allineamento ai documenti ufficiali del Programma (script 22-24): Rapporto a 7 fasi, feedback pubblico, stati del Programma, dati del progetto e territorio ISTAT, ritiro e rientro, account unico e delegati, registri, tariffe e sospensione, accuratezza e accertamenti, informazioni del Programma e metodologie, modelli pubblici; nuovi capitoli Crediti emessi, Reclami, Pagina pubblica; qualità dei dati nel calcolo.</w:t>
             </w:r>
           </w:p>
         </w:tc>
@@ -4363,7 +4363,7 @@
                 <w:sz w:val="18"/>
                 <w:szCs w:val="18"/>
               </w:rPr>
-              <w:t xml:space="preserve">1.5</w:t>
+              <w:t xml:space="preserve">1.6</w:t>
             </w:r>
           </w:p>
         </w:tc>
@@ -4429,7 +4429,7 @@
                 <w:sz w:val="18"/>
                 <w:szCs w:val="18"/>
               </w:rPr>
-              <w:t xml:space="preserve">Nuova pagina Anagrafiche (Organizzazioni ed Enti, anche per gli Operatori); Rapporti con 4 fasi e durate proprie; documenti richiesti per fase; consultazione con documento bloccato, osservazioni numerate e motivazione; conservazione per 10 anni; fascicolo con riepilogo PDF e nuove cartelle.</w:t>
+              <w:t xml:space="preserve">Calcolo crediti: descrizione corretta del buffer (somma delle voci delle Tabelle 15 e 16, più il 20% con le sole utenze virtuose, al massimo 80%).</w:t>
             </w:r>
           </w:p>
         </w:tc>
@@ -4499,7 +4499,7 @@
                 <w:sz w:val="18"/>
                 <w:szCs w:val="18"/>
               </w:rPr>
-              <w:t xml:space="preserve">1.4</w:t>
+              <w:t xml:space="preserve">1.5</w:t>
             </w:r>
           </w:p>
         </w:tc>
@@ -4563,7 +4563,7 @@
                 <w:sz w:val="18"/>
                 <w:szCs w:val="18"/>
               </w:rPr>
-              <w:t xml:space="preserve">Calcolo crediti: il risultato si azzera quando cambiano dati o Banca Dati Utenze, conferma solo dopo un nuovo «Calcola». Gestione utenti: password temporanea di almeno 10 caratteri con lettere e numeri, creazione annullata se non va a buon fine, nessun accesso ai dati prima del cambio password.</w:t>
+              <w:t xml:space="preserve">Nuova pagina Anagrafiche (Organizzazioni ed Enti, anche per gli Operatori); Rapporti con 4 fasi e durate proprie; documenti richiesti per fase; consultazione con documento bloccato, osservazioni numerate e motivazione; conservazione per 10 anni; fascicolo con riepilogo PDF e nuove cartelle.</w:t>
             </w:r>
           </w:p>
         </w:tc>
@@ -4633,7 +4633,7 @@
                 <w:sz w:val="18"/>
                 <w:szCs w:val="18"/>
               </w:rPr>
-              <w:t xml:space="preserve">1.3</w:t>
+              <w:t xml:space="preserve">1.4</w:t>
             </w:r>
           </w:p>
         </w:tc>
@@ -4699,7 +4699,7 @@
                 <w:sz w:val="18"/>
                 <w:szCs w:val="18"/>
               </w:rPr>
-              <w:t xml:space="preserve">Rapporto di calcolo in PDF, archiviazione nella pratica, numero di registro, registro dei crediti.</w:t>
+              <w:t xml:space="preserve">Calcolo crediti: il risultato si azzera quando cambiano dati o Banca Dati Utenze, conferma solo dopo un nuovo «Calcola». Gestione utenti: password temporanea di almeno 10 caratteri con lettere e numeri, creazione annullata se non va a buon fine, nessun accesso ai dati prima del cambio password.</w:t>
             </w:r>
           </w:p>
         </w:tc>
@@ -4769,7 +4769,7 @@
                 <w:sz w:val="18"/>
                 <w:szCs w:val="18"/>
               </w:rPr>
-              <w:t xml:space="preserve">1.2</w:t>
+              <w:t xml:space="preserve">1.3</w:t>
             </w:r>
           </w:p>
         </w:tc>
@@ -4833,7 +4833,7 @@
                 <w:sz w:val="18"/>
                 <w:szCs w:val="18"/>
               </w:rPr>
-              <w:t xml:space="preserve">Calcolo crediti: importare il tracciato nel calcolo (dai documenti della pratica o dal computer), singole letture, blocco dei dati personali, controlli di coerenza.</w:t>
+              <w:t xml:space="preserve">Rapporto di calcolo in PDF, archiviazione nella pratica, numero di registro, registro dei crediti.</w:t>
             </w:r>
           </w:p>
         </w:tc>
@@ -4903,7 +4903,7 @@
                 <w:sz w:val="18"/>
                 <w:szCs w:val="18"/>
               </w:rPr>
-              <w:t xml:space="preserve">1.1</w:t>
+              <w:t xml:space="preserve">1.2</w:t>
             </w:r>
           </w:p>
         </w:tc>
@@ -4969,7 +4969,7 @@
                 <w:sz w:val="18"/>
                 <w:szCs w:val="18"/>
               </w:rPr>
-              <w:t xml:space="preserve">Note di fase, Ente di Validazione della pratica, consultazione sulla pagina pubblica con conferma dell'email, moderazione con autori e allegati, errata corrige; nuovo capitolo Messaggi con il Comune; pagamenti visibili al Comune; Impostazioni: Enti di Validazione e Modelli di documento; notifiche aggiornate.</w:t>
+              <w:t xml:space="preserve">Calcolo crediti: importare il tracciato nel calcolo (dai documenti della pratica o dal computer), singole letture, blocco dei dati personali, controlli di coerenza.</w:t>
             </w:r>
           </w:p>
         </w:tc>
@@ -5039,6 +5039,140 @@
                 <w:sz w:val="18"/>
                 <w:szCs w:val="18"/>
               </w:rPr>
+              <w:t xml:space="preserve">1.1</w:t>
+            </w:r>
+          </w:p>
+        </w:tc>
+        <w:tc>
+          <w:tcPr>
+            <w:tcW w:type="dxa" w:w="1300"/>
+            <w:tcBorders>
+              <w:top w:val="single" w:color="D9D4C5" w:sz="4"/>
+              <w:left w:val="single" w:color="D9D4C5" w:sz="4"/>
+              <w:bottom w:val="single" w:color="D9D4C5" w:sz="4"/>
+              <w:right w:val="single" w:color="D9D4C5" w:sz="4"/>
+            </w:tcBorders>
+            <w:tcMar>
+              <w:top w:type="dxa" w:w="70"/>
+              <w:left w:type="dxa" w:w="110"/>
+              <w:bottom w:type="dxa" w:w="70"/>
+              <w:right w:type="dxa" w:w="110"/>
+            </w:tcMar>
+            <w:vAlign w:val="center"/>
+          </w:tcPr>
+          <w:p>
+            <w:pPr>
+              <w:spacing w:after="0" w:before="0"/>
+            </w:pPr>
+            <w:r>
+              <w:rPr>
+                <w:rFonts w:ascii="Arial" w:cs="Arial" w:eastAsia="Arial" w:hAnsi="Arial"/>
+                <w:color w:val="1B2118"/>
+                <w:sz w:val="18"/>
+                <w:szCs w:val="18"/>
+              </w:rPr>
+              <w:t xml:space="preserve">18/10/2026</w:t>
+            </w:r>
+          </w:p>
+        </w:tc>
+        <w:tc>
+          <w:tcPr>
+            <w:tcW w:type="dxa" w:w="5538"/>
+            <w:tcBorders>
+              <w:top w:val="single" w:color="D9D4C5" w:sz="4"/>
+              <w:left w:val="single" w:color="D9D4C5" w:sz="4"/>
+              <w:bottom w:val="single" w:color="D9D4C5" w:sz="4"/>
+              <w:right w:val="single" w:color="D9D4C5" w:sz="4"/>
+            </w:tcBorders>
+            <w:tcMar>
+              <w:top w:type="dxa" w:w="70"/>
+              <w:left w:type="dxa" w:w="110"/>
+              <w:bottom w:type="dxa" w:w="70"/>
+              <w:right w:type="dxa" w:w="110"/>
+            </w:tcMar>
+            <w:vAlign w:val="center"/>
+          </w:tcPr>
+          <w:p>
+            <w:pPr>
+              <w:spacing w:after="0" w:before="0"/>
+            </w:pPr>
+            <w:r>
+              <w:rPr>
+                <w:rFonts w:ascii="Arial" w:cs="Arial" w:eastAsia="Arial" w:hAnsi="Arial"/>
+                <w:color w:val="1B2118"/>
+                <w:sz w:val="18"/>
+                <w:szCs w:val="18"/>
+              </w:rPr>
+              <w:t xml:space="preserve">Note di fase, Ente di Validazione della pratica, consultazione sulla pagina pubblica con conferma dell'email, moderazione con autori e allegati, errata corrige; nuovo capitolo Messaggi con il Comune; pagamenti visibili al Comune; Impostazioni: Enti di Validazione e Modelli di documento; notifiche aggiornate.</w:t>
+            </w:r>
+          </w:p>
+        </w:tc>
+        <w:tc>
+          <w:tcPr>
+            <w:tcW w:type="dxa" w:w="2000"/>
+            <w:tcBorders>
+              <w:top w:val="single" w:color="D9D4C5" w:sz="4"/>
+              <w:left w:val="single" w:color="D9D4C5" w:sz="4"/>
+              <w:bottom w:val="single" w:color="D9D4C5" w:sz="4"/>
+              <w:right w:val="single" w:color="D9D4C5" w:sz="4"/>
+            </w:tcBorders>
+            <w:tcMar>
+              <w:top w:type="dxa" w:w="70"/>
+              <w:left w:type="dxa" w:w="110"/>
+              <w:bottom w:type="dxa" w:w="70"/>
+              <w:right w:type="dxa" w:w="110"/>
+            </w:tcMar>
+            <w:vAlign w:val="center"/>
+          </w:tcPr>
+          <w:p>
+            <w:pPr>
+              <w:spacing w:after="0" w:before="0"/>
+            </w:pPr>
+            <w:r>
+              <w:rPr>
+                <w:rFonts w:ascii="Arial" w:cs="Arial" w:eastAsia="Arial" w:hAnsi="Arial"/>
+                <w:color w:val="1B2118"/>
+                <w:sz w:val="18"/>
+                <w:szCs w:val="18"/>
+              </w:rPr>
+              <w:t xml:space="preserve">Fondazione Operate</w:t>
+            </w:r>
+          </w:p>
+        </w:tc>
+      </w:tr>
+      <w:tr>
+        <w:trPr>
+          <w:cantSplit/>
+        </w:trPr>
+        <w:tc>
+          <w:tcPr>
+            <w:tcW w:type="dxa" w:w="800"/>
+            <w:tcBorders>
+              <w:top w:val="single" w:color="D9D4C5" w:sz="4"/>
+              <w:left w:val="single" w:color="D9D4C5" w:sz="4"/>
+              <w:bottom w:val="single" w:color="D9D4C5" w:sz="4"/>
+              <w:right w:val="single" w:color="D9D4C5" w:sz="4"/>
+            </w:tcBorders>
+            <w:shd w:fill="F6F4EE" w:color="auto" w:val="clear"/>
+            <w:tcMar>
+              <w:top w:type="dxa" w:w="70"/>
+              <w:left w:type="dxa" w:w="110"/>
+              <w:bottom w:type="dxa" w:w="70"/>
+              <w:right w:type="dxa" w:w="110"/>
+            </w:tcMar>
+            <w:vAlign w:val="center"/>
+          </w:tcPr>
+          <w:p>
+            <w:pPr>
+              <w:spacing w:after="0" w:before="0"/>
+            </w:pPr>
+            <w:r>
+              <w:rPr>
+                <w:rFonts w:ascii="Arial" w:cs="Arial" w:eastAsia="Arial" w:hAnsi="Arial"/>
+                <w:color w:val="1B2118"/>
+                <w:sz w:val="18"/>
+                <w:szCs w:val="18"/>
+              </w:rPr>
               <w:t xml:space="preserve">1.0</w:t>
             </w:r>
           </w:p>
@@ -5052,6 +5186,7 @@
               <w:bottom w:val="single" w:color="D9D4C5" w:sz="4"/>
               <w:right w:val="single" w:color="D9D4C5" w:sz="4"/>
             </w:tcBorders>
+            <w:shd w:fill="F6F4EE" w:color="auto" w:val="clear"/>
             <w:tcMar>
               <w:top w:type="dxa" w:w="70"/>
               <w:left w:type="dxa" w:w="110"/>
@@ -5084,6 +5219,7 @@
               <w:bottom w:val="single" w:color="D9D4C5" w:sz="4"/>
               <w:right w:val="single" w:color="D9D4C5" w:sz="4"/>
             </w:tcBorders>
+            <w:shd w:fill="F6F4EE" w:color="auto" w:val="clear"/>
             <w:tcMar>
               <w:top w:type="dxa" w:w="70"/>
               <w:left w:type="dxa" w:w="110"/>
@@ -5116,6 +5252,7 @@
               <w:bottom w:val="single" w:color="D9D4C5" w:sz="4"/>
               <w:right w:val="single" w:color="D9D4C5" w:sz="4"/>
             </w:tcBorders>
+            <w:shd w:fill="F6F4EE" w:color="auto" w:val="clear"/>
             <w:tcMar>
               <w:top w:type="dxa" w:w="70"/>
               <w:left w:type="dxa" w:w="110"/>
@@ -5157,7 +5294,7 @@
           <w:sz w:val="20"/>
           <w:szCs w:val="20"/>
         </w:rPr>
-        <w:t xml:space="preserve">Questo documento descrive il portale alla revisione 4.2 del 20/10/2026. A ogni modifica del portale il manuale viene aggiornato e la revisione incrementata; la versione corrente si scarica dall'area Documentazione del portale (solo Amministratori).</w:t>
+        <w:t xml:space="preserve">Questo documento descrive il portale alla revisione 4.3 del 20/10/2026. A ogni modifica del portale il manuale viene aggiornato e la revisione incrementata; la versione corrente si scarica dall'area Documentazione del portale (solo Amministratori).</w:t>
       </w:r>
     </w:p>
     <w:p>
@@ -5731,7 +5868,7 @@
             <w:szCs w:val="22"/>
           </w:rPr>
           <w:tab/>
-          <w:t xml:space="preserve">38</w:t>
+          <w:t xml:space="preserve">39</w:t>
         </w:r>
       </w:hyperlink>
     </w:p>
@@ -5760,7 +5897,7 @@
             <w:szCs w:val="22"/>
           </w:rPr>
           <w:tab/>
-          <w:t xml:space="preserve">42</w:t>
+          <w:t xml:space="preserve">43</w:t>
         </w:r>
       </w:hyperlink>
     </w:p>
@@ -5789,7 +5926,7 @@
             <w:szCs w:val="22"/>
           </w:rPr>
           <w:tab/>
-          <w:t xml:space="preserve">44</w:t>
+          <w:t xml:space="preserve">45</w:t>
         </w:r>
       </w:hyperlink>
     </w:p>
@@ -5818,7 +5955,7 @@
             <w:szCs w:val="22"/>
           </w:rPr>
           <w:tab/>
-          <w:t xml:space="preserve">45</w:t>
+          <w:t xml:space="preserve">46</w:t>
         </w:r>
       </w:hyperlink>
     </w:p>
@@ -5847,7 +5984,7 @@
             <w:szCs w:val="22"/>
           </w:rPr>
           <w:tab/>
-          <w:t xml:space="preserve">46</w:t>
+          <w:t xml:space="preserve">47</w:t>
         </w:r>
       </w:hyperlink>
     </w:p>
@@ -5876,7 +6013,7 @@
             <w:szCs w:val="22"/>
           </w:rPr>
           <w:tab/>
-          <w:t xml:space="preserve">47</w:t>
+          <w:t xml:space="preserve">48</w:t>
         </w:r>
       </w:hyperlink>
     </w:p>
@@ -5905,7 +6042,7 @@
             <w:szCs w:val="22"/>
           </w:rPr>
           <w:tab/>
-          <w:t xml:space="preserve">48</w:t>
+          <w:t xml:space="preserve">49</w:t>
         </w:r>
       </w:hyperlink>
     </w:p>
@@ -5934,7 +6071,7 @@
             <w:szCs w:val="22"/>
           </w:rPr>
           <w:tab/>
-          <w:t xml:space="preserve">49</w:t>
+          <w:t xml:space="preserve">50</w:t>
         </w:r>
       </w:hyperlink>
     </w:p>
@@ -5963,7 +6100,7 @@
             <w:szCs w:val="22"/>
           </w:rPr>
           <w:tab/>
-          <w:t xml:space="preserve">50</w:t>
+          <w:t xml:space="preserve">51</w:t>
         </w:r>
       </w:hyperlink>
     </w:p>
@@ -7908,7 +8045,7 @@
         </w:rPr>
         <w:t xml:space="preserve">Si accede da </w:t>
       </w:r>
-      <w:hyperlink w:history="1" r:id="rId2vaq2nlw6-vu76khcgcsu">
+      <w:hyperlink w:history="1" r:id="rIdqldxrl2re3paosp5egwlc">
         <w:r>
           <w:rPr>
             <w:rFonts w:ascii="Arial" w:cs="Arial" w:eastAsia="Arial" w:hAnsi="Arial"/>
@@ -23483,6 +23620,26 @@
           <w:sz w:val="21"/>
           <w:szCs w:val="21"/>
         </w:rPr>
+        <w:t xml:space="preserve">Oggetto e modifiche</w:t>
+      </w:r>
+      <w:r>
+        <w:rPr>
+          <w:rFonts w:ascii="Arial" w:cs="Arial" w:eastAsia="Arial" w:hAnsi="Arial"/>
+          <w:color w:val="1B2118"/>
+          <w:sz w:val="21"/>
+          <w:szCs w:val="21"/>
+        </w:rPr>
+        <w:t xml:space="preserve">, </w:t>
+      </w:r>
+      <w:r>
+        <w:rPr>
+          <w:rFonts w:ascii="Arial" w:cs="Arial" w:eastAsia="Arial" w:hAnsi="Arial"/>
+          <w:b/>
+          <w:bCs/>
+          <w:color w:val="1B2118"/>
+          <w:sz w:val="21"/>
+          <w:szCs w:val="21"/>
+        </w:rPr>
         <w:t xml:space="preserve">Da → A</w:t>
       </w:r>
       <w:r>
@@ -23527,11 +23684,101 @@
       <w:r>
         <w:rPr>
           <w:rFonts w:ascii="Arial" w:cs="Arial" w:eastAsia="Arial" w:hAnsi="Arial"/>
-          <w:color w:val="1B2118"/>
-          <w:sz w:val="21"/>
-          <w:szCs w:val="21"/>
-        </w:rPr>
-        <w:t xml:space="preserve">Il campo di ricerca filtra per operazione, utente, pratica o motivazione.</w:t>
+          <w:b/>
+          <w:bCs/>
+          <w:color w:val="1B2118"/>
+          <w:sz w:val="21"/>
+          <w:szCs w:val="21"/>
+        </w:rPr>
+        <w:t xml:space="preserve">Oggetto e modifiche</w:t>
+      </w:r>
+      <w:r>
+        <w:rPr>
+          <w:rFonts w:ascii="Arial" w:cs="Arial" w:eastAsia="Arial" w:hAnsi="Arial"/>
+          <w:color w:val="1B2118"/>
+          <w:sz w:val="21"/>
+          <w:szCs w:val="21"/>
+        </w:rPr>
+        <w:t xml:space="preserve"> (dal 20/10/2026, collaudo V01): tipo e nome dell'oggetto con il codice breve (le prime 8 cifre del suo identificativo), per esempio </w:t>
+      </w:r>
+      <w:r>
+        <w:rPr>
+          <w:rFonts w:ascii="Arial" w:cs="Arial" w:eastAsia="Arial" w:hAnsi="Arial"/>
+          <w:i/>
+          <w:iCs/>
+          <w:color w:val="1B2118"/>
+          <w:sz w:val="21"/>
+          <w:szCs w:val="21"/>
+        </w:rPr>
+        <w:t xml:space="preserve">Scenario del simulatore «Obiettivo» (5c3a9e10)</w:t>
+      </w:r>
+      <w:r>
+        <w:rPr>
+          <w:rFonts w:ascii="Arial" w:cs="Arial" w:eastAsia="Arial" w:hAnsi="Arial"/>
+          <w:color w:val="1B2118"/>
+          <w:sz w:val="21"/>
+          <w:szCs w:val="21"/>
+        </w:rPr>
+        <w:t xml:space="preserve">. Per le modifiche, </w:t>
+      </w:r>
+      <w:r>
+        <w:rPr>
+          <w:rFonts w:ascii="Arial" w:cs="Arial" w:eastAsia="Arial" w:hAnsi="Arial"/>
+          <w:b/>
+          <w:bCs/>
+          <w:color w:val="1B2118"/>
+          <w:sz w:val="21"/>
+          <w:szCs w:val="21"/>
+        </w:rPr>
+        <w:t xml:space="preserve">n modifiche</w:t>
+      </w:r>
+      <w:r>
+        <w:rPr>
+          <w:rFonts w:ascii="Arial" w:cs="Arial" w:eastAsia="Arial" w:hAnsi="Arial"/>
+          <w:color w:val="1B2118"/>
+          <w:sz w:val="21"/>
+          <w:szCs w:val="21"/>
+        </w:rPr>
+        <w:t xml:space="preserve"> si apre con un clic e mostra ogni campo cambiato «da → a»: per gli scenari buffer, popolazione e produzione anno per anno, valore del credito, crediti stimati e ora del ricalcolo. Le stesse informazioni sono nella scheda Operazioni di </w:t>
+      </w:r>
+      <w:r>
+        <w:rPr>
+          <w:rFonts w:ascii="Arial" w:cs="Arial" w:eastAsia="Arial" w:hAnsi="Arial"/>
+          <w:b/>
+          <w:bCs/>
+          <w:color w:val="1B2118"/>
+          <w:sz w:val="21"/>
+          <w:szCs w:val="21"/>
+        </w:rPr>
+        <w:t xml:space="preserve">Audit User</w:t>
+      </w:r>
+      <w:r>
+        <w:rPr>
+          <w:rFonts w:ascii="Arial" w:cs="Arial" w:eastAsia="Arial" w:hAnsi="Arial"/>
+          <w:color w:val="1B2118"/>
+          <w:sz w:val="21"/>
+          <w:szCs w:val="21"/>
+        </w:rPr>
+        <w:t xml:space="preserve"> e nel suo CSV (colonne «Id oggetto» e «Modifiche»). Gli eventi registrati non cambiano: la pagina li legge e basta.</w:t>
+      </w:r>
+    </w:p>
+    <w:p>
+      <w:pPr>
+        <w:pStyle w:val="ListParagraph"/>
+        <w:numPr>
+          <w:ilvl w:val="0"/>
+          <w:numId w:val="2"/>
+        </w:numPr>
+        <w:spacing w:after="70" w:line="290"/>
+      </w:pPr>
+      <w:r>
+        <w:rPr>
+          <w:rFonts w:ascii="Arial" w:cs="Arial" w:eastAsia="Arial" w:hAnsi="Arial"/>
+          <w:color w:val="1B2118"/>
+          <w:sz w:val="21"/>
+          <w:szCs w:val="21"/>
+        </w:rPr>
+        <w:t xml:space="preserve">Il campo di ricerca filtra per operazione, utente, pratica, oggetto (anche per nome o codice dello scenario) o motivazione.</w:t>
       </w:r>
     </w:p>
     <w:p>
@@ -32847,6 +33094,71 @@
       <w:r>
         <w:rPr>
           <w:rFonts w:ascii="Arial" w:cs="Arial" w:eastAsia="Arial" w:hAnsi="Arial"/>
+          <w:b/>
+          <w:bCs/>
+          <w:color w:val="1B2118"/>
+          <w:sz w:val="21"/>
+          <w:szCs w:val="21"/>
+        </w:rPr>
+        <w:t xml:space="preserve">Tutto o niente (dal 20/10/2026, collaudo V01).</w:t>
+      </w:r>
+      <w:r>
+        <w:rPr>
+          <w:rFonts w:ascii="Arial" w:cs="Arial" w:eastAsia="Arial" w:hAnsi="Arial"/>
+          <w:color w:val="1B2118"/>
+          <w:sz w:val="21"/>
+          <w:szCs w:val="21"/>
+        </w:rPr>
+        <w:t xml:space="preserve"> Prima di salvare il portale controlla ogni riga del file. Basta una riga con un errore perché il file </w:t>
+      </w:r>
+      <w:r>
+        <w:rPr>
+          <w:rFonts w:ascii="Arial" w:cs="Arial" w:eastAsia="Arial" w:hAnsi="Arial"/>
+          <w:b/>
+          <w:bCs/>
+          <w:color w:val="1B2118"/>
+          <w:sz w:val="21"/>
+          <w:szCs w:val="21"/>
+        </w:rPr>
+        <w:t xml:space="preserve">non venga importato</w:t>
+      </w:r>
+      <w:r>
+        <w:rPr>
+          <w:rFonts w:ascii="Arial" w:cs="Arial" w:eastAsia="Arial" w:hAnsi="Arial"/>
+          <w:color w:val="1B2118"/>
+          <w:sz w:val="21"/>
+          <w:szCs w:val="21"/>
+        </w:rPr>
+        <w:t xml:space="preserve"> e la Banca Dati salvata resti quella di prima. Sono errori: un </w:t>
+      </w:r>
+      <w:r>
+        <w:rPr>
+          <w:rFonts w:ascii="Arial" w:cs="Arial" w:eastAsia="Arial" w:hAnsi="Arial"/>
+          <w:b/>
+          <w:bCs/>
+          <w:color w:val="1B2118"/>
+          <w:sz w:val="21"/>
+          <w:szCs w:val="21"/>
+        </w:rPr>
+        <w:t xml:space="preserve">valore negativo</w:t>
+      </w:r>
+      <w:r>
+        <w:rPr>
+          <w:rFonts w:ascii="Arial" w:cs="Arial" w:eastAsia="Arial" w:hAnsi="Arial"/>
+          <w:color w:val="1B2118"/>
+          <w:sz w:val="21"/>
+          <w:szCs w:val="21"/>
+        </w:rPr>
+        <w:t xml:space="preserve"> (svuotamenti, volumi, pesi, pezzi, N. utenze), un testo al posto di un numero, un dato obbligatorio mancante, una macrocategoria o una tipologia non riconosciute. Il messaggio «File non importato: n righe da correggere» indica le prime righe con il motivo. Zero e celle vuote restano ammessi. Le stesse regole valgono nel salvataggio e nel database (script 35).</w:t>
+      </w:r>
+    </w:p>
+    <w:p>
+      <w:pPr>
+        <w:spacing w:after="140" w:line="300"/>
+      </w:pPr>
+      <w:r>
+        <w:rPr>
+          <w:rFonts w:ascii="Arial" w:cs="Arial" w:eastAsia="Arial" w:hAnsi="Arial"/>
           <w:color w:val="1B2118"/>
           <w:sz w:val="21"/>
           <w:szCs w:val="21"/>
@@ -33065,6 +33377,40 @@
       <w:r>
         <w:rPr>
           <w:rFonts w:ascii="Arial" w:cs="Arial" w:eastAsia="Arial" w:hAnsi="Arial"/>
+          <w:color w:val="1B2118"/>
+          <w:sz w:val="21"/>
+          <w:szCs w:val="21"/>
+        </w:rPr>
+        <w:t xml:space="preserve">Il </w:t>
+      </w:r>
+      <w:r>
+        <w:rPr>
+          <w:rFonts w:ascii="Arial" w:cs="Arial" w:eastAsia="Arial" w:hAnsi="Arial"/>
+          <w:b/>
+          <w:bCs/>
+          <w:color w:val="1B2118"/>
+          <w:sz w:val="21"/>
+          <w:szCs w:val="21"/>
+        </w:rPr>
+        <w:t xml:space="preserve">buffer indicato a mano</w:t>
+      </w:r>
+      <w:r>
+        <w:rPr>
+          <w:rFonts w:ascii="Arial" w:cs="Arial" w:eastAsia="Arial" w:hAnsi="Arial"/>
+          <w:color w:val="1B2118"/>
+          <w:sz w:val="21"/>
+          <w:szCs w:val="21"/>
+        </w:rPr>
+        <w:t xml:space="preserve"> deve essere un numero tra 0 e 80%: fuori da questo intervallo il calcolo si blocca con un messaggio (prima il valore veniva tagliato a 80 senza avviso).</w:t>
+      </w:r>
+    </w:p>
+    <w:p>
+      <w:pPr>
+        <w:spacing w:after="140" w:line="300"/>
+      </w:pPr>
+      <w:r>
+        <w:rPr>
+          <w:rFonts w:ascii="Arial" w:cs="Arial" w:eastAsia="Arial" w:hAnsi="Arial"/>
           <w:b/>
           <w:bCs/>
           <w:color w:val="1B2118"/>
@@ -33081,6 +33427,71 @@
           <w:szCs w:val="21"/>
         </w:rPr>
         <w:t xml:space="preserve"> Premete </w:t>
+      </w:r>
+      <w:r>
+        <w:rPr>
+          <w:rFonts w:ascii="Arial" w:cs="Arial" w:eastAsia="Arial" w:hAnsi="Arial"/>
+          <w:b/>
+          <w:bCs/>
+          <w:color w:val="1B2118"/>
+          <w:sz w:val="21"/>
+          <w:szCs w:val="21"/>
+        </w:rPr>
+        <w:t xml:space="preserve">Calcola</w:t>
+      </w:r>
+      <w:r>
+        <w:rPr>
+          <w:rFonts w:ascii="Arial" w:cs="Arial" w:eastAsia="Arial" w:hAnsi="Arial"/>
+          <w:color w:val="1B2118"/>
+          <w:sz w:val="21"/>
+          <w:szCs w:val="21"/>
+        </w:rPr>
+        <w:t xml:space="preserve">.</w:t>
+      </w:r>
+    </w:p>
+    <w:p>
+      <w:pPr>
+        <w:spacing w:after="140" w:line="300"/>
+      </w:pPr>
+      <w:r>
+        <w:rPr>
+          <w:rFonts w:ascii="Arial" w:cs="Arial" w:eastAsia="Arial" w:hAnsi="Arial"/>
+          <w:b/>
+          <w:bCs/>
+          <w:color w:val="1B2118"/>
+          <w:sz w:val="21"/>
+          <w:szCs w:val="21"/>
+        </w:rPr>
+        <w:t xml:space="preserve">Calcolo bloccato.</w:t>
+      </w:r>
+      <w:r>
+        <w:rPr>
+          <w:rFonts w:ascii="Arial" w:cs="Arial" w:eastAsia="Arial" w:hAnsi="Arial"/>
+          <w:color w:val="1B2118"/>
+          <w:sz w:val="21"/>
+          <w:szCs w:val="21"/>
+        </w:rPr>
+        <w:t xml:space="preserve"> Con dati impossibili (valori negativi nella Banca Dati, quantità negative dei rifiuti, data di avvio inesistente come 31/02, buffer fuori da 0-80%) compare il riquadro rosso </w:t>
+      </w:r>
+      <w:r>
+        <w:rPr>
+          <w:rFonts w:ascii="Arial" w:cs="Arial" w:eastAsia="Arial" w:hAnsi="Arial"/>
+          <w:b/>
+          <w:bCs/>
+          <w:color w:val="1B2118"/>
+          <w:sz w:val="21"/>
+          <w:szCs w:val="21"/>
+        </w:rPr>
+        <w:t xml:space="preserve">«Calcolo bloccato: dati non ammessi»</w:t>
+      </w:r>
+      <w:r>
+        <w:rPr>
+          <w:rFonts w:ascii="Arial" w:cs="Arial" w:eastAsia="Arial" w:hAnsi="Arial"/>
+          <w:color w:val="1B2118"/>
+          <w:sz w:val="21"/>
+          <w:szCs w:val="21"/>
+        </w:rPr>
+        <w:t xml:space="preserve"> con l'elenco degli errori. Crediti e debito valgono zero, il risultato non si salva e, se ce n'era uno salvato, viene tolto: il calcolo non si può confermare finché non si correggono i dati e si preme di nuovo </w:t>
       </w:r>
       <w:r>
         <w:rPr>
@@ -34409,7 +34820,27 @@
           <w:sz w:val="21"/>
           <w:szCs w:val="21"/>
         </w:rPr>
-        <w:t xml:space="preserve"> (attivo solo se gli scostamenti oltre il 30% sono motivati).</w:t>
+        <w:t xml:space="preserve">. Il pulsante è attivo solo se gli scostamenti oltre il 30% sono motivati </w:t>
+      </w:r>
+      <w:r>
+        <w:rPr>
+          <w:rFonts w:ascii="Arial" w:cs="Arial" w:eastAsia="Arial" w:hAnsi="Arial"/>
+          <w:b/>
+          <w:bCs/>
+          <w:color w:val="1B2118"/>
+          <w:sz w:val="21"/>
+          <w:szCs w:val="21"/>
+        </w:rPr>
+        <w:t xml:space="preserve">e</w:t>
+      </w:r>
+      <w:r>
+        <w:rPr>
+          <w:rFonts w:ascii="Arial" w:cs="Arial" w:eastAsia="Arial" w:hAnsi="Arial"/>
+          <w:color w:val="1B2118"/>
+          <w:sz w:val="21"/>
+          <w:szCs w:val="21"/>
+        </w:rPr>
+        <w:t xml:space="preserve"> se i controlli di coerenza non segnalano errori (per esempio Banca Dati Utenze mancante, PEF che non fa 100%, classi assenti nella delibera, valori negativi): gli errori sono elencati nel riquadro. Gli avvisi («Da verificare») non bloccano. Il database rifiuta comunque la conferma di un calcolo senza Banca Dati Utenze o con un risultato bloccato (script 35). Questa regola è stata introdotta dopo il collaudo V01 (riserva R05) ed è da confermare con la Fondazione.</w:t>
       </w:r>
     </w:p>
     <w:p>
@@ -35998,6 +36429,219 @@
           <w:szCs w:val="21"/>
         </w:rPr>
         <w:t xml:space="preserve"> si parte da uno esistente e si cambia solo qualche obiettivo.</w:t>
+      </w:r>
+    </w:p>
+    <w:p>
+      <w:pPr>
+        <w:spacing w:after="140" w:line="300"/>
+      </w:pPr>
+      <w:r>
+        <w:rPr>
+          <w:rFonts w:ascii="Arial" w:cs="Arial" w:eastAsia="Arial" w:hAnsi="Arial"/>
+          <w:b/>
+          <w:bCs/>
+          <w:color w:val="1B2118"/>
+          <w:sz w:val="21"/>
+          <w:szCs w:val="21"/>
+        </w:rPr>
+        <w:t xml:space="preserve">Dati non ammessi (dal 20/10/2026, collaudo V01).</w:t>
+      </w:r>
+      <w:r>
+        <w:rPr>
+          <w:rFonts w:ascii="Arial" w:cs="Arial" w:eastAsia="Arial" w:hAnsi="Arial"/>
+          <w:color w:val="1B2118"/>
+          <w:sz w:val="21"/>
+          <w:szCs w:val="21"/>
+        </w:rPr>
+        <w:t xml:space="preserve"> Il simulatore non dà risultati e non salva lo scenario se un dato è fisicamente impossibile. Sono errori:</w:t>
+      </w:r>
+    </w:p>
+    <w:p>
+      <w:pPr>
+        <w:pStyle w:val="ListParagraph"/>
+        <w:numPr>
+          <w:ilvl w:val="0"/>
+          <w:numId w:val="2"/>
+        </w:numPr>
+        <w:spacing w:after="70" w:line="290"/>
+      </w:pPr>
+      <w:r>
+        <w:rPr>
+          <w:rFonts w:ascii="Arial" w:cs="Arial" w:eastAsia="Arial" w:hAnsi="Arial"/>
+          <w:color w:val="1B2118"/>
+          <w:sz w:val="21"/>
+          <w:szCs w:val="21"/>
+        </w:rPr>
+        <w:t xml:space="preserve">popolazione o produzione totale negative o zero;</w:t>
+      </w:r>
+    </w:p>
+    <w:p>
+      <w:pPr>
+        <w:pStyle w:val="ListParagraph"/>
+        <w:numPr>
+          <w:ilvl w:val="0"/>
+          <w:numId w:val="2"/>
+        </w:numPr>
+        <w:spacing w:after="70" w:line="290"/>
+      </w:pPr>
+      <w:r>
+        <w:rPr>
+          <w:rFonts w:ascii="Arial" w:cs="Arial" w:eastAsia="Arial" w:hAnsi="Arial"/>
+          <w:color w:val="1B2118"/>
+          <w:sz w:val="21"/>
+          <w:szCs w:val="21"/>
+        </w:rPr>
+        <w:t xml:space="preserve">secco negativo, oppure secco maggiore della produzione (differenziata oltre il 100%);</w:t>
+      </w:r>
+    </w:p>
+    <w:p>
+      <w:pPr>
+        <w:pStyle w:val="ListParagraph"/>
+        <w:numPr>
+          <w:ilvl w:val="0"/>
+          <w:numId w:val="2"/>
+        </w:numPr>
+        <w:spacing w:after="70" w:line="290"/>
+      </w:pPr>
+      <w:r>
+        <w:rPr>
+          <w:rFonts w:ascii="Arial" w:cs="Arial" w:eastAsia="Arial" w:hAnsi="Arial"/>
+          <w:color w:val="1B2118"/>
+          <w:sz w:val="21"/>
+          <w:szCs w:val="21"/>
+        </w:rPr>
+        <w:t xml:space="preserve">rifiuti di riferimento negativi;</w:t>
+      </w:r>
+    </w:p>
+    <w:p>
+      <w:pPr>
+        <w:pStyle w:val="ListParagraph"/>
+        <w:numPr>
+          <w:ilvl w:val="0"/>
+          <w:numId w:val="2"/>
+        </w:numPr>
+        <w:spacing w:after="70" w:line="290"/>
+      </w:pPr>
+      <w:r>
+        <w:rPr>
+          <w:rFonts w:ascii="Arial" w:cs="Arial" w:eastAsia="Arial" w:hAnsi="Arial"/>
+          <w:color w:val="1B2118"/>
+          <w:sz w:val="21"/>
+          <w:szCs w:val="21"/>
+        </w:rPr>
+        <w:t xml:space="preserve">buffer fuori da 0-80%, oppure campo del buffer vuoto;</w:t>
+      </w:r>
+    </w:p>
+    <w:p>
+      <w:pPr>
+        <w:pStyle w:val="ListParagraph"/>
+        <w:numPr>
+          <w:ilvl w:val="0"/>
+          <w:numId w:val="2"/>
+        </w:numPr>
+        <w:spacing w:after="70" w:line="290"/>
+      </w:pPr>
+      <w:r>
+        <w:rPr>
+          <w:rFonts w:ascii="Arial" w:cs="Arial" w:eastAsia="Arial" w:hAnsi="Arial"/>
+          <w:color w:val="1B2118"/>
+          <w:sz w:val="21"/>
+          <w:szCs w:val="21"/>
+        </w:rPr>
+        <w:t xml:space="preserve">valori del credito o costi negativi o non numerici;</w:t>
+      </w:r>
+    </w:p>
+    <w:p>
+      <w:pPr>
+        <w:pStyle w:val="ListParagraph"/>
+        <w:numPr>
+          <w:ilvl w:val="0"/>
+          <w:numId w:val="2"/>
+        </w:numPr>
+        <w:spacing w:after="70" w:line="290"/>
+      </w:pPr>
+      <w:r>
+        <w:rPr>
+          <w:rFonts w:ascii="Arial" w:cs="Arial" w:eastAsia="Arial" w:hAnsi="Arial"/>
+          <w:color w:val="1B2118"/>
+          <w:sz w:val="21"/>
+          <w:szCs w:val="21"/>
+        </w:rPr>
+        <w:t xml:space="preserve">valore minimo del credito più alto del massimo.</w:t>
+      </w:r>
+    </w:p>
+    <w:p>
+      <w:pPr>
+        <w:spacing w:after="140" w:line="300"/>
+      </w:pPr>
+      <w:r>
+        <w:rPr>
+          <w:rFonts w:ascii="Arial" w:cs="Arial" w:eastAsia="Arial" w:hAnsi="Arial"/>
+          <w:color w:val="1B2118"/>
+          <w:sz w:val="21"/>
+          <w:szCs w:val="21"/>
+        </w:rPr>
+        <w:t xml:space="preserve">In questi casi il riquadro rosso nei Risultati elenca gli errori e accanto a </w:t>
+      </w:r>
+      <w:r>
+        <w:rPr>
+          <w:rFonts w:ascii="Arial" w:cs="Arial" w:eastAsia="Arial" w:hAnsi="Arial"/>
+          <w:b/>
+          <w:bCs/>
+          <w:color w:val="1B2118"/>
+          <w:sz w:val="21"/>
+          <w:szCs w:val="21"/>
+        </w:rPr>
+        <w:t xml:space="preserve">Salva</w:t>
+      </w:r>
+      <w:r>
+        <w:rPr>
+          <w:rFonts w:ascii="Arial" w:cs="Arial" w:eastAsia="Arial" w:hAnsi="Arial"/>
+          <w:color w:val="1B2118"/>
+          <w:sz w:val="21"/>
+          <w:szCs w:val="21"/>
+        </w:rPr>
+        <w:t xml:space="preserve">, che resta disattivato, compare «Da correggere prima di salvare: n». Un campo lasciato </w:t>
+      </w:r>
+      <w:r>
+        <w:rPr>
+          <w:rFonts w:ascii="Arial" w:cs="Arial" w:eastAsia="Arial" w:hAnsi="Arial"/>
+          <w:b/>
+          <w:bCs/>
+          <w:color w:val="1B2118"/>
+          <w:sz w:val="21"/>
+          <w:szCs w:val="21"/>
+        </w:rPr>
+        <w:t xml:space="preserve">vuoto</w:t>
+      </w:r>
+      <w:r>
+        <w:rPr>
+          <w:rFonts w:ascii="Arial" w:cs="Arial" w:eastAsia="Arial" w:hAnsi="Arial"/>
+          <w:color w:val="1B2118"/>
+          <w:sz w:val="21"/>
+          <w:szCs w:val="21"/>
+        </w:rPr>
+        <w:t xml:space="preserve"> vuol dire «non indicato» (per esempio l'anno prende il punto di partenza). Lo </w:t>
+      </w:r>
+      <w:r>
+        <w:rPr>
+          <w:rFonts w:ascii="Arial" w:cs="Arial" w:eastAsia="Arial" w:hAnsi="Arial"/>
+          <w:b/>
+          <w:bCs/>
+          <w:color w:val="1B2118"/>
+          <w:sz w:val="21"/>
+          <w:szCs w:val="21"/>
+        </w:rPr>
+        <w:t xml:space="preserve">zero</w:t>
+      </w:r>
+      <w:r>
+        <w:rPr>
+          <w:rFonts w:ascii="Arial" w:cs="Arial" w:eastAsia="Arial" w:hAnsi="Arial"/>
+          <w:color w:val="1B2118"/>
+          <w:sz w:val="21"/>
+          <w:szCs w:val="21"/>
+        </w:rPr>
+        <w:t xml:space="preserve"> invece è un valore vero: un valore del credito 0 in un anno dà ricavi 0 in quell'anno, e un valore minimo 0 dà lo scenario peggiore con ricavi 0. Il database ripete gli stessi controlli (script 35).</w:t>
       </w:r>
     </w:p>
     <w:p>
@@ -44495,7 +45139,7 @@
         <w:szCs w:val="16"/>
       </w:rPr>
       <w:tab/>
-      <w:t xml:space="preserve">Manuale Amministratore · Rev. 4.2 · 20/10/2026</w:t>
+      <w:t xml:space="preserve">Manuale Amministratore · Rev. 4.3 · 20/10/2026</w:t>
     </w:r>
   </w:p>
 </w:hdr>
@@ -44560,7 +45204,7 @@
         <w:szCs w:val="16"/>
       </w:rPr>
       <w:tab/>
-      <w:t xml:space="preserve">Manuale Amministratore · Rev. 4.2 · 20/10/2026</w:t>
+      <w:t xml:space="preserve">Manuale Amministratore · Rev. 4.3 · 20/10/2026</w:t>
     </w:r>
   </w:p>
 </w:hdr>

</xml_diff>

<commit_message>
Collaudo V05: testo completo dei valori nell'Audit (D05-R1), pagina Account disattivato (O01), risposte nel documento
Co-Authored-By: Claude Opus 5.5 <noreply@anthropic.com>
Claude-Session: https://claude.ai/code/session_01E8XCbEeVHWVP3hntUZ6kZ1
</commit_message>
<xml_diff>
--- a/public/documentazione/Manuale_Amministratore_Portale_CWP.docx
+++ b/public/documentazione/Manuale_Amministratore_Portale_CWP.docx
@@ -302,7 +302,7 @@
                 <w:sz w:val="20"/>
                 <w:szCs w:val="20"/>
               </w:rPr>
-              <w:t xml:space="preserve">Rev. 4.3</w:t>
+              <w:t xml:space="preserve">Rev. 4.4</w:t>
             </w:r>
           </w:p>
         </w:tc>
@@ -365,7 +365,7 @@
                 <w:sz w:val="20"/>
                 <w:szCs w:val="20"/>
               </w:rPr>
-              <w:t xml:space="preserve">20/10/2026</w:t>
+              <w:t xml:space="preserve">21/10/2026</w:t>
             </w:r>
           </w:p>
         </w:tc>
@@ -719,7 +719,7 @@
                 <w:sz w:val="18"/>
                 <w:szCs w:val="18"/>
               </w:rPr>
-              <w:t xml:space="preserve">4.3</w:t>
+              <w:t xml:space="preserve">4.4</w:t>
             </w:r>
           </w:p>
         </w:tc>
@@ -751,7 +751,7 @@
                 <w:sz w:val="18"/>
                 <w:szCs w:val="18"/>
               </w:rPr>
-              <w:t xml:space="preserve">20/10/2026</w:t>
+              <w:t xml:space="preserve">21/10/2026</w:t>
             </w:r>
           </w:p>
         </w:tc>
@@ -783,7 +783,7 @@
                 <w:sz w:val="18"/>
                 <w:szCs w:val="18"/>
               </w:rPr>
-              <w:t xml:space="preserve">Correzioni del collaudo V01: import CSV della Banca Dati «tutto o niente» senza valori negativi, calcolo bloccato con dati non ammessi, buffer manuale 0-80%, conferma definitiva solo senza errori di coerenza, dati non ammessi nel simulatore e zero esplicito nei prezzi, colonna «Oggetto e modifiche» nell'Audit.</w:t>
+              <w:t xml:space="preserve">Collaudo V05: testo completo dei valori lunghi nell'Audit (Prima/Dopo, Tolto/Aggiunto), denominazione delle organizzazioni e ricerca sui valori cambiati; pagina «Account disattivato».</w:t>
             </w:r>
           </w:p>
         </w:tc>
@@ -853,7 +853,7 @@
                 <w:sz w:val="18"/>
                 <w:szCs w:val="18"/>
               </w:rPr>
-              <w:t xml:space="preserve">4.2</w:t>
+              <w:t xml:space="preserve">4.3</w:t>
             </w:r>
           </w:p>
         </w:tc>
@@ -919,7 +919,7 @@
                 <w:sz w:val="18"/>
                 <w:szCs w:val="18"/>
               </w:rPr>
-              <w:t xml:space="preserve">Nuovo capitolo «Sicurezza»: inattività, avvisi, protezioni del sito e del database.</w:t>
+              <w:t xml:space="preserve">Correzioni del collaudo V01: import CSV della Banca Dati «tutto o niente» senza valori negativi, calcolo bloccato con dati non ammessi, buffer manuale 0-80%, conferma definitiva solo senza errori di coerenza, dati non ammessi nel simulatore e zero esplicito nei prezzi, colonna «Oggetto e modifiche» nell'Audit.</w:t>
             </w:r>
           </w:p>
         </w:tc>
@@ -989,7 +989,7 @@
                 <w:sz w:val="18"/>
                 <w:szCs w:val="18"/>
               </w:rPr>
-              <w:t xml:space="preserve">4.1</w:t>
+              <w:t xml:space="preserve">4.2</w:t>
             </w:r>
           </w:p>
         </w:tc>
@@ -1053,7 +1053,7 @@
                 <w:sz w:val="18"/>
                 <w:szCs w:val="18"/>
               </w:rPr>
-              <w:t xml:space="preserve">Voci di menu degli enti aggiornate.</w:t>
+              <w:t xml:space="preserve">Nuovo capitolo «Sicurezza»: inattività, avvisi, protezioni del sito e del database.</w:t>
             </w:r>
           </w:p>
         </w:tc>
@@ -1123,7 +1123,7 @@
                 <w:sz w:val="18"/>
                 <w:szCs w:val="18"/>
               </w:rPr>
-              <w:t xml:space="preserve">4.0</w:t>
+              <w:t xml:space="preserve">4.1</w:t>
             </w:r>
           </w:p>
         </w:tc>
@@ -1189,7 +1189,7 @@
                 <w:sz w:val="18"/>
                 <w:szCs w:val="18"/>
               </w:rPr>
-              <w:t xml:space="preserve">Nuovo ordine del menu; la sezione si chiama «Audit User». Voce «Marketplaces» in arrivo.</w:t>
+              <w:t xml:space="preserve">Voci di menu degli enti aggiornate.</w:t>
             </w:r>
           </w:p>
         </w:tc>
@@ -1259,7 +1259,7 @@
                 <w:sz w:val="18"/>
                 <w:szCs w:val="18"/>
               </w:rPr>
-              <w:t xml:space="preserve">3.9</w:t>
+              <w:t xml:space="preserve">4.0</w:t>
             </w:r>
           </w:p>
         </w:tc>
@@ -1323,7 +1323,7 @@
                 <w:sz w:val="18"/>
                 <w:szCs w:val="18"/>
               </w:rPr>
-              <w:t xml:space="preserve">Nuovo capitolo «Audit trail user».</w:t>
+              <w:t xml:space="preserve">Nuovo ordine del menu; la sezione si chiama «Audit User». Voce «Marketplaces» in arrivo.</w:t>
             </w:r>
           </w:p>
         </w:tc>
@@ -1393,7 +1393,7 @@
                 <w:sz w:val="18"/>
                 <w:szCs w:val="18"/>
               </w:rPr>
-              <w:t xml:space="preserve">3.8</w:t>
+              <w:t xml:space="preserve">3.9</w:t>
             </w:r>
           </w:p>
         </w:tc>
@@ -1459,7 +1459,7 @@
                 <w:sz w:val="18"/>
                 <w:szCs w:val="18"/>
               </w:rPr>
-              <w:t xml:space="preserve">Utenti online; PDF ed Excel del simulatore; messaggi d'errore dell'assistente.</w:t>
+              <w:t xml:space="preserve">Nuovo capitolo «Audit trail user».</w:t>
             </w:r>
           </w:p>
         </w:tc>
@@ -1529,7 +1529,7 @@
                 <w:sz w:val="18"/>
                 <w:szCs w:val="18"/>
               </w:rPr>
-              <w:t xml:space="preserve">3.7</w:t>
+              <w:t xml:space="preserve">3.8</w:t>
             </w:r>
           </w:p>
         </w:tc>
@@ -1561,7 +1561,7 @@
                 <w:sz w:val="18"/>
                 <w:szCs w:val="18"/>
               </w:rPr>
-              <w:t xml:space="preserve">19/10/2026</w:t>
+              <w:t xml:space="preserve">20/10/2026</w:t>
             </w:r>
           </w:p>
         </w:tc>
@@ -1593,7 +1593,7 @@
                 <w:sz w:val="18"/>
                 <w:szCs w:val="18"/>
               </w:rPr>
-              <w:t xml:space="preserve">Assistente virtuale: messaggio «Un attimo…» durante l'attesa.</w:t>
+              <w:t xml:space="preserve">Utenti online; PDF ed Excel del simulatore; messaggi d'errore dell'assistente.</w:t>
             </w:r>
           </w:p>
         </w:tc>
@@ -1663,7 +1663,7 @@
                 <w:sz w:val="18"/>
                 <w:szCs w:val="18"/>
               </w:rPr>
-              <w:t xml:space="preserve">3.6</w:t>
+              <w:t xml:space="preserve">3.7</w:t>
             </w:r>
           </w:p>
         </w:tc>
@@ -1729,7 +1729,7 @@
                 <w:sz w:val="18"/>
                 <w:szCs w:val="18"/>
               </w:rPr>
-              <w:t xml:space="preserve">Assistente virtuale attivo: chiave legata a uno spazio di lavoro, crediti e consumi.</w:t>
+              <w:t xml:space="preserve">Assistente virtuale: messaggio «Un attimo…» durante l'attesa.</w:t>
             </w:r>
           </w:p>
         </w:tc>
@@ -1799,7 +1799,7 @@
                 <w:sz w:val="18"/>
                 <w:szCs w:val="18"/>
               </w:rPr>
-              <w:t xml:space="preserve">3.5</w:t>
+              <w:t xml:space="preserve">3.6</w:t>
             </w:r>
           </w:p>
         </w:tc>
@@ -1863,7 +1863,7 @@
                 <w:sz w:val="18"/>
                 <w:szCs w:val="18"/>
               </w:rPr>
-              <w:t xml:space="preserve">Assistente virtuale; documenti ufficiali del Programma nella Documentazione.</w:t>
+              <w:t xml:space="preserve">Assistente virtuale attivo: chiave legata a uno spazio di lavoro, crediti e consumi.</w:t>
             </w:r>
           </w:p>
         </w:tc>
@@ -1933,7 +1933,7 @@
                 <w:sz w:val="18"/>
                 <w:szCs w:val="18"/>
               </w:rPr>
-              <w:t xml:space="preserve">3.4</w:t>
+              <w:t xml:space="preserve">3.5</w:t>
             </w:r>
           </w:p>
         </w:tc>
@@ -1999,7 +1999,7 @@
                 <w:sz w:val="18"/>
                 <w:szCs w:val="18"/>
               </w:rPr>
-              <w:t xml:space="preserve">Presentazione di riepilogo nella pagina Documentazione.</w:t>
+              <w:t xml:space="preserve">Assistente virtuale; documenti ufficiali del Programma nella Documentazione.</w:t>
             </w:r>
           </w:p>
         </w:tc>
@@ -2069,7 +2069,7 @@
                 <w:sz w:val="18"/>
                 <w:szCs w:val="18"/>
               </w:rPr>
-              <w:t xml:space="preserve">3.3</w:t>
+              <w:t xml:space="preserve">3.4</w:t>
             </w:r>
           </w:p>
         </w:tc>
@@ -2133,7 +2133,7 @@
                 <w:sz w:val="18"/>
                 <w:szCs w:val="18"/>
               </w:rPr>
-              <w:t xml:space="preserve">Ordinamento di tutte le tabelle e degli elenchi.</w:t>
+              <w:t xml:space="preserve">Presentazione di riepilogo nella pagina Documentazione.</w:t>
             </w:r>
           </w:p>
         </w:tc>
@@ -2203,7 +2203,7 @@
                 <w:sz w:val="18"/>
                 <w:szCs w:val="18"/>
               </w:rPr>
-              <w:t xml:space="preserve">3.2</w:t>
+              <w:t xml:space="preserve">3.3</w:t>
             </w:r>
           </w:p>
         </w:tc>
@@ -2269,7 +2269,7 @@
                 <w:sz w:val="18"/>
                 <w:szCs w:val="18"/>
               </w:rPr>
-              <w:t xml:space="preserve">Simulatore: metodo di stima per utenza (solo utenze virtuose), buffer del Capitolo 7, taratura.</w:t>
+              <w:t xml:space="preserve">Ordinamento di tutte le tabelle e degli elenchi.</w:t>
             </w:r>
           </w:p>
         </w:tc>
@@ -2339,7 +2339,7 @@
                 <w:sz w:val="18"/>
                 <w:szCs w:val="18"/>
               </w:rPr>
-              <w:t xml:space="preserve">3.1</w:t>
+              <w:t xml:space="preserve">3.2</w:t>
             </w:r>
           </w:p>
         </w:tc>
@@ -2403,7 +2403,7 @@
                 <w:sz w:val="18"/>
                 <w:szCs w:val="18"/>
               </w:rPr>
-              <w:t xml:space="preserve">Cruscotto diventa Dashboard; barra a LED delle 7 fasi per ogni pratica.</w:t>
+              <w:t xml:space="preserve">Simulatore: metodo di stima per utenza (solo utenze virtuose), buffer del Capitolo 7, taratura.</w:t>
             </w:r>
           </w:p>
         </w:tc>
@@ -2473,7 +2473,7 @@
                 <w:sz w:val="18"/>
                 <w:szCs w:val="18"/>
               </w:rPr>
-              <w:t xml:space="preserve">3.0</w:t>
+              <w:t xml:space="preserve">3.1</w:t>
             </w:r>
           </w:p>
         </w:tc>
@@ -2539,7 +2539,7 @@
                 <w:sz w:val="18"/>
                 <w:szCs w:val="18"/>
               </w:rPr>
-              <w:t xml:space="preserve">Eliminazione degli utenti che non hanno mai operato (script 30).</w:t>
+              <w:t xml:space="preserve">Cruscotto diventa Dashboard; barra a LED delle 7 fasi per ogni pratica.</w:t>
             </w:r>
           </w:p>
         </w:tc>
@@ -2609,7 +2609,7 @@
                 <w:sz w:val="18"/>
                 <w:szCs w:val="18"/>
               </w:rPr>
-              <w:t xml:space="preserve">2.9</w:t>
+              <w:t xml:space="preserve">3.0</w:t>
             </w:r>
           </w:p>
         </w:tc>
@@ -2673,7 +2673,7 @@
                 <w:sz w:val="18"/>
                 <w:szCs w:val="18"/>
               </w:rPr>
-              <w:t xml:space="preserve">Email automatica con le credenziali al nuovo utente e alla reimpostazione della password.</w:t>
+              <w:t xml:space="preserve">Eliminazione degli utenti che non hanno mai operato (script 30).</w:t>
             </w:r>
           </w:p>
         </w:tc>
@@ -2743,7 +2743,7 @@
                 <w:sz w:val="18"/>
                 <w:szCs w:val="18"/>
               </w:rPr>
-              <w:t xml:space="preserve">2.8</w:t>
+              <w:t xml:space="preserve">2.9</w:t>
             </w:r>
           </w:p>
         </w:tc>
@@ -2809,7 +2809,7 @@
                 <w:sz w:val="18"/>
                 <w:szCs w:val="18"/>
               </w:rPr>
-              <w:t xml:space="preserve">Più Amministratori con accesso completo; Amministratore principale protetto (script 29).</w:t>
+              <w:t xml:space="preserve">Email automatica con le credenziali al nuovo utente e alla reimpostazione della password.</w:t>
             </w:r>
           </w:p>
         </w:tc>
@@ -2879,7 +2879,7 @@
                 <w:sz w:val="18"/>
                 <w:szCs w:val="18"/>
               </w:rPr>
-              <w:t xml:space="preserve">2.7</w:t>
+              <w:t xml:space="preserve">2.8</w:t>
             </w:r>
           </w:p>
         </w:tc>
@@ -2943,7 +2943,7 @@
                 <w:sz w:val="18"/>
                 <w:szCs w:val="18"/>
               </w:rPr>
-              <w:t xml:space="preserve">Simulatore: costi per il Comune secondo il Caso 1 (progetto volontario) o il Caso 2 (progetto obbligatorio da bando).</w:t>
+              <w:t xml:space="preserve">Più Amministratori con accesso completo; Amministratore principale protetto (script 29).</w:t>
             </w:r>
           </w:p>
         </w:tc>
@@ -3013,7 +3013,7 @@
                 <w:sz w:val="18"/>
                 <w:szCs w:val="18"/>
               </w:rPr>
-              <w:t xml:space="preserve">2.6</w:t>
+              <w:t xml:space="preserve">2.7</w:t>
             </w:r>
           </w:p>
         </w:tc>
@@ -3079,7 +3079,7 @@
                 <w:sz w:val="18"/>
                 <w:szCs w:val="18"/>
               </w:rPr>
-              <w:t xml:space="preserve">Simulatore: valore del credito anno per anno, proposto 32 €.</w:t>
+              <w:t xml:space="preserve">Simulatore: costi per il Comune secondo il Caso 1 (progetto volontario) o il Caso 2 (progetto obbligatorio da bando).</w:t>
             </w:r>
           </w:p>
         </w:tc>
@@ -3149,7 +3149,7 @@
                 <w:sz w:val="18"/>
                 <w:szCs w:val="18"/>
               </w:rPr>
-              <w:t xml:space="preserve">2.5</w:t>
+              <w:t xml:space="preserve">2.6</w:t>
             </w:r>
           </w:p>
         </w:tc>
@@ -3213,7 +3213,7 @@
                 <w:sz w:val="18"/>
                 <w:szCs w:val="18"/>
               </w:rPr>
-              <w:t xml:space="preserve">Simulatore: simulazione economica con valore unitario del credito e costi per il Comune (contratti tipo della Fondazione, Schema tariffario).</w:t>
+              <w:t xml:space="preserve">Simulatore: valore del credito anno per anno, proposto 32 €.</w:t>
             </w:r>
           </w:p>
         </w:tc>
@@ -3283,7 +3283,7 @@
                 <w:sz w:val="18"/>
                 <w:szCs w:val="18"/>
               </w:rPr>
-              <w:t xml:space="preserve">2.4</w:t>
+              <w:t xml:space="preserve">2.5</w:t>
             </w:r>
           </w:p>
         </w:tc>
@@ -3349,7 +3349,7 @@
                 <w:sz w:val="18"/>
                 <w:szCs w:val="18"/>
               </w:rPr>
-              <w:t xml:space="preserve">Simulatore: riferimento sempre alla soglia del 65% di differenziata e controllo dei valori fuori scala.</w:t>
+              <w:t xml:space="preserve">Simulatore: simulazione economica con valore unitario del credito e costi per il Comune (contratti tipo della Fondazione, Schema tariffario).</w:t>
             </w:r>
           </w:p>
         </w:tc>
@@ -3419,7 +3419,7 @@
                 <w:sz w:val="18"/>
                 <w:szCs w:val="18"/>
               </w:rPr>
-              <w:t xml:space="preserve">2.3</w:t>
+              <w:t xml:space="preserve">2.4</w:t>
             </w:r>
           </w:p>
         </w:tc>
@@ -3483,7 +3483,7 @@
                 <w:sz w:val="18"/>
                 <w:szCs w:val="18"/>
               </w:rPr>
-              <w:t xml:space="preserve">Simulatore conforme al modello CWP: scenario di riferimento dello Standard 4.8.1, situazione attuale, conformità.</w:t>
+              <w:t xml:space="preserve">Simulatore: riferimento sempre alla soglia del 65% di differenziata e controllo dei valori fuori scala.</w:t>
             </w:r>
           </w:p>
         </w:tc>
@@ -3553,7 +3553,7 @@
                 <w:sz w:val="18"/>
                 <w:szCs w:val="18"/>
               </w:rPr>
-              <w:t xml:space="preserve">2.2</w:t>
+              <w:t xml:space="preserve">2.3</w:t>
             </w:r>
           </w:p>
         </w:tc>
@@ -3619,7 +3619,7 @@
                 <w:sz w:val="18"/>
                 <w:szCs w:val="18"/>
               </w:rPr>
-              <w:t xml:space="preserve">Nuovo capitolo «Simulatore di scenari»: creazione, anno base, obiettivi annui, risultati, modello di stima.</w:t>
+              <w:t xml:space="preserve">Simulatore conforme al modello CWP: scenario di riferimento dello Standard 4.8.1, situazione attuale, conformità.</w:t>
             </w:r>
           </w:p>
         </w:tc>
@@ -3689,7 +3689,7 @@
                 <w:sz w:val="18"/>
                 <w:szCs w:val="18"/>
               </w:rPr>
-              <w:t xml:space="preserve">2.1</w:t>
+              <w:t xml:space="preserve">2.2</w:t>
             </w:r>
           </w:p>
         </w:tc>
@@ -3753,7 +3753,7 @@
                 <w:sz w:val="18"/>
                 <w:szCs w:val="18"/>
               </w:rPr>
-              <w:t xml:space="preserve">Funzioni in arrivo: simulatore di scenari (7, 10 o 21 anni, obiettivi annui, % di differenziata e crediti stimati) e assistente virtuale (Claude).</w:t>
+              <w:t xml:space="preserve">Nuovo capitolo «Simulatore di scenari»: creazione, anno base, obiettivi annui, risultati, modello di stima.</w:t>
             </w:r>
           </w:p>
         </w:tc>
@@ -3823,7 +3823,7 @@
                 <w:sz w:val="18"/>
                 <w:szCs w:val="18"/>
               </w:rPr>
-              <w:t xml:space="preserve">2.0</w:t>
+              <w:t xml:space="preserve">2.1</w:t>
             </w:r>
           </w:p>
         </w:tc>
@@ -3889,7 +3889,7 @@
                 <w:sz w:val="18"/>
                 <w:szCs w:val="18"/>
               </w:rPr>
-              <w:t xml:space="preserve">Copie di sicurezza e ripristino: rimando alle Istruzioni di ripristino e punti essenziali (capitolo Manutenzione ed emergenze).</w:t>
+              <w:t xml:space="preserve">Funzioni in arrivo: simulatore di scenari (7, 10 o 21 anni, obiettivi annui, % di differenziata e crediti stimati) e assistente virtuale (Claude).</w:t>
             </w:r>
           </w:p>
         </w:tc>
@@ -3959,7 +3959,7 @@
                 <w:sz w:val="18"/>
                 <w:szCs w:val="18"/>
               </w:rPr>
-              <w:t xml:space="preserve">1.9</w:t>
+              <w:t xml:space="preserve">2.0</w:t>
             </w:r>
           </w:p>
         </w:tc>
@@ -4023,7 +4023,7 @@
                 <w:sz w:val="18"/>
                 <w:szCs w:val="18"/>
               </w:rPr>
-              <w:t xml:space="preserve">Fondazione Operate soggetto promotore del programma (esclusiva conferita da Wastelab).</w:t>
+              <w:t xml:space="preserve">Copie di sicurezza e ripristino: rimando alle Istruzioni di ripristino e punti essenziali (capitolo Manutenzione ed emergenze).</w:t>
             </w:r>
           </w:p>
         </w:tc>
@@ -4093,7 +4093,7 @@
                 <w:sz w:val="18"/>
                 <w:szCs w:val="18"/>
               </w:rPr>
-              <w:t xml:space="preserve">1.8</w:t>
+              <w:t xml:space="preserve">1.9</w:t>
             </w:r>
           </w:p>
         </w:tc>
@@ -4159,7 +4159,7 @@
                 <w:sz w:val="18"/>
                 <w:szCs w:val="18"/>
               </w:rPr>
-              <w:t xml:space="preserve">PEC del Programma e documenti ufficiali già pubblicati sulla pagina pubblica.</w:t>
+              <w:t xml:space="preserve">Fondazione Operate soggetto promotore del programma (esclusiva conferita da Wastelab).</w:t>
             </w:r>
           </w:p>
         </w:tc>
@@ -4229,7 +4229,7 @@
                 <w:sz w:val="18"/>
                 <w:szCs w:val="18"/>
               </w:rPr>
-              <w:t xml:space="preserve">1.7</w:t>
+              <w:t xml:space="preserve">1.8</w:t>
             </w:r>
           </w:p>
         </w:tc>
@@ -4261,7 +4261,7 @@
                 <w:sz w:val="18"/>
                 <w:szCs w:val="18"/>
               </w:rPr>
-              <w:t xml:space="preserve">18/10/2026</w:t>
+              <w:t xml:space="preserve">19/10/2026</w:t>
             </w:r>
           </w:p>
         </w:tc>
@@ -4293,7 +4293,7 @@
                 <w:sz w:val="18"/>
                 <w:szCs w:val="18"/>
               </w:rPr>
-              <w:t xml:space="preserve">Allineamento ai documenti ufficiali del Programma (script 22-24): Rapporto a 7 fasi, feedback pubblico, stati del Programma, dati del progetto e territorio ISTAT, ritiro e rientro, account unico e delegati, registri, tariffe e sospensione, accuratezza e accertamenti, informazioni del Programma e metodologie, modelli pubblici; nuovi capitoli Crediti emessi, Reclami, Pagina pubblica; qualità dei dati nel calcolo.</w:t>
+              <w:t xml:space="preserve">PEC del Programma e documenti ufficiali già pubblicati sulla pagina pubblica.</w:t>
             </w:r>
           </w:p>
         </w:tc>
@@ -4363,7 +4363,7 @@
                 <w:sz w:val="18"/>
                 <w:szCs w:val="18"/>
               </w:rPr>
-              <w:t xml:space="preserve">1.6</w:t>
+              <w:t xml:space="preserve">1.7</w:t>
             </w:r>
           </w:p>
         </w:tc>
@@ -4429,7 +4429,7 @@
                 <w:sz w:val="18"/>
                 <w:szCs w:val="18"/>
               </w:rPr>
-              <w:t xml:space="preserve">Calcolo crediti: descrizione corretta del buffer (somma delle voci delle Tabelle 15 e 16, più il 20% con le sole utenze virtuose, al massimo 80%).</w:t>
+              <w:t xml:space="preserve">Allineamento ai documenti ufficiali del Programma (script 22-24): Rapporto a 7 fasi, feedback pubblico, stati del Programma, dati del progetto e territorio ISTAT, ritiro e rientro, account unico e delegati, registri, tariffe e sospensione, accuratezza e accertamenti, informazioni del Programma e metodologie, modelli pubblici; nuovi capitoli Crediti emessi, Reclami, Pagina pubblica; qualità dei dati nel calcolo.</w:t>
             </w:r>
           </w:p>
         </w:tc>
@@ -4499,7 +4499,7 @@
                 <w:sz w:val="18"/>
                 <w:szCs w:val="18"/>
               </w:rPr>
-              <w:t xml:space="preserve">1.5</w:t>
+              <w:t xml:space="preserve">1.6</w:t>
             </w:r>
           </w:p>
         </w:tc>
@@ -4563,7 +4563,7 @@
                 <w:sz w:val="18"/>
                 <w:szCs w:val="18"/>
               </w:rPr>
-              <w:t xml:space="preserve">Nuova pagina Anagrafiche (Organizzazioni ed Enti, anche per gli Operatori); Rapporti con 4 fasi e durate proprie; documenti richiesti per fase; consultazione con documento bloccato, osservazioni numerate e motivazione; conservazione per 10 anni; fascicolo con riepilogo PDF e nuove cartelle.</w:t>
+              <w:t xml:space="preserve">Calcolo crediti: descrizione corretta del buffer (somma delle voci delle Tabelle 15 e 16, più il 20% con le sole utenze virtuose, al massimo 80%).</w:t>
             </w:r>
           </w:p>
         </w:tc>
@@ -4633,7 +4633,7 @@
                 <w:sz w:val="18"/>
                 <w:szCs w:val="18"/>
               </w:rPr>
-              <w:t xml:space="preserve">1.4</w:t>
+              <w:t xml:space="preserve">1.5</w:t>
             </w:r>
           </w:p>
         </w:tc>
@@ -4699,7 +4699,7 @@
                 <w:sz w:val="18"/>
                 <w:szCs w:val="18"/>
               </w:rPr>
-              <w:t xml:space="preserve">Calcolo crediti: il risultato si azzera quando cambiano dati o Banca Dati Utenze, conferma solo dopo un nuovo «Calcola». Gestione utenti: password temporanea di almeno 10 caratteri con lettere e numeri, creazione annullata se non va a buon fine, nessun accesso ai dati prima del cambio password.</w:t>
+              <w:t xml:space="preserve">Nuova pagina Anagrafiche (Organizzazioni ed Enti, anche per gli Operatori); Rapporti con 4 fasi e durate proprie; documenti richiesti per fase; consultazione con documento bloccato, osservazioni numerate e motivazione; conservazione per 10 anni; fascicolo con riepilogo PDF e nuove cartelle.</w:t>
             </w:r>
           </w:p>
         </w:tc>
@@ -4769,7 +4769,7 @@
                 <w:sz w:val="18"/>
                 <w:szCs w:val="18"/>
               </w:rPr>
-              <w:t xml:space="preserve">1.3</w:t>
+              <w:t xml:space="preserve">1.4</w:t>
             </w:r>
           </w:p>
         </w:tc>
@@ -4833,7 +4833,7 @@
                 <w:sz w:val="18"/>
                 <w:szCs w:val="18"/>
               </w:rPr>
-              <w:t xml:space="preserve">Rapporto di calcolo in PDF, archiviazione nella pratica, numero di registro, registro dei crediti.</w:t>
+              <w:t xml:space="preserve">Calcolo crediti: il risultato si azzera quando cambiano dati o Banca Dati Utenze, conferma solo dopo un nuovo «Calcola». Gestione utenti: password temporanea di almeno 10 caratteri con lettere e numeri, creazione annullata se non va a buon fine, nessun accesso ai dati prima del cambio password.</w:t>
             </w:r>
           </w:p>
         </w:tc>
@@ -4903,7 +4903,7 @@
                 <w:sz w:val="18"/>
                 <w:szCs w:val="18"/>
               </w:rPr>
-              <w:t xml:space="preserve">1.2</w:t>
+              <w:t xml:space="preserve">1.3</w:t>
             </w:r>
           </w:p>
         </w:tc>
@@ -4969,7 +4969,7 @@
                 <w:sz w:val="18"/>
                 <w:szCs w:val="18"/>
               </w:rPr>
-              <w:t xml:space="preserve">Calcolo crediti: importare il tracciato nel calcolo (dai documenti della pratica o dal computer), singole letture, blocco dei dati personali, controlli di coerenza.</w:t>
+              <w:t xml:space="preserve">Rapporto di calcolo in PDF, archiviazione nella pratica, numero di registro, registro dei crediti.</w:t>
             </w:r>
           </w:p>
         </w:tc>
@@ -5039,7 +5039,7 @@
                 <w:sz w:val="18"/>
                 <w:szCs w:val="18"/>
               </w:rPr>
-              <w:t xml:space="preserve">1.1</w:t>
+              <w:t xml:space="preserve">1.2</w:t>
             </w:r>
           </w:p>
         </w:tc>
@@ -5103,7 +5103,7 @@
                 <w:sz w:val="18"/>
                 <w:szCs w:val="18"/>
               </w:rPr>
-              <w:t xml:space="preserve">Note di fase, Ente di Validazione della pratica, consultazione sulla pagina pubblica con conferma dell'email, moderazione con autori e allegati, errata corrige; nuovo capitolo Messaggi con il Comune; pagamenti visibili al Comune; Impostazioni: Enti di Validazione e Modelli di documento; notifiche aggiornate.</w:t>
+              <w:t xml:space="preserve">Calcolo crediti: importare il tracciato nel calcolo (dai documenti della pratica o dal computer), singole letture, blocco dei dati personali, controlli di coerenza.</w:t>
             </w:r>
           </w:p>
         </w:tc>
@@ -5173,6 +5173,142 @@
                 <w:sz w:val="18"/>
                 <w:szCs w:val="18"/>
               </w:rPr>
+              <w:t xml:space="preserve">1.1</w:t>
+            </w:r>
+          </w:p>
+        </w:tc>
+        <w:tc>
+          <w:tcPr>
+            <w:tcW w:type="dxa" w:w="1300"/>
+            <w:tcBorders>
+              <w:top w:val="single" w:color="D9D4C5" w:sz="4"/>
+              <w:left w:val="single" w:color="D9D4C5" w:sz="4"/>
+              <w:bottom w:val="single" w:color="D9D4C5" w:sz="4"/>
+              <w:right w:val="single" w:color="D9D4C5" w:sz="4"/>
+            </w:tcBorders>
+            <w:shd w:fill="F6F4EE" w:color="auto" w:val="clear"/>
+            <w:tcMar>
+              <w:top w:type="dxa" w:w="70"/>
+              <w:left w:type="dxa" w:w="110"/>
+              <w:bottom w:type="dxa" w:w="70"/>
+              <w:right w:type="dxa" w:w="110"/>
+            </w:tcMar>
+            <w:vAlign w:val="center"/>
+          </w:tcPr>
+          <w:p>
+            <w:pPr>
+              <w:spacing w:after="0" w:before="0"/>
+            </w:pPr>
+            <w:r>
+              <w:rPr>
+                <w:rFonts w:ascii="Arial" w:cs="Arial" w:eastAsia="Arial" w:hAnsi="Arial"/>
+                <w:color w:val="1B2118"/>
+                <w:sz w:val="18"/>
+                <w:szCs w:val="18"/>
+              </w:rPr>
+              <w:t xml:space="preserve">18/10/2026</w:t>
+            </w:r>
+          </w:p>
+        </w:tc>
+        <w:tc>
+          <w:tcPr>
+            <w:tcW w:type="dxa" w:w="5538"/>
+            <w:tcBorders>
+              <w:top w:val="single" w:color="D9D4C5" w:sz="4"/>
+              <w:left w:val="single" w:color="D9D4C5" w:sz="4"/>
+              <w:bottom w:val="single" w:color="D9D4C5" w:sz="4"/>
+              <w:right w:val="single" w:color="D9D4C5" w:sz="4"/>
+            </w:tcBorders>
+            <w:shd w:fill="F6F4EE" w:color="auto" w:val="clear"/>
+            <w:tcMar>
+              <w:top w:type="dxa" w:w="70"/>
+              <w:left w:type="dxa" w:w="110"/>
+              <w:bottom w:type="dxa" w:w="70"/>
+              <w:right w:type="dxa" w:w="110"/>
+            </w:tcMar>
+            <w:vAlign w:val="center"/>
+          </w:tcPr>
+          <w:p>
+            <w:pPr>
+              <w:spacing w:after="0" w:before="0"/>
+            </w:pPr>
+            <w:r>
+              <w:rPr>
+                <w:rFonts w:ascii="Arial" w:cs="Arial" w:eastAsia="Arial" w:hAnsi="Arial"/>
+                <w:color w:val="1B2118"/>
+                <w:sz w:val="18"/>
+                <w:szCs w:val="18"/>
+              </w:rPr>
+              <w:t xml:space="preserve">Note di fase, Ente di Validazione della pratica, consultazione sulla pagina pubblica con conferma dell'email, moderazione con autori e allegati, errata corrige; nuovo capitolo Messaggi con il Comune; pagamenti visibili al Comune; Impostazioni: Enti di Validazione e Modelli di documento; notifiche aggiornate.</w:t>
+            </w:r>
+          </w:p>
+        </w:tc>
+        <w:tc>
+          <w:tcPr>
+            <w:tcW w:type="dxa" w:w="2000"/>
+            <w:tcBorders>
+              <w:top w:val="single" w:color="D9D4C5" w:sz="4"/>
+              <w:left w:val="single" w:color="D9D4C5" w:sz="4"/>
+              <w:bottom w:val="single" w:color="D9D4C5" w:sz="4"/>
+              <w:right w:val="single" w:color="D9D4C5" w:sz="4"/>
+            </w:tcBorders>
+            <w:shd w:fill="F6F4EE" w:color="auto" w:val="clear"/>
+            <w:tcMar>
+              <w:top w:type="dxa" w:w="70"/>
+              <w:left w:type="dxa" w:w="110"/>
+              <w:bottom w:type="dxa" w:w="70"/>
+              <w:right w:type="dxa" w:w="110"/>
+            </w:tcMar>
+            <w:vAlign w:val="center"/>
+          </w:tcPr>
+          <w:p>
+            <w:pPr>
+              <w:spacing w:after="0" w:before="0"/>
+            </w:pPr>
+            <w:r>
+              <w:rPr>
+                <w:rFonts w:ascii="Arial" w:cs="Arial" w:eastAsia="Arial" w:hAnsi="Arial"/>
+                <w:color w:val="1B2118"/>
+                <w:sz w:val="18"/>
+                <w:szCs w:val="18"/>
+              </w:rPr>
+              <w:t xml:space="preserve">Fondazione Operate</w:t>
+            </w:r>
+          </w:p>
+        </w:tc>
+      </w:tr>
+      <w:tr>
+        <w:trPr>
+          <w:cantSplit/>
+        </w:trPr>
+        <w:tc>
+          <w:tcPr>
+            <w:tcW w:type="dxa" w:w="800"/>
+            <w:tcBorders>
+              <w:top w:val="single" w:color="D9D4C5" w:sz="4"/>
+              <w:left w:val="single" w:color="D9D4C5" w:sz="4"/>
+              <w:bottom w:val="single" w:color="D9D4C5" w:sz="4"/>
+              <w:right w:val="single" w:color="D9D4C5" w:sz="4"/>
+            </w:tcBorders>
+            <w:tcMar>
+              <w:top w:type="dxa" w:w="70"/>
+              <w:left w:type="dxa" w:w="110"/>
+              <w:bottom w:type="dxa" w:w="70"/>
+              <w:right w:type="dxa" w:w="110"/>
+            </w:tcMar>
+            <w:vAlign w:val="center"/>
+          </w:tcPr>
+          <w:p>
+            <w:pPr>
+              <w:spacing w:after="0" w:before="0"/>
+            </w:pPr>
+            <w:r>
+              <w:rPr>
+                <w:rFonts w:ascii="Arial" w:cs="Arial" w:eastAsia="Arial" w:hAnsi="Arial"/>
+                <w:color w:val="1B2118"/>
+                <w:sz w:val="18"/>
+                <w:szCs w:val="18"/>
+              </w:rPr>
               <w:t xml:space="preserve">1.0</w:t>
             </w:r>
           </w:p>
@@ -5186,7 +5322,6 @@
               <w:bottom w:val="single" w:color="D9D4C5" w:sz="4"/>
               <w:right w:val="single" w:color="D9D4C5" w:sz="4"/>
             </w:tcBorders>
-            <w:shd w:fill="F6F4EE" w:color="auto" w:val="clear"/>
             <w:tcMar>
               <w:top w:type="dxa" w:w="70"/>
               <w:left w:type="dxa" w:w="110"/>
@@ -5219,7 +5354,6 @@
               <w:bottom w:val="single" w:color="D9D4C5" w:sz="4"/>
               <w:right w:val="single" w:color="D9D4C5" w:sz="4"/>
             </w:tcBorders>
-            <w:shd w:fill="F6F4EE" w:color="auto" w:val="clear"/>
             <w:tcMar>
               <w:top w:type="dxa" w:w="70"/>
               <w:left w:type="dxa" w:w="110"/>
@@ -5252,7 +5386,6 @@
               <w:bottom w:val="single" w:color="D9D4C5" w:sz="4"/>
               <w:right w:val="single" w:color="D9D4C5" w:sz="4"/>
             </w:tcBorders>
-            <w:shd w:fill="F6F4EE" w:color="auto" w:val="clear"/>
             <w:tcMar>
               <w:top w:type="dxa" w:w="70"/>
               <w:left w:type="dxa" w:w="110"/>
@@ -5294,7 +5427,7 @@
           <w:sz w:val="20"/>
           <w:szCs w:val="20"/>
         </w:rPr>
-        <w:t xml:space="preserve">Questo documento descrive il portale alla revisione 4.3 del 20/10/2026. A ogni modifica del portale il manuale viene aggiornato e la revisione incrementata; la versione corrente si scarica dall'area Documentazione del portale (solo Amministratori).</w:t>
+        <w:t xml:space="preserve">Questo documento descrive il portale alla revisione 4.4 del 21/10/2026. A ogni modifica del portale il manuale viene aggiornato e la revisione incrementata; la versione corrente si scarica dall'area Documentazione del portale (solo Amministratori).</w:t>
       </w:r>
     </w:p>
     <w:p>
@@ -8045,7 +8178,7 @@
         </w:rPr>
         <w:t xml:space="preserve">Si accede da </w:t>
       </w:r>
-      <w:hyperlink w:history="1" r:id="rIdqldxrl2re3paosp5egwlc">
+      <w:hyperlink w:history="1" r:id="rIdpxe_m3c3n0_kwrf7qhcsw">
         <w:r>
           <w:rPr>
             <w:rFonts w:ascii="Arial" w:cs="Arial" w:eastAsia="Arial" w:hAnsi="Arial"/>
@@ -22518,7 +22651,27 @@
           <w:sz w:val="21"/>
           <w:szCs w:val="21"/>
         </w:rPr>
-        <w:t xml:space="preserve"> non vede più alcun dato ma resta nello storico. Non si può disattivare sé stessi. Si può disattivare anche un altro Amministratore. Un Cliente si riattiva solo se la sua Organizzazione non ha nel frattempo un altro account attivo.</w:t>
+        <w:t xml:space="preserve"> non vede più alcun dato ma resta nello storico. Quando entra (o ricarica la pagina) vede il riquadro </w:t>
+      </w:r>
+      <w:r>
+        <w:rPr>
+          <w:rFonts w:ascii="Arial" w:cs="Arial" w:eastAsia="Arial" w:hAnsi="Arial"/>
+          <w:b/>
+          <w:bCs/>
+          <w:color w:val="1B2118"/>
+          <w:sz w:val="21"/>
+          <w:szCs w:val="21"/>
+        </w:rPr>
+        <w:t xml:space="preserve">«Account disattivato»</w:t>
+      </w:r>
+      <w:r>
+        <w:rPr>
+          <w:rFonts w:ascii="Arial" w:cs="Arial" w:eastAsia="Arial" w:hAnsi="Arial"/>
+          <w:color w:val="1B2118"/>
+          <w:sz w:val="21"/>
+          <w:szCs w:val="21"/>
+        </w:rPr>
+        <w:t xml:space="preserve"> con l'invito a scrivere alla Fondazione e il pulsante Esci, invece di elenchi vuoti che sembrerebbero «nessuna pratica» (dal 21/10/2026, collaudo V05). Non si può disattivare sé stessi. Si può disattivare anche un altro Amministratore. Un Cliente si riattiva solo se la sua Organizzazione non ha nel frattempo un altro account attivo.</w:t>
       </w:r>
     </w:p>
     <w:p>
@@ -23774,11 +23927,200 @@
       <w:r>
         <w:rPr>
           <w:rFonts w:ascii="Arial" w:cs="Arial" w:eastAsia="Arial" w:hAnsi="Arial"/>
-          <w:color w:val="1B2118"/>
-          <w:sz w:val="21"/>
-          <w:szCs w:val="21"/>
-        </w:rPr>
-        <w:t xml:space="preserve">Il campo di ricerca filtra per operazione, utente, pratica, oggetto (anche per nome o codice dello scenario) o motivazione.</w:t>
+          <w:b/>
+          <w:bCs/>
+          <w:color w:val="1B2118"/>
+          <w:sz w:val="21"/>
+          <w:szCs w:val="21"/>
+        </w:rPr>
+        <w:t xml:space="preserve">Testi lunghi</w:t>
+      </w:r>
+      <w:r>
+        <w:rPr>
+          <w:rFonts w:ascii="Arial" w:cs="Arial" w:eastAsia="Arial" w:hAnsi="Arial"/>
+          <w:color w:val="1B2118"/>
+          <w:sz w:val="21"/>
+          <w:szCs w:val="21"/>
+        </w:rPr>
+        <w:t xml:space="preserve"> (dal 21/10/2026, collaudo V05): nella riga un valore lungo resta accorciato con «…», ma accanto compare </w:t>
+      </w:r>
+      <w:r>
+        <w:rPr>
+          <w:rFonts w:ascii="Arial" w:cs="Arial" w:eastAsia="Arial" w:hAnsi="Arial"/>
+          <w:b/>
+          <w:bCs/>
+          <w:color w:val="1B2118"/>
+          <w:sz w:val="21"/>
+          <w:szCs w:val="21"/>
+        </w:rPr>
+        <w:t xml:space="preserve">Testo completo</w:t>
+      </w:r>
+      <w:r>
+        <w:rPr>
+          <w:rFonts w:ascii="Arial" w:cs="Arial" w:eastAsia="Arial" w:hAnsi="Arial"/>
+          <w:color w:val="1B2118"/>
+          <w:sz w:val="21"/>
+          <w:szCs w:val="21"/>
+        </w:rPr>
+        <w:t xml:space="preserve">, che mostra i valori interi </w:t>
+      </w:r>
+      <w:r>
+        <w:rPr>
+          <w:rFonts w:ascii="Arial" w:cs="Arial" w:eastAsia="Arial" w:hAnsi="Arial"/>
+          <w:b/>
+          <w:bCs/>
+          <w:color w:val="1B2118"/>
+          <w:sz w:val="21"/>
+          <w:szCs w:val="21"/>
+        </w:rPr>
+        <w:t xml:space="preserve">Prima</w:t>
+      </w:r>
+      <w:r>
+        <w:rPr>
+          <w:rFonts w:ascii="Arial" w:cs="Arial" w:eastAsia="Arial" w:hAnsi="Arial"/>
+          <w:color w:val="1B2118"/>
+          <w:sz w:val="21"/>
+          <w:szCs w:val="21"/>
+        </w:rPr>
+        <w:t xml:space="preserve"> e </w:t>
+      </w:r>
+      <w:r>
+        <w:rPr>
+          <w:rFonts w:ascii="Arial" w:cs="Arial" w:eastAsia="Arial" w:hAnsi="Arial"/>
+          <w:b/>
+          <w:bCs/>
+          <w:color w:val="1B2118"/>
+          <w:sz w:val="21"/>
+          <w:szCs w:val="21"/>
+        </w:rPr>
+        <w:t xml:space="preserve">Dopo</w:t>
+      </w:r>
+      <w:r>
+        <w:rPr>
+          <w:rFonts w:ascii="Arial" w:cs="Arial" w:eastAsia="Arial" w:hAnsi="Arial"/>
+          <w:color w:val="1B2118"/>
+          <w:sz w:val="21"/>
+          <w:szCs w:val="21"/>
+        </w:rPr>
+        <w:t xml:space="preserve"> (con gli a capo) e la parte </w:t>
+      </w:r>
+      <w:r>
+        <w:rPr>
+          <w:rFonts w:ascii="Arial" w:cs="Arial" w:eastAsia="Arial" w:hAnsi="Arial"/>
+          <w:b/>
+          <w:bCs/>
+          <w:color w:val="1B2118"/>
+          <w:sz w:val="21"/>
+          <w:szCs w:val="21"/>
+        </w:rPr>
+        <w:t xml:space="preserve">Tolto</w:t>
+      </w:r>
+      <w:r>
+        <w:rPr>
+          <w:rFonts w:ascii="Arial" w:cs="Arial" w:eastAsia="Arial" w:hAnsi="Arial"/>
+          <w:color w:val="1B2118"/>
+          <w:sz w:val="21"/>
+          <w:szCs w:val="21"/>
+        </w:rPr>
+        <w:t xml:space="preserve"> / </w:t>
+      </w:r>
+      <w:r>
+        <w:rPr>
+          <w:rFonts w:ascii="Arial" w:cs="Arial" w:eastAsia="Arial" w:hAnsi="Arial"/>
+          <w:b/>
+          <w:bCs/>
+          <w:color w:val="1B2118"/>
+          <w:sz w:val="21"/>
+          <w:szCs w:val="21"/>
+        </w:rPr>
+        <w:t xml:space="preserve">Aggiunto</w:t>
+      </w:r>
+      <w:r>
+        <w:rPr>
+          <w:rFonts w:ascii="Arial" w:cs="Arial" w:eastAsia="Arial" w:hAnsi="Arial"/>
+          <w:color w:val="1B2118"/>
+          <w:sz w:val="21"/>
+          <w:szCs w:val="21"/>
+        </w:rPr>
+        <w:t xml:space="preserve">. Così due note con lo stesso inizio non sembrano più uguali. Nel CSV di Audit User i valori sono interi.</w:t>
+      </w:r>
+    </w:p>
+    <w:p>
+      <w:pPr>
+        <w:pStyle w:val="ListParagraph"/>
+        <w:numPr>
+          <w:ilvl w:val="0"/>
+          <w:numId w:val="2"/>
+        </w:numPr>
+        <w:spacing w:after="70" w:line="290"/>
+      </w:pPr>
+      <w:r>
+        <w:rPr>
+          <w:rFonts w:ascii="Arial" w:cs="Arial" w:eastAsia="Arial" w:hAnsi="Arial"/>
+          <w:color w:val="1B2118"/>
+          <w:sz w:val="21"/>
+          <w:szCs w:val="21"/>
+        </w:rPr>
+        <w:t xml:space="preserve">Per le organizzazioni compare la denominazione, per esempio </w:t>
+      </w:r>
+      <w:r>
+        <w:rPr>
+          <w:rFonts w:ascii="Arial" w:cs="Arial" w:eastAsia="Arial" w:hAnsi="Arial"/>
+          <w:i/>
+          <w:iCs/>
+          <w:color w:val="1B2118"/>
+          <w:sz w:val="21"/>
+          <w:szCs w:val="21"/>
+        </w:rPr>
+        <w:t xml:space="preserve">Organizzazione «COLLAUDO AL V03 - COMUNE B - 20261020» (916f3283)</w:t>
+      </w:r>
+      <w:r>
+        <w:rPr>
+          <w:rFonts w:ascii="Arial" w:cs="Arial" w:eastAsia="Arial" w:hAnsi="Arial"/>
+          <w:color w:val="1B2118"/>
+          <w:sz w:val="21"/>
+          <w:szCs w:val="21"/>
+        </w:rPr>
+        <w:t xml:space="preserve">.</w:t>
+      </w:r>
+    </w:p>
+    <w:p>
+      <w:pPr>
+        <w:pStyle w:val="ListParagraph"/>
+        <w:numPr>
+          <w:ilvl w:val="0"/>
+          <w:numId w:val="2"/>
+        </w:numPr>
+        <w:spacing w:after="70" w:line="290"/>
+      </w:pPr>
+      <w:r>
+        <w:rPr>
+          <w:rFonts w:ascii="Arial" w:cs="Arial" w:eastAsia="Arial" w:hAnsi="Arial"/>
+          <w:color w:val="1B2118"/>
+          <w:sz w:val="21"/>
+          <w:szCs w:val="21"/>
+        </w:rPr>
+        <w:t xml:space="preserve">Il campo di ricerca filtra per operazione, utente, pratica, oggetto (nome o codice di scenari e organizzazioni), motivazione e anche per il </w:t>
+      </w:r>
+      <w:r>
+        <w:rPr>
+          <w:rFonts w:ascii="Arial" w:cs="Arial" w:eastAsia="Arial" w:hAnsi="Arial"/>
+          <w:b/>
+          <w:bCs/>
+          <w:color w:val="1B2118"/>
+          <w:sz w:val="21"/>
+          <w:szCs w:val="21"/>
+        </w:rPr>
+        <w:t xml:space="preserve">testo dei valori cambiati</w:t>
+      </w:r>
+      <w:r>
+        <w:rPr>
+          <w:rFonts w:ascii="Arial" w:cs="Arial" w:eastAsia="Arial" w:hAnsi="Arial"/>
+          <w:color w:val="1B2118"/>
+          <w:sz w:val="21"/>
+          <w:szCs w:val="21"/>
+        </w:rPr>
+        <w:t xml:space="preserve"> (per esempio una riga aggiunta a metà di una nota).</w:t>
       </w:r>
     </w:p>
     <w:p>
@@ -45139,7 +45481,7 @@
         <w:szCs w:val="16"/>
       </w:rPr>
       <w:tab/>
-      <w:t xml:space="preserve">Manuale Amministratore · Rev. 4.3 · 20/10/2026</w:t>
+      <w:t xml:space="preserve">Manuale Amministratore · Rev. 4.4 · 21/10/2026</w:t>
     </w:r>
   </w:p>
 </w:hdr>
@@ -45204,7 +45546,7 @@
         <w:szCs w:val="16"/>
       </w:rPr>
       <w:tab/>
-      <w:t xml:space="preserve">Manuale Amministratore · Rev. 4.3 · 20/10/2026</w:t>
+      <w:t xml:space="preserve">Manuale Amministratore · Rev. 4.4 · 21/10/2026</w:t>
     </w:r>
   </w:p>
 </w:hdr>

</xml_diff>

<commit_message>
Registro issue e test (rev. 1.0): segnalazioni con data e ora, azioni correttive e prove; nella Documentazione per gli Amministratori; regola di aggiornamento a ogni variazione
Co-Authored-By: Claude Opus 5.5 <noreply@anthropic.com>
Claude-Session: https://claude.ai/code/session_01E8XCbEeVHWVP3hntUZ6kZ1
</commit_message>
<xml_diff>
--- a/public/documentazione/Manuale_Amministratore_Portale_CWP.docx
+++ b/public/documentazione/Manuale_Amministratore_Portale_CWP.docx
@@ -302,7 +302,7 @@
                 <w:sz w:val="20"/>
                 <w:szCs w:val="20"/>
               </w:rPr>
-              <w:t xml:space="preserve">Rev. 4.4</w:t>
+              <w:t xml:space="preserve">Rev. 4.5</w:t>
             </w:r>
           </w:p>
         </w:tc>
@@ -719,7 +719,7 @@
                 <w:sz w:val="18"/>
                 <w:szCs w:val="18"/>
               </w:rPr>
-              <w:t xml:space="preserve">4.4</w:t>
+              <w:t xml:space="preserve">4.5</w:t>
             </w:r>
           </w:p>
         </w:tc>
@@ -783,7 +783,7 @@
                 <w:sz w:val="18"/>
                 <w:szCs w:val="18"/>
               </w:rPr>
-              <w:t xml:space="preserve">Collaudo V05: testo completo dei valori lunghi nell'Audit (Prima/Dopo, Tolto/Aggiunto), denominazione delle organizzazioni e ricerca sui valori cambiati; pagina «Account disattivato».</w:t>
+              <w:t xml:space="preserve">Nuovo documento «Registro issue e test» tra quelli scaricabili.</w:t>
             </w:r>
           </w:p>
         </w:tc>
@@ -853,7 +853,7 @@
                 <w:sz w:val="18"/>
                 <w:szCs w:val="18"/>
               </w:rPr>
-              <w:t xml:space="preserve">4.3</w:t>
+              <w:t xml:space="preserve">4.4</w:t>
             </w:r>
           </w:p>
         </w:tc>
@@ -886,7 +886,7 @@
                 <w:sz w:val="18"/>
                 <w:szCs w:val="18"/>
               </w:rPr>
-              <w:t xml:space="preserve">20/10/2026</w:t>
+              <w:t xml:space="preserve">21/10/2026</w:t>
             </w:r>
           </w:p>
         </w:tc>
@@ -919,7 +919,7 @@
                 <w:sz w:val="18"/>
                 <w:szCs w:val="18"/>
               </w:rPr>
-              <w:t xml:space="preserve">Correzioni del collaudo V01: import CSV della Banca Dati «tutto o niente» senza valori negativi, calcolo bloccato con dati non ammessi, buffer manuale 0-80%, conferma definitiva solo senza errori di coerenza, dati non ammessi nel simulatore e zero esplicito nei prezzi, colonna «Oggetto e modifiche» nell'Audit.</w:t>
+              <w:t xml:space="preserve">Collaudo V05: testo completo dei valori lunghi nell'Audit (Prima/Dopo, Tolto/Aggiunto), denominazione delle organizzazioni e ricerca sui valori cambiati; pagina «Account disattivato».</w:t>
             </w:r>
           </w:p>
         </w:tc>
@@ -989,7 +989,7 @@
                 <w:sz w:val="18"/>
                 <w:szCs w:val="18"/>
               </w:rPr>
-              <w:t xml:space="preserve">4.2</w:t>
+              <w:t xml:space="preserve">4.3</w:t>
             </w:r>
           </w:p>
         </w:tc>
@@ -1053,7 +1053,7 @@
                 <w:sz w:val="18"/>
                 <w:szCs w:val="18"/>
               </w:rPr>
-              <w:t xml:space="preserve">Nuovo capitolo «Sicurezza»: inattività, avvisi, protezioni del sito e del database.</w:t>
+              <w:t xml:space="preserve">Correzioni del collaudo V01: import CSV della Banca Dati «tutto o niente» senza valori negativi, calcolo bloccato con dati non ammessi, buffer manuale 0-80%, conferma definitiva solo senza errori di coerenza, dati non ammessi nel simulatore e zero esplicito nei prezzi, colonna «Oggetto e modifiche» nell'Audit.</w:t>
             </w:r>
           </w:p>
         </w:tc>
@@ -1123,7 +1123,7 @@
                 <w:sz w:val="18"/>
                 <w:szCs w:val="18"/>
               </w:rPr>
-              <w:t xml:space="preserve">4.1</w:t>
+              <w:t xml:space="preserve">4.2</w:t>
             </w:r>
           </w:p>
         </w:tc>
@@ -1189,7 +1189,7 @@
                 <w:sz w:val="18"/>
                 <w:szCs w:val="18"/>
               </w:rPr>
-              <w:t xml:space="preserve">Voci di menu degli enti aggiornate.</w:t>
+              <w:t xml:space="preserve">Nuovo capitolo «Sicurezza»: inattività, avvisi, protezioni del sito e del database.</w:t>
             </w:r>
           </w:p>
         </w:tc>
@@ -1259,7 +1259,7 @@
                 <w:sz w:val="18"/>
                 <w:szCs w:val="18"/>
               </w:rPr>
-              <w:t xml:space="preserve">4.0</w:t>
+              <w:t xml:space="preserve">4.1</w:t>
             </w:r>
           </w:p>
         </w:tc>
@@ -1323,7 +1323,7 @@
                 <w:sz w:val="18"/>
                 <w:szCs w:val="18"/>
               </w:rPr>
-              <w:t xml:space="preserve">Nuovo ordine del menu; la sezione si chiama «Audit User». Voce «Marketplaces» in arrivo.</w:t>
+              <w:t xml:space="preserve">Voci di menu degli enti aggiornate.</w:t>
             </w:r>
           </w:p>
         </w:tc>
@@ -1393,7 +1393,7 @@
                 <w:sz w:val="18"/>
                 <w:szCs w:val="18"/>
               </w:rPr>
-              <w:t xml:space="preserve">3.9</w:t>
+              <w:t xml:space="preserve">4.0</w:t>
             </w:r>
           </w:p>
         </w:tc>
@@ -1459,7 +1459,7 @@
                 <w:sz w:val="18"/>
                 <w:szCs w:val="18"/>
               </w:rPr>
-              <w:t xml:space="preserve">Nuovo capitolo «Audit trail user».</w:t>
+              <w:t xml:space="preserve">Nuovo ordine del menu; la sezione si chiama «Audit User». Voce «Marketplaces» in arrivo.</w:t>
             </w:r>
           </w:p>
         </w:tc>
@@ -1529,7 +1529,7 @@
                 <w:sz w:val="18"/>
                 <w:szCs w:val="18"/>
               </w:rPr>
-              <w:t xml:space="preserve">3.8</w:t>
+              <w:t xml:space="preserve">3.9</w:t>
             </w:r>
           </w:p>
         </w:tc>
@@ -1593,7 +1593,7 @@
                 <w:sz w:val="18"/>
                 <w:szCs w:val="18"/>
               </w:rPr>
-              <w:t xml:space="preserve">Utenti online; PDF ed Excel del simulatore; messaggi d'errore dell'assistente.</w:t>
+              <w:t xml:space="preserve">Nuovo capitolo «Audit trail user».</w:t>
             </w:r>
           </w:p>
         </w:tc>
@@ -1663,7 +1663,7 @@
                 <w:sz w:val="18"/>
                 <w:szCs w:val="18"/>
               </w:rPr>
-              <w:t xml:space="preserve">3.7</w:t>
+              <w:t xml:space="preserve">3.8</w:t>
             </w:r>
           </w:p>
         </w:tc>
@@ -1696,7 +1696,7 @@
                 <w:sz w:val="18"/>
                 <w:szCs w:val="18"/>
               </w:rPr>
-              <w:t xml:space="preserve">19/10/2026</w:t>
+              <w:t xml:space="preserve">20/10/2026</w:t>
             </w:r>
           </w:p>
         </w:tc>
@@ -1729,7 +1729,7 @@
                 <w:sz w:val="18"/>
                 <w:szCs w:val="18"/>
               </w:rPr>
-              <w:t xml:space="preserve">Assistente virtuale: messaggio «Un attimo…» durante l'attesa.</w:t>
+              <w:t xml:space="preserve">Utenti online; PDF ed Excel del simulatore; messaggi d'errore dell'assistente.</w:t>
             </w:r>
           </w:p>
         </w:tc>
@@ -1799,7 +1799,7 @@
                 <w:sz w:val="18"/>
                 <w:szCs w:val="18"/>
               </w:rPr>
-              <w:t xml:space="preserve">3.6</w:t>
+              <w:t xml:space="preserve">3.7</w:t>
             </w:r>
           </w:p>
         </w:tc>
@@ -1863,7 +1863,7 @@
                 <w:sz w:val="18"/>
                 <w:szCs w:val="18"/>
               </w:rPr>
-              <w:t xml:space="preserve">Assistente virtuale attivo: chiave legata a uno spazio di lavoro, crediti e consumi.</w:t>
+              <w:t xml:space="preserve">Assistente virtuale: messaggio «Un attimo…» durante l'attesa.</w:t>
             </w:r>
           </w:p>
         </w:tc>
@@ -1933,7 +1933,7 @@
                 <w:sz w:val="18"/>
                 <w:szCs w:val="18"/>
               </w:rPr>
-              <w:t xml:space="preserve">3.5</w:t>
+              <w:t xml:space="preserve">3.6</w:t>
             </w:r>
           </w:p>
         </w:tc>
@@ -1999,7 +1999,7 @@
                 <w:sz w:val="18"/>
                 <w:szCs w:val="18"/>
               </w:rPr>
-              <w:t xml:space="preserve">Assistente virtuale; documenti ufficiali del Programma nella Documentazione.</w:t>
+              <w:t xml:space="preserve">Assistente virtuale attivo: chiave legata a uno spazio di lavoro, crediti e consumi.</w:t>
             </w:r>
           </w:p>
         </w:tc>
@@ -2069,7 +2069,7 @@
                 <w:sz w:val="18"/>
                 <w:szCs w:val="18"/>
               </w:rPr>
-              <w:t xml:space="preserve">3.4</w:t>
+              <w:t xml:space="preserve">3.5</w:t>
             </w:r>
           </w:p>
         </w:tc>
@@ -2133,7 +2133,7 @@
                 <w:sz w:val="18"/>
                 <w:szCs w:val="18"/>
               </w:rPr>
-              <w:t xml:space="preserve">Presentazione di riepilogo nella pagina Documentazione.</w:t>
+              <w:t xml:space="preserve">Assistente virtuale; documenti ufficiali del Programma nella Documentazione.</w:t>
             </w:r>
           </w:p>
         </w:tc>
@@ -2203,7 +2203,7 @@
                 <w:sz w:val="18"/>
                 <w:szCs w:val="18"/>
               </w:rPr>
-              <w:t xml:space="preserve">3.3</w:t>
+              <w:t xml:space="preserve">3.4</w:t>
             </w:r>
           </w:p>
         </w:tc>
@@ -2269,7 +2269,7 @@
                 <w:sz w:val="18"/>
                 <w:szCs w:val="18"/>
               </w:rPr>
-              <w:t xml:space="preserve">Ordinamento di tutte le tabelle e degli elenchi.</w:t>
+              <w:t xml:space="preserve">Presentazione di riepilogo nella pagina Documentazione.</w:t>
             </w:r>
           </w:p>
         </w:tc>
@@ -2339,7 +2339,7 @@
                 <w:sz w:val="18"/>
                 <w:szCs w:val="18"/>
               </w:rPr>
-              <w:t xml:space="preserve">3.2</w:t>
+              <w:t xml:space="preserve">3.3</w:t>
             </w:r>
           </w:p>
         </w:tc>
@@ -2403,7 +2403,7 @@
                 <w:sz w:val="18"/>
                 <w:szCs w:val="18"/>
               </w:rPr>
-              <w:t xml:space="preserve">Simulatore: metodo di stima per utenza (solo utenze virtuose), buffer del Capitolo 7, taratura.</w:t>
+              <w:t xml:space="preserve">Ordinamento di tutte le tabelle e degli elenchi.</w:t>
             </w:r>
           </w:p>
         </w:tc>
@@ -2473,7 +2473,7 @@
                 <w:sz w:val="18"/>
                 <w:szCs w:val="18"/>
               </w:rPr>
-              <w:t xml:space="preserve">3.1</w:t>
+              <w:t xml:space="preserve">3.2</w:t>
             </w:r>
           </w:p>
         </w:tc>
@@ -2539,7 +2539,7 @@
                 <w:sz w:val="18"/>
                 <w:szCs w:val="18"/>
               </w:rPr>
-              <w:t xml:space="preserve">Cruscotto diventa Dashboard; barra a LED delle 7 fasi per ogni pratica.</w:t>
+              <w:t xml:space="preserve">Simulatore: metodo di stima per utenza (solo utenze virtuose), buffer del Capitolo 7, taratura.</w:t>
             </w:r>
           </w:p>
         </w:tc>
@@ -2609,7 +2609,7 @@
                 <w:sz w:val="18"/>
                 <w:szCs w:val="18"/>
               </w:rPr>
-              <w:t xml:space="preserve">3.0</w:t>
+              <w:t xml:space="preserve">3.1</w:t>
             </w:r>
           </w:p>
         </w:tc>
@@ -2673,7 +2673,7 @@
                 <w:sz w:val="18"/>
                 <w:szCs w:val="18"/>
               </w:rPr>
-              <w:t xml:space="preserve">Eliminazione degli utenti che non hanno mai operato (script 30).</w:t>
+              <w:t xml:space="preserve">Cruscotto diventa Dashboard; barra a LED delle 7 fasi per ogni pratica.</w:t>
             </w:r>
           </w:p>
         </w:tc>
@@ -2743,7 +2743,7 @@
                 <w:sz w:val="18"/>
                 <w:szCs w:val="18"/>
               </w:rPr>
-              <w:t xml:space="preserve">2.9</w:t>
+              <w:t xml:space="preserve">3.0</w:t>
             </w:r>
           </w:p>
         </w:tc>
@@ -2809,7 +2809,7 @@
                 <w:sz w:val="18"/>
                 <w:szCs w:val="18"/>
               </w:rPr>
-              <w:t xml:space="preserve">Email automatica con le credenziali al nuovo utente e alla reimpostazione della password.</w:t>
+              <w:t xml:space="preserve">Eliminazione degli utenti che non hanno mai operato (script 30).</w:t>
             </w:r>
           </w:p>
         </w:tc>
@@ -2879,7 +2879,7 @@
                 <w:sz w:val="18"/>
                 <w:szCs w:val="18"/>
               </w:rPr>
-              <w:t xml:space="preserve">2.8</w:t>
+              <w:t xml:space="preserve">2.9</w:t>
             </w:r>
           </w:p>
         </w:tc>
@@ -2943,7 +2943,7 @@
                 <w:sz w:val="18"/>
                 <w:szCs w:val="18"/>
               </w:rPr>
-              <w:t xml:space="preserve">Più Amministratori con accesso completo; Amministratore principale protetto (script 29).</w:t>
+              <w:t xml:space="preserve">Email automatica con le credenziali al nuovo utente e alla reimpostazione della password.</w:t>
             </w:r>
           </w:p>
         </w:tc>
@@ -3013,7 +3013,7 @@
                 <w:sz w:val="18"/>
                 <w:szCs w:val="18"/>
               </w:rPr>
-              <w:t xml:space="preserve">2.7</w:t>
+              <w:t xml:space="preserve">2.8</w:t>
             </w:r>
           </w:p>
         </w:tc>
@@ -3079,7 +3079,7 @@
                 <w:sz w:val="18"/>
                 <w:szCs w:val="18"/>
               </w:rPr>
-              <w:t xml:space="preserve">Simulatore: costi per il Comune secondo il Caso 1 (progetto volontario) o il Caso 2 (progetto obbligatorio da bando).</w:t>
+              <w:t xml:space="preserve">Più Amministratori con accesso completo; Amministratore principale protetto (script 29).</w:t>
             </w:r>
           </w:p>
         </w:tc>
@@ -3149,7 +3149,7 @@
                 <w:sz w:val="18"/>
                 <w:szCs w:val="18"/>
               </w:rPr>
-              <w:t xml:space="preserve">2.6</w:t>
+              <w:t xml:space="preserve">2.7</w:t>
             </w:r>
           </w:p>
         </w:tc>
@@ -3213,7 +3213,7 @@
                 <w:sz w:val="18"/>
                 <w:szCs w:val="18"/>
               </w:rPr>
-              <w:t xml:space="preserve">Simulatore: valore del credito anno per anno, proposto 32 €.</w:t>
+              <w:t xml:space="preserve">Simulatore: costi per il Comune secondo il Caso 1 (progetto volontario) o il Caso 2 (progetto obbligatorio da bando).</w:t>
             </w:r>
           </w:p>
         </w:tc>
@@ -3283,7 +3283,7 @@
                 <w:sz w:val="18"/>
                 <w:szCs w:val="18"/>
               </w:rPr>
-              <w:t xml:space="preserve">2.5</w:t>
+              <w:t xml:space="preserve">2.6</w:t>
             </w:r>
           </w:p>
         </w:tc>
@@ -3349,7 +3349,7 @@
                 <w:sz w:val="18"/>
                 <w:szCs w:val="18"/>
               </w:rPr>
-              <w:t xml:space="preserve">Simulatore: simulazione economica con valore unitario del credito e costi per il Comune (contratti tipo della Fondazione, Schema tariffario).</w:t>
+              <w:t xml:space="preserve">Simulatore: valore del credito anno per anno, proposto 32 €.</w:t>
             </w:r>
           </w:p>
         </w:tc>
@@ -3419,7 +3419,7 @@
                 <w:sz w:val="18"/>
                 <w:szCs w:val="18"/>
               </w:rPr>
-              <w:t xml:space="preserve">2.4</w:t>
+              <w:t xml:space="preserve">2.5</w:t>
             </w:r>
           </w:p>
         </w:tc>
@@ -3483,7 +3483,7 @@
                 <w:sz w:val="18"/>
                 <w:szCs w:val="18"/>
               </w:rPr>
-              <w:t xml:space="preserve">Simulatore: riferimento sempre alla soglia del 65% di differenziata e controllo dei valori fuori scala.</w:t>
+              <w:t xml:space="preserve">Simulatore: simulazione economica con valore unitario del credito e costi per il Comune (contratti tipo della Fondazione, Schema tariffario).</w:t>
             </w:r>
           </w:p>
         </w:tc>
@@ -3553,7 +3553,7 @@
                 <w:sz w:val="18"/>
                 <w:szCs w:val="18"/>
               </w:rPr>
-              <w:t xml:space="preserve">2.3</w:t>
+              <w:t xml:space="preserve">2.4</w:t>
             </w:r>
           </w:p>
         </w:tc>
@@ -3619,7 +3619,7 @@
                 <w:sz w:val="18"/>
                 <w:szCs w:val="18"/>
               </w:rPr>
-              <w:t xml:space="preserve">Simulatore conforme al modello CWP: scenario di riferimento dello Standard 4.8.1, situazione attuale, conformità.</w:t>
+              <w:t xml:space="preserve">Simulatore: riferimento sempre alla soglia del 65% di differenziata e controllo dei valori fuori scala.</w:t>
             </w:r>
           </w:p>
         </w:tc>
@@ -3689,7 +3689,7 @@
                 <w:sz w:val="18"/>
                 <w:szCs w:val="18"/>
               </w:rPr>
-              <w:t xml:space="preserve">2.2</w:t>
+              <w:t xml:space="preserve">2.3</w:t>
             </w:r>
           </w:p>
         </w:tc>
@@ -3753,7 +3753,7 @@
                 <w:sz w:val="18"/>
                 <w:szCs w:val="18"/>
               </w:rPr>
-              <w:t xml:space="preserve">Nuovo capitolo «Simulatore di scenari»: creazione, anno base, obiettivi annui, risultati, modello di stima.</w:t>
+              <w:t xml:space="preserve">Simulatore conforme al modello CWP: scenario di riferimento dello Standard 4.8.1, situazione attuale, conformità.</w:t>
             </w:r>
           </w:p>
         </w:tc>
@@ -3823,7 +3823,7 @@
                 <w:sz w:val="18"/>
                 <w:szCs w:val="18"/>
               </w:rPr>
-              <w:t xml:space="preserve">2.1</w:t>
+              <w:t xml:space="preserve">2.2</w:t>
             </w:r>
           </w:p>
         </w:tc>
@@ -3889,7 +3889,7 @@
                 <w:sz w:val="18"/>
                 <w:szCs w:val="18"/>
               </w:rPr>
-              <w:t xml:space="preserve">Funzioni in arrivo: simulatore di scenari (7, 10 o 21 anni, obiettivi annui, % di differenziata e crediti stimati) e assistente virtuale (Claude).</w:t>
+              <w:t xml:space="preserve">Nuovo capitolo «Simulatore di scenari»: creazione, anno base, obiettivi annui, risultati, modello di stima.</w:t>
             </w:r>
           </w:p>
         </w:tc>
@@ -3959,7 +3959,7 @@
                 <w:sz w:val="18"/>
                 <w:szCs w:val="18"/>
               </w:rPr>
-              <w:t xml:space="preserve">2.0</w:t>
+              <w:t xml:space="preserve">2.1</w:t>
             </w:r>
           </w:p>
         </w:tc>
@@ -4023,7 +4023,7 @@
                 <w:sz w:val="18"/>
                 <w:szCs w:val="18"/>
               </w:rPr>
-              <w:t xml:space="preserve">Copie di sicurezza e ripristino: rimando alle Istruzioni di ripristino e punti essenziali (capitolo Manutenzione ed emergenze).</w:t>
+              <w:t xml:space="preserve">Funzioni in arrivo: simulatore di scenari (7, 10 o 21 anni, obiettivi annui, % di differenziata e crediti stimati) e assistente virtuale (Claude).</w:t>
             </w:r>
           </w:p>
         </w:tc>
@@ -4093,7 +4093,7 @@
                 <w:sz w:val="18"/>
                 <w:szCs w:val="18"/>
               </w:rPr>
-              <w:t xml:space="preserve">1.9</w:t>
+              <w:t xml:space="preserve">2.0</w:t>
             </w:r>
           </w:p>
         </w:tc>
@@ -4159,7 +4159,7 @@
                 <w:sz w:val="18"/>
                 <w:szCs w:val="18"/>
               </w:rPr>
-              <w:t xml:space="preserve">Fondazione Operate soggetto promotore del programma (esclusiva conferita da Wastelab).</w:t>
+              <w:t xml:space="preserve">Copie di sicurezza e ripristino: rimando alle Istruzioni di ripristino e punti essenziali (capitolo Manutenzione ed emergenze).</w:t>
             </w:r>
           </w:p>
         </w:tc>
@@ -4229,7 +4229,7 @@
                 <w:sz w:val="18"/>
                 <w:szCs w:val="18"/>
               </w:rPr>
-              <w:t xml:space="preserve">1.8</w:t>
+              <w:t xml:space="preserve">1.9</w:t>
             </w:r>
           </w:p>
         </w:tc>
@@ -4293,7 +4293,7 @@
                 <w:sz w:val="18"/>
                 <w:szCs w:val="18"/>
               </w:rPr>
-              <w:t xml:space="preserve">PEC del Programma e documenti ufficiali già pubblicati sulla pagina pubblica.</w:t>
+              <w:t xml:space="preserve">Fondazione Operate soggetto promotore del programma (esclusiva conferita da Wastelab).</w:t>
             </w:r>
           </w:p>
         </w:tc>
@@ -4363,7 +4363,7 @@
                 <w:sz w:val="18"/>
                 <w:szCs w:val="18"/>
               </w:rPr>
-              <w:t xml:space="preserve">1.7</w:t>
+              <w:t xml:space="preserve">1.8</w:t>
             </w:r>
           </w:p>
         </w:tc>
@@ -4396,7 +4396,7 @@
                 <w:sz w:val="18"/>
                 <w:szCs w:val="18"/>
               </w:rPr>
-              <w:t xml:space="preserve">18/10/2026</w:t>
+              <w:t xml:space="preserve">19/10/2026</w:t>
             </w:r>
           </w:p>
         </w:tc>
@@ -4429,7 +4429,7 @@
                 <w:sz w:val="18"/>
                 <w:szCs w:val="18"/>
               </w:rPr>
-              <w:t xml:space="preserve">Allineamento ai documenti ufficiali del Programma (script 22-24): Rapporto a 7 fasi, feedback pubblico, stati del Programma, dati del progetto e territorio ISTAT, ritiro e rientro, account unico e delegati, registri, tariffe e sospensione, accuratezza e accertamenti, informazioni del Programma e metodologie, modelli pubblici; nuovi capitoli Crediti emessi, Reclami, Pagina pubblica; qualità dei dati nel calcolo.</w:t>
+              <w:t xml:space="preserve">PEC del Programma e documenti ufficiali già pubblicati sulla pagina pubblica.</w:t>
             </w:r>
           </w:p>
         </w:tc>
@@ -4499,7 +4499,7 @@
                 <w:sz w:val="18"/>
                 <w:szCs w:val="18"/>
               </w:rPr>
-              <w:t xml:space="preserve">1.6</w:t>
+              <w:t xml:space="preserve">1.7</w:t>
             </w:r>
           </w:p>
         </w:tc>
@@ -4563,7 +4563,7 @@
                 <w:sz w:val="18"/>
                 <w:szCs w:val="18"/>
               </w:rPr>
-              <w:t xml:space="preserve">Calcolo crediti: descrizione corretta del buffer (somma delle voci delle Tabelle 15 e 16, più il 20% con le sole utenze virtuose, al massimo 80%).</w:t>
+              <w:t xml:space="preserve">Allineamento ai documenti ufficiali del Programma (script 22-24): Rapporto a 7 fasi, feedback pubblico, stati del Programma, dati del progetto e territorio ISTAT, ritiro e rientro, account unico e delegati, registri, tariffe e sospensione, accuratezza e accertamenti, informazioni del Programma e metodologie, modelli pubblici; nuovi capitoli Crediti emessi, Reclami, Pagina pubblica; qualità dei dati nel calcolo.</w:t>
             </w:r>
           </w:p>
         </w:tc>
@@ -4633,7 +4633,7 @@
                 <w:sz w:val="18"/>
                 <w:szCs w:val="18"/>
               </w:rPr>
-              <w:t xml:space="preserve">1.5</w:t>
+              <w:t xml:space="preserve">1.6</w:t>
             </w:r>
           </w:p>
         </w:tc>
@@ -4699,7 +4699,7 @@
                 <w:sz w:val="18"/>
                 <w:szCs w:val="18"/>
               </w:rPr>
-              <w:t xml:space="preserve">Nuova pagina Anagrafiche (Organizzazioni ed Enti, anche per gli Operatori); Rapporti con 4 fasi e durate proprie; documenti richiesti per fase; consultazione con documento bloccato, osservazioni numerate e motivazione; conservazione per 10 anni; fascicolo con riepilogo PDF e nuove cartelle.</w:t>
+              <w:t xml:space="preserve">Calcolo crediti: descrizione corretta del buffer (somma delle voci delle Tabelle 15 e 16, più il 20% con le sole utenze virtuose, al massimo 80%).</w:t>
             </w:r>
           </w:p>
         </w:tc>
@@ -4769,7 +4769,7 @@
                 <w:sz w:val="18"/>
                 <w:szCs w:val="18"/>
               </w:rPr>
-              <w:t xml:space="preserve">1.4</w:t>
+              <w:t xml:space="preserve">1.5</w:t>
             </w:r>
           </w:p>
         </w:tc>
@@ -4833,7 +4833,7 @@
                 <w:sz w:val="18"/>
                 <w:szCs w:val="18"/>
               </w:rPr>
-              <w:t xml:space="preserve">Calcolo crediti: il risultato si azzera quando cambiano dati o Banca Dati Utenze, conferma solo dopo un nuovo «Calcola». Gestione utenti: password temporanea di almeno 10 caratteri con lettere e numeri, creazione annullata se non va a buon fine, nessun accesso ai dati prima del cambio password.</w:t>
+              <w:t xml:space="preserve">Nuova pagina Anagrafiche (Organizzazioni ed Enti, anche per gli Operatori); Rapporti con 4 fasi e durate proprie; documenti richiesti per fase; consultazione con documento bloccato, osservazioni numerate e motivazione; conservazione per 10 anni; fascicolo con riepilogo PDF e nuove cartelle.</w:t>
             </w:r>
           </w:p>
         </w:tc>
@@ -4903,7 +4903,7 @@
                 <w:sz w:val="18"/>
                 <w:szCs w:val="18"/>
               </w:rPr>
-              <w:t xml:space="preserve">1.3</w:t>
+              <w:t xml:space="preserve">1.4</w:t>
             </w:r>
           </w:p>
         </w:tc>
@@ -4969,7 +4969,7 @@
                 <w:sz w:val="18"/>
                 <w:szCs w:val="18"/>
               </w:rPr>
-              <w:t xml:space="preserve">Rapporto di calcolo in PDF, archiviazione nella pratica, numero di registro, registro dei crediti.</w:t>
+              <w:t xml:space="preserve">Calcolo crediti: il risultato si azzera quando cambiano dati o Banca Dati Utenze, conferma solo dopo un nuovo «Calcola». Gestione utenti: password temporanea di almeno 10 caratteri con lettere e numeri, creazione annullata se non va a buon fine, nessun accesso ai dati prima del cambio password.</w:t>
             </w:r>
           </w:p>
         </w:tc>
@@ -5039,7 +5039,7 @@
                 <w:sz w:val="18"/>
                 <w:szCs w:val="18"/>
               </w:rPr>
-              <w:t xml:space="preserve">1.2</w:t>
+              <w:t xml:space="preserve">1.3</w:t>
             </w:r>
           </w:p>
         </w:tc>
@@ -5103,7 +5103,7 @@
                 <w:sz w:val="18"/>
                 <w:szCs w:val="18"/>
               </w:rPr>
-              <w:t xml:space="preserve">Calcolo crediti: importare il tracciato nel calcolo (dai documenti della pratica o dal computer), singole letture, blocco dei dati personali, controlli di coerenza.</w:t>
+              <w:t xml:space="preserve">Rapporto di calcolo in PDF, archiviazione nella pratica, numero di registro, registro dei crediti.</w:t>
             </w:r>
           </w:p>
         </w:tc>
@@ -5173,7 +5173,7 @@
                 <w:sz w:val="18"/>
                 <w:szCs w:val="18"/>
               </w:rPr>
-              <w:t xml:space="preserve">1.1</w:t>
+              <w:t xml:space="preserve">1.2</w:t>
             </w:r>
           </w:p>
         </w:tc>
@@ -5239,7 +5239,7 @@
                 <w:sz w:val="18"/>
                 <w:szCs w:val="18"/>
               </w:rPr>
-              <w:t xml:space="preserve">Note di fase, Ente di Validazione della pratica, consultazione sulla pagina pubblica con conferma dell'email, moderazione con autori e allegati, errata corrige; nuovo capitolo Messaggi con il Comune; pagamenti visibili al Comune; Impostazioni: Enti di Validazione e Modelli di documento; notifiche aggiornate.</w:t>
+              <w:t xml:space="preserve">Calcolo crediti: importare il tracciato nel calcolo (dai documenti della pratica o dal computer), singole letture, blocco dei dati personali, controlli di coerenza.</w:t>
             </w:r>
           </w:p>
         </w:tc>
@@ -5309,6 +5309,140 @@
                 <w:sz w:val="18"/>
                 <w:szCs w:val="18"/>
               </w:rPr>
+              <w:t xml:space="preserve">1.1</w:t>
+            </w:r>
+          </w:p>
+        </w:tc>
+        <w:tc>
+          <w:tcPr>
+            <w:tcW w:type="dxa" w:w="1300"/>
+            <w:tcBorders>
+              <w:top w:val="single" w:color="D9D4C5" w:sz="4"/>
+              <w:left w:val="single" w:color="D9D4C5" w:sz="4"/>
+              <w:bottom w:val="single" w:color="D9D4C5" w:sz="4"/>
+              <w:right w:val="single" w:color="D9D4C5" w:sz="4"/>
+            </w:tcBorders>
+            <w:tcMar>
+              <w:top w:type="dxa" w:w="70"/>
+              <w:left w:type="dxa" w:w="110"/>
+              <w:bottom w:type="dxa" w:w="70"/>
+              <w:right w:type="dxa" w:w="110"/>
+            </w:tcMar>
+            <w:vAlign w:val="center"/>
+          </w:tcPr>
+          <w:p>
+            <w:pPr>
+              <w:spacing w:after="0" w:before="0"/>
+            </w:pPr>
+            <w:r>
+              <w:rPr>
+                <w:rFonts w:ascii="Arial" w:cs="Arial" w:eastAsia="Arial" w:hAnsi="Arial"/>
+                <w:color w:val="1B2118"/>
+                <w:sz w:val="18"/>
+                <w:szCs w:val="18"/>
+              </w:rPr>
+              <w:t xml:space="preserve">18/10/2026</w:t>
+            </w:r>
+          </w:p>
+        </w:tc>
+        <w:tc>
+          <w:tcPr>
+            <w:tcW w:type="dxa" w:w="5538"/>
+            <w:tcBorders>
+              <w:top w:val="single" w:color="D9D4C5" w:sz="4"/>
+              <w:left w:val="single" w:color="D9D4C5" w:sz="4"/>
+              <w:bottom w:val="single" w:color="D9D4C5" w:sz="4"/>
+              <w:right w:val="single" w:color="D9D4C5" w:sz="4"/>
+            </w:tcBorders>
+            <w:tcMar>
+              <w:top w:type="dxa" w:w="70"/>
+              <w:left w:type="dxa" w:w="110"/>
+              <w:bottom w:type="dxa" w:w="70"/>
+              <w:right w:type="dxa" w:w="110"/>
+            </w:tcMar>
+            <w:vAlign w:val="center"/>
+          </w:tcPr>
+          <w:p>
+            <w:pPr>
+              <w:spacing w:after="0" w:before="0"/>
+            </w:pPr>
+            <w:r>
+              <w:rPr>
+                <w:rFonts w:ascii="Arial" w:cs="Arial" w:eastAsia="Arial" w:hAnsi="Arial"/>
+                <w:color w:val="1B2118"/>
+                <w:sz w:val="18"/>
+                <w:szCs w:val="18"/>
+              </w:rPr>
+              <w:t xml:space="preserve">Note di fase, Ente di Validazione della pratica, consultazione sulla pagina pubblica con conferma dell'email, moderazione con autori e allegati, errata corrige; nuovo capitolo Messaggi con il Comune; pagamenti visibili al Comune; Impostazioni: Enti di Validazione e Modelli di documento; notifiche aggiornate.</w:t>
+            </w:r>
+          </w:p>
+        </w:tc>
+        <w:tc>
+          <w:tcPr>
+            <w:tcW w:type="dxa" w:w="2000"/>
+            <w:tcBorders>
+              <w:top w:val="single" w:color="D9D4C5" w:sz="4"/>
+              <w:left w:val="single" w:color="D9D4C5" w:sz="4"/>
+              <w:bottom w:val="single" w:color="D9D4C5" w:sz="4"/>
+              <w:right w:val="single" w:color="D9D4C5" w:sz="4"/>
+            </w:tcBorders>
+            <w:tcMar>
+              <w:top w:type="dxa" w:w="70"/>
+              <w:left w:type="dxa" w:w="110"/>
+              <w:bottom w:type="dxa" w:w="70"/>
+              <w:right w:type="dxa" w:w="110"/>
+            </w:tcMar>
+            <w:vAlign w:val="center"/>
+          </w:tcPr>
+          <w:p>
+            <w:pPr>
+              <w:spacing w:after="0" w:before="0"/>
+            </w:pPr>
+            <w:r>
+              <w:rPr>
+                <w:rFonts w:ascii="Arial" w:cs="Arial" w:eastAsia="Arial" w:hAnsi="Arial"/>
+                <w:color w:val="1B2118"/>
+                <w:sz w:val="18"/>
+                <w:szCs w:val="18"/>
+              </w:rPr>
+              <w:t xml:space="preserve">Fondazione Operate</w:t>
+            </w:r>
+          </w:p>
+        </w:tc>
+      </w:tr>
+      <w:tr>
+        <w:trPr>
+          <w:cantSplit/>
+        </w:trPr>
+        <w:tc>
+          <w:tcPr>
+            <w:tcW w:type="dxa" w:w="800"/>
+            <w:tcBorders>
+              <w:top w:val="single" w:color="D9D4C5" w:sz="4"/>
+              <w:left w:val="single" w:color="D9D4C5" w:sz="4"/>
+              <w:bottom w:val="single" w:color="D9D4C5" w:sz="4"/>
+              <w:right w:val="single" w:color="D9D4C5" w:sz="4"/>
+            </w:tcBorders>
+            <w:shd w:fill="F6F4EE" w:color="auto" w:val="clear"/>
+            <w:tcMar>
+              <w:top w:type="dxa" w:w="70"/>
+              <w:left w:type="dxa" w:w="110"/>
+              <w:bottom w:type="dxa" w:w="70"/>
+              <w:right w:type="dxa" w:w="110"/>
+            </w:tcMar>
+            <w:vAlign w:val="center"/>
+          </w:tcPr>
+          <w:p>
+            <w:pPr>
+              <w:spacing w:after="0" w:before="0"/>
+            </w:pPr>
+            <w:r>
+              <w:rPr>
+                <w:rFonts w:ascii="Arial" w:cs="Arial" w:eastAsia="Arial" w:hAnsi="Arial"/>
+                <w:color w:val="1B2118"/>
+                <w:sz w:val="18"/>
+                <w:szCs w:val="18"/>
+              </w:rPr>
               <w:t xml:space="preserve">1.0</w:t>
             </w:r>
           </w:p>
@@ -5322,6 +5456,7 @@
               <w:bottom w:val="single" w:color="D9D4C5" w:sz="4"/>
               <w:right w:val="single" w:color="D9D4C5" w:sz="4"/>
             </w:tcBorders>
+            <w:shd w:fill="F6F4EE" w:color="auto" w:val="clear"/>
             <w:tcMar>
               <w:top w:type="dxa" w:w="70"/>
               <w:left w:type="dxa" w:w="110"/>
@@ -5354,6 +5489,7 @@
               <w:bottom w:val="single" w:color="D9D4C5" w:sz="4"/>
               <w:right w:val="single" w:color="D9D4C5" w:sz="4"/>
             </w:tcBorders>
+            <w:shd w:fill="F6F4EE" w:color="auto" w:val="clear"/>
             <w:tcMar>
               <w:top w:type="dxa" w:w="70"/>
               <w:left w:type="dxa" w:w="110"/>
@@ -5386,6 +5522,7 @@
               <w:bottom w:val="single" w:color="D9D4C5" w:sz="4"/>
               <w:right w:val="single" w:color="D9D4C5" w:sz="4"/>
             </w:tcBorders>
+            <w:shd w:fill="F6F4EE" w:color="auto" w:val="clear"/>
             <w:tcMar>
               <w:top w:type="dxa" w:w="70"/>
               <w:left w:type="dxa" w:w="110"/>
@@ -5427,7 +5564,7 @@
           <w:sz w:val="20"/>
           <w:szCs w:val="20"/>
         </w:rPr>
-        <w:t xml:space="preserve">Questo documento descrive il portale alla revisione 4.4 del 21/10/2026. A ogni modifica del portale il manuale viene aggiornato e la revisione incrementata; la versione corrente si scarica dall'area Documentazione del portale (solo Amministratori).</w:t>
+        <w:t xml:space="preserve">Questo documento descrive il portale alla revisione 4.5 del 21/10/2026. A ogni modifica del portale il manuale viene aggiornato e la revisione incrementata; la versione corrente si scarica dall'area Documentazione del portale (solo Amministratori).</w:t>
       </w:r>
     </w:p>
     <w:p>
@@ -8178,7 +8315,7 @@
         </w:rPr>
         <w:t xml:space="preserve">Si accede da </w:t>
       </w:r>
-      <w:hyperlink w:history="1" r:id="rIdhwfma1vut_iua1spig80p">
+      <w:hyperlink w:history="1" r:id="rIdsszdghvk12j7hyyolha1h">
         <w:r>
           <w:rPr>
             <w:rFonts w:ascii="Arial" w:cs="Arial" w:eastAsia="Arial" w:hAnsi="Arial"/>
@@ -42186,9 +42323,9 @@
         <w:tblLayout w:type="fixed"/>
       </w:tblPr>
       <w:tblGrid>
-        <w:gridCol w:w="2136"/>
+        <w:gridCol w:w="2137"/>
         <w:gridCol w:w="2010"/>
-        <w:gridCol w:w="5492"/>
+        <w:gridCol w:w="5491"/>
       </w:tblGrid>
       <w:tr>
         <w:trPr>
@@ -42196,7 +42333,7 @@
         </w:trPr>
         <w:tc>
           <w:tcPr>
-            <w:tcW w:type="dxa" w:w="2136"/>
+            <w:tcW w:type="dxa" w:w="2137"/>
             <w:tcBorders>
               <w:top w:val="single" w:color="D9D4C5" w:sz="4"/>
               <w:left w:val="single" w:color="D9D4C5" w:sz="4"/>
@@ -42266,7 +42403,7 @@
         </w:tc>
         <w:tc>
           <w:tcPr>
-            <w:tcW w:type="dxa" w:w="5492"/>
+            <w:tcW w:type="dxa" w:w="5491"/>
             <w:tcBorders>
               <w:top w:val="single" w:color="D9D4C5" w:sz="4"/>
               <w:left w:val="single" w:color="D9D4C5" w:sz="4"/>
@@ -42306,7 +42443,7 @@
         </w:trPr>
         <w:tc>
           <w:tcPr>
-            <w:tcW w:type="dxa" w:w="2136"/>
+            <w:tcW w:type="dxa" w:w="2137"/>
             <w:tcBorders>
               <w:top w:val="single" w:color="D9D4C5" w:sz="4"/>
               <w:left w:val="single" w:color="D9D4C5" w:sz="4"/>
@@ -42370,7 +42507,7 @@
         </w:tc>
         <w:tc>
           <w:tcPr>
-            <w:tcW w:type="dxa" w:w="5492"/>
+            <w:tcW w:type="dxa" w:w="5491"/>
             <w:tcBorders>
               <w:top w:val="single" w:color="D9D4C5" w:sz="4"/>
               <w:left w:val="single" w:color="D9D4C5" w:sz="4"/>
@@ -42407,7 +42544,7 @@
         </w:trPr>
         <w:tc>
           <w:tcPr>
-            <w:tcW w:type="dxa" w:w="2136"/>
+            <w:tcW w:type="dxa" w:w="2137"/>
             <w:tcBorders>
               <w:top w:val="single" w:color="D9D4C5" w:sz="4"/>
               <w:left w:val="single" w:color="D9D4C5" w:sz="4"/>
@@ -42473,7 +42610,7 @@
         </w:tc>
         <w:tc>
           <w:tcPr>
-            <w:tcW w:type="dxa" w:w="5492"/>
+            <w:tcW w:type="dxa" w:w="5491"/>
             <w:tcBorders>
               <w:top w:val="single" w:color="D9D4C5" w:sz="4"/>
               <w:left w:val="single" w:color="D9D4C5" w:sz="4"/>
@@ -42511,7 +42648,7 @@
         </w:trPr>
         <w:tc>
           <w:tcPr>
-            <w:tcW w:type="dxa" w:w="2136"/>
+            <w:tcW w:type="dxa" w:w="2137"/>
             <w:tcBorders>
               <w:top w:val="single" w:color="D9D4C5" w:sz="4"/>
               <w:left w:val="single" w:color="D9D4C5" w:sz="4"/>
@@ -42575,7 +42712,7 @@
         </w:tc>
         <w:tc>
           <w:tcPr>
-            <w:tcW w:type="dxa" w:w="5492"/>
+            <w:tcW w:type="dxa" w:w="5491"/>
             <w:tcBorders>
               <w:top w:val="single" w:color="D9D4C5" w:sz="4"/>
               <w:left w:val="single" w:color="D9D4C5" w:sz="4"/>
@@ -42612,7 +42749,7 @@
         </w:trPr>
         <w:tc>
           <w:tcPr>
-            <w:tcW w:type="dxa" w:w="2136"/>
+            <w:tcW w:type="dxa" w:w="2137"/>
             <w:tcBorders>
               <w:top w:val="single" w:color="D9D4C5" w:sz="4"/>
               <w:left w:val="single" w:color="D9D4C5" w:sz="4"/>
@@ -42678,7 +42815,7 @@
         </w:tc>
         <w:tc>
           <w:tcPr>
-            <w:tcW w:type="dxa" w:w="5492"/>
+            <w:tcW w:type="dxa" w:w="5491"/>
             <w:tcBorders>
               <w:top w:val="single" w:color="D9D4C5" w:sz="4"/>
               <w:left w:val="single" w:color="D9D4C5" w:sz="4"/>
@@ -42716,33 +42853,33 @@
         </w:trPr>
         <w:tc>
           <w:tcPr>
-            <w:tcW w:type="dxa" w:w="2136"/>
-            <w:tcBorders>
-              <w:top w:val="single" w:color="D9D4C5" w:sz="4"/>
-              <w:left w:val="single" w:color="D9D4C5" w:sz="4"/>
-              <w:bottom w:val="single" w:color="D9D4C5" w:sz="4"/>
-              <w:right w:val="single" w:color="D9D4C5" w:sz="4"/>
-            </w:tcBorders>
-            <w:tcMar>
-              <w:top w:type="dxa" w:w="70"/>
-              <w:left w:type="dxa" w:w="110"/>
-              <w:bottom w:type="dxa" w:w="70"/>
-              <w:right w:type="dxa" w:w="110"/>
-            </w:tcMar>
-            <w:vAlign w:val="center"/>
-          </w:tcPr>
-          <w:p>
-            <w:pPr>
-              <w:spacing w:after="0" w:before="0"/>
-            </w:pPr>
-            <w:r>
-              <w:rPr>
-                <w:rFonts w:ascii="Arial" w:cs="Arial" w:eastAsia="Arial" w:hAnsi="Arial"/>
-                <w:color w:val="1B2118"/>
-                <w:sz w:val="18"/>
-                <w:szCs w:val="18"/>
-              </w:rPr>
-              <w:t xml:space="preserve">Istruzioni di ripristino</w:t>
+            <w:tcW w:type="dxa" w:w="2137"/>
+            <w:tcBorders>
+              <w:top w:val="single" w:color="D9D4C5" w:sz="4"/>
+              <w:left w:val="single" w:color="D9D4C5" w:sz="4"/>
+              <w:bottom w:val="single" w:color="D9D4C5" w:sz="4"/>
+              <w:right w:val="single" w:color="D9D4C5" w:sz="4"/>
+            </w:tcBorders>
+            <w:tcMar>
+              <w:top w:type="dxa" w:w="70"/>
+              <w:left w:type="dxa" w:w="110"/>
+              <w:bottom w:type="dxa" w:w="70"/>
+              <w:right w:type="dxa" w:w="110"/>
+            </w:tcMar>
+            <w:vAlign w:val="center"/>
+          </w:tcPr>
+          <w:p>
+            <w:pPr>
+              <w:spacing w:after="0" w:before="0"/>
+            </w:pPr>
+            <w:r>
+              <w:rPr>
+                <w:rFonts w:ascii="Arial" w:cs="Arial" w:eastAsia="Arial" w:hAnsi="Arial"/>
+                <w:color w:val="1B2118"/>
+                <w:sz w:val="18"/>
+                <w:szCs w:val="18"/>
+              </w:rPr>
+              <w:t xml:space="preserve">Registro issue e test</w:t>
             </w:r>
           </w:p>
         </w:tc>
@@ -42780,33 +42917,33 @@
         </w:tc>
         <w:tc>
           <w:tcPr>
-            <w:tcW w:type="dxa" w:w="5492"/>
-            <w:tcBorders>
-              <w:top w:val="single" w:color="D9D4C5" w:sz="4"/>
-              <w:left w:val="single" w:color="D9D4C5" w:sz="4"/>
-              <w:bottom w:val="single" w:color="D9D4C5" w:sz="4"/>
-              <w:right w:val="single" w:color="D9D4C5" w:sz="4"/>
-            </w:tcBorders>
-            <w:tcMar>
-              <w:top w:type="dxa" w:w="70"/>
-              <w:left w:type="dxa" w:w="110"/>
-              <w:bottom w:type="dxa" w:w="70"/>
-              <w:right w:type="dxa" w:w="110"/>
-            </w:tcMar>
-            <w:vAlign w:val="center"/>
-          </w:tcPr>
-          <w:p>
-            <w:pPr>
-              <w:spacing w:after="0" w:before="0"/>
-            </w:pPr>
-            <w:r>
-              <w:rPr>
-                <w:rFonts w:ascii="Arial" w:cs="Arial" w:eastAsia="Arial" w:hAnsi="Arial"/>
-                <w:color w:val="1B2118"/>
-                <w:sz w:val="18"/>
-                <w:szCs w:val="18"/>
-              </w:rPr>
-              <w:t xml:space="preserve">Copie di sicurezza e ripristino di GitHub, Vercel, Supabase, Resend e del progetto Claude</w:t>
+            <w:tcW w:type="dxa" w:w="5491"/>
+            <w:tcBorders>
+              <w:top w:val="single" w:color="D9D4C5" w:sz="4"/>
+              <w:left w:val="single" w:color="D9D4C5" w:sz="4"/>
+              <w:bottom w:val="single" w:color="D9D4C5" w:sz="4"/>
+              <w:right w:val="single" w:color="D9D4C5" w:sz="4"/>
+            </w:tcBorders>
+            <w:tcMar>
+              <w:top w:type="dxa" w:w="70"/>
+              <w:left w:type="dxa" w:w="110"/>
+              <w:bottom w:type="dxa" w:w="70"/>
+              <w:right w:type="dxa" w:w="110"/>
+            </w:tcMar>
+            <w:vAlign w:val="center"/>
+          </w:tcPr>
+          <w:p>
+            <w:pPr>
+              <w:spacing w:after="0" w:before="0"/>
+            </w:pPr>
+            <w:r>
+              <w:rPr>
+                <w:rFonts w:ascii="Arial" w:cs="Arial" w:eastAsia="Arial" w:hAnsi="Arial"/>
+                <w:color w:val="1B2118"/>
+                <w:sz w:val="18"/>
+                <w:szCs w:val="18"/>
+              </w:rPr>
+              <w:t xml:space="preserve">Tutte le segnalazioni con data e ora, chi le ha fatte, azione correttiva, prove e rilascio; registro dei test e dei collaudi. Aggiornato a ogni variazione</w:t>
             </w:r>
           </w:p>
         </w:tc>
@@ -42817,7 +42954,7 @@
         </w:trPr>
         <w:tc>
           <w:tcPr>
-            <w:tcW w:type="dxa" w:w="2136"/>
+            <w:tcW w:type="dxa" w:w="2137"/>
             <w:tcBorders>
               <w:top w:val="single" w:color="D9D4C5" w:sz="4"/>
               <w:left w:val="single" w:color="D9D4C5" w:sz="4"/>
@@ -42844,6 +42981,109 @@
                 <w:sz w:val="18"/>
                 <w:szCs w:val="18"/>
               </w:rPr>
+              <w:t xml:space="preserve">Istruzioni di ripristino</w:t>
+            </w:r>
+          </w:p>
+        </w:tc>
+        <w:tc>
+          <w:tcPr>
+            <w:tcW w:type="dxa" w:w="2010"/>
+            <w:tcBorders>
+              <w:top w:val="single" w:color="D9D4C5" w:sz="4"/>
+              <w:left w:val="single" w:color="D9D4C5" w:sz="4"/>
+              <w:bottom w:val="single" w:color="D9D4C5" w:sz="4"/>
+              <w:right w:val="single" w:color="D9D4C5" w:sz="4"/>
+            </w:tcBorders>
+            <w:shd w:fill="F6F4EE" w:color="auto" w:val="clear"/>
+            <w:tcMar>
+              <w:top w:type="dxa" w:w="70"/>
+              <w:left w:type="dxa" w:w="110"/>
+              <w:bottom w:type="dxa" w:w="70"/>
+              <w:right w:type="dxa" w:w="110"/>
+            </w:tcMar>
+            <w:vAlign w:val="center"/>
+          </w:tcPr>
+          <w:p>
+            <w:pPr>
+              <w:spacing w:after="0" w:before="0"/>
+            </w:pPr>
+            <w:r>
+              <w:rPr>
+                <w:rFonts w:ascii="Arial" w:cs="Arial" w:eastAsia="Arial" w:hAnsi="Arial"/>
+                <w:color w:val="1B2118"/>
+                <w:sz w:val="18"/>
+                <w:szCs w:val="18"/>
+              </w:rPr>
+              <w:t xml:space="preserve">solo Amministratori</w:t>
+            </w:r>
+          </w:p>
+        </w:tc>
+        <w:tc>
+          <w:tcPr>
+            <w:tcW w:type="dxa" w:w="5491"/>
+            <w:tcBorders>
+              <w:top w:val="single" w:color="D9D4C5" w:sz="4"/>
+              <w:left w:val="single" w:color="D9D4C5" w:sz="4"/>
+              <w:bottom w:val="single" w:color="D9D4C5" w:sz="4"/>
+              <w:right w:val="single" w:color="D9D4C5" w:sz="4"/>
+            </w:tcBorders>
+            <w:shd w:fill="F6F4EE" w:color="auto" w:val="clear"/>
+            <w:tcMar>
+              <w:top w:type="dxa" w:w="70"/>
+              <w:left w:type="dxa" w:w="110"/>
+              <w:bottom w:type="dxa" w:w="70"/>
+              <w:right w:type="dxa" w:w="110"/>
+            </w:tcMar>
+            <w:vAlign w:val="center"/>
+          </w:tcPr>
+          <w:p>
+            <w:pPr>
+              <w:spacing w:after="0" w:before="0"/>
+            </w:pPr>
+            <w:r>
+              <w:rPr>
+                <w:rFonts w:ascii="Arial" w:cs="Arial" w:eastAsia="Arial" w:hAnsi="Arial"/>
+                <w:color w:val="1B2118"/>
+                <w:sz w:val="18"/>
+                <w:szCs w:val="18"/>
+              </w:rPr>
+              <w:t xml:space="preserve">Copie di sicurezza e ripristino di GitHub, Vercel, Supabase, Resend e del progetto Claude</w:t>
+            </w:r>
+          </w:p>
+        </w:tc>
+      </w:tr>
+      <w:tr>
+        <w:trPr>
+          <w:cantSplit/>
+        </w:trPr>
+        <w:tc>
+          <w:tcPr>
+            <w:tcW w:type="dxa" w:w="2137"/>
+            <w:tcBorders>
+              <w:top w:val="single" w:color="D9D4C5" w:sz="4"/>
+              <w:left w:val="single" w:color="D9D4C5" w:sz="4"/>
+              <w:bottom w:val="single" w:color="D9D4C5" w:sz="4"/>
+              <w:right w:val="single" w:color="D9D4C5" w:sz="4"/>
+            </w:tcBorders>
+            <w:tcMar>
+              <w:top w:type="dxa" w:w="70"/>
+              <w:left w:type="dxa" w:w="110"/>
+              <w:bottom w:type="dxa" w:w="70"/>
+              <w:right w:type="dxa" w:w="110"/>
+            </w:tcMar>
+            <w:vAlign w:val="center"/>
+          </w:tcPr>
+          <w:p>
+            <w:pPr>
+              <w:spacing w:after="0" w:before="0"/>
+            </w:pPr>
+            <w:r>
+              <w:rPr>
+                <w:rFonts w:ascii="Arial" w:cs="Arial" w:eastAsia="Arial" w:hAnsi="Arial"/>
+                <w:color w:val="1B2118"/>
+                <w:sz w:val="18"/>
+                <w:szCs w:val="18"/>
+              </w:rPr>
               <w:t xml:space="preserve">Presentazione di riepilogo</w:t>
             </w:r>
           </w:p>
@@ -42857,7 +43097,6 @@
               <w:bottom w:val="single" w:color="D9D4C5" w:sz="4"/>
               <w:right w:val="single" w:color="D9D4C5" w:sz="4"/>
             </w:tcBorders>
-            <w:shd w:fill="F6F4EE" w:color="auto" w:val="clear"/>
             <w:tcMar>
               <w:top w:type="dxa" w:w="70"/>
               <w:left w:type="dxa" w:w="110"/>
@@ -42883,14 +43122,13 @@
         </w:tc>
         <w:tc>
           <w:tcPr>
-            <w:tcW w:type="dxa" w:w="5492"/>
-            <w:tcBorders>
-              <w:top w:val="single" w:color="D9D4C5" w:sz="4"/>
-              <w:left w:val="single" w:color="D9D4C5" w:sz="4"/>
-              <w:bottom w:val="single" w:color="D9D4C5" w:sz="4"/>
-              <w:right w:val="single" w:color="D9D4C5" w:sz="4"/>
-            </w:tcBorders>
-            <w:shd w:fill="F6F4EE" w:color="auto" w:val="clear"/>
+            <w:tcW w:type="dxa" w:w="5491"/>
+            <w:tcBorders>
+              <w:top w:val="single" w:color="D9D4C5" w:sz="4"/>
+              <w:left w:val="single" w:color="D9D4C5" w:sz="4"/>
+              <w:bottom w:val="single" w:color="D9D4C5" w:sz="4"/>
+              <w:right w:val="single" w:color="D9D4C5" w:sz="4"/>
+            </w:tcBorders>
             <w:tcMar>
               <w:top w:type="dxa" w:w="70"/>
               <w:left w:type="dxa" w:w="110"/>
@@ -45481,7 +45719,7 @@
         <w:szCs w:val="16"/>
       </w:rPr>
       <w:tab/>
-      <w:t xml:space="preserve">Manuale Amministratore · Rev. 4.4 · 21/10/2026</w:t>
+      <w:t xml:space="preserve">Manuale Amministratore · Rev. 4.5 · 21/10/2026</w:t>
     </w:r>
   </w:p>
 </w:hdr>
@@ -45546,7 +45784,7 @@
         <w:szCs w:val="16"/>
       </w:rPr>
       <w:tab/>
-      <w:t xml:space="preserve">Manuale Amministratore · Rev. 4.4 · 21/10/2026</w:t>
+      <w:t xml:space="preserve">Manuale Amministratore · Rev. 4.5 · 21/10/2026</w:t>
     </w:r>
   </w:p>
 </w:hdr>

</xml_diff>

<commit_message>
Assistente, seconda fase: Operatori (kb-operatore) e riepilogo della pratica aperta; documenti aggiornati
Co-Authored-By: Claude Opus 5.5 <noreply@anthropic.com>
Claude-Session: https://claude.ai/code/session_01E8XCbEeVHWVP3hntUZ6kZ1
</commit_message>
<xml_diff>
--- a/public/documentazione/Manuale_Amministratore_Portale_CWP.docx
+++ b/public/documentazione/Manuale_Amministratore_Portale_CWP.docx
@@ -302,7 +302,7 @@
                 <w:sz w:val="20"/>
                 <w:szCs w:val="20"/>
               </w:rPr>
-              <w:t xml:space="preserve">Rev. 4.6</w:t>
+              <w:t xml:space="preserve">Rev. 4.7</w:t>
             </w:r>
           </w:p>
         </w:tc>
@@ -719,7 +719,7 @@
                 <w:sz w:val="18"/>
                 <w:szCs w:val="18"/>
               </w:rPr>
-              <w:t xml:space="preserve">4.6</w:t>
+              <w:t xml:space="preserve">4.7</w:t>
             </w:r>
           </w:p>
         </w:tc>
@@ -783,7 +783,7 @@
                 <w:sz w:val="18"/>
                 <w:szCs w:val="18"/>
               </w:rPr>
-              <w:t xml:space="preserve">Capitolo «Backup automatico».</w:t>
+              <w:t xml:space="preserve">Assistente per gli Operatori e domande sulla pratica aperta; menu dell'Operatore con il Simulatore.</w:t>
             </w:r>
           </w:p>
         </w:tc>
@@ -853,7 +853,7 @@
                 <w:sz w:val="18"/>
                 <w:szCs w:val="18"/>
               </w:rPr>
-              <w:t xml:space="preserve">4.5</w:t>
+              <w:t xml:space="preserve">4.6</w:t>
             </w:r>
           </w:p>
         </w:tc>
@@ -919,7 +919,7 @@
                 <w:sz w:val="18"/>
                 <w:szCs w:val="18"/>
               </w:rPr>
-              <w:t xml:space="preserve">Nuovo documento «Registro issue e test» tra quelli scaricabili.</w:t>
+              <w:t xml:space="preserve">Capitolo «Backup automatico».</w:t>
             </w:r>
           </w:p>
         </w:tc>
@@ -989,7 +989,7 @@
                 <w:sz w:val="18"/>
                 <w:szCs w:val="18"/>
               </w:rPr>
-              <w:t xml:space="preserve">4.4</w:t>
+              <w:t xml:space="preserve">4.5</w:t>
             </w:r>
           </w:p>
         </w:tc>
@@ -1053,7 +1053,7 @@
                 <w:sz w:val="18"/>
                 <w:szCs w:val="18"/>
               </w:rPr>
-              <w:t xml:space="preserve">Collaudo V05: testo completo dei valori lunghi nell'Audit (Prima/Dopo, Tolto/Aggiunto), denominazione delle organizzazioni e ricerca sui valori cambiati; pagina «Account disattivato».</w:t>
+              <w:t xml:space="preserve">Nuovo documento «Registro issue e test» tra quelli scaricabili.</w:t>
             </w:r>
           </w:p>
         </w:tc>
@@ -1123,7 +1123,7 @@
                 <w:sz w:val="18"/>
                 <w:szCs w:val="18"/>
               </w:rPr>
-              <w:t xml:space="preserve">4.3</w:t>
+              <w:t xml:space="preserve">4.4</w:t>
             </w:r>
           </w:p>
         </w:tc>
@@ -1156,7 +1156,7 @@
                 <w:sz w:val="18"/>
                 <w:szCs w:val="18"/>
               </w:rPr>
-              <w:t xml:space="preserve">20/10/2026</w:t>
+              <w:t xml:space="preserve">21/10/2026</w:t>
             </w:r>
           </w:p>
         </w:tc>
@@ -1189,7 +1189,7 @@
                 <w:sz w:val="18"/>
                 <w:szCs w:val="18"/>
               </w:rPr>
-              <w:t xml:space="preserve">Correzioni del collaudo V01: import CSV della Banca Dati «tutto o niente» senza valori negativi, calcolo bloccato con dati non ammessi, buffer manuale 0-80%, conferma definitiva solo senza errori di coerenza, dati non ammessi nel simulatore e zero esplicito nei prezzi, colonna «Oggetto e modifiche» nell'Audit.</w:t>
+              <w:t xml:space="preserve">Collaudo V05: testo completo dei valori lunghi nell'Audit (Prima/Dopo, Tolto/Aggiunto), denominazione delle organizzazioni e ricerca sui valori cambiati; pagina «Account disattivato».</w:t>
             </w:r>
           </w:p>
         </w:tc>
@@ -1259,7 +1259,7 @@
                 <w:sz w:val="18"/>
                 <w:szCs w:val="18"/>
               </w:rPr>
-              <w:t xml:space="preserve">4.2</w:t>
+              <w:t xml:space="preserve">4.3</w:t>
             </w:r>
           </w:p>
         </w:tc>
@@ -1323,7 +1323,7 @@
                 <w:sz w:val="18"/>
                 <w:szCs w:val="18"/>
               </w:rPr>
-              <w:t xml:space="preserve">Nuovo capitolo «Sicurezza»: inattività, avvisi, protezioni del sito e del database.</w:t>
+              <w:t xml:space="preserve">Correzioni del collaudo V01: import CSV della Banca Dati «tutto o niente» senza valori negativi, calcolo bloccato con dati non ammessi, buffer manuale 0-80%, conferma definitiva solo senza errori di coerenza, dati non ammessi nel simulatore e zero esplicito nei prezzi, colonna «Oggetto e modifiche» nell'Audit.</w:t>
             </w:r>
           </w:p>
         </w:tc>
@@ -1393,7 +1393,7 @@
                 <w:sz w:val="18"/>
                 <w:szCs w:val="18"/>
               </w:rPr>
-              <w:t xml:space="preserve">4.1</w:t>
+              <w:t xml:space="preserve">4.2</w:t>
             </w:r>
           </w:p>
         </w:tc>
@@ -1459,7 +1459,7 @@
                 <w:sz w:val="18"/>
                 <w:szCs w:val="18"/>
               </w:rPr>
-              <w:t xml:space="preserve">Voci di menu degli enti aggiornate.</w:t>
+              <w:t xml:space="preserve">Nuovo capitolo «Sicurezza»: inattività, avvisi, protezioni del sito e del database.</w:t>
             </w:r>
           </w:p>
         </w:tc>
@@ -1529,7 +1529,7 @@
                 <w:sz w:val="18"/>
                 <w:szCs w:val="18"/>
               </w:rPr>
-              <w:t xml:space="preserve">4.0</w:t>
+              <w:t xml:space="preserve">4.1</w:t>
             </w:r>
           </w:p>
         </w:tc>
@@ -1593,7 +1593,7 @@
                 <w:sz w:val="18"/>
                 <w:szCs w:val="18"/>
               </w:rPr>
-              <w:t xml:space="preserve">Nuovo ordine del menu; la sezione si chiama «Audit User». Voce «Marketplaces» in arrivo.</w:t>
+              <w:t xml:space="preserve">Voci di menu degli enti aggiornate.</w:t>
             </w:r>
           </w:p>
         </w:tc>
@@ -1663,7 +1663,7 @@
                 <w:sz w:val="18"/>
                 <w:szCs w:val="18"/>
               </w:rPr>
-              <w:t xml:space="preserve">3.9</w:t>
+              <w:t xml:space="preserve">4.0</w:t>
             </w:r>
           </w:p>
         </w:tc>
@@ -1729,7 +1729,7 @@
                 <w:sz w:val="18"/>
                 <w:szCs w:val="18"/>
               </w:rPr>
-              <w:t xml:space="preserve">Nuovo capitolo «Audit trail user».</w:t>
+              <w:t xml:space="preserve">Nuovo ordine del menu; la sezione si chiama «Audit User». Voce «Marketplaces» in arrivo.</w:t>
             </w:r>
           </w:p>
         </w:tc>
@@ -1799,7 +1799,7 @@
                 <w:sz w:val="18"/>
                 <w:szCs w:val="18"/>
               </w:rPr>
-              <w:t xml:space="preserve">3.8</w:t>
+              <w:t xml:space="preserve">3.9</w:t>
             </w:r>
           </w:p>
         </w:tc>
@@ -1863,7 +1863,7 @@
                 <w:sz w:val="18"/>
                 <w:szCs w:val="18"/>
               </w:rPr>
-              <w:t xml:space="preserve">Utenti online; PDF ed Excel del simulatore; messaggi d'errore dell'assistente.</w:t>
+              <w:t xml:space="preserve">Nuovo capitolo «Audit trail user».</w:t>
             </w:r>
           </w:p>
         </w:tc>
@@ -1933,7 +1933,7 @@
                 <w:sz w:val="18"/>
                 <w:szCs w:val="18"/>
               </w:rPr>
-              <w:t xml:space="preserve">3.7</w:t>
+              <w:t xml:space="preserve">3.8</w:t>
             </w:r>
           </w:p>
         </w:tc>
@@ -1966,7 +1966,7 @@
                 <w:sz w:val="18"/>
                 <w:szCs w:val="18"/>
               </w:rPr>
-              <w:t xml:space="preserve">19/10/2026</w:t>
+              <w:t xml:space="preserve">20/10/2026</w:t>
             </w:r>
           </w:p>
         </w:tc>
@@ -1999,7 +1999,7 @@
                 <w:sz w:val="18"/>
                 <w:szCs w:val="18"/>
               </w:rPr>
-              <w:t xml:space="preserve">Assistente virtuale: messaggio «Un attimo…» durante l'attesa.</w:t>
+              <w:t xml:space="preserve">Utenti online; PDF ed Excel del simulatore; messaggi d'errore dell'assistente.</w:t>
             </w:r>
           </w:p>
         </w:tc>
@@ -2069,7 +2069,7 @@
                 <w:sz w:val="18"/>
                 <w:szCs w:val="18"/>
               </w:rPr>
-              <w:t xml:space="preserve">3.6</w:t>
+              <w:t xml:space="preserve">3.7</w:t>
             </w:r>
           </w:p>
         </w:tc>
@@ -2133,7 +2133,7 @@
                 <w:sz w:val="18"/>
                 <w:szCs w:val="18"/>
               </w:rPr>
-              <w:t xml:space="preserve">Assistente virtuale attivo: chiave legata a uno spazio di lavoro, crediti e consumi.</w:t>
+              <w:t xml:space="preserve">Assistente virtuale: messaggio «Un attimo…» durante l'attesa.</w:t>
             </w:r>
           </w:p>
         </w:tc>
@@ -2203,7 +2203,7 @@
                 <w:sz w:val="18"/>
                 <w:szCs w:val="18"/>
               </w:rPr>
-              <w:t xml:space="preserve">3.5</w:t>
+              <w:t xml:space="preserve">3.6</w:t>
             </w:r>
           </w:p>
         </w:tc>
@@ -2269,7 +2269,7 @@
                 <w:sz w:val="18"/>
                 <w:szCs w:val="18"/>
               </w:rPr>
-              <w:t xml:space="preserve">Assistente virtuale; documenti ufficiali del Programma nella Documentazione.</w:t>
+              <w:t xml:space="preserve">Assistente virtuale attivo: chiave legata a uno spazio di lavoro, crediti e consumi.</w:t>
             </w:r>
           </w:p>
         </w:tc>
@@ -2339,7 +2339,7 @@
                 <w:sz w:val="18"/>
                 <w:szCs w:val="18"/>
               </w:rPr>
-              <w:t xml:space="preserve">3.4</w:t>
+              <w:t xml:space="preserve">3.5</w:t>
             </w:r>
           </w:p>
         </w:tc>
@@ -2403,7 +2403,7 @@
                 <w:sz w:val="18"/>
                 <w:szCs w:val="18"/>
               </w:rPr>
-              <w:t xml:space="preserve">Presentazione di riepilogo nella pagina Documentazione.</w:t>
+              <w:t xml:space="preserve">Assistente virtuale; documenti ufficiali del Programma nella Documentazione.</w:t>
             </w:r>
           </w:p>
         </w:tc>
@@ -2473,7 +2473,7 @@
                 <w:sz w:val="18"/>
                 <w:szCs w:val="18"/>
               </w:rPr>
-              <w:t xml:space="preserve">3.3</w:t>
+              <w:t xml:space="preserve">3.4</w:t>
             </w:r>
           </w:p>
         </w:tc>
@@ -2539,7 +2539,7 @@
                 <w:sz w:val="18"/>
                 <w:szCs w:val="18"/>
               </w:rPr>
-              <w:t xml:space="preserve">Ordinamento di tutte le tabelle e degli elenchi.</w:t>
+              <w:t xml:space="preserve">Presentazione di riepilogo nella pagina Documentazione.</w:t>
             </w:r>
           </w:p>
         </w:tc>
@@ -2609,7 +2609,7 @@
                 <w:sz w:val="18"/>
                 <w:szCs w:val="18"/>
               </w:rPr>
-              <w:t xml:space="preserve">3.2</w:t>
+              <w:t xml:space="preserve">3.3</w:t>
             </w:r>
           </w:p>
         </w:tc>
@@ -2673,7 +2673,7 @@
                 <w:sz w:val="18"/>
                 <w:szCs w:val="18"/>
               </w:rPr>
-              <w:t xml:space="preserve">Simulatore: metodo di stima per utenza (solo utenze virtuose), buffer del Capitolo 7, taratura.</w:t>
+              <w:t xml:space="preserve">Ordinamento di tutte le tabelle e degli elenchi.</w:t>
             </w:r>
           </w:p>
         </w:tc>
@@ -2743,7 +2743,7 @@
                 <w:sz w:val="18"/>
                 <w:szCs w:val="18"/>
               </w:rPr>
-              <w:t xml:space="preserve">3.1</w:t>
+              <w:t xml:space="preserve">3.2</w:t>
             </w:r>
           </w:p>
         </w:tc>
@@ -2809,7 +2809,7 @@
                 <w:sz w:val="18"/>
                 <w:szCs w:val="18"/>
               </w:rPr>
-              <w:t xml:space="preserve">Cruscotto diventa Dashboard; barra a LED delle 7 fasi per ogni pratica.</w:t>
+              <w:t xml:space="preserve">Simulatore: metodo di stima per utenza (solo utenze virtuose), buffer del Capitolo 7, taratura.</w:t>
             </w:r>
           </w:p>
         </w:tc>
@@ -2879,7 +2879,7 @@
                 <w:sz w:val="18"/>
                 <w:szCs w:val="18"/>
               </w:rPr>
-              <w:t xml:space="preserve">3.0</w:t>
+              <w:t xml:space="preserve">3.1</w:t>
             </w:r>
           </w:p>
         </w:tc>
@@ -2943,7 +2943,7 @@
                 <w:sz w:val="18"/>
                 <w:szCs w:val="18"/>
               </w:rPr>
-              <w:t xml:space="preserve">Eliminazione degli utenti che non hanno mai operato (script 30).</w:t>
+              <w:t xml:space="preserve">Cruscotto diventa Dashboard; barra a LED delle 7 fasi per ogni pratica.</w:t>
             </w:r>
           </w:p>
         </w:tc>
@@ -3013,7 +3013,7 @@
                 <w:sz w:val="18"/>
                 <w:szCs w:val="18"/>
               </w:rPr>
-              <w:t xml:space="preserve">2.9</w:t>
+              <w:t xml:space="preserve">3.0</w:t>
             </w:r>
           </w:p>
         </w:tc>
@@ -3079,7 +3079,7 @@
                 <w:sz w:val="18"/>
                 <w:szCs w:val="18"/>
               </w:rPr>
-              <w:t xml:space="preserve">Email automatica con le credenziali al nuovo utente e alla reimpostazione della password.</w:t>
+              <w:t xml:space="preserve">Eliminazione degli utenti che non hanno mai operato (script 30).</w:t>
             </w:r>
           </w:p>
         </w:tc>
@@ -3149,7 +3149,7 @@
                 <w:sz w:val="18"/>
                 <w:szCs w:val="18"/>
               </w:rPr>
-              <w:t xml:space="preserve">2.8</w:t>
+              <w:t xml:space="preserve">2.9</w:t>
             </w:r>
           </w:p>
         </w:tc>
@@ -3213,7 +3213,7 @@
                 <w:sz w:val="18"/>
                 <w:szCs w:val="18"/>
               </w:rPr>
-              <w:t xml:space="preserve">Più Amministratori con accesso completo; Amministratore principale protetto (script 29).</w:t>
+              <w:t xml:space="preserve">Email automatica con le credenziali al nuovo utente e alla reimpostazione della password.</w:t>
             </w:r>
           </w:p>
         </w:tc>
@@ -3283,7 +3283,7 @@
                 <w:sz w:val="18"/>
                 <w:szCs w:val="18"/>
               </w:rPr>
-              <w:t xml:space="preserve">2.7</w:t>
+              <w:t xml:space="preserve">2.8</w:t>
             </w:r>
           </w:p>
         </w:tc>
@@ -3349,7 +3349,7 @@
                 <w:sz w:val="18"/>
                 <w:szCs w:val="18"/>
               </w:rPr>
-              <w:t xml:space="preserve">Simulatore: costi per il Comune secondo il Caso 1 (progetto volontario) o il Caso 2 (progetto obbligatorio da bando).</w:t>
+              <w:t xml:space="preserve">Più Amministratori con accesso completo; Amministratore principale protetto (script 29).</w:t>
             </w:r>
           </w:p>
         </w:tc>
@@ -3419,7 +3419,7 @@
                 <w:sz w:val="18"/>
                 <w:szCs w:val="18"/>
               </w:rPr>
-              <w:t xml:space="preserve">2.6</w:t>
+              <w:t xml:space="preserve">2.7</w:t>
             </w:r>
           </w:p>
         </w:tc>
@@ -3483,7 +3483,7 @@
                 <w:sz w:val="18"/>
                 <w:szCs w:val="18"/>
               </w:rPr>
-              <w:t xml:space="preserve">Simulatore: valore del credito anno per anno, proposto 32 €.</w:t>
+              <w:t xml:space="preserve">Simulatore: costi per il Comune secondo il Caso 1 (progetto volontario) o il Caso 2 (progetto obbligatorio da bando).</w:t>
             </w:r>
           </w:p>
         </w:tc>
@@ -3553,7 +3553,7 @@
                 <w:sz w:val="18"/>
                 <w:szCs w:val="18"/>
               </w:rPr>
-              <w:t xml:space="preserve">2.5</w:t>
+              <w:t xml:space="preserve">2.6</w:t>
             </w:r>
           </w:p>
         </w:tc>
@@ -3619,7 +3619,7 @@
                 <w:sz w:val="18"/>
                 <w:szCs w:val="18"/>
               </w:rPr>
-              <w:t xml:space="preserve">Simulatore: simulazione economica con valore unitario del credito e costi per il Comune (contratti tipo della Fondazione, Schema tariffario).</w:t>
+              <w:t xml:space="preserve">Simulatore: valore del credito anno per anno, proposto 32 €.</w:t>
             </w:r>
           </w:p>
         </w:tc>
@@ -3689,7 +3689,7 @@
                 <w:sz w:val="18"/>
                 <w:szCs w:val="18"/>
               </w:rPr>
-              <w:t xml:space="preserve">2.4</w:t>
+              <w:t xml:space="preserve">2.5</w:t>
             </w:r>
           </w:p>
         </w:tc>
@@ -3753,7 +3753,7 @@
                 <w:sz w:val="18"/>
                 <w:szCs w:val="18"/>
               </w:rPr>
-              <w:t xml:space="preserve">Simulatore: riferimento sempre alla soglia del 65% di differenziata e controllo dei valori fuori scala.</w:t>
+              <w:t xml:space="preserve">Simulatore: simulazione economica con valore unitario del credito e costi per il Comune (contratti tipo della Fondazione, Schema tariffario).</w:t>
             </w:r>
           </w:p>
         </w:tc>
@@ -3823,7 +3823,7 @@
                 <w:sz w:val="18"/>
                 <w:szCs w:val="18"/>
               </w:rPr>
-              <w:t xml:space="preserve">2.3</w:t>
+              <w:t xml:space="preserve">2.4</w:t>
             </w:r>
           </w:p>
         </w:tc>
@@ -3889,7 +3889,7 @@
                 <w:sz w:val="18"/>
                 <w:szCs w:val="18"/>
               </w:rPr>
-              <w:t xml:space="preserve">Simulatore conforme al modello CWP: scenario di riferimento dello Standard 4.8.1, situazione attuale, conformità.</w:t>
+              <w:t xml:space="preserve">Simulatore: riferimento sempre alla soglia del 65% di differenziata e controllo dei valori fuori scala.</w:t>
             </w:r>
           </w:p>
         </w:tc>
@@ -3959,7 +3959,7 @@
                 <w:sz w:val="18"/>
                 <w:szCs w:val="18"/>
               </w:rPr>
-              <w:t xml:space="preserve">2.2</w:t>
+              <w:t xml:space="preserve">2.3</w:t>
             </w:r>
           </w:p>
         </w:tc>
@@ -4023,7 +4023,7 @@
                 <w:sz w:val="18"/>
                 <w:szCs w:val="18"/>
               </w:rPr>
-              <w:t xml:space="preserve">Nuovo capitolo «Simulatore di scenari»: creazione, anno base, obiettivi annui, risultati, modello di stima.</w:t>
+              <w:t xml:space="preserve">Simulatore conforme al modello CWP: scenario di riferimento dello Standard 4.8.1, situazione attuale, conformità.</w:t>
             </w:r>
           </w:p>
         </w:tc>
@@ -4093,7 +4093,7 @@
                 <w:sz w:val="18"/>
                 <w:szCs w:val="18"/>
               </w:rPr>
-              <w:t xml:space="preserve">2.1</w:t>
+              <w:t xml:space="preserve">2.2</w:t>
             </w:r>
           </w:p>
         </w:tc>
@@ -4159,7 +4159,7 @@
                 <w:sz w:val="18"/>
                 <w:szCs w:val="18"/>
               </w:rPr>
-              <w:t xml:space="preserve">Funzioni in arrivo: simulatore di scenari (7, 10 o 21 anni, obiettivi annui, % di differenziata e crediti stimati) e assistente virtuale (Claude).</w:t>
+              <w:t xml:space="preserve">Nuovo capitolo «Simulatore di scenari»: creazione, anno base, obiettivi annui, risultati, modello di stima.</w:t>
             </w:r>
           </w:p>
         </w:tc>
@@ -4229,7 +4229,7 @@
                 <w:sz w:val="18"/>
                 <w:szCs w:val="18"/>
               </w:rPr>
-              <w:t xml:space="preserve">2.0</w:t>
+              <w:t xml:space="preserve">2.1</w:t>
             </w:r>
           </w:p>
         </w:tc>
@@ -4293,7 +4293,7 @@
                 <w:sz w:val="18"/>
                 <w:szCs w:val="18"/>
               </w:rPr>
-              <w:t xml:space="preserve">Copie di sicurezza e ripristino: rimando alle Istruzioni di ripristino e punti essenziali (capitolo Manutenzione ed emergenze).</w:t>
+              <w:t xml:space="preserve">Funzioni in arrivo: simulatore di scenari (7, 10 o 21 anni, obiettivi annui, % di differenziata e crediti stimati) e assistente virtuale (Claude).</w:t>
             </w:r>
           </w:p>
         </w:tc>
@@ -4363,7 +4363,7 @@
                 <w:sz w:val="18"/>
                 <w:szCs w:val="18"/>
               </w:rPr>
-              <w:t xml:space="preserve">1.9</w:t>
+              <w:t xml:space="preserve">2.0</w:t>
             </w:r>
           </w:p>
         </w:tc>
@@ -4429,7 +4429,7 @@
                 <w:sz w:val="18"/>
                 <w:szCs w:val="18"/>
               </w:rPr>
-              <w:t xml:space="preserve">Fondazione Operate soggetto promotore del programma (esclusiva conferita da Wastelab).</w:t>
+              <w:t xml:space="preserve">Copie di sicurezza e ripristino: rimando alle Istruzioni di ripristino e punti essenziali (capitolo Manutenzione ed emergenze).</w:t>
             </w:r>
           </w:p>
         </w:tc>
@@ -4499,7 +4499,7 @@
                 <w:sz w:val="18"/>
                 <w:szCs w:val="18"/>
               </w:rPr>
-              <w:t xml:space="preserve">1.8</w:t>
+              <w:t xml:space="preserve">1.9</w:t>
             </w:r>
           </w:p>
         </w:tc>
@@ -4563,7 +4563,7 @@
                 <w:sz w:val="18"/>
                 <w:szCs w:val="18"/>
               </w:rPr>
-              <w:t xml:space="preserve">PEC del Programma e documenti ufficiali già pubblicati sulla pagina pubblica.</w:t>
+              <w:t xml:space="preserve">Fondazione Operate soggetto promotore del programma (esclusiva conferita da Wastelab).</w:t>
             </w:r>
           </w:p>
         </w:tc>
@@ -4633,7 +4633,7 @@
                 <w:sz w:val="18"/>
                 <w:szCs w:val="18"/>
               </w:rPr>
-              <w:t xml:space="preserve">1.7</w:t>
+              <w:t xml:space="preserve">1.8</w:t>
             </w:r>
           </w:p>
         </w:tc>
@@ -4666,7 +4666,7 @@
                 <w:sz w:val="18"/>
                 <w:szCs w:val="18"/>
               </w:rPr>
-              <w:t xml:space="preserve">18/10/2026</w:t>
+              <w:t xml:space="preserve">19/10/2026</w:t>
             </w:r>
           </w:p>
         </w:tc>
@@ -4699,7 +4699,7 @@
                 <w:sz w:val="18"/>
                 <w:szCs w:val="18"/>
               </w:rPr>
-              <w:t xml:space="preserve">Allineamento ai documenti ufficiali del Programma (script 22-24): Rapporto a 7 fasi, feedback pubblico, stati del Programma, dati del progetto e territorio ISTAT, ritiro e rientro, account unico e delegati, registri, tariffe e sospensione, accuratezza e accertamenti, informazioni del Programma e metodologie, modelli pubblici; nuovi capitoli Crediti emessi, Reclami, Pagina pubblica; qualità dei dati nel calcolo.</w:t>
+              <w:t xml:space="preserve">PEC del Programma e documenti ufficiali già pubblicati sulla pagina pubblica.</w:t>
             </w:r>
           </w:p>
         </w:tc>
@@ -4769,7 +4769,7 @@
                 <w:sz w:val="18"/>
                 <w:szCs w:val="18"/>
               </w:rPr>
-              <w:t xml:space="preserve">1.6</w:t>
+              <w:t xml:space="preserve">1.7</w:t>
             </w:r>
           </w:p>
         </w:tc>
@@ -4833,7 +4833,7 @@
                 <w:sz w:val="18"/>
                 <w:szCs w:val="18"/>
               </w:rPr>
-              <w:t xml:space="preserve">Calcolo crediti: descrizione corretta del buffer (somma delle voci delle Tabelle 15 e 16, più il 20% con le sole utenze virtuose, al massimo 80%).</w:t>
+              <w:t xml:space="preserve">Allineamento ai documenti ufficiali del Programma (script 22-24): Rapporto a 7 fasi, feedback pubblico, stati del Programma, dati del progetto e territorio ISTAT, ritiro e rientro, account unico e delegati, registri, tariffe e sospensione, accuratezza e accertamenti, informazioni del Programma e metodologie, modelli pubblici; nuovi capitoli Crediti emessi, Reclami, Pagina pubblica; qualità dei dati nel calcolo.</w:t>
             </w:r>
           </w:p>
         </w:tc>
@@ -4903,7 +4903,7 @@
                 <w:sz w:val="18"/>
                 <w:szCs w:val="18"/>
               </w:rPr>
-              <w:t xml:space="preserve">1.5</w:t>
+              <w:t xml:space="preserve">1.6</w:t>
             </w:r>
           </w:p>
         </w:tc>
@@ -4969,7 +4969,7 @@
                 <w:sz w:val="18"/>
                 <w:szCs w:val="18"/>
               </w:rPr>
-              <w:t xml:space="preserve">Nuova pagina Anagrafiche (Organizzazioni ed Enti, anche per gli Operatori); Rapporti con 4 fasi e durate proprie; documenti richiesti per fase; consultazione con documento bloccato, osservazioni numerate e motivazione; conservazione per 10 anni; fascicolo con riepilogo PDF e nuove cartelle.</w:t>
+              <w:t xml:space="preserve">Calcolo crediti: descrizione corretta del buffer (somma delle voci delle Tabelle 15 e 16, più il 20% con le sole utenze virtuose, al massimo 80%).</w:t>
             </w:r>
           </w:p>
         </w:tc>
@@ -5039,7 +5039,7 @@
                 <w:sz w:val="18"/>
                 <w:szCs w:val="18"/>
               </w:rPr>
-              <w:t xml:space="preserve">1.4</w:t>
+              <w:t xml:space="preserve">1.5</w:t>
             </w:r>
           </w:p>
         </w:tc>
@@ -5103,7 +5103,7 @@
                 <w:sz w:val="18"/>
                 <w:szCs w:val="18"/>
               </w:rPr>
-              <w:t xml:space="preserve">Calcolo crediti: il risultato si azzera quando cambiano dati o Banca Dati Utenze, conferma solo dopo un nuovo «Calcola». Gestione utenti: password temporanea di almeno 10 caratteri con lettere e numeri, creazione annullata se non va a buon fine, nessun accesso ai dati prima del cambio password.</w:t>
+              <w:t xml:space="preserve">Nuova pagina Anagrafiche (Organizzazioni ed Enti, anche per gli Operatori); Rapporti con 4 fasi e durate proprie; documenti richiesti per fase; consultazione con documento bloccato, osservazioni numerate e motivazione; conservazione per 10 anni; fascicolo con riepilogo PDF e nuove cartelle.</w:t>
             </w:r>
           </w:p>
         </w:tc>
@@ -5173,7 +5173,7 @@
                 <w:sz w:val="18"/>
                 <w:szCs w:val="18"/>
               </w:rPr>
-              <w:t xml:space="preserve">1.3</w:t>
+              <w:t xml:space="preserve">1.4</w:t>
             </w:r>
           </w:p>
         </w:tc>
@@ -5239,7 +5239,7 @@
                 <w:sz w:val="18"/>
                 <w:szCs w:val="18"/>
               </w:rPr>
-              <w:t xml:space="preserve">Rapporto di calcolo in PDF, archiviazione nella pratica, numero di registro, registro dei crediti.</w:t>
+              <w:t xml:space="preserve">Calcolo crediti: il risultato si azzera quando cambiano dati o Banca Dati Utenze, conferma solo dopo un nuovo «Calcola». Gestione utenti: password temporanea di almeno 10 caratteri con lettere e numeri, creazione annullata se non va a buon fine, nessun accesso ai dati prima del cambio password.</w:t>
             </w:r>
           </w:p>
         </w:tc>
@@ -5309,7 +5309,7 @@
                 <w:sz w:val="18"/>
                 <w:szCs w:val="18"/>
               </w:rPr>
-              <w:t xml:space="preserve">1.2</w:t>
+              <w:t xml:space="preserve">1.3</w:t>
             </w:r>
           </w:p>
         </w:tc>
@@ -5373,7 +5373,7 @@
                 <w:sz w:val="18"/>
                 <w:szCs w:val="18"/>
               </w:rPr>
-              <w:t xml:space="preserve">Calcolo crediti: importare il tracciato nel calcolo (dai documenti della pratica o dal computer), singole letture, blocco dei dati personali, controlli di coerenza.</w:t>
+              <w:t xml:space="preserve">Rapporto di calcolo in PDF, archiviazione nella pratica, numero di registro, registro dei crediti.</w:t>
             </w:r>
           </w:p>
         </w:tc>
@@ -5443,7 +5443,7 @@
                 <w:sz w:val="18"/>
                 <w:szCs w:val="18"/>
               </w:rPr>
-              <w:t xml:space="preserve">1.1</w:t>
+              <w:t xml:space="preserve">1.2</w:t>
             </w:r>
           </w:p>
         </w:tc>
@@ -5509,7 +5509,7 @@
                 <w:sz w:val="18"/>
                 <w:szCs w:val="18"/>
               </w:rPr>
-              <w:t xml:space="preserve">Note di fase, Ente di Validazione della pratica, consultazione sulla pagina pubblica con conferma dell'email, moderazione con autori e allegati, errata corrige; nuovo capitolo Messaggi con il Comune; pagamenti visibili al Comune; Impostazioni: Enti di Validazione e Modelli di documento; notifiche aggiornate.</w:t>
+              <w:t xml:space="preserve">Calcolo crediti: importare il tracciato nel calcolo (dai documenti della pratica o dal computer), singole letture, blocco dei dati personali, controlli di coerenza.</w:t>
             </w:r>
           </w:p>
         </w:tc>
@@ -5579,6 +5579,140 @@
                 <w:sz w:val="18"/>
                 <w:szCs w:val="18"/>
               </w:rPr>
+              <w:t xml:space="preserve">1.1</w:t>
+            </w:r>
+          </w:p>
+        </w:tc>
+        <w:tc>
+          <w:tcPr>
+            <w:tcW w:type="dxa" w:w="1300"/>
+            <w:tcBorders>
+              <w:top w:val="single" w:color="D9D4C5" w:sz="4"/>
+              <w:left w:val="single" w:color="D9D4C5" w:sz="4"/>
+              <w:bottom w:val="single" w:color="D9D4C5" w:sz="4"/>
+              <w:right w:val="single" w:color="D9D4C5" w:sz="4"/>
+            </w:tcBorders>
+            <w:tcMar>
+              <w:top w:type="dxa" w:w="70"/>
+              <w:left w:type="dxa" w:w="110"/>
+              <w:bottom w:type="dxa" w:w="70"/>
+              <w:right w:type="dxa" w:w="110"/>
+            </w:tcMar>
+            <w:vAlign w:val="center"/>
+          </w:tcPr>
+          <w:p>
+            <w:pPr>
+              <w:spacing w:after="0" w:before="0"/>
+            </w:pPr>
+            <w:r>
+              <w:rPr>
+                <w:rFonts w:ascii="Arial" w:cs="Arial" w:eastAsia="Arial" w:hAnsi="Arial"/>
+                <w:color w:val="1B2118"/>
+                <w:sz w:val="18"/>
+                <w:szCs w:val="18"/>
+              </w:rPr>
+              <w:t xml:space="preserve">18/10/2026</w:t>
+            </w:r>
+          </w:p>
+        </w:tc>
+        <w:tc>
+          <w:tcPr>
+            <w:tcW w:type="dxa" w:w="5538"/>
+            <w:tcBorders>
+              <w:top w:val="single" w:color="D9D4C5" w:sz="4"/>
+              <w:left w:val="single" w:color="D9D4C5" w:sz="4"/>
+              <w:bottom w:val="single" w:color="D9D4C5" w:sz="4"/>
+              <w:right w:val="single" w:color="D9D4C5" w:sz="4"/>
+            </w:tcBorders>
+            <w:tcMar>
+              <w:top w:type="dxa" w:w="70"/>
+              <w:left w:type="dxa" w:w="110"/>
+              <w:bottom w:type="dxa" w:w="70"/>
+              <w:right w:type="dxa" w:w="110"/>
+            </w:tcMar>
+            <w:vAlign w:val="center"/>
+          </w:tcPr>
+          <w:p>
+            <w:pPr>
+              <w:spacing w:after="0" w:before="0"/>
+            </w:pPr>
+            <w:r>
+              <w:rPr>
+                <w:rFonts w:ascii="Arial" w:cs="Arial" w:eastAsia="Arial" w:hAnsi="Arial"/>
+                <w:color w:val="1B2118"/>
+                <w:sz w:val="18"/>
+                <w:szCs w:val="18"/>
+              </w:rPr>
+              <w:t xml:space="preserve">Note di fase, Ente di Validazione della pratica, consultazione sulla pagina pubblica con conferma dell'email, moderazione con autori e allegati, errata corrige; nuovo capitolo Messaggi con il Comune; pagamenti visibili al Comune; Impostazioni: Enti di Validazione e Modelli di documento; notifiche aggiornate.</w:t>
+            </w:r>
+          </w:p>
+        </w:tc>
+        <w:tc>
+          <w:tcPr>
+            <w:tcW w:type="dxa" w:w="2000"/>
+            <w:tcBorders>
+              <w:top w:val="single" w:color="D9D4C5" w:sz="4"/>
+              <w:left w:val="single" w:color="D9D4C5" w:sz="4"/>
+              <w:bottom w:val="single" w:color="D9D4C5" w:sz="4"/>
+              <w:right w:val="single" w:color="D9D4C5" w:sz="4"/>
+            </w:tcBorders>
+            <w:tcMar>
+              <w:top w:type="dxa" w:w="70"/>
+              <w:left w:type="dxa" w:w="110"/>
+              <w:bottom w:type="dxa" w:w="70"/>
+              <w:right w:type="dxa" w:w="110"/>
+            </w:tcMar>
+            <w:vAlign w:val="center"/>
+          </w:tcPr>
+          <w:p>
+            <w:pPr>
+              <w:spacing w:after="0" w:before="0"/>
+            </w:pPr>
+            <w:r>
+              <w:rPr>
+                <w:rFonts w:ascii="Arial" w:cs="Arial" w:eastAsia="Arial" w:hAnsi="Arial"/>
+                <w:color w:val="1B2118"/>
+                <w:sz w:val="18"/>
+                <w:szCs w:val="18"/>
+              </w:rPr>
+              <w:t xml:space="preserve">Fondazione Operate</w:t>
+            </w:r>
+          </w:p>
+        </w:tc>
+      </w:tr>
+      <w:tr>
+        <w:trPr>
+          <w:cantSplit/>
+        </w:trPr>
+        <w:tc>
+          <w:tcPr>
+            <w:tcW w:type="dxa" w:w="800"/>
+            <w:tcBorders>
+              <w:top w:val="single" w:color="D9D4C5" w:sz="4"/>
+              <w:left w:val="single" w:color="D9D4C5" w:sz="4"/>
+              <w:bottom w:val="single" w:color="D9D4C5" w:sz="4"/>
+              <w:right w:val="single" w:color="D9D4C5" w:sz="4"/>
+            </w:tcBorders>
+            <w:shd w:fill="F6F4EE" w:color="auto" w:val="clear"/>
+            <w:tcMar>
+              <w:top w:type="dxa" w:w="70"/>
+              <w:left w:type="dxa" w:w="110"/>
+              <w:bottom w:type="dxa" w:w="70"/>
+              <w:right w:type="dxa" w:w="110"/>
+            </w:tcMar>
+            <w:vAlign w:val="center"/>
+          </w:tcPr>
+          <w:p>
+            <w:pPr>
+              <w:spacing w:after="0" w:before="0"/>
+            </w:pPr>
+            <w:r>
+              <w:rPr>
+                <w:rFonts w:ascii="Arial" w:cs="Arial" w:eastAsia="Arial" w:hAnsi="Arial"/>
+                <w:color w:val="1B2118"/>
+                <w:sz w:val="18"/>
+                <w:szCs w:val="18"/>
+              </w:rPr>
               <w:t xml:space="preserve">1.0</w:t>
             </w:r>
           </w:p>
@@ -5592,6 +5726,7 @@
               <w:bottom w:val="single" w:color="D9D4C5" w:sz="4"/>
               <w:right w:val="single" w:color="D9D4C5" w:sz="4"/>
             </w:tcBorders>
+            <w:shd w:fill="F6F4EE" w:color="auto" w:val="clear"/>
             <w:tcMar>
               <w:top w:type="dxa" w:w="70"/>
               <w:left w:type="dxa" w:w="110"/>
@@ -5624,6 +5759,7 @@
               <w:bottom w:val="single" w:color="D9D4C5" w:sz="4"/>
               <w:right w:val="single" w:color="D9D4C5" w:sz="4"/>
             </w:tcBorders>
+            <w:shd w:fill="F6F4EE" w:color="auto" w:val="clear"/>
             <w:tcMar>
               <w:top w:type="dxa" w:w="70"/>
               <w:left w:type="dxa" w:w="110"/>
@@ -5656,6 +5792,7 @@
               <w:bottom w:val="single" w:color="D9D4C5" w:sz="4"/>
               <w:right w:val="single" w:color="D9D4C5" w:sz="4"/>
             </w:tcBorders>
+            <w:shd w:fill="F6F4EE" w:color="auto" w:val="clear"/>
             <w:tcMar>
               <w:top w:type="dxa" w:w="70"/>
               <w:left w:type="dxa" w:w="110"/>
@@ -5697,7 +5834,7 @@
           <w:sz w:val="20"/>
           <w:szCs w:val="20"/>
         </w:rPr>
-        <w:t xml:space="preserve">Questo documento descrive il portale alla revisione 4.6 del 21/10/2026. A ogni modifica del portale il manuale viene aggiornato e la revisione incrementata; la versione corrente si scarica dall'area Documentazione del portale (solo Amministratori).</w:t>
+        <w:t xml:space="preserve">Questo documento descrive il portale alla revisione 4.7 del 21/10/2026. A ogni modifica del portale il manuale viene aggiornato e la revisione incrementata; la versione corrente si scarica dall'area Documentazione del portale (solo Amministratori).</w:t>
       </w:r>
     </w:p>
     <w:p>
@@ -6474,7 +6611,7 @@
             <w:szCs w:val="22"/>
           </w:rPr>
           <w:tab/>
-          <w:t xml:space="preserve">50</w:t>
+          <w:t xml:space="preserve">51</w:t>
         </w:r>
       </w:hyperlink>
     </w:p>
@@ -6503,7 +6640,7 @@
             <w:szCs w:val="22"/>
           </w:rPr>
           <w:tab/>
-          <w:t xml:space="preserve">51</w:t>
+          <w:t xml:space="preserve">52</w:t>
         </w:r>
       </w:hyperlink>
     </w:p>
@@ -6532,7 +6669,7 @@
             <w:szCs w:val="22"/>
           </w:rPr>
           <w:tab/>
-          <w:t xml:space="preserve">52</w:t>
+          <w:t xml:space="preserve">53</w:t>
         </w:r>
       </w:hyperlink>
     </w:p>
@@ -8477,7 +8614,7 @@
         </w:rPr>
         <w:t xml:space="preserve">Si accede da </w:t>
       </w:r>
-      <w:hyperlink w:history="1" r:id="rIdsybth9chyb4qfsmppurhi">
+      <w:hyperlink w:history="1" r:id="rIdxki31uj6ypmnvogbdimgp">
         <w:r>
           <w:rPr>
             <w:rFonts w:ascii="Arial" w:cs="Arial" w:eastAsia="Arial" w:hAnsi="Arial"/>
@@ -8795,7 +8932,7 @@
                 <w:sz w:val="18"/>
                 <w:szCs w:val="18"/>
               </w:rPr>
-              <w:t xml:space="preserve">Dashboard, Pratiche, Anagrafiche, Crediti emessi, Reclami, Manuale</w:t>
+              <w:t xml:space="preserve">Dashboard, Pratiche, Anagrafiche, Simulatore, Crediti emessi, Reclami, Manuale</w:t>
             </w:r>
           </w:p>
         </w:tc>
@@ -43794,7 +43931,7 @@
           <w:sz w:val="21"/>
           <w:szCs w:val="21"/>
         </w:rPr>
-        <w:t xml:space="preserve"> (Anthropic) che risponde alle domande sul funzionamento del portale e del Programma. Per ora è disponibile per gli </w:t>
+        <w:t xml:space="preserve"> (Anthropic) che risponde alle domande sul funzionamento del portale e del Programma. È disponibile per </w:t>
       </w:r>
       <w:r>
         <w:rPr>
@@ -43814,7 +43951,27 @@
           <w:sz w:val="21"/>
           <w:szCs w:val="21"/>
         </w:rPr>
-        <w:t xml:space="preserve"> e per gli </w:t>
+        <w:t xml:space="preserve">, </w:t>
+      </w:r>
+      <w:r>
+        <w:rPr>
+          <w:rFonts w:ascii="Arial" w:cs="Arial" w:eastAsia="Arial" w:hAnsi="Arial"/>
+          <w:b/>
+          <w:bCs/>
+          <w:color w:val="1B2118"/>
+          <w:sz w:val="21"/>
+          <w:szCs w:val="21"/>
+        </w:rPr>
+        <w:t xml:space="preserve">Operatori</w:t>
+      </w:r>
+      <w:r>
+        <w:rPr>
+          <w:rFonts w:ascii="Arial" w:cs="Arial" w:eastAsia="Arial" w:hAnsi="Arial"/>
+          <w:color w:val="1B2118"/>
+          <w:sz w:val="21"/>
+          <w:szCs w:val="21"/>
+        </w:rPr>
+        <w:t xml:space="preserve"> (dal 21/10/2026) e </w:t>
       </w:r>
       <w:r>
         <w:rPr>
@@ -43859,27 +44016,284 @@
           <w:sz w:val="21"/>
           <w:szCs w:val="21"/>
         </w:rPr>
-        <w:t xml:space="preserve"> Risponde solo dalla sua base di conoscenza: per gli Amministratori il Manuale Utente, questo manuale, le tariffe (Schema tariffario v1.2 e costi Caso 1 e Caso 2 del 28/07/2026) e le note sul calcolo dei crediti; per gli enti il Manuale Utente e le tariffe. Se una cosa non c'è lo dice e invita a scrivere alla Fondazione. </w:t>
-      </w:r>
-      <w:r>
-        <w:rPr>
-          <w:rFonts w:ascii="Arial" w:cs="Arial" w:eastAsia="Arial" w:hAnsi="Arial"/>
-          <w:b/>
-          <w:bCs/>
-          <w:color w:val="1B2118"/>
-          <w:sz w:val="21"/>
-          <w:szCs w:val="21"/>
-        </w:rPr>
-        <w:t xml:space="preserve">Non vede i dati delle pratiche</w:t>
-      </w:r>
-      <w:r>
-        <w:rPr>
-          <w:rFonts w:ascii="Arial" w:cs="Arial" w:eastAsia="Arial" w:hAnsi="Arial"/>
-          <w:color w:val="1B2118"/>
-          <w:sz w:val="21"/>
-          <w:szCs w:val="21"/>
-        </w:rPr>
-        <w:t xml:space="preserve"> e non fa operazioni: spiega dove e come farle.</w:t>
+        <w:t xml:space="preserve"> Risponde solo dalla sua base di conoscenza, diversa per ruolo:</w:t>
+      </w:r>
+    </w:p>
+    <w:p>
+      <w:pPr>
+        <w:pStyle w:val="ListParagraph"/>
+        <w:numPr>
+          <w:ilvl w:val="0"/>
+          <w:numId w:val="2"/>
+        </w:numPr>
+        <w:spacing w:after="70" w:line="290"/>
+      </w:pPr>
+      <w:r>
+        <w:rPr>
+          <w:rFonts w:ascii="Arial" w:cs="Arial" w:eastAsia="Arial" w:hAnsi="Arial"/>
+          <w:b/>
+          <w:bCs/>
+          <w:color w:val="1B2118"/>
+          <w:sz w:val="21"/>
+          <w:szCs w:val="21"/>
+        </w:rPr>
+        <w:t xml:space="preserve">Amministratori:</w:t>
+      </w:r>
+      <w:r>
+        <w:rPr>
+          <w:rFonts w:ascii="Arial" w:cs="Arial" w:eastAsia="Arial" w:hAnsi="Arial"/>
+          <w:color w:val="1B2118"/>
+          <w:sz w:val="21"/>
+          <w:szCs w:val="21"/>
+        </w:rPr>
+        <w:t xml:space="preserve"> il Manuale Utente, questo manuale, le tariffe (Schema tariffario v1.2 e costi Caso 1 e Caso 2 del 28/07/2026) e le note sul calcolo dei crediti.</w:t>
+      </w:r>
+    </w:p>
+    <w:p>
+      <w:pPr>
+        <w:pStyle w:val="ListParagraph"/>
+        <w:numPr>
+          <w:ilvl w:val="0"/>
+          <w:numId w:val="2"/>
+        </w:numPr>
+        <w:spacing w:after="70" w:line="290"/>
+      </w:pPr>
+      <w:r>
+        <w:rPr>
+          <w:rFonts w:ascii="Arial" w:cs="Arial" w:eastAsia="Arial" w:hAnsi="Arial"/>
+          <w:b/>
+          <w:bCs/>
+          <w:color w:val="1B2118"/>
+          <w:sz w:val="21"/>
+          <w:szCs w:val="21"/>
+        </w:rPr>
+        <w:t xml:space="preserve">Operatori:</w:t>
+      </w:r>
+      <w:r>
+        <w:rPr>
+          <w:rFonts w:ascii="Arial" w:cs="Arial" w:eastAsia="Arial" w:hAnsi="Arial"/>
+          <w:color w:val="1B2118"/>
+          <w:sz w:val="21"/>
+          <w:szCs w:val="21"/>
+        </w:rPr>
+        <w:t xml:space="preserve"> il Manuale Utente, questo manuale senza i capitoli delle funzioni riservate agli Amministratori (utenti, audit, impostazioni, calcolo dei crediti, backup, sicurezza) e le tariffe.</w:t>
+      </w:r>
+    </w:p>
+    <w:p>
+      <w:pPr>
+        <w:pStyle w:val="ListParagraph"/>
+        <w:numPr>
+          <w:ilvl w:val="0"/>
+          <w:numId w:val="2"/>
+        </w:numPr>
+        <w:spacing w:after="70" w:line="290"/>
+      </w:pPr>
+      <w:r>
+        <w:rPr>
+          <w:rFonts w:ascii="Arial" w:cs="Arial" w:eastAsia="Arial" w:hAnsi="Arial"/>
+          <w:b/>
+          <w:bCs/>
+          <w:color w:val="1B2118"/>
+          <w:sz w:val="21"/>
+          <w:szCs w:val="21"/>
+        </w:rPr>
+        <w:t xml:space="preserve">Enti:</w:t>
+      </w:r>
+      <w:r>
+        <w:rPr>
+          <w:rFonts w:ascii="Arial" w:cs="Arial" w:eastAsia="Arial" w:hAnsi="Arial"/>
+          <w:color w:val="1B2118"/>
+          <w:sz w:val="21"/>
+          <w:szCs w:val="21"/>
+        </w:rPr>
+        <w:t xml:space="preserve"> il Manuale Utente e le tariffe.</w:t>
+      </w:r>
+    </w:p>
+    <w:p>
+      <w:pPr>
+        <w:spacing w:after="140" w:line="300"/>
+      </w:pPr>
+      <w:r>
+        <w:rPr>
+          <w:rFonts w:ascii="Arial" w:cs="Arial" w:eastAsia="Arial" w:hAnsi="Arial"/>
+          <w:color w:val="1B2118"/>
+          <w:sz w:val="21"/>
+          <w:szCs w:val="21"/>
+        </w:rPr>
+        <w:t xml:space="preserve">Se una cosa non c'è lo dice e invita a scrivere alla Fondazione. Non fa operazioni nel portale: spiega dove e come farle.</w:t>
+      </w:r>
+    </w:p>
+    <w:p>
+      <w:pPr>
+        <w:spacing w:after="140" w:line="300"/>
+      </w:pPr>
+      <w:r>
+        <w:rPr>
+          <w:rFonts w:ascii="Arial" w:cs="Arial" w:eastAsia="Arial" w:hAnsi="Arial"/>
+          <w:b/>
+          <w:bCs/>
+          <w:color w:val="1B2118"/>
+          <w:sz w:val="21"/>
+          <w:szCs w:val="21"/>
+        </w:rPr>
+        <w:t xml:space="preserve">Domande sulla pratica aperta</w:t>
+      </w:r>
+      <w:r>
+        <w:rPr>
+          <w:rFonts w:ascii="Arial" w:cs="Arial" w:eastAsia="Arial" w:hAnsi="Arial"/>
+          <w:color w:val="1B2118"/>
+          <w:sz w:val="21"/>
+          <w:szCs w:val="21"/>
+        </w:rPr>
+        <w:t xml:space="preserve"> (dal 21/10/2026). Se si apre l'assistente dalla pagina di una pratica (in «Pratiche» o in «Le mie pratiche»), l'assistente riceve anche un riepilogo di </w:t>
+      </w:r>
+      <w:r>
+        <w:rPr>
+          <w:rFonts w:ascii="Arial" w:cs="Arial" w:eastAsia="Arial" w:hAnsi="Arial"/>
+          <w:b/>
+          <w:bCs/>
+          <w:color w:val="1B2118"/>
+          <w:sz w:val="21"/>
+          <w:szCs w:val="21"/>
+        </w:rPr>
+        <w:t xml:space="preserve">quella</w:t>
+      </w:r>
+      <w:r>
+        <w:rPr>
+          <w:rFonts w:ascii="Arial" w:cs="Arial" w:eastAsia="Arial" w:hAnsi="Arial"/>
+          <w:color w:val="1B2118"/>
+          <w:sz w:val="21"/>
+          <w:szCs w:val="21"/>
+        </w:rPr>
+        <w:t xml:space="preserve"> pratica, letto in quel momento con i permessi di chi chiede:</w:t>
+      </w:r>
+    </w:p>
+    <w:p>
+      <w:pPr>
+        <w:pStyle w:val="ListParagraph"/>
+        <w:numPr>
+          <w:ilvl w:val="0"/>
+          <w:numId w:val="2"/>
+        </w:numPr>
+        <w:spacing w:after="70" w:line="290"/>
+      </w:pPr>
+      <w:r>
+        <w:rPr>
+          <w:rFonts w:ascii="Arial" w:cs="Arial" w:eastAsia="Arial" w:hAnsi="Arial"/>
+          <w:color w:val="1B2118"/>
+          <w:sz w:val="21"/>
+          <w:szCs w:val="21"/>
+        </w:rPr>
+        <w:t xml:space="preserve">stato;</w:t>
+      </w:r>
+    </w:p>
+    <w:p>
+      <w:pPr>
+        <w:pStyle w:val="ListParagraph"/>
+        <w:numPr>
+          <w:ilvl w:val="0"/>
+          <w:numId w:val="2"/>
+        </w:numPr>
+        <w:spacing w:after="70" w:line="290"/>
+      </w:pPr>
+      <w:r>
+        <w:rPr>
+          <w:rFonts w:ascii="Arial" w:cs="Arial" w:eastAsia="Arial" w:hAnsi="Arial"/>
+          <w:color w:val="1B2118"/>
+          <w:sz w:val="21"/>
+          <w:szCs w:val="21"/>
+        </w:rPr>
+        <w:t xml:space="preserve">fasi con scadenze e giorni mancanti;</w:t>
+      </w:r>
+    </w:p>
+    <w:p>
+      <w:pPr>
+        <w:pStyle w:val="ListParagraph"/>
+        <w:numPr>
+          <w:ilvl w:val="0"/>
+          <w:numId w:val="2"/>
+        </w:numPr>
+        <w:spacing w:after="70" w:line="290"/>
+      </w:pPr>
+      <w:r>
+        <w:rPr>
+          <w:rFonts w:ascii="Arial" w:cs="Arial" w:eastAsia="Arial" w:hAnsi="Arial"/>
+          <w:color w:val="1B2118"/>
+          <w:sz w:val="21"/>
+          <w:szCs w:val="21"/>
+        </w:rPr>
+        <w:t xml:space="preserve">documenti richiesti non ancora caricati nelle fasi aperte;</w:t>
+      </w:r>
+    </w:p>
+    <w:p>
+      <w:pPr>
+        <w:pStyle w:val="ListParagraph"/>
+        <w:numPr>
+          <w:ilvl w:val="0"/>
+          <w:numId w:val="2"/>
+        </w:numPr>
+        <w:spacing w:after="70" w:line="290"/>
+      </w:pPr>
+      <w:r>
+        <w:rPr>
+          <w:rFonts w:ascii="Arial" w:cs="Arial" w:eastAsia="Arial" w:hAnsi="Arial"/>
+          <w:color w:val="1B2118"/>
+          <w:sz w:val="21"/>
+          <w:szCs w:val="21"/>
+        </w:rPr>
+        <w:t xml:space="preserve">integrazioni aperte;</w:t>
+      </w:r>
+    </w:p>
+    <w:p>
+      <w:pPr>
+        <w:pStyle w:val="ListParagraph"/>
+        <w:numPr>
+          <w:ilvl w:val="0"/>
+          <w:numId w:val="2"/>
+        </w:numPr>
+        <w:spacing w:after="70" w:line="290"/>
+      </w:pPr>
+      <w:r>
+        <w:rPr>
+          <w:rFonts w:ascii="Arial" w:cs="Arial" w:eastAsia="Arial" w:hAnsi="Arial"/>
+          <w:color w:val="1B2118"/>
+          <w:sz w:val="21"/>
+          <w:szCs w:val="21"/>
+        </w:rPr>
+        <w:t xml:space="preserve">pagamenti non saldati o scaduti;</w:t>
+      </w:r>
+    </w:p>
+    <w:p>
+      <w:pPr>
+        <w:pStyle w:val="ListParagraph"/>
+        <w:numPr>
+          <w:ilvl w:val="0"/>
+          <w:numId w:val="2"/>
+        </w:numPr>
+        <w:spacing w:after="70" w:line="290"/>
+      </w:pPr>
+      <w:r>
+        <w:rPr>
+          <w:rFonts w:ascii="Arial" w:cs="Arial" w:eastAsia="Arial" w:hAnsi="Arial"/>
+          <w:color w:val="1B2118"/>
+          <w:sz w:val="21"/>
+          <w:szCs w:val="21"/>
+        </w:rPr>
+        <w:t xml:space="preserve">feedback pubblico.</w:t>
+      </w:r>
+    </w:p>
+    <w:p>
+      <w:pPr>
+        <w:spacing w:after="140" w:line="300"/>
+      </w:pPr>
+      <w:r>
+        <w:rPr>
+          <w:rFonts w:ascii="Arial" w:cs="Arial" w:eastAsia="Arial" w:hAnsi="Arial"/>
+          <w:color w:val="1B2118"/>
+          <w:sz w:val="21"/>
+          <w:szCs w:val="21"/>
+        </w:rPr>
+        <w:t xml:space="preserve">Si possono chiedere cose come «A che punto è questa pratica?» o «Quali documenti mancano?». Un utente del Comune ottiene il riepilogo solo delle sue pratiche e conta solo i documenti che può vedere. Altrove l'assistente non vede i dati delle pratiche.</w:t>
       </w:r>
     </w:p>
     <w:p>
@@ -46101,7 +46515,7 @@
         <w:szCs w:val="16"/>
       </w:rPr>
       <w:tab/>
-      <w:t xml:space="preserve">Manuale Amministratore · Rev. 4.6 · 21/10/2026</w:t>
+      <w:t xml:space="preserve">Manuale Amministratore · Rev. 4.7 · 21/10/2026</w:t>
     </w:r>
   </w:p>
 </w:hdr>
@@ -46166,7 +46580,7 @@
         <w:szCs w:val="16"/>
       </w:rPr>
       <w:tab/>
-      <w:t xml:space="preserve">Manuale Amministratore · Rev. 4.6 · 21/10/2026</w:t>
+      <w:t xml:space="preserve">Manuale Amministratore · Rev. 4.7 · 21/10/2026</w:t>
     </w:r>
   </w:p>
 </w:hdr>

</xml_diff>

<commit_message>
Simulatore: PDF ed Excel con tutti i dati della pagina, i costi e i grafici (ISS-035)
Il report scaricato da ogni simulazione riprende tutte le sezioni della
pagina: impostazioni e buffer del Capitolo 7, scenario di riferimento con
i rifiuti per tipologia, situazione attuale, obiettivi anno per anno,
risultati con il totale, parametri economici, costi del Caso 1 o 2 e
quattro grafici vettoriali. Excel: nuovo foglio «Dati inseriti».
Documentazione e registro issue aggiornati.

Co-Authored-By: Claude Opus 5.5 <noreply@anthropic.com>
Claude-Session: https://claude.ai/code/session_01E8XCbEeVHWVP3hntUZ6kZ1
</commit_message>
<xml_diff>
--- a/public/documentazione/Manuale_Amministratore_Portale_CWP.docx
+++ b/public/documentazione/Manuale_Amministratore_Portale_CWP.docx
@@ -302,7 +302,7 @@
                 <w:sz w:val="20"/>
                 <w:szCs w:val="20"/>
               </w:rPr>
-              <w:t xml:space="preserve">Rev. 4.7</w:t>
+              <w:t xml:space="preserve">Rev. 4.8</w:t>
             </w:r>
           </w:p>
         </w:tc>
@@ -719,7 +719,7 @@
                 <w:sz w:val="18"/>
                 <w:szCs w:val="18"/>
               </w:rPr>
-              <w:t xml:space="preserve">4.7</w:t>
+              <w:t xml:space="preserve">4.8</w:t>
             </w:r>
           </w:p>
         </w:tc>
@@ -783,7 +783,7 @@
                 <w:sz w:val="18"/>
                 <w:szCs w:val="18"/>
               </w:rPr>
-              <w:t xml:space="preserve">Assistente per gli Operatori e domande sulla pratica aperta; menu dell'Operatore con il Simulatore.</w:t>
+              <w:t xml:space="preserve">Simulatore: il PDF scaricato riporta tutti i dati della pagina, i costi e i grafici; foglio Excel «Dati inseriti».</w:t>
             </w:r>
           </w:p>
         </w:tc>
@@ -853,7 +853,7 @@
                 <w:sz w:val="18"/>
                 <w:szCs w:val="18"/>
               </w:rPr>
-              <w:t xml:space="preserve">4.6</w:t>
+              <w:t xml:space="preserve">4.7</w:t>
             </w:r>
           </w:p>
         </w:tc>
@@ -919,7 +919,7 @@
                 <w:sz w:val="18"/>
                 <w:szCs w:val="18"/>
               </w:rPr>
-              <w:t xml:space="preserve">Capitolo «Backup automatico».</w:t>
+              <w:t xml:space="preserve">Assistente per gli Operatori e domande sulla pratica aperta; menu dell'Operatore con il Simulatore.</w:t>
             </w:r>
           </w:p>
         </w:tc>
@@ -989,7 +989,7 @@
                 <w:sz w:val="18"/>
                 <w:szCs w:val="18"/>
               </w:rPr>
-              <w:t xml:space="preserve">4.5</w:t>
+              <w:t xml:space="preserve">4.6</w:t>
             </w:r>
           </w:p>
         </w:tc>
@@ -1053,7 +1053,7 @@
                 <w:sz w:val="18"/>
                 <w:szCs w:val="18"/>
               </w:rPr>
-              <w:t xml:space="preserve">Nuovo documento «Registro issue e test» tra quelli scaricabili.</w:t>
+              <w:t xml:space="preserve">Capitolo «Backup automatico».</w:t>
             </w:r>
           </w:p>
         </w:tc>
@@ -1123,7 +1123,7 @@
                 <w:sz w:val="18"/>
                 <w:szCs w:val="18"/>
               </w:rPr>
-              <w:t xml:space="preserve">4.4</w:t>
+              <w:t xml:space="preserve">4.5</w:t>
             </w:r>
           </w:p>
         </w:tc>
@@ -1189,7 +1189,7 @@
                 <w:sz w:val="18"/>
                 <w:szCs w:val="18"/>
               </w:rPr>
-              <w:t xml:space="preserve">Collaudo V05: testo completo dei valori lunghi nell'Audit (Prima/Dopo, Tolto/Aggiunto), denominazione delle organizzazioni e ricerca sui valori cambiati; pagina «Account disattivato».</w:t>
+              <w:t xml:space="preserve">Nuovo documento «Registro issue e test» tra quelli scaricabili.</w:t>
             </w:r>
           </w:p>
         </w:tc>
@@ -1259,7 +1259,7 @@
                 <w:sz w:val="18"/>
                 <w:szCs w:val="18"/>
               </w:rPr>
-              <w:t xml:space="preserve">4.3</w:t>
+              <w:t xml:space="preserve">4.4</w:t>
             </w:r>
           </w:p>
         </w:tc>
@@ -1291,7 +1291,7 @@
                 <w:sz w:val="18"/>
                 <w:szCs w:val="18"/>
               </w:rPr>
-              <w:t xml:space="preserve">20/10/2026</w:t>
+              <w:t xml:space="preserve">21/10/2026</w:t>
             </w:r>
           </w:p>
         </w:tc>
@@ -1323,7 +1323,7 @@
                 <w:sz w:val="18"/>
                 <w:szCs w:val="18"/>
               </w:rPr>
-              <w:t xml:space="preserve">Correzioni del collaudo V01: import CSV della Banca Dati «tutto o niente» senza valori negativi, calcolo bloccato con dati non ammessi, buffer manuale 0-80%, conferma definitiva solo senza errori di coerenza, dati non ammessi nel simulatore e zero esplicito nei prezzi, colonna «Oggetto e modifiche» nell'Audit.</w:t>
+              <w:t xml:space="preserve">Collaudo V05: testo completo dei valori lunghi nell'Audit (Prima/Dopo, Tolto/Aggiunto), denominazione delle organizzazioni e ricerca sui valori cambiati; pagina «Account disattivato».</w:t>
             </w:r>
           </w:p>
         </w:tc>
@@ -1393,7 +1393,7 @@
                 <w:sz w:val="18"/>
                 <w:szCs w:val="18"/>
               </w:rPr>
-              <w:t xml:space="preserve">4.2</w:t>
+              <w:t xml:space="preserve">4.3</w:t>
             </w:r>
           </w:p>
         </w:tc>
@@ -1459,7 +1459,7 @@
                 <w:sz w:val="18"/>
                 <w:szCs w:val="18"/>
               </w:rPr>
-              <w:t xml:space="preserve">Nuovo capitolo «Sicurezza»: inattività, avvisi, protezioni del sito e del database.</w:t>
+              <w:t xml:space="preserve">Correzioni del collaudo V01: import CSV della Banca Dati «tutto o niente» senza valori negativi, calcolo bloccato con dati non ammessi, buffer manuale 0-80%, conferma definitiva solo senza errori di coerenza, dati non ammessi nel simulatore e zero esplicito nei prezzi, colonna «Oggetto e modifiche» nell'Audit.</w:t>
             </w:r>
           </w:p>
         </w:tc>
@@ -1529,7 +1529,7 @@
                 <w:sz w:val="18"/>
                 <w:szCs w:val="18"/>
               </w:rPr>
-              <w:t xml:space="preserve">4.1</w:t>
+              <w:t xml:space="preserve">4.2</w:t>
             </w:r>
           </w:p>
         </w:tc>
@@ -1593,7 +1593,7 @@
                 <w:sz w:val="18"/>
                 <w:szCs w:val="18"/>
               </w:rPr>
-              <w:t xml:space="preserve">Voci di menu degli enti aggiornate.</w:t>
+              <w:t xml:space="preserve">Nuovo capitolo «Sicurezza»: inattività, avvisi, protezioni del sito e del database.</w:t>
             </w:r>
           </w:p>
         </w:tc>
@@ -1663,7 +1663,7 @@
                 <w:sz w:val="18"/>
                 <w:szCs w:val="18"/>
               </w:rPr>
-              <w:t xml:space="preserve">4.0</w:t>
+              <w:t xml:space="preserve">4.1</w:t>
             </w:r>
           </w:p>
         </w:tc>
@@ -1729,7 +1729,7 @@
                 <w:sz w:val="18"/>
                 <w:szCs w:val="18"/>
               </w:rPr>
-              <w:t xml:space="preserve">Nuovo ordine del menu; la sezione si chiama «Audit User». Voce «Marketplaces» in arrivo.</w:t>
+              <w:t xml:space="preserve">Voci di menu degli enti aggiornate.</w:t>
             </w:r>
           </w:p>
         </w:tc>
@@ -1799,7 +1799,7 @@
                 <w:sz w:val="18"/>
                 <w:szCs w:val="18"/>
               </w:rPr>
-              <w:t xml:space="preserve">3.9</w:t>
+              <w:t xml:space="preserve">4.0</w:t>
             </w:r>
           </w:p>
         </w:tc>
@@ -1863,7 +1863,7 @@
                 <w:sz w:val="18"/>
                 <w:szCs w:val="18"/>
               </w:rPr>
-              <w:t xml:space="preserve">Nuovo capitolo «Audit trail user».</w:t>
+              <w:t xml:space="preserve">Nuovo ordine del menu; la sezione si chiama «Audit User». Voce «Marketplaces» in arrivo.</w:t>
             </w:r>
           </w:p>
         </w:tc>
@@ -1933,7 +1933,7 @@
                 <w:sz w:val="18"/>
                 <w:szCs w:val="18"/>
               </w:rPr>
-              <w:t xml:space="preserve">3.8</w:t>
+              <w:t xml:space="preserve">3.9</w:t>
             </w:r>
           </w:p>
         </w:tc>
@@ -1999,7 +1999,7 @@
                 <w:sz w:val="18"/>
                 <w:szCs w:val="18"/>
               </w:rPr>
-              <w:t xml:space="preserve">Utenti online; PDF ed Excel del simulatore; messaggi d'errore dell'assistente.</w:t>
+              <w:t xml:space="preserve">Nuovo capitolo «Audit trail user».</w:t>
             </w:r>
           </w:p>
         </w:tc>
@@ -2069,7 +2069,7 @@
                 <w:sz w:val="18"/>
                 <w:szCs w:val="18"/>
               </w:rPr>
-              <w:t xml:space="preserve">3.7</w:t>
+              <w:t xml:space="preserve">3.8</w:t>
             </w:r>
           </w:p>
         </w:tc>
@@ -2101,7 +2101,7 @@
                 <w:sz w:val="18"/>
                 <w:szCs w:val="18"/>
               </w:rPr>
-              <w:t xml:space="preserve">19/10/2026</w:t>
+              <w:t xml:space="preserve">20/10/2026</w:t>
             </w:r>
           </w:p>
         </w:tc>
@@ -2133,7 +2133,7 @@
                 <w:sz w:val="18"/>
                 <w:szCs w:val="18"/>
               </w:rPr>
-              <w:t xml:space="preserve">Assistente virtuale: messaggio «Un attimo…» durante l'attesa.</w:t>
+              <w:t xml:space="preserve">Utenti online; PDF ed Excel del simulatore; messaggi d'errore dell'assistente.</w:t>
             </w:r>
           </w:p>
         </w:tc>
@@ -2203,7 +2203,7 @@
                 <w:sz w:val="18"/>
                 <w:szCs w:val="18"/>
               </w:rPr>
-              <w:t xml:space="preserve">3.6</w:t>
+              <w:t xml:space="preserve">3.7</w:t>
             </w:r>
           </w:p>
         </w:tc>
@@ -2269,7 +2269,7 @@
                 <w:sz w:val="18"/>
                 <w:szCs w:val="18"/>
               </w:rPr>
-              <w:t xml:space="preserve">Assistente virtuale attivo: chiave legata a uno spazio di lavoro, crediti e consumi.</w:t>
+              <w:t xml:space="preserve">Assistente virtuale: messaggio «Un attimo…» durante l'attesa.</w:t>
             </w:r>
           </w:p>
         </w:tc>
@@ -2339,7 +2339,7 @@
                 <w:sz w:val="18"/>
                 <w:szCs w:val="18"/>
               </w:rPr>
-              <w:t xml:space="preserve">3.5</w:t>
+              <w:t xml:space="preserve">3.6</w:t>
             </w:r>
           </w:p>
         </w:tc>
@@ -2403,7 +2403,7 @@
                 <w:sz w:val="18"/>
                 <w:szCs w:val="18"/>
               </w:rPr>
-              <w:t xml:space="preserve">Assistente virtuale; documenti ufficiali del Programma nella Documentazione.</w:t>
+              <w:t xml:space="preserve">Assistente virtuale attivo: chiave legata a uno spazio di lavoro, crediti e consumi.</w:t>
             </w:r>
           </w:p>
         </w:tc>
@@ -2473,7 +2473,7 @@
                 <w:sz w:val="18"/>
                 <w:szCs w:val="18"/>
               </w:rPr>
-              <w:t xml:space="preserve">3.4</w:t>
+              <w:t xml:space="preserve">3.5</w:t>
             </w:r>
           </w:p>
         </w:tc>
@@ -2539,7 +2539,7 @@
                 <w:sz w:val="18"/>
                 <w:szCs w:val="18"/>
               </w:rPr>
-              <w:t xml:space="preserve">Presentazione di riepilogo nella pagina Documentazione.</w:t>
+              <w:t xml:space="preserve">Assistente virtuale; documenti ufficiali del Programma nella Documentazione.</w:t>
             </w:r>
           </w:p>
         </w:tc>
@@ -2609,7 +2609,7 @@
                 <w:sz w:val="18"/>
                 <w:szCs w:val="18"/>
               </w:rPr>
-              <w:t xml:space="preserve">3.3</w:t>
+              <w:t xml:space="preserve">3.4</w:t>
             </w:r>
           </w:p>
         </w:tc>
@@ -2673,7 +2673,7 @@
                 <w:sz w:val="18"/>
                 <w:szCs w:val="18"/>
               </w:rPr>
-              <w:t xml:space="preserve">Ordinamento di tutte le tabelle e degli elenchi.</w:t>
+              <w:t xml:space="preserve">Presentazione di riepilogo nella pagina Documentazione.</w:t>
             </w:r>
           </w:p>
         </w:tc>
@@ -2743,7 +2743,7 @@
                 <w:sz w:val="18"/>
                 <w:szCs w:val="18"/>
               </w:rPr>
-              <w:t xml:space="preserve">3.2</w:t>
+              <w:t xml:space="preserve">3.3</w:t>
             </w:r>
           </w:p>
         </w:tc>
@@ -2809,7 +2809,7 @@
                 <w:sz w:val="18"/>
                 <w:szCs w:val="18"/>
               </w:rPr>
-              <w:t xml:space="preserve">Simulatore: metodo di stima per utenza (solo utenze virtuose), buffer del Capitolo 7, taratura.</w:t>
+              <w:t xml:space="preserve">Ordinamento di tutte le tabelle e degli elenchi.</w:t>
             </w:r>
           </w:p>
         </w:tc>
@@ -2879,7 +2879,7 @@
                 <w:sz w:val="18"/>
                 <w:szCs w:val="18"/>
               </w:rPr>
-              <w:t xml:space="preserve">3.1</w:t>
+              <w:t xml:space="preserve">3.2</w:t>
             </w:r>
           </w:p>
         </w:tc>
@@ -2943,7 +2943,7 @@
                 <w:sz w:val="18"/>
                 <w:szCs w:val="18"/>
               </w:rPr>
-              <w:t xml:space="preserve">Cruscotto diventa Dashboard; barra a LED delle 7 fasi per ogni pratica.</w:t>
+              <w:t xml:space="preserve">Simulatore: metodo di stima per utenza (solo utenze virtuose), buffer del Capitolo 7, taratura.</w:t>
             </w:r>
           </w:p>
         </w:tc>
@@ -3013,7 +3013,7 @@
                 <w:sz w:val="18"/>
                 <w:szCs w:val="18"/>
               </w:rPr>
-              <w:t xml:space="preserve">3.0</w:t>
+              <w:t xml:space="preserve">3.1</w:t>
             </w:r>
           </w:p>
         </w:tc>
@@ -3079,7 +3079,7 @@
                 <w:sz w:val="18"/>
                 <w:szCs w:val="18"/>
               </w:rPr>
-              <w:t xml:space="preserve">Eliminazione degli utenti che non hanno mai operato (script 30).</w:t>
+              <w:t xml:space="preserve">Cruscotto diventa Dashboard; barra a LED delle 7 fasi per ogni pratica.</w:t>
             </w:r>
           </w:p>
         </w:tc>
@@ -3149,7 +3149,7 @@
                 <w:sz w:val="18"/>
                 <w:szCs w:val="18"/>
               </w:rPr>
-              <w:t xml:space="preserve">2.9</w:t>
+              <w:t xml:space="preserve">3.0</w:t>
             </w:r>
           </w:p>
         </w:tc>
@@ -3213,7 +3213,7 @@
                 <w:sz w:val="18"/>
                 <w:szCs w:val="18"/>
               </w:rPr>
-              <w:t xml:space="preserve">Email automatica con le credenziali al nuovo utente e alla reimpostazione della password.</w:t>
+              <w:t xml:space="preserve">Eliminazione degli utenti che non hanno mai operato (script 30).</w:t>
             </w:r>
           </w:p>
         </w:tc>
@@ -3283,7 +3283,7 @@
                 <w:sz w:val="18"/>
                 <w:szCs w:val="18"/>
               </w:rPr>
-              <w:t xml:space="preserve">2.8</w:t>
+              <w:t xml:space="preserve">2.9</w:t>
             </w:r>
           </w:p>
         </w:tc>
@@ -3349,7 +3349,7 @@
                 <w:sz w:val="18"/>
                 <w:szCs w:val="18"/>
               </w:rPr>
-              <w:t xml:space="preserve">Più Amministratori con accesso completo; Amministratore principale protetto (script 29).</w:t>
+              <w:t xml:space="preserve">Email automatica con le credenziali al nuovo utente e alla reimpostazione della password.</w:t>
             </w:r>
           </w:p>
         </w:tc>
@@ -3419,7 +3419,7 @@
                 <w:sz w:val="18"/>
                 <w:szCs w:val="18"/>
               </w:rPr>
-              <w:t xml:space="preserve">2.7</w:t>
+              <w:t xml:space="preserve">2.8</w:t>
             </w:r>
           </w:p>
         </w:tc>
@@ -3483,7 +3483,7 @@
                 <w:sz w:val="18"/>
                 <w:szCs w:val="18"/>
               </w:rPr>
-              <w:t xml:space="preserve">Simulatore: costi per il Comune secondo il Caso 1 (progetto volontario) o il Caso 2 (progetto obbligatorio da bando).</w:t>
+              <w:t xml:space="preserve">Più Amministratori con accesso completo; Amministratore principale protetto (script 29).</w:t>
             </w:r>
           </w:p>
         </w:tc>
@@ -3553,7 +3553,7 @@
                 <w:sz w:val="18"/>
                 <w:szCs w:val="18"/>
               </w:rPr>
-              <w:t xml:space="preserve">2.6</w:t>
+              <w:t xml:space="preserve">2.7</w:t>
             </w:r>
           </w:p>
         </w:tc>
@@ -3619,7 +3619,7 @@
                 <w:sz w:val="18"/>
                 <w:szCs w:val="18"/>
               </w:rPr>
-              <w:t xml:space="preserve">Simulatore: valore del credito anno per anno, proposto 32 €.</w:t>
+              <w:t xml:space="preserve">Simulatore: costi per il Comune secondo il Caso 1 (progetto volontario) o il Caso 2 (progetto obbligatorio da bando).</w:t>
             </w:r>
           </w:p>
         </w:tc>
@@ -3689,7 +3689,7 @@
                 <w:sz w:val="18"/>
                 <w:szCs w:val="18"/>
               </w:rPr>
-              <w:t xml:space="preserve">2.5</w:t>
+              <w:t xml:space="preserve">2.6</w:t>
             </w:r>
           </w:p>
         </w:tc>
@@ -3753,7 +3753,7 @@
                 <w:sz w:val="18"/>
                 <w:szCs w:val="18"/>
               </w:rPr>
-              <w:t xml:space="preserve">Simulatore: simulazione economica con valore unitario del credito e costi per il Comune (contratti tipo della Fondazione, Schema tariffario).</w:t>
+              <w:t xml:space="preserve">Simulatore: valore del credito anno per anno, proposto 32 €.</w:t>
             </w:r>
           </w:p>
         </w:tc>
@@ -3823,7 +3823,7 @@
                 <w:sz w:val="18"/>
                 <w:szCs w:val="18"/>
               </w:rPr>
-              <w:t xml:space="preserve">2.4</w:t>
+              <w:t xml:space="preserve">2.5</w:t>
             </w:r>
           </w:p>
         </w:tc>
@@ -3889,7 +3889,7 @@
                 <w:sz w:val="18"/>
                 <w:szCs w:val="18"/>
               </w:rPr>
-              <w:t xml:space="preserve">Simulatore: riferimento sempre alla soglia del 65% di differenziata e controllo dei valori fuori scala.</w:t>
+              <w:t xml:space="preserve">Simulatore: simulazione economica con valore unitario del credito e costi per il Comune (contratti tipo della Fondazione, Schema tariffario).</w:t>
             </w:r>
           </w:p>
         </w:tc>
@@ -3959,7 +3959,7 @@
                 <w:sz w:val="18"/>
                 <w:szCs w:val="18"/>
               </w:rPr>
-              <w:t xml:space="preserve">2.3</w:t>
+              <w:t xml:space="preserve">2.4</w:t>
             </w:r>
           </w:p>
         </w:tc>
@@ -4023,7 +4023,7 @@
                 <w:sz w:val="18"/>
                 <w:szCs w:val="18"/>
               </w:rPr>
-              <w:t xml:space="preserve">Simulatore conforme al modello CWP: scenario di riferimento dello Standard 4.8.1, situazione attuale, conformità.</w:t>
+              <w:t xml:space="preserve">Simulatore: riferimento sempre alla soglia del 65% di differenziata e controllo dei valori fuori scala.</w:t>
             </w:r>
           </w:p>
         </w:tc>
@@ -4093,7 +4093,7 @@
                 <w:sz w:val="18"/>
                 <w:szCs w:val="18"/>
               </w:rPr>
-              <w:t xml:space="preserve">2.2</w:t>
+              <w:t xml:space="preserve">2.3</w:t>
             </w:r>
           </w:p>
         </w:tc>
@@ -4159,7 +4159,7 @@
                 <w:sz w:val="18"/>
                 <w:szCs w:val="18"/>
               </w:rPr>
-              <w:t xml:space="preserve">Nuovo capitolo «Simulatore di scenari»: creazione, anno base, obiettivi annui, risultati, modello di stima.</w:t>
+              <w:t xml:space="preserve">Simulatore conforme al modello CWP: scenario di riferimento dello Standard 4.8.1, situazione attuale, conformità.</w:t>
             </w:r>
           </w:p>
         </w:tc>
@@ -4229,7 +4229,7 @@
                 <w:sz w:val="18"/>
                 <w:szCs w:val="18"/>
               </w:rPr>
-              <w:t xml:space="preserve">2.1</w:t>
+              <w:t xml:space="preserve">2.2</w:t>
             </w:r>
           </w:p>
         </w:tc>
@@ -4293,7 +4293,7 @@
                 <w:sz w:val="18"/>
                 <w:szCs w:val="18"/>
               </w:rPr>
-              <w:t xml:space="preserve">Funzioni in arrivo: simulatore di scenari (7, 10 o 21 anni, obiettivi annui, % di differenziata e crediti stimati) e assistente virtuale (Claude).</w:t>
+              <w:t xml:space="preserve">Nuovo capitolo «Simulatore di scenari»: creazione, anno base, obiettivi annui, risultati, modello di stima.</w:t>
             </w:r>
           </w:p>
         </w:tc>
@@ -4363,7 +4363,7 @@
                 <w:sz w:val="18"/>
                 <w:szCs w:val="18"/>
               </w:rPr>
-              <w:t xml:space="preserve">2.0</w:t>
+              <w:t xml:space="preserve">2.1</w:t>
             </w:r>
           </w:p>
         </w:tc>
@@ -4429,7 +4429,7 @@
                 <w:sz w:val="18"/>
                 <w:szCs w:val="18"/>
               </w:rPr>
-              <w:t xml:space="preserve">Copie di sicurezza e ripristino: rimando alle Istruzioni di ripristino e punti essenziali (capitolo Manutenzione ed emergenze).</w:t>
+              <w:t xml:space="preserve">Funzioni in arrivo: simulatore di scenari (7, 10 o 21 anni, obiettivi annui, % di differenziata e crediti stimati) e assistente virtuale (Claude).</w:t>
             </w:r>
           </w:p>
         </w:tc>
@@ -4499,7 +4499,7 @@
                 <w:sz w:val="18"/>
                 <w:szCs w:val="18"/>
               </w:rPr>
-              <w:t xml:space="preserve">1.9</w:t>
+              <w:t xml:space="preserve">2.0</w:t>
             </w:r>
           </w:p>
         </w:tc>
@@ -4563,7 +4563,7 @@
                 <w:sz w:val="18"/>
                 <w:szCs w:val="18"/>
               </w:rPr>
-              <w:t xml:space="preserve">Fondazione Operate soggetto promotore del programma (esclusiva conferita da Wastelab).</w:t>
+              <w:t xml:space="preserve">Copie di sicurezza e ripristino: rimando alle Istruzioni di ripristino e punti essenziali (capitolo Manutenzione ed emergenze).</w:t>
             </w:r>
           </w:p>
         </w:tc>
@@ -4633,7 +4633,7 @@
                 <w:sz w:val="18"/>
                 <w:szCs w:val="18"/>
               </w:rPr>
-              <w:t xml:space="preserve">1.8</w:t>
+              <w:t xml:space="preserve">1.9</w:t>
             </w:r>
           </w:p>
         </w:tc>
@@ -4699,7 +4699,7 @@
                 <w:sz w:val="18"/>
                 <w:szCs w:val="18"/>
               </w:rPr>
-              <w:t xml:space="preserve">PEC del Programma e documenti ufficiali già pubblicati sulla pagina pubblica.</w:t>
+              <w:t xml:space="preserve">Fondazione Operate soggetto promotore del programma (esclusiva conferita da Wastelab).</w:t>
             </w:r>
           </w:p>
         </w:tc>
@@ -4769,7 +4769,7 @@
                 <w:sz w:val="18"/>
                 <w:szCs w:val="18"/>
               </w:rPr>
-              <w:t xml:space="preserve">1.7</w:t>
+              <w:t xml:space="preserve">1.8</w:t>
             </w:r>
           </w:p>
         </w:tc>
@@ -4801,7 +4801,7 @@
                 <w:sz w:val="18"/>
                 <w:szCs w:val="18"/>
               </w:rPr>
-              <w:t xml:space="preserve">18/10/2026</w:t>
+              <w:t xml:space="preserve">19/10/2026</w:t>
             </w:r>
           </w:p>
         </w:tc>
@@ -4833,7 +4833,7 @@
                 <w:sz w:val="18"/>
                 <w:szCs w:val="18"/>
               </w:rPr>
-              <w:t xml:space="preserve">Allineamento ai documenti ufficiali del Programma (script 22-24): Rapporto a 7 fasi, feedback pubblico, stati del Programma, dati del progetto e territorio ISTAT, ritiro e rientro, account unico e delegati, registri, tariffe e sospensione, accuratezza e accertamenti, informazioni del Programma e metodologie, modelli pubblici; nuovi capitoli Crediti emessi, Reclami, Pagina pubblica; qualità dei dati nel calcolo.</w:t>
+              <w:t xml:space="preserve">PEC del Programma e documenti ufficiali già pubblicati sulla pagina pubblica.</w:t>
             </w:r>
           </w:p>
         </w:tc>
@@ -4903,7 +4903,7 @@
                 <w:sz w:val="18"/>
                 <w:szCs w:val="18"/>
               </w:rPr>
-              <w:t xml:space="preserve">1.6</w:t>
+              <w:t xml:space="preserve">1.7</w:t>
             </w:r>
           </w:p>
         </w:tc>
@@ -4969,7 +4969,7 @@
                 <w:sz w:val="18"/>
                 <w:szCs w:val="18"/>
               </w:rPr>
-              <w:t xml:space="preserve">Calcolo crediti: descrizione corretta del buffer (somma delle voci delle Tabelle 15 e 16, più il 20% con le sole utenze virtuose, al massimo 80%).</w:t>
+              <w:t xml:space="preserve">Allineamento ai documenti ufficiali del Programma (script 22-24): Rapporto a 7 fasi, feedback pubblico, stati del Programma, dati del progetto e territorio ISTAT, ritiro e rientro, account unico e delegati, registri, tariffe e sospensione, accuratezza e accertamenti, informazioni del Programma e metodologie, modelli pubblici; nuovi capitoli Crediti emessi, Reclami, Pagina pubblica; qualità dei dati nel calcolo.</w:t>
             </w:r>
           </w:p>
         </w:tc>
@@ -5039,7 +5039,7 @@
                 <w:sz w:val="18"/>
                 <w:szCs w:val="18"/>
               </w:rPr>
-              <w:t xml:space="preserve">1.5</w:t>
+              <w:t xml:space="preserve">1.6</w:t>
             </w:r>
           </w:p>
         </w:tc>
@@ -5103,7 +5103,7 @@
                 <w:sz w:val="18"/>
                 <w:szCs w:val="18"/>
               </w:rPr>
-              <w:t xml:space="preserve">Nuova pagina Anagrafiche (Organizzazioni ed Enti, anche per gli Operatori); Rapporti con 4 fasi e durate proprie; documenti richiesti per fase; consultazione con documento bloccato, osservazioni numerate e motivazione; conservazione per 10 anni; fascicolo con riepilogo PDF e nuove cartelle.</w:t>
+              <w:t xml:space="preserve">Calcolo crediti: descrizione corretta del buffer (somma delle voci delle Tabelle 15 e 16, più il 20% con le sole utenze virtuose, al massimo 80%).</w:t>
             </w:r>
           </w:p>
         </w:tc>
@@ -5173,7 +5173,7 @@
                 <w:sz w:val="18"/>
                 <w:szCs w:val="18"/>
               </w:rPr>
-              <w:t xml:space="preserve">1.4</w:t>
+              <w:t xml:space="preserve">1.5</w:t>
             </w:r>
           </w:p>
         </w:tc>
@@ -5239,7 +5239,7 @@
                 <w:sz w:val="18"/>
                 <w:szCs w:val="18"/>
               </w:rPr>
-              <w:t xml:space="preserve">Calcolo crediti: il risultato si azzera quando cambiano dati o Banca Dati Utenze, conferma solo dopo un nuovo «Calcola». Gestione utenti: password temporanea di almeno 10 caratteri con lettere e numeri, creazione annullata se non va a buon fine, nessun accesso ai dati prima del cambio password.</w:t>
+              <w:t xml:space="preserve">Nuova pagina Anagrafiche (Organizzazioni ed Enti, anche per gli Operatori); Rapporti con 4 fasi e durate proprie; documenti richiesti per fase; consultazione con documento bloccato, osservazioni numerate e motivazione; conservazione per 10 anni; fascicolo con riepilogo PDF e nuove cartelle.</w:t>
             </w:r>
           </w:p>
         </w:tc>
@@ -5309,7 +5309,7 @@
                 <w:sz w:val="18"/>
                 <w:szCs w:val="18"/>
               </w:rPr>
-              <w:t xml:space="preserve">1.3</w:t>
+              <w:t xml:space="preserve">1.4</w:t>
             </w:r>
           </w:p>
         </w:tc>
@@ -5373,7 +5373,7 @@
                 <w:sz w:val="18"/>
                 <w:szCs w:val="18"/>
               </w:rPr>
-              <w:t xml:space="preserve">Rapporto di calcolo in PDF, archiviazione nella pratica, numero di registro, registro dei crediti.</w:t>
+              <w:t xml:space="preserve">Calcolo crediti: il risultato si azzera quando cambiano dati o Banca Dati Utenze, conferma solo dopo un nuovo «Calcola». Gestione utenti: password temporanea di almeno 10 caratteri con lettere e numeri, creazione annullata se non va a buon fine, nessun accesso ai dati prima del cambio password.</w:t>
             </w:r>
           </w:p>
         </w:tc>
@@ -5443,7 +5443,7 @@
                 <w:sz w:val="18"/>
                 <w:szCs w:val="18"/>
               </w:rPr>
-              <w:t xml:space="preserve">1.2</w:t>
+              <w:t xml:space="preserve">1.3</w:t>
             </w:r>
           </w:p>
         </w:tc>
@@ -5509,7 +5509,7 @@
                 <w:sz w:val="18"/>
                 <w:szCs w:val="18"/>
               </w:rPr>
-              <w:t xml:space="preserve">Calcolo crediti: importare il tracciato nel calcolo (dai documenti della pratica o dal computer), singole letture, blocco dei dati personali, controlli di coerenza.</w:t>
+              <w:t xml:space="preserve">Rapporto di calcolo in PDF, archiviazione nella pratica, numero di registro, registro dei crediti.</w:t>
             </w:r>
           </w:p>
         </w:tc>
@@ -5579,7 +5579,7 @@
                 <w:sz w:val="18"/>
                 <w:szCs w:val="18"/>
               </w:rPr>
-              <w:t xml:space="preserve">1.1</w:t>
+              <w:t xml:space="preserve">1.2</w:t>
             </w:r>
           </w:p>
         </w:tc>
@@ -5643,7 +5643,7 @@
                 <w:sz w:val="18"/>
                 <w:szCs w:val="18"/>
               </w:rPr>
-              <w:t xml:space="preserve">Note di fase, Ente di Validazione della pratica, consultazione sulla pagina pubblica con conferma dell'email, moderazione con autori e allegati, errata corrige; nuovo capitolo Messaggi con il Comune; pagamenti visibili al Comune; Impostazioni: Enti di Validazione e Modelli di documento; notifiche aggiornate.</w:t>
+              <w:t xml:space="preserve">Calcolo crediti: importare il tracciato nel calcolo (dai documenti della pratica o dal computer), singole letture, blocco dei dati personali, controlli di coerenza.</w:t>
             </w:r>
           </w:p>
         </w:tc>
@@ -5713,6 +5713,142 @@
                 <w:sz w:val="18"/>
                 <w:szCs w:val="18"/>
               </w:rPr>
+              <w:t xml:space="preserve">1.1</w:t>
+            </w:r>
+          </w:p>
+        </w:tc>
+        <w:tc>
+          <w:tcPr>
+            <w:tcW w:type="dxa" w:w="1300"/>
+            <w:tcBorders>
+              <w:top w:val="single" w:color="D9D4C5" w:sz="4"/>
+              <w:left w:val="single" w:color="D9D4C5" w:sz="4"/>
+              <w:bottom w:val="single" w:color="D9D4C5" w:sz="4"/>
+              <w:right w:val="single" w:color="D9D4C5" w:sz="4"/>
+            </w:tcBorders>
+            <w:shd w:fill="F6F4EE" w:color="auto" w:val="clear"/>
+            <w:tcMar>
+              <w:top w:type="dxa" w:w="70"/>
+              <w:left w:type="dxa" w:w="110"/>
+              <w:bottom w:type="dxa" w:w="70"/>
+              <w:right w:type="dxa" w:w="110"/>
+            </w:tcMar>
+            <w:vAlign w:val="center"/>
+          </w:tcPr>
+          <w:p>
+            <w:pPr>
+              <w:spacing w:after="0" w:before="0"/>
+            </w:pPr>
+            <w:r>
+              <w:rPr>
+                <w:rFonts w:ascii="Arial" w:cs="Arial" w:eastAsia="Arial" w:hAnsi="Arial"/>
+                <w:color w:val="1B2118"/>
+                <w:sz w:val="18"/>
+                <w:szCs w:val="18"/>
+              </w:rPr>
+              <w:t xml:space="preserve">18/10/2026</w:t>
+            </w:r>
+          </w:p>
+        </w:tc>
+        <w:tc>
+          <w:tcPr>
+            <w:tcW w:type="dxa" w:w="5538"/>
+            <w:tcBorders>
+              <w:top w:val="single" w:color="D9D4C5" w:sz="4"/>
+              <w:left w:val="single" w:color="D9D4C5" w:sz="4"/>
+              <w:bottom w:val="single" w:color="D9D4C5" w:sz="4"/>
+              <w:right w:val="single" w:color="D9D4C5" w:sz="4"/>
+            </w:tcBorders>
+            <w:shd w:fill="F6F4EE" w:color="auto" w:val="clear"/>
+            <w:tcMar>
+              <w:top w:type="dxa" w:w="70"/>
+              <w:left w:type="dxa" w:w="110"/>
+              <w:bottom w:type="dxa" w:w="70"/>
+              <w:right w:type="dxa" w:w="110"/>
+            </w:tcMar>
+            <w:vAlign w:val="center"/>
+          </w:tcPr>
+          <w:p>
+            <w:pPr>
+              <w:spacing w:after="0" w:before="0"/>
+            </w:pPr>
+            <w:r>
+              <w:rPr>
+                <w:rFonts w:ascii="Arial" w:cs="Arial" w:eastAsia="Arial" w:hAnsi="Arial"/>
+                <w:color w:val="1B2118"/>
+                <w:sz w:val="18"/>
+                <w:szCs w:val="18"/>
+              </w:rPr>
+              <w:t xml:space="preserve">Note di fase, Ente di Validazione della pratica, consultazione sulla pagina pubblica con conferma dell'email, moderazione con autori e allegati, errata corrige; nuovo capitolo Messaggi con il Comune; pagamenti visibili al Comune; Impostazioni: Enti di Validazione e Modelli di documento; notifiche aggiornate.</w:t>
+            </w:r>
+          </w:p>
+        </w:tc>
+        <w:tc>
+          <w:tcPr>
+            <w:tcW w:type="dxa" w:w="2000"/>
+            <w:tcBorders>
+              <w:top w:val="single" w:color="D9D4C5" w:sz="4"/>
+              <w:left w:val="single" w:color="D9D4C5" w:sz="4"/>
+              <w:bottom w:val="single" w:color="D9D4C5" w:sz="4"/>
+              <w:right w:val="single" w:color="D9D4C5" w:sz="4"/>
+            </w:tcBorders>
+            <w:shd w:fill="F6F4EE" w:color="auto" w:val="clear"/>
+            <w:tcMar>
+              <w:top w:type="dxa" w:w="70"/>
+              <w:left w:type="dxa" w:w="110"/>
+              <w:bottom w:type="dxa" w:w="70"/>
+              <w:right w:type="dxa" w:w="110"/>
+            </w:tcMar>
+            <w:vAlign w:val="center"/>
+          </w:tcPr>
+          <w:p>
+            <w:pPr>
+              <w:spacing w:after="0" w:before="0"/>
+            </w:pPr>
+            <w:r>
+              <w:rPr>
+                <w:rFonts w:ascii="Arial" w:cs="Arial" w:eastAsia="Arial" w:hAnsi="Arial"/>
+                <w:color w:val="1B2118"/>
+                <w:sz w:val="18"/>
+                <w:szCs w:val="18"/>
+              </w:rPr>
+              <w:t xml:space="preserve">Fondazione Operate</w:t>
+            </w:r>
+          </w:p>
+        </w:tc>
+      </w:tr>
+      <w:tr>
+        <w:trPr>
+          <w:cantSplit/>
+        </w:trPr>
+        <w:tc>
+          <w:tcPr>
+            <w:tcW w:type="dxa" w:w="800"/>
+            <w:tcBorders>
+              <w:top w:val="single" w:color="D9D4C5" w:sz="4"/>
+              <w:left w:val="single" w:color="D9D4C5" w:sz="4"/>
+              <w:bottom w:val="single" w:color="D9D4C5" w:sz="4"/>
+              <w:right w:val="single" w:color="D9D4C5" w:sz="4"/>
+            </w:tcBorders>
+            <w:tcMar>
+              <w:top w:type="dxa" w:w="70"/>
+              <w:left w:type="dxa" w:w="110"/>
+              <w:bottom w:type="dxa" w:w="70"/>
+              <w:right w:type="dxa" w:w="110"/>
+            </w:tcMar>
+            <w:vAlign w:val="center"/>
+          </w:tcPr>
+          <w:p>
+            <w:pPr>
+              <w:spacing w:after="0" w:before="0"/>
+            </w:pPr>
+            <w:r>
+              <w:rPr>
+                <w:rFonts w:ascii="Arial" w:cs="Arial" w:eastAsia="Arial" w:hAnsi="Arial"/>
+                <w:color w:val="1B2118"/>
+                <w:sz w:val="18"/>
+                <w:szCs w:val="18"/>
+              </w:rPr>
               <w:t xml:space="preserve">1.0</w:t>
             </w:r>
           </w:p>
@@ -5726,7 +5862,6 @@
               <w:bottom w:val="single" w:color="D9D4C5" w:sz="4"/>
               <w:right w:val="single" w:color="D9D4C5" w:sz="4"/>
             </w:tcBorders>
-            <w:shd w:fill="F6F4EE" w:color="auto" w:val="clear"/>
             <w:tcMar>
               <w:top w:type="dxa" w:w="70"/>
               <w:left w:type="dxa" w:w="110"/>
@@ -5759,7 +5894,6 @@
               <w:bottom w:val="single" w:color="D9D4C5" w:sz="4"/>
               <w:right w:val="single" w:color="D9D4C5" w:sz="4"/>
             </w:tcBorders>
-            <w:shd w:fill="F6F4EE" w:color="auto" w:val="clear"/>
             <w:tcMar>
               <w:top w:type="dxa" w:w="70"/>
               <w:left w:type="dxa" w:w="110"/>
@@ -5792,7 +5926,6 @@
               <w:bottom w:val="single" w:color="D9D4C5" w:sz="4"/>
               <w:right w:val="single" w:color="D9D4C5" w:sz="4"/>
             </w:tcBorders>
-            <w:shd w:fill="F6F4EE" w:color="auto" w:val="clear"/>
             <w:tcMar>
               <w:top w:type="dxa" w:w="70"/>
               <w:left w:type="dxa" w:w="110"/>
@@ -5834,7 +5967,7 @@
           <w:sz w:val="20"/>
           <w:szCs w:val="20"/>
         </w:rPr>
-        <w:t xml:space="preserve">Questo documento descrive il portale alla revisione 4.7 del 21/10/2026. A ogni modifica del portale il manuale viene aggiornato e la revisione incrementata; la versione corrente si scarica dall'area Documentazione del portale (solo Amministratori).</w:t>
+        <w:t xml:space="preserve">Questo documento descrive il portale alla revisione 4.8 del 21/10/2026. A ogni modifica del portale il manuale viene aggiornato e la revisione incrementata; la versione corrente si scarica dall'area Documentazione del portale (solo Amministratori).</w:t>
       </w:r>
     </w:p>
     <w:p>
@@ -8614,7 +8747,7 @@
         </w:rPr>
         <w:t xml:space="preserve">Si accede da </w:t>
       </w:r>
-      <w:hyperlink w:history="1" r:id="rIdxki31uj6ypmnvogbdimgp">
+      <w:hyperlink w:history="1" r:id="rIdask6lc1_qvnludxqvipai">
         <w:r>
           <w:rPr>
             <w:rFonts w:ascii="Arial" w:cs="Arial" w:eastAsia="Arial" w:hAnsi="Arial"/>
@@ -38301,7 +38434,300 @@
           <w:sz w:val="21"/>
           <w:szCs w:val="21"/>
         </w:rPr>
-        <w:t xml:space="preserve">: un rapporto impaginato in A4 orizzontale con i loghi, la scheda dello scenario, l'avvertenza «stima ex ante», gli indicatori di sintesi, i crediti anno per anno, la parte economica, i costi del Caso 1 o 2, le note e gli avvisi, con i numeri di pagina;</w:t>
+        <w:t xml:space="preserve">: un rapporto impaginato in A4 orizzontale con </w:t>
+      </w:r>
+      <w:r>
+        <w:rPr>
+          <w:rFonts w:ascii="Arial" w:cs="Arial" w:eastAsia="Arial" w:hAnsi="Arial"/>
+          <w:b/>
+          <w:bCs/>
+          <w:color w:val="1B2118"/>
+          <w:sz w:val="21"/>
+          <w:szCs w:val="21"/>
+        </w:rPr>
+        <w:t xml:space="preserve">tutti i dati della pagina</w:t>
+      </w:r>
+      <w:r>
+        <w:rPr>
+          <w:rFonts w:ascii="Arial" w:cs="Arial" w:eastAsia="Arial" w:hAnsi="Arial"/>
+          <w:color w:val="1B2118"/>
+          <w:sz w:val="21"/>
+          <w:szCs w:val="21"/>
+        </w:rPr>
+        <w:t xml:space="preserve">, sezione per sezione. Contiene:</w:t>
+      </w:r>
+    </w:p>
+    <w:p>
+      <w:pPr>
+        <w:pStyle w:val="ListParagraph"/>
+        <w:numPr>
+          <w:ilvl w:val="1"/>
+          <w:numId w:val="2"/>
+        </w:numPr>
+        <w:spacing w:after="70" w:line="290"/>
+      </w:pPr>
+      <w:r>
+        <w:rPr>
+          <w:rFonts w:ascii="Arial" w:cs="Arial" w:eastAsia="Arial" w:hAnsi="Arial"/>
+          <w:color w:val="1B2118"/>
+          <w:sz w:val="20"/>
+          <w:szCs w:val="20"/>
+        </w:rPr>
+        <w:t xml:space="preserve">i loghi, la scheda dello scenario, l'avvertenza «stima ex ante» e gli indicatori di sintesi;</w:t>
+      </w:r>
+    </w:p>
+    <w:p>
+      <w:pPr>
+        <w:pStyle w:val="ListParagraph"/>
+        <w:numPr>
+          <w:ilvl w:val="1"/>
+          <w:numId w:val="2"/>
+        </w:numPr>
+        <w:spacing w:after="70" w:line="290"/>
+      </w:pPr>
+      <w:r>
+        <w:rPr>
+          <w:rFonts w:ascii="Arial" w:cs="Arial" w:eastAsia="Arial" w:hAnsi="Arial"/>
+          <w:color w:val="1B2118"/>
+          <w:sz w:val="20"/>
+          <w:szCs w:val="20"/>
+        </w:rPr>
+        <w:t xml:space="preserve">i </w:t>
+      </w:r>
+      <w:r>
+        <w:rPr>
+          <w:rFonts w:ascii="Arial" w:cs="Arial" w:eastAsia="Arial" w:hAnsi="Arial"/>
+          <w:b/>
+          <w:bCs/>
+          <w:color w:val="1B2118"/>
+          <w:sz w:val="20"/>
+          <w:szCs w:val="20"/>
+        </w:rPr>
+        <w:t xml:space="preserve">grafici</w:t>
+      </w:r>
+      <w:r>
+        <w:rPr>
+          <w:rFonts w:ascii="Arial" w:cs="Arial" w:eastAsia="Arial" w:hAnsi="Arial"/>
+          <w:color w:val="1B2118"/>
+          <w:sz w:val="20"/>
+          <w:szCs w:val="20"/>
+        </w:rPr>
+        <w:t xml:space="preserve">: crediti netti per anno, raccolta differenziata con la soglia del 65%, margine netto per anno e margine cumulato;</w:t>
+      </w:r>
+    </w:p>
+    <w:p>
+      <w:pPr>
+        <w:pStyle w:val="ListParagraph"/>
+        <w:numPr>
+          <w:ilvl w:val="1"/>
+          <w:numId w:val="2"/>
+        </w:numPr>
+        <w:spacing w:after="70" w:line="290"/>
+      </w:pPr>
+      <w:r>
+        <w:rPr>
+          <w:rFonts w:ascii="Arial" w:cs="Arial" w:eastAsia="Arial" w:hAnsi="Arial"/>
+          <w:color w:val="1B2118"/>
+          <w:sz w:val="20"/>
+          <w:szCs w:val="20"/>
+        </w:rPr>
+        <w:t xml:space="preserve">le </w:t>
+      </w:r>
+      <w:r>
+        <w:rPr>
+          <w:rFonts w:ascii="Arial" w:cs="Arial" w:eastAsia="Arial" w:hAnsi="Arial"/>
+          <w:b/>
+          <w:bCs/>
+          <w:color w:val="1B2118"/>
+          <w:sz w:val="20"/>
+          <w:szCs w:val="20"/>
+        </w:rPr>
+        <w:t xml:space="preserve">impostazioni</w:t>
+      </w:r>
+      <w:r>
+        <w:rPr>
+          <w:rFonts w:ascii="Arial" w:cs="Arial" w:eastAsia="Arial" w:hAnsi="Arial"/>
+          <w:color w:val="1B2118"/>
+          <w:sz w:val="20"/>
+          <w:szCs w:val="20"/>
+        </w:rPr>
+        <w:t xml:space="preserve"> (metodo di stima, buffer previsto, Tabelle 15 e 16, tariffa puntuale) con il buffer calcolato secondo il Capitolo 7;</w:t>
+      </w:r>
+    </w:p>
+    <w:p>
+      <w:pPr>
+        <w:pStyle w:val="ListParagraph"/>
+        <w:numPr>
+          <w:ilvl w:val="1"/>
+          <w:numId w:val="2"/>
+        </w:numPr>
+        <w:spacing w:after="70" w:line="290"/>
+      </w:pPr>
+      <w:r>
+        <w:rPr>
+          <w:rFonts w:ascii="Arial" w:cs="Arial" w:eastAsia="Arial" w:hAnsi="Arial"/>
+          <w:color w:val="1B2118"/>
+          <w:sz w:val="20"/>
+          <w:szCs w:val="20"/>
+        </w:rPr>
+        <w:t xml:space="preserve">lo </w:t>
+      </w:r>
+      <w:r>
+        <w:rPr>
+          <w:rFonts w:ascii="Arial" w:cs="Arial" w:eastAsia="Arial" w:hAnsi="Arial"/>
+          <w:b/>
+          <w:bCs/>
+          <w:color w:val="1B2118"/>
+          <w:sz w:val="20"/>
+          <w:szCs w:val="20"/>
+        </w:rPr>
+        <w:t xml:space="preserve">scenario di riferimento</w:t>
+      </w:r>
+      <w:r>
+        <w:rPr>
+          <w:rFonts w:ascii="Arial" w:cs="Arial" w:eastAsia="Arial" w:hAnsi="Arial"/>
+          <w:color w:val="1B2118"/>
+          <w:sz w:val="20"/>
+          <w:szCs w:val="20"/>
+        </w:rPr>
+        <w:t xml:space="preserve"> con i rifiuti di ogni tipologia (tonnellate e kg per abitante) e il riepilogo, la </w:t>
+      </w:r>
+      <w:r>
+        <w:rPr>
+          <w:rFonts w:ascii="Arial" w:cs="Arial" w:eastAsia="Arial" w:hAnsi="Arial"/>
+          <w:b/>
+          <w:bCs/>
+          <w:color w:val="1B2118"/>
+          <w:sz w:val="20"/>
+          <w:szCs w:val="20"/>
+        </w:rPr>
+        <w:t xml:space="preserve">situazione attuale</w:t>
+      </w:r>
+      <w:r>
+        <w:rPr>
+          <w:rFonts w:ascii="Arial" w:cs="Arial" w:eastAsia="Arial" w:hAnsi="Arial"/>
+          <w:color w:val="1B2118"/>
+          <w:sz w:val="20"/>
+          <w:szCs w:val="20"/>
+        </w:rPr>
+        <w:t xml:space="preserve"> e gli </w:t>
+      </w:r>
+      <w:r>
+        <w:rPr>
+          <w:rFonts w:ascii="Arial" w:cs="Arial" w:eastAsia="Arial" w:hAnsi="Arial"/>
+          <w:b/>
+          <w:bCs/>
+          <w:color w:val="1B2118"/>
+          <w:sz w:val="20"/>
+          <w:szCs w:val="20"/>
+        </w:rPr>
+        <w:t xml:space="preserve">obiettivi anno per anno</w:t>
+      </w:r>
+      <w:r>
+        <w:rPr>
+          <w:rFonts w:ascii="Arial" w:cs="Arial" w:eastAsia="Arial" w:hAnsi="Arial"/>
+          <w:color w:val="1B2118"/>
+          <w:sz w:val="20"/>
+          <w:szCs w:val="20"/>
+        </w:rPr>
+        <w:t xml:space="preserve">;</w:t>
+      </w:r>
+    </w:p>
+    <w:p>
+      <w:pPr>
+        <w:pStyle w:val="ListParagraph"/>
+        <w:numPr>
+          <w:ilvl w:val="1"/>
+          <w:numId w:val="2"/>
+        </w:numPr>
+        <w:spacing w:after="70" w:line="290"/>
+      </w:pPr>
+      <w:r>
+        <w:rPr>
+          <w:rFonts w:ascii="Arial" w:cs="Arial" w:eastAsia="Arial" w:hAnsi="Arial"/>
+          <w:color w:val="1B2118"/>
+          <w:sz w:val="20"/>
+          <w:szCs w:val="20"/>
+        </w:rPr>
+        <w:t xml:space="preserve">i </w:t>
+      </w:r>
+      <w:r>
+        <w:rPr>
+          <w:rFonts w:ascii="Arial" w:cs="Arial" w:eastAsia="Arial" w:hAnsi="Arial"/>
+          <w:b/>
+          <w:bCs/>
+          <w:color w:val="1B2118"/>
+          <w:sz w:val="20"/>
+          <w:szCs w:val="20"/>
+        </w:rPr>
+        <w:t xml:space="preserve">risultati</w:t>
+      </w:r>
+      <w:r>
+        <w:rPr>
+          <w:rFonts w:ascii="Arial" w:cs="Arial" w:eastAsia="Arial" w:hAnsi="Arial"/>
+          <w:color w:val="1B2118"/>
+          <w:sz w:val="20"/>
+          <w:szCs w:val="20"/>
+        </w:rPr>
+        <w:t xml:space="preserve"> anno per anno con la riga del totale e la spiegazione «da dove vengono i crediti»;</w:t>
+      </w:r>
+    </w:p>
+    <w:p>
+      <w:pPr>
+        <w:pStyle w:val="ListParagraph"/>
+        <w:numPr>
+          <w:ilvl w:val="1"/>
+          <w:numId w:val="2"/>
+        </w:numPr>
+        <w:spacing w:after="70" w:line="290"/>
+      </w:pPr>
+      <w:r>
+        <w:rPr>
+          <w:rFonts w:ascii="Arial" w:cs="Arial" w:eastAsia="Arial" w:hAnsi="Arial"/>
+          <w:color w:val="1B2118"/>
+          <w:sz w:val="20"/>
+          <w:szCs w:val="20"/>
+        </w:rPr>
+        <w:t xml:space="preserve">la </w:t>
+      </w:r>
+      <w:r>
+        <w:rPr>
+          <w:rFonts w:ascii="Arial" w:cs="Arial" w:eastAsia="Arial" w:hAnsi="Arial"/>
+          <w:b/>
+          <w:bCs/>
+          <w:color w:val="1B2118"/>
+          <w:sz w:val="20"/>
+          <w:szCs w:val="20"/>
+        </w:rPr>
+        <w:t xml:space="preserve">parte economica</w:t>
+      </w:r>
+      <w:r>
+        <w:rPr>
+          <w:rFonts w:ascii="Arial" w:cs="Arial" w:eastAsia="Arial" w:hAnsi="Arial"/>
+          <w:color w:val="1B2118"/>
+          <w:sz w:val="20"/>
+          <w:szCs w:val="20"/>
+        </w:rPr>
+        <w:t xml:space="preserve">: parametri inseriti (valore del credito, variazione annua, costi dell'ente e altri costi), costi del Caso 1 o 2 con il totale annuo, ricavi, costi e margine anno per anno;</w:t>
+      </w:r>
+    </w:p>
+    <w:p>
+      <w:pPr>
+        <w:pStyle w:val="ListParagraph"/>
+        <w:numPr>
+          <w:ilvl w:val="1"/>
+          <w:numId w:val="2"/>
+        </w:numPr>
+        <w:spacing w:after="70" w:line="290"/>
+      </w:pPr>
+      <w:r>
+        <w:rPr>
+          <w:rFonts w:ascii="Arial" w:cs="Arial" w:eastAsia="Arial" w:hAnsi="Arial"/>
+          <w:color w:val="1B2118"/>
+          <w:sz w:val="20"/>
+          <w:szCs w:val="20"/>
+        </w:rPr>
+        <w:t xml:space="preserve">le note, gli avvisi e i numeri di pagina;</w:t>
       </w:r>
     </w:p>
     <w:p>
@@ -38362,6 +38788,26 @@
           <w:sz w:val="21"/>
           <w:szCs w:val="21"/>
         </w:rPr>
+        <w:t xml:space="preserve">Dati inseriti</w:t>
+      </w:r>
+      <w:r>
+        <w:rPr>
+          <w:rFonts w:ascii="Arial" w:cs="Arial" w:eastAsia="Arial" w:hAnsi="Arial"/>
+          <w:color w:val="1B2118"/>
+          <w:sz w:val="21"/>
+          <w:szCs w:val="21"/>
+        </w:rPr>
+        <w:t xml:space="preserve"> (tutti i valori della pagina, per rifare la simulazione), </w:t>
+      </w:r>
+      <w:r>
+        <w:rPr>
+          <w:rFonts w:ascii="Arial" w:cs="Arial" w:eastAsia="Arial" w:hAnsi="Arial"/>
+          <w:b/>
+          <w:bCs/>
+          <w:color w:val="1B2118"/>
+          <w:sz w:val="21"/>
+          <w:szCs w:val="21"/>
+        </w:rPr>
         <w:t xml:space="preserve">Anni</w:t>
       </w:r>
       <w:r>
@@ -38371,7 +38817,7 @@
           <w:sz w:val="21"/>
           <w:szCs w:val="21"/>
         </w:rPr>
-        <w:t xml:space="preserve">, </w:t>
+        <w:t xml:space="preserve"> (con il totale), </w:t>
       </w:r>
       <w:r>
         <w:rPr>
@@ -46515,7 +46961,7 @@
         <w:szCs w:val="16"/>
       </w:rPr>
       <w:tab/>
-      <w:t xml:space="preserve">Manuale Amministratore · Rev. 4.7 · 21/10/2026</w:t>
+      <w:t xml:space="preserve">Manuale Amministratore · Rev. 4.8 · 21/10/2026</w:t>
     </w:r>
   </w:p>
 </w:hdr>
@@ -46580,7 +47026,7 @@
         <w:szCs w:val="16"/>
       </w:rPr>
       <w:tab/>
-      <w:t xml:space="preserve">Manuale Amministratore · Rev. 4.7 · 21/10/2026</w:t>
+      <w:t xml:space="preserve">Manuale Amministratore · Rev. 4.8 · 21/10/2026</w:t>
     </w:r>
   </w:p>
 </w:hdr>

</xml_diff>

<commit_message>
Documentazione: attivazione delle News, ISS-036 (Bing News), loghi nella pagina di accesso
Co-Authored-By: Claude Opus 5.5 <noreply@anthropic.com>
Claude-Session: https://claude.ai/code/session_01E8XCbEeVHWVP3hntUZ6kZ1
</commit_message>
<xml_diff>
--- a/public/documentazione/Manuale_Amministratore_Portale_CWP.docx
+++ b/public/documentazione/Manuale_Amministratore_Portale_CWP.docx
@@ -783,7 +783,7 @@
                 <w:sz w:val="18"/>
                 <w:szCs w:val="18"/>
               </w:rPr>
-              <w:t xml:space="preserve">Nuovo capitolo «News»: osservatorio sui crediti di carbonio volontari.</w:t>
+              <w:t xml:space="preserve">Nuovo capitolo «News»: osservatorio sui crediti di carbonio volontari. Canali Bing News e Verra.</w:t>
             </w:r>
           </w:p>
         </w:tc>
@@ -8913,7 +8913,7 @@
         </w:rPr>
         <w:t xml:space="preserve">Si accede da </w:t>
       </w:r>
-      <w:hyperlink w:history="1" r:id="rId924maazsz-nesyb-nsfvb">
+      <w:hyperlink w:history="1" r:id="rIdtiqyr_tbf5uor7ok5b5ja">
         <w:r>
           <w:rPr>
             <w:rFonts w:ascii="Arial" w:cs="Arial" w:eastAsia="Arial" w:hAnsi="Arial"/>
@@ -44701,7 +44701,7 @@
           <w:sz w:val="21"/>
           <w:szCs w:val="21"/>
         </w:rPr>
-        <w:t xml:space="preserve">su Google News, con 12 ricerche mirate in italiano e in inglese;</w:t>
+        <w:t xml:space="preserve">su Bing News, con 12 ricerche mirate in italiano e in inglese;</w:t>
       </w:r>
     </w:p>
     <w:p>
@@ -44720,7 +44720,7 @@
           <w:sz w:val="21"/>
           <w:szCs w:val="21"/>
         </w:rPr>
-        <w:t xml:space="preserve">su tre siti specializzati: Carbon Herald, Ecosystem Marketplace, CarbonCredits.com.</w:t>
+        <w:t xml:space="preserve">su quattro siti specializzati: Carbon Herald, CarbonCredits.com, Ecosystem Marketplace e Verra.</w:t>
       </w:r>
     </w:p>
     <w:p>

</xml_diff>

<commit_message>
Manuale Amministratore: righe della tabella dei ruoli nel posto giusto
Co-Authored-By: Claude Opus 5.5 <noreply@anthropic.com>
Claude-Session: https://claude.ai/code/session_01E8XCbEeVHWVP3hntUZ6kZ1
</commit_message>
<xml_diff>
--- a/public/documentazione/Manuale_Amministratore_Portale_CWP.docx
+++ b/public/documentazione/Manuale_Amministratore_Portale_CWP.docx
@@ -8616,116 +8616,36 @@
           </w:p>
         </w:tc>
       </w:tr>
-    </w:tbl>
-    <w:p>
-      <w:pPr>
-        <w:spacing w:after="160"/>
-      </w:pPr>
-    </w:p>
-    <w:p>
-      <w:pPr>
-        <w:spacing w:after="140" w:line="300"/>
-      </w:pPr>
-      <w:r>
-        <w:rPr>
-          <w:rFonts w:ascii="Arial" w:cs="Arial" w:eastAsia="Arial" w:hAnsi="Arial"/>
-          <w:color w:val="1B2118"/>
-          <w:sz w:val="21"/>
-          <w:szCs w:val="21"/>
-        </w:rPr>
-        <w:t xml:space="preserve">Gli </w:t>
-      </w:r>
-      <w:r>
-        <w:rPr>
-          <w:rFonts w:ascii="Arial" w:cs="Arial" w:eastAsia="Arial" w:hAnsi="Arial"/>
-          <w:b/>
-          <w:bCs/>
-          <w:color w:val="1B2118"/>
-          <w:sz w:val="21"/>
-          <w:szCs w:val="21"/>
-        </w:rPr>
-        <w:t xml:space="preserve">Amministratori</w:t>
-      </w:r>
-      <w:r>
-        <w:rPr>
-          <w:rFonts w:ascii="Arial" w:cs="Arial" w:eastAsia="Arial" w:hAnsi="Arial"/>
-          <w:color w:val="1B2118"/>
-          <w:sz w:val="21"/>
-          <w:szCs w:val="21"/>
-        </w:rPr>
-        <w:t xml:space="preserve"> possono essere più di uno e hanno tutti accesso completo a tutti i dati. Un Amministratore può nominare altri Amministratori (capitolo «Gestione utenti»). L'</w:t>
-      </w:r>
-      <w:r>
-        <w:rPr>
-          <w:rFonts w:ascii="Arial" w:cs="Arial" w:eastAsia="Arial" w:hAnsi="Arial"/>
-          <w:b/>
-          <w:bCs/>
-          <w:color w:val="1B2118"/>
-          <w:sz w:val="21"/>
-          <w:szCs w:val="21"/>
-        </w:rPr>
-        <w:t xml:space="preserve">Amministratore principale</w:t>
-      </w:r>
-      <w:r>
-        <w:rPr>
-          <w:rFonts w:ascii="Arial" w:cs="Arial" w:eastAsia="Arial" w:hAnsi="Arial"/>
-          <w:color w:val="1B2118"/>
-          <w:sz w:val="21"/>
-          <w:szCs w:val="21"/>
-        </w:rPr>
-        <w:t xml:space="preserve"> è luca.moretti@operate.it: nessuno lo può modificare, disattivare o cancellare.</w:t>
-      </w:r>
-    </w:p>
-    <w:tbl>
-      <w:tblPr>
-        <w:tblW w:type="dxa" w:w="9638"/>
-        <w:tblBorders>
-          <w:top w:val="single" w:color="auto" w:sz="4"/>
-          <w:left w:val="single" w:color="auto" w:sz="4"/>
-          <w:bottom w:val="single" w:color="auto" w:sz="4"/>
-          <w:right w:val="single" w:color="auto" w:sz="4"/>
-          <w:insideH w:val="single" w:color="auto" w:sz="4"/>
-          <w:insideV w:val="single" w:color="auto" w:sz="4"/>
-        </w:tblBorders>
-        <w:tblLayout w:type="fixed"/>
-      </w:tblPr>
-      <w:tblGrid>
-        <w:gridCol w:w="6325"/>
-        <w:gridCol w:w="1657"/>
-        <w:gridCol w:w="1656"/>
-      </w:tblGrid>
       <w:tr>
         <w:trPr>
-          <w:tblHeader/>
+          <w:cantSplit/>
         </w:trPr>
         <w:tc>
           <w:tcPr>
-            <w:tcW w:type="dxa" w:w="6325"/>
-            <w:tcBorders>
-              <w:top w:val="single" w:color="D9D4C5" w:sz="4"/>
-              <w:left w:val="single" w:color="D9D4C5" w:sz="4"/>
-              <w:bottom w:val="single" w:color="D9D4C5" w:sz="4"/>
-              <w:right w:val="single" w:color="D9D4C5" w:sz="4"/>
-            </w:tcBorders>
-            <w:shd w:fill="2F5D3A" w:color="auto" w:val="clear"/>
-            <w:tcMar>
-              <w:top w:type="dxa" w:w="70"/>
-              <w:left w:type="dxa" w:w="110"/>
-              <w:bottom w:type="dxa" w:w="70"/>
-              <w:right w:type="dxa" w:w="110"/>
-            </w:tcMar>
-            <w:vAlign w:val="center"/>
-          </w:tcPr>
-          <w:p>
-            <w:pPr>
-              <w:spacing w:after="0" w:before="0"/>
-            </w:pPr>
-            <w:r>
-              <w:rPr>
-                <w:rFonts w:ascii="Arial" w:cs="Arial" w:eastAsia="Arial" w:hAnsi="Arial"/>
-                <w:b/>
-                <w:bCs/>
-                <w:color w:val="FFFFFF"/>
+            <w:tcW w:type="dxa" w:w="5449"/>
+            <w:tcBorders>
+              <w:top w:val="single" w:color="D9D4C5" w:sz="4"/>
+              <w:left w:val="single" w:color="D9D4C5" w:sz="4"/>
+              <w:bottom w:val="single" w:color="D9D4C5" w:sz="4"/>
+              <w:right w:val="single" w:color="D9D4C5" w:sz="4"/>
+            </w:tcBorders>
+            <w:shd w:fill="F6F4EE" w:color="auto" w:val="clear"/>
+            <w:tcMar>
+              <w:top w:type="dxa" w:w="70"/>
+              <w:left w:type="dxa" w:w="110"/>
+              <w:bottom w:type="dxa" w:w="70"/>
+              <w:right w:type="dxa" w:w="110"/>
+            </w:tcMar>
+            <w:vAlign w:val="center"/>
+          </w:tcPr>
+          <w:p>
+            <w:pPr>
+              <w:spacing w:after="0" w:before="0"/>
+            </w:pPr>
+            <w:r>
+              <w:rPr>
+                <w:rFonts w:ascii="Arial" w:cs="Arial" w:eastAsia="Arial" w:hAnsi="Arial"/>
+                <w:color w:val="1B2118"/>
                 <w:sz w:val="18"/>
                 <w:szCs w:val="18"/>
               </w:rPr>
@@ -8735,32 +8655,30 @@
         </w:tc>
         <w:tc>
           <w:tcPr>
-            <w:tcW w:type="dxa" w:w="1657"/>
-            <w:tcBorders>
-              <w:top w:val="single" w:color="D9D4C5" w:sz="4"/>
-              <w:left w:val="single" w:color="D9D4C5" w:sz="4"/>
-              <w:bottom w:val="single" w:color="D9D4C5" w:sz="4"/>
-              <w:right w:val="single" w:color="D9D4C5" w:sz="4"/>
-            </w:tcBorders>
-            <w:shd w:fill="2F5D3A" w:color="auto" w:val="clear"/>
-            <w:tcMar>
-              <w:top w:type="dxa" w:w="70"/>
-              <w:left w:type="dxa" w:w="110"/>
-              <w:bottom w:type="dxa" w:w="70"/>
-              <w:right w:type="dxa" w:w="110"/>
-            </w:tcMar>
-            <w:vAlign w:val="center"/>
-          </w:tcPr>
-          <w:p>
-            <w:pPr>
-              <w:spacing w:after="0" w:before="0"/>
-            </w:pPr>
-            <w:r>
-              <w:rPr>
-                <w:rFonts w:ascii="Arial" w:cs="Arial" w:eastAsia="Arial" w:hAnsi="Arial"/>
-                <w:b/>
-                <w:bCs/>
-                <w:color w:val="FFFFFF"/>
+            <w:tcW w:type="dxa" w:w="2179"/>
+            <w:tcBorders>
+              <w:top w:val="single" w:color="D9D4C5" w:sz="4"/>
+              <w:left w:val="single" w:color="D9D4C5" w:sz="4"/>
+              <w:bottom w:val="single" w:color="D9D4C5" w:sz="4"/>
+              <w:right w:val="single" w:color="D9D4C5" w:sz="4"/>
+            </w:tcBorders>
+            <w:shd w:fill="F6F4EE" w:color="auto" w:val="clear"/>
+            <w:tcMar>
+              <w:top w:type="dxa" w:w="70"/>
+              <w:left w:type="dxa" w:w="110"/>
+              <w:bottom w:type="dxa" w:w="70"/>
+              <w:right w:type="dxa" w:w="110"/>
+            </w:tcMar>
+            <w:vAlign w:val="center"/>
+          </w:tcPr>
+          <w:p>
+            <w:pPr>
+              <w:spacing w:after="0" w:before="0"/>
+            </w:pPr>
+            <w:r>
+              <w:rPr>
+                <w:rFonts w:ascii="Arial" w:cs="Arial" w:eastAsia="Arial" w:hAnsi="Arial"/>
+                <w:color w:val="1B2118"/>
                 <w:sz w:val="18"/>
                 <w:szCs w:val="18"/>
               </w:rPr>
@@ -8770,32 +8688,131 @@
         </w:tc>
         <w:tc>
           <w:tcPr>
-            <w:tcW w:type="dxa" w:w="1656"/>
-            <w:tcBorders>
-              <w:top w:val="single" w:color="D9D4C5" w:sz="4"/>
-              <w:left w:val="single" w:color="D9D4C5" w:sz="4"/>
-              <w:bottom w:val="single" w:color="D9D4C5" w:sz="4"/>
-              <w:right w:val="single" w:color="D9D4C5" w:sz="4"/>
-            </w:tcBorders>
-            <w:shd w:fill="2F5D3A" w:color="auto" w:val="clear"/>
-            <w:tcMar>
-              <w:top w:type="dxa" w:w="70"/>
-              <w:left w:type="dxa" w:w="110"/>
-              <w:bottom w:type="dxa" w:w="70"/>
-              <w:right w:type="dxa" w:w="110"/>
-            </w:tcMar>
-            <w:vAlign w:val="center"/>
-          </w:tcPr>
-          <w:p>
-            <w:pPr>
-              <w:spacing w:after="0" w:before="0"/>
-            </w:pPr>
-            <w:r>
-              <w:rPr>
-                <w:rFonts w:ascii="Arial" w:cs="Arial" w:eastAsia="Arial" w:hAnsi="Arial"/>
-                <w:b/>
-                <w:bCs/>
-                <w:color w:val="FFFFFF"/>
+            <w:tcW w:type="dxa" w:w="2010"/>
+            <w:tcBorders>
+              <w:top w:val="single" w:color="D9D4C5" w:sz="4"/>
+              <w:left w:val="single" w:color="D9D4C5" w:sz="4"/>
+              <w:bottom w:val="single" w:color="D9D4C5" w:sz="4"/>
+              <w:right w:val="single" w:color="D9D4C5" w:sz="4"/>
+            </w:tcBorders>
+            <w:shd w:fill="F6F4EE" w:color="auto" w:val="clear"/>
+            <w:tcMar>
+              <w:top w:type="dxa" w:w="70"/>
+              <w:left w:type="dxa" w:w="110"/>
+              <w:bottom w:type="dxa" w:w="70"/>
+              <w:right w:type="dxa" w:w="110"/>
+            </w:tcMar>
+            <w:vAlign w:val="center"/>
+          </w:tcPr>
+          <w:p>
+            <w:pPr>
+              <w:spacing w:after="0" w:before="0"/>
+            </w:pPr>
+            <w:r>
+              <w:rPr>
+                <w:rFonts w:ascii="Arial" w:cs="Arial" w:eastAsia="Arial" w:hAnsi="Arial"/>
+                <w:color w:val="1B2118"/>
+                <w:sz w:val="18"/>
+                <w:szCs w:val="18"/>
+              </w:rPr>
+              <w:t xml:space="preserve">sì</w:t>
+            </w:r>
+          </w:p>
+        </w:tc>
+      </w:tr>
+      <w:tr>
+        <w:trPr>
+          <w:cantSplit/>
+        </w:trPr>
+        <w:tc>
+          <w:tcPr>
+            <w:tcW w:type="dxa" w:w="5449"/>
+            <w:tcBorders>
+              <w:top w:val="single" w:color="D9D4C5" w:sz="4"/>
+              <w:left w:val="single" w:color="D9D4C5" w:sz="4"/>
+              <w:bottom w:val="single" w:color="D9D4C5" w:sz="4"/>
+              <w:right w:val="single" w:color="D9D4C5" w:sz="4"/>
+            </w:tcBorders>
+            <w:tcMar>
+              <w:top w:type="dxa" w:w="70"/>
+              <w:left w:type="dxa" w:w="110"/>
+              <w:bottom w:type="dxa" w:w="70"/>
+              <w:right w:type="dxa" w:w="110"/>
+            </w:tcMar>
+            <w:vAlign w:val="center"/>
+          </w:tcPr>
+          <w:p>
+            <w:pPr>
+              <w:spacing w:after="0" w:before="0"/>
+            </w:pPr>
+            <w:r>
+              <w:rPr>
+                <w:rFonts w:ascii="Arial" w:cs="Arial" w:eastAsia="Arial" w:hAnsi="Arial"/>
+                <w:color w:val="1B2118"/>
+                <w:sz w:val="18"/>
+                <w:szCs w:val="18"/>
+              </w:rPr>
+              <w:t xml:space="preserve">Notizie CO2: osservatorio sui crediti di carbonio volontari</w:t>
+            </w:r>
+          </w:p>
+        </w:tc>
+        <w:tc>
+          <w:tcPr>
+            <w:tcW w:type="dxa" w:w="2179"/>
+            <w:tcBorders>
+              <w:top w:val="single" w:color="D9D4C5" w:sz="4"/>
+              <w:left w:val="single" w:color="D9D4C5" w:sz="4"/>
+              <w:bottom w:val="single" w:color="D9D4C5" w:sz="4"/>
+              <w:right w:val="single" w:color="D9D4C5" w:sz="4"/>
+            </w:tcBorders>
+            <w:tcMar>
+              <w:top w:type="dxa" w:w="70"/>
+              <w:left w:type="dxa" w:w="110"/>
+              <w:bottom w:type="dxa" w:w="70"/>
+              <w:right w:type="dxa" w:w="110"/>
+            </w:tcMar>
+            <w:vAlign w:val="center"/>
+          </w:tcPr>
+          <w:p>
+            <w:pPr>
+              <w:spacing w:after="0" w:before="0"/>
+            </w:pPr>
+            <w:r>
+              <w:rPr>
+                <w:rFonts w:ascii="Arial" w:cs="Arial" w:eastAsia="Arial" w:hAnsi="Arial"/>
+                <w:color w:val="1B2118"/>
+                <w:sz w:val="18"/>
+                <w:szCs w:val="18"/>
+              </w:rPr>
+              <w:t xml:space="preserve">—</w:t>
+            </w:r>
+          </w:p>
+        </w:tc>
+        <w:tc>
+          <w:tcPr>
+            <w:tcW w:type="dxa" w:w="2010"/>
+            <w:tcBorders>
+              <w:top w:val="single" w:color="D9D4C5" w:sz="4"/>
+              <w:left w:val="single" w:color="D9D4C5" w:sz="4"/>
+              <w:bottom w:val="single" w:color="D9D4C5" w:sz="4"/>
+              <w:right w:val="single" w:color="D9D4C5" w:sz="4"/>
+            </w:tcBorders>
+            <w:tcMar>
+              <w:top w:type="dxa" w:w="70"/>
+              <w:left w:type="dxa" w:w="110"/>
+              <w:bottom w:type="dxa" w:w="70"/>
+              <w:right w:type="dxa" w:w="110"/>
+            </w:tcMar>
+            <w:vAlign w:val="center"/>
+          </w:tcPr>
+          <w:p>
+            <w:pPr>
+              <w:spacing w:after="0" w:before="0"/>
+            </w:pPr>
+            <w:r>
+              <w:rPr>
+                <w:rFonts w:ascii="Arial" w:cs="Arial" w:eastAsia="Arial" w:hAnsi="Arial"/>
+                <w:color w:val="1B2118"/>
                 <w:sz w:val="18"/>
                 <w:szCs w:val="18"/>
               </w:rPr>
@@ -8809,6 +8826,60 @@
       <w:pPr>
         <w:spacing w:after="160"/>
       </w:pPr>
+    </w:p>
+    <w:p>
+      <w:pPr>
+        <w:spacing w:after="140" w:line="300"/>
+      </w:pPr>
+      <w:r>
+        <w:rPr>
+          <w:rFonts w:ascii="Arial" w:cs="Arial" w:eastAsia="Arial" w:hAnsi="Arial"/>
+          <w:color w:val="1B2118"/>
+          <w:sz w:val="21"/>
+          <w:szCs w:val="21"/>
+        </w:rPr>
+        <w:t xml:space="preserve">Gli </w:t>
+      </w:r>
+      <w:r>
+        <w:rPr>
+          <w:rFonts w:ascii="Arial" w:cs="Arial" w:eastAsia="Arial" w:hAnsi="Arial"/>
+          <w:b/>
+          <w:bCs/>
+          <w:color w:val="1B2118"/>
+          <w:sz w:val="21"/>
+          <w:szCs w:val="21"/>
+        </w:rPr>
+        <w:t xml:space="preserve">Amministratori</w:t>
+      </w:r>
+      <w:r>
+        <w:rPr>
+          <w:rFonts w:ascii="Arial" w:cs="Arial" w:eastAsia="Arial" w:hAnsi="Arial"/>
+          <w:color w:val="1B2118"/>
+          <w:sz w:val="21"/>
+          <w:szCs w:val="21"/>
+        </w:rPr>
+        <w:t xml:space="preserve"> possono essere più di uno e hanno tutti accesso completo a tutti i dati. Un Amministratore può nominare altri Amministratori (capitolo «Gestione utenti»). L'</w:t>
+      </w:r>
+      <w:r>
+        <w:rPr>
+          <w:rFonts w:ascii="Arial" w:cs="Arial" w:eastAsia="Arial" w:hAnsi="Arial"/>
+          <w:b/>
+          <w:bCs/>
+          <w:color w:val="1B2118"/>
+          <w:sz w:val="21"/>
+          <w:szCs w:val="21"/>
+        </w:rPr>
+        <w:t xml:space="preserve">Amministratore principale</w:t>
+      </w:r>
+      <w:r>
+        <w:rPr>
+          <w:rFonts w:ascii="Arial" w:cs="Arial" w:eastAsia="Arial" w:hAnsi="Arial"/>
+          <w:color w:val="1B2118"/>
+          <w:sz w:val="21"/>
+          <w:szCs w:val="21"/>
+        </w:rPr>
+        <w:t xml:space="preserve"> è luca.moretti@operate.it: nessuno lo può modificare, disattivare o cancellare.</w:t>
+      </w:r>
     </w:p>
     <w:p>
       <w:pPr>
@@ -9046,7 +9117,7 @@
         </w:rPr>
         <w:t xml:space="preserve">Si accede da </w:t>
       </w:r>
-      <w:hyperlink w:history="1" r:id="rIdwvhrc5686yoyngy7wridr">
+      <w:hyperlink w:history="1" r:id="rIdhiwpr25g1zwn6olyyindo">
         <w:r>
           <w:rPr>
             <w:rFonts w:ascii="Arial" w:cs="Arial" w:eastAsia="Arial" w:hAnsi="Arial"/>

</xml_diff>

<commit_message>
Navigazione da smartphone: menu a pannello, schede in Dashboard e Audit, elenco e dettaglio delle pratiche uno alla volta, campi a 16 px, assistente a schermo intero (ISS-038)
Co-Authored-By: Claude Opus 5.5 <noreply@anthropic.com>
Claude-Session: https://claude.ai/code/session_01E8XCbEeVHWVP3hntUZ6kZ1
</commit_message>
<xml_diff>
--- a/public/documentazione/Manuale_Amministratore_Portale_CWP.docx
+++ b/public/documentazione/Manuale_Amministratore_Portale_CWP.docx
@@ -302,7 +302,7 @@
                 <w:sz w:val="20"/>
                 <w:szCs w:val="20"/>
               </w:rPr>
-              <w:t xml:space="preserve">Rev. 5.1</w:t>
+              <w:t xml:space="preserve">Rev. 5.2</w:t>
             </w:r>
           </w:p>
         </w:tc>
@@ -719,7 +719,7 @@
                 <w:sz w:val="18"/>
                 <w:szCs w:val="18"/>
               </w:rPr>
-              <w:t xml:space="preserve">5.1</w:t>
+              <w:t xml:space="preserve">5.2</w:t>
             </w:r>
           </w:p>
         </w:tc>
@@ -783,7 +783,7 @@
                 <w:sz w:val="18"/>
                 <w:szCs w:val="18"/>
               </w:rPr>
-              <w:t xml:space="preserve">Rilievi N01-N06: costi una tantum in 10 rate, feedback pubblico e fase 3, ente prima della fase 5, riquadro «Fase aperta senza scadenza», avviso sui codici, frazioni del fattore dell'indifferenziato.</w:t>
+              <w:t xml:space="preserve">Uso dal telefono: menu a pannello, schede in Dashboard e Audit, elenco e dettaglio delle pratiche.</w:t>
             </w:r>
           </w:p>
         </w:tc>
@@ -853,7 +853,7 @@
                 <w:sz w:val="18"/>
                 <w:szCs w:val="18"/>
               </w:rPr>
-              <w:t xml:space="preserve">5.0</w:t>
+              <w:t xml:space="preserve">5.1</w:t>
             </w:r>
           </w:p>
         </w:tc>
@@ -886,7 +886,7 @@
                 <w:sz w:val="18"/>
                 <w:szCs w:val="18"/>
               </w:rPr>
-              <w:t xml:space="preserve">21/10/2026</w:t>
+              <w:t xml:space="preserve">22/10/2026</w:t>
             </w:r>
           </w:p>
         </w:tc>
@@ -919,7 +919,7 @@
                 <w:sz w:val="18"/>
                 <w:szCs w:val="18"/>
               </w:rPr>
-              <w:t xml:space="preserve">«News» diventa «Notizie CO2»; Google News attraverso il tramite; barra a LED nell'elenco e nella pratica. Pallino verde delle Notizie CO2 nuove. Notizie CO2: siti di notizie ambientali al posto di Google News. Notizie CO2: siti di notizie ambientali al posto di Google News.</w:t>
+              <w:t xml:space="preserve">Rilievi N01-N06: costi una tantum in 10 rate, feedback pubblico e fase 3, ente prima della fase 5, riquadro «Fase aperta senza scadenza», avviso sui codici, frazioni del fattore dell'indifferenziato.</w:t>
             </w:r>
           </w:p>
         </w:tc>
@@ -989,7 +989,7 @@
                 <w:sz w:val="18"/>
                 <w:szCs w:val="18"/>
               </w:rPr>
-              <w:t xml:space="preserve">4.9</w:t>
+              <w:t xml:space="preserve">5.0</w:t>
             </w:r>
           </w:p>
         </w:tc>
@@ -1053,7 +1053,7 @@
                 <w:sz w:val="18"/>
                 <w:szCs w:val="18"/>
               </w:rPr>
-              <w:t xml:space="preserve">Nuovo capitolo «News»: osservatorio sui crediti di carbonio volontari. Canali Bing News e Verra.</w:t>
+              <w:t xml:space="preserve">«News» diventa «Notizie CO2»; Google News attraverso il tramite; barra a LED nell'elenco e nella pratica. Pallino verde delle Notizie CO2 nuove. Notizie CO2: siti di notizie ambientali al posto di Google News. Notizie CO2: siti di notizie ambientali al posto di Google News.</w:t>
             </w:r>
           </w:p>
         </w:tc>
@@ -1123,7 +1123,7 @@
                 <w:sz w:val="18"/>
                 <w:szCs w:val="18"/>
               </w:rPr>
-              <w:t xml:space="preserve">4.8</w:t>
+              <w:t xml:space="preserve">4.9</w:t>
             </w:r>
           </w:p>
         </w:tc>
@@ -1189,7 +1189,7 @@
                 <w:sz w:val="18"/>
                 <w:szCs w:val="18"/>
               </w:rPr>
-              <w:t xml:space="preserve">Simulatore: il PDF scaricato riporta tutti i dati della pagina, i costi e i grafici; foglio Excel «Dati inseriti».</w:t>
+              <w:t xml:space="preserve">Nuovo capitolo «News»: osservatorio sui crediti di carbonio volontari. Canali Bing News e Verra.</w:t>
             </w:r>
           </w:p>
         </w:tc>
@@ -1259,7 +1259,7 @@
                 <w:sz w:val="18"/>
                 <w:szCs w:val="18"/>
               </w:rPr>
-              <w:t xml:space="preserve">4.7</w:t>
+              <w:t xml:space="preserve">4.8</w:t>
             </w:r>
           </w:p>
         </w:tc>
@@ -1323,7 +1323,7 @@
                 <w:sz w:val="18"/>
                 <w:szCs w:val="18"/>
               </w:rPr>
-              <w:t xml:space="preserve">Assistente per gli Operatori e domande sulla pratica aperta; menu dell'Operatore con il Simulatore.</w:t>
+              <w:t xml:space="preserve">Simulatore: il PDF scaricato riporta tutti i dati della pagina, i costi e i grafici; foglio Excel «Dati inseriti».</w:t>
             </w:r>
           </w:p>
         </w:tc>
@@ -1393,7 +1393,7 @@
                 <w:sz w:val="18"/>
                 <w:szCs w:val="18"/>
               </w:rPr>
-              <w:t xml:space="preserve">4.6</w:t>
+              <w:t xml:space="preserve">4.7</w:t>
             </w:r>
           </w:p>
         </w:tc>
@@ -1459,7 +1459,7 @@
                 <w:sz w:val="18"/>
                 <w:szCs w:val="18"/>
               </w:rPr>
-              <w:t xml:space="preserve">Capitolo «Backup automatico».</w:t>
+              <w:t xml:space="preserve">Assistente per gli Operatori e domande sulla pratica aperta; menu dell'Operatore con il Simulatore.</w:t>
             </w:r>
           </w:p>
         </w:tc>
@@ -1529,7 +1529,7 @@
                 <w:sz w:val="18"/>
                 <w:szCs w:val="18"/>
               </w:rPr>
-              <w:t xml:space="preserve">4.5</w:t>
+              <w:t xml:space="preserve">4.6</w:t>
             </w:r>
           </w:p>
         </w:tc>
@@ -1593,7 +1593,7 @@
                 <w:sz w:val="18"/>
                 <w:szCs w:val="18"/>
               </w:rPr>
-              <w:t xml:space="preserve">Nuovo documento «Registro issue e test» tra quelli scaricabili.</w:t>
+              <w:t xml:space="preserve">Capitolo «Backup automatico».</w:t>
             </w:r>
           </w:p>
         </w:tc>
@@ -1663,7 +1663,7 @@
                 <w:sz w:val="18"/>
                 <w:szCs w:val="18"/>
               </w:rPr>
-              <w:t xml:space="preserve">4.4</w:t>
+              <w:t xml:space="preserve">4.5</w:t>
             </w:r>
           </w:p>
         </w:tc>
@@ -1729,7 +1729,7 @@
                 <w:sz w:val="18"/>
                 <w:szCs w:val="18"/>
               </w:rPr>
-              <w:t xml:space="preserve">Collaudo V05: testo completo dei valori lunghi nell'Audit (Prima/Dopo, Tolto/Aggiunto), denominazione delle organizzazioni e ricerca sui valori cambiati; pagina «Account disattivato».</w:t>
+              <w:t xml:space="preserve">Nuovo documento «Registro issue e test» tra quelli scaricabili.</w:t>
             </w:r>
           </w:p>
         </w:tc>
@@ -1799,7 +1799,7 @@
                 <w:sz w:val="18"/>
                 <w:szCs w:val="18"/>
               </w:rPr>
-              <w:t xml:space="preserve">4.3</w:t>
+              <w:t xml:space="preserve">4.4</w:t>
             </w:r>
           </w:p>
         </w:tc>
@@ -1831,7 +1831,7 @@
                 <w:sz w:val="18"/>
                 <w:szCs w:val="18"/>
               </w:rPr>
-              <w:t xml:space="preserve">20/10/2026</w:t>
+              <w:t xml:space="preserve">21/10/2026</w:t>
             </w:r>
           </w:p>
         </w:tc>
@@ -1863,7 +1863,7 @@
                 <w:sz w:val="18"/>
                 <w:szCs w:val="18"/>
               </w:rPr>
-              <w:t xml:space="preserve">Correzioni del collaudo V01: import CSV della Banca Dati «tutto o niente» senza valori negativi, calcolo bloccato con dati non ammessi, buffer manuale 0-80%, conferma definitiva solo senza errori di coerenza, dati non ammessi nel simulatore e zero esplicito nei prezzi, colonna «Oggetto e modifiche» nell'Audit.</w:t>
+              <w:t xml:space="preserve">Collaudo V05: testo completo dei valori lunghi nell'Audit (Prima/Dopo, Tolto/Aggiunto), denominazione delle organizzazioni e ricerca sui valori cambiati; pagina «Account disattivato».</w:t>
             </w:r>
           </w:p>
         </w:tc>
@@ -1933,7 +1933,7 @@
                 <w:sz w:val="18"/>
                 <w:szCs w:val="18"/>
               </w:rPr>
-              <w:t xml:space="preserve">4.2</w:t>
+              <w:t xml:space="preserve">4.3</w:t>
             </w:r>
           </w:p>
         </w:tc>
@@ -1999,7 +1999,7 @@
                 <w:sz w:val="18"/>
                 <w:szCs w:val="18"/>
               </w:rPr>
-              <w:t xml:space="preserve">Nuovo capitolo «Sicurezza»: inattività, avvisi, protezioni del sito e del database.</w:t>
+              <w:t xml:space="preserve">Correzioni del collaudo V01: import CSV della Banca Dati «tutto o niente» senza valori negativi, calcolo bloccato con dati non ammessi, buffer manuale 0-80%, conferma definitiva solo senza errori di coerenza, dati non ammessi nel simulatore e zero esplicito nei prezzi, colonna «Oggetto e modifiche» nell'Audit.</w:t>
             </w:r>
           </w:p>
         </w:tc>
@@ -2069,7 +2069,7 @@
                 <w:sz w:val="18"/>
                 <w:szCs w:val="18"/>
               </w:rPr>
-              <w:t xml:space="preserve">4.1</w:t>
+              <w:t xml:space="preserve">4.2</w:t>
             </w:r>
           </w:p>
         </w:tc>
@@ -2133,7 +2133,7 @@
                 <w:sz w:val="18"/>
                 <w:szCs w:val="18"/>
               </w:rPr>
-              <w:t xml:space="preserve">Voci di menu degli enti aggiornate.</w:t>
+              <w:t xml:space="preserve">Nuovo capitolo «Sicurezza»: inattività, avvisi, protezioni del sito e del database.</w:t>
             </w:r>
           </w:p>
         </w:tc>
@@ -2203,7 +2203,7 @@
                 <w:sz w:val="18"/>
                 <w:szCs w:val="18"/>
               </w:rPr>
-              <w:t xml:space="preserve">4.0</w:t>
+              <w:t xml:space="preserve">4.1</w:t>
             </w:r>
           </w:p>
         </w:tc>
@@ -2269,7 +2269,7 @@
                 <w:sz w:val="18"/>
                 <w:szCs w:val="18"/>
               </w:rPr>
-              <w:t xml:space="preserve">Nuovo ordine del menu; la sezione si chiama «Audit User». Voce «Marketplaces» in arrivo.</w:t>
+              <w:t xml:space="preserve">Voci di menu degli enti aggiornate.</w:t>
             </w:r>
           </w:p>
         </w:tc>
@@ -2339,7 +2339,7 @@
                 <w:sz w:val="18"/>
                 <w:szCs w:val="18"/>
               </w:rPr>
-              <w:t xml:space="preserve">3.9</w:t>
+              <w:t xml:space="preserve">4.0</w:t>
             </w:r>
           </w:p>
         </w:tc>
@@ -2403,7 +2403,7 @@
                 <w:sz w:val="18"/>
                 <w:szCs w:val="18"/>
               </w:rPr>
-              <w:t xml:space="preserve">Nuovo capitolo «Audit trail user».</w:t>
+              <w:t xml:space="preserve">Nuovo ordine del menu; la sezione si chiama «Audit User». Voce «Marketplaces» in arrivo.</w:t>
             </w:r>
           </w:p>
         </w:tc>
@@ -2473,7 +2473,7 @@
                 <w:sz w:val="18"/>
                 <w:szCs w:val="18"/>
               </w:rPr>
-              <w:t xml:space="preserve">3.8</w:t>
+              <w:t xml:space="preserve">3.9</w:t>
             </w:r>
           </w:p>
         </w:tc>
@@ -2539,7 +2539,7 @@
                 <w:sz w:val="18"/>
                 <w:szCs w:val="18"/>
               </w:rPr>
-              <w:t xml:space="preserve">Utenti online; PDF ed Excel del simulatore; messaggi d'errore dell'assistente.</w:t>
+              <w:t xml:space="preserve">Nuovo capitolo «Audit trail user».</w:t>
             </w:r>
           </w:p>
         </w:tc>
@@ -2609,7 +2609,7 @@
                 <w:sz w:val="18"/>
                 <w:szCs w:val="18"/>
               </w:rPr>
-              <w:t xml:space="preserve">3.7</w:t>
+              <w:t xml:space="preserve">3.8</w:t>
             </w:r>
           </w:p>
         </w:tc>
@@ -2641,7 +2641,7 @@
                 <w:sz w:val="18"/>
                 <w:szCs w:val="18"/>
               </w:rPr>
-              <w:t xml:space="preserve">19/10/2026</w:t>
+              <w:t xml:space="preserve">20/10/2026</w:t>
             </w:r>
           </w:p>
         </w:tc>
@@ -2673,7 +2673,7 @@
                 <w:sz w:val="18"/>
                 <w:szCs w:val="18"/>
               </w:rPr>
-              <w:t xml:space="preserve">Assistente virtuale: messaggio «Un attimo…» durante l'attesa.</w:t>
+              <w:t xml:space="preserve">Utenti online; PDF ed Excel del simulatore; messaggi d'errore dell'assistente.</w:t>
             </w:r>
           </w:p>
         </w:tc>
@@ -2743,7 +2743,7 @@
                 <w:sz w:val="18"/>
                 <w:szCs w:val="18"/>
               </w:rPr>
-              <w:t xml:space="preserve">3.6</w:t>
+              <w:t xml:space="preserve">3.7</w:t>
             </w:r>
           </w:p>
         </w:tc>
@@ -2809,7 +2809,7 @@
                 <w:sz w:val="18"/>
                 <w:szCs w:val="18"/>
               </w:rPr>
-              <w:t xml:space="preserve">Assistente virtuale attivo: chiave legata a uno spazio di lavoro, crediti e consumi.</w:t>
+              <w:t xml:space="preserve">Assistente virtuale: messaggio «Un attimo…» durante l'attesa.</w:t>
             </w:r>
           </w:p>
         </w:tc>
@@ -2879,7 +2879,7 @@
                 <w:sz w:val="18"/>
                 <w:szCs w:val="18"/>
               </w:rPr>
-              <w:t xml:space="preserve">3.5</w:t>
+              <w:t xml:space="preserve">3.6</w:t>
             </w:r>
           </w:p>
         </w:tc>
@@ -2943,7 +2943,7 @@
                 <w:sz w:val="18"/>
                 <w:szCs w:val="18"/>
               </w:rPr>
-              <w:t xml:space="preserve">Assistente virtuale; documenti ufficiali del Programma nella Documentazione.</w:t>
+              <w:t xml:space="preserve">Assistente virtuale attivo: chiave legata a uno spazio di lavoro, crediti e consumi.</w:t>
             </w:r>
           </w:p>
         </w:tc>
@@ -3013,7 +3013,7 @@
                 <w:sz w:val="18"/>
                 <w:szCs w:val="18"/>
               </w:rPr>
-              <w:t xml:space="preserve">3.4</w:t>
+              <w:t xml:space="preserve">3.5</w:t>
             </w:r>
           </w:p>
         </w:tc>
@@ -3079,7 +3079,7 @@
                 <w:sz w:val="18"/>
                 <w:szCs w:val="18"/>
               </w:rPr>
-              <w:t xml:space="preserve">Presentazione di riepilogo nella pagina Documentazione.</w:t>
+              <w:t xml:space="preserve">Assistente virtuale; documenti ufficiali del Programma nella Documentazione.</w:t>
             </w:r>
           </w:p>
         </w:tc>
@@ -3149,7 +3149,7 @@
                 <w:sz w:val="18"/>
                 <w:szCs w:val="18"/>
               </w:rPr>
-              <w:t xml:space="preserve">3.3</w:t>
+              <w:t xml:space="preserve">3.4</w:t>
             </w:r>
           </w:p>
         </w:tc>
@@ -3213,7 +3213,7 @@
                 <w:sz w:val="18"/>
                 <w:szCs w:val="18"/>
               </w:rPr>
-              <w:t xml:space="preserve">Ordinamento di tutte le tabelle e degli elenchi.</w:t>
+              <w:t xml:space="preserve">Presentazione di riepilogo nella pagina Documentazione.</w:t>
             </w:r>
           </w:p>
         </w:tc>
@@ -3283,7 +3283,7 @@
                 <w:sz w:val="18"/>
                 <w:szCs w:val="18"/>
               </w:rPr>
-              <w:t xml:space="preserve">3.2</w:t>
+              <w:t xml:space="preserve">3.3</w:t>
             </w:r>
           </w:p>
         </w:tc>
@@ -3349,7 +3349,7 @@
                 <w:sz w:val="18"/>
                 <w:szCs w:val="18"/>
               </w:rPr>
-              <w:t xml:space="preserve">Simulatore: metodo di stima per utenza (solo utenze virtuose), buffer del Capitolo 7, taratura.</w:t>
+              <w:t xml:space="preserve">Ordinamento di tutte le tabelle e degli elenchi.</w:t>
             </w:r>
           </w:p>
         </w:tc>
@@ -3419,7 +3419,7 @@
                 <w:sz w:val="18"/>
                 <w:szCs w:val="18"/>
               </w:rPr>
-              <w:t xml:space="preserve">3.1</w:t>
+              <w:t xml:space="preserve">3.2</w:t>
             </w:r>
           </w:p>
         </w:tc>
@@ -3483,7 +3483,7 @@
                 <w:sz w:val="18"/>
                 <w:szCs w:val="18"/>
               </w:rPr>
-              <w:t xml:space="preserve">Cruscotto diventa Dashboard; barra a LED delle 7 fasi per ogni pratica.</w:t>
+              <w:t xml:space="preserve">Simulatore: metodo di stima per utenza (solo utenze virtuose), buffer del Capitolo 7, taratura.</w:t>
             </w:r>
           </w:p>
         </w:tc>
@@ -3553,7 +3553,7 @@
                 <w:sz w:val="18"/>
                 <w:szCs w:val="18"/>
               </w:rPr>
-              <w:t xml:space="preserve">3.0</w:t>
+              <w:t xml:space="preserve">3.1</w:t>
             </w:r>
           </w:p>
         </w:tc>
@@ -3619,7 +3619,7 @@
                 <w:sz w:val="18"/>
                 <w:szCs w:val="18"/>
               </w:rPr>
-              <w:t xml:space="preserve">Eliminazione degli utenti che non hanno mai operato (script 30).</w:t>
+              <w:t xml:space="preserve">Cruscotto diventa Dashboard; barra a LED delle 7 fasi per ogni pratica.</w:t>
             </w:r>
           </w:p>
         </w:tc>
@@ -3689,7 +3689,7 @@
                 <w:sz w:val="18"/>
                 <w:szCs w:val="18"/>
               </w:rPr>
-              <w:t xml:space="preserve">2.9</w:t>
+              <w:t xml:space="preserve">3.0</w:t>
             </w:r>
           </w:p>
         </w:tc>
@@ -3753,7 +3753,7 @@
                 <w:sz w:val="18"/>
                 <w:szCs w:val="18"/>
               </w:rPr>
-              <w:t xml:space="preserve">Email automatica con le credenziali al nuovo utente e alla reimpostazione della password.</w:t>
+              <w:t xml:space="preserve">Eliminazione degli utenti che non hanno mai operato (script 30).</w:t>
             </w:r>
           </w:p>
         </w:tc>
@@ -3823,7 +3823,7 @@
                 <w:sz w:val="18"/>
                 <w:szCs w:val="18"/>
               </w:rPr>
-              <w:t xml:space="preserve">2.8</w:t>
+              <w:t xml:space="preserve">2.9</w:t>
             </w:r>
           </w:p>
         </w:tc>
@@ -3889,7 +3889,7 @@
                 <w:sz w:val="18"/>
                 <w:szCs w:val="18"/>
               </w:rPr>
-              <w:t xml:space="preserve">Più Amministratori con accesso completo; Amministratore principale protetto (script 29).</w:t>
+              <w:t xml:space="preserve">Email automatica con le credenziali al nuovo utente e alla reimpostazione della password.</w:t>
             </w:r>
           </w:p>
         </w:tc>
@@ -3959,7 +3959,7 @@
                 <w:sz w:val="18"/>
                 <w:szCs w:val="18"/>
               </w:rPr>
-              <w:t xml:space="preserve">2.7</w:t>
+              <w:t xml:space="preserve">2.8</w:t>
             </w:r>
           </w:p>
         </w:tc>
@@ -4023,7 +4023,7 @@
                 <w:sz w:val="18"/>
                 <w:szCs w:val="18"/>
               </w:rPr>
-              <w:t xml:space="preserve">Simulatore: costi per il Comune secondo il Caso 1 (progetto volontario) o il Caso 2 (progetto obbligatorio da bando).</w:t>
+              <w:t xml:space="preserve">Più Amministratori con accesso completo; Amministratore principale protetto (script 29).</w:t>
             </w:r>
           </w:p>
         </w:tc>
@@ -4093,7 +4093,7 @@
                 <w:sz w:val="18"/>
                 <w:szCs w:val="18"/>
               </w:rPr>
-              <w:t xml:space="preserve">2.6</w:t>
+              <w:t xml:space="preserve">2.7</w:t>
             </w:r>
           </w:p>
         </w:tc>
@@ -4159,7 +4159,7 @@
                 <w:sz w:val="18"/>
                 <w:szCs w:val="18"/>
               </w:rPr>
-              <w:t xml:space="preserve">Simulatore: valore del credito anno per anno, proposto 32 €.</w:t>
+              <w:t xml:space="preserve">Simulatore: costi per il Comune secondo il Caso 1 (progetto volontario) o il Caso 2 (progetto obbligatorio da bando).</w:t>
             </w:r>
           </w:p>
         </w:tc>
@@ -4229,7 +4229,7 @@
                 <w:sz w:val="18"/>
                 <w:szCs w:val="18"/>
               </w:rPr>
-              <w:t xml:space="preserve">2.5</w:t>
+              <w:t xml:space="preserve">2.6</w:t>
             </w:r>
           </w:p>
         </w:tc>
@@ -4293,7 +4293,7 @@
                 <w:sz w:val="18"/>
                 <w:szCs w:val="18"/>
               </w:rPr>
-              <w:t xml:space="preserve">Simulatore: simulazione economica con valore unitario del credito e costi per il Comune (contratti tipo della Fondazione, Schema tariffario).</w:t>
+              <w:t xml:space="preserve">Simulatore: valore del credito anno per anno, proposto 32 €.</w:t>
             </w:r>
           </w:p>
         </w:tc>
@@ -4363,7 +4363,7 @@
                 <w:sz w:val="18"/>
                 <w:szCs w:val="18"/>
               </w:rPr>
-              <w:t xml:space="preserve">2.4</w:t>
+              <w:t xml:space="preserve">2.5</w:t>
             </w:r>
           </w:p>
         </w:tc>
@@ -4429,7 +4429,7 @@
                 <w:sz w:val="18"/>
                 <w:szCs w:val="18"/>
               </w:rPr>
-              <w:t xml:space="preserve">Simulatore: riferimento sempre alla soglia del 65% di differenziata e controllo dei valori fuori scala.</w:t>
+              <w:t xml:space="preserve">Simulatore: simulazione economica con valore unitario del credito e costi per il Comune (contratti tipo della Fondazione, Schema tariffario).</w:t>
             </w:r>
           </w:p>
         </w:tc>
@@ -4499,7 +4499,7 @@
                 <w:sz w:val="18"/>
                 <w:szCs w:val="18"/>
               </w:rPr>
-              <w:t xml:space="preserve">2.3</w:t>
+              <w:t xml:space="preserve">2.4</w:t>
             </w:r>
           </w:p>
         </w:tc>
@@ -4563,7 +4563,7 @@
                 <w:sz w:val="18"/>
                 <w:szCs w:val="18"/>
               </w:rPr>
-              <w:t xml:space="preserve">Simulatore conforme al modello CWP: scenario di riferimento dello Standard 4.8.1, situazione attuale, conformità.</w:t>
+              <w:t xml:space="preserve">Simulatore: riferimento sempre alla soglia del 65% di differenziata e controllo dei valori fuori scala.</w:t>
             </w:r>
           </w:p>
         </w:tc>
@@ -4633,7 +4633,7 @@
                 <w:sz w:val="18"/>
                 <w:szCs w:val="18"/>
               </w:rPr>
-              <w:t xml:space="preserve">2.2</w:t>
+              <w:t xml:space="preserve">2.3</w:t>
             </w:r>
           </w:p>
         </w:tc>
@@ -4699,7 +4699,7 @@
                 <w:sz w:val="18"/>
                 <w:szCs w:val="18"/>
               </w:rPr>
-              <w:t xml:space="preserve">Nuovo capitolo «Simulatore di scenari»: creazione, anno base, obiettivi annui, risultati, modello di stima.</w:t>
+              <w:t xml:space="preserve">Simulatore conforme al modello CWP: scenario di riferimento dello Standard 4.8.1, situazione attuale, conformità.</w:t>
             </w:r>
           </w:p>
         </w:tc>
@@ -4769,7 +4769,7 @@
                 <w:sz w:val="18"/>
                 <w:szCs w:val="18"/>
               </w:rPr>
-              <w:t xml:space="preserve">2.1</w:t>
+              <w:t xml:space="preserve">2.2</w:t>
             </w:r>
           </w:p>
         </w:tc>
@@ -4833,7 +4833,7 @@
                 <w:sz w:val="18"/>
                 <w:szCs w:val="18"/>
               </w:rPr>
-              <w:t xml:space="preserve">Funzioni in arrivo: simulatore di scenari (7, 10 o 21 anni, obiettivi annui, % di differenziata e crediti stimati) e assistente virtuale (Claude).</w:t>
+              <w:t xml:space="preserve">Nuovo capitolo «Simulatore di scenari»: creazione, anno base, obiettivi annui, risultati, modello di stima.</w:t>
             </w:r>
           </w:p>
         </w:tc>
@@ -4903,7 +4903,7 @@
                 <w:sz w:val="18"/>
                 <w:szCs w:val="18"/>
               </w:rPr>
-              <w:t xml:space="preserve">2.0</w:t>
+              <w:t xml:space="preserve">2.1</w:t>
             </w:r>
           </w:p>
         </w:tc>
@@ -4969,7 +4969,7 @@
                 <w:sz w:val="18"/>
                 <w:szCs w:val="18"/>
               </w:rPr>
-              <w:t xml:space="preserve">Copie di sicurezza e ripristino: rimando alle Istruzioni di ripristino e punti essenziali (capitolo Manutenzione ed emergenze).</w:t>
+              <w:t xml:space="preserve">Funzioni in arrivo: simulatore di scenari (7, 10 o 21 anni, obiettivi annui, % di differenziata e crediti stimati) e assistente virtuale (Claude).</w:t>
             </w:r>
           </w:p>
         </w:tc>
@@ -5039,7 +5039,7 @@
                 <w:sz w:val="18"/>
                 <w:szCs w:val="18"/>
               </w:rPr>
-              <w:t xml:space="preserve">1.9</w:t>
+              <w:t xml:space="preserve">2.0</w:t>
             </w:r>
           </w:p>
         </w:tc>
@@ -5103,7 +5103,7 @@
                 <w:sz w:val="18"/>
                 <w:szCs w:val="18"/>
               </w:rPr>
-              <w:t xml:space="preserve">Fondazione Operate soggetto promotore del programma (esclusiva conferita da Wastelab).</w:t>
+              <w:t xml:space="preserve">Copie di sicurezza e ripristino: rimando alle Istruzioni di ripristino e punti essenziali (capitolo Manutenzione ed emergenze).</w:t>
             </w:r>
           </w:p>
         </w:tc>
@@ -5173,7 +5173,7 @@
                 <w:sz w:val="18"/>
                 <w:szCs w:val="18"/>
               </w:rPr>
-              <w:t xml:space="preserve">1.8</w:t>
+              <w:t xml:space="preserve">1.9</w:t>
             </w:r>
           </w:p>
         </w:tc>
@@ -5239,7 +5239,7 @@
                 <w:sz w:val="18"/>
                 <w:szCs w:val="18"/>
               </w:rPr>
-              <w:t xml:space="preserve">PEC del Programma e documenti ufficiali già pubblicati sulla pagina pubblica.</w:t>
+              <w:t xml:space="preserve">Fondazione Operate soggetto promotore del programma (esclusiva conferita da Wastelab).</w:t>
             </w:r>
           </w:p>
         </w:tc>
@@ -5309,7 +5309,7 @@
                 <w:sz w:val="18"/>
                 <w:szCs w:val="18"/>
               </w:rPr>
-              <w:t xml:space="preserve">1.7</w:t>
+              <w:t xml:space="preserve">1.8</w:t>
             </w:r>
           </w:p>
         </w:tc>
@@ -5341,7 +5341,7 @@
                 <w:sz w:val="18"/>
                 <w:szCs w:val="18"/>
               </w:rPr>
-              <w:t xml:space="preserve">18/10/2026</w:t>
+              <w:t xml:space="preserve">19/10/2026</w:t>
             </w:r>
           </w:p>
         </w:tc>
@@ -5373,7 +5373,7 @@
                 <w:sz w:val="18"/>
                 <w:szCs w:val="18"/>
               </w:rPr>
-              <w:t xml:space="preserve">Allineamento ai documenti ufficiali del Programma (script 22-24): Rapporto a 7 fasi, feedback pubblico, stati del Programma, dati del progetto e territorio ISTAT, ritiro e rientro, account unico e delegati, registri, tariffe e sospensione, accuratezza e accertamenti, informazioni del Programma e metodologie, modelli pubblici; nuovi capitoli Crediti emessi, Reclami, Pagina pubblica; qualità dei dati nel calcolo.</w:t>
+              <w:t xml:space="preserve">PEC del Programma e documenti ufficiali già pubblicati sulla pagina pubblica.</w:t>
             </w:r>
           </w:p>
         </w:tc>
@@ -5443,7 +5443,7 @@
                 <w:sz w:val="18"/>
                 <w:szCs w:val="18"/>
               </w:rPr>
-              <w:t xml:space="preserve">1.6</w:t>
+              <w:t xml:space="preserve">1.7</w:t>
             </w:r>
           </w:p>
         </w:tc>
@@ -5509,7 +5509,7 @@
                 <w:sz w:val="18"/>
                 <w:szCs w:val="18"/>
               </w:rPr>
-              <w:t xml:space="preserve">Calcolo crediti: descrizione corretta del buffer (somma delle voci delle Tabelle 15 e 16, più il 20% con le sole utenze virtuose, al massimo 80%).</w:t>
+              <w:t xml:space="preserve">Allineamento ai documenti ufficiali del Programma (script 22-24): Rapporto a 7 fasi, feedback pubblico, stati del Programma, dati del progetto e territorio ISTAT, ritiro e rientro, account unico e delegati, registri, tariffe e sospensione, accuratezza e accertamenti, informazioni del Programma e metodologie, modelli pubblici; nuovi capitoli Crediti emessi, Reclami, Pagina pubblica; qualità dei dati nel calcolo.</w:t>
             </w:r>
           </w:p>
         </w:tc>
@@ -5579,7 +5579,7 @@
                 <w:sz w:val="18"/>
                 <w:szCs w:val="18"/>
               </w:rPr>
-              <w:t xml:space="preserve">1.5</w:t>
+              <w:t xml:space="preserve">1.6</w:t>
             </w:r>
           </w:p>
         </w:tc>
@@ -5643,7 +5643,7 @@
                 <w:sz w:val="18"/>
                 <w:szCs w:val="18"/>
               </w:rPr>
-              <w:t xml:space="preserve">Nuova pagina Anagrafiche (Organizzazioni ed Enti, anche per gli Operatori); Rapporti con 4 fasi e durate proprie; documenti richiesti per fase; consultazione con documento bloccato, osservazioni numerate e motivazione; conservazione per 10 anni; fascicolo con riepilogo PDF e nuove cartelle.</w:t>
+              <w:t xml:space="preserve">Calcolo crediti: descrizione corretta del buffer (somma delle voci delle Tabelle 15 e 16, più il 20% con le sole utenze virtuose, al massimo 80%).</w:t>
             </w:r>
           </w:p>
         </w:tc>
@@ -5713,7 +5713,7 @@
                 <w:sz w:val="18"/>
                 <w:szCs w:val="18"/>
               </w:rPr>
-              <w:t xml:space="preserve">1.4</w:t>
+              <w:t xml:space="preserve">1.5</w:t>
             </w:r>
           </w:p>
         </w:tc>
@@ -5779,7 +5779,7 @@
                 <w:sz w:val="18"/>
                 <w:szCs w:val="18"/>
               </w:rPr>
-              <w:t xml:space="preserve">Calcolo crediti: il risultato si azzera quando cambiano dati o Banca Dati Utenze, conferma solo dopo un nuovo «Calcola». Gestione utenti: password temporanea di almeno 10 caratteri con lettere e numeri, creazione annullata se non va a buon fine, nessun accesso ai dati prima del cambio password.</w:t>
+              <w:t xml:space="preserve">Nuova pagina Anagrafiche (Organizzazioni ed Enti, anche per gli Operatori); Rapporti con 4 fasi e durate proprie; documenti richiesti per fase; consultazione con documento bloccato, osservazioni numerate e motivazione; conservazione per 10 anni; fascicolo con riepilogo PDF e nuove cartelle.</w:t>
             </w:r>
           </w:p>
         </w:tc>
@@ -5849,7 +5849,7 @@
                 <w:sz w:val="18"/>
                 <w:szCs w:val="18"/>
               </w:rPr>
-              <w:t xml:space="preserve">1.3</w:t>
+              <w:t xml:space="preserve">1.4</w:t>
             </w:r>
           </w:p>
         </w:tc>
@@ -5913,7 +5913,7 @@
                 <w:sz w:val="18"/>
                 <w:szCs w:val="18"/>
               </w:rPr>
-              <w:t xml:space="preserve">Rapporto di calcolo in PDF, archiviazione nella pratica, numero di registro, registro dei crediti.</w:t>
+              <w:t xml:space="preserve">Calcolo crediti: il risultato si azzera quando cambiano dati o Banca Dati Utenze, conferma solo dopo un nuovo «Calcola». Gestione utenti: password temporanea di almeno 10 caratteri con lettere e numeri, creazione annullata se non va a buon fine, nessun accesso ai dati prima del cambio password.</w:t>
             </w:r>
           </w:p>
         </w:tc>
@@ -5983,7 +5983,7 @@
                 <w:sz w:val="18"/>
                 <w:szCs w:val="18"/>
               </w:rPr>
-              <w:t xml:space="preserve">1.2</w:t>
+              <w:t xml:space="preserve">1.3</w:t>
             </w:r>
           </w:p>
         </w:tc>
@@ -6049,7 +6049,7 @@
                 <w:sz w:val="18"/>
                 <w:szCs w:val="18"/>
               </w:rPr>
-              <w:t xml:space="preserve">Calcolo crediti: importare il tracciato nel calcolo (dai documenti della pratica o dal computer), singole letture, blocco dei dati personali, controlli di coerenza.</w:t>
+              <w:t xml:space="preserve">Rapporto di calcolo in PDF, archiviazione nella pratica, numero di registro, registro dei crediti.</w:t>
             </w:r>
           </w:p>
         </w:tc>
@@ -6119,7 +6119,7 @@
                 <w:sz w:val="18"/>
                 <w:szCs w:val="18"/>
               </w:rPr>
-              <w:t xml:space="preserve">1.1</w:t>
+              <w:t xml:space="preserve">1.2</w:t>
             </w:r>
           </w:p>
         </w:tc>
@@ -6183,7 +6183,7 @@
                 <w:sz w:val="18"/>
                 <w:szCs w:val="18"/>
               </w:rPr>
-              <w:t xml:space="preserve">Note di fase, Ente di Validazione della pratica, consultazione sulla pagina pubblica con conferma dell'email, moderazione con autori e allegati, errata corrige; nuovo capitolo Messaggi con il Comune; pagamenti visibili al Comune; Impostazioni: Enti di Validazione e Modelli di documento; notifiche aggiornate.</w:t>
+              <w:t xml:space="preserve">Calcolo crediti: importare il tracciato nel calcolo (dai documenti della pratica o dal computer), singole letture, blocco dei dati personali, controlli di coerenza.</w:t>
             </w:r>
           </w:p>
         </w:tc>
@@ -6253,6 +6253,142 @@
                 <w:sz w:val="18"/>
                 <w:szCs w:val="18"/>
               </w:rPr>
+              <w:t xml:space="preserve">1.1</w:t>
+            </w:r>
+          </w:p>
+        </w:tc>
+        <w:tc>
+          <w:tcPr>
+            <w:tcW w:type="dxa" w:w="1300"/>
+            <w:tcBorders>
+              <w:top w:val="single" w:color="D9D4C5" w:sz="4"/>
+              <w:left w:val="single" w:color="D9D4C5" w:sz="4"/>
+              <w:bottom w:val="single" w:color="D9D4C5" w:sz="4"/>
+              <w:right w:val="single" w:color="D9D4C5" w:sz="4"/>
+            </w:tcBorders>
+            <w:shd w:fill="F6F4EE" w:color="auto" w:val="clear"/>
+            <w:tcMar>
+              <w:top w:type="dxa" w:w="70"/>
+              <w:left w:type="dxa" w:w="110"/>
+              <w:bottom w:type="dxa" w:w="70"/>
+              <w:right w:type="dxa" w:w="110"/>
+            </w:tcMar>
+            <w:vAlign w:val="center"/>
+          </w:tcPr>
+          <w:p>
+            <w:pPr>
+              <w:spacing w:after="0" w:before="0"/>
+            </w:pPr>
+            <w:r>
+              <w:rPr>
+                <w:rFonts w:ascii="Arial" w:cs="Arial" w:eastAsia="Arial" w:hAnsi="Arial"/>
+                <w:color w:val="1B2118"/>
+                <w:sz w:val="18"/>
+                <w:szCs w:val="18"/>
+              </w:rPr>
+              <w:t xml:space="preserve">18/10/2026</w:t>
+            </w:r>
+          </w:p>
+        </w:tc>
+        <w:tc>
+          <w:tcPr>
+            <w:tcW w:type="dxa" w:w="5538"/>
+            <w:tcBorders>
+              <w:top w:val="single" w:color="D9D4C5" w:sz="4"/>
+              <w:left w:val="single" w:color="D9D4C5" w:sz="4"/>
+              <w:bottom w:val="single" w:color="D9D4C5" w:sz="4"/>
+              <w:right w:val="single" w:color="D9D4C5" w:sz="4"/>
+            </w:tcBorders>
+            <w:shd w:fill="F6F4EE" w:color="auto" w:val="clear"/>
+            <w:tcMar>
+              <w:top w:type="dxa" w:w="70"/>
+              <w:left w:type="dxa" w:w="110"/>
+              <w:bottom w:type="dxa" w:w="70"/>
+              <w:right w:type="dxa" w:w="110"/>
+            </w:tcMar>
+            <w:vAlign w:val="center"/>
+          </w:tcPr>
+          <w:p>
+            <w:pPr>
+              <w:spacing w:after="0" w:before="0"/>
+            </w:pPr>
+            <w:r>
+              <w:rPr>
+                <w:rFonts w:ascii="Arial" w:cs="Arial" w:eastAsia="Arial" w:hAnsi="Arial"/>
+                <w:color w:val="1B2118"/>
+                <w:sz w:val="18"/>
+                <w:szCs w:val="18"/>
+              </w:rPr>
+              <w:t xml:space="preserve">Note di fase, Ente di Validazione della pratica, consultazione sulla pagina pubblica con conferma dell'email, moderazione con autori e allegati, errata corrige; nuovo capitolo Messaggi con il Comune; pagamenti visibili al Comune; Impostazioni: Enti di Validazione e Modelli di documento; notifiche aggiornate.</w:t>
+            </w:r>
+          </w:p>
+        </w:tc>
+        <w:tc>
+          <w:tcPr>
+            <w:tcW w:type="dxa" w:w="2000"/>
+            <w:tcBorders>
+              <w:top w:val="single" w:color="D9D4C5" w:sz="4"/>
+              <w:left w:val="single" w:color="D9D4C5" w:sz="4"/>
+              <w:bottom w:val="single" w:color="D9D4C5" w:sz="4"/>
+              <w:right w:val="single" w:color="D9D4C5" w:sz="4"/>
+            </w:tcBorders>
+            <w:shd w:fill="F6F4EE" w:color="auto" w:val="clear"/>
+            <w:tcMar>
+              <w:top w:type="dxa" w:w="70"/>
+              <w:left w:type="dxa" w:w="110"/>
+              <w:bottom w:type="dxa" w:w="70"/>
+              <w:right w:type="dxa" w:w="110"/>
+            </w:tcMar>
+            <w:vAlign w:val="center"/>
+          </w:tcPr>
+          <w:p>
+            <w:pPr>
+              <w:spacing w:after="0" w:before="0"/>
+            </w:pPr>
+            <w:r>
+              <w:rPr>
+                <w:rFonts w:ascii="Arial" w:cs="Arial" w:eastAsia="Arial" w:hAnsi="Arial"/>
+                <w:color w:val="1B2118"/>
+                <w:sz w:val="18"/>
+                <w:szCs w:val="18"/>
+              </w:rPr>
+              <w:t xml:space="preserve">Fondazione Operate</w:t>
+            </w:r>
+          </w:p>
+        </w:tc>
+      </w:tr>
+      <w:tr>
+        <w:trPr>
+          <w:cantSplit/>
+        </w:trPr>
+        <w:tc>
+          <w:tcPr>
+            <w:tcW w:type="dxa" w:w="800"/>
+            <w:tcBorders>
+              <w:top w:val="single" w:color="D9D4C5" w:sz="4"/>
+              <w:left w:val="single" w:color="D9D4C5" w:sz="4"/>
+              <w:bottom w:val="single" w:color="D9D4C5" w:sz="4"/>
+              <w:right w:val="single" w:color="D9D4C5" w:sz="4"/>
+            </w:tcBorders>
+            <w:tcMar>
+              <w:top w:type="dxa" w:w="70"/>
+              <w:left w:type="dxa" w:w="110"/>
+              <w:bottom w:type="dxa" w:w="70"/>
+              <w:right w:type="dxa" w:w="110"/>
+            </w:tcMar>
+            <w:vAlign w:val="center"/>
+          </w:tcPr>
+          <w:p>
+            <w:pPr>
+              <w:spacing w:after="0" w:before="0"/>
+            </w:pPr>
+            <w:r>
+              <w:rPr>
+                <w:rFonts w:ascii="Arial" w:cs="Arial" w:eastAsia="Arial" w:hAnsi="Arial"/>
+                <w:color w:val="1B2118"/>
+                <w:sz w:val="18"/>
+                <w:szCs w:val="18"/>
+              </w:rPr>
               <w:t xml:space="preserve">1.0</w:t>
             </w:r>
           </w:p>
@@ -6266,7 +6402,6 @@
               <w:bottom w:val="single" w:color="D9D4C5" w:sz="4"/>
               <w:right w:val="single" w:color="D9D4C5" w:sz="4"/>
             </w:tcBorders>
-            <w:shd w:fill="F6F4EE" w:color="auto" w:val="clear"/>
             <w:tcMar>
               <w:top w:type="dxa" w:w="70"/>
               <w:left w:type="dxa" w:w="110"/>
@@ -6299,7 +6434,6 @@
               <w:bottom w:val="single" w:color="D9D4C5" w:sz="4"/>
               <w:right w:val="single" w:color="D9D4C5" w:sz="4"/>
             </w:tcBorders>
-            <w:shd w:fill="F6F4EE" w:color="auto" w:val="clear"/>
             <w:tcMar>
               <w:top w:type="dxa" w:w="70"/>
               <w:left w:type="dxa" w:w="110"/>
@@ -6332,7 +6466,6 @@
               <w:bottom w:val="single" w:color="D9D4C5" w:sz="4"/>
               <w:right w:val="single" w:color="D9D4C5" w:sz="4"/>
             </w:tcBorders>
-            <w:shd w:fill="F6F4EE" w:color="auto" w:val="clear"/>
             <w:tcMar>
               <w:top w:type="dxa" w:w="70"/>
               <w:left w:type="dxa" w:w="110"/>
@@ -6374,7 +6507,7 @@
           <w:sz w:val="20"/>
           <w:szCs w:val="20"/>
         </w:rPr>
-        <w:t xml:space="preserve">Questo documento descrive il portale alla revisione 5.1 del 22/10/2026. A ogni modifica del portale il manuale viene aggiornato e la revisione incrementata; la versione corrente si scarica dall'area Documentazione del portale (solo Amministratori).</w:t>
+        <w:t xml:space="preserve">Questo documento descrive il portale alla revisione 5.2 del 22/10/2026. A ogni modifica del portale il manuale viene aggiornato e la revisione incrementata; la versione corrente si scarica dall'area Documentazione del portale (solo Amministratori).</w:t>
       </w:r>
     </w:p>
     <w:p>
@@ -9254,7 +9387,7 @@
         </w:rPr>
         <w:t xml:space="preserve">Si accede da </w:t>
       </w:r>
-      <w:hyperlink w:history="1" r:id="rIdy_tc7b8x5vxm69quoeoto">
+      <w:hyperlink w:history="1" r:id="rIdln2g_jx9huxhnrhoyqfom">
         <w:r>
           <w:rPr>
             <w:rFonts w:ascii="Arial" w:cs="Arial" w:eastAsia="Arial" w:hAnsi="Arial"/>
@@ -10139,6 +10272,131 @@
         <w:t xml:space="preserve">3. Dashboard</w:t>
       </w:r>
       <w:bookmarkEnd w:id="1"/>
+    </w:p>
+    <w:p>
+      <w:pPr>
+        <w:spacing w:after="140" w:line="300"/>
+      </w:pPr>
+      <w:r>
+        <w:rPr>
+          <w:rFonts w:ascii="Arial" w:cs="Arial" w:eastAsia="Arial" w:hAnsi="Arial"/>
+          <w:b/>
+          <w:bCs/>
+          <w:color w:val="1B2118"/>
+          <w:sz w:val="21"/>
+          <w:szCs w:val="21"/>
+        </w:rPr>
+        <w:t xml:space="preserve">Dal telefono (dal 22/10/2026).</w:t>
+      </w:r>
+      <w:r>
+        <w:rPr>
+          <w:rFonts w:ascii="Arial" w:cs="Arial" w:eastAsia="Arial" w:hAnsi="Arial"/>
+          <w:color w:val="1B2118"/>
+          <w:sz w:val="21"/>
+          <w:szCs w:val="21"/>
+        </w:rPr>
+        <w:t xml:space="preserve"> Su uno schermo fino a 760 px l'intestazione mostra solo i loghi, la campanella e </w:t>
+      </w:r>
+      <w:r>
+        <w:rPr>
+          <w:rFonts w:ascii="Arial" w:cs="Arial" w:eastAsia="Arial" w:hAnsi="Arial"/>
+          <w:b/>
+          <w:bCs/>
+          <w:color w:val="1B2118"/>
+          <w:sz w:val="21"/>
+          <w:szCs w:val="21"/>
+        </w:rPr>
+        <w:t xml:space="preserve">☰ Menu</w:t>
+      </w:r>
+      <w:r>
+        <w:rPr>
+          <w:rFonts w:ascii="Arial" w:cs="Arial" w:eastAsia="Arial" w:hAnsi="Arial"/>
+          <w:color w:val="1B2118"/>
+          <w:sz w:val="21"/>
+          <w:szCs w:val="21"/>
+        </w:rPr>
+        <w:t xml:space="preserve">, che apre tutte le voci, il profilo ed </w:t>
+      </w:r>
+      <w:r>
+        <w:rPr>
+          <w:rFonts w:ascii="Arial" w:cs="Arial" w:eastAsia="Arial" w:hAnsi="Arial"/>
+          <w:b/>
+          <w:bCs/>
+          <w:color w:val="1B2118"/>
+          <w:sz w:val="21"/>
+          <w:szCs w:val="21"/>
+        </w:rPr>
+        <w:t xml:space="preserve">Esci</w:t>
+      </w:r>
+      <w:r>
+        <w:rPr>
+          <w:rFonts w:ascii="Arial" w:cs="Arial" w:eastAsia="Arial" w:hAnsi="Arial"/>
+          <w:color w:val="1B2118"/>
+          <w:sz w:val="21"/>
+          <w:szCs w:val="21"/>
+        </w:rPr>
+        <w:t xml:space="preserve">; il pallino verde delle Notizie CO2 compare sul pulsante Menu e accanto alla voce. La tabella della Dashboard e quella dell'Audit diventano schede, una per pratica o per evento, con l'etichetta di ogni colonna; l'ordine si sceglie con </w:t>
+      </w:r>
+      <w:r>
+        <w:rPr>
+          <w:rFonts w:ascii="Arial" w:cs="Arial" w:eastAsia="Arial" w:hAnsi="Arial"/>
+          <w:b/>
+          <w:bCs/>
+          <w:color w:val="1B2118"/>
+          <w:sz w:val="21"/>
+          <w:szCs w:val="21"/>
+        </w:rPr>
+        <w:t xml:space="preserve">Ordina per</w:t>
+      </w:r>
+      <w:r>
+        <w:rPr>
+          <w:rFonts w:ascii="Arial" w:cs="Arial" w:eastAsia="Arial" w:hAnsi="Arial"/>
+          <w:color w:val="1B2118"/>
+          <w:sz w:val="21"/>
+          <w:szCs w:val="21"/>
+        </w:rPr>
+        <w:t xml:space="preserve"> sopra le schede. In </w:t>
+      </w:r>
+      <w:r>
+        <w:rPr>
+          <w:rFonts w:ascii="Arial" w:cs="Arial" w:eastAsia="Arial" w:hAnsi="Arial"/>
+          <w:b/>
+          <w:bCs/>
+          <w:color w:val="1B2118"/>
+          <w:sz w:val="21"/>
+          <w:szCs w:val="21"/>
+        </w:rPr>
+        <w:t xml:space="preserve">Pratiche</w:t>
+      </w:r>
+      <w:r>
+        <w:rPr>
+          <w:rFonts w:ascii="Arial" w:cs="Arial" w:eastAsia="Arial" w:hAnsi="Arial"/>
+          <w:color w:val="1B2118"/>
+          <w:sz w:val="21"/>
+          <w:szCs w:val="21"/>
+        </w:rPr>
+        <w:t xml:space="preserve"> si vede prima l'elenco: toccando una pratica si apre il dettaglio, con </w:t>
+      </w:r>
+      <w:r>
+        <w:rPr>
+          <w:rFonts w:ascii="Arial" w:cs="Arial" w:eastAsia="Arial" w:hAnsi="Arial"/>
+          <w:b/>
+          <w:bCs/>
+          <w:color w:val="1B2118"/>
+          <w:sz w:val="21"/>
+          <w:szCs w:val="21"/>
+        </w:rPr>
+        <w:t xml:space="preserve">← Tutte le pratiche</w:t>
+      </w:r>
+      <w:r>
+        <w:rPr>
+          <w:rFonts w:ascii="Arial" w:cs="Arial" w:eastAsia="Arial" w:hAnsi="Arial"/>
+          <w:color w:val="1B2118"/>
+          <w:sz w:val="21"/>
+          <w:szCs w:val="21"/>
+        </w:rPr>
+        <w:t xml:space="preserve"> in alto. Le tabelle più larghe (simulatore, calcolo) scorrono di lato dentro il loro riquadro. I campi di testo sono a 16 px, così l'iPhone non ingrandisce la pagina quando li si tocca.</w:t>
+      </w:r>
     </w:p>
     <w:p>
       <w:pPr>
@@ -45482,7 +45740,7 @@
           <w:sz w:val="21"/>
           <w:szCs w:val="21"/>
         </w:rPr>
-        <w:t xml:space="preserve">su otto siti di notizie ambientali: Rinnovabili.it, QualEnergia, GreenReport, ESGnews, LifeGate, Climate Home News, edie, BusinessGreen. Da questi passano al controllo solo le notizie che parlano espressamente di crediti, compensazioni o mercati del carbonio.</w:t>
+        <w:t xml:space="preserve">su otto siti di notizie ambientali: Rinnovabili.it, QualEnergia, GreenReport, ESGnews, LifeGate, Climate Home News, edie, BusinessGreen (Rinnovabili.it e GreenReport attraverso Bing News, perché non si leggono direttamente). Da questi passano al controllo solo le notizie che parlano espressamente di crediti, compensazioni o mercati del carbonio.</w:t>
       </w:r>
     </w:p>
     <w:p>
@@ -48729,7 +48987,7 @@
         <w:szCs w:val="16"/>
       </w:rPr>
       <w:tab/>
-      <w:t xml:space="preserve">Manuale Amministratore · Rev. 5.1 · 22/10/2026</w:t>
+      <w:t xml:space="preserve">Manuale Amministratore · Rev. 5.2 · 22/10/2026</w:t>
     </w:r>
   </w:p>
 </w:hdr>
@@ -48794,7 +49052,7 @@
         <w:szCs w:val="16"/>
       </w:rPr>
       <w:tab/>
-      <w:t xml:space="preserve">Manuale Amministratore · Rev. 5.1 · 22/10/2026</w:t>
+      <w:t xml:space="preserve">Manuale Amministratore · Rev. 5.2 · 22/10/2026</w:t>
     </w:r>
   </w:p>
 </w:hdr>

</xml_diff>

<commit_message>
Banca Dati Utenze per utenza: script 40 (tabella calcolo_utenza, letture registrate nell'audit), modello Excel Banca_dati_utenze_CWP_v1 e spiegazione dei campi nei documenti
Co-Authored-By: Claude Opus 5.5 <noreply@anthropic.com>
Claude-Session: https://claude.ai/code/session_01E8XCbEeVHWVP3hntUZ6kZ1
</commit_message>
<xml_diff>
--- a/public/documentazione/Manuale_Amministratore_Portale_CWP.docx
+++ b/public/documentazione/Manuale_Amministratore_Portale_CWP.docx
@@ -302,7 +302,7 @@
                 <w:sz w:val="20"/>
                 <w:szCs w:val="20"/>
               </w:rPr>
-              <w:t xml:space="preserve">Rev. 5.2</w:t>
+              <w:t xml:space="preserve">Rev. 5.3</w:t>
             </w:r>
           </w:p>
         </w:tc>
@@ -719,7 +719,7 @@
                 <w:sz w:val="18"/>
                 <w:szCs w:val="18"/>
               </w:rPr>
-              <w:t xml:space="preserve">5.2</w:t>
+              <w:t xml:space="preserve">5.3</w:t>
             </w:r>
           </w:p>
         </w:tc>
@@ -783,7 +783,7 @@
                 <w:sz w:val="18"/>
                 <w:szCs w:val="18"/>
               </w:rPr>
-              <w:t xml:space="preserve">Uso dal telefono: menu a pannello, schede in Dashboard e Audit, elenco e dettaglio delle pratiche.</w:t>
+              <w:t xml:space="preserve">Banca Dati Utenze per utenza: campi, regole, dati personali.</w:t>
             </w:r>
           </w:p>
         </w:tc>
@@ -853,7 +853,7 @@
                 <w:sz w:val="18"/>
                 <w:szCs w:val="18"/>
               </w:rPr>
-              <w:t xml:space="preserve">5.1</w:t>
+              <w:t xml:space="preserve">5.2</w:t>
             </w:r>
           </w:p>
         </w:tc>
@@ -919,7 +919,7 @@
                 <w:sz w:val="18"/>
                 <w:szCs w:val="18"/>
               </w:rPr>
-              <w:t xml:space="preserve">Rilievi N01-N06: costi una tantum in 10 rate, feedback pubblico e fase 3, ente prima della fase 5, riquadro «Fase aperta senza scadenza», avviso sui codici, frazioni del fattore dell'indifferenziato.</w:t>
+              <w:t xml:space="preserve">Uso dal telefono: menu a pannello, schede in Dashboard e Audit, elenco e dettaglio delle pratiche.</w:t>
             </w:r>
           </w:p>
         </w:tc>
@@ -989,7 +989,7 @@
                 <w:sz w:val="18"/>
                 <w:szCs w:val="18"/>
               </w:rPr>
-              <w:t xml:space="preserve">5.0</w:t>
+              <w:t xml:space="preserve">5.1</w:t>
             </w:r>
           </w:p>
         </w:tc>
@@ -1021,7 +1021,7 @@
                 <w:sz w:val="18"/>
                 <w:szCs w:val="18"/>
               </w:rPr>
-              <w:t xml:space="preserve">21/10/2026</w:t>
+              <w:t xml:space="preserve">22/10/2026</w:t>
             </w:r>
           </w:p>
         </w:tc>
@@ -1053,7 +1053,7 @@
                 <w:sz w:val="18"/>
                 <w:szCs w:val="18"/>
               </w:rPr>
-              <w:t xml:space="preserve">«News» diventa «Notizie CO2»; Google News attraverso il tramite; barra a LED nell'elenco e nella pratica. Pallino verde delle Notizie CO2 nuove. Notizie CO2: siti di notizie ambientali al posto di Google News. Notizie CO2: siti di notizie ambientali al posto di Google News.</w:t>
+              <w:t xml:space="preserve">Rilievi N01-N06: costi una tantum in 10 rate, feedback pubblico e fase 3, ente prima della fase 5, riquadro «Fase aperta senza scadenza», avviso sui codici, frazioni del fattore dell'indifferenziato.</w:t>
             </w:r>
           </w:p>
         </w:tc>
@@ -1123,7 +1123,7 @@
                 <w:sz w:val="18"/>
                 <w:szCs w:val="18"/>
               </w:rPr>
-              <w:t xml:space="preserve">4.9</w:t>
+              <w:t xml:space="preserve">5.0</w:t>
             </w:r>
           </w:p>
         </w:tc>
@@ -1189,7 +1189,7 @@
                 <w:sz w:val="18"/>
                 <w:szCs w:val="18"/>
               </w:rPr>
-              <w:t xml:space="preserve">Nuovo capitolo «News»: osservatorio sui crediti di carbonio volontari. Canali Bing News e Verra.</w:t>
+              <w:t xml:space="preserve">«News» diventa «Notizie CO2»; Google News attraverso il tramite; barra a LED nell'elenco e nella pratica. Pallino verde delle Notizie CO2 nuove. Notizie CO2: siti di notizie ambientali al posto di Google News. Notizie CO2: siti di notizie ambientali al posto di Google News.</w:t>
             </w:r>
           </w:p>
         </w:tc>
@@ -1259,7 +1259,7 @@
                 <w:sz w:val="18"/>
                 <w:szCs w:val="18"/>
               </w:rPr>
-              <w:t xml:space="preserve">4.8</w:t>
+              <w:t xml:space="preserve">4.9</w:t>
             </w:r>
           </w:p>
         </w:tc>
@@ -1323,7 +1323,7 @@
                 <w:sz w:val="18"/>
                 <w:szCs w:val="18"/>
               </w:rPr>
-              <w:t xml:space="preserve">Simulatore: il PDF scaricato riporta tutti i dati della pagina, i costi e i grafici; foglio Excel «Dati inseriti».</w:t>
+              <w:t xml:space="preserve">Nuovo capitolo «News»: osservatorio sui crediti di carbonio volontari. Canali Bing News e Verra.</w:t>
             </w:r>
           </w:p>
         </w:tc>
@@ -1393,7 +1393,7 @@
                 <w:sz w:val="18"/>
                 <w:szCs w:val="18"/>
               </w:rPr>
-              <w:t xml:space="preserve">4.7</w:t>
+              <w:t xml:space="preserve">4.8</w:t>
             </w:r>
           </w:p>
         </w:tc>
@@ -1459,7 +1459,7 @@
                 <w:sz w:val="18"/>
                 <w:szCs w:val="18"/>
               </w:rPr>
-              <w:t xml:space="preserve">Assistente per gli Operatori e domande sulla pratica aperta; menu dell'Operatore con il Simulatore.</w:t>
+              <w:t xml:space="preserve">Simulatore: il PDF scaricato riporta tutti i dati della pagina, i costi e i grafici; foglio Excel «Dati inseriti».</w:t>
             </w:r>
           </w:p>
         </w:tc>
@@ -1529,7 +1529,7 @@
                 <w:sz w:val="18"/>
                 <w:szCs w:val="18"/>
               </w:rPr>
-              <w:t xml:space="preserve">4.6</w:t>
+              <w:t xml:space="preserve">4.7</w:t>
             </w:r>
           </w:p>
         </w:tc>
@@ -1593,7 +1593,7 @@
                 <w:sz w:val="18"/>
                 <w:szCs w:val="18"/>
               </w:rPr>
-              <w:t xml:space="preserve">Capitolo «Backup automatico».</w:t>
+              <w:t xml:space="preserve">Assistente per gli Operatori e domande sulla pratica aperta; menu dell'Operatore con il Simulatore.</w:t>
             </w:r>
           </w:p>
         </w:tc>
@@ -1663,7 +1663,7 @@
                 <w:sz w:val="18"/>
                 <w:szCs w:val="18"/>
               </w:rPr>
-              <w:t xml:space="preserve">4.5</w:t>
+              <w:t xml:space="preserve">4.6</w:t>
             </w:r>
           </w:p>
         </w:tc>
@@ -1729,7 +1729,7 @@
                 <w:sz w:val="18"/>
                 <w:szCs w:val="18"/>
               </w:rPr>
-              <w:t xml:space="preserve">Nuovo documento «Registro issue e test» tra quelli scaricabili.</w:t>
+              <w:t xml:space="preserve">Capitolo «Backup automatico».</w:t>
             </w:r>
           </w:p>
         </w:tc>
@@ -1799,7 +1799,7 @@
                 <w:sz w:val="18"/>
                 <w:szCs w:val="18"/>
               </w:rPr>
-              <w:t xml:space="preserve">4.4</w:t>
+              <w:t xml:space="preserve">4.5</w:t>
             </w:r>
           </w:p>
         </w:tc>
@@ -1863,7 +1863,7 @@
                 <w:sz w:val="18"/>
                 <w:szCs w:val="18"/>
               </w:rPr>
-              <w:t xml:space="preserve">Collaudo V05: testo completo dei valori lunghi nell'Audit (Prima/Dopo, Tolto/Aggiunto), denominazione delle organizzazioni e ricerca sui valori cambiati; pagina «Account disattivato».</w:t>
+              <w:t xml:space="preserve">Nuovo documento «Registro issue e test» tra quelli scaricabili.</w:t>
             </w:r>
           </w:p>
         </w:tc>
@@ -1933,7 +1933,7 @@
                 <w:sz w:val="18"/>
                 <w:szCs w:val="18"/>
               </w:rPr>
-              <w:t xml:space="preserve">4.3</w:t>
+              <w:t xml:space="preserve">4.4</w:t>
             </w:r>
           </w:p>
         </w:tc>
@@ -1966,7 +1966,7 @@
                 <w:sz w:val="18"/>
                 <w:szCs w:val="18"/>
               </w:rPr>
-              <w:t xml:space="preserve">20/10/2026</w:t>
+              <w:t xml:space="preserve">21/10/2026</w:t>
             </w:r>
           </w:p>
         </w:tc>
@@ -1999,7 +1999,7 @@
                 <w:sz w:val="18"/>
                 <w:szCs w:val="18"/>
               </w:rPr>
-              <w:t xml:space="preserve">Correzioni del collaudo V01: import CSV della Banca Dati «tutto o niente» senza valori negativi, calcolo bloccato con dati non ammessi, buffer manuale 0-80%, conferma definitiva solo senza errori di coerenza, dati non ammessi nel simulatore e zero esplicito nei prezzi, colonna «Oggetto e modifiche» nell'Audit.</w:t>
+              <w:t xml:space="preserve">Collaudo V05: testo completo dei valori lunghi nell'Audit (Prima/Dopo, Tolto/Aggiunto), denominazione delle organizzazioni e ricerca sui valori cambiati; pagina «Account disattivato».</w:t>
             </w:r>
           </w:p>
         </w:tc>
@@ -2069,7 +2069,7 @@
                 <w:sz w:val="18"/>
                 <w:szCs w:val="18"/>
               </w:rPr>
-              <w:t xml:space="preserve">4.2</w:t>
+              <w:t xml:space="preserve">4.3</w:t>
             </w:r>
           </w:p>
         </w:tc>
@@ -2133,7 +2133,7 @@
                 <w:sz w:val="18"/>
                 <w:szCs w:val="18"/>
               </w:rPr>
-              <w:t xml:space="preserve">Nuovo capitolo «Sicurezza»: inattività, avvisi, protezioni del sito e del database.</w:t>
+              <w:t xml:space="preserve">Correzioni del collaudo V01: import CSV della Banca Dati «tutto o niente» senza valori negativi, calcolo bloccato con dati non ammessi, buffer manuale 0-80%, conferma definitiva solo senza errori di coerenza, dati non ammessi nel simulatore e zero esplicito nei prezzi, colonna «Oggetto e modifiche» nell'Audit.</w:t>
             </w:r>
           </w:p>
         </w:tc>
@@ -2203,7 +2203,7 @@
                 <w:sz w:val="18"/>
                 <w:szCs w:val="18"/>
               </w:rPr>
-              <w:t xml:space="preserve">4.1</w:t>
+              <w:t xml:space="preserve">4.2</w:t>
             </w:r>
           </w:p>
         </w:tc>
@@ -2269,7 +2269,7 @@
                 <w:sz w:val="18"/>
                 <w:szCs w:val="18"/>
               </w:rPr>
-              <w:t xml:space="preserve">Voci di menu degli enti aggiornate.</w:t>
+              <w:t xml:space="preserve">Nuovo capitolo «Sicurezza»: inattività, avvisi, protezioni del sito e del database.</w:t>
             </w:r>
           </w:p>
         </w:tc>
@@ -2339,7 +2339,7 @@
                 <w:sz w:val="18"/>
                 <w:szCs w:val="18"/>
               </w:rPr>
-              <w:t xml:space="preserve">4.0</w:t>
+              <w:t xml:space="preserve">4.1</w:t>
             </w:r>
           </w:p>
         </w:tc>
@@ -2403,7 +2403,7 @@
                 <w:sz w:val="18"/>
                 <w:szCs w:val="18"/>
               </w:rPr>
-              <w:t xml:space="preserve">Nuovo ordine del menu; la sezione si chiama «Audit User». Voce «Marketplaces» in arrivo.</w:t>
+              <w:t xml:space="preserve">Voci di menu degli enti aggiornate.</w:t>
             </w:r>
           </w:p>
         </w:tc>
@@ -2473,7 +2473,7 @@
                 <w:sz w:val="18"/>
                 <w:szCs w:val="18"/>
               </w:rPr>
-              <w:t xml:space="preserve">3.9</w:t>
+              <w:t xml:space="preserve">4.0</w:t>
             </w:r>
           </w:p>
         </w:tc>
@@ -2539,7 +2539,7 @@
                 <w:sz w:val="18"/>
                 <w:szCs w:val="18"/>
               </w:rPr>
-              <w:t xml:space="preserve">Nuovo capitolo «Audit trail user».</w:t>
+              <w:t xml:space="preserve">Nuovo ordine del menu; la sezione si chiama «Audit User». Voce «Marketplaces» in arrivo.</w:t>
             </w:r>
           </w:p>
         </w:tc>
@@ -2609,7 +2609,7 @@
                 <w:sz w:val="18"/>
                 <w:szCs w:val="18"/>
               </w:rPr>
-              <w:t xml:space="preserve">3.8</w:t>
+              <w:t xml:space="preserve">3.9</w:t>
             </w:r>
           </w:p>
         </w:tc>
@@ -2673,7 +2673,7 @@
                 <w:sz w:val="18"/>
                 <w:szCs w:val="18"/>
               </w:rPr>
-              <w:t xml:space="preserve">Utenti online; PDF ed Excel del simulatore; messaggi d'errore dell'assistente.</w:t>
+              <w:t xml:space="preserve">Nuovo capitolo «Audit trail user».</w:t>
             </w:r>
           </w:p>
         </w:tc>
@@ -2743,7 +2743,7 @@
                 <w:sz w:val="18"/>
                 <w:szCs w:val="18"/>
               </w:rPr>
-              <w:t xml:space="preserve">3.7</w:t>
+              <w:t xml:space="preserve">3.8</w:t>
             </w:r>
           </w:p>
         </w:tc>
@@ -2776,7 +2776,7 @@
                 <w:sz w:val="18"/>
                 <w:szCs w:val="18"/>
               </w:rPr>
-              <w:t xml:space="preserve">19/10/2026</w:t>
+              <w:t xml:space="preserve">20/10/2026</w:t>
             </w:r>
           </w:p>
         </w:tc>
@@ -2809,7 +2809,7 @@
                 <w:sz w:val="18"/>
                 <w:szCs w:val="18"/>
               </w:rPr>
-              <w:t xml:space="preserve">Assistente virtuale: messaggio «Un attimo…» durante l'attesa.</w:t>
+              <w:t xml:space="preserve">Utenti online; PDF ed Excel del simulatore; messaggi d'errore dell'assistente.</w:t>
             </w:r>
           </w:p>
         </w:tc>
@@ -2879,7 +2879,7 @@
                 <w:sz w:val="18"/>
                 <w:szCs w:val="18"/>
               </w:rPr>
-              <w:t xml:space="preserve">3.6</w:t>
+              <w:t xml:space="preserve">3.7</w:t>
             </w:r>
           </w:p>
         </w:tc>
@@ -2943,7 +2943,7 @@
                 <w:sz w:val="18"/>
                 <w:szCs w:val="18"/>
               </w:rPr>
-              <w:t xml:space="preserve">Assistente virtuale attivo: chiave legata a uno spazio di lavoro, crediti e consumi.</w:t>
+              <w:t xml:space="preserve">Assistente virtuale: messaggio «Un attimo…» durante l'attesa.</w:t>
             </w:r>
           </w:p>
         </w:tc>
@@ -3013,7 +3013,7 @@
                 <w:sz w:val="18"/>
                 <w:szCs w:val="18"/>
               </w:rPr>
-              <w:t xml:space="preserve">3.5</w:t>
+              <w:t xml:space="preserve">3.6</w:t>
             </w:r>
           </w:p>
         </w:tc>
@@ -3079,7 +3079,7 @@
                 <w:sz w:val="18"/>
                 <w:szCs w:val="18"/>
               </w:rPr>
-              <w:t xml:space="preserve">Assistente virtuale; documenti ufficiali del Programma nella Documentazione.</w:t>
+              <w:t xml:space="preserve">Assistente virtuale attivo: chiave legata a uno spazio di lavoro, crediti e consumi.</w:t>
             </w:r>
           </w:p>
         </w:tc>
@@ -3149,7 +3149,7 @@
                 <w:sz w:val="18"/>
                 <w:szCs w:val="18"/>
               </w:rPr>
-              <w:t xml:space="preserve">3.4</w:t>
+              <w:t xml:space="preserve">3.5</w:t>
             </w:r>
           </w:p>
         </w:tc>
@@ -3213,7 +3213,7 @@
                 <w:sz w:val="18"/>
                 <w:szCs w:val="18"/>
               </w:rPr>
-              <w:t xml:space="preserve">Presentazione di riepilogo nella pagina Documentazione.</w:t>
+              <w:t xml:space="preserve">Assistente virtuale; documenti ufficiali del Programma nella Documentazione.</w:t>
             </w:r>
           </w:p>
         </w:tc>
@@ -3283,7 +3283,7 @@
                 <w:sz w:val="18"/>
                 <w:szCs w:val="18"/>
               </w:rPr>
-              <w:t xml:space="preserve">3.3</w:t>
+              <w:t xml:space="preserve">3.4</w:t>
             </w:r>
           </w:p>
         </w:tc>
@@ -3349,7 +3349,7 @@
                 <w:sz w:val="18"/>
                 <w:szCs w:val="18"/>
               </w:rPr>
-              <w:t xml:space="preserve">Ordinamento di tutte le tabelle e degli elenchi.</w:t>
+              <w:t xml:space="preserve">Presentazione di riepilogo nella pagina Documentazione.</w:t>
             </w:r>
           </w:p>
         </w:tc>
@@ -3419,7 +3419,7 @@
                 <w:sz w:val="18"/>
                 <w:szCs w:val="18"/>
               </w:rPr>
-              <w:t xml:space="preserve">3.2</w:t>
+              <w:t xml:space="preserve">3.3</w:t>
             </w:r>
           </w:p>
         </w:tc>
@@ -3483,7 +3483,7 @@
                 <w:sz w:val="18"/>
                 <w:szCs w:val="18"/>
               </w:rPr>
-              <w:t xml:space="preserve">Simulatore: metodo di stima per utenza (solo utenze virtuose), buffer del Capitolo 7, taratura.</w:t>
+              <w:t xml:space="preserve">Ordinamento di tutte le tabelle e degli elenchi.</w:t>
             </w:r>
           </w:p>
         </w:tc>
@@ -3553,7 +3553,7 @@
                 <w:sz w:val="18"/>
                 <w:szCs w:val="18"/>
               </w:rPr>
-              <w:t xml:space="preserve">3.1</w:t>
+              <w:t xml:space="preserve">3.2</w:t>
             </w:r>
           </w:p>
         </w:tc>
@@ -3619,7 +3619,7 @@
                 <w:sz w:val="18"/>
                 <w:szCs w:val="18"/>
               </w:rPr>
-              <w:t xml:space="preserve">Cruscotto diventa Dashboard; barra a LED delle 7 fasi per ogni pratica.</w:t>
+              <w:t xml:space="preserve">Simulatore: metodo di stima per utenza (solo utenze virtuose), buffer del Capitolo 7, taratura.</w:t>
             </w:r>
           </w:p>
         </w:tc>
@@ -3689,7 +3689,7 @@
                 <w:sz w:val="18"/>
                 <w:szCs w:val="18"/>
               </w:rPr>
-              <w:t xml:space="preserve">3.0</w:t>
+              <w:t xml:space="preserve">3.1</w:t>
             </w:r>
           </w:p>
         </w:tc>
@@ -3753,7 +3753,7 @@
                 <w:sz w:val="18"/>
                 <w:szCs w:val="18"/>
               </w:rPr>
-              <w:t xml:space="preserve">Eliminazione degli utenti che non hanno mai operato (script 30).</w:t>
+              <w:t xml:space="preserve">Cruscotto diventa Dashboard; barra a LED delle 7 fasi per ogni pratica.</w:t>
             </w:r>
           </w:p>
         </w:tc>
@@ -3823,7 +3823,7 @@
                 <w:sz w:val="18"/>
                 <w:szCs w:val="18"/>
               </w:rPr>
-              <w:t xml:space="preserve">2.9</w:t>
+              <w:t xml:space="preserve">3.0</w:t>
             </w:r>
           </w:p>
         </w:tc>
@@ -3889,7 +3889,7 @@
                 <w:sz w:val="18"/>
                 <w:szCs w:val="18"/>
               </w:rPr>
-              <w:t xml:space="preserve">Email automatica con le credenziali al nuovo utente e alla reimpostazione della password.</w:t>
+              <w:t xml:space="preserve">Eliminazione degli utenti che non hanno mai operato (script 30).</w:t>
             </w:r>
           </w:p>
         </w:tc>
@@ -3959,7 +3959,7 @@
                 <w:sz w:val="18"/>
                 <w:szCs w:val="18"/>
               </w:rPr>
-              <w:t xml:space="preserve">2.8</w:t>
+              <w:t xml:space="preserve">2.9</w:t>
             </w:r>
           </w:p>
         </w:tc>
@@ -4023,7 +4023,7 @@
                 <w:sz w:val="18"/>
                 <w:szCs w:val="18"/>
               </w:rPr>
-              <w:t xml:space="preserve">Più Amministratori con accesso completo; Amministratore principale protetto (script 29).</w:t>
+              <w:t xml:space="preserve">Email automatica con le credenziali al nuovo utente e alla reimpostazione della password.</w:t>
             </w:r>
           </w:p>
         </w:tc>
@@ -4093,7 +4093,7 @@
                 <w:sz w:val="18"/>
                 <w:szCs w:val="18"/>
               </w:rPr>
-              <w:t xml:space="preserve">2.7</w:t>
+              <w:t xml:space="preserve">2.8</w:t>
             </w:r>
           </w:p>
         </w:tc>
@@ -4159,7 +4159,7 @@
                 <w:sz w:val="18"/>
                 <w:szCs w:val="18"/>
               </w:rPr>
-              <w:t xml:space="preserve">Simulatore: costi per il Comune secondo il Caso 1 (progetto volontario) o il Caso 2 (progetto obbligatorio da bando).</w:t>
+              <w:t xml:space="preserve">Più Amministratori con accesso completo; Amministratore principale protetto (script 29).</w:t>
             </w:r>
           </w:p>
         </w:tc>
@@ -4229,7 +4229,7 @@
                 <w:sz w:val="18"/>
                 <w:szCs w:val="18"/>
               </w:rPr>
-              <w:t xml:space="preserve">2.6</w:t>
+              <w:t xml:space="preserve">2.7</w:t>
             </w:r>
           </w:p>
         </w:tc>
@@ -4293,7 +4293,7 @@
                 <w:sz w:val="18"/>
                 <w:szCs w:val="18"/>
               </w:rPr>
-              <w:t xml:space="preserve">Simulatore: valore del credito anno per anno, proposto 32 €.</w:t>
+              <w:t xml:space="preserve">Simulatore: costi per il Comune secondo il Caso 1 (progetto volontario) o il Caso 2 (progetto obbligatorio da bando).</w:t>
             </w:r>
           </w:p>
         </w:tc>
@@ -4363,7 +4363,7 @@
                 <w:sz w:val="18"/>
                 <w:szCs w:val="18"/>
               </w:rPr>
-              <w:t xml:space="preserve">2.5</w:t>
+              <w:t xml:space="preserve">2.6</w:t>
             </w:r>
           </w:p>
         </w:tc>
@@ -4429,7 +4429,7 @@
                 <w:sz w:val="18"/>
                 <w:szCs w:val="18"/>
               </w:rPr>
-              <w:t xml:space="preserve">Simulatore: simulazione economica con valore unitario del credito e costi per il Comune (contratti tipo della Fondazione, Schema tariffario).</w:t>
+              <w:t xml:space="preserve">Simulatore: valore del credito anno per anno, proposto 32 €.</w:t>
             </w:r>
           </w:p>
         </w:tc>
@@ -4499,7 +4499,7 @@
                 <w:sz w:val="18"/>
                 <w:szCs w:val="18"/>
               </w:rPr>
-              <w:t xml:space="preserve">2.4</w:t>
+              <w:t xml:space="preserve">2.5</w:t>
             </w:r>
           </w:p>
         </w:tc>
@@ -4563,7 +4563,7 @@
                 <w:sz w:val="18"/>
                 <w:szCs w:val="18"/>
               </w:rPr>
-              <w:t xml:space="preserve">Simulatore: riferimento sempre alla soglia del 65% di differenziata e controllo dei valori fuori scala.</w:t>
+              <w:t xml:space="preserve">Simulatore: simulazione economica con valore unitario del credito e costi per il Comune (contratti tipo della Fondazione, Schema tariffario).</w:t>
             </w:r>
           </w:p>
         </w:tc>
@@ -4633,7 +4633,7 @@
                 <w:sz w:val="18"/>
                 <w:szCs w:val="18"/>
               </w:rPr>
-              <w:t xml:space="preserve">2.3</w:t>
+              <w:t xml:space="preserve">2.4</w:t>
             </w:r>
           </w:p>
         </w:tc>
@@ -4699,7 +4699,7 @@
                 <w:sz w:val="18"/>
                 <w:szCs w:val="18"/>
               </w:rPr>
-              <w:t xml:space="preserve">Simulatore conforme al modello CWP: scenario di riferimento dello Standard 4.8.1, situazione attuale, conformità.</w:t>
+              <w:t xml:space="preserve">Simulatore: riferimento sempre alla soglia del 65% di differenziata e controllo dei valori fuori scala.</w:t>
             </w:r>
           </w:p>
         </w:tc>
@@ -4769,7 +4769,7 @@
                 <w:sz w:val="18"/>
                 <w:szCs w:val="18"/>
               </w:rPr>
-              <w:t xml:space="preserve">2.2</w:t>
+              <w:t xml:space="preserve">2.3</w:t>
             </w:r>
           </w:p>
         </w:tc>
@@ -4833,7 +4833,7 @@
                 <w:sz w:val="18"/>
                 <w:szCs w:val="18"/>
               </w:rPr>
-              <w:t xml:space="preserve">Nuovo capitolo «Simulatore di scenari»: creazione, anno base, obiettivi annui, risultati, modello di stima.</w:t>
+              <w:t xml:space="preserve">Simulatore conforme al modello CWP: scenario di riferimento dello Standard 4.8.1, situazione attuale, conformità.</w:t>
             </w:r>
           </w:p>
         </w:tc>
@@ -4903,7 +4903,7 @@
                 <w:sz w:val="18"/>
                 <w:szCs w:val="18"/>
               </w:rPr>
-              <w:t xml:space="preserve">2.1</w:t>
+              <w:t xml:space="preserve">2.2</w:t>
             </w:r>
           </w:p>
         </w:tc>
@@ -4969,7 +4969,7 @@
                 <w:sz w:val="18"/>
                 <w:szCs w:val="18"/>
               </w:rPr>
-              <w:t xml:space="preserve">Funzioni in arrivo: simulatore di scenari (7, 10 o 21 anni, obiettivi annui, % di differenziata e crediti stimati) e assistente virtuale (Claude).</w:t>
+              <w:t xml:space="preserve">Nuovo capitolo «Simulatore di scenari»: creazione, anno base, obiettivi annui, risultati, modello di stima.</w:t>
             </w:r>
           </w:p>
         </w:tc>
@@ -5039,7 +5039,7 @@
                 <w:sz w:val="18"/>
                 <w:szCs w:val="18"/>
               </w:rPr>
-              <w:t xml:space="preserve">2.0</w:t>
+              <w:t xml:space="preserve">2.1</w:t>
             </w:r>
           </w:p>
         </w:tc>
@@ -5103,7 +5103,7 @@
                 <w:sz w:val="18"/>
                 <w:szCs w:val="18"/>
               </w:rPr>
-              <w:t xml:space="preserve">Copie di sicurezza e ripristino: rimando alle Istruzioni di ripristino e punti essenziali (capitolo Manutenzione ed emergenze).</w:t>
+              <w:t xml:space="preserve">Funzioni in arrivo: simulatore di scenari (7, 10 o 21 anni, obiettivi annui, % di differenziata e crediti stimati) e assistente virtuale (Claude).</w:t>
             </w:r>
           </w:p>
         </w:tc>
@@ -5173,7 +5173,7 @@
                 <w:sz w:val="18"/>
                 <w:szCs w:val="18"/>
               </w:rPr>
-              <w:t xml:space="preserve">1.9</w:t>
+              <w:t xml:space="preserve">2.0</w:t>
             </w:r>
           </w:p>
         </w:tc>
@@ -5239,7 +5239,7 @@
                 <w:sz w:val="18"/>
                 <w:szCs w:val="18"/>
               </w:rPr>
-              <w:t xml:space="preserve">Fondazione Operate soggetto promotore del programma (esclusiva conferita da Wastelab).</w:t>
+              <w:t xml:space="preserve">Copie di sicurezza e ripristino: rimando alle Istruzioni di ripristino e punti essenziali (capitolo Manutenzione ed emergenze).</w:t>
             </w:r>
           </w:p>
         </w:tc>
@@ -5309,7 +5309,7 @@
                 <w:sz w:val="18"/>
                 <w:szCs w:val="18"/>
               </w:rPr>
-              <w:t xml:space="preserve">1.8</w:t>
+              <w:t xml:space="preserve">1.9</w:t>
             </w:r>
           </w:p>
         </w:tc>
@@ -5373,7 +5373,7 @@
                 <w:sz w:val="18"/>
                 <w:szCs w:val="18"/>
               </w:rPr>
-              <w:t xml:space="preserve">PEC del Programma e documenti ufficiali già pubblicati sulla pagina pubblica.</w:t>
+              <w:t xml:space="preserve">Fondazione Operate soggetto promotore del programma (esclusiva conferita da Wastelab).</w:t>
             </w:r>
           </w:p>
         </w:tc>
@@ -5443,7 +5443,7 @@
                 <w:sz w:val="18"/>
                 <w:szCs w:val="18"/>
               </w:rPr>
-              <w:t xml:space="preserve">1.7</w:t>
+              <w:t xml:space="preserve">1.8</w:t>
             </w:r>
           </w:p>
         </w:tc>
@@ -5476,7 +5476,7 @@
                 <w:sz w:val="18"/>
                 <w:szCs w:val="18"/>
               </w:rPr>
-              <w:t xml:space="preserve">18/10/2026</w:t>
+              <w:t xml:space="preserve">19/10/2026</w:t>
             </w:r>
           </w:p>
         </w:tc>
@@ -5509,7 +5509,7 @@
                 <w:sz w:val="18"/>
                 <w:szCs w:val="18"/>
               </w:rPr>
-              <w:t xml:space="preserve">Allineamento ai documenti ufficiali del Programma (script 22-24): Rapporto a 7 fasi, feedback pubblico, stati del Programma, dati del progetto e territorio ISTAT, ritiro e rientro, account unico e delegati, registri, tariffe e sospensione, accuratezza e accertamenti, informazioni del Programma e metodologie, modelli pubblici; nuovi capitoli Crediti emessi, Reclami, Pagina pubblica; qualità dei dati nel calcolo.</w:t>
+              <w:t xml:space="preserve">PEC del Programma e documenti ufficiali già pubblicati sulla pagina pubblica.</w:t>
             </w:r>
           </w:p>
         </w:tc>
@@ -5579,7 +5579,7 @@
                 <w:sz w:val="18"/>
                 <w:szCs w:val="18"/>
               </w:rPr>
-              <w:t xml:space="preserve">1.6</w:t>
+              <w:t xml:space="preserve">1.7</w:t>
             </w:r>
           </w:p>
         </w:tc>
@@ -5643,7 +5643,7 @@
                 <w:sz w:val="18"/>
                 <w:szCs w:val="18"/>
               </w:rPr>
-              <w:t xml:space="preserve">Calcolo crediti: descrizione corretta del buffer (somma delle voci delle Tabelle 15 e 16, più il 20% con le sole utenze virtuose, al massimo 80%).</w:t>
+              <w:t xml:space="preserve">Allineamento ai documenti ufficiali del Programma (script 22-24): Rapporto a 7 fasi, feedback pubblico, stati del Programma, dati del progetto e territorio ISTAT, ritiro e rientro, account unico e delegati, registri, tariffe e sospensione, accuratezza e accertamenti, informazioni del Programma e metodologie, modelli pubblici; nuovi capitoli Crediti emessi, Reclami, Pagina pubblica; qualità dei dati nel calcolo.</w:t>
             </w:r>
           </w:p>
         </w:tc>
@@ -5713,7 +5713,7 @@
                 <w:sz w:val="18"/>
                 <w:szCs w:val="18"/>
               </w:rPr>
-              <w:t xml:space="preserve">1.5</w:t>
+              <w:t xml:space="preserve">1.6</w:t>
             </w:r>
           </w:p>
         </w:tc>
@@ -5779,7 +5779,7 @@
                 <w:sz w:val="18"/>
                 <w:szCs w:val="18"/>
               </w:rPr>
-              <w:t xml:space="preserve">Nuova pagina Anagrafiche (Organizzazioni ed Enti, anche per gli Operatori); Rapporti con 4 fasi e durate proprie; documenti richiesti per fase; consultazione con documento bloccato, osservazioni numerate e motivazione; conservazione per 10 anni; fascicolo con riepilogo PDF e nuove cartelle.</w:t>
+              <w:t xml:space="preserve">Calcolo crediti: descrizione corretta del buffer (somma delle voci delle Tabelle 15 e 16, più il 20% con le sole utenze virtuose, al massimo 80%).</w:t>
             </w:r>
           </w:p>
         </w:tc>
@@ -5849,7 +5849,7 @@
                 <w:sz w:val="18"/>
                 <w:szCs w:val="18"/>
               </w:rPr>
-              <w:t xml:space="preserve">1.4</w:t>
+              <w:t xml:space="preserve">1.5</w:t>
             </w:r>
           </w:p>
         </w:tc>
@@ -5913,7 +5913,7 @@
                 <w:sz w:val="18"/>
                 <w:szCs w:val="18"/>
               </w:rPr>
-              <w:t xml:space="preserve">Calcolo crediti: il risultato si azzera quando cambiano dati o Banca Dati Utenze, conferma solo dopo un nuovo «Calcola». Gestione utenti: password temporanea di almeno 10 caratteri con lettere e numeri, creazione annullata se non va a buon fine, nessun accesso ai dati prima del cambio password.</w:t>
+              <w:t xml:space="preserve">Nuova pagina Anagrafiche (Organizzazioni ed Enti, anche per gli Operatori); Rapporti con 4 fasi e durate proprie; documenti richiesti per fase; consultazione con documento bloccato, osservazioni numerate e motivazione; conservazione per 10 anni; fascicolo con riepilogo PDF e nuove cartelle.</w:t>
             </w:r>
           </w:p>
         </w:tc>
@@ -5983,7 +5983,7 @@
                 <w:sz w:val="18"/>
                 <w:szCs w:val="18"/>
               </w:rPr>
-              <w:t xml:space="preserve">1.3</w:t>
+              <w:t xml:space="preserve">1.4</w:t>
             </w:r>
           </w:p>
         </w:tc>
@@ -6049,7 +6049,7 @@
                 <w:sz w:val="18"/>
                 <w:szCs w:val="18"/>
               </w:rPr>
-              <w:t xml:space="preserve">Rapporto di calcolo in PDF, archiviazione nella pratica, numero di registro, registro dei crediti.</w:t>
+              <w:t xml:space="preserve">Calcolo crediti: il risultato si azzera quando cambiano dati o Banca Dati Utenze, conferma solo dopo un nuovo «Calcola». Gestione utenti: password temporanea di almeno 10 caratteri con lettere e numeri, creazione annullata se non va a buon fine, nessun accesso ai dati prima del cambio password.</w:t>
             </w:r>
           </w:p>
         </w:tc>
@@ -6119,7 +6119,7 @@
                 <w:sz w:val="18"/>
                 <w:szCs w:val="18"/>
               </w:rPr>
-              <w:t xml:space="preserve">1.2</w:t>
+              <w:t xml:space="preserve">1.3</w:t>
             </w:r>
           </w:p>
         </w:tc>
@@ -6183,7 +6183,7 @@
                 <w:sz w:val="18"/>
                 <w:szCs w:val="18"/>
               </w:rPr>
-              <w:t xml:space="preserve">Calcolo crediti: importare il tracciato nel calcolo (dai documenti della pratica o dal computer), singole letture, blocco dei dati personali, controlli di coerenza.</w:t>
+              <w:t xml:space="preserve">Rapporto di calcolo in PDF, archiviazione nella pratica, numero di registro, registro dei crediti.</w:t>
             </w:r>
           </w:p>
         </w:tc>
@@ -6253,7 +6253,7 @@
                 <w:sz w:val="18"/>
                 <w:szCs w:val="18"/>
               </w:rPr>
-              <w:t xml:space="preserve">1.1</w:t>
+              <w:t xml:space="preserve">1.2</w:t>
             </w:r>
           </w:p>
         </w:tc>
@@ -6319,7 +6319,7 @@
                 <w:sz w:val="18"/>
                 <w:szCs w:val="18"/>
               </w:rPr>
-              <w:t xml:space="preserve">Note di fase, Ente di Validazione della pratica, consultazione sulla pagina pubblica con conferma dell'email, moderazione con autori e allegati, errata corrige; nuovo capitolo Messaggi con il Comune; pagamenti visibili al Comune; Impostazioni: Enti di Validazione e Modelli di documento; notifiche aggiornate.</w:t>
+              <w:t xml:space="preserve">Calcolo crediti: importare il tracciato nel calcolo (dai documenti della pratica o dal computer), singole letture, blocco dei dati personali, controlli di coerenza.</w:t>
             </w:r>
           </w:p>
         </w:tc>
@@ -6389,6 +6389,140 @@
                 <w:sz w:val="18"/>
                 <w:szCs w:val="18"/>
               </w:rPr>
+              <w:t xml:space="preserve">1.1</w:t>
+            </w:r>
+          </w:p>
+        </w:tc>
+        <w:tc>
+          <w:tcPr>
+            <w:tcW w:type="dxa" w:w="1300"/>
+            <w:tcBorders>
+              <w:top w:val="single" w:color="D9D4C5" w:sz="4"/>
+              <w:left w:val="single" w:color="D9D4C5" w:sz="4"/>
+              <w:bottom w:val="single" w:color="D9D4C5" w:sz="4"/>
+              <w:right w:val="single" w:color="D9D4C5" w:sz="4"/>
+            </w:tcBorders>
+            <w:tcMar>
+              <w:top w:type="dxa" w:w="70"/>
+              <w:left w:type="dxa" w:w="110"/>
+              <w:bottom w:type="dxa" w:w="70"/>
+              <w:right w:type="dxa" w:w="110"/>
+            </w:tcMar>
+            <w:vAlign w:val="center"/>
+          </w:tcPr>
+          <w:p>
+            <w:pPr>
+              <w:spacing w:after="0" w:before="0"/>
+            </w:pPr>
+            <w:r>
+              <w:rPr>
+                <w:rFonts w:ascii="Arial" w:cs="Arial" w:eastAsia="Arial" w:hAnsi="Arial"/>
+                <w:color w:val="1B2118"/>
+                <w:sz w:val="18"/>
+                <w:szCs w:val="18"/>
+              </w:rPr>
+              <w:t xml:space="preserve">18/10/2026</w:t>
+            </w:r>
+          </w:p>
+        </w:tc>
+        <w:tc>
+          <w:tcPr>
+            <w:tcW w:type="dxa" w:w="5538"/>
+            <w:tcBorders>
+              <w:top w:val="single" w:color="D9D4C5" w:sz="4"/>
+              <w:left w:val="single" w:color="D9D4C5" w:sz="4"/>
+              <w:bottom w:val="single" w:color="D9D4C5" w:sz="4"/>
+              <w:right w:val="single" w:color="D9D4C5" w:sz="4"/>
+            </w:tcBorders>
+            <w:tcMar>
+              <w:top w:type="dxa" w:w="70"/>
+              <w:left w:type="dxa" w:w="110"/>
+              <w:bottom w:type="dxa" w:w="70"/>
+              <w:right w:type="dxa" w:w="110"/>
+            </w:tcMar>
+            <w:vAlign w:val="center"/>
+          </w:tcPr>
+          <w:p>
+            <w:pPr>
+              <w:spacing w:after="0" w:before="0"/>
+            </w:pPr>
+            <w:r>
+              <w:rPr>
+                <w:rFonts w:ascii="Arial" w:cs="Arial" w:eastAsia="Arial" w:hAnsi="Arial"/>
+                <w:color w:val="1B2118"/>
+                <w:sz w:val="18"/>
+                <w:szCs w:val="18"/>
+              </w:rPr>
+              <w:t xml:space="preserve">Note di fase, Ente di Validazione della pratica, consultazione sulla pagina pubblica con conferma dell'email, moderazione con autori e allegati, errata corrige; nuovo capitolo Messaggi con il Comune; pagamenti visibili al Comune; Impostazioni: Enti di Validazione e Modelli di documento; notifiche aggiornate.</w:t>
+            </w:r>
+          </w:p>
+        </w:tc>
+        <w:tc>
+          <w:tcPr>
+            <w:tcW w:type="dxa" w:w="2000"/>
+            <w:tcBorders>
+              <w:top w:val="single" w:color="D9D4C5" w:sz="4"/>
+              <w:left w:val="single" w:color="D9D4C5" w:sz="4"/>
+              <w:bottom w:val="single" w:color="D9D4C5" w:sz="4"/>
+              <w:right w:val="single" w:color="D9D4C5" w:sz="4"/>
+            </w:tcBorders>
+            <w:tcMar>
+              <w:top w:type="dxa" w:w="70"/>
+              <w:left w:type="dxa" w:w="110"/>
+              <w:bottom w:type="dxa" w:w="70"/>
+              <w:right w:type="dxa" w:w="110"/>
+            </w:tcMar>
+            <w:vAlign w:val="center"/>
+          </w:tcPr>
+          <w:p>
+            <w:pPr>
+              <w:spacing w:after="0" w:before="0"/>
+            </w:pPr>
+            <w:r>
+              <w:rPr>
+                <w:rFonts w:ascii="Arial" w:cs="Arial" w:eastAsia="Arial" w:hAnsi="Arial"/>
+                <w:color w:val="1B2118"/>
+                <w:sz w:val="18"/>
+                <w:szCs w:val="18"/>
+              </w:rPr>
+              <w:t xml:space="preserve">Fondazione Operate</w:t>
+            </w:r>
+          </w:p>
+        </w:tc>
+      </w:tr>
+      <w:tr>
+        <w:trPr>
+          <w:cantSplit/>
+        </w:trPr>
+        <w:tc>
+          <w:tcPr>
+            <w:tcW w:type="dxa" w:w="800"/>
+            <w:tcBorders>
+              <w:top w:val="single" w:color="D9D4C5" w:sz="4"/>
+              <w:left w:val="single" w:color="D9D4C5" w:sz="4"/>
+              <w:bottom w:val="single" w:color="D9D4C5" w:sz="4"/>
+              <w:right w:val="single" w:color="D9D4C5" w:sz="4"/>
+            </w:tcBorders>
+            <w:shd w:fill="F6F4EE" w:color="auto" w:val="clear"/>
+            <w:tcMar>
+              <w:top w:type="dxa" w:w="70"/>
+              <w:left w:type="dxa" w:w="110"/>
+              <w:bottom w:type="dxa" w:w="70"/>
+              <w:right w:type="dxa" w:w="110"/>
+            </w:tcMar>
+            <w:vAlign w:val="center"/>
+          </w:tcPr>
+          <w:p>
+            <w:pPr>
+              <w:spacing w:after="0" w:before="0"/>
+            </w:pPr>
+            <w:r>
+              <w:rPr>
+                <w:rFonts w:ascii="Arial" w:cs="Arial" w:eastAsia="Arial" w:hAnsi="Arial"/>
+                <w:color w:val="1B2118"/>
+                <w:sz w:val="18"/>
+                <w:szCs w:val="18"/>
+              </w:rPr>
               <w:t xml:space="preserve">1.0</w:t>
             </w:r>
           </w:p>
@@ -6402,6 +6536,7 @@
               <w:bottom w:val="single" w:color="D9D4C5" w:sz="4"/>
               <w:right w:val="single" w:color="D9D4C5" w:sz="4"/>
             </w:tcBorders>
+            <w:shd w:fill="F6F4EE" w:color="auto" w:val="clear"/>
             <w:tcMar>
               <w:top w:type="dxa" w:w="70"/>
               <w:left w:type="dxa" w:w="110"/>
@@ -6434,6 +6569,7 @@
               <w:bottom w:val="single" w:color="D9D4C5" w:sz="4"/>
               <w:right w:val="single" w:color="D9D4C5" w:sz="4"/>
             </w:tcBorders>
+            <w:shd w:fill="F6F4EE" w:color="auto" w:val="clear"/>
             <w:tcMar>
               <w:top w:type="dxa" w:w="70"/>
               <w:left w:type="dxa" w:w="110"/>
@@ -6466,6 +6602,7 @@
               <w:bottom w:val="single" w:color="D9D4C5" w:sz="4"/>
               <w:right w:val="single" w:color="D9D4C5" w:sz="4"/>
             </w:tcBorders>
+            <w:shd w:fill="F6F4EE" w:color="auto" w:val="clear"/>
             <w:tcMar>
               <w:top w:type="dxa" w:w="70"/>
               <w:left w:type="dxa" w:w="110"/>
@@ -6507,7 +6644,7 @@
           <w:sz w:val="20"/>
           <w:szCs w:val="20"/>
         </w:rPr>
-        <w:t xml:space="preserve">Questo documento descrive il portale alla revisione 5.2 del 22/10/2026. A ogni modifica del portale il manuale viene aggiornato e la revisione incrementata; la versione corrente si scarica dall'area Documentazione del portale (solo Amministratori).</w:t>
+        <w:t xml:space="preserve">Questo documento descrive il portale alla revisione 5.3 del 22/10/2026. A ogni modifica del portale il manuale viene aggiornato e la revisione incrementata; la versione corrente si scarica dall'area Documentazione del portale (solo Amministratori).</w:t>
       </w:r>
     </w:p>
     <w:p>
@@ -7081,7 +7218,7 @@
             <w:szCs w:val="22"/>
           </w:rPr>
           <w:tab/>
-          <w:t xml:space="preserve">41</w:t>
+          <w:t xml:space="preserve">42</w:t>
         </w:r>
       </w:hyperlink>
     </w:p>
@@ -7110,7 +7247,7 @@
             <w:szCs w:val="22"/>
           </w:rPr>
           <w:tab/>
-          <w:t xml:space="preserve">45</w:t>
+          <w:t xml:space="preserve">46</w:t>
         </w:r>
       </w:hyperlink>
     </w:p>
@@ -7139,7 +7276,7 @@
             <w:szCs w:val="22"/>
           </w:rPr>
           <w:tab/>
-          <w:t xml:space="preserve">47</w:t>
+          <w:t xml:space="preserve">48</w:t>
         </w:r>
       </w:hyperlink>
     </w:p>
@@ -7168,7 +7305,7 @@
             <w:szCs w:val="22"/>
           </w:rPr>
           <w:tab/>
-          <w:t xml:space="preserve">48</w:t>
+          <w:t xml:space="preserve">49</w:t>
         </w:r>
       </w:hyperlink>
     </w:p>
@@ -7197,7 +7334,7 @@
             <w:szCs w:val="22"/>
           </w:rPr>
           <w:tab/>
-          <w:t xml:space="preserve">49</w:t>
+          <w:t xml:space="preserve">50</w:t>
         </w:r>
       </w:hyperlink>
     </w:p>
@@ -7226,7 +7363,7 @@
             <w:szCs w:val="22"/>
           </w:rPr>
           <w:tab/>
-          <w:t xml:space="preserve">50</w:t>
+          <w:t xml:space="preserve">51</w:t>
         </w:r>
       </w:hyperlink>
     </w:p>
@@ -7284,7 +7421,7 @@
             <w:szCs w:val="22"/>
           </w:rPr>
           <w:tab/>
-          <w:t xml:space="preserve">53</w:t>
+          <w:t xml:space="preserve">54</w:t>
         </w:r>
       </w:hyperlink>
     </w:p>
@@ -7313,7 +7450,7 @@
             <w:szCs w:val="22"/>
           </w:rPr>
           <w:tab/>
-          <w:t xml:space="preserve">55</w:t>
+          <w:t xml:space="preserve">56</w:t>
         </w:r>
       </w:hyperlink>
     </w:p>
@@ -7342,7 +7479,7 @@
             <w:szCs w:val="22"/>
           </w:rPr>
           <w:tab/>
-          <w:t xml:space="preserve">56</w:t>
+          <w:t xml:space="preserve">57</w:t>
         </w:r>
       </w:hyperlink>
     </w:p>
@@ -7371,7 +7508,7 @@
             <w:szCs w:val="22"/>
           </w:rPr>
           <w:tab/>
-          <w:t xml:space="preserve">57</w:t>
+          <w:t xml:space="preserve">58</w:t>
         </w:r>
       </w:hyperlink>
     </w:p>
@@ -9387,7 +9524,7 @@
         </w:rPr>
         <w:t xml:space="preserve">Si accede da </w:t>
       </w:r>
-      <w:hyperlink w:history="1" r:id="rIdj00cxwd139jmglwpb2ntm">
+      <w:hyperlink w:history="1" r:id="rIdepix4z_fvirohfa9wu4he">
         <w:r>
           <w:rPr>
             <w:rFonts w:ascii="Arial" w:cs="Arial" w:eastAsia="Arial" w:hAnsi="Arial"/>
@@ -33243,6 +33380,1909 @@
           <w:szCs w:val="21"/>
         </w:rPr>
         <w:t xml:space="preserve">).</w:t>
+      </w:r>
+    </w:p>
+    <w:p>
+      <w:pPr>
+        <w:pStyle w:val="Heading2"/>
+        <w:keepNext/>
+        <w:spacing w:after="120" w:before="240"/>
+      </w:pPr>
+      <w:r>
+        <w:rPr>
+          <w:rFonts w:ascii="Arial" w:cs="Arial" w:eastAsia="Arial" w:hAnsi="Arial"/>
+          <w:b/>
+          <w:bCs/>
+          <w:color w:val="2F5D3A"/>
+          <w:sz w:val="25"/>
+          <w:szCs w:val="25"/>
+        </w:rPr>
+        <w:t xml:space="preserve">Banca Dati Utenze per utenza (nuovo formato, in arrivo)</w:t>
+      </w:r>
+    </w:p>
+    <w:p>
+      <w:pPr>
+        <w:spacing w:after="140" w:line="300"/>
+      </w:pPr>
+      <w:r>
+        <w:rPr>
+          <w:rFonts w:ascii="Arial" w:cs="Arial" w:eastAsia="Arial" w:hAnsi="Arial"/>
+          <w:color w:val="1B2118"/>
+          <w:sz w:val="21"/>
+          <w:szCs w:val="21"/>
+        </w:rPr>
+        <w:t xml:space="preserve">Il calcolo dei crediti passerà a un formato </w:t>
+      </w:r>
+      <w:r>
+        <w:rPr>
+          <w:rFonts w:ascii="Arial" w:cs="Arial" w:eastAsia="Arial" w:hAnsi="Arial"/>
+          <w:b/>
+          <w:bCs/>
+          <w:color w:val="1B2118"/>
+          <w:sz w:val="21"/>
+          <w:szCs w:val="21"/>
+        </w:rPr>
+        <w:t xml:space="preserve">per utenza</w:t>
+      </w:r>
+      <w:r>
+        <w:rPr>
+          <w:rFonts w:ascii="Arial" w:cs="Arial" w:eastAsia="Arial" w:hAnsi="Arial"/>
+          <w:color w:val="1B2118"/>
+          <w:sz w:val="21"/>
+          <w:szCs w:val="21"/>
+        </w:rPr>
+        <w:t xml:space="preserve">: ogni anno il Comune o il gestore compila il modello </w:t>
+      </w:r>
+      <w:r>
+        <w:rPr>
+          <w:rFonts w:ascii="Arial" w:cs="Arial" w:eastAsia="Arial" w:hAnsi="Arial"/>
+          <w:b/>
+          <w:bCs/>
+          <w:color w:val="1B2118"/>
+          <w:sz w:val="21"/>
+          <w:szCs w:val="21"/>
+        </w:rPr>
+        <w:t xml:space="preserve">Banca dati utenze CWP</w:t>
+      </w:r>
+      <w:r>
+        <w:rPr>
+          <w:rFonts w:ascii="Arial" w:cs="Arial" w:eastAsia="Arial" w:hAnsi="Arial"/>
+          <w:color w:val="1B2118"/>
+          <w:sz w:val="21"/>
+          <w:szCs w:val="21"/>
+        </w:rPr>
+        <w:t xml:space="preserve"> con l'elenco </w:t>
+      </w:r>
+      <w:r>
+        <w:rPr>
+          <w:rFonts w:ascii="Arial" w:cs="Arial" w:eastAsia="Arial" w:hAnsi="Arial"/>
+          <w:b/>
+          <w:bCs/>
+          <w:color w:val="1B2118"/>
+          <w:sz w:val="21"/>
+          <w:szCs w:val="21"/>
+        </w:rPr>
+        <w:t xml:space="preserve">completo</w:t>
+      </w:r>
+      <w:r>
+        <w:rPr>
+          <w:rFonts w:ascii="Arial" w:cs="Arial" w:eastAsia="Arial" w:hAnsi="Arial"/>
+          <w:color w:val="1B2118"/>
+          <w:sz w:val="21"/>
+          <w:szCs w:val="21"/>
+        </w:rPr>
+        <w:t xml:space="preserve"> delle utenze dell'anno, domestiche e non domestiche, e lo carica nel calcolo di quell'anno. Nessun dato si riprende dall'anno precedente, perché le utenze cambiano di continuo.</w:t>
+      </w:r>
+    </w:p>
+    <w:p>
+      <w:pPr>
+        <w:spacing w:after="140" w:line="300"/>
+      </w:pPr>
+      <w:r>
+        <w:rPr>
+          <w:rFonts w:ascii="Arial" w:cs="Arial" w:eastAsia="Arial" w:hAnsi="Arial"/>
+          <w:b/>
+          <w:bCs/>
+          <w:color w:val="1B2118"/>
+          <w:sz w:val="21"/>
+          <w:szCs w:val="21"/>
+        </w:rPr>
+        <w:t xml:space="preserve">Foglio Utenze_domestiche</w:t>
+      </w:r>
+      <w:r>
+        <w:rPr>
+          <w:rFonts w:ascii="Arial" w:cs="Arial" w:eastAsia="Arial" w:hAnsi="Arial"/>
+          <w:color w:val="1B2118"/>
+          <w:sz w:val="21"/>
+          <w:szCs w:val="21"/>
+        </w:rPr>
+        <w:t xml:space="preserve"> — una riga per ogni utenza domestica attiva nell'anno.</w:t>
+      </w:r>
+    </w:p>
+    <w:tbl>
+      <w:tblPr>
+        <w:tblW w:type="dxa" w:w="9638"/>
+        <w:tblBorders>
+          <w:top w:val="single" w:color="auto" w:sz="4"/>
+          <w:left w:val="single" w:color="auto" w:sz="4"/>
+          <w:bottom w:val="single" w:color="auto" w:sz="4"/>
+          <w:right w:val="single" w:color="auto" w:sz="4"/>
+          <w:insideH w:val="single" w:color="auto" w:sz="4"/>
+          <w:insideV w:val="single" w:color="auto" w:sz="4"/>
+        </w:tblBorders>
+        <w:tblLayout w:type="fixed"/>
+      </w:tblPr>
+      <w:tblGrid>
+        <w:gridCol w:w="3939"/>
+        <w:gridCol w:w="1760"/>
+        <w:gridCol w:w="3939"/>
+      </w:tblGrid>
+      <w:tr>
+        <w:trPr>
+          <w:tblHeader/>
+        </w:trPr>
+        <w:tc>
+          <w:tcPr>
+            <w:tcW w:type="dxa" w:w="3939"/>
+            <w:tcBorders>
+              <w:top w:val="single" w:color="D9D4C5" w:sz="4"/>
+              <w:left w:val="single" w:color="D9D4C5" w:sz="4"/>
+              <w:bottom w:val="single" w:color="D9D4C5" w:sz="4"/>
+              <w:right w:val="single" w:color="D9D4C5" w:sz="4"/>
+            </w:tcBorders>
+            <w:shd w:fill="2F5D3A" w:color="auto" w:val="clear"/>
+            <w:tcMar>
+              <w:top w:type="dxa" w:w="70"/>
+              <w:left w:type="dxa" w:w="110"/>
+              <w:bottom w:type="dxa" w:w="70"/>
+              <w:right w:type="dxa" w:w="110"/>
+            </w:tcMar>
+            <w:vAlign w:val="center"/>
+          </w:tcPr>
+          <w:p>
+            <w:pPr>
+              <w:spacing w:after="0" w:before="0"/>
+            </w:pPr>
+            <w:r>
+              <w:rPr>
+                <w:rFonts w:ascii="Arial" w:cs="Arial" w:eastAsia="Arial" w:hAnsi="Arial"/>
+                <w:b/>
+                <w:bCs/>
+                <w:color w:val="FFFFFF"/>
+                <w:sz w:val="18"/>
+                <w:szCs w:val="18"/>
+              </w:rPr>
+              <w:t xml:space="preserve">Colonna</w:t>
+            </w:r>
+          </w:p>
+        </w:tc>
+        <w:tc>
+          <w:tcPr>
+            <w:tcW w:type="dxa" w:w="1760"/>
+            <w:tcBorders>
+              <w:top w:val="single" w:color="D9D4C5" w:sz="4"/>
+              <w:left w:val="single" w:color="D9D4C5" w:sz="4"/>
+              <w:bottom w:val="single" w:color="D9D4C5" w:sz="4"/>
+              <w:right w:val="single" w:color="D9D4C5" w:sz="4"/>
+            </w:tcBorders>
+            <w:shd w:fill="2F5D3A" w:color="auto" w:val="clear"/>
+            <w:tcMar>
+              <w:top w:type="dxa" w:w="70"/>
+              <w:left w:type="dxa" w:w="110"/>
+              <w:bottom w:type="dxa" w:w="70"/>
+              <w:right w:type="dxa" w:w="110"/>
+            </w:tcMar>
+            <w:vAlign w:val="center"/>
+          </w:tcPr>
+          <w:p>
+            <w:pPr>
+              <w:spacing w:after="0" w:before="0"/>
+            </w:pPr>
+            <w:r>
+              <w:rPr>
+                <w:rFonts w:ascii="Arial" w:cs="Arial" w:eastAsia="Arial" w:hAnsi="Arial"/>
+                <w:b/>
+                <w:bCs/>
+                <w:color w:val="FFFFFF"/>
+                <w:sz w:val="18"/>
+                <w:szCs w:val="18"/>
+              </w:rPr>
+              <w:t xml:space="preserve">Obbligatoria</w:t>
+            </w:r>
+          </w:p>
+        </w:tc>
+        <w:tc>
+          <w:tcPr>
+            <w:tcW w:type="dxa" w:w="3939"/>
+            <w:tcBorders>
+              <w:top w:val="single" w:color="D9D4C5" w:sz="4"/>
+              <w:left w:val="single" w:color="D9D4C5" w:sz="4"/>
+              <w:bottom w:val="single" w:color="D9D4C5" w:sz="4"/>
+              <w:right w:val="single" w:color="D9D4C5" w:sz="4"/>
+            </w:tcBorders>
+            <w:shd w:fill="2F5D3A" w:color="auto" w:val="clear"/>
+            <w:tcMar>
+              <w:top w:type="dxa" w:w="70"/>
+              <w:left w:type="dxa" w:w="110"/>
+              <w:bottom w:type="dxa" w:w="70"/>
+              <w:right w:type="dxa" w:w="110"/>
+            </w:tcMar>
+            <w:vAlign w:val="center"/>
+          </w:tcPr>
+          <w:p>
+            <w:pPr>
+              <w:spacing w:after="0" w:before="0"/>
+            </w:pPr>
+            <w:r>
+              <w:rPr>
+                <w:rFonts w:ascii="Arial" w:cs="Arial" w:eastAsia="Arial" w:hAnsi="Arial"/>
+                <w:b/>
+                <w:bCs/>
+                <w:color w:val="FFFFFF"/>
+                <w:sz w:val="18"/>
+                <w:szCs w:val="18"/>
+              </w:rPr>
+              <w:t xml:space="preserve">Cosa contiene</w:t>
+            </w:r>
+          </w:p>
+        </w:tc>
+      </w:tr>
+      <w:tr>
+        <w:trPr>
+          <w:cantSplit/>
+        </w:trPr>
+        <w:tc>
+          <w:tcPr>
+            <w:tcW w:type="dxa" w:w="3939"/>
+            <w:tcBorders>
+              <w:top w:val="single" w:color="D9D4C5" w:sz="4"/>
+              <w:left w:val="single" w:color="D9D4C5" w:sz="4"/>
+              <w:bottom w:val="single" w:color="D9D4C5" w:sz="4"/>
+              <w:right w:val="single" w:color="D9D4C5" w:sz="4"/>
+            </w:tcBorders>
+            <w:tcMar>
+              <w:top w:type="dxa" w:w="70"/>
+              <w:left w:type="dxa" w:w="110"/>
+              <w:bottom w:type="dxa" w:w="70"/>
+              <w:right w:type="dxa" w:w="110"/>
+            </w:tcMar>
+            <w:vAlign w:val="center"/>
+          </w:tcPr>
+          <w:p>
+            <w:pPr>
+              <w:spacing w:after="0" w:before="0"/>
+            </w:pPr>
+            <w:r>
+              <w:rPr>
+                <w:rFonts w:ascii="Arial" w:cs="Arial" w:eastAsia="Arial" w:hAnsi="Arial"/>
+                <w:color w:val="1B2118"/>
+                <w:sz w:val="18"/>
+                <w:szCs w:val="18"/>
+              </w:rPr>
+              <w:t xml:space="preserve">Codice utenza</w:t>
+            </w:r>
+          </w:p>
+        </w:tc>
+        <w:tc>
+          <w:tcPr>
+            <w:tcW w:type="dxa" w:w="1760"/>
+            <w:tcBorders>
+              <w:top w:val="single" w:color="D9D4C5" w:sz="4"/>
+              <w:left w:val="single" w:color="D9D4C5" w:sz="4"/>
+              <w:bottom w:val="single" w:color="D9D4C5" w:sz="4"/>
+              <w:right w:val="single" w:color="D9D4C5" w:sz="4"/>
+            </w:tcBorders>
+            <w:tcMar>
+              <w:top w:type="dxa" w:w="70"/>
+              <w:left w:type="dxa" w:w="110"/>
+              <w:bottom w:type="dxa" w:w="70"/>
+              <w:right w:type="dxa" w:w="110"/>
+            </w:tcMar>
+            <w:vAlign w:val="center"/>
+          </w:tcPr>
+          <w:p>
+            <w:pPr>
+              <w:spacing w:after="0" w:before="0"/>
+            </w:pPr>
+            <w:r>
+              <w:rPr>
+                <w:rFonts w:ascii="Arial" w:cs="Arial" w:eastAsia="Arial" w:hAnsi="Arial"/>
+                <w:color w:val="1B2118"/>
+                <w:sz w:val="18"/>
+                <w:szCs w:val="18"/>
+              </w:rPr>
+              <w:t xml:space="preserve">sì</w:t>
+            </w:r>
+          </w:p>
+        </w:tc>
+        <w:tc>
+          <w:tcPr>
+            <w:tcW w:type="dxa" w:w="3939"/>
+            <w:tcBorders>
+              <w:top w:val="single" w:color="D9D4C5" w:sz="4"/>
+              <w:left w:val="single" w:color="D9D4C5" w:sz="4"/>
+              <w:bottom w:val="single" w:color="D9D4C5" w:sz="4"/>
+              <w:right w:val="single" w:color="D9D4C5" w:sz="4"/>
+            </w:tcBorders>
+            <w:tcMar>
+              <w:top w:type="dxa" w:w="70"/>
+              <w:left w:type="dxa" w:w="110"/>
+              <w:bottom w:type="dxa" w:w="70"/>
+              <w:right w:type="dxa" w:w="110"/>
+            </w:tcMar>
+            <w:vAlign w:val="center"/>
+          </w:tcPr>
+          <w:p>
+            <w:pPr>
+              <w:spacing w:after="0" w:before="0"/>
+            </w:pPr>
+            <w:r>
+              <w:rPr>
+                <w:rFonts w:ascii="Arial" w:cs="Arial" w:eastAsia="Arial" w:hAnsi="Arial"/>
+                <w:color w:val="1B2118"/>
+                <w:sz w:val="18"/>
+                <w:szCs w:val="18"/>
+              </w:rPr>
+              <w:t xml:space="preserve">Codice dell'utenza nel sistema del Comune o del gestore (es. codice TARI); unico nel file</w:t>
+            </w:r>
+          </w:p>
+        </w:tc>
+      </w:tr>
+      <w:tr>
+        <w:trPr>
+          <w:cantSplit/>
+        </w:trPr>
+        <w:tc>
+          <w:tcPr>
+            <w:tcW w:type="dxa" w:w="3939"/>
+            <w:tcBorders>
+              <w:top w:val="single" w:color="D9D4C5" w:sz="4"/>
+              <w:left w:val="single" w:color="D9D4C5" w:sz="4"/>
+              <w:bottom w:val="single" w:color="D9D4C5" w:sz="4"/>
+              <w:right w:val="single" w:color="D9D4C5" w:sz="4"/>
+            </w:tcBorders>
+            <w:shd w:fill="F6F4EE" w:color="auto" w:val="clear"/>
+            <w:tcMar>
+              <w:top w:type="dxa" w:w="70"/>
+              <w:left w:type="dxa" w:w="110"/>
+              <w:bottom w:type="dxa" w:w="70"/>
+              <w:right w:type="dxa" w:w="110"/>
+            </w:tcMar>
+            <w:vAlign w:val="center"/>
+          </w:tcPr>
+          <w:p>
+            <w:pPr>
+              <w:spacing w:after="0" w:before="0"/>
+            </w:pPr>
+            <w:r>
+              <w:rPr>
+                <w:rFonts w:ascii="Arial" w:cs="Arial" w:eastAsia="Arial" w:hAnsi="Arial"/>
+                <w:color w:val="1B2118"/>
+                <w:sz w:val="18"/>
+                <w:szCs w:val="18"/>
+              </w:rPr>
+              <w:t xml:space="preserve">Nome capofamiglia</w:t>
+            </w:r>
+          </w:p>
+        </w:tc>
+        <w:tc>
+          <w:tcPr>
+            <w:tcW w:type="dxa" w:w="1760"/>
+            <w:tcBorders>
+              <w:top w:val="single" w:color="D9D4C5" w:sz="4"/>
+              <w:left w:val="single" w:color="D9D4C5" w:sz="4"/>
+              <w:bottom w:val="single" w:color="D9D4C5" w:sz="4"/>
+              <w:right w:val="single" w:color="D9D4C5" w:sz="4"/>
+            </w:tcBorders>
+            <w:shd w:fill="F6F4EE" w:color="auto" w:val="clear"/>
+            <w:tcMar>
+              <w:top w:type="dxa" w:w="70"/>
+              <w:left w:type="dxa" w:w="110"/>
+              <w:bottom w:type="dxa" w:w="70"/>
+              <w:right w:type="dxa" w:w="110"/>
+            </w:tcMar>
+            <w:vAlign w:val="center"/>
+          </w:tcPr>
+          <w:p>
+            <w:pPr>
+              <w:spacing w:after="0" w:before="0"/>
+            </w:pPr>
+            <w:r>
+              <w:rPr>
+                <w:rFonts w:ascii="Arial" w:cs="Arial" w:eastAsia="Arial" w:hAnsi="Arial"/>
+                <w:color w:val="1B2118"/>
+                <w:sz w:val="18"/>
+                <w:szCs w:val="18"/>
+              </w:rPr>
+              <w:t xml:space="preserve">sì</w:t>
+            </w:r>
+          </w:p>
+        </w:tc>
+        <w:tc>
+          <w:tcPr>
+            <w:tcW w:type="dxa" w:w="3939"/>
+            <w:tcBorders>
+              <w:top w:val="single" w:color="D9D4C5" w:sz="4"/>
+              <w:left w:val="single" w:color="D9D4C5" w:sz="4"/>
+              <w:bottom w:val="single" w:color="D9D4C5" w:sz="4"/>
+              <w:right w:val="single" w:color="D9D4C5" w:sz="4"/>
+            </w:tcBorders>
+            <w:shd w:fill="F6F4EE" w:color="auto" w:val="clear"/>
+            <w:tcMar>
+              <w:top w:type="dxa" w:w="70"/>
+              <w:left w:type="dxa" w:w="110"/>
+              <w:bottom w:type="dxa" w:w="70"/>
+              <w:right w:type="dxa" w:w="110"/>
+            </w:tcMar>
+            <w:vAlign w:val="center"/>
+          </w:tcPr>
+          <w:p>
+            <w:pPr>
+              <w:spacing w:after="0" w:before="0"/>
+            </w:pPr>
+            <w:r>
+              <w:rPr>
+                <w:rFonts w:ascii="Arial" w:cs="Arial" w:eastAsia="Arial" w:hAnsi="Arial"/>
+                <w:color w:val="1B2118"/>
+                <w:sz w:val="18"/>
+                <w:szCs w:val="18"/>
+              </w:rPr>
+              <w:t xml:space="preserve">Nome e cognome dell'intestatario</w:t>
+            </w:r>
+          </w:p>
+        </w:tc>
+      </w:tr>
+      <w:tr>
+        <w:trPr>
+          <w:cantSplit/>
+        </w:trPr>
+        <w:tc>
+          <w:tcPr>
+            <w:tcW w:type="dxa" w:w="3939"/>
+            <w:tcBorders>
+              <w:top w:val="single" w:color="D9D4C5" w:sz="4"/>
+              <w:left w:val="single" w:color="D9D4C5" w:sz="4"/>
+              <w:bottom w:val="single" w:color="D9D4C5" w:sz="4"/>
+              <w:right w:val="single" w:color="D9D4C5" w:sz="4"/>
+            </w:tcBorders>
+            <w:tcMar>
+              <w:top w:type="dxa" w:w="70"/>
+              <w:left w:type="dxa" w:w="110"/>
+              <w:bottom w:type="dxa" w:w="70"/>
+              <w:right w:type="dxa" w:w="110"/>
+            </w:tcMar>
+            <w:vAlign w:val="center"/>
+          </w:tcPr>
+          <w:p>
+            <w:pPr>
+              <w:spacing w:after="0" w:before="0"/>
+            </w:pPr>
+            <w:r>
+              <w:rPr>
+                <w:rFonts w:ascii="Arial" w:cs="Arial" w:eastAsia="Arial" w:hAnsi="Arial"/>
+                <w:color w:val="1B2118"/>
+                <w:sz w:val="18"/>
+                <w:szCs w:val="18"/>
+              </w:rPr>
+              <w:t xml:space="preserve">Indirizzo</w:t>
+            </w:r>
+          </w:p>
+        </w:tc>
+        <w:tc>
+          <w:tcPr>
+            <w:tcW w:type="dxa" w:w="1760"/>
+            <w:tcBorders>
+              <w:top w:val="single" w:color="D9D4C5" w:sz="4"/>
+              <w:left w:val="single" w:color="D9D4C5" w:sz="4"/>
+              <w:bottom w:val="single" w:color="D9D4C5" w:sz="4"/>
+              <w:right w:val="single" w:color="D9D4C5" w:sz="4"/>
+            </w:tcBorders>
+            <w:tcMar>
+              <w:top w:type="dxa" w:w="70"/>
+              <w:left w:type="dxa" w:w="110"/>
+              <w:bottom w:type="dxa" w:w="70"/>
+              <w:right w:type="dxa" w:w="110"/>
+            </w:tcMar>
+            <w:vAlign w:val="center"/>
+          </w:tcPr>
+          <w:p>
+            <w:pPr>
+              <w:spacing w:after="0" w:before="0"/>
+            </w:pPr>
+            <w:r>
+              <w:rPr>
+                <w:rFonts w:ascii="Arial" w:cs="Arial" w:eastAsia="Arial" w:hAnsi="Arial"/>
+                <w:color w:val="1B2118"/>
+                <w:sz w:val="18"/>
+                <w:szCs w:val="18"/>
+              </w:rPr>
+              <w:t xml:space="preserve">sì</w:t>
+            </w:r>
+          </w:p>
+        </w:tc>
+        <w:tc>
+          <w:tcPr>
+            <w:tcW w:type="dxa" w:w="3939"/>
+            <w:tcBorders>
+              <w:top w:val="single" w:color="D9D4C5" w:sz="4"/>
+              <w:left w:val="single" w:color="D9D4C5" w:sz="4"/>
+              <w:bottom w:val="single" w:color="D9D4C5" w:sz="4"/>
+              <w:right w:val="single" w:color="D9D4C5" w:sz="4"/>
+            </w:tcBorders>
+            <w:tcMar>
+              <w:top w:type="dxa" w:w="70"/>
+              <w:left w:type="dxa" w:w="110"/>
+              <w:bottom w:type="dxa" w:w="70"/>
+              <w:right w:type="dxa" w:w="110"/>
+            </w:tcMar>
+            <w:vAlign w:val="center"/>
+          </w:tcPr>
+          <w:p>
+            <w:pPr>
+              <w:spacing w:after="0" w:before="0"/>
+            </w:pPr>
+            <w:r>
+              <w:rPr>
+                <w:rFonts w:ascii="Arial" w:cs="Arial" w:eastAsia="Arial" w:hAnsi="Arial"/>
+                <w:color w:val="1B2118"/>
+                <w:sz w:val="18"/>
+                <w:szCs w:val="18"/>
+              </w:rPr>
+              <w:t xml:space="preserve">Via, numero civico ed eventuale interno</w:t>
+            </w:r>
+          </w:p>
+        </w:tc>
+      </w:tr>
+      <w:tr>
+        <w:trPr>
+          <w:cantSplit/>
+        </w:trPr>
+        <w:tc>
+          <w:tcPr>
+            <w:tcW w:type="dxa" w:w="3939"/>
+            <w:tcBorders>
+              <w:top w:val="single" w:color="D9D4C5" w:sz="4"/>
+              <w:left w:val="single" w:color="D9D4C5" w:sz="4"/>
+              <w:bottom w:val="single" w:color="D9D4C5" w:sz="4"/>
+              <w:right w:val="single" w:color="D9D4C5" w:sz="4"/>
+            </w:tcBorders>
+            <w:shd w:fill="F6F4EE" w:color="auto" w:val="clear"/>
+            <w:tcMar>
+              <w:top w:type="dxa" w:w="70"/>
+              <w:left w:type="dxa" w:w="110"/>
+              <w:bottom w:type="dxa" w:w="70"/>
+              <w:right w:type="dxa" w:w="110"/>
+            </w:tcMar>
+            <w:vAlign w:val="center"/>
+          </w:tcPr>
+          <w:p>
+            <w:pPr>
+              <w:spacing w:after="0" w:before="0"/>
+            </w:pPr>
+            <w:r>
+              <w:rPr>
+                <w:rFonts w:ascii="Arial" w:cs="Arial" w:eastAsia="Arial" w:hAnsi="Arial"/>
+                <w:color w:val="1B2118"/>
+                <w:sz w:val="18"/>
+                <w:szCs w:val="18"/>
+              </w:rPr>
+              <w:t xml:space="preserve">N. componenti</w:t>
+            </w:r>
+          </w:p>
+        </w:tc>
+        <w:tc>
+          <w:tcPr>
+            <w:tcW w:type="dxa" w:w="1760"/>
+            <w:tcBorders>
+              <w:top w:val="single" w:color="D9D4C5" w:sz="4"/>
+              <w:left w:val="single" w:color="D9D4C5" w:sz="4"/>
+              <w:bottom w:val="single" w:color="D9D4C5" w:sz="4"/>
+              <w:right w:val="single" w:color="D9D4C5" w:sz="4"/>
+            </w:tcBorders>
+            <w:shd w:fill="F6F4EE" w:color="auto" w:val="clear"/>
+            <w:tcMar>
+              <w:top w:type="dxa" w:w="70"/>
+              <w:left w:type="dxa" w:w="110"/>
+              <w:bottom w:type="dxa" w:w="70"/>
+              <w:right w:type="dxa" w:w="110"/>
+            </w:tcMar>
+            <w:vAlign w:val="center"/>
+          </w:tcPr>
+          <w:p>
+            <w:pPr>
+              <w:spacing w:after="0" w:before="0"/>
+            </w:pPr>
+            <w:r>
+              <w:rPr>
+                <w:rFonts w:ascii="Arial" w:cs="Arial" w:eastAsia="Arial" w:hAnsi="Arial"/>
+                <w:color w:val="1B2118"/>
+                <w:sz w:val="18"/>
+                <w:szCs w:val="18"/>
+              </w:rPr>
+              <w:t xml:space="preserve">no</w:t>
+            </w:r>
+          </w:p>
+        </w:tc>
+        <w:tc>
+          <w:tcPr>
+            <w:tcW w:type="dxa" w:w="3939"/>
+            <w:tcBorders>
+              <w:top w:val="single" w:color="D9D4C5" w:sz="4"/>
+              <w:left w:val="single" w:color="D9D4C5" w:sz="4"/>
+              <w:bottom w:val="single" w:color="D9D4C5" w:sz="4"/>
+              <w:right w:val="single" w:color="D9D4C5" w:sz="4"/>
+            </w:tcBorders>
+            <w:shd w:fill="F6F4EE" w:color="auto" w:val="clear"/>
+            <w:tcMar>
+              <w:top w:type="dxa" w:w="70"/>
+              <w:left w:type="dxa" w:w="110"/>
+              <w:bottom w:type="dxa" w:w="70"/>
+              <w:right w:type="dxa" w:w="110"/>
+            </w:tcMar>
+            <w:vAlign w:val="center"/>
+          </w:tcPr>
+          <w:p>
+            <w:pPr>
+              <w:spacing w:after="0" w:before="0"/>
+            </w:pPr>
+            <w:r>
+              <w:rPr>
+                <w:rFonts w:ascii="Arial" w:cs="Arial" w:eastAsia="Arial" w:hAnsi="Arial"/>
+                <w:color w:val="1B2118"/>
+                <w:sz w:val="18"/>
+                <w:szCs w:val="18"/>
+              </w:rPr>
+              <w:t xml:space="preserve">Componenti del nucleo familiare: colloca l'utenza nella classe della delibera (Kb); se manca si usano i valori medi</w:t>
+            </w:r>
+          </w:p>
+        </w:tc>
+      </w:tr>
+      <w:tr>
+        <w:trPr>
+          <w:cantSplit/>
+        </w:trPr>
+        <w:tc>
+          <w:tcPr>
+            <w:tcW w:type="dxa" w:w="3939"/>
+            <w:tcBorders>
+              <w:top w:val="single" w:color="D9D4C5" w:sz="4"/>
+              <w:left w:val="single" w:color="D9D4C5" w:sz="4"/>
+              <w:bottom w:val="single" w:color="D9D4C5" w:sz="4"/>
+              <w:right w:val="single" w:color="D9D4C5" w:sz="4"/>
+            </w:tcBorders>
+            <w:tcMar>
+              <w:top w:type="dxa" w:w="70"/>
+              <w:left w:type="dxa" w:w="110"/>
+              <w:bottom w:type="dxa" w:w="70"/>
+              <w:right w:type="dxa" w:w="110"/>
+            </w:tcMar>
+            <w:vAlign w:val="center"/>
+          </w:tcPr>
+          <w:p>
+            <w:pPr>
+              <w:spacing w:after="0" w:before="0"/>
+            </w:pPr>
+            <w:r>
+              <w:rPr>
+                <w:rFonts w:ascii="Arial" w:cs="Arial" w:eastAsia="Arial" w:hAnsi="Arial"/>
+                <w:color w:val="1B2118"/>
+                <w:sz w:val="18"/>
+                <w:szCs w:val="18"/>
+              </w:rPr>
+              <w:t xml:space="preserve">Mq abitazione</w:t>
+            </w:r>
+          </w:p>
+        </w:tc>
+        <w:tc>
+          <w:tcPr>
+            <w:tcW w:type="dxa" w:w="1760"/>
+            <w:tcBorders>
+              <w:top w:val="single" w:color="D9D4C5" w:sz="4"/>
+              <w:left w:val="single" w:color="D9D4C5" w:sz="4"/>
+              <w:bottom w:val="single" w:color="D9D4C5" w:sz="4"/>
+              <w:right w:val="single" w:color="D9D4C5" w:sz="4"/>
+            </w:tcBorders>
+            <w:tcMar>
+              <w:top w:type="dxa" w:w="70"/>
+              <w:left w:type="dxa" w:w="110"/>
+              <w:bottom w:type="dxa" w:w="70"/>
+              <w:right w:type="dxa" w:w="110"/>
+            </w:tcMar>
+            <w:vAlign w:val="center"/>
+          </w:tcPr>
+          <w:p>
+            <w:pPr>
+              <w:spacing w:after="0" w:before="0"/>
+            </w:pPr>
+            <w:r>
+              <w:rPr>
+                <w:rFonts w:ascii="Arial" w:cs="Arial" w:eastAsia="Arial" w:hAnsi="Arial"/>
+                <w:color w:val="1B2118"/>
+                <w:sz w:val="18"/>
+                <w:szCs w:val="18"/>
+              </w:rPr>
+              <w:t xml:space="preserve">no</w:t>
+            </w:r>
+          </w:p>
+        </w:tc>
+        <w:tc>
+          <w:tcPr>
+            <w:tcW w:type="dxa" w:w="3939"/>
+            <w:tcBorders>
+              <w:top w:val="single" w:color="D9D4C5" w:sz="4"/>
+              <w:left w:val="single" w:color="D9D4C5" w:sz="4"/>
+              <w:bottom w:val="single" w:color="D9D4C5" w:sz="4"/>
+              <w:right w:val="single" w:color="D9D4C5" w:sz="4"/>
+            </w:tcBorders>
+            <w:tcMar>
+              <w:top w:type="dxa" w:w="70"/>
+              <w:left w:type="dxa" w:w="110"/>
+              <w:bottom w:type="dxa" w:w="70"/>
+              <w:right w:type="dxa" w:w="110"/>
+            </w:tcMar>
+            <w:vAlign w:val="center"/>
+          </w:tcPr>
+          <w:p>
+            <w:pPr>
+              <w:spacing w:after="0" w:before="0"/>
+            </w:pPr>
+            <w:r>
+              <w:rPr>
+                <w:rFonts w:ascii="Arial" w:cs="Arial" w:eastAsia="Arial" w:hAnsi="Arial"/>
+                <w:color w:val="1B2118"/>
+                <w:sz w:val="18"/>
+                <w:szCs w:val="18"/>
+              </w:rPr>
+              <w:t xml:space="preserve">Superficie dell'abitazione in m²</w:t>
+            </w:r>
+          </w:p>
+        </w:tc>
+      </w:tr>
+      <w:tr>
+        <w:trPr>
+          <w:cantSplit/>
+        </w:trPr>
+        <w:tc>
+          <w:tcPr>
+            <w:tcW w:type="dxa" w:w="3939"/>
+            <w:tcBorders>
+              <w:top w:val="single" w:color="D9D4C5" w:sz="4"/>
+              <w:left w:val="single" w:color="D9D4C5" w:sz="4"/>
+              <w:bottom w:val="single" w:color="D9D4C5" w:sz="4"/>
+              <w:right w:val="single" w:color="D9D4C5" w:sz="4"/>
+            </w:tcBorders>
+            <w:shd w:fill="F6F4EE" w:color="auto" w:val="clear"/>
+            <w:tcMar>
+              <w:top w:type="dxa" w:w="70"/>
+              <w:left w:type="dxa" w:w="110"/>
+              <w:bottom w:type="dxa" w:w="70"/>
+              <w:right w:type="dxa" w:w="110"/>
+            </w:tcMar>
+            <w:vAlign w:val="center"/>
+          </w:tcPr>
+          <w:p>
+            <w:pPr>
+              <w:spacing w:after="0" w:before="0"/>
+            </w:pPr>
+            <w:r>
+              <w:rPr>
+                <w:rFonts w:ascii="Arial" w:cs="Arial" w:eastAsia="Arial" w:hAnsi="Arial"/>
+                <w:color w:val="1B2118"/>
+                <w:sz w:val="18"/>
+                <w:szCs w:val="18"/>
+              </w:rPr>
+              <w:t xml:space="preserve">Produzione totale (kg)</w:t>
+            </w:r>
+          </w:p>
+        </w:tc>
+        <w:tc>
+          <w:tcPr>
+            <w:tcW w:type="dxa" w:w="1760"/>
+            <w:tcBorders>
+              <w:top w:val="single" w:color="D9D4C5" w:sz="4"/>
+              <w:left w:val="single" w:color="D9D4C5" w:sz="4"/>
+              <w:bottom w:val="single" w:color="D9D4C5" w:sz="4"/>
+              <w:right w:val="single" w:color="D9D4C5" w:sz="4"/>
+            </w:tcBorders>
+            <w:shd w:fill="F6F4EE" w:color="auto" w:val="clear"/>
+            <w:tcMar>
+              <w:top w:type="dxa" w:w="70"/>
+              <w:left w:type="dxa" w:w="110"/>
+              <w:bottom w:type="dxa" w:w="70"/>
+              <w:right w:type="dxa" w:w="110"/>
+            </w:tcMar>
+            <w:vAlign w:val="center"/>
+          </w:tcPr>
+          <w:p>
+            <w:pPr>
+              <w:spacing w:after="0" w:before="0"/>
+            </w:pPr>
+            <w:r>
+              <w:rPr>
+                <w:rFonts w:ascii="Arial" w:cs="Arial" w:eastAsia="Arial" w:hAnsi="Arial"/>
+                <w:color w:val="1B2118"/>
+                <w:sz w:val="18"/>
+                <w:szCs w:val="18"/>
+              </w:rPr>
+              <w:t xml:space="preserve">sì</w:t>
+            </w:r>
+          </w:p>
+        </w:tc>
+        <w:tc>
+          <w:tcPr>
+            <w:tcW w:type="dxa" w:w="3939"/>
+            <w:tcBorders>
+              <w:top w:val="single" w:color="D9D4C5" w:sz="4"/>
+              <w:left w:val="single" w:color="D9D4C5" w:sz="4"/>
+              <w:bottom w:val="single" w:color="D9D4C5" w:sz="4"/>
+              <w:right w:val="single" w:color="D9D4C5" w:sz="4"/>
+            </w:tcBorders>
+            <w:shd w:fill="F6F4EE" w:color="auto" w:val="clear"/>
+            <w:tcMar>
+              <w:top w:type="dxa" w:w="70"/>
+              <w:left w:type="dxa" w:w="110"/>
+              <w:bottom w:type="dxa" w:w="70"/>
+              <w:right w:type="dxa" w:w="110"/>
+            </w:tcMar>
+            <w:vAlign w:val="center"/>
+          </w:tcPr>
+          <w:p>
+            <w:pPr>
+              <w:spacing w:after="0" w:before="0"/>
+            </w:pPr>
+            <w:r>
+              <w:rPr>
+                <w:rFonts w:ascii="Arial" w:cs="Arial" w:eastAsia="Arial" w:hAnsi="Arial"/>
+                <w:color w:val="1B2118"/>
+                <w:sz w:val="18"/>
+                <w:szCs w:val="18"/>
+              </w:rPr>
+              <w:t xml:space="preserve">Rifiuti prodotti nell'anno, somma di tutte le frazioni</w:t>
+            </w:r>
+          </w:p>
+        </w:tc>
+      </w:tr>
+      <w:tr>
+        <w:trPr>
+          <w:cantSplit/>
+        </w:trPr>
+        <w:tc>
+          <w:tcPr>
+            <w:tcW w:type="dxa" w:w="3939"/>
+            <w:tcBorders>
+              <w:top w:val="single" w:color="D9D4C5" w:sz="4"/>
+              <w:left w:val="single" w:color="D9D4C5" w:sz="4"/>
+              <w:bottom w:val="single" w:color="D9D4C5" w:sz="4"/>
+              <w:right w:val="single" w:color="D9D4C5" w:sz="4"/>
+            </w:tcBorders>
+            <w:tcMar>
+              <w:top w:type="dxa" w:w="70"/>
+              <w:left w:type="dxa" w:w="110"/>
+              <w:bottom w:type="dxa" w:w="70"/>
+              <w:right w:type="dxa" w:w="110"/>
+            </w:tcMar>
+            <w:vAlign w:val="center"/>
+          </w:tcPr>
+          <w:p>
+            <w:pPr>
+              <w:spacing w:after="0" w:before="0"/>
+            </w:pPr>
+            <w:r>
+              <w:rPr>
+                <w:rFonts w:ascii="Arial" w:cs="Arial" w:eastAsia="Arial" w:hAnsi="Arial"/>
+                <w:color w:val="1B2118"/>
+                <w:sz w:val="18"/>
+                <w:szCs w:val="18"/>
+              </w:rPr>
+              <w:t xml:space="preserve">Indifferenziato (kg)</w:t>
+            </w:r>
+          </w:p>
+        </w:tc>
+        <w:tc>
+          <w:tcPr>
+            <w:tcW w:type="dxa" w:w="1760"/>
+            <w:tcBorders>
+              <w:top w:val="single" w:color="D9D4C5" w:sz="4"/>
+              <w:left w:val="single" w:color="D9D4C5" w:sz="4"/>
+              <w:bottom w:val="single" w:color="D9D4C5" w:sz="4"/>
+              <w:right w:val="single" w:color="D9D4C5" w:sz="4"/>
+            </w:tcBorders>
+            <w:tcMar>
+              <w:top w:type="dxa" w:w="70"/>
+              <w:left w:type="dxa" w:w="110"/>
+              <w:bottom w:type="dxa" w:w="70"/>
+              <w:right w:type="dxa" w:w="110"/>
+            </w:tcMar>
+            <w:vAlign w:val="center"/>
+          </w:tcPr>
+          <w:p>
+            <w:pPr>
+              <w:spacing w:after="0" w:before="0"/>
+            </w:pPr>
+            <w:r>
+              <w:rPr>
+                <w:rFonts w:ascii="Arial" w:cs="Arial" w:eastAsia="Arial" w:hAnsi="Arial"/>
+                <w:color w:val="1B2118"/>
+                <w:sz w:val="18"/>
+                <w:szCs w:val="18"/>
+              </w:rPr>
+              <w:t xml:space="preserve">sì</w:t>
+            </w:r>
+          </w:p>
+        </w:tc>
+        <w:tc>
+          <w:tcPr>
+            <w:tcW w:type="dxa" w:w="3939"/>
+            <w:tcBorders>
+              <w:top w:val="single" w:color="D9D4C5" w:sz="4"/>
+              <w:left w:val="single" w:color="D9D4C5" w:sz="4"/>
+              <w:bottom w:val="single" w:color="D9D4C5" w:sz="4"/>
+              <w:right w:val="single" w:color="D9D4C5" w:sz="4"/>
+            </w:tcBorders>
+            <w:tcMar>
+              <w:top w:type="dxa" w:w="70"/>
+              <w:left w:type="dxa" w:w="110"/>
+              <w:bottom w:type="dxa" w:w="70"/>
+              <w:right w:type="dxa" w:w="110"/>
+            </w:tcMar>
+            <w:vAlign w:val="center"/>
+          </w:tcPr>
+          <w:p>
+            <w:pPr>
+              <w:spacing w:after="0" w:before="0"/>
+            </w:pPr>
+            <w:r>
+              <w:rPr>
+                <w:rFonts w:ascii="Arial" w:cs="Arial" w:eastAsia="Arial" w:hAnsi="Arial"/>
+                <w:color w:val="1B2118"/>
+                <w:sz w:val="18"/>
+                <w:szCs w:val="18"/>
+              </w:rPr>
+              <w:t xml:space="preserve">Secco residuo dell'anno, anche 0</w:t>
+            </w:r>
+          </w:p>
+        </w:tc>
+      </w:tr>
+      <w:tr>
+        <w:trPr>
+          <w:cantSplit/>
+        </w:trPr>
+        <w:tc>
+          <w:tcPr>
+            <w:tcW w:type="dxa" w:w="3939"/>
+            <w:tcBorders>
+              <w:top w:val="single" w:color="D9D4C5" w:sz="4"/>
+              <w:left w:val="single" w:color="D9D4C5" w:sz="4"/>
+              <w:bottom w:val="single" w:color="D9D4C5" w:sz="4"/>
+              <w:right w:val="single" w:color="D9D4C5" w:sz="4"/>
+            </w:tcBorders>
+            <w:shd w:fill="F6F4EE" w:color="auto" w:val="clear"/>
+            <w:tcMar>
+              <w:top w:type="dxa" w:w="70"/>
+              <w:left w:type="dxa" w:w="110"/>
+              <w:bottom w:type="dxa" w:w="70"/>
+              <w:right w:type="dxa" w:w="110"/>
+            </w:tcMar>
+            <w:vAlign w:val="center"/>
+          </w:tcPr>
+          <w:p>
+            <w:pPr>
+              <w:spacing w:after="0" w:before="0"/>
+            </w:pPr>
+            <w:r>
+              <w:rPr>
+                <w:rFonts w:ascii="Arial" w:cs="Arial" w:eastAsia="Arial" w:hAnsi="Arial"/>
+                <w:color w:val="1B2118"/>
+                <w:sz w:val="18"/>
+                <w:szCs w:val="18"/>
+              </w:rPr>
+              <w:t xml:space="preserve">Organico, Carta e cartone, Plastica, Vetro, Metallo, Verde, Legno, Tessili, RAEE, Ingombranti, Inerti (kg)</w:t>
+            </w:r>
+          </w:p>
+        </w:tc>
+        <w:tc>
+          <w:tcPr>
+            <w:tcW w:type="dxa" w:w="1760"/>
+            <w:tcBorders>
+              <w:top w:val="single" w:color="D9D4C5" w:sz="4"/>
+              <w:left w:val="single" w:color="D9D4C5" w:sz="4"/>
+              <w:bottom w:val="single" w:color="D9D4C5" w:sz="4"/>
+              <w:right w:val="single" w:color="D9D4C5" w:sz="4"/>
+            </w:tcBorders>
+            <w:shd w:fill="F6F4EE" w:color="auto" w:val="clear"/>
+            <w:tcMar>
+              <w:top w:type="dxa" w:w="70"/>
+              <w:left w:type="dxa" w:w="110"/>
+              <w:bottom w:type="dxa" w:w="70"/>
+              <w:right w:type="dxa" w:w="110"/>
+            </w:tcMar>
+            <w:vAlign w:val="center"/>
+          </w:tcPr>
+          <w:p>
+            <w:pPr>
+              <w:spacing w:after="0" w:before="0"/>
+            </w:pPr>
+            <w:r>
+              <w:rPr>
+                <w:rFonts w:ascii="Arial" w:cs="Arial" w:eastAsia="Arial" w:hAnsi="Arial"/>
+                <w:color w:val="1B2118"/>
+                <w:sz w:val="18"/>
+                <w:szCs w:val="18"/>
+              </w:rPr>
+              <w:t xml:space="preserve">no</w:t>
+            </w:r>
+          </w:p>
+        </w:tc>
+        <w:tc>
+          <w:tcPr>
+            <w:tcW w:type="dxa" w:w="3939"/>
+            <w:tcBorders>
+              <w:top w:val="single" w:color="D9D4C5" w:sz="4"/>
+              <w:left w:val="single" w:color="D9D4C5" w:sz="4"/>
+              <w:bottom w:val="single" w:color="D9D4C5" w:sz="4"/>
+              <w:right w:val="single" w:color="D9D4C5" w:sz="4"/>
+            </w:tcBorders>
+            <w:shd w:fill="F6F4EE" w:color="auto" w:val="clear"/>
+            <w:tcMar>
+              <w:top w:type="dxa" w:w="70"/>
+              <w:left w:type="dxa" w:w="110"/>
+              <w:bottom w:type="dxa" w:w="70"/>
+              <w:right w:type="dxa" w:w="110"/>
+            </w:tcMar>
+            <w:vAlign w:val="center"/>
+          </w:tcPr>
+          <w:p>
+            <w:pPr>
+              <w:spacing w:after="0" w:before="0"/>
+            </w:pPr>
+            <w:r>
+              <w:rPr>
+                <w:rFonts w:ascii="Arial" w:cs="Arial" w:eastAsia="Arial" w:hAnsi="Arial"/>
+                <w:color w:val="1B2118"/>
+                <w:sz w:val="18"/>
+                <w:szCs w:val="18"/>
+              </w:rPr>
+              <w:t xml:space="preserve">Kg di ciascuna frazione nell'anno; vuoto = frazione non raccolta o non misurata (vuoto è diverso da 0)</w:t>
+            </w:r>
+          </w:p>
+        </w:tc>
+      </w:tr>
+      <w:tr>
+        <w:trPr>
+          <w:cantSplit/>
+        </w:trPr>
+        <w:tc>
+          <w:tcPr>
+            <w:tcW w:type="dxa" w:w="3939"/>
+            <w:tcBorders>
+              <w:top w:val="single" w:color="D9D4C5" w:sz="4"/>
+              <w:left w:val="single" w:color="D9D4C5" w:sz="4"/>
+              <w:bottom w:val="single" w:color="D9D4C5" w:sz="4"/>
+              <w:right w:val="single" w:color="D9D4C5" w:sz="4"/>
+            </w:tcBorders>
+            <w:tcMar>
+              <w:top w:type="dxa" w:w="70"/>
+              <w:left w:type="dxa" w:w="110"/>
+              <w:bottom w:type="dxa" w:w="70"/>
+              <w:right w:type="dxa" w:w="110"/>
+            </w:tcMar>
+            <w:vAlign w:val="center"/>
+          </w:tcPr>
+          <w:p>
+            <w:pPr>
+              <w:spacing w:after="0" w:before="0"/>
+            </w:pPr>
+            <w:r>
+              <w:rPr>
+                <w:rFonts w:ascii="Arial" w:cs="Arial" w:eastAsia="Arial" w:hAnsi="Arial"/>
+                <w:color w:val="1B2118"/>
+                <w:sz w:val="18"/>
+                <w:szCs w:val="18"/>
+              </w:rPr>
+              <w:t xml:space="preserve">Svuotamenti (una colonna per frazione)</w:t>
+            </w:r>
+          </w:p>
+        </w:tc>
+        <w:tc>
+          <w:tcPr>
+            <w:tcW w:type="dxa" w:w="1760"/>
+            <w:tcBorders>
+              <w:top w:val="single" w:color="D9D4C5" w:sz="4"/>
+              <w:left w:val="single" w:color="D9D4C5" w:sz="4"/>
+              <w:bottom w:val="single" w:color="D9D4C5" w:sz="4"/>
+              <w:right w:val="single" w:color="D9D4C5" w:sz="4"/>
+            </w:tcBorders>
+            <w:tcMar>
+              <w:top w:type="dxa" w:w="70"/>
+              <w:left w:type="dxa" w:w="110"/>
+              <w:bottom w:type="dxa" w:w="70"/>
+              <w:right w:type="dxa" w:w="110"/>
+            </w:tcMar>
+            <w:vAlign w:val="center"/>
+          </w:tcPr>
+          <w:p>
+            <w:pPr>
+              <w:spacing w:after="0" w:before="0"/>
+            </w:pPr>
+            <w:r>
+              <w:rPr>
+                <w:rFonts w:ascii="Arial" w:cs="Arial" w:eastAsia="Arial" w:hAnsi="Arial"/>
+                <w:color w:val="1B2118"/>
+                <w:sz w:val="18"/>
+                <w:szCs w:val="18"/>
+              </w:rPr>
+              <w:t xml:space="preserve">no</w:t>
+            </w:r>
+          </w:p>
+        </w:tc>
+        <w:tc>
+          <w:tcPr>
+            <w:tcW w:type="dxa" w:w="3939"/>
+            <w:tcBorders>
+              <w:top w:val="single" w:color="D9D4C5" w:sz="4"/>
+              <w:left w:val="single" w:color="D9D4C5" w:sz="4"/>
+              <w:bottom w:val="single" w:color="D9D4C5" w:sz="4"/>
+              <w:right w:val="single" w:color="D9D4C5" w:sz="4"/>
+            </w:tcBorders>
+            <w:tcMar>
+              <w:top w:type="dxa" w:w="70"/>
+              <w:left w:type="dxa" w:w="110"/>
+              <w:bottom w:type="dxa" w:w="70"/>
+              <w:right w:type="dxa" w:w="110"/>
+            </w:tcMar>
+            <w:vAlign w:val="center"/>
+          </w:tcPr>
+          <w:p>
+            <w:pPr>
+              <w:spacing w:after="0" w:before="0"/>
+            </w:pPr>
+            <w:r>
+              <w:rPr>
+                <w:rFonts w:ascii="Arial" w:cs="Arial" w:eastAsia="Arial" w:hAnsi="Arial"/>
+                <w:color w:val="1B2118"/>
+                <w:sz w:val="18"/>
+                <w:szCs w:val="18"/>
+              </w:rPr>
+              <w:t xml:space="preserve">Numero di svuotamenti o conferimenti della frazione nell'anno, intero</w:t>
+            </w:r>
+          </w:p>
+        </w:tc>
+      </w:tr>
+    </w:tbl>
+    <w:p>
+      <w:pPr>
+        <w:spacing w:after="160"/>
+      </w:pPr>
+    </w:p>
+    <w:p>
+      <w:pPr>
+        <w:spacing w:after="140" w:line="300"/>
+      </w:pPr>
+      <w:r>
+        <w:rPr>
+          <w:rFonts w:ascii="Arial" w:cs="Arial" w:eastAsia="Arial" w:hAnsi="Arial"/>
+          <w:b/>
+          <w:bCs/>
+          <w:color w:val="1B2118"/>
+          <w:sz w:val="21"/>
+          <w:szCs w:val="21"/>
+        </w:rPr>
+        <w:t xml:space="preserve">Foglio Utenze_non_domestiche</w:t>
+      </w:r>
+      <w:r>
+        <w:rPr>
+          <w:rFonts w:ascii="Arial" w:cs="Arial" w:eastAsia="Arial" w:hAnsi="Arial"/>
+          <w:color w:val="1B2118"/>
+          <w:sz w:val="21"/>
+          <w:szCs w:val="21"/>
+        </w:rPr>
+        <w:t xml:space="preserve"> — una riga per ogni attività, ente o ufficio. Stesse colonne, con queste differenze:</w:t>
+      </w:r>
+    </w:p>
+    <w:tbl>
+      <w:tblPr>
+        <w:tblW w:type="dxa" w:w="9638"/>
+        <w:tblBorders>
+          <w:top w:val="single" w:color="auto" w:sz="4"/>
+          <w:left w:val="single" w:color="auto" w:sz="4"/>
+          <w:bottom w:val="single" w:color="auto" w:sz="4"/>
+          <w:right w:val="single" w:color="auto" w:sz="4"/>
+          <w:insideH w:val="single" w:color="auto" w:sz="4"/>
+          <w:insideV w:val="single" w:color="auto" w:sz="4"/>
+        </w:tblBorders>
+        <w:tblLayout w:type="fixed"/>
+      </w:tblPr>
+      <w:tblGrid>
+        <w:gridCol w:w="1510"/>
+        <w:gridCol w:w="1760"/>
+        <w:gridCol w:w="6368"/>
+      </w:tblGrid>
+      <w:tr>
+        <w:trPr>
+          <w:tblHeader/>
+        </w:trPr>
+        <w:tc>
+          <w:tcPr>
+            <w:tcW w:type="dxa" w:w="1510"/>
+            <w:tcBorders>
+              <w:top w:val="single" w:color="D9D4C5" w:sz="4"/>
+              <w:left w:val="single" w:color="D9D4C5" w:sz="4"/>
+              <w:bottom w:val="single" w:color="D9D4C5" w:sz="4"/>
+              <w:right w:val="single" w:color="D9D4C5" w:sz="4"/>
+            </w:tcBorders>
+            <w:shd w:fill="2F5D3A" w:color="auto" w:val="clear"/>
+            <w:tcMar>
+              <w:top w:type="dxa" w:w="70"/>
+              <w:left w:type="dxa" w:w="110"/>
+              <w:bottom w:type="dxa" w:w="70"/>
+              <w:right w:type="dxa" w:w="110"/>
+            </w:tcMar>
+            <w:vAlign w:val="center"/>
+          </w:tcPr>
+          <w:p>
+            <w:pPr>
+              <w:spacing w:after="0" w:before="0"/>
+            </w:pPr>
+            <w:r>
+              <w:rPr>
+                <w:rFonts w:ascii="Arial" w:cs="Arial" w:eastAsia="Arial" w:hAnsi="Arial"/>
+                <w:b/>
+                <w:bCs/>
+                <w:color w:val="FFFFFF"/>
+                <w:sz w:val="18"/>
+                <w:szCs w:val="18"/>
+              </w:rPr>
+              <w:t xml:space="preserve">Colonna</w:t>
+            </w:r>
+          </w:p>
+        </w:tc>
+        <w:tc>
+          <w:tcPr>
+            <w:tcW w:type="dxa" w:w="1760"/>
+            <w:tcBorders>
+              <w:top w:val="single" w:color="D9D4C5" w:sz="4"/>
+              <w:left w:val="single" w:color="D9D4C5" w:sz="4"/>
+              <w:bottom w:val="single" w:color="D9D4C5" w:sz="4"/>
+              <w:right w:val="single" w:color="D9D4C5" w:sz="4"/>
+            </w:tcBorders>
+            <w:shd w:fill="2F5D3A" w:color="auto" w:val="clear"/>
+            <w:tcMar>
+              <w:top w:type="dxa" w:w="70"/>
+              <w:left w:type="dxa" w:w="110"/>
+              <w:bottom w:type="dxa" w:w="70"/>
+              <w:right w:type="dxa" w:w="110"/>
+            </w:tcMar>
+            <w:vAlign w:val="center"/>
+          </w:tcPr>
+          <w:p>
+            <w:pPr>
+              <w:spacing w:after="0" w:before="0"/>
+            </w:pPr>
+            <w:r>
+              <w:rPr>
+                <w:rFonts w:ascii="Arial" w:cs="Arial" w:eastAsia="Arial" w:hAnsi="Arial"/>
+                <w:b/>
+                <w:bCs/>
+                <w:color w:val="FFFFFF"/>
+                <w:sz w:val="18"/>
+                <w:szCs w:val="18"/>
+              </w:rPr>
+              <w:t xml:space="preserve">Obbligatoria</w:t>
+            </w:r>
+          </w:p>
+        </w:tc>
+        <w:tc>
+          <w:tcPr>
+            <w:tcW w:type="dxa" w:w="6368"/>
+            <w:tcBorders>
+              <w:top w:val="single" w:color="D9D4C5" w:sz="4"/>
+              <w:left w:val="single" w:color="D9D4C5" w:sz="4"/>
+              <w:bottom w:val="single" w:color="D9D4C5" w:sz="4"/>
+              <w:right w:val="single" w:color="D9D4C5" w:sz="4"/>
+            </w:tcBorders>
+            <w:shd w:fill="2F5D3A" w:color="auto" w:val="clear"/>
+            <w:tcMar>
+              <w:top w:type="dxa" w:w="70"/>
+              <w:left w:type="dxa" w:w="110"/>
+              <w:bottom w:type="dxa" w:w="70"/>
+              <w:right w:type="dxa" w:w="110"/>
+            </w:tcMar>
+            <w:vAlign w:val="center"/>
+          </w:tcPr>
+          <w:p>
+            <w:pPr>
+              <w:spacing w:after="0" w:before="0"/>
+            </w:pPr>
+            <w:r>
+              <w:rPr>
+                <w:rFonts w:ascii="Arial" w:cs="Arial" w:eastAsia="Arial" w:hAnsi="Arial"/>
+                <w:b/>
+                <w:bCs/>
+                <w:color w:val="FFFFFF"/>
+                <w:sz w:val="18"/>
+                <w:szCs w:val="18"/>
+              </w:rPr>
+              <w:t xml:space="preserve">Cosa contiene</w:t>
+            </w:r>
+          </w:p>
+        </w:tc>
+      </w:tr>
+      <w:tr>
+        <w:trPr>
+          <w:cantSplit/>
+        </w:trPr>
+        <w:tc>
+          <w:tcPr>
+            <w:tcW w:type="dxa" w:w="1510"/>
+            <w:tcBorders>
+              <w:top w:val="single" w:color="D9D4C5" w:sz="4"/>
+              <w:left w:val="single" w:color="D9D4C5" w:sz="4"/>
+              <w:bottom w:val="single" w:color="D9D4C5" w:sz="4"/>
+              <w:right w:val="single" w:color="D9D4C5" w:sz="4"/>
+            </w:tcBorders>
+            <w:tcMar>
+              <w:top w:type="dxa" w:w="70"/>
+              <w:left w:type="dxa" w:w="110"/>
+              <w:bottom w:type="dxa" w:w="70"/>
+              <w:right w:type="dxa" w:w="110"/>
+            </w:tcMar>
+            <w:vAlign w:val="center"/>
+          </w:tcPr>
+          <w:p>
+            <w:pPr>
+              <w:spacing w:after="0" w:before="0"/>
+            </w:pPr>
+            <w:r>
+              <w:rPr>
+                <w:rFonts w:ascii="Arial" w:cs="Arial" w:eastAsia="Arial" w:hAnsi="Arial"/>
+                <w:color w:val="1B2118"/>
+                <w:sz w:val="18"/>
+                <w:szCs w:val="18"/>
+              </w:rPr>
+              <w:t xml:space="preserve">Ragione sociale</w:t>
+            </w:r>
+          </w:p>
+        </w:tc>
+        <w:tc>
+          <w:tcPr>
+            <w:tcW w:type="dxa" w:w="1760"/>
+            <w:tcBorders>
+              <w:top w:val="single" w:color="D9D4C5" w:sz="4"/>
+              <w:left w:val="single" w:color="D9D4C5" w:sz="4"/>
+              <w:bottom w:val="single" w:color="D9D4C5" w:sz="4"/>
+              <w:right w:val="single" w:color="D9D4C5" w:sz="4"/>
+            </w:tcBorders>
+            <w:tcMar>
+              <w:top w:type="dxa" w:w="70"/>
+              <w:left w:type="dxa" w:w="110"/>
+              <w:bottom w:type="dxa" w:w="70"/>
+              <w:right w:type="dxa" w:w="110"/>
+            </w:tcMar>
+            <w:vAlign w:val="center"/>
+          </w:tcPr>
+          <w:p>
+            <w:pPr>
+              <w:spacing w:after="0" w:before="0"/>
+            </w:pPr>
+            <w:r>
+              <w:rPr>
+                <w:rFonts w:ascii="Arial" w:cs="Arial" w:eastAsia="Arial" w:hAnsi="Arial"/>
+                <w:color w:val="1B2118"/>
+                <w:sz w:val="18"/>
+                <w:szCs w:val="18"/>
+              </w:rPr>
+              <w:t xml:space="preserve">sì</w:t>
+            </w:r>
+          </w:p>
+        </w:tc>
+        <w:tc>
+          <w:tcPr>
+            <w:tcW w:type="dxa" w:w="6368"/>
+            <w:tcBorders>
+              <w:top w:val="single" w:color="D9D4C5" w:sz="4"/>
+              <w:left w:val="single" w:color="D9D4C5" w:sz="4"/>
+              <w:bottom w:val="single" w:color="D9D4C5" w:sz="4"/>
+              <w:right w:val="single" w:color="D9D4C5" w:sz="4"/>
+            </w:tcBorders>
+            <w:tcMar>
+              <w:top w:type="dxa" w:w="70"/>
+              <w:left w:type="dxa" w:w="110"/>
+              <w:bottom w:type="dxa" w:w="70"/>
+              <w:right w:type="dxa" w:w="110"/>
+            </w:tcMar>
+            <w:vAlign w:val="center"/>
+          </w:tcPr>
+          <w:p>
+            <w:pPr>
+              <w:spacing w:after="0" w:before="0"/>
+            </w:pPr>
+            <w:r>
+              <w:rPr>
+                <w:rFonts w:ascii="Arial" w:cs="Arial" w:eastAsia="Arial" w:hAnsi="Arial"/>
+                <w:color w:val="1B2118"/>
+                <w:sz w:val="18"/>
+                <w:szCs w:val="18"/>
+              </w:rPr>
+              <w:t xml:space="preserve">Al posto del nome del capofamiglia</w:t>
+            </w:r>
+          </w:p>
+        </w:tc>
+      </w:tr>
+      <w:tr>
+        <w:trPr>
+          <w:cantSplit/>
+        </w:trPr>
+        <w:tc>
+          <w:tcPr>
+            <w:tcW w:type="dxa" w:w="1510"/>
+            <w:tcBorders>
+              <w:top w:val="single" w:color="D9D4C5" w:sz="4"/>
+              <w:left w:val="single" w:color="D9D4C5" w:sz="4"/>
+              <w:bottom w:val="single" w:color="D9D4C5" w:sz="4"/>
+              <w:right w:val="single" w:color="D9D4C5" w:sz="4"/>
+            </w:tcBorders>
+            <w:shd w:fill="F6F4EE" w:color="auto" w:val="clear"/>
+            <w:tcMar>
+              <w:top w:type="dxa" w:w="70"/>
+              <w:left w:type="dxa" w:w="110"/>
+              <w:bottom w:type="dxa" w:w="70"/>
+              <w:right w:type="dxa" w:w="110"/>
+            </w:tcMar>
+            <w:vAlign w:val="center"/>
+          </w:tcPr>
+          <w:p>
+            <w:pPr>
+              <w:spacing w:after="0" w:before="0"/>
+            </w:pPr>
+            <w:r>
+              <w:rPr>
+                <w:rFonts w:ascii="Arial" w:cs="Arial" w:eastAsia="Arial" w:hAnsi="Arial"/>
+                <w:color w:val="1B2118"/>
+                <w:sz w:val="18"/>
+                <w:szCs w:val="18"/>
+              </w:rPr>
+              <w:t xml:space="preserve">Categoria</w:t>
+            </w:r>
+          </w:p>
+        </w:tc>
+        <w:tc>
+          <w:tcPr>
+            <w:tcW w:type="dxa" w:w="1760"/>
+            <w:tcBorders>
+              <w:top w:val="single" w:color="D9D4C5" w:sz="4"/>
+              <w:left w:val="single" w:color="D9D4C5" w:sz="4"/>
+              <w:bottom w:val="single" w:color="D9D4C5" w:sz="4"/>
+              <w:right w:val="single" w:color="D9D4C5" w:sz="4"/>
+            </w:tcBorders>
+            <w:shd w:fill="F6F4EE" w:color="auto" w:val="clear"/>
+            <w:tcMar>
+              <w:top w:type="dxa" w:w="70"/>
+              <w:left w:type="dxa" w:w="110"/>
+              <w:bottom w:type="dxa" w:w="70"/>
+              <w:right w:type="dxa" w:w="110"/>
+            </w:tcMar>
+            <w:vAlign w:val="center"/>
+          </w:tcPr>
+          <w:p>
+            <w:pPr>
+              <w:spacing w:after="0" w:before="0"/>
+            </w:pPr>
+            <w:r>
+              <w:rPr>
+                <w:rFonts w:ascii="Arial" w:cs="Arial" w:eastAsia="Arial" w:hAnsi="Arial"/>
+                <w:color w:val="1B2118"/>
+                <w:sz w:val="18"/>
+                <w:szCs w:val="18"/>
+              </w:rPr>
+              <w:t xml:space="preserve">sì</w:t>
+            </w:r>
+          </w:p>
+        </w:tc>
+        <w:tc>
+          <w:tcPr>
+            <w:tcW w:type="dxa" w:w="6368"/>
+            <w:tcBorders>
+              <w:top w:val="single" w:color="D9D4C5" w:sz="4"/>
+              <w:left w:val="single" w:color="D9D4C5" w:sz="4"/>
+              <w:bottom w:val="single" w:color="D9D4C5" w:sz="4"/>
+              <w:right w:val="single" w:color="D9D4C5" w:sz="4"/>
+            </w:tcBorders>
+            <w:shd w:fill="F6F4EE" w:color="auto" w:val="clear"/>
+            <w:tcMar>
+              <w:top w:type="dxa" w:w="70"/>
+              <w:left w:type="dxa" w:w="110"/>
+              <w:bottom w:type="dxa" w:w="70"/>
+              <w:right w:type="dxa" w:w="110"/>
+            </w:tcMar>
+            <w:vAlign w:val="center"/>
+          </w:tcPr>
+          <w:p>
+            <w:pPr>
+              <w:spacing w:after="0" w:before="0"/>
+            </w:pPr>
+            <w:r>
+              <w:rPr>
+                <w:rFonts w:ascii="Arial" w:cs="Arial" w:eastAsia="Arial" w:hAnsi="Arial"/>
+                <w:color w:val="1B2118"/>
+                <w:sz w:val="18"/>
+                <w:szCs w:val="18"/>
+              </w:rPr>
+              <w:t xml:space="preserve">Numero della categoria tariffaria della delibera TARI (DPR 158/1999, es. 22 = ristoranti): serve per i rifiuti attesi (Kd). Il foglio Categorie ha l'elenco di riferimento</w:t>
+            </w:r>
+          </w:p>
+        </w:tc>
+      </w:tr>
+      <w:tr>
+        <w:trPr>
+          <w:cantSplit/>
+        </w:trPr>
+        <w:tc>
+          <w:tcPr>
+            <w:tcW w:type="dxa" w:w="1510"/>
+            <w:tcBorders>
+              <w:top w:val="single" w:color="D9D4C5" w:sz="4"/>
+              <w:left w:val="single" w:color="D9D4C5" w:sz="4"/>
+              <w:bottom w:val="single" w:color="D9D4C5" w:sz="4"/>
+              <w:right w:val="single" w:color="D9D4C5" w:sz="4"/>
+            </w:tcBorders>
+            <w:tcMar>
+              <w:top w:type="dxa" w:w="70"/>
+              <w:left w:type="dxa" w:w="110"/>
+              <w:bottom w:type="dxa" w:w="70"/>
+              <w:right w:type="dxa" w:w="110"/>
+            </w:tcMar>
+            <w:vAlign w:val="center"/>
+          </w:tcPr>
+          <w:p>
+            <w:pPr>
+              <w:spacing w:after="0" w:before="0"/>
+            </w:pPr>
+            <w:r>
+              <w:rPr>
+                <w:rFonts w:ascii="Arial" w:cs="Arial" w:eastAsia="Arial" w:hAnsi="Arial"/>
+                <w:color w:val="1B2118"/>
+                <w:sz w:val="18"/>
+                <w:szCs w:val="18"/>
+              </w:rPr>
+              <w:t xml:space="preserve">Mq locali</w:t>
+            </w:r>
+          </w:p>
+        </w:tc>
+        <w:tc>
+          <w:tcPr>
+            <w:tcW w:type="dxa" w:w="1760"/>
+            <w:tcBorders>
+              <w:top w:val="single" w:color="D9D4C5" w:sz="4"/>
+              <w:left w:val="single" w:color="D9D4C5" w:sz="4"/>
+              <w:bottom w:val="single" w:color="D9D4C5" w:sz="4"/>
+              <w:right w:val="single" w:color="D9D4C5" w:sz="4"/>
+            </w:tcBorders>
+            <w:tcMar>
+              <w:top w:type="dxa" w:w="70"/>
+              <w:left w:type="dxa" w:w="110"/>
+              <w:bottom w:type="dxa" w:w="70"/>
+              <w:right w:type="dxa" w:w="110"/>
+            </w:tcMar>
+            <w:vAlign w:val="center"/>
+          </w:tcPr>
+          <w:p>
+            <w:pPr>
+              <w:spacing w:after="0" w:before="0"/>
+            </w:pPr>
+            <w:r>
+              <w:rPr>
+                <w:rFonts w:ascii="Arial" w:cs="Arial" w:eastAsia="Arial" w:hAnsi="Arial"/>
+                <w:color w:val="1B2118"/>
+                <w:sz w:val="18"/>
+                <w:szCs w:val="18"/>
+              </w:rPr>
+              <w:t xml:space="preserve">no</w:t>
+            </w:r>
+          </w:p>
+        </w:tc>
+        <w:tc>
+          <w:tcPr>
+            <w:tcW w:type="dxa" w:w="6368"/>
+            <w:tcBorders>
+              <w:top w:val="single" w:color="D9D4C5" w:sz="4"/>
+              <w:left w:val="single" w:color="D9D4C5" w:sz="4"/>
+              <w:bottom w:val="single" w:color="D9D4C5" w:sz="4"/>
+              <w:right w:val="single" w:color="D9D4C5" w:sz="4"/>
+            </w:tcBorders>
+            <w:tcMar>
+              <w:top w:type="dxa" w:w="70"/>
+              <w:left w:type="dxa" w:w="110"/>
+              <w:bottom w:type="dxa" w:w="70"/>
+              <w:right w:type="dxa" w:w="110"/>
+            </w:tcMar>
+            <w:vAlign w:val="center"/>
+          </w:tcPr>
+          <w:p>
+            <w:pPr>
+              <w:spacing w:after="0" w:before="0"/>
+            </w:pPr>
+            <w:r>
+              <w:rPr>
+                <w:rFonts w:ascii="Arial" w:cs="Arial" w:eastAsia="Arial" w:hAnsi="Arial"/>
+                <w:color w:val="1B2118"/>
+                <w:sz w:val="18"/>
+                <w:szCs w:val="18"/>
+              </w:rPr>
+              <w:t xml:space="preserve">Superficie tassata dei locali in m² (al posto dei mq dell'abitazione); se manca si usano i valori medi della categoria</w:t>
+            </w:r>
+          </w:p>
+        </w:tc>
+      </w:tr>
+      <w:tr>
+        <w:trPr>
+          <w:cantSplit/>
+        </w:trPr>
+        <w:tc>
+          <w:tcPr>
+            <w:tcW w:type="dxa" w:w="1510"/>
+            <w:tcBorders>
+              <w:top w:val="single" w:color="D9D4C5" w:sz="4"/>
+              <w:left w:val="single" w:color="D9D4C5" w:sz="4"/>
+              <w:bottom w:val="single" w:color="D9D4C5" w:sz="4"/>
+              <w:right w:val="single" w:color="D9D4C5" w:sz="4"/>
+            </w:tcBorders>
+            <w:shd w:fill="F6F4EE" w:color="auto" w:val="clear"/>
+            <w:tcMar>
+              <w:top w:type="dxa" w:w="70"/>
+              <w:left w:type="dxa" w:w="110"/>
+              <w:bottom w:type="dxa" w:w="70"/>
+              <w:right w:type="dxa" w:w="110"/>
+            </w:tcMar>
+            <w:vAlign w:val="center"/>
+          </w:tcPr>
+          <w:p>
+            <w:pPr>
+              <w:spacing w:after="0" w:before="0"/>
+            </w:pPr>
+            <w:r>
+              <w:rPr>
+                <w:rFonts w:ascii="Arial" w:cs="Arial" w:eastAsia="Arial" w:hAnsi="Arial"/>
+                <w:color w:val="1B2118"/>
+                <w:sz w:val="18"/>
+                <w:szCs w:val="18"/>
+              </w:rPr>
+              <w:t xml:space="preserve">N. componenti</w:t>
+            </w:r>
+          </w:p>
+        </w:tc>
+        <w:tc>
+          <w:tcPr>
+            <w:tcW w:type="dxa" w:w="1760"/>
+            <w:tcBorders>
+              <w:top w:val="single" w:color="D9D4C5" w:sz="4"/>
+              <w:left w:val="single" w:color="D9D4C5" w:sz="4"/>
+              <w:bottom w:val="single" w:color="D9D4C5" w:sz="4"/>
+              <w:right w:val="single" w:color="D9D4C5" w:sz="4"/>
+            </w:tcBorders>
+            <w:shd w:fill="F6F4EE" w:color="auto" w:val="clear"/>
+            <w:tcMar>
+              <w:top w:type="dxa" w:w="70"/>
+              <w:left w:type="dxa" w:w="110"/>
+              <w:bottom w:type="dxa" w:w="70"/>
+              <w:right w:type="dxa" w:w="110"/>
+            </w:tcMar>
+            <w:vAlign w:val="center"/>
+          </w:tcPr>
+          <w:p>
+            <w:pPr>
+              <w:spacing w:after="0" w:before="0"/>
+            </w:pPr>
+            <w:r>
+              <w:rPr>
+                <w:rFonts w:ascii="Arial" w:cs="Arial" w:eastAsia="Arial" w:hAnsi="Arial"/>
+                <w:color w:val="1B2118"/>
+                <w:sz w:val="18"/>
+                <w:szCs w:val="18"/>
+              </w:rPr>
+              <w:t xml:space="preserve">—</w:t>
+            </w:r>
+          </w:p>
+        </w:tc>
+        <w:tc>
+          <w:tcPr>
+            <w:tcW w:type="dxa" w:w="6368"/>
+            <w:tcBorders>
+              <w:top w:val="single" w:color="D9D4C5" w:sz="4"/>
+              <w:left w:val="single" w:color="D9D4C5" w:sz="4"/>
+              <w:bottom w:val="single" w:color="D9D4C5" w:sz="4"/>
+              <w:right w:val="single" w:color="D9D4C5" w:sz="4"/>
+            </w:tcBorders>
+            <w:shd w:fill="F6F4EE" w:color="auto" w:val="clear"/>
+            <w:tcMar>
+              <w:top w:type="dxa" w:w="70"/>
+              <w:left w:type="dxa" w:w="110"/>
+              <w:bottom w:type="dxa" w:w="70"/>
+              <w:right w:type="dxa" w:w="110"/>
+            </w:tcMar>
+            <w:vAlign w:val="center"/>
+          </w:tcPr>
+          <w:p>
+            <w:pPr>
+              <w:spacing w:after="0" w:before="0"/>
+            </w:pPr>
+            <w:r>
+              <w:rPr>
+                <w:rFonts w:ascii="Arial" w:cs="Arial" w:eastAsia="Arial" w:hAnsi="Arial"/>
+                <w:color w:val="1B2118"/>
+                <w:sz w:val="18"/>
+                <w:szCs w:val="18"/>
+              </w:rPr>
+              <w:t xml:space="preserve">Non c'è: vale solo per le domestiche</w:t>
+            </w:r>
+          </w:p>
+        </w:tc>
+      </w:tr>
+    </w:tbl>
+    <w:p>
+      <w:pPr>
+        <w:spacing w:after="160"/>
+      </w:pPr>
+    </w:p>
+    <w:p>
+      <w:pPr>
+        <w:spacing w:after="140" w:line="300"/>
+      </w:pPr>
+      <w:r>
+        <w:rPr>
+          <w:rFonts w:ascii="Arial" w:cs="Arial" w:eastAsia="Arial" w:hAnsi="Arial"/>
+          <w:b/>
+          <w:bCs/>
+          <w:color w:val="1B2118"/>
+          <w:sz w:val="21"/>
+          <w:szCs w:val="21"/>
+        </w:rPr>
+        <w:t xml:space="preserve">Regole.</w:t>
+      </w:r>
+    </w:p>
+    <w:p>
+      <w:pPr>
+        <w:pStyle w:val="ListParagraph"/>
+        <w:numPr>
+          <w:ilvl w:val="0"/>
+          <w:numId w:val="2"/>
+        </w:numPr>
+        <w:spacing w:after="70" w:line="290"/>
+      </w:pPr>
+      <w:r>
+        <w:rPr>
+          <w:rFonts w:ascii="Arial" w:cs="Arial" w:eastAsia="Arial" w:hAnsi="Arial"/>
+          <w:color w:val="1B2118"/>
+          <w:sz w:val="21"/>
+          <w:szCs w:val="21"/>
+        </w:rPr>
+        <w:t xml:space="preserve">Ogni anno si carica l'</w:t>
+      </w:r>
+      <w:r>
+        <w:rPr>
+          <w:rFonts w:ascii="Arial" w:cs="Arial" w:eastAsia="Arial" w:hAnsi="Arial"/>
+          <w:b/>
+          <w:bCs/>
+          <w:color w:val="1B2118"/>
+          <w:sz w:val="21"/>
+          <w:szCs w:val="21"/>
+        </w:rPr>
+        <w:t xml:space="preserve">elenco completo</w:t>
+      </w:r>
+      <w:r>
+        <w:rPr>
+          <w:rFonts w:ascii="Arial" w:cs="Arial" w:eastAsia="Arial" w:hAnsi="Arial"/>
+          <w:color w:val="1B2118"/>
+          <w:sz w:val="21"/>
+          <w:szCs w:val="21"/>
+        </w:rPr>
+        <w:t xml:space="preserve"> delle utenze, domestiche e non domestiche: le utenze cambiano di continuo e nessun dato si riprende dall'anno prima.</w:t>
+      </w:r>
+    </w:p>
+    <w:p>
+      <w:pPr>
+        <w:pStyle w:val="ListParagraph"/>
+        <w:numPr>
+          <w:ilvl w:val="0"/>
+          <w:numId w:val="2"/>
+        </w:numPr>
+        <w:spacing w:after="70" w:line="290"/>
+      </w:pPr>
+      <w:r>
+        <w:rPr>
+          <w:rFonts w:ascii="Arial" w:cs="Arial" w:eastAsia="Arial" w:hAnsi="Arial"/>
+          <w:color w:val="1B2118"/>
+          <w:sz w:val="21"/>
+          <w:szCs w:val="21"/>
+        </w:rPr>
+        <w:t xml:space="preserve">Numeri senza unità di misura; decimali con la virgola.</w:t>
+      </w:r>
+    </w:p>
+    <w:p>
+      <w:pPr>
+        <w:pStyle w:val="ListParagraph"/>
+        <w:numPr>
+          <w:ilvl w:val="0"/>
+          <w:numId w:val="2"/>
+        </w:numPr>
+        <w:spacing w:after="70" w:line="290"/>
+      </w:pPr>
+      <w:r>
+        <w:rPr>
+          <w:rFonts w:ascii="Arial" w:cs="Arial" w:eastAsia="Arial" w:hAnsi="Arial"/>
+          <w:color w:val="1B2118"/>
+          <w:sz w:val="21"/>
+          <w:szCs w:val="21"/>
+        </w:rPr>
+        <w:t xml:space="preserve">La produzione totale deve corrispondere alla somma delle frazioni: il portale segnala le differenze oltre l'1%.</w:t>
+      </w:r>
+    </w:p>
+    <w:p>
+      <w:pPr>
+        <w:pStyle w:val="ListParagraph"/>
+        <w:numPr>
+          <w:ilvl w:val="0"/>
+          <w:numId w:val="2"/>
+        </w:numPr>
+        <w:spacing w:after="70" w:line="290"/>
+      </w:pPr>
+      <w:r>
+        <w:rPr>
+          <w:rFonts w:ascii="Arial" w:cs="Arial" w:eastAsia="Arial" w:hAnsi="Arial"/>
+          <w:color w:val="1B2118"/>
+          <w:sz w:val="21"/>
+          <w:szCs w:val="21"/>
+        </w:rPr>
+        <w:t xml:space="preserve">Oltre 1 milione di righe o 50 MB: un CSV per foglio, con lo stesso nome, dentro uno ZIP.</w:t>
+      </w:r>
+    </w:p>
+    <w:p>
+      <w:pPr>
+        <w:spacing w:after="140" w:line="300"/>
+      </w:pPr>
+      <w:r>
+        <w:rPr>
+          <w:rFonts w:ascii="Arial" w:cs="Arial" w:eastAsia="Arial" w:hAnsi="Arial"/>
+          <w:b/>
+          <w:bCs/>
+          <w:color w:val="1B2118"/>
+          <w:sz w:val="21"/>
+          <w:szCs w:val="21"/>
+        </w:rPr>
+        <w:t xml:space="preserve">Dati personali.</w:t>
+      </w:r>
+      <w:r>
+        <w:rPr>
+          <w:rFonts w:ascii="Arial" w:cs="Arial" w:eastAsia="Arial" w:hAnsi="Arial"/>
+          <w:color w:val="1B2118"/>
+          <w:sz w:val="21"/>
+          <w:szCs w:val="21"/>
+        </w:rPr>
+        <w:t xml:space="preserve"> Questo modello contiene nomi e indirizzi, a differenza del tracciato attuale. Nel portale li vedono solo Operatori e Amministratori. Ogni consultazione dell'elenco finisce nell'Audit («consultazione utenze»), così come ogni caricamento («caricamento utenze», con il solo numero di utenze) e ogni cancellazione. Nomi e indirizzi non compaiono nei rapporti di calcolo, nei fascicoli né nelle pagine pubbliche. Prima dell'uso con dati reali servono la valutazione d'impatto (DPIA) e l'accordo sul trattamento con ogni Comune.</w:t>
+      </w:r>
+    </w:p>
+    <w:p>
+      <w:pPr>
+        <w:spacing w:after="140" w:line="300"/>
+      </w:pPr>
+      <w:r>
+        <w:rPr>
+          <w:rFonts w:ascii="Arial" w:cs="Arial" w:eastAsia="Arial" w:hAnsi="Arial"/>
+          <w:b/>
+          <w:bCs/>
+          <w:color w:val="1B2118"/>
+          <w:sz w:val="21"/>
+          <w:szCs w:val="21"/>
+        </w:rPr>
+        <w:t xml:space="preserve">Stato al 22/10/2026.</w:t>
+      </w:r>
+      <w:r>
+        <w:rPr>
+          <w:rFonts w:ascii="Arial" w:cs="Arial" w:eastAsia="Arial" w:hAnsi="Arial"/>
+          <w:color w:val="1B2118"/>
+          <w:sz w:val="21"/>
+          <w:szCs w:val="21"/>
+        </w:rPr>
+        <w:t xml:space="preserve"> Il modello Excel è pronto e la struttura del database è provata. Il caricamento nel portale e il collegamento al calcolo sono in preparazione: fino ad allora si usa il tracciato con i fogli 5_Conferimenti o 6_Letture.</w:t>
       </w:r>
     </w:p>
     <w:p>
@@ -48987,7 +51027,7 @@
         <w:szCs w:val="16"/>
       </w:rPr>
       <w:tab/>
-      <w:t xml:space="preserve">Manuale Amministratore · Rev. 5.2 · 22/10/2026</w:t>
+      <w:t xml:space="preserve">Manuale Amministratore · Rev. 5.3 · 22/10/2026</w:t>
     </w:r>
   </w:p>
 </w:hdr>
@@ -49052,7 +51092,7 @@
         <w:szCs w:val="16"/>
       </w:rPr>
       <w:tab/>
-      <w:t xml:space="preserve">Manuale Amministratore · Rev. 5.2 · 22/10/2026</w:t>
+      <w:t xml:space="preserve">Manuale Amministratore · Rev. 5.3 · 22/10/2026</w:t>
     </w:r>
   </w:p>
 </w:hdr>

</xml_diff>

<commit_message>
Audit: eventi della Banca Dati Utenze con codice, numeri e campi cambiati; documenti del rilascio e del calcolo di prova
Co-Authored-By: Claude Opus 5.5 <noreply@anthropic.com>
Claude-Session: https://claude.ai/code/session_01E8XCbEeVHWVP3hntUZ6kZ1
</commit_message>
<xml_diff>
--- a/public/documentazione/Manuale_Amministratore_Portale_CWP.docx
+++ b/public/documentazione/Manuale_Amministratore_Portale_CWP.docx
@@ -302,7 +302,7 @@
                 <w:sz w:val="20"/>
                 <w:szCs w:val="20"/>
               </w:rPr>
-              <w:t xml:space="preserve">Rev. 5.4</w:t>
+              <w:t xml:space="preserve">Rev. 5.5</w:t>
             </w:r>
           </w:p>
         </w:tc>
@@ -719,7 +719,7 @@
                 <w:sz w:val="18"/>
                 <w:szCs w:val="18"/>
               </w:rPr>
-              <w:t xml:space="preserve">5.4</w:t>
+              <w:t xml:space="preserve">5.5</w:t>
             </w:r>
           </w:p>
         </w:tc>
@@ -783,7 +783,7 @@
                 <w:sz w:val="18"/>
                 <w:szCs w:val="18"/>
               </w:rPr>
-              <w:t xml:space="preserve">Gestione delle utenze nel passo 5a del calcolo: caricamento, schede, modulo; categorie tariffaria e di simulazione.</w:t>
+              <w:t xml:space="preserve">Audit delle utenze; calcolo di prova.</w:t>
             </w:r>
           </w:p>
         </w:tc>
@@ -853,7 +853,7 @@
                 <w:sz w:val="18"/>
                 <w:szCs w:val="18"/>
               </w:rPr>
-              <w:t xml:space="preserve">5.3</w:t>
+              <w:t xml:space="preserve">5.4</w:t>
             </w:r>
           </w:p>
         </w:tc>
@@ -919,7 +919,7 @@
                 <w:sz w:val="18"/>
                 <w:szCs w:val="18"/>
               </w:rPr>
-              <w:t xml:space="preserve">Banca Dati Utenze per utenza: campi, regole, dati personali.</w:t>
+              <w:t xml:space="preserve">Gestione delle utenze nel passo 5a del calcolo: caricamento, schede, modulo; categorie tariffaria e di simulazione.</w:t>
             </w:r>
           </w:p>
         </w:tc>
@@ -989,7 +989,7 @@
                 <w:sz w:val="18"/>
                 <w:szCs w:val="18"/>
               </w:rPr>
-              <w:t xml:space="preserve">5.2</w:t>
+              <w:t xml:space="preserve">5.3</w:t>
             </w:r>
           </w:p>
         </w:tc>
@@ -1053,7 +1053,7 @@
                 <w:sz w:val="18"/>
                 <w:szCs w:val="18"/>
               </w:rPr>
-              <w:t xml:space="preserve">Uso dal telefono: menu a pannello, schede in Dashboard e Audit, elenco e dettaglio delle pratiche.</w:t>
+              <w:t xml:space="preserve">Banca Dati Utenze per utenza: campi, regole, dati personali.</w:t>
             </w:r>
           </w:p>
         </w:tc>
@@ -1123,7 +1123,7 @@
                 <w:sz w:val="18"/>
                 <w:szCs w:val="18"/>
               </w:rPr>
-              <w:t xml:space="preserve">5.1</w:t>
+              <w:t xml:space="preserve">5.2</w:t>
             </w:r>
           </w:p>
         </w:tc>
@@ -1189,7 +1189,7 @@
                 <w:sz w:val="18"/>
                 <w:szCs w:val="18"/>
               </w:rPr>
-              <w:t xml:space="preserve">Rilievi N01-N06: costi una tantum in 10 rate, feedback pubblico e fase 3, ente prima della fase 5, riquadro «Fase aperta senza scadenza», avviso sui codici, frazioni del fattore dell'indifferenziato.</w:t>
+              <w:t xml:space="preserve">Uso dal telefono: menu a pannello, schede in Dashboard e Audit, elenco e dettaglio delle pratiche.</w:t>
             </w:r>
           </w:p>
         </w:tc>
@@ -1259,7 +1259,7 @@
                 <w:sz w:val="18"/>
                 <w:szCs w:val="18"/>
               </w:rPr>
-              <w:t xml:space="preserve">5.0</w:t>
+              <w:t xml:space="preserve">5.1</w:t>
             </w:r>
           </w:p>
         </w:tc>
@@ -1291,7 +1291,7 @@
                 <w:sz w:val="18"/>
                 <w:szCs w:val="18"/>
               </w:rPr>
-              <w:t xml:space="preserve">21/10/2026</w:t>
+              <w:t xml:space="preserve">22/10/2026</w:t>
             </w:r>
           </w:p>
         </w:tc>
@@ -1323,7 +1323,7 @@
                 <w:sz w:val="18"/>
                 <w:szCs w:val="18"/>
               </w:rPr>
-              <w:t xml:space="preserve">«News» diventa «Notizie CO2»; Google News attraverso il tramite; barra a LED nell'elenco e nella pratica. Pallino verde delle Notizie CO2 nuove. Notizie CO2: siti di notizie ambientali al posto di Google News. Notizie CO2: siti di notizie ambientali al posto di Google News.</w:t>
+              <w:t xml:space="preserve">Rilievi N01-N06: costi una tantum in 10 rate, feedback pubblico e fase 3, ente prima della fase 5, riquadro «Fase aperta senza scadenza», avviso sui codici, frazioni del fattore dell'indifferenziato.</w:t>
             </w:r>
           </w:p>
         </w:tc>
@@ -1393,7 +1393,7 @@
                 <w:sz w:val="18"/>
                 <w:szCs w:val="18"/>
               </w:rPr>
-              <w:t xml:space="preserve">4.9</w:t>
+              <w:t xml:space="preserve">5.0</w:t>
             </w:r>
           </w:p>
         </w:tc>
@@ -1459,7 +1459,7 @@
                 <w:sz w:val="18"/>
                 <w:szCs w:val="18"/>
               </w:rPr>
-              <w:t xml:space="preserve">Nuovo capitolo «News»: osservatorio sui crediti di carbonio volontari. Canali Bing News e Verra.</w:t>
+              <w:t xml:space="preserve">«News» diventa «Notizie CO2»; Google News attraverso il tramite; barra a LED nell'elenco e nella pratica. Pallino verde delle Notizie CO2 nuove. Notizie CO2: siti di notizie ambientali al posto di Google News. Notizie CO2: siti di notizie ambientali al posto di Google News.</w:t>
             </w:r>
           </w:p>
         </w:tc>
@@ -1529,7 +1529,7 @@
                 <w:sz w:val="18"/>
                 <w:szCs w:val="18"/>
               </w:rPr>
-              <w:t xml:space="preserve">4.8</w:t>
+              <w:t xml:space="preserve">4.9</w:t>
             </w:r>
           </w:p>
         </w:tc>
@@ -1593,7 +1593,7 @@
                 <w:sz w:val="18"/>
                 <w:szCs w:val="18"/>
               </w:rPr>
-              <w:t xml:space="preserve">Simulatore: il PDF scaricato riporta tutti i dati della pagina, i costi e i grafici; foglio Excel «Dati inseriti».</w:t>
+              <w:t xml:space="preserve">Nuovo capitolo «News»: osservatorio sui crediti di carbonio volontari. Canali Bing News e Verra.</w:t>
             </w:r>
           </w:p>
         </w:tc>
@@ -1663,7 +1663,7 @@
                 <w:sz w:val="18"/>
                 <w:szCs w:val="18"/>
               </w:rPr>
-              <w:t xml:space="preserve">4.7</w:t>
+              <w:t xml:space="preserve">4.8</w:t>
             </w:r>
           </w:p>
         </w:tc>
@@ -1729,7 +1729,7 @@
                 <w:sz w:val="18"/>
                 <w:szCs w:val="18"/>
               </w:rPr>
-              <w:t xml:space="preserve">Assistente per gli Operatori e domande sulla pratica aperta; menu dell'Operatore con il Simulatore.</w:t>
+              <w:t xml:space="preserve">Simulatore: il PDF scaricato riporta tutti i dati della pagina, i costi e i grafici; foglio Excel «Dati inseriti».</w:t>
             </w:r>
           </w:p>
         </w:tc>
@@ -1799,7 +1799,7 @@
                 <w:sz w:val="18"/>
                 <w:szCs w:val="18"/>
               </w:rPr>
-              <w:t xml:space="preserve">4.6</w:t>
+              <w:t xml:space="preserve">4.7</w:t>
             </w:r>
           </w:p>
         </w:tc>
@@ -1863,7 +1863,7 @@
                 <w:sz w:val="18"/>
                 <w:szCs w:val="18"/>
               </w:rPr>
-              <w:t xml:space="preserve">Capitolo «Backup automatico».</w:t>
+              <w:t xml:space="preserve">Assistente per gli Operatori e domande sulla pratica aperta; menu dell'Operatore con il Simulatore.</w:t>
             </w:r>
           </w:p>
         </w:tc>
@@ -1933,7 +1933,7 @@
                 <w:sz w:val="18"/>
                 <w:szCs w:val="18"/>
               </w:rPr>
-              <w:t xml:space="preserve">4.5</w:t>
+              <w:t xml:space="preserve">4.6</w:t>
             </w:r>
           </w:p>
         </w:tc>
@@ -1999,7 +1999,7 @@
                 <w:sz w:val="18"/>
                 <w:szCs w:val="18"/>
               </w:rPr>
-              <w:t xml:space="preserve">Nuovo documento «Registro issue e test» tra quelli scaricabili.</w:t>
+              <w:t xml:space="preserve">Capitolo «Backup automatico».</w:t>
             </w:r>
           </w:p>
         </w:tc>
@@ -2069,7 +2069,7 @@
                 <w:sz w:val="18"/>
                 <w:szCs w:val="18"/>
               </w:rPr>
-              <w:t xml:space="preserve">4.4</w:t>
+              <w:t xml:space="preserve">4.5</w:t>
             </w:r>
           </w:p>
         </w:tc>
@@ -2133,7 +2133,7 @@
                 <w:sz w:val="18"/>
                 <w:szCs w:val="18"/>
               </w:rPr>
-              <w:t xml:space="preserve">Collaudo V05: testo completo dei valori lunghi nell'Audit (Prima/Dopo, Tolto/Aggiunto), denominazione delle organizzazioni e ricerca sui valori cambiati; pagina «Account disattivato».</w:t>
+              <w:t xml:space="preserve">Nuovo documento «Registro issue e test» tra quelli scaricabili.</w:t>
             </w:r>
           </w:p>
         </w:tc>
@@ -2203,7 +2203,7 @@
                 <w:sz w:val="18"/>
                 <w:szCs w:val="18"/>
               </w:rPr>
-              <w:t xml:space="preserve">4.3</w:t>
+              <w:t xml:space="preserve">4.4</w:t>
             </w:r>
           </w:p>
         </w:tc>
@@ -2236,7 +2236,7 @@
                 <w:sz w:val="18"/>
                 <w:szCs w:val="18"/>
               </w:rPr>
-              <w:t xml:space="preserve">20/10/2026</w:t>
+              <w:t xml:space="preserve">21/10/2026</w:t>
             </w:r>
           </w:p>
         </w:tc>
@@ -2269,7 +2269,7 @@
                 <w:sz w:val="18"/>
                 <w:szCs w:val="18"/>
               </w:rPr>
-              <w:t xml:space="preserve">Correzioni del collaudo V01: import CSV della Banca Dati «tutto o niente» senza valori negativi, calcolo bloccato con dati non ammessi, buffer manuale 0-80%, conferma definitiva solo senza errori di coerenza, dati non ammessi nel simulatore e zero esplicito nei prezzi, colonna «Oggetto e modifiche» nell'Audit.</w:t>
+              <w:t xml:space="preserve">Collaudo V05: testo completo dei valori lunghi nell'Audit (Prima/Dopo, Tolto/Aggiunto), denominazione delle organizzazioni e ricerca sui valori cambiati; pagina «Account disattivato».</w:t>
             </w:r>
           </w:p>
         </w:tc>
@@ -2339,7 +2339,7 @@
                 <w:sz w:val="18"/>
                 <w:szCs w:val="18"/>
               </w:rPr>
-              <w:t xml:space="preserve">4.2</w:t>
+              <w:t xml:space="preserve">4.3</w:t>
             </w:r>
           </w:p>
         </w:tc>
@@ -2403,7 +2403,7 @@
                 <w:sz w:val="18"/>
                 <w:szCs w:val="18"/>
               </w:rPr>
-              <w:t xml:space="preserve">Nuovo capitolo «Sicurezza»: inattività, avvisi, protezioni del sito e del database.</w:t>
+              <w:t xml:space="preserve">Correzioni del collaudo V01: import CSV della Banca Dati «tutto o niente» senza valori negativi, calcolo bloccato con dati non ammessi, buffer manuale 0-80%, conferma definitiva solo senza errori di coerenza, dati non ammessi nel simulatore e zero esplicito nei prezzi, colonna «Oggetto e modifiche» nell'Audit.</w:t>
             </w:r>
           </w:p>
         </w:tc>
@@ -2473,7 +2473,7 @@
                 <w:sz w:val="18"/>
                 <w:szCs w:val="18"/>
               </w:rPr>
-              <w:t xml:space="preserve">4.1</w:t>
+              <w:t xml:space="preserve">4.2</w:t>
             </w:r>
           </w:p>
         </w:tc>
@@ -2539,7 +2539,7 @@
                 <w:sz w:val="18"/>
                 <w:szCs w:val="18"/>
               </w:rPr>
-              <w:t xml:space="preserve">Voci di menu degli enti aggiornate.</w:t>
+              <w:t xml:space="preserve">Nuovo capitolo «Sicurezza»: inattività, avvisi, protezioni del sito e del database.</w:t>
             </w:r>
           </w:p>
         </w:tc>
@@ -2609,7 +2609,7 @@
                 <w:sz w:val="18"/>
                 <w:szCs w:val="18"/>
               </w:rPr>
-              <w:t xml:space="preserve">4.0</w:t>
+              <w:t xml:space="preserve">4.1</w:t>
             </w:r>
           </w:p>
         </w:tc>
@@ -2673,7 +2673,7 @@
                 <w:sz w:val="18"/>
                 <w:szCs w:val="18"/>
               </w:rPr>
-              <w:t xml:space="preserve">Nuovo ordine del menu; la sezione si chiama «Audit User». Voce «Marketplaces» in arrivo.</w:t>
+              <w:t xml:space="preserve">Voci di menu degli enti aggiornate.</w:t>
             </w:r>
           </w:p>
         </w:tc>
@@ -2743,7 +2743,7 @@
                 <w:sz w:val="18"/>
                 <w:szCs w:val="18"/>
               </w:rPr>
-              <w:t xml:space="preserve">3.9</w:t>
+              <w:t xml:space="preserve">4.0</w:t>
             </w:r>
           </w:p>
         </w:tc>
@@ -2809,7 +2809,7 @@
                 <w:sz w:val="18"/>
                 <w:szCs w:val="18"/>
               </w:rPr>
-              <w:t xml:space="preserve">Nuovo capitolo «Audit trail user».</w:t>
+              <w:t xml:space="preserve">Nuovo ordine del menu; la sezione si chiama «Audit User». Voce «Marketplaces» in arrivo.</w:t>
             </w:r>
           </w:p>
         </w:tc>
@@ -2879,7 +2879,7 @@
                 <w:sz w:val="18"/>
                 <w:szCs w:val="18"/>
               </w:rPr>
-              <w:t xml:space="preserve">3.8</w:t>
+              <w:t xml:space="preserve">3.9</w:t>
             </w:r>
           </w:p>
         </w:tc>
@@ -2943,7 +2943,7 @@
                 <w:sz w:val="18"/>
                 <w:szCs w:val="18"/>
               </w:rPr>
-              <w:t xml:space="preserve">Utenti online; PDF ed Excel del simulatore; messaggi d'errore dell'assistente.</w:t>
+              <w:t xml:space="preserve">Nuovo capitolo «Audit trail user».</w:t>
             </w:r>
           </w:p>
         </w:tc>
@@ -3013,7 +3013,7 @@
                 <w:sz w:val="18"/>
                 <w:szCs w:val="18"/>
               </w:rPr>
-              <w:t xml:space="preserve">3.7</w:t>
+              <w:t xml:space="preserve">3.8</w:t>
             </w:r>
           </w:p>
         </w:tc>
@@ -3046,7 +3046,7 @@
                 <w:sz w:val="18"/>
                 <w:szCs w:val="18"/>
               </w:rPr>
-              <w:t xml:space="preserve">19/10/2026</w:t>
+              <w:t xml:space="preserve">20/10/2026</w:t>
             </w:r>
           </w:p>
         </w:tc>
@@ -3079,7 +3079,7 @@
                 <w:sz w:val="18"/>
                 <w:szCs w:val="18"/>
               </w:rPr>
-              <w:t xml:space="preserve">Assistente virtuale: messaggio «Un attimo…» durante l'attesa.</w:t>
+              <w:t xml:space="preserve">Utenti online; PDF ed Excel del simulatore; messaggi d'errore dell'assistente.</w:t>
             </w:r>
           </w:p>
         </w:tc>
@@ -3149,7 +3149,7 @@
                 <w:sz w:val="18"/>
                 <w:szCs w:val="18"/>
               </w:rPr>
-              <w:t xml:space="preserve">3.6</w:t>
+              <w:t xml:space="preserve">3.7</w:t>
             </w:r>
           </w:p>
         </w:tc>
@@ -3213,7 +3213,7 @@
                 <w:sz w:val="18"/>
                 <w:szCs w:val="18"/>
               </w:rPr>
-              <w:t xml:space="preserve">Assistente virtuale attivo: chiave legata a uno spazio di lavoro, crediti e consumi.</w:t>
+              <w:t xml:space="preserve">Assistente virtuale: messaggio «Un attimo…» durante l'attesa.</w:t>
             </w:r>
           </w:p>
         </w:tc>
@@ -3283,7 +3283,7 @@
                 <w:sz w:val="18"/>
                 <w:szCs w:val="18"/>
               </w:rPr>
-              <w:t xml:space="preserve">3.5</w:t>
+              <w:t xml:space="preserve">3.6</w:t>
             </w:r>
           </w:p>
         </w:tc>
@@ -3349,7 +3349,7 @@
                 <w:sz w:val="18"/>
                 <w:szCs w:val="18"/>
               </w:rPr>
-              <w:t xml:space="preserve">Assistente virtuale; documenti ufficiali del Programma nella Documentazione.</w:t>
+              <w:t xml:space="preserve">Assistente virtuale attivo: chiave legata a uno spazio di lavoro, crediti e consumi.</w:t>
             </w:r>
           </w:p>
         </w:tc>
@@ -3419,7 +3419,7 @@
                 <w:sz w:val="18"/>
                 <w:szCs w:val="18"/>
               </w:rPr>
-              <w:t xml:space="preserve">3.4</w:t>
+              <w:t xml:space="preserve">3.5</w:t>
             </w:r>
           </w:p>
         </w:tc>
@@ -3483,7 +3483,7 @@
                 <w:sz w:val="18"/>
                 <w:szCs w:val="18"/>
               </w:rPr>
-              <w:t xml:space="preserve">Presentazione di riepilogo nella pagina Documentazione.</w:t>
+              <w:t xml:space="preserve">Assistente virtuale; documenti ufficiali del Programma nella Documentazione.</w:t>
             </w:r>
           </w:p>
         </w:tc>
@@ -3553,7 +3553,7 @@
                 <w:sz w:val="18"/>
                 <w:szCs w:val="18"/>
               </w:rPr>
-              <w:t xml:space="preserve">3.3</w:t>
+              <w:t xml:space="preserve">3.4</w:t>
             </w:r>
           </w:p>
         </w:tc>
@@ -3619,7 +3619,7 @@
                 <w:sz w:val="18"/>
                 <w:szCs w:val="18"/>
               </w:rPr>
-              <w:t xml:space="preserve">Ordinamento di tutte le tabelle e degli elenchi.</w:t>
+              <w:t xml:space="preserve">Presentazione di riepilogo nella pagina Documentazione.</w:t>
             </w:r>
           </w:p>
         </w:tc>
@@ -3689,7 +3689,7 @@
                 <w:sz w:val="18"/>
                 <w:szCs w:val="18"/>
               </w:rPr>
-              <w:t xml:space="preserve">3.2</w:t>
+              <w:t xml:space="preserve">3.3</w:t>
             </w:r>
           </w:p>
         </w:tc>
@@ -3753,7 +3753,7 @@
                 <w:sz w:val="18"/>
                 <w:szCs w:val="18"/>
               </w:rPr>
-              <w:t xml:space="preserve">Simulatore: metodo di stima per utenza (solo utenze virtuose), buffer del Capitolo 7, taratura.</w:t>
+              <w:t xml:space="preserve">Ordinamento di tutte le tabelle e degli elenchi.</w:t>
             </w:r>
           </w:p>
         </w:tc>
@@ -3823,7 +3823,7 @@
                 <w:sz w:val="18"/>
                 <w:szCs w:val="18"/>
               </w:rPr>
-              <w:t xml:space="preserve">3.1</w:t>
+              <w:t xml:space="preserve">3.2</w:t>
             </w:r>
           </w:p>
         </w:tc>
@@ -3889,7 +3889,7 @@
                 <w:sz w:val="18"/>
                 <w:szCs w:val="18"/>
               </w:rPr>
-              <w:t xml:space="preserve">Cruscotto diventa Dashboard; barra a LED delle 7 fasi per ogni pratica.</w:t>
+              <w:t xml:space="preserve">Simulatore: metodo di stima per utenza (solo utenze virtuose), buffer del Capitolo 7, taratura.</w:t>
             </w:r>
           </w:p>
         </w:tc>
@@ -3959,7 +3959,7 @@
                 <w:sz w:val="18"/>
                 <w:szCs w:val="18"/>
               </w:rPr>
-              <w:t xml:space="preserve">3.0</w:t>
+              <w:t xml:space="preserve">3.1</w:t>
             </w:r>
           </w:p>
         </w:tc>
@@ -4023,7 +4023,7 @@
                 <w:sz w:val="18"/>
                 <w:szCs w:val="18"/>
               </w:rPr>
-              <w:t xml:space="preserve">Eliminazione degli utenti che non hanno mai operato (script 30).</w:t>
+              <w:t xml:space="preserve">Cruscotto diventa Dashboard; barra a LED delle 7 fasi per ogni pratica.</w:t>
             </w:r>
           </w:p>
         </w:tc>
@@ -4093,7 +4093,7 @@
                 <w:sz w:val="18"/>
                 <w:szCs w:val="18"/>
               </w:rPr>
-              <w:t xml:space="preserve">2.9</w:t>
+              <w:t xml:space="preserve">3.0</w:t>
             </w:r>
           </w:p>
         </w:tc>
@@ -4159,7 +4159,7 @@
                 <w:sz w:val="18"/>
                 <w:szCs w:val="18"/>
               </w:rPr>
-              <w:t xml:space="preserve">Email automatica con le credenziali al nuovo utente e alla reimpostazione della password.</w:t>
+              <w:t xml:space="preserve">Eliminazione degli utenti che non hanno mai operato (script 30).</w:t>
             </w:r>
           </w:p>
         </w:tc>
@@ -4229,7 +4229,7 @@
                 <w:sz w:val="18"/>
                 <w:szCs w:val="18"/>
               </w:rPr>
-              <w:t xml:space="preserve">2.8</w:t>
+              <w:t xml:space="preserve">2.9</w:t>
             </w:r>
           </w:p>
         </w:tc>
@@ -4293,7 +4293,7 @@
                 <w:sz w:val="18"/>
                 <w:szCs w:val="18"/>
               </w:rPr>
-              <w:t xml:space="preserve">Più Amministratori con accesso completo; Amministratore principale protetto (script 29).</w:t>
+              <w:t xml:space="preserve">Email automatica con le credenziali al nuovo utente e alla reimpostazione della password.</w:t>
             </w:r>
           </w:p>
         </w:tc>
@@ -4363,7 +4363,7 @@
                 <w:sz w:val="18"/>
                 <w:szCs w:val="18"/>
               </w:rPr>
-              <w:t xml:space="preserve">2.7</w:t>
+              <w:t xml:space="preserve">2.8</w:t>
             </w:r>
           </w:p>
         </w:tc>
@@ -4429,7 +4429,7 @@
                 <w:sz w:val="18"/>
                 <w:szCs w:val="18"/>
               </w:rPr>
-              <w:t xml:space="preserve">Simulatore: costi per il Comune secondo il Caso 1 (progetto volontario) o il Caso 2 (progetto obbligatorio da bando).</w:t>
+              <w:t xml:space="preserve">Più Amministratori con accesso completo; Amministratore principale protetto (script 29).</w:t>
             </w:r>
           </w:p>
         </w:tc>
@@ -4499,7 +4499,7 @@
                 <w:sz w:val="18"/>
                 <w:szCs w:val="18"/>
               </w:rPr>
-              <w:t xml:space="preserve">2.6</w:t>
+              <w:t xml:space="preserve">2.7</w:t>
             </w:r>
           </w:p>
         </w:tc>
@@ -4563,7 +4563,7 @@
                 <w:sz w:val="18"/>
                 <w:szCs w:val="18"/>
               </w:rPr>
-              <w:t xml:space="preserve">Simulatore: valore del credito anno per anno, proposto 32 €.</w:t>
+              <w:t xml:space="preserve">Simulatore: costi per il Comune secondo il Caso 1 (progetto volontario) o il Caso 2 (progetto obbligatorio da bando).</w:t>
             </w:r>
           </w:p>
         </w:tc>
@@ -4633,7 +4633,7 @@
                 <w:sz w:val="18"/>
                 <w:szCs w:val="18"/>
               </w:rPr>
-              <w:t xml:space="preserve">2.5</w:t>
+              <w:t xml:space="preserve">2.6</w:t>
             </w:r>
           </w:p>
         </w:tc>
@@ -4699,7 +4699,7 @@
                 <w:sz w:val="18"/>
                 <w:szCs w:val="18"/>
               </w:rPr>
-              <w:t xml:space="preserve">Simulatore: simulazione economica con valore unitario del credito e costi per il Comune (contratti tipo della Fondazione, Schema tariffario).</w:t>
+              <w:t xml:space="preserve">Simulatore: valore del credito anno per anno, proposto 32 €.</w:t>
             </w:r>
           </w:p>
         </w:tc>
@@ -4769,7 +4769,7 @@
                 <w:sz w:val="18"/>
                 <w:szCs w:val="18"/>
               </w:rPr>
-              <w:t xml:space="preserve">2.4</w:t>
+              <w:t xml:space="preserve">2.5</w:t>
             </w:r>
           </w:p>
         </w:tc>
@@ -4833,7 +4833,7 @@
                 <w:sz w:val="18"/>
                 <w:szCs w:val="18"/>
               </w:rPr>
-              <w:t xml:space="preserve">Simulatore: riferimento sempre alla soglia del 65% di differenziata e controllo dei valori fuori scala.</w:t>
+              <w:t xml:space="preserve">Simulatore: simulazione economica con valore unitario del credito e costi per il Comune (contratti tipo della Fondazione, Schema tariffario).</w:t>
             </w:r>
           </w:p>
         </w:tc>
@@ -4903,7 +4903,7 @@
                 <w:sz w:val="18"/>
                 <w:szCs w:val="18"/>
               </w:rPr>
-              <w:t xml:space="preserve">2.3</w:t>
+              <w:t xml:space="preserve">2.4</w:t>
             </w:r>
           </w:p>
         </w:tc>
@@ -4969,7 +4969,7 @@
                 <w:sz w:val="18"/>
                 <w:szCs w:val="18"/>
               </w:rPr>
-              <w:t xml:space="preserve">Simulatore conforme al modello CWP: scenario di riferimento dello Standard 4.8.1, situazione attuale, conformità.</w:t>
+              <w:t xml:space="preserve">Simulatore: riferimento sempre alla soglia del 65% di differenziata e controllo dei valori fuori scala.</w:t>
             </w:r>
           </w:p>
         </w:tc>
@@ -5039,7 +5039,7 @@
                 <w:sz w:val="18"/>
                 <w:szCs w:val="18"/>
               </w:rPr>
-              <w:t xml:space="preserve">2.2</w:t>
+              <w:t xml:space="preserve">2.3</w:t>
             </w:r>
           </w:p>
         </w:tc>
@@ -5103,7 +5103,7 @@
                 <w:sz w:val="18"/>
                 <w:szCs w:val="18"/>
               </w:rPr>
-              <w:t xml:space="preserve">Nuovo capitolo «Simulatore di scenari»: creazione, anno base, obiettivi annui, risultati, modello di stima.</w:t>
+              <w:t xml:space="preserve">Simulatore conforme al modello CWP: scenario di riferimento dello Standard 4.8.1, situazione attuale, conformità.</w:t>
             </w:r>
           </w:p>
         </w:tc>
@@ -5173,7 +5173,7 @@
                 <w:sz w:val="18"/>
                 <w:szCs w:val="18"/>
               </w:rPr>
-              <w:t xml:space="preserve">2.1</w:t>
+              <w:t xml:space="preserve">2.2</w:t>
             </w:r>
           </w:p>
         </w:tc>
@@ -5239,7 +5239,7 @@
                 <w:sz w:val="18"/>
                 <w:szCs w:val="18"/>
               </w:rPr>
-              <w:t xml:space="preserve">Funzioni in arrivo: simulatore di scenari (7, 10 o 21 anni, obiettivi annui, % di differenziata e crediti stimati) e assistente virtuale (Claude).</w:t>
+              <w:t xml:space="preserve">Nuovo capitolo «Simulatore di scenari»: creazione, anno base, obiettivi annui, risultati, modello di stima.</w:t>
             </w:r>
           </w:p>
         </w:tc>
@@ -5309,7 +5309,7 @@
                 <w:sz w:val="18"/>
                 <w:szCs w:val="18"/>
               </w:rPr>
-              <w:t xml:space="preserve">2.0</w:t>
+              <w:t xml:space="preserve">2.1</w:t>
             </w:r>
           </w:p>
         </w:tc>
@@ -5373,7 +5373,7 @@
                 <w:sz w:val="18"/>
                 <w:szCs w:val="18"/>
               </w:rPr>
-              <w:t xml:space="preserve">Copie di sicurezza e ripristino: rimando alle Istruzioni di ripristino e punti essenziali (capitolo Manutenzione ed emergenze).</w:t>
+              <w:t xml:space="preserve">Funzioni in arrivo: simulatore di scenari (7, 10 o 21 anni, obiettivi annui, % di differenziata e crediti stimati) e assistente virtuale (Claude).</w:t>
             </w:r>
           </w:p>
         </w:tc>
@@ -5443,7 +5443,7 @@
                 <w:sz w:val="18"/>
                 <w:szCs w:val="18"/>
               </w:rPr>
-              <w:t xml:space="preserve">1.9</w:t>
+              <w:t xml:space="preserve">2.0</w:t>
             </w:r>
           </w:p>
         </w:tc>
@@ -5509,7 +5509,7 @@
                 <w:sz w:val="18"/>
                 <w:szCs w:val="18"/>
               </w:rPr>
-              <w:t xml:space="preserve">Fondazione Operate soggetto promotore del programma (esclusiva conferita da Wastelab).</w:t>
+              <w:t xml:space="preserve">Copie di sicurezza e ripristino: rimando alle Istruzioni di ripristino e punti essenziali (capitolo Manutenzione ed emergenze).</w:t>
             </w:r>
           </w:p>
         </w:tc>
@@ -5579,7 +5579,7 @@
                 <w:sz w:val="18"/>
                 <w:szCs w:val="18"/>
               </w:rPr>
-              <w:t xml:space="preserve">1.8</w:t>
+              <w:t xml:space="preserve">1.9</w:t>
             </w:r>
           </w:p>
         </w:tc>
@@ -5643,7 +5643,7 @@
                 <w:sz w:val="18"/>
                 <w:szCs w:val="18"/>
               </w:rPr>
-              <w:t xml:space="preserve">PEC del Programma e documenti ufficiali già pubblicati sulla pagina pubblica.</w:t>
+              <w:t xml:space="preserve">Fondazione Operate soggetto promotore del programma (esclusiva conferita da Wastelab).</w:t>
             </w:r>
           </w:p>
         </w:tc>
@@ -5713,7 +5713,7 @@
                 <w:sz w:val="18"/>
                 <w:szCs w:val="18"/>
               </w:rPr>
-              <w:t xml:space="preserve">1.7</w:t>
+              <w:t xml:space="preserve">1.8</w:t>
             </w:r>
           </w:p>
         </w:tc>
@@ -5746,7 +5746,7 @@
                 <w:sz w:val="18"/>
                 <w:szCs w:val="18"/>
               </w:rPr>
-              <w:t xml:space="preserve">18/10/2026</w:t>
+              <w:t xml:space="preserve">19/10/2026</w:t>
             </w:r>
           </w:p>
         </w:tc>
@@ -5779,7 +5779,7 @@
                 <w:sz w:val="18"/>
                 <w:szCs w:val="18"/>
               </w:rPr>
-              <w:t xml:space="preserve">Allineamento ai documenti ufficiali del Programma (script 22-24): Rapporto a 7 fasi, feedback pubblico, stati del Programma, dati del progetto e territorio ISTAT, ritiro e rientro, account unico e delegati, registri, tariffe e sospensione, accuratezza e accertamenti, informazioni del Programma e metodologie, modelli pubblici; nuovi capitoli Crediti emessi, Reclami, Pagina pubblica; qualità dei dati nel calcolo.</w:t>
+              <w:t xml:space="preserve">PEC del Programma e documenti ufficiali già pubblicati sulla pagina pubblica.</w:t>
             </w:r>
           </w:p>
         </w:tc>
@@ -5849,7 +5849,7 @@
                 <w:sz w:val="18"/>
                 <w:szCs w:val="18"/>
               </w:rPr>
-              <w:t xml:space="preserve">1.6</w:t>
+              <w:t xml:space="preserve">1.7</w:t>
             </w:r>
           </w:p>
         </w:tc>
@@ -5913,7 +5913,7 @@
                 <w:sz w:val="18"/>
                 <w:szCs w:val="18"/>
               </w:rPr>
-              <w:t xml:space="preserve">Calcolo crediti: descrizione corretta del buffer (somma delle voci delle Tabelle 15 e 16, più il 20% con le sole utenze virtuose, al massimo 80%).</w:t>
+              <w:t xml:space="preserve">Allineamento ai documenti ufficiali del Programma (script 22-24): Rapporto a 7 fasi, feedback pubblico, stati del Programma, dati del progetto e territorio ISTAT, ritiro e rientro, account unico e delegati, registri, tariffe e sospensione, accuratezza e accertamenti, informazioni del Programma e metodologie, modelli pubblici; nuovi capitoli Crediti emessi, Reclami, Pagina pubblica; qualità dei dati nel calcolo.</w:t>
             </w:r>
           </w:p>
         </w:tc>
@@ -5983,7 +5983,7 @@
                 <w:sz w:val="18"/>
                 <w:szCs w:val="18"/>
               </w:rPr>
-              <w:t xml:space="preserve">1.5</w:t>
+              <w:t xml:space="preserve">1.6</w:t>
             </w:r>
           </w:p>
         </w:tc>
@@ -6049,7 +6049,7 @@
                 <w:sz w:val="18"/>
                 <w:szCs w:val="18"/>
               </w:rPr>
-              <w:t xml:space="preserve">Nuova pagina Anagrafiche (Organizzazioni ed Enti, anche per gli Operatori); Rapporti con 4 fasi e durate proprie; documenti richiesti per fase; consultazione con documento bloccato, osservazioni numerate e motivazione; conservazione per 10 anni; fascicolo con riepilogo PDF e nuove cartelle.</w:t>
+              <w:t xml:space="preserve">Calcolo crediti: descrizione corretta del buffer (somma delle voci delle Tabelle 15 e 16, più il 20% con le sole utenze virtuose, al massimo 80%).</w:t>
             </w:r>
           </w:p>
         </w:tc>
@@ -6119,7 +6119,7 @@
                 <w:sz w:val="18"/>
                 <w:szCs w:val="18"/>
               </w:rPr>
-              <w:t xml:space="preserve">1.4</w:t>
+              <w:t xml:space="preserve">1.5</w:t>
             </w:r>
           </w:p>
         </w:tc>
@@ -6183,7 +6183,7 @@
                 <w:sz w:val="18"/>
                 <w:szCs w:val="18"/>
               </w:rPr>
-              <w:t xml:space="preserve">Calcolo crediti: il risultato si azzera quando cambiano dati o Banca Dati Utenze, conferma solo dopo un nuovo «Calcola». Gestione utenti: password temporanea di almeno 10 caratteri con lettere e numeri, creazione annullata se non va a buon fine, nessun accesso ai dati prima del cambio password.</w:t>
+              <w:t xml:space="preserve">Nuova pagina Anagrafiche (Organizzazioni ed Enti, anche per gli Operatori); Rapporti con 4 fasi e durate proprie; documenti richiesti per fase; consultazione con documento bloccato, osservazioni numerate e motivazione; conservazione per 10 anni; fascicolo con riepilogo PDF e nuove cartelle.</w:t>
             </w:r>
           </w:p>
         </w:tc>
@@ -6253,7 +6253,7 @@
                 <w:sz w:val="18"/>
                 <w:szCs w:val="18"/>
               </w:rPr>
-              <w:t xml:space="preserve">1.3</w:t>
+              <w:t xml:space="preserve">1.4</w:t>
             </w:r>
           </w:p>
         </w:tc>
@@ -6319,7 +6319,7 @@
                 <w:sz w:val="18"/>
                 <w:szCs w:val="18"/>
               </w:rPr>
-              <w:t xml:space="preserve">Rapporto di calcolo in PDF, archiviazione nella pratica, numero di registro, registro dei crediti.</w:t>
+              <w:t xml:space="preserve">Calcolo crediti: il risultato si azzera quando cambiano dati o Banca Dati Utenze, conferma solo dopo un nuovo «Calcola». Gestione utenti: password temporanea di almeno 10 caratteri con lettere e numeri, creazione annullata se non va a buon fine, nessun accesso ai dati prima del cambio password.</w:t>
             </w:r>
           </w:p>
         </w:tc>
@@ -6389,7 +6389,7 @@
                 <w:sz w:val="18"/>
                 <w:szCs w:val="18"/>
               </w:rPr>
-              <w:t xml:space="preserve">1.2</w:t>
+              <w:t xml:space="preserve">1.3</w:t>
             </w:r>
           </w:p>
         </w:tc>
@@ -6453,7 +6453,7 @@
                 <w:sz w:val="18"/>
                 <w:szCs w:val="18"/>
               </w:rPr>
-              <w:t xml:space="preserve">Calcolo crediti: importare il tracciato nel calcolo (dai documenti della pratica o dal computer), singole letture, blocco dei dati personali, controlli di coerenza.</w:t>
+              <w:t xml:space="preserve">Rapporto di calcolo in PDF, archiviazione nella pratica, numero di registro, registro dei crediti.</w:t>
             </w:r>
           </w:p>
         </w:tc>
@@ -6523,7 +6523,7 @@
                 <w:sz w:val="18"/>
                 <w:szCs w:val="18"/>
               </w:rPr>
-              <w:t xml:space="preserve">1.1</w:t>
+              <w:t xml:space="preserve">1.2</w:t>
             </w:r>
           </w:p>
         </w:tc>
@@ -6589,7 +6589,7 @@
                 <w:sz w:val="18"/>
                 <w:szCs w:val="18"/>
               </w:rPr>
-              <w:t xml:space="preserve">Note di fase, Ente di Validazione della pratica, consultazione sulla pagina pubblica con conferma dell'email, moderazione con autori e allegati, errata corrige; nuovo capitolo Messaggi con il Comune; pagamenti visibili al Comune; Impostazioni: Enti di Validazione e Modelli di documento; notifiche aggiornate.</w:t>
+              <w:t xml:space="preserve">Calcolo crediti: importare il tracciato nel calcolo (dai documenti della pratica o dal computer), singole letture, blocco dei dati personali, controlli di coerenza.</w:t>
             </w:r>
           </w:p>
         </w:tc>
@@ -6659,6 +6659,140 @@
                 <w:sz w:val="18"/>
                 <w:szCs w:val="18"/>
               </w:rPr>
+              <w:t xml:space="preserve">1.1</w:t>
+            </w:r>
+          </w:p>
+        </w:tc>
+        <w:tc>
+          <w:tcPr>
+            <w:tcW w:type="dxa" w:w="1300"/>
+            <w:tcBorders>
+              <w:top w:val="single" w:color="D9D4C5" w:sz="4"/>
+              <w:left w:val="single" w:color="D9D4C5" w:sz="4"/>
+              <w:bottom w:val="single" w:color="D9D4C5" w:sz="4"/>
+              <w:right w:val="single" w:color="D9D4C5" w:sz="4"/>
+            </w:tcBorders>
+            <w:tcMar>
+              <w:top w:type="dxa" w:w="70"/>
+              <w:left w:type="dxa" w:w="110"/>
+              <w:bottom w:type="dxa" w:w="70"/>
+              <w:right w:type="dxa" w:w="110"/>
+            </w:tcMar>
+            <w:vAlign w:val="center"/>
+          </w:tcPr>
+          <w:p>
+            <w:pPr>
+              <w:spacing w:after="0" w:before="0"/>
+            </w:pPr>
+            <w:r>
+              <w:rPr>
+                <w:rFonts w:ascii="Arial" w:cs="Arial" w:eastAsia="Arial" w:hAnsi="Arial"/>
+                <w:color w:val="1B2118"/>
+                <w:sz w:val="18"/>
+                <w:szCs w:val="18"/>
+              </w:rPr>
+              <w:t xml:space="preserve">18/10/2026</w:t>
+            </w:r>
+          </w:p>
+        </w:tc>
+        <w:tc>
+          <w:tcPr>
+            <w:tcW w:type="dxa" w:w="5538"/>
+            <w:tcBorders>
+              <w:top w:val="single" w:color="D9D4C5" w:sz="4"/>
+              <w:left w:val="single" w:color="D9D4C5" w:sz="4"/>
+              <w:bottom w:val="single" w:color="D9D4C5" w:sz="4"/>
+              <w:right w:val="single" w:color="D9D4C5" w:sz="4"/>
+            </w:tcBorders>
+            <w:tcMar>
+              <w:top w:type="dxa" w:w="70"/>
+              <w:left w:type="dxa" w:w="110"/>
+              <w:bottom w:type="dxa" w:w="70"/>
+              <w:right w:type="dxa" w:w="110"/>
+            </w:tcMar>
+            <w:vAlign w:val="center"/>
+          </w:tcPr>
+          <w:p>
+            <w:pPr>
+              <w:spacing w:after="0" w:before="0"/>
+            </w:pPr>
+            <w:r>
+              <w:rPr>
+                <w:rFonts w:ascii="Arial" w:cs="Arial" w:eastAsia="Arial" w:hAnsi="Arial"/>
+                <w:color w:val="1B2118"/>
+                <w:sz w:val="18"/>
+                <w:szCs w:val="18"/>
+              </w:rPr>
+              <w:t xml:space="preserve">Note di fase, Ente di Validazione della pratica, consultazione sulla pagina pubblica con conferma dell'email, moderazione con autori e allegati, errata corrige; nuovo capitolo Messaggi con il Comune; pagamenti visibili al Comune; Impostazioni: Enti di Validazione e Modelli di documento; notifiche aggiornate.</w:t>
+            </w:r>
+          </w:p>
+        </w:tc>
+        <w:tc>
+          <w:tcPr>
+            <w:tcW w:type="dxa" w:w="2000"/>
+            <w:tcBorders>
+              <w:top w:val="single" w:color="D9D4C5" w:sz="4"/>
+              <w:left w:val="single" w:color="D9D4C5" w:sz="4"/>
+              <w:bottom w:val="single" w:color="D9D4C5" w:sz="4"/>
+              <w:right w:val="single" w:color="D9D4C5" w:sz="4"/>
+            </w:tcBorders>
+            <w:tcMar>
+              <w:top w:type="dxa" w:w="70"/>
+              <w:left w:type="dxa" w:w="110"/>
+              <w:bottom w:type="dxa" w:w="70"/>
+              <w:right w:type="dxa" w:w="110"/>
+            </w:tcMar>
+            <w:vAlign w:val="center"/>
+          </w:tcPr>
+          <w:p>
+            <w:pPr>
+              <w:spacing w:after="0" w:before="0"/>
+            </w:pPr>
+            <w:r>
+              <w:rPr>
+                <w:rFonts w:ascii="Arial" w:cs="Arial" w:eastAsia="Arial" w:hAnsi="Arial"/>
+                <w:color w:val="1B2118"/>
+                <w:sz w:val="18"/>
+                <w:szCs w:val="18"/>
+              </w:rPr>
+              <w:t xml:space="preserve">Fondazione Operate</w:t>
+            </w:r>
+          </w:p>
+        </w:tc>
+      </w:tr>
+      <w:tr>
+        <w:trPr>
+          <w:cantSplit/>
+        </w:trPr>
+        <w:tc>
+          <w:tcPr>
+            <w:tcW w:type="dxa" w:w="800"/>
+            <w:tcBorders>
+              <w:top w:val="single" w:color="D9D4C5" w:sz="4"/>
+              <w:left w:val="single" w:color="D9D4C5" w:sz="4"/>
+              <w:bottom w:val="single" w:color="D9D4C5" w:sz="4"/>
+              <w:right w:val="single" w:color="D9D4C5" w:sz="4"/>
+            </w:tcBorders>
+            <w:shd w:fill="F6F4EE" w:color="auto" w:val="clear"/>
+            <w:tcMar>
+              <w:top w:type="dxa" w:w="70"/>
+              <w:left w:type="dxa" w:w="110"/>
+              <w:bottom w:type="dxa" w:w="70"/>
+              <w:right w:type="dxa" w:w="110"/>
+            </w:tcMar>
+            <w:vAlign w:val="center"/>
+          </w:tcPr>
+          <w:p>
+            <w:pPr>
+              <w:spacing w:after="0" w:before="0"/>
+            </w:pPr>
+            <w:r>
+              <w:rPr>
+                <w:rFonts w:ascii="Arial" w:cs="Arial" w:eastAsia="Arial" w:hAnsi="Arial"/>
+                <w:color w:val="1B2118"/>
+                <w:sz w:val="18"/>
+                <w:szCs w:val="18"/>
+              </w:rPr>
               <w:t xml:space="preserve">1.0</w:t>
             </w:r>
           </w:p>
@@ -6672,6 +6806,7 @@
               <w:bottom w:val="single" w:color="D9D4C5" w:sz="4"/>
               <w:right w:val="single" w:color="D9D4C5" w:sz="4"/>
             </w:tcBorders>
+            <w:shd w:fill="F6F4EE" w:color="auto" w:val="clear"/>
             <w:tcMar>
               <w:top w:type="dxa" w:w="70"/>
               <w:left w:type="dxa" w:w="110"/>
@@ -6704,6 +6839,7 @@
               <w:bottom w:val="single" w:color="D9D4C5" w:sz="4"/>
               <w:right w:val="single" w:color="D9D4C5" w:sz="4"/>
             </w:tcBorders>
+            <w:shd w:fill="F6F4EE" w:color="auto" w:val="clear"/>
             <w:tcMar>
               <w:top w:type="dxa" w:w="70"/>
               <w:left w:type="dxa" w:w="110"/>
@@ -6736,6 +6872,7 @@
               <w:bottom w:val="single" w:color="D9D4C5" w:sz="4"/>
               <w:right w:val="single" w:color="D9D4C5" w:sz="4"/>
             </w:tcBorders>
+            <w:shd w:fill="F6F4EE" w:color="auto" w:val="clear"/>
             <w:tcMar>
               <w:top w:type="dxa" w:w="70"/>
               <w:left w:type="dxa" w:w="110"/>
@@ -6777,7 +6914,7 @@
           <w:sz w:val="20"/>
           <w:szCs w:val="20"/>
         </w:rPr>
-        <w:t xml:space="preserve">Questo documento descrive il portale alla revisione 5.4 del 22/10/2026. A ogni modifica del portale il manuale viene aggiornato e la revisione incrementata; la versione corrente si scarica dall'area Documentazione del portale (solo Amministratori).</w:t>
+        <w:t xml:space="preserve">Questo documento descrive il portale alla revisione 5.5 del 22/10/2026. A ogni modifica del portale il manuale viene aggiornato e la revisione incrementata; la versione corrente si scarica dall'area Documentazione del portale (solo Amministratori).</w:t>
       </w:r>
     </w:p>
     <w:p>
@@ -7351,7 +7488,7 @@
             <w:szCs w:val="22"/>
           </w:rPr>
           <w:tab/>
-          <w:t xml:space="preserve">42</w:t>
+          <w:t xml:space="preserve">43</w:t>
         </w:r>
       </w:hyperlink>
     </w:p>
@@ -7380,7 +7517,7 @@
             <w:szCs w:val="22"/>
           </w:rPr>
           <w:tab/>
-          <w:t xml:space="preserve">46</w:t>
+          <w:t xml:space="preserve">47</w:t>
         </w:r>
       </w:hyperlink>
     </w:p>
@@ -7409,7 +7546,7 @@
             <w:szCs w:val="22"/>
           </w:rPr>
           <w:tab/>
-          <w:t xml:space="preserve">48</w:t>
+          <w:t xml:space="preserve">49</w:t>
         </w:r>
       </w:hyperlink>
     </w:p>
@@ -7438,7 +7575,7 @@
             <w:szCs w:val="22"/>
           </w:rPr>
           <w:tab/>
-          <w:t xml:space="preserve">49</w:t>
+          <w:t xml:space="preserve">50</w:t>
         </w:r>
       </w:hyperlink>
     </w:p>
@@ -7467,7 +7604,7 @@
             <w:szCs w:val="22"/>
           </w:rPr>
           <w:tab/>
-          <w:t xml:space="preserve">50</w:t>
+          <w:t xml:space="preserve">51</w:t>
         </w:r>
       </w:hyperlink>
     </w:p>
@@ -7496,7 +7633,7 @@
             <w:szCs w:val="22"/>
           </w:rPr>
           <w:tab/>
-          <w:t xml:space="preserve">51</w:t>
+          <w:t xml:space="preserve">52</w:t>
         </w:r>
       </w:hyperlink>
     </w:p>
@@ -7554,7 +7691,7 @@
             <w:szCs w:val="22"/>
           </w:rPr>
           <w:tab/>
-          <w:t xml:space="preserve">54</w:t>
+          <w:t xml:space="preserve">55</w:t>
         </w:r>
       </w:hyperlink>
     </w:p>
@@ -7583,7 +7720,7 @@
             <w:szCs w:val="22"/>
           </w:rPr>
           <w:tab/>
-          <w:t xml:space="preserve">56</w:t>
+          <w:t xml:space="preserve">57</w:t>
         </w:r>
       </w:hyperlink>
     </w:p>
@@ -7612,7 +7749,7 @@
             <w:szCs w:val="22"/>
           </w:rPr>
           <w:tab/>
-          <w:t xml:space="preserve">57</w:t>
+          <w:t xml:space="preserve">58</w:t>
         </w:r>
       </w:hyperlink>
     </w:p>
@@ -7641,7 +7778,7 @@
             <w:szCs w:val="22"/>
           </w:rPr>
           <w:tab/>
-          <w:t xml:space="preserve">58</w:t>
+          <w:t xml:space="preserve">59</w:t>
         </w:r>
       </w:hyperlink>
     </w:p>
@@ -9657,7 +9794,7 @@
         </w:rPr>
         <w:t xml:space="preserve">Si accede da </w:t>
       </w:r>
-      <w:hyperlink w:history="1" r:id="rIds4kcotcsezrptsf5r8dlp">
+      <w:hyperlink w:history="1" r:id="rIdj_w0qambu9__j9r14tsbd">
         <w:r>
           <w:rPr>
             <w:rFonts w:ascii="Arial" w:cs="Arial" w:eastAsia="Arial" w:hAnsi="Arial"/>
@@ -36002,7 +36139,52 @@
           <w:sz w:val="21"/>
           <w:szCs w:val="21"/>
         </w:rPr>
-        <w:t xml:space="preserve">). In un calcolo confermato il passo è in sola lettura.</w:t>
+        <w:t xml:space="preserve">). In un calcolo confermato il passo è in sola lettura. Nell'</w:t>
+      </w:r>
+      <w:r>
+        <w:rPr>
+          <w:rFonts w:ascii="Arial" w:cs="Arial" w:eastAsia="Arial" w:hAnsi="Arial"/>
+          <w:b/>
+          <w:bCs/>
+          <w:color w:val="1B2118"/>
+          <w:sz w:val="21"/>
+          <w:szCs w:val="21"/>
+        </w:rPr>
+        <w:t xml:space="preserve">Audit</w:t>
+      </w:r>
+      <w:r>
+        <w:rPr>
+          <w:rFonts w:ascii="Arial" w:cs="Arial" w:eastAsia="Arial" w:hAnsi="Arial"/>
+          <w:color w:val="1B2118"/>
+          <w:sz w:val="21"/>
+          <w:szCs w:val="21"/>
+        </w:rPr>
+        <w:t xml:space="preserve"> le operazioni compaiono come «caricamento utenze» (con il numero di utenze), «consultazione utenze» (con la ricerca), «inserimento», «modifica» e «cancellazione utenza» (con il codice e i campi cambiati), senza nomi né indirizzi.</w:t>
+      </w:r>
+    </w:p>
+    <w:p>
+      <w:pPr>
+        <w:spacing w:after="140" w:line="300"/>
+      </w:pPr>
+      <w:r>
+        <w:rPr>
+          <w:rFonts w:ascii="Arial" w:cs="Arial" w:eastAsia="Arial" w:hAnsi="Arial"/>
+          <w:b/>
+          <w:bCs/>
+          <w:color w:val="1B2118"/>
+          <w:sz w:val="21"/>
+          <w:szCs w:val="21"/>
+        </w:rPr>
+        <w:t xml:space="preserve">Calcolo di prova.</w:t>
+      </w:r>
+      <w:r>
+        <w:rPr>
+          <w:rFonts w:ascii="Arial" w:cs="Arial" w:eastAsia="Arial" w:hAnsi="Arial"/>
+          <w:color w:val="1B2118"/>
+          <w:sz w:val="21"/>
+          <w:szCs w:val="21"/>
+        </w:rPr>
+        <w:t xml:space="preserve"> Dal 22/10/2026 c'è il calcolo «PROVA Banca Dati Utenze - dati casuali (non confermare)» sul Progetto CWP-2026-003, con 20 utenze domestiche e 20 non domestiche inventate (codici PROVA-…): serve a provare il passo 5a e si può eliminare quando non serve più.</w:t>
       </w:r>
     </w:p>
     <w:p>
@@ -51792,7 +51974,7 @@
         <w:szCs w:val="16"/>
       </w:rPr>
       <w:tab/>
-      <w:t xml:space="preserve">Manuale Amministratore · Rev. 5.4 · 22/10/2026</w:t>
+      <w:t xml:space="preserve">Manuale Amministratore · Rev. 5.5 · 22/10/2026</w:t>
     </w:r>
   </w:p>
 </w:hdr>
@@ -51857,7 +52039,7 @@
         <w:szCs w:val="16"/>
       </w:rPr>
       <w:tab/>
-      <w:t xml:space="preserve">Manuale Amministratore · Rev. 5.4 · 22/10/2026</w:t>
+      <w:t xml:space="preserve">Manuale Amministratore · Rev. 5.5 · 22/10/2026</w:t>
     </w:r>
   </w:p>
 </w:hdr>

</xml_diff>

<commit_message>
Documentazione: revisione generale al 23/10 (registro 0.42, dati personali, da fare subito, struttura del codice, manuali) e slide «Novità del 22 e 23 ottobre»
Co-Authored-By: Claude Opus 5.5 <noreply@anthropic.com>
Claude-Session: https://claude.ai/code/session_01E8XCbEeVHWVP3hntUZ6kZ1
</commit_message>
<xml_diff>
--- a/public/documentazione/Manuale_Amministratore_Portale_CWP.docx
+++ b/public/documentazione/Manuale_Amministratore_Portale_CWP.docx
@@ -302,7 +302,7 @@
                 <w:sz w:val="20"/>
                 <w:szCs w:val="20"/>
               </w:rPr>
-              <w:t xml:space="preserve">Rev. 5.7</w:t>
+              <w:t xml:space="preserve">Rev. 5.8</w:t>
             </w:r>
           </w:p>
         </w:tc>
@@ -719,7 +719,7 @@
                 <w:sz w:val="18"/>
                 <w:szCs w:val="18"/>
               </w:rPr>
-              <w:t xml:space="preserve">5.7</w:t>
+              <w:t xml:space="preserve">5.8</w:t>
             </w:r>
           </w:p>
         </w:tc>
@@ -783,7 +783,7 @@
                 <w:sz w:val="18"/>
                 <w:szCs w:val="18"/>
               </w:rPr>
-              <w:t xml:space="preserve">Dashboard: valore dei crediti in simulazione e in fase esecutiva; Impostazioni: prezzo di riferimento del credito.</w:t>
+              <w:t xml:space="preserve">Revisione generale al 23/10: protezione dei dati del tracciato e della Banca Dati Utenze per utenza.</w:t>
             </w:r>
           </w:p>
         </w:tc>
@@ -853,7 +853,7 @@
                 <w:sz w:val="18"/>
                 <w:szCs w:val="18"/>
               </w:rPr>
-              <w:t xml:space="preserve">5.6</w:t>
+              <w:t xml:space="preserve">5.7</w:t>
             </w:r>
           </w:p>
         </w:tc>
@@ -919,7 +919,7 @@
                 <w:sz w:val="18"/>
                 <w:szCs w:val="18"/>
               </w:rPr>
-              <w:t xml:space="preserve">Passo 5a: «Calcola» usa le utenze (categoria di simulazione come classe della delibera, kg misurati, frazioni per utenza); utenze senza categoria o fuori delibera escluse e conferma bloccata; fonte nei Risultati, nel CSV e nel PDF.</w:t>
+              <w:t xml:space="preserve">Dashboard: valore dei crediti in simulazione e in fase esecutiva; Impostazioni: prezzo di riferimento del credito.</w:t>
             </w:r>
           </w:p>
         </w:tc>
@@ -989,7 +989,7 @@
                 <w:sz w:val="18"/>
                 <w:szCs w:val="18"/>
               </w:rPr>
-              <w:t xml:space="preserve">5.5</w:t>
+              <w:t xml:space="preserve">5.6</w:t>
             </w:r>
           </w:p>
         </w:tc>
@@ -1021,7 +1021,7 @@
                 <w:sz w:val="18"/>
                 <w:szCs w:val="18"/>
               </w:rPr>
-              <w:t xml:space="preserve">22/10/2026</w:t>
+              <w:t xml:space="preserve">23/10/2026</w:t>
             </w:r>
           </w:p>
         </w:tc>
@@ -1053,7 +1053,7 @@
                 <w:sz w:val="18"/>
                 <w:szCs w:val="18"/>
               </w:rPr>
-              <w:t xml:space="preserve">Audit delle utenze; calcolo di prova.</w:t>
+              <w:t xml:space="preserve">Passo 5a: «Calcola» usa le utenze (categoria di simulazione come classe della delibera, kg misurati, frazioni per utenza); utenze senza categoria o fuori delibera escluse e conferma bloccata; fonte nei Risultati, nel CSV e nel PDF.</w:t>
             </w:r>
           </w:p>
         </w:tc>
@@ -1123,7 +1123,7 @@
                 <w:sz w:val="18"/>
                 <w:szCs w:val="18"/>
               </w:rPr>
-              <w:t xml:space="preserve">5.4</w:t>
+              <w:t xml:space="preserve">5.5</w:t>
             </w:r>
           </w:p>
         </w:tc>
@@ -1189,7 +1189,7 @@
                 <w:sz w:val="18"/>
                 <w:szCs w:val="18"/>
               </w:rPr>
-              <w:t xml:space="preserve">Gestione delle utenze nel passo 5a del calcolo: caricamento, schede, modulo; categorie tariffaria e di simulazione.</w:t>
+              <w:t xml:space="preserve">Audit delle utenze; calcolo di prova.</w:t>
             </w:r>
           </w:p>
         </w:tc>
@@ -1259,7 +1259,7 @@
                 <w:sz w:val="18"/>
                 <w:szCs w:val="18"/>
               </w:rPr>
-              <w:t xml:space="preserve">5.3</w:t>
+              <w:t xml:space="preserve">5.4</w:t>
             </w:r>
           </w:p>
         </w:tc>
@@ -1323,7 +1323,7 @@
                 <w:sz w:val="18"/>
                 <w:szCs w:val="18"/>
               </w:rPr>
-              <w:t xml:space="preserve">Banca Dati Utenze per utenza: campi, regole, dati personali.</w:t>
+              <w:t xml:space="preserve">Gestione delle utenze nel passo 5a del calcolo: caricamento, schede, modulo; categorie tariffaria e di simulazione.</w:t>
             </w:r>
           </w:p>
         </w:tc>
@@ -1393,7 +1393,7 @@
                 <w:sz w:val="18"/>
                 <w:szCs w:val="18"/>
               </w:rPr>
-              <w:t xml:space="preserve">5.2</w:t>
+              <w:t xml:space="preserve">5.3</w:t>
             </w:r>
           </w:p>
         </w:tc>
@@ -1459,7 +1459,7 @@
                 <w:sz w:val="18"/>
                 <w:szCs w:val="18"/>
               </w:rPr>
-              <w:t xml:space="preserve">Uso dal telefono: menu a pannello, schede in Dashboard e Audit, elenco e dettaglio delle pratiche.</w:t>
+              <w:t xml:space="preserve">Banca Dati Utenze per utenza: campi, regole, dati personali.</w:t>
             </w:r>
           </w:p>
         </w:tc>
@@ -1529,7 +1529,7 @@
                 <w:sz w:val="18"/>
                 <w:szCs w:val="18"/>
               </w:rPr>
-              <w:t xml:space="preserve">5.1</w:t>
+              <w:t xml:space="preserve">5.2</w:t>
             </w:r>
           </w:p>
         </w:tc>
@@ -1593,7 +1593,7 @@
                 <w:sz w:val="18"/>
                 <w:szCs w:val="18"/>
               </w:rPr>
-              <w:t xml:space="preserve">Rilievi N01-N06: costi una tantum in 10 rate, feedback pubblico e fase 3, ente prima della fase 5, riquadro «Fase aperta senza scadenza», avviso sui codici, frazioni del fattore dell'indifferenziato.</w:t>
+              <w:t xml:space="preserve">Uso dal telefono: menu a pannello, schede in Dashboard e Audit, elenco e dettaglio delle pratiche.</w:t>
             </w:r>
           </w:p>
         </w:tc>
@@ -1663,7 +1663,7 @@
                 <w:sz w:val="18"/>
                 <w:szCs w:val="18"/>
               </w:rPr>
-              <w:t xml:space="preserve">5.0</w:t>
+              <w:t xml:space="preserve">5.1</w:t>
             </w:r>
           </w:p>
         </w:tc>
@@ -1696,7 +1696,7 @@
                 <w:sz w:val="18"/>
                 <w:szCs w:val="18"/>
               </w:rPr>
-              <w:t xml:space="preserve">21/10/2026</w:t>
+              <w:t xml:space="preserve">22/10/2026</w:t>
             </w:r>
           </w:p>
         </w:tc>
@@ -1729,7 +1729,7 @@
                 <w:sz w:val="18"/>
                 <w:szCs w:val="18"/>
               </w:rPr>
-              <w:t xml:space="preserve">«News» diventa «Notizie CO2»; Google News attraverso il tramite; barra a LED nell'elenco e nella pratica. Pallino verde delle Notizie CO2 nuove. Notizie CO2: siti di notizie ambientali al posto di Google News. Notizie CO2: siti di notizie ambientali al posto di Google News.</w:t>
+              <w:t xml:space="preserve">Rilievi N01-N06: costi una tantum in 10 rate, feedback pubblico e fase 3, ente prima della fase 5, riquadro «Fase aperta senza scadenza», avviso sui codici, frazioni del fattore dell'indifferenziato.</w:t>
             </w:r>
           </w:p>
         </w:tc>
@@ -1799,7 +1799,7 @@
                 <w:sz w:val="18"/>
                 <w:szCs w:val="18"/>
               </w:rPr>
-              <w:t xml:space="preserve">4.9</w:t>
+              <w:t xml:space="preserve">5.0</w:t>
             </w:r>
           </w:p>
         </w:tc>
@@ -1863,7 +1863,7 @@
                 <w:sz w:val="18"/>
                 <w:szCs w:val="18"/>
               </w:rPr>
-              <w:t xml:space="preserve">Nuovo capitolo «News»: osservatorio sui crediti di carbonio volontari. Canali Bing News e Verra.</w:t>
+              <w:t xml:space="preserve">«News» diventa «Notizie CO2»; Google News attraverso il tramite; barra a LED nell'elenco e nella pratica. Pallino verde delle Notizie CO2 nuove. Notizie CO2: siti di notizie ambientali al posto di Google News. Notizie CO2: siti di notizie ambientali al posto di Google News.</w:t>
             </w:r>
           </w:p>
         </w:tc>
@@ -1933,7 +1933,7 @@
                 <w:sz w:val="18"/>
                 <w:szCs w:val="18"/>
               </w:rPr>
-              <w:t xml:space="preserve">4.8</w:t>
+              <w:t xml:space="preserve">4.9</w:t>
             </w:r>
           </w:p>
         </w:tc>
@@ -1999,7 +1999,7 @@
                 <w:sz w:val="18"/>
                 <w:szCs w:val="18"/>
               </w:rPr>
-              <w:t xml:space="preserve">Simulatore: il PDF scaricato riporta tutti i dati della pagina, i costi e i grafici; foglio Excel «Dati inseriti».</w:t>
+              <w:t xml:space="preserve">Nuovo capitolo «News»: osservatorio sui crediti di carbonio volontari. Canali Bing News e Verra.</w:t>
             </w:r>
           </w:p>
         </w:tc>
@@ -2069,7 +2069,7 @@
                 <w:sz w:val="18"/>
                 <w:szCs w:val="18"/>
               </w:rPr>
-              <w:t xml:space="preserve">4.7</w:t>
+              <w:t xml:space="preserve">4.8</w:t>
             </w:r>
           </w:p>
         </w:tc>
@@ -2133,7 +2133,7 @@
                 <w:sz w:val="18"/>
                 <w:szCs w:val="18"/>
               </w:rPr>
-              <w:t xml:space="preserve">Assistente per gli Operatori e domande sulla pratica aperta; menu dell'Operatore con il Simulatore.</w:t>
+              <w:t xml:space="preserve">Simulatore: il PDF scaricato riporta tutti i dati della pagina, i costi e i grafici; foglio Excel «Dati inseriti».</w:t>
             </w:r>
           </w:p>
         </w:tc>
@@ -2203,7 +2203,7 @@
                 <w:sz w:val="18"/>
                 <w:szCs w:val="18"/>
               </w:rPr>
-              <w:t xml:space="preserve">4.6</w:t>
+              <w:t xml:space="preserve">4.7</w:t>
             </w:r>
           </w:p>
         </w:tc>
@@ -2269,7 +2269,7 @@
                 <w:sz w:val="18"/>
                 <w:szCs w:val="18"/>
               </w:rPr>
-              <w:t xml:space="preserve">Capitolo «Backup automatico».</w:t>
+              <w:t xml:space="preserve">Assistente per gli Operatori e domande sulla pratica aperta; menu dell'Operatore con il Simulatore.</w:t>
             </w:r>
           </w:p>
         </w:tc>
@@ -2339,7 +2339,7 @@
                 <w:sz w:val="18"/>
                 <w:szCs w:val="18"/>
               </w:rPr>
-              <w:t xml:space="preserve">4.5</w:t>
+              <w:t xml:space="preserve">4.6</w:t>
             </w:r>
           </w:p>
         </w:tc>
@@ -2403,7 +2403,7 @@
                 <w:sz w:val="18"/>
                 <w:szCs w:val="18"/>
               </w:rPr>
-              <w:t xml:space="preserve">Nuovo documento «Registro issue e test» tra quelli scaricabili.</w:t>
+              <w:t xml:space="preserve">Capitolo «Backup automatico».</w:t>
             </w:r>
           </w:p>
         </w:tc>
@@ -2473,7 +2473,7 @@
                 <w:sz w:val="18"/>
                 <w:szCs w:val="18"/>
               </w:rPr>
-              <w:t xml:space="preserve">4.4</w:t>
+              <w:t xml:space="preserve">4.5</w:t>
             </w:r>
           </w:p>
         </w:tc>
@@ -2539,7 +2539,7 @@
                 <w:sz w:val="18"/>
                 <w:szCs w:val="18"/>
               </w:rPr>
-              <w:t xml:space="preserve">Collaudo V05: testo completo dei valori lunghi nell'Audit (Prima/Dopo, Tolto/Aggiunto), denominazione delle organizzazioni e ricerca sui valori cambiati; pagina «Account disattivato».</w:t>
+              <w:t xml:space="preserve">Nuovo documento «Registro issue e test» tra quelli scaricabili.</w:t>
             </w:r>
           </w:p>
         </w:tc>
@@ -2609,7 +2609,7 @@
                 <w:sz w:val="18"/>
                 <w:szCs w:val="18"/>
               </w:rPr>
-              <w:t xml:space="preserve">4.3</w:t>
+              <w:t xml:space="preserve">4.4</w:t>
             </w:r>
           </w:p>
         </w:tc>
@@ -2641,7 +2641,7 @@
                 <w:sz w:val="18"/>
                 <w:szCs w:val="18"/>
               </w:rPr>
-              <w:t xml:space="preserve">20/10/2026</w:t>
+              <w:t xml:space="preserve">21/10/2026</w:t>
             </w:r>
           </w:p>
         </w:tc>
@@ -2673,7 +2673,7 @@
                 <w:sz w:val="18"/>
                 <w:szCs w:val="18"/>
               </w:rPr>
-              <w:t xml:space="preserve">Correzioni del collaudo V01: import CSV della Banca Dati «tutto o niente» senza valori negativi, calcolo bloccato con dati non ammessi, buffer manuale 0-80%, conferma definitiva solo senza errori di coerenza, dati non ammessi nel simulatore e zero esplicito nei prezzi, colonna «Oggetto e modifiche» nell'Audit.</w:t>
+              <w:t xml:space="preserve">Collaudo V05: testo completo dei valori lunghi nell'Audit (Prima/Dopo, Tolto/Aggiunto), denominazione delle organizzazioni e ricerca sui valori cambiati; pagina «Account disattivato».</w:t>
             </w:r>
           </w:p>
         </w:tc>
@@ -2743,7 +2743,7 @@
                 <w:sz w:val="18"/>
                 <w:szCs w:val="18"/>
               </w:rPr>
-              <w:t xml:space="preserve">4.2</w:t>
+              <w:t xml:space="preserve">4.3</w:t>
             </w:r>
           </w:p>
         </w:tc>
@@ -2809,7 +2809,7 @@
                 <w:sz w:val="18"/>
                 <w:szCs w:val="18"/>
               </w:rPr>
-              <w:t xml:space="preserve">Nuovo capitolo «Sicurezza»: inattività, avvisi, protezioni del sito e del database.</w:t>
+              <w:t xml:space="preserve">Correzioni del collaudo V01: import CSV della Banca Dati «tutto o niente» senza valori negativi, calcolo bloccato con dati non ammessi, buffer manuale 0-80%, conferma definitiva solo senza errori di coerenza, dati non ammessi nel simulatore e zero esplicito nei prezzi, colonna «Oggetto e modifiche» nell'Audit.</w:t>
             </w:r>
           </w:p>
         </w:tc>
@@ -2879,7 +2879,7 @@
                 <w:sz w:val="18"/>
                 <w:szCs w:val="18"/>
               </w:rPr>
-              <w:t xml:space="preserve">4.1</w:t>
+              <w:t xml:space="preserve">4.2</w:t>
             </w:r>
           </w:p>
         </w:tc>
@@ -2943,7 +2943,7 @@
                 <w:sz w:val="18"/>
                 <w:szCs w:val="18"/>
               </w:rPr>
-              <w:t xml:space="preserve">Voci di menu degli enti aggiornate.</w:t>
+              <w:t xml:space="preserve">Nuovo capitolo «Sicurezza»: inattività, avvisi, protezioni del sito e del database.</w:t>
             </w:r>
           </w:p>
         </w:tc>
@@ -3013,7 +3013,7 @@
                 <w:sz w:val="18"/>
                 <w:szCs w:val="18"/>
               </w:rPr>
-              <w:t xml:space="preserve">4.0</w:t>
+              <w:t xml:space="preserve">4.1</w:t>
             </w:r>
           </w:p>
         </w:tc>
@@ -3079,7 +3079,7 @@
                 <w:sz w:val="18"/>
                 <w:szCs w:val="18"/>
               </w:rPr>
-              <w:t xml:space="preserve">Nuovo ordine del menu; la sezione si chiama «Audit User». Voce «Marketplaces» in arrivo.</w:t>
+              <w:t xml:space="preserve">Voci di menu degli enti aggiornate.</w:t>
             </w:r>
           </w:p>
         </w:tc>
@@ -3149,7 +3149,7 @@
                 <w:sz w:val="18"/>
                 <w:szCs w:val="18"/>
               </w:rPr>
-              <w:t xml:space="preserve">3.9</w:t>
+              <w:t xml:space="preserve">4.0</w:t>
             </w:r>
           </w:p>
         </w:tc>
@@ -3213,7 +3213,7 @@
                 <w:sz w:val="18"/>
                 <w:szCs w:val="18"/>
               </w:rPr>
-              <w:t xml:space="preserve">Nuovo capitolo «Audit trail user».</w:t>
+              <w:t xml:space="preserve">Nuovo ordine del menu; la sezione si chiama «Audit User». Voce «Marketplaces» in arrivo.</w:t>
             </w:r>
           </w:p>
         </w:tc>
@@ -3283,7 +3283,7 @@
                 <w:sz w:val="18"/>
                 <w:szCs w:val="18"/>
               </w:rPr>
-              <w:t xml:space="preserve">3.8</w:t>
+              <w:t xml:space="preserve">3.9</w:t>
             </w:r>
           </w:p>
         </w:tc>
@@ -3349,7 +3349,7 @@
                 <w:sz w:val="18"/>
                 <w:szCs w:val="18"/>
               </w:rPr>
-              <w:t xml:space="preserve">Utenti online; PDF ed Excel del simulatore; messaggi d'errore dell'assistente.</w:t>
+              <w:t xml:space="preserve">Nuovo capitolo «Audit trail user».</w:t>
             </w:r>
           </w:p>
         </w:tc>
@@ -3419,7 +3419,7 @@
                 <w:sz w:val="18"/>
                 <w:szCs w:val="18"/>
               </w:rPr>
-              <w:t xml:space="preserve">3.7</w:t>
+              <w:t xml:space="preserve">3.8</w:t>
             </w:r>
           </w:p>
         </w:tc>
@@ -3451,7 +3451,7 @@
                 <w:sz w:val="18"/>
                 <w:szCs w:val="18"/>
               </w:rPr>
-              <w:t xml:space="preserve">19/10/2026</w:t>
+              <w:t xml:space="preserve">20/10/2026</w:t>
             </w:r>
           </w:p>
         </w:tc>
@@ -3483,7 +3483,7 @@
                 <w:sz w:val="18"/>
                 <w:szCs w:val="18"/>
               </w:rPr>
-              <w:t xml:space="preserve">Assistente virtuale: messaggio «Un attimo…» durante l'attesa.</w:t>
+              <w:t xml:space="preserve">Utenti online; PDF ed Excel del simulatore; messaggi d'errore dell'assistente.</w:t>
             </w:r>
           </w:p>
         </w:tc>
@@ -3553,7 +3553,7 @@
                 <w:sz w:val="18"/>
                 <w:szCs w:val="18"/>
               </w:rPr>
-              <w:t xml:space="preserve">3.6</w:t>
+              <w:t xml:space="preserve">3.7</w:t>
             </w:r>
           </w:p>
         </w:tc>
@@ -3619,7 +3619,7 @@
                 <w:sz w:val="18"/>
                 <w:szCs w:val="18"/>
               </w:rPr>
-              <w:t xml:space="preserve">Assistente virtuale attivo: chiave legata a uno spazio di lavoro, crediti e consumi.</w:t>
+              <w:t xml:space="preserve">Assistente virtuale: messaggio «Un attimo…» durante l'attesa.</w:t>
             </w:r>
           </w:p>
         </w:tc>
@@ -3689,7 +3689,7 @@
                 <w:sz w:val="18"/>
                 <w:szCs w:val="18"/>
               </w:rPr>
-              <w:t xml:space="preserve">3.5</w:t>
+              <w:t xml:space="preserve">3.6</w:t>
             </w:r>
           </w:p>
         </w:tc>
@@ -3753,7 +3753,7 @@
                 <w:sz w:val="18"/>
                 <w:szCs w:val="18"/>
               </w:rPr>
-              <w:t xml:space="preserve">Assistente virtuale; documenti ufficiali del Programma nella Documentazione.</w:t>
+              <w:t xml:space="preserve">Assistente virtuale attivo: chiave legata a uno spazio di lavoro, crediti e consumi.</w:t>
             </w:r>
           </w:p>
         </w:tc>
@@ -3823,7 +3823,7 @@
                 <w:sz w:val="18"/>
                 <w:szCs w:val="18"/>
               </w:rPr>
-              <w:t xml:space="preserve">3.4</w:t>
+              <w:t xml:space="preserve">3.5</w:t>
             </w:r>
           </w:p>
         </w:tc>
@@ -3889,7 +3889,7 @@
                 <w:sz w:val="18"/>
                 <w:szCs w:val="18"/>
               </w:rPr>
-              <w:t xml:space="preserve">Presentazione di riepilogo nella pagina Documentazione.</w:t>
+              <w:t xml:space="preserve">Assistente virtuale; documenti ufficiali del Programma nella Documentazione.</w:t>
             </w:r>
           </w:p>
         </w:tc>
@@ -3959,7 +3959,7 @@
                 <w:sz w:val="18"/>
                 <w:szCs w:val="18"/>
               </w:rPr>
-              <w:t xml:space="preserve">3.3</w:t>
+              <w:t xml:space="preserve">3.4</w:t>
             </w:r>
           </w:p>
         </w:tc>
@@ -4023,7 +4023,7 @@
                 <w:sz w:val="18"/>
                 <w:szCs w:val="18"/>
               </w:rPr>
-              <w:t xml:space="preserve">Ordinamento di tutte le tabelle e degli elenchi.</w:t>
+              <w:t xml:space="preserve">Presentazione di riepilogo nella pagina Documentazione.</w:t>
             </w:r>
           </w:p>
         </w:tc>
@@ -4093,7 +4093,7 @@
                 <w:sz w:val="18"/>
                 <w:szCs w:val="18"/>
               </w:rPr>
-              <w:t xml:space="preserve">3.2</w:t>
+              <w:t xml:space="preserve">3.3</w:t>
             </w:r>
           </w:p>
         </w:tc>
@@ -4159,7 +4159,7 @@
                 <w:sz w:val="18"/>
                 <w:szCs w:val="18"/>
               </w:rPr>
-              <w:t xml:space="preserve">Simulatore: metodo di stima per utenza (solo utenze virtuose), buffer del Capitolo 7, taratura.</w:t>
+              <w:t xml:space="preserve">Ordinamento di tutte le tabelle e degli elenchi.</w:t>
             </w:r>
           </w:p>
         </w:tc>
@@ -4229,7 +4229,7 @@
                 <w:sz w:val="18"/>
                 <w:szCs w:val="18"/>
               </w:rPr>
-              <w:t xml:space="preserve">3.1</w:t>
+              <w:t xml:space="preserve">3.2</w:t>
             </w:r>
           </w:p>
         </w:tc>
@@ -4293,7 +4293,7 @@
                 <w:sz w:val="18"/>
                 <w:szCs w:val="18"/>
               </w:rPr>
-              <w:t xml:space="preserve">Cruscotto diventa Dashboard; barra a LED delle 7 fasi per ogni pratica.</w:t>
+              <w:t xml:space="preserve">Simulatore: metodo di stima per utenza (solo utenze virtuose), buffer del Capitolo 7, taratura.</w:t>
             </w:r>
           </w:p>
         </w:tc>
@@ -4363,7 +4363,7 @@
                 <w:sz w:val="18"/>
                 <w:szCs w:val="18"/>
               </w:rPr>
-              <w:t xml:space="preserve">3.0</w:t>
+              <w:t xml:space="preserve">3.1</w:t>
             </w:r>
           </w:p>
         </w:tc>
@@ -4429,7 +4429,7 @@
                 <w:sz w:val="18"/>
                 <w:szCs w:val="18"/>
               </w:rPr>
-              <w:t xml:space="preserve">Eliminazione degli utenti che non hanno mai operato (script 30).</w:t>
+              <w:t xml:space="preserve">Cruscotto diventa Dashboard; barra a LED delle 7 fasi per ogni pratica.</w:t>
             </w:r>
           </w:p>
         </w:tc>
@@ -4499,7 +4499,7 @@
                 <w:sz w:val="18"/>
                 <w:szCs w:val="18"/>
               </w:rPr>
-              <w:t xml:space="preserve">2.9</w:t>
+              <w:t xml:space="preserve">3.0</w:t>
             </w:r>
           </w:p>
         </w:tc>
@@ -4563,7 +4563,7 @@
                 <w:sz w:val="18"/>
                 <w:szCs w:val="18"/>
               </w:rPr>
-              <w:t xml:space="preserve">Email automatica con le credenziali al nuovo utente e alla reimpostazione della password.</w:t>
+              <w:t xml:space="preserve">Eliminazione degli utenti che non hanno mai operato (script 30).</w:t>
             </w:r>
           </w:p>
         </w:tc>
@@ -4633,7 +4633,7 @@
                 <w:sz w:val="18"/>
                 <w:szCs w:val="18"/>
               </w:rPr>
-              <w:t xml:space="preserve">2.8</w:t>
+              <w:t xml:space="preserve">2.9</w:t>
             </w:r>
           </w:p>
         </w:tc>
@@ -4699,7 +4699,7 @@
                 <w:sz w:val="18"/>
                 <w:szCs w:val="18"/>
               </w:rPr>
-              <w:t xml:space="preserve">Più Amministratori con accesso completo; Amministratore principale protetto (script 29).</w:t>
+              <w:t xml:space="preserve">Email automatica con le credenziali al nuovo utente e alla reimpostazione della password.</w:t>
             </w:r>
           </w:p>
         </w:tc>
@@ -4769,7 +4769,7 @@
                 <w:sz w:val="18"/>
                 <w:szCs w:val="18"/>
               </w:rPr>
-              <w:t xml:space="preserve">2.7</w:t>
+              <w:t xml:space="preserve">2.8</w:t>
             </w:r>
           </w:p>
         </w:tc>
@@ -4833,7 +4833,7 @@
                 <w:sz w:val="18"/>
                 <w:szCs w:val="18"/>
               </w:rPr>
-              <w:t xml:space="preserve">Simulatore: costi per il Comune secondo il Caso 1 (progetto volontario) o il Caso 2 (progetto obbligatorio da bando).</w:t>
+              <w:t xml:space="preserve">Più Amministratori con accesso completo; Amministratore principale protetto (script 29).</w:t>
             </w:r>
           </w:p>
         </w:tc>
@@ -4903,7 +4903,7 @@
                 <w:sz w:val="18"/>
                 <w:szCs w:val="18"/>
               </w:rPr>
-              <w:t xml:space="preserve">2.6</w:t>
+              <w:t xml:space="preserve">2.7</w:t>
             </w:r>
           </w:p>
         </w:tc>
@@ -4969,7 +4969,7 @@
                 <w:sz w:val="18"/>
                 <w:szCs w:val="18"/>
               </w:rPr>
-              <w:t xml:space="preserve">Simulatore: valore del credito anno per anno, proposto 32 €.</w:t>
+              <w:t xml:space="preserve">Simulatore: costi per il Comune secondo il Caso 1 (progetto volontario) o il Caso 2 (progetto obbligatorio da bando).</w:t>
             </w:r>
           </w:p>
         </w:tc>
@@ -5039,7 +5039,7 @@
                 <w:sz w:val="18"/>
                 <w:szCs w:val="18"/>
               </w:rPr>
-              <w:t xml:space="preserve">2.5</w:t>
+              <w:t xml:space="preserve">2.6</w:t>
             </w:r>
           </w:p>
         </w:tc>
@@ -5103,7 +5103,7 @@
                 <w:sz w:val="18"/>
                 <w:szCs w:val="18"/>
               </w:rPr>
-              <w:t xml:space="preserve">Simulatore: simulazione economica con valore unitario del credito e costi per il Comune (contratti tipo della Fondazione, Schema tariffario).</w:t>
+              <w:t xml:space="preserve">Simulatore: valore del credito anno per anno, proposto 32 €.</w:t>
             </w:r>
           </w:p>
         </w:tc>
@@ -5173,7 +5173,7 @@
                 <w:sz w:val="18"/>
                 <w:szCs w:val="18"/>
               </w:rPr>
-              <w:t xml:space="preserve">2.4</w:t>
+              <w:t xml:space="preserve">2.5</w:t>
             </w:r>
           </w:p>
         </w:tc>
@@ -5239,7 +5239,7 @@
                 <w:sz w:val="18"/>
                 <w:szCs w:val="18"/>
               </w:rPr>
-              <w:t xml:space="preserve">Simulatore: riferimento sempre alla soglia del 65% di differenziata e controllo dei valori fuori scala.</w:t>
+              <w:t xml:space="preserve">Simulatore: simulazione economica con valore unitario del credito e costi per il Comune (contratti tipo della Fondazione, Schema tariffario).</w:t>
             </w:r>
           </w:p>
         </w:tc>
@@ -5309,7 +5309,7 @@
                 <w:sz w:val="18"/>
                 <w:szCs w:val="18"/>
               </w:rPr>
-              <w:t xml:space="preserve">2.3</w:t>
+              <w:t xml:space="preserve">2.4</w:t>
             </w:r>
           </w:p>
         </w:tc>
@@ -5373,7 +5373,7 @@
                 <w:sz w:val="18"/>
                 <w:szCs w:val="18"/>
               </w:rPr>
-              <w:t xml:space="preserve">Simulatore conforme al modello CWP: scenario di riferimento dello Standard 4.8.1, situazione attuale, conformità.</w:t>
+              <w:t xml:space="preserve">Simulatore: riferimento sempre alla soglia del 65% di differenziata e controllo dei valori fuori scala.</w:t>
             </w:r>
           </w:p>
         </w:tc>
@@ -5443,7 +5443,7 @@
                 <w:sz w:val="18"/>
                 <w:szCs w:val="18"/>
               </w:rPr>
-              <w:t xml:space="preserve">2.2</w:t>
+              <w:t xml:space="preserve">2.3</w:t>
             </w:r>
           </w:p>
         </w:tc>
@@ -5509,7 +5509,7 @@
                 <w:sz w:val="18"/>
                 <w:szCs w:val="18"/>
               </w:rPr>
-              <w:t xml:space="preserve">Nuovo capitolo «Simulatore di scenari»: creazione, anno base, obiettivi annui, risultati, modello di stima.</w:t>
+              <w:t xml:space="preserve">Simulatore conforme al modello CWP: scenario di riferimento dello Standard 4.8.1, situazione attuale, conformità.</w:t>
             </w:r>
           </w:p>
         </w:tc>
@@ -5579,7 +5579,7 @@
                 <w:sz w:val="18"/>
                 <w:szCs w:val="18"/>
               </w:rPr>
-              <w:t xml:space="preserve">2.1</w:t>
+              <w:t xml:space="preserve">2.2</w:t>
             </w:r>
           </w:p>
         </w:tc>
@@ -5643,7 +5643,7 @@
                 <w:sz w:val="18"/>
                 <w:szCs w:val="18"/>
               </w:rPr>
-              <w:t xml:space="preserve">Funzioni in arrivo: simulatore di scenari (7, 10 o 21 anni, obiettivi annui, % di differenziata e crediti stimati) e assistente virtuale (Claude).</w:t>
+              <w:t xml:space="preserve">Nuovo capitolo «Simulatore di scenari»: creazione, anno base, obiettivi annui, risultati, modello di stima.</w:t>
             </w:r>
           </w:p>
         </w:tc>
@@ -5713,7 +5713,7 @@
                 <w:sz w:val="18"/>
                 <w:szCs w:val="18"/>
               </w:rPr>
-              <w:t xml:space="preserve">2.0</w:t>
+              <w:t xml:space="preserve">2.1</w:t>
             </w:r>
           </w:p>
         </w:tc>
@@ -5779,7 +5779,7 @@
                 <w:sz w:val="18"/>
                 <w:szCs w:val="18"/>
               </w:rPr>
-              <w:t xml:space="preserve">Copie di sicurezza e ripristino: rimando alle Istruzioni di ripristino e punti essenziali (capitolo Manutenzione ed emergenze).</w:t>
+              <w:t xml:space="preserve">Funzioni in arrivo: simulatore di scenari (7, 10 o 21 anni, obiettivi annui, % di differenziata e crediti stimati) e assistente virtuale (Claude).</w:t>
             </w:r>
           </w:p>
         </w:tc>
@@ -5849,7 +5849,7 @@
                 <w:sz w:val="18"/>
                 <w:szCs w:val="18"/>
               </w:rPr>
-              <w:t xml:space="preserve">1.9</w:t>
+              <w:t xml:space="preserve">2.0</w:t>
             </w:r>
           </w:p>
         </w:tc>
@@ -5913,7 +5913,7 @@
                 <w:sz w:val="18"/>
                 <w:szCs w:val="18"/>
               </w:rPr>
-              <w:t xml:space="preserve">Fondazione Operate soggetto promotore del programma (esclusiva conferita da Wastelab).</w:t>
+              <w:t xml:space="preserve">Copie di sicurezza e ripristino: rimando alle Istruzioni di ripristino e punti essenziali (capitolo Manutenzione ed emergenze).</w:t>
             </w:r>
           </w:p>
         </w:tc>
@@ -5983,7 +5983,7 @@
                 <w:sz w:val="18"/>
                 <w:szCs w:val="18"/>
               </w:rPr>
-              <w:t xml:space="preserve">1.8</w:t>
+              <w:t xml:space="preserve">1.9</w:t>
             </w:r>
           </w:p>
         </w:tc>
@@ -6049,7 +6049,7 @@
                 <w:sz w:val="18"/>
                 <w:szCs w:val="18"/>
               </w:rPr>
-              <w:t xml:space="preserve">PEC del Programma e documenti ufficiali già pubblicati sulla pagina pubblica.</w:t>
+              <w:t xml:space="preserve">Fondazione Operate soggetto promotore del programma (esclusiva conferita da Wastelab).</w:t>
             </w:r>
           </w:p>
         </w:tc>
@@ -6119,7 +6119,7 @@
                 <w:sz w:val="18"/>
                 <w:szCs w:val="18"/>
               </w:rPr>
-              <w:t xml:space="preserve">1.7</w:t>
+              <w:t xml:space="preserve">1.8</w:t>
             </w:r>
           </w:p>
         </w:tc>
@@ -6151,7 +6151,7 @@
                 <w:sz w:val="18"/>
                 <w:szCs w:val="18"/>
               </w:rPr>
-              <w:t xml:space="preserve">18/10/2026</w:t>
+              <w:t xml:space="preserve">19/10/2026</w:t>
             </w:r>
           </w:p>
         </w:tc>
@@ -6183,7 +6183,7 @@
                 <w:sz w:val="18"/>
                 <w:szCs w:val="18"/>
               </w:rPr>
-              <w:t xml:space="preserve">Allineamento ai documenti ufficiali del Programma (script 22-24): Rapporto a 7 fasi, feedback pubblico, stati del Programma, dati del progetto e territorio ISTAT, ritiro e rientro, account unico e delegati, registri, tariffe e sospensione, accuratezza e accertamenti, informazioni del Programma e metodologie, modelli pubblici; nuovi capitoli Crediti emessi, Reclami, Pagina pubblica; qualità dei dati nel calcolo.</w:t>
+              <w:t xml:space="preserve">PEC del Programma e documenti ufficiali già pubblicati sulla pagina pubblica.</w:t>
             </w:r>
           </w:p>
         </w:tc>
@@ -6253,7 +6253,7 @@
                 <w:sz w:val="18"/>
                 <w:szCs w:val="18"/>
               </w:rPr>
-              <w:t xml:space="preserve">1.6</w:t>
+              <w:t xml:space="preserve">1.7</w:t>
             </w:r>
           </w:p>
         </w:tc>
@@ -6319,7 +6319,7 @@
                 <w:sz w:val="18"/>
                 <w:szCs w:val="18"/>
               </w:rPr>
-              <w:t xml:space="preserve">Calcolo crediti: descrizione corretta del buffer (somma delle voci delle Tabelle 15 e 16, più il 20% con le sole utenze virtuose, al massimo 80%).</w:t>
+              <w:t xml:space="preserve">Allineamento ai documenti ufficiali del Programma (script 22-24): Rapporto a 7 fasi, feedback pubblico, stati del Programma, dati del progetto e territorio ISTAT, ritiro e rientro, account unico e delegati, registri, tariffe e sospensione, accuratezza e accertamenti, informazioni del Programma e metodologie, modelli pubblici; nuovi capitoli Crediti emessi, Reclami, Pagina pubblica; qualità dei dati nel calcolo.</w:t>
             </w:r>
           </w:p>
         </w:tc>
@@ -6389,7 +6389,7 @@
                 <w:sz w:val="18"/>
                 <w:szCs w:val="18"/>
               </w:rPr>
-              <w:t xml:space="preserve">1.5</w:t>
+              <w:t xml:space="preserve">1.6</w:t>
             </w:r>
           </w:p>
         </w:tc>
@@ -6453,7 +6453,7 @@
                 <w:sz w:val="18"/>
                 <w:szCs w:val="18"/>
               </w:rPr>
-              <w:t xml:space="preserve">Nuova pagina Anagrafiche (Organizzazioni ed Enti, anche per gli Operatori); Rapporti con 4 fasi e durate proprie; documenti richiesti per fase; consultazione con documento bloccato, osservazioni numerate e motivazione; conservazione per 10 anni; fascicolo con riepilogo PDF e nuove cartelle.</w:t>
+              <w:t xml:space="preserve">Calcolo crediti: descrizione corretta del buffer (somma delle voci delle Tabelle 15 e 16, più il 20% con le sole utenze virtuose, al massimo 80%).</w:t>
             </w:r>
           </w:p>
         </w:tc>
@@ -6523,7 +6523,7 @@
                 <w:sz w:val="18"/>
                 <w:szCs w:val="18"/>
               </w:rPr>
-              <w:t xml:space="preserve">1.4</w:t>
+              <w:t xml:space="preserve">1.5</w:t>
             </w:r>
           </w:p>
         </w:tc>
@@ -6589,7 +6589,7 @@
                 <w:sz w:val="18"/>
                 <w:szCs w:val="18"/>
               </w:rPr>
-              <w:t xml:space="preserve">Calcolo crediti: il risultato si azzera quando cambiano dati o Banca Dati Utenze, conferma solo dopo un nuovo «Calcola». Gestione utenti: password temporanea di almeno 10 caratteri con lettere e numeri, creazione annullata se non va a buon fine, nessun accesso ai dati prima del cambio password.</w:t>
+              <w:t xml:space="preserve">Nuova pagina Anagrafiche (Organizzazioni ed Enti, anche per gli Operatori); Rapporti con 4 fasi e durate proprie; documenti richiesti per fase; consultazione con documento bloccato, osservazioni numerate e motivazione; conservazione per 10 anni; fascicolo con riepilogo PDF e nuove cartelle.</w:t>
             </w:r>
           </w:p>
         </w:tc>
@@ -6659,7 +6659,7 @@
                 <w:sz w:val="18"/>
                 <w:szCs w:val="18"/>
               </w:rPr>
-              <w:t xml:space="preserve">1.3</w:t>
+              <w:t xml:space="preserve">1.4</w:t>
             </w:r>
           </w:p>
         </w:tc>
@@ -6723,7 +6723,7 @@
                 <w:sz w:val="18"/>
                 <w:szCs w:val="18"/>
               </w:rPr>
-              <w:t xml:space="preserve">Rapporto di calcolo in PDF, archiviazione nella pratica, numero di registro, registro dei crediti.</w:t>
+              <w:t xml:space="preserve">Calcolo crediti: il risultato si azzera quando cambiano dati o Banca Dati Utenze, conferma solo dopo un nuovo «Calcola». Gestione utenti: password temporanea di almeno 10 caratteri con lettere e numeri, creazione annullata se non va a buon fine, nessun accesso ai dati prima del cambio password.</w:t>
             </w:r>
           </w:p>
         </w:tc>
@@ -6793,7 +6793,7 @@
                 <w:sz w:val="18"/>
                 <w:szCs w:val="18"/>
               </w:rPr>
-              <w:t xml:space="preserve">1.2</w:t>
+              <w:t xml:space="preserve">1.3</w:t>
             </w:r>
           </w:p>
         </w:tc>
@@ -6859,7 +6859,7 @@
                 <w:sz w:val="18"/>
                 <w:szCs w:val="18"/>
               </w:rPr>
-              <w:t xml:space="preserve">Calcolo crediti: importare il tracciato nel calcolo (dai documenti della pratica o dal computer), singole letture, blocco dei dati personali, controlli di coerenza.</w:t>
+              <w:t xml:space="preserve">Rapporto di calcolo in PDF, archiviazione nella pratica, numero di registro, registro dei crediti.</w:t>
             </w:r>
           </w:p>
         </w:tc>
@@ -6929,7 +6929,7 @@
                 <w:sz w:val="18"/>
                 <w:szCs w:val="18"/>
               </w:rPr>
-              <w:t xml:space="preserve">1.1</w:t>
+              <w:t xml:space="preserve">1.2</w:t>
             </w:r>
           </w:p>
         </w:tc>
@@ -6993,7 +6993,7 @@
                 <w:sz w:val="18"/>
                 <w:szCs w:val="18"/>
               </w:rPr>
-              <w:t xml:space="preserve">Note di fase, Ente di Validazione della pratica, consultazione sulla pagina pubblica con conferma dell'email, moderazione con autori e allegati, errata corrige; nuovo capitolo Messaggi con il Comune; pagamenti visibili al Comune; Impostazioni: Enti di Validazione e Modelli di documento; notifiche aggiornate.</w:t>
+              <w:t xml:space="preserve">Calcolo crediti: importare il tracciato nel calcolo (dai documenti della pratica o dal computer), singole letture, blocco dei dati personali, controlli di coerenza.</w:t>
             </w:r>
           </w:p>
         </w:tc>
@@ -7063,6 +7063,142 @@
                 <w:sz w:val="18"/>
                 <w:szCs w:val="18"/>
               </w:rPr>
+              <w:t xml:space="preserve">1.1</w:t>
+            </w:r>
+          </w:p>
+        </w:tc>
+        <w:tc>
+          <w:tcPr>
+            <w:tcW w:type="dxa" w:w="1300"/>
+            <w:tcBorders>
+              <w:top w:val="single" w:color="D9D4C5" w:sz="4"/>
+              <w:left w:val="single" w:color="D9D4C5" w:sz="4"/>
+              <w:bottom w:val="single" w:color="D9D4C5" w:sz="4"/>
+              <w:right w:val="single" w:color="D9D4C5" w:sz="4"/>
+            </w:tcBorders>
+            <w:shd w:fill="F6F4EE" w:color="auto" w:val="clear"/>
+            <w:tcMar>
+              <w:top w:type="dxa" w:w="70"/>
+              <w:left w:type="dxa" w:w="110"/>
+              <w:bottom w:type="dxa" w:w="70"/>
+              <w:right w:type="dxa" w:w="110"/>
+            </w:tcMar>
+            <w:vAlign w:val="center"/>
+          </w:tcPr>
+          <w:p>
+            <w:pPr>
+              <w:spacing w:after="0" w:before="0"/>
+            </w:pPr>
+            <w:r>
+              <w:rPr>
+                <w:rFonts w:ascii="Arial" w:cs="Arial" w:eastAsia="Arial" w:hAnsi="Arial"/>
+                <w:color w:val="1B2118"/>
+                <w:sz w:val="18"/>
+                <w:szCs w:val="18"/>
+              </w:rPr>
+              <w:t xml:space="preserve">18/10/2026</w:t>
+            </w:r>
+          </w:p>
+        </w:tc>
+        <w:tc>
+          <w:tcPr>
+            <w:tcW w:type="dxa" w:w="5538"/>
+            <w:tcBorders>
+              <w:top w:val="single" w:color="D9D4C5" w:sz="4"/>
+              <w:left w:val="single" w:color="D9D4C5" w:sz="4"/>
+              <w:bottom w:val="single" w:color="D9D4C5" w:sz="4"/>
+              <w:right w:val="single" w:color="D9D4C5" w:sz="4"/>
+            </w:tcBorders>
+            <w:shd w:fill="F6F4EE" w:color="auto" w:val="clear"/>
+            <w:tcMar>
+              <w:top w:type="dxa" w:w="70"/>
+              <w:left w:type="dxa" w:w="110"/>
+              <w:bottom w:type="dxa" w:w="70"/>
+              <w:right w:type="dxa" w:w="110"/>
+            </w:tcMar>
+            <w:vAlign w:val="center"/>
+          </w:tcPr>
+          <w:p>
+            <w:pPr>
+              <w:spacing w:after="0" w:before="0"/>
+            </w:pPr>
+            <w:r>
+              <w:rPr>
+                <w:rFonts w:ascii="Arial" w:cs="Arial" w:eastAsia="Arial" w:hAnsi="Arial"/>
+                <w:color w:val="1B2118"/>
+                <w:sz w:val="18"/>
+                <w:szCs w:val="18"/>
+              </w:rPr>
+              <w:t xml:space="preserve">Note di fase, Ente di Validazione della pratica, consultazione sulla pagina pubblica con conferma dell'email, moderazione con autori e allegati, errata corrige; nuovo capitolo Messaggi con il Comune; pagamenti visibili al Comune; Impostazioni: Enti di Validazione e Modelli di documento; notifiche aggiornate.</w:t>
+            </w:r>
+          </w:p>
+        </w:tc>
+        <w:tc>
+          <w:tcPr>
+            <w:tcW w:type="dxa" w:w="2000"/>
+            <w:tcBorders>
+              <w:top w:val="single" w:color="D9D4C5" w:sz="4"/>
+              <w:left w:val="single" w:color="D9D4C5" w:sz="4"/>
+              <w:bottom w:val="single" w:color="D9D4C5" w:sz="4"/>
+              <w:right w:val="single" w:color="D9D4C5" w:sz="4"/>
+            </w:tcBorders>
+            <w:shd w:fill="F6F4EE" w:color="auto" w:val="clear"/>
+            <w:tcMar>
+              <w:top w:type="dxa" w:w="70"/>
+              <w:left w:type="dxa" w:w="110"/>
+              <w:bottom w:type="dxa" w:w="70"/>
+              <w:right w:type="dxa" w:w="110"/>
+            </w:tcMar>
+            <w:vAlign w:val="center"/>
+          </w:tcPr>
+          <w:p>
+            <w:pPr>
+              <w:spacing w:after="0" w:before="0"/>
+            </w:pPr>
+            <w:r>
+              <w:rPr>
+                <w:rFonts w:ascii="Arial" w:cs="Arial" w:eastAsia="Arial" w:hAnsi="Arial"/>
+                <w:color w:val="1B2118"/>
+                <w:sz w:val="18"/>
+                <w:szCs w:val="18"/>
+              </w:rPr>
+              <w:t xml:space="preserve">Fondazione Operate</w:t>
+            </w:r>
+          </w:p>
+        </w:tc>
+      </w:tr>
+      <w:tr>
+        <w:trPr>
+          <w:cantSplit/>
+        </w:trPr>
+        <w:tc>
+          <w:tcPr>
+            <w:tcW w:type="dxa" w:w="800"/>
+            <w:tcBorders>
+              <w:top w:val="single" w:color="D9D4C5" w:sz="4"/>
+              <w:left w:val="single" w:color="D9D4C5" w:sz="4"/>
+              <w:bottom w:val="single" w:color="D9D4C5" w:sz="4"/>
+              <w:right w:val="single" w:color="D9D4C5" w:sz="4"/>
+            </w:tcBorders>
+            <w:tcMar>
+              <w:top w:type="dxa" w:w="70"/>
+              <w:left w:type="dxa" w:w="110"/>
+              <w:bottom w:type="dxa" w:w="70"/>
+              <w:right w:type="dxa" w:w="110"/>
+            </w:tcMar>
+            <w:vAlign w:val="center"/>
+          </w:tcPr>
+          <w:p>
+            <w:pPr>
+              <w:spacing w:after="0" w:before="0"/>
+            </w:pPr>
+            <w:r>
+              <w:rPr>
+                <w:rFonts w:ascii="Arial" w:cs="Arial" w:eastAsia="Arial" w:hAnsi="Arial"/>
+                <w:color w:val="1B2118"/>
+                <w:sz w:val="18"/>
+                <w:szCs w:val="18"/>
+              </w:rPr>
               <w:t xml:space="preserve">1.0</w:t>
             </w:r>
           </w:p>
@@ -7076,7 +7212,6 @@
               <w:bottom w:val="single" w:color="D9D4C5" w:sz="4"/>
               <w:right w:val="single" w:color="D9D4C5" w:sz="4"/>
             </w:tcBorders>
-            <w:shd w:fill="F6F4EE" w:color="auto" w:val="clear"/>
             <w:tcMar>
               <w:top w:type="dxa" w:w="70"/>
               <w:left w:type="dxa" w:w="110"/>
@@ -7109,7 +7244,6 @@
               <w:bottom w:val="single" w:color="D9D4C5" w:sz="4"/>
               <w:right w:val="single" w:color="D9D4C5" w:sz="4"/>
             </w:tcBorders>
-            <w:shd w:fill="F6F4EE" w:color="auto" w:val="clear"/>
             <w:tcMar>
               <w:top w:type="dxa" w:w="70"/>
               <w:left w:type="dxa" w:w="110"/>
@@ -7142,7 +7276,6 @@
               <w:bottom w:val="single" w:color="D9D4C5" w:sz="4"/>
               <w:right w:val="single" w:color="D9D4C5" w:sz="4"/>
             </w:tcBorders>
-            <w:shd w:fill="F6F4EE" w:color="auto" w:val="clear"/>
             <w:tcMar>
               <w:top w:type="dxa" w:w="70"/>
               <w:left w:type="dxa" w:w="110"/>
@@ -7184,7 +7317,7 @@
           <w:sz w:val="20"/>
           <w:szCs w:val="20"/>
         </w:rPr>
-        <w:t xml:space="preserve">Questo documento descrive il portale alla revisione 5.7 del 23/10/2026. A ogni modifica del portale il manuale viene aggiornato e la revisione incrementata; la versione corrente si scarica dall'area Documentazione del portale (solo Amministratori).</w:t>
+        <w:t xml:space="preserve">Questo documento descrive il portale alla revisione 5.8 del 23/10/2026. A ogni modifica del portale il manuale viene aggiornato e la revisione incrementata; la versione corrente si scarica dall'area Documentazione del portale (solo Amministratori).</w:t>
       </w:r>
     </w:p>
     <w:p>
@@ -10064,7 +10197,7 @@
         </w:rPr>
         <w:t xml:space="preserve">Si accede da </w:t>
       </w:r>
-      <w:hyperlink w:history="1" r:id="rIdkh4opyjvb9aeaocyoposq">
+      <w:hyperlink w:history="1" r:id="rIdqwaawmmc0bm4yseehrbiv">
         <w:r>
           <w:rPr>
             <w:rFonts w:ascii="Arial" w:cs="Arial" w:eastAsia="Arial" w:hAnsi="Arial"/>
@@ -34158,7 +34291,7 @@
           <w:sz w:val="21"/>
           <w:szCs w:val="21"/>
         </w:rPr>
-        <w:t xml:space="preserve"> La Banca Dati Utenze deve contenere solo un </w:t>
+        <w:t xml:space="preserve"> Il tracciato (passo 5b) deve contenere solo un </w:t>
       </w:r>
       <w:r>
         <w:rPr>
@@ -34178,7 +34311,7 @@
           <w:sz w:val="21"/>
           <w:szCs w:val="21"/>
         </w:rPr>
-        <w:t xml:space="preserve"> per ogni utenza: niente nomi, codici fiscali, indirizzi, email o telefoni. Il portale controlla il file prima dell'import e lo </w:t>
+        <w:t xml:space="preserve"> per ogni utenza (la Banca Dati Utenze per utenza del passo 5a, descritta più avanti, contiene invece nomi e indirizzi, con le protezioni indicate lì): niente nomi, codici fiscali, indirizzi, email o telefoni. Il portale controlla il file prima dell'import e lo </w:t>
       </w:r>
       <w:r>
         <w:rPr>
@@ -52849,7 +52982,7 @@
         <w:szCs w:val="16"/>
       </w:rPr>
       <w:tab/>
-      <w:t xml:space="preserve">Manuale Amministratore · Rev. 5.7 · 23/10/2026</w:t>
+      <w:t xml:space="preserve">Manuale Amministratore · Rev. 5.8 · 23/10/2026</w:t>
     </w:r>
   </w:p>
 </w:hdr>
@@ -52914,7 +53047,7 @@
         <w:szCs w:val="16"/>
       </w:rPr>
       <w:tab/>
-      <w:t xml:space="preserve">Manuale Amministratore · Rev. 5.7 · 23/10/2026</w:t>
+      <w:t xml:space="preserve">Manuale Amministratore · Rev. 5.8 · 23/10/2026</w:t>
     </w:r>
   </w:p>
 </w:hdr>

</xml_diff>

<commit_message>
Pratiche e Dashboard: stato delle fasi verde (completata), arancio (in corso), rosso (non iniziata); documenti
Co-Authored-By: Claude Opus 5.5 <noreply@anthropic.com>
Claude-Session: https://claude.ai/code/session_01E8XCbEeVHWVP3hntUZ6kZ1
</commit_message>
<xml_diff>
--- a/public/documentazione/Manuale_Amministratore_Portale_CWP.docx
+++ b/public/documentazione/Manuale_Amministratore_Portale_CWP.docx
@@ -302,7 +302,7 @@
                 <w:sz w:val="20"/>
                 <w:szCs w:val="20"/>
               </w:rPr>
-              <w:t xml:space="preserve">Rev. 5.9</w:t>
+              <w:t xml:space="preserve">Rev. 6.0</w:t>
             </w:r>
           </w:p>
         </w:tc>
@@ -719,7 +719,7 @@
                 <w:sz w:val="18"/>
                 <w:szCs w:val="18"/>
               </w:rPr>
-              <w:t xml:space="preserve">5.9</w:t>
+              <w:t xml:space="preserve">6.0</w:t>
             </w:r>
           </w:p>
         </w:tc>
@@ -783,7 +783,7 @@
                 <w:sz w:val="18"/>
                 <w:szCs w:val="18"/>
               </w:rPr>
-              <w:t xml:space="preserve">Nuovo progetto e dati della pratica: listino Caso 1 / Caso 2 e valore del progetto; Dashboard: valore dei progetti per il cliente.</w:t>
+              <w:t xml:space="preserve">Colori dello stato delle fasi in Dashboard e nella pratica.</w:t>
             </w:r>
           </w:p>
         </w:tc>
@@ -853,7 +853,7 @@
                 <w:sz w:val="18"/>
                 <w:szCs w:val="18"/>
               </w:rPr>
-              <w:t xml:space="preserve">5.8</w:t>
+              <w:t xml:space="preserve">5.9</w:t>
             </w:r>
           </w:p>
         </w:tc>
@@ -919,7 +919,7 @@
                 <w:sz w:val="18"/>
                 <w:szCs w:val="18"/>
               </w:rPr>
-              <w:t xml:space="preserve">Revisione generale al 23/10: protezione dei dati del tracciato e della Banca Dati Utenze per utenza.</w:t>
+              <w:t xml:space="preserve">Nuovo progetto e dati della pratica: listino Caso 1 / Caso 2 e valore del progetto; Dashboard: valore dei progetti per il cliente.</w:t>
             </w:r>
           </w:p>
         </w:tc>
@@ -989,7 +989,7 @@
                 <w:sz w:val="18"/>
                 <w:szCs w:val="18"/>
               </w:rPr>
-              <w:t xml:space="preserve">5.7</w:t>
+              <w:t xml:space="preserve">5.8</w:t>
             </w:r>
           </w:p>
         </w:tc>
@@ -1053,7 +1053,7 @@
                 <w:sz w:val="18"/>
                 <w:szCs w:val="18"/>
               </w:rPr>
-              <w:t xml:space="preserve">Dashboard: valore dei crediti in simulazione e in fase esecutiva; Impostazioni: prezzo di riferimento del credito.</w:t>
+              <w:t xml:space="preserve">Revisione generale al 23/10: protezione dei dati del tracciato e della Banca Dati Utenze per utenza.</w:t>
             </w:r>
           </w:p>
         </w:tc>
@@ -1123,7 +1123,7 @@
                 <w:sz w:val="18"/>
                 <w:szCs w:val="18"/>
               </w:rPr>
-              <w:t xml:space="preserve">5.6</w:t>
+              <w:t xml:space="preserve">5.7</w:t>
             </w:r>
           </w:p>
         </w:tc>
@@ -1189,7 +1189,7 @@
                 <w:sz w:val="18"/>
                 <w:szCs w:val="18"/>
               </w:rPr>
-              <w:t xml:space="preserve">Passo 5a: «Calcola» usa le utenze (categoria di simulazione come classe della delibera, kg misurati, frazioni per utenza); utenze senza categoria o fuori delibera escluse e conferma bloccata; fonte nei Risultati, nel CSV e nel PDF.</w:t>
+              <w:t xml:space="preserve">Dashboard: valore dei crediti in simulazione e in fase esecutiva; Impostazioni: prezzo di riferimento del credito.</w:t>
             </w:r>
           </w:p>
         </w:tc>
@@ -1259,7 +1259,7 @@
                 <w:sz w:val="18"/>
                 <w:szCs w:val="18"/>
               </w:rPr>
-              <w:t xml:space="preserve">5.5</w:t>
+              <w:t xml:space="preserve">5.6</w:t>
             </w:r>
           </w:p>
         </w:tc>
@@ -1291,7 +1291,7 @@
                 <w:sz w:val="18"/>
                 <w:szCs w:val="18"/>
               </w:rPr>
-              <w:t xml:space="preserve">22/10/2026</w:t>
+              <w:t xml:space="preserve">23/10/2026</w:t>
             </w:r>
           </w:p>
         </w:tc>
@@ -1323,7 +1323,7 @@
                 <w:sz w:val="18"/>
                 <w:szCs w:val="18"/>
               </w:rPr>
-              <w:t xml:space="preserve">Audit delle utenze; calcolo di prova.</w:t>
+              <w:t xml:space="preserve">Passo 5a: «Calcola» usa le utenze (categoria di simulazione come classe della delibera, kg misurati, frazioni per utenza); utenze senza categoria o fuori delibera escluse e conferma bloccata; fonte nei Risultati, nel CSV e nel PDF.</w:t>
             </w:r>
           </w:p>
         </w:tc>
@@ -1393,7 +1393,7 @@
                 <w:sz w:val="18"/>
                 <w:szCs w:val="18"/>
               </w:rPr>
-              <w:t xml:space="preserve">5.4</w:t>
+              <w:t xml:space="preserve">5.5</w:t>
             </w:r>
           </w:p>
         </w:tc>
@@ -1459,7 +1459,7 @@
                 <w:sz w:val="18"/>
                 <w:szCs w:val="18"/>
               </w:rPr>
-              <w:t xml:space="preserve">Gestione delle utenze nel passo 5a del calcolo: caricamento, schede, modulo; categorie tariffaria e di simulazione.</w:t>
+              <w:t xml:space="preserve">Audit delle utenze; calcolo di prova.</w:t>
             </w:r>
           </w:p>
         </w:tc>
@@ -1529,7 +1529,7 @@
                 <w:sz w:val="18"/>
                 <w:szCs w:val="18"/>
               </w:rPr>
-              <w:t xml:space="preserve">5.3</w:t>
+              <w:t xml:space="preserve">5.4</w:t>
             </w:r>
           </w:p>
         </w:tc>
@@ -1593,7 +1593,7 @@
                 <w:sz w:val="18"/>
                 <w:szCs w:val="18"/>
               </w:rPr>
-              <w:t xml:space="preserve">Banca Dati Utenze per utenza: campi, regole, dati personali.</w:t>
+              <w:t xml:space="preserve">Gestione delle utenze nel passo 5a del calcolo: caricamento, schede, modulo; categorie tariffaria e di simulazione.</w:t>
             </w:r>
           </w:p>
         </w:tc>
@@ -1663,7 +1663,7 @@
                 <w:sz w:val="18"/>
                 <w:szCs w:val="18"/>
               </w:rPr>
-              <w:t xml:space="preserve">5.2</w:t>
+              <w:t xml:space="preserve">5.3</w:t>
             </w:r>
           </w:p>
         </w:tc>
@@ -1729,7 +1729,7 @@
                 <w:sz w:val="18"/>
                 <w:szCs w:val="18"/>
               </w:rPr>
-              <w:t xml:space="preserve">Uso dal telefono: menu a pannello, schede in Dashboard e Audit, elenco e dettaglio delle pratiche.</w:t>
+              <w:t xml:space="preserve">Banca Dati Utenze per utenza: campi, regole, dati personali.</w:t>
             </w:r>
           </w:p>
         </w:tc>
@@ -1799,7 +1799,7 @@
                 <w:sz w:val="18"/>
                 <w:szCs w:val="18"/>
               </w:rPr>
-              <w:t xml:space="preserve">5.1</w:t>
+              <w:t xml:space="preserve">5.2</w:t>
             </w:r>
           </w:p>
         </w:tc>
@@ -1863,7 +1863,7 @@
                 <w:sz w:val="18"/>
                 <w:szCs w:val="18"/>
               </w:rPr>
-              <w:t xml:space="preserve">Rilievi N01-N06: costi una tantum in 10 rate, feedback pubblico e fase 3, ente prima della fase 5, riquadro «Fase aperta senza scadenza», avviso sui codici, frazioni del fattore dell'indifferenziato.</w:t>
+              <w:t xml:space="preserve">Uso dal telefono: menu a pannello, schede in Dashboard e Audit, elenco e dettaglio delle pratiche.</w:t>
             </w:r>
           </w:p>
         </w:tc>
@@ -1933,7 +1933,7 @@
                 <w:sz w:val="18"/>
                 <w:szCs w:val="18"/>
               </w:rPr>
-              <w:t xml:space="preserve">5.0</w:t>
+              <w:t xml:space="preserve">5.1</w:t>
             </w:r>
           </w:p>
         </w:tc>
@@ -1966,7 +1966,7 @@
                 <w:sz w:val="18"/>
                 <w:szCs w:val="18"/>
               </w:rPr>
-              <w:t xml:space="preserve">21/10/2026</w:t>
+              <w:t xml:space="preserve">22/10/2026</w:t>
             </w:r>
           </w:p>
         </w:tc>
@@ -1999,7 +1999,7 @@
                 <w:sz w:val="18"/>
                 <w:szCs w:val="18"/>
               </w:rPr>
-              <w:t xml:space="preserve">«News» diventa «Notizie CO2»; Google News attraverso il tramite; barra a LED nell'elenco e nella pratica. Pallino verde delle Notizie CO2 nuove. Notizie CO2: siti di notizie ambientali al posto di Google News. Notizie CO2: siti di notizie ambientali al posto di Google News.</w:t>
+              <w:t xml:space="preserve">Rilievi N01-N06: costi una tantum in 10 rate, feedback pubblico e fase 3, ente prima della fase 5, riquadro «Fase aperta senza scadenza», avviso sui codici, frazioni del fattore dell'indifferenziato.</w:t>
             </w:r>
           </w:p>
         </w:tc>
@@ -2069,7 +2069,7 @@
                 <w:sz w:val="18"/>
                 <w:szCs w:val="18"/>
               </w:rPr>
-              <w:t xml:space="preserve">4.9</w:t>
+              <w:t xml:space="preserve">5.0</w:t>
             </w:r>
           </w:p>
         </w:tc>
@@ -2133,7 +2133,7 @@
                 <w:sz w:val="18"/>
                 <w:szCs w:val="18"/>
               </w:rPr>
-              <w:t xml:space="preserve">Nuovo capitolo «News»: osservatorio sui crediti di carbonio volontari. Canali Bing News e Verra.</w:t>
+              <w:t xml:space="preserve">«News» diventa «Notizie CO2»; Google News attraverso il tramite; barra a LED nell'elenco e nella pratica. Pallino verde delle Notizie CO2 nuove. Notizie CO2: siti di notizie ambientali al posto di Google News. Notizie CO2: siti di notizie ambientali al posto di Google News.</w:t>
             </w:r>
           </w:p>
         </w:tc>
@@ -2203,7 +2203,7 @@
                 <w:sz w:val="18"/>
                 <w:szCs w:val="18"/>
               </w:rPr>
-              <w:t xml:space="preserve">4.8</w:t>
+              <w:t xml:space="preserve">4.9</w:t>
             </w:r>
           </w:p>
         </w:tc>
@@ -2269,7 +2269,7 @@
                 <w:sz w:val="18"/>
                 <w:szCs w:val="18"/>
               </w:rPr>
-              <w:t xml:space="preserve">Simulatore: il PDF scaricato riporta tutti i dati della pagina, i costi e i grafici; foglio Excel «Dati inseriti».</w:t>
+              <w:t xml:space="preserve">Nuovo capitolo «News»: osservatorio sui crediti di carbonio volontari. Canali Bing News e Verra.</w:t>
             </w:r>
           </w:p>
         </w:tc>
@@ -2339,7 +2339,7 @@
                 <w:sz w:val="18"/>
                 <w:szCs w:val="18"/>
               </w:rPr>
-              <w:t xml:space="preserve">4.7</w:t>
+              <w:t xml:space="preserve">4.8</w:t>
             </w:r>
           </w:p>
         </w:tc>
@@ -2403,7 +2403,7 @@
                 <w:sz w:val="18"/>
                 <w:szCs w:val="18"/>
               </w:rPr>
-              <w:t xml:space="preserve">Assistente per gli Operatori e domande sulla pratica aperta; menu dell'Operatore con il Simulatore.</w:t>
+              <w:t xml:space="preserve">Simulatore: il PDF scaricato riporta tutti i dati della pagina, i costi e i grafici; foglio Excel «Dati inseriti».</w:t>
             </w:r>
           </w:p>
         </w:tc>
@@ -2473,7 +2473,7 @@
                 <w:sz w:val="18"/>
                 <w:szCs w:val="18"/>
               </w:rPr>
-              <w:t xml:space="preserve">4.6</w:t>
+              <w:t xml:space="preserve">4.7</w:t>
             </w:r>
           </w:p>
         </w:tc>
@@ -2539,7 +2539,7 @@
                 <w:sz w:val="18"/>
                 <w:szCs w:val="18"/>
               </w:rPr>
-              <w:t xml:space="preserve">Capitolo «Backup automatico».</w:t>
+              <w:t xml:space="preserve">Assistente per gli Operatori e domande sulla pratica aperta; menu dell'Operatore con il Simulatore.</w:t>
             </w:r>
           </w:p>
         </w:tc>
@@ -2609,7 +2609,7 @@
                 <w:sz w:val="18"/>
                 <w:szCs w:val="18"/>
               </w:rPr>
-              <w:t xml:space="preserve">4.5</w:t>
+              <w:t xml:space="preserve">4.6</w:t>
             </w:r>
           </w:p>
         </w:tc>
@@ -2673,7 +2673,7 @@
                 <w:sz w:val="18"/>
                 <w:szCs w:val="18"/>
               </w:rPr>
-              <w:t xml:space="preserve">Nuovo documento «Registro issue e test» tra quelli scaricabili.</w:t>
+              <w:t xml:space="preserve">Capitolo «Backup automatico».</w:t>
             </w:r>
           </w:p>
         </w:tc>
@@ -2743,7 +2743,7 @@
                 <w:sz w:val="18"/>
                 <w:szCs w:val="18"/>
               </w:rPr>
-              <w:t xml:space="preserve">4.4</w:t>
+              <w:t xml:space="preserve">4.5</w:t>
             </w:r>
           </w:p>
         </w:tc>
@@ -2809,7 +2809,7 @@
                 <w:sz w:val="18"/>
                 <w:szCs w:val="18"/>
               </w:rPr>
-              <w:t xml:space="preserve">Collaudo V05: testo completo dei valori lunghi nell'Audit (Prima/Dopo, Tolto/Aggiunto), denominazione delle organizzazioni e ricerca sui valori cambiati; pagina «Account disattivato».</w:t>
+              <w:t xml:space="preserve">Nuovo documento «Registro issue e test» tra quelli scaricabili.</w:t>
             </w:r>
           </w:p>
         </w:tc>
@@ -2879,7 +2879,7 @@
                 <w:sz w:val="18"/>
                 <w:szCs w:val="18"/>
               </w:rPr>
-              <w:t xml:space="preserve">4.3</w:t>
+              <w:t xml:space="preserve">4.4</w:t>
             </w:r>
           </w:p>
         </w:tc>
@@ -2911,7 +2911,7 @@
                 <w:sz w:val="18"/>
                 <w:szCs w:val="18"/>
               </w:rPr>
-              <w:t xml:space="preserve">20/10/2026</w:t>
+              <w:t xml:space="preserve">21/10/2026</w:t>
             </w:r>
           </w:p>
         </w:tc>
@@ -2943,7 +2943,7 @@
                 <w:sz w:val="18"/>
                 <w:szCs w:val="18"/>
               </w:rPr>
-              <w:t xml:space="preserve">Correzioni del collaudo V01: import CSV della Banca Dati «tutto o niente» senza valori negativi, calcolo bloccato con dati non ammessi, buffer manuale 0-80%, conferma definitiva solo senza errori di coerenza, dati non ammessi nel simulatore e zero esplicito nei prezzi, colonna «Oggetto e modifiche» nell'Audit.</w:t>
+              <w:t xml:space="preserve">Collaudo V05: testo completo dei valori lunghi nell'Audit (Prima/Dopo, Tolto/Aggiunto), denominazione delle organizzazioni e ricerca sui valori cambiati; pagina «Account disattivato».</w:t>
             </w:r>
           </w:p>
         </w:tc>
@@ -3013,7 +3013,7 @@
                 <w:sz w:val="18"/>
                 <w:szCs w:val="18"/>
               </w:rPr>
-              <w:t xml:space="preserve">4.2</w:t>
+              <w:t xml:space="preserve">4.3</w:t>
             </w:r>
           </w:p>
         </w:tc>
@@ -3079,7 +3079,7 @@
                 <w:sz w:val="18"/>
                 <w:szCs w:val="18"/>
               </w:rPr>
-              <w:t xml:space="preserve">Nuovo capitolo «Sicurezza»: inattività, avvisi, protezioni del sito e del database.</w:t>
+              <w:t xml:space="preserve">Correzioni del collaudo V01: import CSV della Banca Dati «tutto o niente» senza valori negativi, calcolo bloccato con dati non ammessi, buffer manuale 0-80%, conferma definitiva solo senza errori di coerenza, dati non ammessi nel simulatore e zero esplicito nei prezzi, colonna «Oggetto e modifiche» nell'Audit.</w:t>
             </w:r>
           </w:p>
         </w:tc>
@@ -3149,7 +3149,7 @@
                 <w:sz w:val="18"/>
                 <w:szCs w:val="18"/>
               </w:rPr>
-              <w:t xml:space="preserve">4.1</w:t>
+              <w:t xml:space="preserve">4.2</w:t>
             </w:r>
           </w:p>
         </w:tc>
@@ -3213,7 +3213,7 @@
                 <w:sz w:val="18"/>
                 <w:szCs w:val="18"/>
               </w:rPr>
-              <w:t xml:space="preserve">Voci di menu degli enti aggiornate.</w:t>
+              <w:t xml:space="preserve">Nuovo capitolo «Sicurezza»: inattività, avvisi, protezioni del sito e del database.</w:t>
             </w:r>
           </w:p>
         </w:tc>
@@ -3283,7 +3283,7 @@
                 <w:sz w:val="18"/>
                 <w:szCs w:val="18"/>
               </w:rPr>
-              <w:t xml:space="preserve">4.0</w:t>
+              <w:t xml:space="preserve">4.1</w:t>
             </w:r>
           </w:p>
         </w:tc>
@@ -3349,7 +3349,7 @@
                 <w:sz w:val="18"/>
                 <w:szCs w:val="18"/>
               </w:rPr>
-              <w:t xml:space="preserve">Nuovo ordine del menu; la sezione si chiama «Audit User». Voce «Marketplaces» in arrivo.</w:t>
+              <w:t xml:space="preserve">Voci di menu degli enti aggiornate.</w:t>
             </w:r>
           </w:p>
         </w:tc>
@@ -3419,7 +3419,7 @@
                 <w:sz w:val="18"/>
                 <w:szCs w:val="18"/>
               </w:rPr>
-              <w:t xml:space="preserve">3.9</w:t>
+              <w:t xml:space="preserve">4.0</w:t>
             </w:r>
           </w:p>
         </w:tc>
@@ -3483,7 +3483,7 @@
                 <w:sz w:val="18"/>
                 <w:szCs w:val="18"/>
               </w:rPr>
-              <w:t xml:space="preserve">Nuovo capitolo «Audit trail user».</w:t>
+              <w:t xml:space="preserve">Nuovo ordine del menu; la sezione si chiama «Audit User». Voce «Marketplaces» in arrivo.</w:t>
             </w:r>
           </w:p>
         </w:tc>
@@ -3553,7 +3553,7 @@
                 <w:sz w:val="18"/>
                 <w:szCs w:val="18"/>
               </w:rPr>
-              <w:t xml:space="preserve">3.8</w:t>
+              <w:t xml:space="preserve">3.9</w:t>
             </w:r>
           </w:p>
         </w:tc>
@@ -3619,7 +3619,7 @@
                 <w:sz w:val="18"/>
                 <w:szCs w:val="18"/>
               </w:rPr>
-              <w:t xml:space="preserve">Utenti online; PDF ed Excel del simulatore; messaggi d'errore dell'assistente.</w:t>
+              <w:t xml:space="preserve">Nuovo capitolo «Audit trail user».</w:t>
             </w:r>
           </w:p>
         </w:tc>
@@ -3689,7 +3689,7 @@
                 <w:sz w:val="18"/>
                 <w:szCs w:val="18"/>
               </w:rPr>
-              <w:t xml:space="preserve">3.7</w:t>
+              <w:t xml:space="preserve">3.8</w:t>
             </w:r>
           </w:p>
         </w:tc>
@@ -3721,7 +3721,7 @@
                 <w:sz w:val="18"/>
                 <w:szCs w:val="18"/>
               </w:rPr>
-              <w:t xml:space="preserve">19/10/2026</w:t>
+              <w:t xml:space="preserve">20/10/2026</w:t>
             </w:r>
           </w:p>
         </w:tc>
@@ -3753,7 +3753,7 @@
                 <w:sz w:val="18"/>
                 <w:szCs w:val="18"/>
               </w:rPr>
-              <w:t xml:space="preserve">Assistente virtuale: messaggio «Un attimo…» durante l'attesa.</w:t>
+              <w:t xml:space="preserve">Utenti online; PDF ed Excel del simulatore; messaggi d'errore dell'assistente.</w:t>
             </w:r>
           </w:p>
         </w:tc>
@@ -3823,7 +3823,7 @@
                 <w:sz w:val="18"/>
                 <w:szCs w:val="18"/>
               </w:rPr>
-              <w:t xml:space="preserve">3.6</w:t>
+              <w:t xml:space="preserve">3.7</w:t>
             </w:r>
           </w:p>
         </w:tc>
@@ -3889,7 +3889,7 @@
                 <w:sz w:val="18"/>
                 <w:szCs w:val="18"/>
               </w:rPr>
-              <w:t xml:space="preserve">Assistente virtuale attivo: chiave legata a uno spazio di lavoro, crediti e consumi.</w:t>
+              <w:t xml:space="preserve">Assistente virtuale: messaggio «Un attimo…» durante l'attesa.</w:t>
             </w:r>
           </w:p>
         </w:tc>
@@ -3959,7 +3959,7 @@
                 <w:sz w:val="18"/>
                 <w:szCs w:val="18"/>
               </w:rPr>
-              <w:t xml:space="preserve">3.5</w:t>
+              <w:t xml:space="preserve">3.6</w:t>
             </w:r>
           </w:p>
         </w:tc>
@@ -4023,7 +4023,7 @@
                 <w:sz w:val="18"/>
                 <w:szCs w:val="18"/>
               </w:rPr>
-              <w:t xml:space="preserve">Assistente virtuale; documenti ufficiali del Programma nella Documentazione.</w:t>
+              <w:t xml:space="preserve">Assistente virtuale attivo: chiave legata a uno spazio di lavoro, crediti e consumi.</w:t>
             </w:r>
           </w:p>
         </w:tc>
@@ -4093,7 +4093,7 @@
                 <w:sz w:val="18"/>
                 <w:szCs w:val="18"/>
               </w:rPr>
-              <w:t xml:space="preserve">3.4</w:t>
+              <w:t xml:space="preserve">3.5</w:t>
             </w:r>
           </w:p>
         </w:tc>
@@ -4159,7 +4159,7 @@
                 <w:sz w:val="18"/>
                 <w:szCs w:val="18"/>
               </w:rPr>
-              <w:t xml:space="preserve">Presentazione di riepilogo nella pagina Documentazione.</w:t>
+              <w:t xml:space="preserve">Assistente virtuale; documenti ufficiali del Programma nella Documentazione.</w:t>
             </w:r>
           </w:p>
         </w:tc>
@@ -4229,7 +4229,7 @@
                 <w:sz w:val="18"/>
                 <w:szCs w:val="18"/>
               </w:rPr>
-              <w:t xml:space="preserve">3.3</w:t>
+              <w:t xml:space="preserve">3.4</w:t>
             </w:r>
           </w:p>
         </w:tc>
@@ -4293,7 +4293,7 @@
                 <w:sz w:val="18"/>
                 <w:szCs w:val="18"/>
               </w:rPr>
-              <w:t xml:space="preserve">Ordinamento di tutte le tabelle e degli elenchi.</w:t>
+              <w:t xml:space="preserve">Presentazione di riepilogo nella pagina Documentazione.</w:t>
             </w:r>
           </w:p>
         </w:tc>
@@ -4363,7 +4363,7 @@
                 <w:sz w:val="18"/>
                 <w:szCs w:val="18"/>
               </w:rPr>
-              <w:t xml:space="preserve">3.2</w:t>
+              <w:t xml:space="preserve">3.3</w:t>
             </w:r>
           </w:p>
         </w:tc>
@@ -4429,7 +4429,7 @@
                 <w:sz w:val="18"/>
                 <w:szCs w:val="18"/>
               </w:rPr>
-              <w:t xml:space="preserve">Simulatore: metodo di stima per utenza (solo utenze virtuose), buffer del Capitolo 7, taratura.</w:t>
+              <w:t xml:space="preserve">Ordinamento di tutte le tabelle e degli elenchi.</w:t>
             </w:r>
           </w:p>
         </w:tc>
@@ -4499,7 +4499,7 @@
                 <w:sz w:val="18"/>
                 <w:szCs w:val="18"/>
               </w:rPr>
-              <w:t xml:space="preserve">3.1</w:t>
+              <w:t xml:space="preserve">3.2</w:t>
             </w:r>
           </w:p>
         </w:tc>
@@ -4563,7 +4563,7 @@
                 <w:sz w:val="18"/>
                 <w:szCs w:val="18"/>
               </w:rPr>
-              <w:t xml:space="preserve">Cruscotto diventa Dashboard; barra a LED delle 7 fasi per ogni pratica.</w:t>
+              <w:t xml:space="preserve">Simulatore: metodo di stima per utenza (solo utenze virtuose), buffer del Capitolo 7, taratura.</w:t>
             </w:r>
           </w:p>
         </w:tc>
@@ -4633,7 +4633,7 @@
                 <w:sz w:val="18"/>
                 <w:szCs w:val="18"/>
               </w:rPr>
-              <w:t xml:space="preserve">3.0</w:t>
+              <w:t xml:space="preserve">3.1</w:t>
             </w:r>
           </w:p>
         </w:tc>
@@ -4699,7 +4699,7 @@
                 <w:sz w:val="18"/>
                 <w:szCs w:val="18"/>
               </w:rPr>
-              <w:t xml:space="preserve">Eliminazione degli utenti che non hanno mai operato (script 30).</w:t>
+              <w:t xml:space="preserve">Cruscotto diventa Dashboard; barra a LED delle 7 fasi per ogni pratica.</w:t>
             </w:r>
           </w:p>
         </w:tc>
@@ -4769,7 +4769,7 @@
                 <w:sz w:val="18"/>
                 <w:szCs w:val="18"/>
               </w:rPr>
-              <w:t xml:space="preserve">2.9</w:t>
+              <w:t xml:space="preserve">3.0</w:t>
             </w:r>
           </w:p>
         </w:tc>
@@ -4833,7 +4833,7 @@
                 <w:sz w:val="18"/>
                 <w:szCs w:val="18"/>
               </w:rPr>
-              <w:t xml:space="preserve">Email automatica con le credenziali al nuovo utente e alla reimpostazione della password.</w:t>
+              <w:t xml:space="preserve">Eliminazione degli utenti che non hanno mai operato (script 30).</w:t>
             </w:r>
           </w:p>
         </w:tc>
@@ -4903,7 +4903,7 @@
                 <w:sz w:val="18"/>
                 <w:szCs w:val="18"/>
               </w:rPr>
-              <w:t xml:space="preserve">2.8</w:t>
+              <w:t xml:space="preserve">2.9</w:t>
             </w:r>
           </w:p>
         </w:tc>
@@ -4969,7 +4969,7 @@
                 <w:sz w:val="18"/>
                 <w:szCs w:val="18"/>
               </w:rPr>
-              <w:t xml:space="preserve">Più Amministratori con accesso completo; Amministratore principale protetto (script 29).</w:t>
+              <w:t xml:space="preserve">Email automatica con le credenziali al nuovo utente e alla reimpostazione della password.</w:t>
             </w:r>
           </w:p>
         </w:tc>
@@ -5039,7 +5039,7 @@
                 <w:sz w:val="18"/>
                 <w:szCs w:val="18"/>
               </w:rPr>
-              <w:t xml:space="preserve">2.7</w:t>
+              <w:t xml:space="preserve">2.8</w:t>
             </w:r>
           </w:p>
         </w:tc>
@@ -5103,7 +5103,7 @@
                 <w:sz w:val="18"/>
                 <w:szCs w:val="18"/>
               </w:rPr>
-              <w:t xml:space="preserve">Simulatore: costi per il Comune secondo il Caso 1 (progetto volontario) o il Caso 2 (progetto obbligatorio da bando).</w:t>
+              <w:t xml:space="preserve">Più Amministratori con accesso completo; Amministratore principale protetto (script 29).</w:t>
             </w:r>
           </w:p>
         </w:tc>
@@ -5173,7 +5173,7 @@
                 <w:sz w:val="18"/>
                 <w:szCs w:val="18"/>
               </w:rPr>
-              <w:t xml:space="preserve">2.6</w:t>
+              <w:t xml:space="preserve">2.7</w:t>
             </w:r>
           </w:p>
         </w:tc>
@@ -5239,7 +5239,7 @@
                 <w:sz w:val="18"/>
                 <w:szCs w:val="18"/>
               </w:rPr>
-              <w:t xml:space="preserve">Simulatore: valore del credito anno per anno, proposto 32 €.</w:t>
+              <w:t xml:space="preserve">Simulatore: costi per il Comune secondo il Caso 1 (progetto volontario) o il Caso 2 (progetto obbligatorio da bando).</w:t>
             </w:r>
           </w:p>
         </w:tc>
@@ -5309,7 +5309,7 @@
                 <w:sz w:val="18"/>
                 <w:szCs w:val="18"/>
               </w:rPr>
-              <w:t xml:space="preserve">2.5</w:t>
+              <w:t xml:space="preserve">2.6</w:t>
             </w:r>
           </w:p>
         </w:tc>
@@ -5373,7 +5373,7 @@
                 <w:sz w:val="18"/>
                 <w:szCs w:val="18"/>
               </w:rPr>
-              <w:t xml:space="preserve">Simulatore: simulazione economica con valore unitario del credito e costi per il Comune (contratti tipo della Fondazione, Schema tariffario).</w:t>
+              <w:t xml:space="preserve">Simulatore: valore del credito anno per anno, proposto 32 €.</w:t>
             </w:r>
           </w:p>
         </w:tc>
@@ -5443,7 +5443,7 @@
                 <w:sz w:val="18"/>
                 <w:szCs w:val="18"/>
               </w:rPr>
-              <w:t xml:space="preserve">2.4</w:t>
+              <w:t xml:space="preserve">2.5</w:t>
             </w:r>
           </w:p>
         </w:tc>
@@ -5509,7 +5509,7 @@
                 <w:sz w:val="18"/>
                 <w:szCs w:val="18"/>
               </w:rPr>
-              <w:t xml:space="preserve">Simulatore: riferimento sempre alla soglia del 65% di differenziata e controllo dei valori fuori scala.</w:t>
+              <w:t xml:space="preserve">Simulatore: simulazione economica con valore unitario del credito e costi per il Comune (contratti tipo della Fondazione, Schema tariffario).</w:t>
             </w:r>
           </w:p>
         </w:tc>
@@ -5579,7 +5579,7 @@
                 <w:sz w:val="18"/>
                 <w:szCs w:val="18"/>
               </w:rPr>
-              <w:t xml:space="preserve">2.3</w:t>
+              <w:t xml:space="preserve">2.4</w:t>
             </w:r>
           </w:p>
         </w:tc>
@@ -5643,7 +5643,7 @@
                 <w:sz w:val="18"/>
                 <w:szCs w:val="18"/>
               </w:rPr>
-              <w:t xml:space="preserve">Simulatore conforme al modello CWP: scenario di riferimento dello Standard 4.8.1, situazione attuale, conformità.</w:t>
+              <w:t xml:space="preserve">Simulatore: riferimento sempre alla soglia del 65% di differenziata e controllo dei valori fuori scala.</w:t>
             </w:r>
           </w:p>
         </w:tc>
@@ -5713,7 +5713,7 @@
                 <w:sz w:val="18"/>
                 <w:szCs w:val="18"/>
               </w:rPr>
-              <w:t xml:space="preserve">2.2</w:t>
+              <w:t xml:space="preserve">2.3</w:t>
             </w:r>
           </w:p>
         </w:tc>
@@ -5779,7 +5779,7 @@
                 <w:sz w:val="18"/>
                 <w:szCs w:val="18"/>
               </w:rPr>
-              <w:t xml:space="preserve">Nuovo capitolo «Simulatore di scenari»: creazione, anno base, obiettivi annui, risultati, modello di stima.</w:t>
+              <w:t xml:space="preserve">Simulatore conforme al modello CWP: scenario di riferimento dello Standard 4.8.1, situazione attuale, conformità.</w:t>
             </w:r>
           </w:p>
         </w:tc>
@@ -5849,7 +5849,7 @@
                 <w:sz w:val="18"/>
                 <w:szCs w:val="18"/>
               </w:rPr>
-              <w:t xml:space="preserve">2.1</w:t>
+              <w:t xml:space="preserve">2.2</w:t>
             </w:r>
           </w:p>
         </w:tc>
@@ -5913,7 +5913,7 @@
                 <w:sz w:val="18"/>
                 <w:szCs w:val="18"/>
               </w:rPr>
-              <w:t xml:space="preserve">Funzioni in arrivo: simulatore di scenari (7, 10 o 21 anni, obiettivi annui, % di differenziata e crediti stimati) e assistente virtuale (Claude).</w:t>
+              <w:t xml:space="preserve">Nuovo capitolo «Simulatore di scenari»: creazione, anno base, obiettivi annui, risultati, modello di stima.</w:t>
             </w:r>
           </w:p>
         </w:tc>
@@ -5983,7 +5983,7 @@
                 <w:sz w:val="18"/>
                 <w:szCs w:val="18"/>
               </w:rPr>
-              <w:t xml:space="preserve">2.0</w:t>
+              <w:t xml:space="preserve">2.1</w:t>
             </w:r>
           </w:p>
         </w:tc>
@@ -6049,7 +6049,7 @@
                 <w:sz w:val="18"/>
                 <w:szCs w:val="18"/>
               </w:rPr>
-              <w:t xml:space="preserve">Copie di sicurezza e ripristino: rimando alle Istruzioni di ripristino e punti essenziali (capitolo Manutenzione ed emergenze).</w:t>
+              <w:t xml:space="preserve">Funzioni in arrivo: simulatore di scenari (7, 10 o 21 anni, obiettivi annui, % di differenziata e crediti stimati) e assistente virtuale (Claude).</w:t>
             </w:r>
           </w:p>
         </w:tc>
@@ -6119,7 +6119,7 @@
                 <w:sz w:val="18"/>
                 <w:szCs w:val="18"/>
               </w:rPr>
-              <w:t xml:space="preserve">1.9</w:t>
+              <w:t xml:space="preserve">2.0</w:t>
             </w:r>
           </w:p>
         </w:tc>
@@ -6183,7 +6183,7 @@
                 <w:sz w:val="18"/>
                 <w:szCs w:val="18"/>
               </w:rPr>
-              <w:t xml:space="preserve">Fondazione Operate soggetto promotore del programma (esclusiva conferita da Wastelab).</w:t>
+              <w:t xml:space="preserve">Copie di sicurezza e ripristino: rimando alle Istruzioni di ripristino e punti essenziali (capitolo Manutenzione ed emergenze).</w:t>
             </w:r>
           </w:p>
         </w:tc>
@@ -6253,7 +6253,7 @@
                 <w:sz w:val="18"/>
                 <w:szCs w:val="18"/>
               </w:rPr>
-              <w:t xml:space="preserve">1.8</w:t>
+              <w:t xml:space="preserve">1.9</w:t>
             </w:r>
           </w:p>
         </w:tc>
@@ -6319,7 +6319,7 @@
                 <w:sz w:val="18"/>
                 <w:szCs w:val="18"/>
               </w:rPr>
-              <w:t xml:space="preserve">PEC del Programma e documenti ufficiali già pubblicati sulla pagina pubblica.</w:t>
+              <w:t xml:space="preserve">Fondazione Operate soggetto promotore del programma (esclusiva conferita da Wastelab).</w:t>
             </w:r>
           </w:p>
         </w:tc>
@@ -6389,7 +6389,7 @@
                 <w:sz w:val="18"/>
                 <w:szCs w:val="18"/>
               </w:rPr>
-              <w:t xml:space="preserve">1.7</w:t>
+              <w:t xml:space="preserve">1.8</w:t>
             </w:r>
           </w:p>
         </w:tc>
@@ -6421,7 +6421,7 @@
                 <w:sz w:val="18"/>
                 <w:szCs w:val="18"/>
               </w:rPr>
-              <w:t xml:space="preserve">18/10/2026</w:t>
+              <w:t xml:space="preserve">19/10/2026</w:t>
             </w:r>
           </w:p>
         </w:tc>
@@ -6453,7 +6453,7 @@
                 <w:sz w:val="18"/>
                 <w:szCs w:val="18"/>
               </w:rPr>
-              <w:t xml:space="preserve">Allineamento ai documenti ufficiali del Programma (script 22-24): Rapporto a 7 fasi, feedback pubblico, stati del Programma, dati del progetto e territorio ISTAT, ritiro e rientro, account unico e delegati, registri, tariffe e sospensione, accuratezza e accertamenti, informazioni del Programma e metodologie, modelli pubblici; nuovi capitoli Crediti emessi, Reclami, Pagina pubblica; qualità dei dati nel calcolo.</w:t>
+              <w:t xml:space="preserve">PEC del Programma e documenti ufficiali già pubblicati sulla pagina pubblica.</w:t>
             </w:r>
           </w:p>
         </w:tc>
@@ -6523,7 +6523,7 @@
                 <w:sz w:val="18"/>
                 <w:szCs w:val="18"/>
               </w:rPr>
-              <w:t xml:space="preserve">1.6</w:t>
+              <w:t xml:space="preserve">1.7</w:t>
             </w:r>
           </w:p>
         </w:tc>
@@ -6589,7 +6589,7 @@
                 <w:sz w:val="18"/>
                 <w:szCs w:val="18"/>
               </w:rPr>
-              <w:t xml:space="preserve">Calcolo crediti: descrizione corretta del buffer (somma delle voci delle Tabelle 15 e 16, più il 20% con le sole utenze virtuose, al massimo 80%).</w:t>
+              <w:t xml:space="preserve">Allineamento ai documenti ufficiali del Programma (script 22-24): Rapporto a 7 fasi, feedback pubblico, stati del Programma, dati del progetto e territorio ISTAT, ritiro e rientro, account unico e delegati, registri, tariffe e sospensione, accuratezza e accertamenti, informazioni del Programma e metodologie, modelli pubblici; nuovi capitoli Crediti emessi, Reclami, Pagina pubblica; qualità dei dati nel calcolo.</w:t>
             </w:r>
           </w:p>
         </w:tc>
@@ -6659,7 +6659,7 @@
                 <w:sz w:val="18"/>
                 <w:szCs w:val="18"/>
               </w:rPr>
-              <w:t xml:space="preserve">1.5</w:t>
+              <w:t xml:space="preserve">1.6</w:t>
             </w:r>
           </w:p>
         </w:tc>
@@ -6723,7 +6723,7 @@
                 <w:sz w:val="18"/>
                 <w:szCs w:val="18"/>
               </w:rPr>
-              <w:t xml:space="preserve">Nuova pagina Anagrafiche (Organizzazioni ed Enti, anche per gli Operatori); Rapporti con 4 fasi e durate proprie; documenti richiesti per fase; consultazione con documento bloccato, osservazioni numerate e motivazione; conservazione per 10 anni; fascicolo con riepilogo PDF e nuove cartelle.</w:t>
+              <w:t xml:space="preserve">Calcolo crediti: descrizione corretta del buffer (somma delle voci delle Tabelle 15 e 16, più il 20% con le sole utenze virtuose, al massimo 80%).</w:t>
             </w:r>
           </w:p>
         </w:tc>
@@ -6793,7 +6793,7 @@
                 <w:sz w:val="18"/>
                 <w:szCs w:val="18"/>
               </w:rPr>
-              <w:t xml:space="preserve">1.4</w:t>
+              <w:t xml:space="preserve">1.5</w:t>
             </w:r>
           </w:p>
         </w:tc>
@@ -6859,7 +6859,7 @@
                 <w:sz w:val="18"/>
                 <w:szCs w:val="18"/>
               </w:rPr>
-              <w:t xml:space="preserve">Calcolo crediti: il risultato si azzera quando cambiano dati o Banca Dati Utenze, conferma solo dopo un nuovo «Calcola». Gestione utenti: password temporanea di almeno 10 caratteri con lettere e numeri, creazione annullata se non va a buon fine, nessun accesso ai dati prima del cambio password.</w:t>
+              <w:t xml:space="preserve">Nuova pagina Anagrafiche (Organizzazioni ed Enti, anche per gli Operatori); Rapporti con 4 fasi e durate proprie; documenti richiesti per fase; consultazione con documento bloccato, osservazioni numerate e motivazione; conservazione per 10 anni; fascicolo con riepilogo PDF e nuove cartelle.</w:t>
             </w:r>
           </w:p>
         </w:tc>
@@ -6929,7 +6929,7 @@
                 <w:sz w:val="18"/>
                 <w:szCs w:val="18"/>
               </w:rPr>
-              <w:t xml:space="preserve">1.3</w:t>
+              <w:t xml:space="preserve">1.4</w:t>
             </w:r>
           </w:p>
         </w:tc>
@@ -6993,7 +6993,7 @@
                 <w:sz w:val="18"/>
                 <w:szCs w:val="18"/>
               </w:rPr>
-              <w:t xml:space="preserve">Rapporto di calcolo in PDF, archiviazione nella pratica, numero di registro, registro dei crediti.</w:t>
+              <w:t xml:space="preserve">Calcolo crediti: il risultato si azzera quando cambiano dati o Banca Dati Utenze, conferma solo dopo un nuovo «Calcola». Gestione utenti: password temporanea di almeno 10 caratteri con lettere e numeri, creazione annullata se non va a buon fine, nessun accesso ai dati prima del cambio password.</w:t>
             </w:r>
           </w:p>
         </w:tc>
@@ -7063,7 +7063,7 @@
                 <w:sz w:val="18"/>
                 <w:szCs w:val="18"/>
               </w:rPr>
-              <w:t xml:space="preserve">1.2</w:t>
+              <w:t xml:space="preserve">1.3</w:t>
             </w:r>
           </w:p>
         </w:tc>
@@ -7129,7 +7129,7 @@
                 <w:sz w:val="18"/>
                 <w:szCs w:val="18"/>
               </w:rPr>
-              <w:t xml:space="preserve">Calcolo crediti: importare il tracciato nel calcolo (dai documenti della pratica o dal computer), singole letture, blocco dei dati personali, controlli di coerenza.</w:t>
+              <w:t xml:space="preserve">Rapporto di calcolo in PDF, archiviazione nella pratica, numero di registro, registro dei crediti.</w:t>
             </w:r>
           </w:p>
         </w:tc>
@@ -7199,7 +7199,7 @@
                 <w:sz w:val="18"/>
                 <w:szCs w:val="18"/>
               </w:rPr>
-              <w:t xml:space="preserve">1.1</w:t>
+              <w:t xml:space="preserve">1.2</w:t>
             </w:r>
           </w:p>
         </w:tc>
@@ -7263,7 +7263,7 @@
                 <w:sz w:val="18"/>
                 <w:szCs w:val="18"/>
               </w:rPr>
-              <w:t xml:space="preserve">Note di fase, Ente di Validazione della pratica, consultazione sulla pagina pubblica con conferma dell'email, moderazione con autori e allegati, errata corrige; nuovo capitolo Messaggi con il Comune; pagamenti visibili al Comune; Impostazioni: Enti di Validazione e Modelli di documento; notifiche aggiornate.</w:t>
+              <w:t xml:space="preserve">Calcolo crediti: importare il tracciato nel calcolo (dai documenti della pratica o dal computer), singole letture, blocco dei dati personali, controlli di coerenza.</w:t>
             </w:r>
           </w:p>
         </w:tc>
@@ -7333,6 +7333,142 @@
                 <w:sz w:val="18"/>
                 <w:szCs w:val="18"/>
               </w:rPr>
+              <w:t xml:space="preserve">1.1</w:t>
+            </w:r>
+          </w:p>
+        </w:tc>
+        <w:tc>
+          <w:tcPr>
+            <w:tcW w:type="dxa" w:w="1300"/>
+            <w:tcBorders>
+              <w:top w:val="single" w:color="D9D4C5" w:sz="4"/>
+              <w:left w:val="single" w:color="D9D4C5" w:sz="4"/>
+              <w:bottom w:val="single" w:color="D9D4C5" w:sz="4"/>
+              <w:right w:val="single" w:color="D9D4C5" w:sz="4"/>
+            </w:tcBorders>
+            <w:shd w:fill="F6F4EE" w:color="auto" w:val="clear"/>
+            <w:tcMar>
+              <w:top w:type="dxa" w:w="70"/>
+              <w:left w:type="dxa" w:w="110"/>
+              <w:bottom w:type="dxa" w:w="70"/>
+              <w:right w:type="dxa" w:w="110"/>
+            </w:tcMar>
+            <w:vAlign w:val="center"/>
+          </w:tcPr>
+          <w:p>
+            <w:pPr>
+              <w:spacing w:after="0" w:before="0"/>
+            </w:pPr>
+            <w:r>
+              <w:rPr>
+                <w:rFonts w:ascii="Arial" w:cs="Arial" w:eastAsia="Arial" w:hAnsi="Arial"/>
+                <w:color w:val="1B2118"/>
+                <w:sz w:val="18"/>
+                <w:szCs w:val="18"/>
+              </w:rPr>
+              <w:t xml:space="preserve">18/10/2026</w:t>
+            </w:r>
+          </w:p>
+        </w:tc>
+        <w:tc>
+          <w:tcPr>
+            <w:tcW w:type="dxa" w:w="5538"/>
+            <w:tcBorders>
+              <w:top w:val="single" w:color="D9D4C5" w:sz="4"/>
+              <w:left w:val="single" w:color="D9D4C5" w:sz="4"/>
+              <w:bottom w:val="single" w:color="D9D4C5" w:sz="4"/>
+              <w:right w:val="single" w:color="D9D4C5" w:sz="4"/>
+            </w:tcBorders>
+            <w:shd w:fill="F6F4EE" w:color="auto" w:val="clear"/>
+            <w:tcMar>
+              <w:top w:type="dxa" w:w="70"/>
+              <w:left w:type="dxa" w:w="110"/>
+              <w:bottom w:type="dxa" w:w="70"/>
+              <w:right w:type="dxa" w:w="110"/>
+            </w:tcMar>
+            <w:vAlign w:val="center"/>
+          </w:tcPr>
+          <w:p>
+            <w:pPr>
+              <w:spacing w:after="0" w:before="0"/>
+            </w:pPr>
+            <w:r>
+              <w:rPr>
+                <w:rFonts w:ascii="Arial" w:cs="Arial" w:eastAsia="Arial" w:hAnsi="Arial"/>
+                <w:color w:val="1B2118"/>
+                <w:sz w:val="18"/>
+                <w:szCs w:val="18"/>
+              </w:rPr>
+              <w:t xml:space="preserve">Note di fase, Ente di Validazione della pratica, consultazione sulla pagina pubblica con conferma dell'email, moderazione con autori e allegati, errata corrige; nuovo capitolo Messaggi con il Comune; pagamenti visibili al Comune; Impostazioni: Enti di Validazione e Modelli di documento; notifiche aggiornate.</w:t>
+            </w:r>
+          </w:p>
+        </w:tc>
+        <w:tc>
+          <w:tcPr>
+            <w:tcW w:type="dxa" w:w="2000"/>
+            <w:tcBorders>
+              <w:top w:val="single" w:color="D9D4C5" w:sz="4"/>
+              <w:left w:val="single" w:color="D9D4C5" w:sz="4"/>
+              <w:bottom w:val="single" w:color="D9D4C5" w:sz="4"/>
+              <w:right w:val="single" w:color="D9D4C5" w:sz="4"/>
+            </w:tcBorders>
+            <w:shd w:fill="F6F4EE" w:color="auto" w:val="clear"/>
+            <w:tcMar>
+              <w:top w:type="dxa" w:w="70"/>
+              <w:left w:type="dxa" w:w="110"/>
+              <w:bottom w:type="dxa" w:w="70"/>
+              <w:right w:type="dxa" w:w="110"/>
+            </w:tcMar>
+            <w:vAlign w:val="center"/>
+          </w:tcPr>
+          <w:p>
+            <w:pPr>
+              <w:spacing w:after="0" w:before="0"/>
+            </w:pPr>
+            <w:r>
+              <w:rPr>
+                <w:rFonts w:ascii="Arial" w:cs="Arial" w:eastAsia="Arial" w:hAnsi="Arial"/>
+                <w:color w:val="1B2118"/>
+                <w:sz w:val="18"/>
+                <w:szCs w:val="18"/>
+              </w:rPr>
+              <w:t xml:space="preserve">Fondazione Operate</w:t>
+            </w:r>
+          </w:p>
+        </w:tc>
+      </w:tr>
+      <w:tr>
+        <w:trPr>
+          <w:cantSplit/>
+        </w:trPr>
+        <w:tc>
+          <w:tcPr>
+            <w:tcW w:type="dxa" w:w="800"/>
+            <w:tcBorders>
+              <w:top w:val="single" w:color="D9D4C5" w:sz="4"/>
+              <w:left w:val="single" w:color="D9D4C5" w:sz="4"/>
+              <w:bottom w:val="single" w:color="D9D4C5" w:sz="4"/>
+              <w:right w:val="single" w:color="D9D4C5" w:sz="4"/>
+            </w:tcBorders>
+            <w:tcMar>
+              <w:top w:type="dxa" w:w="70"/>
+              <w:left w:type="dxa" w:w="110"/>
+              <w:bottom w:type="dxa" w:w="70"/>
+              <w:right w:type="dxa" w:w="110"/>
+            </w:tcMar>
+            <w:vAlign w:val="center"/>
+          </w:tcPr>
+          <w:p>
+            <w:pPr>
+              <w:spacing w:after="0" w:before="0"/>
+            </w:pPr>
+            <w:r>
+              <w:rPr>
+                <w:rFonts w:ascii="Arial" w:cs="Arial" w:eastAsia="Arial" w:hAnsi="Arial"/>
+                <w:color w:val="1B2118"/>
+                <w:sz w:val="18"/>
+                <w:szCs w:val="18"/>
+              </w:rPr>
               <w:t xml:space="preserve">1.0</w:t>
             </w:r>
           </w:p>
@@ -7346,7 +7482,6 @@
               <w:bottom w:val="single" w:color="D9D4C5" w:sz="4"/>
               <w:right w:val="single" w:color="D9D4C5" w:sz="4"/>
             </w:tcBorders>
-            <w:shd w:fill="F6F4EE" w:color="auto" w:val="clear"/>
             <w:tcMar>
               <w:top w:type="dxa" w:w="70"/>
               <w:left w:type="dxa" w:w="110"/>
@@ -7379,7 +7514,6 @@
               <w:bottom w:val="single" w:color="D9D4C5" w:sz="4"/>
               <w:right w:val="single" w:color="D9D4C5" w:sz="4"/>
             </w:tcBorders>
-            <w:shd w:fill="F6F4EE" w:color="auto" w:val="clear"/>
             <w:tcMar>
               <w:top w:type="dxa" w:w="70"/>
               <w:left w:type="dxa" w:w="110"/>
@@ -7412,7 +7546,6 @@
               <w:bottom w:val="single" w:color="D9D4C5" w:sz="4"/>
               <w:right w:val="single" w:color="D9D4C5" w:sz="4"/>
             </w:tcBorders>
-            <w:shd w:fill="F6F4EE" w:color="auto" w:val="clear"/>
             <w:tcMar>
               <w:top w:type="dxa" w:w="70"/>
               <w:left w:type="dxa" w:w="110"/>
@@ -7454,7 +7587,7 @@
           <w:sz w:val="20"/>
           <w:szCs w:val="20"/>
         </w:rPr>
-        <w:t xml:space="preserve">Questo documento descrive il portale alla revisione 5.9 del 23/10/2026. A ogni modifica del portale il manuale viene aggiornato e la revisione incrementata; la versione corrente si scarica dall'area Documentazione del portale (solo Amministratori).</w:t>
+        <w:t xml:space="preserve">Questo documento descrive il portale alla revisione 6.0 del 23/10/2026. A ogni modifica del portale il manuale viene aggiornato e la revisione incrementata; la versione corrente si scarica dall'area Documentazione del portale (solo Amministratori).</w:t>
       </w:r>
     </w:p>
     <w:p>
@@ -10334,7 +10467,7 @@
         </w:rPr>
         <w:t xml:space="preserve">Si accede da </w:t>
       </w:r>
-      <w:hyperlink w:history="1" r:id="rIdsiv5jzru74uwfuocrofty">
+      <w:hyperlink w:history="1" r:id="rIdumm3olenajtapvqigwwmx">
         <w:r>
           <w:rPr>
             <w:rFonts w:ascii="Arial" w:cs="Arial" w:eastAsia="Arial" w:hAnsi="Arial"/>
@@ -12667,6 +12800,171 @@
           <w:szCs w:val="21"/>
         </w:rPr>
         <w:t xml:space="preserve"> è l'ultima aperta; se nessuna è aperta, la prima non iniziata.</w:t>
+      </w:r>
+    </w:p>
+    <w:p>
+      <w:pPr>
+        <w:spacing w:after="140" w:line="300"/>
+      </w:pPr>
+      <w:r>
+        <w:rPr>
+          <w:rFonts w:ascii="Arial" w:cs="Arial" w:eastAsia="Arial" w:hAnsi="Arial"/>
+          <w:b/>
+          <w:bCs/>
+          <w:color w:val="1B2118"/>
+          <w:sz w:val="21"/>
+          <w:szCs w:val="21"/>
+        </w:rPr>
+        <w:t xml:space="preserve">Colori dello stato delle fasi (dal 23/10/2026).</w:t>
+      </w:r>
+      <w:r>
+        <w:rPr>
+          <w:rFonts w:ascii="Arial" w:cs="Arial" w:eastAsia="Arial" w:hAnsi="Arial"/>
+          <w:color w:val="1B2118"/>
+          <w:sz w:val="21"/>
+          <w:szCs w:val="21"/>
+        </w:rPr>
+        <w:t xml:space="preserve"> Nella Dashboard (colonna Fase corrente) e nelle fasi della pratica la scritta dello stato è </w:t>
+      </w:r>
+      <w:r>
+        <w:rPr>
+          <w:rFonts w:ascii="Arial" w:cs="Arial" w:eastAsia="Arial" w:hAnsi="Arial"/>
+          <w:b/>
+          <w:bCs/>
+          <w:color w:val="1B2118"/>
+          <w:sz w:val="21"/>
+          <w:szCs w:val="21"/>
+        </w:rPr>
+        <w:t xml:space="preserve">verde</w:t>
+      </w:r>
+      <w:r>
+        <w:rPr>
+          <w:rFonts w:ascii="Arial" w:cs="Arial" w:eastAsia="Arial" w:hAnsi="Arial"/>
+          <w:color w:val="1B2118"/>
+          <w:sz w:val="21"/>
+          <w:szCs w:val="21"/>
+        </w:rPr>
+        <w:t xml:space="preserve"> per </w:t>
+      </w:r>
+      <w:r>
+        <w:rPr>
+          <w:rFonts w:ascii="Arial" w:cs="Arial" w:eastAsia="Arial" w:hAnsi="Arial"/>
+          <w:i/>
+          <w:iCs/>
+          <w:color w:val="1B2118"/>
+          <w:sz w:val="21"/>
+          <w:szCs w:val="21"/>
+        </w:rPr>
+        <w:t xml:space="preserve">Completata</w:t>
+      </w:r>
+      <w:r>
+        <w:rPr>
+          <w:rFonts w:ascii="Arial" w:cs="Arial" w:eastAsia="Arial" w:hAnsi="Arial"/>
+          <w:color w:val="1B2118"/>
+          <w:sz w:val="21"/>
+          <w:szCs w:val="21"/>
+        </w:rPr>
+        <w:t xml:space="preserve">, </w:t>
+      </w:r>
+      <w:r>
+        <w:rPr>
+          <w:rFonts w:ascii="Arial" w:cs="Arial" w:eastAsia="Arial" w:hAnsi="Arial"/>
+          <w:b/>
+          <w:bCs/>
+          <w:color w:val="1B2118"/>
+          <w:sz w:val="21"/>
+          <w:szCs w:val="21"/>
+        </w:rPr>
+        <w:t xml:space="preserve">arancio</w:t>
+      </w:r>
+      <w:r>
+        <w:rPr>
+          <w:rFonts w:ascii="Arial" w:cs="Arial" w:eastAsia="Arial" w:hAnsi="Arial"/>
+          <w:color w:val="1B2118"/>
+          <w:sz w:val="21"/>
+          <w:szCs w:val="21"/>
+        </w:rPr>
+        <w:t xml:space="preserve"> per </w:t>
+      </w:r>
+      <w:r>
+        <w:rPr>
+          <w:rFonts w:ascii="Arial" w:cs="Arial" w:eastAsia="Arial" w:hAnsi="Arial"/>
+          <w:i/>
+          <w:iCs/>
+          <w:color w:val="1B2118"/>
+          <w:sz w:val="21"/>
+          <w:szCs w:val="21"/>
+        </w:rPr>
+        <w:t xml:space="preserve">In corso</w:t>
+      </w:r>
+      <w:r>
+        <w:rPr>
+          <w:rFonts w:ascii="Arial" w:cs="Arial" w:eastAsia="Arial" w:hAnsi="Arial"/>
+          <w:color w:val="1B2118"/>
+          <w:sz w:val="21"/>
+          <w:szCs w:val="21"/>
+        </w:rPr>
+        <w:t xml:space="preserve"> e </w:t>
+      </w:r>
+      <w:r>
+        <w:rPr>
+          <w:rFonts w:ascii="Arial" w:cs="Arial" w:eastAsia="Arial" w:hAnsi="Arial"/>
+          <w:i/>
+          <w:iCs/>
+          <w:color w:val="1B2118"/>
+          <w:sz w:val="21"/>
+          <w:szCs w:val="21"/>
+        </w:rPr>
+        <w:t xml:space="preserve">In attesa di integrazione</w:t>
+      </w:r>
+      <w:r>
+        <w:rPr>
+          <w:rFonts w:ascii="Arial" w:cs="Arial" w:eastAsia="Arial" w:hAnsi="Arial"/>
+          <w:color w:val="1B2118"/>
+          <w:sz w:val="21"/>
+          <w:szCs w:val="21"/>
+        </w:rPr>
+        <w:t xml:space="preserve">, </w:t>
+      </w:r>
+      <w:r>
+        <w:rPr>
+          <w:rFonts w:ascii="Arial" w:cs="Arial" w:eastAsia="Arial" w:hAnsi="Arial"/>
+          <w:b/>
+          <w:bCs/>
+          <w:color w:val="1B2118"/>
+          <w:sz w:val="21"/>
+          <w:szCs w:val="21"/>
+        </w:rPr>
+        <w:t xml:space="preserve">rossa</w:t>
+      </w:r>
+      <w:r>
+        <w:rPr>
+          <w:rFonts w:ascii="Arial" w:cs="Arial" w:eastAsia="Arial" w:hAnsi="Arial"/>
+          <w:color w:val="1B2118"/>
+          <w:sz w:val="21"/>
+          <w:szCs w:val="21"/>
+        </w:rPr>
+        <w:t xml:space="preserve"> per </w:t>
+      </w:r>
+      <w:r>
+        <w:rPr>
+          <w:rFonts w:ascii="Arial" w:cs="Arial" w:eastAsia="Arial" w:hAnsi="Arial"/>
+          <w:i/>
+          <w:iCs/>
+          <w:color w:val="1B2118"/>
+          <w:sz w:val="21"/>
+          <w:szCs w:val="21"/>
+        </w:rPr>
+        <w:t xml:space="preserve">Non iniziata</w:t>
+      </w:r>
+      <w:r>
+        <w:rPr>
+          <w:rFonts w:ascii="Arial" w:cs="Arial" w:eastAsia="Arial" w:hAnsi="Arial"/>
+          <w:color w:val="1B2118"/>
+          <w:sz w:val="21"/>
+          <w:szCs w:val="21"/>
+        </w:rPr>
+        <w:t xml:space="preserve">.</w:t>
       </w:r>
     </w:p>
     <w:p>
@@ -53399,7 +53697,7 @@
         <w:szCs w:val="16"/>
       </w:rPr>
       <w:tab/>
-      <w:t xml:space="preserve">Manuale Amministratore · Rev. 5.9 · 23/10/2026</w:t>
+      <w:t xml:space="preserve">Manuale Amministratore · Rev. 6.0 · 23/10/2026</w:t>
     </w:r>
   </w:p>
 </w:hdr>
@@ -53464,7 +53762,7 @@
         <w:szCs w:val="16"/>
       </w:rPr>
       <w:tab/>
-      <w:t xml:space="preserve">Manuale Amministratore · Rev. 5.9 · 23/10/2026</w:t>
+      <w:t xml:space="preserve">Manuale Amministratore · Rev. 6.0 · 23/10/2026</w:t>
     </w:r>
   </w:p>
 </w:hdr>

</xml_diff>

<commit_message>
Documenti: Marketing in produzione (script 44, funzione marketing), correzioni dell'importazione e banche dati caricate
Co-Authored-By: Claude Opus 5.5 <noreply@anthropic.com>
Claude-Session: https://claude.ai/code/session_01E8XCbEeVHWVP3hntUZ6kZ1
</commit_message>
<xml_diff>
--- a/public/documentazione/Manuale_Amministratore_Portale_CWP.docx
+++ b/public/documentazione/Manuale_Amministratore_Portale_CWP.docx
@@ -302,7 +302,7 @@
                 <w:sz w:val="20"/>
                 <w:szCs w:val="20"/>
               </w:rPr>
-              <w:t xml:space="preserve">Rev. 6.1</w:t>
+              <w:t xml:space="preserve">Rev. 6.2</w:t>
             </w:r>
           </w:p>
         </w:tc>
@@ -719,7 +719,7 @@
                 <w:sz w:val="18"/>
                 <w:szCs w:val="18"/>
               </w:rPr>
-              <w:t xml:space="preserve">6.1</w:t>
+              <w:t xml:space="preserve">6.2</w:t>
             </w:r>
           </w:p>
         </w:tc>
@@ -783,7 +783,7 @@
                 <w:sz w:val="18"/>
                 <w:szCs w:val="18"/>
               </w:rPr>
-              <w:t xml:space="preserve">Nuovo capitolo «Marketing: Comuni, gestori e campagne» (banche dati, campagne, pagina Approfondisci, richieste).</w:t>
+              <w:t xml:space="preserve">Marketing: aggiornamento a blocchi e IndicePA non disponibile.</w:t>
             </w:r>
           </w:p>
         </w:tc>
@@ -853,7 +853,7 @@
                 <w:sz w:val="18"/>
                 <w:szCs w:val="18"/>
               </w:rPr>
-              <w:t xml:space="preserve">6.0</w:t>
+              <w:t xml:space="preserve">6.1</w:t>
             </w:r>
           </w:p>
         </w:tc>
@@ -919,7 +919,7 @@
                 <w:sz w:val="18"/>
                 <w:szCs w:val="18"/>
               </w:rPr>
-              <w:t xml:space="preserve">Colori dello stato delle fasi in Dashboard e nella pratica.</w:t>
+              <w:t xml:space="preserve">Nuovo capitolo «Marketing: Comuni, gestori e campagne» (banche dati, campagne, pagina Approfondisci, richieste).</w:t>
             </w:r>
           </w:p>
         </w:tc>
@@ -989,7 +989,7 @@
                 <w:sz w:val="18"/>
                 <w:szCs w:val="18"/>
               </w:rPr>
-              <w:t xml:space="preserve">5.9</w:t>
+              <w:t xml:space="preserve">6.0</w:t>
             </w:r>
           </w:p>
         </w:tc>
@@ -1053,7 +1053,7 @@
                 <w:sz w:val="18"/>
                 <w:szCs w:val="18"/>
               </w:rPr>
-              <w:t xml:space="preserve">Nuovo progetto e dati della pratica: listino Caso 1 / Caso 2 e valore del progetto; Dashboard: valore dei progetti per il cliente.</w:t>
+              <w:t xml:space="preserve">Colori dello stato delle fasi in Dashboard e nella pratica.</w:t>
             </w:r>
           </w:p>
         </w:tc>
@@ -1123,7 +1123,7 @@
                 <w:sz w:val="18"/>
                 <w:szCs w:val="18"/>
               </w:rPr>
-              <w:t xml:space="preserve">5.8</w:t>
+              <w:t xml:space="preserve">5.9</w:t>
             </w:r>
           </w:p>
         </w:tc>
@@ -1189,7 +1189,7 @@
                 <w:sz w:val="18"/>
                 <w:szCs w:val="18"/>
               </w:rPr>
-              <w:t xml:space="preserve">Revisione generale al 23/10: protezione dei dati del tracciato e della Banca Dati Utenze per utenza.</w:t>
+              <w:t xml:space="preserve">Nuovo progetto e dati della pratica: listino Caso 1 / Caso 2 e valore del progetto; Dashboard: valore dei progetti per il cliente.</w:t>
             </w:r>
           </w:p>
         </w:tc>
@@ -1259,7 +1259,7 @@
                 <w:sz w:val="18"/>
                 <w:szCs w:val="18"/>
               </w:rPr>
-              <w:t xml:space="preserve">5.7</w:t>
+              <w:t xml:space="preserve">5.8</w:t>
             </w:r>
           </w:p>
         </w:tc>
@@ -1323,7 +1323,7 @@
                 <w:sz w:val="18"/>
                 <w:szCs w:val="18"/>
               </w:rPr>
-              <w:t xml:space="preserve">Dashboard: valore dei crediti in simulazione e in fase esecutiva; Impostazioni: prezzo di riferimento del credito.</w:t>
+              <w:t xml:space="preserve">Revisione generale al 23/10: protezione dei dati del tracciato e della Banca Dati Utenze per utenza.</w:t>
             </w:r>
           </w:p>
         </w:tc>
@@ -1393,7 +1393,7 @@
                 <w:sz w:val="18"/>
                 <w:szCs w:val="18"/>
               </w:rPr>
-              <w:t xml:space="preserve">5.6</w:t>
+              <w:t xml:space="preserve">5.7</w:t>
             </w:r>
           </w:p>
         </w:tc>
@@ -1459,7 +1459,7 @@
                 <w:sz w:val="18"/>
                 <w:szCs w:val="18"/>
               </w:rPr>
-              <w:t xml:space="preserve">Passo 5a: «Calcola» usa le utenze (categoria di simulazione come classe della delibera, kg misurati, frazioni per utenza); utenze senza categoria o fuori delibera escluse e conferma bloccata; fonte nei Risultati, nel CSV e nel PDF.</w:t>
+              <w:t xml:space="preserve">Dashboard: valore dei crediti in simulazione e in fase esecutiva; Impostazioni: prezzo di riferimento del credito.</w:t>
             </w:r>
           </w:p>
         </w:tc>
@@ -1529,7 +1529,7 @@
                 <w:sz w:val="18"/>
                 <w:szCs w:val="18"/>
               </w:rPr>
-              <w:t xml:space="preserve">5.5</w:t>
+              <w:t xml:space="preserve">5.6</w:t>
             </w:r>
           </w:p>
         </w:tc>
@@ -1561,7 +1561,7 @@
                 <w:sz w:val="18"/>
                 <w:szCs w:val="18"/>
               </w:rPr>
-              <w:t xml:space="preserve">22/10/2026</w:t>
+              <w:t xml:space="preserve">23/10/2026</w:t>
             </w:r>
           </w:p>
         </w:tc>
@@ -1593,7 +1593,7 @@
                 <w:sz w:val="18"/>
                 <w:szCs w:val="18"/>
               </w:rPr>
-              <w:t xml:space="preserve">Audit delle utenze; calcolo di prova.</w:t>
+              <w:t xml:space="preserve">Passo 5a: «Calcola» usa le utenze (categoria di simulazione come classe della delibera, kg misurati, frazioni per utenza); utenze senza categoria o fuori delibera escluse e conferma bloccata; fonte nei Risultati, nel CSV e nel PDF.</w:t>
             </w:r>
           </w:p>
         </w:tc>
@@ -1663,7 +1663,7 @@
                 <w:sz w:val="18"/>
                 <w:szCs w:val="18"/>
               </w:rPr>
-              <w:t xml:space="preserve">5.4</w:t>
+              <w:t xml:space="preserve">5.5</w:t>
             </w:r>
           </w:p>
         </w:tc>
@@ -1729,7 +1729,7 @@
                 <w:sz w:val="18"/>
                 <w:szCs w:val="18"/>
               </w:rPr>
-              <w:t xml:space="preserve">Gestione delle utenze nel passo 5a del calcolo: caricamento, schede, modulo; categorie tariffaria e di simulazione.</w:t>
+              <w:t xml:space="preserve">Audit delle utenze; calcolo di prova.</w:t>
             </w:r>
           </w:p>
         </w:tc>
@@ -1799,7 +1799,7 @@
                 <w:sz w:val="18"/>
                 <w:szCs w:val="18"/>
               </w:rPr>
-              <w:t xml:space="preserve">5.3</w:t>
+              <w:t xml:space="preserve">5.4</w:t>
             </w:r>
           </w:p>
         </w:tc>
@@ -1863,7 +1863,7 @@
                 <w:sz w:val="18"/>
                 <w:szCs w:val="18"/>
               </w:rPr>
-              <w:t xml:space="preserve">Banca Dati Utenze per utenza: campi, regole, dati personali.</w:t>
+              <w:t xml:space="preserve">Gestione delle utenze nel passo 5a del calcolo: caricamento, schede, modulo; categorie tariffaria e di simulazione.</w:t>
             </w:r>
           </w:p>
         </w:tc>
@@ -1933,7 +1933,7 @@
                 <w:sz w:val="18"/>
                 <w:szCs w:val="18"/>
               </w:rPr>
-              <w:t xml:space="preserve">5.2</w:t>
+              <w:t xml:space="preserve">5.3</w:t>
             </w:r>
           </w:p>
         </w:tc>
@@ -1999,7 +1999,7 @@
                 <w:sz w:val="18"/>
                 <w:szCs w:val="18"/>
               </w:rPr>
-              <w:t xml:space="preserve">Uso dal telefono: menu a pannello, schede in Dashboard e Audit, elenco e dettaglio delle pratiche.</w:t>
+              <w:t xml:space="preserve">Banca Dati Utenze per utenza: campi, regole, dati personali.</w:t>
             </w:r>
           </w:p>
         </w:tc>
@@ -2069,7 +2069,7 @@
                 <w:sz w:val="18"/>
                 <w:szCs w:val="18"/>
               </w:rPr>
-              <w:t xml:space="preserve">5.1</w:t>
+              <w:t xml:space="preserve">5.2</w:t>
             </w:r>
           </w:p>
         </w:tc>
@@ -2133,7 +2133,7 @@
                 <w:sz w:val="18"/>
                 <w:szCs w:val="18"/>
               </w:rPr>
-              <w:t xml:space="preserve">Rilievi N01-N06: costi una tantum in 10 rate, feedback pubblico e fase 3, ente prima della fase 5, riquadro «Fase aperta senza scadenza», avviso sui codici, frazioni del fattore dell'indifferenziato.</w:t>
+              <w:t xml:space="preserve">Uso dal telefono: menu a pannello, schede in Dashboard e Audit, elenco e dettaglio delle pratiche.</w:t>
             </w:r>
           </w:p>
         </w:tc>
@@ -2203,7 +2203,7 @@
                 <w:sz w:val="18"/>
                 <w:szCs w:val="18"/>
               </w:rPr>
-              <w:t xml:space="preserve">5.0</w:t>
+              <w:t xml:space="preserve">5.1</w:t>
             </w:r>
           </w:p>
         </w:tc>
@@ -2236,7 +2236,7 @@
                 <w:sz w:val="18"/>
                 <w:szCs w:val="18"/>
               </w:rPr>
-              <w:t xml:space="preserve">21/10/2026</w:t>
+              <w:t xml:space="preserve">22/10/2026</w:t>
             </w:r>
           </w:p>
         </w:tc>
@@ -2269,7 +2269,7 @@
                 <w:sz w:val="18"/>
                 <w:szCs w:val="18"/>
               </w:rPr>
-              <w:t xml:space="preserve">«News» diventa «Notizie CO2»; Google News attraverso il tramite; barra a LED nell'elenco e nella pratica. Pallino verde delle Notizie CO2 nuove. Notizie CO2: siti di notizie ambientali al posto di Google News. Notizie CO2: siti di notizie ambientali al posto di Google News.</w:t>
+              <w:t xml:space="preserve">Rilievi N01-N06: costi una tantum in 10 rate, feedback pubblico e fase 3, ente prima della fase 5, riquadro «Fase aperta senza scadenza», avviso sui codici, frazioni del fattore dell'indifferenziato.</w:t>
             </w:r>
           </w:p>
         </w:tc>
@@ -2339,7 +2339,7 @@
                 <w:sz w:val="18"/>
                 <w:szCs w:val="18"/>
               </w:rPr>
-              <w:t xml:space="preserve">4.9</w:t>
+              <w:t xml:space="preserve">5.0</w:t>
             </w:r>
           </w:p>
         </w:tc>
@@ -2403,7 +2403,7 @@
                 <w:sz w:val="18"/>
                 <w:szCs w:val="18"/>
               </w:rPr>
-              <w:t xml:space="preserve">Nuovo capitolo «News»: osservatorio sui crediti di carbonio volontari. Canali Bing News e Verra.</w:t>
+              <w:t xml:space="preserve">«News» diventa «Notizie CO2»; Google News attraverso il tramite; barra a LED nell'elenco e nella pratica. Pallino verde delle Notizie CO2 nuove. Notizie CO2: siti di notizie ambientali al posto di Google News. Notizie CO2: siti di notizie ambientali al posto di Google News.</w:t>
             </w:r>
           </w:p>
         </w:tc>
@@ -2473,7 +2473,7 @@
                 <w:sz w:val="18"/>
                 <w:szCs w:val="18"/>
               </w:rPr>
-              <w:t xml:space="preserve">4.8</w:t>
+              <w:t xml:space="preserve">4.9</w:t>
             </w:r>
           </w:p>
         </w:tc>
@@ -2539,7 +2539,7 @@
                 <w:sz w:val="18"/>
                 <w:szCs w:val="18"/>
               </w:rPr>
-              <w:t xml:space="preserve">Simulatore: il PDF scaricato riporta tutti i dati della pagina, i costi e i grafici; foglio Excel «Dati inseriti».</w:t>
+              <w:t xml:space="preserve">Nuovo capitolo «News»: osservatorio sui crediti di carbonio volontari. Canali Bing News e Verra.</w:t>
             </w:r>
           </w:p>
         </w:tc>
@@ -2609,7 +2609,7 @@
                 <w:sz w:val="18"/>
                 <w:szCs w:val="18"/>
               </w:rPr>
-              <w:t xml:space="preserve">4.7</w:t>
+              <w:t xml:space="preserve">4.8</w:t>
             </w:r>
           </w:p>
         </w:tc>
@@ -2673,7 +2673,7 @@
                 <w:sz w:val="18"/>
                 <w:szCs w:val="18"/>
               </w:rPr>
-              <w:t xml:space="preserve">Assistente per gli Operatori e domande sulla pratica aperta; menu dell'Operatore con il Simulatore.</w:t>
+              <w:t xml:space="preserve">Simulatore: il PDF scaricato riporta tutti i dati della pagina, i costi e i grafici; foglio Excel «Dati inseriti».</w:t>
             </w:r>
           </w:p>
         </w:tc>
@@ -2743,7 +2743,7 @@
                 <w:sz w:val="18"/>
                 <w:szCs w:val="18"/>
               </w:rPr>
-              <w:t xml:space="preserve">4.6</w:t>
+              <w:t xml:space="preserve">4.7</w:t>
             </w:r>
           </w:p>
         </w:tc>
@@ -2809,7 +2809,7 @@
                 <w:sz w:val="18"/>
                 <w:szCs w:val="18"/>
               </w:rPr>
-              <w:t xml:space="preserve">Capitolo «Backup automatico».</w:t>
+              <w:t xml:space="preserve">Assistente per gli Operatori e domande sulla pratica aperta; menu dell'Operatore con il Simulatore.</w:t>
             </w:r>
           </w:p>
         </w:tc>
@@ -2879,7 +2879,7 @@
                 <w:sz w:val="18"/>
                 <w:szCs w:val="18"/>
               </w:rPr>
-              <w:t xml:space="preserve">4.5</w:t>
+              <w:t xml:space="preserve">4.6</w:t>
             </w:r>
           </w:p>
         </w:tc>
@@ -2943,7 +2943,7 @@
                 <w:sz w:val="18"/>
                 <w:szCs w:val="18"/>
               </w:rPr>
-              <w:t xml:space="preserve">Nuovo documento «Registro issue e test» tra quelli scaricabili.</w:t>
+              <w:t xml:space="preserve">Capitolo «Backup automatico».</w:t>
             </w:r>
           </w:p>
         </w:tc>
@@ -3013,7 +3013,7 @@
                 <w:sz w:val="18"/>
                 <w:szCs w:val="18"/>
               </w:rPr>
-              <w:t xml:space="preserve">4.4</w:t>
+              <w:t xml:space="preserve">4.5</w:t>
             </w:r>
           </w:p>
         </w:tc>
@@ -3079,7 +3079,7 @@
                 <w:sz w:val="18"/>
                 <w:szCs w:val="18"/>
               </w:rPr>
-              <w:t xml:space="preserve">Collaudo V05: testo completo dei valori lunghi nell'Audit (Prima/Dopo, Tolto/Aggiunto), denominazione delle organizzazioni e ricerca sui valori cambiati; pagina «Account disattivato».</w:t>
+              <w:t xml:space="preserve">Nuovo documento «Registro issue e test» tra quelli scaricabili.</w:t>
             </w:r>
           </w:p>
         </w:tc>
@@ -3149,7 +3149,7 @@
                 <w:sz w:val="18"/>
                 <w:szCs w:val="18"/>
               </w:rPr>
-              <w:t xml:space="preserve">4.3</w:t>
+              <w:t xml:space="preserve">4.4</w:t>
             </w:r>
           </w:p>
         </w:tc>
@@ -3181,7 +3181,7 @@
                 <w:sz w:val="18"/>
                 <w:szCs w:val="18"/>
               </w:rPr>
-              <w:t xml:space="preserve">20/10/2026</w:t>
+              <w:t xml:space="preserve">21/10/2026</w:t>
             </w:r>
           </w:p>
         </w:tc>
@@ -3213,7 +3213,7 @@
                 <w:sz w:val="18"/>
                 <w:szCs w:val="18"/>
               </w:rPr>
-              <w:t xml:space="preserve">Correzioni del collaudo V01: import CSV della Banca Dati «tutto o niente» senza valori negativi, calcolo bloccato con dati non ammessi, buffer manuale 0-80%, conferma definitiva solo senza errori di coerenza, dati non ammessi nel simulatore e zero esplicito nei prezzi, colonna «Oggetto e modifiche» nell'Audit.</w:t>
+              <w:t xml:space="preserve">Collaudo V05: testo completo dei valori lunghi nell'Audit (Prima/Dopo, Tolto/Aggiunto), denominazione delle organizzazioni e ricerca sui valori cambiati; pagina «Account disattivato».</w:t>
             </w:r>
           </w:p>
         </w:tc>
@@ -3283,7 +3283,7 @@
                 <w:sz w:val="18"/>
                 <w:szCs w:val="18"/>
               </w:rPr>
-              <w:t xml:space="preserve">4.2</w:t>
+              <w:t xml:space="preserve">4.3</w:t>
             </w:r>
           </w:p>
         </w:tc>
@@ -3349,7 +3349,7 @@
                 <w:sz w:val="18"/>
                 <w:szCs w:val="18"/>
               </w:rPr>
-              <w:t xml:space="preserve">Nuovo capitolo «Sicurezza»: inattività, avvisi, protezioni del sito e del database.</w:t>
+              <w:t xml:space="preserve">Correzioni del collaudo V01: import CSV della Banca Dati «tutto o niente» senza valori negativi, calcolo bloccato con dati non ammessi, buffer manuale 0-80%, conferma definitiva solo senza errori di coerenza, dati non ammessi nel simulatore e zero esplicito nei prezzi, colonna «Oggetto e modifiche» nell'Audit.</w:t>
             </w:r>
           </w:p>
         </w:tc>
@@ -3419,7 +3419,7 @@
                 <w:sz w:val="18"/>
                 <w:szCs w:val="18"/>
               </w:rPr>
-              <w:t xml:space="preserve">4.1</w:t>
+              <w:t xml:space="preserve">4.2</w:t>
             </w:r>
           </w:p>
         </w:tc>
@@ -3483,7 +3483,7 @@
                 <w:sz w:val="18"/>
                 <w:szCs w:val="18"/>
               </w:rPr>
-              <w:t xml:space="preserve">Voci di menu degli enti aggiornate.</w:t>
+              <w:t xml:space="preserve">Nuovo capitolo «Sicurezza»: inattività, avvisi, protezioni del sito e del database.</w:t>
             </w:r>
           </w:p>
         </w:tc>
@@ -3553,7 +3553,7 @@
                 <w:sz w:val="18"/>
                 <w:szCs w:val="18"/>
               </w:rPr>
-              <w:t xml:space="preserve">4.0</w:t>
+              <w:t xml:space="preserve">4.1</w:t>
             </w:r>
           </w:p>
         </w:tc>
@@ -3619,7 +3619,7 @@
                 <w:sz w:val="18"/>
                 <w:szCs w:val="18"/>
               </w:rPr>
-              <w:t xml:space="preserve">Nuovo ordine del menu; la sezione si chiama «Audit User». Voce «Marketplaces» in arrivo.</w:t>
+              <w:t xml:space="preserve">Voci di menu degli enti aggiornate.</w:t>
             </w:r>
           </w:p>
         </w:tc>
@@ -3689,7 +3689,7 @@
                 <w:sz w:val="18"/>
                 <w:szCs w:val="18"/>
               </w:rPr>
-              <w:t xml:space="preserve">3.9</w:t>
+              <w:t xml:space="preserve">4.0</w:t>
             </w:r>
           </w:p>
         </w:tc>
@@ -3753,7 +3753,7 @@
                 <w:sz w:val="18"/>
                 <w:szCs w:val="18"/>
               </w:rPr>
-              <w:t xml:space="preserve">Nuovo capitolo «Audit trail user».</w:t>
+              <w:t xml:space="preserve">Nuovo ordine del menu; la sezione si chiama «Audit User». Voce «Marketplaces» in arrivo.</w:t>
             </w:r>
           </w:p>
         </w:tc>
@@ -3823,7 +3823,7 @@
                 <w:sz w:val="18"/>
                 <w:szCs w:val="18"/>
               </w:rPr>
-              <w:t xml:space="preserve">3.8</w:t>
+              <w:t xml:space="preserve">3.9</w:t>
             </w:r>
           </w:p>
         </w:tc>
@@ -3889,7 +3889,7 @@
                 <w:sz w:val="18"/>
                 <w:szCs w:val="18"/>
               </w:rPr>
-              <w:t xml:space="preserve">Utenti online; PDF ed Excel del simulatore; messaggi d'errore dell'assistente.</w:t>
+              <w:t xml:space="preserve">Nuovo capitolo «Audit trail user».</w:t>
             </w:r>
           </w:p>
         </w:tc>
@@ -3959,7 +3959,7 @@
                 <w:sz w:val="18"/>
                 <w:szCs w:val="18"/>
               </w:rPr>
-              <w:t xml:space="preserve">3.7</w:t>
+              <w:t xml:space="preserve">3.8</w:t>
             </w:r>
           </w:p>
         </w:tc>
@@ -3991,7 +3991,7 @@
                 <w:sz w:val="18"/>
                 <w:szCs w:val="18"/>
               </w:rPr>
-              <w:t xml:space="preserve">19/10/2026</w:t>
+              <w:t xml:space="preserve">20/10/2026</w:t>
             </w:r>
           </w:p>
         </w:tc>
@@ -4023,7 +4023,7 @@
                 <w:sz w:val="18"/>
                 <w:szCs w:val="18"/>
               </w:rPr>
-              <w:t xml:space="preserve">Assistente virtuale: messaggio «Un attimo…» durante l'attesa.</w:t>
+              <w:t xml:space="preserve">Utenti online; PDF ed Excel del simulatore; messaggi d'errore dell'assistente.</w:t>
             </w:r>
           </w:p>
         </w:tc>
@@ -4093,7 +4093,7 @@
                 <w:sz w:val="18"/>
                 <w:szCs w:val="18"/>
               </w:rPr>
-              <w:t xml:space="preserve">3.6</w:t>
+              <w:t xml:space="preserve">3.7</w:t>
             </w:r>
           </w:p>
         </w:tc>
@@ -4159,7 +4159,7 @@
                 <w:sz w:val="18"/>
                 <w:szCs w:val="18"/>
               </w:rPr>
-              <w:t xml:space="preserve">Assistente virtuale attivo: chiave legata a uno spazio di lavoro, crediti e consumi.</w:t>
+              <w:t xml:space="preserve">Assistente virtuale: messaggio «Un attimo…» durante l'attesa.</w:t>
             </w:r>
           </w:p>
         </w:tc>
@@ -4229,7 +4229,7 @@
                 <w:sz w:val="18"/>
                 <w:szCs w:val="18"/>
               </w:rPr>
-              <w:t xml:space="preserve">3.5</w:t>
+              <w:t xml:space="preserve">3.6</w:t>
             </w:r>
           </w:p>
         </w:tc>
@@ -4293,7 +4293,7 @@
                 <w:sz w:val="18"/>
                 <w:szCs w:val="18"/>
               </w:rPr>
-              <w:t xml:space="preserve">Assistente virtuale; documenti ufficiali del Programma nella Documentazione.</w:t>
+              <w:t xml:space="preserve">Assistente virtuale attivo: chiave legata a uno spazio di lavoro, crediti e consumi.</w:t>
             </w:r>
           </w:p>
         </w:tc>
@@ -4363,7 +4363,7 @@
                 <w:sz w:val="18"/>
                 <w:szCs w:val="18"/>
               </w:rPr>
-              <w:t xml:space="preserve">3.4</w:t>
+              <w:t xml:space="preserve">3.5</w:t>
             </w:r>
           </w:p>
         </w:tc>
@@ -4429,7 +4429,7 @@
                 <w:sz w:val="18"/>
                 <w:szCs w:val="18"/>
               </w:rPr>
-              <w:t xml:space="preserve">Presentazione di riepilogo nella pagina Documentazione.</w:t>
+              <w:t xml:space="preserve">Assistente virtuale; documenti ufficiali del Programma nella Documentazione.</w:t>
             </w:r>
           </w:p>
         </w:tc>
@@ -4499,7 +4499,7 @@
                 <w:sz w:val="18"/>
                 <w:szCs w:val="18"/>
               </w:rPr>
-              <w:t xml:space="preserve">3.3</w:t>
+              <w:t xml:space="preserve">3.4</w:t>
             </w:r>
           </w:p>
         </w:tc>
@@ -4563,7 +4563,7 @@
                 <w:sz w:val="18"/>
                 <w:szCs w:val="18"/>
               </w:rPr>
-              <w:t xml:space="preserve">Ordinamento di tutte le tabelle e degli elenchi.</w:t>
+              <w:t xml:space="preserve">Presentazione di riepilogo nella pagina Documentazione.</w:t>
             </w:r>
           </w:p>
         </w:tc>
@@ -4633,7 +4633,7 @@
                 <w:sz w:val="18"/>
                 <w:szCs w:val="18"/>
               </w:rPr>
-              <w:t xml:space="preserve">3.2</w:t>
+              <w:t xml:space="preserve">3.3</w:t>
             </w:r>
           </w:p>
         </w:tc>
@@ -4699,7 +4699,7 @@
                 <w:sz w:val="18"/>
                 <w:szCs w:val="18"/>
               </w:rPr>
-              <w:t xml:space="preserve">Simulatore: metodo di stima per utenza (solo utenze virtuose), buffer del Capitolo 7, taratura.</w:t>
+              <w:t xml:space="preserve">Ordinamento di tutte le tabelle e degli elenchi.</w:t>
             </w:r>
           </w:p>
         </w:tc>
@@ -4769,7 +4769,7 @@
                 <w:sz w:val="18"/>
                 <w:szCs w:val="18"/>
               </w:rPr>
-              <w:t xml:space="preserve">3.1</w:t>
+              <w:t xml:space="preserve">3.2</w:t>
             </w:r>
           </w:p>
         </w:tc>
@@ -4833,7 +4833,7 @@
                 <w:sz w:val="18"/>
                 <w:szCs w:val="18"/>
               </w:rPr>
-              <w:t xml:space="preserve">Cruscotto diventa Dashboard; barra a LED delle 7 fasi per ogni pratica.</w:t>
+              <w:t xml:space="preserve">Simulatore: metodo di stima per utenza (solo utenze virtuose), buffer del Capitolo 7, taratura.</w:t>
             </w:r>
           </w:p>
         </w:tc>
@@ -4903,7 +4903,7 @@
                 <w:sz w:val="18"/>
                 <w:szCs w:val="18"/>
               </w:rPr>
-              <w:t xml:space="preserve">3.0</w:t>
+              <w:t xml:space="preserve">3.1</w:t>
             </w:r>
           </w:p>
         </w:tc>
@@ -4969,7 +4969,7 @@
                 <w:sz w:val="18"/>
                 <w:szCs w:val="18"/>
               </w:rPr>
-              <w:t xml:space="preserve">Eliminazione degli utenti che non hanno mai operato (script 30).</w:t>
+              <w:t xml:space="preserve">Cruscotto diventa Dashboard; barra a LED delle 7 fasi per ogni pratica.</w:t>
             </w:r>
           </w:p>
         </w:tc>
@@ -5039,7 +5039,7 @@
                 <w:sz w:val="18"/>
                 <w:szCs w:val="18"/>
               </w:rPr>
-              <w:t xml:space="preserve">2.9</w:t>
+              <w:t xml:space="preserve">3.0</w:t>
             </w:r>
           </w:p>
         </w:tc>
@@ -5103,7 +5103,7 @@
                 <w:sz w:val="18"/>
                 <w:szCs w:val="18"/>
               </w:rPr>
-              <w:t xml:space="preserve">Email automatica con le credenziali al nuovo utente e alla reimpostazione della password.</w:t>
+              <w:t xml:space="preserve">Eliminazione degli utenti che non hanno mai operato (script 30).</w:t>
             </w:r>
           </w:p>
         </w:tc>
@@ -5173,7 +5173,7 @@
                 <w:sz w:val="18"/>
                 <w:szCs w:val="18"/>
               </w:rPr>
-              <w:t xml:space="preserve">2.8</w:t>
+              <w:t xml:space="preserve">2.9</w:t>
             </w:r>
           </w:p>
         </w:tc>
@@ -5239,7 +5239,7 @@
                 <w:sz w:val="18"/>
                 <w:szCs w:val="18"/>
               </w:rPr>
-              <w:t xml:space="preserve">Più Amministratori con accesso completo; Amministratore principale protetto (script 29).</w:t>
+              <w:t xml:space="preserve">Email automatica con le credenziali al nuovo utente e alla reimpostazione della password.</w:t>
             </w:r>
           </w:p>
         </w:tc>
@@ -5309,7 +5309,7 @@
                 <w:sz w:val="18"/>
                 <w:szCs w:val="18"/>
               </w:rPr>
-              <w:t xml:space="preserve">2.7</w:t>
+              <w:t xml:space="preserve">2.8</w:t>
             </w:r>
           </w:p>
         </w:tc>
@@ -5373,7 +5373,7 @@
                 <w:sz w:val="18"/>
                 <w:szCs w:val="18"/>
               </w:rPr>
-              <w:t xml:space="preserve">Simulatore: costi per il Comune secondo il Caso 1 (progetto volontario) o il Caso 2 (progetto obbligatorio da bando).</w:t>
+              <w:t xml:space="preserve">Più Amministratori con accesso completo; Amministratore principale protetto (script 29).</w:t>
             </w:r>
           </w:p>
         </w:tc>
@@ -5443,7 +5443,7 @@
                 <w:sz w:val="18"/>
                 <w:szCs w:val="18"/>
               </w:rPr>
-              <w:t xml:space="preserve">2.6</w:t>
+              <w:t xml:space="preserve">2.7</w:t>
             </w:r>
           </w:p>
         </w:tc>
@@ -5509,7 +5509,7 @@
                 <w:sz w:val="18"/>
                 <w:szCs w:val="18"/>
               </w:rPr>
-              <w:t xml:space="preserve">Simulatore: valore del credito anno per anno, proposto 32 €.</w:t>
+              <w:t xml:space="preserve">Simulatore: costi per il Comune secondo il Caso 1 (progetto volontario) o il Caso 2 (progetto obbligatorio da bando).</w:t>
             </w:r>
           </w:p>
         </w:tc>
@@ -5579,7 +5579,7 @@
                 <w:sz w:val="18"/>
                 <w:szCs w:val="18"/>
               </w:rPr>
-              <w:t xml:space="preserve">2.5</w:t>
+              <w:t xml:space="preserve">2.6</w:t>
             </w:r>
           </w:p>
         </w:tc>
@@ -5643,7 +5643,7 @@
                 <w:sz w:val="18"/>
                 <w:szCs w:val="18"/>
               </w:rPr>
-              <w:t xml:space="preserve">Simulatore: simulazione economica con valore unitario del credito e costi per il Comune (contratti tipo della Fondazione, Schema tariffario).</w:t>
+              <w:t xml:space="preserve">Simulatore: valore del credito anno per anno, proposto 32 €.</w:t>
             </w:r>
           </w:p>
         </w:tc>
@@ -5713,7 +5713,7 @@
                 <w:sz w:val="18"/>
                 <w:szCs w:val="18"/>
               </w:rPr>
-              <w:t xml:space="preserve">2.4</w:t>
+              <w:t xml:space="preserve">2.5</w:t>
             </w:r>
           </w:p>
         </w:tc>
@@ -5779,7 +5779,7 @@
                 <w:sz w:val="18"/>
                 <w:szCs w:val="18"/>
               </w:rPr>
-              <w:t xml:space="preserve">Simulatore: riferimento sempre alla soglia del 65% di differenziata e controllo dei valori fuori scala.</w:t>
+              <w:t xml:space="preserve">Simulatore: simulazione economica con valore unitario del credito e costi per il Comune (contratti tipo della Fondazione, Schema tariffario).</w:t>
             </w:r>
           </w:p>
         </w:tc>
@@ -5849,7 +5849,7 @@
                 <w:sz w:val="18"/>
                 <w:szCs w:val="18"/>
               </w:rPr>
-              <w:t xml:space="preserve">2.3</w:t>
+              <w:t xml:space="preserve">2.4</w:t>
             </w:r>
           </w:p>
         </w:tc>
@@ -5913,7 +5913,7 @@
                 <w:sz w:val="18"/>
                 <w:szCs w:val="18"/>
               </w:rPr>
-              <w:t xml:space="preserve">Simulatore conforme al modello CWP: scenario di riferimento dello Standard 4.8.1, situazione attuale, conformità.</w:t>
+              <w:t xml:space="preserve">Simulatore: riferimento sempre alla soglia del 65% di differenziata e controllo dei valori fuori scala.</w:t>
             </w:r>
           </w:p>
         </w:tc>
@@ -5983,7 +5983,7 @@
                 <w:sz w:val="18"/>
                 <w:szCs w:val="18"/>
               </w:rPr>
-              <w:t xml:space="preserve">2.2</w:t>
+              <w:t xml:space="preserve">2.3</w:t>
             </w:r>
           </w:p>
         </w:tc>
@@ -6049,7 +6049,7 @@
                 <w:sz w:val="18"/>
                 <w:szCs w:val="18"/>
               </w:rPr>
-              <w:t xml:space="preserve">Nuovo capitolo «Simulatore di scenari»: creazione, anno base, obiettivi annui, risultati, modello di stima.</w:t>
+              <w:t xml:space="preserve">Simulatore conforme al modello CWP: scenario di riferimento dello Standard 4.8.1, situazione attuale, conformità.</w:t>
             </w:r>
           </w:p>
         </w:tc>
@@ -6119,7 +6119,7 @@
                 <w:sz w:val="18"/>
                 <w:szCs w:val="18"/>
               </w:rPr>
-              <w:t xml:space="preserve">2.1</w:t>
+              <w:t xml:space="preserve">2.2</w:t>
             </w:r>
           </w:p>
         </w:tc>
@@ -6183,7 +6183,7 @@
                 <w:sz w:val="18"/>
                 <w:szCs w:val="18"/>
               </w:rPr>
-              <w:t xml:space="preserve">Funzioni in arrivo: simulatore di scenari (7, 10 o 21 anni, obiettivi annui, % di differenziata e crediti stimati) e assistente virtuale (Claude).</w:t>
+              <w:t xml:space="preserve">Nuovo capitolo «Simulatore di scenari»: creazione, anno base, obiettivi annui, risultati, modello di stima.</w:t>
             </w:r>
           </w:p>
         </w:tc>
@@ -6253,7 +6253,7 @@
                 <w:sz w:val="18"/>
                 <w:szCs w:val="18"/>
               </w:rPr>
-              <w:t xml:space="preserve">2.0</w:t>
+              <w:t xml:space="preserve">2.1</w:t>
             </w:r>
           </w:p>
         </w:tc>
@@ -6319,7 +6319,7 @@
                 <w:sz w:val="18"/>
                 <w:szCs w:val="18"/>
               </w:rPr>
-              <w:t xml:space="preserve">Copie di sicurezza e ripristino: rimando alle Istruzioni di ripristino e punti essenziali (capitolo Manutenzione ed emergenze).</w:t>
+              <w:t xml:space="preserve">Funzioni in arrivo: simulatore di scenari (7, 10 o 21 anni, obiettivi annui, % di differenziata e crediti stimati) e assistente virtuale (Claude).</w:t>
             </w:r>
           </w:p>
         </w:tc>
@@ -6389,7 +6389,7 @@
                 <w:sz w:val="18"/>
                 <w:szCs w:val="18"/>
               </w:rPr>
-              <w:t xml:space="preserve">1.9</w:t>
+              <w:t xml:space="preserve">2.0</w:t>
             </w:r>
           </w:p>
         </w:tc>
@@ -6453,7 +6453,7 @@
                 <w:sz w:val="18"/>
                 <w:szCs w:val="18"/>
               </w:rPr>
-              <w:t xml:space="preserve">Fondazione Operate soggetto promotore del programma (esclusiva conferita da Wastelab).</w:t>
+              <w:t xml:space="preserve">Copie di sicurezza e ripristino: rimando alle Istruzioni di ripristino e punti essenziali (capitolo Manutenzione ed emergenze).</w:t>
             </w:r>
           </w:p>
         </w:tc>
@@ -6523,7 +6523,7 @@
                 <w:sz w:val="18"/>
                 <w:szCs w:val="18"/>
               </w:rPr>
-              <w:t xml:space="preserve">1.8</w:t>
+              <w:t xml:space="preserve">1.9</w:t>
             </w:r>
           </w:p>
         </w:tc>
@@ -6589,7 +6589,7 @@
                 <w:sz w:val="18"/>
                 <w:szCs w:val="18"/>
               </w:rPr>
-              <w:t xml:space="preserve">PEC del Programma e documenti ufficiali già pubblicati sulla pagina pubblica.</w:t>
+              <w:t xml:space="preserve">Fondazione Operate soggetto promotore del programma (esclusiva conferita da Wastelab).</w:t>
             </w:r>
           </w:p>
         </w:tc>
@@ -6659,7 +6659,7 @@
                 <w:sz w:val="18"/>
                 <w:szCs w:val="18"/>
               </w:rPr>
-              <w:t xml:space="preserve">1.7</w:t>
+              <w:t xml:space="preserve">1.8</w:t>
             </w:r>
           </w:p>
         </w:tc>
@@ -6691,7 +6691,7 @@
                 <w:sz w:val="18"/>
                 <w:szCs w:val="18"/>
               </w:rPr>
-              <w:t xml:space="preserve">18/10/2026</w:t>
+              <w:t xml:space="preserve">19/10/2026</w:t>
             </w:r>
           </w:p>
         </w:tc>
@@ -6723,7 +6723,7 @@
                 <w:sz w:val="18"/>
                 <w:szCs w:val="18"/>
               </w:rPr>
-              <w:t xml:space="preserve">Allineamento ai documenti ufficiali del Programma (script 22-24): Rapporto a 7 fasi, feedback pubblico, stati del Programma, dati del progetto e territorio ISTAT, ritiro e rientro, account unico e delegati, registri, tariffe e sospensione, accuratezza e accertamenti, informazioni del Programma e metodologie, modelli pubblici; nuovi capitoli Crediti emessi, Reclami, Pagina pubblica; qualità dei dati nel calcolo.</w:t>
+              <w:t xml:space="preserve">PEC del Programma e documenti ufficiali già pubblicati sulla pagina pubblica.</w:t>
             </w:r>
           </w:p>
         </w:tc>
@@ -6793,7 +6793,7 @@
                 <w:sz w:val="18"/>
                 <w:szCs w:val="18"/>
               </w:rPr>
-              <w:t xml:space="preserve">1.6</w:t>
+              <w:t xml:space="preserve">1.7</w:t>
             </w:r>
           </w:p>
         </w:tc>
@@ -6859,7 +6859,7 @@
                 <w:sz w:val="18"/>
                 <w:szCs w:val="18"/>
               </w:rPr>
-              <w:t xml:space="preserve">Calcolo crediti: descrizione corretta del buffer (somma delle voci delle Tabelle 15 e 16, più il 20% con le sole utenze virtuose, al massimo 80%).</w:t>
+              <w:t xml:space="preserve">Allineamento ai documenti ufficiali del Programma (script 22-24): Rapporto a 7 fasi, feedback pubblico, stati del Programma, dati del progetto e territorio ISTAT, ritiro e rientro, account unico e delegati, registri, tariffe e sospensione, accuratezza e accertamenti, informazioni del Programma e metodologie, modelli pubblici; nuovi capitoli Crediti emessi, Reclami, Pagina pubblica; qualità dei dati nel calcolo.</w:t>
             </w:r>
           </w:p>
         </w:tc>
@@ -6929,7 +6929,7 @@
                 <w:sz w:val="18"/>
                 <w:szCs w:val="18"/>
               </w:rPr>
-              <w:t xml:space="preserve">1.5</w:t>
+              <w:t xml:space="preserve">1.6</w:t>
             </w:r>
           </w:p>
         </w:tc>
@@ -6993,7 +6993,7 @@
                 <w:sz w:val="18"/>
                 <w:szCs w:val="18"/>
               </w:rPr>
-              <w:t xml:space="preserve">Nuova pagina Anagrafiche (Organizzazioni ed Enti, anche per gli Operatori); Rapporti con 4 fasi e durate proprie; documenti richiesti per fase; consultazione con documento bloccato, osservazioni numerate e motivazione; conservazione per 10 anni; fascicolo con riepilogo PDF e nuove cartelle.</w:t>
+              <w:t xml:space="preserve">Calcolo crediti: descrizione corretta del buffer (somma delle voci delle Tabelle 15 e 16, più il 20% con le sole utenze virtuose, al massimo 80%).</w:t>
             </w:r>
           </w:p>
         </w:tc>
@@ -7063,7 +7063,7 @@
                 <w:sz w:val="18"/>
                 <w:szCs w:val="18"/>
               </w:rPr>
-              <w:t xml:space="preserve">1.4</w:t>
+              <w:t xml:space="preserve">1.5</w:t>
             </w:r>
           </w:p>
         </w:tc>
@@ -7129,7 +7129,7 @@
                 <w:sz w:val="18"/>
                 <w:szCs w:val="18"/>
               </w:rPr>
-              <w:t xml:space="preserve">Calcolo crediti: il risultato si azzera quando cambiano dati o Banca Dati Utenze, conferma solo dopo un nuovo «Calcola». Gestione utenti: password temporanea di almeno 10 caratteri con lettere e numeri, creazione annullata se non va a buon fine, nessun accesso ai dati prima del cambio password.</w:t>
+              <w:t xml:space="preserve">Nuova pagina Anagrafiche (Organizzazioni ed Enti, anche per gli Operatori); Rapporti con 4 fasi e durate proprie; documenti richiesti per fase; consultazione con documento bloccato, osservazioni numerate e motivazione; conservazione per 10 anni; fascicolo con riepilogo PDF e nuove cartelle.</w:t>
             </w:r>
           </w:p>
         </w:tc>
@@ -7199,7 +7199,7 @@
                 <w:sz w:val="18"/>
                 <w:szCs w:val="18"/>
               </w:rPr>
-              <w:t xml:space="preserve">1.3</w:t>
+              <w:t xml:space="preserve">1.4</w:t>
             </w:r>
           </w:p>
         </w:tc>
@@ -7263,7 +7263,7 @@
                 <w:sz w:val="18"/>
                 <w:szCs w:val="18"/>
               </w:rPr>
-              <w:t xml:space="preserve">Rapporto di calcolo in PDF, archiviazione nella pratica, numero di registro, registro dei crediti.</w:t>
+              <w:t xml:space="preserve">Calcolo crediti: il risultato si azzera quando cambiano dati o Banca Dati Utenze, conferma solo dopo un nuovo «Calcola». Gestione utenti: password temporanea di almeno 10 caratteri con lettere e numeri, creazione annullata se non va a buon fine, nessun accesso ai dati prima del cambio password.</w:t>
             </w:r>
           </w:p>
         </w:tc>
@@ -7333,7 +7333,7 @@
                 <w:sz w:val="18"/>
                 <w:szCs w:val="18"/>
               </w:rPr>
-              <w:t xml:space="preserve">1.2</w:t>
+              <w:t xml:space="preserve">1.3</w:t>
             </w:r>
           </w:p>
         </w:tc>
@@ -7399,7 +7399,7 @@
                 <w:sz w:val="18"/>
                 <w:szCs w:val="18"/>
               </w:rPr>
-              <w:t xml:space="preserve">Calcolo crediti: importare il tracciato nel calcolo (dai documenti della pratica o dal computer), singole letture, blocco dei dati personali, controlli di coerenza.</w:t>
+              <w:t xml:space="preserve">Rapporto di calcolo in PDF, archiviazione nella pratica, numero di registro, registro dei crediti.</w:t>
             </w:r>
           </w:p>
         </w:tc>
@@ -7469,7 +7469,7 @@
                 <w:sz w:val="18"/>
                 <w:szCs w:val="18"/>
               </w:rPr>
-              <w:t xml:space="preserve">1.1</w:t>
+              <w:t xml:space="preserve">1.2</w:t>
             </w:r>
           </w:p>
         </w:tc>
@@ -7533,7 +7533,7 @@
                 <w:sz w:val="18"/>
                 <w:szCs w:val="18"/>
               </w:rPr>
-              <w:t xml:space="preserve">Note di fase, Ente di Validazione della pratica, consultazione sulla pagina pubblica con conferma dell'email, moderazione con autori e allegati, errata corrige; nuovo capitolo Messaggi con il Comune; pagamenti visibili al Comune; Impostazioni: Enti di Validazione e Modelli di documento; notifiche aggiornate.</w:t>
+              <w:t xml:space="preserve">Calcolo crediti: importare il tracciato nel calcolo (dai documenti della pratica o dal computer), singole letture, blocco dei dati personali, controlli di coerenza.</w:t>
             </w:r>
           </w:p>
         </w:tc>
@@ -7603,6 +7603,142 @@
                 <w:sz w:val="18"/>
                 <w:szCs w:val="18"/>
               </w:rPr>
+              <w:t xml:space="preserve">1.1</w:t>
+            </w:r>
+          </w:p>
+        </w:tc>
+        <w:tc>
+          <w:tcPr>
+            <w:tcW w:type="dxa" w:w="1300"/>
+            <w:tcBorders>
+              <w:top w:val="single" w:color="D9D4C5" w:sz="4"/>
+              <w:left w:val="single" w:color="D9D4C5" w:sz="4"/>
+              <w:bottom w:val="single" w:color="D9D4C5" w:sz="4"/>
+              <w:right w:val="single" w:color="D9D4C5" w:sz="4"/>
+            </w:tcBorders>
+            <w:shd w:fill="F6F4EE" w:color="auto" w:val="clear"/>
+            <w:tcMar>
+              <w:top w:type="dxa" w:w="70"/>
+              <w:left w:type="dxa" w:w="110"/>
+              <w:bottom w:type="dxa" w:w="70"/>
+              <w:right w:type="dxa" w:w="110"/>
+            </w:tcMar>
+            <w:vAlign w:val="center"/>
+          </w:tcPr>
+          <w:p>
+            <w:pPr>
+              <w:spacing w:after="0" w:before="0"/>
+            </w:pPr>
+            <w:r>
+              <w:rPr>
+                <w:rFonts w:ascii="Arial" w:cs="Arial" w:eastAsia="Arial" w:hAnsi="Arial"/>
+                <w:color w:val="1B2118"/>
+                <w:sz w:val="18"/>
+                <w:szCs w:val="18"/>
+              </w:rPr>
+              <w:t xml:space="preserve">18/10/2026</w:t>
+            </w:r>
+          </w:p>
+        </w:tc>
+        <w:tc>
+          <w:tcPr>
+            <w:tcW w:type="dxa" w:w="5538"/>
+            <w:tcBorders>
+              <w:top w:val="single" w:color="D9D4C5" w:sz="4"/>
+              <w:left w:val="single" w:color="D9D4C5" w:sz="4"/>
+              <w:bottom w:val="single" w:color="D9D4C5" w:sz="4"/>
+              <w:right w:val="single" w:color="D9D4C5" w:sz="4"/>
+            </w:tcBorders>
+            <w:shd w:fill="F6F4EE" w:color="auto" w:val="clear"/>
+            <w:tcMar>
+              <w:top w:type="dxa" w:w="70"/>
+              <w:left w:type="dxa" w:w="110"/>
+              <w:bottom w:type="dxa" w:w="70"/>
+              <w:right w:type="dxa" w:w="110"/>
+            </w:tcMar>
+            <w:vAlign w:val="center"/>
+          </w:tcPr>
+          <w:p>
+            <w:pPr>
+              <w:spacing w:after="0" w:before="0"/>
+            </w:pPr>
+            <w:r>
+              <w:rPr>
+                <w:rFonts w:ascii="Arial" w:cs="Arial" w:eastAsia="Arial" w:hAnsi="Arial"/>
+                <w:color w:val="1B2118"/>
+                <w:sz w:val="18"/>
+                <w:szCs w:val="18"/>
+              </w:rPr>
+              <w:t xml:space="preserve">Note di fase, Ente di Validazione della pratica, consultazione sulla pagina pubblica con conferma dell'email, moderazione con autori e allegati, errata corrige; nuovo capitolo Messaggi con il Comune; pagamenti visibili al Comune; Impostazioni: Enti di Validazione e Modelli di documento; notifiche aggiornate.</w:t>
+            </w:r>
+          </w:p>
+        </w:tc>
+        <w:tc>
+          <w:tcPr>
+            <w:tcW w:type="dxa" w:w="2000"/>
+            <w:tcBorders>
+              <w:top w:val="single" w:color="D9D4C5" w:sz="4"/>
+              <w:left w:val="single" w:color="D9D4C5" w:sz="4"/>
+              <w:bottom w:val="single" w:color="D9D4C5" w:sz="4"/>
+              <w:right w:val="single" w:color="D9D4C5" w:sz="4"/>
+            </w:tcBorders>
+            <w:shd w:fill="F6F4EE" w:color="auto" w:val="clear"/>
+            <w:tcMar>
+              <w:top w:type="dxa" w:w="70"/>
+              <w:left w:type="dxa" w:w="110"/>
+              <w:bottom w:type="dxa" w:w="70"/>
+              <w:right w:type="dxa" w:w="110"/>
+            </w:tcMar>
+            <w:vAlign w:val="center"/>
+          </w:tcPr>
+          <w:p>
+            <w:pPr>
+              <w:spacing w:after="0" w:before="0"/>
+            </w:pPr>
+            <w:r>
+              <w:rPr>
+                <w:rFonts w:ascii="Arial" w:cs="Arial" w:eastAsia="Arial" w:hAnsi="Arial"/>
+                <w:color w:val="1B2118"/>
+                <w:sz w:val="18"/>
+                <w:szCs w:val="18"/>
+              </w:rPr>
+              <w:t xml:space="preserve">Fondazione Operate</w:t>
+            </w:r>
+          </w:p>
+        </w:tc>
+      </w:tr>
+      <w:tr>
+        <w:trPr>
+          <w:cantSplit/>
+        </w:trPr>
+        <w:tc>
+          <w:tcPr>
+            <w:tcW w:type="dxa" w:w="800"/>
+            <w:tcBorders>
+              <w:top w:val="single" w:color="D9D4C5" w:sz="4"/>
+              <w:left w:val="single" w:color="D9D4C5" w:sz="4"/>
+              <w:bottom w:val="single" w:color="D9D4C5" w:sz="4"/>
+              <w:right w:val="single" w:color="D9D4C5" w:sz="4"/>
+            </w:tcBorders>
+            <w:tcMar>
+              <w:top w:type="dxa" w:w="70"/>
+              <w:left w:type="dxa" w:w="110"/>
+              <w:bottom w:type="dxa" w:w="70"/>
+              <w:right w:type="dxa" w:w="110"/>
+            </w:tcMar>
+            <w:vAlign w:val="center"/>
+          </w:tcPr>
+          <w:p>
+            <w:pPr>
+              <w:spacing w:after="0" w:before="0"/>
+            </w:pPr>
+            <w:r>
+              <w:rPr>
+                <w:rFonts w:ascii="Arial" w:cs="Arial" w:eastAsia="Arial" w:hAnsi="Arial"/>
+                <w:color w:val="1B2118"/>
+                <w:sz w:val="18"/>
+                <w:szCs w:val="18"/>
+              </w:rPr>
               <w:t xml:space="preserve">1.0</w:t>
             </w:r>
           </w:p>
@@ -7616,7 +7752,6 @@
               <w:bottom w:val="single" w:color="D9D4C5" w:sz="4"/>
               <w:right w:val="single" w:color="D9D4C5" w:sz="4"/>
             </w:tcBorders>
-            <w:shd w:fill="F6F4EE" w:color="auto" w:val="clear"/>
             <w:tcMar>
               <w:top w:type="dxa" w:w="70"/>
               <w:left w:type="dxa" w:w="110"/>
@@ -7649,7 +7784,6 @@
               <w:bottom w:val="single" w:color="D9D4C5" w:sz="4"/>
               <w:right w:val="single" w:color="D9D4C5" w:sz="4"/>
             </w:tcBorders>
-            <w:shd w:fill="F6F4EE" w:color="auto" w:val="clear"/>
             <w:tcMar>
               <w:top w:type="dxa" w:w="70"/>
               <w:left w:type="dxa" w:w="110"/>
@@ -7682,7 +7816,6 @@
               <w:bottom w:val="single" w:color="D9D4C5" w:sz="4"/>
               <w:right w:val="single" w:color="D9D4C5" w:sz="4"/>
             </w:tcBorders>
-            <w:shd w:fill="F6F4EE" w:color="auto" w:val="clear"/>
             <w:tcMar>
               <w:top w:type="dxa" w:w="70"/>
               <w:left w:type="dxa" w:w="110"/>
@@ -7724,7 +7857,7 @@
           <w:sz w:val="20"/>
           <w:szCs w:val="20"/>
         </w:rPr>
-        <w:t xml:space="preserve">Questo documento descrive il portale alla revisione 6.1 del 23/10/2026. A ogni modifica del portale il manuale viene aggiornato e la revisione incrementata; la versione corrente si scarica dall'area Documentazione del portale (solo Amministratori).</w:t>
+        <w:t xml:space="preserve">Questo documento descrive il portale alla revisione 6.2 del 23/10/2026. A ogni modifica del portale il manuale viene aggiornato e la revisione incrementata; la versione corrente si scarica dall'area Documentazione del portale (solo Amministratori).</w:t>
       </w:r>
     </w:p>
     <w:p>
@@ -10633,7 +10766,7 @@
         </w:rPr>
         <w:t xml:space="preserve">Si accede da </w:t>
       </w:r>
-      <w:hyperlink w:history="1" r:id="rIdzamcfmirci-ykbtkhlx2v">
+      <w:hyperlink w:history="1" r:id="rIdacdmow6cotgjuvonipi1_">
         <w:r>
           <w:rPr>
             <w:rFonts w:ascii="Arial" w:cs="Arial" w:eastAsia="Arial" w:hAnsi="Arial"/>
@@ -51423,7 +51556,7 @@
           <w:sz w:val="21"/>
           <w:szCs w:val="21"/>
         </w:rPr>
-        <w:t xml:space="preserve"> (qualche minuto: elenco ISTAT, poi IndicePA e gli uffici dei Comuni) e </w:t>
+        <w:t xml:space="preserve"> (qualche minuto: elenco ISTAT, poi IndicePA e gli uffici dei Comuni a blocchi di 400) e </w:t>
       </w:r>
       <w:r>
         <w:rPr>
@@ -51443,7 +51576,7 @@
           <w:sz w:val="21"/>
           <w:szCs w:val="21"/>
         </w:rPr>
-        <w:t xml:space="preserve"> (tutte le sezioni dell'Albo o una sola). Il diario mostra cosa è stato letto. Le modifiche fatte a mano restano, salvo nuovi valori dalla stessa fonte. Per i gestori privati le attività e i referenti si completano dalle schede, verificando sui loro siti.</w:t>
+        <w:t xml:space="preserve"> (tutte le sezioni dell'Albo o una sola, una provincia alla volta: circa cinque minuti in tutto). Se IndicePA non risponde (capita: «App offline») ripetete l'aggiornamento più tardi: i dati già letti restano. Il diario mostra cosa è stato letto. Le modifiche fatte a mano restano, salvo nuovi valori dalla stessa fonte. Per i gestori privati le attività e i referenti si completano dalle schede, verificando sui loro siti.</w:t>
       </w:r>
     </w:p>
     <w:p>
@@ -54494,7 +54627,7 @@
         <w:szCs w:val="16"/>
       </w:rPr>
       <w:tab/>
-      <w:t xml:space="preserve">Manuale Amministratore · Rev. 6.1 · 23/10/2026</w:t>
+      <w:t xml:space="preserve">Manuale Amministratore · Rev. 6.2 · 23/10/2026</w:t>
     </w:r>
   </w:p>
 </w:hdr>
@@ -54559,7 +54692,7 @@
         <w:szCs w:val="16"/>
       </w:rPr>
       <w:tab/>
-      <w:t xml:space="preserve">Manuale Amministratore · Rev. 6.1 · 23/10/2026</w:t>
+      <w:t xml:space="preserve">Manuale Amministratore · Rev. 6.2 · 23/10/2026</w:t>
     </w:r>
   </w:p>
 </w:hdr>

</xml_diff>

<commit_message>
Traccia DPIA della Banca Dati Utenze nell'area Documentazione (Amministratori)
Co-Authored-By: Claude Opus 5.5 <noreply@anthropic.com>
Claude-Session: https://claude.ai/code/session_01E8XCbEeVHWVP3hntUZ6kZ1
</commit_message>
<xml_diff>
--- a/public/documentazione/Manuale_Amministratore_Portale_CWP.docx
+++ b/public/documentazione/Manuale_Amministratore_Portale_CWP.docx
@@ -302,7 +302,7 @@
                 <w:sz w:val="20"/>
                 <w:szCs w:val="20"/>
               </w:rPr>
-              <w:t xml:space="preserve">Rev. 6.6</w:t>
+              <w:t xml:space="preserve">Rev. 6.7</w:t>
             </w:r>
           </w:p>
         </w:tc>
@@ -719,7 +719,7 @@
                 <w:sz w:val="18"/>
                 <w:szCs w:val="18"/>
               </w:rPr>
-              <w:t xml:space="preserve">6.6</w:t>
+              <w:t xml:space="preserve">6.7</w:t>
             </w:r>
           </w:p>
         </w:tc>
@@ -783,7 +783,7 @@
                 <w:sz w:val="18"/>
                 <w:szCs w:val="18"/>
               </w:rPr>
-              <w:t xml:space="preserve">Lettura dei siti: siti che rifiutano i programmi automatici.</w:t>
+              <w:t xml:space="preserve">Traccia DPIA della Banca Dati Utenze nella pagina Documentazione.</w:t>
             </w:r>
           </w:p>
         </w:tc>
@@ -853,7 +853,7 @@
                 <w:sz w:val="18"/>
                 <w:szCs w:val="18"/>
               </w:rPr>
-              <w:t xml:space="preserve">6.5</w:t>
+              <w:t xml:space="preserve">6.6</w:t>
             </w:r>
           </w:p>
         </w:tc>
@@ -886,7 +886,7 @@
                 <w:sz w:val="18"/>
                 <w:szCs w:val="18"/>
               </w:rPr>
-              <w:t xml:space="preserve">25/10/2026</w:t>
+              <w:t xml:space="preserve">26/10/2026</w:t>
             </w:r>
           </w:p>
         </w:tc>
@@ -919,7 +919,7 @@
                 <w:sz w:val="18"/>
                 <w:szCs w:val="18"/>
               </w:rPr>
-              <w:t xml:space="preserve">Listino sempre obbligatorio; Progetti esistenti a Caso 1.</w:t>
+              <w:t xml:space="preserve">Lettura dei siti: siti che rifiutano i programmi automatici.</w:t>
             </w:r>
           </w:p>
         </w:tc>
@@ -989,7 +989,7 @@
                 <w:sz w:val="18"/>
                 <w:szCs w:val="18"/>
               </w:rPr>
-              <w:t xml:space="preserve">6.4</w:t>
+              <w:t xml:space="preserve">6.5</w:t>
             </w:r>
           </w:p>
         </w:tc>
@@ -1053,7 +1053,7 @@
                 <w:sz w:val="18"/>
                 <w:szCs w:val="18"/>
               </w:rPr>
-              <w:t xml:space="preserve">Marketing: Lettura dei siti.</w:t>
+              <w:t xml:space="preserve">Listino sempre obbligatorio; Progetti esistenti a Caso 1.</w:t>
             </w:r>
           </w:p>
         </w:tc>
@@ -1123,7 +1123,7 @@
                 <w:sz w:val="18"/>
                 <w:szCs w:val="18"/>
               </w:rPr>
-              <w:t xml:space="preserve">6.3</w:t>
+              <w:t xml:space="preserve">6.4</w:t>
             </w:r>
           </w:p>
         </w:tc>
@@ -1156,7 +1156,7 @@
                 <w:sz w:val="18"/>
                 <w:szCs w:val="18"/>
               </w:rPr>
-              <w:t xml:space="preserve">23/10/2026</w:t>
+              <w:t xml:space="preserve">25/10/2026</w:t>
             </w:r>
           </w:p>
         </w:tc>
@@ -1189,7 +1189,7 @@
                 <w:sz w:val="18"/>
                 <w:szCs w:val="18"/>
               </w:rPr>
-              <w:t xml:space="preserve">Rapporto di Monitoraggio solo per Progetti registrati.</w:t>
+              <w:t xml:space="preserve">Marketing: Lettura dei siti.</w:t>
             </w:r>
           </w:p>
         </w:tc>
@@ -1259,7 +1259,7 @@
                 <w:sz w:val="18"/>
                 <w:szCs w:val="18"/>
               </w:rPr>
-              <w:t xml:space="preserve">6.2</w:t>
+              <w:t xml:space="preserve">6.3</w:t>
             </w:r>
           </w:p>
         </w:tc>
@@ -1323,7 +1323,7 @@
                 <w:sz w:val="18"/>
                 <w:szCs w:val="18"/>
               </w:rPr>
-              <w:t xml:space="preserve">Marketing: aggiornamento a blocchi e IndicePA non disponibile.</w:t>
+              <w:t xml:space="preserve">Rapporto di Monitoraggio solo per Progetti registrati.</w:t>
             </w:r>
           </w:p>
         </w:tc>
@@ -1393,7 +1393,7 @@
                 <w:sz w:val="18"/>
                 <w:szCs w:val="18"/>
               </w:rPr>
-              <w:t xml:space="preserve">6.1</w:t>
+              <w:t xml:space="preserve">6.2</w:t>
             </w:r>
           </w:p>
         </w:tc>
@@ -1459,7 +1459,7 @@
                 <w:sz w:val="18"/>
                 <w:szCs w:val="18"/>
               </w:rPr>
-              <w:t xml:space="preserve">Nuovo capitolo «Marketing: Comuni, gestori e campagne» (banche dati, campagne, pagina Approfondisci, richieste).</w:t>
+              <w:t xml:space="preserve">Marketing: aggiornamento a blocchi e IndicePA non disponibile.</w:t>
             </w:r>
           </w:p>
         </w:tc>
@@ -1529,7 +1529,7 @@
                 <w:sz w:val="18"/>
                 <w:szCs w:val="18"/>
               </w:rPr>
-              <w:t xml:space="preserve">6.0</w:t>
+              <w:t xml:space="preserve">6.1</w:t>
             </w:r>
           </w:p>
         </w:tc>
@@ -1593,7 +1593,7 @@
                 <w:sz w:val="18"/>
                 <w:szCs w:val="18"/>
               </w:rPr>
-              <w:t xml:space="preserve">Colori dello stato delle fasi in Dashboard e nella pratica.</w:t>
+              <w:t xml:space="preserve">Nuovo capitolo «Marketing: Comuni, gestori e campagne» (banche dati, campagne, pagina Approfondisci, richieste).</w:t>
             </w:r>
           </w:p>
         </w:tc>
@@ -1663,7 +1663,7 @@
                 <w:sz w:val="18"/>
                 <w:szCs w:val="18"/>
               </w:rPr>
-              <w:t xml:space="preserve">5.9</w:t>
+              <w:t xml:space="preserve">6.0</w:t>
             </w:r>
           </w:p>
         </w:tc>
@@ -1729,7 +1729,7 @@
                 <w:sz w:val="18"/>
                 <w:szCs w:val="18"/>
               </w:rPr>
-              <w:t xml:space="preserve">Nuovo progetto e dati della pratica: listino Caso 1 / Caso 2 e valore del progetto; Dashboard: valore dei progetti per il cliente.</w:t>
+              <w:t xml:space="preserve">Colori dello stato delle fasi in Dashboard e nella pratica.</w:t>
             </w:r>
           </w:p>
         </w:tc>
@@ -1799,7 +1799,7 @@
                 <w:sz w:val="18"/>
                 <w:szCs w:val="18"/>
               </w:rPr>
-              <w:t xml:space="preserve">5.8</w:t>
+              <w:t xml:space="preserve">5.9</w:t>
             </w:r>
           </w:p>
         </w:tc>
@@ -1863,7 +1863,7 @@
                 <w:sz w:val="18"/>
                 <w:szCs w:val="18"/>
               </w:rPr>
-              <w:t xml:space="preserve">Revisione generale al 23/10: protezione dei dati del tracciato e della Banca Dati Utenze per utenza.</w:t>
+              <w:t xml:space="preserve">Nuovo progetto e dati della pratica: listino Caso 1 / Caso 2 e valore del progetto; Dashboard: valore dei progetti per il cliente.</w:t>
             </w:r>
           </w:p>
         </w:tc>
@@ -1933,7 +1933,7 @@
                 <w:sz w:val="18"/>
                 <w:szCs w:val="18"/>
               </w:rPr>
-              <w:t xml:space="preserve">5.7</w:t>
+              <w:t xml:space="preserve">5.8</w:t>
             </w:r>
           </w:p>
         </w:tc>
@@ -1999,7 +1999,7 @@
                 <w:sz w:val="18"/>
                 <w:szCs w:val="18"/>
               </w:rPr>
-              <w:t xml:space="preserve">Dashboard: valore dei crediti in simulazione e in fase esecutiva; Impostazioni: prezzo di riferimento del credito.</w:t>
+              <w:t xml:space="preserve">Revisione generale al 23/10: protezione dei dati del tracciato e della Banca Dati Utenze per utenza.</w:t>
             </w:r>
           </w:p>
         </w:tc>
@@ -2069,7 +2069,7 @@
                 <w:sz w:val="18"/>
                 <w:szCs w:val="18"/>
               </w:rPr>
-              <w:t xml:space="preserve">5.6</w:t>
+              <w:t xml:space="preserve">5.7</w:t>
             </w:r>
           </w:p>
         </w:tc>
@@ -2133,7 +2133,7 @@
                 <w:sz w:val="18"/>
                 <w:szCs w:val="18"/>
               </w:rPr>
-              <w:t xml:space="preserve">Passo 5a: «Calcola» usa le utenze (categoria di simulazione come classe della delibera, kg misurati, frazioni per utenza); utenze senza categoria o fuori delibera escluse e conferma bloccata; fonte nei Risultati, nel CSV e nel PDF.</w:t>
+              <w:t xml:space="preserve">Dashboard: valore dei crediti in simulazione e in fase esecutiva; Impostazioni: prezzo di riferimento del credito.</w:t>
             </w:r>
           </w:p>
         </w:tc>
@@ -2203,7 +2203,7 @@
                 <w:sz w:val="18"/>
                 <w:szCs w:val="18"/>
               </w:rPr>
-              <w:t xml:space="preserve">5.5</w:t>
+              <w:t xml:space="preserve">5.6</w:t>
             </w:r>
           </w:p>
         </w:tc>
@@ -2236,7 +2236,7 @@
                 <w:sz w:val="18"/>
                 <w:szCs w:val="18"/>
               </w:rPr>
-              <w:t xml:space="preserve">22/10/2026</w:t>
+              <w:t xml:space="preserve">23/10/2026</w:t>
             </w:r>
           </w:p>
         </w:tc>
@@ -2269,7 +2269,7 @@
                 <w:sz w:val="18"/>
                 <w:szCs w:val="18"/>
               </w:rPr>
-              <w:t xml:space="preserve">Audit delle utenze; calcolo di prova.</w:t>
+              <w:t xml:space="preserve">Passo 5a: «Calcola» usa le utenze (categoria di simulazione come classe della delibera, kg misurati, frazioni per utenza); utenze senza categoria o fuori delibera escluse e conferma bloccata; fonte nei Risultati, nel CSV e nel PDF.</w:t>
             </w:r>
           </w:p>
         </w:tc>
@@ -2339,7 +2339,7 @@
                 <w:sz w:val="18"/>
                 <w:szCs w:val="18"/>
               </w:rPr>
-              <w:t xml:space="preserve">5.4</w:t>
+              <w:t xml:space="preserve">5.5</w:t>
             </w:r>
           </w:p>
         </w:tc>
@@ -2403,7 +2403,7 @@
                 <w:sz w:val="18"/>
                 <w:szCs w:val="18"/>
               </w:rPr>
-              <w:t xml:space="preserve">Gestione delle utenze nel passo 5a del calcolo: caricamento, schede, modulo; categorie tariffaria e di simulazione.</w:t>
+              <w:t xml:space="preserve">Audit delle utenze; calcolo di prova.</w:t>
             </w:r>
           </w:p>
         </w:tc>
@@ -2473,7 +2473,7 @@
                 <w:sz w:val="18"/>
                 <w:szCs w:val="18"/>
               </w:rPr>
-              <w:t xml:space="preserve">5.3</w:t>
+              <w:t xml:space="preserve">5.4</w:t>
             </w:r>
           </w:p>
         </w:tc>
@@ -2539,7 +2539,7 @@
                 <w:sz w:val="18"/>
                 <w:szCs w:val="18"/>
               </w:rPr>
-              <w:t xml:space="preserve">Banca Dati Utenze per utenza: campi, regole, dati personali.</w:t>
+              <w:t xml:space="preserve">Gestione delle utenze nel passo 5a del calcolo: caricamento, schede, modulo; categorie tariffaria e di simulazione.</w:t>
             </w:r>
           </w:p>
         </w:tc>
@@ -2609,7 +2609,7 @@
                 <w:sz w:val="18"/>
                 <w:szCs w:val="18"/>
               </w:rPr>
-              <w:t xml:space="preserve">5.2</w:t>
+              <w:t xml:space="preserve">5.3</w:t>
             </w:r>
           </w:p>
         </w:tc>
@@ -2673,7 +2673,7 @@
                 <w:sz w:val="18"/>
                 <w:szCs w:val="18"/>
               </w:rPr>
-              <w:t xml:space="preserve">Uso dal telefono: menu a pannello, schede in Dashboard e Audit, elenco e dettaglio delle pratiche.</w:t>
+              <w:t xml:space="preserve">Banca Dati Utenze per utenza: campi, regole, dati personali.</w:t>
             </w:r>
           </w:p>
         </w:tc>
@@ -2743,7 +2743,7 @@
                 <w:sz w:val="18"/>
                 <w:szCs w:val="18"/>
               </w:rPr>
-              <w:t xml:space="preserve">5.1</w:t>
+              <w:t xml:space="preserve">5.2</w:t>
             </w:r>
           </w:p>
         </w:tc>
@@ -2809,7 +2809,7 @@
                 <w:sz w:val="18"/>
                 <w:szCs w:val="18"/>
               </w:rPr>
-              <w:t xml:space="preserve">Rilievi N01-N06: costi una tantum in 10 rate, feedback pubblico e fase 3, ente prima della fase 5, riquadro «Fase aperta senza scadenza», avviso sui codici, frazioni del fattore dell'indifferenziato.</w:t>
+              <w:t xml:space="preserve">Uso dal telefono: menu a pannello, schede in Dashboard e Audit, elenco e dettaglio delle pratiche.</w:t>
             </w:r>
           </w:p>
         </w:tc>
@@ -2879,7 +2879,7 @@
                 <w:sz w:val="18"/>
                 <w:szCs w:val="18"/>
               </w:rPr>
-              <w:t xml:space="preserve">5.0</w:t>
+              <w:t xml:space="preserve">5.1</w:t>
             </w:r>
           </w:p>
         </w:tc>
@@ -2911,7 +2911,7 @@
                 <w:sz w:val="18"/>
                 <w:szCs w:val="18"/>
               </w:rPr>
-              <w:t xml:space="preserve">21/10/2026</w:t>
+              <w:t xml:space="preserve">22/10/2026</w:t>
             </w:r>
           </w:p>
         </w:tc>
@@ -2943,7 +2943,7 @@
                 <w:sz w:val="18"/>
                 <w:szCs w:val="18"/>
               </w:rPr>
-              <w:t xml:space="preserve">«News» diventa «Notizie CO2»; Google News attraverso il tramite; barra a LED nell'elenco e nella pratica. Pallino verde delle Notizie CO2 nuove. Notizie CO2: siti di notizie ambientali al posto di Google News. Notizie CO2: siti di notizie ambientali al posto di Google News.</w:t>
+              <w:t xml:space="preserve">Rilievi N01-N06: costi una tantum in 10 rate, feedback pubblico e fase 3, ente prima della fase 5, riquadro «Fase aperta senza scadenza», avviso sui codici, frazioni del fattore dell'indifferenziato.</w:t>
             </w:r>
           </w:p>
         </w:tc>
@@ -3013,7 +3013,7 @@
                 <w:sz w:val="18"/>
                 <w:szCs w:val="18"/>
               </w:rPr>
-              <w:t xml:space="preserve">4.9</w:t>
+              <w:t xml:space="preserve">5.0</w:t>
             </w:r>
           </w:p>
         </w:tc>
@@ -3079,7 +3079,7 @@
                 <w:sz w:val="18"/>
                 <w:szCs w:val="18"/>
               </w:rPr>
-              <w:t xml:space="preserve">Nuovo capitolo «News»: osservatorio sui crediti di carbonio volontari. Canali Bing News e Verra.</w:t>
+              <w:t xml:space="preserve">«News» diventa «Notizie CO2»; Google News attraverso il tramite; barra a LED nell'elenco e nella pratica. Pallino verde delle Notizie CO2 nuove. Notizie CO2: siti di notizie ambientali al posto di Google News. Notizie CO2: siti di notizie ambientali al posto di Google News.</w:t>
             </w:r>
           </w:p>
         </w:tc>
@@ -3149,7 +3149,7 @@
                 <w:sz w:val="18"/>
                 <w:szCs w:val="18"/>
               </w:rPr>
-              <w:t xml:space="preserve">4.8</w:t>
+              <w:t xml:space="preserve">4.9</w:t>
             </w:r>
           </w:p>
         </w:tc>
@@ -3213,7 +3213,7 @@
                 <w:sz w:val="18"/>
                 <w:szCs w:val="18"/>
               </w:rPr>
-              <w:t xml:space="preserve">Simulatore: il PDF scaricato riporta tutti i dati della pagina, i costi e i grafici; foglio Excel «Dati inseriti».</w:t>
+              <w:t xml:space="preserve">Nuovo capitolo «News»: osservatorio sui crediti di carbonio volontari. Canali Bing News e Verra.</w:t>
             </w:r>
           </w:p>
         </w:tc>
@@ -3283,7 +3283,7 @@
                 <w:sz w:val="18"/>
                 <w:szCs w:val="18"/>
               </w:rPr>
-              <w:t xml:space="preserve">4.7</w:t>
+              <w:t xml:space="preserve">4.8</w:t>
             </w:r>
           </w:p>
         </w:tc>
@@ -3349,7 +3349,7 @@
                 <w:sz w:val="18"/>
                 <w:szCs w:val="18"/>
               </w:rPr>
-              <w:t xml:space="preserve">Assistente per gli Operatori e domande sulla pratica aperta; menu dell'Operatore con il Simulatore.</w:t>
+              <w:t xml:space="preserve">Simulatore: il PDF scaricato riporta tutti i dati della pagina, i costi e i grafici; foglio Excel «Dati inseriti».</w:t>
             </w:r>
           </w:p>
         </w:tc>
@@ -3419,7 +3419,7 @@
                 <w:sz w:val="18"/>
                 <w:szCs w:val="18"/>
               </w:rPr>
-              <w:t xml:space="preserve">4.6</w:t>
+              <w:t xml:space="preserve">4.7</w:t>
             </w:r>
           </w:p>
         </w:tc>
@@ -3483,7 +3483,7 @@
                 <w:sz w:val="18"/>
                 <w:szCs w:val="18"/>
               </w:rPr>
-              <w:t xml:space="preserve">Capitolo «Backup automatico».</w:t>
+              <w:t xml:space="preserve">Assistente per gli Operatori e domande sulla pratica aperta; menu dell'Operatore con il Simulatore.</w:t>
             </w:r>
           </w:p>
         </w:tc>
@@ -3553,7 +3553,7 @@
                 <w:sz w:val="18"/>
                 <w:szCs w:val="18"/>
               </w:rPr>
-              <w:t xml:space="preserve">4.5</w:t>
+              <w:t xml:space="preserve">4.6</w:t>
             </w:r>
           </w:p>
         </w:tc>
@@ -3619,7 +3619,7 @@
                 <w:sz w:val="18"/>
                 <w:szCs w:val="18"/>
               </w:rPr>
-              <w:t xml:space="preserve">Nuovo documento «Registro issue e test» tra quelli scaricabili.</w:t>
+              <w:t xml:space="preserve">Capitolo «Backup automatico».</w:t>
             </w:r>
           </w:p>
         </w:tc>
@@ -3689,7 +3689,7 @@
                 <w:sz w:val="18"/>
                 <w:szCs w:val="18"/>
               </w:rPr>
-              <w:t xml:space="preserve">4.4</w:t>
+              <w:t xml:space="preserve">4.5</w:t>
             </w:r>
           </w:p>
         </w:tc>
@@ -3753,7 +3753,7 @@
                 <w:sz w:val="18"/>
                 <w:szCs w:val="18"/>
               </w:rPr>
-              <w:t xml:space="preserve">Collaudo V05: testo completo dei valori lunghi nell'Audit (Prima/Dopo, Tolto/Aggiunto), denominazione delle organizzazioni e ricerca sui valori cambiati; pagina «Account disattivato».</w:t>
+              <w:t xml:space="preserve">Nuovo documento «Registro issue e test» tra quelli scaricabili.</w:t>
             </w:r>
           </w:p>
         </w:tc>
@@ -3823,7 +3823,7 @@
                 <w:sz w:val="18"/>
                 <w:szCs w:val="18"/>
               </w:rPr>
-              <w:t xml:space="preserve">4.3</w:t>
+              <w:t xml:space="preserve">4.4</w:t>
             </w:r>
           </w:p>
         </w:tc>
@@ -3856,7 +3856,7 @@
                 <w:sz w:val="18"/>
                 <w:szCs w:val="18"/>
               </w:rPr>
-              <w:t xml:space="preserve">20/10/2026</w:t>
+              <w:t xml:space="preserve">21/10/2026</w:t>
             </w:r>
           </w:p>
         </w:tc>
@@ -3889,7 +3889,7 @@
                 <w:sz w:val="18"/>
                 <w:szCs w:val="18"/>
               </w:rPr>
-              <w:t xml:space="preserve">Correzioni del collaudo V01: import CSV della Banca Dati «tutto o niente» senza valori negativi, calcolo bloccato con dati non ammessi, buffer manuale 0-80%, conferma definitiva solo senza errori di coerenza, dati non ammessi nel simulatore e zero esplicito nei prezzi, colonna «Oggetto e modifiche» nell'Audit.</w:t>
+              <w:t xml:space="preserve">Collaudo V05: testo completo dei valori lunghi nell'Audit (Prima/Dopo, Tolto/Aggiunto), denominazione delle organizzazioni e ricerca sui valori cambiati; pagina «Account disattivato».</w:t>
             </w:r>
           </w:p>
         </w:tc>
@@ -3959,7 +3959,7 @@
                 <w:sz w:val="18"/>
                 <w:szCs w:val="18"/>
               </w:rPr>
-              <w:t xml:space="preserve">4.2</w:t>
+              <w:t xml:space="preserve">4.3</w:t>
             </w:r>
           </w:p>
         </w:tc>
@@ -4023,7 +4023,7 @@
                 <w:sz w:val="18"/>
                 <w:szCs w:val="18"/>
               </w:rPr>
-              <w:t xml:space="preserve">Nuovo capitolo «Sicurezza»: inattività, avvisi, protezioni del sito e del database.</w:t>
+              <w:t xml:space="preserve">Correzioni del collaudo V01: import CSV della Banca Dati «tutto o niente» senza valori negativi, calcolo bloccato con dati non ammessi, buffer manuale 0-80%, conferma definitiva solo senza errori di coerenza, dati non ammessi nel simulatore e zero esplicito nei prezzi, colonna «Oggetto e modifiche» nell'Audit.</w:t>
             </w:r>
           </w:p>
         </w:tc>
@@ -4093,7 +4093,7 @@
                 <w:sz w:val="18"/>
                 <w:szCs w:val="18"/>
               </w:rPr>
-              <w:t xml:space="preserve">4.1</w:t>
+              <w:t xml:space="preserve">4.2</w:t>
             </w:r>
           </w:p>
         </w:tc>
@@ -4159,7 +4159,7 @@
                 <w:sz w:val="18"/>
                 <w:szCs w:val="18"/>
               </w:rPr>
-              <w:t xml:space="preserve">Voci di menu degli enti aggiornate.</w:t>
+              <w:t xml:space="preserve">Nuovo capitolo «Sicurezza»: inattività, avvisi, protezioni del sito e del database.</w:t>
             </w:r>
           </w:p>
         </w:tc>
@@ -4229,7 +4229,7 @@
                 <w:sz w:val="18"/>
                 <w:szCs w:val="18"/>
               </w:rPr>
-              <w:t xml:space="preserve">4.0</w:t>
+              <w:t xml:space="preserve">4.1</w:t>
             </w:r>
           </w:p>
         </w:tc>
@@ -4293,7 +4293,7 @@
                 <w:sz w:val="18"/>
                 <w:szCs w:val="18"/>
               </w:rPr>
-              <w:t xml:space="preserve">Nuovo ordine del menu; la sezione si chiama «Audit User». Voce «Marketplaces» in arrivo.</w:t>
+              <w:t xml:space="preserve">Voci di menu degli enti aggiornate.</w:t>
             </w:r>
           </w:p>
         </w:tc>
@@ -4363,7 +4363,7 @@
                 <w:sz w:val="18"/>
                 <w:szCs w:val="18"/>
               </w:rPr>
-              <w:t xml:space="preserve">3.9</w:t>
+              <w:t xml:space="preserve">4.0</w:t>
             </w:r>
           </w:p>
         </w:tc>
@@ -4429,7 +4429,7 @@
                 <w:sz w:val="18"/>
                 <w:szCs w:val="18"/>
               </w:rPr>
-              <w:t xml:space="preserve">Nuovo capitolo «Audit trail user».</w:t>
+              <w:t xml:space="preserve">Nuovo ordine del menu; la sezione si chiama «Audit User». Voce «Marketplaces» in arrivo.</w:t>
             </w:r>
           </w:p>
         </w:tc>
@@ -4499,7 +4499,7 @@
                 <w:sz w:val="18"/>
                 <w:szCs w:val="18"/>
               </w:rPr>
-              <w:t xml:space="preserve">3.8</w:t>
+              <w:t xml:space="preserve">3.9</w:t>
             </w:r>
           </w:p>
         </w:tc>
@@ -4563,7 +4563,7 @@
                 <w:sz w:val="18"/>
                 <w:szCs w:val="18"/>
               </w:rPr>
-              <w:t xml:space="preserve">Utenti online; PDF ed Excel del simulatore; messaggi d'errore dell'assistente.</w:t>
+              <w:t xml:space="preserve">Nuovo capitolo «Audit trail user».</w:t>
             </w:r>
           </w:p>
         </w:tc>
@@ -4633,7 +4633,7 @@
                 <w:sz w:val="18"/>
                 <w:szCs w:val="18"/>
               </w:rPr>
-              <w:t xml:space="preserve">3.7</w:t>
+              <w:t xml:space="preserve">3.8</w:t>
             </w:r>
           </w:p>
         </w:tc>
@@ -4666,7 +4666,7 @@
                 <w:sz w:val="18"/>
                 <w:szCs w:val="18"/>
               </w:rPr>
-              <w:t xml:space="preserve">19/10/2026</w:t>
+              <w:t xml:space="preserve">20/10/2026</w:t>
             </w:r>
           </w:p>
         </w:tc>
@@ -4699,7 +4699,7 @@
                 <w:sz w:val="18"/>
                 <w:szCs w:val="18"/>
               </w:rPr>
-              <w:t xml:space="preserve">Assistente virtuale: messaggio «Un attimo…» durante l'attesa.</w:t>
+              <w:t xml:space="preserve">Utenti online; PDF ed Excel del simulatore; messaggi d'errore dell'assistente.</w:t>
             </w:r>
           </w:p>
         </w:tc>
@@ -4769,7 +4769,7 @@
                 <w:sz w:val="18"/>
                 <w:szCs w:val="18"/>
               </w:rPr>
-              <w:t xml:space="preserve">3.6</w:t>
+              <w:t xml:space="preserve">3.7</w:t>
             </w:r>
           </w:p>
         </w:tc>
@@ -4833,7 +4833,7 @@
                 <w:sz w:val="18"/>
                 <w:szCs w:val="18"/>
               </w:rPr>
-              <w:t xml:space="preserve">Assistente virtuale attivo: chiave legata a uno spazio di lavoro, crediti e consumi.</w:t>
+              <w:t xml:space="preserve">Assistente virtuale: messaggio «Un attimo…» durante l'attesa.</w:t>
             </w:r>
           </w:p>
         </w:tc>
@@ -4903,7 +4903,7 @@
                 <w:sz w:val="18"/>
                 <w:szCs w:val="18"/>
               </w:rPr>
-              <w:t xml:space="preserve">3.5</w:t>
+              <w:t xml:space="preserve">3.6</w:t>
             </w:r>
           </w:p>
         </w:tc>
@@ -4969,7 +4969,7 @@
                 <w:sz w:val="18"/>
                 <w:szCs w:val="18"/>
               </w:rPr>
-              <w:t xml:space="preserve">Assistente virtuale; documenti ufficiali del Programma nella Documentazione.</w:t>
+              <w:t xml:space="preserve">Assistente virtuale attivo: chiave legata a uno spazio di lavoro, crediti e consumi.</w:t>
             </w:r>
           </w:p>
         </w:tc>
@@ -5039,7 +5039,7 @@
                 <w:sz w:val="18"/>
                 <w:szCs w:val="18"/>
               </w:rPr>
-              <w:t xml:space="preserve">3.4</w:t>
+              <w:t xml:space="preserve">3.5</w:t>
             </w:r>
           </w:p>
         </w:tc>
@@ -5103,7 +5103,7 @@
                 <w:sz w:val="18"/>
                 <w:szCs w:val="18"/>
               </w:rPr>
-              <w:t xml:space="preserve">Presentazione di riepilogo nella pagina Documentazione.</w:t>
+              <w:t xml:space="preserve">Assistente virtuale; documenti ufficiali del Programma nella Documentazione.</w:t>
             </w:r>
           </w:p>
         </w:tc>
@@ -5173,7 +5173,7 @@
                 <w:sz w:val="18"/>
                 <w:szCs w:val="18"/>
               </w:rPr>
-              <w:t xml:space="preserve">3.3</w:t>
+              <w:t xml:space="preserve">3.4</w:t>
             </w:r>
           </w:p>
         </w:tc>
@@ -5239,7 +5239,7 @@
                 <w:sz w:val="18"/>
                 <w:szCs w:val="18"/>
               </w:rPr>
-              <w:t xml:space="preserve">Ordinamento di tutte le tabelle e degli elenchi.</w:t>
+              <w:t xml:space="preserve">Presentazione di riepilogo nella pagina Documentazione.</w:t>
             </w:r>
           </w:p>
         </w:tc>
@@ -5309,7 +5309,7 @@
                 <w:sz w:val="18"/>
                 <w:szCs w:val="18"/>
               </w:rPr>
-              <w:t xml:space="preserve">3.2</w:t>
+              <w:t xml:space="preserve">3.3</w:t>
             </w:r>
           </w:p>
         </w:tc>
@@ -5373,7 +5373,7 @@
                 <w:sz w:val="18"/>
                 <w:szCs w:val="18"/>
               </w:rPr>
-              <w:t xml:space="preserve">Simulatore: metodo di stima per utenza (solo utenze virtuose), buffer del Capitolo 7, taratura.</w:t>
+              <w:t xml:space="preserve">Ordinamento di tutte le tabelle e degli elenchi.</w:t>
             </w:r>
           </w:p>
         </w:tc>
@@ -5443,7 +5443,7 @@
                 <w:sz w:val="18"/>
                 <w:szCs w:val="18"/>
               </w:rPr>
-              <w:t xml:space="preserve">3.1</w:t>
+              <w:t xml:space="preserve">3.2</w:t>
             </w:r>
           </w:p>
         </w:tc>
@@ -5509,7 +5509,7 @@
                 <w:sz w:val="18"/>
                 <w:szCs w:val="18"/>
               </w:rPr>
-              <w:t xml:space="preserve">Cruscotto diventa Dashboard; barra a LED delle 7 fasi per ogni pratica.</w:t>
+              <w:t xml:space="preserve">Simulatore: metodo di stima per utenza (solo utenze virtuose), buffer del Capitolo 7, taratura.</w:t>
             </w:r>
           </w:p>
         </w:tc>
@@ -5579,7 +5579,7 @@
                 <w:sz w:val="18"/>
                 <w:szCs w:val="18"/>
               </w:rPr>
-              <w:t xml:space="preserve">3.0</w:t>
+              <w:t xml:space="preserve">3.1</w:t>
             </w:r>
           </w:p>
         </w:tc>
@@ -5643,7 +5643,7 @@
                 <w:sz w:val="18"/>
                 <w:szCs w:val="18"/>
               </w:rPr>
-              <w:t xml:space="preserve">Eliminazione degli utenti che non hanno mai operato (script 30).</w:t>
+              <w:t xml:space="preserve">Cruscotto diventa Dashboard; barra a LED delle 7 fasi per ogni pratica.</w:t>
             </w:r>
           </w:p>
         </w:tc>
@@ -5713,7 +5713,7 @@
                 <w:sz w:val="18"/>
                 <w:szCs w:val="18"/>
               </w:rPr>
-              <w:t xml:space="preserve">2.9</w:t>
+              <w:t xml:space="preserve">3.0</w:t>
             </w:r>
           </w:p>
         </w:tc>
@@ -5779,7 +5779,7 @@
                 <w:sz w:val="18"/>
                 <w:szCs w:val="18"/>
               </w:rPr>
-              <w:t xml:space="preserve">Email automatica con le credenziali al nuovo utente e alla reimpostazione della password.</w:t>
+              <w:t xml:space="preserve">Eliminazione degli utenti che non hanno mai operato (script 30).</w:t>
             </w:r>
           </w:p>
         </w:tc>
@@ -5849,7 +5849,7 @@
                 <w:sz w:val="18"/>
                 <w:szCs w:val="18"/>
               </w:rPr>
-              <w:t xml:space="preserve">2.8</w:t>
+              <w:t xml:space="preserve">2.9</w:t>
             </w:r>
           </w:p>
         </w:tc>
@@ -5913,7 +5913,7 @@
                 <w:sz w:val="18"/>
                 <w:szCs w:val="18"/>
               </w:rPr>
-              <w:t xml:space="preserve">Più Amministratori con accesso completo; Amministratore principale protetto (script 29).</w:t>
+              <w:t xml:space="preserve">Email automatica con le credenziali al nuovo utente e alla reimpostazione della password.</w:t>
             </w:r>
           </w:p>
         </w:tc>
@@ -5983,7 +5983,7 @@
                 <w:sz w:val="18"/>
                 <w:szCs w:val="18"/>
               </w:rPr>
-              <w:t xml:space="preserve">2.7</w:t>
+              <w:t xml:space="preserve">2.8</w:t>
             </w:r>
           </w:p>
         </w:tc>
@@ -6049,7 +6049,7 @@
                 <w:sz w:val="18"/>
                 <w:szCs w:val="18"/>
               </w:rPr>
-              <w:t xml:space="preserve">Simulatore: costi per il Comune secondo il Caso 1 (progetto volontario) o il Caso 2 (progetto obbligatorio da bando).</w:t>
+              <w:t xml:space="preserve">Più Amministratori con accesso completo; Amministratore principale protetto (script 29).</w:t>
             </w:r>
           </w:p>
         </w:tc>
@@ -6119,7 +6119,7 @@
                 <w:sz w:val="18"/>
                 <w:szCs w:val="18"/>
               </w:rPr>
-              <w:t xml:space="preserve">2.6</w:t>
+              <w:t xml:space="preserve">2.7</w:t>
             </w:r>
           </w:p>
         </w:tc>
@@ -6183,7 +6183,7 @@
                 <w:sz w:val="18"/>
                 <w:szCs w:val="18"/>
               </w:rPr>
-              <w:t xml:space="preserve">Simulatore: valore del credito anno per anno, proposto 32 €.</w:t>
+              <w:t xml:space="preserve">Simulatore: costi per il Comune secondo il Caso 1 (progetto volontario) o il Caso 2 (progetto obbligatorio da bando).</w:t>
             </w:r>
           </w:p>
         </w:tc>
@@ -6253,7 +6253,7 @@
                 <w:sz w:val="18"/>
                 <w:szCs w:val="18"/>
               </w:rPr>
-              <w:t xml:space="preserve">2.5</w:t>
+              <w:t xml:space="preserve">2.6</w:t>
             </w:r>
           </w:p>
         </w:tc>
@@ -6319,7 +6319,7 @@
                 <w:sz w:val="18"/>
                 <w:szCs w:val="18"/>
               </w:rPr>
-              <w:t xml:space="preserve">Simulatore: simulazione economica con valore unitario del credito e costi per il Comune (contratti tipo della Fondazione, Schema tariffario).</w:t>
+              <w:t xml:space="preserve">Simulatore: valore del credito anno per anno, proposto 32 €.</w:t>
             </w:r>
           </w:p>
         </w:tc>
@@ -6389,7 +6389,7 @@
                 <w:sz w:val="18"/>
                 <w:szCs w:val="18"/>
               </w:rPr>
-              <w:t xml:space="preserve">2.4</w:t>
+              <w:t xml:space="preserve">2.5</w:t>
             </w:r>
           </w:p>
         </w:tc>
@@ -6453,7 +6453,7 @@
                 <w:sz w:val="18"/>
                 <w:szCs w:val="18"/>
               </w:rPr>
-              <w:t xml:space="preserve">Simulatore: riferimento sempre alla soglia del 65% di differenziata e controllo dei valori fuori scala.</w:t>
+              <w:t xml:space="preserve">Simulatore: simulazione economica con valore unitario del credito e costi per il Comune (contratti tipo della Fondazione, Schema tariffario).</w:t>
             </w:r>
           </w:p>
         </w:tc>
@@ -6523,7 +6523,7 @@
                 <w:sz w:val="18"/>
                 <w:szCs w:val="18"/>
               </w:rPr>
-              <w:t xml:space="preserve">2.3</w:t>
+              <w:t xml:space="preserve">2.4</w:t>
             </w:r>
           </w:p>
         </w:tc>
@@ -6589,7 +6589,7 @@
                 <w:sz w:val="18"/>
                 <w:szCs w:val="18"/>
               </w:rPr>
-              <w:t xml:space="preserve">Simulatore conforme al modello CWP: scenario di riferimento dello Standard 4.8.1, situazione attuale, conformità.</w:t>
+              <w:t xml:space="preserve">Simulatore: riferimento sempre alla soglia del 65% di differenziata e controllo dei valori fuori scala.</w:t>
             </w:r>
           </w:p>
         </w:tc>
@@ -6659,7 +6659,7 @@
                 <w:sz w:val="18"/>
                 <w:szCs w:val="18"/>
               </w:rPr>
-              <w:t xml:space="preserve">2.2</w:t>
+              <w:t xml:space="preserve">2.3</w:t>
             </w:r>
           </w:p>
         </w:tc>
@@ -6723,7 +6723,7 @@
                 <w:sz w:val="18"/>
                 <w:szCs w:val="18"/>
               </w:rPr>
-              <w:t xml:space="preserve">Nuovo capitolo «Simulatore di scenari»: creazione, anno base, obiettivi annui, risultati, modello di stima.</w:t>
+              <w:t xml:space="preserve">Simulatore conforme al modello CWP: scenario di riferimento dello Standard 4.8.1, situazione attuale, conformità.</w:t>
             </w:r>
           </w:p>
         </w:tc>
@@ -6793,7 +6793,7 @@
                 <w:sz w:val="18"/>
                 <w:szCs w:val="18"/>
               </w:rPr>
-              <w:t xml:space="preserve">2.1</w:t>
+              <w:t xml:space="preserve">2.2</w:t>
             </w:r>
           </w:p>
         </w:tc>
@@ -6859,7 +6859,7 @@
                 <w:sz w:val="18"/>
                 <w:szCs w:val="18"/>
               </w:rPr>
-              <w:t xml:space="preserve">Funzioni in arrivo: simulatore di scenari (7, 10 o 21 anni, obiettivi annui, % di differenziata e crediti stimati) e assistente virtuale (Claude).</w:t>
+              <w:t xml:space="preserve">Nuovo capitolo «Simulatore di scenari»: creazione, anno base, obiettivi annui, risultati, modello di stima.</w:t>
             </w:r>
           </w:p>
         </w:tc>
@@ -6929,7 +6929,7 @@
                 <w:sz w:val="18"/>
                 <w:szCs w:val="18"/>
               </w:rPr>
-              <w:t xml:space="preserve">2.0</w:t>
+              <w:t xml:space="preserve">2.1</w:t>
             </w:r>
           </w:p>
         </w:tc>
@@ -6993,7 +6993,7 @@
                 <w:sz w:val="18"/>
                 <w:szCs w:val="18"/>
               </w:rPr>
-              <w:t xml:space="preserve">Copie di sicurezza e ripristino: rimando alle Istruzioni di ripristino e punti essenziali (capitolo Manutenzione ed emergenze).</w:t>
+              <w:t xml:space="preserve">Funzioni in arrivo: simulatore di scenari (7, 10 o 21 anni, obiettivi annui, % di differenziata e crediti stimati) e assistente virtuale (Claude).</w:t>
             </w:r>
           </w:p>
         </w:tc>
@@ -7063,7 +7063,7 @@
                 <w:sz w:val="18"/>
                 <w:szCs w:val="18"/>
               </w:rPr>
-              <w:t xml:space="preserve">1.9</w:t>
+              <w:t xml:space="preserve">2.0</w:t>
             </w:r>
           </w:p>
         </w:tc>
@@ -7129,7 +7129,7 @@
                 <w:sz w:val="18"/>
                 <w:szCs w:val="18"/>
               </w:rPr>
-              <w:t xml:space="preserve">Fondazione Operate soggetto promotore del programma (esclusiva conferita da Wastelab).</w:t>
+              <w:t xml:space="preserve">Copie di sicurezza e ripristino: rimando alle Istruzioni di ripristino e punti essenziali (capitolo Manutenzione ed emergenze).</w:t>
             </w:r>
           </w:p>
         </w:tc>
@@ -7199,7 +7199,7 @@
                 <w:sz w:val="18"/>
                 <w:szCs w:val="18"/>
               </w:rPr>
-              <w:t xml:space="preserve">1.8</w:t>
+              <w:t xml:space="preserve">1.9</w:t>
             </w:r>
           </w:p>
         </w:tc>
@@ -7263,7 +7263,7 @@
                 <w:sz w:val="18"/>
                 <w:szCs w:val="18"/>
               </w:rPr>
-              <w:t xml:space="preserve">PEC del Programma e documenti ufficiali già pubblicati sulla pagina pubblica.</w:t>
+              <w:t xml:space="preserve">Fondazione Operate soggetto promotore del programma (esclusiva conferita da Wastelab).</w:t>
             </w:r>
           </w:p>
         </w:tc>
@@ -7333,7 +7333,7 @@
                 <w:sz w:val="18"/>
                 <w:szCs w:val="18"/>
               </w:rPr>
-              <w:t xml:space="preserve">1.7</w:t>
+              <w:t xml:space="preserve">1.8</w:t>
             </w:r>
           </w:p>
         </w:tc>
@@ -7366,7 +7366,7 @@
                 <w:sz w:val="18"/>
                 <w:szCs w:val="18"/>
               </w:rPr>
-              <w:t xml:space="preserve">18/10/2026</w:t>
+              <w:t xml:space="preserve">19/10/2026</w:t>
             </w:r>
           </w:p>
         </w:tc>
@@ -7399,7 +7399,7 @@
                 <w:sz w:val="18"/>
                 <w:szCs w:val="18"/>
               </w:rPr>
-              <w:t xml:space="preserve">Allineamento ai documenti ufficiali del Programma (script 22-24): Rapporto a 7 fasi, feedback pubblico, stati del Programma, dati del progetto e territorio ISTAT, ritiro e rientro, account unico e delegati, registri, tariffe e sospensione, accuratezza e accertamenti, informazioni del Programma e metodologie, modelli pubblici; nuovi capitoli Crediti emessi, Reclami, Pagina pubblica; qualità dei dati nel calcolo.</w:t>
+              <w:t xml:space="preserve">PEC del Programma e documenti ufficiali già pubblicati sulla pagina pubblica.</w:t>
             </w:r>
           </w:p>
         </w:tc>
@@ -7469,7 +7469,7 @@
                 <w:sz w:val="18"/>
                 <w:szCs w:val="18"/>
               </w:rPr>
-              <w:t xml:space="preserve">1.6</w:t>
+              <w:t xml:space="preserve">1.7</w:t>
             </w:r>
           </w:p>
         </w:tc>
@@ -7533,7 +7533,7 @@
                 <w:sz w:val="18"/>
                 <w:szCs w:val="18"/>
               </w:rPr>
-              <w:t xml:space="preserve">Calcolo crediti: descrizione corretta del buffer (somma delle voci delle Tabelle 15 e 16, più il 20% con le sole utenze virtuose, al massimo 80%).</w:t>
+              <w:t xml:space="preserve">Allineamento ai documenti ufficiali del Programma (script 22-24): Rapporto a 7 fasi, feedback pubblico, stati del Programma, dati del progetto e territorio ISTAT, ritiro e rientro, account unico e delegati, registri, tariffe e sospensione, accuratezza e accertamenti, informazioni del Programma e metodologie, modelli pubblici; nuovi capitoli Crediti emessi, Reclami, Pagina pubblica; qualità dei dati nel calcolo.</w:t>
             </w:r>
           </w:p>
         </w:tc>
@@ -7603,7 +7603,7 @@
                 <w:sz w:val="18"/>
                 <w:szCs w:val="18"/>
               </w:rPr>
-              <w:t xml:space="preserve">1.5</w:t>
+              <w:t xml:space="preserve">1.6</w:t>
             </w:r>
           </w:p>
         </w:tc>
@@ -7669,7 +7669,7 @@
                 <w:sz w:val="18"/>
                 <w:szCs w:val="18"/>
               </w:rPr>
-              <w:t xml:space="preserve">Nuova pagina Anagrafiche (Organizzazioni ed Enti, anche per gli Operatori); Rapporti con 4 fasi e durate proprie; documenti richiesti per fase; consultazione con documento bloccato, osservazioni numerate e motivazione; conservazione per 10 anni; fascicolo con riepilogo PDF e nuove cartelle.</w:t>
+              <w:t xml:space="preserve">Calcolo crediti: descrizione corretta del buffer (somma delle voci delle Tabelle 15 e 16, più il 20% con le sole utenze virtuose, al massimo 80%).</w:t>
             </w:r>
           </w:p>
         </w:tc>
@@ -7739,7 +7739,7 @@
                 <w:sz w:val="18"/>
                 <w:szCs w:val="18"/>
               </w:rPr>
-              <w:t xml:space="preserve">1.4</w:t>
+              <w:t xml:space="preserve">1.5</w:t>
             </w:r>
           </w:p>
         </w:tc>
@@ -7803,7 +7803,7 @@
                 <w:sz w:val="18"/>
                 <w:szCs w:val="18"/>
               </w:rPr>
-              <w:t xml:space="preserve">Calcolo crediti: il risultato si azzera quando cambiano dati o Banca Dati Utenze, conferma solo dopo un nuovo «Calcola». Gestione utenti: password temporanea di almeno 10 caratteri con lettere e numeri, creazione annullata se non va a buon fine, nessun accesso ai dati prima del cambio password.</w:t>
+              <w:t xml:space="preserve">Nuova pagina Anagrafiche (Organizzazioni ed Enti, anche per gli Operatori); Rapporti con 4 fasi e durate proprie; documenti richiesti per fase; consultazione con documento bloccato, osservazioni numerate e motivazione; conservazione per 10 anni; fascicolo con riepilogo PDF e nuove cartelle.</w:t>
             </w:r>
           </w:p>
         </w:tc>
@@ -7873,7 +7873,7 @@
                 <w:sz w:val="18"/>
                 <w:szCs w:val="18"/>
               </w:rPr>
-              <w:t xml:space="preserve">1.3</w:t>
+              <w:t xml:space="preserve">1.4</w:t>
             </w:r>
           </w:p>
         </w:tc>
@@ -7939,7 +7939,7 @@
                 <w:sz w:val="18"/>
                 <w:szCs w:val="18"/>
               </w:rPr>
-              <w:t xml:space="preserve">Rapporto di calcolo in PDF, archiviazione nella pratica, numero di registro, registro dei crediti.</w:t>
+              <w:t xml:space="preserve">Calcolo crediti: il risultato si azzera quando cambiano dati o Banca Dati Utenze, conferma solo dopo un nuovo «Calcola». Gestione utenti: password temporanea di almeno 10 caratteri con lettere e numeri, creazione annullata se non va a buon fine, nessun accesso ai dati prima del cambio password.</w:t>
             </w:r>
           </w:p>
         </w:tc>
@@ -8009,7 +8009,7 @@
                 <w:sz w:val="18"/>
                 <w:szCs w:val="18"/>
               </w:rPr>
-              <w:t xml:space="preserve">1.2</w:t>
+              <w:t xml:space="preserve">1.3</w:t>
             </w:r>
           </w:p>
         </w:tc>
@@ -8073,7 +8073,7 @@
                 <w:sz w:val="18"/>
                 <w:szCs w:val="18"/>
               </w:rPr>
-              <w:t xml:space="preserve">Calcolo crediti: importare il tracciato nel calcolo (dai documenti della pratica o dal computer), singole letture, blocco dei dati personali, controlli di coerenza.</w:t>
+              <w:t xml:space="preserve">Rapporto di calcolo in PDF, archiviazione nella pratica, numero di registro, registro dei crediti.</w:t>
             </w:r>
           </w:p>
         </w:tc>
@@ -8143,7 +8143,7 @@
                 <w:sz w:val="18"/>
                 <w:szCs w:val="18"/>
               </w:rPr>
-              <w:t xml:space="preserve">1.1</w:t>
+              <w:t xml:space="preserve">1.2</w:t>
             </w:r>
           </w:p>
         </w:tc>
@@ -8209,7 +8209,7 @@
                 <w:sz w:val="18"/>
                 <w:szCs w:val="18"/>
               </w:rPr>
-              <w:t xml:space="preserve">Note di fase, Ente di Validazione della pratica, consultazione sulla pagina pubblica con conferma dell'email, moderazione con autori e allegati, errata corrige; nuovo capitolo Messaggi con il Comune; pagamenti visibili al Comune; Impostazioni: Enti di Validazione e Modelli di documento; notifiche aggiornate.</w:t>
+              <w:t xml:space="preserve">Calcolo crediti: importare il tracciato nel calcolo (dai documenti della pratica o dal computer), singole letture, blocco dei dati personali, controlli di coerenza.</w:t>
             </w:r>
           </w:p>
         </w:tc>
@@ -8279,6 +8279,140 @@
                 <w:sz w:val="18"/>
                 <w:szCs w:val="18"/>
               </w:rPr>
+              <w:t xml:space="preserve">1.1</w:t>
+            </w:r>
+          </w:p>
+        </w:tc>
+        <w:tc>
+          <w:tcPr>
+            <w:tcW w:type="dxa" w:w="1300"/>
+            <w:tcBorders>
+              <w:top w:val="single" w:color="D9D4C5" w:sz="4"/>
+              <w:left w:val="single" w:color="D9D4C5" w:sz="4"/>
+              <w:bottom w:val="single" w:color="D9D4C5" w:sz="4"/>
+              <w:right w:val="single" w:color="D9D4C5" w:sz="4"/>
+            </w:tcBorders>
+            <w:tcMar>
+              <w:top w:type="dxa" w:w="70"/>
+              <w:left w:type="dxa" w:w="110"/>
+              <w:bottom w:type="dxa" w:w="70"/>
+              <w:right w:type="dxa" w:w="110"/>
+            </w:tcMar>
+            <w:vAlign w:val="center"/>
+          </w:tcPr>
+          <w:p>
+            <w:pPr>
+              <w:spacing w:after="0" w:before="0"/>
+            </w:pPr>
+            <w:r>
+              <w:rPr>
+                <w:rFonts w:ascii="Arial" w:cs="Arial" w:eastAsia="Arial" w:hAnsi="Arial"/>
+                <w:color w:val="1B2118"/>
+                <w:sz w:val="18"/>
+                <w:szCs w:val="18"/>
+              </w:rPr>
+              <w:t xml:space="preserve">18/10/2026</w:t>
+            </w:r>
+          </w:p>
+        </w:tc>
+        <w:tc>
+          <w:tcPr>
+            <w:tcW w:type="dxa" w:w="5538"/>
+            <w:tcBorders>
+              <w:top w:val="single" w:color="D9D4C5" w:sz="4"/>
+              <w:left w:val="single" w:color="D9D4C5" w:sz="4"/>
+              <w:bottom w:val="single" w:color="D9D4C5" w:sz="4"/>
+              <w:right w:val="single" w:color="D9D4C5" w:sz="4"/>
+            </w:tcBorders>
+            <w:tcMar>
+              <w:top w:type="dxa" w:w="70"/>
+              <w:left w:type="dxa" w:w="110"/>
+              <w:bottom w:type="dxa" w:w="70"/>
+              <w:right w:type="dxa" w:w="110"/>
+            </w:tcMar>
+            <w:vAlign w:val="center"/>
+          </w:tcPr>
+          <w:p>
+            <w:pPr>
+              <w:spacing w:after="0" w:before="0"/>
+            </w:pPr>
+            <w:r>
+              <w:rPr>
+                <w:rFonts w:ascii="Arial" w:cs="Arial" w:eastAsia="Arial" w:hAnsi="Arial"/>
+                <w:color w:val="1B2118"/>
+                <w:sz w:val="18"/>
+                <w:szCs w:val="18"/>
+              </w:rPr>
+              <w:t xml:space="preserve">Note di fase, Ente di Validazione della pratica, consultazione sulla pagina pubblica con conferma dell'email, moderazione con autori e allegati, errata corrige; nuovo capitolo Messaggi con il Comune; pagamenti visibili al Comune; Impostazioni: Enti di Validazione e Modelli di documento; notifiche aggiornate.</w:t>
+            </w:r>
+          </w:p>
+        </w:tc>
+        <w:tc>
+          <w:tcPr>
+            <w:tcW w:type="dxa" w:w="2000"/>
+            <w:tcBorders>
+              <w:top w:val="single" w:color="D9D4C5" w:sz="4"/>
+              <w:left w:val="single" w:color="D9D4C5" w:sz="4"/>
+              <w:bottom w:val="single" w:color="D9D4C5" w:sz="4"/>
+              <w:right w:val="single" w:color="D9D4C5" w:sz="4"/>
+            </w:tcBorders>
+            <w:tcMar>
+              <w:top w:type="dxa" w:w="70"/>
+              <w:left w:type="dxa" w:w="110"/>
+              <w:bottom w:type="dxa" w:w="70"/>
+              <w:right w:type="dxa" w:w="110"/>
+            </w:tcMar>
+            <w:vAlign w:val="center"/>
+          </w:tcPr>
+          <w:p>
+            <w:pPr>
+              <w:spacing w:after="0" w:before="0"/>
+            </w:pPr>
+            <w:r>
+              <w:rPr>
+                <w:rFonts w:ascii="Arial" w:cs="Arial" w:eastAsia="Arial" w:hAnsi="Arial"/>
+                <w:color w:val="1B2118"/>
+                <w:sz w:val="18"/>
+                <w:szCs w:val="18"/>
+              </w:rPr>
+              <w:t xml:space="preserve">Fondazione Operate</w:t>
+            </w:r>
+          </w:p>
+        </w:tc>
+      </w:tr>
+      <w:tr>
+        <w:trPr>
+          <w:cantSplit/>
+        </w:trPr>
+        <w:tc>
+          <w:tcPr>
+            <w:tcW w:type="dxa" w:w="800"/>
+            <w:tcBorders>
+              <w:top w:val="single" w:color="D9D4C5" w:sz="4"/>
+              <w:left w:val="single" w:color="D9D4C5" w:sz="4"/>
+              <w:bottom w:val="single" w:color="D9D4C5" w:sz="4"/>
+              <w:right w:val="single" w:color="D9D4C5" w:sz="4"/>
+            </w:tcBorders>
+            <w:shd w:fill="F6F4EE" w:color="auto" w:val="clear"/>
+            <w:tcMar>
+              <w:top w:type="dxa" w:w="70"/>
+              <w:left w:type="dxa" w:w="110"/>
+              <w:bottom w:type="dxa" w:w="70"/>
+              <w:right w:type="dxa" w:w="110"/>
+            </w:tcMar>
+            <w:vAlign w:val="center"/>
+          </w:tcPr>
+          <w:p>
+            <w:pPr>
+              <w:spacing w:after="0" w:before="0"/>
+            </w:pPr>
+            <w:r>
+              <w:rPr>
+                <w:rFonts w:ascii="Arial" w:cs="Arial" w:eastAsia="Arial" w:hAnsi="Arial"/>
+                <w:color w:val="1B2118"/>
+                <w:sz w:val="18"/>
+                <w:szCs w:val="18"/>
+              </w:rPr>
               <w:t xml:space="preserve">1.0</w:t>
             </w:r>
           </w:p>
@@ -8292,6 +8426,7 @@
               <w:bottom w:val="single" w:color="D9D4C5" w:sz="4"/>
               <w:right w:val="single" w:color="D9D4C5" w:sz="4"/>
             </w:tcBorders>
+            <w:shd w:fill="F6F4EE" w:color="auto" w:val="clear"/>
             <w:tcMar>
               <w:top w:type="dxa" w:w="70"/>
               <w:left w:type="dxa" w:w="110"/>
@@ -8324,6 +8459,7 @@
               <w:bottom w:val="single" w:color="D9D4C5" w:sz="4"/>
               <w:right w:val="single" w:color="D9D4C5" w:sz="4"/>
             </w:tcBorders>
+            <w:shd w:fill="F6F4EE" w:color="auto" w:val="clear"/>
             <w:tcMar>
               <w:top w:type="dxa" w:w="70"/>
               <w:left w:type="dxa" w:w="110"/>
@@ -8356,6 +8492,7 @@
               <w:bottom w:val="single" w:color="D9D4C5" w:sz="4"/>
               <w:right w:val="single" w:color="D9D4C5" w:sz="4"/>
             </w:tcBorders>
+            <w:shd w:fill="F6F4EE" w:color="auto" w:val="clear"/>
             <w:tcMar>
               <w:top w:type="dxa" w:w="70"/>
               <w:left w:type="dxa" w:w="110"/>
@@ -8397,7 +8534,7 @@
           <w:sz w:val="20"/>
           <w:szCs w:val="20"/>
         </w:rPr>
-        <w:t xml:space="preserve">Questo documento descrive il portale alla revisione 6.6 del 26/10/2026. A ogni modifica del portale il manuale viene aggiornato e la revisione incrementata; la versione corrente si scarica dall'area Documentazione del portale (solo Amministratori).</w:t>
+        <w:t xml:space="preserve">Questo documento descrive il portale alla revisione 6.7 del 26/10/2026. A ogni modifica del portale il manuale viene aggiornato e la revisione incrementata; la versione corrente si scarica dall'area Documentazione del portale (solo Amministratori).</w:t>
       </w:r>
     </w:p>
     <w:p>
@@ -11306,7 +11443,7 @@
         </w:rPr>
         <w:t xml:space="preserve">Si accede da </w:t>
       </w:r>
-      <w:hyperlink w:history="1" r:id="rIdukobi57uccykkxpev7kw3">
+      <w:hyperlink w:history="1" r:id="rIdnm6pxdjwexcdqyvh-cjuo">
         <w:r>
           <w:rPr>
             <w:rFonts w:ascii="Arial" w:cs="Arial" w:eastAsia="Arial" w:hAnsi="Arial"/>
@@ -37966,7 +38103,47 @@
           <w:sz w:val="21"/>
           <w:szCs w:val="21"/>
         </w:rPr>
-        <w:t xml:space="preserve"> Questo modello contiene nomi e indirizzi, a differenza del tracciato attuale. Nel portale li vedono solo Operatori e Amministratori. Ogni consultazione dell'elenco finisce nell'Audit («consultazione utenze»), così come ogni caricamento («caricamento utenze», con il solo numero di utenze) e ogni cancellazione. Nomi e indirizzi non compaiono nei rapporti di calcolo, nei fascicoli né nelle pagine pubbliche. Prima dell'uso con dati reali servono la valutazione d'impatto (DPIA) e l'accordo sul trattamento con ogni Comune.</w:t>
+        <w:t xml:space="preserve"> Questo modello contiene nomi e indirizzi, a differenza del tracciato attuale. Nel portale li vedono solo Operatori e Amministratori. Ogni consultazione dell'elenco finisce nell'Audit («consultazione utenze»), così come ogni caricamento («caricamento utenze», con il solo numero di utenze) e ogni cancellazione. Nomi e indirizzi non compaiono nei rapporti di calcolo, nei fascicoli né nelle pagine pubbliche. Prima dell'uso con dati reali servono la valutazione d'impatto (DPIA) e l'accordo sul trattamento con ogni Comune: la </w:t>
+      </w:r>
+      <w:r>
+        <w:rPr>
+          <w:rFonts w:ascii="Arial" w:cs="Arial" w:eastAsia="Arial" w:hAnsi="Arial"/>
+          <w:b/>
+          <w:bCs/>
+          <w:color w:val="1B2118"/>
+          <w:sz w:val="21"/>
+          <w:szCs w:val="21"/>
+        </w:rPr>
+        <w:t xml:space="preserve">traccia della DPIA</w:t>
+      </w:r>
+      <w:r>
+        <w:rPr>
+          <w:rFonts w:ascii="Arial" w:cs="Arial" w:eastAsia="Arial" w:hAnsi="Arial"/>
+          <w:color w:val="1B2118"/>
+          <w:sz w:val="21"/>
+          <w:szCs w:val="21"/>
+        </w:rPr>
+        <w:t xml:space="preserve"> è nella pagina </w:t>
+      </w:r>
+      <w:r>
+        <w:rPr>
+          <w:rFonts w:ascii="Arial" w:cs="Arial" w:eastAsia="Arial" w:hAnsi="Arial"/>
+          <w:i/>
+          <w:iCs/>
+          <w:color w:val="1B2118"/>
+          <w:sz w:val="21"/>
+          <w:szCs w:val="21"/>
+        </w:rPr>
+        <w:t xml:space="preserve">Documentazione</w:t>
+      </w:r>
+      <w:r>
+        <w:rPr>
+          <w:rFonts w:ascii="Arial" w:cs="Arial" w:eastAsia="Arial" w:hAnsi="Arial"/>
+          <w:color w:val="1B2118"/>
+          <w:sz w:val="21"/>
+          <w:szCs w:val="21"/>
+        </w:rPr>
+        <w:t xml:space="preserve"> (dal 26/10/2026). Si scarica in Word, si manda al Comune, che la completa con il suo DPO nelle parti «da completare»; propone anche di caricare solo i codici delle utenze, senza nomi e indirizzi (pseudonimizzazione).</w:t>
       </w:r>
     </w:p>
     <w:p>
@@ -50024,9 +50201,9 @@
         <w:tblLayout w:type="fixed"/>
       </w:tblPr>
       <w:tblGrid>
-        <w:gridCol w:w="2137"/>
+        <w:gridCol w:w="2438"/>
         <w:gridCol w:w="2010"/>
-        <w:gridCol w:w="5491"/>
+        <w:gridCol w:w="5190"/>
       </w:tblGrid>
       <w:tr>
         <w:trPr>
@@ -50034,7 +50211,7 @@
         </w:trPr>
         <w:tc>
           <w:tcPr>
-            <w:tcW w:type="dxa" w:w="2137"/>
+            <w:tcW w:type="dxa" w:w="2438"/>
             <w:tcBorders>
               <w:top w:val="single" w:color="D9D4C5" w:sz="4"/>
               <w:left w:val="single" w:color="D9D4C5" w:sz="4"/>
@@ -50104,7 +50281,7 @@
         </w:tc>
         <w:tc>
           <w:tcPr>
-            <w:tcW w:type="dxa" w:w="5491"/>
+            <w:tcW w:type="dxa" w:w="5190"/>
             <w:tcBorders>
               <w:top w:val="single" w:color="D9D4C5" w:sz="4"/>
               <w:left w:val="single" w:color="D9D4C5" w:sz="4"/>
@@ -50144,7 +50321,7 @@
         </w:trPr>
         <w:tc>
           <w:tcPr>
-            <w:tcW w:type="dxa" w:w="2137"/>
+            <w:tcW w:type="dxa" w:w="2438"/>
             <w:tcBorders>
               <w:top w:val="single" w:color="D9D4C5" w:sz="4"/>
               <w:left w:val="single" w:color="D9D4C5" w:sz="4"/>
@@ -50208,7 +50385,7 @@
         </w:tc>
         <w:tc>
           <w:tcPr>
-            <w:tcW w:type="dxa" w:w="5491"/>
+            <w:tcW w:type="dxa" w:w="5190"/>
             <w:tcBorders>
               <w:top w:val="single" w:color="D9D4C5" w:sz="4"/>
               <w:left w:val="single" w:color="D9D4C5" w:sz="4"/>
@@ -50245,7 +50422,7 @@
         </w:trPr>
         <w:tc>
           <w:tcPr>
-            <w:tcW w:type="dxa" w:w="2137"/>
+            <w:tcW w:type="dxa" w:w="2438"/>
             <w:tcBorders>
               <w:top w:val="single" w:color="D9D4C5" w:sz="4"/>
               <w:left w:val="single" w:color="D9D4C5" w:sz="4"/>
@@ -50311,7 +50488,7 @@
         </w:tc>
         <w:tc>
           <w:tcPr>
-            <w:tcW w:type="dxa" w:w="5491"/>
+            <w:tcW w:type="dxa" w:w="5190"/>
             <w:tcBorders>
               <w:top w:val="single" w:color="D9D4C5" w:sz="4"/>
               <w:left w:val="single" w:color="D9D4C5" w:sz="4"/>
@@ -50349,7 +50526,7 @@
         </w:trPr>
         <w:tc>
           <w:tcPr>
-            <w:tcW w:type="dxa" w:w="2137"/>
+            <w:tcW w:type="dxa" w:w="2438"/>
             <w:tcBorders>
               <w:top w:val="single" w:color="D9D4C5" w:sz="4"/>
               <w:left w:val="single" w:color="D9D4C5" w:sz="4"/>
@@ -50413,7 +50590,7 @@
         </w:tc>
         <w:tc>
           <w:tcPr>
-            <w:tcW w:type="dxa" w:w="5491"/>
+            <w:tcW w:type="dxa" w:w="5190"/>
             <w:tcBorders>
               <w:top w:val="single" w:color="D9D4C5" w:sz="4"/>
               <w:left w:val="single" w:color="D9D4C5" w:sz="4"/>
@@ -50450,7 +50627,7 @@
         </w:trPr>
         <w:tc>
           <w:tcPr>
-            <w:tcW w:type="dxa" w:w="2137"/>
+            <w:tcW w:type="dxa" w:w="2438"/>
             <w:tcBorders>
               <w:top w:val="single" w:color="D9D4C5" w:sz="4"/>
               <w:left w:val="single" w:color="D9D4C5" w:sz="4"/>
@@ -50516,7 +50693,7 @@
         </w:tc>
         <w:tc>
           <w:tcPr>
-            <w:tcW w:type="dxa" w:w="5491"/>
+            <w:tcW w:type="dxa" w:w="5190"/>
             <w:tcBorders>
               <w:top w:val="single" w:color="D9D4C5" w:sz="4"/>
               <w:left w:val="single" w:color="D9D4C5" w:sz="4"/>
@@ -50554,7 +50731,7 @@
         </w:trPr>
         <w:tc>
           <w:tcPr>
-            <w:tcW w:type="dxa" w:w="2137"/>
+            <w:tcW w:type="dxa" w:w="2438"/>
             <w:tcBorders>
               <w:top w:val="single" w:color="D9D4C5" w:sz="4"/>
               <w:left w:val="single" w:color="D9D4C5" w:sz="4"/>
@@ -50618,7 +50795,7 @@
         </w:tc>
         <w:tc>
           <w:tcPr>
-            <w:tcW w:type="dxa" w:w="5491"/>
+            <w:tcW w:type="dxa" w:w="5190"/>
             <w:tcBorders>
               <w:top w:val="single" w:color="D9D4C5" w:sz="4"/>
               <w:left w:val="single" w:color="D9D4C5" w:sz="4"/>
@@ -50655,7 +50832,7 @@
         </w:trPr>
         <w:tc>
           <w:tcPr>
-            <w:tcW w:type="dxa" w:w="2137"/>
+            <w:tcW w:type="dxa" w:w="2438"/>
             <w:tcBorders>
               <w:top w:val="single" w:color="D9D4C5" w:sz="4"/>
               <w:left w:val="single" w:color="D9D4C5" w:sz="4"/>
@@ -50721,7 +50898,7 @@
         </w:tc>
         <w:tc>
           <w:tcPr>
-            <w:tcW w:type="dxa" w:w="5491"/>
+            <w:tcW w:type="dxa" w:w="5190"/>
             <w:tcBorders>
               <w:top w:val="single" w:color="D9D4C5" w:sz="4"/>
               <w:left w:val="single" w:color="D9D4C5" w:sz="4"/>
@@ -50759,13 +50936,115 @@
         </w:trPr>
         <w:tc>
           <w:tcPr>
-            <w:tcW w:type="dxa" w:w="2137"/>
-            <w:tcBorders>
-              <w:top w:val="single" w:color="D9D4C5" w:sz="4"/>
-              <w:left w:val="single" w:color="D9D4C5" w:sz="4"/>
-              <w:bottom w:val="single" w:color="D9D4C5" w:sz="4"/>
-              <w:right w:val="single" w:color="D9D4C5" w:sz="4"/>
-            </w:tcBorders>
+            <w:tcW w:type="dxa" w:w="2438"/>
+            <w:tcBorders>
+              <w:top w:val="single" w:color="D9D4C5" w:sz="4"/>
+              <w:left w:val="single" w:color="D9D4C5" w:sz="4"/>
+              <w:bottom w:val="single" w:color="D9D4C5" w:sz="4"/>
+              <w:right w:val="single" w:color="D9D4C5" w:sz="4"/>
+            </w:tcBorders>
+            <w:tcMar>
+              <w:top w:type="dxa" w:w="70"/>
+              <w:left w:type="dxa" w:w="110"/>
+              <w:bottom w:type="dxa" w:w="70"/>
+              <w:right w:type="dxa" w:w="110"/>
+            </w:tcMar>
+            <w:vAlign w:val="center"/>
+          </w:tcPr>
+          <w:p>
+            <w:pPr>
+              <w:spacing w:after="0" w:before="0"/>
+            </w:pPr>
+            <w:r>
+              <w:rPr>
+                <w:rFonts w:ascii="Arial" w:cs="Arial" w:eastAsia="Arial" w:hAnsi="Arial"/>
+                <w:color w:val="1B2118"/>
+                <w:sz w:val="18"/>
+                <w:szCs w:val="18"/>
+              </w:rPr>
+              <w:t xml:space="preserve">DPIA – Banca Dati Utenze (traccia)</w:t>
+            </w:r>
+          </w:p>
+        </w:tc>
+        <w:tc>
+          <w:tcPr>
+            <w:tcW w:type="dxa" w:w="2010"/>
+            <w:tcBorders>
+              <w:top w:val="single" w:color="D9D4C5" w:sz="4"/>
+              <w:left w:val="single" w:color="D9D4C5" w:sz="4"/>
+              <w:bottom w:val="single" w:color="D9D4C5" w:sz="4"/>
+              <w:right w:val="single" w:color="D9D4C5" w:sz="4"/>
+            </w:tcBorders>
+            <w:tcMar>
+              <w:top w:type="dxa" w:w="70"/>
+              <w:left w:type="dxa" w:w="110"/>
+              <w:bottom w:type="dxa" w:w="70"/>
+              <w:right w:type="dxa" w:w="110"/>
+            </w:tcMar>
+            <w:vAlign w:val="center"/>
+          </w:tcPr>
+          <w:p>
+            <w:pPr>
+              <w:spacing w:after="0" w:before="0"/>
+            </w:pPr>
+            <w:r>
+              <w:rPr>
+                <w:rFonts w:ascii="Arial" w:cs="Arial" w:eastAsia="Arial" w:hAnsi="Arial"/>
+                <w:color w:val="1B2118"/>
+                <w:sz w:val="18"/>
+                <w:szCs w:val="18"/>
+              </w:rPr>
+              <w:t xml:space="preserve">solo Amministratori</w:t>
+            </w:r>
+          </w:p>
+        </w:tc>
+        <w:tc>
+          <w:tcPr>
+            <w:tcW w:type="dxa" w:w="5190"/>
+            <w:tcBorders>
+              <w:top w:val="single" w:color="D9D4C5" w:sz="4"/>
+              <w:left w:val="single" w:color="D9D4C5" w:sz="4"/>
+              <w:bottom w:val="single" w:color="D9D4C5" w:sz="4"/>
+              <w:right w:val="single" w:color="D9D4C5" w:sz="4"/>
+            </w:tcBorders>
+            <w:tcMar>
+              <w:top w:type="dxa" w:w="70"/>
+              <w:left w:type="dxa" w:w="110"/>
+              <w:bottom w:type="dxa" w:w="70"/>
+              <w:right w:type="dxa" w:w="110"/>
+            </w:tcMar>
+            <w:vAlign w:val="center"/>
+          </w:tcPr>
+          <w:p>
+            <w:pPr>
+              <w:spacing w:after="0" w:before="0"/>
+            </w:pPr>
+            <w:r>
+              <w:rPr>
+                <w:rFonts w:ascii="Arial" w:cs="Arial" w:eastAsia="Arial" w:hAnsi="Arial"/>
+                <w:color w:val="1B2118"/>
+                <w:sz w:val="18"/>
+                <w:szCs w:val="18"/>
+              </w:rPr>
+              <w:t xml:space="preserve">Valutazione d'impatto sulla protezione dei dati (art. 35 GDPR) per le utenze: si scarica in Word e si manda al Comune, che la completa con il suo DPO prima di caricare utenze reali</w:t>
+            </w:r>
+          </w:p>
+        </w:tc>
+      </w:tr>
+      <w:tr>
+        <w:trPr>
+          <w:cantSplit/>
+        </w:trPr>
+        <w:tc>
+          <w:tcPr>
+            <w:tcW w:type="dxa" w:w="2438"/>
+            <w:tcBorders>
+              <w:top w:val="single" w:color="D9D4C5" w:sz="4"/>
+              <w:left w:val="single" w:color="D9D4C5" w:sz="4"/>
+              <w:bottom w:val="single" w:color="D9D4C5" w:sz="4"/>
+              <w:right w:val="single" w:color="D9D4C5" w:sz="4"/>
+            </w:tcBorders>
+            <w:shd w:fill="F6F4EE" w:color="auto" w:val="clear"/>
             <w:tcMar>
               <w:top w:type="dxa" w:w="70"/>
               <w:left w:type="dxa" w:w="110"/>
@@ -50798,6 +51077,7 @@
               <w:bottom w:val="single" w:color="D9D4C5" w:sz="4"/>
               <w:right w:val="single" w:color="D9D4C5" w:sz="4"/>
             </w:tcBorders>
+            <w:shd w:fill="F6F4EE" w:color="auto" w:val="clear"/>
             <w:tcMar>
               <w:top w:type="dxa" w:w="70"/>
               <w:left w:type="dxa" w:w="110"/>
@@ -50823,13 +51103,14 @@
         </w:tc>
         <w:tc>
           <w:tcPr>
-            <w:tcW w:type="dxa" w:w="5491"/>
-            <w:tcBorders>
-              <w:top w:val="single" w:color="D9D4C5" w:sz="4"/>
-              <w:left w:val="single" w:color="D9D4C5" w:sz="4"/>
-              <w:bottom w:val="single" w:color="D9D4C5" w:sz="4"/>
-              <w:right w:val="single" w:color="D9D4C5" w:sz="4"/>
-            </w:tcBorders>
+            <w:tcW w:type="dxa" w:w="5190"/>
+            <w:tcBorders>
+              <w:top w:val="single" w:color="D9D4C5" w:sz="4"/>
+              <w:left w:val="single" w:color="D9D4C5" w:sz="4"/>
+              <w:bottom w:val="single" w:color="D9D4C5" w:sz="4"/>
+              <w:right w:val="single" w:color="D9D4C5" w:sz="4"/>
+            </w:tcBorders>
+            <w:shd w:fill="F6F4EE" w:color="auto" w:val="clear"/>
             <w:tcMar>
               <w:top w:type="dxa" w:w="70"/>
               <w:left w:type="dxa" w:w="110"/>
@@ -55532,7 +55813,7 @@
         <w:szCs w:val="16"/>
       </w:rPr>
       <w:tab/>
-      <w:t xml:space="preserve">Manuale Amministratore · Rev. 6.6 · 26/10/2026</w:t>
+      <w:t xml:space="preserve">Manuale Amministratore · Rev. 6.7 · 26/10/2026</w:t>
     </w:r>
   </w:p>
 </w:hdr>
@@ -55597,7 +55878,7 @@
         <w:szCs w:val="16"/>
       </w:rPr>
       <w:tab/>
-      <w:t xml:space="preserve">Manuale Amministratore · Rev. 6.6 · 26/10/2026</w:t>
+      <w:t xml:space="preserve">Manuale Amministratore · Rev. 6.7 · 26/10/2026</w:t>
     </w:r>
   </w:p>
 </w:hdr>

</xml_diff>

<commit_message>
Documenti: prova di Borgoval e ISS-041
Co-Authored-By: Claude Opus 5.5 <noreply@anthropic.com>
Claude-Session: https://claude.ai/code/session_01E8XCbEeVHWVP3hntUZ6kZ1
</commit_message>
<xml_diff>
--- a/public/documentazione/Manuale_Amministratore_Portale_CWP.docx
+++ b/public/documentazione/Manuale_Amministratore_Portale_CWP.docx
@@ -302,7 +302,7 @@
                 <w:sz w:val="20"/>
                 <w:szCs w:val="20"/>
               </w:rPr>
-              <w:t xml:space="preserve">Rev. 6.7</w:t>
+              <w:t xml:space="preserve">Rev. 6.8</w:t>
             </w:r>
           </w:p>
         </w:tc>
@@ -719,7 +719,7 @@
                 <w:sz w:val="18"/>
                 <w:szCs w:val="18"/>
               </w:rPr>
-              <w:t xml:space="preserve">6.7</w:t>
+              <w:t xml:space="preserve">6.8</w:t>
             </w:r>
           </w:p>
         </w:tc>
@@ -783,7 +783,7 @@
                 <w:sz w:val="18"/>
                 <w:szCs w:val="18"/>
               </w:rPr>
-              <w:t xml:space="preserve">Traccia DPIA della Banca Dati Utenze nella pagina Documentazione.</w:t>
+              <w:t xml:space="preserve">Prova di Borgoval (simulatore e calcolo con 10.778 utenze).</w:t>
             </w:r>
           </w:p>
         </w:tc>
@@ -853,7 +853,7 @@
                 <w:sz w:val="18"/>
                 <w:szCs w:val="18"/>
               </w:rPr>
-              <w:t xml:space="preserve">6.6</w:t>
+              <w:t xml:space="preserve">6.7</w:t>
             </w:r>
           </w:p>
         </w:tc>
@@ -919,7 +919,7 @@
                 <w:sz w:val="18"/>
                 <w:szCs w:val="18"/>
               </w:rPr>
-              <w:t xml:space="preserve">Lettura dei siti: siti che rifiutano i programmi automatici.</w:t>
+              <w:t xml:space="preserve">Traccia DPIA della Banca Dati Utenze nella pagina Documentazione.</w:t>
             </w:r>
           </w:p>
         </w:tc>
@@ -989,7 +989,7 @@
                 <w:sz w:val="18"/>
                 <w:szCs w:val="18"/>
               </w:rPr>
-              <w:t xml:space="preserve">6.5</w:t>
+              <w:t xml:space="preserve">6.6</w:t>
             </w:r>
           </w:p>
         </w:tc>
@@ -1021,7 +1021,7 @@
                 <w:sz w:val="18"/>
                 <w:szCs w:val="18"/>
               </w:rPr>
-              <w:t xml:space="preserve">25/10/2026</w:t>
+              <w:t xml:space="preserve">26/10/2026</w:t>
             </w:r>
           </w:p>
         </w:tc>
@@ -1053,7 +1053,7 @@
                 <w:sz w:val="18"/>
                 <w:szCs w:val="18"/>
               </w:rPr>
-              <w:t xml:space="preserve">Listino sempre obbligatorio; Progetti esistenti a Caso 1.</w:t>
+              <w:t xml:space="preserve">Lettura dei siti: siti che rifiutano i programmi automatici.</w:t>
             </w:r>
           </w:p>
         </w:tc>
@@ -1123,7 +1123,7 @@
                 <w:sz w:val="18"/>
                 <w:szCs w:val="18"/>
               </w:rPr>
-              <w:t xml:space="preserve">6.4</w:t>
+              <w:t xml:space="preserve">6.5</w:t>
             </w:r>
           </w:p>
         </w:tc>
@@ -1189,7 +1189,7 @@
                 <w:sz w:val="18"/>
                 <w:szCs w:val="18"/>
               </w:rPr>
-              <w:t xml:space="preserve">Marketing: Lettura dei siti.</w:t>
+              <w:t xml:space="preserve">Listino sempre obbligatorio; Progetti esistenti a Caso 1.</w:t>
             </w:r>
           </w:p>
         </w:tc>
@@ -1259,7 +1259,7 @@
                 <w:sz w:val="18"/>
                 <w:szCs w:val="18"/>
               </w:rPr>
-              <w:t xml:space="preserve">6.3</w:t>
+              <w:t xml:space="preserve">6.4</w:t>
             </w:r>
           </w:p>
         </w:tc>
@@ -1291,7 +1291,7 @@
                 <w:sz w:val="18"/>
                 <w:szCs w:val="18"/>
               </w:rPr>
-              <w:t xml:space="preserve">23/10/2026</w:t>
+              <w:t xml:space="preserve">25/10/2026</w:t>
             </w:r>
           </w:p>
         </w:tc>
@@ -1323,7 +1323,7 @@
                 <w:sz w:val="18"/>
                 <w:szCs w:val="18"/>
               </w:rPr>
-              <w:t xml:space="preserve">Rapporto di Monitoraggio solo per Progetti registrati.</w:t>
+              <w:t xml:space="preserve">Marketing: Lettura dei siti.</w:t>
             </w:r>
           </w:p>
         </w:tc>
@@ -1393,7 +1393,7 @@
                 <w:sz w:val="18"/>
                 <w:szCs w:val="18"/>
               </w:rPr>
-              <w:t xml:space="preserve">6.2</w:t>
+              <w:t xml:space="preserve">6.3</w:t>
             </w:r>
           </w:p>
         </w:tc>
@@ -1459,7 +1459,7 @@
                 <w:sz w:val="18"/>
                 <w:szCs w:val="18"/>
               </w:rPr>
-              <w:t xml:space="preserve">Marketing: aggiornamento a blocchi e IndicePA non disponibile.</w:t>
+              <w:t xml:space="preserve">Rapporto di Monitoraggio solo per Progetti registrati.</w:t>
             </w:r>
           </w:p>
         </w:tc>
@@ -1529,7 +1529,7 @@
                 <w:sz w:val="18"/>
                 <w:szCs w:val="18"/>
               </w:rPr>
-              <w:t xml:space="preserve">6.1</w:t>
+              <w:t xml:space="preserve">6.2</w:t>
             </w:r>
           </w:p>
         </w:tc>
@@ -1593,7 +1593,7 @@
                 <w:sz w:val="18"/>
                 <w:szCs w:val="18"/>
               </w:rPr>
-              <w:t xml:space="preserve">Nuovo capitolo «Marketing: Comuni, gestori e campagne» (banche dati, campagne, pagina Approfondisci, richieste).</w:t>
+              <w:t xml:space="preserve">Marketing: aggiornamento a blocchi e IndicePA non disponibile.</w:t>
             </w:r>
           </w:p>
         </w:tc>
@@ -1663,7 +1663,7 @@
                 <w:sz w:val="18"/>
                 <w:szCs w:val="18"/>
               </w:rPr>
-              <w:t xml:space="preserve">6.0</w:t>
+              <w:t xml:space="preserve">6.1</w:t>
             </w:r>
           </w:p>
         </w:tc>
@@ -1729,7 +1729,7 @@
                 <w:sz w:val="18"/>
                 <w:szCs w:val="18"/>
               </w:rPr>
-              <w:t xml:space="preserve">Colori dello stato delle fasi in Dashboard e nella pratica.</w:t>
+              <w:t xml:space="preserve">Nuovo capitolo «Marketing: Comuni, gestori e campagne» (banche dati, campagne, pagina Approfondisci, richieste).</w:t>
             </w:r>
           </w:p>
         </w:tc>
@@ -1799,7 +1799,7 @@
                 <w:sz w:val="18"/>
                 <w:szCs w:val="18"/>
               </w:rPr>
-              <w:t xml:space="preserve">5.9</w:t>
+              <w:t xml:space="preserve">6.0</w:t>
             </w:r>
           </w:p>
         </w:tc>
@@ -1863,7 +1863,7 @@
                 <w:sz w:val="18"/>
                 <w:szCs w:val="18"/>
               </w:rPr>
-              <w:t xml:space="preserve">Nuovo progetto e dati della pratica: listino Caso 1 / Caso 2 e valore del progetto; Dashboard: valore dei progetti per il cliente.</w:t>
+              <w:t xml:space="preserve">Colori dello stato delle fasi in Dashboard e nella pratica.</w:t>
             </w:r>
           </w:p>
         </w:tc>
@@ -1933,7 +1933,7 @@
                 <w:sz w:val="18"/>
                 <w:szCs w:val="18"/>
               </w:rPr>
-              <w:t xml:space="preserve">5.8</w:t>
+              <w:t xml:space="preserve">5.9</w:t>
             </w:r>
           </w:p>
         </w:tc>
@@ -1999,7 +1999,7 @@
                 <w:sz w:val="18"/>
                 <w:szCs w:val="18"/>
               </w:rPr>
-              <w:t xml:space="preserve">Revisione generale al 23/10: protezione dei dati del tracciato e della Banca Dati Utenze per utenza.</w:t>
+              <w:t xml:space="preserve">Nuovo progetto e dati della pratica: listino Caso 1 / Caso 2 e valore del progetto; Dashboard: valore dei progetti per il cliente.</w:t>
             </w:r>
           </w:p>
         </w:tc>
@@ -2069,7 +2069,7 @@
                 <w:sz w:val="18"/>
                 <w:szCs w:val="18"/>
               </w:rPr>
-              <w:t xml:space="preserve">5.7</w:t>
+              <w:t xml:space="preserve">5.8</w:t>
             </w:r>
           </w:p>
         </w:tc>
@@ -2133,7 +2133,7 @@
                 <w:sz w:val="18"/>
                 <w:szCs w:val="18"/>
               </w:rPr>
-              <w:t xml:space="preserve">Dashboard: valore dei crediti in simulazione e in fase esecutiva; Impostazioni: prezzo di riferimento del credito.</w:t>
+              <w:t xml:space="preserve">Revisione generale al 23/10: protezione dei dati del tracciato e della Banca Dati Utenze per utenza.</w:t>
             </w:r>
           </w:p>
         </w:tc>
@@ -2203,7 +2203,7 @@
                 <w:sz w:val="18"/>
                 <w:szCs w:val="18"/>
               </w:rPr>
-              <w:t xml:space="preserve">5.6</w:t>
+              <w:t xml:space="preserve">5.7</w:t>
             </w:r>
           </w:p>
         </w:tc>
@@ -2269,7 +2269,7 @@
                 <w:sz w:val="18"/>
                 <w:szCs w:val="18"/>
               </w:rPr>
-              <w:t xml:space="preserve">Passo 5a: «Calcola» usa le utenze (categoria di simulazione come classe della delibera, kg misurati, frazioni per utenza); utenze senza categoria o fuori delibera escluse e conferma bloccata; fonte nei Risultati, nel CSV e nel PDF.</w:t>
+              <w:t xml:space="preserve">Dashboard: valore dei crediti in simulazione e in fase esecutiva; Impostazioni: prezzo di riferimento del credito.</w:t>
             </w:r>
           </w:p>
         </w:tc>
@@ -2339,7 +2339,7 @@
                 <w:sz w:val="18"/>
                 <w:szCs w:val="18"/>
               </w:rPr>
-              <w:t xml:space="preserve">5.5</w:t>
+              <w:t xml:space="preserve">5.6</w:t>
             </w:r>
           </w:p>
         </w:tc>
@@ -2371,7 +2371,7 @@
                 <w:sz w:val="18"/>
                 <w:szCs w:val="18"/>
               </w:rPr>
-              <w:t xml:space="preserve">22/10/2026</w:t>
+              <w:t xml:space="preserve">23/10/2026</w:t>
             </w:r>
           </w:p>
         </w:tc>
@@ -2403,7 +2403,7 @@
                 <w:sz w:val="18"/>
                 <w:szCs w:val="18"/>
               </w:rPr>
-              <w:t xml:space="preserve">Audit delle utenze; calcolo di prova.</w:t>
+              <w:t xml:space="preserve">Passo 5a: «Calcola» usa le utenze (categoria di simulazione come classe della delibera, kg misurati, frazioni per utenza); utenze senza categoria o fuori delibera escluse e conferma bloccata; fonte nei Risultati, nel CSV e nel PDF.</w:t>
             </w:r>
           </w:p>
         </w:tc>
@@ -2473,7 +2473,7 @@
                 <w:sz w:val="18"/>
                 <w:szCs w:val="18"/>
               </w:rPr>
-              <w:t xml:space="preserve">5.4</w:t>
+              <w:t xml:space="preserve">5.5</w:t>
             </w:r>
           </w:p>
         </w:tc>
@@ -2539,7 +2539,7 @@
                 <w:sz w:val="18"/>
                 <w:szCs w:val="18"/>
               </w:rPr>
-              <w:t xml:space="preserve">Gestione delle utenze nel passo 5a del calcolo: caricamento, schede, modulo; categorie tariffaria e di simulazione.</w:t>
+              <w:t xml:space="preserve">Audit delle utenze; calcolo di prova.</w:t>
             </w:r>
           </w:p>
         </w:tc>
@@ -2609,7 +2609,7 @@
                 <w:sz w:val="18"/>
                 <w:szCs w:val="18"/>
               </w:rPr>
-              <w:t xml:space="preserve">5.3</w:t>
+              <w:t xml:space="preserve">5.4</w:t>
             </w:r>
           </w:p>
         </w:tc>
@@ -2673,7 +2673,7 @@
                 <w:sz w:val="18"/>
                 <w:szCs w:val="18"/>
               </w:rPr>
-              <w:t xml:space="preserve">Banca Dati Utenze per utenza: campi, regole, dati personali.</w:t>
+              <w:t xml:space="preserve">Gestione delle utenze nel passo 5a del calcolo: caricamento, schede, modulo; categorie tariffaria e di simulazione.</w:t>
             </w:r>
           </w:p>
         </w:tc>
@@ -2743,7 +2743,7 @@
                 <w:sz w:val="18"/>
                 <w:szCs w:val="18"/>
               </w:rPr>
-              <w:t xml:space="preserve">5.2</w:t>
+              <w:t xml:space="preserve">5.3</w:t>
             </w:r>
           </w:p>
         </w:tc>
@@ -2809,7 +2809,7 @@
                 <w:sz w:val="18"/>
                 <w:szCs w:val="18"/>
               </w:rPr>
-              <w:t xml:space="preserve">Uso dal telefono: menu a pannello, schede in Dashboard e Audit, elenco e dettaglio delle pratiche.</w:t>
+              <w:t xml:space="preserve">Banca Dati Utenze per utenza: campi, regole, dati personali.</w:t>
             </w:r>
           </w:p>
         </w:tc>
@@ -2879,7 +2879,7 @@
                 <w:sz w:val="18"/>
                 <w:szCs w:val="18"/>
               </w:rPr>
-              <w:t xml:space="preserve">5.1</w:t>
+              <w:t xml:space="preserve">5.2</w:t>
             </w:r>
           </w:p>
         </w:tc>
@@ -2943,7 +2943,7 @@
                 <w:sz w:val="18"/>
                 <w:szCs w:val="18"/>
               </w:rPr>
-              <w:t xml:space="preserve">Rilievi N01-N06: costi una tantum in 10 rate, feedback pubblico e fase 3, ente prima della fase 5, riquadro «Fase aperta senza scadenza», avviso sui codici, frazioni del fattore dell'indifferenziato.</w:t>
+              <w:t xml:space="preserve">Uso dal telefono: menu a pannello, schede in Dashboard e Audit, elenco e dettaglio delle pratiche.</w:t>
             </w:r>
           </w:p>
         </w:tc>
@@ -3013,7 +3013,7 @@
                 <w:sz w:val="18"/>
                 <w:szCs w:val="18"/>
               </w:rPr>
-              <w:t xml:space="preserve">5.0</w:t>
+              <w:t xml:space="preserve">5.1</w:t>
             </w:r>
           </w:p>
         </w:tc>
@@ -3046,7 +3046,7 @@
                 <w:sz w:val="18"/>
                 <w:szCs w:val="18"/>
               </w:rPr>
-              <w:t xml:space="preserve">21/10/2026</w:t>
+              <w:t xml:space="preserve">22/10/2026</w:t>
             </w:r>
           </w:p>
         </w:tc>
@@ -3079,7 +3079,7 @@
                 <w:sz w:val="18"/>
                 <w:szCs w:val="18"/>
               </w:rPr>
-              <w:t xml:space="preserve">«News» diventa «Notizie CO2»; Google News attraverso il tramite; barra a LED nell'elenco e nella pratica. Pallino verde delle Notizie CO2 nuove. Notizie CO2: siti di notizie ambientali al posto di Google News. Notizie CO2: siti di notizie ambientali al posto di Google News.</w:t>
+              <w:t xml:space="preserve">Rilievi N01-N06: costi una tantum in 10 rate, feedback pubblico e fase 3, ente prima della fase 5, riquadro «Fase aperta senza scadenza», avviso sui codici, frazioni del fattore dell'indifferenziato.</w:t>
             </w:r>
           </w:p>
         </w:tc>
@@ -3149,7 +3149,7 @@
                 <w:sz w:val="18"/>
                 <w:szCs w:val="18"/>
               </w:rPr>
-              <w:t xml:space="preserve">4.9</w:t>
+              <w:t xml:space="preserve">5.0</w:t>
             </w:r>
           </w:p>
         </w:tc>
@@ -3213,7 +3213,7 @@
                 <w:sz w:val="18"/>
                 <w:szCs w:val="18"/>
               </w:rPr>
-              <w:t xml:space="preserve">Nuovo capitolo «News»: osservatorio sui crediti di carbonio volontari. Canali Bing News e Verra.</w:t>
+              <w:t xml:space="preserve">«News» diventa «Notizie CO2»; Google News attraverso il tramite; barra a LED nell'elenco e nella pratica. Pallino verde delle Notizie CO2 nuove. Notizie CO2: siti di notizie ambientali al posto di Google News. Notizie CO2: siti di notizie ambientali al posto di Google News.</w:t>
             </w:r>
           </w:p>
         </w:tc>
@@ -3283,7 +3283,7 @@
                 <w:sz w:val="18"/>
                 <w:szCs w:val="18"/>
               </w:rPr>
-              <w:t xml:space="preserve">4.8</w:t>
+              <w:t xml:space="preserve">4.9</w:t>
             </w:r>
           </w:p>
         </w:tc>
@@ -3349,7 +3349,7 @@
                 <w:sz w:val="18"/>
                 <w:szCs w:val="18"/>
               </w:rPr>
-              <w:t xml:space="preserve">Simulatore: il PDF scaricato riporta tutti i dati della pagina, i costi e i grafici; foglio Excel «Dati inseriti».</w:t>
+              <w:t xml:space="preserve">Nuovo capitolo «News»: osservatorio sui crediti di carbonio volontari. Canali Bing News e Verra.</w:t>
             </w:r>
           </w:p>
         </w:tc>
@@ -3419,7 +3419,7 @@
                 <w:sz w:val="18"/>
                 <w:szCs w:val="18"/>
               </w:rPr>
-              <w:t xml:space="preserve">4.7</w:t>
+              <w:t xml:space="preserve">4.8</w:t>
             </w:r>
           </w:p>
         </w:tc>
@@ -3483,7 +3483,7 @@
                 <w:sz w:val="18"/>
                 <w:szCs w:val="18"/>
               </w:rPr>
-              <w:t xml:space="preserve">Assistente per gli Operatori e domande sulla pratica aperta; menu dell'Operatore con il Simulatore.</w:t>
+              <w:t xml:space="preserve">Simulatore: il PDF scaricato riporta tutti i dati della pagina, i costi e i grafici; foglio Excel «Dati inseriti».</w:t>
             </w:r>
           </w:p>
         </w:tc>
@@ -3553,7 +3553,7 @@
                 <w:sz w:val="18"/>
                 <w:szCs w:val="18"/>
               </w:rPr>
-              <w:t xml:space="preserve">4.6</w:t>
+              <w:t xml:space="preserve">4.7</w:t>
             </w:r>
           </w:p>
         </w:tc>
@@ -3619,7 +3619,7 @@
                 <w:sz w:val="18"/>
                 <w:szCs w:val="18"/>
               </w:rPr>
-              <w:t xml:space="preserve">Capitolo «Backup automatico».</w:t>
+              <w:t xml:space="preserve">Assistente per gli Operatori e domande sulla pratica aperta; menu dell'Operatore con il Simulatore.</w:t>
             </w:r>
           </w:p>
         </w:tc>
@@ -3689,7 +3689,7 @@
                 <w:sz w:val="18"/>
                 <w:szCs w:val="18"/>
               </w:rPr>
-              <w:t xml:space="preserve">4.5</w:t>
+              <w:t xml:space="preserve">4.6</w:t>
             </w:r>
           </w:p>
         </w:tc>
@@ -3753,7 +3753,7 @@
                 <w:sz w:val="18"/>
                 <w:szCs w:val="18"/>
               </w:rPr>
-              <w:t xml:space="preserve">Nuovo documento «Registro issue e test» tra quelli scaricabili.</w:t>
+              <w:t xml:space="preserve">Capitolo «Backup automatico».</w:t>
             </w:r>
           </w:p>
         </w:tc>
@@ -3823,7 +3823,7 @@
                 <w:sz w:val="18"/>
                 <w:szCs w:val="18"/>
               </w:rPr>
-              <w:t xml:space="preserve">4.4</w:t>
+              <w:t xml:space="preserve">4.5</w:t>
             </w:r>
           </w:p>
         </w:tc>
@@ -3889,7 +3889,7 @@
                 <w:sz w:val="18"/>
                 <w:szCs w:val="18"/>
               </w:rPr>
-              <w:t xml:space="preserve">Collaudo V05: testo completo dei valori lunghi nell'Audit (Prima/Dopo, Tolto/Aggiunto), denominazione delle organizzazioni e ricerca sui valori cambiati; pagina «Account disattivato».</w:t>
+              <w:t xml:space="preserve">Nuovo documento «Registro issue e test» tra quelli scaricabili.</w:t>
             </w:r>
           </w:p>
         </w:tc>
@@ -3959,7 +3959,7 @@
                 <w:sz w:val="18"/>
                 <w:szCs w:val="18"/>
               </w:rPr>
-              <w:t xml:space="preserve">4.3</w:t>
+              <w:t xml:space="preserve">4.4</w:t>
             </w:r>
           </w:p>
         </w:tc>
@@ -3991,7 +3991,7 @@
                 <w:sz w:val="18"/>
                 <w:szCs w:val="18"/>
               </w:rPr>
-              <w:t xml:space="preserve">20/10/2026</w:t>
+              <w:t xml:space="preserve">21/10/2026</w:t>
             </w:r>
           </w:p>
         </w:tc>
@@ -4023,7 +4023,7 @@
                 <w:sz w:val="18"/>
                 <w:szCs w:val="18"/>
               </w:rPr>
-              <w:t xml:space="preserve">Correzioni del collaudo V01: import CSV della Banca Dati «tutto o niente» senza valori negativi, calcolo bloccato con dati non ammessi, buffer manuale 0-80%, conferma definitiva solo senza errori di coerenza, dati non ammessi nel simulatore e zero esplicito nei prezzi, colonna «Oggetto e modifiche» nell'Audit.</w:t>
+              <w:t xml:space="preserve">Collaudo V05: testo completo dei valori lunghi nell'Audit (Prima/Dopo, Tolto/Aggiunto), denominazione delle organizzazioni e ricerca sui valori cambiati; pagina «Account disattivato».</w:t>
             </w:r>
           </w:p>
         </w:tc>
@@ -4093,7 +4093,7 @@
                 <w:sz w:val="18"/>
                 <w:szCs w:val="18"/>
               </w:rPr>
-              <w:t xml:space="preserve">4.2</w:t>
+              <w:t xml:space="preserve">4.3</w:t>
             </w:r>
           </w:p>
         </w:tc>
@@ -4159,7 +4159,7 @@
                 <w:sz w:val="18"/>
                 <w:szCs w:val="18"/>
               </w:rPr>
-              <w:t xml:space="preserve">Nuovo capitolo «Sicurezza»: inattività, avvisi, protezioni del sito e del database.</w:t>
+              <w:t xml:space="preserve">Correzioni del collaudo V01: import CSV della Banca Dati «tutto o niente» senza valori negativi, calcolo bloccato con dati non ammessi, buffer manuale 0-80%, conferma definitiva solo senza errori di coerenza, dati non ammessi nel simulatore e zero esplicito nei prezzi, colonna «Oggetto e modifiche» nell'Audit.</w:t>
             </w:r>
           </w:p>
         </w:tc>
@@ -4229,7 +4229,7 @@
                 <w:sz w:val="18"/>
                 <w:szCs w:val="18"/>
               </w:rPr>
-              <w:t xml:space="preserve">4.1</w:t>
+              <w:t xml:space="preserve">4.2</w:t>
             </w:r>
           </w:p>
         </w:tc>
@@ -4293,7 +4293,7 @@
                 <w:sz w:val="18"/>
                 <w:szCs w:val="18"/>
               </w:rPr>
-              <w:t xml:space="preserve">Voci di menu degli enti aggiornate.</w:t>
+              <w:t xml:space="preserve">Nuovo capitolo «Sicurezza»: inattività, avvisi, protezioni del sito e del database.</w:t>
             </w:r>
           </w:p>
         </w:tc>
@@ -4363,7 +4363,7 @@
                 <w:sz w:val="18"/>
                 <w:szCs w:val="18"/>
               </w:rPr>
-              <w:t xml:space="preserve">4.0</w:t>
+              <w:t xml:space="preserve">4.1</w:t>
             </w:r>
           </w:p>
         </w:tc>
@@ -4429,7 +4429,7 @@
                 <w:sz w:val="18"/>
                 <w:szCs w:val="18"/>
               </w:rPr>
-              <w:t xml:space="preserve">Nuovo ordine del menu; la sezione si chiama «Audit User». Voce «Marketplaces» in arrivo.</w:t>
+              <w:t xml:space="preserve">Voci di menu degli enti aggiornate.</w:t>
             </w:r>
           </w:p>
         </w:tc>
@@ -4499,7 +4499,7 @@
                 <w:sz w:val="18"/>
                 <w:szCs w:val="18"/>
               </w:rPr>
-              <w:t xml:space="preserve">3.9</w:t>
+              <w:t xml:space="preserve">4.0</w:t>
             </w:r>
           </w:p>
         </w:tc>
@@ -4563,7 +4563,7 @@
                 <w:sz w:val="18"/>
                 <w:szCs w:val="18"/>
               </w:rPr>
-              <w:t xml:space="preserve">Nuovo capitolo «Audit trail user».</w:t>
+              <w:t xml:space="preserve">Nuovo ordine del menu; la sezione si chiama «Audit User». Voce «Marketplaces» in arrivo.</w:t>
             </w:r>
           </w:p>
         </w:tc>
@@ -4633,7 +4633,7 @@
                 <w:sz w:val="18"/>
                 <w:szCs w:val="18"/>
               </w:rPr>
-              <w:t xml:space="preserve">3.8</w:t>
+              <w:t xml:space="preserve">3.9</w:t>
             </w:r>
           </w:p>
         </w:tc>
@@ -4699,7 +4699,7 @@
                 <w:sz w:val="18"/>
                 <w:szCs w:val="18"/>
               </w:rPr>
-              <w:t xml:space="preserve">Utenti online; PDF ed Excel del simulatore; messaggi d'errore dell'assistente.</w:t>
+              <w:t xml:space="preserve">Nuovo capitolo «Audit trail user».</w:t>
             </w:r>
           </w:p>
         </w:tc>
@@ -4769,7 +4769,7 @@
                 <w:sz w:val="18"/>
                 <w:szCs w:val="18"/>
               </w:rPr>
-              <w:t xml:space="preserve">3.7</w:t>
+              <w:t xml:space="preserve">3.8</w:t>
             </w:r>
           </w:p>
         </w:tc>
@@ -4801,7 +4801,7 @@
                 <w:sz w:val="18"/>
                 <w:szCs w:val="18"/>
               </w:rPr>
-              <w:t xml:space="preserve">19/10/2026</w:t>
+              <w:t xml:space="preserve">20/10/2026</w:t>
             </w:r>
           </w:p>
         </w:tc>
@@ -4833,7 +4833,7 @@
                 <w:sz w:val="18"/>
                 <w:szCs w:val="18"/>
               </w:rPr>
-              <w:t xml:space="preserve">Assistente virtuale: messaggio «Un attimo…» durante l'attesa.</w:t>
+              <w:t xml:space="preserve">Utenti online; PDF ed Excel del simulatore; messaggi d'errore dell'assistente.</w:t>
             </w:r>
           </w:p>
         </w:tc>
@@ -4903,7 +4903,7 @@
                 <w:sz w:val="18"/>
                 <w:szCs w:val="18"/>
               </w:rPr>
-              <w:t xml:space="preserve">3.6</w:t>
+              <w:t xml:space="preserve">3.7</w:t>
             </w:r>
           </w:p>
         </w:tc>
@@ -4969,7 +4969,7 @@
                 <w:sz w:val="18"/>
                 <w:szCs w:val="18"/>
               </w:rPr>
-              <w:t xml:space="preserve">Assistente virtuale attivo: chiave legata a uno spazio di lavoro, crediti e consumi.</w:t>
+              <w:t xml:space="preserve">Assistente virtuale: messaggio «Un attimo…» durante l'attesa.</w:t>
             </w:r>
           </w:p>
         </w:tc>
@@ -5039,7 +5039,7 @@
                 <w:sz w:val="18"/>
                 <w:szCs w:val="18"/>
               </w:rPr>
-              <w:t xml:space="preserve">3.5</w:t>
+              <w:t xml:space="preserve">3.6</w:t>
             </w:r>
           </w:p>
         </w:tc>
@@ -5103,7 +5103,7 @@
                 <w:sz w:val="18"/>
                 <w:szCs w:val="18"/>
               </w:rPr>
-              <w:t xml:space="preserve">Assistente virtuale; documenti ufficiali del Programma nella Documentazione.</w:t>
+              <w:t xml:space="preserve">Assistente virtuale attivo: chiave legata a uno spazio di lavoro, crediti e consumi.</w:t>
             </w:r>
           </w:p>
         </w:tc>
@@ -5173,7 +5173,7 @@
                 <w:sz w:val="18"/>
                 <w:szCs w:val="18"/>
               </w:rPr>
-              <w:t xml:space="preserve">3.4</w:t>
+              <w:t xml:space="preserve">3.5</w:t>
             </w:r>
           </w:p>
         </w:tc>
@@ -5239,7 +5239,7 @@
                 <w:sz w:val="18"/>
                 <w:szCs w:val="18"/>
               </w:rPr>
-              <w:t xml:space="preserve">Presentazione di riepilogo nella pagina Documentazione.</w:t>
+              <w:t xml:space="preserve">Assistente virtuale; documenti ufficiali del Programma nella Documentazione.</w:t>
             </w:r>
           </w:p>
         </w:tc>
@@ -5309,7 +5309,7 @@
                 <w:sz w:val="18"/>
                 <w:szCs w:val="18"/>
               </w:rPr>
-              <w:t xml:space="preserve">3.3</w:t>
+              <w:t xml:space="preserve">3.4</w:t>
             </w:r>
           </w:p>
         </w:tc>
@@ -5373,7 +5373,7 @@
                 <w:sz w:val="18"/>
                 <w:szCs w:val="18"/>
               </w:rPr>
-              <w:t xml:space="preserve">Ordinamento di tutte le tabelle e degli elenchi.</w:t>
+              <w:t xml:space="preserve">Presentazione di riepilogo nella pagina Documentazione.</w:t>
             </w:r>
           </w:p>
         </w:tc>
@@ -5443,7 +5443,7 @@
                 <w:sz w:val="18"/>
                 <w:szCs w:val="18"/>
               </w:rPr>
-              <w:t xml:space="preserve">3.2</w:t>
+              <w:t xml:space="preserve">3.3</w:t>
             </w:r>
           </w:p>
         </w:tc>
@@ -5509,7 +5509,7 @@
                 <w:sz w:val="18"/>
                 <w:szCs w:val="18"/>
               </w:rPr>
-              <w:t xml:space="preserve">Simulatore: metodo di stima per utenza (solo utenze virtuose), buffer del Capitolo 7, taratura.</w:t>
+              <w:t xml:space="preserve">Ordinamento di tutte le tabelle e degli elenchi.</w:t>
             </w:r>
           </w:p>
         </w:tc>
@@ -5579,7 +5579,7 @@
                 <w:sz w:val="18"/>
                 <w:szCs w:val="18"/>
               </w:rPr>
-              <w:t xml:space="preserve">3.1</w:t>
+              <w:t xml:space="preserve">3.2</w:t>
             </w:r>
           </w:p>
         </w:tc>
@@ -5643,7 +5643,7 @@
                 <w:sz w:val="18"/>
                 <w:szCs w:val="18"/>
               </w:rPr>
-              <w:t xml:space="preserve">Cruscotto diventa Dashboard; barra a LED delle 7 fasi per ogni pratica.</w:t>
+              <w:t xml:space="preserve">Simulatore: metodo di stima per utenza (solo utenze virtuose), buffer del Capitolo 7, taratura.</w:t>
             </w:r>
           </w:p>
         </w:tc>
@@ -5713,7 +5713,7 @@
                 <w:sz w:val="18"/>
                 <w:szCs w:val="18"/>
               </w:rPr>
-              <w:t xml:space="preserve">3.0</w:t>
+              <w:t xml:space="preserve">3.1</w:t>
             </w:r>
           </w:p>
         </w:tc>
@@ -5779,7 +5779,7 @@
                 <w:sz w:val="18"/>
                 <w:szCs w:val="18"/>
               </w:rPr>
-              <w:t xml:space="preserve">Eliminazione degli utenti che non hanno mai operato (script 30).</w:t>
+              <w:t xml:space="preserve">Cruscotto diventa Dashboard; barra a LED delle 7 fasi per ogni pratica.</w:t>
             </w:r>
           </w:p>
         </w:tc>
@@ -5849,7 +5849,7 @@
                 <w:sz w:val="18"/>
                 <w:szCs w:val="18"/>
               </w:rPr>
-              <w:t xml:space="preserve">2.9</w:t>
+              <w:t xml:space="preserve">3.0</w:t>
             </w:r>
           </w:p>
         </w:tc>
@@ -5913,7 +5913,7 @@
                 <w:sz w:val="18"/>
                 <w:szCs w:val="18"/>
               </w:rPr>
-              <w:t xml:space="preserve">Email automatica con le credenziali al nuovo utente e alla reimpostazione della password.</w:t>
+              <w:t xml:space="preserve">Eliminazione degli utenti che non hanno mai operato (script 30).</w:t>
             </w:r>
           </w:p>
         </w:tc>
@@ -5983,7 +5983,7 @@
                 <w:sz w:val="18"/>
                 <w:szCs w:val="18"/>
               </w:rPr>
-              <w:t xml:space="preserve">2.8</w:t>
+              <w:t xml:space="preserve">2.9</w:t>
             </w:r>
           </w:p>
         </w:tc>
@@ -6049,7 +6049,7 @@
                 <w:sz w:val="18"/>
                 <w:szCs w:val="18"/>
               </w:rPr>
-              <w:t xml:space="preserve">Più Amministratori con accesso completo; Amministratore principale protetto (script 29).</w:t>
+              <w:t xml:space="preserve">Email automatica con le credenziali al nuovo utente e alla reimpostazione della password.</w:t>
             </w:r>
           </w:p>
         </w:tc>
@@ -6119,7 +6119,7 @@
                 <w:sz w:val="18"/>
                 <w:szCs w:val="18"/>
               </w:rPr>
-              <w:t xml:space="preserve">2.7</w:t>
+              <w:t xml:space="preserve">2.8</w:t>
             </w:r>
           </w:p>
         </w:tc>
@@ -6183,7 +6183,7 @@
                 <w:sz w:val="18"/>
                 <w:szCs w:val="18"/>
               </w:rPr>
-              <w:t xml:space="preserve">Simulatore: costi per il Comune secondo il Caso 1 (progetto volontario) o il Caso 2 (progetto obbligatorio da bando).</w:t>
+              <w:t xml:space="preserve">Più Amministratori con accesso completo; Amministratore principale protetto (script 29).</w:t>
             </w:r>
           </w:p>
         </w:tc>
@@ -6253,7 +6253,7 @@
                 <w:sz w:val="18"/>
                 <w:szCs w:val="18"/>
               </w:rPr>
-              <w:t xml:space="preserve">2.6</w:t>
+              <w:t xml:space="preserve">2.7</w:t>
             </w:r>
           </w:p>
         </w:tc>
@@ -6319,7 +6319,7 @@
                 <w:sz w:val="18"/>
                 <w:szCs w:val="18"/>
               </w:rPr>
-              <w:t xml:space="preserve">Simulatore: valore del credito anno per anno, proposto 32 €.</w:t>
+              <w:t xml:space="preserve">Simulatore: costi per il Comune secondo il Caso 1 (progetto volontario) o il Caso 2 (progetto obbligatorio da bando).</w:t>
             </w:r>
           </w:p>
         </w:tc>
@@ -6389,7 +6389,7 @@
                 <w:sz w:val="18"/>
                 <w:szCs w:val="18"/>
               </w:rPr>
-              <w:t xml:space="preserve">2.5</w:t>
+              <w:t xml:space="preserve">2.6</w:t>
             </w:r>
           </w:p>
         </w:tc>
@@ -6453,7 +6453,7 @@
                 <w:sz w:val="18"/>
                 <w:szCs w:val="18"/>
               </w:rPr>
-              <w:t xml:space="preserve">Simulatore: simulazione economica con valore unitario del credito e costi per il Comune (contratti tipo della Fondazione, Schema tariffario).</w:t>
+              <w:t xml:space="preserve">Simulatore: valore del credito anno per anno, proposto 32 €.</w:t>
             </w:r>
           </w:p>
         </w:tc>
@@ -6523,7 +6523,7 @@
                 <w:sz w:val="18"/>
                 <w:szCs w:val="18"/>
               </w:rPr>
-              <w:t xml:space="preserve">2.4</w:t>
+              <w:t xml:space="preserve">2.5</w:t>
             </w:r>
           </w:p>
         </w:tc>
@@ -6589,7 +6589,7 @@
                 <w:sz w:val="18"/>
                 <w:szCs w:val="18"/>
               </w:rPr>
-              <w:t xml:space="preserve">Simulatore: riferimento sempre alla soglia del 65% di differenziata e controllo dei valori fuori scala.</w:t>
+              <w:t xml:space="preserve">Simulatore: simulazione economica con valore unitario del credito e costi per il Comune (contratti tipo della Fondazione, Schema tariffario).</w:t>
             </w:r>
           </w:p>
         </w:tc>
@@ -6659,7 +6659,7 @@
                 <w:sz w:val="18"/>
                 <w:szCs w:val="18"/>
               </w:rPr>
-              <w:t xml:space="preserve">2.3</w:t>
+              <w:t xml:space="preserve">2.4</w:t>
             </w:r>
           </w:p>
         </w:tc>
@@ -6723,7 +6723,7 @@
                 <w:sz w:val="18"/>
                 <w:szCs w:val="18"/>
               </w:rPr>
-              <w:t xml:space="preserve">Simulatore conforme al modello CWP: scenario di riferimento dello Standard 4.8.1, situazione attuale, conformità.</w:t>
+              <w:t xml:space="preserve">Simulatore: riferimento sempre alla soglia del 65% di differenziata e controllo dei valori fuori scala.</w:t>
             </w:r>
           </w:p>
         </w:tc>
@@ -6793,7 +6793,7 @@
                 <w:sz w:val="18"/>
                 <w:szCs w:val="18"/>
               </w:rPr>
-              <w:t xml:space="preserve">2.2</w:t>
+              <w:t xml:space="preserve">2.3</w:t>
             </w:r>
           </w:p>
         </w:tc>
@@ -6859,7 +6859,7 @@
                 <w:sz w:val="18"/>
                 <w:szCs w:val="18"/>
               </w:rPr>
-              <w:t xml:space="preserve">Nuovo capitolo «Simulatore di scenari»: creazione, anno base, obiettivi annui, risultati, modello di stima.</w:t>
+              <w:t xml:space="preserve">Simulatore conforme al modello CWP: scenario di riferimento dello Standard 4.8.1, situazione attuale, conformità.</w:t>
             </w:r>
           </w:p>
         </w:tc>
@@ -6929,7 +6929,7 @@
                 <w:sz w:val="18"/>
                 <w:szCs w:val="18"/>
               </w:rPr>
-              <w:t xml:space="preserve">2.1</w:t>
+              <w:t xml:space="preserve">2.2</w:t>
             </w:r>
           </w:p>
         </w:tc>
@@ -6993,7 +6993,7 @@
                 <w:sz w:val="18"/>
                 <w:szCs w:val="18"/>
               </w:rPr>
-              <w:t xml:space="preserve">Funzioni in arrivo: simulatore di scenari (7, 10 o 21 anni, obiettivi annui, % di differenziata e crediti stimati) e assistente virtuale (Claude).</w:t>
+              <w:t xml:space="preserve">Nuovo capitolo «Simulatore di scenari»: creazione, anno base, obiettivi annui, risultati, modello di stima.</w:t>
             </w:r>
           </w:p>
         </w:tc>
@@ -7063,7 +7063,7 @@
                 <w:sz w:val="18"/>
                 <w:szCs w:val="18"/>
               </w:rPr>
-              <w:t xml:space="preserve">2.0</w:t>
+              <w:t xml:space="preserve">2.1</w:t>
             </w:r>
           </w:p>
         </w:tc>
@@ -7129,7 +7129,7 @@
                 <w:sz w:val="18"/>
                 <w:szCs w:val="18"/>
               </w:rPr>
-              <w:t xml:space="preserve">Copie di sicurezza e ripristino: rimando alle Istruzioni di ripristino e punti essenziali (capitolo Manutenzione ed emergenze).</w:t>
+              <w:t xml:space="preserve">Funzioni in arrivo: simulatore di scenari (7, 10 o 21 anni, obiettivi annui, % di differenziata e crediti stimati) e assistente virtuale (Claude).</w:t>
             </w:r>
           </w:p>
         </w:tc>
@@ -7199,7 +7199,7 @@
                 <w:sz w:val="18"/>
                 <w:szCs w:val="18"/>
               </w:rPr>
-              <w:t xml:space="preserve">1.9</w:t>
+              <w:t xml:space="preserve">2.0</w:t>
             </w:r>
           </w:p>
         </w:tc>
@@ -7263,7 +7263,7 @@
                 <w:sz w:val="18"/>
                 <w:szCs w:val="18"/>
               </w:rPr>
-              <w:t xml:space="preserve">Fondazione Operate soggetto promotore del programma (esclusiva conferita da Wastelab).</w:t>
+              <w:t xml:space="preserve">Copie di sicurezza e ripristino: rimando alle Istruzioni di ripristino e punti essenziali (capitolo Manutenzione ed emergenze).</w:t>
             </w:r>
           </w:p>
         </w:tc>
@@ -7333,7 +7333,7 @@
                 <w:sz w:val="18"/>
                 <w:szCs w:val="18"/>
               </w:rPr>
-              <w:t xml:space="preserve">1.8</w:t>
+              <w:t xml:space="preserve">1.9</w:t>
             </w:r>
           </w:p>
         </w:tc>
@@ -7399,7 +7399,7 @@
                 <w:sz w:val="18"/>
                 <w:szCs w:val="18"/>
               </w:rPr>
-              <w:t xml:space="preserve">PEC del Programma e documenti ufficiali già pubblicati sulla pagina pubblica.</w:t>
+              <w:t xml:space="preserve">Fondazione Operate soggetto promotore del programma (esclusiva conferita da Wastelab).</w:t>
             </w:r>
           </w:p>
         </w:tc>
@@ -7469,7 +7469,7 @@
                 <w:sz w:val="18"/>
                 <w:szCs w:val="18"/>
               </w:rPr>
-              <w:t xml:space="preserve">1.7</w:t>
+              <w:t xml:space="preserve">1.8</w:t>
             </w:r>
           </w:p>
         </w:tc>
@@ -7501,7 +7501,7 @@
                 <w:sz w:val="18"/>
                 <w:szCs w:val="18"/>
               </w:rPr>
-              <w:t xml:space="preserve">18/10/2026</w:t>
+              <w:t xml:space="preserve">19/10/2026</w:t>
             </w:r>
           </w:p>
         </w:tc>
@@ -7533,7 +7533,7 @@
                 <w:sz w:val="18"/>
                 <w:szCs w:val="18"/>
               </w:rPr>
-              <w:t xml:space="preserve">Allineamento ai documenti ufficiali del Programma (script 22-24): Rapporto a 7 fasi, feedback pubblico, stati del Programma, dati del progetto e territorio ISTAT, ritiro e rientro, account unico e delegati, registri, tariffe e sospensione, accuratezza e accertamenti, informazioni del Programma e metodologie, modelli pubblici; nuovi capitoli Crediti emessi, Reclami, Pagina pubblica; qualità dei dati nel calcolo.</w:t>
+              <w:t xml:space="preserve">PEC del Programma e documenti ufficiali già pubblicati sulla pagina pubblica.</w:t>
             </w:r>
           </w:p>
         </w:tc>
@@ -7603,7 +7603,7 @@
                 <w:sz w:val="18"/>
                 <w:szCs w:val="18"/>
               </w:rPr>
-              <w:t xml:space="preserve">1.6</w:t>
+              <w:t xml:space="preserve">1.7</w:t>
             </w:r>
           </w:p>
         </w:tc>
@@ -7669,7 +7669,7 @@
                 <w:sz w:val="18"/>
                 <w:szCs w:val="18"/>
               </w:rPr>
-              <w:t xml:space="preserve">Calcolo crediti: descrizione corretta del buffer (somma delle voci delle Tabelle 15 e 16, più il 20% con le sole utenze virtuose, al massimo 80%).</w:t>
+              <w:t xml:space="preserve">Allineamento ai documenti ufficiali del Programma (script 22-24): Rapporto a 7 fasi, feedback pubblico, stati del Programma, dati del progetto e territorio ISTAT, ritiro e rientro, account unico e delegati, registri, tariffe e sospensione, accuratezza e accertamenti, informazioni del Programma e metodologie, modelli pubblici; nuovi capitoli Crediti emessi, Reclami, Pagina pubblica; qualità dei dati nel calcolo.</w:t>
             </w:r>
           </w:p>
         </w:tc>
@@ -7739,7 +7739,7 @@
                 <w:sz w:val="18"/>
                 <w:szCs w:val="18"/>
               </w:rPr>
-              <w:t xml:space="preserve">1.5</w:t>
+              <w:t xml:space="preserve">1.6</w:t>
             </w:r>
           </w:p>
         </w:tc>
@@ -7803,7 +7803,7 @@
                 <w:sz w:val="18"/>
                 <w:szCs w:val="18"/>
               </w:rPr>
-              <w:t xml:space="preserve">Nuova pagina Anagrafiche (Organizzazioni ed Enti, anche per gli Operatori); Rapporti con 4 fasi e durate proprie; documenti richiesti per fase; consultazione con documento bloccato, osservazioni numerate e motivazione; conservazione per 10 anni; fascicolo con riepilogo PDF e nuove cartelle.</w:t>
+              <w:t xml:space="preserve">Calcolo crediti: descrizione corretta del buffer (somma delle voci delle Tabelle 15 e 16, più il 20% con le sole utenze virtuose, al massimo 80%).</w:t>
             </w:r>
           </w:p>
         </w:tc>
@@ -7873,7 +7873,7 @@
                 <w:sz w:val="18"/>
                 <w:szCs w:val="18"/>
               </w:rPr>
-              <w:t xml:space="preserve">1.4</w:t>
+              <w:t xml:space="preserve">1.5</w:t>
             </w:r>
           </w:p>
         </w:tc>
@@ -7939,7 +7939,7 @@
                 <w:sz w:val="18"/>
                 <w:szCs w:val="18"/>
               </w:rPr>
-              <w:t xml:space="preserve">Calcolo crediti: il risultato si azzera quando cambiano dati o Banca Dati Utenze, conferma solo dopo un nuovo «Calcola». Gestione utenti: password temporanea di almeno 10 caratteri con lettere e numeri, creazione annullata se non va a buon fine, nessun accesso ai dati prima del cambio password.</w:t>
+              <w:t xml:space="preserve">Nuova pagina Anagrafiche (Organizzazioni ed Enti, anche per gli Operatori); Rapporti con 4 fasi e durate proprie; documenti richiesti per fase; consultazione con documento bloccato, osservazioni numerate e motivazione; conservazione per 10 anni; fascicolo con riepilogo PDF e nuove cartelle.</w:t>
             </w:r>
           </w:p>
         </w:tc>
@@ -8009,7 +8009,7 @@
                 <w:sz w:val="18"/>
                 <w:szCs w:val="18"/>
               </w:rPr>
-              <w:t xml:space="preserve">1.3</w:t>
+              <w:t xml:space="preserve">1.4</w:t>
             </w:r>
           </w:p>
         </w:tc>
@@ -8073,7 +8073,7 @@
                 <w:sz w:val="18"/>
                 <w:szCs w:val="18"/>
               </w:rPr>
-              <w:t xml:space="preserve">Rapporto di calcolo in PDF, archiviazione nella pratica, numero di registro, registro dei crediti.</w:t>
+              <w:t xml:space="preserve">Calcolo crediti: il risultato si azzera quando cambiano dati o Banca Dati Utenze, conferma solo dopo un nuovo «Calcola». Gestione utenti: password temporanea di almeno 10 caratteri con lettere e numeri, creazione annullata se non va a buon fine, nessun accesso ai dati prima del cambio password.</w:t>
             </w:r>
           </w:p>
         </w:tc>
@@ -8143,7 +8143,7 @@
                 <w:sz w:val="18"/>
                 <w:szCs w:val="18"/>
               </w:rPr>
-              <w:t xml:space="preserve">1.2</w:t>
+              <w:t xml:space="preserve">1.3</w:t>
             </w:r>
           </w:p>
         </w:tc>
@@ -8209,7 +8209,7 @@
                 <w:sz w:val="18"/>
                 <w:szCs w:val="18"/>
               </w:rPr>
-              <w:t xml:space="preserve">Calcolo crediti: importare il tracciato nel calcolo (dai documenti della pratica o dal computer), singole letture, blocco dei dati personali, controlli di coerenza.</w:t>
+              <w:t xml:space="preserve">Rapporto di calcolo in PDF, archiviazione nella pratica, numero di registro, registro dei crediti.</w:t>
             </w:r>
           </w:p>
         </w:tc>
@@ -8279,7 +8279,7 @@
                 <w:sz w:val="18"/>
                 <w:szCs w:val="18"/>
               </w:rPr>
-              <w:t xml:space="preserve">1.1</w:t>
+              <w:t xml:space="preserve">1.2</w:t>
             </w:r>
           </w:p>
         </w:tc>
@@ -8343,7 +8343,7 @@
                 <w:sz w:val="18"/>
                 <w:szCs w:val="18"/>
               </w:rPr>
-              <w:t xml:space="preserve">Note di fase, Ente di Validazione della pratica, consultazione sulla pagina pubblica con conferma dell'email, moderazione con autori e allegati, errata corrige; nuovo capitolo Messaggi con il Comune; pagamenti visibili al Comune; Impostazioni: Enti di Validazione e Modelli di documento; notifiche aggiornate.</w:t>
+              <w:t xml:space="preserve">Calcolo crediti: importare il tracciato nel calcolo (dai documenti della pratica o dal computer), singole letture, blocco dei dati personali, controlli di coerenza.</w:t>
             </w:r>
           </w:p>
         </w:tc>
@@ -8413,6 +8413,142 @@
                 <w:sz w:val="18"/>
                 <w:szCs w:val="18"/>
               </w:rPr>
+              <w:t xml:space="preserve">1.1</w:t>
+            </w:r>
+          </w:p>
+        </w:tc>
+        <w:tc>
+          <w:tcPr>
+            <w:tcW w:type="dxa" w:w="1300"/>
+            <w:tcBorders>
+              <w:top w:val="single" w:color="D9D4C5" w:sz="4"/>
+              <w:left w:val="single" w:color="D9D4C5" w:sz="4"/>
+              <w:bottom w:val="single" w:color="D9D4C5" w:sz="4"/>
+              <w:right w:val="single" w:color="D9D4C5" w:sz="4"/>
+            </w:tcBorders>
+            <w:shd w:fill="F6F4EE" w:color="auto" w:val="clear"/>
+            <w:tcMar>
+              <w:top w:type="dxa" w:w="70"/>
+              <w:left w:type="dxa" w:w="110"/>
+              <w:bottom w:type="dxa" w:w="70"/>
+              <w:right w:type="dxa" w:w="110"/>
+            </w:tcMar>
+            <w:vAlign w:val="center"/>
+          </w:tcPr>
+          <w:p>
+            <w:pPr>
+              <w:spacing w:after="0" w:before="0"/>
+            </w:pPr>
+            <w:r>
+              <w:rPr>
+                <w:rFonts w:ascii="Arial" w:cs="Arial" w:eastAsia="Arial" w:hAnsi="Arial"/>
+                <w:color w:val="1B2118"/>
+                <w:sz w:val="18"/>
+                <w:szCs w:val="18"/>
+              </w:rPr>
+              <w:t xml:space="preserve">18/10/2026</w:t>
+            </w:r>
+          </w:p>
+        </w:tc>
+        <w:tc>
+          <w:tcPr>
+            <w:tcW w:type="dxa" w:w="5538"/>
+            <w:tcBorders>
+              <w:top w:val="single" w:color="D9D4C5" w:sz="4"/>
+              <w:left w:val="single" w:color="D9D4C5" w:sz="4"/>
+              <w:bottom w:val="single" w:color="D9D4C5" w:sz="4"/>
+              <w:right w:val="single" w:color="D9D4C5" w:sz="4"/>
+            </w:tcBorders>
+            <w:shd w:fill="F6F4EE" w:color="auto" w:val="clear"/>
+            <w:tcMar>
+              <w:top w:type="dxa" w:w="70"/>
+              <w:left w:type="dxa" w:w="110"/>
+              <w:bottom w:type="dxa" w:w="70"/>
+              <w:right w:type="dxa" w:w="110"/>
+            </w:tcMar>
+            <w:vAlign w:val="center"/>
+          </w:tcPr>
+          <w:p>
+            <w:pPr>
+              <w:spacing w:after="0" w:before="0"/>
+            </w:pPr>
+            <w:r>
+              <w:rPr>
+                <w:rFonts w:ascii="Arial" w:cs="Arial" w:eastAsia="Arial" w:hAnsi="Arial"/>
+                <w:color w:val="1B2118"/>
+                <w:sz w:val="18"/>
+                <w:szCs w:val="18"/>
+              </w:rPr>
+              <w:t xml:space="preserve">Note di fase, Ente di Validazione della pratica, consultazione sulla pagina pubblica con conferma dell'email, moderazione con autori e allegati, errata corrige; nuovo capitolo Messaggi con il Comune; pagamenti visibili al Comune; Impostazioni: Enti di Validazione e Modelli di documento; notifiche aggiornate.</w:t>
+            </w:r>
+          </w:p>
+        </w:tc>
+        <w:tc>
+          <w:tcPr>
+            <w:tcW w:type="dxa" w:w="2000"/>
+            <w:tcBorders>
+              <w:top w:val="single" w:color="D9D4C5" w:sz="4"/>
+              <w:left w:val="single" w:color="D9D4C5" w:sz="4"/>
+              <w:bottom w:val="single" w:color="D9D4C5" w:sz="4"/>
+              <w:right w:val="single" w:color="D9D4C5" w:sz="4"/>
+            </w:tcBorders>
+            <w:shd w:fill="F6F4EE" w:color="auto" w:val="clear"/>
+            <w:tcMar>
+              <w:top w:type="dxa" w:w="70"/>
+              <w:left w:type="dxa" w:w="110"/>
+              <w:bottom w:type="dxa" w:w="70"/>
+              <w:right w:type="dxa" w:w="110"/>
+            </w:tcMar>
+            <w:vAlign w:val="center"/>
+          </w:tcPr>
+          <w:p>
+            <w:pPr>
+              <w:spacing w:after="0" w:before="0"/>
+            </w:pPr>
+            <w:r>
+              <w:rPr>
+                <w:rFonts w:ascii="Arial" w:cs="Arial" w:eastAsia="Arial" w:hAnsi="Arial"/>
+                <w:color w:val="1B2118"/>
+                <w:sz w:val="18"/>
+                <w:szCs w:val="18"/>
+              </w:rPr>
+              <w:t xml:space="preserve">Fondazione Operate</w:t>
+            </w:r>
+          </w:p>
+        </w:tc>
+      </w:tr>
+      <w:tr>
+        <w:trPr>
+          <w:cantSplit/>
+        </w:trPr>
+        <w:tc>
+          <w:tcPr>
+            <w:tcW w:type="dxa" w:w="800"/>
+            <w:tcBorders>
+              <w:top w:val="single" w:color="D9D4C5" w:sz="4"/>
+              <w:left w:val="single" w:color="D9D4C5" w:sz="4"/>
+              <w:bottom w:val="single" w:color="D9D4C5" w:sz="4"/>
+              <w:right w:val="single" w:color="D9D4C5" w:sz="4"/>
+            </w:tcBorders>
+            <w:tcMar>
+              <w:top w:type="dxa" w:w="70"/>
+              <w:left w:type="dxa" w:w="110"/>
+              <w:bottom w:type="dxa" w:w="70"/>
+              <w:right w:type="dxa" w:w="110"/>
+            </w:tcMar>
+            <w:vAlign w:val="center"/>
+          </w:tcPr>
+          <w:p>
+            <w:pPr>
+              <w:spacing w:after="0" w:before="0"/>
+            </w:pPr>
+            <w:r>
+              <w:rPr>
+                <w:rFonts w:ascii="Arial" w:cs="Arial" w:eastAsia="Arial" w:hAnsi="Arial"/>
+                <w:color w:val="1B2118"/>
+                <w:sz w:val="18"/>
+                <w:szCs w:val="18"/>
+              </w:rPr>
               <w:t xml:space="preserve">1.0</w:t>
             </w:r>
           </w:p>
@@ -8426,7 +8562,6 @@
               <w:bottom w:val="single" w:color="D9D4C5" w:sz="4"/>
               <w:right w:val="single" w:color="D9D4C5" w:sz="4"/>
             </w:tcBorders>
-            <w:shd w:fill="F6F4EE" w:color="auto" w:val="clear"/>
             <w:tcMar>
               <w:top w:type="dxa" w:w="70"/>
               <w:left w:type="dxa" w:w="110"/>
@@ -8459,7 +8594,6 @@
               <w:bottom w:val="single" w:color="D9D4C5" w:sz="4"/>
               <w:right w:val="single" w:color="D9D4C5" w:sz="4"/>
             </w:tcBorders>
-            <w:shd w:fill="F6F4EE" w:color="auto" w:val="clear"/>
             <w:tcMar>
               <w:top w:type="dxa" w:w="70"/>
               <w:left w:type="dxa" w:w="110"/>
@@ -8492,7 +8626,6 @@
               <w:bottom w:val="single" w:color="D9D4C5" w:sz="4"/>
               <w:right w:val="single" w:color="D9D4C5" w:sz="4"/>
             </w:tcBorders>
-            <w:shd w:fill="F6F4EE" w:color="auto" w:val="clear"/>
             <w:tcMar>
               <w:top w:type="dxa" w:w="70"/>
               <w:left w:type="dxa" w:w="110"/>
@@ -8534,7 +8667,7 @@
           <w:sz w:val="20"/>
           <w:szCs w:val="20"/>
         </w:rPr>
-        <w:t xml:space="preserve">Questo documento descrive il portale alla revisione 6.7 del 26/10/2026. A ogni modifica del portale il manuale viene aggiornato e la revisione incrementata; la versione corrente si scarica dall'area Documentazione del portale (solo Amministratori).</w:t>
+        <w:t xml:space="preserve">Questo documento descrive il portale alla revisione 6.8 del 26/10/2026. A ogni modifica del portale il manuale viene aggiornato e la revisione incrementata; la versione corrente si scarica dall'area Documentazione del portale (solo Amministratori).</w:t>
       </w:r>
     </w:p>
     <w:p>
@@ -11443,7 +11576,7 @@
         </w:rPr>
         <w:t xml:space="preserve">Si accede da </w:t>
       </w:r>
-      <w:hyperlink w:history="1" r:id="rIdnm6pxdjwexcdqyvh-cjuo">
+      <w:hyperlink w:history="1" r:id="rIdshbv4ltcgltuvsvqtx_28">
         <w:r>
           <w:rPr>
             <w:rFonts w:ascii="Arial" w:cs="Arial" w:eastAsia="Arial" w:hAnsi="Arial"/>
@@ -38650,6 +38783,31 @@
           <w:szCs w:val="21"/>
         </w:rPr>
         <w:t xml:space="preserve"> Dal 22/10/2026 c'è il calcolo «PROVA Banca Dati Utenze - dati casuali (non confermare)» sul Progetto CWP-2026-003, con 20 utenze domestiche e 20 non domestiche inventate (codici PROVA-…): serve a provare il passo 5a e si può eliminare quando non serve più.</w:t>
+      </w:r>
+    </w:p>
+    <w:p>
+      <w:pPr>
+        <w:spacing w:after="140" w:line="300"/>
+      </w:pPr>
+      <w:r>
+        <w:rPr>
+          <w:rFonts w:ascii="Arial" w:cs="Arial" w:eastAsia="Arial" w:hAnsi="Arial"/>
+          <w:b/>
+          <w:bCs/>
+          <w:color w:val="1B2118"/>
+          <w:sz w:val="21"/>
+          <w:szCs w:val="21"/>
+        </w:rPr>
+        <w:t xml:space="preserve">Prova di Borgoval (26/10/2026).</w:t>
+      </w:r>
+      <w:r>
+        <w:rPr>
+          <w:rFonts w:ascii="Arial" w:cs="Arial" w:eastAsia="Arial" w:hAnsi="Arial"/>
+          <w:color w:val="1B2118"/>
+          <w:sz w:val="21"/>
+          <w:szCs w:val="21"/>
+        </w:rPr>
+        <w:t xml:space="preserve"> Sul Progetto CWP-2026-0001 c'è il calcolo «PROVA Borgoval 2027 - utenze generate (ISPRA Casalmaggiore) - non confermare», con 9.000 utenze domestiche (UtD1…UtD9000) e 1.778 non domestiche (UtND1…UtND1778) inventate, kg e svuotamenti di secco e organico. Va insieme allo scenario del simulatore «ISPRA Casalmaggiore 2024 - differenziata all'87% (per utenza)» del Comune di Borgoval: dati ISPRA 2024 di Casalmaggiore riportati a 26.382 abitanti, differenziata fino all'87%, margine positivo ogni anno. Serve a vedere il portale con un Comune di dimensioni reali; non va confermato e si può eliminare quando non serve più.</w:t>
       </w:r>
     </w:p>
     <w:p>
@@ -55813,7 +55971,7 @@
         <w:szCs w:val="16"/>
       </w:rPr>
       <w:tab/>
-      <w:t xml:space="preserve">Manuale Amministratore · Rev. 6.7 · 26/10/2026</w:t>
+      <w:t xml:space="preserve">Manuale Amministratore · Rev. 6.8 · 26/10/2026</w:t>
     </w:r>
   </w:p>
 </w:hdr>
@@ -55878,7 +56036,7 @@
         <w:szCs w:val="16"/>
       </w:rPr>
       <w:tab/>
-      <w:t xml:space="preserve">Manuale Amministratore · Rev. 6.7 · 26/10/2026</w:t>
+      <w:t xml:space="preserve">Manuale Amministratore · Rev. 6.8 · 26/10/2026</w:t>
     </w:r>
   </w:p>
 </w:hdr>

</xml_diff>